<commit_message>
Add Class 20 and 31
</commit_message>
<xml_diff>
--- a/raildriver-UK-Remapped.docx
+++ b/raildriver-UK-Remapped.docx
@@ -1099,7 +1099,2293 @@
         </w:rPr>
       </w:pPr>
       <w:r>
-        <w:rPr/>
+        <w:rPr>
+          <w:color w:val="000000"/>
+          <w:sz w:val="16"/>
+          <w:szCs w:val="16"/>
+        </w:rPr>
+      </w:r>
+    </w:p>
+    <w:p>
+      <w:pPr>
+        <w:pStyle w:val="Normal"/>
+        <w:rPr>
+          <w:color w:val="000000"/>
+          <w:sz w:val="16"/>
+          <w:szCs w:val="16"/>
+        </w:rPr>
+      </w:pPr>
+      <w:r>
+        <w:rPr>
+          <w:color w:val="000000"/>
+          <w:sz w:val="16"/>
+          <w:szCs w:val="16"/>
+        </w:rPr>
+        <w:tab/>
+        <w:t xml:space="preserve">       </w:t>
+      </w:r>
+      <w:r>
+        <w:rPr>
+          <w:rFonts w:eastAsia="arial" w:ascii="arial" w:hAnsi="arial"/>
+          <w:color w:val="000000"/>
+          <w:sz w:val="16"/>
+          <w:szCs w:val="16"/>
+        </w:rPr>
+        <w:t xml:space="preserve">    Class </w:t>
+      </w:r>
+      <w:r>
+        <w:rPr>
+          <w:rFonts w:eastAsia="arial" w:ascii="arial" w:hAnsi="arial"/>
+          <w:color w:val="000000"/>
+          <w:sz w:val="16"/>
+          <w:szCs w:val="16"/>
+        </w:rPr>
+        <w:t>20</w:t>
+      </w:r>
+      <w:r>
+        <w:rPr>
+          <w:rFonts w:eastAsia="arial" w:ascii="arial" w:hAnsi="arial"/>
+          <w:color w:val="000000"/>
+          <w:sz w:val="16"/>
+          <w:szCs w:val="16"/>
+        </w:rPr>
+        <w:t>-1</w:t>
+      </w:r>
+    </w:p>
+    <w:tbl>
+      <w:tblPr>
+        <w:tblW w:w="14248" w:type="dxa"/>
+        <w:jc w:val="left"/>
+        <w:tblInd w:w="-5" w:type="dxa"/>
+        <w:tblLayout w:type="fixed"/>
+        <w:tblCellMar>
+          <w:top w:w="0" w:type="dxa"/>
+          <w:left w:w="108" w:type="dxa"/>
+          <w:bottom w:w="0" w:type="dxa"/>
+          <w:right w:w="108" w:type="dxa"/>
+        </w:tblCellMar>
+        <w:tblLook w:firstRow="1" w:noVBand="1" w:lastRow="0" w:firstColumn="1" w:lastColumn="0" w:noHBand="0" w:val="04a0"/>
+      </w:tblPr>
+      <w:tblGrid>
+        <w:gridCol w:w="1017"/>
+        <w:gridCol w:w="1019"/>
+        <w:gridCol w:w="1014"/>
+        <w:gridCol w:w="1016"/>
+        <w:gridCol w:w="1020"/>
+        <w:gridCol w:w="1016"/>
+        <w:gridCol w:w="1016"/>
+        <w:gridCol w:w="1017"/>
+        <w:gridCol w:w="1016"/>
+        <w:gridCol w:w="1020"/>
+        <w:gridCol w:w="1016"/>
+        <w:gridCol w:w="1016"/>
+        <w:gridCol w:w="1016"/>
+        <w:gridCol w:w="1029"/>
+      </w:tblGrid>
+      <w:tr>
+        <w:trPr>
+          <w:trHeight w:val="440" w:hRule="exact"/>
+          <w:cantSplit w:val="true"/>
+        </w:trPr>
+        <w:tc>
+          <w:tcPr>
+            <w:tcW w:w="1017" w:type="dxa"/>
+            <w:tcBorders>
+              <w:top w:val="single" w:sz="4" w:space="0" w:color="000000"/>
+              <w:left w:val="single" w:sz="4" w:space="0" w:color="000000"/>
+              <w:bottom w:val="single" w:sz="4" w:space="0" w:color="000000"/>
+            </w:tcBorders>
+            <w:vAlign w:val="bottom"/>
+          </w:tcPr>
+          <w:p>
+            <w:pPr>
+              <w:pStyle w:val="Normal"/>
+              <w:widowControl w:val="false"/>
+              <w:spacing w:lineRule="auto" w:line="180" w:before="0" w:after="60"/>
+              <w:jc w:val="center"/>
+              <w:rPr>
+                <w:color w:val="000000"/>
+                <w:sz w:val="16"/>
+                <w:szCs w:val="16"/>
+              </w:rPr>
+            </w:pPr>
+            <w:r>
+              <w:rPr>
+                <w:rFonts w:eastAsia="arial" w:ascii="arial" w:hAnsi="arial"/>
+                <w:b/>
+                <w:color w:val="000000"/>
+                <w:sz w:val="16"/>
+                <w:szCs w:val="16"/>
+              </w:rPr>
+              <w:t>Pause</w:t>
+            </w:r>
+          </w:p>
+        </w:tc>
+        <w:tc>
+          <w:tcPr>
+            <w:tcW w:w="1019" w:type="dxa"/>
+            <w:tcBorders>
+              <w:top w:val="single" w:sz="4" w:space="0" w:color="000000"/>
+              <w:left w:val="single" w:sz="4" w:space="0" w:color="000000"/>
+              <w:bottom w:val="single" w:sz="4" w:space="0" w:color="000000"/>
+            </w:tcBorders>
+            <w:vAlign w:val="bottom"/>
+          </w:tcPr>
+          <w:p>
+            <w:pPr>
+              <w:pStyle w:val="Normal"/>
+              <w:widowControl w:val="false"/>
+              <w:spacing w:lineRule="auto" w:line="180"/>
+              <w:jc w:val="center"/>
+              <w:rPr>
+                <w:color w:val="000000"/>
+                <w:sz w:val="16"/>
+                <w:szCs w:val="16"/>
+              </w:rPr>
+            </w:pPr>
+            <w:r>
+              <w:rPr>
+                <w:color w:val="000000"/>
+                <w:sz w:val="16"/>
+                <w:szCs w:val="16"/>
+              </w:rPr>
+              <w:t>Master Key</w:t>
+            </w:r>
+          </w:p>
+        </w:tc>
+        <w:tc>
+          <w:tcPr>
+            <w:tcW w:w="1014" w:type="dxa"/>
+            <w:tcBorders>
+              <w:top w:val="single" w:sz="4" w:space="0" w:color="000000"/>
+              <w:left w:val="single" w:sz="4" w:space="0" w:color="000000"/>
+              <w:bottom w:val="single" w:sz="4" w:space="0" w:color="000000"/>
+            </w:tcBorders>
+            <w:vAlign w:val="bottom"/>
+          </w:tcPr>
+          <w:p>
+            <w:pPr>
+              <w:pStyle w:val="Normal"/>
+              <w:widowControl w:val="false"/>
+              <w:spacing w:lineRule="auto" w:line="180"/>
+              <w:jc w:val="center"/>
+              <w:rPr>
+                <w:color w:val="000000"/>
+                <w:sz w:val="16"/>
+                <w:szCs w:val="16"/>
+              </w:rPr>
+            </w:pPr>
+            <w:r>
+              <w:rPr>
+                <w:rFonts w:eastAsia="arial" w:ascii="arial" w:hAnsi="arial"/>
+                <w:color w:val="000000"/>
+                <w:sz w:val="16"/>
+                <w:szCs w:val="16"/>
+              </w:rPr>
+              <w:t>Engine Start</w:t>
+            </w:r>
+          </w:p>
+        </w:tc>
+        <w:tc>
+          <w:tcPr>
+            <w:tcW w:w="1016" w:type="dxa"/>
+            <w:tcBorders>
+              <w:top w:val="single" w:sz="4" w:space="0" w:color="000000"/>
+              <w:left w:val="single" w:sz="4" w:space="0" w:color="000000"/>
+              <w:bottom w:val="single" w:sz="4" w:space="0" w:color="000000"/>
+            </w:tcBorders>
+            <w:vAlign w:val="bottom"/>
+          </w:tcPr>
+          <w:p>
+            <w:pPr>
+              <w:pStyle w:val="Normal"/>
+              <w:widowControl w:val="false"/>
+              <w:spacing w:lineRule="auto" w:line="180"/>
+              <w:jc w:val="center"/>
+              <w:rPr>
+                <w:color w:val="000000"/>
+                <w:sz w:val="16"/>
+                <w:szCs w:val="16"/>
+              </w:rPr>
+            </w:pPr>
+            <w:r>
+              <w:rPr>
+                <w:color w:val="000000"/>
+                <w:sz w:val="16"/>
+                <w:szCs w:val="16"/>
+              </w:rPr>
+              <w:t>AWS</w:t>
+            </w:r>
+          </w:p>
+        </w:tc>
+        <w:tc>
+          <w:tcPr>
+            <w:tcW w:w="1020" w:type="dxa"/>
+            <w:tcBorders>
+              <w:top w:val="single" w:sz="4" w:space="0" w:color="000000"/>
+              <w:left w:val="single" w:sz="4" w:space="0" w:color="000000"/>
+              <w:bottom w:val="single" w:sz="4" w:space="0" w:color="000000"/>
+            </w:tcBorders>
+            <w:vAlign w:val="bottom"/>
+          </w:tcPr>
+          <w:p>
+            <w:pPr>
+              <w:pStyle w:val="Normal"/>
+              <w:widowControl w:val="false"/>
+              <w:spacing w:lineRule="auto" w:line="180"/>
+              <w:jc w:val="center"/>
+              <w:rPr>
+                <w:color w:val="000000"/>
+                <w:sz w:val="16"/>
+                <w:szCs w:val="16"/>
+              </w:rPr>
+            </w:pPr>
+            <w:r>
+              <w:rPr>
+                <w:color w:val="000000"/>
+                <w:sz w:val="16"/>
+                <w:szCs w:val="16"/>
+              </w:rPr>
+              <w:t>AWS Cab Change</w:t>
+            </w:r>
+          </w:p>
+        </w:tc>
+        <w:tc>
+          <w:tcPr>
+            <w:tcW w:w="1016" w:type="dxa"/>
+            <w:tcBorders>
+              <w:top w:val="single" w:sz="4" w:space="0" w:color="000000"/>
+              <w:left w:val="single" w:sz="4" w:space="0" w:color="000000"/>
+              <w:bottom w:val="single" w:sz="4" w:space="0" w:color="000000"/>
+            </w:tcBorders>
+            <w:vAlign w:val="bottom"/>
+          </w:tcPr>
+          <w:p>
+            <w:pPr>
+              <w:pStyle w:val="Normal"/>
+              <w:widowControl w:val="false"/>
+              <w:jc w:val="center"/>
+              <w:rPr>
+                <w:color w:val="000000"/>
+                <w:sz w:val="16"/>
+                <w:szCs w:val="16"/>
+              </w:rPr>
+            </w:pPr>
+            <w:r>
+              <w:rPr>
+                <w:color w:val="000000"/>
+                <w:sz w:val="16"/>
+                <w:szCs w:val="16"/>
+              </w:rPr>
+            </w:r>
+          </w:p>
+        </w:tc>
+        <w:tc>
+          <w:tcPr>
+            <w:tcW w:w="1016" w:type="dxa"/>
+            <w:tcBorders>
+              <w:top w:val="single" w:sz="4" w:space="0" w:color="000000"/>
+              <w:left w:val="single" w:sz="4" w:space="0" w:color="000000"/>
+              <w:bottom w:val="single" w:sz="4" w:space="0" w:color="000000"/>
+            </w:tcBorders>
+            <w:vAlign w:val="bottom"/>
+          </w:tcPr>
+          <w:p>
+            <w:pPr>
+              <w:pStyle w:val="Normal"/>
+              <w:widowControl w:val="false"/>
+              <w:jc w:val="center"/>
+              <w:rPr>
+                <w:color w:val="000000"/>
+                <w:sz w:val="16"/>
+                <w:szCs w:val="16"/>
+              </w:rPr>
+            </w:pPr>
+            <w:r>
+              <w:rPr>
+                <w:color w:val="000000"/>
+                <w:sz w:val="16"/>
+                <w:szCs w:val="16"/>
+              </w:rPr>
+              <w:t>Top Marker</w:t>
+            </w:r>
+          </w:p>
+        </w:tc>
+        <w:tc>
+          <w:tcPr>
+            <w:tcW w:w="1017" w:type="dxa"/>
+            <w:tcBorders>
+              <w:top w:val="single" w:sz="4" w:space="0" w:color="000000"/>
+              <w:left w:val="single" w:sz="4" w:space="0" w:color="000000"/>
+              <w:bottom w:val="single" w:sz="4" w:space="0" w:color="000000"/>
+            </w:tcBorders>
+            <w:vAlign w:val="bottom"/>
+          </w:tcPr>
+          <w:p>
+            <w:pPr>
+              <w:pStyle w:val="Normal"/>
+              <w:widowControl w:val="false"/>
+              <w:jc w:val="center"/>
+              <w:rPr>
+                <w:color w:val="000000"/>
+                <w:sz w:val="16"/>
+                <w:szCs w:val="16"/>
+              </w:rPr>
+            </w:pPr>
+            <w:r>
+              <w:rPr>
+                <w:rFonts w:eastAsia="arial" w:ascii="arial" w:hAnsi="arial"/>
+                <w:color w:val="000000"/>
+                <w:sz w:val="16"/>
+                <w:szCs w:val="16"/>
+              </w:rPr>
+              <w:t>Brake Switch</w:t>
+            </w:r>
+          </w:p>
+        </w:tc>
+        <w:tc>
+          <w:tcPr>
+            <w:tcW w:w="1016" w:type="dxa"/>
+            <w:tcBorders>
+              <w:top w:val="single" w:sz="4" w:space="0" w:color="000000"/>
+              <w:left w:val="single" w:sz="4" w:space="0" w:color="000000"/>
+              <w:bottom w:val="single" w:sz="4" w:space="0" w:color="000000"/>
+            </w:tcBorders>
+            <w:vAlign w:val="bottom"/>
+          </w:tcPr>
+          <w:p>
+            <w:pPr>
+              <w:pStyle w:val="Normal"/>
+              <w:widowControl w:val="false"/>
+              <w:jc w:val="center"/>
+              <w:rPr>
+                <w:rFonts w:ascii="arial" w:hAnsi="arial" w:eastAsia="arial"/>
+                <w:color w:val="000000"/>
+                <w:sz w:val="16"/>
+                <w:szCs w:val="16"/>
+              </w:rPr>
+            </w:pPr>
+            <w:r>
+              <w:rPr>
+                <w:rFonts w:eastAsia="arial" w:ascii="arial" w:hAnsi="arial"/>
+                <w:color w:val="000000"/>
+                <w:sz w:val="16"/>
+                <w:szCs w:val="16"/>
+              </w:rPr>
+              <w:t>Inst. Light Up</w:t>
+            </w:r>
+          </w:p>
+        </w:tc>
+        <w:tc>
+          <w:tcPr>
+            <w:tcW w:w="1020" w:type="dxa"/>
+            <w:tcBorders>
+              <w:top w:val="single" w:sz="4" w:space="0" w:color="000000"/>
+              <w:left w:val="single" w:sz="4" w:space="0" w:color="000000"/>
+              <w:bottom w:val="single" w:sz="4" w:space="0" w:color="000000"/>
+            </w:tcBorders>
+            <w:vAlign w:val="bottom"/>
+          </w:tcPr>
+          <w:p>
+            <w:pPr>
+              <w:pStyle w:val="Normal"/>
+              <w:widowControl w:val="false"/>
+              <w:spacing w:lineRule="auto" w:line="180"/>
+              <w:jc w:val="center"/>
+              <w:rPr>
+                <w:sz w:val="16"/>
+                <w:szCs w:val="16"/>
+              </w:rPr>
+            </w:pPr>
+            <w:r>
+              <w:rPr>
+                <w:sz w:val="16"/>
+                <w:szCs w:val="16"/>
+              </w:rPr>
+              <w:t>Inst. Light</w:t>
+            </w:r>
+          </w:p>
+        </w:tc>
+        <w:tc>
+          <w:tcPr>
+            <w:tcW w:w="1016" w:type="dxa"/>
+            <w:tcBorders>
+              <w:top w:val="single" w:sz="4" w:space="0" w:color="000000"/>
+              <w:left w:val="single" w:sz="4" w:space="0" w:color="000000"/>
+              <w:bottom w:val="single" w:sz="4" w:space="0" w:color="000000"/>
+            </w:tcBorders>
+            <w:vAlign w:val="bottom"/>
+          </w:tcPr>
+          <w:p>
+            <w:pPr>
+              <w:pStyle w:val="Normal"/>
+              <w:widowControl w:val="false"/>
+              <w:spacing w:lineRule="auto" w:line="180"/>
+              <w:jc w:val="center"/>
+              <w:rPr>
+                <w:sz w:val="16"/>
+                <w:szCs w:val="16"/>
+              </w:rPr>
+            </w:pPr>
+            <w:r>
+              <w:rPr>
+                <w:rFonts w:eastAsia="arial" w:ascii="arial" w:hAnsi="arial"/>
+                <w:color w:val="000000"/>
+                <w:sz w:val="16"/>
+                <w:szCs w:val="16"/>
+              </w:rPr>
+              <w:t>Cab Light</w:t>
+            </w:r>
+          </w:p>
+        </w:tc>
+        <w:tc>
+          <w:tcPr>
+            <w:tcW w:w="1016" w:type="dxa"/>
+            <w:tcBorders>
+              <w:top w:val="single" w:sz="4" w:space="0" w:color="000000"/>
+              <w:left w:val="single" w:sz="4" w:space="0" w:color="000000"/>
+              <w:bottom w:val="single" w:sz="4" w:space="0" w:color="000000"/>
+            </w:tcBorders>
+            <w:vAlign w:val="bottom"/>
+          </w:tcPr>
+          <w:p>
+            <w:pPr>
+              <w:pStyle w:val="Normal"/>
+              <w:widowControl w:val="false"/>
+              <w:spacing w:lineRule="auto" w:line="180"/>
+              <w:jc w:val="center"/>
+              <w:rPr>
+                <w:sz w:val="16"/>
+                <w:szCs w:val="16"/>
+              </w:rPr>
+            </w:pPr>
+            <w:r>
+              <w:rPr>
+                <w:sz w:val="16"/>
+                <w:szCs w:val="16"/>
+              </w:rPr>
+              <w:t>Handbrake On</w:t>
+            </w:r>
+          </w:p>
+        </w:tc>
+        <w:tc>
+          <w:tcPr>
+            <w:tcW w:w="1016" w:type="dxa"/>
+            <w:tcBorders>
+              <w:top w:val="single" w:sz="4" w:space="0" w:color="000000"/>
+              <w:left w:val="single" w:sz="4" w:space="0" w:color="000000"/>
+              <w:bottom w:val="single" w:sz="4" w:space="0" w:color="000000"/>
+            </w:tcBorders>
+            <w:vAlign w:val="bottom"/>
+          </w:tcPr>
+          <w:p>
+            <w:pPr>
+              <w:pStyle w:val="Normal"/>
+              <w:widowControl w:val="false"/>
+              <w:spacing w:lineRule="auto" w:line="180"/>
+              <w:jc w:val="center"/>
+              <w:rPr>
+                <w:sz w:val="16"/>
+                <w:szCs w:val="16"/>
+              </w:rPr>
+            </w:pPr>
+            <w:r>
+              <w:rPr>
+                <w:rFonts w:eastAsia="arial" w:ascii="arial" w:hAnsi="arial"/>
+                <w:color w:val="000000"/>
+                <w:sz w:val="16"/>
+                <w:szCs w:val="16"/>
+              </w:rPr>
+              <w:t>1-Person</w:t>
+            </w:r>
+          </w:p>
+        </w:tc>
+        <w:tc>
+          <w:tcPr>
+            <w:tcW w:w="1029" w:type="dxa"/>
+            <w:tcBorders>
+              <w:top w:val="single" w:sz="4" w:space="0" w:color="000000"/>
+              <w:left w:val="single" w:sz="4" w:space="0" w:color="000000"/>
+              <w:bottom w:val="single" w:sz="4" w:space="0" w:color="000000"/>
+              <w:right w:val="single" w:sz="4" w:space="0" w:color="000000"/>
+            </w:tcBorders>
+            <w:vAlign w:val="bottom"/>
+          </w:tcPr>
+          <w:p>
+            <w:pPr>
+              <w:pStyle w:val="Normal"/>
+              <w:widowControl w:val="false"/>
+              <w:spacing w:lineRule="auto" w:line="180"/>
+              <w:jc w:val="center"/>
+              <w:rPr>
+                <w:sz w:val="16"/>
+                <w:szCs w:val="16"/>
+              </w:rPr>
+            </w:pPr>
+            <w:r>
+              <w:rPr>
+                <w:rFonts w:eastAsia="arial" w:ascii="arial" w:hAnsi="arial"/>
+                <w:color w:val="000000"/>
+                <w:sz w:val="16"/>
+                <w:szCs w:val="16"/>
+              </w:rPr>
+              <w:t>Next</w:t>
+            </w:r>
+          </w:p>
+          <w:p>
+            <w:pPr>
+              <w:pStyle w:val="Normal"/>
+              <w:widowControl w:val="false"/>
+              <w:spacing w:lineRule="auto" w:line="180"/>
+              <w:jc w:val="center"/>
+              <w:rPr>
+                <w:sz w:val="16"/>
+                <w:szCs w:val="16"/>
+              </w:rPr>
+            </w:pPr>
+            <w:r>
+              <w:rPr>
+                <w:rFonts w:eastAsia="arial" w:ascii="arial" w:hAnsi="arial"/>
+                <w:color w:val="000000"/>
+                <w:sz w:val="16"/>
+                <w:szCs w:val="16"/>
+              </w:rPr>
+              <w:t>Cab Cam</w:t>
+            </w:r>
+          </w:p>
+        </w:tc>
+      </w:tr>
+    </w:tbl>
+    <w:p>
+      <w:pPr>
+        <w:pStyle w:val="Normal"/>
+        <w:rPr>
+          <w:rFonts w:ascii="arial" w:hAnsi="arial" w:eastAsia="arial"/>
+          <w:color w:val="000000"/>
+          <w:sz w:val="16"/>
+          <w:szCs w:val="16"/>
+        </w:rPr>
+      </w:pPr>
+      <w:r>
+        <w:rPr>
+          <w:rFonts w:eastAsia="arial" w:ascii="arial" w:hAnsi="arial"/>
+          <w:color w:val="000000"/>
+          <w:sz w:val="16"/>
+          <w:szCs w:val="16"/>
+        </w:rPr>
+      </w:r>
+    </w:p>
+    <w:p>
+      <w:pPr>
+        <w:pStyle w:val="Normal"/>
+        <w:rPr>
+          <w:color w:val="000000"/>
+          <w:sz w:val="16"/>
+          <w:szCs w:val="16"/>
+        </w:rPr>
+      </w:pPr>
+      <w:r>
+        <w:rPr>
+          <w:rFonts w:eastAsia="arial" w:ascii="arial" w:hAnsi="arial"/>
+          <w:color w:val="000000"/>
+          <w:sz w:val="16"/>
+          <w:szCs w:val="16"/>
+        </w:rPr>
+        <w:tab/>
+        <w:t xml:space="preserve">           Class </w:t>
+      </w:r>
+      <w:r>
+        <w:rPr>
+          <w:rFonts w:eastAsia="arial" w:ascii="arial" w:hAnsi="arial"/>
+          <w:color w:val="000000"/>
+          <w:sz w:val="16"/>
+          <w:szCs w:val="16"/>
+        </w:rPr>
+        <w:t>20</w:t>
+      </w:r>
+      <w:r>
+        <w:rPr>
+          <w:rFonts w:eastAsia="arial" w:ascii="arial" w:hAnsi="arial"/>
+          <w:color w:val="000000"/>
+          <w:sz w:val="16"/>
+          <w:szCs w:val="16"/>
+        </w:rPr>
+        <w:t>-2</w:t>
+      </w:r>
+    </w:p>
+    <w:tbl>
+      <w:tblPr>
+        <w:tblW w:w="14248" w:type="dxa"/>
+        <w:jc w:val="left"/>
+        <w:tblInd w:w="-5" w:type="dxa"/>
+        <w:tblLayout w:type="fixed"/>
+        <w:tblCellMar>
+          <w:top w:w="0" w:type="dxa"/>
+          <w:left w:w="108" w:type="dxa"/>
+          <w:bottom w:w="0" w:type="dxa"/>
+          <w:right w:w="108" w:type="dxa"/>
+        </w:tblCellMar>
+        <w:tblLook w:firstRow="1" w:noVBand="1" w:lastRow="0" w:firstColumn="1" w:lastColumn="0" w:noHBand="0" w:val="04a0"/>
+      </w:tblPr>
+      <w:tblGrid>
+        <w:gridCol w:w="1017"/>
+        <w:gridCol w:w="1019"/>
+        <w:gridCol w:w="1014"/>
+        <w:gridCol w:w="1016"/>
+        <w:gridCol w:w="1020"/>
+        <w:gridCol w:w="1016"/>
+        <w:gridCol w:w="1016"/>
+        <w:gridCol w:w="1017"/>
+        <w:gridCol w:w="1016"/>
+        <w:gridCol w:w="1020"/>
+        <w:gridCol w:w="1016"/>
+        <w:gridCol w:w="1016"/>
+        <w:gridCol w:w="1016"/>
+        <w:gridCol w:w="1029"/>
+      </w:tblGrid>
+      <w:tr>
+        <w:trPr>
+          <w:trHeight w:val="440" w:hRule="exact"/>
+          <w:cantSplit w:val="true"/>
+        </w:trPr>
+        <w:tc>
+          <w:tcPr>
+            <w:tcW w:w="1017" w:type="dxa"/>
+            <w:tcBorders>
+              <w:top w:val="single" w:sz="4" w:space="0" w:color="000000"/>
+              <w:left w:val="single" w:sz="4" w:space="0" w:color="000000"/>
+              <w:bottom w:val="single" w:sz="4" w:space="0" w:color="000000"/>
+            </w:tcBorders>
+            <w:vAlign w:val="bottom"/>
+          </w:tcPr>
+          <w:p>
+            <w:pPr>
+              <w:pStyle w:val="Normal"/>
+              <w:widowControl w:val="false"/>
+              <w:spacing w:lineRule="auto" w:line="180" w:before="0" w:after="60"/>
+              <w:jc w:val="center"/>
+              <w:rPr>
+                <w:b/>
+                <w:bCs/>
+              </w:rPr>
+            </w:pPr>
+            <w:r>
+              <w:rPr>
+                <w:b/>
+                <w:bCs/>
+                <w:color w:val="000000"/>
+                <w:sz w:val="16"/>
+                <w:szCs w:val="16"/>
+              </w:rPr>
+              <w:t>HUD</w:t>
+            </w:r>
+          </w:p>
+        </w:tc>
+        <w:tc>
+          <w:tcPr>
+            <w:tcW w:w="1019" w:type="dxa"/>
+            <w:tcBorders>
+              <w:top w:val="single" w:sz="4" w:space="0" w:color="000000"/>
+              <w:left w:val="single" w:sz="4" w:space="0" w:color="000000"/>
+              <w:bottom w:val="single" w:sz="4" w:space="0" w:color="000000"/>
+            </w:tcBorders>
+            <w:vAlign w:val="bottom"/>
+          </w:tcPr>
+          <w:p>
+            <w:pPr>
+              <w:pStyle w:val="Normal"/>
+              <w:widowControl w:val="false"/>
+              <w:spacing w:lineRule="auto" w:line="180"/>
+              <w:jc w:val="center"/>
+              <w:rPr>
+                <w:color w:val="000000"/>
+                <w:sz w:val="16"/>
+                <w:szCs w:val="16"/>
+              </w:rPr>
+            </w:pPr>
+            <w:r>
+              <w:rPr>
+                <w:color w:val="000000"/>
+                <w:sz w:val="16"/>
+                <w:szCs w:val="16"/>
+              </w:rPr>
+              <w:t>Schedule</w:t>
+            </w:r>
+          </w:p>
+        </w:tc>
+        <w:tc>
+          <w:tcPr>
+            <w:tcW w:w="1014" w:type="dxa"/>
+            <w:tcBorders>
+              <w:top w:val="single" w:sz="4" w:space="0" w:color="000000"/>
+              <w:left w:val="single" w:sz="4" w:space="0" w:color="000000"/>
+              <w:bottom w:val="single" w:sz="4" w:space="0" w:color="000000"/>
+            </w:tcBorders>
+            <w:vAlign w:val="bottom"/>
+          </w:tcPr>
+          <w:p>
+            <w:pPr>
+              <w:pStyle w:val="Normal"/>
+              <w:widowControl w:val="false"/>
+              <w:spacing w:lineRule="auto" w:line="180"/>
+              <w:jc w:val="center"/>
+              <w:rPr>
+                <w:color w:val="000000"/>
+                <w:sz w:val="16"/>
+                <w:szCs w:val="16"/>
+              </w:rPr>
+            </w:pPr>
+            <w:r>
+              <w:rPr>
+                <w:rFonts w:eastAsia="arial" w:ascii="arial" w:hAnsi="arial"/>
+                <w:color w:val="000000"/>
+                <w:sz w:val="16"/>
+                <w:szCs w:val="16"/>
+              </w:rPr>
+              <w:t>Engine Stop</w:t>
+            </w:r>
+          </w:p>
+        </w:tc>
+        <w:tc>
+          <w:tcPr>
+            <w:tcW w:w="1016" w:type="dxa"/>
+            <w:tcBorders>
+              <w:top w:val="single" w:sz="4" w:space="0" w:color="000000"/>
+              <w:left w:val="single" w:sz="4" w:space="0" w:color="000000"/>
+              <w:bottom w:val="single" w:sz="4" w:space="0" w:color="000000"/>
+            </w:tcBorders>
+            <w:vAlign w:val="bottom"/>
+          </w:tcPr>
+          <w:p>
+            <w:pPr>
+              <w:pStyle w:val="Normal"/>
+              <w:widowControl w:val="false"/>
+              <w:spacing w:lineRule="auto" w:line="180"/>
+              <w:jc w:val="center"/>
+              <w:rPr>
+                <w:color w:val="000000"/>
+                <w:sz w:val="16"/>
+                <w:szCs w:val="16"/>
+              </w:rPr>
+            </w:pPr>
+            <w:r>
+              <w:rPr>
+                <w:color w:val="000000"/>
+                <w:sz w:val="16"/>
+                <w:szCs w:val="16"/>
+              </w:rPr>
+              <w:t>DSD</w:t>
+            </w:r>
+          </w:p>
+        </w:tc>
+        <w:tc>
+          <w:tcPr>
+            <w:tcW w:w="1020" w:type="dxa"/>
+            <w:tcBorders>
+              <w:top w:val="single" w:sz="4" w:space="0" w:color="000000"/>
+              <w:left w:val="single" w:sz="4" w:space="0" w:color="000000"/>
+              <w:bottom w:val="single" w:sz="4" w:space="0" w:color="000000"/>
+            </w:tcBorders>
+            <w:vAlign w:val="bottom"/>
+          </w:tcPr>
+          <w:p>
+            <w:pPr>
+              <w:pStyle w:val="Normal"/>
+              <w:widowControl w:val="false"/>
+              <w:spacing w:lineRule="auto" w:line="180"/>
+              <w:jc w:val="center"/>
+              <w:rPr>
+                <w:color w:val="000000"/>
+                <w:sz w:val="16"/>
+                <w:szCs w:val="16"/>
+              </w:rPr>
+            </w:pPr>
+            <w:r>
+              <w:rPr>
+                <w:color w:val="000000"/>
+                <w:sz w:val="16"/>
+                <w:szCs w:val="16"/>
+              </w:rPr>
+            </w:r>
+          </w:p>
+        </w:tc>
+        <w:tc>
+          <w:tcPr>
+            <w:tcW w:w="1016" w:type="dxa"/>
+            <w:tcBorders>
+              <w:top w:val="single" w:sz="4" w:space="0" w:color="000000"/>
+              <w:left w:val="single" w:sz="4" w:space="0" w:color="000000"/>
+              <w:bottom w:val="single" w:sz="4" w:space="0" w:color="000000"/>
+            </w:tcBorders>
+            <w:vAlign w:val="bottom"/>
+          </w:tcPr>
+          <w:p>
+            <w:pPr>
+              <w:pStyle w:val="Normal"/>
+              <w:widowControl w:val="false"/>
+              <w:jc w:val="center"/>
+              <w:rPr>
+                <w:color w:val="000000"/>
+                <w:sz w:val="16"/>
+                <w:szCs w:val="16"/>
+              </w:rPr>
+            </w:pPr>
+            <w:r>
+              <w:rPr>
+                <w:color w:val="000000"/>
+                <w:sz w:val="16"/>
+                <w:szCs w:val="16"/>
+              </w:rPr>
+            </w:r>
+          </w:p>
+        </w:tc>
+        <w:tc>
+          <w:tcPr>
+            <w:tcW w:w="1016" w:type="dxa"/>
+            <w:tcBorders>
+              <w:top w:val="single" w:sz="4" w:space="0" w:color="000000"/>
+              <w:left w:val="single" w:sz="4" w:space="0" w:color="000000"/>
+              <w:bottom w:val="single" w:sz="4" w:space="0" w:color="000000"/>
+            </w:tcBorders>
+            <w:vAlign w:val="bottom"/>
+          </w:tcPr>
+          <w:p>
+            <w:pPr>
+              <w:pStyle w:val="Normal"/>
+              <w:widowControl w:val="false"/>
+              <w:jc w:val="center"/>
+              <w:rPr>
+                <w:color w:val="000000"/>
+                <w:sz w:val="16"/>
+                <w:szCs w:val="16"/>
+              </w:rPr>
+            </w:pPr>
+            <w:r>
+              <w:rPr>
+                <w:rFonts w:eastAsia="arial" w:ascii="arial" w:hAnsi="arial"/>
+                <w:color w:val="000000"/>
+                <w:sz w:val="16"/>
+                <w:szCs w:val="16"/>
+              </w:rPr>
+              <w:t>Bottom Marker</w:t>
+            </w:r>
+          </w:p>
+        </w:tc>
+        <w:tc>
+          <w:tcPr>
+            <w:tcW w:w="1017" w:type="dxa"/>
+            <w:tcBorders>
+              <w:top w:val="single" w:sz="4" w:space="0" w:color="000000"/>
+              <w:left w:val="single" w:sz="4" w:space="0" w:color="000000"/>
+              <w:bottom w:val="single" w:sz="4" w:space="0" w:color="000000"/>
+            </w:tcBorders>
+            <w:vAlign w:val="bottom"/>
+          </w:tcPr>
+          <w:p>
+            <w:pPr>
+              <w:pStyle w:val="Normal"/>
+              <w:widowControl w:val="false"/>
+              <w:jc w:val="center"/>
+              <w:rPr>
+                <w:rFonts w:ascii="arial" w:hAnsi="arial" w:eastAsia="arial"/>
+                <w:color w:val="000000"/>
+                <w:sz w:val="16"/>
+                <w:szCs w:val="16"/>
+              </w:rPr>
+            </w:pPr>
+            <w:r>
+              <w:rPr/>
+            </w:r>
+          </w:p>
+        </w:tc>
+        <w:tc>
+          <w:tcPr>
+            <w:tcW w:w="1016" w:type="dxa"/>
+            <w:tcBorders>
+              <w:top w:val="single" w:sz="4" w:space="0" w:color="000000"/>
+              <w:left w:val="single" w:sz="4" w:space="0" w:color="000000"/>
+              <w:bottom w:val="single" w:sz="4" w:space="0" w:color="000000"/>
+            </w:tcBorders>
+            <w:vAlign w:val="bottom"/>
+          </w:tcPr>
+          <w:p>
+            <w:pPr>
+              <w:pStyle w:val="Normal"/>
+              <w:widowControl w:val="false"/>
+              <w:jc w:val="center"/>
+              <w:rPr>
+                <w:rFonts w:ascii="arial" w:hAnsi="arial" w:eastAsia="arial"/>
+                <w:color w:val="000000"/>
+                <w:sz w:val="16"/>
+                <w:szCs w:val="16"/>
+              </w:rPr>
+            </w:pPr>
+            <w:r>
+              <w:rPr>
+                <w:rFonts w:eastAsia="arial" w:ascii="arial" w:hAnsi="arial"/>
+                <w:color w:val="000000"/>
+                <w:sz w:val="16"/>
+                <w:szCs w:val="16"/>
+              </w:rPr>
+              <w:t xml:space="preserve">Inst. Light </w:t>
+            </w:r>
+            <w:r>
+              <w:rPr>
+                <w:rFonts w:eastAsia="arial" w:ascii="arial" w:hAnsi="arial"/>
+                <w:color w:val="000000"/>
+                <w:sz w:val="16"/>
+                <w:szCs w:val="16"/>
+              </w:rPr>
+              <w:t>Down</w:t>
+            </w:r>
+          </w:p>
+        </w:tc>
+        <w:tc>
+          <w:tcPr>
+            <w:tcW w:w="1020" w:type="dxa"/>
+            <w:tcBorders>
+              <w:top w:val="single" w:sz="4" w:space="0" w:color="000000"/>
+              <w:left w:val="single" w:sz="4" w:space="0" w:color="000000"/>
+              <w:bottom w:val="single" w:sz="4" w:space="0" w:color="000000"/>
+            </w:tcBorders>
+            <w:vAlign w:val="bottom"/>
+          </w:tcPr>
+          <w:p>
+            <w:pPr>
+              <w:pStyle w:val="Normal"/>
+              <w:widowControl w:val="false"/>
+              <w:spacing w:lineRule="auto" w:line="180"/>
+              <w:jc w:val="center"/>
+              <w:rPr>
+                <w:sz w:val="16"/>
+                <w:szCs w:val="16"/>
+              </w:rPr>
+            </w:pPr>
+            <w:r>
+              <w:rPr>
+                <w:sz w:val="16"/>
+                <w:szCs w:val="16"/>
+              </w:rPr>
+            </w:r>
+          </w:p>
+        </w:tc>
+        <w:tc>
+          <w:tcPr>
+            <w:tcW w:w="1016" w:type="dxa"/>
+            <w:tcBorders>
+              <w:top w:val="single" w:sz="4" w:space="0" w:color="000000"/>
+              <w:left w:val="single" w:sz="4" w:space="0" w:color="000000"/>
+              <w:bottom w:val="single" w:sz="4" w:space="0" w:color="000000"/>
+            </w:tcBorders>
+            <w:vAlign w:val="bottom"/>
+          </w:tcPr>
+          <w:p>
+            <w:pPr>
+              <w:pStyle w:val="Normal"/>
+              <w:widowControl w:val="false"/>
+              <w:spacing w:lineRule="auto" w:line="180"/>
+              <w:jc w:val="center"/>
+              <w:rPr>
+                <w:sz w:val="16"/>
+                <w:szCs w:val="16"/>
+              </w:rPr>
+            </w:pPr>
+            <w:r>
+              <w:rPr>
+                <w:sz w:val="16"/>
+                <w:szCs w:val="16"/>
+              </w:rPr>
+              <w:t>Tail Light</w:t>
+            </w:r>
+          </w:p>
+        </w:tc>
+        <w:tc>
+          <w:tcPr>
+            <w:tcW w:w="1016" w:type="dxa"/>
+            <w:tcBorders>
+              <w:top w:val="single" w:sz="4" w:space="0" w:color="000000"/>
+              <w:left w:val="single" w:sz="4" w:space="0" w:color="000000"/>
+              <w:bottom w:val="single" w:sz="4" w:space="0" w:color="000000"/>
+            </w:tcBorders>
+            <w:vAlign w:val="bottom"/>
+          </w:tcPr>
+          <w:p>
+            <w:pPr>
+              <w:pStyle w:val="Normal"/>
+              <w:widowControl w:val="false"/>
+              <w:spacing w:lineRule="auto" w:line="180"/>
+              <w:jc w:val="center"/>
+              <w:rPr>
+                <w:sz w:val="16"/>
+                <w:szCs w:val="16"/>
+              </w:rPr>
+            </w:pPr>
+            <w:r>
+              <w:rPr>
+                <w:sz w:val="16"/>
+                <w:szCs w:val="16"/>
+              </w:rPr>
+              <w:t>Handbrake Off</w:t>
+            </w:r>
+          </w:p>
+        </w:tc>
+        <w:tc>
+          <w:tcPr>
+            <w:tcW w:w="1016" w:type="dxa"/>
+            <w:tcBorders>
+              <w:top w:val="single" w:sz="4" w:space="0" w:color="000000"/>
+              <w:left w:val="single" w:sz="4" w:space="0" w:color="000000"/>
+              <w:bottom w:val="single" w:sz="4" w:space="0" w:color="000000"/>
+            </w:tcBorders>
+            <w:vAlign w:val="bottom"/>
+          </w:tcPr>
+          <w:p>
+            <w:pPr>
+              <w:pStyle w:val="Normal"/>
+              <w:widowControl w:val="false"/>
+              <w:spacing w:lineRule="auto" w:line="180"/>
+              <w:jc w:val="center"/>
+              <w:rPr>
+                <w:sz w:val="16"/>
+                <w:szCs w:val="16"/>
+              </w:rPr>
+            </w:pPr>
+            <w:r>
+              <w:rPr>
+                <w:rFonts w:eastAsia="arial" w:ascii="arial" w:hAnsi="arial"/>
+                <w:color w:val="000000"/>
+                <w:sz w:val="16"/>
+                <w:szCs w:val="16"/>
+              </w:rPr>
+              <w:t>Exterior</w:t>
+            </w:r>
+          </w:p>
+          <w:p>
+            <w:pPr>
+              <w:pStyle w:val="Normal"/>
+              <w:widowControl w:val="false"/>
+              <w:spacing w:lineRule="auto" w:line="180"/>
+              <w:jc w:val="center"/>
+              <w:rPr>
+                <w:sz w:val="16"/>
+                <w:szCs w:val="16"/>
+              </w:rPr>
+            </w:pPr>
+            <w:r>
+              <w:rPr>
+                <w:rFonts w:eastAsia="arial" w:ascii="arial" w:hAnsi="arial"/>
+                <w:color w:val="000000"/>
+                <w:sz w:val="16"/>
+                <w:szCs w:val="16"/>
+              </w:rPr>
+              <w:t>Camera</w:t>
+            </w:r>
+          </w:p>
+        </w:tc>
+        <w:tc>
+          <w:tcPr>
+            <w:tcW w:w="1029" w:type="dxa"/>
+            <w:tcBorders>
+              <w:top w:val="single" w:sz="4" w:space="0" w:color="000000"/>
+              <w:left w:val="single" w:sz="4" w:space="0" w:color="000000"/>
+              <w:bottom w:val="single" w:sz="4" w:space="0" w:color="000000"/>
+              <w:right w:val="single" w:sz="4" w:space="0" w:color="000000"/>
+            </w:tcBorders>
+            <w:vAlign w:val="bottom"/>
+          </w:tcPr>
+          <w:p>
+            <w:pPr>
+              <w:pStyle w:val="Normal"/>
+              <w:widowControl w:val="false"/>
+              <w:spacing w:lineRule="auto" w:line="180"/>
+              <w:jc w:val="center"/>
+              <w:rPr>
+                <w:sz w:val="16"/>
+                <w:szCs w:val="16"/>
+              </w:rPr>
+            </w:pPr>
+            <w:r>
+              <w:rPr>
+                <w:rFonts w:eastAsia="arial" w:ascii="arial" w:hAnsi="arial"/>
+                <w:color w:val="000000"/>
+                <w:sz w:val="16"/>
+                <w:szCs w:val="16"/>
+              </w:rPr>
+              <w:t>Prev</w:t>
+            </w:r>
+          </w:p>
+          <w:p>
+            <w:pPr>
+              <w:pStyle w:val="Normal"/>
+              <w:widowControl w:val="false"/>
+              <w:spacing w:lineRule="auto" w:line="180"/>
+              <w:jc w:val="center"/>
+              <w:rPr>
+                <w:sz w:val="16"/>
+                <w:szCs w:val="16"/>
+              </w:rPr>
+            </w:pPr>
+            <w:r>
+              <w:rPr>
+                <w:rFonts w:eastAsia="arial" w:ascii="arial" w:hAnsi="arial"/>
+                <w:color w:val="000000"/>
+                <w:sz w:val="16"/>
+                <w:szCs w:val="16"/>
+              </w:rPr>
+              <w:t>Cab Cam</w:t>
+            </w:r>
+          </w:p>
+        </w:tc>
+      </w:tr>
+    </w:tbl>
+    <w:p>
+      <w:pPr>
+        <w:pStyle w:val="Normal"/>
+        <w:rPr>
+          <w:color w:val="000000"/>
+          <w:sz w:val="16"/>
+          <w:szCs w:val="16"/>
+        </w:rPr>
+      </w:pPr>
+      <w:r>
+        <w:rPr>
+          <w:color w:val="000000"/>
+          <w:sz w:val="16"/>
+          <w:szCs w:val="16"/>
+        </w:rPr>
+      </w:r>
+    </w:p>
+    <w:p>
+      <w:pPr>
+        <w:pStyle w:val="Normal"/>
+        <w:rPr>
+          <w:color w:val="000000"/>
+          <w:sz w:val="16"/>
+          <w:szCs w:val="16"/>
+        </w:rPr>
+      </w:pPr>
+      <w:r>
+        <w:rPr>
+          <w:color w:val="000000"/>
+          <w:sz w:val="16"/>
+          <w:szCs w:val="16"/>
+        </w:rPr>
+        <w:tab/>
+        <w:t xml:space="preserve">       </w:t>
+      </w:r>
+      <w:r>
+        <w:rPr>
+          <w:rFonts w:eastAsia="arial" w:ascii="arial" w:hAnsi="arial"/>
+          <w:color w:val="000000"/>
+          <w:sz w:val="16"/>
+          <w:szCs w:val="16"/>
+        </w:rPr>
+        <w:t xml:space="preserve">    Class </w:t>
+      </w:r>
+      <w:r>
+        <w:rPr>
+          <w:rFonts w:eastAsia="arial" w:ascii="arial" w:hAnsi="arial"/>
+          <w:color w:val="000000"/>
+          <w:sz w:val="16"/>
+          <w:szCs w:val="16"/>
+        </w:rPr>
+        <w:t>31</w:t>
+      </w:r>
+      <w:r>
+        <w:rPr>
+          <w:rFonts w:eastAsia="arial" w:ascii="arial" w:hAnsi="arial"/>
+          <w:color w:val="000000"/>
+          <w:sz w:val="16"/>
+          <w:szCs w:val="16"/>
+        </w:rPr>
+        <w:t>-1</w:t>
+      </w:r>
+    </w:p>
+    <w:tbl>
+      <w:tblPr>
+        <w:tblW w:w="14248" w:type="dxa"/>
+        <w:jc w:val="left"/>
+        <w:tblInd w:w="-5" w:type="dxa"/>
+        <w:tblLayout w:type="fixed"/>
+        <w:tblCellMar>
+          <w:top w:w="0" w:type="dxa"/>
+          <w:left w:w="108" w:type="dxa"/>
+          <w:bottom w:w="0" w:type="dxa"/>
+          <w:right w:w="108" w:type="dxa"/>
+        </w:tblCellMar>
+        <w:tblLook w:firstRow="1" w:noVBand="1" w:lastRow="0" w:firstColumn="1" w:lastColumn="0" w:noHBand="0" w:val="04a0"/>
+      </w:tblPr>
+      <w:tblGrid>
+        <w:gridCol w:w="1017"/>
+        <w:gridCol w:w="1019"/>
+        <w:gridCol w:w="1014"/>
+        <w:gridCol w:w="1016"/>
+        <w:gridCol w:w="1020"/>
+        <w:gridCol w:w="1016"/>
+        <w:gridCol w:w="1016"/>
+        <w:gridCol w:w="1017"/>
+        <w:gridCol w:w="1016"/>
+        <w:gridCol w:w="1020"/>
+        <w:gridCol w:w="1016"/>
+        <w:gridCol w:w="1016"/>
+        <w:gridCol w:w="1016"/>
+        <w:gridCol w:w="1029"/>
+      </w:tblGrid>
+      <w:tr>
+        <w:trPr>
+          <w:trHeight w:val="440" w:hRule="exact"/>
+          <w:cantSplit w:val="true"/>
+        </w:trPr>
+        <w:tc>
+          <w:tcPr>
+            <w:tcW w:w="1017" w:type="dxa"/>
+            <w:tcBorders>
+              <w:top w:val="single" w:sz="4" w:space="0" w:color="000000"/>
+              <w:left w:val="single" w:sz="4" w:space="0" w:color="000000"/>
+              <w:bottom w:val="single" w:sz="4" w:space="0" w:color="000000"/>
+            </w:tcBorders>
+            <w:vAlign w:val="bottom"/>
+          </w:tcPr>
+          <w:p>
+            <w:pPr>
+              <w:pStyle w:val="Normal"/>
+              <w:widowControl w:val="false"/>
+              <w:spacing w:lineRule="auto" w:line="180" w:before="0" w:after="60"/>
+              <w:jc w:val="center"/>
+              <w:rPr>
+                <w:color w:val="000000"/>
+                <w:sz w:val="16"/>
+                <w:szCs w:val="16"/>
+              </w:rPr>
+            </w:pPr>
+            <w:r>
+              <w:rPr>
+                <w:rFonts w:eastAsia="arial" w:ascii="arial" w:hAnsi="arial"/>
+                <w:b/>
+                <w:color w:val="000000"/>
+                <w:sz w:val="16"/>
+                <w:szCs w:val="16"/>
+              </w:rPr>
+              <w:t>Pause</w:t>
+            </w:r>
+          </w:p>
+        </w:tc>
+        <w:tc>
+          <w:tcPr>
+            <w:tcW w:w="1019" w:type="dxa"/>
+            <w:tcBorders>
+              <w:top w:val="single" w:sz="4" w:space="0" w:color="000000"/>
+              <w:left w:val="single" w:sz="4" w:space="0" w:color="000000"/>
+              <w:bottom w:val="single" w:sz="4" w:space="0" w:color="000000"/>
+            </w:tcBorders>
+            <w:vAlign w:val="bottom"/>
+          </w:tcPr>
+          <w:p>
+            <w:pPr>
+              <w:pStyle w:val="Normal"/>
+              <w:widowControl w:val="false"/>
+              <w:spacing w:lineRule="auto" w:line="180"/>
+              <w:jc w:val="center"/>
+              <w:rPr>
+                <w:color w:val="000000"/>
+                <w:sz w:val="16"/>
+                <w:szCs w:val="16"/>
+              </w:rPr>
+            </w:pPr>
+            <w:r>
+              <w:rPr>
+                <w:color w:val="000000"/>
+                <w:sz w:val="16"/>
+                <w:szCs w:val="16"/>
+              </w:rPr>
+              <w:t>Master Key</w:t>
+            </w:r>
+          </w:p>
+        </w:tc>
+        <w:tc>
+          <w:tcPr>
+            <w:tcW w:w="1014" w:type="dxa"/>
+            <w:tcBorders>
+              <w:top w:val="single" w:sz="4" w:space="0" w:color="000000"/>
+              <w:left w:val="single" w:sz="4" w:space="0" w:color="000000"/>
+              <w:bottom w:val="single" w:sz="4" w:space="0" w:color="000000"/>
+            </w:tcBorders>
+            <w:vAlign w:val="bottom"/>
+          </w:tcPr>
+          <w:p>
+            <w:pPr>
+              <w:pStyle w:val="Normal"/>
+              <w:widowControl w:val="false"/>
+              <w:spacing w:lineRule="auto" w:line="180"/>
+              <w:jc w:val="center"/>
+              <w:rPr>
+                <w:color w:val="000000"/>
+                <w:sz w:val="16"/>
+                <w:szCs w:val="16"/>
+              </w:rPr>
+            </w:pPr>
+            <w:r>
+              <w:rPr>
+                <w:rFonts w:eastAsia="arial" w:ascii="arial" w:hAnsi="arial"/>
+                <w:color w:val="000000"/>
+                <w:sz w:val="16"/>
+                <w:szCs w:val="16"/>
+              </w:rPr>
+              <w:t>Engine Start</w:t>
+            </w:r>
+          </w:p>
+        </w:tc>
+        <w:tc>
+          <w:tcPr>
+            <w:tcW w:w="1016" w:type="dxa"/>
+            <w:tcBorders>
+              <w:top w:val="single" w:sz="4" w:space="0" w:color="000000"/>
+              <w:left w:val="single" w:sz="4" w:space="0" w:color="000000"/>
+              <w:bottom w:val="single" w:sz="4" w:space="0" w:color="000000"/>
+            </w:tcBorders>
+            <w:vAlign w:val="bottom"/>
+          </w:tcPr>
+          <w:p>
+            <w:pPr>
+              <w:pStyle w:val="Normal"/>
+              <w:widowControl w:val="false"/>
+              <w:spacing w:lineRule="auto" w:line="180"/>
+              <w:jc w:val="center"/>
+              <w:rPr>
+                <w:color w:val="000000"/>
+                <w:sz w:val="16"/>
+                <w:szCs w:val="16"/>
+              </w:rPr>
+            </w:pPr>
+            <w:r>
+              <w:rPr>
+                <w:color w:val="000000"/>
+                <w:sz w:val="16"/>
+                <w:szCs w:val="16"/>
+              </w:rPr>
+              <w:t>AWS</w:t>
+            </w:r>
+          </w:p>
+        </w:tc>
+        <w:tc>
+          <w:tcPr>
+            <w:tcW w:w="1020" w:type="dxa"/>
+            <w:tcBorders>
+              <w:top w:val="single" w:sz="4" w:space="0" w:color="000000"/>
+              <w:left w:val="single" w:sz="4" w:space="0" w:color="000000"/>
+              <w:bottom w:val="single" w:sz="4" w:space="0" w:color="000000"/>
+            </w:tcBorders>
+            <w:vAlign w:val="bottom"/>
+          </w:tcPr>
+          <w:p>
+            <w:pPr>
+              <w:pStyle w:val="Normal"/>
+              <w:widowControl w:val="false"/>
+              <w:spacing w:lineRule="auto" w:line="180"/>
+              <w:jc w:val="center"/>
+              <w:rPr>
+                <w:color w:val="000000"/>
+                <w:sz w:val="16"/>
+                <w:szCs w:val="16"/>
+              </w:rPr>
+            </w:pPr>
+            <w:r>
+              <w:rPr>
+                <w:color w:val="000000"/>
+                <w:sz w:val="16"/>
+                <w:szCs w:val="16"/>
+              </w:rPr>
+              <w:t>AWS Cab Change</w:t>
+            </w:r>
+          </w:p>
+        </w:tc>
+        <w:tc>
+          <w:tcPr>
+            <w:tcW w:w="1016" w:type="dxa"/>
+            <w:tcBorders>
+              <w:top w:val="single" w:sz="4" w:space="0" w:color="000000"/>
+              <w:left w:val="single" w:sz="4" w:space="0" w:color="000000"/>
+              <w:bottom w:val="single" w:sz="4" w:space="0" w:color="000000"/>
+            </w:tcBorders>
+            <w:vAlign w:val="bottom"/>
+          </w:tcPr>
+          <w:p>
+            <w:pPr>
+              <w:pStyle w:val="Normal"/>
+              <w:widowControl w:val="false"/>
+              <w:jc w:val="center"/>
+              <w:rPr>
+                <w:color w:val="000000"/>
+                <w:sz w:val="16"/>
+                <w:szCs w:val="16"/>
+              </w:rPr>
+            </w:pPr>
+            <w:r>
+              <w:rPr>
+                <w:color w:val="000000"/>
+                <w:sz w:val="16"/>
+                <w:szCs w:val="16"/>
+              </w:rPr>
+            </w:r>
+          </w:p>
+        </w:tc>
+        <w:tc>
+          <w:tcPr>
+            <w:tcW w:w="1016" w:type="dxa"/>
+            <w:tcBorders>
+              <w:top w:val="single" w:sz="4" w:space="0" w:color="000000"/>
+              <w:left w:val="single" w:sz="4" w:space="0" w:color="000000"/>
+              <w:bottom w:val="single" w:sz="4" w:space="0" w:color="000000"/>
+            </w:tcBorders>
+            <w:vAlign w:val="bottom"/>
+          </w:tcPr>
+          <w:p>
+            <w:pPr>
+              <w:pStyle w:val="Normal"/>
+              <w:widowControl w:val="false"/>
+              <w:jc w:val="center"/>
+              <w:rPr>
+                <w:color w:val="000000"/>
+                <w:sz w:val="16"/>
+                <w:szCs w:val="16"/>
+              </w:rPr>
+            </w:pPr>
+            <w:r>
+              <w:rPr/>
+            </w:r>
+          </w:p>
+        </w:tc>
+        <w:tc>
+          <w:tcPr>
+            <w:tcW w:w="1017" w:type="dxa"/>
+            <w:tcBorders>
+              <w:top w:val="single" w:sz="4" w:space="0" w:color="000000"/>
+              <w:left w:val="single" w:sz="4" w:space="0" w:color="000000"/>
+              <w:bottom w:val="single" w:sz="4" w:space="0" w:color="000000"/>
+            </w:tcBorders>
+            <w:vAlign w:val="bottom"/>
+          </w:tcPr>
+          <w:p>
+            <w:pPr>
+              <w:pStyle w:val="Normal"/>
+              <w:widowControl w:val="false"/>
+              <w:jc w:val="center"/>
+              <w:rPr>
+                <w:color w:val="000000"/>
+                <w:sz w:val="16"/>
+                <w:szCs w:val="16"/>
+              </w:rPr>
+            </w:pPr>
+            <w:r>
+              <w:rPr>
+                <w:rFonts w:eastAsia="arial" w:ascii="arial" w:hAnsi="arial"/>
+                <w:color w:val="000000"/>
+                <w:sz w:val="16"/>
+                <w:szCs w:val="16"/>
+              </w:rPr>
+              <w:t>Brake Switch</w:t>
+            </w:r>
+          </w:p>
+        </w:tc>
+        <w:tc>
+          <w:tcPr>
+            <w:tcW w:w="1016" w:type="dxa"/>
+            <w:tcBorders>
+              <w:top w:val="single" w:sz="4" w:space="0" w:color="000000"/>
+              <w:left w:val="single" w:sz="4" w:space="0" w:color="000000"/>
+              <w:bottom w:val="single" w:sz="4" w:space="0" w:color="000000"/>
+            </w:tcBorders>
+            <w:vAlign w:val="bottom"/>
+          </w:tcPr>
+          <w:p>
+            <w:pPr>
+              <w:pStyle w:val="Normal"/>
+              <w:widowControl w:val="false"/>
+              <w:jc w:val="center"/>
+              <w:rPr>
+                <w:rFonts w:ascii="arial" w:hAnsi="arial" w:eastAsia="arial"/>
+                <w:color w:val="000000"/>
+                <w:sz w:val="16"/>
+                <w:szCs w:val="16"/>
+              </w:rPr>
+            </w:pPr>
+            <w:r>
+              <w:rPr>
+                <w:rFonts w:eastAsia="arial" w:ascii="arial" w:hAnsi="arial"/>
+                <w:color w:val="000000"/>
+                <w:sz w:val="16"/>
+                <w:szCs w:val="16"/>
+              </w:rPr>
+            </w:r>
+          </w:p>
+        </w:tc>
+        <w:tc>
+          <w:tcPr>
+            <w:tcW w:w="1020" w:type="dxa"/>
+            <w:tcBorders>
+              <w:top w:val="single" w:sz="4" w:space="0" w:color="000000"/>
+              <w:left w:val="single" w:sz="4" w:space="0" w:color="000000"/>
+              <w:bottom w:val="single" w:sz="4" w:space="0" w:color="000000"/>
+            </w:tcBorders>
+            <w:vAlign w:val="bottom"/>
+          </w:tcPr>
+          <w:p>
+            <w:pPr>
+              <w:pStyle w:val="Normal"/>
+              <w:widowControl w:val="false"/>
+              <w:spacing w:lineRule="auto" w:line="180"/>
+              <w:jc w:val="center"/>
+              <w:rPr>
+                <w:sz w:val="16"/>
+                <w:szCs w:val="16"/>
+              </w:rPr>
+            </w:pPr>
+            <w:r>
+              <w:rPr>
+                <w:sz w:val="16"/>
+                <w:szCs w:val="16"/>
+              </w:rPr>
+              <w:t>Inst. Light</w:t>
+            </w:r>
+          </w:p>
+        </w:tc>
+        <w:tc>
+          <w:tcPr>
+            <w:tcW w:w="1016" w:type="dxa"/>
+            <w:tcBorders>
+              <w:top w:val="single" w:sz="4" w:space="0" w:color="000000"/>
+              <w:left w:val="single" w:sz="4" w:space="0" w:color="000000"/>
+              <w:bottom w:val="single" w:sz="4" w:space="0" w:color="000000"/>
+            </w:tcBorders>
+            <w:vAlign w:val="bottom"/>
+          </w:tcPr>
+          <w:p>
+            <w:pPr>
+              <w:pStyle w:val="Normal"/>
+              <w:widowControl w:val="false"/>
+              <w:spacing w:lineRule="auto" w:line="180"/>
+              <w:jc w:val="center"/>
+              <w:rPr>
+                <w:sz w:val="16"/>
+                <w:szCs w:val="16"/>
+              </w:rPr>
+            </w:pPr>
+            <w:r>
+              <w:rPr>
+                <w:rFonts w:eastAsia="arial" w:ascii="arial" w:hAnsi="arial"/>
+                <w:color w:val="000000"/>
+                <w:sz w:val="16"/>
+                <w:szCs w:val="16"/>
+              </w:rPr>
+              <w:t>Cab Light</w:t>
+            </w:r>
+          </w:p>
+        </w:tc>
+        <w:tc>
+          <w:tcPr>
+            <w:tcW w:w="1016" w:type="dxa"/>
+            <w:tcBorders>
+              <w:top w:val="single" w:sz="4" w:space="0" w:color="000000"/>
+              <w:left w:val="single" w:sz="4" w:space="0" w:color="000000"/>
+              <w:bottom w:val="single" w:sz="4" w:space="0" w:color="000000"/>
+            </w:tcBorders>
+            <w:vAlign w:val="bottom"/>
+          </w:tcPr>
+          <w:p>
+            <w:pPr>
+              <w:pStyle w:val="Normal"/>
+              <w:widowControl w:val="false"/>
+              <w:spacing w:lineRule="auto" w:line="180"/>
+              <w:jc w:val="center"/>
+              <w:rPr>
+                <w:sz w:val="16"/>
+                <w:szCs w:val="16"/>
+              </w:rPr>
+            </w:pPr>
+            <w:r>
+              <w:rPr>
+                <w:sz w:val="16"/>
+                <w:szCs w:val="16"/>
+              </w:rPr>
+              <w:t>Handbrake On</w:t>
+            </w:r>
+          </w:p>
+        </w:tc>
+        <w:tc>
+          <w:tcPr>
+            <w:tcW w:w="1016" w:type="dxa"/>
+            <w:tcBorders>
+              <w:top w:val="single" w:sz="4" w:space="0" w:color="000000"/>
+              <w:left w:val="single" w:sz="4" w:space="0" w:color="000000"/>
+              <w:bottom w:val="single" w:sz="4" w:space="0" w:color="000000"/>
+            </w:tcBorders>
+            <w:vAlign w:val="bottom"/>
+          </w:tcPr>
+          <w:p>
+            <w:pPr>
+              <w:pStyle w:val="Normal"/>
+              <w:widowControl w:val="false"/>
+              <w:spacing w:lineRule="auto" w:line="180"/>
+              <w:jc w:val="center"/>
+              <w:rPr>
+                <w:sz w:val="16"/>
+                <w:szCs w:val="16"/>
+              </w:rPr>
+            </w:pPr>
+            <w:r>
+              <w:rPr>
+                <w:rFonts w:eastAsia="arial" w:ascii="arial" w:hAnsi="arial"/>
+                <w:color w:val="000000"/>
+                <w:sz w:val="16"/>
+                <w:szCs w:val="16"/>
+              </w:rPr>
+              <w:t>1-Person</w:t>
+            </w:r>
+          </w:p>
+        </w:tc>
+        <w:tc>
+          <w:tcPr>
+            <w:tcW w:w="1029" w:type="dxa"/>
+            <w:tcBorders>
+              <w:top w:val="single" w:sz="4" w:space="0" w:color="000000"/>
+              <w:left w:val="single" w:sz="4" w:space="0" w:color="000000"/>
+              <w:bottom w:val="single" w:sz="4" w:space="0" w:color="000000"/>
+              <w:right w:val="single" w:sz="4" w:space="0" w:color="000000"/>
+            </w:tcBorders>
+            <w:vAlign w:val="bottom"/>
+          </w:tcPr>
+          <w:p>
+            <w:pPr>
+              <w:pStyle w:val="Normal"/>
+              <w:widowControl w:val="false"/>
+              <w:spacing w:lineRule="auto" w:line="180"/>
+              <w:jc w:val="center"/>
+              <w:rPr>
+                <w:sz w:val="16"/>
+                <w:szCs w:val="16"/>
+              </w:rPr>
+            </w:pPr>
+            <w:r>
+              <w:rPr>
+                <w:rFonts w:eastAsia="arial" w:ascii="arial" w:hAnsi="arial"/>
+                <w:color w:val="000000"/>
+                <w:sz w:val="16"/>
+                <w:szCs w:val="16"/>
+              </w:rPr>
+              <w:t>Next</w:t>
+            </w:r>
+          </w:p>
+          <w:p>
+            <w:pPr>
+              <w:pStyle w:val="Normal"/>
+              <w:widowControl w:val="false"/>
+              <w:spacing w:lineRule="auto" w:line="180"/>
+              <w:jc w:val="center"/>
+              <w:rPr>
+                <w:sz w:val="16"/>
+                <w:szCs w:val="16"/>
+              </w:rPr>
+            </w:pPr>
+            <w:r>
+              <w:rPr>
+                <w:rFonts w:eastAsia="arial" w:ascii="arial" w:hAnsi="arial"/>
+                <w:color w:val="000000"/>
+                <w:sz w:val="16"/>
+                <w:szCs w:val="16"/>
+              </w:rPr>
+              <w:t>Cab Cam</w:t>
+            </w:r>
+          </w:p>
+        </w:tc>
+      </w:tr>
+    </w:tbl>
+    <w:p>
+      <w:pPr>
+        <w:pStyle w:val="Normal"/>
+        <w:rPr>
+          <w:rFonts w:ascii="arial" w:hAnsi="arial" w:eastAsia="arial"/>
+          <w:color w:val="000000"/>
+          <w:sz w:val="16"/>
+          <w:szCs w:val="16"/>
+        </w:rPr>
+      </w:pPr>
+      <w:r>
+        <w:rPr>
+          <w:rFonts w:eastAsia="arial" w:ascii="arial" w:hAnsi="arial"/>
+          <w:color w:val="000000"/>
+          <w:sz w:val="16"/>
+          <w:szCs w:val="16"/>
+        </w:rPr>
+      </w:r>
+    </w:p>
+    <w:p>
+      <w:pPr>
+        <w:pStyle w:val="Normal"/>
+        <w:rPr>
+          <w:color w:val="000000"/>
+          <w:sz w:val="16"/>
+          <w:szCs w:val="16"/>
+        </w:rPr>
+      </w:pPr>
+      <w:r>
+        <w:rPr>
+          <w:rFonts w:eastAsia="arial" w:ascii="arial" w:hAnsi="arial"/>
+          <w:color w:val="000000"/>
+          <w:sz w:val="16"/>
+          <w:szCs w:val="16"/>
+        </w:rPr>
+        <w:tab/>
+        <w:t xml:space="preserve">           Class </w:t>
+      </w:r>
+      <w:r>
+        <w:rPr>
+          <w:rFonts w:eastAsia="arial" w:ascii="arial" w:hAnsi="arial"/>
+          <w:color w:val="000000"/>
+          <w:sz w:val="16"/>
+          <w:szCs w:val="16"/>
+        </w:rPr>
+        <w:t>31</w:t>
+      </w:r>
+      <w:r>
+        <w:rPr>
+          <w:rFonts w:eastAsia="arial" w:ascii="arial" w:hAnsi="arial"/>
+          <w:color w:val="000000"/>
+          <w:sz w:val="16"/>
+          <w:szCs w:val="16"/>
+        </w:rPr>
+        <w:t>-2</w:t>
+      </w:r>
+    </w:p>
+    <w:tbl>
+      <w:tblPr>
+        <w:tblW w:w="14248" w:type="dxa"/>
+        <w:jc w:val="left"/>
+        <w:tblInd w:w="-5" w:type="dxa"/>
+        <w:tblLayout w:type="fixed"/>
+        <w:tblCellMar>
+          <w:top w:w="0" w:type="dxa"/>
+          <w:left w:w="108" w:type="dxa"/>
+          <w:bottom w:w="0" w:type="dxa"/>
+          <w:right w:w="108" w:type="dxa"/>
+        </w:tblCellMar>
+        <w:tblLook w:firstRow="1" w:noVBand="1" w:lastRow="0" w:firstColumn="1" w:lastColumn="0" w:noHBand="0" w:val="04a0"/>
+      </w:tblPr>
+      <w:tblGrid>
+        <w:gridCol w:w="1017"/>
+        <w:gridCol w:w="1019"/>
+        <w:gridCol w:w="1014"/>
+        <w:gridCol w:w="1016"/>
+        <w:gridCol w:w="1020"/>
+        <w:gridCol w:w="1016"/>
+        <w:gridCol w:w="1016"/>
+        <w:gridCol w:w="1017"/>
+        <w:gridCol w:w="1016"/>
+        <w:gridCol w:w="1020"/>
+        <w:gridCol w:w="1016"/>
+        <w:gridCol w:w="1016"/>
+        <w:gridCol w:w="1016"/>
+        <w:gridCol w:w="1029"/>
+      </w:tblGrid>
+      <w:tr>
+        <w:trPr>
+          <w:trHeight w:val="440" w:hRule="exact"/>
+          <w:cantSplit w:val="true"/>
+        </w:trPr>
+        <w:tc>
+          <w:tcPr>
+            <w:tcW w:w="1017" w:type="dxa"/>
+            <w:tcBorders>
+              <w:top w:val="single" w:sz="4" w:space="0" w:color="000000"/>
+              <w:left w:val="single" w:sz="4" w:space="0" w:color="000000"/>
+              <w:bottom w:val="single" w:sz="4" w:space="0" w:color="000000"/>
+            </w:tcBorders>
+            <w:vAlign w:val="bottom"/>
+          </w:tcPr>
+          <w:p>
+            <w:pPr>
+              <w:pStyle w:val="Normal"/>
+              <w:widowControl w:val="false"/>
+              <w:spacing w:lineRule="auto" w:line="180" w:before="0" w:after="60"/>
+              <w:jc w:val="center"/>
+              <w:rPr>
+                <w:b/>
+                <w:bCs/>
+              </w:rPr>
+            </w:pPr>
+            <w:r>
+              <w:rPr>
+                <w:b/>
+                <w:bCs/>
+                <w:color w:val="000000"/>
+                <w:sz w:val="16"/>
+                <w:szCs w:val="16"/>
+              </w:rPr>
+              <w:t>HUD</w:t>
+            </w:r>
+          </w:p>
+        </w:tc>
+        <w:tc>
+          <w:tcPr>
+            <w:tcW w:w="1019" w:type="dxa"/>
+            <w:tcBorders>
+              <w:top w:val="single" w:sz="4" w:space="0" w:color="000000"/>
+              <w:left w:val="single" w:sz="4" w:space="0" w:color="000000"/>
+              <w:bottom w:val="single" w:sz="4" w:space="0" w:color="000000"/>
+            </w:tcBorders>
+            <w:vAlign w:val="bottom"/>
+          </w:tcPr>
+          <w:p>
+            <w:pPr>
+              <w:pStyle w:val="Normal"/>
+              <w:widowControl w:val="false"/>
+              <w:spacing w:lineRule="auto" w:line="180"/>
+              <w:jc w:val="center"/>
+              <w:rPr>
+                <w:color w:val="000000"/>
+                <w:sz w:val="16"/>
+                <w:szCs w:val="16"/>
+              </w:rPr>
+            </w:pPr>
+            <w:r>
+              <w:rPr>
+                <w:color w:val="000000"/>
+                <w:sz w:val="16"/>
+                <w:szCs w:val="16"/>
+              </w:rPr>
+              <w:t>Schedule</w:t>
+            </w:r>
+          </w:p>
+        </w:tc>
+        <w:tc>
+          <w:tcPr>
+            <w:tcW w:w="1014" w:type="dxa"/>
+            <w:tcBorders>
+              <w:top w:val="single" w:sz="4" w:space="0" w:color="000000"/>
+              <w:left w:val="single" w:sz="4" w:space="0" w:color="000000"/>
+              <w:bottom w:val="single" w:sz="4" w:space="0" w:color="000000"/>
+            </w:tcBorders>
+            <w:vAlign w:val="bottom"/>
+          </w:tcPr>
+          <w:p>
+            <w:pPr>
+              <w:pStyle w:val="Normal"/>
+              <w:widowControl w:val="false"/>
+              <w:spacing w:lineRule="auto" w:line="180"/>
+              <w:jc w:val="center"/>
+              <w:rPr>
+                <w:color w:val="000000"/>
+                <w:sz w:val="16"/>
+                <w:szCs w:val="16"/>
+              </w:rPr>
+            </w:pPr>
+            <w:r>
+              <w:rPr>
+                <w:rFonts w:eastAsia="arial" w:ascii="arial" w:hAnsi="arial"/>
+                <w:color w:val="000000"/>
+                <w:sz w:val="16"/>
+                <w:szCs w:val="16"/>
+              </w:rPr>
+              <w:t>Engine Stop</w:t>
+            </w:r>
+          </w:p>
+        </w:tc>
+        <w:tc>
+          <w:tcPr>
+            <w:tcW w:w="1016" w:type="dxa"/>
+            <w:tcBorders>
+              <w:top w:val="single" w:sz="4" w:space="0" w:color="000000"/>
+              <w:left w:val="single" w:sz="4" w:space="0" w:color="000000"/>
+              <w:bottom w:val="single" w:sz="4" w:space="0" w:color="000000"/>
+            </w:tcBorders>
+            <w:vAlign w:val="bottom"/>
+          </w:tcPr>
+          <w:p>
+            <w:pPr>
+              <w:pStyle w:val="Normal"/>
+              <w:widowControl w:val="false"/>
+              <w:spacing w:lineRule="auto" w:line="180"/>
+              <w:jc w:val="center"/>
+              <w:rPr>
+                <w:color w:val="000000"/>
+                <w:sz w:val="16"/>
+                <w:szCs w:val="16"/>
+              </w:rPr>
+            </w:pPr>
+            <w:r>
+              <w:rPr>
+                <w:color w:val="000000"/>
+                <w:sz w:val="16"/>
+                <w:szCs w:val="16"/>
+              </w:rPr>
+              <w:t>DSD</w:t>
+            </w:r>
+          </w:p>
+        </w:tc>
+        <w:tc>
+          <w:tcPr>
+            <w:tcW w:w="1020" w:type="dxa"/>
+            <w:tcBorders>
+              <w:top w:val="single" w:sz="4" w:space="0" w:color="000000"/>
+              <w:left w:val="single" w:sz="4" w:space="0" w:color="000000"/>
+              <w:bottom w:val="single" w:sz="4" w:space="0" w:color="000000"/>
+            </w:tcBorders>
+            <w:vAlign w:val="bottom"/>
+          </w:tcPr>
+          <w:p>
+            <w:pPr>
+              <w:pStyle w:val="Normal"/>
+              <w:widowControl w:val="false"/>
+              <w:spacing w:lineRule="auto" w:line="180"/>
+              <w:jc w:val="center"/>
+              <w:rPr>
+                <w:color w:val="000000"/>
+                <w:sz w:val="16"/>
+                <w:szCs w:val="16"/>
+              </w:rPr>
+            </w:pPr>
+            <w:r>
+              <w:rPr>
+                <w:color w:val="000000"/>
+                <w:sz w:val="16"/>
+                <w:szCs w:val="16"/>
+              </w:rPr>
+            </w:r>
+          </w:p>
+        </w:tc>
+        <w:tc>
+          <w:tcPr>
+            <w:tcW w:w="1016" w:type="dxa"/>
+            <w:tcBorders>
+              <w:top w:val="single" w:sz="4" w:space="0" w:color="000000"/>
+              <w:left w:val="single" w:sz="4" w:space="0" w:color="000000"/>
+              <w:bottom w:val="single" w:sz="4" w:space="0" w:color="000000"/>
+            </w:tcBorders>
+            <w:vAlign w:val="bottom"/>
+          </w:tcPr>
+          <w:p>
+            <w:pPr>
+              <w:pStyle w:val="Normal"/>
+              <w:widowControl w:val="false"/>
+              <w:jc w:val="center"/>
+              <w:rPr>
+                <w:color w:val="000000"/>
+                <w:sz w:val="16"/>
+                <w:szCs w:val="16"/>
+              </w:rPr>
+            </w:pPr>
+            <w:r>
+              <w:rPr>
+                <w:color w:val="000000"/>
+                <w:sz w:val="16"/>
+                <w:szCs w:val="16"/>
+              </w:rPr>
+            </w:r>
+          </w:p>
+        </w:tc>
+        <w:tc>
+          <w:tcPr>
+            <w:tcW w:w="1016" w:type="dxa"/>
+            <w:tcBorders>
+              <w:top w:val="single" w:sz="4" w:space="0" w:color="000000"/>
+              <w:left w:val="single" w:sz="4" w:space="0" w:color="000000"/>
+              <w:bottom w:val="single" w:sz="4" w:space="0" w:color="000000"/>
+            </w:tcBorders>
+            <w:vAlign w:val="bottom"/>
+          </w:tcPr>
+          <w:p>
+            <w:pPr>
+              <w:pStyle w:val="Normal"/>
+              <w:widowControl w:val="false"/>
+              <w:jc w:val="center"/>
+              <w:rPr>
+                <w:color w:val="000000"/>
+                <w:sz w:val="16"/>
+                <w:szCs w:val="16"/>
+              </w:rPr>
+            </w:pPr>
+            <w:r>
+              <w:rPr/>
+            </w:r>
+          </w:p>
+        </w:tc>
+        <w:tc>
+          <w:tcPr>
+            <w:tcW w:w="1017" w:type="dxa"/>
+            <w:tcBorders>
+              <w:top w:val="single" w:sz="4" w:space="0" w:color="000000"/>
+              <w:left w:val="single" w:sz="4" w:space="0" w:color="000000"/>
+              <w:bottom w:val="single" w:sz="4" w:space="0" w:color="000000"/>
+            </w:tcBorders>
+            <w:vAlign w:val="bottom"/>
+          </w:tcPr>
+          <w:p>
+            <w:pPr>
+              <w:pStyle w:val="Normal"/>
+              <w:widowControl w:val="false"/>
+              <w:jc w:val="center"/>
+              <w:rPr>
+                <w:rFonts w:ascii="arial" w:hAnsi="arial" w:eastAsia="arial"/>
+                <w:color w:val="000000"/>
+                <w:sz w:val="16"/>
+                <w:szCs w:val="16"/>
+              </w:rPr>
+            </w:pPr>
+            <w:r>
+              <w:rPr>
+                <w:rFonts w:eastAsia="arial" w:ascii="arial" w:hAnsi="arial"/>
+                <w:color w:val="000000"/>
+                <w:sz w:val="16"/>
+                <w:szCs w:val="16"/>
+              </w:rPr>
+              <w:t>Vacuum Chamber</w:t>
+            </w:r>
+          </w:p>
+        </w:tc>
+        <w:tc>
+          <w:tcPr>
+            <w:tcW w:w="1016" w:type="dxa"/>
+            <w:tcBorders>
+              <w:top w:val="single" w:sz="4" w:space="0" w:color="000000"/>
+              <w:left w:val="single" w:sz="4" w:space="0" w:color="000000"/>
+              <w:bottom w:val="single" w:sz="4" w:space="0" w:color="000000"/>
+            </w:tcBorders>
+            <w:vAlign w:val="bottom"/>
+          </w:tcPr>
+          <w:p>
+            <w:pPr>
+              <w:pStyle w:val="Normal"/>
+              <w:widowControl w:val="false"/>
+              <w:jc w:val="center"/>
+              <w:rPr>
+                <w:rFonts w:ascii="arial" w:hAnsi="arial" w:eastAsia="arial"/>
+                <w:color w:val="000000"/>
+                <w:sz w:val="16"/>
+                <w:szCs w:val="16"/>
+              </w:rPr>
+            </w:pPr>
+            <w:r>
+              <w:rPr>
+                <w:rFonts w:eastAsia="arial" w:ascii="arial" w:hAnsi="arial"/>
+                <w:color w:val="000000"/>
+                <w:sz w:val="16"/>
+                <w:szCs w:val="16"/>
+              </w:rPr>
+            </w:r>
+          </w:p>
+        </w:tc>
+        <w:tc>
+          <w:tcPr>
+            <w:tcW w:w="1020" w:type="dxa"/>
+            <w:tcBorders>
+              <w:top w:val="single" w:sz="4" w:space="0" w:color="000000"/>
+              <w:left w:val="single" w:sz="4" w:space="0" w:color="000000"/>
+              <w:bottom w:val="single" w:sz="4" w:space="0" w:color="000000"/>
+            </w:tcBorders>
+            <w:vAlign w:val="bottom"/>
+          </w:tcPr>
+          <w:p>
+            <w:pPr>
+              <w:pStyle w:val="Normal"/>
+              <w:widowControl w:val="false"/>
+              <w:spacing w:lineRule="auto" w:line="180"/>
+              <w:jc w:val="center"/>
+              <w:rPr>
+                <w:sz w:val="16"/>
+                <w:szCs w:val="16"/>
+              </w:rPr>
+            </w:pPr>
+            <w:r>
+              <w:rPr>
+                <w:sz w:val="16"/>
+                <w:szCs w:val="16"/>
+              </w:rPr>
+            </w:r>
+          </w:p>
+        </w:tc>
+        <w:tc>
+          <w:tcPr>
+            <w:tcW w:w="1016" w:type="dxa"/>
+            <w:tcBorders>
+              <w:top w:val="single" w:sz="4" w:space="0" w:color="000000"/>
+              <w:left w:val="single" w:sz="4" w:space="0" w:color="000000"/>
+              <w:bottom w:val="single" w:sz="4" w:space="0" w:color="000000"/>
+            </w:tcBorders>
+            <w:vAlign w:val="bottom"/>
+          </w:tcPr>
+          <w:p>
+            <w:pPr>
+              <w:pStyle w:val="Normal"/>
+              <w:widowControl w:val="false"/>
+              <w:spacing w:lineRule="auto" w:line="180"/>
+              <w:jc w:val="center"/>
+              <w:rPr>
+                <w:sz w:val="16"/>
+                <w:szCs w:val="16"/>
+              </w:rPr>
+            </w:pPr>
+            <w:r>
+              <w:rPr>
+                <w:sz w:val="16"/>
+                <w:szCs w:val="16"/>
+              </w:rPr>
+              <w:t>Tail Light</w:t>
+            </w:r>
+          </w:p>
+        </w:tc>
+        <w:tc>
+          <w:tcPr>
+            <w:tcW w:w="1016" w:type="dxa"/>
+            <w:tcBorders>
+              <w:top w:val="single" w:sz="4" w:space="0" w:color="000000"/>
+              <w:left w:val="single" w:sz="4" w:space="0" w:color="000000"/>
+              <w:bottom w:val="single" w:sz="4" w:space="0" w:color="000000"/>
+            </w:tcBorders>
+            <w:vAlign w:val="bottom"/>
+          </w:tcPr>
+          <w:p>
+            <w:pPr>
+              <w:pStyle w:val="Normal"/>
+              <w:widowControl w:val="false"/>
+              <w:spacing w:lineRule="auto" w:line="180"/>
+              <w:jc w:val="center"/>
+              <w:rPr>
+                <w:sz w:val="16"/>
+                <w:szCs w:val="16"/>
+              </w:rPr>
+            </w:pPr>
+            <w:r>
+              <w:rPr>
+                <w:sz w:val="16"/>
+                <w:szCs w:val="16"/>
+              </w:rPr>
+              <w:t>Handbrake Off</w:t>
+            </w:r>
+          </w:p>
+        </w:tc>
+        <w:tc>
+          <w:tcPr>
+            <w:tcW w:w="1016" w:type="dxa"/>
+            <w:tcBorders>
+              <w:top w:val="single" w:sz="4" w:space="0" w:color="000000"/>
+              <w:left w:val="single" w:sz="4" w:space="0" w:color="000000"/>
+              <w:bottom w:val="single" w:sz="4" w:space="0" w:color="000000"/>
+            </w:tcBorders>
+            <w:vAlign w:val="bottom"/>
+          </w:tcPr>
+          <w:p>
+            <w:pPr>
+              <w:pStyle w:val="Normal"/>
+              <w:widowControl w:val="false"/>
+              <w:spacing w:lineRule="auto" w:line="180"/>
+              <w:jc w:val="center"/>
+              <w:rPr>
+                <w:sz w:val="16"/>
+                <w:szCs w:val="16"/>
+              </w:rPr>
+            </w:pPr>
+            <w:r>
+              <w:rPr>
+                <w:rFonts w:eastAsia="arial" w:ascii="arial" w:hAnsi="arial"/>
+                <w:color w:val="000000"/>
+                <w:sz w:val="16"/>
+                <w:szCs w:val="16"/>
+              </w:rPr>
+              <w:t>Exterior</w:t>
+            </w:r>
+          </w:p>
+          <w:p>
+            <w:pPr>
+              <w:pStyle w:val="Normal"/>
+              <w:widowControl w:val="false"/>
+              <w:spacing w:lineRule="auto" w:line="180"/>
+              <w:jc w:val="center"/>
+              <w:rPr>
+                <w:sz w:val="16"/>
+                <w:szCs w:val="16"/>
+              </w:rPr>
+            </w:pPr>
+            <w:r>
+              <w:rPr>
+                <w:rFonts w:eastAsia="arial" w:ascii="arial" w:hAnsi="arial"/>
+                <w:color w:val="000000"/>
+                <w:sz w:val="16"/>
+                <w:szCs w:val="16"/>
+              </w:rPr>
+              <w:t>Camera</w:t>
+            </w:r>
+          </w:p>
+        </w:tc>
+        <w:tc>
+          <w:tcPr>
+            <w:tcW w:w="1029" w:type="dxa"/>
+            <w:tcBorders>
+              <w:top w:val="single" w:sz="4" w:space="0" w:color="000000"/>
+              <w:left w:val="single" w:sz="4" w:space="0" w:color="000000"/>
+              <w:bottom w:val="single" w:sz="4" w:space="0" w:color="000000"/>
+              <w:right w:val="single" w:sz="4" w:space="0" w:color="000000"/>
+            </w:tcBorders>
+            <w:vAlign w:val="bottom"/>
+          </w:tcPr>
+          <w:p>
+            <w:pPr>
+              <w:pStyle w:val="Normal"/>
+              <w:widowControl w:val="false"/>
+              <w:spacing w:lineRule="auto" w:line="180"/>
+              <w:jc w:val="center"/>
+              <w:rPr>
+                <w:sz w:val="16"/>
+                <w:szCs w:val="16"/>
+              </w:rPr>
+            </w:pPr>
+            <w:r>
+              <w:rPr>
+                <w:rFonts w:eastAsia="arial" w:ascii="arial" w:hAnsi="arial"/>
+                <w:color w:val="000000"/>
+                <w:sz w:val="16"/>
+                <w:szCs w:val="16"/>
+              </w:rPr>
+              <w:t>Prev</w:t>
+            </w:r>
+          </w:p>
+          <w:p>
+            <w:pPr>
+              <w:pStyle w:val="Normal"/>
+              <w:widowControl w:val="false"/>
+              <w:spacing w:lineRule="auto" w:line="180"/>
+              <w:jc w:val="center"/>
+              <w:rPr>
+                <w:sz w:val="16"/>
+                <w:szCs w:val="16"/>
+              </w:rPr>
+            </w:pPr>
+            <w:r>
+              <w:rPr>
+                <w:rFonts w:eastAsia="arial" w:ascii="arial" w:hAnsi="arial"/>
+                <w:color w:val="000000"/>
+                <w:sz w:val="16"/>
+                <w:szCs w:val="16"/>
+              </w:rPr>
+              <w:t>Cab Cam</w:t>
+            </w:r>
+          </w:p>
+        </w:tc>
+      </w:tr>
+    </w:tbl>
+    <w:p>
+      <w:pPr>
+        <w:pStyle w:val="Normal"/>
+        <w:rPr>
+          <w:color w:val="000000"/>
+          <w:sz w:val="16"/>
+          <w:szCs w:val="16"/>
+        </w:rPr>
+      </w:pPr>
+      <w:r>
+        <w:rPr>
+          <w:color w:val="000000"/>
+          <w:sz w:val="16"/>
+          <w:szCs w:val="16"/>
+        </w:rPr>
       </w:r>
     </w:p>
     <w:sectPr>
@@ -2123,12 +4409,12 @@
       <w:rFonts w:ascii="Symbol" w:hAnsi="Symbol" w:cs="Symbol"/>
     </w:rPr>
   </w:style>
-  <w:style w:type="character" w:styleId="Style5" w:customStyle="1">
-    <w:name w:val="번호 매기기 기호"/>
-    <w:qFormat/>
-    <w:rPr/>
-  </w:style>
-  <w:style w:type="paragraph" w:styleId="Style6">
+  <w:style w:type="character" w:styleId="user" w:customStyle="1">
+    <w:name w:val="번호 매기기 기호 (user)"/>
+    <w:qFormat/>
+    <w:rPr/>
+  </w:style>
+  <w:style w:type="paragraph" w:styleId="Style5">
     <w:name w:val="제목"/>
     <w:basedOn w:val="Normal"/>
     <w:next w:val="BodyText"/>
@@ -2138,7 +4424,7 @@
       <w:spacing w:before="240" w:after="120"/>
     </w:pPr>
     <w:rPr>
-      <w:rFonts w:ascii="Liberation Sans" w:hAnsi="Liberation Sans" w:eastAsia="나눔고딕" w:cs="Arial"/>
+      <w:rFonts w:ascii="Liberation Sans" w:hAnsi="Liberation Sans" w:eastAsia="Noto Sans CJK KR" w:cs="Lohit Devanagari"/>
       <w:sz w:val="28"/>
       <w:szCs w:val="28"/>
     </w:rPr>
@@ -2175,8 +4461,34 @@
       <w:szCs w:val="24"/>
     </w:rPr>
   </w:style>
-  <w:style w:type="paragraph" w:styleId="Style7">
+  <w:style w:type="paragraph" w:styleId="Style6" w:customStyle="1">
     <w:name w:val="색인"/>
+    <w:basedOn w:val="Normal"/>
+    <w:qFormat/>
+    <w:pPr>
+      <w:suppressLineNumbers/>
+    </w:pPr>
+    <w:rPr>
+      <w:rFonts w:cs="Lohit Devanagari"/>
+    </w:rPr>
+  </w:style>
+  <w:style w:type="paragraph" w:styleId="user1">
+    <w:name w:val="제목 (user)"/>
+    <w:basedOn w:val="Normal"/>
+    <w:next w:val="BodyText"/>
+    <w:qFormat/>
+    <w:pPr>
+      <w:keepNext w:val="true"/>
+      <w:spacing w:before="240" w:after="120"/>
+    </w:pPr>
+    <w:rPr>
+      <w:rFonts w:ascii="Liberation Sans" w:hAnsi="Liberation Sans" w:eastAsia="나눔고딕" w:cs="Arial"/>
+      <w:sz w:val="28"/>
+      <w:szCs w:val="28"/>
+    </w:rPr>
+  </w:style>
+  <w:style w:type="paragraph" w:styleId="user2">
+    <w:name w:val="색인 (user)"/>
     <w:basedOn w:val="Normal"/>
     <w:qFormat/>
     <w:pPr>
@@ -2185,32 +4497,6 @@
     <w:rPr>
       <w:rFonts w:cs="Arial"/>
       <w:sz w:val="24"/>
-    </w:rPr>
-  </w:style>
-  <w:style w:type="paragraph" w:styleId="user">
-    <w:name w:val="제목 (user)"/>
-    <w:basedOn w:val="Normal"/>
-    <w:next w:val="BodyText"/>
-    <w:qFormat/>
-    <w:pPr>
-      <w:keepNext w:val="true"/>
-      <w:spacing w:before="240" w:after="120"/>
-    </w:pPr>
-    <w:rPr>
-      <w:rFonts w:ascii="Liberation Sans" w:hAnsi="Liberation Sans" w:eastAsia="Noto Sans CJK KR" w:cs="Lohit Devanagari"/>
-      <w:sz w:val="28"/>
-      <w:szCs w:val="28"/>
-    </w:rPr>
-  </w:style>
-  <w:style w:type="paragraph" w:styleId="user1" w:customStyle="1">
-    <w:name w:val="색인 (user)"/>
-    <w:basedOn w:val="Normal"/>
-    <w:qFormat/>
-    <w:pPr>
-      <w:suppressLineNumbers/>
-    </w:pPr>
-    <w:rPr>
-      <w:rFonts w:cs="Lohit Devanagari"/>
     </w:rPr>
   </w:style>
   <w:style w:type="paragraph" w:styleId="Title">
@@ -2892,8 +5178,8 @@
       <w:szCs w:val="24"/>
     </w:rPr>
   </w:style>
-  <w:style w:type="paragraph" w:styleId="user2" w:customStyle="1">
-    <w:name w:val="표 내용 (user)"/>
+  <w:style w:type="paragraph" w:styleId="Style7" w:customStyle="1">
+    <w:name w:val="표 내용"/>
     <w:basedOn w:val="Normal"/>
     <w:qFormat/>
     <w:pPr>
@@ -2901,9 +5187,9 @@
     </w:pPr>
     <w:rPr/>
   </w:style>
-  <w:style w:type="paragraph" w:styleId="user3" w:customStyle="1">
-    <w:name w:val="표제목 (user)"/>
-    <w:basedOn w:val="user2"/>
+  <w:style w:type="paragraph" w:styleId="Style8" w:customStyle="1">
+    <w:name w:val="표제목"/>
+    <w:basedOn w:val="Style7"/>
     <w:qFormat/>
     <w:pPr>
       <w:jc w:val="center"/>
@@ -2913,8 +5199,8 @@
       <w:bCs/>
     </w:rPr>
   </w:style>
-  <w:style w:type="paragraph" w:styleId="Style8">
-    <w:name w:val="표 내용"/>
+  <w:style w:type="paragraph" w:styleId="user3">
+    <w:name w:val="표 내용 (user)"/>
     <w:basedOn w:val="Normal"/>
     <w:qFormat/>
     <w:pPr>
@@ -2923,9 +5209,9 @@
     </w:pPr>
     <w:rPr/>
   </w:style>
-  <w:style w:type="paragraph" w:styleId="Style9">
-    <w:name w:val="표제목"/>
-    <w:basedOn w:val="Style8"/>
+  <w:style w:type="paragraph" w:styleId="user4">
+    <w:name w:val="표제목 (user)"/>
+    <w:basedOn w:val="user3"/>
     <w:qFormat/>
     <w:pPr>
       <w:suppressLineNumbers/>

</xml_diff>

<commit_message>
Add Class 37 and 40
</commit_message>
<xml_diff>
--- a/raildriver-UK-Remapped.docx
+++ b/raildriver-UK-Remapped.docx
@@ -4532,7 +4532,1100 @@
           <w:sz w:val="16"/>
           <w:szCs w:val="16"/>
         </w:rPr>
-        <w:t xml:space="preserve">    Class 3</w:t>
+        <w:t xml:space="preserve">    Class 37-1</w:t>
+      </w:r>
+    </w:p>
+    <w:tbl>
+      <w:tblPr>
+        <w:tblW w:w="14248" w:type="dxa"/>
+        <w:jc w:val="left"/>
+        <w:tblInd w:w="-5" w:type="dxa"/>
+        <w:tblLayout w:type="fixed"/>
+        <w:tblCellMar>
+          <w:top w:w="0" w:type="dxa"/>
+          <w:left w:w="108" w:type="dxa"/>
+          <w:bottom w:w="0" w:type="dxa"/>
+          <w:right w:w="108" w:type="dxa"/>
+        </w:tblCellMar>
+        <w:tblLook w:firstRow="1" w:noVBand="1" w:lastRow="0" w:firstColumn="1" w:lastColumn="0" w:noHBand="0" w:val="04a0"/>
+      </w:tblPr>
+      <w:tblGrid>
+        <w:gridCol w:w="1017"/>
+        <w:gridCol w:w="1019"/>
+        <w:gridCol w:w="1014"/>
+        <w:gridCol w:w="1016"/>
+        <w:gridCol w:w="1020"/>
+        <w:gridCol w:w="1016"/>
+        <w:gridCol w:w="1016"/>
+        <w:gridCol w:w="1017"/>
+        <w:gridCol w:w="1016"/>
+        <w:gridCol w:w="1020"/>
+        <w:gridCol w:w="1016"/>
+        <w:gridCol w:w="1016"/>
+        <w:gridCol w:w="1016"/>
+        <w:gridCol w:w="1029"/>
+      </w:tblGrid>
+      <w:tr>
+        <w:trPr>
+          <w:trHeight w:val="440" w:hRule="exact"/>
+          <w:cantSplit w:val="true"/>
+        </w:trPr>
+        <w:tc>
+          <w:tcPr>
+            <w:tcW w:w="1017" w:type="dxa"/>
+            <w:tcBorders>
+              <w:top w:val="single" w:sz="4" w:space="0" w:color="000000"/>
+              <w:left w:val="single" w:sz="4" w:space="0" w:color="000000"/>
+              <w:bottom w:val="single" w:sz="4" w:space="0" w:color="000000"/>
+            </w:tcBorders>
+            <w:vAlign w:val="bottom"/>
+          </w:tcPr>
+          <w:p>
+            <w:pPr>
+              <w:pStyle w:val="Normal"/>
+              <w:widowControl w:val="false"/>
+              <w:spacing w:lineRule="auto" w:line="180" w:before="0" w:after="60"/>
+              <w:jc w:val="center"/>
+              <w:rPr>
+                <w:color w:val="000000"/>
+                <w:sz w:val="16"/>
+                <w:szCs w:val="16"/>
+              </w:rPr>
+            </w:pPr>
+            <w:r>
+              <w:rPr>
+                <w:rFonts w:eastAsia="arial" w:ascii="arial" w:hAnsi="arial"/>
+                <w:b/>
+                <w:color w:val="000000"/>
+                <w:sz w:val="16"/>
+                <w:szCs w:val="16"/>
+              </w:rPr>
+              <w:t>Pause</w:t>
+            </w:r>
+          </w:p>
+        </w:tc>
+        <w:tc>
+          <w:tcPr>
+            <w:tcW w:w="1019" w:type="dxa"/>
+            <w:tcBorders>
+              <w:top w:val="single" w:sz="4" w:space="0" w:color="000000"/>
+              <w:left w:val="single" w:sz="4" w:space="0" w:color="000000"/>
+              <w:bottom w:val="single" w:sz="4" w:space="0" w:color="000000"/>
+            </w:tcBorders>
+            <w:vAlign w:val="bottom"/>
+          </w:tcPr>
+          <w:p>
+            <w:pPr>
+              <w:pStyle w:val="Normal"/>
+              <w:widowControl w:val="false"/>
+              <w:spacing w:lineRule="auto" w:line="180"/>
+              <w:jc w:val="center"/>
+              <w:rPr>
+                <w:color w:val="000000"/>
+                <w:sz w:val="16"/>
+                <w:szCs w:val="16"/>
+              </w:rPr>
+            </w:pPr>
+            <w:r>
+              <w:rPr>
+                <w:color w:val="000000"/>
+                <w:sz w:val="16"/>
+                <w:szCs w:val="16"/>
+              </w:rPr>
+              <w:t>Master Key</w:t>
+            </w:r>
+          </w:p>
+        </w:tc>
+        <w:tc>
+          <w:tcPr>
+            <w:tcW w:w="1014" w:type="dxa"/>
+            <w:tcBorders>
+              <w:top w:val="single" w:sz="4" w:space="0" w:color="000000"/>
+              <w:left w:val="single" w:sz="4" w:space="0" w:color="000000"/>
+              <w:bottom w:val="single" w:sz="4" w:space="0" w:color="000000"/>
+            </w:tcBorders>
+            <w:vAlign w:val="bottom"/>
+          </w:tcPr>
+          <w:p>
+            <w:pPr>
+              <w:pStyle w:val="Normal"/>
+              <w:widowControl w:val="false"/>
+              <w:spacing w:lineRule="auto" w:line="180"/>
+              <w:jc w:val="center"/>
+              <w:rPr>
+                <w:color w:val="000000"/>
+                <w:sz w:val="16"/>
+                <w:szCs w:val="16"/>
+              </w:rPr>
+            </w:pPr>
+            <w:r>
+              <w:rPr>
+                <w:rFonts w:eastAsia="arial" w:ascii="arial" w:hAnsi="arial"/>
+                <w:color w:val="000000"/>
+                <w:sz w:val="16"/>
+                <w:szCs w:val="16"/>
+              </w:rPr>
+              <w:t>Engine Start</w:t>
+            </w:r>
+          </w:p>
+        </w:tc>
+        <w:tc>
+          <w:tcPr>
+            <w:tcW w:w="1016" w:type="dxa"/>
+            <w:tcBorders>
+              <w:top w:val="single" w:sz="4" w:space="0" w:color="000000"/>
+              <w:left w:val="single" w:sz="4" w:space="0" w:color="000000"/>
+              <w:bottom w:val="single" w:sz="4" w:space="0" w:color="000000"/>
+            </w:tcBorders>
+            <w:vAlign w:val="bottom"/>
+          </w:tcPr>
+          <w:p>
+            <w:pPr>
+              <w:pStyle w:val="Normal"/>
+              <w:widowControl w:val="false"/>
+              <w:spacing w:lineRule="auto" w:line="180"/>
+              <w:jc w:val="center"/>
+              <w:rPr>
+                <w:color w:val="000000"/>
+                <w:sz w:val="16"/>
+                <w:szCs w:val="16"/>
+              </w:rPr>
+            </w:pPr>
+            <w:r>
+              <w:rPr>
+                <w:color w:val="000000"/>
+                <w:sz w:val="16"/>
+                <w:szCs w:val="16"/>
+              </w:rPr>
+              <w:t>AWS/</w:t>
+            </w:r>
+            <w:r>
+              <w:rPr>
+                <w:color w:val="000000"/>
+                <w:sz w:val="16"/>
+                <w:szCs w:val="16"/>
+              </w:rPr>
+              <w:t>TPWS</w:t>
+            </w:r>
+          </w:p>
+        </w:tc>
+        <w:tc>
+          <w:tcPr>
+            <w:tcW w:w="1020" w:type="dxa"/>
+            <w:tcBorders>
+              <w:top w:val="single" w:sz="4" w:space="0" w:color="000000"/>
+              <w:left w:val="single" w:sz="4" w:space="0" w:color="000000"/>
+              <w:bottom w:val="single" w:sz="4" w:space="0" w:color="000000"/>
+            </w:tcBorders>
+            <w:vAlign w:val="bottom"/>
+          </w:tcPr>
+          <w:p>
+            <w:pPr>
+              <w:pStyle w:val="Normal"/>
+              <w:widowControl w:val="false"/>
+              <w:spacing w:lineRule="auto" w:line="180"/>
+              <w:jc w:val="center"/>
+              <w:rPr>
+                <w:color w:val="000000"/>
+                <w:sz w:val="16"/>
+                <w:szCs w:val="16"/>
+              </w:rPr>
+            </w:pPr>
+            <w:r>
+              <w:rPr>
+                <w:color w:val="000000"/>
+                <w:sz w:val="16"/>
+                <w:szCs w:val="16"/>
+              </w:rPr>
+              <w:t>AWS Cab Change</w:t>
+            </w:r>
+          </w:p>
+        </w:tc>
+        <w:tc>
+          <w:tcPr>
+            <w:tcW w:w="1016" w:type="dxa"/>
+            <w:tcBorders>
+              <w:top w:val="single" w:sz="4" w:space="0" w:color="000000"/>
+              <w:left w:val="single" w:sz="4" w:space="0" w:color="000000"/>
+              <w:bottom w:val="single" w:sz="4" w:space="0" w:color="000000"/>
+            </w:tcBorders>
+            <w:vAlign w:val="bottom"/>
+          </w:tcPr>
+          <w:p>
+            <w:pPr>
+              <w:pStyle w:val="Normal"/>
+              <w:widowControl w:val="false"/>
+              <w:jc w:val="center"/>
+              <w:rPr>
+                <w:color w:val="000000"/>
+                <w:sz w:val="16"/>
+                <w:szCs w:val="16"/>
+              </w:rPr>
+            </w:pPr>
+            <w:r>
+              <w:rPr>
+                <w:color w:val="000000"/>
+                <w:sz w:val="16"/>
+                <w:szCs w:val="16"/>
+              </w:rPr>
+              <w:t>Slow Speed</w:t>
+            </w:r>
+          </w:p>
+        </w:tc>
+        <w:tc>
+          <w:tcPr>
+            <w:tcW w:w="1016" w:type="dxa"/>
+            <w:tcBorders>
+              <w:top w:val="single" w:sz="4" w:space="0" w:color="000000"/>
+              <w:left w:val="single" w:sz="4" w:space="0" w:color="000000"/>
+              <w:bottom w:val="single" w:sz="4" w:space="0" w:color="000000"/>
+            </w:tcBorders>
+            <w:vAlign w:val="bottom"/>
+          </w:tcPr>
+          <w:p>
+            <w:pPr>
+              <w:pStyle w:val="Normal"/>
+              <w:widowControl w:val="false"/>
+              <w:jc w:val="center"/>
+              <w:rPr>
+                <w:color w:val="000000"/>
+                <w:sz w:val="16"/>
+                <w:szCs w:val="16"/>
+              </w:rPr>
+            </w:pPr>
+            <w:r>
+              <w:rPr>
+                <w:color w:val="000000"/>
+                <w:sz w:val="16"/>
+                <w:szCs w:val="16"/>
+              </w:rPr>
+            </w:r>
+          </w:p>
+        </w:tc>
+        <w:tc>
+          <w:tcPr>
+            <w:tcW w:w="1017" w:type="dxa"/>
+            <w:tcBorders>
+              <w:top w:val="single" w:sz="4" w:space="0" w:color="000000"/>
+              <w:left w:val="single" w:sz="4" w:space="0" w:color="000000"/>
+              <w:bottom w:val="single" w:sz="4" w:space="0" w:color="000000"/>
+            </w:tcBorders>
+            <w:vAlign w:val="bottom"/>
+          </w:tcPr>
+          <w:p>
+            <w:pPr>
+              <w:pStyle w:val="Normal"/>
+              <w:widowControl w:val="false"/>
+              <w:jc w:val="center"/>
+              <w:rPr>
+                <w:color w:val="000000"/>
+                <w:sz w:val="16"/>
+                <w:szCs w:val="16"/>
+              </w:rPr>
+            </w:pPr>
+            <w:r>
+              <w:rPr>
+                <w:rFonts w:eastAsia="arial" w:ascii="arial" w:hAnsi="arial"/>
+                <w:color w:val="000000"/>
+                <w:sz w:val="16"/>
+                <w:szCs w:val="16"/>
+              </w:rPr>
+              <w:t>Brake Selector</w:t>
+            </w:r>
+          </w:p>
+        </w:tc>
+        <w:tc>
+          <w:tcPr>
+            <w:tcW w:w="1016" w:type="dxa"/>
+            <w:tcBorders>
+              <w:top w:val="single" w:sz="4" w:space="0" w:color="000000"/>
+              <w:left w:val="single" w:sz="4" w:space="0" w:color="000000"/>
+              <w:bottom w:val="single" w:sz="4" w:space="0" w:color="000000"/>
+            </w:tcBorders>
+            <w:vAlign w:val="bottom"/>
+          </w:tcPr>
+          <w:p>
+            <w:pPr>
+              <w:pStyle w:val="Normal"/>
+              <w:widowControl w:val="false"/>
+              <w:jc w:val="center"/>
+              <w:rPr>
+                <w:color w:val="000000"/>
+                <w:sz w:val="16"/>
+                <w:szCs w:val="16"/>
+              </w:rPr>
+            </w:pPr>
+            <w:r>
+              <w:rPr/>
+            </w:r>
+          </w:p>
+        </w:tc>
+        <w:tc>
+          <w:tcPr>
+            <w:tcW w:w="1020" w:type="dxa"/>
+            <w:tcBorders>
+              <w:top w:val="single" w:sz="4" w:space="0" w:color="000000"/>
+              <w:left w:val="single" w:sz="4" w:space="0" w:color="000000"/>
+              <w:bottom w:val="single" w:sz="4" w:space="0" w:color="000000"/>
+            </w:tcBorders>
+            <w:vAlign w:val="bottom"/>
+          </w:tcPr>
+          <w:p>
+            <w:pPr>
+              <w:pStyle w:val="Normal"/>
+              <w:widowControl w:val="false"/>
+              <w:spacing w:lineRule="auto" w:line="180"/>
+              <w:jc w:val="center"/>
+              <w:rPr>
+                <w:sz w:val="16"/>
+                <w:szCs w:val="16"/>
+              </w:rPr>
+            </w:pPr>
+            <w:r>
+              <w:rPr>
+                <w:sz w:val="16"/>
+                <w:szCs w:val="16"/>
+              </w:rPr>
+            </w:r>
+          </w:p>
+        </w:tc>
+        <w:tc>
+          <w:tcPr>
+            <w:tcW w:w="1016" w:type="dxa"/>
+            <w:tcBorders>
+              <w:top w:val="single" w:sz="4" w:space="0" w:color="000000"/>
+              <w:left w:val="single" w:sz="4" w:space="0" w:color="000000"/>
+              <w:bottom w:val="single" w:sz="4" w:space="0" w:color="000000"/>
+            </w:tcBorders>
+            <w:vAlign w:val="bottom"/>
+          </w:tcPr>
+          <w:p>
+            <w:pPr>
+              <w:pStyle w:val="Normal"/>
+              <w:widowControl w:val="false"/>
+              <w:spacing w:lineRule="auto" w:line="180"/>
+              <w:jc w:val="center"/>
+              <w:rPr>
+                <w:sz w:val="16"/>
+                <w:szCs w:val="16"/>
+              </w:rPr>
+            </w:pPr>
+            <w:r>
+              <w:rPr>
+                <w:rFonts w:eastAsia="arial" w:ascii="arial" w:hAnsi="arial"/>
+                <w:color w:val="000000"/>
+                <w:sz w:val="16"/>
+                <w:szCs w:val="16"/>
+              </w:rPr>
+              <w:t>Cab Light</w:t>
+            </w:r>
+          </w:p>
+        </w:tc>
+        <w:tc>
+          <w:tcPr>
+            <w:tcW w:w="1016" w:type="dxa"/>
+            <w:tcBorders>
+              <w:top w:val="single" w:sz="4" w:space="0" w:color="000000"/>
+              <w:left w:val="single" w:sz="4" w:space="0" w:color="000000"/>
+              <w:bottom w:val="single" w:sz="4" w:space="0" w:color="000000"/>
+            </w:tcBorders>
+            <w:vAlign w:val="bottom"/>
+          </w:tcPr>
+          <w:p>
+            <w:pPr>
+              <w:pStyle w:val="Normal"/>
+              <w:widowControl w:val="false"/>
+              <w:spacing w:lineRule="auto" w:line="180"/>
+              <w:jc w:val="center"/>
+              <w:rPr>
+                <w:sz w:val="16"/>
+                <w:szCs w:val="16"/>
+              </w:rPr>
+            </w:pPr>
+            <w:r>
+              <w:rPr>
+                <w:sz w:val="16"/>
+                <w:szCs w:val="16"/>
+              </w:rPr>
+              <w:t>Handbrake On</w:t>
+            </w:r>
+          </w:p>
+        </w:tc>
+        <w:tc>
+          <w:tcPr>
+            <w:tcW w:w="1016" w:type="dxa"/>
+            <w:tcBorders>
+              <w:top w:val="single" w:sz="4" w:space="0" w:color="000000"/>
+              <w:left w:val="single" w:sz="4" w:space="0" w:color="000000"/>
+              <w:bottom w:val="single" w:sz="4" w:space="0" w:color="000000"/>
+            </w:tcBorders>
+            <w:vAlign w:val="bottom"/>
+          </w:tcPr>
+          <w:p>
+            <w:pPr>
+              <w:pStyle w:val="Normal"/>
+              <w:widowControl w:val="false"/>
+              <w:spacing w:lineRule="auto" w:line="180"/>
+              <w:jc w:val="center"/>
+              <w:rPr>
+                <w:sz w:val="16"/>
+                <w:szCs w:val="16"/>
+              </w:rPr>
+            </w:pPr>
+            <w:r>
+              <w:rPr>
+                <w:rFonts w:eastAsia="arial" w:ascii="arial" w:hAnsi="arial"/>
+                <w:color w:val="000000"/>
+                <w:sz w:val="16"/>
+                <w:szCs w:val="16"/>
+              </w:rPr>
+              <w:t>1-Person</w:t>
+            </w:r>
+          </w:p>
+        </w:tc>
+        <w:tc>
+          <w:tcPr>
+            <w:tcW w:w="1029" w:type="dxa"/>
+            <w:tcBorders>
+              <w:top w:val="single" w:sz="4" w:space="0" w:color="000000"/>
+              <w:left w:val="single" w:sz="4" w:space="0" w:color="000000"/>
+              <w:bottom w:val="single" w:sz="4" w:space="0" w:color="000000"/>
+              <w:right w:val="single" w:sz="4" w:space="0" w:color="000000"/>
+            </w:tcBorders>
+            <w:vAlign w:val="bottom"/>
+          </w:tcPr>
+          <w:p>
+            <w:pPr>
+              <w:pStyle w:val="Normal"/>
+              <w:widowControl w:val="false"/>
+              <w:spacing w:lineRule="auto" w:line="180"/>
+              <w:jc w:val="center"/>
+              <w:rPr>
+                <w:sz w:val="16"/>
+                <w:szCs w:val="16"/>
+              </w:rPr>
+            </w:pPr>
+            <w:r>
+              <w:rPr>
+                <w:rFonts w:eastAsia="arial" w:ascii="arial" w:hAnsi="arial"/>
+                <w:color w:val="000000"/>
+                <w:sz w:val="16"/>
+                <w:szCs w:val="16"/>
+              </w:rPr>
+              <w:t>Next</w:t>
+            </w:r>
+          </w:p>
+          <w:p>
+            <w:pPr>
+              <w:pStyle w:val="Normal"/>
+              <w:widowControl w:val="false"/>
+              <w:spacing w:lineRule="auto" w:line="180"/>
+              <w:jc w:val="center"/>
+              <w:rPr>
+                <w:sz w:val="16"/>
+                <w:szCs w:val="16"/>
+              </w:rPr>
+            </w:pPr>
+            <w:r>
+              <w:rPr>
+                <w:rFonts w:eastAsia="arial" w:ascii="arial" w:hAnsi="arial"/>
+                <w:color w:val="000000"/>
+                <w:sz w:val="16"/>
+                <w:szCs w:val="16"/>
+              </w:rPr>
+              <w:t>Cab Cam</w:t>
+            </w:r>
+          </w:p>
+        </w:tc>
+      </w:tr>
+    </w:tbl>
+    <w:p>
+      <w:pPr>
+        <w:pStyle w:val="Normal"/>
+        <w:rPr>
+          <w:rFonts w:ascii="arial" w:hAnsi="arial" w:eastAsia="arial"/>
+          <w:color w:val="000000"/>
+          <w:sz w:val="16"/>
+          <w:szCs w:val="16"/>
+        </w:rPr>
+      </w:pPr>
+      <w:r>
+        <w:rPr>
+          <w:rFonts w:eastAsia="arial" w:ascii="arial" w:hAnsi="arial"/>
+          <w:color w:val="000000"/>
+          <w:sz w:val="16"/>
+          <w:szCs w:val="16"/>
+        </w:rPr>
+      </w:r>
+    </w:p>
+    <w:p>
+      <w:pPr>
+        <w:pStyle w:val="Normal"/>
+        <w:rPr>
+          <w:color w:val="000000"/>
+          <w:sz w:val="16"/>
+          <w:szCs w:val="16"/>
+        </w:rPr>
+      </w:pPr>
+      <w:r>
+        <w:rPr>
+          <w:rFonts w:eastAsia="arial" w:ascii="arial" w:hAnsi="arial"/>
+          <w:color w:val="000000"/>
+          <w:sz w:val="16"/>
+          <w:szCs w:val="16"/>
+        </w:rPr>
+        <w:tab/>
+        <w:t xml:space="preserve">           Class 37-2</w:t>
+      </w:r>
+    </w:p>
+    <w:tbl>
+      <w:tblPr>
+        <w:tblW w:w="14248" w:type="dxa"/>
+        <w:jc w:val="left"/>
+        <w:tblInd w:w="-5" w:type="dxa"/>
+        <w:tblLayout w:type="fixed"/>
+        <w:tblCellMar>
+          <w:top w:w="0" w:type="dxa"/>
+          <w:left w:w="108" w:type="dxa"/>
+          <w:bottom w:w="0" w:type="dxa"/>
+          <w:right w:w="108" w:type="dxa"/>
+        </w:tblCellMar>
+        <w:tblLook w:firstRow="1" w:noVBand="1" w:lastRow="0" w:firstColumn="1" w:lastColumn="0" w:noHBand="0" w:val="04a0"/>
+      </w:tblPr>
+      <w:tblGrid>
+        <w:gridCol w:w="1017"/>
+        <w:gridCol w:w="1019"/>
+        <w:gridCol w:w="1014"/>
+        <w:gridCol w:w="1016"/>
+        <w:gridCol w:w="1020"/>
+        <w:gridCol w:w="1016"/>
+        <w:gridCol w:w="1016"/>
+        <w:gridCol w:w="1017"/>
+        <w:gridCol w:w="1016"/>
+        <w:gridCol w:w="1020"/>
+        <w:gridCol w:w="1016"/>
+        <w:gridCol w:w="1016"/>
+        <w:gridCol w:w="1016"/>
+        <w:gridCol w:w="1029"/>
+      </w:tblGrid>
+      <w:tr>
+        <w:trPr>
+          <w:trHeight w:val="440" w:hRule="exact"/>
+          <w:cantSplit w:val="true"/>
+        </w:trPr>
+        <w:tc>
+          <w:tcPr>
+            <w:tcW w:w="1017" w:type="dxa"/>
+            <w:tcBorders>
+              <w:top w:val="single" w:sz="4" w:space="0" w:color="000000"/>
+              <w:left w:val="single" w:sz="4" w:space="0" w:color="000000"/>
+              <w:bottom w:val="single" w:sz="4" w:space="0" w:color="000000"/>
+            </w:tcBorders>
+            <w:vAlign w:val="bottom"/>
+          </w:tcPr>
+          <w:p>
+            <w:pPr>
+              <w:pStyle w:val="Normal"/>
+              <w:widowControl w:val="false"/>
+              <w:spacing w:lineRule="auto" w:line="180" w:before="0" w:after="60"/>
+              <w:jc w:val="center"/>
+              <w:rPr>
+                <w:b/>
+                <w:bCs/>
+              </w:rPr>
+            </w:pPr>
+            <w:r>
+              <w:rPr>
+                <w:b/>
+                <w:bCs/>
+                <w:color w:val="000000"/>
+                <w:sz w:val="16"/>
+                <w:szCs w:val="16"/>
+              </w:rPr>
+              <w:t>HUD</w:t>
+            </w:r>
+          </w:p>
+        </w:tc>
+        <w:tc>
+          <w:tcPr>
+            <w:tcW w:w="1019" w:type="dxa"/>
+            <w:tcBorders>
+              <w:top w:val="single" w:sz="4" w:space="0" w:color="000000"/>
+              <w:left w:val="single" w:sz="4" w:space="0" w:color="000000"/>
+              <w:bottom w:val="single" w:sz="4" w:space="0" w:color="000000"/>
+            </w:tcBorders>
+            <w:vAlign w:val="bottom"/>
+          </w:tcPr>
+          <w:p>
+            <w:pPr>
+              <w:pStyle w:val="Normal"/>
+              <w:widowControl w:val="false"/>
+              <w:spacing w:lineRule="auto" w:line="180"/>
+              <w:jc w:val="center"/>
+              <w:rPr>
+                <w:color w:val="000000"/>
+                <w:sz w:val="16"/>
+                <w:szCs w:val="16"/>
+              </w:rPr>
+            </w:pPr>
+            <w:r>
+              <w:rPr>
+                <w:color w:val="000000"/>
+                <w:sz w:val="16"/>
+                <w:szCs w:val="16"/>
+              </w:rPr>
+              <w:t>Schedule</w:t>
+            </w:r>
+          </w:p>
+        </w:tc>
+        <w:tc>
+          <w:tcPr>
+            <w:tcW w:w="1014" w:type="dxa"/>
+            <w:tcBorders>
+              <w:top w:val="single" w:sz="4" w:space="0" w:color="000000"/>
+              <w:left w:val="single" w:sz="4" w:space="0" w:color="000000"/>
+              <w:bottom w:val="single" w:sz="4" w:space="0" w:color="000000"/>
+            </w:tcBorders>
+            <w:vAlign w:val="bottom"/>
+          </w:tcPr>
+          <w:p>
+            <w:pPr>
+              <w:pStyle w:val="Normal"/>
+              <w:widowControl w:val="false"/>
+              <w:spacing w:lineRule="auto" w:line="180"/>
+              <w:jc w:val="center"/>
+              <w:rPr>
+                <w:color w:val="000000"/>
+                <w:sz w:val="16"/>
+                <w:szCs w:val="16"/>
+              </w:rPr>
+            </w:pPr>
+            <w:r>
+              <w:rPr>
+                <w:rFonts w:eastAsia="arial" w:ascii="arial" w:hAnsi="arial"/>
+                <w:color w:val="000000"/>
+                <w:sz w:val="16"/>
+                <w:szCs w:val="16"/>
+              </w:rPr>
+              <w:t>Engine Stop</w:t>
+            </w:r>
+          </w:p>
+        </w:tc>
+        <w:tc>
+          <w:tcPr>
+            <w:tcW w:w="1016" w:type="dxa"/>
+            <w:tcBorders>
+              <w:top w:val="single" w:sz="4" w:space="0" w:color="000000"/>
+              <w:left w:val="single" w:sz="4" w:space="0" w:color="000000"/>
+              <w:bottom w:val="single" w:sz="4" w:space="0" w:color="000000"/>
+            </w:tcBorders>
+            <w:vAlign w:val="bottom"/>
+          </w:tcPr>
+          <w:p>
+            <w:pPr>
+              <w:pStyle w:val="Normal"/>
+              <w:widowControl w:val="false"/>
+              <w:spacing w:lineRule="auto" w:line="180"/>
+              <w:jc w:val="center"/>
+              <w:rPr>
+                <w:color w:val="000000"/>
+                <w:sz w:val="16"/>
+                <w:szCs w:val="16"/>
+              </w:rPr>
+            </w:pPr>
+            <w:r>
+              <w:rPr>
+                <w:color w:val="000000"/>
+                <w:sz w:val="16"/>
+                <w:szCs w:val="16"/>
+              </w:rPr>
+              <w:t>DSD</w:t>
+            </w:r>
+          </w:p>
+        </w:tc>
+        <w:tc>
+          <w:tcPr>
+            <w:tcW w:w="1020" w:type="dxa"/>
+            <w:tcBorders>
+              <w:top w:val="single" w:sz="4" w:space="0" w:color="000000"/>
+              <w:left w:val="single" w:sz="4" w:space="0" w:color="000000"/>
+              <w:bottom w:val="single" w:sz="4" w:space="0" w:color="000000"/>
+            </w:tcBorders>
+            <w:vAlign w:val="bottom"/>
+          </w:tcPr>
+          <w:p>
+            <w:pPr>
+              <w:pStyle w:val="Normal"/>
+              <w:widowControl w:val="false"/>
+              <w:spacing w:lineRule="auto" w:line="180"/>
+              <w:jc w:val="center"/>
+              <w:rPr>
+                <w:color w:val="000000"/>
+                <w:sz w:val="16"/>
+                <w:szCs w:val="16"/>
+              </w:rPr>
+            </w:pPr>
+            <w:r>
+              <w:rPr>
+                <w:color w:val="000000"/>
+                <w:sz w:val="16"/>
+                <w:szCs w:val="16"/>
+              </w:rPr>
+            </w:r>
+          </w:p>
+        </w:tc>
+        <w:tc>
+          <w:tcPr>
+            <w:tcW w:w="1016" w:type="dxa"/>
+            <w:tcBorders>
+              <w:top w:val="single" w:sz="4" w:space="0" w:color="000000"/>
+              <w:left w:val="single" w:sz="4" w:space="0" w:color="000000"/>
+              <w:bottom w:val="single" w:sz="4" w:space="0" w:color="000000"/>
+            </w:tcBorders>
+            <w:vAlign w:val="bottom"/>
+          </w:tcPr>
+          <w:p>
+            <w:pPr>
+              <w:pStyle w:val="Normal"/>
+              <w:widowControl w:val="false"/>
+              <w:jc w:val="center"/>
+              <w:rPr>
+                <w:color w:val="000000"/>
+                <w:sz w:val="16"/>
+                <w:szCs w:val="16"/>
+              </w:rPr>
+            </w:pPr>
+            <w:r>
+              <w:rPr>
+                <w:color w:val="000000"/>
+                <w:sz w:val="16"/>
+                <w:szCs w:val="16"/>
+              </w:rPr>
+            </w:r>
+          </w:p>
+        </w:tc>
+        <w:tc>
+          <w:tcPr>
+            <w:tcW w:w="1016" w:type="dxa"/>
+            <w:tcBorders>
+              <w:top w:val="single" w:sz="4" w:space="0" w:color="000000"/>
+              <w:left w:val="single" w:sz="4" w:space="0" w:color="000000"/>
+              <w:bottom w:val="single" w:sz="4" w:space="0" w:color="000000"/>
+            </w:tcBorders>
+            <w:vAlign w:val="bottom"/>
+          </w:tcPr>
+          <w:p>
+            <w:pPr>
+              <w:pStyle w:val="Normal"/>
+              <w:widowControl w:val="false"/>
+              <w:jc w:val="center"/>
+              <w:rPr>
+                <w:color w:val="000000"/>
+                <w:sz w:val="16"/>
+                <w:szCs w:val="16"/>
+              </w:rPr>
+            </w:pPr>
+            <w:r>
+              <w:rPr>
+                <w:color w:val="000000"/>
+                <w:sz w:val="16"/>
+                <w:szCs w:val="16"/>
+              </w:rPr>
+            </w:r>
+          </w:p>
+        </w:tc>
+        <w:tc>
+          <w:tcPr>
+            <w:tcW w:w="1017" w:type="dxa"/>
+            <w:tcBorders>
+              <w:top w:val="single" w:sz="4" w:space="0" w:color="000000"/>
+              <w:left w:val="single" w:sz="4" w:space="0" w:color="000000"/>
+              <w:bottom w:val="single" w:sz="4" w:space="0" w:color="000000"/>
+            </w:tcBorders>
+            <w:vAlign w:val="bottom"/>
+          </w:tcPr>
+          <w:p>
+            <w:pPr>
+              <w:pStyle w:val="Normal"/>
+              <w:widowControl w:val="false"/>
+              <w:jc w:val="center"/>
+              <w:rPr>
+                <w:rFonts w:ascii="arial" w:hAnsi="arial" w:eastAsia="arial"/>
+                <w:color w:val="000000"/>
+                <w:sz w:val="16"/>
+                <w:szCs w:val="16"/>
+              </w:rPr>
+            </w:pPr>
+            <w:r>
+              <w:rPr>
+                <w:rFonts w:eastAsia="arial" w:ascii="arial" w:hAnsi="arial"/>
+                <w:color w:val="000000"/>
+                <w:sz w:val="16"/>
+                <w:szCs w:val="16"/>
+              </w:rPr>
+              <w:t>Vacuum Chamber</w:t>
+            </w:r>
+          </w:p>
+        </w:tc>
+        <w:tc>
+          <w:tcPr>
+            <w:tcW w:w="1016" w:type="dxa"/>
+            <w:tcBorders>
+              <w:top w:val="single" w:sz="4" w:space="0" w:color="000000"/>
+              <w:left w:val="single" w:sz="4" w:space="0" w:color="000000"/>
+              <w:bottom w:val="single" w:sz="4" w:space="0" w:color="000000"/>
+            </w:tcBorders>
+            <w:vAlign w:val="bottom"/>
+          </w:tcPr>
+          <w:p>
+            <w:pPr>
+              <w:pStyle w:val="Normal"/>
+              <w:widowControl w:val="false"/>
+              <w:jc w:val="center"/>
+              <w:rPr>
+                <w:color w:val="000000"/>
+                <w:sz w:val="16"/>
+                <w:szCs w:val="16"/>
+              </w:rPr>
+            </w:pPr>
+            <w:r>
+              <w:rPr/>
+            </w:r>
+          </w:p>
+        </w:tc>
+        <w:tc>
+          <w:tcPr>
+            <w:tcW w:w="1020" w:type="dxa"/>
+            <w:tcBorders>
+              <w:top w:val="single" w:sz="4" w:space="0" w:color="000000"/>
+              <w:left w:val="single" w:sz="4" w:space="0" w:color="000000"/>
+              <w:bottom w:val="single" w:sz="4" w:space="0" w:color="000000"/>
+            </w:tcBorders>
+            <w:vAlign w:val="bottom"/>
+          </w:tcPr>
+          <w:p>
+            <w:pPr>
+              <w:pStyle w:val="Normal"/>
+              <w:widowControl w:val="false"/>
+              <w:spacing w:lineRule="auto" w:line="180"/>
+              <w:jc w:val="center"/>
+              <w:rPr>
+                <w:sz w:val="16"/>
+                <w:szCs w:val="16"/>
+              </w:rPr>
+            </w:pPr>
+            <w:r>
+              <w:rPr>
+                <w:sz w:val="16"/>
+                <w:szCs w:val="16"/>
+              </w:rPr>
+              <w:t>Tail Light</w:t>
+            </w:r>
+          </w:p>
+        </w:tc>
+        <w:tc>
+          <w:tcPr>
+            <w:tcW w:w="1016" w:type="dxa"/>
+            <w:tcBorders>
+              <w:top w:val="single" w:sz="4" w:space="0" w:color="000000"/>
+              <w:left w:val="single" w:sz="4" w:space="0" w:color="000000"/>
+              <w:bottom w:val="single" w:sz="4" w:space="0" w:color="000000"/>
+            </w:tcBorders>
+            <w:vAlign w:val="bottom"/>
+          </w:tcPr>
+          <w:p>
+            <w:pPr>
+              <w:pStyle w:val="Normal"/>
+              <w:widowControl w:val="false"/>
+              <w:spacing w:lineRule="auto" w:line="180"/>
+              <w:jc w:val="center"/>
+              <w:rPr>
+                <w:sz w:val="16"/>
+                <w:szCs w:val="16"/>
+              </w:rPr>
+            </w:pPr>
+            <w:r>
+              <w:rPr>
+                <w:sz w:val="16"/>
+                <w:szCs w:val="16"/>
+              </w:rPr>
+              <w:t>Inst. Light</w:t>
+            </w:r>
+          </w:p>
+        </w:tc>
+        <w:tc>
+          <w:tcPr>
+            <w:tcW w:w="1016" w:type="dxa"/>
+            <w:tcBorders>
+              <w:top w:val="single" w:sz="4" w:space="0" w:color="000000"/>
+              <w:left w:val="single" w:sz="4" w:space="0" w:color="000000"/>
+              <w:bottom w:val="single" w:sz="4" w:space="0" w:color="000000"/>
+            </w:tcBorders>
+            <w:vAlign w:val="bottom"/>
+          </w:tcPr>
+          <w:p>
+            <w:pPr>
+              <w:pStyle w:val="Normal"/>
+              <w:widowControl w:val="false"/>
+              <w:spacing w:lineRule="auto" w:line="180"/>
+              <w:jc w:val="center"/>
+              <w:rPr>
+                <w:sz w:val="16"/>
+                <w:szCs w:val="16"/>
+              </w:rPr>
+            </w:pPr>
+            <w:r>
+              <w:rPr>
+                <w:sz w:val="16"/>
+                <w:szCs w:val="16"/>
+              </w:rPr>
+              <w:t>Handbrake Off</w:t>
+            </w:r>
+          </w:p>
+        </w:tc>
+        <w:tc>
+          <w:tcPr>
+            <w:tcW w:w="1016" w:type="dxa"/>
+            <w:tcBorders>
+              <w:top w:val="single" w:sz="4" w:space="0" w:color="000000"/>
+              <w:left w:val="single" w:sz="4" w:space="0" w:color="000000"/>
+              <w:bottom w:val="single" w:sz="4" w:space="0" w:color="000000"/>
+            </w:tcBorders>
+            <w:vAlign w:val="bottom"/>
+          </w:tcPr>
+          <w:p>
+            <w:pPr>
+              <w:pStyle w:val="Normal"/>
+              <w:widowControl w:val="false"/>
+              <w:spacing w:lineRule="auto" w:line="180"/>
+              <w:jc w:val="center"/>
+              <w:rPr>
+                <w:sz w:val="16"/>
+                <w:szCs w:val="16"/>
+              </w:rPr>
+            </w:pPr>
+            <w:r>
+              <w:rPr>
+                <w:rFonts w:eastAsia="arial" w:ascii="arial" w:hAnsi="arial"/>
+                <w:color w:val="000000"/>
+                <w:sz w:val="16"/>
+                <w:szCs w:val="16"/>
+              </w:rPr>
+              <w:t>Exterior</w:t>
+            </w:r>
+          </w:p>
+          <w:p>
+            <w:pPr>
+              <w:pStyle w:val="Normal"/>
+              <w:widowControl w:val="false"/>
+              <w:spacing w:lineRule="auto" w:line="180"/>
+              <w:jc w:val="center"/>
+              <w:rPr>
+                <w:sz w:val="16"/>
+                <w:szCs w:val="16"/>
+              </w:rPr>
+            </w:pPr>
+            <w:r>
+              <w:rPr>
+                <w:rFonts w:eastAsia="arial" w:ascii="arial" w:hAnsi="arial"/>
+                <w:color w:val="000000"/>
+                <w:sz w:val="16"/>
+                <w:szCs w:val="16"/>
+              </w:rPr>
+              <w:t>Camera</w:t>
+            </w:r>
+          </w:p>
+        </w:tc>
+        <w:tc>
+          <w:tcPr>
+            <w:tcW w:w="1029" w:type="dxa"/>
+            <w:tcBorders>
+              <w:top w:val="single" w:sz="4" w:space="0" w:color="000000"/>
+              <w:left w:val="single" w:sz="4" w:space="0" w:color="000000"/>
+              <w:bottom w:val="single" w:sz="4" w:space="0" w:color="000000"/>
+              <w:right w:val="single" w:sz="4" w:space="0" w:color="000000"/>
+            </w:tcBorders>
+            <w:vAlign w:val="bottom"/>
+          </w:tcPr>
+          <w:p>
+            <w:pPr>
+              <w:pStyle w:val="Normal"/>
+              <w:widowControl w:val="false"/>
+              <w:spacing w:lineRule="auto" w:line="180"/>
+              <w:jc w:val="center"/>
+              <w:rPr>
+                <w:sz w:val="16"/>
+                <w:szCs w:val="16"/>
+              </w:rPr>
+            </w:pPr>
+            <w:r>
+              <w:rPr>
+                <w:rFonts w:eastAsia="arial" w:ascii="arial" w:hAnsi="arial"/>
+                <w:color w:val="000000"/>
+                <w:sz w:val="16"/>
+                <w:szCs w:val="16"/>
+              </w:rPr>
+              <w:t>Prev</w:t>
+            </w:r>
+          </w:p>
+          <w:p>
+            <w:pPr>
+              <w:pStyle w:val="Normal"/>
+              <w:widowControl w:val="false"/>
+              <w:spacing w:lineRule="auto" w:line="180"/>
+              <w:jc w:val="center"/>
+              <w:rPr>
+                <w:sz w:val="16"/>
+                <w:szCs w:val="16"/>
+              </w:rPr>
+            </w:pPr>
+            <w:r>
+              <w:rPr>
+                <w:rFonts w:eastAsia="arial" w:ascii="arial" w:hAnsi="arial"/>
+                <w:color w:val="000000"/>
+                <w:sz w:val="16"/>
+                <w:szCs w:val="16"/>
+              </w:rPr>
+              <w:t>Cab Cam</w:t>
+            </w:r>
+          </w:p>
+        </w:tc>
+      </w:tr>
+    </w:tbl>
+    <w:p>
+      <w:pPr>
+        <w:pStyle w:val="Normal"/>
+        <w:rPr>
+          <w:color w:val="000000"/>
+          <w:sz w:val="16"/>
+          <w:szCs w:val="16"/>
+        </w:rPr>
+      </w:pPr>
+      <w:r>
+        <w:rPr>
+          <w:color w:val="000000"/>
+          <w:sz w:val="16"/>
+          <w:szCs w:val="16"/>
+        </w:rPr>
+      </w:r>
+    </w:p>
+    <w:p>
+      <w:pPr>
+        <w:pStyle w:val="Normal"/>
+        <w:rPr>
+          <w:color w:val="000000"/>
+          <w:sz w:val="16"/>
+          <w:szCs w:val="16"/>
+        </w:rPr>
+      </w:pPr>
+      <w:r>
+        <w:rPr>
+          <w:color w:val="000000"/>
+          <w:sz w:val="16"/>
+          <w:szCs w:val="16"/>
+        </w:rPr>
+        <w:tab/>
+        <w:t xml:space="preserve">       </w:t>
       </w:r>
       <w:r>
         <w:rPr>
@@ -4541,7 +5634,16 @@
           <w:sz w:val="16"/>
           <w:szCs w:val="16"/>
         </w:rPr>
-        <w:t>7</w:t>
+        <w:t xml:space="preserve">    Class </w:t>
+      </w:r>
+      <w:r>
+        <w:rPr>
+          <w:rFonts w:eastAsia="arial" w:ascii="arial" w:hAnsi="arial"/>
+          <w:color w:val="000000"/>
+          <w:sz w:val="16"/>
+          <w:szCs w:val="16"/>
+        </w:rPr>
+        <w:t>40</w:t>
       </w:r>
       <w:r>
         <w:rPr>
@@ -4773,7 +5875,11 @@
               </w:rPr>
             </w:pPr>
             <w:r>
-              <w:rPr/>
+              <w:rPr>
+                <w:color w:val="000000"/>
+                <w:sz w:val="16"/>
+                <w:szCs w:val="16"/>
+              </w:rPr>
             </w:r>
           </w:p>
         </w:tc>
@@ -4799,7 +5905,11 @@
               </w:rPr>
             </w:pPr>
             <w:r>
-              <w:rPr/>
+              <w:rPr>
+                <w:color w:val="000000"/>
+                <w:sz w:val="16"/>
+                <w:szCs w:val="16"/>
+              </w:rPr>
             </w:r>
           </w:p>
         </w:tc>
@@ -4831,7 +5941,7 @@
                 <w:sz w:val="16"/>
                 <w:szCs w:val="16"/>
               </w:rPr>
-              <w:t>Brake System</w:t>
+              <w:t>Brake Selector</w:t>
             </w:r>
           </w:p>
         </w:tc>
@@ -4862,7 +5972,7 @@
                 <w:sz w:val="16"/>
                 <w:szCs w:val="16"/>
               </w:rPr>
-              <w:t>Brake Timing</w:t>
+              <w:t>Top Marker</w:t>
             </w:r>
           </w:p>
         </w:tc>
@@ -4892,7 +6002,6 @@
                 <w:sz w:val="16"/>
                 <w:szCs w:val="16"/>
               </w:rPr>
-              <w:t>Marker Light White</w:t>
             </w:r>
           </w:p>
         </w:tc>
@@ -4954,14 +6063,7 @@
                 <w:sz w:val="16"/>
                 <w:szCs w:val="16"/>
               </w:rPr>
-              <w:t xml:space="preserve">Handbrake </w:t>
-            </w:r>
-            <w:r>
-              <w:rPr>
-                <w:sz w:val="16"/>
-                <w:szCs w:val="16"/>
-              </w:rPr>
-              <w:t>On</w:t>
+              <w:t>Handbrake On</w:t>
             </w:r>
           </w:p>
         </w:tc>
@@ -5089,7 +6191,7 @@
           <w:szCs w:val="16"/>
         </w:rPr>
         <w:tab/>
-        <w:t xml:space="preserve">           Class 3</w:t>
+        <w:t xml:space="preserve">           Class </w:t>
       </w:r>
       <w:r>
         <w:rPr>
@@ -5098,7 +6200,7 @@
           <w:sz w:val="16"/>
           <w:szCs w:val="16"/>
         </w:rPr>
-        <w:t>7</w:t>
+        <w:t>40</w:t>
       </w:r>
       <w:r>
         <w:rPr>
@@ -5297,7 +6399,11 @@
               </w:rPr>
             </w:pPr>
             <w:r>
-              <w:rPr/>
+              <w:rPr>
+                <w:color w:val="000000"/>
+                <w:sz w:val="16"/>
+                <w:szCs w:val="16"/>
+              </w:rPr>
             </w:r>
           </w:p>
         </w:tc>
@@ -5323,7 +6429,11 @@
               </w:rPr>
             </w:pPr>
             <w:r>
-              <w:rPr/>
+              <w:rPr>
+                <w:color w:val="000000"/>
+                <w:sz w:val="16"/>
+                <w:szCs w:val="16"/>
+              </w:rPr>
             </w:r>
           </w:p>
         </w:tc>
@@ -5349,7 +6459,11 @@
               </w:rPr>
             </w:pPr>
             <w:r>
-              <w:rPr/>
+              <w:rPr>
+                <w:color w:val="000000"/>
+                <w:sz w:val="16"/>
+                <w:szCs w:val="16"/>
+              </w:rPr>
             </w:r>
           </w:p>
         </w:tc>
@@ -5413,7 +6527,7 @@
                 <w:sz w:val="16"/>
                 <w:szCs w:val="16"/>
               </w:rPr>
-              <w:t>Exhauster Speed Up</w:t>
+              <w:t>Low Cent. Marker</w:t>
             </w:r>
           </w:p>
         </w:tc>
@@ -5443,7 +6557,7 @@
                 <w:sz w:val="16"/>
                 <w:szCs w:val="16"/>
               </w:rPr>
-              <w:t>Marker Light Red</w:t>
+              <w:t>Tail Light</w:t>
             </w:r>
           </w:p>
         </w:tc>
@@ -5503,14 +6617,7 @@
                 <w:sz w:val="16"/>
                 <w:szCs w:val="16"/>
               </w:rPr>
-              <w:t xml:space="preserve">Handbrake </w:t>
-            </w:r>
-            <w:r>
-              <w:rPr>
-                <w:sz w:val="16"/>
-                <w:szCs w:val="16"/>
-              </w:rPr>
-              <w:t>Off</w:t>
+              <w:t>Handbrake Off</w:t>
             </w:r>
           </w:p>
         </w:tc>
@@ -6661,12 +7768,12 @@
       <w:rFonts w:ascii="Symbol" w:hAnsi="Symbol" w:cs="Symbol"/>
     </w:rPr>
   </w:style>
-  <w:style w:type="character" w:styleId="user" w:customStyle="1">
-    <w:name w:val="번호 매기기 기호 (user)"/>
+  <w:style w:type="character" w:styleId="Style5" w:customStyle="1">
+    <w:name w:val="번호 매기기 기호"/>
     <w:qFormat/>
     <w:rPr/>
   </w:style>
-  <w:style w:type="paragraph" w:styleId="Style5">
+  <w:style w:type="paragraph" w:styleId="Style6">
     <w:name w:val="제목"/>
     <w:basedOn w:val="Normal"/>
     <w:next w:val="BodyText"/>
@@ -6676,7 +7783,7 @@
       <w:spacing w:before="240" w:after="120"/>
     </w:pPr>
     <w:rPr>
-      <w:rFonts w:ascii="Liberation Sans" w:hAnsi="Liberation Sans" w:eastAsia="Noto Sans CJK KR" w:cs="Lohit Devanagari"/>
+      <w:rFonts w:ascii="Liberation Sans" w:hAnsi="Liberation Sans" w:eastAsia="나눔고딕" w:cs="Arial"/>
       <w:sz w:val="28"/>
       <w:szCs w:val="28"/>
     </w:rPr>
@@ -6713,34 +7820,8 @@
       <w:szCs w:val="24"/>
     </w:rPr>
   </w:style>
-  <w:style w:type="paragraph" w:styleId="Style6" w:customStyle="1">
+  <w:style w:type="paragraph" w:styleId="Style7">
     <w:name w:val="색인"/>
-    <w:basedOn w:val="Normal"/>
-    <w:qFormat/>
-    <w:pPr>
-      <w:suppressLineNumbers/>
-    </w:pPr>
-    <w:rPr>
-      <w:rFonts w:cs="Lohit Devanagari"/>
-    </w:rPr>
-  </w:style>
-  <w:style w:type="paragraph" w:styleId="user1">
-    <w:name w:val="제목 (user)"/>
-    <w:basedOn w:val="Normal"/>
-    <w:next w:val="BodyText"/>
-    <w:qFormat/>
-    <w:pPr>
-      <w:keepNext w:val="true"/>
-      <w:spacing w:before="240" w:after="120"/>
-    </w:pPr>
-    <w:rPr>
-      <w:rFonts w:ascii="Liberation Sans" w:hAnsi="Liberation Sans" w:eastAsia="나눔고딕" w:cs="Arial"/>
-      <w:sz w:val="28"/>
-      <w:szCs w:val="28"/>
-    </w:rPr>
-  </w:style>
-  <w:style w:type="paragraph" w:styleId="user2">
-    <w:name w:val="색인 (user)"/>
     <w:basedOn w:val="Normal"/>
     <w:qFormat/>
     <w:pPr>
@@ -6749,6 +7830,32 @@
     <w:rPr>
       <w:rFonts w:cs="Arial"/>
       <w:sz w:val="24"/>
+    </w:rPr>
+  </w:style>
+  <w:style w:type="paragraph" w:styleId="user">
+    <w:name w:val="제목 (user)"/>
+    <w:basedOn w:val="Normal"/>
+    <w:next w:val="BodyText"/>
+    <w:qFormat/>
+    <w:pPr>
+      <w:keepNext w:val="true"/>
+      <w:spacing w:before="240" w:after="120"/>
+    </w:pPr>
+    <w:rPr>
+      <w:rFonts w:ascii="Liberation Sans" w:hAnsi="Liberation Sans" w:eastAsia="Noto Sans CJK KR" w:cs="Lohit Devanagari"/>
+      <w:sz w:val="28"/>
+      <w:szCs w:val="28"/>
+    </w:rPr>
+  </w:style>
+  <w:style w:type="paragraph" w:styleId="user1" w:customStyle="1">
+    <w:name w:val="색인 (user)"/>
+    <w:basedOn w:val="Normal"/>
+    <w:qFormat/>
+    <w:pPr>
+      <w:suppressLineNumbers/>
+    </w:pPr>
+    <w:rPr>
+      <w:rFonts w:cs="Lohit Devanagari"/>
     </w:rPr>
   </w:style>
   <w:style w:type="paragraph" w:styleId="Title">
@@ -7430,8 +8537,8 @@
       <w:szCs w:val="24"/>
     </w:rPr>
   </w:style>
-  <w:style w:type="paragraph" w:styleId="Style7" w:customStyle="1">
-    <w:name w:val="표 내용"/>
+  <w:style w:type="paragraph" w:styleId="user2" w:customStyle="1">
+    <w:name w:val="표 내용 (user)"/>
     <w:basedOn w:val="Normal"/>
     <w:qFormat/>
     <w:pPr>
@@ -7439,9 +8546,9 @@
     </w:pPr>
     <w:rPr/>
   </w:style>
-  <w:style w:type="paragraph" w:styleId="Style8" w:customStyle="1">
-    <w:name w:val="표제목"/>
-    <w:basedOn w:val="Style7"/>
+  <w:style w:type="paragraph" w:styleId="user3" w:customStyle="1">
+    <w:name w:val="표제목 (user)"/>
+    <w:basedOn w:val="user2"/>
     <w:qFormat/>
     <w:pPr>
       <w:jc w:val="center"/>
@@ -7451,8 +8558,8 @@
       <w:bCs/>
     </w:rPr>
   </w:style>
-  <w:style w:type="paragraph" w:styleId="user3">
-    <w:name w:val="표 내용 (user)"/>
+  <w:style w:type="paragraph" w:styleId="Style8">
+    <w:name w:val="표 내용"/>
     <w:basedOn w:val="Normal"/>
     <w:qFormat/>
     <w:pPr>
@@ -7461,9 +8568,9 @@
     </w:pPr>
     <w:rPr/>
   </w:style>
-  <w:style w:type="paragraph" w:styleId="user4">
-    <w:name w:val="표제목 (user)"/>
-    <w:basedOn w:val="user3"/>
+  <w:style w:type="paragraph" w:styleId="Style9">
+    <w:name w:val="표제목"/>
+    <w:basedOn w:val="Style8"/>
     <w:qFormat/>
     <w:pPr>
       <w:suppressLineNumbers/>

</xml_diff>

<commit_message>
Add Class 43 HST
</commit_message>
<xml_diff>
--- a/raildriver-UK-Remapped.docx
+++ b/raildriver-UK-Remapped.docx
@@ -4697,15 +4697,7 @@
                 <w:sz w:val="16"/>
                 <w:szCs w:val="16"/>
               </w:rPr>
-              <w:t>AWS/</w:t>
-            </w:r>
-            <w:r>
-              <w:rPr>
-                <w:color w:val="000000"/>
-                <w:sz w:val="16"/>
-                <w:szCs w:val="16"/>
-              </w:rPr>
-              <w:t>TPWS</w:t>
+              <w:t>AWS/TPWS</w:t>
             </w:r>
           </w:p>
         </w:tc>
@@ -4856,7 +4848,11 @@
               </w:rPr>
             </w:pPr>
             <w:r>
-              <w:rPr/>
+              <w:rPr>
+                <w:color w:val="000000"/>
+                <w:sz w:val="16"/>
+                <w:szCs w:val="16"/>
+              </w:rPr>
             </w:r>
           </w:p>
         </w:tc>
@@ -5389,7 +5385,11 @@
               </w:rPr>
             </w:pPr>
             <w:r>
-              <w:rPr/>
+              <w:rPr>
+                <w:color w:val="000000"/>
+                <w:sz w:val="16"/>
+                <w:szCs w:val="16"/>
+              </w:rPr>
             </w:r>
           </w:p>
         </w:tc>
@@ -5634,7 +5634,1100 @@
           <w:sz w:val="16"/>
           <w:szCs w:val="16"/>
         </w:rPr>
-        <w:t xml:space="preserve">    Class </w:t>
+        <w:t xml:space="preserve">    Class 40-1</w:t>
+      </w:r>
+    </w:p>
+    <w:tbl>
+      <w:tblPr>
+        <w:tblW w:w="14248" w:type="dxa"/>
+        <w:jc w:val="left"/>
+        <w:tblInd w:w="-5" w:type="dxa"/>
+        <w:tblLayout w:type="fixed"/>
+        <w:tblCellMar>
+          <w:top w:w="0" w:type="dxa"/>
+          <w:left w:w="108" w:type="dxa"/>
+          <w:bottom w:w="0" w:type="dxa"/>
+          <w:right w:w="108" w:type="dxa"/>
+        </w:tblCellMar>
+        <w:tblLook w:firstRow="1" w:noVBand="1" w:lastRow="0" w:firstColumn="1" w:lastColumn="0" w:noHBand="0" w:val="04a0"/>
+      </w:tblPr>
+      <w:tblGrid>
+        <w:gridCol w:w="1017"/>
+        <w:gridCol w:w="1019"/>
+        <w:gridCol w:w="1014"/>
+        <w:gridCol w:w="1016"/>
+        <w:gridCol w:w="1020"/>
+        <w:gridCol w:w="1016"/>
+        <w:gridCol w:w="1016"/>
+        <w:gridCol w:w="1017"/>
+        <w:gridCol w:w="1016"/>
+        <w:gridCol w:w="1020"/>
+        <w:gridCol w:w="1016"/>
+        <w:gridCol w:w="1016"/>
+        <w:gridCol w:w="1016"/>
+        <w:gridCol w:w="1029"/>
+      </w:tblGrid>
+      <w:tr>
+        <w:trPr>
+          <w:trHeight w:val="440" w:hRule="exact"/>
+          <w:cantSplit w:val="true"/>
+        </w:trPr>
+        <w:tc>
+          <w:tcPr>
+            <w:tcW w:w="1017" w:type="dxa"/>
+            <w:tcBorders>
+              <w:top w:val="single" w:sz="4" w:space="0" w:color="000000"/>
+              <w:left w:val="single" w:sz="4" w:space="0" w:color="000000"/>
+              <w:bottom w:val="single" w:sz="4" w:space="0" w:color="000000"/>
+            </w:tcBorders>
+            <w:vAlign w:val="bottom"/>
+          </w:tcPr>
+          <w:p>
+            <w:pPr>
+              <w:pStyle w:val="Normal"/>
+              <w:widowControl w:val="false"/>
+              <w:spacing w:lineRule="auto" w:line="180" w:before="0" w:after="60"/>
+              <w:jc w:val="center"/>
+              <w:rPr>
+                <w:color w:val="000000"/>
+                <w:sz w:val="16"/>
+                <w:szCs w:val="16"/>
+              </w:rPr>
+            </w:pPr>
+            <w:r>
+              <w:rPr>
+                <w:rFonts w:eastAsia="arial" w:ascii="arial" w:hAnsi="arial"/>
+                <w:b/>
+                <w:color w:val="000000"/>
+                <w:sz w:val="16"/>
+                <w:szCs w:val="16"/>
+              </w:rPr>
+              <w:t>Pause</w:t>
+            </w:r>
+          </w:p>
+        </w:tc>
+        <w:tc>
+          <w:tcPr>
+            <w:tcW w:w="1019" w:type="dxa"/>
+            <w:tcBorders>
+              <w:top w:val="single" w:sz="4" w:space="0" w:color="000000"/>
+              <w:left w:val="single" w:sz="4" w:space="0" w:color="000000"/>
+              <w:bottom w:val="single" w:sz="4" w:space="0" w:color="000000"/>
+            </w:tcBorders>
+            <w:vAlign w:val="bottom"/>
+          </w:tcPr>
+          <w:p>
+            <w:pPr>
+              <w:pStyle w:val="Normal"/>
+              <w:widowControl w:val="false"/>
+              <w:spacing w:lineRule="auto" w:line="180"/>
+              <w:jc w:val="center"/>
+              <w:rPr>
+                <w:color w:val="000000"/>
+                <w:sz w:val="16"/>
+                <w:szCs w:val="16"/>
+              </w:rPr>
+            </w:pPr>
+            <w:r>
+              <w:rPr>
+                <w:color w:val="000000"/>
+                <w:sz w:val="16"/>
+                <w:szCs w:val="16"/>
+              </w:rPr>
+              <w:t>Master Key</w:t>
+            </w:r>
+          </w:p>
+        </w:tc>
+        <w:tc>
+          <w:tcPr>
+            <w:tcW w:w="1014" w:type="dxa"/>
+            <w:tcBorders>
+              <w:top w:val="single" w:sz="4" w:space="0" w:color="000000"/>
+              <w:left w:val="single" w:sz="4" w:space="0" w:color="000000"/>
+              <w:bottom w:val="single" w:sz="4" w:space="0" w:color="000000"/>
+            </w:tcBorders>
+            <w:vAlign w:val="bottom"/>
+          </w:tcPr>
+          <w:p>
+            <w:pPr>
+              <w:pStyle w:val="Normal"/>
+              <w:widowControl w:val="false"/>
+              <w:spacing w:lineRule="auto" w:line="180"/>
+              <w:jc w:val="center"/>
+              <w:rPr>
+                <w:color w:val="000000"/>
+                <w:sz w:val="16"/>
+                <w:szCs w:val="16"/>
+              </w:rPr>
+            </w:pPr>
+            <w:r>
+              <w:rPr>
+                <w:rFonts w:eastAsia="arial" w:ascii="arial" w:hAnsi="arial"/>
+                <w:color w:val="000000"/>
+                <w:sz w:val="16"/>
+                <w:szCs w:val="16"/>
+              </w:rPr>
+              <w:t>Engine Start</w:t>
+            </w:r>
+          </w:p>
+        </w:tc>
+        <w:tc>
+          <w:tcPr>
+            <w:tcW w:w="1016" w:type="dxa"/>
+            <w:tcBorders>
+              <w:top w:val="single" w:sz="4" w:space="0" w:color="000000"/>
+              <w:left w:val="single" w:sz="4" w:space="0" w:color="000000"/>
+              <w:bottom w:val="single" w:sz="4" w:space="0" w:color="000000"/>
+            </w:tcBorders>
+            <w:vAlign w:val="bottom"/>
+          </w:tcPr>
+          <w:p>
+            <w:pPr>
+              <w:pStyle w:val="Normal"/>
+              <w:widowControl w:val="false"/>
+              <w:spacing w:lineRule="auto" w:line="180"/>
+              <w:jc w:val="center"/>
+              <w:rPr>
+                <w:color w:val="000000"/>
+                <w:sz w:val="16"/>
+                <w:szCs w:val="16"/>
+              </w:rPr>
+            </w:pPr>
+            <w:r>
+              <w:rPr>
+                <w:color w:val="000000"/>
+                <w:sz w:val="16"/>
+                <w:szCs w:val="16"/>
+              </w:rPr>
+              <w:t>AWS</w:t>
+            </w:r>
+          </w:p>
+        </w:tc>
+        <w:tc>
+          <w:tcPr>
+            <w:tcW w:w="1020" w:type="dxa"/>
+            <w:tcBorders>
+              <w:top w:val="single" w:sz="4" w:space="0" w:color="000000"/>
+              <w:left w:val="single" w:sz="4" w:space="0" w:color="000000"/>
+              <w:bottom w:val="single" w:sz="4" w:space="0" w:color="000000"/>
+            </w:tcBorders>
+            <w:vAlign w:val="bottom"/>
+          </w:tcPr>
+          <w:p>
+            <w:pPr>
+              <w:pStyle w:val="Normal"/>
+              <w:widowControl w:val="false"/>
+              <w:spacing w:lineRule="auto" w:line="180"/>
+              <w:jc w:val="center"/>
+              <w:rPr>
+                <w:color w:val="000000"/>
+                <w:sz w:val="16"/>
+                <w:szCs w:val="16"/>
+              </w:rPr>
+            </w:pPr>
+            <w:r>
+              <w:rPr>
+                <w:color w:val="000000"/>
+                <w:sz w:val="16"/>
+                <w:szCs w:val="16"/>
+              </w:rPr>
+              <w:t>AWS Cab Change</w:t>
+            </w:r>
+          </w:p>
+        </w:tc>
+        <w:tc>
+          <w:tcPr>
+            <w:tcW w:w="1016" w:type="dxa"/>
+            <w:tcBorders>
+              <w:top w:val="single" w:sz="4" w:space="0" w:color="000000"/>
+              <w:left w:val="single" w:sz="4" w:space="0" w:color="000000"/>
+              <w:bottom w:val="single" w:sz="4" w:space="0" w:color="000000"/>
+            </w:tcBorders>
+            <w:vAlign w:val="bottom"/>
+          </w:tcPr>
+          <w:p>
+            <w:pPr>
+              <w:pStyle w:val="Normal"/>
+              <w:widowControl w:val="false"/>
+              <w:jc w:val="center"/>
+              <w:rPr>
+                <w:color w:val="000000"/>
+                <w:sz w:val="16"/>
+                <w:szCs w:val="16"/>
+              </w:rPr>
+            </w:pPr>
+            <w:r>
+              <w:rPr>
+                <w:color w:val="000000"/>
+                <w:sz w:val="16"/>
+                <w:szCs w:val="16"/>
+              </w:rPr>
+            </w:r>
+          </w:p>
+        </w:tc>
+        <w:tc>
+          <w:tcPr>
+            <w:tcW w:w="1016" w:type="dxa"/>
+            <w:tcBorders>
+              <w:top w:val="single" w:sz="4" w:space="0" w:color="000000"/>
+              <w:left w:val="single" w:sz="4" w:space="0" w:color="000000"/>
+              <w:bottom w:val="single" w:sz="4" w:space="0" w:color="000000"/>
+            </w:tcBorders>
+            <w:vAlign w:val="bottom"/>
+          </w:tcPr>
+          <w:p>
+            <w:pPr>
+              <w:pStyle w:val="Normal"/>
+              <w:widowControl w:val="false"/>
+              <w:jc w:val="center"/>
+              <w:rPr>
+                <w:color w:val="000000"/>
+                <w:sz w:val="16"/>
+                <w:szCs w:val="16"/>
+              </w:rPr>
+            </w:pPr>
+            <w:r>
+              <w:rPr>
+                <w:color w:val="000000"/>
+                <w:sz w:val="16"/>
+                <w:szCs w:val="16"/>
+              </w:rPr>
+            </w:r>
+          </w:p>
+        </w:tc>
+        <w:tc>
+          <w:tcPr>
+            <w:tcW w:w="1017" w:type="dxa"/>
+            <w:tcBorders>
+              <w:top w:val="single" w:sz="4" w:space="0" w:color="000000"/>
+              <w:left w:val="single" w:sz="4" w:space="0" w:color="000000"/>
+              <w:bottom w:val="single" w:sz="4" w:space="0" w:color="000000"/>
+            </w:tcBorders>
+            <w:vAlign w:val="bottom"/>
+          </w:tcPr>
+          <w:p>
+            <w:pPr>
+              <w:pStyle w:val="Normal"/>
+              <w:widowControl w:val="false"/>
+              <w:jc w:val="center"/>
+              <w:rPr>
+                <w:color w:val="000000"/>
+                <w:sz w:val="16"/>
+                <w:szCs w:val="16"/>
+              </w:rPr>
+            </w:pPr>
+            <w:r>
+              <w:rPr>
+                <w:rFonts w:eastAsia="arial" w:ascii="arial" w:hAnsi="arial"/>
+                <w:color w:val="000000"/>
+                <w:sz w:val="16"/>
+                <w:szCs w:val="16"/>
+              </w:rPr>
+              <w:t>Brake Selector</w:t>
+            </w:r>
+          </w:p>
+        </w:tc>
+        <w:tc>
+          <w:tcPr>
+            <w:tcW w:w="1016" w:type="dxa"/>
+            <w:tcBorders>
+              <w:top w:val="single" w:sz="4" w:space="0" w:color="000000"/>
+              <w:left w:val="single" w:sz="4" w:space="0" w:color="000000"/>
+              <w:bottom w:val="single" w:sz="4" w:space="0" w:color="000000"/>
+            </w:tcBorders>
+            <w:vAlign w:val="bottom"/>
+          </w:tcPr>
+          <w:p>
+            <w:pPr>
+              <w:pStyle w:val="Normal"/>
+              <w:widowControl w:val="false"/>
+              <w:jc w:val="center"/>
+              <w:rPr>
+                <w:color w:val="000000"/>
+                <w:sz w:val="16"/>
+                <w:szCs w:val="16"/>
+              </w:rPr>
+            </w:pPr>
+            <w:r>
+              <w:rPr>
+                <w:color w:val="000000"/>
+                <w:sz w:val="16"/>
+                <w:szCs w:val="16"/>
+              </w:rPr>
+              <w:t>Top Marker</w:t>
+            </w:r>
+          </w:p>
+        </w:tc>
+        <w:tc>
+          <w:tcPr>
+            <w:tcW w:w="1020" w:type="dxa"/>
+            <w:tcBorders>
+              <w:top w:val="single" w:sz="4" w:space="0" w:color="000000"/>
+              <w:left w:val="single" w:sz="4" w:space="0" w:color="000000"/>
+              <w:bottom w:val="single" w:sz="4" w:space="0" w:color="000000"/>
+            </w:tcBorders>
+            <w:vAlign w:val="bottom"/>
+          </w:tcPr>
+          <w:p>
+            <w:pPr>
+              <w:pStyle w:val="Normal"/>
+              <w:widowControl w:val="false"/>
+              <w:spacing w:lineRule="auto" w:line="180"/>
+              <w:jc w:val="center"/>
+              <w:rPr>
+                <w:sz w:val="16"/>
+                <w:szCs w:val="16"/>
+              </w:rPr>
+            </w:pPr>
+            <w:r>
+              <w:rPr>
+                <w:sz w:val="16"/>
+                <w:szCs w:val="16"/>
+              </w:rPr>
+            </w:r>
+          </w:p>
+        </w:tc>
+        <w:tc>
+          <w:tcPr>
+            <w:tcW w:w="1016" w:type="dxa"/>
+            <w:tcBorders>
+              <w:top w:val="single" w:sz="4" w:space="0" w:color="000000"/>
+              <w:left w:val="single" w:sz="4" w:space="0" w:color="000000"/>
+              <w:bottom w:val="single" w:sz="4" w:space="0" w:color="000000"/>
+            </w:tcBorders>
+            <w:vAlign w:val="bottom"/>
+          </w:tcPr>
+          <w:p>
+            <w:pPr>
+              <w:pStyle w:val="Normal"/>
+              <w:widowControl w:val="false"/>
+              <w:spacing w:lineRule="auto" w:line="180"/>
+              <w:jc w:val="center"/>
+              <w:rPr>
+                <w:sz w:val="16"/>
+                <w:szCs w:val="16"/>
+              </w:rPr>
+            </w:pPr>
+            <w:r>
+              <w:rPr>
+                <w:rFonts w:eastAsia="arial" w:ascii="arial" w:hAnsi="arial"/>
+                <w:color w:val="000000"/>
+                <w:sz w:val="16"/>
+                <w:szCs w:val="16"/>
+              </w:rPr>
+              <w:t>Cab Light</w:t>
+            </w:r>
+          </w:p>
+        </w:tc>
+        <w:tc>
+          <w:tcPr>
+            <w:tcW w:w="1016" w:type="dxa"/>
+            <w:tcBorders>
+              <w:top w:val="single" w:sz="4" w:space="0" w:color="000000"/>
+              <w:left w:val="single" w:sz="4" w:space="0" w:color="000000"/>
+              <w:bottom w:val="single" w:sz="4" w:space="0" w:color="000000"/>
+            </w:tcBorders>
+            <w:vAlign w:val="bottom"/>
+          </w:tcPr>
+          <w:p>
+            <w:pPr>
+              <w:pStyle w:val="Normal"/>
+              <w:widowControl w:val="false"/>
+              <w:spacing w:lineRule="auto" w:line="180"/>
+              <w:jc w:val="center"/>
+              <w:rPr>
+                <w:sz w:val="16"/>
+                <w:szCs w:val="16"/>
+              </w:rPr>
+            </w:pPr>
+            <w:r>
+              <w:rPr>
+                <w:sz w:val="16"/>
+                <w:szCs w:val="16"/>
+              </w:rPr>
+              <w:t>Handbrake On</w:t>
+            </w:r>
+          </w:p>
+        </w:tc>
+        <w:tc>
+          <w:tcPr>
+            <w:tcW w:w="1016" w:type="dxa"/>
+            <w:tcBorders>
+              <w:top w:val="single" w:sz="4" w:space="0" w:color="000000"/>
+              <w:left w:val="single" w:sz="4" w:space="0" w:color="000000"/>
+              <w:bottom w:val="single" w:sz="4" w:space="0" w:color="000000"/>
+            </w:tcBorders>
+            <w:vAlign w:val="bottom"/>
+          </w:tcPr>
+          <w:p>
+            <w:pPr>
+              <w:pStyle w:val="Normal"/>
+              <w:widowControl w:val="false"/>
+              <w:spacing w:lineRule="auto" w:line="180"/>
+              <w:jc w:val="center"/>
+              <w:rPr>
+                <w:sz w:val="16"/>
+                <w:szCs w:val="16"/>
+              </w:rPr>
+            </w:pPr>
+            <w:r>
+              <w:rPr>
+                <w:rFonts w:eastAsia="arial" w:ascii="arial" w:hAnsi="arial"/>
+                <w:color w:val="000000"/>
+                <w:sz w:val="16"/>
+                <w:szCs w:val="16"/>
+              </w:rPr>
+              <w:t>1-Person</w:t>
+            </w:r>
+          </w:p>
+        </w:tc>
+        <w:tc>
+          <w:tcPr>
+            <w:tcW w:w="1029" w:type="dxa"/>
+            <w:tcBorders>
+              <w:top w:val="single" w:sz="4" w:space="0" w:color="000000"/>
+              <w:left w:val="single" w:sz="4" w:space="0" w:color="000000"/>
+              <w:bottom w:val="single" w:sz="4" w:space="0" w:color="000000"/>
+              <w:right w:val="single" w:sz="4" w:space="0" w:color="000000"/>
+            </w:tcBorders>
+            <w:vAlign w:val="bottom"/>
+          </w:tcPr>
+          <w:p>
+            <w:pPr>
+              <w:pStyle w:val="Normal"/>
+              <w:widowControl w:val="false"/>
+              <w:spacing w:lineRule="auto" w:line="180"/>
+              <w:jc w:val="center"/>
+              <w:rPr>
+                <w:sz w:val="16"/>
+                <w:szCs w:val="16"/>
+              </w:rPr>
+            </w:pPr>
+            <w:r>
+              <w:rPr>
+                <w:rFonts w:eastAsia="arial" w:ascii="arial" w:hAnsi="arial"/>
+                <w:color w:val="000000"/>
+                <w:sz w:val="16"/>
+                <w:szCs w:val="16"/>
+              </w:rPr>
+              <w:t>Next</w:t>
+            </w:r>
+          </w:p>
+          <w:p>
+            <w:pPr>
+              <w:pStyle w:val="Normal"/>
+              <w:widowControl w:val="false"/>
+              <w:spacing w:lineRule="auto" w:line="180"/>
+              <w:jc w:val="center"/>
+              <w:rPr>
+                <w:sz w:val="16"/>
+                <w:szCs w:val="16"/>
+              </w:rPr>
+            </w:pPr>
+            <w:r>
+              <w:rPr>
+                <w:rFonts w:eastAsia="arial" w:ascii="arial" w:hAnsi="arial"/>
+                <w:color w:val="000000"/>
+                <w:sz w:val="16"/>
+                <w:szCs w:val="16"/>
+              </w:rPr>
+              <w:t>Cab Cam</w:t>
+            </w:r>
+          </w:p>
+        </w:tc>
+      </w:tr>
+    </w:tbl>
+    <w:p>
+      <w:pPr>
+        <w:pStyle w:val="Normal"/>
+        <w:rPr>
+          <w:rFonts w:ascii="arial" w:hAnsi="arial" w:eastAsia="arial"/>
+          <w:color w:val="000000"/>
+          <w:sz w:val="16"/>
+          <w:szCs w:val="16"/>
+        </w:rPr>
+      </w:pPr>
+      <w:r>
+        <w:rPr>
+          <w:rFonts w:eastAsia="arial" w:ascii="arial" w:hAnsi="arial"/>
+          <w:color w:val="000000"/>
+          <w:sz w:val="16"/>
+          <w:szCs w:val="16"/>
+        </w:rPr>
+      </w:r>
+    </w:p>
+    <w:p>
+      <w:pPr>
+        <w:pStyle w:val="Normal"/>
+        <w:rPr>
+          <w:color w:val="000000"/>
+          <w:sz w:val="16"/>
+          <w:szCs w:val="16"/>
+        </w:rPr>
+      </w:pPr>
+      <w:r>
+        <w:rPr>
+          <w:rFonts w:eastAsia="arial" w:ascii="arial" w:hAnsi="arial"/>
+          <w:color w:val="000000"/>
+          <w:sz w:val="16"/>
+          <w:szCs w:val="16"/>
+        </w:rPr>
+        <w:tab/>
+        <w:t xml:space="preserve">           Class 40-2</w:t>
+      </w:r>
+    </w:p>
+    <w:tbl>
+      <w:tblPr>
+        <w:tblW w:w="14248" w:type="dxa"/>
+        <w:jc w:val="left"/>
+        <w:tblInd w:w="-5" w:type="dxa"/>
+        <w:tblLayout w:type="fixed"/>
+        <w:tblCellMar>
+          <w:top w:w="0" w:type="dxa"/>
+          <w:left w:w="108" w:type="dxa"/>
+          <w:bottom w:w="0" w:type="dxa"/>
+          <w:right w:w="108" w:type="dxa"/>
+        </w:tblCellMar>
+        <w:tblLook w:firstRow="1" w:noVBand="1" w:lastRow="0" w:firstColumn="1" w:lastColumn="0" w:noHBand="0" w:val="04a0"/>
+      </w:tblPr>
+      <w:tblGrid>
+        <w:gridCol w:w="1017"/>
+        <w:gridCol w:w="1019"/>
+        <w:gridCol w:w="1014"/>
+        <w:gridCol w:w="1016"/>
+        <w:gridCol w:w="1020"/>
+        <w:gridCol w:w="1016"/>
+        <w:gridCol w:w="1016"/>
+        <w:gridCol w:w="1017"/>
+        <w:gridCol w:w="1016"/>
+        <w:gridCol w:w="1020"/>
+        <w:gridCol w:w="1016"/>
+        <w:gridCol w:w="1016"/>
+        <w:gridCol w:w="1016"/>
+        <w:gridCol w:w="1029"/>
+      </w:tblGrid>
+      <w:tr>
+        <w:trPr>
+          <w:trHeight w:val="440" w:hRule="exact"/>
+          <w:cantSplit w:val="true"/>
+        </w:trPr>
+        <w:tc>
+          <w:tcPr>
+            <w:tcW w:w="1017" w:type="dxa"/>
+            <w:tcBorders>
+              <w:top w:val="single" w:sz="4" w:space="0" w:color="000000"/>
+              <w:left w:val="single" w:sz="4" w:space="0" w:color="000000"/>
+              <w:bottom w:val="single" w:sz="4" w:space="0" w:color="000000"/>
+            </w:tcBorders>
+            <w:vAlign w:val="bottom"/>
+          </w:tcPr>
+          <w:p>
+            <w:pPr>
+              <w:pStyle w:val="Normal"/>
+              <w:widowControl w:val="false"/>
+              <w:spacing w:lineRule="auto" w:line="180" w:before="0" w:after="60"/>
+              <w:jc w:val="center"/>
+              <w:rPr>
+                <w:b/>
+                <w:bCs/>
+              </w:rPr>
+            </w:pPr>
+            <w:r>
+              <w:rPr>
+                <w:b/>
+                <w:bCs/>
+                <w:color w:val="000000"/>
+                <w:sz w:val="16"/>
+                <w:szCs w:val="16"/>
+              </w:rPr>
+              <w:t>HUD</w:t>
+            </w:r>
+          </w:p>
+        </w:tc>
+        <w:tc>
+          <w:tcPr>
+            <w:tcW w:w="1019" w:type="dxa"/>
+            <w:tcBorders>
+              <w:top w:val="single" w:sz="4" w:space="0" w:color="000000"/>
+              <w:left w:val="single" w:sz="4" w:space="0" w:color="000000"/>
+              <w:bottom w:val="single" w:sz="4" w:space="0" w:color="000000"/>
+            </w:tcBorders>
+            <w:vAlign w:val="bottom"/>
+          </w:tcPr>
+          <w:p>
+            <w:pPr>
+              <w:pStyle w:val="Normal"/>
+              <w:widowControl w:val="false"/>
+              <w:spacing w:lineRule="auto" w:line="180"/>
+              <w:jc w:val="center"/>
+              <w:rPr>
+                <w:color w:val="000000"/>
+                <w:sz w:val="16"/>
+                <w:szCs w:val="16"/>
+              </w:rPr>
+            </w:pPr>
+            <w:r>
+              <w:rPr>
+                <w:color w:val="000000"/>
+                <w:sz w:val="16"/>
+                <w:szCs w:val="16"/>
+              </w:rPr>
+              <w:t>Schedule</w:t>
+            </w:r>
+          </w:p>
+        </w:tc>
+        <w:tc>
+          <w:tcPr>
+            <w:tcW w:w="1014" w:type="dxa"/>
+            <w:tcBorders>
+              <w:top w:val="single" w:sz="4" w:space="0" w:color="000000"/>
+              <w:left w:val="single" w:sz="4" w:space="0" w:color="000000"/>
+              <w:bottom w:val="single" w:sz="4" w:space="0" w:color="000000"/>
+            </w:tcBorders>
+            <w:vAlign w:val="bottom"/>
+          </w:tcPr>
+          <w:p>
+            <w:pPr>
+              <w:pStyle w:val="Normal"/>
+              <w:widowControl w:val="false"/>
+              <w:spacing w:lineRule="auto" w:line="180"/>
+              <w:jc w:val="center"/>
+              <w:rPr>
+                <w:color w:val="000000"/>
+                <w:sz w:val="16"/>
+                <w:szCs w:val="16"/>
+              </w:rPr>
+            </w:pPr>
+            <w:r>
+              <w:rPr>
+                <w:rFonts w:eastAsia="arial" w:ascii="arial" w:hAnsi="arial"/>
+                <w:color w:val="000000"/>
+                <w:sz w:val="16"/>
+                <w:szCs w:val="16"/>
+              </w:rPr>
+              <w:t>Engine Stop</w:t>
+            </w:r>
+          </w:p>
+        </w:tc>
+        <w:tc>
+          <w:tcPr>
+            <w:tcW w:w="1016" w:type="dxa"/>
+            <w:tcBorders>
+              <w:top w:val="single" w:sz="4" w:space="0" w:color="000000"/>
+              <w:left w:val="single" w:sz="4" w:space="0" w:color="000000"/>
+              <w:bottom w:val="single" w:sz="4" w:space="0" w:color="000000"/>
+            </w:tcBorders>
+            <w:vAlign w:val="bottom"/>
+          </w:tcPr>
+          <w:p>
+            <w:pPr>
+              <w:pStyle w:val="Normal"/>
+              <w:widowControl w:val="false"/>
+              <w:spacing w:lineRule="auto" w:line="180"/>
+              <w:jc w:val="center"/>
+              <w:rPr>
+                <w:color w:val="000000"/>
+                <w:sz w:val="16"/>
+                <w:szCs w:val="16"/>
+              </w:rPr>
+            </w:pPr>
+            <w:r>
+              <w:rPr>
+                <w:color w:val="000000"/>
+                <w:sz w:val="16"/>
+                <w:szCs w:val="16"/>
+              </w:rPr>
+            </w:r>
+          </w:p>
+        </w:tc>
+        <w:tc>
+          <w:tcPr>
+            <w:tcW w:w="1020" w:type="dxa"/>
+            <w:tcBorders>
+              <w:top w:val="single" w:sz="4" w:space="0" w:color="000000"/>
+              <w:left w:val="single" w:sz="4" w:space="0" w:color="000000"/>
+              <w:bottom w:val="single" w:sz="4" w:space="0" w:color="000000"/>
+            </w:tcBorders>
+            <w:vAlign w:val="bottom"/>
+          </w:tcPr>
+          <w:p>
+            <w:pPr>
+              <w:pStyle w:val="Normal"/>
+              <w:widowControl w:val="false"/>
+              <w:spacing w:lineRule="auto" w:line="180"/>
+              <w:jc w:val="center"/>
+              <w:rPr>
+                <w:color w:val="000000"/>
+                <w:sz w:val="16"/>
+                <w:szCs w:val="16"/>
+              </w:rPr>
+            </w:pPr>
+            <w:r>
+              <w:rPr>
+                <w:color w:val="000000"/>
+                <w:sz w:val="16"/>
+                <w:szCs w:val="16"/>
+              </w:rPr>
+            </w:r>
+          </w:p>
+        </w:tc>
+        <w:tc>
+          <w:tcPr>
+            <w:tcW w:w="1016" w:type="dxa"/>
+            <w:tcBorders>
+              <w:top w:val="single" w:sz="4" w:space="0" w:color="000000"/>
+              <w:left w:val="single" w:sz="4" w:space="0" w:color="000000"/>
+              <w:bottom w:val="single" w:sz="4" w:space="0" w:color="000000"/>
+            </w:tcBorders>
+            <w:vAlign w:val="bottom"/>
+          </w:tcPr>
+          <w:p>
+            <w:pPr>
+              <w:pStyle w:val="Normal"/>
+              <w:widowControl w:val="false"/>
+              <w:jc w:val="center"/>
+              <w:rPr>
+                <w:color w:val="000000"/>
+                <w:sz w:val="16"/>
+                <w:szCs w:val="16"/>
+              </w:rPr>
+            </w:pPr>
+            <w:r>
+              <w:rPr>
+                <w:color w:val="000000"/>
+                <w:sz w:val="16"/>
+                <w:szCs w:val="16"/>
+              </w:rPr>
+            </w:r>
+          </w:p>
+        </w:tc>
+        <w:tc>
+          <w:tcPr>
+            <w:tcW w:w="1016" w:type="dxa"/>
+            <w:tcBorders>
+              <w:top w:val="single" w:sz="4" w:space="0" w:color="000000"/>
+              <w:left w:val="single" w:sz="4" w:space="0" w:color="000000"/>
+              <w:bottom w:val="single" w:sz="4" w:space="0" w:color="000000"/>
+            </w:tcBorders>
+            <w:vAlign w:val="bottom"/>
+          </w:tcPr>
+          <w:p>
+            <w:pPr>
+              <w:pStyle w:val="Normal"/>
+              <w:widowControl w:val="false"/>
+              <w:jc w:val="center"/>
+              <w:rPr>
+                <w:color w:val="000000"/>
+                <w:sz w:val="16"/>
+                <w:szCs w:val="16"/>
+              </w:rPr>
+            </w:pPr>
+            <w:r>
+              <w:rPr>
+                <w:color w:val="000000"/>
+                <w:sz w:val="16"/>
+                <w:szCs w:val="16"/>
+              </w:rPr>
+            </w:r>
+          </w:p>
+        </w:tc>
+        <w:tc>
+          <w:tcPr>
+            <w:tcW w:w="1017" w:type="dxa"/>
+            <w:tcBorders>
+              <w:top w:val="single" w:sz="4" w:space="0" w:color="000000"/>
+              <w:left w:val="single" w:sz="4" w:space="0" w:color="000000"/>
+              <w:bottom w:val="single" w:sz="4" w:space="0" w:color="000000"/>
+            </w:tcBorders>
+            <w:vAlign w:val="bottom"/>
+          </w:tcPr>
+          <w:p>
+            <w:pPr>
+              <w:pStyle w:val="Normal"/>
+              <w:widowControl w:val="false"/>
+              <w:jc w:val="center"/>
+              <w:rPr>
+                <w:rFonts w:ascii="arial" w:hAnsi="arial" w:eastAsia="arial"/>
+                <w:color w:val="000000"/>
+                <w:sz w:val="16"/>
+                <w:szCs w:val="16"/>
+              </w:rPr>
+            </w:pPr>
+            <w:r>
+              <w:rPr>
+                <w:rFonts w:eastAsia="arial" w:ascii="arial" w:hAnsi="arial"/>
+                <w:color w:val="000000"/>
+                <w:sz w:val="16"/>
+                <w:szCs w:val="16"/>
+              </w:rPr>
+              <w:t>Vacuum Chamber</w:t>
+            </w:r>
+          </w:p>
+        </w:tc>
+        <w:tc>
+          <w:tcPr>
+            <w:tcW w:w="1016" w:type="dxa"/>
+            <w:tcBorders>
+              <w:top w:val="single" w:sz="4" w:space="0" w:color="000000"/>
+              <w:left w:val="single" w:sz="4" w:space="0" w:color="000000"/>
+              <w:bottom w:val="single" w:sz="4" w:space="0" w:color="000000"/>
+            </w:tcBorders>
+            <w:vAlign w:val="bottom"/>
+          </w:tcPr>
+          <w:p>
+            <w:pPr>
+              <w:pStyle w:val="Normal"/>
+              <w:widowControl w:val="false"/>
+              <w:jc w:val="center"/>
+              <w:rPr>
+                <w:color w:val="000000"/>
+                <w:sz w:val="16"/>
+                <w:szCs w:val="16"/>
+              </w:rPr>
+            </w:pPr>
+            <w:r>
+              <w:rPr>
+                <w:color w:val="000000"/>
+                <w:sz w:val="16"/>
+                <w:szCs w:val="16"/>
+              </w:rPr>
+              <w:t>Low Cent. Marker</w:t>
+            </w:r>
+          </w:p>
+        </w:tc>
+        <w:tc>
+          <w:tcPr>
+            <w:tcW w:w="1020" w:type="dxa"/>
+            <w:tcBorders>
+              <w:top w:val="single" w:sz="4" w:space="0" w:color="000000"/>
+              <w:left w:val="single" w:sz="4" w:space="0" w:color="000000"/>
+              <w:bottom w:val="single" w:sz="4" w:space="0" w:color="000000"/>
+            </w:tcBorders>
+            <w:vAlign w:val="bottom"/>
+          </w:tcPr>
+          <w:p>
+            <w:pPr>
+              <w:pStyle w:val="Normal"/>
+              <w:widowControl w:val="false"/>
+              <w:spacing w:lineRule="auto" w:line="180"/>
+              <w:jc w:val="center"/>
+              <w:rPr>
+                <w:sz w:val="16"/>
+                <w:szCs w:val="16"/>
+              </w:rPr>
+            </w:pPr>
+            <w:r>
+              <w:rPr>
+                <w:sz w:val="16"/>
+                <w:szCs w:val="16"/>
+              </w:rPr>
+              <w:t>Tail Light</w:t>
+            </w:r>
+          </w:p>
+        </w:tc>
+        <w:tc>
+          <w:tcPr>
+            <w:tcW w:w="1016" w:type="dxa"/>
+            <w:tcBorders>
+              <w:top w:val="single" w:sz="4" w:space="0" w:color="000000"/>
+              <w:left w:val="single" w:sz="4" w:space="0" w:color="000000"/>
+              <w:bottom w:val="single" w:sz="4" w:space="0" w:color="000000"/>
+            </w:tcBorders>
+            <w:vAlign w:val="bottom"/>
+          </w:tcPr>
+          <w:p>
+            <w:pPr>
+              <w:pStyle w:val="Normal"/>
+              <w:widowControl w:val="false"/>
+              <w:spacing w:lineRule="auto" w:line="180"/>
+              <w:jc w:val="center"/>
+              <w:rPr>
+                <w:sz w:val="16"/>
+                <w:szCs w:val="16"/>
+              </w:rPr>
+            </w:pPr>
+            <w:r>
+              <w:rPr>
+                <w:sz w:val="16"/>
+                <w:szCs w:val="16"/>
+              </w:rPr>
+              <w:t>Inst. Light</w:t>
+            </w:r>
+          </w:p>
+        </w:tc>
+        <w:tc>
+          <w:tcPr>
+            <w:tcW w:w="1016" w:type="dxa"/>
+            <w:tcBorders>
+              <w:top w:val="single" w:sz="4" w:space="0" w:color="000000"/>
+              <w:left w:val="single" w:sz="4" w:space="0" w:color="000000"/>
+              <w:bottom w:val="single" w:sz="4" w:space="0" w:color="000000"/>
+            </w:tcBorders>
+            <w:vAlign w:val="bottom"/>
+          </w:tcPr>
+          <w:p>
+            <w:pPr>
+              <w:pStyle w:val="Normal"/>
+              <w:widowControl w:val="false"/>
+              <w:spacing w:lineRule="auto" w:line="180"/>
+              <w:jc w:val="center"/>
+              <w:rPr>
+                <w:sz w:val="16"/>
+                <w:szCs w:val="16"/>
+              </w:rPr>
+            </w:pPr>
+            <w:r>
+              <w:rPr>
+                <w:sz w:val="16"/>
+                <w:szCs w:val="16"/>
+              </w:rPr>
+              <w:t>Handbrake Off</w:t>
+            </w:r>
+          </w:p>
+        </w:tc>
+        <w:tc>
+          <w:tcPr>
+            <w:tcW w:w="1016" w:type="dxa"/>
+            <w:tcBorders>
+              <w:top w:val="single" w:sz="4" w:space="0" w:color="000000"/>
+              <w:left w:val="single" w:sz="4" w:space="0" w:color="000000"/>
+              <w:bottom w:val="single" w:sz="4" w:space="0" w:color="000000"/>
+            </w:tcBorders>
+            <w:vAlign w:val="bottom"/>
+          </w:tcPr>
+          <w:p>
+            <w:pPr>
+              <w:pStyle w:val="Normal"/>
+              <w:widowControl w:val="false"/>
+              <w:spacing w:lineRule="auto" w:line="180"/>
+              <w:jc w:val="center"/>
+              <w:rPr>
+                <w:sz w:val="16"/>
+                <w:szCs w:val="16"/>
+              </w:rPr>
+            </w:pPr>
+            <w:r>
+              <w:rPr>
+                <w:rFonts w:eastAsia="arial" w:ascii="arial" w:hAnsi="arial"/>
+                <w:color w:val="000000"/>
+                <w:sz w:val="16"/>
+                <w:szCs w:val="16"/>
+              </w:rPr>
+              <w:t>Exterior</w:t>
+            </w:r>
+          </w:p>
+          <w:p>
+            <w:pPr>
+              <w:pStyle w:val="Normal"/>
+              <w:widowControl w:val="false"/>
+              <w:spacing w:lineRule="auto" w:line="180"/>
+              <w:jc w:val="center"/>
+              <w:rPr>
+                <w:sz w:val="16"/>
+                <w:szCs w:val="16"/>
+              </w:rPr>
+            </w:pPr>
+            <w:r>
+              <w:rPr>
+                <w:rFonts w:eastAsia="arial" w:ascii="arial" w:hAnsi="arial"/>
+                <w:color w:val="000000"/>
+                <w:sz w:val="16"/>
+                <w:szCs w:val="16"/>
+              </w:rPr>
+              <w:t>Camera</w:t>
+            </w:r>
+          </w:p>
+        </w:tc>
+        <w:tc>
+          <w:tcPr>
+            <w:tcW w:w="1029" w:type="dxa"/>
+            <w:tcBorders>
+              <w:top w:val="single" w:sz="4" w:space="0" w:color="000000"/>
+              <w:left w:val="single" w:sz="4" w:space="0" w:color="000000"/>
+              <w:bottom w:val="single" w:sz="4" w:space="0" w:color="000000"/>
+              <w:right w:val="single" w:sz="4" w:space="0" w:color="000000"/>
+            </w:tcBorders>
+            <w:vAlign w:val="bottom"/>
+          </w:tcPr>
+          <w:p>
+            <w:pPr>
+              <w:pStyle w:val="Normal"/>
+              <w:widowControl w:val="false"/>
+              <w:spacing w:lineRule="auto" w:line="180"/>
+              <w:jc w:val="center"/>
+              <w:rPr>
+                <w:sz w:val="16"/>
+                <w:szCs w:val="16"/>
+              </w:rPr>
+            </w:pPr>
+            <w:r>
+              <w:rPr>
+                <w:rFonts w:eastAsia="arial" w:ascii="arial" w:hAnsi="arial"/>
+                <w:color w:val="000000"/>
+                <w:sz w:val="16"/>
+                <w:szCs w:val="16"/>
+              </w:rPr>
+              <w:t>Prev</w:t>
+            </w:r>
+          </w:p>
+          <w:p>
+            <w:pPr>
+              <w:pStyle w:val="Normal"/>
+              <w:widowControl w:val="false"/>
+              <w:spacing w:lineRule="auto" w:line="180"/>
+              <w:jc w:val="center"/>
+              <w:rPr>
+                <w:sz w:val="16"/>
+                <w:szCs w:val="16"/>
+              </w:rPr>
+            </w:pPr>
+            <w:r>
+              <w:rPr>
+                <w:rFonts w:eastAsia="arial" w:ascii="arial" w:hAnsi="arial"/>
+                <w:color w:val="000000"/>
+                <w:sz w:val="16"/>
+                <w:szCs w:val="16"/>
+              </w:rPr>
+              <w:t>Cab Cam</w:t>
+            </w:r>
+          </w:p>
+        </w:tc>
+      </w:tr>
+    </w:tbl>
+    <w:p>
+      <w:pPr>
+        <w:pStyle w:val="Normal"/>
+        <w:rPr>
+          <w:color w:val="000000"/>
+          <w:sz w:val="16"/>
+          <w:szCs w:val="16"/>
+        </w:rPr>
+      </w:pPr>
+      <w:r>
+        <w:rPr>
+          <w:color w:val="000000"/>
+          <w:sz w:val="16"/>
+          <w:szCs w:val="16"/>
+        </w:rPr>
+      </w:r>
+    </w:p>
+    <w:p>
+      <w:pPr>
+        <w:pStyle w:val="Normal"/>
+        <w:rPr>
+          <w:color w:val="000000"/>
+          <w:sz w:val="16"/>
+          <w:szCs w:val="16"/>
+        </w:rPr>
+      </w:pPr>
+      <w:r>
+        <w:rPr>
+          <w:color w:val="000000"/>
+          <w:sz w:val="16"/>
+          <w:szCs w:val="16"/>
+        </w:rPr>
+        <w:tab/>
+        <w:t xml:space="preserve">       </w:t>
       </w:r>
       <w:r>
         <w:rPr>
@@ -5643,7 +6736,16 @@
           <w:sz w:val="16"/>
           <w:szCs w:val="16"/>
         </w:rPr>
-        <w:t>40</w:t>
+        <w:t xml:space="preserve">    Class 4</w:t>
+      </w:r>
+      <w:r>
+        <w:rPr>
+          <w:rFonts w:eastAsia="arial" w:ascii="arial" w:hAnsi="arial"/>
+          <w:color w:val="000000"/>
+          <w:sz w:val="16"/>
+          <w:szCs w:val="16"/>
+        </w:rPr>
+        <w:t>3 HST</w:t>
       </w:r>
       <w:r>
         <w:rPr>
@@ -5817,7 +6919,15 @@
                 <w:sz w:val="16"/>
                 <w:szCs w:val="16"/>
               </w:rPr>
-              <w:t>AWS</w:t>
+              <w:t>AWS/</w:t>
+            </w:r>
+            <w:r>
+              <w:rPr>
+                <w:color w:val="000000"/>
+                <w:sz w:val="16"/>
+                <w:szCs w:val="16"/>
+              </w:rPr>
+              <w:t>TPWS</w:t>
             </w:r>
           </w:p>
         </w:tc>
@@ -5849,7 +6959,7 @@
                 <w:sz w:val="16"/>
                 <w:szCs w:val="16"/>
               </w:rPr>
-              <w:t>AWS Cab Change</w:t>
+              <w:t>Train Supply On</w:t>
             </w:r>
           </w:p>
         </w:tc>
@@ -5880,6 +6990,7 @@
                 <w:sz w:val="16"/>
                 <w:szCs w:val="16"/>
               </w:rPr>
+              <w:t>DRA</w:t>
             </w:r>
           </w:p>
         </w:tc>
@@ -5910,6 +7021,7 @@
                 <w:sz w:val="16"/>
                 <w:szCs w:val="16"/>
               </w:rPr>
+              <w:t>Headlight Flash</w:t>
             </w:r>
           </w:p>
         </w:tc>
@@ -5941,7 +7053,7 @@
                 <w:sz w:val="16"/>
                 <w:szCs w:val="16"/>
               </w:rPr>
-              <w:t>Brake Selector</w:t>
+              <w:t>Gauge Light Up</w:t>
             </w:r>
           </w:p>
         </w:tc>
@@ -5972,7 +7084,7 @@
                 <w:sz w:val="16"/>
                 <w:szCs w:val="16"/>
               </w:rPr>
-              <w:t>Top Marker</w:t>
+              <w:t>Slow Speed Up</w:t>
             </w:r>
           </w:p>
         </w:tc>
@@ -6063,7 +7175,14 @@
                 <w:sz w:val="16"/>
                 <w:szCs w:val="16"/>
               </w:rPr>
-              <w:t>Handbrake On</w:t>
+              <w:t xml:space="preserve">Parking Brake </w:t>
+            </w:r>
+            <w:r>
+              <w:rPr>
+                <w:sz w:val="16"/>
+                <w:szCs w:val="16"/>
+              </w:rPr>
+              <w:t>On</w:t>
             </w:r>
           </w:p>
         </w:tc>
@@ -6191,7 +7310,7 @@
           <w:szCs w:val="16"/>
         </w:rPr>
         <w:tab/>
-        <w:t xml:space="preserve">           Class </w:t>
+        <w:t xml:space="preserve">           Class 4</w:t>
       </w:r>
       <w:r>
         <w:rPr>
@@ -6200,7 +7319,7 @@
           <w:sz w:val="16"/>
           <w:szCs w:val="16"/>
         </w:rPr>
-        <w:t>40</w:t>
+        <w:t>3 HST</w:t>
       </w:r>
       <w:r>
         <w:rPr>
@@ -6373,6 +7492,7 @@
                 <w:sz w:val="16"/>
                 <w:szCs w:val="16"/>
               </w:rPr>
+              <w:t>DSD</w:t>
             </w:r>
           </w:p>
         </w:tc>
@@ -6393,17 +7513,16 @@
               <w:spacing w:lineRule="auto" w:line="180"/>
               <w:jc w:val="center"/>
               <w:rPr>
-                <w:color w:val="000000"/>
-                <w:sz w:val="16"/>
-                <w:szCs w:val="16"/>
-              </w:rPr>
-            </w:pPr>
-            <w:r>
-              <w:rPr>
-                <w:color w:val="000000"/>
-                <w:sz w:val="16"/>
-                <w:szCs w:val="16"/>
-              </w:rPr>
+                <w:sz w:val="16"/>
+                <w:szCs w:val="16"/>
+              </w:rPr>
+            </w:pPr>
+            <w:r>
+              <w:rPr>
+                <w:sz w:val="16"/>
+                <w:szCs w:val="16"/>
+              </w:rPr>
+              <w:t>Train Supply Off</w:t>
             </w:r>
           </w:p>
         </w:tc>
@@ -6434,6 +7553,7 @@
                 <w:sz w:val="16"/>
                 <w:szCs w:val="16"/>
               </w:rPr>
+              <w:t>Train Sup. Dim</w:t>
             </w:r>
           </w:p>
         </w:tc>
@@ -6483,7 +7603,6 @@
               <w:widowControl w:val="false"/>
               <w:jc w:val="center"/>
               <w:rPr>
-                <w:rFonts w:ascii="arial" w:hAnsi="arial" w:eastAsia="arial"/>
                 <w:color w:val="000000"/>
                 <w:sz w:val="16"/>
                 <w:szCs w:val="16"/>
@@ -6496,7 +7615,7 @@
                 <w:sz w:val="16"/>
                 <w:szCs w:val="16"/>
               </w:rPr>
-              <w:t>Vacuum Chamber</w:t>
+              <w:t>Gauge Light Dw.</w:t>
             </w:r>
           </w:p>
         </w:tc>
@@ -6527,7 +7646,7 @@
                 <w:sz w:val="16"/>
                 <w:szCs w:val="16"/>
               </w:rPr>
-              <w:t>Low Cent. Marker</w:t>
+              <w:t>Slow Speed Dw</w:t>
             </w:r>
           </w:p>
         </w:tc>
@@ -6553,11 +7672,7 @@
               </w:rPr>
             </w:pPr>
             <w:r>
-              <w:rPr>
-                <w:sz w:val="16"/>
-                <w:szCs w:val="16"/>
-              </w:rPr>
-              <w:t>Tail Light</w:t>
+              <w:rPr/>
             </w:r>
           </w:p>
         </w:tc>
@@ -6587,7 +7702,7 @@
                 <w:sz w:val="16"/>
                 <w:szCs w:val="16"/>
               </w:rPr>
-              <w:t>Inst. Light</w:t>
+              <w:t>Desk Light</w:t>
             </w:r>
           </w:p>
         </w:tc>
@@ -6617,7 +7732,14 @@
                 <w:sz w:val="16"/>
                 <w:szCs w:val="16"/>
               </w:rPr>
-              <w:t>Handbrake Off</w:t>
+              <w:t>Parking Brake</w:t>
+            </w:r>
+            <w:r>
+              <w:rPr>
+                <w:sz w:val="16"/>
+                <w:szCs w:val="16"/>
+              </w:rPr>
+              <w:t xml:space="preserve"> Off</w:t>
             </w:r>
           </w:p>
         </w:tc>
@@ -7768,12 +8890,12 @@
       <w:rFonts w:ascii="Symbol" w:hAnsi="Symbol" w:cs="Symbol"/>
     </w:rPr>
   </w:style>
-  <w:style w:type="character" w:styleId="Style5" w:customStyle="1">
-    <w:name w:val="번호 매기기 기호"/>
+  <w:style w:type="character" w:styleId="user" w:customStyle="1">
+    <w:name w:val="번호 매기기 기호 (user)"/>
     <w:qFormat/>
     <w:rPr/>
   </w:style>
-  <w:style w:type="paragraph" w:styleId="Style6">
+  <w:style w:type="paragraph" w:styleId="Style5">
     <w:name w:val="제목"/>
     <w:basedOn w:val="Normal"/>
     <w:next w:val="BodyText"/>
@@ -7783,7 +8905,7 @@
       <w:spacing w:before="240" w:after="120"/>
     </w:pPr>
     <w:rPr>
-      <w:rFonts w:ascii="Liberation Sans" w:hAnsi="Liberation Sans" w:eastAsia="나눔고딕" w:cs="Arial"/>
+      <w:rFonts w:ascii="Liberation Sans" w:hAnsi="Liberation Sans" w:eastAsia="Noto Sans CJK KR" w:cs="Lohit Devanagari"/>
       <w:sz w:val="28"/>
       <w:szCs w:val="28"/>
     </w:rPr>
@@ -7820,7 +8942,7 @@
       <w:szCs w:val="24"/>
     </w:rPr>
   </w:style>
-  <w:style w:type="paragraph" w:styleId="Style7">
+  <w:style w:type="paragraph" w:styleId="Style6" w:customStyle="1">
     <w:name w:val="색인"/>
     <w:basedOn w:val="Normal"/>
     <w:qFormat/>
@@ -7828,11 +8950,10 @@
       <w:suppressLineNumbers/>
     </w:pPr>
     <w:rPr>
-      <w:rFonts w:cs="Arial"/>
-      <w:sz w:val="24"/>
+      <w:rFonts w:cs="Lohit Devanagari"/>
     </w:rPr>
   </w:style>
-  <w:style w:type="paragraph" w:styleId="user">
+  <w:style w:type="paragraph" w:styleId="user1">
     <w:name w:val="제목 (user)"/>
     <w:basedOn w:val="Normal"/>
     <w:next w:val="BodyText"/>
@@ -7842,12 +8963,12 @@
       <w:spacing w:before="240" w:after="120"/>
     </w:pPr>
     <w:rPr>
-      <w:rFonts w:ascii="Liberation Sans" w:hAnsi="Liberation Sans" w:eastAsia="Noto Sans CJK KR" w:cs="Lohit Devanagari"/>
+      <w:rFonts w:ascii="Liberation Sans" w:hAnsi="Liberation Sans" w:eastAsia="나눔고딕" w:cs="Arial"/>
       <w:sz w:val="28"/>
       <w:szCs w:val="28"/>
     </w:rPr>
   </w:style>
-  <w:style w:type="paragraph" w:styleId="user1" w:customStyle="1">
+  <w:style w:type="paragraph" w:styleId="user2">
     <w:name w:val="색인 (user)"/>
     <w:basedOn w:val="Normal"/>
     <w:qFormat/>
@@ -7855,7 +8976,8 @@
       <w:suppressLineNumbers/>
     </w:pPr>
     <w:rPr>
-      <w:rFonts w:cs="Lohit Devanagari"/>
+      <w:rFonts w:cs="Arial"/>
+      <w:sz w:val="24"/>
     </w:rPr>
   </w:style>
   <w:style w:type="paragraph" w:styleId="Title">
@@ -8537,8 +9659,8 @@
       <w:szCs w:val="24"/>
     </w:rPr>
   </w:style>
-  <w:style w:type="paragraph" w:styleId="user2" w:customStyle="1">
-    <w:name w:val="표 내용 (user)"/>
+  <w:style w:type="paragraph" w:styleId="Style7" w:customStyle="1">
+    <w:name w:val="표 내용"/>
     <w:basedOn w:val="Normal"/>
     <w:qFormat/>
     <w:pPr>
@@ -8546,9 +9668,9 @@
     </w:pPr>
     <w:rPr/>
   </w:style>
-  <w:style w:type="paragraph" w:styleId="user3" w:customStyle="1">
-    <w:name w:val="표제목 (user)"/>
-    <w:basedOn w:val="user2"/>
+  <w:style w:type="paragraph" w:styleId="Style8" w:customStyle="1">
+    <w:name w:val="표제목"/>
+    <w:basedOn w:val="Style7"/>
     <w:qFormat/>
     <w:pPr>
       <w:jc w:val="center"/>
@@ -8558,8 +9680,8 @@
       <w:bCs/>
     </w:rPr>
   </w:style>
-  <w:style w:type="paragraph" w:styleId="Style8">
-    <w:name w:val="표 내용"/>
+  <w:style w:type="paragraph" w:styleId="user3">
+    <w:name w:val="표 내용 (user)"/>
     <w:basedOn w:val="Normal"/>
     <w:qFormat/>
     <w:pPr>
@@ -8568,9 +9690,9 @@
     </w:pPr>
     <w:rPr/>
   </w:style>
-  <w:style w:type="paragraph" w:styleId="Style9">
-    <w:name w:val="표제목"/>
-    <w:basedOn w:val="Style8"/>
+  <w:style w:type="paragraph" w:styleId="user4">
+    <w:name w:val="표제목 (user)"/>
+    <w:basedOn w:val="user3"/>
     <w:qFormat/>
     <w:pPr>
       <w:suppressLineNumbers/>

</xml_diff>

<commit_message>
Add Class 45 and 47
</commit_message>
<xml_diff>
--- a/raildriver-UK-Remapped.docx
+++ b/raildriver-UK-Remapped.docx
@@ -6736,25 +6736,7 @@
           <w:sz w:val="16"/>
           <w:szCs w:val="16"/>
         </w:rPr>
-        <w:t xml:space="preserve">    Class 4</w:t>
-      </w:r>
-      <w:r>
-        <w:rPr>
-          <w:rFonts w:eastAsia="arial" w:ascii="arial" w:hAnsi="arial"/>
-          <w:color w:val="000000"/>
-          <w:sz w:val="16"/>
-          <w:szCs w:val="16"/>
-        </w:rPr>
-        <w:t>3 HST</w:t>
-      </w:r>
-      <w:r>
-        <w:rPr>
-          <w:rFonts w:eastAsia="arial" w:ascii="arial" w:hAnsi="arial"/>
-          <w:color w:val="000000"/>
-          <w:sz w:val="16"/>
-          <w:szCs w:val="16"/>
-        </w:rPr>
-        <w:t>-1</w:t>
+        <w:t xml:space="preserve">    Class 43 HST-1</w:t>
       </w:r>
     </w:p>
     <w:tbl>
@@ -6919,15 +6901,7 @@
                 <w:sz w:val="16"/>
                 <w:szCs w:val="16"/>
               </w:rPr>
-              <w:t>AWS/</w:t>
-            </w:r>
-            <w:r>
-              <w:rPr>
-                <w:color w:val="000000"/>
-                <w:sz w:val="16"/>
-                <w:szCs w:val="16"/>
-              </w:rPr>
-              <w:t>TPWS</w:t>
+              <w:t>AWS/TPWS</w:t>
             </w:r>
           </w:p>
         </w:tc>
@@ -7175,14 +7149,7 @@
                 <w:sz w:val="16"/>
                 <w:szCs w:val="16"/>
               </w:rPr>
-              <w:t xml:space="preserve">Parking Brake </w:t>
-            </w:r>
-            <w:r>
-              <w:rPr>
-                <w:sz w:val="16"/>
-                <w:szCs w:val="16"/>
-              </w:rPr>
-              <w:t>On</w:t>
+              <w:t>Parking Brake On</w:t>
             </w:r>
           </w:p>
         </w:tc>
@@ -7310,7 +7277,560 @@
           <w:szCs w:val="16"/>
         </w:rPr>
         <w:tab/>
-        <w:t xml:space="preserve">           Class 4</w:t>
+        <w:t xml:space="preserve">           Class 43 HST-2</w:t>
+      </w:r>
+    </w:p>
+    <w:tbl>
+      <w:tblPr>
+        <w:tblW w:w="14248" w:type="dxa"/>
+        <w:jc w:val="left"/>
+        <w:tblInd w:w="-5" w:type="dxa"/>
+        <w:tblLayout w:type="fixed"/>
+        <w:tblCellMar>
+          <w:top w:w="0" w:type="dxa"/>
+          <w:left w:w="108" w:type="dxa"/>
+          <w:bottom w:w="0" w:type="dxa"/>
+          <w:right w:w="108" w:type="dxa"/>
+        </w:tblCellMar>
+        <w:tblLook w:firstRow="1" w:noVBand="1" w:lastRow="0" w:firstColumn="1" w:lastColumn="0" w:noHBand="0" w:val="04a0"/>
+      </w:tblPr>
+      <w:tblGrid>
+        <w:gridCol w:w="1017"/>
+        <w:gridCol w:w="1019"/>
+        <w:gridCol w:w="1014"/>
+        <w:gridCol w:w="1016"/>
+        <w:gridCol w:w="1020"/>
+        <w:gridCol w:w="1016"/>
+        <w:gridCol w:w="1016"/>
+        <w:gridCol w:w="1017"/>
+        <w:gridCol w:w="1016"/>
+        <w:gridCol w:w="1020"/>
+        <w:gridCol w:w="1016"/>
+        <w:gridCol w:w="1016"/>
+        <w:gridCol w:w="1016"/>
+        <w:gridCol w:w="1029"/>
+      </w:tblGrid>
+      <w:tr>
+        <w:trPr>
+          <w:trHeight w:val="440" w:hRule="exact"/>
+          <w:cantSplit w:val="true"/>
+        </w:trPr>
+        <w:tc>
+          <w:tcPr>
+            <w:tcW w:w="1017" w:type="dxa"/>
+            <w:tcBorders>
+              <w:top w:val="single" w:sz="4" w:space="0" w:color="000000"/>
+              <w:left w:val="single" w:sz="4" w:space="0" w:color="000000"/>
+              <w:bottom w:val="single" w:sz="4" w:space="0" w:color="000000"/>
+            </w:tcBorders>
+            <w:vAlign w:val="bottom"/>
+          </w:tcPr>
+          <w:p>
+            <w:pPr>
+              <w:pStyle w:val="Normal"/>
+              <w:widowControl w:val="false"/>
+              <w:spacing w:lineRule="auto" w:line="180" w:before="0" w:after="60"/>
+              <w:jc w:val="center"/>
+              <w:rPr>
+                <w:b/>
+                <w:bCs/>
+              </w:rPr>
+            </w:pPr>
+            <w:r>
+              <w:rPr>
+                <w:b/>
+                <w:bCs/>
+                <w:color w:val="000000"/>
+                <w:sz w:val="16"/>
+                <w:szCs w:val="16"/>
+              </w:rPr>
+              <w:t>HUD</w:t>
+            </w:r>
+          </w:p>
+        </w:tc>
+        <w:tc>
+          <w:tcPr>
+            <w:tcW w:w="1019" w:type="dxa"/>
+            <w:tcBorders>
+              <w:top w:val="single" w:sz="4" w:space="0" w:color="000000"/>
+              <w:left w:val="single" w:sz="4" w:space="0" w:color="000000"/>
+              <w:bottom w:val="single" w:sz="4" w:space="0" w:color="000000"/>
+            </w:tcBorders>
+            <w:vAlign w:val="bottom"/>
+          </w:tcPr>
+          <w:p>
+            <w:pPr>
+              <w:pStyle w:val="Normal"/>
+              <w:widowControl w:val="false"/>
+              <w:spacing w:lineRule="auto" w:line="180"/>
+              <w:jc w:val="center"/>
+              <w:rPr>
+                <w:color w:val="000000"/>
+                <w:sz w:val="16"/>
+                <w:szCs w:val="16"/>
+              </w:rPr>
+            </w:pPr>
+            <w:r>
+              <w:rPr>
+                <w:color w:val="000000"/>
+                <w:sz w:val="16"/>
+                <w:szCs w:val="16"/>
+              </w:rPr>
+              <w:t>Schedule</w:t>
+            </w:r>
+          </w:p>
+        </w:tc>
+        <w:tc>
+          <w:tcPr>
+            <w:tcW w:w="1014" w:type="dxa"/>
+            <w:tcBorders>
+              <w:top w:val="single" w:sz="4" w:space="0" w:color="000000"/>
+              <w:left w:val="single" w:sz="4" w:space="0" w:color="000000"/>
+              <w:bottom w:val="single" w:sz="4" w:space="0" w:color="000000"/>
+            </w:tcBorders>
+            <w:vAlign w:val="bottom"/>
+          </w:tcPr>
+          <w:p>
+            <w:pPr>
+              <w:pStyle w:val="Normal"/>
+              <w:widowControl w:val="false"/>
+              <w:spacing w:lineRule="auto" w:line="180"/>
+              <w:jc w:val="center"/>
+              <w:rPr>
+                <w:color w:val="000000"/>
+                <w:sz w:val="16"/>
+                <w:szCs w:val="16"/>
+              </w:rPr>
+            </w:pPr>
+            <w:r>
+              <w:rPr>
+                <w:rFonts w:eastAsia="arial" w:ascii="arial" w:hAnsi="arial"/>
+                <w:color w:val="000000"/>
+                <w:sz w:val="16"/>
+                <w:szCs w:val="16"/>
+              </w:rPr>
+              <w:t>Engine Stop</w:t>
+            </w:r>
+          </w:p>
+        </w:tc>
+        <w:tc>
+          <w:tcPr>
+            <w:tcW w:w="1016" w:type="dxa"/>
+            <w:tcBorders>
+              <w:top w:val="single" w:sz="4" w:space="0" w:color="000000"/>
+              <w:left w:val="single" w:sz="4" w:space="0" w:color="000000"/>
+              <w:bottom w:val="single" w:sz="4" w:space="0" w:color="000000"/>
+            </w:tcBorders>
+            <w:vAlign w:val="bottom"/>
+          </w:tcPr>
+          <w:p>
+            <w:pPr>
+              <w:pStyle w:val="Normal"/>
+              <w:widowControl w:val="false"/>
+              <w:spacing w:lineRule="auto" w:line="180"/>
+              <w:jc w:val="center"/>
+              <w:rPr>
+                <w:color w:val="000000"/>
+                <w:sz w:val="16"/>
+                <w:szCs w:val="16"/>
+              </w:rPr>
+            </w:pPr>
+            <w:r>
+              <w:rPr>
+                <w:color w:val="000000"/>
+                <w:sz w:val="16"/>
+                <w:szCs w:val="16"/>
+              </w:rPr>
+              <w:t>DSD</w:t>
+            </w:r>
+          </w:p>
+        </w:tc>
+        <w:tc>
+          <w:tcPr>
+            <w:tcW w:w="1020" w:type="dxa"/>
+            <w:tcBorders>
+              <w:top w:val="single" w:sz="4" w:space="0" w:color="000000"/>
+              <w:left w:val="single" w:sz="4" w:space="0" w:color="000000"/>
+              <w:bottom w:val="single" w:sz="4" w:space="0" w:color="000000"/>
+            </w:tcBorders>
+            <w:vAlign w:val="bottom"/>
+          </w:tcPr>
+          <w:p>
+            <w:pPr>
+              <w:pStyle w:val="Normal"/>
+              <w:widowControl w:val="false"/>
+              <w:spacing w:lineRule="auto" w:line="180"/>
+              <w:jc w:val="center"/>
+              <w:rPr>
+                <w:sz w:val="16"/>
+                <w:szCs w:val="16"/>
+              </w:rPr>
+            </w:pPr>
+            <w:r>
+              <w:rPr>
+                <w:sz w:val="16"/>
+                <w:szCs w:val="16"/>
+              </w:rPr>
+              <w:t>Train Supply Off</w:t>
+            </w:r>
+          </w:p>
+        </w:tc>
+        <w:tc>
+          <w:tcPr>
+            <w:tcW w:w="1016" w:type="dxa"/>
+            <w:tcBorders>
+              <w:top w:val="single" w:sz="4" w:space="0" w:color="000000"/>
+              <w:left w:val="single" w:sz="4" w:space="0" w:color="000000"/>
+              <w:bottom w:val="single" w:sz="4" w:space="0" w:color="000000"/>
+            </w:tcBorders>
+            <w:vAlign w:val="bottom"/>
+          </w:tcPr>
+          <w:p>
+            <w:pPr>
+              <w:pStyle w:val="Normal"/>
+              <w:widowControl w:val="false"/>
+              <w:jc w:val="center"/>
+              <w:rPr>
+                <w:color w:val="000000"/>
+                <w:sz w:val="16"/>
+                <w:szCs w:val="16"/>
+              </w:rPr>
+            </w:pPr>
+            <w:r>
+              <w:rPr>
+                <w:color w:val="000000"/>
+                <w:sz w:val="16"/>
+                <w:szCs w:val="16"/>
+              </w:rPr>
+              <w:t>Train Sup. Dim</w:t>
+            </w:r>
+          </w:p>
+        </w:tc>
+        <w:tc>
+          <w:tcPr>
+            <w:tcW w:w="1016" w:type="dxa"/>
+            <w:tcBorders>
+              <w:top w:val="single" w:sz="4" w:space="0" w:color="000000"/>
+              <w:left w:val="single" w:sz="4" w:space="0" w:color="000000"/>
+              <w:bottom w:val="single" w:sz="4" w:space="0" w:color="000000"/>
+            </w:tcBorders>
+            <w:vAlign w:val="bottom"/>
+          </w:tcPr>
+          <w:p>
+            <w:pPr>
+              <w:pStyle w:val="Normal"/>
+              <w:widowControl w:val="false"/>
+              <w:jc w:val="center"/>
+              <w:rPr>
+                <w:color w:val="000000"/>
+                <w:sz w:val="16"/>
+                <w:szCs w:val="16"/>
+              </w:rPr>
+            </w:pPr>
+            <w:r>
+              <w:rPr>
+                <w:color w:val="000000"/>
+                <w:sz w:val="16"/>
+                <w:szCs w:val="16"/>
+              </w:rPr>
+            </w:r>
+          </w:p>
+        </w:tc>
+        <w:tc>
+          <w:tcPr>
+            <w:tcW w:w="1017" w:type="dxa"/>
+            <w:tcBorders>
+              <w:top w:val="single" w:sz="4" w:space="0" w:color="000000"/>
+              <w:left w:val="single" w:sz="4" w:space="0" w:color="000000"/>
+              <w:bottom w:val="single" w:sz="4" w:space="0" w:color="000000"/>
+            </w:tcBorders>
+            <w:vAlign w:val="bottom"/>
+          </w:tcPr>
+          <w:p>
+            <w:pPr>
+              <w:pStyle w:val="Normal"/>
+              <w:widowControl w:val="false"/>
+              <w:jc w:val="center"/>
+              <w:rPr>
+                <w:color w:val="000000"/>
+                <w:sz w:val="16"/>
+                <w:szCs w:val="16"/>
+              </w:rPr>
+            </w:pPr>
+            <w:r>
+              <w:rPr>
+                <w:rFonts w:eastAsia="arial" w:ascii="arial" w:hAnsi="arial"/>
+                <w:color w:val="000000"/>
+                <w:sz w:val="16"/>
+                <w:szCs w:val="16"/>
+              </w:rPr>
+              <w:t>Gauge Light Dw.</w:t>
+            </w:r>
+          </w:p>
+        </w:tc>
+        <w:tc>
+          <w:tcPr>
+            <w:tcW w:w="1016" w:type="dxa"/>
+            <w:tcBorders>
+              <w:top w:val="single" w:sz="4" w:space="0" w:color="000000"/>
+              <w:left w:val="single" w:sz="4" w:space="0" w:color="000000"/>
+              <w:bottom w:val="single" w:sz="4" w:space="0" w:color="000000"/>
+            </w:tcBorders>
+            <w:vAlign w:val="bottom"/>
+          </w:tcPr>
+          <w:p>
+            <w:pPr>
+              <w:pStyle w:val="Normal"/>
+              <w:widowControl w:val="false"/>
+              <w:jc w:val="center"/>
+              <w:rPr>
+                <w:color w:val="000000"/>
+                <w:sz w:val="16"/>
+                <w:szCs w:val="16"/>
+              </w:rPr>
+            </w:pPr>
+            <w:r>
+              <w:rPr>
+                <w:color w:val="000000"/>
+                <w:sz w:val="16"/>
+                <w:szCs w:val="16"/>
+              </w:rPr>
+              <w:t>Slow Speed Dw</w:t>
+            </w:r>
+          </w:p>
+        </w:tc>
+        <w:tc>
+          <w:tcPr>
+            <w:tcW w:w="1020" w:type="dxa"/>
+            <w:tcBorders>
+              <w:top w:val="single" w:sz="4" w:space="0" w:color="000000"/>
+              <w:left w:val="single" w:sz="4" w:space="0" w:color="000000"/>
+              <w:bottom w:val="single" w:sz="4" w:space="0" w:color="000000"/>
+            </w:tcBorders>
+            <w:vAlign w:val="bottom"/>
+          </w:tcPr>
+          <w:p>
+            <w:pPr>
+              <w:pStyle w:val="Normal"/>
+              <w:widowControl w:val="false"/>
+              <w:spacing w:lineRule="auto" w:line="180"/>
+              <w:jc w:val="center"/>
+              <w:rPr>
+                <w:sz w:val="16"/>
+                <w:szCs w:val="16"/>
+              </w:rPr>
+            </w:pPr>
+            <w:r>
+              <w:rPr>
+                <w:sz w:val="16"/>
+                <w:szCs w:val="16"/>
+              </w:rPr>
+            </w:r>
+          </w:p>
+        </w:tc>
+        <w:tc>
+          <w:tcPr>
+            <w:tcW w:w="1016" w:type="dxa"/>
+            <w:tcBorders>
+              <w:top w:val="single" w:sz="4" w:space="0" w:color="000000"/>
+              <w:left w:val="single" w:sz="4" w:space="0" w:color="000000"/>
+              <w:bottom w:val="single" w:sz="4" w:space="0" w:color="000000"/>
+            </w:tcBorders>
+            <w:vAlign w:val="bottom"/>
+          </w:tcPr>
+          <w:p>
+            <w:pPr>
+              <w:pStyle w:val="Normal"/>
+              <w:widowControl w:val="false"/>
+              <w:spacing w:lineRule="auto" w:line="180"/>
+              <w:jc w:val="center"/>
+              <w:rPr>
+                <w:sz w:val="16"/>
+                <w:szCs w:val="16"/>
+              </w:rPr>
+            </w:pPr>
+            <w:r>
+              <w:rPr>
+                <w:sz w:val="16"/>
+                <w:szCs w:val="16"/>
+              </w:rPr>
+              <w:t>Desk Light</w:t>
+            </w:r>
+          </w:p>
+        </w:tc>
+        <w:tc>
+          <w:tcPr>
+            <w:tcW w:w="1016" w:type="dxa"/>
+            <w:tcBorders>
+              <w:top w:val="single" w:sz="4" w:space="0" w:color="000000"/>
+              <w:left w:val="single" w:sz="4" w:space="0" w:color="000000"/>
+              <w:bottom w:val="single" w:sz="4" w:space="0" w:color="000000"/>
+            </w:tcBorders>
+            <w:vAlign w:val="bottom"/>
+          </w:tcPr>
+          <w:p>
+            <w:pPr>
+              <w:pStyle w:val="Normal"/>
+              <w:widowControl w:val="false"/>
+              <w:spacing w:lineRule="auto" w:line="180"/>
+              <w:jc w:val="center"/>
+              <w:rPr>
+                <w:sz w:val="16"/>
+                <w:szCs w:val="16"/>
+              </w:rPr>
+            </w:pPr>
+            <w:r>
+              <w:rPr>
+                <w:sz w:val="16"/>
+                <w:szCs w:val="16"/>
+              </w:rPr>
+              <w:t>Parking Brake Off</w:t>
+            </w:r>
+          </w:p>
+        </w:tc>
+        <w:tc>
+          <w:tcPr>
+            <w:tcW w:w="1016" w:type="dxa"/>
+            <w:tcBorders>
+              <w:top w:val="single" w:sz="4" w:space="0" w:color="000000"/>
+              <w:left w:val="single" w:sz="4" w:space="0" w:color="000000"/>
+              <w:bottom w:val="single" w:sz="4" w:space="0" w:color="000000"/>
+            </w:tcBorders>
+            <w:vAlign w:val="bottom"/>
+          </w:tcPr>
+          <w:p>
+            <w:pPr>
+              <w:pStyle w:val="Normal"/>
+              <w:widowControl w:val="false"/>
+              <w:spacing w:lineRule="auto" w:line="180"/>
+              <w:jc w:val="center"/>
+              <w:rPr>
+                <w:sz w:val="16"/>
+                <w:szCs w:val="16"/>
+              </w:rPr>
+            </w:pPr>
+            <w:r>
+              <w:rPr>
+                <w:rFonts w:eastAsia="arial" w:ascii="arial" w:hAnsi="arial"/>
+                <w:color w:val="000000"/>
+                <w:sz w:val="16"/>
+                <w:szCs w:val="16"/>
+              </w:rPr>
+              <w:t>Exterior</w:t>
+            </w:r>
+          </w:p>
+          <w:p>
+            <w:pPr>
+              <w:pStyle w:val="Normal"/>
+              <w:widowControl w:val="false"/>
+              <w:spacing w:lineRule="auto" w:line="180"/>
+              <w:jc w:val="center"/>
+              <w:rPr>
+                <w:sz w:val="16"/>
+                <w:szCs w:val="16"/>
+              </w:rPr>
+            </w:pPr>
+            <w:r>
+              <w:rPr>
+                <w:rFonts w:eastAsia="arial" w:ascii="arial" w:hAnsi="arial"/>
+                <w:color w:val="000000"/>
+                <w:sz w:val="16"/>
+                <w:szCs w:val="16"/>
+              </w:rPr>
+              <w:t>Camera</w:t>
+            </w:r>
+          </w:p>
+        </w:tc>
+        <w:tc>
+          <w:tcPr>
+            <w:tcW w:w="1029" w:type="dxa"/>
+            <w:tcBorders>
+              <w:top w:val="single" w:sz="4" w:space="0" w:color="000000"/>
+              <w:left w:val="single" w:sz="4" w:space="0" w:color="000000"/>
+              <w:bottom w:val="single" w:sz="4" w:space="0" w:color="000000"/>
+              <w:right w:val="single" w:sz="4" w:space="0" w:color="000000"/>
+            </w:tcBorders>
+            <w:vAlign w:val="bottom"/>
+          </w:tcPr>
+          <w:p>
+            <w:pPr>
+              <w:pStyle w:val="Normal"/>
+              <w:widowControl w:val="false"/>
+              <w:spacing w:lineRule="auto" w:line="180"/>
+              <w:jc w:val="center"/>
+              <w:rPr>
+                <w:sz w:val="16"/>
+                <w:szCs w:val="16"/>
+              </w:rPr>
+            </w:pPr>
+            <w:r>
+              <w:rPr>
+                <w:rFonts w:eastAsia="arial" w:ascii="arial" w:hAnsi="arial"/>
+                <w:color w:val="000000"/>
+                <w:sz w:val="16"/>
+                <w:szCs w:val="16"/>
+              </w:rPr>
+              <w:t>Prev</w:t>
+            </w:r>
+          </w:p>
+          <w:p>
+            <w:pPr>
+              <w:pStyle w:val="Normal"/>
+              <w:widowControl w:val="false"/>
+              <w:spacing w:lineRule="auto" w:line="180"/>
+              <w:jc w:val="center"/>
+              <w:rPr>
+                <w:sz w:val="16"/>
+                <w:szCs w:val="16"/>
+              </w:rPr>
+            </w:pPr>
+            <w:r>
+              <w:rPr>
+                <w:rFonts w:eastAsia="arial" w:ascii="arial" w:hAnsi="arial"/>
+                <w:color w:val="000000"/>
+                <w:sz w:val="16"/>
+                <w:szCs w:val="16"/>
+              </w:rPr>
+              <w:t>Cab Cam</w:t>
+            </w:r>
+          </w:p>
+        </w:tc>
+      </w:tr>
+    </w:tbl>
+    <w:p>
+      <w:pPr>
+        <w:pStyle w:val="Normal"/>
+        <w:rPr>
+          <w:color w:val="000000"/>
+          <w:sz w:val="16"/>
+          <w:szCs w:val="16"/>
+        </w:rPr>
+      </w:pPr>
+      <w:r>
+        <w:rPr>
+          <w:color w:val="000000"/>
+          <w:sz w:val="16"/>
+          <w:szCs w:val="16"/>
+        </w:rPr>
+      </w:r>
+    </w:p>
+    <w:p>
+      <w:pPr>
+        <w:pStyle w:val="Normal"/>
+        <w:rPr>
+          <w:color w:val="000000"/>
+          <w:sz w:val="16"/>
+          <w:szCs w:val="16"/>
+        </w:rPr>
+      </w:pPr>
+      <w:r>
+        <w:rPr>
+          <w:color w:val="000000"/>
+          <w:sz w:val="16"/>
+          <w:szCs w:val="16"/>
+        </w:rPr>
+        <w:tab/>
+        <w:t xml:space="preserve">       </w:t>
       </w:r>
       <w:r>
         <w:rPr>
@@ -7319,7 +7839,568 @@
           <w:sz w:val="16"/>
           <w:szCs w:val="16"/>
         </w:rPr>
-        <w:t>3 HST</w:t>
+        <w:t xml:space="preserve">    Class </w:t>
+      </w:r>
+      <w:r>
+        <w:rPr>
+          <w:rFonts w:eastAsia="arial" w:ascii="arial" w:hAnsi="arial"/>
+          <w:color w:val="000000"/>
+          <w:sz w:val="16"/>
+          <w:szCs w:val="16"/>
+        </w:rPr>
+        <w:t>45</w:t>
+      </w:r>
+      <w:r>
+        <w:rPr>
+          <w:rFonts w:eastAsia="arial" w:ascii="arial" w:hAnsi="arial"/>
+          <w:color w:val="000000"/>
+          <w:sz w:val="16"/>
+          <w:szCs w:val="16"/>
+        </w:rPr>
+        <w:t>-1</w:t>
+      </w:r>
+    </w:p>
+    <w:tbl>
+      <w:tblPr>
+        <w:tblW w:w="14248" w:type="dxa"/>
+        <w:jc w:val="left"/>
+        <w:tblInd w:w="-5" w:type="dxa"/>
+        <w:tblLayout w:type="fixed"/>
+        <w:tblCellMar>
+          <w:top w:w="0" w:type="dxa"/>
+          <w:left w:w="108" w:type="dxa"/>
+          <w:bottom w:w="0" w:type="dxa"/>
+          <w:right w:w="108" w:type="dxa"/>
+        </w:tblCellMar>
+        <w:tblLook w:firstRow="1" w:noVBand="1" w:lastRow="0" w:firstColumn="1" w:lastColumn="0" w:noHBand="0" w:val="04a0"/>
+      </w:tblPr>
+      <w:tblGrid>
+        <w:gridCol w:w="1017"/>
+        <w:gridCol w:w="1019"/>
+        <w:gridCol w:w="1014"/>
+        <w:gridCol w:w="1016"/>
+        <w:gridCol w:w="1020"/>
+        <w:gridCol w:w="1016"/>
+        <w:gridCol w:w="1016"/>
+        <w:gridCol w:w="1017"/>
+        <w:gridCol w:w="1016"/>
+        <w:gridCol w:w="1020"/>
+        <w:gridCol w:w="1016"/>
+        <w:gridCol w:w="1016"/>
+        <w:gridCol w:w="1016"/>
+        <w:gridCol w:w="1029"/>
+      </w:tblGrid>
+      <w:tr>
+        <w:trPr>
+          <w:trHeight w:val="440" w:hRule="exact"/>
+          <w:cantSplit w:val="true"/>
+        </w:trPr>
+        <w:tc>
+          <w:tcPr>
+            <w:tcW w:w="1017" w:type="dxa"/>
+            <w:tcBorders>
+              <w:top w:val="single" w:sz="4" w:space="0" w:color="000000"/>
+              <w:left w:val="single" w:sz="4" w:space="0" w:color="000000"/>
+              <w:bottom w:val="single" w:sz="4" w:space="0" w:color="000000"/>
+            </w:tcBorders>
+            <w:vAlign w:val="bottom"/>
+          </w:tcPr>
+          <w:p>
+            <w:pPr>
+              <w:pStyle w:val="Normal"/>
+              <w:widowControl w:val="false"/>
+              <w:spacing w:lineRule="auto" w:line="180" w:before="0" w:after="60"/>
+              <w:jc w:val="center"/>
+              <w:rPr>
+                <w:color w:val="000000"/>
+                <w:sz w:val="16"/>
+                <w:szCs w:val="16"/>
+              </w:rPr>
+            </w:pPr>
+            <w:r>
+              <w:rPr>
+                <w:rFonts w:eastAsia="arial" w:ascii="arial" w:hAnsi="arial"/>
+                <w:b/>
+                <w:color w:val="000000"/>
+                <w:sz w:val="16"/>
+                <w:szCs w:val="16"/>
+              </w:rPr>
+              <w:t>Pause</w:t>
+            </w:r>
+          </w:p>
+        </w:tc>
+        <w:tc>
+          <w:tcPr>
+            <w:tcW w:w="1019" w:type="dxa"/>
+            <w:tcBorders>
+              <w:top w:val="single" w:sz="4" w:space="0" w:color="000000"/>
+              <w:left w:val="single" w:sz="4" w:space="0" w:color="000000"/>
+              <w:bottom w:val="single" w:sz="4" w:space="0" w:color="000000"/>
+            </w:tcBorders>
+            <w:vAlign w:val="bottom"/>
+          </w:tcPr>
+          <w:p>
+            <w:pPr>
+              <w:pStyle w:val="Normal"/>
+              <w:widowControl w:val="false"/>
+              <w:spacing w:lineRule="auto" w:line="180"/>
+              <w:jc w:val="center"/>
+              <w:rPr>
+                <w:color w:val="000000"/>
+                <w:sz w:val="16"/>
+                <w:szCs w:val="16"/>
+              </w:rPr>
+            </w:pPr>
+            <w:r>
+              <w:rPr>
+                <w:color w:val="000000"/>
+                <w:sz w:val="16"/>
+                <w:szCs w:val="16"/>
+              </w:rPr>
+              <w:t>Master Key</w:t>
+            </w:r>
+          </w:p>
+        </w:tc>
+        <w:tc>
+          <w:tcPr>
+            <w:tcW w:w="1014" w:type="dxa"/>
+            <w:tcBorders>
+              <w:top w:val="single" w:sz="4" w:space="0" w:color="000000"/>
+              <w:left w:val="single" w:sz="4" w:space="0" w:color="000000"/>
+              <w:bottom w:val="single" w:sz="4" w:space="0" w:color="000000"/>
+            </w:tcBorders>
+            <w:vAlign w:val="bottom"/>
+          </w:tcPr>
+          <w:p>
+            <w:pPr>
+              <w:pStyle w:val="Normal"/>
+              <w:widowControl w:val="false"/>
+              <w:spacing w:lineRule="auto" w:line="180"/>
+              <w:jc w:val="center"/>
+              <w:rPr>
+                <w:color w:val="000000"/>
+                <w:sz w:val="16"/>
+                <w:szCs w:val="16"/>
+              </w:rPr>
+            </w:pPr>
+            <w:r>
+              <w:rPr>
+                <w:rFonts w:eastAsia="arial" w:ascii="arial" w:hAnsi="arial"/>
+                <w:color w:val="000000"/>
+                <w:sz w:val="16"/>
+                <w:szCs w:val="16"/>
+              </w:rPr>
+              <w:t>Engine Start</w:t>
+            </w:r>
+          </w:p>
+        </w:tc>
+        <w:tc>
+          <w:tcPr>
+            <w:tcW w:w="1016" w:type="dxa"/>
+            <w:tcBorders>
+              <w:top w:val="single" w:sz="4" w:space="0" w:color="000000"/>
+              <w:left w:val="single" w:sz="4" w:space="0" w:color="000000"/>
+              <w:bottom w:val="single" w:sz="4" w:space="0" w:color="000000"/>
+            </w:tcBorders>
+            <w:vAlign w:val="bottom"/>
+          </w:tcPr>
+          <w:p>
+            <w:pPr>
+              <w:pStyle w:val="Normal"/>
+              <w:widowControl w:val="false"/>
+              <w:spacing w:lineRule="auto" w:line="180"/>
+              <w:jc w:val="center"/>
+              <w:rPr>
+                <w:color w:val="000000"/>
+                <w:sz w:val="16"/>
+                <w:szCs w:val="16"/>
+              </w:rPr>
+            </w:pPr>
+            <w:r>
+              <w:rPr>
+                <w:color w:val="000000"/>
+                <w:sz w:val="16"/>
+                <w:szCs w:val="16"/>
+              </w:rPr>
+              <w:t>AWS</w:t>
+            </w:r>
+          </w:p>
+        </w:tc>
+        <w:tc>
+          <w:tcPr>
+            <w:tcW w:w="1020" w:type="dxa"/>
+            <w:tcBorders>
+              <w:top w:val="single" w:sz="4" w:space="0" w:color="000000"/>
+              <w:left w:val="single" w:sz="4" w:space="0" w:color="000000"/>
+              <w:bottom w:val="single" w:sz="4" w:space="0" w:color="000000"/>
+            </w:tcBorders>
+            <w:vAlign w:val="bottom"/>
+          </w:tcPr>
+          <w:p>
+            <w:pPr>
+              <w:pStyle w:val="Normal"/>
+              <w:widowControl w:val="false"/>
+              <w:spacing w:lineRule="auto" w:line="180"/>
+              <w:jc w:val="center"/>
+              <w:rPr>
+                <w:color w:val="000000"/>
+                <w:sz w:val="16"/>
+                <w:szCs w:val="16"/>
+              </w:rPr>
+            </w:pPr>
+            <w:r>
+              <w:rPr>
+                <w:color w:val="000000"/>
+                <w:sz w:val="16"/>
+                <w:szCs w:val="16"/>
+              </w:rPr>
+              <w:t>AWS Cab Change</w:t>
+            </w:r>
+          </w:p>
+        </w:tc>
+        <w:tc>
+          <w:tcPr>
+            <w:tcW w:w="1016" w:type="dxa"/>
+            <w:tcBorders>
+              <w:top w:val="single" w:sz="4" w:space="0" w:color="000000"/>
+              <w:left w:val="single" w:sz="4" w:space="0" w:color="000000"/>
+              <w:bottom w:val="single" w:sz="4" w:space="0" w:color="000000"/>
+            </w:tcBorders>
+            <w:vAlign w:val="bottom"/>
+          </w:tcPr>
+          <w:p>
+            <w:pPr>
+              <w:pStyle w:val="Normal"/>
+              <w:widowControl w:val="false"/>
+              <w:jc w:val="center"/>
+              <w:rPr>
+                <w:color w:val="000000"/>
+                <w:sz w:val="16"/>
+                <w:szCs w:val="16"/>
+              </w:rPr>
+            </w:pPr>
+            <w:r>
+              <w:rPr/>
+            </w:r>
+          </w:p>
+        </w:tc>
+        <w:tc>
+          <w:tcPr>
+            <w:tcW w:w="1016" w:type="dxa"/>
+            <w:tcBorders>
+              <w:top w:val="single" w:sz="4" w:space="0" w:color="000000"/>
+              <w:left w:val="single" w:sz="4" w:space="0" w:color="000000"/>
+              <w:bottom w:val="single" w:sz="4" w:space="0" w:color="000000"/>
+            </w:tcBorders>
+            <w:vAlign w:val="bottom"/>
+          </w:tcPr>
+          <w:p>
+            <w:pPr>
+              <w:pStyle w:val="Normal"/>
+              <w:widowControl w:val="false"/>
+              <w:jc w:val="center"/>
+              <w:rPr>
+                <w:color w:val="000000"/>
+                <w:sz w:val="16"/>
+                <w:szCs w:val="16"/>
+              </w:rPr>
+            </w:pPr>
+            <w:r>
+              <w:rPr>
+                <w:color w:val="000000"/>
+                <w:sz w:val="16"/>
+                <w:szCs w:val="16"/>
+              </w:rPr>
+            </w:r>
+          </w:p>
+        </w:tc>
+        <w:tc>
+          <w:tcPr>
+            <w:tcW w:w="1017" w:type="dxa"/>
+            <w:tcBorders>
+              <w:top w:val="single" w:sz="4" w:space="0" w:color="000000"/>
+              <w:left w:val="single" w:sz="4" w:space="0" w:color="000000"/>
+              <w:bottom w:val="single" w:sz="4" w:space="0" w:color="000000"/>
+            </w:tcBorders>
+            <w:vAlign w:val="bottom"/>
+          </w:tcPr>
+          <w:p>
+            <w:pPr>
+              <w:pStyle w:val="Normal"/>
+              <w:widowControl w:val="false"/>
+              <w:jc w:val="center"/>
+              <w:rPr>
+                <w:color w:val="000000"/>
+                <w:sz w:val="16"/>
+                <w:szCs w:val="16"/>
+              </w:rPr>
+            </w:pPr>
+            <w:r>
+              <w:rPr>
+                <w:rFonts w:eastAsia="arial" w:ascii="arial" w:hAnsi="arial"/>
+                <w:color w:val="000000"/>
+                <w:sz w:val="16"/>
+                <w:szCs w:val="16"/>
+              </w:rPr>
+              <w:t>Brake Selector</w:t>
+            </w:r>
+          </w:p>
+        </w:tc>
+        <w:tc>
+          <w:tcPr>
+            <w:tcW w:w="1016" w:type="dxa"/>
+            <w:tcBorders>
+              <w:top w:val="single" w:sz="4" w:space="0" w:color="000000"/>
+              <w:left w:val="single" w:sz="4" w:space="0" w:color="000000"/>
+              <w:bottom w:val="single" w:sz="4" w:space="0" w:color="000000"/>
+            </w:tcBorders>
+            <w:vAlign w:val="bottom"/>
+          </w:tcPr>
+          <w:p>
+            <w:pPr>
+              <w:pStyle w:val="Normal"/>
+              <w:widowControl w:val="false"/>
+              <w:jc w:val="center"/>
+              <w:rPr>
+                <w:color w:val="000000"/>
+                <w:sz w:val="16"/>
+                <w:szCs w:val="16"/>
+              </w:rPr>
+            </w:pPr>
+            <w:r>
+              <w:rPr>
+                <w:color w:val="000000"/>
+                <w:sz w:val="16"/>
+                <w:szCs w:val="16"/>
+              </w:rPr>
+            </w:r>
+          </w:p>
+        </w:tc>
+        <w:tc>
+          <w:tcPr>
+            <w:tcW w:w="1020" w:type="dxa"/>
+            <w:tcBorders>
+              <w:top w:val="single" w:sz="4" w:space="0" w:color="000000"/>
+              <w:left w:val="single" w:sz="4" w:space="0" w:color="000000"/>
+              <w:bottom w:val="single" w:sz="4" w:space="0" w:color="000000"/>
+            </w:tcBorders>
+            <w:vAlign w:val="bottom"/>
+          </w:tcPr>
+          <w:p>
+            <w:pPr>
+              <w:pStyle w:val="Normal"/>
+              <w:widowControl w:val="false"/>
+              <w:spacing w:lineRule="auto" w:line="180"/>
+              <w:jc w:val="center"/>
+              <w:rPr>
+                <w:sz w:val="16"/>
+                <w:szCs w:val="16"/>
+              </w:rPr>
+            </w:pPr>
+            <w:r>
+              <w:rPr>
+                <w:sz w:val="16"/>
+                <w:szCs w:val="16"/>
+              </w:rPr>
+            </w:r>
+          </w:p>
+        </w:tc>
+        <w:tc>
+          <w:tcPr>
+            <w:tcW w:w="1016" w:type="dxa"/>
+            <w:tcBorders>
+              <w:top w:val="single" w:sz="4" w:space="0" w:color="000000"/>
+              <w:left w:val="single" w:sz="4" w:space="0" w:color="000000"/>
+              <w:bottom w:val="single" w:sz="4" w:space="0" w:color="000000"/>
+            </w:tcBorders>
+            <w:vAlign w:val="bottom"/>
+          </w:tcPr>
+          <w:p>
+            <w:pPr>
+              <w:pStyle w:val="Normal"/>
+              <w:widowControl w:val="false"/>
+              <w:spacing w:lineRule="auto" w:line="180"/>
+              <w:jc w:val="center"/>
+              <w:rPr>
+                <w:sz w:val="16"/>
+                <w:szCs w:val="16"/>
+              </w:rPr>
+            </w:pPr>
+            <w:r>
+              <w:rPr>
+                <w:rFonts w:eastAsia="arial" w:ascii="arial" w:hAnsi="arial"/>
+                <w:color w:val="000000"/>
+                <w:sz w:val="16"/>
+                <w:szCs w:val="16"/>
+              </w:rPr>
+              <w:t>Cab Light</w:t>
+            </w:r>
+          </w:p>
+        </w:tc>
+        <w:tc>
+          <w:tcPr>
+            <w:tcW w:w="1016" w:type="dxa"/>
+            <w:tcBorders>
+              <w:top w:val="single" w:sz="4" w:space="0" w:color="000000"/>
+              <w:left w:val="single" w:sz="4" w:space="0" w:color="000000"/>
+              <w:bottom w:val="single" w:sz="4" w:space="0" w:color="000000"/>
+            </w:tcBorders>
+            <w:vAlign w:val="bottom"/>
+          </w:tcPr>
+          <w:p>
+            <w:pPr>
+              <w:pStyle w:val="Normal"/>
+              <w:widowControl w:val="false"/>
+              <w:spacing w:lineRule="auto" w:line="180"/>
+              <w:jc w:val="center"/>
+              <w:rPr>
+                <w:sz w:val="16"/>
+                <w:szCs w:val="16"/>
+              </w:rPr>
+            </w:pPr>
+            <w:r>
+              <w:rPr>
+                <w:sz w:val="16"/>
+                <w:szCs w:val="16"/>
+              </w:rPr>
+              <w:t>Handbrake On</w:t>
+            </w:r>
+          </w:p>
+        </w:tc>
+        <w:tc>
+          <w:tcPr>
+            <w:tcW w:w="1016" w:type="dxa"/>
+            <w:tcBorders>
+              <w:top w:val="single" w:sz="4" w:space="0" w:color="000000"/>
+              <w:left w:val="single" w:sz="4" w:space="0" w:color="000000"/>
+              <w:bottom w:val="single" w:sz="4" w:space="0" w:color="000000"/>
+            </w:tcBorders>
+            <w:vAlign w:val="bottom"/>
+          </w:tcPr>
+          <w:p>
+            <w:pPr>
+              <w:pStyle w:val="Normal"/>
+              <w:widowControl w:val="false"/>
+              <w:spacing w:lineRule="auto" w:line="180"/>
+              <w:jc w:val="center"/>
+              <w:rPr>
+                <w:sz w:val="16"/>
+                <w:szCs w:val="16"/>
+              </w:rPr>
+            </w:pPr>
+            <w:r>
+              <w:rPr>
+                <w:rFonts w:eastAsia="arial" w:ascii="arial" w:hAnsi="arial"/>
+                <w:color w:val="000000"/>
+                <w:sz w:val="16"/>
+                <w:szCs w:val="16"/>
+              </w:rPr>
+              <w:t>1-Person</w:t>
+            </w:r>
+          </w:p>
+        </w:tc>
+        <w:tc>
+          <w:tcPr>
+            <w:tcW w:w="1029" w:type="dxa"/>
+            <w:tcBorders>
+              <w:top w:val="single" w:sz="4" w:space="0" w:color="000000"/>
+              <w:left w:val="single" w:sz="4" w:space="0" w:color="000000"/>
+              <w:bottom w:val="single" w:sz="4" w:space="0" w:color="000000"/>
+              <w:right w:val="single" w:sz="4" w:space="0" w:color="000000"/>
+            </w:tcBorders>
+            <w:vAlign w:val="bottom"/>
+          </w:tcPr>
+          <w:p>
+            <w:pPr>
+              <w:pStyle w:val="Normal"/>
+              <w:widowControl w:val="false"/>
+              <w:spacing w:lineRule="auto" w:line="180"/>
+              <w:jc w:val="center"/>
+              <w:rPr>
+                <w:sz w:val="16"/>
+                <w:szCs w:val="16"/>
+              </w:rPr>
+            </w:pPr>
+            <w:r>
+              <w:rPr>
+                <w:rFonts w:eastAsia="arial" w:ascii="arial" w:hAnsi="arial"/>
+                <w:color w:val="000000"/>
+                <w:sz w:val="16"/>
+                <w:szCs w:val="16"/>
+              </w:rPr>
+              <w:t>Next</w:t>
+            </w:r>
+          </w:p>
+          <w:p>
+            <w:pPr>
+              <w:pStyle w:val="Normal"/>
+              <w:widowControl w:val="false"/>
+              <w:spacing w:lineRule="auto" w:line="180"/>
+              <w:jc w:val="center"/>
+              <w:rPr>
+                <w:sz w:val="16"/>
+                <w:szCs w:val="16"/>
+              </w:rPr>
+            </w:pPr>
+            <w:r>
+              <w:rPr>
+                <w:rFonts w:eastAsia="arial" w:ascii="arial" w:hAnsi="arial"/>
+                <w:color w:val="000000"/>
+                <w:sz w:val="16"/>
+                <w:szCs w:val="16"/>
+              </w:rPr>
+              <w:t>Cab Cam</w:t>
+            </w:r>
+          </w:p>
+        </w:tc>
+      </w:tr>
+    </w:tbl>
+    <w:p>
+      <w:pPr>
+        <w:pStyle w:val="Normal"/>
+        <w:rPr>
+          <w:rFonts w:ascii="arial" w:hAnsi="arial" w:eastAsia="arial"/>
+          <w:color w:val="000000"/>
+          <w:sz w:val="16"/>
+          <w:szCs w:val="16"/>
+        </w:rPr>
+      </w:pPr>
+      <w:r>
+        <w:rPr>
+          <w:rFonts w:eastAsia="arial" w:ascii="arial" w:hAnsi="arial"/>
+          <w:color w:val="000000"/>
+          <w:sz w:val="16"/>
+          <w:szCs w:val="16"/>
+        </w:rPr>
+      </w:r>
+    </w:p>
+    <w:p>
+      <w:pPr>
+        <w:pStyle w:val="Normal"/>
+        <w:rPr>
+          <w:color w:val="000000"/>
+          <w:sz w:val="16"/>
+          <w:szCs w:val="16"/>
+        </w:rPr>
+      </w:pPr>
+      <w:r>
+        <w:rPr>
+          <w:rFonts w:eastAsia="arial" w:ascii="arial" w:hAnsi="arial"/>
+          <w:color w:val="000000"/>
+          <w:sz w:val="16"/>
+          <w:szCs w:val="16"/>
+        </w:rPr>
+        <w:tab/>
+        <w:t xml:space="preserve">           Class </w:t>
+      </w:r>
+      <w:r>
+        <w:rPr>
+          <w:rFonts w:eastAsia="arial" w:ascii="arial" w:hAnsi="arial"/>
+          <w:color w:val="000000"/>
+          <w:sz w:val="16"/>
+          <w:szCs w:val="16"/>
+        </w:rPr>
+        <w:t>45</w:t>
       </w:r>
       <w:r>
         <w:rPr>
@@ -7513,47 +8594,47 @@
               <w:spacing w:lineRule="auto" w:line="180"/>
               <w:jc w:val="center"/>
               <w:rPr>
-                <w:sz w:val="16"/>
-                <w:szCs w:val="16"/>
-              </w:rPr>
-            </w:pPr>
-            <w:r>
-              <w:rPr>
-                <w:sz w:val="16"/>
-                <w:szCs w:val="16"/>
-              </w:rPr>
-              <w:t>Train Supply Off</w:t>
-            </w:r>
-          </w:p>
-        </w:tc>
-        <w:tc>
-          <w:tcPr>
-            <w:tcW w:w="1016" w:type="dxa"/>
-            <w:tcBorders>
-              <w:top w:val="single" w:sz="4" w:space="0" w:color="000000"/>
-              <w:left w:val="single" w:sz="4" w:space="0" w:color="000000"/>
-              <w:bottom w:val="single" w:sz="4" w:space="0" w:color="000000"/>
-            </w:tcBorders>
-            <w:vAlign w:val="bottom"/>
-          </w:tcPr>
-          <w:p>
-            <w:pPr>
-              <w:pStyle w:val="Normal"/>
-              <w:widowControl w:val="false"/>
-              <w:jc w:val="center"/>
-              <w:rPr>
-                <w:color w:val="000000"/>
-                <w:sz w:val="16"/>
-                <w:szCs w:val="16"/>
-              </w:rPr>
-            </w:pPr>
-            <w:r>
-              <w:rPr>
-                <w:color w:val="000000"/>
-                <w:sz w:val="16"/>
-                <w:szCs w:val="16"/>
-              </w:rPr>
-              <w:t>Train Sup. Dim</w:t>
+                <w:color w:val="000000"/>
+                <w:sz w:val="16"/>
+                <w:szCs w:val="16"/>
+              </w:rPr>
+            </w:pPr>
+            <w:r>
+              <w:rPr>
+                <w:color w:val="000000"/>
+                <w:sz w:val="16"/>
+                <w:szCs w:val="16"/>
+              </w:rPr>
+            </w:r>
+          </w:p>
+        </w:tc>
+        <w:tc>
+          <w:tcPr>
+            <w:tcW w:w="1016" w:type="dxa"/>
+            <w:tcBorders>
+              <w:top w:val="single" w:sz="4" w:space="0" w:color="000000"/>
+              <w:left w:val="single" w:sz="4" w:space="0" w:color="000000"/>
+              <w:bottom w:val="single" w:sz="4" w:space="0" w:color="000000"/>
+            </w:tcBorders>
+            <w:vAlign w:val="bottom"/>
+          </w:tcPr>
+          <w:p>
+            <w:pPr>
+              <w:pStyle w:val="Normal"/>
+              <w:widowControl w:val="false"/>
+              <w:jc w:val="center"/>
+              <w:rPr>
+                <w:color w:val="000000"/>
+                <w:sz w:val="16"/>
+                <w:szCs w:val="16"/>
+              </w:rPr>
+            </w:pPr>
+            <w:r>
+              <w:rPr>
+                <w:color w:val="000000"/>
+                <w:sz w:val="16"/>
+                <w:szCs w:val="16"/>
+              </w:rPr>
             </w:r>
           </w:p>
         </w:tc>
@@ -7603,50 +8684,50 @@
               <w:widowControl w:val="false"/>
               <w:jc w:val="center"/>
               <w:rPr>
-                <w:color w:val="000000"/>
-                <w:sz w:val="16"/>
-                <w:szCs w:val="16"/>
-              </w:rPr>
-            </w:pPr>
-            <w:r>
-              <w:rPr>
-                <w:rFonts w:eastAsia="arial" w:ascii="arial" w:hAnsi="arial"/>
-                <w:color w:val="000000"/>
-                <w:sz w:val="16"/>
-                <w:szCs w:val="16"/>
-              </w:rPr>
-              <w:t>Gauge Light Dw.</w:t>
-            </w:r>
-          </w:p>
-        </w:tc>
-        <w:tc>
-          <w:tcPr>
-            <w:tcW w:w="1016" w:type="dxa"/>
-            <w:tcBorders>
-              <w:top w:val="single" w:sz="4" w:space="0" w:color="000000"/>
-              <w:left w:val="single" w:sz="4" w:space="0" w:color="000000"/>
-              <w:bottom w:val="single" w:sz="4" w:space="0" w:color="000000"/>
-            </w:tcBorders>
-            <w:vAlign w:val="bottom"/>
-          </w:tcPr>
-          <w:p>
-            <w:pPr>
-              <w:pStyle w:val="Normal"/>
-              <w:widowControl w:val="false"/>
-              <w:jc w:val="center"/>
-              <w:rPr>
-                <w:color w:val="000000"/>
-                <w:sz w:val="16"/>
-                <w:szCs w:val="16"/>
-              </w:rPr>
-            </w:pPr>
-            <w:r>
-              <w:rPr>
-                <w:color w:val="000000"/>
-                <w:sz w:val="16"/>
-                <w:szCs w:val="16"/>
-              </w:rPr>
-              <w:t>Slow Speed Dw</w:t>
+                <w:rFonts w:ascii="arial" w:hAnsi="arial" w:eastAsia="arial"/>
+                <w:color w:val="000000"/>
+                <w:sz w:val="16"/>
+                <w:szCs w:val="16"/>
+              </w:rPr>
+            </w:pPr>
+            <w:r>
+              <w:rPr>
+                <w:rFonts w:eastAsia="arial" w:ascii="arial" w:hAnsi="arial"/>
+                <w:color w:val="000000"/>
+                <w:sz w:val="16"/>
+                <w:szCs w:val="16"/>
+              </w:rPr>
+              <w:t>Vacuum Chamber</w:t>
+            </w:r>
+          </w:p>
+        </w:tc>
+        <w:tc>
+          <w:tcPr>
+            <w:tcW w:w="1016" w:type="dxa"/>
+            <w:tcBorders>
+              <w:top w:val="single" w:sz="4" w:space="0" w:color="000000"/>
+              <w:left w:val="single" w:sz="4" w:space="0" w:color="000000"/>
+              <w:bottom w:val="single" w:sz="4" w:space="0" w:color="000000"/>
+            </w:tcBorders>
+            <w:vAlign w:val="bottom"/>
+          </w:tcPr>
+          <w:p>
+            <w:pPr>
+              <w:pStyle w:val="Normal"/>
+              <w:widowControl w:val="false"/>
+              <w:jc w:val="center"/>
+              <w:rPr>
+                <w:color w:val="000000"/>
+                <w:sz w:val="16"/>
+                <w:szCs w:val="16"/>
+              </w:rPr>
+            </w:pPr>
+            <w:r>
+              <w:rPr>
+                <w:color w:val="000000"/>
+                <w:sz w:val="16"/>
+                <w:szCs w:val="16"/>
+              </w:rPr>
             </w:r>
           </w:p>
         </w:tc>
@@ -7672,6 +8753,466 @@
               </w:rPr>
             </w:pPr>
             <w:r>
+              <w:rPr>
+                <w:sz w:val="16"/>
+                <w:szCs w:val="16"/>
+              </w:rPr>
+              <w:t>Tail Light</w:t>
+            </w:r>
+          </w:p>
+        </w:tc>
+        <w:tc>
+          <w:tcPr>
+            <w:tcW w:w="1016" w:type="dxa"/>
+            <w:tcBorders>
+              <w:top w:val="single" w:sz="4" w:space="0" w:color="000000"/>
+              <w:left w:val="single" w:sz="4" w:space="0" w:color="000000"/>
+              <w:bottom w:val="single" w:sz="4" w:space="0" w:color="000000"/>
+            </w:tcBorders>
+            <w:vAlign w:val="bottom"/>
+          </w:tcPr>
+          <w:p>
+            <w:pPr>
+              <w:pStyle w:val="Normal"/>
+              <w:widowControl w:val="false"/>
+              <w:spacing w:lineRule="auto" w:line="180"/>
+              <w:jc w:val="center"/>
+              <w:rPr>
+                <w:sz w:val="16"/>
+                <w:szCs w:val="16"/>
+              </w:rPr>
+            </w:pPr>
+            <w:r>
+              <w:rPr>
+                <w:sz w:val="16"/>
+                <w:szCs w:val="16"/>
+              </w:rPr>
+              <w:t>Inst. Light</w:t>
+            </w:r>
+          </w:p>
+        </w:tc>
+        <w:tc>
+          <w:tcPr>
+            <w:tcW w:w="1016" w:type="dxa"/>
+            <w:tcBorders>
+              <w:top w:val="single" w:sz="4" w:space="0" w:color="000000"/>
+              <w:left w:val="single" w:sz="4" w:space="0" w:color="000000"/>
+              <w:bottom w:val="single" w:sz="4" w:space="0" w:color="000000"/>
+            </w:tcBorders>
+            <w:vAlign w:val="bottom"/>
+          </w:tcPr>
+          <w:p>
+            <w:pPr>
+              <w:pStyle w:val="Normal"/>
+              <w:widowControl w:val="false"/>
+              <w:spacing w:lineRule="auto" w:line="180"/>
+              <w:jc w:val="center"/>
+              <w:rPr>
+                <w:sz w:val="16"/>
+                <w:szCs w:val="16"/>
+              </w:rPr>
+            </w:pPr>
+            <w:r>
+              <w:rPr>
+                <w:sz w:val="16"/>
+                <w:szCs w:val="16"/>
+              </w:rPr>
+              <w:t>Handbrake Off</w:t>
+            </w:r>
+          </w:p>
+        </w:tc>
+        <w:tc>
+          <w:tcPr>
+            <w:tcW w:w="1016" w:type="dxa"/>
+            <w:tcBorders>
+              <w:top w:val="single" w:sz="4" w:space="0" w:color="000000"/>
+              <w:left w:val="single" w:sz="4" w:space="0" w:color="000000"/>
+              <w:bottom w:val="single" w:sz="4" w:space="0" w:color="000000"/>
+            </w:tcBorders>
+            <w:vAlign w:val="bottom"/>
+          </w:tcPr>
+          <w:p>
+            <w:pPr>
+              <w:pStyle w:val="Normal"/>
+              <w:widowControl w:val="false"/>
+              <w:spacing w:lineRule="auto" w:line="180"/>
+              <w:jc w:val="center"/>
+              <w:rPr>
+                <w:sz w:val="16"/>
+                <w:szCs w:val="16"/>
+              </w:rPr>
+            </w:pPr>
+            <w:r>
+              <w:rPr>
+                <w:rFonts w:eastAsia="arial" w:ascii="arial" w:hAnsi="arial"/>
+                <w:color w:val="000000"/>
+                <w:sz w:val="16"/>
+                <w:szCs w:val="16"/>
+              </w:rPr>
+              <w:t>Exterior</w:t>
+            </w:r>
+          </w:p>
+          <w:p>
+            <w:pPr>
+              <w:pStyle w:val="Normal"/>
+              <w:widowControl w:val="false"/>
+              <w:spacing w:lineRule="auto" w:line="180"/>
+              <w:jc w:val="center"/>
+              <w:rPr>
+                <w:sz w:val="16"/>
+                <w:szCs w:val="16"/>
+              </w:rPr>
+            </w:pPr>
+            <w:r>
+              <w:rPr>
+                <w:rFonts w:eastAsia="arial" w:ascii="arial" w:hAnsi="arial"/>
+                <w:color w:val="000000"/>
+                <w:sz w:val="16"/>
+                <w:szCs w:val="16"/>
+              </w:rPr>
+              <w:t>Camera</w:t>
+            </w:r>
+          </w:p>
+        </w:tc>
+        <w:tc>
+          <w:tcPr>
+            <w:tcW w:w="1029" w:type="dxa"/>
+            <w:tcBorders>
+              <w:top w:val="single" w:sz="4" w:space="0" w:color="000000"/>
+              <w:left w:val="single" w:sz="4" w:space="0" w:color="000000"/>
+              <w:bottom w:val="single" w:sz="4" w:space="0" w:color="000000"/>
+              <w:right w:val="single" w:sz="4" w:space="0" w:color="000000"/>
+            </w:tcBorders>
+            <w:vAlign w:val="bottom"/>
+          </w:tcPr>
+          <w:p>
+            <w:pPr>
+              <w:pStyle w:val="Normal"/>
+              <w:widowControl w:val="false"/>
+              <w:spacing w:lineRule="auto" w:line="180"/>
+              <w:jc w:val="center"/>
+              <w:rPr>
+                <w:sz w:val="16"/>
+                <w:szCs w:val="16"/>
+              </w:rPr>
+            </w:pPr>
+            <w:r>
+              <w:rPr>
+                <w:rFonts w:eastAsia="arial" w:ascii="arial" w:hAnsi="arial"/>
+                <w:color w:val="000000"/>
+                <w:sz w:val="16"/>
+                <w:szCs w:val="16"/>
+              </w:rPr>
+              <w:t>Prev</w:t>
+            </w:r>
+          </w:p>
+          <w:p>
+            <w:pPr>
+              <w:pStyle w:val="Normal"/>
+              <w:widowControl w:val="false"/>
+              <w:spacing w:lineRule="auto" w:line="180"/>
+              <w:jc w:val="center"/>
+              <w:rPr>
+                <w:sz w:val="16"/>
+                <w:szCs w:val="16"/>
+              </w:rPr>
+            </w:pPr>
+            <w:r>
+              <w:rPr>
+                <w:rFonts w:eastAsia="arial" w:ascii="arial" w:hAnsi="arial"/>
+                <w:color w:val="000000"/>
+                <w:sz w:val="16"/>
+                <w:szCs w:val="16"/>
+              </w:rPr>
+              <w:t>Cab Cam</w:t>
+            </w:r>
+          </w:p>
+        </w:tc>
+      </w:tr>
+    </w:tbl>
+    <w:p>
+      <w:pPr>
+        <w:pStyle w:val="Normal"/>
+        <w:rPr>
+          <w:color w:val="000000"/>
+          <w:sz w:val="16"/>
+          <w:szCs w:val="16"/>
+        </w:rPr>
+      </w:pPr>
+      <w:r>
+        <w:rPr>
+          <w:color w:val="000000"/>
+          <w:sz w:val="16"/>
+          <w:szCs w:val="16"/>
+        </w:rPr>
+      </w:r>
+    </w:p>
+    <w:p>
+      <w:pPr>
+        <w:pStyle w:val="Normal"/>
+        <w:rPr>
+          <w:color w:val="000000"/>
+          <w:sz w:val="16"/>
+          <w:szCs w:val="16"/>
+        </w:rPr>
+      </w:pPr>
+      <w:r>
+        <w:rPr>
+          <w:color w:val="000000"/>
+          <w:sz w:val="16"/>
+          <w:szCs w:val="16"/>
+        </w:rPr>
+        <w:tab/>
+        <w:t xml:space="preserve">       </w:t>
+      </w:r>
+      <w:r>
+        <w:rPr>
+          <w:rFonts w:eastAsia="arial" w:ascii="arial" w:hAnsi="arial"/>
+          <w:color w:val="000000"/>
+          <w:sz w:val="16"/>
+          <w:szCs w:val="16"/>
+        </w:rPr>
+        <w:t xml:space="preserve">    Class </w:t>
+      </w:r>
+      <w:r>
+        <w:rPr>
+          <w:rFonts w:eastAsia="arial" w:ascii="arial" w:hAnsi="arial"/>
+          <w:color w:val="000000"/>
+          <w:sz w:val="16"/>
+          <w:szCs w:val="16"/>
+        </w:rPr>
+        <w:t>47</w:t>
+      </w:r>
+      <w:r>
+        <w:rPr>
+          <w:rFonts w:eastAsia="arial" w:ascii="arial" w:hAnsi="arial"/>
+          <w:color w:val="000000"/>
+          <w:sz w:val="16"/>
+          <w:szCs w:val="16"/>
+        </w:rPr>
+        <w:t>-1</w:t>
+      </w:r>
+    </w:p>
+    <w:tbl>
+      <w:tblPr>
+        <w:tblW w:w="14248" w:type="dxa"/>
+        <w:jc w:val="left"/>
+        <w:tblInd w:w="-5" w:type="dxa"/>
+        <w:tblLayout w:type="fixed"/>
+        <w:tblCellMar>
+          <w:top w:w="0" w:type="dxa"/>
+          <w:left w:w="108" w:type="dxa"/>
+          <w:bottom w:w="0" w:type="dxa"/>
+          <w:right w:w="108" w:type="dxa"/>
+        </w:tblCellMar>
+        <w:tblLook w:firstRow="1" w:noVBand="1" w:lastRow="0" w:firstColumn="1" w:lastColumn="0" w:noHBand="0" w:val="04a0"/>
+      </w:tblPr>
+      <w:tblGrid>
+        <w:gridCol w:w="1017"/>
+        <w:gridCol w:w="1019"/>
+        <w:gridCol w:w="1014"/>
+        <w:gridCol w:w="1016"/>
+        <w:gridCol w:w="1020"/>
+        <w:gridCol w:w="1016"/>
+        <w:gridCol w:w="1016"/>
+        <w:gridCol w:w="1017"/>
+        <w:gridCol w:w="1016"/>
+        <w:gridCol w:w="1020"/>
+        <w:gridCol w:w="1016"/>
+        <w:gridCol w:w="1016"/>
+        <w:gridCol w:w="1016"/>
+        <w:gridCol w:w="1029"/>
+      </w:tblGrid>
+      <w:tr>
+        <w:trPr>
+          <w:trHeight w:val="440" w:hRule="exact"/>
+          <w:cantSplit w:val="true"/>
+        </w:trPr>
+        <w:tc>
+          <w:tcPr>
+            <w:tcW w:w="1017" w:type="dxa"/>
+            <w:tcBorders>
+              <w:top w:val="single" w:sz="4" w:space="0" w:color="000000"/>
+              <w:left w:val="single" w:sz="4" w:space="0" w:color="000000"/>
+              <w:bottom w:val="single" w:sz="4" w:space="0" w:color="000000"/>
+            </w:tcBorders>
+            <w:vAlign w:val="bottom"/>
+          </w:tcPr>
+          <w:p>
+            <w:pPr>
+              <w:pStyle w:val="Normal"/>
+              <w:widowControl w:val="false"/>
+              <w:spacing w:lineRule="auto" w:line="180" w:before="0" w:after="60"/>
+              <w:jc w:val="center"/>
+              <w:rPr>
+                <w:color w:val="000000"/>
+                <w:sz w:val="16"/>
+                <w:szCs w:val="16"/>
+              </w:rPr>
+            </w:pPr>
+            <w:r>
+              <w:rPr>
+                <w:rFonts w:eastAsia="arial" w:ascii="arial" w:hAnsi="arial"/>
+                <w:b/>
+                <w:color w:val="000000"/>
+                <w:sz w:val="16"/>
+                <w:szCs w:val="16"/>
+              </w:rPr>
+              <w:t>Pause</w:t>
+            </w:r>
+          </w:p>
+        </w:tc>
+        <w:tc>
+          <w:tcPr>
+            <w:tcW w:w="1019" w:type="dxa"/>
+            <w:tcBorders>
+              <w:top w:val="single" w:sz="4" w:space="0" w:color="000000"/>
+              <w:left w:val="single" w:sz="4" w:space="0" w:color="000000"/>
+              <w:bottom w:val="single" w:sz="4" w:space="0" w:color="000000"/>
+            </w:tcBorders>
+            <w:vAlign w:val="bottom"/>
+          </w:tcPr>
+          <w:p>
+            <w:pPr>
+              <w:pStyle w:val="Normal"/>
+              <w:widowControl w:val="false"/>
+              <w:spacing w:lineRule="auto" w:line="180"/>
+              <w:jc w:val="center"/>
+              <w:rPr>
+                <w:color w:val="000000"/>
+                <w:sz w:val="16"/>
+                <w:szCs w:val="16"/>
+              </w:rPr>
+            </w:pPr>
+            <w:r>
+              <w:rPr>
+                <w:color w:val="000000"/>
+                <w:sz w:val="16"/>
+                <w:szCs w:val="16"/>
+              </w:rPr>
+              <w:t>Master Key</w:t>
+            </w:r>
+          </w:p>
+        </w:tc>
+        <w:tc>
+          <w:tcPr>
+            <w:tcW w:w="1014" w:type="dxa"/>
+            <w:tcBorders>
+              <w:top w:val="single" w:sz="4" w:space="0" w:color="000000"/>
+              <w:left w:val="single" w:sz="4" w:space="0" w:color="000000"/>
+              <w:bottom w:val="single" w:sz="4" w:space="0" w:color="000000"/>
+            </w:tcBorders>
+            <w:vAlign w:val="bottom"/>
+          </w:tcPr>
+          <w:p>
+            <w:pPr>
+              <w:pStyle w:val="Normal"/>
+              <w:widowControl w:val="false"/>
+              <w:spacing w:lineRule="auto" w:line="180"/>
+              <w:jc w:val="center"/>
+              <w:rPr>
+                <w:color w:val="000000"/>
+                <w:sz w:val="16"/>
+                <w:szCs w:val="16"/>
+              </w:rPr>
+            </w:pPr>
+            <w:r>
+              <w:rPr>
+                <w:rFonts w:eastAsia="arial" w:ascii="arial" w:hAnsi="arial"/>
+                <w:color w:val="000000"/>
+                <w:sz w:val="16"/>
+                <w:szCs w:val="16"/>
+              </w:rPr>
+              <w:t>Engine Start</w:t>
+            </w:r>
+          </w:p>
+        </w:tc>
+        <w:tc>
+          <w:tcPr>
+            <w:tcW w:w="1016" w:type="dxa"/>
+            <w:tcBorders>
+              <w:top w:val="single" w:sz="4" w:space="0" w:color="000000"/>
+              <w:left w:val="single" w:sz="4" w:space="0" w:color="000000"/>
+              <w:bottom w:val="single" w:sz="4" w:space="0" w:color="000000"/>
+            </w:tcBorders>
+            <w:vAlign w:val="bottom"/>
+          </w:tcPr>
+          <w:p>
+            <w:pPr>
+              <w:pStyle w:val="Normal"/>
+              <w:widowControl w:val="false"/>
+              <w:spacing w:lineRule="auto" w:line="180"/>
+              <w:jc w:val="center"/>
+              <w:rPr>
+                <w:color w:val="000000"/>
+                <w:sz w:val="16"/>
+                <w:szCs w:val="16"/>
+              </w:rPr>
+            </w:pPr>
+            <w:r>
+              <w:rPr>
+                <w:color w:val="000000"/>
+                <w:sz w:val="16"/>
+                <w:szCs w:val="16"/>
+              </w:rPr>
+              <w:t>AWS</w:t>
+            </w:r>
+          </w:p>
+        </w:tc>
+        <w:tc>
+          <w:tcPr>
+            <w:tcW w:w="1020" w:type="dxa"/>
+            <w:tcBorders>
+              <w:top w:val="single" w:sz="4" w:space="0" w:color="000000"/>
+              <w:left w:val="single" w:sz="4" w:space="0" w:color="000000"/>
+              <w:bottom w:val="single" w:sz="4" w:space="0" w:color="000000"/>
+            </w:tcBorders>
+            <w:vAlign w:val="bottom"/>
+          </w:tcPr>
+          <w:p>
+            <w:pPr>
+              <w:pStyle w:val="Normal"/>
+              <w:widowControl w:val="false"/>
+              <w:spacing w:lineRule="auto" w:line="180"/>
+              <w:jc w:val="center"/>
+              <w:rPr>
+                <w:color w:val="000000"/>
+                <w:sz w:val="16"/>
+                <w:szCs w:val="16"/>
+              </w:rPr>
+            </w:pPr>
+            <w:r>
+              <w:rPr>
+                <w:color w:val="000000"/>
+                <w:sz w:val="16"/>
+                <w:szCs w:val="16"/>
+              </w:rPr>
+              <w:t>AWS Cab Change</w:t>
+            </w:r>
+          </w:p>
+        </w:tc>
+        <w:tc>
+          <w:tcPr>
+            <w:tcW w:w="1016" w:type="dxa"/>
+            <w:tcBorders>
+              <w:top w:val="single" w:sz="4" w:space="0" w:color="000000"/>
+              <w:left w:val="single" w:sz="4" w:space="0" w:color="000000"/>
+              <w:bottom w:val="single" w:sz="4" w:space="0" w:color="000000"/>
+            </w:tcBorders>
+            <w:vAlign w:val="bottom"/>
+          </w:tcPr>
+          <w:p>
+            <w:pPr>
+              <w:pStyle w:val="Normal"/>
+              <w:widowControl w:val="false"/>
+              <w:jc w:val="center"/>
+              <w:rPr>
+                <w:color w:val="000000"/>
+                <w:sz w:val="16"/>
+                <w:szCs w:val="16"/>
+              </w:rPr>
+            </w:pPr>
+            <w:r>
               <w:rPr/>
             </w:r>
           </w:p>
@@ -7690,56 +9231,735 @@
             <w:pPr>
               <w:pStyle w:val="Normal"/>
               <w:widowControl w:val="false"/>
-              <w:spacing w:lineRule="auto" w:line="180"/>
-              <w:jc w:val="center"/>
-              <w:rPr>
-                <w:sz w:val="16"/>
-                <w:szCs w:val="16"/>
-              </w:rPr>
-            </w:pPr>
-            <w:r>
-              <w:rPr>
-                <w:sz w:val="16"/>
-                <w:szCs w:val="16"/>
-              </w:rPr>
-              <w:t>Desk Light</w:t>
-            </w:r>
-          </w:p>
-        </w:tc>
-        <w:tc>
-          <w:tcPr>
-            <w:tcW w:w="1016" w:type="dxa"/>
-            <w:tcBorders>
-              <w:top w:val="single" w:sz="4" w:space="0" w:color="000000"/>
-              <w:left w:val="single" w:sz="4" w:space="0" w:color="000000"/>
-              <w:bottom w:val="single" w:sz="4" w:space="0" w:color="000000"/>
-            </w:tcBorders>
-            <w:vAlign w:val="bottom"/>
-          </w:tcPr>
-          <w:p>
-            <w:pPr>
-              <w:pStyle w:val="Normal"/>
-              <w:widowControl w:val="false"/>
-              <w:spacing w:lineRule="auto" w:line="180"/>
-              <w:jc w:val="center"/>
-              <w:rPr>
-                <w:sz w:val="16"/>
-                <w:szCs w:val="16"/>
-              </w:rPr>
-            </w:pPr>
-            <w:r>
-              <w:rPr>
-                <w:sz w:val="16"/>
-                <w:szCs w:val="16"/>
-              </w:rPr>
-              <w:t>Parking Brake</w:t>
-            </w:r>
-            <w:r>
-              <w:rPr>
-                <w:sz w:val="16"/>
-                <w:szCs w:val="16"/>
-              </w:rPr>
-              <w:t xml:space="preserve"> Off</w:t>
+              <w:jc w:val="center"/>
+              <w:rPr>
+                <w:color w:val="000000"/>
+                <w:sz w:val="16"/>
+                <w:szCs w:val="16"/>
+              </w:rPr>
+            </w:pPr>
+            <w:r>
+              <w:rPr>
+                <w:color w:val="000000"/>
+                <w:sz w:val="16"/>
+                <w:szCs w:val="16"/>
+              </w:rPr>
+            </w:r>
+          </w:p>
+        </w:tc>
+        <w:tc>
+          <w:tcPr>
+            <w:tcW w:w="1017" w:type="dxa"/>
+            <w:tcBorders>
+              <w:top w:val="single" w:sz="4" w:space="0" w:color="000000"/>
+              <w:left w:val="single" w:sz="4" w:space="0" w:color="000000"/>
+              <w:bottom w:val="single" w:sz="4" w:space="0" w:color="000000"/>
+            </w:tcBorders>
+            <w:vAlign w:val="bottom"/>
+          </w:tcPr>
+          <w:p>
+            <w:pPr>
+              <w:pStyle w:val="Normal"/>
+              <w:widowControl w:val="false"/>
+              <w:jc w:val="center"/>
+              <w:rPr>
+                <w:color w:val="000000"/>
+                <w:sz w:val="16"/>
+                <w:szCs w:val="16"/>
+              </w:rPr>
+            </w:pPr>
+            <w:r>
+              <w:rPr>
+                <w:rFonts w:eastAsia="arial" w:ascii="arial" w:hAnsi="arial"/>
+                <w:color w:val="000000"/>
+                <w:sz w:val="16"/>
+                <w:szCs w:val="16"/>
+              </w:rPr>
+              <w:t>Brake Selector</w:t>
+            </w:r>
+          </w:p>
+        </w:tc>
+        <w:tc>
+          <w:tcPr>
+            <w:tcW w:w="1016" w:type="dxa"/>
+            <w:tcBorders>
+              <w:top w:val="single" w:sz="4" w:space="0" w:color="000000"/>
+              <w:left w:val="single" w:sz="4" w:space="0" w:color="000000"/>
+              <w:bottom w:val="single" w:sz="4" w:space="0" w:color="000000"/>
+            </w:tcBorders>
+            <w:vAlign w:val="bottom"/>
+          </w:tcPr>
+          <w:p>
+            <w:pPr>
+              <w:pStyle w:val="Normal"/>
+              <w:widowControl w:val="false"/>
+              <w:jc w:val="center"/>
+              <w:rPr>
+                <w:color w:val="000000"/>
+                <w:sz w:val="16"/>
+                <w:szCs w:val="16"/>
+              </w:rPr>
+            </w:pPr>
+            <w:r>
+              <w:rPr>
+                <w:color w:val="000000"/>
+                <w:sz w:val="16"/>
+                <w:szCs w:val="16"/>
+              </w:rPr>
+            </w:r>
+          </w:p>
+        </w:tc>
+        <w:tc>
+          <w:tcPr>
+            <w:tcW w:w="1020" w:type="dxa"/>
+            <w:tcBorders>
+              <w:top w:val="single" w:sz="4" w:space="0" w:color="000000"/>
+              <w:left w:val="single" w:sz="4" w:space="0" w:color="000000"/>
+              <w:bottom w:val="single" w:sz="4" w:space="0" w:color="000000"/>
+            </w:tcBorders>
+            <w:vAlign w:val="bottom"/>
+          </w:tcPr>
+          <w:p>
+            <w:pPr>
+              <w:pStyle w:val="Normal"/>
+              <w:widowControl w:val="false"/>
+              <w:spacing w:lineRule="auto" w:line="180"/>
+              <w:jc w:val="center"/>
+              <w:rPr>
+                <w:sz w:val="16"/>
+                <w:szCs w:val="16"/>
+              </w:rPr>
+            </w:pPr>
+            <w:r>
+              <w:rPr>
+                <w:sz w:val="16"/>
+                <w:szCs w:val="16"/>
+              </w:rPr>
+              <w:t xml:space="preserve">Tail Light </w:t>
+            </w:r>
+            <w:r>
+              <w:rPr>
+                <w:sz w:val="16"/>
+                <w:szCs w:val="16"/>
+              </w:rPr>
+              <w:t>Left</w:t>
+            </w:r>
+          </w:p>
+        </w:tc>
+        <w:tc>
+          <w:tcPr>
+            <w:tcW w:w="1016" w:type="dxa"/>
+            <w:tcBorders>
+              <w:top w:val="single" w:sz="4" w:space="0" w:color="000000"/>
+              <w:left w:val="single" w:sz="4" w:space="0" w:color="000000"/>
+              <w:bottom w:val="single" w:sz="4" w:space="0" w:color="000000"/>
+            </w:tcBorders>
+            <w:vAlign w:val="bottom"/>
+          </w:tcPr>
+          <w:p>
+            <w:pPr>
+              <w:pStyle w:val="Normal"/>
+              <w:widowControl w:val="false"/>
+              <w:spacing w:lineRule="auto" w:line="180"/>
+              <w:jc w:val="center"/>
+              <w:rPr>
+                <w:sz w:val="16"/>
+                <w:szCs w:val="16"/>
+              </w:rPr>
+            </w:pPr>
+            <w:r>
+              <w:rPr>
+                <w:rFonts w:eastAsia="arial" w:ascii="arial" w:hAnsi="arial"/>
+                <w:color w:val="000000"/>
+                <w:sz w:val="16"/>
+                <w:szCs w:val="16"/>
+              </w:rPr>
+              <w:t>Cab Light</w:t>
+            </w:r>
+          </w:p>
+        </w:tc>
+        <w:tc>
+          <w:tcPr>
+            <w:tcW w:w="1016" w:type="dxa"/>
+            <w:tcBorders>
+              <w:top w:val="single" w:sz="4" w:space="0" w:color="000000"/>
+              <w:left w:val="single" w:sz="4" w:space="0" w:color="000000"/>
+              <w:bottom w:val="single" w:sz="4" w:space="0" w:color="000000"/>
+            </w:tcBorders>
+            <w:vAlign w:val="bottom"/>
+          </w:tcPr>
+          <w:p>
+            <w:pPr>
+              <w:pStyle w:val="Normal"/>
+              <w:widowControl w:val="false"/>
+              <w:spacing w:lineRule="auto" w:line="180"/>
+              <w:jc w:val="center"/>
+              <w:rPr>
+                <w:sz w:val="16"/>
+                <w:szCs w:val="16"/>
+              </w:rPr>
+            </w:pPr>
+            <w:r>
+              <w:rPr>
+                <w:sz w:val="16"/>
+                <w:szCs w:val="16"/>
+              </w:rPr>
+              <w:t>Handbrake On</w:t>
+            </w:r>
+          </w:p>
+        </w:tc>
+        <w:tc>
+          <w:tcPr>
+            <w:tcW w:w="1016" w:type="dxa"/>
+            <w:tcBorders>
+              <w:top w:val="single" w:sz="4" w:space="0" w:color="000000"/>
+              <w:left w:val="single" w:sz="4" w:space="0" w:color="000000"/>
+              <w:bottom w:val="single" w:sz="4" w:space="0" w:color="000000"/>
+            </w:tcBorders>
+            <w:vAlign w:val="bottom"/>
+          </w:tcPr>
+          <w:p>
+            <w:pPr>
+              <w:pStyle w:val="Normal"/>
+              <w:widowControl w:val="false"/>
+              <w:spacing w:lineRule="auto" w:line="180"/>
+              <w:jc w:val="center"/>
+              <w:rPr>
+                <w:sz w:val="16"/>
+                <w:szCs w:val="16"/>
+              </w:rPr>
+            </w:pPr>
+            <w:r>
+              <w:rPr>
+                <w:rFonts w:eastAsia="arial" w:ascii="arial" w:hAnsi="arial"/>
+                <w:color w:val="000000"/>
+                <w:sz w:val="16"/>
+                <w:szCs w:val="16"/>
+              </w:rPr>
+              <w:t>1-Person</w:t>
+            </w:r>
+          </w:p>
+        </w:tc>
+        <w:tc>
+          <w:tcPr>
+            <w:tcW w:w="1029" w:type="dxa"/>
+            <w:tcBorders>
+              <w:top w:val="single" w:sz="4" w:space="0" w:color="000000"/>
+              <w:left w:val="single" w:sz="4" w:space="0" w:color="000000"/>
+              <w:bottom w:val="single" w:sz="4" w:space="0" w:color="000000"/>
+              <w:right w:val="single" w:sz="4" w:space="0" w:color="000000"/>
+            </w:tcBorders>
+            <w:vAlign w:val="bottom"/>
+          </w:tcPr>
+          <w:p>
+            <w:pPr>
+              <w:pStyle w:val="Normal"/>
+              <w:widowControl w:val="false"/>
+              <w:spacing w:lineRule="auto" w:line="180"/>
+              <w:jc w:val="center"/>
+              <w:rPr>
+                <w:sz w:val="16"/>
+                <w:szCs w:val="16"/>
+              </w:rPr>
+            </w:pPr>
+            <w:r>
+              <w:rPr>
+                <w:rFonts w:eastAsia="arial" w:ascii="arial" w:hAnsi="arial"/>
+                <w:color w:val="000000"/>
+                <w:sz w:val="16"/>
+                <w:szCs w:val="16"/>
+              </w:rPr>
+              <w:t>Next</w:t>
+            </w:r>
+          </w:p>
+          <w:p>
+            <w:pPr>
+              <w:pStyle w:val="Normal"/>
+              <w:widowControl w:val="false"/>
+              <w:spacing w:lineRule="auto" w:line="180"/>
+              <w:jc w:val="center"/>
+              <w:rPr>
+                <w:sz w:val="16"/>
+                <w:szCs w:val="16"/>
+              </w:rPr>
+            </w:pPr>
+            <w:r>
+              <w:rPr>
+                <w:rFonts w:eastAsia="arial" w:ascii="arial" w:hAnsi="arial"/>
+                <w:color w:val="000000"/>
+                <w:sz w:val="16"/>
+                <w:szCs w:val="16"/>
+              </w:rPr>
+              <w:t>Cab Cam</w:t>
+            </w:r>
+          </w:p>
+        </w:tc>
+      </w:tr>
+    </w:tbl>
+    <w:p>
+      <w:pPr>
+        <w:pStyle w:val="Normal"/>
+        <w:rPr>
+          <w:rFonts w:ascii="arial" w:hAnsi="arial" w:eastAsia="arial"/>
+          <w:color w:val="000000"/>
+          <w:sz w:val="16"/>
+          <w:szCs w:val="16"/>
+        </w:rPr>
+      </w:pPr>
+      <w:r>
+        <w:rPr>
+          <w:rFonts w:eastAsia="arial" w:ascii="arial" w:hAnsi="arial"/>
+          <w:color w:val="000000"/>
+          <w:sz w:val="16"/>
+          <w:szCs w:val="16"/>
+        </w:rPr>
+      </w:r>
+    </w:p>
+    <w:p>
+      <w:pPr>
+        <w:pStyle w:val="Normal"/>
+        <w:rPr>
+          <w:color w:val="000000"/>
+          <w:sz w:val="16"/>
+          <w:szCs w:val="16"/>
+        </w:rPr>
+      </w:pPr>
+      <w:r>
+        <w:rPr>
+          <w:rFonts w:eastAsia="arial" w:ascii="arial" w:hAnsi="arial"/>
+          <w:color w:val="000000"/>
+          <w:sz w:val="16"/>
+          <w:szCs w:val="16"/>
+        </w:rPr>
+        <w:tab/>
+        <w:t xml:space="preserve">           Class </w:t>
+      </w:r>
+      <w:r>
+        <w:rPr>
+          <w:rFonts w:eastAsia="arial" w:ascii="arial" w:hAnsi="arial"/>
+          <w:color w:val="000000"/>
+          <w:sz w:val="16"/>
+          <w:szCs w:val="16"/>
+        </w:rPr>
+        <w:t>47</w:t>
+      </w:r>
+      <w:r>
+        <w:rPr>
+          <w:rFonts w:eastAsia="arial" w:ascii="arial" w:hAnsi="arial"/>
+          <w:color w:val="000000"/>
+          <w:sz w:val="16"/>
+          <w:szCs w:val="16"/>
+        </w:rPr>
+        <w:t>-2</w:t>
+      </w:r>
+    </w:p>
+    <w:tbl>
+      <w:tblPr>
+        <w:tblW w:w="14248" w:type="dxa"/>
+        <w:jc w:val="left"/>
+        <w:tblInd w:w="-5" w:type="dxa"/>
+        <w:tblLayout w:type="fixed"/>
+        <w:tblCellMar>
+          <w:top w:w="0" w:type="dxa"/>
+          <w:left w:w="108" w:type="dxa"/>
+          <w:bottom w:w="0" w:type="dxa"/>
+          <w:right w:w="108" w:type="dxa"/>
+        </w:tblCellMar>
+        <w:tblLook w:firstRow="1" w:noVBand="1" w:lastRow="0" w:firstColumn="1" w:lastColumn="0" w:noHBand="0" w:val="04a0"/>
+      </w:tblPr>
+      <w:tblGrid>
+        <w:gridCol w:w="1017"/>
+        <w:gridCol w:w="1019"/>
+        <w:gridCol w:w="1014"/>
+        <w:gridCol w:w="1016"/>
+        <w:gridCol w:w="1020"/>
+        <w:gridCol w:w="1016"/>
+        <w:gridCol w:w="1016"/>
+        <w:gridCol w:w="1017"/>
+        <w:gridCol w:w="1016"/>
+        <w:gridCol w:w="1020"/>
+        <w:gridCol w:w="1016"/>
+        <w:gridCol w:w="1016"/>
+        <w:gridCol w:w="1016"/>
+        <w:gridCol w:w="1029"/>
+      </w:tblGrid>
+      <w:tr>
+        <w:trPr>
+          <w:trHeight w:val="440" w:hRule="exact"/>
+          <w:cantSplit w:val="true"/>
+        </w:trPr>
+        <w:tc>
+          <w:tcPr>
+            <w:tcW w:w="1017" w:type="dxa"/>
+            <w:tcBorders>
+              <w:top w:val="single" w:sz="4" w:space="0" w:color="000000"/>
+              <w:left w:val="single" w:sz="4" w:space="0" w:color="000000"/>
+              <w:bottom w:val="single" w:sz="4" w:space="0" w:color="000000"/>
+            </w:tcBorders>
+            <w:vAlign w:val="bottom"/>
+          </w:tcPr>
+          <w:p>
+            <w:pPr>
+              <w:pStyle w:val="Normal"/>
+              <w:widowControl w:val="false"/>
+              <w:spacing w:lineRule="auto" w:line="180" w:before="0" w:after="60"/>
+              <w:jc w:val="center"/>
+              <w:rPr>
+                <w:b/>
+                <w:bCs/>
+              </w:rPr>
+            </w:pPr>
+            <w:r>
+              <w:rPr>
+                <w:b/>
+                <w:bCs/>
+                <w:color w:val="000000"/>
+                <w:sz w:val="16"/>
+                <w:szCs w:val="16"/>
+              </w:rPr>
+              <w:t>HUD</w:t>
+            </w:r>
+          </w:p>
+        </w:tc>
+        <w:tc>
+          <w:tcPr>
+            <w:tcW w:w="1019" w:type="dxa"/>
+            <w:tcBorders>
+              <w:top w:val="single" w:sz="4" w:space="0" w:color="000000"/>
+              <w:left w:val="single" w:sz="4" w:space="0" w:color="000000"/>
+              <w:bottom w:val="single" w:sz="4" w:space="0" w:color="000000"/>
+            </w:tcBorders>
+            <w:vAlign w:val="bottom"/>
+          </w:tcPr>
+          <w:p>
+            <w:pPr>
+              <w:pStyle w:val="Normal"/>
+              <w:widowControl w:val="false"/>
+              <w:spacing w:lineRule="auto" w:line="180"/>
+              <w:jc w:val="center"/>
+              <w:rPr>
+                <w:color w:val="000000"/>
+                <w:sz w:val="16"/>
+                <w:szCs w:val="16"/>
+              </w:rPr>
+            </w:pPr>
+            <w:r>
+              <w:rPr>
+                <w:color w:val="000000"/>
+                <w:sz w:val="16"/>
+                <w:szCs w:val="16"/>
+              </w:rPr>
+              <w:t>Schedule</w:t>
+            </w:r>
+          </w:p>
+        </w:tc>
+        <w:tc>
+          <w:tcPr>
+            <w:tcW w:w="1014" w:type="dxa"/>
+            <w:tcBorders>
+              <w:top w:val="single" w:sz="4" w:space="0" w:color="000000"/>
+              <w:left w:val="single" w:sz="4" w:space="0" w:color="000000"/>
+              <w:bottom w:val="single" w:sz="4" w:space="0" w:color="000000"/>
+            </w:tcBorders>
+            <w:vAlign w:val="bottom"/>
+          </w:tcPr>
+          <w:p>
+            <w:pPr>
+              <w:pStyle w:val="Normal"/>
+              <w:widowControl w:val="false"/>
+              <w:spacing w:lineRule="auto" w:line="180"/>
+              <w:jc w:val="center"/>
+              <w:rPr>
+                <w:color w:val="000000"/>
+                <w:sz w:val="16"/>
+                <w:szCs w:val="16"/>
+              </w:rPr>
+            </w:pPr>
+            <w:r>
+              <w:rPr>
+                <w:rFonts w:eastAsia="arial" w:ascii="arial" w:hAnsi="arial"/>
+                <w:color w:val="000000"/>
+                <w:sz w:val="16"/>
+                <w:szCs w:val="16"/>
+              </w:rPr>
+              <w:t>Engine Stop</w:t>
+            </w:r>
+          </w:p>
+        </w:tc>
+        <w:tc>
+          <w:tcPr>
+            <w:tcW w:w="1016" w:type="dxa"/>
+            <w:tcBorders>
+              <w:top w:val="single" w:sz="4" w:space="0" w:color="000000"/>
+              <w:left w:val="single" w:sz="4" w:space="0" w:color="000000"/>
+              <w:bottom w:val="single" w:sz="4" w:space="0" w:color="000000"/>
+            </w:tcBorders>
+            <w:vAlign w:val="bottom"/>
+          </w:tcPr>
+          <w:p>
+            <w:pPr>
+              <w:pStyle w:val="Normal"/>
+              <w:widowControl w:val="false"/>
+              <w:spacing w:lineRule="auto" w:line="180"/>
+              <w:jc w:val="center"/>
+              <w:rPr>
+                <w:color w:val="000000"/>
+                <w:sz w:val="16"/>
+                <w:szCs w:val="16"/>
+              </w:rPr>
+            </w:pPr>
+            <w:r>
+              <w:rPr>
+                <w:color w:val="000000"/>
+                <w:sz w:val="16"/>
+                <w:szCs w:val="16"/>
+              </w:rPr>
+              <w:t>DSD</w:t>
+            </w:r>
+          </w:p>
+        </w:tc>
+        <w:tc>
+          <w:tcPr>
+            <w:tcW w:w="1020" w:type="dxa"/>
+            <w:tcBorders>
+              <w:top w:val="single" w:sz="4" w:space="0" w:color="000000"/>
+              <w:left w:val="single" w:sz="4" w:space="0" w:color="000000"/>
+              <w:bottom w:val="single" w:sz="4" w:space="0" w:color="000000"/>
+            </w:tcBorders>
+            <w:vAlign w:val="bottom"/>
+          </w:tcPr>
+          <w:p>
+            <w:pPr>
+              <w:pStyle w:val="Normal"/>
+              <w:widowControl w:val="false"/>
+              <w:spacing w:lineRule="auto" w:line="180"/>
+              <w:jc w:val="center"/>
+              <w:rPr>
+                <w:color w:val="000000"/>
+                <w:sz w:val="16"/>
+                <w:szCs w:val="16"/>
+              </w:rPr>
+            </w:pPr>
+            <w:r>
+              <w:rPr>
+                <w:color w:val="000000"/>
+                <w:sz w:val="16"/>
+                <w:szCs w:val="16"/>
+              </w:rPr>
+            </w:r>
+          </w:p>
+        </w:tc>
+        <w:tc>
+          <w:tcPr>
+            <w:tcW w:w="1016" w:type="dxa"/>
+            <w:tcBorders>
+              <w:top w:val="single" w:sz="4" w:space="0" w:color="000000"/>
+              <w:left w:val="single" w:sz="4" w:space="0" w:color="000000"/>
+              <w:bottom w:val="single" w:sz="4" w:space="0" w:color="000000"/>
+            </w:tcBorders>
+            <w:vAlign w:val="bottom"/>
+          </w:tcPr>
+          <w:p>
+            <w:pPr>
+              <w:pStyle w:val="Normal"/>
+              <w:widowControl w:val="false"/>
+              <w:jc w:val="center"/>
+              <w:rPr>
+                <w:color w:val="000000"/>
+                <w:sz w:val="16"/>
+                <w:szCs w:val="16"/>
+              </w:rPr>
+            </w:pPr>
+            <w:r>
+              <w:rPr>
+                <w:color w:val="000000"/>
+                <w:sz w:val="16"/>
+                <w:szCs w:val="16"/>
+              </w:rPr>
+            </w:r>
+          </w:p>
+        </w:tc>
+        <w:tc>
+          <w:tcPr>
+            <w:tcW w:w="1016" w:type="dxa"/>
+            <w:tcBorders>
+              <w:top w:val="single" w:sz="4" w:space="0" w:color="000000"/>
+              <w:left w:val="single" w:sz="4" w:space="0" w:color="000000"/>
+              <w:bottom w:val="single" w:sz="4" w:space="0" w:color="000000"/>
+            </w:tcBorders>
+            <w:vAlign w:val="bottom"/>
+          </w:tcPr>
+          <w:p>
+            <w:pPr>
+              <w:pStyle w:val="Normal"/>
+              <w:widowControl w:val="false"/>
+              <w:jc w:val="center"/>
+              <w:rPr>
+                <w:color w:val="000000"/>
+                <w:sz w:val="16"/>
+                <w:szCs w:val="16"/>
+              </w:rPr>
+            </w:pPr>
+            <w:r>
+              <w:rPr>
+                <w:color w:val="000000"/>
+                <w:sz w:val="16"/>
+                <w:szCs w:val="16"/>
+              </w:rPr>
+            </w:r>
+          </w:p>
+        </w:tc>
+        <w:tc>
+          <w:tcPr>
+            <w:tcW w:w="1017" w:type="dxa"/>
+            <w:tcBorders>
+              <w:top w:val="single" w:sz="4" w:space="0" w:color="000000"/>
+              <w:left w:val="single" w:sz="4" w:space="0" w:color="000000"/>
+              <w:bottom w:val="single" w:sz="4" w:space="0" w:color="000000"/>
+            </w:tcBorders>
+            <w:vAlign w:val="bottom"/>
+          </w:tcPr>
+          <w:p>
+            <w:pPr>
+              <w:pStyle w:val="Normal"/>
+              <w:widowControl w:val="false"/>
+              <w:jc w:val="center"/>
+              <w:rPr>
+                <w:rFonts w:ascii="arial" w:hAnsi="arial" w:eastAsia="arial"/>
+                <w:color w:val="000000"/>
+                <w:sz w:val="16"/>
+                <w:szCs w:val="16"/>
+              </w:rPr>
+            </w:pPr>
+            <w:r>
+              <w:rPr/>
+            </w:r>
+          </w:p>
+        </w:tc>
+        <w:tc>
+          <w:tcPr>
+            <w:tcW w:w="1016" w:type="dxa"/>
+            <w:tcBorders>
+              <w:top w:val="single" w:sz="4" w:space="0" w:color="000000"/>
+              <w:left w:val="single" w:sz="4" w:space="0" w:color="000000"/>
+              <w:bottom w:val="single" w:sz="4" w:space="0" w:color="000000"/>
+            </w:tcBorders>
+            <w:vAlign w:val="bottom"/>
+          </w:tcPr>
+          <w:p>
+            <w:pPr>
+              <w:pStyle w:val="Normal"/>
+              <w:widowControl w:val="false"/>
+              <w:jc w:val="center"/>
+              <w:rPr>
+                <w:color w:val="000000"/>
+                <w:sz w:val="16"/>
+                <w:szCs w:val="16"/>
+              </w:rPr>
+            </w:pPr>
+            <w:r>
+              <w:rPr>
+                <w:color w:val="000000"/>
+                <w:sz w:val="16"/>
+                <w:szCs w:val="16"/>
+              </w:rPr>
+            </w:r>
+          </w:p>
+        </w:tc>
+        <w:tc>
+          <w:tcPr>
+            <w:tcW w:w="1020" w:type="dxa"/>
+            <w:tcBorders>
+              <w:top w:val="single" w:sz="4" w:space="0" w:color="000000"/>
+              <w:left w:val="single" w:sz="4" w:space="0" w:color="000000"/>
+              <w:bottom w:val="single" w:sz="4" w:space="0" w:color="000000"/>
+            </w:tcBorders>
+            <w:vAlign w:val="bottom"/>
+          </w:tcPr>
+          <w:p>
+            <w:pPr>
+              <w:pStyle w:val="Normal"/>
+              <w:widowControl w:val="false"/>
+              <w:spacing w:lineRule="auto" w:line="180"/>
+              <w:jc w:val="center"/>
+              <w:rPr>
+                <w:sz w:val="16"/>
+                <w:szCs w:val="16"/>
+              </w:rPr>
+            </w:pPr>
+            <w:r>
+              <w:rPr>
+                <w:sz w:val="16"/>
+                <w:szCs w:val="16"/>
+              </w:rPr>
+              <w:t xml:space="preserve">Tail Light </w:t>
+            </w:r>
+            <w:r>
+              <w:rPr>
+                <w:sz w:val="16"/>
+                <w:szCs w:val="16"/>
+              </w:rPr>
+              <w:t>Right</w:t>
+            </w:r>
+          </w:p>
+        </w:tc>
+        <w:tc>
+          <w:tcPr>
+            <w:tcW w:w="1016" w:type="dxa"/>
+            <w:tcBorders>
+              <w:top w:val="single" w:sz="4" w:space="0" w:color="000000"/>
+              <w:left w:val="single" w:sz="4" w:space="0" w:color="000000"/>
+              <w:bottom w:val="single" w:sz="4" w:space="0" w:color="000000"/>
+            </w:tcBorders>
+            <w:vAlign w:val="bottom"/>
+          </w:tcPr>
+          <w:p>
+            <w:pPr>
+              <w:pStyle w:val="Normal"/>
+              <w:widowControl w:val="false"/>
+              <w:spacing w:lineRule="auto" w:line="180"/>
+              <w:jc w:val="center"/>
+              <w:rPr>
+                <w:sz w:val="16"/>
+                <w:szCs w:val="16"/>
+              </w:rPr>
+            </w:pPr>
+            <w:r>
+              <w:rPr>
+                <w:sz w:val="16"/>
+                <w:szCs w:val="16"/>
+              </w:rPr>
+              <w:t>Inst. Light</w:t>
+            </w:r>
+          </w:p>
+        </w:tc>
+        <w:tc>
+          <w:tcPr>
+            <w:tcW w:w="1016" w:type="dxa"/>
+            <w:tcBorders>
+              <w:top w:val="single" w:sz="4" w:space="0" w:color="000000"/>
+              <w:left w:val="single" w:sz="4" w:space="0" w:color="000000"/>
+              <w:bottom w:val="single" w:sz="4" w:space="0" w:color="000000"/>
+            </w:tcBorders>
+            <w:vAlign w:val="bottom"/>
+          </w:tcPr>
+          <w:p>
+            <w:pPr>
+              <w:pStyle w:val="Normal"/>
+              <w:widowControl w:val="false"/>
+              <w:spacing w:lineRule="auto" w:line="180"/>
+              <w:jc w:val="center"/>
+              <w:rPr>
+                <w:sz w:val="16"/>
+                <w:szCs w:val="16"/>
+              </w:rPr>
+            </w:pPr>
+            <w:r>
+              <w:rPr>
+                <w:sz w:val="16"/>
+                <w:szCs w:val="16"/>
+              </w:rPr>
+              <w:t>Handbrake Off</w:t>
             </w:r>
           </w:p>
         </w:tc>
@@ -8890,12 +11110,12 @@
       <w:rFonts w:ascii="Symbol" w:hAnsi="Symbol" w:cs="Symbol"/>
     </w:rPr>
   </w:style>
-  <w:style w:type="character" w:styleId="user" w:customStyle="1">
-    <w:name w:val="번호 매기기 기호 (user)"/>
+  <w:style w:type="character" w:styleId="Style5" w:customStyle="1">
+    <w:name w:val="번호 매기기 기호"/>
     <w:qFormat/>
     <w:rPr/>
   </w:style>
-  <w:style w:type="paragraph" w:styleId="Style5">
+  <w:style w:type="paragraph" w:styleId="Style6">
     <w:name w:val="제목"/>
     <w:basedOn w:val="Normal"/>
     <w:next w:val="BodyText"/>
@@ -8905,7 +11125,7 @@
       <w:spacing w:before="240" w:after="120"/>
     </w:pPr>
     <w:rPr>
-      <w:rFonts w:ascii="Liberation Sans" w:hAnsi="Liberation Sans" w:eastAsia="Noto Sans CJK KR" w:cs="Lohit Devanagari"/>
+      <w:rFonts w:ascii="Liberation Sans" w:hAnsi="Liberation Sans" w:eastAsia="나눔고딕" w:cs="Arial"/>
       <w:sz w:val="28"/>
       <w:szCs w:val="28"/>
     </w:rPr>
@@ -8942,7 +11162,7 @@
       <w:szCs w:val="24"/>
     </w:rPr>
   </w:style>
-  <w:style w:type="paragraph" w:styleId="Style6" w:customStyle="1">
+  <w:style w:type="paragraph" w:styleId="Style7">
     <w:name w:val="색인"/>
     <w:basedOn w:val="Normal"/>
     <w:qFormat/>
@@ -8950,10 +11170,11 @@
       <w:suppressLineNumbers/>
     </w:pPr>
     <w:rPr>
-      <w:rFonts w:cs="Lohit Devanagari"/>
+      <w:rFonts w:cs="Arial"/>
+      <w:sz w:val="24"/>
     </w:rPr>
   </w:style>
-  <w:style w:type="paragraph" w:styleId="user1">
+  <w:style w:type="paragraph" w:styleId="user">
     <w:name w:val="제목 (user)"/>
     <w:basedOn w:val="Normal"/>
     <w:next w:val="BodyText"/>
@@ -8963,12 +11184,12 @@
       <w:spacing w:before="240" w:after="120"/>
     </w:pPr>
     <w:rPr>
-      <w:rFonts w:ascii="Liberation Sans" w:hAnsi="Liberation Sans" w:eastAsia="나눔고딕" w:cs="Arial"/>
+      <w:rFonts w:ascii="Liberation Sans" w:hAnsi="Liberation Sans" w:eastAsia="Noto Sans CJK KR" w:cs="Lohit Devanagari"/>
       <w:sz w:val="28"/>
       <w:szCs w:val="28"/>
     </w:rPr>
   </w:style>
-  <w:style w:type="paragraph" w:styleId="user2">
+  <w:style w:type="paragraph" w:styleId="user1" w:customStyle="1">
     <w:name w:val="색인 (user)"/>
     <w:basedOn w:val="Normal"/>
     <w:qFormat/>
@@ -8976,8 +11197,7 @@
       <w:suppressLineNumbers/>
     </w:pPr>
     <w:rPr>
-      <w:rFonts w:cs="Arial"/>
-      <w:sz w:val="24"/>
+      <w:rFonts w:cs="Lohit Devanagari"/>
     </w:rPr>
   </w:style>
   <w:style w:type="paragraph" w:styleId="Title">
@@ -9659,8 +11879,8 @@
       <w:szCs w:val="24"/>
     </w:rPr>
   </w:style>
-  <w:style w:type="paragraph" w:styleId="Style7" w:customStyle="1">
-    <w:name w:val="표 내용"/>
+  <w:style w:type="paragraph" w:styleId="user2" w:customStyle="1">
+    <w:name w:val="표 내용 (user)"/>
     <w:basedOn w:val="Normal"/>
     <w:qFormat/>
     <w:pPr>
@@ -9668,9 +11888,9 @@
     </w:pPr>
     <w:rPr/>
   </w:style>
-  <w:style w:type="paragraph" w:styleId="Style8" w:customStyle="1">
-    <w:name w:val="표제목"/>
-    <w:basedOn w:val="Style7"/>
+  <w:style w:type="paragraph" w:styleId="user3" w:customStyle="1">
+    <w:name w:val="표제목 (user)"/>
+    <w:basedOn w:val="user2"/>
     <w:qFormat/>
     <w:pPr>
       <w:jc w:val="center"/>
@@ -9680,8 +11900,8 @@
       <w:bCs/>
     </w:rPr>
   </w:style>
-  <w:style w:type="paragraph" w:styleId="user3">
-    <w:name w:val="표 내용 (user)"/>
+  <w:style w:type="paragraph" w:styleId="Style8">
+    <w:name w:val="표 내용"/>
     <w:basedOn w:val="Normal"/>
     <w:qFormat/>
     <w:pPr>
@@ -9690,9 +11910,9 @@
     </w:pPr>
     <w:rPr/>
   </w:style>
-  <w:style w:type="paragraph" w:styleId="user4">
-    <w:name w:val="표제목 (user)"/>
-    <w:basedOn w:val="user3"/>
+  <w:style w:type="paragraph" w:styleId="Style9">
+    <w:name w:val="표제목"/>
+    <w:basedOn w:val="Style8"/>
     <w:qFormat/>
     <w:pPr>
       <w:suppressLineNumbers/>

</xml_diff>

<commit_message>
Added Class 86 and 87
</commit_message>
<xml_diff>
--- a/raildriver-UK-Remapped.docx
+++ b/raildriver-UK-Remapped.docx
@@ -7053,12 +7053,7 @@
               </w:rPr>
             </w:pPr>
             <w:r>
-              <w:rPr>
-                <w:color w:val="000000"/>
-                <w:sz w:val="16"/>
-                <w:szCs w:val="16"/>
-              </w:rPr>
-              <w:t>Slow Speed Up</w:t>
+              <w:rPr/>
             </w:r>
           </w:p>
         </w:tc>
@@ -7590,12 +7585,7 @@
               </w:rPr>
             </w:pPr>
             <w:r>
-              <w:rPr>
-                <w:color w:val="000000"/>
-                <w:sz w:val="16"/>
-                <w:szCs w:val="16"/>
-              </w:rPr>
-              <w:t>Slow Speed Dw</w:t>
+              <w:rPr/>
             </w:r>
           </w:p>
         </w:tc>
@@ -10041,7 +10031,1105 @@
           <w:sz w:val="16"/>
           <w:szCs w:val="16"/>
         </w:rPr>
-        <w:t xml:space="preserve">    Class </w:t>
+        <w:t xml:space="preserve">    Class 52-1</w:t>
+      </w:r>
+    </w:p>
+    <w:tbl>
+      <w:tblPr>
+        <w:tblW w:w="14248" w:type="dxa"/>
+        <w:jc w:val="left"/>
+        <w:tblInd w:w="-5" w:type="dxa"/>
+        <w:tblLayout w:type="fixed"/>
+        <w:tblCellMar>
+          <w:top w:w="0" w:type="dxa"/>
+          <w:left w:w="108" w:type="dxa"/>
+          <w:bottom w:w="0" w:type="dxa"/>
+          <w:right w:w="108" w:type="dxa"/>
+        </w:tblCellMar>
+        <w:tblLook w:firstRow="1" w:noVBand="1" w:lastRow="0" w:firstColumn="1" w:lastColumn="0" w:noHBand="0" w:val="04a0"/>
+      </w:tblPr>
+      <w:tblGrid>
+        <w:gridCol w:w="1017"/>
+        <w:gridCol w:w="1019"/>
+        <w:gridCol w:w="1014"/>
+        <w:gridCol w:w="1016"/>
+        <w:gridCol w:w="1020"/>
+        <w:gridCol w:w="1016"/>
+        <w:gridCol w:w="1016"/>
+        <w:gridCol w:w="1017"/>
+        <w:gridCol w:w="1016"/>
+        <w:gridCol w:w="1020"/>
+        <w:gridCol w:w="1016"/>
+        <w:gridCol w:w="1016"/>
+        <w:gridCol w:w="1016"/>
+        <w:gridCol w:w="1029"/>
+      </w:tblGrid>
+      <w:tr>
+        <w:trPr>
+          <w:trHeight w:val="440" w:hRule="exact"/>
+          <w:cantSplit w:val="true"/>
+        </w:trPr>
+        <w:tc>
+          <w:tcPr>
+            <w:tcW w:w="1017" w:type="dxa"/>
+            <w:tcBorders>
+              <w:top w:val="single" w:sz="4" w:space="0" w:color="000000"/>
+              <w:left w:val="single" w:sz="4" w:space="0" w:color="000000"/>
+              <w:bottom w:val="single" w:sz="4" w:space="0" w:color="000000"/>
+            </w:tcBorders>
+            <w:vAlign w:val="bottom"/>
+          </w:tcPr>
+          <w:p>
+            <w:pPr>
+              <w:pStyle w:val="Normal"/>
+              <w:widowControl w:val="false"/>
+              <w:spacing w:lineRule="auto" w:line="180" w:before="0" w:after="60"/>
+              <w:jc w:val="center"/>
+              <w:rPr>
+                <w:color w:val="000000"/>
+                <w:sz w:val="16"/>
+                <w:szCs w:val="16"/>
+              </w:rPr>
+            </w:pPr>
+            <w:r>
+              <w:rPr>
+                <w:rFonts w:eastAsia="arial" w:ascii="arial" w:hAnsi="arial"/>
+                <w:b/>
+                <w:color w:val="000000"/>
+                <w:sz w:val="16"/>
+                <w:szCs w:val="16"/>
+              </w:rPr>
+              <w:t>Pause</w:t>
+            </w:r>
+          </w:p>
+        </w:tc>
+        <w:tc>
+          <w:tcPr>
+            <w:tcW w:w="1019" w:type="dxa"/>
+            <w:tcBorders>
+              <w:top w:val="single" w:sz="4" w:space="0" w:color="000000"/>
+              <w:left w:val="single" w:sz="4" w:space="0" w:color="000000"/>
+              <w:bottom w:val="single" w:sz="4" w:space="0" w:color="000000"/>
+            </w:tcBorders>
+            <w:vAlign w:val="bottom"/>
+          </w:tcPr>
+          <w:p>
+            <w:pPr>
+              <w:pStyle w:val="Normal"/>
+              <w:widowControl w:val="false"/>
+              <w:spacing w:lineRule="auto" w:line="180"/>
+              <w:jc w:val="center"/>
+              <w:rPr>
+                <w:color w:val="000000"/>
+                <w:sz w:val="16"/>
+                <w:szCs w:val="16"/>
+              </w:rPr>
+            </w:pPr>
+            <w:r>
+              <w:rPr>
+                <w:color w:val="000000"/>
+                <w:sz w:val="16"/>
+                <w:szCs w:val="16"/>
+              </w:rPr>
+              <w:t>Master Key</w:t>
+            </w:r>
+          </w:p>
+        </w:tc>
+        <w:tc>
+          <w:tcPr>
+            <w:tcW w:w="1014" w:type="dxa"/>
+            <w:tcBorders>
+              <w:top w:val="single" w:sz="4" w:space="0" w:color="000000"/>
+              <w:left w:val="single" w:sz="4" w:space="0" w:color="000000"/>
+              <w:bottom w:val="single" w:sz="4" w:space="0" w:color="000000"/>
+            </w:tcBorders>
+            <w:vAlign w:val="bottom"/>
+          </w:tcPr>
+          <w:p>
+            <w:pPr>
+              <w:pStyle w:val="Normal"/>
+              <w:widowControl w:val="false"/>
+              <w:spacing w:lineRule="auto" w:line="180"/>
+              <w:jc w:val="center"/>
+              <w:rPr>
+                <w:color w:val="000000"/>
+                <w:sz w:val="16"/>
+                <w:szCs w:val="16"/>
+              </w:rPr>
+            </w:pPr>
+            <w:r>
+              <w:rPr>
+                <w:rFonts w:eastAsia="arial" w:ascii="arial" w:hAnsi="arial"/>
+                <w:color w:val="000000"/>
+                <w:sz w:val="16"/>
+                <w:szCs w:val="16"/>
+              </w:rPr>
+              <w:t>Engine A Start</w:t>
+            </w:r>
+          </w:p>
+        </w:tc>
+        <w:tc>
+          <w:tcPr>
+            <w:tcW w:w="1016" w:type="dxa"/>
+            <w:tcBorders>
+              <w:top w:val="single" w:sz="4" w:space="0" w:color="000000"/>
+              <w:left w:val="single" w:sz="4" w:space="0" w:color="000000"/>
+              <w:bottom w:val="single" w:sz="4" w:space="0" w:color="000000"/>
+            </w:tcBorders>
+            <w:vAlign w:val="bottom"/>
+          </w:tcPr>
+          <w:p>
+            <w:pPr>
+              <w:pStyle w:val="Normal"/>
+              <w:widowControl w:val="false"/>
+              <w:spacing w:lineRule="auto" w:line="180"/>
+              <w:jc w:val="center"/>
+              <w:rPr>
+                <w:color w:val="000000"/>
+                <w:sz w:val="16"/>
+                <w:szCs w:val="16"/>
+              </w:rPr>
+            </w:pPr>
+            <w:r>
+              <w:rPr>
+                <w:color w:val="000000"/>
+                <w:sz w:val="16"/>
+                <w:szCs w:val="16"/>
+              </w:rPr>
+              <w:t>AWS</w:t>
+            </w:r>
+          </w:p>
+        </w:tc>
+        <w:tc>
+          <w:tcPr>
+            <w:tcW w:w="1020" w:type="dxa"/>
+            <w:tcBorders>
+              <w:top w:val="single" w:sz="4" w:space="0" w:color="000000"/>
+              <w:left w:val="single" w:sz="4" w:space="0" w:color="000000"/>
+              <w:bottom w:val="single" w:sz="4" w:space="0" w:color="000000"/>
+            </w:tcBorders>
+            <w:vAlign w:val="bottom"/>
+          </w:tcPr>
+          <w:p>
+            <w:pPr>
+              <w:pStyle w:val="Normal"/>
+              <w:widowControl w:val="false"/>
+              <w:spacing w:lineRule="auto" w:line="180"/>
+              <w:jc w:val="center"/>
+              <w:rPr>
+                <w:color w:val="000000"/>
+                <w:sz w:val="16"/>
+                <w:szCs w:val="16"/>
+              </w:rPr>
+            </w:pPr>
+            <w:r>
+              <w:rPr>
+                <w:color w:val="000000"/>
+                <w:sz w:val="16"/>
+                <w:szCs w:val="16"/>
+              </w:rPr>
+              <w:t>AWS Cab Change</w:t>
+            </w:r>
+          </w:p>
+        </w:tc>
+        <w:tc>
+          <w:tcPr>
+            <w:tcW w:w="1016" w:type="dxa"/>
+            <w:tcBorders>
+              <w:top w:val="single" w:sz="4" w:space="0" w:color="000000"/>
+              <w:left w:val="single" w:sz="4" w:space="0" w:color="000000"/>
+              <w:bottom w:val="single" w:sz="4" w:space="0" w:color="000000"/>
+            </w:tcBorders>
+            <w:vAlign w:val="bottom"/>
+          </w:tcPr>
+          <w:p>
+            <w:pPr>
+              <w:pStyle w:val="Normal"/>
+              <w:widowControl w:val="false"/>
+              <w:jc w:val="center"/>
+              <w:rPr>
+                <w:color w:val="000000"/>
+                <w:sz w:val="16"/>
+                <w:szCs w:val="16"/>
+              </w:rPr>
+            </w:pPr>
+            <w:r>
+              <w:rPr>
+                <w:color w:val="000000"/>
+                <w:sz w:val="16"/>
+                <w:szCs w:val="16"/>
+              </w:rPr>
+              <w:t>Engine B Start</w:t>
+            </w:r>
+          </w:p>
+        </w:tc>
+        <w:tc>
+          <w:tcPr>
+            <w:tcW w:w="1016" w:type="dxa"/>
+            <w:tcBorders>
+              <w:top w:val="single" w:sz="4" w:space="0" w:color="000000"/>
+              <w:left w:val="single" w:sz="4" w:space="0" w:color="000000"/>
+              <w:bottom w:val="single" w:sz="4" w:space="0" w:color="000000"/>
+            </w:tcBorders>
+            <w:vAlign w:val="bottom"/>
+          </w:tcPr>
+          <w:p>
+            <w:pPr>
+              <w:pStyle w:val="Normal"/>
+              <w:widowControl w:val="false"/>
+              <w:spacing w:lineRule="auto" w:line="180"/>
+              <w:jc w:val="center"/>
+              <w:rPr>
+                <w:color w:val="000000"/>
+                <w:sz w:val="16"/>
+                <w:szCs w:val="16"/>
+              </w:rPr>
+            </w:pPr>
+            <w:r>
+              <w:rPr>
+                <w:color w:val="000000"/>
+                <w:sz w:val="16"/>
+                <w:szCs w:val="16"/>
+              </w:rPr>
+              <w:t>Engine Isol. On</w:t>
+            </w:r>
+          </w:p>
+        </w:tc>
+        <w:tc>
+          <w:tcPr>
+            <w:tcW w:w="1017" w:type="dxa"/>
+            <w:tcBorders>
+              <w:top w:val="single" w:sz="4" w:space="0" w:color="000000"/>
+              <w:left w:val="single" w:sz="4" w:space="0" w:color="000000"/>
+              <w:bottom w:val="single" w:sz="4" w:space="0" w:color="000000"/>
+            </w:tcBorders>
+            <w:vAlign w:val="bottom"/>
+          </w:tcPr>
+          <w:p>
+            <w:pPr>
+              <w:pStyle w:val="Normal"/>
+              <w:widowControl w:val="false"/>
+              <w:jc w:val="center"/>
+              <w:rPr>
+                <w:color w:val="000000"/>
+                <w:sz w:val="16"/>
+                <w:szCs w:val="16"/>
+              </w:rPr>
+            </w:pPr>
+            <w:r>
+              <w:rPr>
+                <w:rFonts w:eastAsia="arial" w:ascii="arial" w:hAnsi="arial"/>
+                <w:color w:val="000000"/>
+                <w:sz w:val="16"/>
+                <w:szCs w:val="16"/>
+              </w:rPr>
+              <w:t>Brake Selector</w:t>
+            </w:r>
+          </w:p>
+        </w:tc>
+        <w:tc>
+          <w:tcPr>
+            <w:tcW w:w="1016" w:type="dxa"/>
+            <w:tcBorders>
+              <w:top w:val="single" w:sz="4" w:space="0" w:color="000000"/>
+              <w:left w:val="single" w:sz="4" w:space="0" w:color="000000"/>
+              <w:bottom w:val="single" w:sz="4" w:space="0" w:color="000000"/>
+            </w:tcBorders>
+            <w:vAlign w:val="bottom"/>
+          </w:tcPr>
+          <w:p>
+            <w:pPr>
+              <w:pStyle w:val="Normal"/>
+              <w:widowControl w:val="false"/>
+              <w:jc w:val="center"/>
+              <w:rPr>
+                <w:color w:val="000000"/>
+                <w:sz w:val="16"/>
+                <w:szCs w:val="16"/>
+              </w:rPr>
+            </w:pPr>
+            <w:r>
+              <w:rPr>
+                <w:color w:val="000000"/>
+                <w:sz w:val="16"/>
+                <w:szCs w:val="16"/>
+              </w:rPr>
+            </w:r>
+          </w:p>
+        </w:tc>
+        <w:tc>
+          <w:tcPr>
+            <w:tcW w:w="1020" w:type="dxa"/>
+            <w:tcBorders>
+              <w:top w:val="single" w:sz="4" w:space="0" w:color="000000"/>
+              <w:left w:val="single" w:sz="4" w:space="0" w:color="000000"/>
+              <w:bottom w:val="single" w:sz="4" w:space="0" w:color="000000"/>
+            </w:tcBorders>
+            <w:vAlign w:val="bottom"/>
+          </w:tcPr>
+          <w:p>
+            <w:pPr>
+              <w:pStyle w:val="Normal"/>
+              <w:widowControl w:val="false"/>
+              <w:spacing w:lineRule="auto" w:line="180"/>
+              <w:jc w:val="center"/>
+              <w:rPr>
+                <w:sz w:val="16"/>
+                <w:szCs w:val="16"/>
+              </w:rPr>
+            </w:pPr>
+            <w:r>
+              <w:rPr>
+                <w:sz w:val="16"/>
+                <w:szCs w:val="16"/>
+              </w:rPr>
+              <w:t>Class Light</w:t>
+            </w:r>
+          </w:p>
+        </w:tc>
+        <w:tc>
+          <w:tcPr>
+            <w:tcW w:w="1016" w:type="dxa"/>
+            <w:tcBorders>
+              <w:top w:val="single" w:sz="4" w:space="0" w:color="000000"/>
+              <w:left w:val="single" w:sz="4" w:space="0" w:color="000000"/>
+              <w:bottom w:val="single" w:sz="4" w:space="0" w:color="000000"/>
+            </w:tcBorders>
+            <w:vAlign w:val="bottom"/>
+          </w:tcPr>
+          <w:p>
+            <w:pPr>
+              <w:pStyle w:val="Normal"/>
+              <w:widowControl w:val="false"/>
+              <w:spacing w:lineRule="auto" w:line="180"/>
+              <w:jc w:val="center"/>
+              <w:rPr>
+                <w:sz w:val="16"/>
+                <w:szCs w:val="16"/>
+              </w:rPr>
+            </w:pPr>
+            <w:r>
+              <w:rPr>
+                <w:rFonts w:eastAsia="arial" w:ascii="arial" w:hAnsi="arial"/>
+                <w:color w:val="000000"/>
+                <w:sz w:val="16"/>
+                <w:szCs w:val="16"/>
+              </w:rPr>
+              <w:t>Cab Light</w:t>
+            </w:r>
+          </w:p>
+        </w:tc>
+        <w:tc>
+          <w:tcPr>
+            <w:tcW w:w="1016" w:type="dxa"/>
+            <w:tcBorders>
+              <w:top w:val="single" w:sz="4" w:space="0" w:color="000000"/>
+              <w:left w:val="single" w:sz="4" w:space="0" w:color="000000"/>
+              <w:bottom w:val="single" w:sz="4" w:space="0" w:color="000000"/>
+            </w:tcBorders>
+            <w:vAlign w:val="bottom"/>
+          </w:tcPr>
+          <w:p>
+            <w:pPr>
+              <w:pStyle w:val="Normal"/>
+              <w:widowControl w:val="false"/>
+              <w:spacing w:lineRule="auto" w:line="180"/>
+              <w:jc w:val="center"/>
+              <w:rPr>
+                <w:sz w:val="16"/>
+                <w:szCs w:val="16"/>
+              </w:rPr>
+            </w:pPr>
+            <w:r>
+              <w:rPr>
+                <w:sz w:val="16"/>
+                <w:szCs w:val="16"/>
+              </w:rPr>
+              <w:t>Handbrake On</w:t>
+            </w:r>
+          </w:p>
+        </w:tc>
+        <w:tc>
+          <w:tcPr>
+            <w:tcW w:w="1016" w:type="dxa"/>
+            <w:tcBorders>
+              <w:top w:val="single" w:sz="4" w:space="0" w:color="000000"/>
+              <w:left w:val="single" w:sz="4" w:space="0" w:color="000000"/>
+              <w:bottom w:val="single" w:sz="4" w:space="0" w:color="000000"/>
+            </w:tcBorders>
+            <w:vAlign w:val="bottom"/>
+          </w:tcPr>
+          <w:p>
+            <w:pPr>
+              <w:pStyle w:val="Normal"/>
+              <w:widowControl w:val="false"/>
+              <w:spacing w:lineRule="auto" w:line="180"/>
+              <w:jc w:val="center"/>
+              <w:rPr>
+                <w:sz w:val="16"/>
+                <w:szCs w:val="16"/>
+              </w:rPr>
+            </w:pPr>
+            <w:r>
+              <w:rPr>
+                <w:rFonts w:eastAsia="arial" w:ascii="arial" w:hAnsi="arial"/>
+                <w:color w:val="000000"/>
+                <w:sz w:val="16"/>
+                <w:szCs w:val="16"/>
+              </w:rPr>
+              <w:t>1-Person</w:t>
+            </w:r>
+          </w:p>
+        </w:tc>
+        <w:tc>
+          <w:tcPr>
+            <w:tcW w:w="1029" w:type="dxa"/>
+            <w:tcBorders>
+              <w:top w:val="single" w:sz="4" w:space="0" w:color="000000"/>
+              <w:left w:val="single" w:sz="4" w:space="0" w:color="000000"/>
+              <w:bottom w:val="single" w:sz="4" w:space="0" w:color="000000"/>
+              <w:right w:val="single" w:sz="4" w:space="0" w:color="000000"/>
+            </w:tcBorders>
+            <w:vAlign w:val="bottom"/>
+          </w:tcPr>
+          <w:p>
+            <w:pPr>
+              <w:pStyle w:val="Normal"/>
+              <w:widowControl w:val="false"/>
+              <w:spacing w:lineRule="auto" w:line="180"/>
+              <w:jc w:val="center"/>
+              <w:rPr>
+                <w:sz w:val="16"/>
+                <w:szCs w:val="16"/>
+              </w:rPr>
+            </w:pPr>
+            <w:r>
+              <w:rPr>
+                <w:rFonts w:eastAsia="arial" w:ascii="arial" w:hAnsi="arial"/>
+                <w:color w:val="000000"/>
+                <w:sz w:val="16"/>
+                <w:szCs w:val="16"/>
+              </w:rPr>
+              <w:t>Next</w:t>
+            </w:r>
+          </w:p>
+          <w:p>
+            <w:pPr>
+              <w:pStyle w:val="Normal"/>
+              <w:widowControl w:val="false"/>
+              <w:spacing w:lineRule="auto" w:line="180"/>
+              <w:jc w:val="center"/>
+              <w:rPr>
+                <w:sz w:val="16"/>
+                <w:szCs w:val="16"/>
+              </w:rPr>
+            </w:pPr>
+            <w:r>
+              <w:rPr>
+                <w:rFonts w:eastAsia="arial" w:ascii="arial" w:hAnsi="arial"/>
+                <w:color w:val="000000"/>
+                <w:sz w:val="16"/>
+                <w:szCs w:val="16"/>
+              </w:rPr>
+              <w:t>Cab Cam</w:t>
+            </w:r>
+          </w:p>
+        </w:tc>
+      </w:tr>
+    </w:tbl>
+    <w:p>
+      <w:pPr>
+        <w:pStyle w:val="Normal"/>
+        <w:rPr>
+          <w:rFonts w:ascii="arial" w:hAnsi="arial" w:eastAsia="arial"/>
+          <w:color w:val="000000"/>
+          <w:sz w:val="16"/>
+          <w:szCs w:val="16"/>
+        </w:rPr>
+      </w:pPr>
+      <w:r>
+        <w:rPr>
+          <w:rFonts w:eastAsia="arial" w:ascii="arial" w:hAnsi="arial"/>
+          <w:color w:val="000000"/>
+          <w:sz w:val="16"/>
+          <w:szCs w:val="16"/>
+        </w:rPr>
+      </w:r>
+    </w:p>
+    <w:p>
+      <w:pPr>
+        <w:pStyle w:val="Normal"/>
+        <w:rPr>
+          <w:color w:val="000000"/>
+          <w:sz w:val="16"/>
+          <w:szCs w:val="16"/>
+        </w:rPr>
+      </w:pPr>
+      <w:r>
+        <w:rPr>
+          <w:rFonts w:eastAsia="arial" w:ascii="arial" w:hAnsi="arial"/>
+          <w:color w:val="000000"/>
+          <w:sz w:val="16"/>
+          <w:szCs w:val="16"/>
+        </w:rPr>
+        <w:tab/>
+        <w:t xml:space="preserve">           Class 52-2</w:t>
+      </w:r>
+    </w:p>
+    <w:tbl>
+      <w:tblPr>
+        <w:tblW w:w="14248" w:type="dxa"/>
+        <w:jc w:val="left"/>
+        <w:tblInd w:w="-5" w:type="dxa"/>
+        <w:tblLayout w:type="fixed"/>
+        <w:tblCellMar>
+          <w:top w:w="0" w:type="dxa"/>
+          <w:left w:w="108" w:type="dxa"/>
+          <w:bottom w:w="0" w:type="dxa"/>
+          <w:right w:w="108" w:type="dxa"/>
+        </w:tblCellMar>
+        <w:tblLook w:firstRow="1" w:noVBand="1" w:lastRow="0" w:firstColumn="1" w:lastColumn="0" w:noHBand="0" w:val="04a0"/>
+      </w:tblPr>
+      <w:tblGrid>
+        <w:gridCol w:w="1017"/>
+        <w:gridCol w:w="1019"/>
+        <w:gridCol w:w="1014"/>
+        <w:gridCol w:w="1016"/>
+        <w:gridCol w:w="1020"/>
+        <w:gridCol w:w="1016"/>
+        <w:gridCol w:w="1016"/>
+        <w:gridCol w:w="1017"/>
+        <w:gridCol w:w="1016"/>
+        <w:gridCol w:w="1020"/>
+        <w:gridCol w:w="1016"/>
+        <w:gridCol w:w="1016"/>
+        <w:gridCol w:w="1016"/>
+        <w:gridCol w:w="1029"/>
+      </w:tblGrid>
+      <w:tr>
+        <w:trPr>
+          <w:trHeight w:val="440" w:hRule="exact"/>
+          <w:cantSplit w:val="true"/>
+        </w:trPr>
+        <w:tc>
+          <w:tcPr>
+            <w:tcW w:w="1017" w:type="dxa"/>
+            <w:tcBorders>
+              <w:top w:val="single" w:sz="4" w:space="0" w:color="000000"/>
+              <w:left w:val="single" w:sz="4" w:space="0" w:color="000000"/>
+              <w:bottom w:val="single" w:sz="4" w:space="0" w:color="000000"/>
+            </w:tcBorders>
+            <w:vAlign w:val="bottom"/>
+          </w:tcPr>
+          <w:p>
+            <w:pPr>
+              <w:pStyle w:val="Normal"/>
+              <w:widowControl w:val="false"/>
+              <w:spacing w:lineRule="auto" w:line="180" w:before="0" w:after="60"/>
+              <w:jc w:val="center"/>
+              <w:rPr>
+                <w:b/>
+                <w:bCs/>
+              </w:rPr>
+            </w:pPr>
+            <w:r>
+              <w:rPr>
+                <w:b/>
+                <w:bCs/>
+                <w:color w:val="000000"/>
+                <w:sz w:val="16"/>
+                <w:szCs w:val="16"/>
+              </w:rPr>
+              <w:t>HUD</w:t>
+            </w:r>
+          </w:p>
+        </w:tc>
+        <w:tc>
+          <w:tcPr>
+            <w:tcW w:w="1019" w:type="dxa"/>
+            <w:tcBorders>
+              <w:top w:val="single" w:sz="4" w:space="0" w:color="000000"/>
+              <w:left w:val="single" w:sz="4" w:space="0" w:color="000000"/>
+              <w:bottom w:val="single" w:sz="4" w:space="0" w:color="000000"/>
+            </w:tcBorders>
+            <w:vAlign w:val="bottom"/>
+          </w:tcPr>
+          <w:p>
+            <w:pPr>
+              <w:pStyle w:val="Normal"/>
+              <w:widowControl w:val="false"/>
+              <w:spacing w:lineRule="auto" w:line="180"/>
+              <w:jc w:val="center"/>
+              <w:rPr>
+                <w:color w:val="000000"/>
+                <w:sz w:val="16"/>
+                <w:szCs w:val="16"/>
+              </w:rPr>
+            </w:pPr>
+            <w:r>
+              <w:rPr>
+                <w:color w:val="000000"/>
+                <w:sz w:val="16"/>
+                <w:szCs w:val="16"/>
+              </w:rPr>
+              <w:t>Schedule</w:t>
+            </w:r>
+          </w:p>
+        </w:tc>
+        <w:tc>
+          <w:tcPr>
+            <w:tcW w:w="1014" w:type="dxa"/>
+            <w:tcBorders>
+              <w:top w:val="single" w:sz="4" w:space="0" w:color="000000"/>
+              <w:left w:val="single" w:sz="4" w:space="0" w:color="000000"/>
+              <w:bottom w:val="single" w:sz="4" w:space="0" w:color="000000"/>
+            </w:tcBorders>
+            <w:vAlign w:val="bottom"/>
+          </w:tcPr>
+          <w:p>
+            <w:pPr>
+              <w:pStyle w:val="Normal"/>
+              <w:widowControl w:val="false"/>
+              <w:spacing w:lineRule="auto" w:line="180"/>
+              <w:jc w:val="center"/>
+              <w:rPr>
+                <w:color w:val="000000"/>
+                <w:sz w:val="16"/>
+                <w:szCs w:val="16"/>
+              </w:rPr>
+            </w:pPr>
+            <w:r>
+              <w:rPr>
+                <w:rFonts w:eastAsia="arial" w:ascii="arial" w:hAnsi="arial"/>
+                <w:color w:val="000000"/>
+                <w:sz w:val="16"/>
+                <w:szCs w:val="16"/>
+              </w:rPr>
+              <w:t>Engine A Stop</w:t>
+            </w:r>
+          </w:p>
+        </w:tc>
+        <w:tc>
+          <w:tcPr>
+            <w:tcW w:w="1016" w:type="dxa"/>
+            <w:tcBorders>
+              <w:top w:val="single" w:sz="4" w:space="0" w:color="000000"/>
+              <w:left w:val="single" w:sz="4" w:space="0" w:color="000000"/>
+              <w:bottom w:val="single" w:sz="4" w:space="0" w:color="000000"/>
+            </w:tcBorders>
+            <w:vAlign w:val="bottom"/>
+          </w:tcPr>
+          <w:p>
+            <w:pPr>
+              <w:pStyle w:val="Normal"/>
+              <w:widowControl w:val="false"/>
+              <w:spacing w:lineRule="auto" w:line="180"/>
+              <w:jc w:val="center"/>
+              <w:rPr>
+                <w:color w:val="000000"/>
+                <w:sz w:val="16"/>
+                <w:szCs w:val="16"/>
+              </w:rPr>
+            </w:pPr>
+            <w:r>
+              <w:rPr>
+                <w:color w:val="000000"/>
+                <w:sz w:val="16"/>
+                <w:szCs w:val="16"/>
+              </w:rPr>
+              <w:t>DSD</w:t>
+            </w:r>
+          </w:p>
+        </w:tc>
+        <w:tc>
+          <w:tcPr>
+            <w:tcW w:w="1020" w:type="dxa"/>
+            <w:tcBorders>
+              <w:top w:val="single" w:sz="4" w:space="0" w:color="000000"/>
+              <w:left w:val="single" w:sz="4" w:space="0" w:color="000000"/>
+              <w:bottom w:val="single" w:sz="4" w:space="0" w:color="000000"/>
+            </w:tcBorders>
+            <w:vAlign w:val="bottom"/>
+          </w:tcPr>
+          <w:p>
+            <w:pPr>
+              <w:pStyle w:val="Normal"/>
+              <w:widowControl w:val="false"/>
+              <w:spacing w:lineRule="auto" w:line="180"/>
+              <w:jc w:val="center"/>
+              <w:rPr>
+                <w:color w:val="000000"/>
+                <w:sz w:val="16"/>
+                <w:szCs w:val="16"/>
+              </w:rPr>
+            </w:pPr>
+            <w:r>
+              <w:rPr>
+                <w:color w:val="000000"/>
+                <w:sz w:val="16"/>
+                <w:szCs w:val="16"/>
+              </w:rPr>
+            </w:r>
+          </w:p>
+        </w:tc>
+        <w:tc>
+          <w:tcPr>
+            <w:tcW w:w="1016" w:type="dxa"/>
+            <w:tcBorders>
+              <w:top w:val="single" w:sz="4" w:space="0" w:color="000000"/>
+              <w:left w:val="single" w:sz="4" w:space="0" w:color="000000"/>
+              <w:bottom w:val="single" w:sz="4" w:space="0" w:color="000000"/>
+            </w:tcBorders>
+            <w:vAlign w:val="bottom"/>
+          </w:tcPr>
+          <w:p>
+            <w:pPr>
+              <w:pStyle w:val="Normal"/>
+              <w:widowControl w:val="false"/>
+              <w:jc w:val="center"/>
+              <w:rPr>
+                <w:color w:val="000000"/>
+                <w:sz w:val="16"/>
+                <w:szCs w:val="16"/>
+              </w:rPr>
+            </w:pPr>
+            <w:r>
+              <w:rPr>
+                <w:color w:val="000000"/>
+                <w:sz w:val="16"/>
+                <w:szCs w:val="16"/>
+              </w:rPr>
+              <w:t>Engine B Stop</w:t>
+            </w:r>
+          </w:p>
+        </w:tc>
+        <w:tc>
+          <w:tcPr>
+            <w:tcW w:w="1016" w:type="dxa"/>
+            <w:tcBorders>
+              <w:top w:val="single" w:sz="4" w:space="0" w:color="000000"/>
+              <w:left w:val="single" w:sz="4" w:space="0" w:color="000000"/>
+              <w:bottom w:val="single" w:sz="4" w:space="0" w:color="000000"/>
+            </w:tcBorders>
+            <w:vAlign w:val="bottom"/>
+          </w:tcPr>
+          <w:p>
+            <w:pPr>
+              <w:pStyle w:val="Normal"/>
+              <w:widowControl w:val="false"/>
+              <w:spacing w:lineRule="auto" w:line="180"/>
+              <w:jc w:val="center"/>
+              <w:rPr>
+                <w:color w:val="000000"/>
+                <w:sz w:val="16"/>
+                <w:szCs w:val="16"/>
+              </w:rPr>
+            </w:pPr>
+            <w:r>
+              <w:rPr>
+                <w:color w:val="000000"/>
+                <w:sz w:val="16"/>
+                <w:szCs w:val="16"/>
+              </w:rPr>
+              <w:t>Engine Isol. Off</w:t>
+            </w:r>
+          </w:p>
+        </w:tc>
+        <w:tc>
+          <w:tcPr>
+            <w:tcW w:w="1017" w:type="dxa"/>
+            <w:tcBorders>
+              <w:top w:val="single" w:sz="4" w:space="0" w:color="000000"/>
+              <w:left w:val="single" w:sz="4" w:space="0" w:color="000000"/>
+              <w:bottom w:val="single" w:sz="4" w:space="0" w:color="000000"/>
+            </w:tcBorders>
+            <w:vAlign w:val="bottom"/>
+          </w:tcPr>
+          <w:p>
+            <w:pPr>
+              <w:pStyle w:val="Normal"/>
+              <w:widowControl w:val="false"/>
+              <w:jc w:val="center"/>
+              <w:rPr>
+                <w:rFonts w:ascii="arial" w:hAnsi="arial" w:eastAsia="arial"/>
+                <w:color w:val="000000"/>
+                <w:sz w:val="16"/>
+                <w:szCs w:val="16"/>
+              </w:rPr>
+            </w:pPr>
+            <w:r>
+              <w:rPr>
+                <w:rFonts w:eastAsia="arial" w:ascii="arial" w:hAnsi="arial"/>
+                <w:color w:val="000000"/>
+                <w:sz w:val="16"/>
+                <w:szCs w:val="16"/>
+              </w:rPr>
+            </w:r>
+          </w:p>
+        </w:tc>
+        <w:tc>
+          <w:tcPr>
+            <w:tcW w:w="1016" w:type="dxa"/>
+            <w:tcBorders>
+              <w:top w:val="single" w:sz="4" w:space="0" w:color="000000"/>
+              <w:left w:val="single" w:sz="4" w:space="0" w:color="000000"/>
+              <w:bottom w:val="single" w:sz="4" w:space="0" w:color="000000"/>
+            </w:tcBorders>
+            <w:vAlign w:val="bottom"/>
+          </w:tcPr>
+          <w:p>
+            <w:pPr>
+              <w:pStyle w:val="Normal"/>
+              <w:widowControl w:val="false"/>
+              <w:jc w:val="center"/>
+              <w:rPr>
+                <w:color w:val="000000"/>
+                <w:sz w:val="16"/>
+                <w:szCs w:val="16"/>
+              </w:rPr>
+            </w:pPr>
+            <w:r>
+              <w:rPr>
+                <w:color w:val="000000"/>
+                <w:sz w:val="16"/>
+                <w:szCs w:val="16"/>
+              </w:rPr>
+            </w:r>
+          </w:p>
+        </w:tc>
+        <w:tc>
+          <w:tcPr>
+            <w:tcW w:w="1020" w:type="dxa"/>
+            <w:tcBorders>
+              <w:top w:val="single" w:sz="4" w:space="0" w:color="000000"/>
+              <w:left w:val="single" w:sz="4" w:space="0" w:color="000000"/>
+              <w:bottom w:val="single" w:sz="4" w:space="0" w:color="000000"/>
+            </w:tcBorders>
+            <w:vAlign w:val="bottom"/>
+          </w:tcPr>
+          <w:p>
+            <w:pPr>
+              <w:pStyle w:val="Normal"/>
+              <w:widowControl w:val="false"/>
+              <w:spacing w:lineRule="auto" w:line="180"/>
+              <w:jc w:val="center"/>
+              <w:rPr>
+                <w:sz w:val="16"/>
+                <w:szCs w:val="16"/>
+              </w:rPr>
+            </w:pPr>
+            <w:r>
+              <w:rPr>
+                <w:sz w:val="16"/>
+                <w:szCs w:val="16"/>
+              </w:rPr>
+              <w:t>Tail Light</w:t>
+            </w:r>
+          </w:p>
+        </w:tc>
+        <w:tc>
+          <w:tcPr>
+            <w:tcW w:w="1016" w:type="dxa"/>
+            <w:tcBorders>
+              <w:top w:val="single" w:sz="4" w:space="0" w:color="000000"/>
+              <w:left w:val="single" w:sz="4" w:space="0" w:color="000000"/>
+              <w:bottom w:val="single" w:sz="4" w:space="0" w:color="000000"/>
+            </w:tcBorders>
+            <w:vAlign w:val="bottom"/>
+          </w:tcPr>
+          <w:p>
+            <w:pPr>
+              <w:pStyle w:val="Normal"/>
+              <w:widowControl w:val="false"/>
+              <w:spacing w:lineRule="auto" w:line="180"/>
+              <w:jc w:val="center"/>
+              <w:rPr>
+                <w:sz w:val="16"/>
+                <w:szCs w:val="16"/>
+              </w:rPr>
+            </w:pPr>
+            <w:r>
+              <w:rPr>
+                <w:sz w:val="16"/>
+                <w:szCs w:val="16"/>
+              </w:rPr>
+              <w:t>Inst. Light</w:t>
+            </w:r>
+          </w:p>
+        </w:tc>
+        <w:tc>
+          <w:tcPr>
+            <w:tcW w:w="1016" w:type="dxa"/>
+            <w:tcBorders>
+              <w:top w:val="single" w:sz="4" w:space="0" w:color="000000"/>
+              <w:left w:val="single" w:sz="4" w:space="0" w:color="000000"/>
+              <w:bottom w:val="single" w:sz="4" w:space="0" w:color="000000"/>
+            </w:tcBorders>
+            <w:vAlign w:val="bottom"/>
+          </w:tcPr>
+          <w:p>
+            <w:pPr>
+              <w:pStyle w:val="Normal"/>
+              <w:widowControl w:val="false"/>
+              <w:spacing w:lineRule="auto" w:line="180"/>
+              <w:jc w:val="center"/>
+              <w:rPr>
+                <w:sz w:val="16"/>
+                <w:szCs w:val="16"/>
+              </w:rPr>
+            </w:pPr>
+            <w:r>
+              <w:rPr>
+                <w:sz w:val="16"/>
+                <w:szCs w:val="16"/>
+              </w:rPr>
+              <w:t>Handbrake Off</w:t>
+            </w:r>
+          </w:p>
+        </w:tc>
+        <w:tc>
+          <w:tcPr>
+            <w:tcW w:w="1016" w:type="dxa"/>
+            <w:tcBorders>
+              <w:top w:val="single" w:sz="4" w:space="0" w:color="000000"/>
+              <w:left w:val="single" w:sz="4" w:space="0" w:color="000000"/>
+              <w:bottom w:val="single" w:sz="4" w:space="0" w:color="000000"/>
+            </w:tcBorders>
+            <w:vAlign w:val="bottom"/>
+          </w:tcPr>
+          <w:p>
+            <w:pPr>
+              <w:pStyle w:val="Normal"/>
+              <w:widowControl w:val="false"/>
+              <w:spacing w:lineRule="auto" w:line="180"/>
+              <w:jc w:val="center"/>
+              <w:rPr>
+                <w:sz w:val="16"/>
+                <w:szCs w:val="16"/>
+              </w:rPr>
+            </w:pPr>
+            <w:r>
+              <w:rPr>
+                <w:rFonts w:eastAsia="arial" w:ascii="arial" w:hAnsi="arial"/>
+                <w:color w:val="000000"/>
+                <w:sz w:val="16"/>
+                <w:szCs w:val="16"/>
+              </w:rPr>
+              <w:t>Exterior</w:t>
+            </w:r>
+          </w:p>
+          <w:p>
+            <w:pPr>
+              <w:pStyle w:val="Normal"/>
+              <w:widowControl w:val="false"/>
+              <w:spacing w:lineRule="auto" w:line="180"/>
+              <w:jc w:val="center"/>
+              <w:rPr>
+                <w:sz w:val="16"/>
+                <w:szCs w:val="16"/>
+              </w:rPr>
+            </w:pPr>
+            <w:r>
+              <w:rPr>
+                <w:rFonts w:eastAsia="arial" w:ascii="arial" w:hAnsi="arial"/>
+                <w:color w:val="000000"/>
+                <w:sz w:val="16"/>
+                <w:szCs w:val="16"/>
+              </w:rPr>
+              <w:t>Camera</w:t>
+            </w:r>
+          </w:p>
+        </w:tc>
+        <w:tc>
+          <w:tcPr>
+            <w:tcW w:w="1029" w:type="dxa"/>
+            <w:tcBorders>
+              <w:top w:val="single" w:sz="4" w:space="0" w:color="000000"/>
+              <w:left w:val="single" w:sz="4" w:space="0" w:color="000000"/>
+              <w:bottom w:val="single" w:sz="4" w:space="0" w:color="000000"/>
+              <w:right w:val="single" w:sz="4" w:space="0" w:color="000000"/>
+            </w:tcBorders>
+            <w:vAlign w:val="bottom"/>
+          </w:tcPr>
+          <w:p>
+            <w:pPr>
+              <w:pStyle w:val="Normal"/>
+              <w:widowControl w:val="false"/>
+              <w:spacing w:lineRule="auto" w:line="180"/>
+              <w:jc w:val="center"/>
+              <w:rPr>
+                <w:sz w:val="16"/>
+                <w:szCs w:val="16"/>
+              </w:rPr>
+            </w:pPr>
+            <w:r>
+              <w:rPr>
+                <w:rFonts w:eastAsia="arial" w:ascii="arial" w:hAnsi="arial"/>
+                <w:color w:val="000000"/>
+                <w:sz w:val="16"/>
+                <w:szCs w:val="16"/>
+              </w:rPr>
+              <w:t>Prev</w:t>
+            </w:r>
+          </w:p>
+          <w:p>
+            <w:pPr>
+              <w:pStyle w:val="Normal"/>
+              <w:widowControl w:val="false"/>
+              <w:spacing w:lineRule="auto" w:line="180"/>
+              <w:jc w:val="center"/>
+              <w:rPr>
+                <w:sz w:val="16"/>
+                <w:szCs w:val="16"/>
+              </w:rPr>
+            </w:pPr>
+            <w:r>
+              <w:rPr>
+                <w:rFonts w:eastAsia="arial" w:ascii="arial" w:hAnsi="arial"/>
+                <w:color w:val="000000"/>
+                <w:sz w:val="16"/>
+                <w:szCs w:val="16"/>
+              </w:rPr>
+              <w:t>Cab Cam</w:t>
+            </w:r>
+          </w:p>
+        </w:tc>
+      </w:tr>
+    </w:tbl>
+    <w:p>
+      <w:pPr>
+        <w:pStyle w:val="Normal"/>
+        <w:rPr>
+          <w:color w:val="000000"/>
+          <w:sz w:val="16"/>
+          <w:szCs w:val="16"/>
+        </w:rPr>
+      </w:pPr>
+      <w:r>
+        <w:rPr>
+          <w:color w:val="000000"/>
+          <w:sz w:val="16"/>
+          <w:szCs w:val="16"/>
+        </w:rPr>
+      </w:r>
+    </w:p>
+    <w:p>
+      <w:pPr>
+        <w:pStyle w:val="Normal"/>
+        <w:rPr>
+          <w:color w:val="000000"/>
+          <w:sz w:val="16"/>
+          <w:szCs w:val="16"/>
+        </w:rPr>
+      </w:pPr>
+      <w:r>
+        <w:rPr>
+          <w:color w:val="000000"/>
+          <w:sz w:val="16"/>
+          <w:szCs w:val="16"/>
+        </w:rPr>
+        <w:tab/>
+        <w:t xml:space="preserve">       </w:t>
       </w:r>
       <w:r>
         <w:rPr>
@@ -10050,7 +11138,1111 @@
           <w:sz w:val="16"/>
           <w:szCs w:val="16"/>
         </w:rPr>
-        <w:t>52</w:t>
+        <w:t xml:space="preserve">    Class 66-1</w:t>
+      </w:r>
+    </w:p>
+    <w:tbl>
+      <w:tblPr>
+        <w:tblW w:w="14248" w:type="dxa"/>
+        <w:jc w:val="left"/>
+        <w:tblInd w:w="-5" w:type="dxa"/>
+        <w:tblLayout w:type="fixed"/>
+        <w:tblCellMar>
+          <w:top w:w="0" w:type="dxa"/>
+          <w:left w:w="108" w:type="dxa"/>
+          <w:bottom w:w="0" w:type="dxa"/>
+          <w:right w:w="108" w:type="dxa"/>
+        </w:tblCellMar>
+        <w:tblLook w:firstRow="1" w:noVBand="1" w:lastRow="0" w:firstColumn="1" w:lastColumn="0" w:noHBand="0" w:val="04a0"/>
+      </w:tblPr>
+      <w:tblGrid>
+        <w:gridCol w:w="1017"/>
+        <w:gridCol w:w="1019"/>
+        <w:gridCol w:w="1014"/>
+        <w:gridCol w:w="1016"/>
+        <w:gridCol w:w="1020"/>
+        <w:gridCol w:w="1016"/>
+        <w:gridCol w:w="1016"/>
+        <w:gridCol w:w="1017"/>
+        <w:gridCol w:w="1016"/>
+        <w:gridCol w:w="1020"/>
+        <w:gridCol w:w="1016"/>
+        <w:gridCol w:w="1016"/>
+        <w:gridCol w:w="1016"/>
+        <w:gridCol w:w="1029"/>
+      </w:tblGrid>
+      <w:tr>
+        <w:trPr>
+          <w:trHeight w:val="440" w:hRule="exact"/>
+          <w:cantSplit w:val="true"/>
+        </w:trPr>
+        <w:tc>
+          <w:tcPr>
+            <w:tcW w:w="1017" w:type="dxa"/>
+            <w:tcBorders>
+              <w:top w:val="single" w:sz="4" w:space="0" w:color="000000"/>
+              <w:left w:val="single" w:sz="4" w:space="0" w:color="000000"/>
+              <w:bottom w:val="single" w:sz="4" w:space="0" w:color="000000"/>
+            </w:tcBorders>
+            <w:vAlign w:val="bottom"/>
+          </w:tcPr>
+          <w:p>
+            <w:pPr>
+              <w:pStyle w:val="Normal"/>
+              <w:widowControl w:val="false"/>
+              <w:spacing w:lineRule="auto" w:line="180" w:before="0" w:after="60"/>
+              <w:jc w:val="center"/>
+              <w:rPr>
+                <w:color w:val="000000"/>
+                <w:sz w:val="16"/>
+                <w:szCs w:val="16"/>
+              </w:rPr>
+            </w:pPr>
+            <w:r>
+              <w:rPr>
+                <w:rFonts w:eastAsia="arial" w:ascii="arial" w:hAnsi="arial"/>
+                <w:b/>
+                <w:color w:val="000000"/>
+                <w:sz w:val="16"/>
+                <w:szCs w:val="16"/>
+              </w:rPr>
+              <w:t>Pause</w:t>
+            </w:r>
+          </w:p>
+        </w:tc>
+        <w:tc>
+          <w:tcPr>
+            <w:tcW w:w="1019" w:type="dxa"/>
+            <w:tcBorders>
+              <w:top w:val="single" w:sz="4" w:space="0" w:color="000000"/>
+              <w:left w:val="single" w:sz="4" w:space="0" w:color="000000"/>
+              <w:bottom w:val="single" w:sz="4" w:space="0" w:color="000000"/>
+            </w:tcBorders>
+            <w:vAlign w:val="bottom"/>
+          </w:tcPr>
+          <w:p>
+            <w:pPr>
+              <w:pStyle w:val="Normal"/>
+              <w:widowControl w:val="false"/>
+              <w:spacing w:lineRule="auto" w:line="180"/>
+              <w:jc w:val="center"/>
+              <w:rPr>
+                <w:color w:val="000000"/>
+                <w:sz w:val="16"/>
+                <w:szCs w:val="16"/>
+              </w:rPr>
+            </w:pPr>
+            <w:r>
+              <w:rPr>
+                <w:color w:val="000000"/>
+                <w:sz w:val="16"/>
+                <w:szCs w:val="16"/>
+              </w:rPr>
+              <w:t>Reverser Handle</w:t>
+            </w:r>
+          </w:p>
+        </w:tc>
+        <w:tc>
+          <w:tcPr>
+            <w:tcW w:w="1014" w:type="dxa"/>
+            <w:tcBorders>
+              <w:top w:val="single" w:sz="4" w:space="0" w:color="000000"/>
+              <w:left w:val="single" w:sz="4" w:space="0" w:color="000000"/>
+              <w:bottom w:val="single" w:sz="4" w:space="0" w:color="000000"/>
+            </w:tcBorders>
+            <w:vAlign w:val="bottom"/>
+          </w:tcPr>
+          <w:p>
+            <w:pPr>
+              <w:pStyle w:val="Normal"/>
+              <w:widowControl w:val="false"/>
+              <w:spacing w:lineRule="auto" w:line="180"/>
+              <w:jc w:val="center"/>
+              <w:rPr>
+                <w:color w:val="000000"/>
+                <w:sz w:val="16"/>
+                <w:szCs w:val="16"/>
+              </w:rPr>
+            </w:pPr>
+            <w:r>
+              <w:rPr>
+                <w:rFonts w:eastAsia="arial" w:ascii="arial" w:hAnsi="arial"/>
+                <w:color w:val="000000"/>
+                <w:sz w:val="16"/>
+                <w:szCs w:val="16"/>
+              </w:rPr>
+              <w:t>Engine Start</w:t>
+            </w:r>
+          </w:p>
+        </w:tc>
+        <w:tc>
+          <w:tcPr>
+            <w:tcW w:w="1016" w:type="dxa"/>
+            <w:tcBorders>
+              <w:top w:val="single" w:sz="4" w:space="0" w:color="000000"/>
+              <w:left w:val="single" w:sz="4" w:space="0" w:color="000000"/>
+              <w:bottom w:val="single" w:sz="4" w:space="0" w:color="000000"/>
+            </w:tcBorders>
+            <w:vAlign w:val="bottom"/>
+          </w:tcPr>
+          <w:p>
+            <w:pPr>
+              <w:pStyle w:val="Normal"/>
+              <w:widowControl w:val="false"/>
+              <w:spacing w:lineRule="auto" w:line="180"/>
+              <w:jc w:val="center"/>
+              <w:rPr>
+                <w:color w:val="000000"/>
+                <w:sz w:val="16"/>
+                <w:szCs w:val="16"/>
+              </w:rPr>
+            </w:pPr>
+            <w:r>
+              <w:rPr>
+                <w:color w:val="000000"/>
+                <w:sz w:val="16"/>
+                <w:szCs w:val="16"/>
+              </w:rPr>
+              <w:t>AWS/TPWS</w:t>
+            </w:r>
+          </w:p>
+        </w:tc>
+        <w:tc>
+          <w:tcPr>
+            <w:tcW w:w="1020" w:type="dxa"/>
+            <w:tcBorders>
+              <w:top w:val="single" w:sz="4" w:space="0" w:color="000000"/>
+              <w:left w:val="single" w:sz="4" w:space="0" w:color="000000"/>
+              <w:bottom w:val="single" w:sz="4" w:space="0" w:color="000000"/>
+            </w:tcBorders>
+            <w:vAlign w:val="bottom"/>
+          </w:tcPr>
+          <w:p>
+            <w:pPr>
+              <w:pStyle w:val="Normal"/>
+              <w:widowControl w:val="false"/>
+              <w:spacing w:lineRule="auto" w:line="180"/>
+              <w:jc w:val="center"/>
+              <w:rPr>
+                <w:color w:val="000000"/>
+                <w:sz w:val="16"/>
+                <w:szCs w:val="16"/>
+              </w:rPr>
+            </w:pPr>
+            <w:r>
+              <w:rPr>
+                <w:color w:val="000000"/>
+                <w:sz w:val="16"/>
+                <w:szCs w:val="16"/>
+              </w:rPr>
+              <w:t>Isolation Switch</w:t>
+            </w:r>
+          </w:p>
+        </w:tc>
+        <w:tc>
+          <w:tcPr>
+            <w:tcW w:w="1016" w:type="dxa"/>
+            <w:tcBorders>
+              <w:top w:val="single" w:sz="4" w:space="0" w:color="000000"/>
+              <w:left w:val="single" w:sz="4" w:space="0" w:color="000000"/>
+              <w:bottom w:val="single" w:sz="4" w:space="0" w:color="000000"/>
+            </w:tcBorders>
+            <w:vAlign w:val="bottom"/>
+          </w:tcPr>
+          <w:p>
+            <w:pPr>
+              <w:pStyle w:val="Normal"/>
+              <w:widowControl w:val="false"/>
+              <w:jc w:val="center"/>
+              <w:rPr>
+                <w:color w:val="000000"/>
+                <w:sz w:val="16"/>
+                <w:szCs w:val="16"/>
+              </w:rPr>
+            </w:pPr>
+            <w:r>
+              <w:rPr>
+                <w:color w:val="000000"/>
+                <w:sz w:val="16"/>
+                <w:szCs w:val="16"/>
+              </w:rPr>
+              <w:t>GeneratorField</w:t>
+            </w:r>
+          </w:p>
+        </w:tc>
+        <w:tc>
+          <w:tcPr>
+            <w:tcW w:w="1016" w:type="dxa"/>
+            <w:tcBorders>
+              <w:top w:val="single" w:sz="4" w:space="0" w:color="000000"/>
+              <w:left w:val="single" w:sz="4" w:space="0" w:color="000000"/>
+              <w:bottom w:val="single" w:sz="4" w:space="0" w:color="000000"/>
+            </w:tcBorders>
+            <w:vAlign w:val="bottom"/>
+          </w:tcPr>
+          <w:p>
+            <w:pPr>
+              <w:pStyle w:val="Normal"/>
+              <w:widowControl w:val="false"/>
+              <w:spacing w:lineRule="auto" w:line="180"/>
+              <w:jc w:val="center"/>
+              <w:rPr>
+                <w:color w:val="000000"/>
+                <w:sz w:val="16"/>
+                <w:szCs w:val="16"/>
+              </w:rPr>
+            </w:pPr>
+            <w:r>
+              <w:rPr>
+                <w:color w:val="000000"/>
+                <w:sz w:val="16"/>
+                <w:szCs w:val="16"/>
+              </w:rPr>
+              <w:t>Slow Speed</w:t>
+            </w:r>
+          </w:p>
+        </w:tc>
+        <w:tc>
+          <w:tcPr>
+            <w:tcW w:w="1017" w:type="dxa"/>
+            <w:tcBorders>
+              <w:top w:val="single" w:sz="4" w:space="0" w:color="000000"/>
+              <w:left w:val="single" w:sz="4" w:space="0" w:color="000000"/>
+              <w:bottom w:val="single" w:sz="4" w:space="0" w:color="000000"/>
+            </w:tcBorders>
+            <w:vAlign w:val="bottom"/>
+          </w:tcPr>
+          <w:p>
+            <w:pPr>
+              <w:pStyle w:val="Normal"/>
+              <w:widowControl w:val="false"/>
+              <w:jc w:val="center"/>
+              <w:rPr>
+                <w:color w:val="000000"/>
+                <w:sz w:val="16"/>
+                <w:szCs w:val="16"/>
+              </w:rPr>
+            </w:pPr>
+            <w:r>
+              <w:rPr>
+                <w:color w:val="000000"/>
+                <w:sz w:val="16"/>
+                <w:szCs w:val="16"/>
+              </w:rPr>
+            </w:r>
+          </w:p>
+        </w:tc>
+        <w:tc>
+          <w:tcPr>
+            <w:tcW w:w="1016" w:type="dxa"/>
+            <w:tcBorders>
+              <w:top w:val="single" w:sz="4" w:space="0" w:color="000000"/>
+              <w:left w:val="single" w:sz="4" w:space="0" w:color="000000"/>
+              <w:bottom w:val="single" w:sz="4" w:space="0" w:color="000000"/>
+            </w:tcBorders>
+            <w:vAlign w:val="bottom"/>
+          </w:tcPr>
+          <w:p>
+            <w:pPr>
+              <w:pStyle w:val="Normal"/>
+              <w:widowControl w:val="false"/>
+              <w:jc w:val="center"/>
+              <w:rPr>
+                <w:color w:val="000000"/>
+                <w:sz w:val="16"/>
+                <w:szCs w:val="16"/>
+              </w:rPr>
+            </w:pPr>
+            <w:r>
+              <w:rPr>
+                <w:color w:val="000000"/>
+                <w:sz w:val="16"/>
+                <w:szCs w:val="16"/>
+              </w:rPr>
+              <w:t>Inst. Light Bright</w:t>
+            </w:r>
+          </w:p>
+        </w:tc>
+        <w:tc>
+          <w:tcPr>
+            <w:tcW w:w="1020" w:type="dxa"/>
+            <w:tcBorders>
+              <w:top w:val="single" w:sz="4" w:space="0" w:color="000000"/>
+              <w:left w:val="single" w:sz="4" w:space="0" w:color="000000"/>
+              <w:bottom w:val="single" w:sz="4" w:space="0" w:color="000000"/>
+            </w:tcBorders>
+            <w:vAlign w:val="bottom"/>
+          </w:tcPr>
+          <w:p>
+            <w:pPr>
+              <w:pStyle w:val="Normal"/>
+              <w:widowControl w:val="false"/>
+              <w:spacing w:lineRule="auto" w:line="180"/>
+              <w:jc w:val="center"/>
+              <w:rPr>
+                <w:sz w:val="16"/>
+                <w:szCs w:val="16"/>
+              </w:rPr>
+            </w:pPr>
+            <w:r>
+              <w:rPr>
+                <w:sz w:val="16"/>
+                <w:szCs w:val="16"/>
+              </w:rPr>
+              <w:t>Desk Light</w:t>
+            </w:r>
+          </w:p>
+        </w:tc>
+        <w:tc>
+          <w:tcPr>
+            <w:tcW w:w="1016" w:type="dxa"/>
+            <w:tcBorders>
+              <w:top w:val="single" w:sz="4" w:space="0" w:color="000000"/>
+              <w:left w:val="single" w:sz="4" w:space="0" w:color="000000"/>
+              <w:bottom w:val="single" w:sz="4" w:space="0" w:color="000000"/>
+            </w:tcBorders>
+            <w:vAlign w:val="bottom"/>
+          </w:tcPr>
+          <w:p>
+            <w:pPr>
+              <w:pStyle w:val="Normal"/>
+              <w:widowControl w:val="false"/>
+              <w:spacing w:lineRule="auto" w:line="180"/>
+              <w:jc w:val="center"/>
+              <w:rPr>
+                <w:sz w:val="16"/>
+                <w:szCs w:val="16"/>
+              </w:rPr>
+            </w:pPr>
+            <w:r>
+              <w:rPr>
+                <w:rFonts w:eastAsia="arial" w:ascii="arial" w:hAnsi="arial"/>
+                <w:color w:val="000000"/>
+                <w:sz w:val="16"/>
+                <w:szCs w:val="16"/>
+              </w:rPr>
+              <w:t>Cab Light</w:t>
+            </w:r>
+          </w:p>
+        </w:tc>
+        <w:tc>
+          <w:tcPr>
+            <w:tcW w:w="1016" w:type="dxa"/>
+            <w:tcBorders>
+              <w:top w:val="single" w:sz="4" w:space="0" w:color="000000"/>
+              <w:left w:val="single" w:sz="4" w:space="0" w:color="000000"/>
+              <w:bottom w:val="single" w:sz="4" w:space="0" w:color="000000"/>
+            </w:tcBorders>
+            <w:vAlign w:val="bottom"/>
+          </w:tcPr>
+          <w:p>
+            <w:pPr>
+              <w:pStyle w:val="Normal"/>
+              <w:widowControl w:val="false"/>
+              <w:spacing w:lineRule="auto" w:line="180"/>
+              <w:jc w:val="center"/>
+              <w:rPr>
+                <w:sz w:val="16"/>
+                <w:szCs w:val="16"/>
+              </w:rPr>
+            </w:pPr>
+            <w:r>
+              <w:rPr>
+                <w:sz w:val="16"/>
+                <w:szCs w:val="16"/>
+              </w:rPr>
+              <w:t>Parking Brake On</w:t>
+            </w:r>
+          </w:p>
+        </w:tc>
+        <w:tc>
+          <w:tcPr>
+            <w:tcW w:w="1016" w:type="dxa"/>
+            <w:tcBorders>
+              <w:top w:val="single" w:sz="4" w:space="0" w:color="000000"/>
+              <w:left w:val="single" w:sz="4" w:space="0" w:color="000000"/>
+              <w:bottom w:val="single" w:sz="4" w:space="0" w:color="000000"/>
+            </w:tcBorders>
+            <w:vAlign w:val="bottom"/>
+          </w:tcPr>
+          <w:p>
+            <w:pPr>
+              <w:pStyle w:val="Normal"/>
+              <w:widowControl w:val="false"/>
+              <w:spacing w:lineRule="auto" w:line="180"/>
+              <w:jc w:val="center"/>
+              <w:rPr>
+                <w:sz w:val="16"/>
+                <w:szCs w:val="16"/>
+              </w:rPr>
+            </w:pPr>
+            <w:r>
+              <w:rPr>
+                <w:rFonts w:eastAsia="arial" w:ascii="arial" w:hAnsi="arial"/>
+                <w:color w:val="000000"/>
+                <w:sz w:val="16"/>
+                <w:szCs w:val="16"/>
+              </w:rPr>
+              <w:t>1-Person</w:t>
+            </w:r>
+          </w:p>
+        </w:tc>
+        <w:tc>
+          <w:tcPr>
+            <w:tcW w:w="1029" w:type="dxa"/>
+            <w:tcBorders>
+              <w:top w:val="single" w:sz="4" w:space="0" w:color="000000"/>
+              <w:left w:val="single" w:sz="4" w:space="0" w:color="000000"/>
+              <w:bottom w:val="single" w:sz="4" w:space="0" w:color="000000"/>
+              <w:right w:val="single" w:sz="4" w:space="0" w:color="000000"/>
+            </w:tcBorders>
+            <w:vAlign w:val="bottom"/>
+          </w:tcPr>
+          <w:p>
+            <w:pPr>
+              <w:pStyle w:val="Normal"/>
+              <w:widowControl w:val="false"/>
+              <w:spacing w:lineRule="auto" w:line="180"/>
+              <w:jc w:val="center"/>
+              <w:rPr>
+                <w:sz w:val="16"/>
+                <w:szCs w:val="16"/>
+              </w:rPr>
+            </w:pPr>
+            <w:r>
+              <w:rPr>
+                <w:rFonts w:eastAsia="arial" w:ascii="arial" w:hAnsi="arial"/>
+                <w:color w:val="000000"/>
+                <w:sz w:val="16"/>
+                <w:szCs w:val="16"/>
+              </w:rPr>
+              <w:t>Next</w:t>
+            </w:r>
+          </w:p>
+          <w:p>
+            <w:pPr>
+              <w:pStyle w:val="Normal"/>
+              <w:widowControl w:val="false"/>
+              <w:spacing w:lineRule="auto" w:line="180"/>
+              <w:jc w:val="center"/>
+              <w:rPr>
+                <w:sz w:val="16"/>
+                <w:szCs w:val="16"/>
+              </w:rPr>
+            </w:pPr>
+            <w:r>
+              <w:rPr>
+                <w:rFonts w:eastAsia="arial" w:ascii="arial" w:hAnsi="arial"/>
+                <w:color w:val="000000"/>
+                <w:sz w:val="16"/>
+                <w:szCs w:val="16"/>
+              </w:rPr>
+              <w:t>Cab Cam</w:t>
+            </w:r>
+          </w:p>
+        </w:tc>
+      </w:tr>
+    </w:tbl>
+    <w:p>
+      <w:pPr>
+        <w:pStyle w:val="Normal"/>
+        <w:rPr>
+          <w:rFonts w:ascii="arial" w:hAnsi="arial" w:eastAsia="arial"/>
+          <w:color w:val="000000"/>
+          <w:sz w:val="16"/>
+          <w:szCs w:val="16"/>
+        </w:rPr>
+      </w:pPr>
+      <w:r>
+        <w:rPr>
+          <w:rFonts w:eastAsia="arial" w:ascii="arial" w:hAnsi="arial"/>
+          <w:color w:val="000000"/>
+          <w:sz w:val="16"/>
+          <w:szCs w:val="16"/>
+        </w:rPr>
+      </w:r>
+    </w:p>
+    <w:p>
+      <w:pPr>
+        <w:pStyle w:val="Normal"/>
+        <w:rPr>
+          <w:color w:val="000000"/>
+          <w:sz w:val="16"/>
+          <w:szCs w:val="16"/>
+        </w:rPr>
+      </w:pPr>
+      <w:r>
+        <w:rPr>
+          <w:rFonts w:eastAsia="arial" w:ascii="arial" w:hAnsi="arial"/>
+          <w:color w:val="000000"/>
+          <w:sz w:val="16"/>
+          <w:szCs w:val="16"/>
+        </w:rPr>
+        <w:tab/>
+        <w:t xml:space="preserve">           Class 66-2</w:t>
+      </w:r>
+    </w:p>
+    <w:tbl>
+      <w:tblPr>
+        <w:tblW w:w="14248" w:type="dxa"/>
+        <w:jc w:val="left"/>
+        <w:tblInd w:w="-5" w:type="dxa"/>
+        <w:tblLayout w:type="fixed"/>
+        <w:tblCellMar>
+          <w:top w:w="0" w:type="dxa"/>
+          <w:left w:w="108" w:type="dxa"/>
+          <w:bottom w:w="0" w:type="dxa"/>
+          <w:right w:w="108" w:type="dxa"/>
+        </w:tblCellMar>
+        <w:tblLook w:firstRow="1" w:noVBand="1" w:lastRow="0" w:firstColumn="1" w:lastColumn="0" w:noHBand="0" w:val="04a0"/>
+      </w:tblPr>
+      <w:tblGrid>
+        <w:gridCol w:w="1017"/>
+        <w:gridCol w:w="1019"/>
+        <w:gridCol w:w="1014"/>
+        <w:gridCol w:w="1016"/>
+        <w:gridCol w:w="1020"/>
+        <w:gridCol w:w="1016"/>
+        <w:gridCol w:w="1016"/>
+        <w:gridCol w:w="1017"/>
+        <w:gridCol w:w="1016"/>
+        <w:gridCol w:w="1020"/>
+        <w:gridCol w:w="1016"/>
+        <w:gridCol w:w="1016"/>
+        <w:gridCol w:w="1016"/>
+        <w:gridCol w:w="1029"/>
+      </w:tblGrid>
+      <w:tr>
+        <w:trPr>
+          <w:trHeight w:val="440" w:hRule="exact"/>
+          <w:cantSplit w:val="true"/>
+        </w:trPr>
+        <w:tc>
+          <w:tcPr>
+            <w:tcW w:w="1017" w:type="dxa"/>
+            <w:tcBorders>
+              <w:top w:val="single" w:sz="4" w:space="0" w:color="000000"/>
+              <w:left w:val="single" w:sz="4" w:space="0" w:color="000000"/>
+              <w:bottom w:val="single" w:sz="4" w:space="0" w:color="000000"/>
+            </w:tcBorders>
+            <w:vAlign w:val="bottom"/>
+          </w:tcPr>
+          <w:p>
+            <w:pPr>
+              <w:pStyle w:val="Normal"/>
+              <w:widowControl w:val="false"/>
+              <w:spacing w:lineRule="auto" w:line="180" w:before="0" w:after="60"/>
+              <w:jc w:val="center"/>
+              <w:rPr>
+                <w:b/>
+                <w:bCs/>
+              </w:rPr>
+            </w:pPr>
+            <w:r>
+              <w:rPr>
+                <w:b/>
+                <w:bCs/>
+                <w:color w:val="000000"/>
+                <w:sz w:val="16"/>
+                <w:szCs w:val="16"/>
+              </w:rPr>
+              <w:t>HUD</w:t>
+            </w:r>
+          </w:p>
+        </w:tc>
+        <w:tc>
+          <w:tcPr>
+            <w:tcW w:w="1019" w:type="dxa"/>
+            <w:tcBorders>
+              <w:top w:val="single" w:sz="4" w:space="0" w:color="000000"/>
+              <w:left w:val="single" w:sz="4" w:space="0" w:color="000000"/>
+              <w:bottom w:val="single" w:sz="4" w:space="0" w:color="000000"/>
+            </w:tcBorders>
+            <w:vAlign w:val="bottom"/>
+          </w:tcPr>
+          <w:p>
+            <w:pPr>
+              <w:pStyle w:val="Normal"/>
+              <w:widowControl w:val="false"/>
+              <w:spacing w:lineRule="auto" w:line="180"/>
+              <w:jc w:val="center"/>
+              <w:rPr>
+                <w:color w:val="000000"/>
+                <w:sz w:val="16"/>
+                <w:szCs w:val="16"/>
+              </w:rPr>
+            </w:pPr>
+            <w:r>
+              <w:rPr>
+                <w:color w:val="000000"/>
+                <w:sz w:val="16"/>
+                <w:szCs w:val="16"/>
+              </w:rPr>
+              <w:t>Schedule</w:t>
+            </w:r>
+          </w:p>
+        </w:tc>
+        <w:tc>
+          <w:tcPr>
+            <w:tcW w:w="1014" w:type="dxa"/>
+            <w:tcBorders>
+              <w:top w:val="single" w:sz="4" w:space="0" w:color="000000"/>
+              <w:left w:val="single" w:sz="4" w:space="0" w:color="000000"/>
+              <w:bottom w:val="single" w:sz="4" w:space="0" w:color="000000"/>
+            </w:tcBorders>
+            <w:vAlign w:val="bottom"/>
+          </w:tcPr>
+          <w:p>
+            <w:pPr>
+              <w:pStyle w:val="Normal"/>
+              <w:widowControl w:val="false"/>
+              <w:spacing w:lineRule="auto" w:line="180"/>
+              <w:jc w:val="center"/>
+              <w:rPr>
+                <w:color w:val="000000"/>
+                <w:sz w:val="16"/>
+                <w:szCs w:val="16"/>
+              </w:rPr>
+            </w:pPr>
+            <w:r>
+              <w:rPr>
+                <w:rFonts w:eastAsia="arial" w:ascii="arial" w:hAnsi="arial"/>
+                <w:color w:val="000000"/>
+                <w:sz w:val="16"/>
+                <w:szCs w:val="16"/>
+              </w:rPr>
+              <w:t>Engine Stop</w:t>
+            </w:r>
+          </w:p>
+        </w:tc>
+        <w:tc>
+          <w:tcPr>
+            <w:tcW w:w="1016" w:type="dxa"/>
+            <w:tcBorders>
+              <w:top w:val="single" w:sz="4" w:space="0" w:color="000000"/>
+              <w:left w:val="single" w:sz="4" w:space="0" w:color="000000"/>
+              <w:bottom w:val="single" w:sz="4" w:space="0" w:color="000000"/>
+            </w:tcBorders>
+            <w:vAlign w:val="bottom"/>
+          </w:tcPr>
+          <w:p>
+            <w:pPr>
+              <w:pStyle w:val="Normal"/>
+              <w:widowControl w:val="false"/>
+              <w:spacing w:lineRule="auto" w:line="180"/>
+              <w:jc w:val="center"/>
+              <w:rPr>
+                <w:color w:val="000000"/>
+                <w:sz w:val="16"/>
+                <w:szCs w:val="16"/>
+              </w:rPr>
+            </w:pPr>
+            <w:r>
+              <w:rPr>
+                <w:color w:val="000000"/>
+                <w:sz w:val="16"/>
+                <w:szCs w:val="16"/>
+              </w:rPr>
+              <w:t>DSD</w:t>
+            </w:r>
+          </w:p>
+        </w:tc>
+        <w:tc>
+          <w:tcPr>
+            <w:tcW w:w="1020" w:type="dxa"/>
+            <w:tcBorders>
+              <w:top w:val="single" w:sz="4" w:space="0" w:color="000000"/>
+              <w:left w:val="single" w:sz="4" w:space="0" w:color="000000"/>
+              <w:bottom w:val="single" w:sz="4" w:space="0" w:color="000000"/>
+            </w:tcBorders>
+            <w:vAlign w:val="bottom"/>
+          </w:tcPr>
+          <w:p>
+            <w:pPr>
+              <w:pStyle w:val="Normal"/>
+              <w:widowControl w:val="false"/>
+              <w:spacing w:lineRule="auto" w:line="180"/>
+              <w:jc w:val="center"/>
+              <w:rPr>
+                <w:color w:val="000000"/>
+                <w:sz w:val="16"/>
+                <w:szCs w:val="16"/>
+              </w:rPr>
+            </w:pPr>
+            <w:r>
+              <w:rPr>
+                <w:color w:val="000000"/>
+                <w:sz w:val="16"/>
+                <w:szCs w:val="16"/>
+              </w:rPr>
+              <w:t>Engine Run</w:t>
+            </w:r>
+          </w:p>
+        </w:tc>
+        <w:tc>
+          <w:tcPr>
+            <w:tcW w:w="1016" w:type="dxa"/>
+            <w:tcBorders>
+              <w:top w:val="single" w:sz="4" w:space="0" w:color="000000"/>
+              <w:left w:val="single" w:sz="4" w:space="0" w:color="000000"/>
+              <w:bottom w:val="single" w:sz="4" w:space="0" w:color="000000"/>
+            </w:tcBorders>
+            <w:vAlign w:val="bottom"/>
+          </w:tcPr>
+          <w:p>
+            <w:pPr>
+              <w:pStyle w:val="Normal"/>
+              <w:widowControl w:val="false"/>
+              <w:jc w:val="center"/>
+              <w:rPr>
+                <w:color w:val="000000"/>
+                <w:sz w:val="16"/>
+                <w:szCs w:val="16"/>
+              </w:rPr>
+            </w:pPr>
+            <w:r>
+              <w:rPr>
+                <w:color w:val="000000"/>
+                <w:sz w:val="16"/>
+                <w:szCs w:val="16"/>
+              </w:rPr>
+              <w:t>Control &amp; Fuel Pump</w:t>
+            </w:r>
+          </w:p>
+        </w:tc>
+        <w:tc>
+          <w:tcPr>
+            <w:tcW w:w="1016" w:type="dxa"/>
+            <w:tcBorders>
+              <w:top w:val="single" w:sz="4" w:space="0" w:color="000000"/>
+              <w:left w:val="single" w:sz="4" w:space="0" w:color="000000"/>
+              <w:bottom w:val="single" w:sz="4" w:space="0" w:color="000000"/>
+            </w:tcBorders>
+            <w:vAlign w:val="bottom"/>
+          </w:tcPr>
+          <w:p>
+            <w:pPr>
+              <w:pStyle w:val="Normal"/>
+              <w:widowControl w:val="false"/>
+              <w:spacing w:lineRule="auto" w:line="180"/>
+              <w:jc w:val="center"/>
+              <w:rPr>
+                <w:color w:val="000000"/>
+                <w:sz w:val="16"/>
+                <w:szCs w:val="16"/>
+              </w:rPr>
+            </w:pPr>
+            <w:r>
+              <w:rPr/>
+            </w:r>
+          </w:p>
+        </w:tc>
+        <w:tc>
+          <w:tcPr>
+            <w:tcW w:w="1017" w:type="dxa"/>
+            <w:tcBorders>
+              <w:top w:val="single" w:sz="4" w:space="0" w:color="000000"/>
+              <w:left w:val="single" w:sz="4" w:space="0" w:color="000000"/>
+              <w:bottom w:val="single" w:sz="4" w:space="0" w:color="000000"/>
+            </w:tcBorders>
+            <w:vAlign w:val="bottom"/>
+          </w:tcPr>
+          <w:p>
+            <w:pPr>
+              <w:pStyle w:val="Normal"/>
+              <w:widowControl w:val="false"/>
+              <w:jc w:val="center"/>
+              <w:rPr>
+                <w:rFonts w:ascii="arial" w:hAnsi="arial" w:eastAsia="arial"/>
+                <w:color w:val="000000"/>
+                <w:sz w:val="16"/>
+                <w:szCs w:val="16"/>
+              </w:rPr>
+            </w:pPr>
+            <w:r>
+              <w:rPr>
+                <w:rFonts w:eastAsia="arial" w:ascii="arial" w:hAnsi="arial"/>
+                <w:color w:val="000000"/>
+                <w:sz w:val="16"/>
+                <w:szCs w:val="16"/>
+              </w:rPr>
+            </w:r>
+          </w:p>
+        </w:tc>
+        <w:tc>
+          <w:tcPr>
+            <w:tcW w:w="1016" w:type="dxa"/>
+            <w:tcBorders>
+              <w:top w:val="single" w:sz="4" w:space="0" w:color="000000"/>
+              <w:left w:val="single" w:sz="4" w:space="0" w:color="000000"/>
+              <w:bottom w:val="single" w:sz="4" w:space="0" w:color="000000"/>
+            </w:tcBorders>
+            <w:vAlign w:val="bottom"/>
+          </w:tcPr>
+          <w:p>
+            <w:pPr>
+              <w:pStyle w:val="Normal"/>
+              <w:widowControl w:val="false"/>
+              <w:jc w:val="center"/>
+              <w:rPr>
+                <w:color w:val="000000"/>
+                <w:sz w:val="16"/>
+                <w:szCs w:val="16"/>
+              </w:rPr>
+            </w:pPr>
+            <w:r>
+              <w:rPr>
+                <w:color w:val="000000"/>
+                <w:sz w:val="16"/>
+                <w:szCs w:val="16"/>
+              </w:rPr>
+              <w:t>Inst. Light Dim</w:t>
+            </w:r>
+          </w:p>
+        </w:tc>
+        <w:tc>
+          <w:tcPr>
+            <w:tcW w:w="1020" w:type="dxa"/>
+            <w:tcBorders>
+              <w:top w:val="single" w:sz="4" w:space="0" w:color="000000"/>
+              <w:left w:val="single" w:sz="4" w:space="0" w:color="000000"/>
+              <w:bottom w:val="single" w:sz="4" w:space="0" w:color="000000"/>
+            </w:tcBorders>
+            <w:vAlign w:val="bottom"/>
+          </w:tcPr>
+          <w:p>
+            <w:pPr>
+              <w:pStyle w:val="Normal"/>
+              <w:widowControl w:val="false"/>
+              <w:spacing w:lineRule="auto" w:line="180"/>
+              <w:jc w:val="center"/>
+              <w:rPr>
+                <w:sz w:val="16"/>
+                <w:szCs w:val="16"/>
+              </w:rPr>
+            </w:pPr>
+            <w:r>
+              <w:rPr>
+                <w:sz w:val="16"/>
+                <w:szCs w:val="16"/>
+              </w:rPr>
+              <w:t>Tail Light</w:t>
+            </w:r>
+          </w:p>
+        </w:tc>
+        <w:tc>
+          <w:tcPr>
+            <w:tcW w:w="1016" w:type="dxa"/>
+            <w:tcBorders>
+              <w:top w:val="single" w:sz="4" w:space="0" w:color="000000"/>
+              <w:left w:val="single" w:sz="4" w:space="0" w:color="000000"/>
+              <w:bottom w:val="single" w:sz="4" w:space="0" w:color="000000"/>
+            </w:tcBorders>
+            <w:vAlign w:val="bottom"/>
+          </w:tcPr>
+          <w:p>
+            <w:pPr>
+              <w:pStyle w:val="Normal"/>
+              <w:widowControl w:val="false"/>
+              <w:spacing w:lineRule="auto" w:line="180"/>
+              <w:jc w:val="center"/>
+              <w:rPr>
+                <w:sz w:val="16"/>
+                <w:szCs w:val="16"/>
+              </w:rPr>
+            </w:pPr>
+            <w:r>
+              <w:rPr>
+                <w:sz w:val="16"/>
+                <w:szCs w:val="16"/>
+              </w:rPr>
+              <w:t>Inst. Light</w:t>
+            </w:r>
+          </w:p>
+        </w:tc>
+        <w:tc>
+          <w:tcPr>
+            <w:tcW w:w="1016" w:type="dxa"/>
+            <w:tcBorders>
+              <w:top w:val="single" w:sz="4" w:space="0" w:color="000000"/>
+              <w:left w:val="single" w:sz="4" w:space="0" w:color="000000"/>
+              <w:bottom w:val="single" w:sz="4" w:space="0" w:color="000000"/>
+            </w:tcBorders>
+            <w:vAlign w:val="bottom"/>
+          </w:tcPr>
+          <w:p>
+            <w:pPr>
+              <w:pStyle w:val="Normal"/>
+              <w:widowControl w:val="false"/>
+              <w:spacing w:lineRule="auto" w:line="180"/>
+              <w:jc w:val="center"/>
+              <w:rPr>
+                <w:sz w:val="16"/>
+                <w:szCs w:val="16"/>
+              </w:rPr>
+            </w:pPr>
+            <w:r>
+              <w:rPr>
+                <w:sz w:val="16"/>
+                <w:szCs w:val="16"/>
+              </w:rPr>
+              <w:t>Parking Brake Off</w:t>
+            </w:r>
+          </w:p>
+        </w:tc>
+        <w:tc>
+          <w:tcPr>
+            <w:tcW w:w="1016" w:type="dxa"/>
+            <w:tcBorders>
+              <w:top w:val="single" w:sz="4" w:space="0" w:color="000000"/>
+              <w:left w:val="single" w:sz="4" w:space="0" w:color="000000"/>
+              <w:bottom w:val="single" w:sz="4" w:space="0" w:color="000000"/>
+            </w:tcBorders>
+            <w:vAlign w:val="bottom"/>
+          </w:tcPr>
+          <w:p>
+            <w:pPr>
+              <w:pStyle w:val="Normal"/>
+              <w:widowControl w:val="false"/>
+              <w:spacing w:lineRule="auto" w:line="180"/>
+              <w:jc w:val="center"/>
+              <w:rPr>
+                <w:sz w:val="16"/>
+                <w:szCs w:val="16"/>
+              </w:rPr>
+            </w:pPr>
+            <w:r>
+              <w:rPr>
+                <w:rFonts w:eastAsia="arial" w:ascii="arial" w:hAnsi="arial"/>
+                <w:color w:val="000000"/>
+                <w:sz w:val="16"/>
+                <w:szCs w:val="16"/>
+              </w:rPr>
+              <w:t>Exterior</w:t>
+            </w:r>
+          </w:p>
+          <w:p>
+            <w:pPr>
+              <w:pStyle w:val="Normal"/>
+              <w:widowControl w:val="false"/>
+              <w:spacing w:lineRule="auto" w:line="180"/>
+              <w:jc w:val="center"/>
+              <w:rPr>
+                <w:sz w:val="16"/>
+                <w:szCs w:val="16"/>
+              </w:rPr>
+            </w:pPr>
+            <w:r>
+              <w:rPr>
+                <w:rFonts w:eastAsia="arial" w:ascii="arial" w:hAnsi="arial"/>
+                <w:color w:val="000000"/>
+                <w:sz w:val="16"/>
+                <w:szCs w:val="16"/>
+              </w:rPr>
+              <w:t>Camera</w:t>
+            </w:r>
+          </w:p>
+        </w:tc>
+        <w:tc>
+          <w:tcPr>
+            <w:tcW w:w="1029" w:type="dxa"/>
+            <w:tcBorders>
+              <w:top w:val="single" w:sz="4" w:space="0" w:color="000000"/>
+              <w:left w:val="single" w:sz="4" w:space="0" w:color="000000"/>
+              <w:bottom w:val="single" w:sz="4" w:space="0" w:color="000000"/>
+              <w:right w:val="single" w:sz="4" w:space="0" w:color="000000"/>
+            </w:tcBorders>
+            <w:vAlign w:val="bottom"/>
+          </w:tcPr>
+          <w:p>
+            <w:pPr>
+              <w:pStyle w:val="Normal"/>
+              <w:widowControl w:val="false"/>
+              <w:spacing w:lineRule="auto" w:line="180"/>
+              <w:jc w:val="center"/>
+              <w:rPr>
+                <w:sz w:val="16"/>
+                <w:szCs w:val="16"/>
+              </w:rPr>
+            </w:pPr>
+            <w:r>
+              <w:rPr>
+                <w:rFonts w:eastAsia="arial" w:ascii="arial" w:hAnsi="arial"/>
+                <w:color w:val="000000"/>
+                <w:sz w:val="16"/>
+                <w:szCs w:val="16"/>
+              </w:rPr>
+              <w:t>Prev</w:t>
+            </w:r>
+          </w:p>
+          <w:p>
+            <w:pPr>
+              <w:pStyle w:val="Normal"/>
+              <w:widowControl w:val="false"/>
+              <w:spacing w:lineRule="auto" w:line="180"/>
+              <w:jc w:val="center"/>
+              <w:rPr>
+                <w:sz w:val="16"/>
+                <w:szCs w:val="16"/>
+              </w:rPr>
+            </w:pPr>
+            <w:r>
+              <w:rPr>
+                <w:rFonts w:eastAsia="arial" w:ascii="arial" w:hAnsi="arial"/>
+                <w:color w:val="000000"/>
+                <w:sz w:val="16"/>
+                <w:szCs w:val="16"/>
+              </w:rPr>
+              <w:t>Cab Cam</w:t>
+            </w:r>
+          </w:p>
+        </w:tc>
+      </w:tr>
+    </w:tbl>
+    <w:p>
+      <w:pPr>
+        <w:pStyle w:val="Normal"/>
+        <w:rPr>
+          <w:color w:val="000000"/>
+          <w:sz w:val="16"/>
+          <w:szCs w:val="16"/>
+        </w:rPr>
+      </w:pPr>
+      <w:r>
+        <w:rPr>
+          <w:color w:val="000000"/>
+          <w:sz w:val="16"/>
+          <w:szCs w:val="16"/>
+        </w:rPr>
+      </w:r>
+    </w:p>
+    <w:p>
+      <w:pPr>
+        <w:pStyle w:val="Normal"/>
+        <w:rPr>
+          <w:color w:val="000000"/>
+          <w:sz w:val="16"/>
+          <w:szCs w:val="16"/>
+        </w:rPr>
+      </w:pPr>
+      <w:r>
+        <w:rPr>
+          <w:rFonts w:eastAsia="arial" w:ascii="arial" w:hAnsi="arial"/>
+          <w:color w:val="000000"/>
+          <w:sz w:val="16"/>
+          <w:szCs w:val="16"/>
+        </w:rPr>
+        <w:tab/>
+        <w:t xml:space="preserve">           Class </w:t>
+      </w:r>
+      <w:r>
+        <w:rPr>
+          <w:rFonts w:eastAsia="arial" w:ascii="arial" w:hAnsi="arial"/>
+          <w:color w:val="000000"/>
+          <w:sz w:val="16"/>
+          <w:szCs w:val="16"/>
+        </w:rPr>
+        <w:t>86</w:t>
       </w:r>
       <w:r>
         <w:rPr>
@@ -10192,57 +12384,39 @@
                 <w:sz w:val="16"/>
                 <w:szCs w:val="16"/>
               </w:rPr>
-              <w:t xml:space="preserve">Engine </w:t>
-            </w:r>
-            <w:r>
-              <w:rPr>
-                <w:rFonts w:eastAsia="arial" w:ascii="arial" w:hAnsi="arial"/>
-                <w:color w:val="000000"/>
-                <w:sz w:val="16"/>
-                <w:szCs w:val="16"/>
-              </w:rPr>
-              <w:t>A</w:t>
-            </w:r>
-            <w:r>
-              <w:rPr>
-                <w:rFonts w:eastAsia="arial" w:ascii="arial" w:hAnsi="arial"/>
-                <w:color w:val="000000"/>
-                <w:sz w:val="16"/>
-                <w:szCs w:val="16"/>
-              </w:rPr>
-              <w:t xml:space="preserve"> Start</w:t>
-            </w:r>
-          </w:p>
-        </w:tc>
-        <w:tc>
-          <w:tcPr>
-            <w:tcW w:w="1016" w:type="dxa"/>
-            <w:tcBorders>
-              <w:top w:val="single" w:sz="4" w:space="0" w:color="000000"/>
-              <w:left w:val="single" w:sz="4" w:space="0" w:color="000000"/>
-              <w:bottom w:val="single" w:sz="4" w:space="0" w:color="000000"/>
-            </w:tcBorders>
-            <w:vAlign w:val="bottom"/>
-          </w:tcPr>
-          <w:p>
-            <w:pPr>
-              <w:pStyle w:val="Normal"/>
-              <w:widowControl w:val="false"/>
-              <w:spacing w:lineRule="auto" w:line="180"/>
-              <w:jc w:val="center"/>
-              <w:rPr>
-                <w:color w:val="000000"/>
-                <w:sz w:val="16"/>
-                <w:szCs w:val="16"/>
-              </w:rPr>
-            </w:pPr>
-            <w:r>
-              <w:rPr>
-                <w:color w:val="000000"/>
-                <w:sz w:val="16"/>
-                <w:szCs w:val="16"/>
-              </w:rPr>
-              <w:t>AWS</w:t>
+              <w:t>AWS Cab Change</w:t>
+            </w:r>
+          </w:p>
+        </w:tc>
+        <w:tc>
+          <w:tcPr>
+            <w:tcW w:w="1016" w:type="dxa"/>
+            <w:tcBorders>
+              <w:top w:val="single" w:sz="4" w:space="0" w:color="000000"/>
+              <w:left w:val="single" w:sz="4" w:space="0" w:color="000000"/>
+              <w:bottom w:val="single" w:sz="4" w:space="0" w:color="000000"/>
+            </w:tcBorders>
+            <w:vAlign w:val="bottom"/>
+          </w:tcPr>
+          <w:p>
+            <w:pPr>
+              <w:pStyle w:val="Normal"/>
+              <w:widowControl w:val="false"/>
+              <w:spacing w:lineRule="auto" w:line="180"/>
+              <w:jc w:val="center"/>
+              <w:rPr>
+                <w:color w:val="000000"/>
+                <w:sz w:val="16"/>
+                <w:szCs w:val="16"/>
+              </w:rPr>
+            </w:pPr>
+            <w:r>
+              <w:rPr>
+                <w:color w:val="000000"/>
+                <w:sz w:val="16"/>
+                <w:szCs w:val="16"/>
+              </w:rPr>
+              <w:t>AWS/TPWS</w:t>
             </w:r>
           </w:p>
         </w:tc>
@@ -10274,70 +12448,60 @@
                 <w:sz w:val="16"/>
                 <w:szCs w:val="16"/>
               </w:rPr>
-              <w:t>AWS Cab Change</w:t>
-            </w:r>
-          </w:p>
-        </w:tc>
-        <w:tc>
-          <w:tcPr>
-            <w:tcW w:w="1016" w:type="dxa"/>
-            <w:tcBorders>
-              <w:top w:val="single" w:sz="4" w:space="0" w:color="000000"/>
-              <w:left w:val="single" w:sz="4" w:space="0" w:color="000000"/>
-              <w:bottom w:val="single" w:sz="4" w:space="0" w:color="000000"/>
-            </w:tcBorders>
-            <w:vAlign w:val="bottom"/>
-          </w:tcPr>
-          <w:p>
-            <w:pPr>
-              <w:pStyle w:val="Normal"/>
-              <w:widowControl w:val="false"/>
-              <w:jc w:val="center"/>
-              <w:rPr>
-                <w:color w:val="000000"/>
-                <w:sz w:val="16"/>
-                <w:szCs w:val="16"/>
-              </w:rPr>
-            </w:pPr>
-            <w:r>
-              <w:rPr>
-                <w:color w:val="000000"/>
-                <w:sz w:val="16"/>
-                <w:szCs w:val="16"/>
-              </w:rPr>
-              <w:t>Engine B Start</w:t>
-            </w:r>
-          </w:p>
-        </w:tc>
-        <w:tc>
-          <w:tcPr>
-            <w:tcW w:w="1016" w:type="dxa"/>
-            <w:tcBorders>
-              <w:top w:val="single" w:sz="4" w:space="0" w:color="000000"/>
-              <w:left w:val="single" w:sz="4" w:space="0" w:color="000000"/>
-              <w:bottom w:val="single" w:sz="4" w:space="0" w:color="000000"/>
-            </w:tcBorders>
-            <w:vAlign w:val="bottom"/>
-          </w:tcPr>
-          <w:p>
-            <w:pPr>
-              <w:pStyle w:val="Normal"/>
-              <w:widowControl w:val="false"/>
-              <w:spacing w:lineRule="auto" w:line="180"/>
-              <w:jc w:val="center"/>
-              <w:rPr>
-                <w:color w:val="000000"/>
-                <w:sz w:val="16"/>
-                <w:szCs w:val="16"/>
-              </w:rPr>
-            </w:pPr>
-            <w:r>
-              <w:rPr>
-                <w:color w:val="000000"/>
-                <w:sz w:val="16"/>
-                <w:szCs w:val="16"/>
-              </w:rPr>
-              <w:t>Engine Isol. On</w:t>
+              <w:t>Panto. Raise</w:t>
+            </w:r>
+          </w:p>
+        </w:tc>
+        <w:tc>
+          <w:tcPr>
+            <w:tcW w:w="1016" w:type="dxa"/>
+            <w:tcBorders>
+              <w:top w:val="single" w:sz="4" w:space="0" w:color="000000"/>
+              <w:left w:val="single" w:sz="4" w:space="0" w:color="000000"/>
+              <w:bottom w:val="single" w:sz="4" w:space="0" w:color="000000"/>
+            </w:tcBorders>
+            <w:vAlign w:val="bottom"/>
+          </w:tcPr>
+          <w:p>
+            <w:pPr>
+              <w:pStyle w:val="Normal"/>
+              <w:widowControl w:val="false"/>
+              <w:jc w:val="center"/>
+              <w:rPr>
+                <w:color w:val="000000"/>
+                <w:sz w:val="16"/>
+                <w:szCs w:val="16"/>
+              </w:rPr>
+            </w:pPr>
+            <w:r>
+              <w:rPr/>
+            </w:r>
+          </w:p>
+        </w:tc>
+        <w:tc>
+          <w:tcPr>
+            <w:tcW w:w="1016" w:type="dxa"/>
+            <w:tcBorders>
+              <w:top w:val="single" w:sz="4" w:space="0" w:color="000000"/>
+              <w:left w:val="single" w:sz="4" w:space="0" w:color="000000"/>
+              <w:bottom w:val="single" w:sz="4" w:space="0" w:color="000000"/>
+            </w:tcBorders>
+            <w:vAlign w:val="bottom"/>
+          </w:tcPr>
+          <w:p>
+            <w:pPr>
+              <w:pStyle w:val="Normal"/>
+              <w:widowControl w:val="false"/>
+              <w:spacing w:lineRule="auto" w:line="180"/>
+              <w:jc w:val="center"/>
+              <w:rPr>
+                <w:color w:val="000000"/>
+                <w:sz w:val="16"/>
+                <w:szCs w:val="16"/>
+              </w:rPr>
+            </w:pPr>
+            <w:r>
+              <w:rPr/>
             </w:r>
           </w:p>
         </w:tc>
@@ -10364,42 +12528,36 @@
             </w:pPr>
             <w:r>
               <w:rPr>
-                <w:rFonts w:eastAsia="arial" w:ascii="arial" w:hAnsi="arial"/>
-                <w:color w:val="000000"/>
-                <w:sz w:val="16"/>
-                <w:szCs w:val="16"/>
-              </w:rPr>
-              <w:t>Brake Selector</w:t>
-            </w:r>
-          </w:p>
-        </w:tc>
-        <w:tc>
-          <w:tcPr>
-            <w:tcW w:w="1016" w:type="dxa"/>
-            <w:tcBorders>
-              <w:top w:val="single" w:sz="4" w:space="0" w:color="000000"/>
-              <w:left w:val="single" w:sz="4" w:space="0" w:color="000000"/>
-              <w:bottom w:val="single" w:sz="4" w:space="0" w:color="000000"/>
-            </w:tcBorders>
-            <w:vAlign w:val="bottom"/>
-          </w:tcPr>
-          <w:p>
-            <w:pPr>
-              <w:pStyle w:val="Normal"/>
-              <w:widowControl w:val="false"/>
-              <w:jc w:val="center"/>
-              <w:rPr>
-                <w:color w:val="000000"/>
-                <w:sz w:val="16"/>
-                <w:szCs w:val="16"/>
-              </w:rPr>
-            </w:pPr>
-            <w:r>
-              <w:rPr>
-                <w:color w:val="000000"/>
-                <w:sz w:val="16"/>
-                <w:szCs w:val="16"/>
-              </w:rPr>
+                <w:color w:val="000000"/>
+                <w:sz w:val="16"/>
+                <w:szCs w:val="16"/>
+              </w:rPr>
+            </w:r>
+          </w:p>
+        </w:tc>
+        <w:tc>
+          <w:tcPr>
+            <w:tcW w:w="1016" w:type="dxa"/>
+            <w:tcBorders>
+              <w:top w:val="single" w:sz="4" w:space="0" w:color="000000"/>
+              <w:left w:val="single" w:sz="4" w:space="0" w:color="000000"/>
+              <w:bottom w:val="single" w:sz="4" w:space="0" w:color="000000"/>
+            </w:tcBorders>
+            <w:vAlign w:val="bottom"/>
+          </w:tcPr>
+          <w:p>
+            <w:pPr>
+              <w:pStyle w:val="Normal"/>
+              <w:widowControl w:val="false"/>
+              <w:jc w:val="center"/>
+              <w:rPr>
+                <w:color w:val="000000"/>
+                <w:sz w:val="16"/>
+                <w:szCs w:val="16"/>
+              </w:rPr>
+            </w:pPr>
+            <w:r>
+              <w:rPr/>
             </w:r>
           </w:p>
         </w:tc>
@@ -10417,19 +12575,20 @@
             <w:pPr>
               <w:pStyle w:val="Normal"/>
               <w:widowControl w:val="false"/>
-              <w:spacing w:lineRule="auto" w:line="180"/>
-              <w:jc w:val="center"/>
-              <w:rPr>
-                <w:sz w:val="16"/>
-                <w:szCs w:val="16"/>
-              </w:rPr>
-            </w:pPr>
-            <w:r>
-              <w:rPr>
-                <w:sz w:val="16"/>
-                <w:szCs w:val="16"/>
-              </w:rPr>
-              <w:t>Class Light</w:t>
+              <w:jc w:val="center"/>
+              <w:rPr>
+                <w:color w:val="000000"/>
+                <w:sz w:val="16"/>
+                <w:szCs w:val="16"/>
+              </w:rPr>
+            </w:pPr>
+            <w:r>
+              <w:rPr>
+                <w:color w:val="000000"/>
+                <w:sz w:val="16"/>
+                <w:szCs w:val="16"/>
+              </w:rPr>
+              <w:t>Inst. Light</w:t>
             </w:r>
           </w:p>
         </w:tc>
@@ -10628,7 +12787,7 @@
           <w:sz w:val="16"/>
           <w:szCs w:val="16"/>
         </w:rPr>
-        <w:t>52</w:t>
+        <w:t>86</w:t>
       </w:r>
       <w:r>
         <w:rPr>
@@ -10769,25 +12928,7 @@
                 <w:sz w:val="16"/>
                 <w:szCs w:val="16"/>
               </w:rPr>
-              <w:t xml:space="preserve">Engine </w:t>
-            </w:r>
-            <w:r>
-              <w:rPr>
-                <w:rFonts w:eastAsia="arial" w:ascii="arial" w:hAnsi="arial"/>
-                <w:color w:val="000000"/>
-                <w:sz w:val="16"/>
-                <w:szCs w:val="16"/>
-              </w:rPr>
-              <w:t>A</w:t>
-            </w:r>
-            <w:r>
-              <w:rPr>
-                <w:rFonts w:eastAsia="arial" w:ascii="arial" w:hAnsi="arial"/>
-                <w:color w:val="000000"/>
-                <w:sz w:val="16"/>
-                <w:szCs w:val="16"/>
-              </w:rPr>
-              <w:t xml:space="preserve"> Stop</w:t>
+              <w:t>Reverse Lock</w:t>
             </w:r>
           </w:p>
         </w:tc>
@@ -10851,69 +12992,60 @@
                 <w:sz w:val="16"/>
                 <w:szCs w:val="16"/>
               </w:rPr>
-            </w:r>
-          </w:p>
-        </w:tc>
-        <w:tc>
-          <w:tcPr>
-            <w:tcW w:w="1016" w:type="dxa"/>
-            <w:tcBorders>
-              <w:top w:val="single" w:sz="4" w:space="0" w:color="000000"/>
-              <w:left w:val="single" w:sz="4" w:space="0" w:color="000000"/>
-              <w:bottom w:val="single" w:sz="4" w:space="0" w:color="000000"/>
-            </w:tcBorders>
-            <w:vAlign w:val="bottom"/>
-          </w:tcPr>
-          <w:p>
-            <w:pPr>
-              <w:pStyle w:val="Normal"/>
-              <w:widowControl w:val="false"/>
-              <w:jc w:val="center"/>
-              <w:rPr>
-                <w:color w:val="000000"/>
-                <w:sz w:val="16"/>
-                <w:szCs w:val="16"/>
-              </w:rPr>
-            </w:pPr>
-            <w:r>
-              <w:rPr>
-                <w:color w:val="000000"/>
-                <w:sz w:val="16"/>
-                <w:szCs w:val="16"/>
-              </w:rPr>
-              <w:t>Engine B Stop</w:t>
-            </w:r>
-          </w:p>
-        </w:tc>
-        <w:tc>
-          <w:tcPr>
-            <w:tcW w:w="1016" w:type="dxa"/>
-            <w:tcBorders>
-              <w:top w:val="single" w:sz="4" w:space="0" w:color="000000"/>
-              <w:left w:val="single" w:sz="4" w:space="0" w:color="000000"/>
-              <w:bottom w:val="single" w:sz="4" w:space="0" w:color="000000"/>
-            </w:tcBorders>
-            <w:vAlign w:val="bottom"/>
-          </w:tcPr>
-          <w:p>
-            <w:pPr>
-              <w:pStyle w:val="Normal"/>
-              <w:widowControl w:val="false"/>
-              <w:spacing w:lineRule="auto" w:line="180"/>
-              <w:jc w:val="center"/>
-              <w:rPr>
-                <w:color w:val="000000"/>
-                <w:sz w:val="16"/>
-                <w:szCs w:val="16"/>
-              </w:rPr>
-            </w:pPr>
-            <w:r>
-              <w:rPr>
-                <w:color w:val="000000"/>
-                <w:sz w:val="16"/>
-                <w:szCs w:val="16"/>
-              </w:rPr>
-              <w:t>Engine Isol. Off</w:t>
+              <w:t>Panto. Low</w:t>
+            </w:r>
+          </w:p>
+        </w:tc>
+        <w:tc>
+          <w:tcPr>
+            <w:tcW w:w="1016" w:type="dxa"/>
+            <w:tcBorders>
+              <w:top w:val="single" w:sz="4" w:space="0" w:color="000000"/>
+              <w:left w:val="single" w:sz="4" w:space="0" w:color="000000"/>
+              <w:bottom w:val="single" w:sz="4" w:space="0" w:color="000000"/>
+            </w:tcBorders>
+            <w:vAlign w:val="bottom"/>
+          </w:tcPr>
+          <w:p>
+            <w:pPr>
+              <w:pStyle w:val="Normal"/>
+              <w:widowControl w:val="false"/>
+              <w:jc w:val="center"/>
+              <w:rPr>
+                <w:color w:val="000000"/>
+                <w:sz w:val="16"/>
+                <w:szCs w:val="16"/>
+              </w:rPr>
+            </w:pPr>
+            <w:r>
+              <w:rPr/>
+            </w:r>
+          </w:p>
+        </w:tc>
+        <w:tc>
+          <w:tcPr>
+            <w:tcW w:w="1016" w:type="dxa"/>
+            <w:tcBorders>
+              <w:top w:val="single" w:sz="4" w:space="0" w:color="000000"/>
+              <w:left w:val="single" w:sz="4" w:space="0" w:color="000000"/>
+              <w:bottom w:val="single" w:sz="4" w:space="0" w:color="000000"/>
+            </w:tcBorders>
+            <w:vAlign w:val="bottom"/>
+          </w:tcPr>
+          <w:p>
+            <w:pPr>
+              <w:pStyle w:val="Normal"/>
+              <w:widowControl w:val="false"/>
+              <w:spacing w:lineRule="auto" w:line="180"/>
+              <w:jc w:val="center"/>
+              <w:rPr>
+                <w:color w:val="000000"/>
+                <w:sz w:val="16"/>
+                <w:szCs w:val="16"/>
+              </w:rPr>
+            </w:pPr>
+            <w:r>
+              <w:rPr/>
             </w:r>
           </w:p>
         </w:tc>
@@ -10971,11 +13103,7 @@
               </w:rPr>
             </w:pPr>
             <w:r>
-              <w:rPr>
-                <w:color w:val="000000"/>
-                <w:sz w:val="16"/>
-                <w:szCs w:val="16"/>
-              </w:rPr>
+              <w:rPr/>
             </w:r>
           </w:p>
         </w:tc>
@@ -11035,7 +13163,7 @@
                 <w:sz w:val="16"/>
                 <w:szCs w:val="16"/>
               </w:rPr>
-              <w:t>Inst. Light</w:t>
+              <w:t>Dimmer Switch</w:t>
             </w:r>
           </w:p>
         </w:tc>
@@ -11193,6 +13321,1168 @@
           <w:sz w:val="16"/>
           <w:szCs w:val="16"/>
         </w:rPr>
+      </w:r>
+    </w:p>
+    <w:p>
+      <w:pPr>
+        <w:pStyle w:val="Normal"/>
+        <w:rPr>
+          <w:color w:val="000000"/>
+          <w:sz w:val="16"/>
+          <w:szCs w:val="16"/>
+        </w:rPr>
+      </w:pPr>
+      <w:r>
+        <w:rPr>
+          <w:rFonts w:eastAsia="arial" w:ascii="arial" w:hAnsi="arial"/>
+          <w:color w:val="000000"/>
+          <w:sz w:val="16"/>
+          <w:szCs w:val="16"/>
+        </w:rPr>
+        <w:tab/>
+        <w:t xml:space="preserve">           Class </w:t>
+      </w:r>
+      <w:r>
+        <w:rPr>
+          <w:rFonts w:eastAsia="arial" w:ascii="arial" w:hAnsi="arial"/>
+          <w:color w:val="000000"/>
+          <w:sz w:val="16"/>
+          <w:szCs w:val="16"/>
+        </w:rPr>
+        <w:t>87</w:t>
+      </w:r>
+      <w:r>
+        <w:rPr>
+          <w:rFonts w:eastAsia="arial" w:ascii="arial" w:hAnsi="arial"/>
+          <w:color w:val="000000"/>
+          <w:sz w:val="16"/>
+          <w:szCs w:val="16"/>
+        </w:rPr>
+        <w:t>-1</w:t>
+      </w:r>
+    </w:p>
+    <w:tbl>
+      <w:tblPr>
+        <w:tblW w:w="14248" w:type="dxa"/>
+        <w:jc w:val="left"/>
+        <w:tblInd w:w="-5" w:type="dxa"/>
+        <w:tblLayout w:type="fixed"/>
+        <w:tblCellMar>
+          <w:top w:w="0" w:type="dxa"/>
+          <w:left w:w="108" w:type="dxa"/>
+          <w:bottom w:w="0" w:type="dxa"/>
+          <w:right w:w="108" w:type="dxa"/>
+        </w:tblCellMar>
+        <w:tblLook w:firstRow="1" w:noVBand="1" w:lastRow="0" w:firstColumn="1" w:lastColumn="0" w:noHBand="0" w:val="04a0"/>
+      </w:tblPr>
+      <w:tblGrid>
+        <w:gridCol w:w="1017"/>
+        <w:gridCol w:w="1019"/>
+        <w:gridCol w:w="1014"/>
+        <w:gridCol w:w="1016"/>
+        <w:gridCol w:w="1020"/>
+        <w:gridCol w:w="1016"/>
+        <w:gridCol w:w="1016"/>
+        <w:gridCol w:w="1017"/>
+        <w:gridCol w:w="1016"/>
+        <w:gridCol w:w="1020"/>
+        <w:gridCol w:w="1016"/>
+        <w:gridCol w:w="1016"/>
+        <w:gridCol w:w="1016"/>
+        <w:gridCol w:w="1029"/>
+      </w:tblGrid>
+      <w:tr>
+        <w:trPr>
+          <w:trHeight w:val="440" w:hRule="exact"/>
+          <w:cantSplit w:val="true"/>
+        </w:trPr>
+        <w:tc>
+          <w:tcPr>
+            <w:tcW w:w="1017" w:type="dxa"/>
+            <w:tcBorders>
+              <w:top w:val="single" w:sz="4" w:space="0" w:color="000000"/>
+              <w:left w:val="single" w:sz="4" w:space="0" w:color="000000"/>
+              <w:bottom w:val="single" w:sz="4" w:space="0" w:color="000000"/>
+            </w:tcBorders>
+            <w:vAlign w:val="bottom"/>
+          </w:tcPr>
+          <w:p>
+            <w:pPr>
+              <w:pStyle w:val="Normal"/>
+              <w:widowControl w:val="false"/>
+              <w:spacing w:lineRule="auto" w:line="180" w:before="0" w:after="60"/>
+              <w:jc w:val="center"/>
+              <w:rPr>
+                <w:color w:val="000000"/>
+                <w:sz w:val="16"/>
+                <w:szCs w:val="16"/>
+              </w:rPr>
+            </w:pPr>
+            <w:r>
+              <w:rPr>
+                <w:rFonts w:eastAsia="arial" w:ascii="arial" w:hAnsi="arial"/>
+                <w:b/>
+                <w:color w:val="000000"/>
+                <w:sz w:val="16"/>
+                <w:szCs w:val="16"/>
+              </w:rPr>
+              <w:t>Pause</w:t>
+            </w:r>
+          </w:p>
+        </w:tc>
+        <w:tc>
+          <w:tcPr>
+            <w:tcW w:w="1019" w:type="dxa"/>
+            <w:tcBorders>
+              <w:top w:val="single" w:sz="4" w:space="0" w:color="000000"/>
+              <w:left w:val="single" w:sz="4" w:space="0" w:color="000000"/>
+              <w:bottom w:val="single" w:sz="4" w:space="0" w:color="000000"/>
+            </w:tcBorders>
+            <w:vAlign w:val="bottom"/>
+          </w:tcPr>
+          <w:p>
+            <w:pPr>
+              <w:pStyle w:val="Normal"/>
+              <w:widowControl w:val="false"/>
+              <w:spacing w:lineRule="auto" w:line="180"/>
+              <w:jc w:val="center"/>
+              <w:rPr>
+                <w:color w:val="000000"/>
+                <w:sz w:val="16"/>
+                <w:szCs w:val="16"/>
+              </w:rPr>
+            </w:pPr>
+            <w:r>
+              <w:rPr>
+                <w:color w:val="000000"/>
+                <w:sz w:val="16"/>
+                <w:szCs w:val="16"/>
+              </w:rPr>
+              <w:t>Master Key</w:t>
+            </w:r>
+          </w:p>
+        </w:tc>
+        <w:tc>
+          <w:tcPr>
+            <w:tcW w:w="1014" w:type="dxa"/>
+            <w:tcBorders>
+              <w:top w:val="single" w:sz="4" w:space="0" w:color="000000"/>
+              <w:left w:val="single" w:sz="4" w:space="0" w:color="000000"/>
+              <w:bottom w:val="single" w:sz="4" w:space="0" w:color="000000"/>
+            </w:tcBorders>
+            <w:vAlign w:val="bottom"/>
+          </w:tcPr>
+          <w:p>
+            <w:pPr>
+              <w:pStyle w:val="Normal"/>
+              <w:widowControl w:val="false"/>
+              <w:spacing w:lineRule="auto" w:line="180"/>
+              <w:jc w:val="center"/>
+              <w:rPr>
+                <w:color w:val="000000"/>
+                <w:sz w:val="16"/>
+                <w:szCs w:val="16"/>
+              </w:rPr>
+            </w:pPr>
+            <w:r>
+              <w:rPr>
+                <w:rFonts w:eastAsia="arial" w:ascii="arial" w:hAnsi="arial"/>
+                <w:color w:val="000000"/>
+                <w:sz w:val="16"/>
+                <w:szCs w:val="16"/>
+              </w:rPr>
+              <w:t>AWS Cab Change</w:t>
+            </w:r>
+          </w:p>
+        </w:tc>
+        <w:tc>
+          <w:tcPr>
+            <w:tcW w:w="1016" w:type="dxa"/>
+            <w:tcBorders>
+              <w:top w:val="single" w:sz="4" w:space="0" w:color="000000"/>
+              <w:left w:val="single" w:sz="4" w:space="0" w:color="000000"/>
+              <w:bottom w:val="single" w:sz="4" w:space="0" w:color="000000"/>
+            </w:tcBorders>
+            <w:vAlign w:val="bottom"/>
+          </w:tcPr>
+          <w:p>
+            <w:pPr>
+              <w:pStyle w:val="Normal"/>
+              <w:widowControl w:val="false"/>
+              <w:spacing w:lineRule="auto" w:line="180"/>
+              <w:jc w:val="center"/>
+              <w:rPr>
+                <w:color w:val="000000"/>
+                <w:sz w:val="16"/>
+                <w:szCs w:val="16"/>
+              </w:rPr>
+            </w:pPr>
+            <w:r>
+              <w:rPr>
+                <w:color w:val="000000"/>
+                <w:sz w:val="16"/>
+                <w:szCs w:val="16"/>
+              </w:rPr>
+              <w:t>AWS/TPWS</w:t>
+            </w:r>
+          </w:p>
+        </w:tc>
+        <w:tc>
+          <w:tcPr>
+            <w:tcW w:w="1020" w:type="dxa"/>
+            <w:tcBorders>
+              <w:top w:val="single" w:sz="4" w:space="0" w:color="000000"/>
+              <w:left w:val="single" w:sz="4" w:space="0" w:color="000000"/>
+              <w:bottom w:val="single" w:sz="4" w:space="0" w:color="000000"/>
+            </w:tcBorders>
+            <w:vAlign w:val="bottom"/>
+          </w:tcPr>
+          <w:p>
+            <w:pPr>
+              <w:pStyle w:val="Normal"/>
+              <w:widowControl w:val="false"/>
+              <w:spacing w:lineRule="auto" w:line="180"/>
+              <w:jc w:val="center"/>
+              <w:rPr>
+                <w:color w:val="000000"/>
+                <w:sz w:val="16"/>
+                <w:szCs w:val="16"/>
+              </w:rPr>
+            </w:pPr>
+            <w:r>
+              <w:rPr>
+                <w:color w:val="000000"/>
+                <w:sz w:val="16"/>
+                <w:szCs w:val="16"/>
+              </w:rPr>
+              <w:t>Panto. Raise</w:t>
+            </w:r>
+          </w:p>
+        </w:tc>
+        <w:tc>
+          <w:tcPr>
+            <w:tcW w:w="1016" w:type="dxa"/>
+            <w:tcBorders>
+              <w:top w:val="single" w:sz="4" w:space="0" w:color="000000"/>
+              <w:left w:val="single" w:sz="4" w:space="0" w:color="000000"/>
+              <w:bottom w:val="single" w:sz="4" w:space="0" w:color="000000"/>
+            </w:tcBorders>
+            <w:vAlign w:val="bottom"/>
+          </w:tcPr>
+          <w:p>
+            <w:pPr>
+              <w:pStyle w:val="Normal"/>
+              <w:widowControl w:val="false"/>
+              <w:jc w:val="center"/>
+              <w:rPr>
+                <w:color w:val="000000"/>
+                <w:sz w:val="16"/>
+                <w:szCs w:val="16"/>
+              </w:rPr>
+            </w:pPr>
+            <w:r>
+              <w:rPr/>
+            </w:r>
+          </w:p>
+        </w:tc>
+        <w:tc>
+          <w:tcPr>
+            <w:tcW w:w="1016" w:type="dxa"/>
+            <w:tcBorders>
+              <w:top w:val="single" w:sz="4" w:space="0" w:color="000000"/>
+              <w:left w:val="single" w:sz="4" w:space="0" w:color="000000"/>
+              <w:bottom w:val="single" w:sz="4" w:space="0" w:color="000000"/>
+            </w:tcBorders>
+            <w:vAlign w:val="bottom"/>
+          </w:tcPr>
+          <w:p>
+            <w:pPr>
+              <w:pStyle w:val="Normal"/>
+              <w:widowControl w:val="false"/>
+              <w:spacing w:lineRule="auto" w:line="180"/>
+              <w:jc w:val="center"/>
+              <w:rPr>
+                <w:color w:val="000000"/>
+                <w:sz w:val="16"/>
+                <w:szCs w:val="16"/>
+              </w:rPr>
+            </w:pPr>
+            <w:r>
+              <w:rPr/>
+            </w:r>
+          </w:p>
+        </w:tc>
+        <w:tc>
+          <w:tcPr>
+            <w:tcW w:w="1017" w:type="dxa"/>
+            <w:tcBorders>
+              <w:top w:val="single" w:sz="4" w:space="0" w:color="000000"/>
+              <w:left w:val="single" w:sz="4" w:space="0" w:color="000000"/>
+              <w:bottom w:val="single" w:sz="4" w:space="0" w:color="000000"/>
+            </w:tcBorders>
+            <w:vAlign w:val="bottom"/>
+          </w:tcPr>
+          <w:p>
+            <w:pPr>
+              <w:pStyle w:val="Normal"/>
+              <w:widowControl w:val="false"/>
+              <w:jc w:val="center"/>
+              <w:rPr>
+                <w:color w:val="000000"/>
+                <w:sz w:val="16"/>
+                <w:szCs w:val="16"/>
+              </w:rPr>
+            </w:pPr>
+            <w:r>
+              <w:rPr>
+                <w:color w:val="000000"/>
+                <w:sz w:val="16"/>
+                <w:szCs w:val="16"/>
+              </w:rPr>
+            </w:r>
+          </w:p>
+        </w:tc>
+        <w:tc>
+          <w:tcPr>
+            <w:tcW w:w="1016" w:type="dxa"/>
+            <w:tcBorders>
+              <w:top w:val="single" w:sz="4" w:space="0" w:color="000000"/>
+              <w:left w:val="single" w:sz="4" w:space="0" w:color="000000"/>
+              <w:bottom w:val="single" w:sz="4" w:space="0" w:color="000000"/>
+            </w:tcBorders>
+            <w:vAlign w:val="bottom"/>
+          </w:tcPr>
+          <w:p>
+            <w:pPr>
+              <w:pStyle w:val="Normal"/>
+              <w:widowControl w:val="false"/>
+              <w:jc w:val="center"/>
+              <w:rPr>
+                <w:color w:val="000000"/>
+                <w:sz w:val="16"/>
+                <w:szCs w:val="16"/>
+              </w:rPr>
+            </w:pPr>
+            <w:r>
+              <w:rPr/>
+            </w:r>
+          </w:p>
+        </w:tc>
+        <w:tc>
+          <w:tcPr>
+            <w:tcW w:w="1020" w:type="dxa"/>
+            <w:tcBorders>
+              <w:top w:val="single" w:sz="4" w:space="0" w:color="000000"/>
+              <w:left w:val="single" w:sz="4" w:space="0" w:color="000000"/>
+              <w:bottom w:val="single" w:sz="4" w:space="0" w:color="000000"/>
+            </w:tcBorders>
+            <w:vAlign w:val="bottom"/>
+          </w:tcPr>
+          <w:p>
+            <w:pPr>
+              <w:pStyle w:val="Normal"/>
+              <w:widowControl w:val="false"/>
+              <w:jc w:val="center"/>
+              <w:rPr>
+                <w:color w:val="000000"/>
+                <w:sz w:val="16"/>
+                <w:szCs w:val="16"/>
+              </w:rPr>
+            </w:pPr>
+            <w:r>
+              <w:rPr>
+                <w:color w:val="000000"/>
+                <w:sz w:val="16"/>
+                <w:szCs w:val="16"/>
+              </w:rPr>
+              <w:t>Inst. Light</w:t>
+            </w:r>
+          </w:p>
+        </w:tc>
+        <w:tc>
+          <w:tcPr>
+            <w:tcW w:w="1016" w:type="dxa"/>
+            <w:tcBorders>
+              <w:top w:val="single" w:sz="4" w:space="0" w:color="000000"/>
+              <w:left w:val="single" w:sz="4" w:space="0" w:color="000000"/>
+              <w:bottom w:val="single" w:sz="4" w:space="0" w:color="000000"/>
+            </w:tcBorders>
+            <w:vAlign w:val="bottom"/>
+          </w:tcPr>
+          <w:p>
+            <w:pPr>
+              <w:pStyle w:val="Normal"/>
+              <w:widowControl w:val="false"/>
+              <w:spacing w:lineRule="auto" w:line="180"/>
+              <w:jc w:val="center"/>
+              <w:rPr>
+                <w:sz w:val="16"/>
+                <w:szCs w:val="16"/>
+              </w:rPr>
+            </w:pPr>
+            <w:r>
+              <w:rPr>
+                <w:rFonts w:eastAsia="arial" w:ascii="arial" w:hAnsi="arial"/>
+                <w:color w:val="000000"/>
+                <w:sz w:val="16"/>
+                <w:szCs w:val="16"/>
+              </w:rPr>
+              <w:t>Cab Light</w:t>
+            </w:r>
+          </w:p>
+        </w:tc>
+        <w:tc>
+          <w:tcPr>
+            <w:tcW w:w="1016" w:type="dxa"/>
+            <w:tcBorders>
+              <w:top w:val="single" w:sz="4" w:space="0" w:color="000000"/>
+              <w:left w:val="single" w:sz="4" w:space="0" w:color="000000"/>
+              <w:bottom w:val="single" w:sz="4" w:space="0" w:color="000000"/>
+            </w:tcBorders>
+            <w:vAlign w:val="bottom"/>
+          </w:tcPr>
+          <w:p>
+            <w:pPr>
+              <w:pStyle w:val="Normal"/>
+              <w:widowControl w:val="false"/>
+              <w:spacing w:lineRule="auto" w:line="180"/>
+              <w:jc w:val="center"/>
+              <w:rPr>
+                <w:sz w:val="16"/>
+                <w:szCs w:val="16"/>
+              </w:rPr>
+            </w:pPr>
+            <w:r>
+              <w:rPr>
+                <w:sz w:val="16"/>
+                <w:szCs w:val="16"/>
+              </w:rPr>
+              <w:t>Parking Brake On</w:t>
+            </w:r>
+          </w:p>
+        </w:tc>
+        <w:tc>
+          <w:tcPr>
+            <w:tcW w:w="1016" w:type="dxa"/>
+            <w:tcBorders>
+              <w:top w:val="single" w:sz="4" w:space="0" w:color="000000"/>
+              <w:left w:val="single" w:sz="4" w:space="0" w:color="000000"/>
+              <w:bottom w:val="single" w:sz="4" w:space="0" w:color="000000"/>
+            </w:tcBorders>
+            <w:vAlign w:val="bottom"/>
+          </w:tcPr>
+          <w:p>
+            <w:pPr>
+              <w:pStyle w:val="Normal"/>
+              <w:widowControl w:val="false"/>
+              <w:spacing w:lineRule="auto" w:line="180"/>
+              <w:jc w:val="center"/>
+              <w:rPr>
+                <w:sz w:val="16"/>
+                <w:szCs w:val="16"/>
+              </w:rPr>
+            </w:pPr>
+            <w:r>
+              <w:rPr>
+                <w:rFonts w:eastAsia="arial" w:ascii="arial" w:hAnsi="arial"/>
+                <w:color w:val="000000"/>
+                <w:sz w:val="16"/>
+                <w:szCs w:val="16"/>
+              </w:rPr>
+              <w:t>1-Person</w:t>
+            </w:r>
+          </w:p>
+        </w:tc>
+        <w:tc>
+          <w:tcPr>
+            <w:tcW w:w="1029" w:type="dxa"/>
+            <w:tcBorders>
+              <w:top w:val="single" w:sz="4" w:space="0" w:color="000000"/>
+              <w:left w:val="single" w:sz="4" w:space="0" w:color="000000"/>
+              <w:bottom w:val="single" w:sz="4" w:space="0" w:color="000000"/>
+              <w:right w:val="single" w:sz="4" w:space="0" w:color="000000"/>
+            </w:tcBorders>
+            <w:vAlign w:val="bottom"/>
+          </w:tcPr>
+          <w:p>
+            <w:pPr>
+              <w:pStyle w:val="Normal"/>
+              <w:widowControl w:val="false"/>
+              <w:spacing w:lineRule="auto" w:line="180"/>
+              <w:jc w:val="center"/>
+              <w:rPr>
+                <w:sz w:val="16"/>
+                <w:szCs w:val="16"/>
+              </w:rPr>
+            </w:pPr>
+            <w:r>
+              <w:rPr>
+                <w:rFonts w:eastAsia="arial" w:ascii="arial" w:hAnsi="arial"/>
+                <w:color w:val="000000"/>
+                <w:sz w:val="16"/>
+                <w:szCs w:val="16"/>
+              </w:rPr>
+              <w:t>Next</w:t>
+            </w:r>
+          </w:p>
+          <w:p>
+            <w:pPr>
+              <w:pStyle w:val="Normal"/>
+              <w:widowControl w:val="false"/>
+              <w:spacing w:lineRule="auto" w:line="180"/>
+              <w:jc w:val="center"/>
+              <w:rPr>
+                <w:sz w:val="16"/>
+                <w:szCs w:val="16"/>
+              </w:rPr>
+            </w:pPr>
+            <w:r>
+              <w:rPr>
+                <w:rFonts w:eastAsia="arial" w:ascii="arial" w:hAnsi="arial"/>
+                <w:color w:val="000000"/>
+                <w:sz w:val="16"/>
+                <w:szCs w:val="16"/>
+              </w:rPr>
+              <w:t>Cab Cam</w:t>
+            </w:r>
+          </w:p>
+        </w:tc>
+      </w:tr>
+    </w:tbl>
+    <w:p>
+      <w:pPr>
+        <w:pStyle w:val="Normal"/>
+        <w:rPr>
+          <w:rFonts w:ascii="arial" w:hAnsi="arial" w:eastAsia="arial"/>
+          <w:color w:val="000000"/>
+          <w:sz w:val="16"/>
+          <w:szCs w:val="16"/>
+        </w:rPr>
+      </w:pPr>
+      <w:r>
+        <w:rPr>
+          <w:rFonts w:eastAsia="arial" w:ascii="arial" w:hAnsi="arial"/>
+          <w:color w:val="000000"/>
+          <w:sz w:val="16"/>
+          <w:szCs w:val="16"/>
+        </w:rPr>
+      </w:r>
+    </w:p>
+    <w:p>
+      <w:pPr>
+        <w:pStyle w:val="Normal"/>
+        <w:rPr>
+          <w:color w:val="000000"/>
+          <w:sz w:val="16"/>
+          <w:szCs w:val="16"/>
+        </w:rPr>
+      </w:pPr>
+      <w:r>
+        <w:rPr>
+          <w:rFonts w:eastAsia="arial" w:ascii="arial" w:hAnsi="arial"/>
+          <w:color w:val="000000"/>
+          <w:sz w:val="16"/>
+          <w:szCs w:val="16"/>
+        </w:rPr>
+      </w:r>
+    </w:p>
+    <w:p>
+      <w:pPr>
+        <w:pStyle w:val="Normal"/>
+        <w:rPr>
+          <w:color w:val="000000"/>
+          <w:sz w:val="16"/>
+          <w:szCs w:val="16"/>
+        </w:rPr>
+      </w:pPr>
+      <w:r>
+        <w:rPr>
+          <w:rFonts w:eastAsia="arial" w:ascii="arial" w:hAnsi="arial"/>
+          <w:color w:val="000000"/>
+          <w:sz w:val="16"/>
+          <w:szCs w:val="16"/>
+        </w:rPr>
+      </w:r>
+    </w:p>
+    <w:p>
+      <w:pPr>
+        <w:pStyle w:val="Normal"/>
+        <w:rPr>
+          <w:color w:val="000000"/>
+          <w:sz w:val="16"/>
+          <w:szCs w:val="16"/>
+        </w:rPr>
+      </w:pPr>
+      <w:r>
+        <w:rPr>
+          <w:rFonts w:eastAsia="arial" w:ascii="arial" w:hAnsi="arial"/>
+          <w:color w:val="000000"/>
+          <w:sz w:val="16"/>
+          <w:szCs w:val="16"/>
+        </w:rPr>
+      </w:r>
+    </w:p>
+    <w:p>
+      <w:pPr>
+        <w:pStyle w:val="Normal"/>
+        <w:rPr>
+          <w:color w:val="000000"/>
+          <w:sz w:val="16"/>
+          <w:szCs w:val="16"/>
+        </w:rPr>
+      </w:pPr>
+      <w:r>
+        <w:rPr>
+          <w:rFonts w:eastAsia="arial" w:ascii="arial" w:hAnsi="arial"/>
+          <w:color w:val="000000"/>
+          <w:sz w:val="16"/>
+          <w:szCs w:val="16"/>
+        </w:rPr>
+        <w:tab/>
+        <w:t xml:space="preserve">           Class </w:t>
+      </w:r>
+      <w:r>
+        <w:rPr>
+          <w:rFonts w:eastAsia="arial" w:ascii="arial" w:hAnsi="arial"/>
+          <w:color w:val="000000"/>
+          <w:sz w:val="16"/>
+          <w:szCs w:val="16"/>
+        </w:rPr>
+        <w:t>87</w:t>
+      </w:r>
+      <w:r>
+        <w:rPr>
+          <w:rFonts w:eastAsia="arial" w:ascii="arial" w:hAnsi="arial"/>
+          <w:color w:val="000000"/>
+          <w:sz w:val="16"/>
+          <w:szCs w:val="16"/>
+        </w:rPr>
+        <w:t>-2</w:t>
+      </w:r>
+    </w:p>
+    <w:tbl>
+      <w:tblPr>
+        <w:tblW w:w="14248" w:type="dxa"/>
+        <w:jc w:val="left"/>
+        <w:tblInd w:w="-5" w:type="dxa"/>
+        <w:tblLayout w:type="fixed"/>
+        <w:tblCellMar>
+          <w:top w:w="0" w:type="dxa"/>
+          <w:left w:w="108" w:type="dxa"/>
+          <w:bottom w:w="0" w:type="dxa"/>
+          <w:right w:w="108" w:type="dxa"/>
+        </w:tblCellMar>
+        <w:tblLook w:firstRow="1" w:noVBand="1" w:lastRow="0" w:firstColumn="1" w:lastColumn="0" w:noHBand="0" w:val="04a0"/>
+      </w:tblPr>
+      <w:tblGrid>
+        <w:gridCol w:w="1017"/>
+        <w:gridCol w:w="1019"/>
+        <w:gridCol w:w="1014"/>
+        <w:gridCol w:w="1016"/>
+        <w:gridCol w:w="1020"/>
+        <w:gridCol w:w="1016"/>
+        <w:gridCol w:w="1016"/>
+        <w:gridCol w:w="1017"/>
+        <w:gridCol w:w="1016"/>
+        <w:gridCol w:w="1020"/>
+        <w:gridCol w:w="1016"/>
+        <w:gridCol w:w="1016"/>
+        <w:gridCol w:w="1016"/>
+        <w:gridCol w:w="1029"/>
+      </w:tblGrid>
+      <w:tr>
+        <w:trPr>
+          <w:trHeight w:val="440" w:hRule="exact"/>
+          <w:cantSplit w:val="true"/>
+        </w:trPr>
+        <w:tc>
+          <w:tcPr>
+            <w:tcW w:w="1017" w:type="dxa"/>
+            <w:tcBorders>
+              <w:top w:val="single" w:sz="4" w:space="0" w:color="000000"/>
+              <w:left w:val="single" w:sz="4" w:space="0" w:color="000000"/>
+              <w:bottom w:val="single" w:sz="4" w:space="0" w:color="000000"/>
+            </w:tcBorders>
+            <w:vAlign w:val="bottom"/>
+          </w:tcPr>
+          <w:p>
+            <w:pPr>
+              <w:pStyle w:val="Normal"/>
+              <w:widowControl w:val="false"/>
+              <w:spacing w:lineRule="auto" w:line="180" w:before="0" w:after="60"/>
+              <w:jc w:val="center"/>
+              <w:rPr>
+                <w:b/>
+                <w:bCs/>
+              </w:rPr>
+            </w:pPr>
+            <w:r>
+              <w:rPr>
+                <w:b/>
+                <w:bCs/>
+                <w:color w:val="000000"/>
+                <w:sz w:val="16"/>
+                <w:szCs w:val="16"/>
+              </w:rPr>
+              <w:t>HUD</w:t>
+            </w:r>
+          </w:p>
+        </w:tc>
+        <w:tc>
+          <w:tcPr>
+            <w:tcW w:w="1019" w:type="dxa"/>
+            <w:tcBorders>
+              <w:top w:val="single" w:sz="4" w:space="0" w:color="000000"/>
+              <w:left w:val="single" w:sz="4" w:space="0" w:color="000000"/>
+              <w:bottom w:val="single" w:sz="4" w:space="0" w:color="000000"/>
+            </w:tcBorders>
+            <w:vAlign w:val="bottom"/>
+          </w:tcPr>
+          <w:p>
+            <w:pPr>
+              <w:pStyle w:val="Normal"/>
+              <w:widowControl w:val="false"/>
+              <w:spacing w:lineRule="auto" w:line="180"/>
+              <w:jc w:val="center"/>
+              <w:rPr>
+                <w:color w:val="000000"/>
+                <w:sz w:val="16"/>
+                <w:szCs w:val="16"/>
+              </w:rPr>
+            </w:pPr>
+            <w:r>
+              <w:rPr>
+                <w:color w:val="000000"/>
+                <w:sz w:val="16"/>
+                <w:szCs w:val="16"/>
+              </w:rPr>
+              <w:t>Schedule</w:t>
+            </w:r>
+          </w:p>
+        </w:tc>
+        <w:tc>
+          <w:tcPr>
+            <w:tcW w:w="1014" w:type="dxa"/>
+            <w:tcBorders>
+              <w:top w:val="single" w:sz="4" w:space="0" w:color="000000"/>
+              <w:left w:val="single" w:sz="4" w:space="0" w:color="000000"/>
+              <w:bottom w:val="single" w:sz="4" w:space="0" w:color="000000"/>
+            </w:tcBorders>
+            <w:vAlign w:val="bottom"/>
+          </w:tcPr>
+          <w:p>
+            <w:pPr>
+              <w:pStyle w:val="Normal"/>
+              <w:widowControl w:val="false"/>
+              <w:spacing w:lineRule="auto" w:line="180"/>
+              <w:jc w:val="center"/>
+              <w:rPr>
+                <w:color w:val="000000"/>
+                <w:sz w:val="16"/>
+                <w:szCs w:val="16"/>
+              </w:rPr>
+            </w:pPr>
+            <w:r>
+              <w:rPr>
+                <w:rFonts w:eastAsia="arial" w:ascii="arial" w:hAnsi="arial"/>
+                <w:color w:val="000000"/>
+                <w:sz w:val="16"/>
+                <w:szCs w:val="16"/>
+              </w:rPr>
+              <w:t>Reverse Lock</w:t>
+            </w:r>
+          </w:p>
+        </w:tc>
+        <w:tc>
+          <w:tcPr>
+            <w:tcW w:w="1016" w:type="dxa"/>
+            <w:tcBorders>
+              <w:top w:val="single" w:sz="4" w:space="0" w:color="000000"/>
+              <w:left w:val="single" w:sz="4" w:space="0" w:color="000000"/>
+              <w:bottom w:val="single" w:sz="4" w:space="0" w:color="000000"/>
+            </w:tcBorders>
+            <w:vAlign w:val="bottom"/>
+          </w:tcPr>
+          <w:p>
+            <w:pPr>
+              <w:pStyle w:val="Normal"/>
+              <w:widowControl w:val="false"/>
+              <w:spacing w:lineRule="auto" w:line="180"/>
+              <w:jc w:val="center"/>
+              <w:rPr>
+                <w:color w:val="000000"/>
+                <w:sz w:val="16"/>
+                <w:szCs w:val="16"/>
+              </w:rPr>
+            </w:pPr>
+            <w:r>
+              <w:rPr>
+                <w:color w:val="000000"/>
+                <w:sz w:val="16"/>
+                <w:szCs w:val="16"/>
+              </w:rPr>
+              <w:t>DSD</w:t>
+            </w:r>
+          </w:p>
+        </w:tc>
+        <w:tc>
+          <w:tcPr>
+            <w:tcW w:w="1020" w:type="dxa"/>
+            <w:tcBorders>
+              <w:top w:val="single" w:sz="4" w:space="0" w:color="000000"/>
+              <w:left w:val="single" w:sz="4" w:space="0" w:color="000000"/>
+              <w:bottom w:val="single" w:sz="4" w:space="0" w:color="000000"/>
+            </w:tcBorders>
+            <w:vAlign w:val="bottom"/>
+          </w:tcPr>
+          <w:p>
+            <w:pPr>
+              <w:pStyle w:val="Normal"/>
+              <w:widowControl w:val="false"/>
+              <w:spacing w:lineRule="auto" w:line="180"/>
+              <w:jc w:val="center"/>
+              <w:rPr>
+                <w:color w:val="000000"/>
+                <w:sz w:val="16"/>
+                <w:szCs w:val="16"/>
+              </w:rPr>
+            </w:pPr>
+            <w:r>
+              <w:rPr>
+                <w:color w:val="000000"/>
+                <w:sz w:val="16"/>
+                <w:szCs w:val="16"/>
+              </w:rPr>
+              <w:t>Panto. Low</w:t>
+            </w:r>
+          </w:p>
+        </w:tc>
+        <w:tc>
+          <w:tcPr>
+            <w:tcW w:w="1016" w:type="dxa"/>
+            <w:tcBorders>
+              <w:top w:val="single" w:sz="4" w:space="0" w:color="000000"/>
+              <w:left w:val="single" w:sz="4" w:space="0" w:color="000000"/>
+              <w:bottom w:val="single" w:sz="4" w:space="0" w:color="000000"/>
+            </w:tcBorders>
+            <w:vAlign w:val="bottom"/>
+          </w:tcPr>
+          <w:p>
+            <w:pPr>
+              <w:pStyle w:val="Normal"/>
+              <w:widowControl w:val="false"/>
+              <w:jc w:val="center"/>
+              <w:rPr>
+                <w:color w:val="000000"/>
+                <w:sz w:val="16"/>
+                <w:szCs w:val="16"/>
+              </w:rPr>
+            </w:pPr>
+            <w:r>
+              <w:rPr/>
+            </w:r>
+          </w:p>
+        </w:tc>
+        <w:tc>
+          <w:tcPr>
+            <w:tcW w:w="1016" w:type="dxa"/>
+            <w:tcBorders>
+              <w:top w:val="single" w:sz="4" w:space="0" w:color="000000"/>
+              <w:left w:val="single" w:sz="4" w:space="0" w:color="000000"/>
+              <w:bottom w:val="single" w:sz="4" w:space="0" w:color="000000"/>
+            </w:tcBorders>
+            <w:vAlign w:val="bottom"/>
+          </w:tcPr>
+          <w:p>
+            <w:pPr>
+              <w:pStyle w:val="Normal"/>
+              <w:widowControl w:val="false"/>
+              <w:spacing w:lineRule="auto" w:line="180"/>
+              <w:jc w:val="center"/>
+              <w:rPr>
+                <w:color w:val="000000"/>
+                <w:sz w:val="16"/>
+                <w:szCs w:val="16"/>
+              </w:rPr>
+            </w:pPr>
+            <w:r>
+              <w:rPr/>
+            </w:r>
+          </w:p>
+        </w:tc>
+        <w:tc>
+          <w:tcPr>
+            <w:tcW w:w="1017" w:type="dxa"/>
+            <w:tcBorders>
+              <w:top w:val="single" w:sz="4" w:space="0" w:color="000000"/>
+              <w:left w:val="single" w:sz="4" w:space="0" w:color="000000"/>
+              <w:bottom w:val="single" w:sz="4" w:space="0" w:color="000000"/>
+            </w:tcBorders>
+            <w:vAlign w:val="bottom"/>
+          </w:tcPr>
+          <w:p>
+            <w:pPr>
+              <w:pStyle w:val="Normal"/>
+              <w:widowControl w:val="false"/>
+              <w:jc w:val="center"/>
+              <w:rPr>
+                <w:rFonts w:ascii="arial" w:hAnsi="arial" w:eastAsia="arial"/>
+                <w:color w:val="000000"/>
+                <w:sz w:val="16"/>
+                <w:szCs w:val="16"/>
+              </w:rPr>
+            </w:pPr>
+            <w:r>
+              <w:rPr>
+                <w:rFonts w:eastAsia="arial" w:ascii="arial" w:hAnsi="arial"/>
+                <w:color w:val="000000"/>
+                <w:sz w:val="16"/>
+                <w:szCs w:val="16"/>
+              </w:rPr>
+            </w:r>
+          </w:p>
+        </w:tc>
+        <w:tc>
+          <w:tcPr>
+            <w:tcW w:w="1016" w:type="dxa"/>
+            <w:tcBorders>
+              <w:top w:val="single" w:sz="4" w:space="0" w:color="000000"/>
+              <w:left w:val="single" w:sz="4" w:space="0" w:color="000000"/>
+              <w:bottom w:val="single" w:sz="4" w:space="0" w:color="000000"/>
+            </w:tcBorders>
+            <w:vAlign w:val="bottom"/>
+          </w:tcPr>
+          <w:p>
+            <w:pPr>
+              <w:pStyle w:val="Normal"/>
+              <w:widowControl w:val="false"/>
+              <w:jc w:val="center"/>
+              <w:rPr>
+                <w:color w:val="000000"/>
+                <w:sz w:val="16"/>
+                <w:szCs w:val="16"/>
+              </w:rPr>
+            </w:pPr>
+            <w:r>
+              <w:rPr>
+                <w:color w:val="000000"/>
+                <w:sz w:val="16"/>
+                <w:szCs w:val="16"/>
+              </w:rPr>
+              <w:t>Brake Charge</w:t>
+            </w:r>
+          </w:p>
+        </w:tc>
+        <w:tc>
+          <w:tcPr>
+            <w:tcW w:w="1020" w:type="dxa"/>
+            <w:tcBorders>
+              <w:top w:val="single" w:sz="4" w:space="0" w:color="000000"/>
+              <w:left w:val="single" w:sz="4" w:space="0" w:color="000000"/>
+              <w:bottom w:val="single" w:sz="4" w:space="0" w:color="000000"/>
+            </w:tcBorders>
+            <w:vAlign w:val="bottom"/>
+          </w:tcPr>
+          <w:p>
+            <w:pPr>
+              <w:pStyle w:val="Normal"/>
+              <w:widowControl w:val="false"/>
+              <w:spacing w:lineRule="auto" w:line="180"/>
+              <w:jc w:val="center"/>
+              <w:rPr>
+                <w:sz w:val="16"/>
+                <w:szCs w:val="16"/>
+              </w:rPr>
+            </w:pPr>
+            <w:r>
+              <w:rPr>
+                <w:sz w:val="16"/>
+                <w:szCs w:val="16"/>
+              </w:rPr>
+              <w:t>Tail Light</w:t>
+            </w:r>
+          </w:p>
+        </w:tc>
+        <w:tc>
+          <w:tcPr>
+            <w:tcW w:w="1016" w:type="dxa"/>
+            <w:tcBorders>
+              <w:top w:val="single" w:sz="4" w:space="0" w:color="000000"/>
+              <w:left w:val="single" w:sz="4" w:space="0" w:color="000000"/>
+              <w:bottom w:val="single" w:sz="4" w:space="0" w:color="000000"/>
+            </w:tcBorders>
+            <w:vAlign w:val="bottom"/>
+          </w:tcPr>
+          <w:p>
+            <w:pPr>
+              <w:pStyle w:val="Normal"/>
+              <w:widowControl w:val="false"/>
+              <w:spacing w:lineRule="auto" w:line="180"/>
+              <w:jc w:val="center"/>
+              <w:rPr>
+                <w:sz w:val="16"/>
+                <w:szCs w:val="16"/>
+              </w:rPr>
+            </w:pPr>
+            <w:r>
+              <w:rPr>
+                <w:sz w:val="16"/>
+                <w:szCs w:val="16"/>
+              </w:rPr>
+              <w:t>Dimmer Switch</w:t>
+            </w:r>
+          </w:p>
+        </w:tc>
+        <w:tc>
+          <w:tcPr>
+            <w:tcW w:w="1016" w:type="dxa"/>
+            <w:tcBorders>
+              <w:top w:val="single" w:sz="4" w:space="0" w:color="000000"/>
+              <w:left w:val="single" w:sz="4" w:space="0" w:color="000000"/>
+              <w:bottom w:val="single" w:sz="4" w:space="0" w:color="000000"/>
+            </w:tcBorders>
+            <w:vAlign w:val="bottom"/>
+          </w:tcPr>
+          <w:p>
+            <w:pPr>
+              <w:pStyle w:val="Normal"/>
+              <w:widowControl w:val="false"/>
+              <w:spacing w:lineRule="auto" w:line="180"/>
+              <w:jc w:val="center"/>
+              <w:rPr>
+                <w:sz w:val="16"/>
+                <w:szCs w:val="16"/>
+              </w:rPr>
+            </w:pPr>
+            <w:r>
+              <w:rPr>
+                <w:sz w:val="16"/>
+                <w:szCs w:val="16"/>
+              </w:rPr>
+              <w:t>Parking Brake Off</w:t>
+            </w:r>
+          </w:p>
+        </w:tc>
+        <w:tc>
+          <w:tcPr>
+            <w:tcW w:w="1016" w:type="dxa"/>
+            <w:tcBorders>
+              <w:top w:val="single" w:sz="4" w:space="0" w:color="000000"/>
+              <w:left w:val="single" w:sz="4" w:space="0" w:color="000000"/>
+              <w:bottom w:val="single" w:sz="4" w:space="0" w:color="000000"/>
+            </w:tcBorders>
+            <w:vAlign w:val="bottom"/>
+          </w:tcPr>
+          <w:p>
+            <w:pPr>
+              <w:pStyle w:val="Normal"/>
+              <w:widowControl w:val="false"/>
+              <w:spacing w:lineRule="auto" w:line="180"/>
+              <w:jc w:val="center"/>
+              <w:rPr>
+                <w:sz w:val="16"/>
+                <w:szCs w:val="16"/>
+              </w:rPr>
+            </w:pPr>
+            <w:r>
+              <w:rPr>
+                <w:rFonts w:eastAsia="arial" w:ascii="arial" w:hAnsi="arial"/>
+                <w:color w:val="000000"/>
+                <w:sz w:val="16"/>
+                <w:szCs w:val="16"/>
+              </w:rPr>
+              <w:t>Exterior</w:t>
+            </w:r>
+          </w:p>
+          <w:p>
+            <w:pPr>
+              <w:pStyle w:val="Normal"/>
+              <w:widowControl w:val="false"/>
+              <w:spacing w:lineRule="auto" w:line="180"/>
+              <w:jc w:val="center"/>
+              <w:rPr>
+                <w:sz w:val="16"/>
+                <w:szCs w:val="16"/>
+              </w:rPr>
+            </w:pPr>
+            <w:r>
+              <w:rPr>
+                <w:rFonts w:eastAsia="arial" w:ascii="arial" w:hAnsi="arial"/>
+                <w:color w:val="000000"/>
+                <w:sz w:val="16"/>
+                <w:szCs w:val="16"/>
+              </w:rPr>
+              <w:t>Camera</w:t>
+            </w:r>
+          </w:p>
+        </w:tc>
+        <w:tc>
+          <w:tcPr>
+            <w:tcW w:w="1029" w:type="dxa"/>
+            <w:tcBorders>
+              <w:top w:val="single" w:sz="4" w:space="0" w:color="000000"/>
+              <w:left w:val="single" w:sz="4" w:space="0" w:color="000000"/>
+              <w:bottom w:val="single" w:sz="4" w:space="0" w:color="000000"/>
+              <w:right w:val="single" w:sz="4" w:space="0" w:color="000000"/>
+            </w:tcBorders>
+            <w:vAlign w:val="bottom"/>
+          </w:tcPr>
+          <w:p>
+            <w:pPr>
+              <w:pStyle w:val="Normal"/>
+              <w:widowControl w:val="false"/>
+              <w:spacing w:lineRule="auto" w:line="180"/>
+              <w:jc w:val="center"/>
+              <w:rPr>
+                <w:sz w:val="16"/>
+                <w:szCs w:val="16"/>
+              </w:rPr>
+            </w:pPr>
+            <w:r>
+              <w:rPr>
+                <w:rFonts w:eastAsia="arial" w:ascii="arial" w:hAnsi="arial"/>
+                <w:color w:val="000000"/>
+                <w:sz w:val="16"/>
+                <w:szCs w:val="16"/>
+              </w:rPr>
+              <w:t>Prev</w:t>
+            </w:r>
+          </w:p>
+          <w:p>
+            <w:pPr>
+              <w:pStyle w:val="Normal"/>
+              <w:widowControl w:val="false"/>
+              <w:spacing w:lineRule="auto" w:line="180"/>
+              <w:jc w:val="center"/>
+              <w:rPr>
+                <w:sz w:val="16"/>
+                <w:szCs w:val="16"/>
+              </w:rPr>
+            </w:pPr>
+            <w:r>
+              <w:rPr>
+                <w:rFonts w:eastAsia="arial" w:ascii="arial" w:hAnsi="arial"/>
+                <w:color w:val="000000"/>
+                <w:sz w:val="16"/>
+                <w:szCs w:val="16"/>
+              </w:rPr>
+              <w:t>Cab Cam</w:t>
+            </w:r>
+          </w:p>
+        </w:tc>
+      </w:tr>
+    </w:tbl>
+    <w:p>
+      <w:pPr>
+        <w:pStyle w:val="Normal"/>
+        <w:rPr>
+          <w:color w:val="000000"/>
+          <w:sz w:val="16"/>
+          <w:szCs w:val="16"/>
+        </w:rPr>
+      </w:pPr>
+      <w:r>
+        <w:rPr/>
       </w:r>
     </w:p>
     <w:sectPr>

</xml_diff>

<commit_message>
Add Class 142 and fix Class 101 buzzer
</commit_message>
<xml_diff>
--- a/raildriver-UK-Remapped.docx
+++ b/raildriver-UK-Remapped.docx
@@ -15586,25 +15586,7 @@
           <w:szCs w:val="16"/>
         </w:rPr>
         <w:tab/>
-        <w:t xml:space="preserve">           Class </w:t>
-      </w:r>
-      <w:r>
-        <w:rPr>
-          <w:rFonts w:eastAsia="arial" w:ascii="arial" w:hAnsi="arial"/>
-          <w:color w:val="000000"/>
-          <w:sz w:val="16"/>
-          <w:szCs w:val="16"/>
-        </w:rPr>
-        <w:t>101</w:t>
-      </w:r>
-      <w:r>
-        <w:rPr>
-          <w:rFonts w:eastAsia="arial" w:ascii="arial" w:hAnsi="arial"/>
-          <w:color w:val="000000"/>
-          <w:sz w:val="16"/>
-          <w:szCs w:val="16"/>
-        </w:rPr>
-        <w:t>-1</w:t>
+        <w:t xml:space="preserve">           Class 101-1</w:t>
       </w:r>
     </w:p>
     <w:tbl>
@@ -15889,7 +15871,11 @@
               </w:rPr>
             </w:pPr>
             <w:r>
-              <w:rPr/>
+              <w:rPr>
+                <w:color w:val="000000"/>
+                <w:sz w:val="16"/>
+                <w:szCs w:val="16"/>
+              </w:rPr>
             </w:r>
           </w:p>
         </w:tc>
@@ -16141,7 +16127,562 @@
           <w:szCs w:val="16"/>
         </w:rPr>
         <w:tab/>
-        <w:t xml:space="preserve">           Class </w:t>
+        <w:t xml:space="preserve">           Class 101-2</w:t>
+      </w:r>
+    </w:p>
+    <w:tbl>
+      <w:tblPr>
+        <w:tblW w:w="14248" w:type="dxa"/>
+        <w:jc w:val="left"/>
+        <w:tblInd w:w="-5" w:type="dxa"/>
+        <w:tblLayout w:type="fixed"/>
+        <w:tblCellMar>
+          <w:top w:w="0" w:type="dxa"/>
+          <w:left w:w="108" w:type="dxa"/>
+          <w:bottom w:w="0" w:type="dxa"/>
+          <w:right w:w="108" w:type="dxa"/>
+        </w:tblCellMar>
+        <w:tblLook w:firstRow="1" w:noVBand="1" w:lastRow="0" w:firstColumn="1" w:lastColumn="0" w:noHBand="0" w:val="04a0"/>
+      </w:tblPr>
+      <w:tblGrid>
+        <w:gridCol w:w="1017"/>
+        <w:gridCol w:w="1019"/>
+        <w:gridCol w:w="1014"/>
+        <w:gridCol w:w="1016"/>
+        <w:gridCol w:w="1020"/>
+        <w:gridCol w:w="1016"/>
+        <w:gridCol w:w="1016"/>
+        <w:gridCol w:w="1017"/>
+        <w:gridCol w:w="1016"/>
+        <w:gridCol w:w="1020"/>
+        <w:gridCol w:w="1016"/>
+        <w:gridCol w:w="1016"/>
+        <w:gridCol w:w="1016"/>
+        <w:gridCol w:w="1029"/>
+      </w:tblGrid>
+      <w:tr>
+        <w:trPr>
+          <w:trHeight w:val="440" w:hRule="exact"/>
+          <w:cantSplit w:val="true"/>
+        </w:trPr>
+        <w:tc>
+          <w:tcPr>
+            <w:tcW w:w="1017" w:type="dxa"/>
+            <w:tcBorders>
+              <w:top w:val="single" w:sz="4" w:space="0" w:color="000000"/>
+              <w:left w:val="single" w:sz="4" w:space="0" w:color="000000"/>
+              <w:bottom w:val="single" w:sz="4" w:space="0" w:color="000000"/>
+            </w:tcBorders>
+            <w:vAlign w:val="bottom"/>
+          </w:tcPr>
+          <w:p>
+            <w:pPr>
+              <w:pStyle w:val="Normal"/>
+              <w:widowControl w:val="false"/>
+              <w:spacing w:lineRule="auto" w:line="180" w:before="0" w:after="60"/>
+              <w:jc w:val="center"/>
+              <w:rPr>
+                <w:b/>
+                <w:bCs/>
+              </w:rPr>
+            </w:pPr>
+            <w:r>
+              <w:rPr>
+                <w:b/>
+                <w:bCs/>
+                <w:color w:val="000000"/>
+                <w:sz w:val="16"/>
+                <w:szCs w:val="16"/>
+              </w:rPr>
+              <w:t>HUD</w:t>
+            </w:r>
+          </w:p>
+        </w:tc>
+        <w:tc>
+          <w:tcPr>
+            <w:tcW w:w="1019" w:type="dxa"/>
+            <w:tcBorders>
+              <w:top w:val="single" w:sz="4" w:space="0" w:color="000000"/>
+              <w:left w:val="single" w:sz="4" w:space="0" w:color="000000"/>
+              <w:bottom w:val="single" w:sz="4" w:space="0" w:color="000000"/>
+            </w:tcBorders>
+            <w:vAlign w:val="bottom"/>
+          </w:tcPr>
+          <w:p>
+            <w:pPr>
+              <w:pStyle w:val="Normal"/>
+              <w:widowControl w:val="false"/>
+              <w:spacing w:lineRule="auto" w:line="180"/>
+              <w:jc w:val="center"/>
+              <w:rPr>
+                <w:color w:val="000000"/>
+                <w:sz w:val="16"/>
+                <w:szCs w:val="16"/>
+              </w:rPr>
+            </w:pPr>
+            <w:r>
+              <w:rPr>
+                <w:color w:val="000000"/>
+                <w:sz w:val="16"/>
+                <w:szCs w:val="16"/>
+              </w:rPr>
+              <w:t>Schedule</w:t>
+            </w:r>
+          </w:p>
+        </w:tc>
+        <w:tc>
+          <w:tcPr>
+            <w:tcW w:w="1014" w:type="dxa"/>
+            <w:tcBorders>
+              <w:top w:val="single" w:sz="4" w:space="0" w:color="000000"/>
+              <w:left w:val="single" w:sz="4" w:space="0" w:color="000000"/>
+              <w:bottom w:val="single" w:sz="4" w:space="0" w:color="000000"/>
+            </w:tcBorders>
+            <w:vAlign w:val="bottom"/>
+          </w:tcPr>
+          <w:p>
+            <w:pPr>
+              <w:pStyle w:val="Normal"/>
+              <w:widowControl w:val="false"/>
+              <w:spacing w:lineRule="auto" w:line="180"/>
+              <w:jc w:val="center"/>
+              <w:rPr>
+                <w:sz w:val="16"/>
+                <w:szCs w:val="16"/>
+              </w:rPr>
+            </w:pPr>
+            <w:r>
+              <w:rPr>
+                <w:rFonts w:eastAsia="arial" w:ascii="arial" w:hAnsi="arial"/>
+                <w:sz w:val="16"/>
+                <w:szCs w:val="16"/>
+              </w:rPr>
+              <w:t>Engine Stop</w:t>
+            </w:r>
+          </w:p>
+        </w:tc>
+        <w:tc>
+          <w:tcPr>
+            <w:tcW w:w="1016" w:type="dxa"/>
+            <w:tcBorders>
+              <w:top w:val="single" w:sz="4" w:space="0" w:color="000000"/>
+              <w:left w:val="single" w:sz="4" w:space="0" w:color="000000"/>
+              <w:bottom w:val="single" w:sz="4" w:space="0" w:color="000000"/>
+            </w:tcBorders>
+            <w:vAlign w:val="bottom"/>
+          </w:tcPr>
+          <w:p>
+            <w:pPr>
+              <w:pStyle w:val="Normal"/>
+              <w:widowControl w:val="false"/>
+              <w:spacing w:lineRule="auto" w:line="180"/>
+              <w:jc w:val="center"/>
+              <w:rPr>
+                <w:color w:val="000000"/>
+                <w:sz w:val="16"/>
+                <w:szCs w:val="16"/>
+              </w:rPr>
+            </w:pPr>
+            <w:r>
+              <w:rPr>
+                <w:color w:val="000000"/>
+                <w:sz w:val="16"/>
+                <w:szCs w:val="16"/>
+              </w:rPr>
+              <w:t>Engine RPM</w:t>
+            </w:r>
+          </w:p>
+        </w:tc>
+        <w:tc>
+          <w:tcPr>
+            <w:tcW w:w="1020" w:type="dxa"/>
+            <w:tcBorders>
+              <w:top w:val="single" w:sz="4" w:space="0" w:color="000000"/>
+              <w:left w:val="single" w:sz="4" w:space="0" w:color="000000"/>
+              <w:bottom w:val="single" w:sz="4" w:space="0" w:color="000000"/>
+            </w:tcBorders>
+            <w:vAlign w:val="bottom"/>
+          </w:tcPr>
+          <w:p>
+            <w:pPr>
+              <w:pStyle w:val="Normal"/>
+              <w:widowControl w:val="false"/>
+              <w:spacing w:lineRule="auto" w:line="180"/>
+              <w:jc w:val="center"/>
+              <w:rPr>
+                <w:color w:val="000000"/>
+                <w:sz w:val="16"/>
+                <w:szCs w:val="16"/>
+              </w:rPr>
+            </w:pPr>
+            <w:r>
+              <w:rPr>
+                <w:color w:val="000000"/>
+                <w:sz w:val="16"/>
+                <w:szCs w:val="16"/>
+              </w:rPr>
+              <w:t>Train Light Off</w:t>
+            </w:r>
+          </w:p>
+        </w:tc>
+        <w:tc>
+          <w:tcPr>
+            <w:tcW w:w="1016" w:type="dxa"/>
+            <w:tcBorders>
+              <w:top w:val="single" w:sz="4" w:space="0" w:color="000000"/>
+              <w:left w:val="single" w:sz="4" w:space="0" w:color="000000"/>
+              <w:bottom w:val="single" w:sz="4" w:space="0" w:color="000000"/>
+            </w:tcBorders>
+            <w:vAlign w:val="bottom"/>
+          </w:tcPr>
+          <w:p>
+            <w:pPr>
+              <w:pStyle w:val="Normal"/>
+              <w:widowControl w:val="false"/>
+              <w:jc w:val="center"/>
+              <w:rPr>
+                <w:color w:val="000000"/>
+                <w:sz w:val="16"/>
+                <w:szCs w:val="16"/>
+              </w:rPr>
+            </w:pPr>
+            <w:r>
+              <w:rPr>
+                <w:color w:val="000000"/>
+                <w:sz w:val="16"/>
+                <w:szCs w:val="16"/>
+              </w:rPr>
+            </w:r>
+          </w:p>
+        </w:tc>
+        <w:tc>
+          <w:tcPr>
+            <w:tcW w:w="1016" w:type="dxa"/>
+            <w:tcBorders>
+              <w:top w:val="single" w:sz="4" w:space="0" w:color="000000"/>
+              <w:left w:val="single" w:sz="4" w:space="0" w:color="000000"/>
+              <w:bottom w:val="single" w:sz="4" w:space="0" w:color="000000"/>
+            </w:tcBorders>
+            <w:vAlign w:val="bottom"/>
+          </w:tcPr>
+          <w:p>
+            <w:pPr>
+              <w:pStyle w:val="Normal"/>
+              <w:widowControl w:val="false"/>
+              <w:spacing w:lineRule="auto" w:line="180"/>
+              <w:jc w:val="center"/>
+              <w:rPr>
+                <w:color w:val="000000"/>
+                <w:sz w:val="16"/>
+                <w:szCs w:val="16"/>
+              </w:rPr>
+            </w:pPr>
+            <w:r>
+              <w:rPr>
+                <w:color w:val="000000"/>
+                <w:sz w:val="16"/>
+                <w:szCs w:val="16"/>
+              </w:rPr>
+            </w:r>
+          </w:p>
+        </w:tc>
+        <w:tc>
+          <w:tcPr>
+            <w:tcW w:w="1017" w:type="dxa"/>
+            <w:tcBorders>
+              <w:top w:val="single" w:sz="4" w:space="0" w:color="000000"/>
+              <w:left w:val="single" w:sz="4" w:space="0" w:color="000000"/>
+              <w:bottom w:val="single" w:sz="4" w:space="0" w:color="000000"/>
+            </w:tcBorders>
+            <w:vAlign w:val="bottom"/>
+          </w:tcPr>
+          <w:p>
+            <w:pPr>
+              <w:pStyle w:val="Normal"/>
+              <w:widowControl w:val="false"/>
+              <w:jc w:val="center"/>
+              <w:rPr>
+                <w:rFonts w:ascii="arial" w:hAnsi="arial" w:eastAsia="arial"/>
+                <w:color w:val="000000"/>
+                <w:sz w:val="16"/>
+                <w:szCs w:val="16"/>
+              </w:rPr>
+            </w:pPr>
+            <w:r>
+              <w:rPr>
+                <w:rFonts w:eastAsia="arial" w:ascii="arial" w:hAnsi="arial"/>
+                <w:color w:val="000000"/>
+                <w:sz w:val="16"/>
+                <w:szCs w:val="16"/>
+              </w:rPr>
+            </w:r>
+          </w:p>
+        </w:tc>
+        <w:tc>
+          <w:tcPr>
+            <w:tcW w:w="1016" w:type="dxa"/>
+            <w:tcBorders>
+              <w:top w:val="single" w:sz="4" w:space="0" w:color="000000"/>
+              <w:left w:val="single" w:sz="4" w:space="0" w:color="000000"/>
+              <w:bottom w:val="single" w:sz="4" w:space="0" w:color="000000"/>
+            </w:tcBorders>
+            <w:vAlign w:val="bottom"/>
+          </w:tcPr>
+          <w:p>
+            <w:pPr>
+              <w:pStyle w:val="Normal"/>
+              <w:widowControl w:val="false"/>
+              <w:jc w:val="center"/>
+              <w:rPr>
+                <w:color w:val="000000"/>
+                <w:sz w:val="16"/>
+                <w:szCs w:val="16"/>
+              </w:rPr>
+            </w:pPr>
+            <w:r>
+              <w:rPr>
+                <w:color w:val="000000"/>
+                <w:sz w:val="16"/>
+                <w:szCs w:val="16"/>
+              </w:rPr>
+              <w:t>Dest. Down</w:t>
+            </w:r>
+          </w:p>
+        </w:tc>
+        <w:tc>
+          <w:tcPr>
+            <w:tcW w:w="1020" w:type="dxa"/>
+            <w:tcBorders>
+              <w:top w:val="single" w:sz="4" w:space="0" w:color="000000"/>
+              <w:left w:val="single" w:sz="4" w:space="0" w:color="000000"/>
+              <w:bottom w:val="single" w:sz="4" w:space="0" w:color="000000"/>
+            </w:tcBorders>
+            <w:vAlign w:val="bottom"/>
+          </w:tcPr>
+          <w:p>
+            <w:pPr>
+              <w:pStyle w:val="Normal"/>
+              <w:widowControl w:val="false"/>
+              <w:jc w:val="center"/>
+              <w:rPr>
+                <w:color w:val="000000"/>
+                <w:sz w:val="16"/>
+                <w:szCs w:val="16"/>
+              </w:rPr>
+            </w:pPr>
+            <w:r>
+              <w:rPr>
+                <w:color w:val="000000"/>
+                <w:sz w:val="16"/>
+                <w:szCs w:val="16"/>
+              </w:rPr>
+            </w:r>
+          </w:p>
+        </w:tc>
+        <w:tc>
+          <w:tcPr>
+            <w:tcW w:w="1016" w:type="dxa"/>
+            <w:tcBorders>
+              <w:top w:val="single" w:sz="4" w:space="0" w:color="000000"/>
+              <w:left w:val="single" w:sz="4" w:space="0" w:color="000000"/>
+              <w:bottom w:val="single" w:sz="4" w:space="0" w:color="000000"/>
+            </w:tcBorders>
+            <w:vAlign w:val="bottom"/>
+          </w:tcPr>
+          <w:p>
+            <w:pPr>
+              <w:pStyle w:val="Normal"/>
+              <w:widowControl w:val="false"/>
+              <w:spacing w:lineRule="auto" w:line="180"/>
+              <w:jc w:val="center"/>
+              <w:rPr>
+                <w:sz w:val="16"/>
+                <w:szCs w:val="16"/>
+              </w:rPr>
+            </w:pPr>
+            <w:r>
+              <w:rPr>
+                <w:sz w:val="16"/>
+                <w:szCs w:val="16"/>
+              </w:rPr>
+              <w:t>Panel Light</w:t>
+            </w:r>
+          </w:p>
+        </w:tc>
+        <w:tc>
+          <w:tcPr>
+            <w:tcW w:w="1016" w:type="dxa"/>
+            <w:tcBorders>
+              <w:top w:val="single" w:sz="4" w:space="0" w:color="000000"/>
+              <w:left w:val="single" w:sz="4" w:space="0" w:color="000000"/>
+              <w:bottom w:val="single" w:sz="4" w:space="0" w:color="000000"/>
+            </w:tcBorders>
+            <w:vAlign w:val="bottom"/>
+          </w:tcPr>
+          <w:p>
+            <w:pPr>
+              <w:pStyle w:val="Normal"/>
+              <w:widowControl w:val="false"/>
+              <w:spacing w:lineRule="auto" w:line="180"/>
+              <w:jc w:val="center"/>
+              <w:rPr>
+                <w:sz w:val="16"/>
+                <w:szCs w:val="16"/>
+              </w:rPr>
+            </w:pPr>
+            <w:r>
+              <w:rPr>
+                <w:sz w:val="16"/>
+                <w:szCs w:val="16"/>
+              </w:rPr>
+              <w:t>Handbrake Off</w:t>
+            </w:r>
+          </w:p>
+        </w:tc>
+        <w:tc>
+          <w:tcPr>
+            <w:tcW w:w="1016" w:type="dxa"/>
+            <w:tcBorders>
+              <w:top w:val="single" w:sz="4" w:space="0" w:color="000000"/>
+              <w:left w:val="single" w:sz="4" w:space="0" w:color="000000"/>
+              <w:bottom w:val="single" w:sz="4" w:space="0" w:color="000000"/>
+            </w:tcBorders>
+            <w:vAlign w:val="bottom"/>
+          </w:tcPr>
+          <w:p>
+            <w:pPr>
+              <w:pStyle w:val="Normal"/>
+              <w:widowControl w:val="false"/>
+              <w:spacing w:lineRule="auto" w:line="180"/>
+              <w:jc w:val="center"/>
+              <w:rPr>
+                <w:sz w:val="16"/>
+                <w:szCs w:val="16"/>
+              </w:rPr>
+            </w:pPr>
+            <w:r>
+              <w:rPr>
+                <w:rFonts w:eastAsia="arial" w:ascii="arial" w:hAnsi="arial"/>
+                <w:color w:val="000000"/>
+                <w:sz w:val="16"/>
+                <w:szCs w:val="16"/>
+              </w:rPr>
+              <w:t>Exterior</w:t>
+            </w:r>
+          </w:p>
+          <w:p>
+            <w:pPr>
+              <w:pStyle w:val="Normal"/>
+              <w:widowControl w:val="false"/>
+              <w:spacing w:lineRule="auto" w:line="180"/>
+              <w:jc w:val="center"/>
+              <w:rPr>
+                <w:sz w:val="16"/>
+                <w:szCs w:val="16"/>
+              </w:rPr>
+            </w:pPr>
+            <w:r>
+              <w:rPr>
+                <w:rFonts w:eastAsia="arial" w:ascii="arial" w:hAnsi="arial"/>
+                <w:color w:val="000000"/>
+                <w:sz w:val="16"/>
+                <w:szCs w:val="16"/>
+              </w:rPr>
+              <w:t>Camera</w:t>
+            </w:r>
+          </w:p>
+        </w:tc>
+        <w:tc>
+          <w:tcPr>
+            <w:tcW w:w="1029" w:type="dxa"/>
+            <w:tcBorders>
+              <w:top w:val="single" w:sz="4" w:space="0" w:color="000000"/>
+              <w:left w:val="single" w:sz="4" w:space="0" w:color="000000"/>
+              <w:bottom w:val="single" w:sz="4" w:space="0" w:color="000000"/>
+              <w:right w:val="single" w:sz="4" w:space="0" w:color="000000"/>
+            </w:tcBorders>
+            <w:vAlign w:val="bottom"/>
+          </w:tcPr>
+          <w:p>
+            <w:pPr>
+              <w:pStyle w:val="Normal"/>
+              <w:widowControl w:val="false"/>
+              <w:spacing w:lineRule="auto" w:line="180"/>
+              <w:jc w:val="center"/>
+              <w:rPr>
+                <w:sz w:val="16"/>
+                <w:szCs w:val="16"/>
+              </w:rPr>
+            </w:pPr>
+            <w:r>
+              <w:rPr>
+                <w:rFonts w:eastAsia="arial" w:ascii="arial" w:hAnsi="arial"/>
+                <w:color w:val="000000"/>
+                <w:sz w:val="16"/>
+                <w:szCs w:val="16"/>
+              </w:rPr>
+              <w:t>Prev</w:t>
+            </w:r>
+          </w:p>
+          <w:p>
+            <w:pPr>
+              <w:pStyle w:val="Normal"/>
+              <w:widowControl w:val="false"/>
+              <w:spacing w:lineRule="auto" w:line="180"/>
+              <w:jc w:val="center"/>
+              <w:rPr>
+                <w:sz w:val="16"/>
+                <w:szCs w:val="16"/>
+              </w:rPr>
+            </w:pPr>
+            <w:r>
+              <w:rPr>
+                <w:rFonts w:eastAsia="arial" w:ascii="arial" w:hAnsi="arial"/>
+                <w:color w:val="000000"/>
+                <w:sz w:val="16"/>
+                <w:szCs w:val="16"/>
+              </w:rPr>
+              <w:t>Cab Cam</w:t>
+            </w:r>
+          </w:p>
+        </w:tc>
+      </w:tr>
+    </w:tbl>
+    <w:p>
+      <w:pPr>
+        <w:pStyle w:val="Normal"/>
+        <w:rPr>
+          <w:color w:val="000000"/>
+          <w:sz w:val="16"/>
+          <w:szCs w:val="16"/>
+        </w:rPr>
+      </w:pPr>
+      <w:r>
+        <w:rPr>
+          <w:color w:val="000000"/>
+          <w:sz w:val="16"/>
+          <w:szCs w:val="16"/>
+        </w:rPr>
+      </w:r>
+    </w:p>
+    <w:p>
+      <w:pPr>
+        <w:pStyle w:val="Normal"/>
+        <w:rPr>
+          <w:color w:val="000000"/>
+          <w:sz w:val="16"/>
+          <w:szCs w:val="16"/>
+        </w:rPr>
+      </w:pPr>
+      <w:r>
+        <w:rPr>
+          <w:rFonts w:eastAsia="arial" w:ascii="arial" w:hAnsi="arial"/>
+          <w:color w:val="000000"/>
+          <w:sz w:val="16"/>
+          <w:szCs w:val="16"/>
+        </w:rPr>
+        <w:tab/>
+        <w:t xml:space="preserve">           Class 1</w:t>
       </w:r>
       <w:r>
         <w:rPr>
@@ -16150,7 +16691,597 @@
           <w:sz w:val="16"/>
           <w:szCs w:val="16"/>
         </w:rPr>
-        <w:t>101</w:t>
+        <w:t>42</w:t>
+      </w:r>
+      <w:r>
+        <w:rPr>
+          <w:rFonts w:eastAsia="arial" w:ascii="arial" w:hAnsi="arial"/>
+          <w:color w:val="000000"/>
+          <w:sz w:val="16"/>
+          <w:szCs w:val="16"/>
+        </w:rPr>
+        <w:t>-1</w:t>
+      </w:r>
+    </w:p>
+    <w:tbl>
+      <w:tblPr>
+        <w:tblW w:w="14248" w:type="dxa"/>
+        <w:jc w:val="left"/>
+        <w:tblInd w:w="-5" w:type="dxa"/>
+        <w:tblLayout w:type="fixed"/>
+        <w:tblCellMar>
+          <w:top w:w="0" w:type="dxa"/>
+          <w:left w:w="108" w:type="dxa"/>
+          <w:bottom w:w="0" w:type="dxa"/>
+          <w:right w:w="108" w:type="dxa"/>
+        </w:tblCellMar>
+        <w:tblLook w:firstRow="1" w:noVBand="1" w:lastRow="0" w:firstColumn="1" w:lastColumn="0" w:noHBand="0" w:val="04a0"/>
+      </w:tblPr>
+      <w:tblGrid>
+        <w:gridCol w:w="1017"/>
+        <w:gridCol w:w="1019"/>
+        <w:gridCol w:w="1014"/>
+        <w:gridCol w:w="1016"/>
+        <w:gridCol w:w="1020"/>
+        <w:gridCol w:w="1016"/>
+        <w:gridCol w:w="1016"/>
+        <w:gridCol w:w="1017"/>
+        <w:gridCol w:w="1016"/>
+        <w:gridCol w:w="1020"/>
+        <w:gridCol w:w="1016"/>
+        <w:gridCol w:w="1016"/>
+        <w:gridCol w:w="1016"/>
+        <w:gridCol w:w="1029"/>
+      </w:tblGrid>
+      <w:tr>
+        <w:trPr>
+          <w:trHeight w:val="440" w:hRule="exact"/>
+          <w:cantSplit w:val="true"/>
+        </w:trPr>
+        <w:tc>
+          <w:tcPr>
+            <w:tcW w:w="1017" w:type="dxa"/>
+            <w:tcBorders>
+              <w:top w:val="single" w:sz="4" w:space="0" w:color="000000"/>
+              <w:left w:val="single" w:sz="4" w:space="0" w:color="000000"/>
+              <w:bottom w:val="single" w:sz="4" w:space="0" w:color="000000"/>
+            </w:tcBorders>
+            <w:vAlign w:val="bottom"/>
+          </w:tcPr>
+          <w:p>
+            <w:pPr>
+              <w:pStyle w:val="Normal"/>
+              <w:widowControl w:val="false"/>
+              <w:spacing w:lineRule="auto" w:line="180" w:before="0" w:after="60"/>
+              <w:jc w:val="center"/>
+              <w:rPr>
+                <w:color w:val="000000"/>
+                <w:sz w:val="16"/>
+                <w:szCs w:val="16"/>
+              </w:rPr>
+            </w:pPr>
+            <w:r>
+              <w:rPr>
+                <w:rFonts w:eastAsia="arial" w:ascii="arial" w:hAnsi="arial"/>
+                <w:b/>
+                <w:color w:val="000000"/>
+                <w:sz w:val="16"/>
+                <w:szCs w:val="16"/>
+              </w:rPr>
+              <w:t>Pause</w:t>
+            </w:r>
+          </w:p>
+        </w:tc>
+        <w:tc>
+          <w:tcPr>
+            <w:tcW w:w="1019" w:type="dxa"/>
+            <w:tcBorders>
+              <w:top w:val="single" w:sz="4" w:space="0" w:color="000000"/>
+              <w:left w:val="single" w:sz="4" w:space="0" w:color="000000"/>
+              <w:bottom w:val="single" w:sz="4" w:space="0" w:color="000000"/>
+            </w:tcBorders>
+            <w:vAlign w:val="bottom"/>
+          </w:tcPr>
+          <w:p>
+            <w:pPr>
+              <w:pStyle w:val="Normal"/>
+              <w:widowControl w:val="false"/>
+              <w:spacing w:lineRule="auto" w:line="180"/>
+              <w:jc w:val="center"/>
+              <w:rPr>
+                <w:color w:val="000000"/>
+                <w:sz w:val="16"/>
+                <w:szCs w:val="16"/>
+              </w:rPr>
+            </w:pPr>
+            <w:r>
+              <w:rPr>
+                <w:color w:val="000000"/>
+                <w:sz w:val="16"/>
+                <w:szCs w:val="16"/>
+              </w:rPr>
+              <w:t>Master Key</w:t>
+            </w:r>
+          </w:p>
+        </w:tc>
+        <w:tc>
+          <w:tcPr>
+            <w:tcW w:w="1014" w:type="dxa"/>
+            <w:tcBorders>
+              <w:top w:val="single" w:sz="4" w:space="0" w:color="000000"/>
+              <w:left w:val="single" w:sz="4" w:space="0" w:color="000000"/>
+              <w:bottom w:val="single" w:sz="4" w:space="0" w:color="000000"/>
+            </w:tcBorders>
+            <w:vAlign w:val="bottom"/>
+          </w:tcPr>
+          <w:p>
+            <w:pPr>
+              <w:pStyle w:val="Normal"/>
+              <w:widowControl w:val="false"/>
+              <w:spacing w:lineRule="auto" w:line="180"/>
+              <w:jc w:val="center"/>
+              <w:rPr>
+                <w:color w:val="000000"/>
+                <w:sz w:val="16"/>
+                <w:szCs w:val="16"/>
+              </w:rPr>
+            </w:pPr>
+            <w:r>
+              <w:rPr>
+                <w:rFonts w:eastAsia="arial" w:ascii="arial" w:hAnsi="arial"/>
+                <w:color w:val="000000"/>
+                <w:sz w:val="16"/>
+                <w:szCs w:val="16"/>
+              </w:rPr>
+              <w:t>Engine Start</w:t>
+            </w:r>
+          </w:p>
+        </w:tc>
+        <w:tc>
+          <w:tcPr>
+            <w:tcW w:w="1016" w:type="dxa"/>
+            <w:tcBorders>
+              <w:top w:val="single" w:sz="4" w:space="0" w:color="000000"/>
+              <w:left w:val="single" w:sz="4" w:space="0" w:color="000000"/>
+              <w:bottom w:val="single" w:sz="4" w:space="0" w:color="000000"/>
+            </w:tcBorders>
+            <w:vAlign w:val="bottom"/>
+          </w:tcPr>
+          <w:p>
+            <w:pPr>
+              <w:pStyle w:val="Normal"/>
+              <w:widowControl w:val="false"/>
+              <w:spacing w:lineRule="auto" w:line="180"/>
+              <w:jc w:val="center"/>
+              <w:rPr>
+                <w:color w:val="000000"/>
+                <w:sz w:val="16"/>
+                <w:szCs w:val="16"/>
+              </w:rPr>
+            </w:pPr>
+            <w:r>
+              <w:rPr>
+                <w:color w:val="000000"/>
+                <w:sz w:val="16"/>
+                <w:szCs w:val="16"/>
+              </w:rPr>
+              <w:t>AWS</w:t>
+            </w:r>
+          </w:p>
+        </w:tc>
+        <w:tc>
+          <w:tcPr>
+            <w:tcW w:w="1020" w:type="dxa"/>
+            <w:tcBorders>
+              <w:top w:val="single" w:sz="4" w:space="0" w:color="000000"/>
+              <w:left w:val="single" w:sz="4" w:space="0" w:color="000000"/>
+              <w:bottom w:val="single" w:sz="4" w:space="0" w:color="000000"/>
+            </w:tcBorders>
+            <w:vAlign w:val="bottom"/>
+          </w:tcPr>
+          <w:p>
+            <w:pPr>
+              <w:pStyle w:val="Normal"/>
+              <w:widowControl w:val="false"/>
+              <w:spacing w:lineRule="auto" w:line="180"/>
+              <w:jc w:val="center"/>
+              <w:rPr>
+                <w:color w:val="000000"/>
+                <w:sz w:val="16"/>
+                <w:szCs w:val="16"/>
+              </w:rPr>
+            </w:pPr>
+            <w:r>
+              <w:rPr>
+                <w:color w:val="000000"/>
+                <w:sz w:val="16"/>
+                <w:szCs w:val="16"/>
+              </w:rPr>
+              <w:t>Saloon</w:t>
+            </w:r>
+            <w:r>
+              <w:rPr>
+                <w:color w:val="000000"/>
+                <w:sz w:val="16"/>
+                <w:szCs w:val="16"/>
+              </w:rPr>
+              <w:t xml:space="preserve"> Light On</w:t>
+            </w:r>
+          </w:p>
+        </w:tc>
+        <w:tc>
+          <w:tcPr>
+            <w:tcW w:w="1016" w:type="dxa"/>
+            <w:tcBorders>
+              <w:top w:val="single" w:sz="4" w:space="0" w:color="000000"/>
+              <w:left w:val="single" w:sz="4" w:space="0" w:color="000000"/>
+              <w:bottom w:val="single" w:sz="4" w:space="0" w:color="000000"/>
+            </w:tcBorders>
+            <w:vAlign w:val="bottom"/>
+          </w:tcPr>
+          <w:p>
+            <w:pPr>
+              <w:pStyle w:val="Normal"/>
+              <w:widowControl w:val="false"/>
+              <w:jc w:val="center"/>
+              <w:rPr>
+                <w:color w:val="000000"/>
+                <w:sz w:val="16"/>
+                <w:szCs w:val="16"/>
+              </w:rPr>
+            </w:pPr>
+            <w:r>
+              <w:rPr>
+                <w:color w:val="000000"/>
+                <w:sz w:val="16"/>
+                <w:szCs w:val="16"/>
+              </w:rPr>
+              <w:t>DRA</w:t>
+            </w:r>
+          </w:p>
+        </w:tc>
+        <w:tc>
+          <w:tcPr>
+            <w:tcW w:w="1016" w:type="dxa"/>
+            <w:tcBorders>
+              <w:top w:val="single" w:sz="4" w:space="0" w:color="000000"/>
+              <w:left w:val="single" w:sz="4" w:space="0" w:color="000000"/>
+              <w:bottom w:val="single" w:sz="4" w:space="0" w:color="000000"/>
+            </w:tcBorders>
+            <w:vAlign w:val="bottom"/>
+          </w:tcPr>
+          <w:p>
+            <w:pPr>
+              <w:pStyle w:val="Normal"/>
+              <w:widowControl w:val="false"/>
+              <w:spacing w:lineRule="auto" w:line="180"/>
+              <w:jc w:val="center"/>
+              <w:rPr>
+                <w:color w:val="000000"/>
+                <w:sz w:val="16"/>
+                <w:szCs w:val="16"/>
+              </w:rPr>
+            </w:pPr>
+            <w:r>
+              <w:rPr>
+                <w:color w:val="000000"/>
+                <w:sz w:val="16"/>
+                <w:szCs w:val="16"/>
+              </w:rPr>
+              <w:t>Public</w:t>
+            </w:r>
+          </w:p>
+          <w:p>
+            <w:pPr>
+              <w:pStyle w:val="Normal"/>
+              <w:widowControl w:val="false"/>
+              <w:spacing w:lineRule="auto" w:line="180"/>
+              <w:jc w:val="center"/>
+              <w:rPr>
+                <w:color w:val="000000"/>
+                <w:sz w:val="16"/>
+                <w:szCs w:val="16"/>
+              </w:rPr>
+            </w:pPr>
+            <w:r>
+              <w:rPr>
+                <w:color w:val="000000"/>
+                <w:sz w:val="16"/>
+                <w:szCs w:val="16"/>
+              </w:rPr>
+              <w:t>Announce</w:t>
+            </w:r>
+          </w:p>
+        </w:tc>
+        <w:tc>
+          <w:tcPr>
+            <w:tcW w:w="1017" w:type="dxa"/>
+            <w:tcBorders>
+              <w:top w:val="single" w:sz="4" w:space="0" w:color="000000"/>
+              <w:left w:val="single" w:sz="4" w:space="0" w:color="000000"/>
+              <w:bottom w:val="single" w:sz="4" w:space="0" w:color="000000"/>
+            </w:tcBorders>
+            <w:vAlign w:val="bottom"/>
+          </w:tcPr>
+          <w:p>
+            <w:pPr>
+              <w:pStyle w:val="Normal"/>
+              <w:widowControl w:val="false"/>
+              <w:jc w:val="center"/>
+              <w:rPr>
+                <w:color w:val="000000"/>
+                <w:sz w:val="16"/>
+                <w:szCs w:val="16"/>
+              </w:rPr>
+            </w:pPr>
+            <w:r>
+              <w:rPr>
+                <w:color w:val="000000"/>
+                <w:sz w:val="16"/>
+                <w:szCs w:val="16"/>
+              </w:rPr>
+            </w:r>
+          </w:p>
+        </w:tc>
+        <w:tc>
+          <w:tcPr>
+            <w:tcW w:w="1016" w:type="dxa"/>
+            <w:tcBorders>
+              <w:top w:val="single" w:sz="4" w:space="0" w:color="000000"/>
+              <w:left w:val="single" w:sz="4" w:space="0" w:color="000000"/>
+              <w:bottom w:val="single" w:sz="4" w:space="0" w:color="000000"/>
+            </w:tcBorders>
+            <w:vAlign w:val="bottom"/>
+          </w:tcPr>
+          <w:p>
+            <w:pPr>
+              <w:pStyle w:val="Normal"/>
+              <w:widowControl w:val="false"/>
+              <w:jc w:val="center"/>
+              <w:rPr>
+                <w:color w:val="000000"/>
+                <w:sz w:val="16"/>
+                <w:szCs w:val="16"/>
+              </w:rPr>
+            </w:pPr>
+            <w:r>
+              <w:rPr>
+                <w:color w:val="000000"/>
+                <w:sz w:val="16"/>
+                <w:szCs w:val="16"/>
+              </w:rPr>
+              <w:t>Dest. Up</w:t>
+            </w:r>
+          </w:p>
+        </w:tc>
+        <w:tc>
+          <w:tcPr>
+            <w:tcW w:w="1020" w:type="dxa"/>
+            <w:tcBorders>
+              <w:top w:val="single" w:sz="4" w:space="0" w:color="000000"/>
+              <w:left w:val="single" w:sz="4" w:space="0" w:color="000000"/>
+              <w:bottom w:val="single" w:sz="4" w:space="0" w:color="000000"/>
+            </w:tcBorders>
+            <w:vAlign w:val="bottom"/>
+          </w:tcPr>
+          <w:p>
+            <w:pPr>
+              <w:pStyle w:val="Normal"/>
+              <w:widowControl w:val="false"/>
+              <w:jc w:val="center"/>
+              <w:rPr>
+                <w:color w:val="000000"/>
+                <w:sz w:val="16"/>
+                <w:szCs w:val="16"/>
+              </w:rPr>
+            </w:pPr>
+            <w:r>
+              <w:rPr>
+                <w:color w:val="000000"/>
+                <w:sz w:val="16"/>
+                <w:szCs w:val="16"/>
+              </w:rPr>
+              <w:t>Destination Light</w:t>
+            </w:r>
+          </w:p>
+        </w:tc>
+        <w:tc>
+          <w:tcPr>
+            <w:tcW w:w="1016" w:type="dxa"/>
+            <w:tcBorders>
+              <w:top w:val="single" w:sz="4" w:space="0" w:color="000000"/>
+              <w:left w:val="single" w:sz="4" w:space="0" w:color="000000"/>
+              <w:bottom w:val="single" w:sz="4" w:space="0" w:color="000000"/>
+            </w:tcBorders>
+            <w:vAlign w:val="bottom"/>
+          </w:tcPr>
+          <w:p>
+            <w:pPr>
+              <w:pStyle w:val="Normal"/>
+              <w:widowControl w:val="false"/>
+              <w:spacing w:lineRule="auto" w:line="180"/>
+              <w:jc w:val="center"/>
+              <w:rPr>
+                <w:sz w:val="16"/>
+                <w:szCs w:val="16"/>
+              </w:rPr>
+            </w:pPr>
+            <w:r>
+              <w:rPr>
+                <w:rFonts w:eastAsia="arial" w:ascii="arial" w:hAnsi="arial"/>
+                <w:color w:val="000000"/>
+                <w:sz w:val="16"/>
+                <w:szCs w:val="16"/>
+              </w:rPr>
+              <w:t>Cab Light</w:t>
+            </w:r>
+          </w:p>
+        </w:tc>
+        <w:tc>
+          <w:tcPr>
+            <w:tcW w:w="1016" w:type="dxa"/>
+            <w:tcBorders>
+              <w:top w:val="single" w:sz="4" w:space="0" w:color="000000"/>
+              <w:left w:val="single" w:sz="4" w:space="0" w:color="000000"/>
+              <w:bottom w:val="single" w:sz="4" w:space="0" w:color="000000"/>
+            </w:tcBorders>
+            <w:vAlign w:val="bottom"/>
+          </w:tcPr>
+          <w:p>
+            <w:pPr>
+              <w:pStyle w:val="Normal"/>
+              <w:widowControl w:val="false"/>
+              <w:jc w:val="center"/>
+              <w:rPr>
+                <w:color w:val="000000"/>
+                <w:sz w:val="16"/>
+                <w:szCs w:val="16"/>
+              </w:rPr>
+            </w:pPr>
+            <w:r>
+              <w:rPr>
+                <w:color w:val="000000"/>
+                <w:sz w:val="16"/>
+                <w:szCs w:val="16"/>
+              </w:rPr>
+              <w:t>Couple</w:t>
+            </w:r>
+          </w:p>
+        </w:tc>
+        <w:tc>
+          <w:tcPr>
+            <w:tcW w:w="1016" w:type="dxa"/>
+            <w:tcBorders>
+              <w:top w:val="single" w:sz="4" w:space="0" w:color="000000"/>
+              <w:left w:val="single" w:sz="4" w:space="0" w:color="000000"/>
+              <w:bottom w:val="single" w:sz="4" w:space="0" w:color="000000"/>
+            </w:tcBorders>
+            <w:vAlign w:val="bottom"/>
+          </w:tcPr>
+          <w:p>
+            <w:pPr>
+              <w:pStyle w:val="Normal"/>
+              <w:widowControl w:val="false"/>
+              <w:spacing w:lineRule="auto" w:line="180"/>
+              <w:jc w:val="center"/>
+              <w:rPr>
+                <w:sz w:val="16"/>
+                <w:szCs w:val="16"/>
+              </w:rPr>
+            </w:pPr>
+            <w:r>
+              <w:rPr>
+                <w:rFonts w:eastAsia="arial" w:ascii="arial" w:hAnsi="arial"/>
+                <w:color w:val="000000"/>
+                <w:sz w:val="16"/>
+                <w:szCs w:val="16"/>
+              </w:rPr>
+              <w:t>1-Person</w:t>
+            </w:r>
+          </w:p>
+        </w:tc>
+        <w:tc>
+          <w:tcPr>
+            <w:tcW w:w="1029" w:type="dxa"/>
+            <w:tcBorders>
+              <w:top w:val="single" w:sz="4" w:space="0" w:color="000000"/>
+              <w:left w:val="single" w:sz="4" w:space="0" w:color="000000"/>
+              <w:bottom w:val="single" w:sz="4" w:space="0" w:color="000000"/>
+              <w:right w:val="single" w:sz="4" w:space="0" w:color="000000"/>
+            </w:tcBorders>
+            <w:vAlign w:val="bottom"/>
+          </w:tcPr>
+          <w:p>
+            <w:pPr>
+              <w:pStyle w:val="Normal"/>
+              <w:widowControl w:val="false"/>
+              <w:spacing w:lineRule="auto" w:line="180"/>
+              <w:jc w:val="center"/>
+              <w:rPr>
+                <w:sz w:val="16"/>
+                <w:szCs w:val="16"/>
+              </w:rPr>
+            </w:pPr>
+            <w:r>
+              <w:rPr>
+                <w:rFonts w:eastAsia="arial" w:ascii="arial" w:hAnsi="arial"/>
+                <w:color w:val="000000"/>
+                <w:sz w:val="16"/>
+                <w:szCs w:val="16"/>
+              </w:rPr>
+              <w:t>Next</w:t>
+            </w:r>
+          </w:p>
+          <w:p>
+            <w:pPr>
+              <w:pStyle w:val="Normal"/>
+              <w:widowControl w:val="false"/>
+              <w:spacing w:lineRule="auto" w:line="180"/>
+              <w:jc w:val="center"/>
+              <w:rPr>
+                <w:sz w:val="16"/>
+                <w:szCs w:val="16"/>
+              </w:rPr>
+            </w:pPr>
+            <w:r>
+              <w:rPr>
+                <w:rFonts w:eastAsia="arial" w:ascii="arial" w:hAnsi="arial"/>
+                <w:color w:val="000000"/>
+                <w:sz w:val="16"/>
+                <w:szCs w:val="16"/>
+              </w:rPr>
+              <w:t>Cab Cam</w:t>
+            </w:r>
+          </w:p>
+        </w:tc>
+      </w:tr>
+    </w:tbl>
+    <w:p>
+      <w:pPr>
+        <w:pStyle w:val="Normal"/>
+        <w:rPr>
+          <w:rFonts w:ascii="arial" w:hAnsi="arial" w:eastAsia="arial"/>
+          <w:color w:val="000000"/>
+          <w:sz w:val="16"/>
+          <w:szCs w:val="16"/>
+        </w:rPr>
+      </w:pPr>
+      <w:r>
+        <w:rPr>
+          <w:rFonts w:eastAsia="arial" w:ascii="arial" w:hAnsi="arial"/>
+          <w:color w:val="000000"/>
+          <w:sz w:val="16"/>
+          <w:szCs w:val="16"/>
+        </w:rPr>
+      </w:r>
+    </w:p>
+    <w:p>
+      <w:pPr>
+        <w:pStyle w:val="Normal"/>
+        <w:rPr>
+          <w:color w:val="000000"/>
+          <w:sz w:val="16"/>
+          <w:szCs w:val="16"/>
+        </w:rPr>
+      </w:pPr>
+      <w:r>
+        <w:rPr>
+          <w:rFonts w:eastAsia="arial" w:ascii="arial" w:hAnsi="arial"/>
+          <w:color w:val="000000"/>
+          <w:sz w:val="16"/>
+          <w:szCs w:val="16"/>
+        </w:rPr>
+        <w:tab/>
+        <w:t xml:space="preserve">           Class 1</w:t>
+      </w:r>
+      <w:r>
+        <w:rPr>
+          <w:rFonts w:eastAsia="arial" w:ascii="arial" w:hAnsi="arial"/>
+          <w:color w:val="000000"/>
+          <w:sz w:val="16"/>
+          <w:szCs w:val="16"/>
+        </w:rPr>
+        <w:t>42</w:t>
       </w:r>
       <w:r>
         <w:rPr>
@@ -16316,12 +17447,7 @@
               </w:rPr>
             </w:pPr>
             <w:r>
-              <w:rPr>
-                <w:color w:val="000000"/>
-                <w:sz w:val="16"/>
-                <w:szCs w:val="16"/>
-              </w:rPr>
-              <w:t>Engine RPM</w:t>
+              <w:rPr/>
             </w:r>
           </w:p>
         </w:tc>
@@ -16353,33 +17479,45 @@
                 <w:sz w:val="16"/>
                 <w:szCs w:val="16"/>
               </w:rPr>
-              <w:t>Train Light Off</w:t>
-            </w:r>
-          </w:p>
-        </w:tc>
-        <w:tc>
-          <w:tcPr>
-            <w:tcW w:w="1016" w:type="dxa"/>
-            <w:tcBorders>
-              <w:top w:val="single" w:sz="4" w:space="0" w:color="000000"/>
-              <w:left w:val="single" w:sz="4" w:space="0" w:color="000000"/>
-              <w:bottom w:val="single" w:sz="4" w:space="0" w:color="000000"/>
-            </w:tcBorders>
-            <w:vAlign w:val="bottom"/>
-          </w:tcPr>
-          <w:p>
-            <w:pPr>
-              <w:pStyle w:val="Normal"/>
-              <w:widowControl w:val="false"/>
-              <w:jc w:val="center"/>
-              <w:rPr>
-                <w:color w:val="000000"/>
-                <w:sz w:val="16"/>
-                <w:szCs w:val="16"/>
-              </w:rPr>
-            </w:pPr>
-            <w:r>
-              <w:rPr/>
+              <w:t>Saloon</w:t>
+            </w:r>
+            <w:r>
+              <w:rPr>
+                <w:color w:val="000000"/>
+                <w:sz w:val="16"/>
+                <w:szCs w:val="16"/>
+              </w:rPr>
+              <w:t xml:space="preserve"> Light Off</w:t>
+            </w:r>
+          </w:p>
+        </w:tc>
+        <w:tc>
+          <w:tcPr>
+            <w:tcW w:w="1016" w:type="dxa"/>
+            <w:tcBorders>
+              <w:top w:val="single" w:sz="4" w:space="0" w:color="000000"/>
+              <w:left w:val="single" w:sz="4" w:space="0" w:color="000000"/>
+              <w:bottom w:val="single" w:sz="4" w:space="0" w:color="000000"/>
+            </w:tcBorders>
+            <w:vAlign w:val="bottom"/>
+          </w:tcPr>
+          <w:p>
+            <w:pPr>
+              <w:pStyle w:val="Normal"/>
+              <w:widowControl w:val="false"/>
+              <w:jc w:val="center"/>
+              <w:rPr>
+                <w:color w:val="000000"/>
+                <w:sz w:val="16"/>
+                <w:szCs w:val="16"/>
+              </w:rPr>
+            </w:pPr>
+            <w:r>
+              <w:rPr>
+                <w:color w:val="000000"/>
+                <w:sz w:val="16"/>
+                <w:szCs w:val="16"/>
+              </w:rPr>
             </w:r>
           </w:p>
         </w:tc>
@@ -16499,67 +17637,78 @@
               </w:rPr>
             </w:pPr>
             <w:r>
-              <w:rPr/>
-            </w:r>
-          </w:p>
-        </w:tc>
-        <w:tc>
-          <w:tcPr>
-            <w:tcW w:w="1016" w:type="dxa"/>
-            <w:tcBorders>
-              <w:top w:val="single" w:sz="4" w:space="0" w:color="000000"/>
-              <w:left w:val="single" w:sz="4" w:space="0" w:color="000000"/>
-              <w:bottom w:val="single" w:sz="4" w:space="0" w:color="000000"/>
-            </w:tcBorders>
-            <w:vAlign w:val="bottom"/>
-          </w:tcPr>
-          <w:p>
-            <w:pPr>
-              <w:pStyle w:val="Normal"/>
-              <w:widowControl w:val="false"/>
-              <w:spacing w:lineRule="auto" w:line="180"/>
-              <w:jc w:val="center"/>
-              <w:rPr>
-                <w:sz w:val="16"/>
-                <w:szCs w:val="16"/>
-              </w:rPr>
-            </w:pPr>
-            <w:r>
-              <w:rPr>
-                <w:sz w:val="16"/>
-                <w:szCs w:val="16"/>
-              </w:rPr>
-              <w:t>Panel Light</w:t>
-            </w:r>
-          </w:p>
-        </w:tc>
-        <w:tc>
-          <w:tcPr>
-            <w:tcW w:w="1016" w:type="dxa"/>
-            <w:tcBorders>
-              <w:top w:val="single" w:sz="4" w:space="0" w:color="000000"/>
-              <w:left w:val="single" w:sz="4" w:space="0" w:color="000000"/>
-              <w:bottom w:val="single" w:sz="4" w:space="0" w:color="000000"/>
-            </w:tcBorders>
-            <w:vAlign w:val="bottom"/>
-          </w:tcPr>
-          <w:p>
-            <w:pPr>
-              <w:pStyle w:val="Normal"/>
-              <w:widowControl w:val="false"/>
-              <w:spacing w:lineRule="auto" w:line="180"/>
-              <w:jc w:val="center"/>
-              <w:rPr>
-                <w:sz w:val="16"/>
-                <w:szCs w:val="16"/>
-              </w:rPr>
-            </w:pPr>
-            <w:r>
-              <w:rPr>
-                <w:sz w:val="16"/>
-                <w:szCs w:val="16"/>
-              </w:rPr>
-              <w:t>Handbrake Off</w:t>
+              <w:rPr>
+                <w:color w:val="000000"/>
+                <w:sz w:val="16"/>
+                <w:szCs w:val="16"/>
+              </w:rPr>
+            </w:r>
+          </w:p>
+        </w:tc>
+        <w:tc>
+          <w:tcPr>
+            <w:tcW w:w="1016" w:type="dxa"/>
+            <w:tcBorders>
+              <w:top w:val="single" w:sz="4" w:space="0" w:color="000000"/>
+              <w:left w:val="single" w:sz="4" w:space="0" w:color="000000"/>
+              <w:bottom w:val="single" w:sz="4" w:space="0" w:color="000000"/>
+            </w:tcBorders>
+            <w:vAlign w:val="bottom"/>
+          </w:tcPr>
+          <w:p>
+            <w:pPr>
+              <w:pStyle w:val="Normal"/>
+              <w:widowControl w:val="false"/>
+              <w:spacing w:lineRule="auto" w:line="180"/>
+              <w:jc w:val="center"/>
+              <w:rPr>
+                <w:sz w:val="16"/>
+                <w:szCs w:val="16"/>
+              </w:rPr>
+            </w:pPr>
+            <w:r>
+              <w:rPr>
+                <w:sz w:val="16"/>
+                <w:szCs w:val="16"/>
+              </w:rPr>
+              <w:t>Instrument</w:t>
+            </w:r>
+            <w:r>
+              <w:rPr>
+                <w:sz w:val="16"/>
+                <w:szCs w:val="16"/>
+              </w:rPr>
+              <w:t xml:space="preserve"> Light</w:t>
+            </w:r>
+          </w:p>
+        </w:tc>
+        <w:tc>
+          <w:tcPr>
+            <w:tcW w:w="1016" w:type="dxa"/>
+            <w:tcBorders>
+              <w:top w:val="single" w:sz="4" w:space="0" w:color="000000"/>
+              <w:left w:val="single" w:sz="4" w:space="0" w:color="000000"/>
+              <w:bottom w:val="single" w:sz="4" w:space="0" w:color="000000"/>
+            </w:tcBorders>
+            <w:vAlign w:val="bottom"/>
+          </w:tcPr>
+          <w:p>
+            <w:pPr>
+              <w:pStyle w:val="Normal"/>
+              <w:widowControl w:val="false"/>
+              <w:spacing w:lineRule="auto" w:line="180"/>
+              <w:jc w:val="center"/>
+              <w:rPr>
+                <w:sz w:val="16"/>
+                <w:szCs w:val="16"/>
+              </w:rPr>
+            </w:pPr>
+            <w:r>
+              <w:rPr>
+                <w:sz w:val="16"/>
+                <w:szCs w:val="16"/>
+              </w:rPr>
+              <w:t>Uncouple</w:t>
             </w:r>
           </w:p>
         </w:tc>
@@ -17710,12 +18859,12 @@
       <w:rFonts w:ascii="Symbol" w:hAnsi="Symbol" w:cs="Symbol"/>
     </w:rPr>
   </w:style>
-  <w:style w:type="character" w:styleId="user" w:customStyle="1">
-    <w:name w:val="번호 매기기 기호 (user)"/>
+  <w:style w:type="character" w:styleId="Style5" w:customStyle="1">
+    <w:name w:val="번호 매기기 기호"/>
     <w:qFormat/>
     <w:rPr/>
   </w:style>
-  <w:style w:type="paragraph" w:styleId="Style5">
+  <w:style w:type="paragraph" w:styleId="Style6">
     <w:name w:val="제목"/>
     <w:basedOn w:val="Normal"/>
     <w:next w:val="BodyText"/>
@@ -17725,7 +18874,7 @@
       <w:spacing w:before="240" w:after="120"/>
     </w:pPr>
     <w:rPr>
-      <w:rFonts w:ascii="Liberation Sans" w:hAnsi="Liberation Sans" w:eastAsia="Noto Sans CJK KR" w:cs="Lohit Devanagari"/>
+      <w:rFonts w:ascii="Liberation Sans" w:hAnsi="Liberation Sans" w:eastAsia="나눔고딕" w:cs="Arial"/>
       <w:sz w:val="28"/>
       <w:szCs w:val="28"/>
     </w:rPr>
@@ -17762,7 +18911,7 @@
       <w:szCs w:val="24"/>
     </w:rPr>
   </w:style>
-  <w:style w:type="paragraph" w:styleId="Style6" w:customStyle="1">
+  <w:style w:type="paragraph" w:styleId="Style7">
     <w:name w:val="색인"/>
     <w:basedOn w:val="Normal"/>
     <w:qFormat/>
@@ -17770,10 +18919,11 @@
       <w:suppressLineNumbers/>
     </w:pPr>
     <w:rPr>
-      <w:rFonts w:cs="Lohit Devanagari"/>
+      <w:rFonts w:cs="Arial"/>
+      <w:sz w:val="24"/>
     </w:rPr>
   </w:style>
-  <w:style w:type="paragraph" w:styleId="user1">
+  <w:style w:type="paragraph" w:styleId="user">
     <w:name w:val="제목 (user)"/>
     <w:basedOn w:val="Normal"/>
     <w:next w:val="BodyText"/>
@@ -17783,12 +18933,12 @@
       <w:spacing w:before="240" w:after="120"/>
     </w:pPr>
     <w:rPr>
-      <w:rFonts w:ascii="Liberation Sans" w:hAnsi="Liberation Sans" w:eastAsia="나눔고딕" w:cs="Arial"/>
+      <w:rFonts w:ascii="Liberation Sans" w:hAnsi="Liberation Sans" w:eastAsia="Noto Sans CJK KR" w:cs="Lohit Devanagari"/>
       <w:sz w:val="28"/>
       <w:szCs w:val="28"/>
     </w:rPr>
   </w:style>
-  <w:style w:type="paragraph" w:styleId="user2">
+  <w:style w:type="paragraph" w:styleId="user1" w:customStyle="1">
     <w:name w:val="색인 (user)"/>
     <w:basedOn w:val="Normal"/>
     <w:qFormat/>
@@ -17796,8 +18946,7 @@
       <w:suppressLineNumbers/>
     </w:pPr>
     <w:rPr>
-      <w:rFonts w:cs="Arial"/>
-      <w:sz w:val="24"/>
+      <w:rFonts w:cs="Lohit Devanagari"/>
     </w:rPr>
   </w:style>
   <w:style w:type="paragraph" w:styleId="Title">
@@ -18479,8 +19628,8 @@
       <w:szCs w:val="24"/>
     </w:rPr>
   </w:style>
-  <w:style w:type="paragraph" w:styleId="Style7" w:customStyle="1">
-    <w:name w:val="표 내용"/>
+  <w:style w:type="paragraph" w:styleId="user2" w:customStyle="1">
+    <w:name w:val="표 내용 (user)"/>
     <w:basedOn w:val="Normal"/>
     <w:qFormat/>
     <w:pPr>
@@ -18488,9 +19637,9 @@
     </w:pPr>
     <w:rPr/>
   </w:style>
-  <w:style w:type="paragraph" w:styleId="Style8" w:customStyle="1">
-    <w:name w:val="표제목"/>
-    <w:basedOn w:val="Style7"/>
+  <w:style w:type="paragraph" w:styleId="user3" w:customStyle="1">
+    <w:name w:val="표제목 (user)"/>
+    <w:basedOn w:val="user2"/>
     <w:qFormat/>
     <w:pPr>
       <w:jc w:val="center"/>
@@ -18500,8 +19649,8 @@
       <w:bCs/>
     </w:rPr>
   </w:style>
-  <w:style w:type="paragraph" w:styleId="user3">
-    <w:name w:val="표 내용 (user)"/>
+  <w:style w:type="paragraph" w:styleId="Style8">
+    <w:name w:val="표 내용"/>
     <w:basedOn w:val="Normal"/>
     <w:qFormat/>
     <w:pPr>
@@ -18510,9 +19659,9 @@
     </w:pPr>
     <w:rPr/>
   </w:style>
-  <w:style w:type="paragraph" w:styleId="user4">
-    <w:name w:val="표제목 (user)"/>
-    <w:basedOn w:val="user3"/>
+  <w:style w:type="paragraph" w:styleId="Style9">
+    <w:name w:val="표제목"/>
+    <w:basedOn w:val="Style8"/>
     <w:qFormat/>
     <w:pPr>
       <w:suppressLineNumbers/>

</xml_diff>

<commit_message>
Add Class 153 and 158
</commit_message>
<xml_diff>
--- a/raildriver-UK-Remapped.docx
+++ b/raildriver-UK-Remapped.docx
@@ -17800,25 +17800,7 @@
           <w:szCs w:val="16"/>
         </w:rPr>
         <w:tab/>
-        <w:t xml:space="preserve">           Class 1</w:t>
-      </w:r>
-      <w:r>
-        <w:rPr>
-          <w:rFonts w:eastAsia="arial" w:ascii="arial" w:hAnsi="arial"/>
-          <w:color w:val="000000"/>
-          <w:sz w:val="16"/>
-          <w:szCs w:val="16"/>
-        </w:rPr>
-        <w:t>50</w:t>
-      </w:r>
-      <w:r>
-        <w:rPr>
-          <w:rFonts w:eastAsia="arial" w:ascii="arial" w:hAnsi="arial"/>
-          <w:color w:val="000000"/>
-          <w:sz w:val="16"/>
-          <w:szCs w:val="16"/>
-        </w:rPr>
-        <w:t>-1</w:t>
+        <w:t xml:space="preserve">           Class 150-1</w:t>
       </w:r>
     </w:p>
     <w:tbl>
@@ -17983,15 +17965,7 @@
                 <w:sz w:val="16"/>
                 <w:szCs w:val="16"/>
               </w:rPr>
-              <w:t>AWS/</w:t>
-            </w:r>
-            <w:r>
-              <w:rPr>
-                <w:color w:val="000000"/>
-                <w:sz w:val="16"/>
-                <w:szCs w:val="16"/>
-              </w:rPr>
-              <w:t>TPWS</w:t>
+              <w:t>AWS/TPWS</w:t>
             </w:r>
           </w:p>
         </w:tc>
@@ -18023,15 +17997,7 @@
                 <w:sz w:val="16"/>
                 <w:szCs w:val="16"/>
               </w:rPr>
-              <w:t>Train</w:t>
-            </w:r>
-            <w:r>
-              <w:rPr>
-                <w:color w:val="000000"/>
-                <w:sz w:val="16"/>
-                <w:szCs w:val="16"/>
-              </w:rPr>
-              <w:t xml:space="preserve"> Light On</w:t>
+              <w:t>Train Light On</w:t>
             </w:r>
           </w:p>
         </w:tc>
@@ -18089,7 +18055,11 @@
               </w:rPr>
             </w:pPr>
             <w:r>
-              <w:rPr/>
+              <w:rPr>
+                <w:color w:val="000000"/>
+                <w:sz w:val="16"/>
+                <w:szCs w:val="16"/>
+              </w:rPr>
             </w:r>
           </w:p>
         </w:tc>
@@ -18373,7 +18343,582 @@
           <w:szCs w:val="16"/>
         </w:rPr>
         <w:tab/>
-        <w:t xml:space="preserve">           Class 1</w:t>
+        <w:t xml:space="preserve">           Class 150-2</w:t>
+      </w:r>
+    </w:p>
+    <w:tbl>
+      <w:tblPr>
+        <w:tblW w:w="14248" w:type="dxa"/>
+        <w:jc w:val="left"/>
+        <w:tblInd w:w="-5" w:type="dxa"/>
+        <w:tblLayout w:type="fixed"/>
+        <w:tblCellMar>
+          <w:top w:w="0" w:type="dxa"/>
+          <w:left w:w="108" w:type="dxa"/>
+          <w:bottom w:w="0" w:type="dxa"/>
+          <w:right w:w="108" w:type="dxa"/>
+        </w:tblCellMar>
+        <w:tblLook w:firstRow="1" w:noVBand="1" w:lastRow="0" w:firstColumn="1" w:lastColumn="0" w:noHBand="0" w:val="04a0"/>
+      </w:tblPr>
+      <w:tblGrid>
+        <w:gridCol w:w="1017"/>
+        <w:gridCol w:w="1019"/>
+        <w:gridCol w:w="1014"/>
+        <w:gridCol w:w="1016"/>
+        <w:gridCol w:w="1020"/>
+        <w:gridCol w:w="1016"/>
+        <w:gridCol w:w="1016"/>
+        <w:gridCol w:w="1017"/>
+        <w:gridCol w:w="1016"/>
+        <w:gridCol w:w="1020"/>
+        <w:gridCol w:w="1016"/>
+        <w:gridCol w:w="1016"/>
+        <w:gridCol w:w="1016"/>
+        <w:gridCol w:w="1029"/>
+      </w:tblGrid>
+      <w:tr>
+        <w:trPr>
+          <w:trHeight w:val="440" w:hRule="exact"/>
+          <w:cantSplit w:val="true"/>
+        </w:trPr>
+        <w:tc>
+          <w:tcPr>
+            <w:tcW w:w="1017" w:type="dxa"/>
+            <w:tcBorders>
+              <w:top w:val="single" w:sz="4" w:space="0" w:color="000000"/>
+              <w:left w:val="single" w:sz="4" w:space="0" w:color="000000"/>
+              <w:bottom w:val="single" w:sz="4" w:space="0" w:color="000000"/>
+            </w:tcBorders>
+            <w:vAlign w:val="bottom"/>
+          </w:tcPr>
+          <w:p>
+            <w:pPr>
+              <w:pStyle w:val="Normal"/>
+              <w:widowControl w:val="false"/>
+              <w:spacing w:lineRule="auto" w:line="180" w:before="0" w:after="60"/>
+              <w:jc w:val="center"/>
+              <w:rPr>
+                <w:b/>
+                <w:bCs/>
+              </w:rPr>
+            </w:pPr>
+            <w:r>
+              <w:rPr>
+                <w:b/>
+                <w:bCs/>
+                <w:color w:val="000000"/>
+                <w:sz w:val="16"/>
+                <w:szCs w:val="16"/>
+              </w:rPr>
+              <w:t>HUD</w:t>
+            </w:r>
+          </w:p>
+        </w:tc>
+        <w:tc>
+          <w:tcPr>
+            <w:tcW w:w="1019" w:type="dxa"/>
+            <w:tcBorders>
+              <w:top w:val="single" w:sz="4" w:space="0" w:color="000000"/>
+              <w:left w:val="single" w:sz="4" w:space="0" w:color="000000"/>
+              <w:bottom w:val="single" w:sz="4" w:space="0" w:color="000000"/>
+            </w:tcBorders>
+            <w:vAlign w:val="bottom"/>
+          </w:tcPr>
+          <w:p>
+            <w:pPr>
+              <w:pStyle w:val="Normal"/>
+              <w:widowControl w:val="false"/>
+              <w:spacing w:lineRule="auto" w:line="180"/>
+              <w:jc w:val="center"/>
+              <w:rPr>
+                <w:color w:val="000000"/>
+                <w:sz w:val="16"/>
+                <w:szCs w:val="16"/>
+              </w:rPr>
+            </w:pPr>
+            <w:r>
+              <w:rPr>
+                <w:color w:val="000000"/>
+                <w:sz w:val="16"/>
+                <w:szCs w:val="16"/>
+              </w:rPr>
+              <w:t>Schedule</w:t>
+            </w:r>
+          </w:p>
+        </w:tc>
+        <w:tc>
+          <w:tcPr>
+            <w:tcW w:w="1014" w:type="dxa"/>
+            <w:tcBorders>
+              <w:top w:val="single" w:sz="4" w:space="0" w:color="000000"/>
+              <w:left w:val="single" w:sz="4" w:space="0" w:color="000000"/>
+              <w:bottom w:val="single" w:sz="4" w:space="0" w:color="000000"/>
+            </w:tcBorders>
+            <w:vAlign w:val="bottom"/>
+          </w:tcPr>
+          <w:p>
+            <w:pPr>
+              <w:pStyle w:val="Normal"/>
+              <w:widowControl w:val="false"/>
+              <w:spacing w:lineRule="auto" w:line="180"/>
+              <w:jc w:val="center"/>
+              <w:rPr>
+                <w:sz w:val="16"/>
+                <w:szCs w:val="16"/>
+              </w:rPr>
+            </w:pPr>
+            <w:r>
+              <w:rPr>
+                <w:rFonts w:eastAsia="arial" w:ascii="arial" w:hAnsi="arial"/>
+                <w:sz w:val="16"/>
+                <w:szCs w:val="16"/>
+              </w:rPr>
+              <w:t>Engine Stop</w:t>
+            </w:r>
+          </w:p>
+        </w:tc>
+        <w:tc>
+          <w:tcPr>
+            <w:tcW w:w="1016" w:type="dxa"/>
+            <w:tcBorders>
+              <w:top w:val="single" w:sz="4" w:space="0" w:color="000000"/>
+              <w:left w:val="single" w:sz="4" w:space="0" w:color="000000"/>
+              <w:bottom w:val="single" w:sz="4" w:space="0" w:color="000000"/>
+            </w:tcBorders>
+            <w:vAlign w:val="bottom"/>
+          </w:tcPr>
+          <w:p>
+            <w:pPr>
+              <w:pStyle w:val="Normal"/>
+              <w:widowControl w:val="false"/>
+              <w:spacing w:lineRule="auto" w:line="180"/>
+              <w:jc w:val="center"/>
+              <w:rPr>
+                <w:color w:val="000000"/>
+                <w:sz w:val="16"/>
+                <w:szCs w:val="16"/>
+              </w:rPr>
+            </w:pPr>
+            <w:r>
+              <w:rPr>
+                <w:color w:val="000000"/>
+                <w:sz w:val="16"/>
+                <w:szCs w:val="16"/>
+              </w:rPr>
+              <w:t>DSD</w:t>
+            </w:r>
+          </w:p>
+        </w:tc>
+        <w:tc>
+          <w:tcPr>
+            <w:tcW w:w="1020" w:type="dxa"/>
+            <w:tcBorders>
+              <w:top w:val="single" w:sz="4" w:space="0" w:color="000000"/>
+              <w:left w:val="single" w:sz="4" w:space="0" w:color="000000"/>
+              <w:bottom w:val="single" w:sz="4" w:space="0" w:color="000000"/>
+            </w:tcBorders>
+            <w:vAlign w:val="bottom"/>
+          </w:tcPr>
+          <w:p>
+            <w:pPr>
+              <w:pStyle w:val="Normal"/>
+              <w:widowControl w:val="false"/>
+              <w:spacing w:lineRule="auto" w:line="180"/>
+              <w:jc w:val="center"/>
+              <w:rPr>
+                <w:color w:val="000000"/>
+                <w:sz w:val="16"/>
+                <w:szCs w:val="16"/>
+              </w:rPr>
+            </w:pPr>
+            <w:r>
+              <w:rPr>
+                <w:color w:val="000000"/>
+                <w:sz w:val="16"/>
+                <w:szCs w:val="16"/>
+              </w:rPr>
+              <w:t>Train Light Off</w:t>
+            </w:r>
+          </w:p>
+        </w:tc>
+        <w:tc>
+          <w:tcPr>
+            <w:tcW w:w="1016" w:type="dxa"/>
+            <w:tcBorders>
+              <w:top w:val="single" w:sz="4" w:space="0" w:color="000000"/>
+              <w:left w:val="single" w:sz="4" w:space="0" w:color="000000"/>
+              <w:bottom w:val="single" w:sz="4" w:space="0" w:color="000000"/>
+            </w:tcBorders>
+            <w:vAlign w:val="bottom"/>
+          </w:tcPr>
+          <w:p>
+            <w:pPr>
+              <w:pStyle w:val="Normal"/>
+              <w:widowControl w:val="false"/>
+              <w:jc w:val="center"/>
+              <w:rPr>
+                <w:color w:val="000000"/>
+                <w:sz w:val="16"/>
+                <w:szCs w:val="16"/>
+              </w:rPr>
+            </w:pPr>
+            <w:r>
+              <w:rPr>
+                <w:color w:val="000000"/>
+                <w:sz w:val="16"/>
+                <w:szCs w:val="16"/>
+              </w:rPr>
+            </w:r>
+          </w:p>
+        </w:tc>
+        <w:tc>
+          <w:tcPr>
+            <w:tcW w:w="1016" w:type="dxa"/>
+            <w:tcBorders>
+              <w:top w:val="single" w:sz="4" w:space="0" w:color="000000"/>
+              <w:left w:val="single" w:sz="4" w:space="0" w:color="000000"/>
+              <w:bottom w:val="single" w:sz="4" w:space="0" w:color="000000"/>
+            </w:tcBorders>
+            <w:vAlign w:val="bottom"/>
+          </w:tcPr>
+          <w:p>
+            <w:pPr>
+              <w:pStyle w:val="Normal"/>
+              <w:widowControl w:val="false"/>
+              <w:spacing w:lineRule="auto" w:line="180"/>
+              <w:jc w:val="center"/>
+              <w:rPr>
+                <w:color w:val="000000"/>
+                <w:sz w:val="16"/>
+                <w:szCs w:val="16"/>
+              </w:rPr>
+            </w:pPr>
+            <w:r>
+              <w:rPr>
+                <w:color w:val="000000"/>
+                <w:sz w:val="16"/>
+                <w:szCs w:val="16"/>
+              </w:rPr>
+            </w:r>
+          </w:p>
+        </w:tc>
+        <w:tc>
+          <w:tcPr>
+            <w:tcW w:w="1017" w:type="dxa"/>
+            <w:tcBorders>
+              <w:top w:val="single" w:sz="4" w:space="0" w:color="000000"/>
+              <w:left w:val="single" w:sz="4" w:space="0" w:color="000000"/>
+              <w:bottom w:val="single" w:sz="4" w:space="0" w:color="000000"/>
+            </w:tcBorders>
+            <w:vAlign w:val="bottom"/>
+          </w:tcPr>
+          <w:p>
+            <w:pPr>
+              <w:pStyle w:val="Normal"/>
+              <w:widowControl w:val="false"/>
+              <w:jc w:val="center"/>
+              <w:rPr>
+                <w:rFonts w:ascii="arial" w:hAnsi="arial" w:eastAsia="arial"/>
+                <w:color w:val="000000"/>
+                <w:sz w:val="16"/>
+                <w:szCs w:val="16"/>
+              </w:rPr>
+            </w:pPr>
+            <w:r>
+              <w:rPr>
+                <w:rFonts w:eastAsia="arial" w:ascii="arial" w:hAnsi="arial"/>
+                <w:color w:val="000000"/>
+                <w:sz w:val="16"/>
+                <w:szCs w:val="16"/>
+              </w:rPr>
+            </w:r>
+          </w:p>
+        </w:tc>
+        <w:tc>
+          <w:tcPr>
+            <w:tcW w:w="1016" w:type="dxa"/>
+            <w:tcBorders>
+              <w:top w:val="single" w:sz="4" w:space="0" w:color="000000"/>
+              <w:left w:val="single" w:sz="4" w:space="0" w:color="000000"/>
+              <w:bottom w:val="single" w:sz="4" w:space="0" w:color="000000"/>
+            </w:tcBorders>
+            <w:vAlign w:val="bottom"/>
+          </w:tcPr>
+          <w:p>
+            <w:pPr>
+              <w:pStyle w:val="Normal"/>
+              <w:widowControl w:val="false"/>
+              <w:jc w:val="center"/>
+              <w:rPr>
+                <w:color w:val="000000"/>
+                <w:sz w:val="16"/>
+                <w:szCs w:val="16"/>
+              </w:rPr>
+            </w:pPr>
+            <w:r>
+              <w:rPr>
+                <w:color w:val="000000"/>
+                <w:sz w:val="16"/>
+                <w:szCs w:val="16"/>
+              </w:rPr>
+              <w:t>Dest. Down</w:t>
+            </w:r>
+          </w:p>
+        </w:tc>
+        <w:tc>
+          <w:tcPr>
+            <w:tcW w:w="1020" w:type="dxa"/>
+            <w:tcBorders>
+              <w:top w:val="single" w:sz="4" w:space="0" w:color="000000"/>
+              <w:left w:val="single" w:sz="4" w:space="0" w:color="000000"/>
+              <w:bottom w:val="single" w:sz="4" w:space="0" w:color="000000"/>
+            </w:tcBorders>
+            <w:vAlign w:val="bottom"/>
+          </w:tcPr>
+          <w:p>
+            <w:pPr>
+              <w:pStyle w:val="Normal"/>
+              <w:widowControl w:val="false"/>
+              <w:jc w:val="center"/>
+              <w:rPr>
+                <w:color w:val="000000"/>
+                <w:sz w:val="16"/>
+                <w:szCs w:val="16"/>
+              </w:rPr>
+            </w:pPr>
+            <w:r>
+              <w:rPr>
+                <w:color w:val="000000"/>
+                <w:sz w:val="16"/>
+                <w:szCs w:val="16"/>
+              </w:rPr>
+            </w:r>
+          </w:p>
+          <w:p>
+            <w:pPr>
+              <w:pStyle w:val="Normal"/>
+              <w:widowControl w:val="false"/>
+              <w:jc w:val="center"/>
+              <w:rPr>
+                <w:color w:val="000000"/>
+                <w:sz w:val="16"/>
+                <w:szCs w:val="16"/>
+              </w:rPr>
+            </w:pPr>
+            <w:r>
+              <w:rPr>
+                <w:color w:val="000000"/>
+                <w:sz w:val="16"/>
+                <w:szCs w:val="16"/>
+              </w:rPr>
+              <w:t>Tail Light</w:t>
+            </w:r>
+          </w:p>
+        </w:tc>
+        <w:tc>
+          <w:tcPr>
+            <w:tcW w:w="1016" w:type="dxa"/>
+            <w:tcBorders>
+              <w:top w:val="single" w:sz="4" w:space="0" w:color="000000"/>
+              <w:left w:val="single" w:sz="4" w:space="0" w:color="000000"/>
+              <w:bottom w:val="single" w:sz="4" w:space="0" w:color="000000"/>
+            </w:tcBorders>
+            <w:vAlign w:val="bottom"/>
+          </w:tcPr>
+          <w:p>
+            <w:pPr>
+              <w:pStyle w:val="Normal"/>
+              <w:widowControl w:val="false"/>
+              <w:spacing w:lineRule="auto" w:line="180"/>
+              <w:jc w:val="center"/>
+              <w:rPr>
+                <w:sz w:val="16"/>
+                <w:szCs w:val="16"/>
+              </w:rPr>
+            </w:pPr>
+            <w:r>
+              <w:rPr>
+                <w:sz w:val="16"/>
+                <w:szCs w:val="16"/>
+              </w:rPr>
+              <w:t>Instrument Light</w:t>
+            </w:r>
+          </w:p>
+        </w:tc>
+        <w:tc>
+          <w:tcPr>
+            <w:tcW w:w="1016" w:type="dxa"/>
+            <w:tcBorders>
+              <w:top w:val="single" w:sz="4" w:space="0" w:color="000000"/>
+              <w:left w:val="single" w:sz="4" w:space="0" w:color="000000"/>
+              <w:bottom w:val="single" w:sz="4" w:space="0" w:color="000000"/>
+            </w:tcBorders>
+            <w:vAlign w:val="bottom"/>
+          </w:tcPr>
+          <w:p>
+            <w:pPr>
+              <w:pStyle w:val="Normal"/>
+              <w:widowControl w:val="false"/>
+              <w:spacing w:lineRule="auto" w:line="180"/>
+              <w:jc w:val="center"/>
+              <w:rPr>
+                <w:sz w:val="16"/>
+                <w:szCs w:val="16"/>
+              </w:rPr>
+            </w:pPr>
+            <w:r>
+              <w:rPr>
+                <w:sz w:val="16"/>
+                <w:szCs w:val="16"/>
+              </w:rPr>
+              <w:t>Uncouple</w:t>
+            </w:r>
+          </w:p>
+        </w:tc>
+        <w:tc>
+          <w:tcPr>
+            <w:tcW w:w="1016" w:type="dxa"/>
+            <w:tcBorders>
+              <w:top w:val="single" w:sz="4" w:space="0" w:color="000000"/>
+              <w:left w:val="single" w:sz="4" w:space="0" w:color="000000"/>
+              <w:bottom w:val="single" w:sz="4" w:space="0" w:color="000000"/>
+            </w:tcBorders>
+            <w:vAlign w:val="bottom"/>
+          </w:tcPr>
+          <w:p>
+            <w:pPr>
+              <w:pStyle w:val="Normal"/>
+              <w:widowControl w:val="false"/>
+              <w:spacing w:lineRule="auto" w:line="180"/>
+              <w:jc w:val="center"/>
+              <w:rPr>
+                <w:sz w:val="16"/>
+                <w:szCs w:val="16"/>
+              </w:rPr>
+            </w:pPr>
+            <w:r>
+              <w:rPr>
+                <w:rFonts w:eastAsia="arial" w:ascii="arial" w:hAnsi="arial"/>
+                <w:color w:val="000000"/>
+                <w:sz w:val="16"/>
+                <w:szCs w:val="16"/>
+              </w:rPr>
+              <w:t>Exterior</w:t>
+            </w:r>
+          </w:p>
+          <w:p>
+            <w:pPr>
+              <w:pStyle w:val="Normal"/>
+              <w:widowControl w:val="false"/>
+              <w:spacing w:lineRule="auto" w:line="180"/>
+              <w:jc w:val="center"/>
+              <w:rPr>
+                <w:sz w:val="16"/>
+                <w:szCs w:val="16"/>
+              </w:rPr>
+            </w:pPr>
+            <w:r>
+              <w:rPr>
+                <w:rFonts w:eastAsia="arial" w:ascii="arial" w:hAnsi="arial"/>
+                <w:color w:val="000000"/>
+                <w:sz w:val="16"/>
+                <w:szCs w:val="16"/>
+              </w:rPr>
+              <w:t>Camera</w:t>
+            </w:r>
+          </w:p>
+        </w:tc>
+        <w:tc>
+          <w:tcPr>
+            <w:tcW w:w="1029" w:type="dxa"/>
+            <w:tcBorders>
+              <w:top w:val="single" w:sz="4" w:space="0" w:color="000000"/>
+              <w:left w:val="single" w:sz="4" w:space="0" w:color="000000"/>
+              <w:bottom w:val="single" w:sz="4" w:space="0" w:color="000000"/>
+              <w:right w:val="single" w:sz="4" w:space="0" w:color="000000"/>
+            </w:tcBorders>
+            <w:vAlign w:val="bottom"/>
+          </w:tcPr>
+          <w:p>
+            <w:pPr>
+              <w:pStyle w:val="Normal"/>
+              <w:widowControl w:val="false"/>
+              <w:spacing w:lineRule="auto" w:line="180"/>
+              <w:jc w:val="center"/>
+              <w:rPr>
+                <w:sz w:val="16"/>
+                <w:szCs w:val="16"/>
+              </w:rPr>
+            </w:pPr>
+            <w:r>
+              <w:rPr>
+                <w:rFonts w:eastAsia="arial" w:ascii="arial" w:hAnsi="arial"/>
+                <w:color w:val="000000"/>
+                <w:sz w:val="16"/>
+                <w:szCs w:val="16"/>
+              </w:rPr>
+              <w:t>Prev</w:t>
+            </w:r>
+          </w:p>
+          <w:p>
+            <w:pPr>
+              <w:pStyle w:val="Normal"/>
+              <w:widowControl w:val="false"/>
+              <w:spacing w:lineRule="auto" w:line="180"/>
+              <w:jc w:val="center"/>
+              <w:rPr>
+                <w:sz w:val="16"/>
+                <w:szCs w:val="16"/>
+              </w:rPr>
+            </w:pPr>
+            <w:r>
+              <w:rPr>
+                <w:rFonts w:eastAsia="arial" w:ascii="arial" w:hAnsi="arial"/>
+                <w:color w:val="000000"/>
+                <w:sz w:val="16"/>
+                <w:szCs w:val="16"/>
+              </w:rPr>
+              <w:t>Cab Cam</w:t>
+            </w:r>
+          </w:p>
+        </w:tc>
+      </w:tr>
+    </w:tbl>
+    <w:p>
+      <w:pPr>
+        <w:pStyle w:val="Normal"/>
+        <w:rPr>
+          <w:color w:val="000000"/>
+          <w:sz w:val="16"/>
+          <w:szCs w:val="16"/>
+        </w:rPr>
+      </w:pPr>
+      <w:r>
+        <w:rPr>
+          <w:color w:val="000000"/>
+          <w:sz w:val="16"/>
+          <w:szCs w:val="16"/>
+        </w:rPr>
+      </w:r>
+    </w:p>
+    <w:p>
+      <w:pPr>
+        <w:pStyle w:val="Normal"/>
+        <w:rPr>
+          <w:color w:val="000000"/>
+          <w:sz w:val="16"/>
+          <w:szCs w:val="16"/>
+        </w:rPr>
+      </w:pPr>
+      <w:r>
+        <w:rPr>
+          <w:rFonts w:eastAsia="arial" w:ascii="arial" w:hAnsi="arial"/>
+          <w:color w:val="000000"/>
+          <w:sz w:val="16"/>
+          <w:szCs w:val="16"/>
+        </w:rPr>
+        <w:tab/>
+        <w:t xml:space="preserve">           Class 15</w:t>
       </w:r>
       <w:r>
         <w:rPr>
@@ -18382,7 +18927,553 @@
           <w:sz w:val="16"/>
           <w:szCs w:val="16"/>
         </w:rPr>
-        <w:t>50</w:t>
+        <w:t>3</w:t>
+      </w:r>
+      <w:r>
+        <w:rPr>
+          <w:rFonts w:eastAsia="arial" w:ascii="arial" w:hAnsi="arial"/>
+          <w:color w:val="000000"/>
+          <w:sz w:val="16"/>
+          <w:szCs w:val="16"/>
+        </w:rPr>
+        <w:t>-1</w:t>
+      </w:r>
+    </w:p>
+    <w:tbl>
+      <w:tblPr>
+        <w:tblW w:w="14248" w:type="dxa"/>
+        <w:jc w:val="left"/>
+        <w:tblInd w:w="-5" w:type="dxa"/>
+        <w:tblLayout w:type="fixed"/>
+        <w:tblCellMar>
+          <w:top w:w="0" w:type="dxa"/>
+          <w:left w:w="108" w:type="dxa"/>
+          <w:bottom w:w="0" w:type="dxa"/>
+          <w:right w:w="108" w:type="dxa"/>
+        </w:tblCellMar>
+        <w:tblLook w:firstRow="1" w:noVBand="1" w:lastRow="0" w:firstColumn="1" w:lastColumn="0" w:noHBand="0" w:val="04a0"/>
+      </w:tblPr>
+      <w:tblGrid>
+        <w:gridCol w:w="1017"/>
+        <w:gridCol w:w="1019"/>
+        <w:gridCol w:w="1014"/>
+        <w:gridCol w:w="1016"/>
+        <w:gridCol w:w="1020"/>
+        <w:gridCol w:w="1016"/>
+        <w:gridCol w:w="1016"/>
+        <w:gridCol w:w="1017"/>
+        <w:gridCol w:w="1016"/>
+        <w:gridCol w:w="1020"/>
+        <w:gridCol w:w="1016"/>
+        <w:gridCol w:w="1016"/>
+        <w:gridCol w:w="1016"/>
+        <w:gridCol w:w="1029"/>
+      </w:tblGrid>
+      <w:tr>
+        <w:trPr>
+          <w:trHeight w:val="440" w:hRule="exact"/>
+          <w:cantSplit w:val="true"/>
+        </w:trPr>
+        <w:tc>
+          <w:tcPr>
+            <w:tcW w:w="1017" w:type="dxa"/>
+            <w:tcBorders>
+              <w:top w:val="single" w:sz="4" w:space="0" w:color="000000"/>
+              <w:left w:val="single" w:sz="4" w:space="0" w:color="000000"/>
+              <w:bottom w:val="single" w:sz="4" w:space="0" w:color="000000"/>
+            </w:tcBorders>
+            <w:vAlign w:val="bottom"/>
+          </w:tcPr>
+          <w:p>
+            <w:pPr>
+              <w:pStyle w:val="Normal"/>
+              <w:widowControl w:val="false"/>
+              <w:spacing w:lineRule="auto" w:line="180" w:before="0" w:after="60"/>
+              <w:jc w:val="center"/>
+              <w:rPr>
+                <w:color w:val="000000"/>
+                <w:sz w:val="16"/>
+                <w:szCs w:val="16"/>
+              </w:rPr>
+            </w:pPr>
+            <w:r>
+              <w:rPr>
+                <w:rFonts w:eastAsia="arial" w:ascii="arial" w:hAnsi="arial"/>
+                <w:b/>
+                <w:color w:val="000000"/>
+                <w:sz w:val="16"/>
+                <w:szCs w:val="16"/>
+              </w:rPr>
+              <w:t>Pause</w:t>
+            </w:r>
+          </w:p>
+        </w:tc>
+        <w:tc>
+          <w:tcPr>
+            <w:tcW w:w="1019" w:type="dxa"/>
+            <w:tcBorders>
+              <w:top w:val="single" w:sz="4" w:space="0" w:color="000000"/>
+              <w:left w:val="single" w:sz="4" w:space="0" w:color="000000"/>
+              <w:bottom w:val="single" w:sz="4" w:space="0" w:color="000000"/>
+            </w:tcBorders>
+            <w:vAlign w:val="bottom"/>
+          </w:tcPr>
+          <w:p>
+            <w:pPr>
+              <w:pStyle w:val="Normal"/>
+              <w:widowControl w:val="false"/>
+              <w:spacing w:lineRule="auto" w:line="180"/>
+              <w:jc w:val="center"/>
+              <w:rPr>
+                <w:color w:val="000000"/>
+                <w:sz w:val="16"/>
+                <w:szCs w:val="16"/>
+              </w:rPr>
+            </w:pPr>
+            <w:r>
+              <w:rPr>
+                <w:color w:val="000000"/>
+                <w:sz w:val="16"/>
+                <w:szCs w:val="16"/>
+              </w:rPr>
+              <w:t>Master Key</w:t>
+            </w:r>
+          </w:p>
+        </w:tc>
+        <w:tc>
+          <w:tcPr>
+            <w:tcW w:w="1014" w:type="dxa"/>
+            <w:tcBorders>
+              <w:top w:val="single" w:sz="4" w:space="0" w:color="000000"/>
+              <w:left w:val="single" w:sz="4" w:space="0" w:color="000000"/>
+              <w:bottom w:val="single" w:sz="4" w:space="0" w:color="000000"/>
+            </w:tcBorders>
+            <w:vAlign w:val="bottom"/>
+          </w:tcPr>
+          <w:p>
+            <w:pPr>
+              <w:pStyle w:val="Normal"/>
+              <w:widowControl w:val="false"/>
+              <w:spacing w:lineRule="auto" w:line="180"/>
+              <w:jc w:val="center"/>
+              <w:rPr>
+                <w:color w:val="000000"/>
+                <w:sz w:val="16"/>
+                <w:szCs w:val="16"/>
+              </w:rPr>
+            </w:pPr>
+            <w:r>
+              <w:rPr>
+                <w:rFonts w:eastAsia="arial" w:ascii="arial" w:hAnsi="arial"/>
+                <w:color w:val="000000"/>
+                <w:sz w:val="16"/>
+                <w:szCs w:val="16"/>
+              </w:rPr>
+              <w:t>Engine Start</w:t>
+            </w:r>
+          </w:p>
+        </w:tc>
+        <w:tc>
+          <w:tcPr>
+            <w:tcW w:w="1016" w:type="dxa"/>
+            <w:tcBorders>
+              <w:top w:val="single" w:sz="4" w:space="0" w:color="000000"/>
+              <w:left w:val="single" w:sz="4" w:space="0" w:color="000000"/>
+              <w:bottom w:val="single" w:sz="4" w:space="0" w:color="000000"/>
+            </w:tcBorders>
+            <w:vAlign w:val="bottom"/>
+          </w:tcPr>
+          <w:p>
+            <w:pPr>
+              <w:pStyle w:val="Normal"/>
+              <w:widowControl w:val="false"/>
+              <w:spacing w:lineRule="auto" w:line="180"/>
+              <w:jc w:val="center"/>
+              <w:rPr>
+                <w:color w:val="000000"/>
+                <w:sz w:val="16"/>
+                <w:szCs w:val="16"/>
+              </w:rPr>
+            </w:pPr>
+            <w:r>
+              <w:rPr>
+                <w:color w:val="000000"/>
+                <w:sz w:val="16"/>
+                <w:szCs w:val="16"/>
+              </w:rPr>
+              <w:t>AWS/TPWS</w:t>
+            </w:r>
+          </w:p>
+        </w:tc>
+        <w:tc>
+          <w:tcPr>
+            <w:tcW w:w="1020" w:type="dxa"/>
+            <w:tcBorders>
+              <w:top w:val="single" w:sz="4" w:space="0" w:color="000000"/>
+              <w:left w:val="single" w:sz="4" w:space="0" w:color="000000"/>
+              <w:bottom w:val="single" w:sz="4" w:space="0" w:color="000000"/>
+            </w:tcBorders>
+            <w:vAlign w:val="bottom"/>
+          </w:tcPr>
+          <w:p>
+            <w:pPr>
+              <w:pStyle w:val="Normal"/>
+              <w:widowControl w:val="false"/>
+              <w:spacing w:lineRule="auto" w:line="180"/>
+              <w:jc w:val="center"/>
+              <w:rPr>
+                <w:color w:val="000000"/>
+                <w:sz w:val="16"/>
+                <w:szCs w:val="16"/>
+              </w:rPr>
+            </w:pPr>
+            <w:r>
+              <w:rPr>
+                <w:color w:val="000000"/>
+                <w:sz w:val="16"/>
+                <w:szCs w:val="16"/>
+              </w:rPr>
+              <w:t>Train Light On</w:t>
+            </w:r>
+          </w:p>
+        </w:tc>
+        <w:tc>
+          <w:tcPr>
+            <w:tcW w:w="1016" w:type="dxa"/>
+            <w:tcBorders>
+              <w:top w:val="single" w:sz="4" w:space="0" w:color="000000"/>
+              <w:left w:val="single" w:sz="4" w:space="0" w:color="000000"/>
+              <w:bottom w:val="single" w:sz="4" w:space="0" w:color="000000"/>
+            </w:tcBorders>
+            <w:vAlign w:val="bottom"/>
+          </w:tcPr>
+          <w:p>
+            <w:pPr>
+              <w:pStyle w:val="Normal"/>
+              <w:widowControl w:val="false"/>
+              <w:jc w:val="center"/>
+              <w:rPr>
+                <w:color w:val="000000"/>
+                <w:sz w:val="16"/>
+                <w:szCs w:val="16"/>
+              </w:rPr>
+            </w:pPr>
+            <w:r>
+              <w:rPr>
+                <w:color w:val="000000"/>
+                <w:sz w:val="16"/>
+                <w:szCs w:val="16"/>
+              </w:rPr>
+              <w:t>DRA</w:t>
+            </w:r>
+          </w:p>
+        </w:tc>
+        <w:tc>
+          <w:tcPr>
+            <w:tcW w:w="1016" w:type="dxa"/>
+            <w:tcBorders>
+              <w:top w:val="single" w:sz="4" w:space="0" w:color="000000"/>
+              <w:left w:val="single" w:sz="4" w:space="0" w:color="000000"/>
+              <w:bottom w:val="single" w:sz="4" w:space="0" w:color="000000"/>
+            </w:tcBorders>
+            <w:vAlign w:val="bottom"/>
+          </w:tcPr>
+          <w:p>
+            <w:pPr>
+              <w:pStyle w:val="Normal"/>
+              <w:widowControl w:val="false"/>
+              <w:spacing w:lineRule="auto" w:line="180"/>
+              <w:jc w:val="center"/>
+              <w:rPr>
+                <w:color w:val="000000"/>
+                <w:sz w:val="16"/>
+                <w:szCs w:val="16"/>
+              </w:rPr>
+            </w:pPr>
+            <w:r>
+              <w:rPr>
+                <w:color w:val="000000"/>
+                <w:sz w:val="16"/>
+                <w:szCs w:val="16"/>
+              </w:rPr>
+            </w:r>
+          </w:p>
+        </w:tc>
+        <w:tc>
+          <w:tcPr>
+            <w:tcW w:w="1017" w:type="dxa"/>
+            <w:tcBorders>
+              <w:top w:val="single" w:sz="4" w:space="0" w:color="000000"/>
+              <w:left w:val="single" w:sz="4" w:space="0" w:color="000000"/>
+              <w:bottom w:val="single" w:sz="4" w:space="0" w:color="000000"/>
+            </w:tcBorders>
+            <w:vAlign w:val="bottom"/>
+          </w:tcPr>
+          <w:p>
+            <w:pPr>
+              <w:pStyle w:val="Normal"/>
+              <w:widowControl w:val="false"/>
+              <w:jc w:val="center"/>
+              <w:rPr>
+                <w:color w:val="000000"/>
+                <w:sz w:val="16"/>
+                <w:szCs w:val="16"/>
+              </w:rPr>
+            </w:pPr>
+            <w:r>
+              <w:rPr/>
+            </w:r>
+          </w:p>
+        </w:tc>
+        <w:tc>
+          <w:tcPr>
+            <w:tcW w:w="1016" w:type="dxa"/>
+            <w:tcBorders>
+              <w:top w:val="single" w:sz="4" w:space="0" w:color="000000"/>
+              <w:left w:val="single" w:sz="4" w:space="0" w:color="000000"/>
+              <w:bottom w:val="single" w:sz="4" w:space="0" w:color="000000"/>
+            </w:tcBorders>
+            <w:vAlign w:val="bottom"/>
+          </w:tcPr>
+          <w:p>
+            <w:pPr>
+              <w:pStyle w:val="Normal"/>
+              <w:widowControl w:val="false"/>
+              <w:jc w:val="center"/>
+              <w:rPr>
+                <w:color w:val="000000"/>
+                <w:sz w:val="16"/>
+                <w:szCs w:val="16"/>
+              </w:rPr>
+            </w:pPr>
+            <w:r>
+              <w:rPr/>
+            </w:r>
+          </w:p>
+        </w:tc>
+        <w:tc>
+          <w:tcPr>
+            <w:tcW w:w="1020" w:type="dxa"/>
+            <w:tcBorders>
+              <w:top w:val="single" w:sz="4" w:space="0" w:color="000000"/>
+              <w:left w:val="single" w:sz="4" w:space="0" w:color="000000"/>
+              <w:bottom w:val="single" w:sz="4" w:space="0" w:color="000000"/>
+            </w:tcBorders>
+            <w:vAlign w:val="bottom"/>
+          </w:tcPr>
+          <w:p>
+            <w:pPr>
+              <w:pStyle w:val="Normal"/>
+              <w:widowControl w:val="false"/>
+              <w:jc w:val="center"/>
+              <w:rPr>
+                <w:color w:val="000000"/>
+                <w:sz w:val="16"/>
+                <w:szCs w:val="16"/>
+              </w:rPr>
+            </w:pPr>
+            <w:r>
+              <w:rPr/>
+            </w:r>
+          </w:p>
+        </w:tc>
+        <w:tc>
+          <w:tcPr>
+            <w:tcW w:w="1016" w:type="dxa"/>
+            <w:tcBorders>
+              <w:top w:val="single" w:sz="4" w:space="0" w:color="000000"/>
+              <w:left w:val="single" w:sz="4" w:space="0" w:color="000000"/>
+              <w:bottom w:val="single" w:sz="4" w:space="0" w:color="000000"/>
+            </w:tcBorders>
+            <w:vAlign w:val="bottom"/>
+          </w:tcPr>
+          <w:p>
+            <w:pPr>
+              <w:pStyle w:val="Normal"/>
+              <w:widowControl w:val="false"/>
+              <w:spacing w:lineRule="auto" w:line="180"/>
+              <w:jc w:val="center"/>
+              <w:rPr>
+                <w:sz w:val="16"/>
+                <w:szCs w:val="16"/>
+              </w:rPr>
+            </w:pPr>
+            <w:r>
+              <w:rPr>
+                <w:rFonts w:eastAsia="arial" w:ascii="arial" w:hAnsi="arial"/>
+                <w:color w:val="000000"/>
+                <w:sz w:val="16"/>
+                <w:szCs w:val="16"/>
+              </w:rPr>
+              <w:t>Cab Light</w:t>
+            </w:r>
+          </w:p>
+        </w:tc>
+        <w:tc>
+          <w:tcPr>
+            <w:tcW w:w="1016" w:type="dxa"/>
+            <w:tcBorders>
+              <w:top w:val="single" w:sz="4" w:space="0" w:color="000000"/>
+              <w:left w:val="single" w:sz="4" w:space="0" w:color="000000"/>
+              <w:bottom w:val="single" w:sz="4" w:space="0" w:color="000000"/>
+            </w:tcBorders>
+            <w:vAlign w:val="bottom"/>
+          </w:tcPr>
+          <w:p>
+            <w:pPr>
+              <w:pStyle w:val="Normal"/>
+              <w:widowControl w:val="false"/>
+              <w:jc w:val="center"/>
+              <w:rPr>
+                <w:color w:val="000000"/>
+                <w:sz w:val="16"/>
+                <w:szCs w:val="16"/>
+              </w:rPr>
+            </w:pPr>
+            <w:r>
+              <w:rPr>
+                <w:color w:val="000000"/>
+                <w:sz w:val="16"/>
+                <w:szCs w:val="16"/>
+              </w:rPr>
+              <w:t>Couple</w:t>
+            </w:r>
+          </w:p>
+        </w:tc>
+        <w:tc>
+          <w:tcPr>
+            <w:tcW w:w="1016" w:type="dxa"/>
+            <w:tcBorders>
+              <w:top w:val="single" w:sz="4" w:space="0" w:color="000000"/>
+              <w:left w:val="single" w:sz="4" w:space="0" w:color="000000"/>
+              <w:bottom w:val="single" w:sz="4" w:space="0" w:color="000000"/>
+            </w:tcBorders>
+            <w:vAlign w:val="bottom"/>
+          </w:tcPr>
+          <w:p>
+            <w:pPr>
+              <w:pStyle w:val="Normal"/>
+              <w:widowControl w:val="false"/>
+              <w:spacing w:lineRule="auto" w:line="180"/>
+              <w:jc w:val="center"/>
+              <w:rPr>
+                <w:sz w:val="16"/>
+                <w:szCs w:val="16"/>
+              </w:rPr>
+            </w:pPr>
+            <w:r>
+              <w:rPr>
+                <w:rFonts w:eastAsia="arial" w:ascii="arial" w:hAnsi="arial"/>
+                <w:color w:val="000000"/>
+                <w:sz w:val="16"/>
+                <w:szCs w:val="16"/>
+              </w:rPr>
+              <w:t>1-Person</w:t>
+            </w:r>
+          </w:p>
+        </w:tc>
+        <w:tc>
+          <w:tcPr>
+            <w:tcW w:w="1029" w:type="dxa"/>
+            <w:tcBorders>
+              <w:top w:val="single" w:sz="4" w:space="0" w:color="000000"/>
+              <w:left w:val="single" w:sz="4" w:space="0" w:color="000000"/>
+              <w:bottom w:val="single" w:sz="4" w:space="0" w:color="000000"/>
+              <w:right w:val="single" w:sz="4" w:space="0" w:color="000000"/>
+            </w:tcBorders>
+            <w:vAlign w:val="bottom"/>
+          </w:tcPr>
+          <w:p>
+            <w:pPr>
+              <w:pStyle w:val="Normal"/>
+              <w:widowControl w:val="false"/>
+              <w:spacing w:lineRule="auto" w:line="180"/>
+              <w:jc w:val="center"/>
+              <w:rPr>
+                <w:sz w:val="16"/>
+                <w:szCs w:val="16"/>
+              </w:rPr>
+            </w:pPr>
+            <w:r>
+              <w:rPr>
+                <w:rFonts w:eastAsia="arial" w:ascii="arial" w:hAnsi="arial"/>
+                <w:color w:val="000000"/>
+                <w:sz w:val="16"/>
+                <w:szCs w:val="16"/>
+              </w:rPr>
+              <w:t>Next</w:t>
+            </w:r>
+          </w:p>
+          <w:p>
+            <w:pPr>
+              <w:pStyle w:val="Normal"/>
+              <w:widowControl w:val="false"/>
+              <w:spacing w:lineRule="auto" w:line="180"/>
+              <w:jc w:val="center"/>
+              <w:rPr>
+                <w:sz w:val="16"/>
+                <w:szCs w:val="16"/>
+              </w:rPr>
+            </w:pPr>
+            <w:r>
+              <w:rPr>
+                <w:rFonts w:eastAsia="arial" w:ascii="arial" w:hAnsi="arial"/>
+                <w:color w:val="000000"/>
+                <w:sz w:val="16"/>
+                <w:szCs w:val="16"/>
+              </w:rPr>
+              <w:t>Cab Cam</w:t>
+            </w:r>
+          </w:p>
+        </w:tc>
+      </w:tr>
+    </w:tbl>
+    <w:p>
+      <w:pPr>
+        <w:pStyle w:val="Normal"/>
+        <w:rPr>
+          <w:rFonts w:ascii="arial" w:hAnsi="arial" w:eastAsia="arial"/>
+          <w:color w:val="000000"/>
+          <w:sz w:val="16"/>
+          <w:szCs w:val="16"/>
+        </w:rPr>
+      </w:pPr>
+      <w:r>
+        <w:rPr>
+          <w:rFonts w:eastAsia="arial" w:ascii="arial" w:hAnsi="arial"/>
+          <w:color w:val="000000"/>
+          <w:sz w:val="16"/>
+          <w:szCs w:val="16"/>
+        </w:rPr>
+      </w:r>
+    </w:p>
+    <w:p>
+      <w:pPr>
+        <w:pStyle w:val="Normal"/>
+        <w:rPr>
+          <w:color w:val="000000"/>
+          <w:sz w:val="16"/>
+          <w:szCs w:val="16"/>
+        </w:rPr>
+      </w:pPr>
+      <w:r>
+        <w:rPr>
+          <w:rFonts w:eastAsia="arial" w:ascii="arial" w:hAnsi="arial"/>
+          <w:color w:val="000000"/>
+          <w:sz w:val="16"/>
+          <w:szCs w:val="16"/>
+        </w:rPr>
+        <w:tab/>
+        <w:t xml:space="preserve">           Class 15</w:t>
+      </w:r>
+      <w:r>
+        <w:rPr>
+          <w:rFonts w:eastAsia="arial" w:ascii="arial" w:hAnsi="arial"/>
+          <w:color w:val="000000"/>
+          <w:sz w:val="16"/>
+          <w:szCs w:val="16"/>
+        </w:rPr>
+        <w:t>3</w:t>
       </w:r>
       <w:r>
         <w:rPr>
@@ -18585,15 +19676,7 @@
                 <w:sz w:val="16"/>
                 <w:szCs w:val="16"/>
               </w:rPr>
-              <w:t>Train</w:t>
-            </w:r>
-            <w:r>
-              <w:rPr>
-                <w:color w:val="000000"/>
-                <w:sz w:val="16"/>
-                <w:szCs w:val="16"/>
-              </w:rPr>
-              <w:t xml:space="preserve"> Light Off</w:t>
+              <w:t>Train Light Off</w:t>
             </w:r>
           </w:p>
         </w:tc>
@@ -18712,12 +19795,7 @@
               </w:rPr>
             </w:pPr>
             <w:r>
-              <w:rPr>
-                <w:color w:val="000000"/>
-                <w:sz w:val="16"/>
-                <w:szCs w:val="16"/>
-              </w:rPr>
-              <w:t>Dest. Down</w:t>
+              <w:rPr/>
             </w:r>
           </w:p>
         </w:tc>
@@ -18743,31 +19821,1117 @@
               </w:rPr>
             </w:pPr>
             <w:r>
-              <w:rPr>
-                <w:color w:val="000000"/>
-                <w:sz w:val="16"/>
-                <w:szCs w:val="16"/>
-              </w:rPr>
-            </w:r>
-          </w:p>
-          <w:p>
-            <w:pPr>
-              <w:pStyle w:val="Normal"/>
-              <w:widowControl w:val="false"/>
-              <w:jc w:val="center"/>
-              <w:rPr>
-                <w:color w:val="000000"/>
-                <w:sz w:val="16"/>
-                <w:szCs w:val="16"/>
-              </w:rPr>
-            </w:pPr>
-            <w:r>
-              <w:rPr>
-                <w:color w:val="000000"/>
-                <w:sz w:val="16"/>
-                <w:szCs w:val="16"/>
-              </w:rPr>
-              <w:t>Tail Light</w:t>
+              <w:rPr/>
+            </w:r>
+          </w:p>
+        </w:tc>
+        <w:tc>
+          <w:tcPr>
+            <w:tcW w:w="1016" w:type="dxa"/>
+            <w:tcBorders>
+              <w:top w:val="single" w:sz="4" w:space="0" w:color="000000"/>
+              <w:left w:val="single" w:sz="4" w:space="0" w:color="000000"/>
+              <w:bottom w:val="single" w:sz="4" w:space="0" w:color="000000"/>
+            </w:tcBorders>
+            <w:vAlign w:val="bottom"/>
+          </w:tcPr>
+          <w:p>
+            <w:pPr>
+              <w:pStyle w:val="Normal"/>
+              <w:widowControl w:val="false"/>
+              <w:spacing w:lineRule="auto" w:line="180"/>
+              <w:jc w:val="center"/>
+              <w:rPr>
+                <w:sz w:val="16"/>
+                <w:szCs w:val="16"/>
+              </w:rPr>
+            </w:pPr>
+            <w:r>
+              <w:rPr>
+                <w:sz w:val="16"/>
+                <w:szCs w:val="16"/>
+              </w:rPr>
+              <w:t>Instrument Light</w:t>
+            </w:r>
+          </w:p>
+        </w:tc>
+        <w:tc>
+          <w:tcPr>
+            <w:tcW w:w="1016" w:type="dxa"/>
+            <w:tcBorders>
+              <w:top w:val="single" w:sz="4" w:space="0" w:color="000000"/>
+              <w:left w:val="single" w:sz="4" w:space="0" w:color="000000"/>
+              <w:bottom w:val="single" w:sz="4" w:space="0" w:color="000000"/>
+            </w:tcBorders>
+            <w:vAlign w:val="bottom"/>
+          </w:tcPr>
+          <w:p>
+            <w:pPr>
+              <w:pStyle w:val="Normal"/>
+              <w:widowControl w:val="false"/>
+              <w:spacing w:lineRule="auto" w:line="180"/>
+              <w:jc w:val="center"/>
+              <w:rPr>
+                <w:sz w:val="16"/>
+                <w:szCs w:val="16"/>
+              </w:rPr>
+            </w:pPr>
+            <w:r>
+              <w:rPr>
+                <w:sz w:val="16"/>
+                <w:szCs w:val="16"/>
+              </w:rPr>
+              <w:t>Uncouple</w:t>
+            </w:r>
+          </w:p>
+        </w:tc>
+        <w:tc>
+          <w:tcPr>
+            <w:tcW w:w="1016" w:type="dxa"/>
+            <w:tcBorders>
+              <w:top w:val="single" w:sz="4" w:space="0" w:color="000000"/>
+              <w:left w:val="single" w:sz="4" w:space="0" w:color="000000"/>
+              <w:bottom w:val="single" w:sz="4" w:space="0" w:color="000000"/>
+            </w:tcBorders>
+            <w:vAlign w:val="bottom"/>
+          </w:tcPr>
+          <w:p>
+            <w:pPr>
+              <w:pStyle w:val="Normal"/>
+              <w:widowControl w:val="false"/>
+              <w:spacing w:lineRule="auto" w:line="180"/>
+              <w:jc w:val="center"/>
+              <w:rPr>
+                <w:sz w:val="16"/>
+                <w:szCs w:val="16"/>
+              </w:rPr>
+            </w:pPr>
+            <w:r>
+              <w:rPr>
+                <w:rFonts w:eastAsia="arial" w:ascii="arial" w:hAnsi="arial"/>
+                <w:color w:val="000000"/>
+                <w:sz w:val="16"/>
+                <w:szCs w:val="16"/>
+              </w:rPr>
+              <w:t>Exterior</w:t>
+            </w:r>
+          </w:p>
+          <w:p>
+            <w:pPr>
+              <w:pStyle w:val="Normal"/>
+              <w:widowControl w:val="false"/>
+              <w:spacing w:lineRule="auto" w:line="180"/>
+              <w:jc w:val="center"/>
+              <w:rPr>
+                <w:sz w:val="16"/>
+                <w:szCs w:val="16"/>
+              </w:rPr>
+            </w:pPr>
+            <w:r>
+              <w:rPr>
+                <w:rFonts w:eastAsia="arial" w:ascii="arial" w:hAnsi="arial"/>
+                <w:color w:val="000000"/>
+                <w:sz w:val="16"/>
+                <w:szCs w:val="16"/>
+              </w:rPr>
+              <w:t>Camera</w:t>
+            </w:r>
+          </w:p>
+        </w:tc>
+        <w:tc>
+          <w:tcPr>
+            <w:tcW w:w="1029" w:type="dxa"/>
+            <w:tcBorders>
+              <w:top w:val="single" w:sz="4" w:space="0" w:color="000000"/>
+              <w:left w:val="single" w:sz="4" w:space="0" w:color="000000"/>
+              <w:bottom w:val="single" w:sz="4" w:space="0" w:color="000000"/>
+              <w:right w:val="single" w:sz="4" w:space="0" w:color="000000"/>
+            </w:tcBorders>
+            <w:vAlign w:val="bottom"/>
+          </w:tcPr>
+          <w:p>
+            <w:pPr>
+              <w:pStyle w:val="Normal"/>
+              <w:widowControl w:val="false"/>
+              <w:spacing w:lineRule="auto" w:line="180"/>
+              <w:jc w:val="center"/>
+              <w:rPr>
+                <w:sz w:val="16"/>
+                <w:szCs w:val="16"/>
+              </w:rPr>
+            </w:pPr>
+            <w:r>
+              <w:rPr>
+                <w:rFonts w:eastAsia="arial" w:ascii="arial" w:hAnsi="arial"/>
+                <w:color w:val="000000"/>
+                <w:sz w:val="16"/>
+                <w:szCs w:val="16"/>
+              </w:rPr>
+              <w:t>Prev</w:t>
+            </w:r>
+          </w:p>
+          <w:p>
+            <w:pPr>
+              <w:pStyle w:val="Normal"/>
+              <w:widowControl w:val="false"/>
+              <w:spacing w:lineRule="auto" w:line="180"/>
+              <w:jc w:val="center"/>
+              <w:rPr>
+                <w:sz w:val="16"/>
+                <w:szCs w:val="16"/>
+              </w:rPr>
+            </w:pPr>
+            <w:r>
+              <w:rPr>
+                <w:rFonts w:eastAsia="arial" w:ascii="arial" w:hAnsi="arial"/>
+                <w:color w:val="000000"/>
+                <w:sz w:val="16"/>
+                <w:szCs w:val="16"/>
+              </w:rPr>
+              <w:t>Cab Cam</w:t>
+            </w:r>
+          </w:p>
+        </w:tc>
+      </w:tr>
+    </w:tbl>
+    <w:p>
+      <w:pPr>
+        <w:pStyle w:val="Normal"/>
+        <w:rPr>
+          <w:color w:val="000000"/>
+          <w:sz w:val="16"/>
+          <w:szCs w:val="16"/>
+        </w:rPr>
+      </w:pPr>
+      <w:r>
+        <w:rPr>
+          <w:color w:val="000000"/>
+          <w:sz w:val="16"/>
+          <w:szCs w:val="16"/>
+        </w:rPr>
+      </w:r>
+    </w:p>
+    <w:p>
+      <w:pPr>
+        <w:pStyle w:val="Normal"/>
+        <w:rPr>
+          <w:color w:val="000000"/>
+          <w:sz w:val="16"/>
+          <w:szCs w:val="16"/>
+        </w:rPr>
+      </w:pPr>
+      <w:r>
+        <w:rPr>
+          <w:rFonts w:eastAsia="arial" w:ascii="arial" w:hAnsi="arial"/>
+          <w:color w:val="000000"/>
+          <w:sz w:val="16"/>
+          <w:szCs w:val="16"/>
+        </w:rPr>
+        <w:tab/>
+        <w:t xml:space="preserve">           Class 15</w:t>
+      </w:r>
+      <w:r>
+        <w:rPr>
+          <w:rFonts w:eastAsia="arial" w:ascii="arial" w:hAnsi="arial"/>
+          <w:color w:val="000000"/>
+          <w:sz w:val="16"/>
+          <w:szCs w:val="16"/>
+        </w:rPr>
+        <w:t>8</w:t>
+      </w:r>
+      <w:r>
+        <w:rPr>
+          <w:rFonts w:eastAsia="arial" w:ascii="arial" w:hAnsi="arial"/>
+          <w:color w:val="000000"/>
+          <w:sz w:val="16"/>
+          <w:szCs w:val="16"/>
+        </w:rPr>
+        <w:t>-1</w:t>
+      </w:r>
+    </w:p>
+    <w:tbl>
+      <w:tblPr>
+        <w:tblW w:w="14248" w:type="dxa"/>
+        <w:jc w:val="left"/>
+        <w:tblInd w:w="-5" w:type="dxa"/>
+        <w:tblLayout w:type="fixed"/>
+        <w:tblCellMar>
+          <w:top w:w="0" w:type="dxa"/>
+          <w:left w:w="108" w:type="dxa"/>
+          <w:bottom w:w="0" w:type="dxa"/>
+          <w:right w:w="108" w:type="dxa"/>
+        </w:tblCellMar>
+        <w:tblLook w:firstRow="1" w:noVBand="1" w:lastRow="0" w:firstColumn="1" w:lastColumn="0" w:noHBand="0" w:val="04a0"/>
+      </w:tblPr>
+      <w:tblGrid>
+        <w:gridCol w:w="1017"/>
+        <w:gridCol w:w="1019"/>
+        <w:gridCol w:w="1014"/>
+        <w:gridCol w:w="1016"/>
+        <w:gridCol w:w="1020"/>
+        <w:gridCol w:w="1016"/>
+        <w:gridCol w:w="1016"/>
+        <w:gridCol w:w="1017"/>
+        <w:gridCol w:w="1016"/>
+        <w:gridCol w:w="1020"/>
+        <w:gridCol w:w="1016"/>
+        <w:gridCol w:w="1016"/>
+        <w:gridCol w:w="1016"/>
+        <w:gridCol w:w="1029"/>
+      </w:tblGrid>
+      <w:tr>
+        <w:trPr>
+          <w:trHeight w:val="440" w:hRule="exact"/>
+          <w:cantSplit w:val="true"/>
+        </w:trPr>
+        <w:tc>
+          <w:tcPr>
+            <w:tcW w:w="1017" w:type="dxa"/>
+            <w:tcBorders>
+              <w:top w:val="single" w:sz="4" w:space="0" w:color="000000"/>
+              <w:left w:val="single" w:sz="4" w:space="0" w:color="000000"/>
+              <w:bottom w:val="single" w:sz="4" w:space="0" w:color="000000"/>
+            </w:tcBorders>
+            <w:vAlign w:val="bottom"/>
+          </w:tcPr>
+          <w:p>
+            <w:pPr>
+              <w:pStyle w:val="Normal"/>
+              <w:widowControl w:val="false"/>
+              <w:spacing w:lineRule="auto" w:line="180" w:before="0" w:after="60"/>
+              <w:jc w:val="center"/>
+              <w:rPr>
+                <w:color w:val="000000"/>
+                <w:sz w:val="16"/>
+                <w:szCs w:val="16"/>
+              </w:rPr>
+            </w:pPr>
+            <w:r>
+              <w:rPr>
+                <w:rFonts w:eastAsia="arial" w:ascii="arial" w:hAnsi="arial"/>
+                <w:b/>
+                <w:color w:val="000000"/>
+                <w:sz w:val="16"/>
+                <w:szCs w:val="16"/>
+              </w:rPr>
+              <w:t>Pause</w:t>
+            </w:r>
+          </w:p>
+        </w:tc>
+        <w:tc>
+          <w:tcPr>
+            <w:tcW w:w="1019" w:type="dxa"/>
+            <w:tcBorders>
+              <w:top w:val="single" w:sz="4" w:space="0" w:color="000000"/>
+              <w:left w:val="single" w:sz="4" w:space="0" w:color="000000"/>
+              <w:bottom w:val="single" w:sz="4" w:space="0" w:color="000000"/>
+            </w:tcBorders>
+            <w:vAlign w:val="bottom"/>
+          </w:tcPr>
+          <w:p>
+            <w:pPr>
+              <w:pStyle w:val="Normal"/>
+              <w:widowControl w:val="false"/>
+              <w:spacing w:lineRule="auto" w:line="180"/>
+              <w:jc w:val="center"/>
+              <w:rPr>
+                <w:color w:val="000000"/>
+                <w:sz w:val="16"/>
+                <w:szCs w:val="16"/>
+              </w:rPr>
+            </w:pPr>
+            <w:r>
+              <w:rPr>
+                <w:color w:val="000000"/>
+                <w:sz w:val="16"/>
+                <w:szCs w:val="16"/>
+              </w:rPr>
+              <w:t>Master Key</w:t>
+            </w:r>
+          </w:p>
+        </w:tc>
+        <w:tc>
+          <w:tcPr>
+            <w:tcW w:w="1014" w:type="dxa"/>
+            <w:tcBorders>
+              <w:top w:val="single" w:sz="4" w:space="0" w:color="000000"/>
+              <w:left w:val="single" w:sz="4" w:space="0" w:color="000000"/>
+              <w:bottom w:val="single" w:sz="4" w:space="0" w:color="000000"/>
+            </w:tcBorders>
+            <w:vAlign w:val="bottom"/>
+          </w:tcPr>
+          <w:p>
+            <w:pPr>
+              <w:pStyle w:val="Normal"/>
+              <w:widowControl w:val="false"/>
+              <w:spacing w:lineRule="auto" w:line="180"/>
+              <w:jc w:val="center"/>
+              <w:rPr>
+                <w:color w:val="000000"/>
+                <w:sz w:val="16"/>
+                <w:szCs w:val="16"/>
+              </w:rPr>
+            </w:pPr>
+            <w:r>
+              <w:rPr>
+                <w:rFonts w:eastAsia="arial" w:ascii="arial" w:hAnsi="arial"/>
+                <w:color w:val="000000"/>
+                <w:sz w:val="16"/>
+                <w:szCs w:val="16"/>
+              </w:rPr>
+              <w:t>Engine Start</w:t>
+            </w:r>
+          </w:p>
+        </w:tc>
+        <w:tc>
+          <w:tcPr>
+            <w:tcW w:w="1016" w:type="dxa"/>
+            <w:tcBorders>
+              <w:top w:val="single" w:sz="4" w:space="0" w:color="000000"/>
+              <w:left w:val="single" w:sz="4" w:space="0" w:color="000000"/>
+              <w:bottom w:val="single" w:sz="4" w:space="0" w:color="000000"/>
+            </w:tcBorders>
+            <w:vAlign w:val="bottom"/>
+          </w:tcPr>
+          <w:p>
+            <w:pPr>
+              <w:pStyle w:val="Normal"/>
+              <w:widowControl w:val="false"/>
+              <w:spacing w:lineRule="auto" w:line="180"/>
+              <w:jc w:val="center"/>
+              <w:rPr>
+                <w:color w:val="000000"/>
+                <w:sz w:val="16"/>
+                <w:szCs w:val="16"/>
+              </w:rPr>
+            </w:pPr>
+            <w:r>
+              <w:rPr>
+                <w:color w:val="000000"/>
+                <w:sz w:val="16"/>
+                <w:szCs w:val="16"/>
+              </w:rPr>
+              <w:t>AWS/TPWS</w:t>
+            </w:r>
+          </w:p>
+        </w:tc>
+        <w:tc>
+          <w:tcPr>
+            <w:tcW w:w="1020" w:type="dxa"/>
+            <w:tcBorders>
+              <w:top w:val="single" w:sz="4" w:space="0" w:color="000000"/>
+              <w:left w:val="single" w:sz="4" w:space="0" w:color="000000"/>
+              <w:bottom w:val="single" w:sz="4" w:space="0" w:color="000000"/>
+            </w:tcBorders>
+            <w:vAlign w:val="bottom"/>
+          </w:tcPr>
+          <w:p>
+            <w:pPr>
+              <w:pStyle w:val="Normal"/>
+              <w:widowControl w:val="false"/>
+              <w:spacing w:lineRule="auto" w:line="180"/>
+              <w:jc w:val="center"/>
+              <w:rPr>
+                <w:color w:val="000000"/>
+                <w:sz w:val="16"/>
+                <w:szCs w:val="16"/>
+              </w:rPr>
+            </w:pPr>
+            <w:r>
+              <w:rPr>
+                <w:color w:val="000000"/>
+                <w:sz w:val="16"/>
+                <w:szCs w:val="16"/>
+              </w:rPr>
+              <w:t>Train Light On</w:t>
+            </w:r>
+          </w:p>
+        </w:tc>
+        <w:tc>
+          <w:tcPr>
+            <w:tcW w:w="1016" w:type="dxa"/>
+            <w:tcBorders>
+              <w:top w:val="single" w:sz="4" w:space="0" w:color="000000"/>
+              <w:left w:val="single" w:sz="4" w:space="0" w:color="000000"/>
+              <w:bottom w:val="single" w:sz="4" w:space="0" w:color="000000"/>
+            </w:tcBorders>
+            <w:vAlign w:val="bottom"/>
+          </w:tcPr>
+          <w:p>
+            <w:pPr>
+              <w:pStyle w:val="Normal"/>
+              <w:widowControl w:val="false"/>
+              <w:jc w:val="center"/>
+              <w:rPr>
+                <w:color w:val="000000"/>
+                <w:sz w:val="16"/>
+                <w:szCs w:val="16"/>
+              </w:rPr>
+            </w:pPr>
+            <w:r>
+              <w:rPr>
+                <w:color w:val="000000"/>
+                <w:sz w:val="16"/>
+                <w:szCs w:val="16"/>
+              </w:rPr>
+              <w:t>DRA</w:t>
+            </w:r>
+          </w:p>
+        </w:tc>
+        <w:tc>
+          <w:tcPr>
+            <w:tcW w:w="1016" w:type="dxa"/>
+            <w:tcBorders>
+              <w:top w:val="single" w:sz="4" w:space="0" w:color="000000"/>
+              <w:left w:val="single" w:sz="4" w:space="0" w:color="000000"/>
+              <w:bottom w:val="single" w:sz="4" w:space="0" w:color="000000"/>
+            </w:tcBorders>
+            <w:vAlign w:val="bottom"/>
+          </w:tcPr>
+          <w:p>
+            <w:pPr>
+              <w:pStyle w:val="Normal"/>
+              <w:widowControl w:val="false"/>
+              <w:spacing w:lineRule="auto" w:line="180"/>
+              <w:jc w:val="center"/>
+              <w:rPr>
+                <w:color w:val="000000"/>
+                <w:sz w:val="16"/>
+                <w:szCs w:val="16"/>
+              </w:rPr>
+            </w:pPr>
+            <w:r>
+              <w:rPr>
+                <w:color w:val="000000"/>
+                <w:sz w:val="16"/>
+                <w:szCs w:val="16"/>
+              </w:rPr>
+            </w:r>
+          </w:p>
+        </w:tc>
+        <w:tc>
+          <w:tcPr>
+            <w:tcW w:w="1017" w:type="dxa"/>
+            <w:tcBorders>
+              <w:top w:val="single" w:sz="4" w:space="0" w:color="000000"/>
+              <w:left w:val="single" w:sz="4" w:space="0" w:color="000000"/>
+              <w:bottom w:val="single" w:sz="4" w:space="0" w:color="000000"/>
+            </w:tcBorders>
+            <w:vAlign w:val="bottom"/>
+          </w:tcPr>
+          <w:p>
+            <w:pPr>
+              <w:pStyle w:val="Normal"/>
+              <w:widowControl w:val="false"/>
+              <w:jc w:val="center"/>
+              <w:rPr>
+                <w:color w:val="000000"/>
+                <w:sz w:val="16"/>
+                <w:szCs w:val="16"/>
+              </w:rPr>
+            </w:pPr>
+            <w:r>
+              <w:rPr/>
+            </w:r>
+          </w:p>
+        </w:tc>
+        <w:tc>
+          <w:tcPr>
+            <w:tcW w:w="1016" w:type="dxa"/>
+            <w:tcBorders>
+              <w:top w:val="single" w:sz="4" w:space="0" w:color="000000"/>
+              <w:left w:val="single" w:sz="4" w:space="0" w:color="000000"/>
+              <w:bottom w:val="single" w:sz="4" w:space="0" w:color="000000"/>
+            </w:tcBorders>
+            <w:vAlign w:val="bottom"/>
+          </w:tcPr>
+          <w:p>
+            <w:pPr>
+              <w:pStyle w:val="Normal"/>
+              <w:widowControl w:val="false"/>
+              <w:jc w:val="center"/>
+              <w:rPr>
+                <w:color w:val="000000"/>
+                <w:sz w:val="16"/>
+                <w:szCs w:val="16"/>
+              </w:rPr>
+            </w:pPr>
+            <w:r>
+              <w:rPr/>
+            </w:r>
+          </w:p>
+        </w:tc>
+        <w:tc>
+          <w:tcPr>
+            <w:tcW w:w="1020" w:type="dxa"/>
+            <w:tcBorders>
+              <w:top w:val="single" w:sz="4" w:space="0" w:color="000000"/>
+              <w:left w:val="single" w:sz="4" w:space="0" w:color="000000"/>
+              <w:bottom w:val="single" w:sz="4" w:space="0" w:color="000000"/>
+            </w:tcBorders>
+            <w:vAlign w:val="bottom"/>
+          </w:tcPr>
+          <w:p>
+            <w:pPr>
+              <w:pStyle w:val="Normal"/>
+              <w:widowControl w:val="false"/>
+              <w:jc w:val="center"/>
+              <w:rPr>
+                <w:color w:val="000000"/>
+                <w:sz w:val="16"/>
+                <w:szCs w:val="16"/>
+              </w:rPr>
+            </w:pPr>
+            <w:r>
+              <w:rPr/>
+            </w:r>
+          </w:p>
+        </w:tc>
+        <w:tc>
+          <w:tcPr>
+            <w:tcW w:w="1016" w:type="dxa"/>
+            <w:tcBorders>
+              <w:top w:val="single" w:sz="4" w:space="0" w:color="000000"/>
+              <w:left w:val="single" w:sz="4" w:space="0" w:color="000000"/>
+              <w:bottom w:val="single" w:sz="4" w:space="0" w:color="000000"/>
+            </w:tcBorders>
+            <w:vAlign w:val="bottom"/>
+          </w:tcPr>
+          <w:p>
+            <w:pPr>
+              <w:pStyle w:val="Normal"/>
+              <w:widowControl w:val="false"/>
+              <w:spacing w:lineRule="auto" w:line="180"/>
+              <w:jc w:val="center"/>
+              <w:rPr>
+                <w:sz w:val="16"/>
+                <w:szCs w:val="16"/>
+              </w:rPr>
+            </w:pPr>
+            <w:r>
+              <w:rPr>
+                <w:rFonts w:eastAsia="arial" w:ascii="arial" w:hAnsi="arial"/>
+                <w:color w:val="000000"/>
+                <w:sz w:val="16"/>
+                <w:szCs w:val="16"/>
+              </w:rPr>
+              <w:t>Cab Light</w:t>
+            </w:r>
+          </w:p>
+        </w:tc>
+        <w:tc>
+          <w:tcPr>
+            <w:tcW w:w="1016" w:type="dxa"/>
+            <w:tcBorders>
+              <w:top w:val="single" w:sz="4" w:space="0" w:color="000000"/>
+              <w:left w:val="single" w:sz="4" w:space="0" w:color="000000"/>
+              <w:bottom w:val="single" w:sz="4" w:space="0" w:color="000000"/>
+            </w:tcBorders>
+            <w:vAlign w:val="bottom"/>
+          </w:tcPr>
+          <w:p>
+            <w:pPr>
+              <w:pStyle w:val="Normal"/>
+              <w:widowControl w:val="false"/>
+              <w:jc w:val="center"/>
+              <w:rPr>
+                <w:color w:val="000000"/>
+                <w:sz w:val="16"/>
+                <w:szCs w:val="16"/>
+              </w:rPr>
+            </w:pPr>
+            <w:r>
+              <w:rPr>
+                <w:color w:val="000000"/>
+                <w:sz w:val="16"/>
+                <w:szCs w:val="16"/>
+              </w:rPr>
+              <w:t>Couple</w:t>
+            </w:r>
+          </w:p>
+        </w:tc>
+        <w:tc>
+          <w:tcPr>
+            <w:tcW w:w="1016" w:type="dxa"/>
+            <w:tcBorders>
+              <w:top w:val="single" w:sz="4" w:space="0" w:color="000000"/>
+              <w:left w:val="single" w:sz="4" w:space="0" w:color="000000"/>
+              <w:bottom w:val="single" w:sz="4" w:space="0" w:color="000000"/>
+            </w:tcBorders>
+            <w:vAlign w:val="bottom"/>
+          </w:tcPr>
+          <w:p>
+            <w:pPr>
+              <w:pStyle w:val="Normal"/>
+              <w:widowControl w:val="false"/>
+              <w:spacing w:lineRule="auto" w:line="180"/>
+              <w:jc w:val="center"/>
+              <w:rPr>
+                <w:sz w:val="16"/>
+                <w:szCs w:val="16"/>
+              </w:rPr>
+            </w:pPr>
+            <w:r>
+              <w:rPr>
+                <w:rFonts w:eastAsia="arial" w:ascii="arial" w:hAnsi="arial"/>
+                <w:color w:val="000000"/>
+                <w:sz w:val="16"/>
+                <w:szCs w:val="16"/>
+              </w:rPr>
+              <w:t>1-Person</w:t>
+            </w:r>
+          </w:p>
+        </w:tc>
+        <w:tc>
+          <w:tcPr>
+            <w:tcW w:w="1029" w:type="dxa"/>
+            <w:tcBorders>
+              <w:top w:val="single" w:sz="4" w:space="0" w:color="000000"/>
+              <w:left w:val="single" w:sz="4" w:space="0" w:color="000000"/>
+              <w:bottom w:val="single" w:sz="4" w:space="0" w:color="000000"/>
+              <w:right w:val="single" w:sz="4" w:space="0" w:color="000000"/>
+            </w:tcBorders>
+            <w:vAlign w:val="bottom"/>
+          </w:tcPr>
+          <w:p>
+            <w:pPr>
+              <w:pStyle w:val="Normal"/>
+              <w:widowControl w:val="false"/>
+              <w:spacing w:lineRule="auto" w:line="180"/>
+              <w:jc w:val="center"/>
+              <w:rPr>
+                <w:sz w:val="16"/>
+                <w:szCs w:val="16"/>
+              </w:rPr>
+            </w:pPr>
+            <w:r>
+              <w:rPr>
+                <w:rFonts w:eastAsia="arial" w:ascii="arial" w:hAnsi="arial"/>
+                <w:color w:val="000000"/>
+                <w:sz w:val="16"/>
+                <w:szCs w:val="16"/>
+              </w:rPr>
+              <w:t>Next</w:t>
+            </w:r>
+          </w:p>
+          <w:p>
+            <w:pPr>
+              <w:pStyle w:val="Normal"/>
+              <w:widowControl w:val="false"/>
+              <w:spacing w:lineRule="auto" w:line="180"/>
+              <w:jc w:val="center"/>
+              <w:rPr>
+                <w:sz w:val="16"/>
+                <w:szCs w:val="16"/>
+              </w:rPr>
+            </w:pPr>
+            <w:r>
+              <w:rPr>
+                <w:rFonts w:eastAsia="arial" w:ascii="arial" w:hAnsi="arial"/>
+                <w:color w:val="000000"/>
+                <w:sz w:val="16"/>
+                <w:szCs w:val="16"/>
+              </w:rPr>
+              <w:t>Cab Cam</w:t>
+            </w:r>
+          </w:p>
+        </w:tc>
+      </w:tr>
+    </w:tbl>
+    <w:p>
+      <w:pPr>
+        <w:pStyle w:val="Normal"/>
+        <w:rPr>
+          <w:rFonts w:ascii="arial" w:hAnsi="arial" w:eastAsia="arial"/>
+          <w:color w:val="000000"/>
+          <w:sz w:val="16"/>
+          <w:szCs w:val="16"/>
+        </w:rPr>
+      </w:pPr>
+      <w:r>
+        <w:rPr>
+          <w:rFonts w:eastAsia="arial" w:ascii="arial" w:hAnsi="arial"/>
+          <w:color w:val="000000"/>
+          <w:sz w:val="16"/>
+          <w:szCs w:val="16"/>
+        </w:rPr>
+      </w:r>
+    </w:p>
+    <w:p>
+      <w:pPr>
+        <w:pStyle w:val="Normal"/>
+        <w:rPr>
+          <w:color w:val="000000"/>
+          <w:sz w:val="16"/>
+          <w:szCs w:val="16"/>
+        </w:rPr>
+      </w:pPr>
+      <w:r>
+        <w:rPr>
+          <w:rFonts w:eastAsia="arial" w:ascii="arial" w:hAnsi="arial"/>
+          <w:color w:val="000000"/>
+          <w:sz w:val="16"/>
+          <w:szCs w:val="16"/>
+        </w:rPr>
+        <w:tab/>
+        <w:t xml:space="preserve">           Class 15</w:t>
+      </w:r>
+      <w:r>
+        <w:rPr>
+          <w:rFonts w:eastAsia="arial" w:ascii="arial" w:hAnsi="arial"/>
+          <w:color w:val="000000"/>
+          <w:sz w:val="16"/>
+          <w:szCs w:val="16"/>
+        </w:rPr>
+        <w:t>8</w:t>
+      </w:r>
+      <w:r>
+        <w:rPr>
+          <w:rFonts w:eastAsia="arial" w:ascii="arial" w:hAnsi="arial"/>
+          <w:color w:val="000000"/>
+          <w:sz w:val="16"/>
+          <w:szCs w:val="16"/>
+        </w:rPr>
+        <w:t>-2</w:t>
+      </w:r>
+    </w:p>
+    <w:tbl>
+      <w:tblPr>
+        <w:tblW w:w="14248" w:type="dxa"/>
+        <w:jc w:val="left"/>
+        <w:tblInd w:w="-5" w:type="dxa"/>
+        <w:tblLayout w:type="fixed"/>
+        <w:tblCellMar>
+          <w:top w:w="0" w:type="dxa"/>
+          <w:left w:w="108" w:type="dxa"/>
+          <w:bottom w:w="0" w:type="dxa"/>
+          <w:right w:w="108" w:type="dxa"/>
+        </w:tblCellMar>
+        <w:tblLook w:firstRow="1" w:noVBand="1" w:lastRow="0" w:firstColumn="1" w:lastColumn="0" w:noHBand="0" w:val="04a0"/>
+      </w:tblPr>
+      <w:tblGrid>
+        <w:gridCol w:w="1017"/>
+        <w:gridCol w:w="1019"/>
+        <w:gridCol w:w="1014"/>
+        <w:gridCol w:w="1016"/>
+        <w:gridCol w:w="1020"/>
+        <w:gridCol w:w="1016"/>
+        <w:gridCol w:w="1016"/>
+        <w:gridCol w:w="1017"/>
+        <w:gridCol w:w="1016"/>
+        <w:gridCol w:w="1020"/>
+        <w:gridCol w:w="1016"/>
+        <w:gridCol w:w="1016"/>
+        <w:gridCol w:w="1016"/>
+        <w:gridCol w:w="1029"/>
+      </w:tblGrid>
+      <w:tr>
+        <w:trPr>
+          <w:trHeight w:val="440" w:hRule="exact"/>
+          <w:cantSplit w:val="true"/>
+        </w:trPr>
+        <w:tc>
+          <w:tcPr>
+            <w:tcW w:w="1017" w:type="dxa"/>
+            <w:tcBorders>
+              <w:top w:val="single" w:sz="4" w:space="0" w:color="000000"/>
+              <w:left w:val="single" w:sz="4" w:space="0" w:color="000000"/>
+              <w:bottom w:val="single" w:sz="4" w:space="0" w:color="000000"/>
+            </w:tcBorders>
+            <w:vAlign w:val="bottom"/>
+          </w:tcPr>
+          <w:p>
+            <w:pPr>
+              <w:pStyle w:val="Normal"/>
+              <w:widowControl w:val="false"/>
+              <w:spacing w:lineRule="auto" w:line="180" w:before="0" w:after="60"/>
+              <w:jc w:val="center"/>
+              <w:rPr>
+                <w:b/>
+                <w:bCs/>
+              </w:rPr>
+            </w:pPr>
+            <w:r>
+              <w:rPr>
+                <w:b/>
+                <w:bCs/>
+                <w:color w:val="000000"/>
+                <w:sz w:val="16"/>
+                <w:szCs w:val="16"/>
+              </w:rPr>
+              <w:t>HUD</w:t>
+            </w:r>
+          </w:p>
+        </w:tc>
+        <w:tc>
+          <w:tcPr>
+            <w:tcW w:w="1019" w:type="dxa"/>
+            <w:tcBorders>
+              <w:top w:val="single" w:sz="4" w:space="0" w:color="000000"/>
+              <w:left w:val="single" w:sz="4" w:space="0" w:color="000000"/>
+              <w:bottom w:val="single" w:sz="4" w:space="0" w:color="000000"/>
+            </w:tcBorders>
+            <w:vAlign w:val="bottom"/>
+          </w:tcPr>
+          <w:p>
+            <w:pPr>
+              <w:pStyle w:val="Normal"/>
+              <w:widowControl w:val="false"/>
+              <w:spacing w:lineRule="auto" w:line="180"/>
+              <w:jc w:val="center"/>
+              <w:rPr>
+                <w:color w:val="000000"/>
+                <w:sz w:val="16"/>
+                <w:szCs w:val="16"/>
+              </w:rPr>
+            </w:pPr>
+            <w:r>
+              <w:rPr>
+                <w:color w:val="000000"/>
+                <w:sz w:val="16"/>
+                <w:szCs w:val="16"/>
+              </w:rPr>
+              <w:t>Schedule</w:t>
+            </w:r>
+          </w:p>
+        </w:tc>
+        <w:tc>
+          <w:tcPr>
+            <w:tcW w:w="1014" w:type="dxa"/>
+            <w:tcBorders>
+              <w:top w:val="single" w:sz="4" w:space="0" w:color="000000"/>
+              <w:left w:val="single" w:sz="4" w:space="0" w:color="000000"/>
+              <w:bottom w:val="single" w:sz="4" w:space="0" w:color="000000"/>
+            </w:tcBorders>
+            <w:vAlign w:val="bottom"/>
+          </w:tcPr>
+          <w:p>
+            <w:pPr>
+              <w:pStyle w:val="Normal"/>
+              <w:widowControl w:val="false"/>
+              <w:spacing w:lineRule="auto" w:line="180"/>
+              <w:jc w:val="center"/>
+              <w:rPr>
+                <w:sz w:val="16"/>
+                <w:szCs w:val="16"/>
+              </w:rPr>
+            </w:pPr>
+            <w:r>
+              <w:rPr>
+                <w:rFonts w:eastAsia="arial" w:ascii="arial" w:hAnsi="arial"/>
+                <w:sz w:val="16"/>
+                <w:szCs w:val="16"/>
+              </w:rPr>
+              <w:t>Engine Stop</w:t>
+            </w:r>
+          </w:p>
+        </w:tc>
+        <w:tc>
+          <w:tcPr>
+            <w:tcW w:w="1016" w:type="dxa"/>
+            <w:tcBorders>
+              <w:top w:val="single" w:sz="4" w:space="0" w:color="000000"/>
+              <w:left w:val="single" w:sz="4" w:space="0" w:color="000000"/>
+              <w:bottom w:val="single" w:sz="4" w:space="0" w:color="000000"/>
+            </w:tcBorders>
+            <w:vAlign w:val="bottom"/>
+          </w:tcPr>
+          <w:p>
+            <w:pPr>
+              <w:pStyle w:val="Normal"/>
+              <w:widowControl w:val="false"/>
+              <w:spacing w:lineRule="auto" w:line="180"/>
+              <w:jc w:val="center"/>
+              <w:rPr>
+                <w:color w:val="000000"/>
+                <w:sz w:val="16"/>
+                <w:szCs w:val="16"/>
+              </w:rPr>
+            </w:pPr>
+            <w:r>
+              <w:rPr>
+                <w:color w:val="000000"/>
+                <w:sz w:val="16"/>
+                <w:szCs w:val="16"/>
+              </w:rPr>
+              <w:t>DSD/Vigilance</w:t>
+            </w:r>
+          </w:p>
+        </w:tc>
+        <w:tc>
+          <w:tcPr>
+            <w:tcW w:w="1020" w:type="dxa"/>
+            <w:tcBorders>
+              <w:top w:val="single" w:sz="4" w:space="0" w:color="000000"/>
+              <w:left w:val="single" w:sz="4" w:space="0" w:color="000000"/>
+              <w:bottom w:val="single" w:sz="4" w:space="0" w:color="000000"/>
+            </w:tcBorders>
+            <w:vAlign w:val="bottom"/>
+          </w:tcPr>
+          <w:p>
+            <w:pPr>
+              <w:pStyle w:val="Normal"/>
+              <w:widowControl w:val="false"/>
+              <w:spacing w:lineRule="auto" w:line="180"/>
+              <w:jc w:val="center"/>
+              <w:rPr>
+                <w:color w:val="000000"/>
+                <w:sz w:val="16"/>
+                <w:szCs w:val="16"/>
+              </w:rPr>
+            </w:pPr>
+            <w:r>
+              <w:rPr>
+                <w:color w:val="000000"/>
+                <w:sz w:val="16"/>
+                <w:szCs w:val="16"/>
+              </w:rPr>
+              <w:t>Train Light Off</w:t>
+            </w:r>
+          </w:p>
+        </w:tc>
+        <w:tc>
+          <w:tcPr>
+            <w:tcW w:w="1016" w:type="dxa"/>
+            <w:tcBorders>
+              <w:top w:val="single" w:sz="4" w:space="0" w:color="000000"/>
+              <w:left w:val="single" w:sz="4" w:space="0" w:color="000000"/>
+              <w:bottom w:val="single" w:sz="4" w:space="0" w:color="000000"/>
+            </w:tcBorders>
+            <w:vAlign w:val="bottom"/>
+          </w:tcPr>
+          <w:p>
+            <w:pPr>
+              <w:pStyle w:val="Normal"/>
+              <w:widowControl w:val="false"/>
+              <w:jc w:val="center"/>
+              <w:rPr>
+                <w:color w:val="000000"/>
+                <w:sz w:val="16"/>
+                <w:szCs w:val="16"/>
+              </w:rPr>
+            </w:pPr>
+            <w:r>
+              <w:rPr>
+                <w:color w:val="000000"/>
+                <w:sz w:val="16"/>
+                <w:szCs w:val="16"/>
+              </w:rPr>
+            </w:r>
+          </w:p>
+        </w:tc>
+        <w:tc>
+          <w:tcPr>
+            <w:tcW w:w="1016" w:type="dxa"/>
+            <w:tcBorders>
+              <w:top w:val="single" w:sz="4" w:space="0" w:color="000000"/>
+              <w:left w:val="single" w:sz="4" w:space="0" w:color="000000"/>
+              <w:bottom w:val="single" w:sz="4" w:space="0" w:color="000000"/>
+            </w:tcBorders>
+            <w:vAlign w:val="bottom"/>
+          </w:tcPr>
+          <w:p>
+            <w:pPr>
+              <w:pStyle w:val="Normal"/>
+              <w:widowControl w:val="false"/>
+              <w:spacing w:lineRule="auto" w:line="180"/>
+              <w:jc w:val="center"/>
+              <w:rPr>
+                <w:color w:val="000000"/>
+                <w:sz w:val="16"/>
+                <w:szCs w:val="16"/>
+              </w:rPr>
+            </w:pPr>
+            <w:r>
+              <w:rPr>
+                <w:color w:val="000000"/>
+                <w:sz w:val="16"/>
+                <w:szCs w:val="16"/>
+              </w:rPr>
+            </w:r>
+          </w:p>
+        </w:tc>
+        <w:tc>
+          <w:tcPr>
+            <w:tcW w:w="1017" w:type="dxa"/>
+            <w:tcBorders>
+              <w:top w:val="single" w:sz="4" w:space="0" w:color="000000"/>
+              <w:left w:val="single" w:sz="4" w:space="0" w:color="000000"/>
+              <w:bottom w:val="single" w:sz="4" w:space="0" w:color="000000"/>
+            </w:tcBorders>
+            <w:vAlign w:val="bottom"/>
+          </w:tcPr>
+          <w:p>
+            <w:pPr>
+              <w:pStyle w:val="Normal"/>
+              <w:widowControl w:val="false"/>
+              <w:jc w:val="center"/>
+              <w:rPr>
+                <w:rFonts w:ascii="arial" w:hAnsi="arial" w:eastAsia="arial"/>
+                <w:color w:val="000000"/>
+                <w:sz w:val="16"/>
+                <w:szCs w:val="16"/>
+              </w:rPr>
+            </w:pPr>
+            <w:r>
+              <w:rPr>
+                <w:rFonts w:eastAsia="arial" w:ascii="arial" w:hAnsi="arial"/>
+                <w:color w:val="000000"/>
+                <w:sz w:val="16"/>
+                <w:szCs w:val="16"/>
+              </w:rPr>
+            </w:r>
+          </w:p>
+        </w:tc>
+        <w:tc>
+          <w:tcPr>
+            <w:tcW w:w="1016" w:type="dxa"/>
+            <w:tcBorders>
+              <w:top w:val="single" w:sz="4" w:space="0" w:color="000000"/>
+              <w:left w:val="single" w:sz="4" w:space="0" w:color="000000"/>
+              <w:bottom w:val="single" w:sz="4" w:space="0" w:color="000000"/>
+            </w:tcBorders>
+            <w:vAlign w:val="bottom"/>
+          </w:tcPr>
+          <w:p>
+            <w:pPr>
+              <w:pStyle w:val="Normal"/>
+              <w:widowControl w:val="false"/>
+              <w:jc w:val="center"/>
+              <w:rPr>
+                <w:color w:val="000000"/>
+                <w:sz w:val="16"/>
+                <w:szCs w:val="16"/>
+              </w:rPr>
+            </w:pPr>
+            <w:r>
+              <w:rPr/>
+            </w:r>
+          </w:p>
+        </w:tc>
+        <w:tc>
+          <w:tcPr>
+            <w:tcW w:w="1020" w:type="dxa"/>
+            <w:tcBorders>
+              <w:top w:val="single" w:sz="4" w:space="0" w:color="000000"/>
+              <w:left w:val="single" w:sz="4" w:space="0" w:color="000000"/>
+              <w:bottom w:val="single" w:sz="4" w:space="0" w:color="000000"/>
+            </w:tcBorders>
+            <w:vAlign w:val="bottom"/>
+          </w:tcPr>
+          <w:p>
+            <w:pPr>
+              <w:pStyle w:val="Normal"/>
+              <w:widowControl w:val="false"/>
+              <w:jc w:val="center"/>
+              <w:rPr>
+                <w:color w:val="000000"/>
+                <w:sz w:val="16"/>
+                <w:szCs w:val="16"/>
+              </w:rPr>
+            </w:pPr>
+            <w:r>
+              <w:rPr/>
             </w:r>
           </w:p>
         </w:tc>
@@ -19978,12 +22142,12 @@
       <w:rFonts w:ascii="Symbol" w:hAnsi="Symbol" w:cs="Symbol"/>
     </w:rPr>
   </w:style>
-  <w:style w:type="character" w:styleId="user" w:customStyle="1">
-    <w:name w:val="번호 매기기 기호 (user)"/>
+  <w:style w:type="character" w:styleId="Style5" w:customStyle="1">
+    <w:name w:val="번호 매기기 기호"/>
     <w:qFormat/>
     <w:rPr/>
   </w:style>
-  <w:style w:type="paragraph" w:styleId="Style5">
+  <w:style w:type="paragraph" w:styleId="Style6">
     <w:name w:val="제목"/>
     <w:basedOn w:val="Normal"/>
     <w:next w:val="BodyText"/>
@@ -19993,7 +22157,7 @@
       <w:spacing w:before="240" w:after="120"/>
     </w:pPr>
     <w:rPr>
-      <w:rFonts w:ascii="Liberation Sans" w:hAnsi="Liberation Sans" w:eastAsia="Noto Sans CJK KR" w:cs="Lohit Devanagari"/>
+      <w:rFonts w:ascii="Liberation Sans" w:hAnsi="Liberation Sans" w:eastAsia="나눔고딕" w:cs="Arial"/>
       <w:sz w:val="28"/>
       <w:szCs w:val="28"/>
     </w:rPr>
@@ -20030,7 +22194,7 @@
       <w:szCs w:val="24"/>
     </w:rPr>
   </w:style>
-  <w:style w:type="paragraph" w:styleId="Style6" w:customStyle="1">
+  <w:style w:type="paragraph" w:styleId="Style7">
     <w:name w:val="색인"/>
     <w:basedOn w:val="Normal"/>
     <w:qFormat/>
@@ -20038,10 +22202,11 @@
       <w:suppressLineNumbers/>
     </w:pPr>
     <w:rPr>
-      <w:rFonts w:cs="Lohit Devanagari"/>
+      <w:rFonts w:cs="Arial"/>
+      <w:sz w:val="24"/>
     </w:rPr>
   </w:style>
-  <w:style w:type="paragraph" w:styleId="user1">
+  <w:style w:type="paragraph" w:styleId="user">
     <w:name w:val="제목 (user)"/>
     <w:basedOn w:val="Normal"/>
     <w:next w:val="BodyText"/>
@@ -20051,12 +22216,12 @@
       <w:spacing w:before="240" w:after="120"/>
     </w:pPr>
     <w:rPr>
-      <w:rFonts w:ascii="Liberation Sans" w:hAnsi="Liberation Sans" w:eastAsia="나눔고딕" w:cs="Arial"/>
+      <w:rFonts w:ascii="Liberation Sans" w:hAnsi="Liberation Sans" w:eastAsia="Noto Sans CJK KR" w:cs="Lohit Devanagari"/>
       <w:sz w:val="28"/>
       <w:szCs w:val="28"/>
     </w:rPr>
   </w:style>
-  <w:style w:type="paragraph" w:styleId="user2">
+  <w:style w:type="paragraph" w:styleId="user1" w:customStyle="1">
     <w:name w:val="색인 (user)"/>
     <w:basedOn w:val="Normal"/>
     <w:qFormat/>
@@ -20064,8 +22229,7 @@
       <w:suppressLineNumbers/>
     </w:pPr>
     <w:rPr>
-      <w:rFonts w:cs="Arial"/>
-      <w:sz w:val="24"/>
+      <w:rFonts w:cs="Lohit Devanagari"/>
     </w:rPr>
   </w:style>
   <w:style w:type="paragraph" w:styleId="Title">
@@ -20747,8 +22911,8 @@
       <w:szCs w:val="24"/>
     </w:rPr>
   </w:style>
-  <w:style w:type="paragraph" w:styleId="Style7" w:customStyle="1">
-    <w:name w:val="표 내용"/>
+  <w:style w:type="paragraph" w:styleId="user2" w:customStyle="1">
+    <w:name w:val="표 내용 (user)"/>
     <w:basedOn w:val="Normal"/>
     <w:qFormat/>
     <w:pPr>
@@ -20756,9 +22920,9 @@
     </w:pPr>
     <w:rPr/>
   </w:style>
-  <w:style w:type="paragraph" w:styleId="Style8" w:customStyle="1">
-    <w:name w:val="표제목"/>
-    <w:basedOn w:val="Style7"/>
+  <w:style w:type="paragraph" w:styleId="user3" w:customStyle="1">
+    <w:name w:val="표제목 (user)"/>
+    <w:basedOn w:val="user2"/>
     <w:qFormat/>
     <w:pPr>
       <w:jc w:val="center"/>
@@ -20768,8 +22932,8 @@
       <w:bCs/>
     </w:rPr>
   </w:style>
-  <w:style w:type="paragraph" w:styleId="user3">
-    <w:name w:val="표 내용 (user)"/>
+  <w:style w:type="paragraph" w:styleId="Style8">
+    <w:name w:val="표 내용"/>
     <w:basedOn w:val="Normal"/>
     <w:qFormat/>
     <w:pPr>
@@ -20778,9 +22942,9 @@
     </w:pPr>
     <w:rPr/>
   </w:style>
-  <w:style w:type="paragraph" w:styleId="user4">
-    <w:name w:val="표제목 (user)"/>
-    <w:basedOn w:val="user3"/>
+  <w:style w:type="paragraph" w:styleId="Style9">
+    <w:name w:val="표제목"/>
+    <w:basedOn w:val="Style8"/>
     <w:qFormat/>
     <w:pPr>
       <w:suppressLineNumbers/>

</xml_diff>

<commit_message>
Add Class 166 and 170/171
</commit_message>
<xml_diff>
--- a/raildriver-UK-Remapped.docx
+++ b/raildriver-UK-Remapped.docx
@@ -18918,25 +18918,7 @@
           <w:szCs w:val="16"/>
         </w:rPr>
         <w:tab/>
-        <w:t xml:space="preserve">           Class 15</w:t>
-      </w:r>
-      <w:r>
-        <w:rPr>
-          <w:rFonts w:eastAsia="arial" w:ascii="arial" w:hAnsi="arial"/>
-          <w:color w:val="000000"/>
-          <w:sz w:val="16"/>
-          <w:szCs w:val="16"/>
-        </w:rPr>
-        <w:t>3</w:t>
-      </w:r>
-      <w:r>
-        <w:rPr>
-          <w:rFonts w:eastAsia="arial" w:ascii="arial" w:hAnsi="arial"/>
-          <w:color w:val="000000"/>
-          <w:sz w:val="16"/>
-          <w:szCs w:val="16"/>
-        </w:rPr>
-        <w:t>-1</w:t>
+        <w:t xml:space="preserve">           Class 153-1</w:t>
       </w:r>
     </w:p>
     <w:tbl>
@@ -19221,33 +19203,41 @@
               </w:rPr>
             </w:pPr>
             <w:r>
-              <w:rPr/>
-            </w:r>
-          </w:p>
-        </w:tc>
-        <w:tc>
-          <w:tcPr>
-            <w:tcW w:w="1016" w:type="dxa"/>
-            <w:tcBorders>
-              <w:top w:val="single" w:sz="4" w:space="0" w:color="000000"/>
-              <w:left w:val="single" w:sz="4" w:space="0" w:color="000000"/>
-              <w:bottom w:val="single" w:sz="4" w:space="0" w:color="000000"/>
-            </w:tcBorders>
-            <w:vAlign w:val="bottom"/>
-          </w:tcPr>
-          <w:p>
-            <w:pPr>
-              <w:pStyle w:val="Normal"/>
-              <w:widowControl w:val="false"/>
-              <w:jc w:val="center"/>
-              <w:rPr>
-                <w:color w:val="000000"/>
-                <w:sz w:val="16"/>
-                <w:szCs w:val="16"/>
-              </w:rPr>
-            </w:pPr>
-            <w:r>
-              <w:rPr/>
+              <w:rPr>
+                <w:color w:val="000000"/>
+                <w:sz w:val="16"/>
+                <w:szCs w:val="16"/>
+              </w:rPr>
+            </w:r>
+          </w:p>
+        </w:tc>
+        <w:tc>
+          <w:tcPr>
+            <w:tcW w:w="1016" w:type="dxa"/>
+            <w:tcBorders>
+              <w:top w:val="single" w:sz="4" w:space="0" w:color="000000"/>
+              <w:left w:val="single" w:sz="4" w:space="0" w:color="000000"/>
+              <w:bottom w:val="single" w:sz="4" w:space="0" w:color="000000"/>
+            </w:tcBorders>
+            <w:vAlign w:val="bottom"/>
+          </w:tcPr>
+          <w:p>
+            <w:pPr>
+              <w:pStyle w:val="Normal"/>
+              <w:widowControl w:val="false"/>
+              <w:jc w:val="center"/>
+              <w:rPr>
+                <w:color w:val="000000"/>
+                <w:sz w:val="16"/>
+                <w:szCs w:val="16"/>
+              </w:rPr>
+            </w:pPr>
+            <w:r>
+              <w:rPr>
+                <w:color w:val="000000"/>
+                <w:sz w:val="16"/>
+                <w:szCs w:val="16"/>
+              </w:rPr>
             </w:r>
           </w:p>
         </w:tc>
@@ -19273,7 +19263,11 @@
               </w:rPr>
             </w:pPr>
             <w:r>
-              <w:rPr/>
+              <w:rPr>
+                <w:color w:val="000000"/>
+                <w:sz w:val="16"/>
+                <w:szCs w:val="16"/>
+              </w:rPr>
             </w:r>
           </w:p>
         </w:tc>
@@ -19464,25 +19458,7 @@
           <w:szCs w:val="16"/>
         </w:rPr>
         <w:tab/>
-        <w:t xml:space="preserve">           Class 15</w:t>
-      </w:r>
-      <w:r>
-        <w:rPr>
-          <w:rFonts w:eastAsia="arial" w:ascii="arial" w:hAnsi="arial"/>
-          <w:color w:val="000000"/>
-          <w:sz w:val="16"/>
-          <w:szCs w:val="16"/>
-        </w:rPr>
-        <w:t>3</w:t>
-      </w:r>
-      <w:r>
-        <w:rPr>
-          <w:rFonts w:eastAsia="arial" w:ascii="arial" w:hAnsi="arial"/>
-          <w:color w:val="000000"/>
-          <w:sz w:val="16"/>
-          <w:szCs w:val="16"/>
-        </w:rPr>
-        <w:t>-2</w:t>
+        <w:t xml:space="preserve">           Class 153-2</w:t>
       </w:r>
     </w:p>
     <w:tbl>
@@ -19795,7 +19771,11 @@
               </w:rPr>
             </w:pPr>
             <w:r>
-              <w:rPr/>
+              <w:rPr>
+                <w:color w:val="000000"/>
+                <w:sz w:val="16"/>
+                <w:szCs w:val="16"/>
+              </w:rPr>
             </w:r>
           </w:p>
         </w:tc>
@@ -19821,7 +19801,11 @@
               </w:rPr>
             </w:pPr>
             <w:r>
-              <w:rPr/>
+              <w:rPr>
+                <w:color w:val="000000"/>
+                <w:sz w:val="16"/>
+                <w:szCs w:val="16"/>
+              </w:rPr>
             </w:r>
           </w:p>
         </w:tc>
@@ -20028,25 +20012,7 @@
           <w:szCs w:val="16"/>
         </w:rPr>
         <w:tab/>
-        <w:t xml:space="preserve">           Class 15</w:t>
-      </w:r>
-      <w:r>
-        <w:rPr>
-          <w:rFonts w:eastAsia="arial" w:ascii="arial" w:hAnsi="arial"/>
-          <w:color w:val="000000"/>
-          <w:sz w:val="16"/>
-          <w:szCs w:val="16"/>
-        </w:rPr>
-        <w:t>8</w:t>
-      </w:r>
-      <w:r>
-        <w:rPr>
-          <w:rFonts w:eastAsia="arial" w:ascii="arial" w:hAnsi="arial"/>
-          <w:color w:val="000000"/>
-          <w:sz w:val="16"/>
-          <w:szCs w:val="16"/>
-        </w:rPr>
-        <w:t>-1</w:t>
+        <w:t xml:space="preserve">           Class 158-1</w:t>
       </w:r>
     </w:p>
     <w:tbl>
@@ -20331,33 +20297,41 @@
               </w:rPr>
             </w:pPr>
             <w:r>
-              <w:rPr/>
-            </w:r>
-          </w:p>
-        </w:tc>
-        <w:tc>
-          <w:tcPr>
-            <w:tcW w:w="1016" w:type="dxa"/>
-            <w:tcBorders>
-              <w:top w:val="single" w:sz="4" w:space="0" w:color="000000"/>
-              <w:left w:val="single" w:sz="4" w:space="0" w:color="000000"/>
-              <w:bottom w:val="single" w:sz="4" w:space="0" w:color="000000"/>
-            </w:tcBorders>
-            <w:vAlign w:val="bottom"/>
-          </w:tcPr>
-          <w:p>
-            <w:pPr>
-              <w:pStyle w:val="Normal"/>
-              <w:widowControl w:val="false"/>
-              <w:jc w:val="center"/>
-              <w:rPr>
-                <w:color w:val="000000"/>
-                <w:sz w:val="16"/>
-                <w:szCs w:val="16"/>
-              </w:rPr>
-            </w:pPr>
-            <w:r>
-              <w:rPr/>
+              <w:rPr>
+                <w:color w:val="000000"/>
+                <w:sz w:val="16"/>
+                <w:szCs w:val="16"/>
+              </w:rPr>
+            </w:r>
+          </w:p>
+        </w:tc>
+        <w:tc>
+          <w:tcPr>
+            <w:tcW w:w="1016" w:type="dxa"/>
+            <w:tcBorders>
+              <w:top w:val="single" w:sz="4" w:space="0" w:color="000000"/>
+              <w:left w:val="single" w:sz="4" w:space="0" w:color="000000"/>
+              <w:bottom w:val="single" w:sz="4" w:space="0" w:color="000000"/>
+            </w:tcBorders>
+            <w:vAlign w:val="bottom"/>
+          </w:tcPr>
+          <w:p>
+            <w:pPr>
+              <w:pStyle w:val="Normal"/>
+              <w:widowControl w:val="false"/>
+              <w:jc w:val="center"/>
+              <w:rPr>
+                <w:color w:val="000000"/>
+                <w:sz w:val="16"/>
+                <w:szCs w:val="16"/>
+              </w:rPr>
+            </w:pPr>
+            <w:r>
+              <w:rPr>
+                <w:color w:val="000000"/>
+                <w:sz w:val="16"/>
+                <w:szCs w:val="16"/>
+              </w:rPr>
             </w:r>
           </w:p>
         </w:tc>
@@ -20383,7 +20357,11 @@
               </w:rPr>
             </w:pPr>
             <w:r>
-              <w:rPr/>
+              <w:rPr>
+                <w:color w:val="000000"/>
+                <w:sz w:val="16"/>
+                <w:szCs w:val="16"/>
+              </w:rPr>
             </w:r>
           </w:p>
         </w:tc>
@@ -20574,7 +20552,544 @@
           <w:szCs w:val="16"/>
         </w:rPr>
         <w:tab/>
-        <w:t xml:space="preserve">           Class 15</w:t>
+        <w:t xml:space="preserve">           Class 158-2</w:t>
+      </w:r>
+    </w:p>
+    <w:tbl>
+      <w:tblPr>
+        <w:tblW w:w="14248" w:type="dxa"/>
+        <w:jc w:val="left"/>
+        <w:tblInd w:w="-5" w:type="dxa"/>
+        <w:tblLayout w:type="fixed"/>
+        <w:tblCellMar>
+          <w:top w:w="0" w:type="dxa"/>
+          <w:left w:w="108" w:type="dxa"/>
+          <w:bottom w:w="0" w:type="dxa"/>
+          <w:right w:w="108" w:type="dxa"/>
+        </w:tblCellMar>
+        <w:tblLook w:firstRow="1" w:noVBand="1" w:lastRow="0" w:firstColumn="1" w:lastColumn="0" w:noHBand="0" w:val="04a0"/>
+      </w:tblPr>
+      <w:tblGrid>
+        <w:gridCol w:w="1017"/>
+        <w:gridCol w:w="1019"/>
+        <w:gridCol w:w="1014"/>
+        <w:gridCol w:w="1016"/>
+        <w:gridCol w:w="1020"/>
+        <w:gridCol w:w="1016"/>
+        <w:gridCol w:w="1016"/>
+        <w:gridCol w:w="1017"/>
+        <w:gridCol w:w="1016"/>
+        <w:gridCol w:w="1020"/>
+        <w:gridCol w:w="1016"/>
+        <w:gridCol w:w="1016"/>
+        <w:gridCol w:w="1016"/>
+        <w:gridCol w:w="1029"/>
+      </w:tblGrid>
+      <w:tr>
+        <w:trPr>
+          <w:trHeight w:val="440" w:hRule="exact"/>
+          <w:cantSplit w:val="true"/>
+        </w:trPr>
+        <w:tc>
+          <w:tcPr>
+            <w:tcW w:w="1017" w:type="dxa"/>
+            <w:tcBorders>
+              <w:top w:val="single" w:sz="4" w:space="0" w:color="000000"/>
+              <w:left w:val="single" w:sz="4" w:space="0" w:color="000000"/>
+              <w:bottom w:val="single" w:sz="4" w:space="0" w:color="000000"/>
+            </w:tcBorders>
+            <w:vAlign w:val="bottom"/>
+          </w:tcPr>
+          <w:p>
+            <w:pPr>
+              <w:pStyle w:val="Normal"/>
+              <w:widowControl w:val="false"/>
+              <w:spacing w:lineRule="auto" w:line="180" w:before="0" w:after="60"/>
+              <w:jc w:val="center"/>
+              <w:rPr>
+                <w:b/>
+                <w:bCs/>
+              </w:rPr>
+            </w:pPr>
+            <w:r>
+              <w:rPr>
+                <w:b/>
+                <w:bCs/>
+                <w:color w:val="000000"/>
+                <w:sz w:val="16"/>
+                <w:szCs w:val="16"/>
+              </w:rPr>
+              <w:t>HUD</w:t>
+            </w:r>
+          </w:p>
+        </w:tc>
+        <w:tc>
+          <w:tcPr>
+            <w:tcW w:w="1019" w:type="dxa"/>
+            <w:tcBorders>
+              <w:top w:val="single" w:sz="4" w:space="0" w:color="000000"/>
+              <w:left w:val="single" w:sz="4" w:space="0" w:color="000000"/>
+              <w:bottom w:val="single" w:sz="4" w:space="0" w:color="000000"/>
+            </w:tcBorders>
+            <w:vAlign w:val="bottom"/>
+          </w:tcPr>
+          <w:p>
+            <w:pPr>
+              <w:pStyle w:val="Normal"/>
+              <w:widowControl w:val="false"/>
+              <w:spacing w:lineRule="auto" w:line="180"/>
+              <w:jc w:val="center"/>
+              <w:rPr>
+                <w:color w:val="000000"/>
+                <w:sz w:val="16"/>
+                <w:szCs w:val="16"/>
+              </w:rPr>
+            </w:pPr>
+            <w:r>
+              <w:rPr>
+                <w:color w:val="000000"/>
+                <w:sz w:val="16"/>
+                <w:szCs w:val="16"/>
+              </w:rPr>
+              <w:t>Schedule</w:t>
+            </w:r>
+          </w:p>
+        </w:tc>
+        <w:tc>
+          <w:tcPr>
+            <w:tcW w:w="1014" w:type="dxa"/>
+            <w:tcBorders>
+              <w:top w:val="single" w:sz="4" w:space="0" w:color="000000"/>
+              <w:left w:val="single" w:sz="4" w:space="0" w:color="000000"/>
+              <w:bottom w:val="single" w:sz="4" w:space="0" w:color="000000"/>
+            </w:tcBorders>
+            <w:vAlign w:val="bottom"/>
+          </w:tcPr>
+          <w:p>
+            <w:pPr>
+              <w:pStyle w:val="Normal"/>
+              <w:widowControl w:val="false"/>
+              <w:spacing w:lineRule="auto" w:line="180"/>
+              <w:jc w:val="center"/>
+              <w:rPr>
+                <w:sz w:val="16"/>
+                <w:szCs w:val="16"/>
+              </w:rPr>
+            </w:pPr>
+            <w:r>
+              <w:rPr>
+                <w:rFonts w:eastAsia="arial" w:ascii="arial" w:hAnsi="arial"/>
+                <w:sz w:val="16"/>
+                <w:szCs w:val="16"/>
+              </w:rPr>
+              <w:t>Engine Stop</w:t>
+            </w:r>
+          </w:p>
+        </w:tc>
+        <w:tc>
+          <w:tcPr>
+            <w:tcW w:w="1016" w:type="dxa"/>
+            <w:tcBorders>
+              <w:top w:val="single" w:sz="4" w:space="0" w:color="000000"/>
+              <w:left w:val="single" w:sz="4" w:space="0" w:color="000000"/>
+              <w:bottom w:val="single" w:sz="4" w:space="0" w:color="000000"/>
+            </w:tcBorders>
+            <w:vAlign w:val="bottom"/>
+          </w:tcPr>
+          <w:p>
+            <w:pPr>
+              <w:pStyle w:val="Normal"/>
+              <w:widowControl w:val="false"/>
+              <w:spacing w:lineRule="auto" w:line="180"/>
+              <w:jc w:val="center"/>
+              <w:rPr>
+                <w:color w:val="000000"/>
+                <w:sz w:val="16"/>
+                <w:szCs w:val="16"/>
+              </w:rPr>
+            </w:pPr>
+            <w:r>
+              <w:rPr>
+                <w:color w:val="000000"/>
+                <w:sz w:val="16"/>
+                <w:szCs w:val="16"/>
+              </w:rPr>
+              <w:t>DSD/Vigilance</w:t>
+            </w:r>
+          </w:p>
+        </w:tc>
+        <w:tc>
+          <w:tcPr>
+            <w:tcW w:w="1020" w:type="dxa"/>
+            <w:tcBorders>
+              <w:top w:val="single" w:sz="4" w:space="0" w:color="000000"/>
+              <w:left w:val="single" w:sz="4" w:space="0" w:color="000000"/>
+              <w:bottom w:val="single" w:sz="4" w:space="0" w:color="000000"/>
+            </w:tcBorders>
+            <w:vAlign w:val="bottom"/>
+          </w:tcPr>
+          <w:p>
+            <w:pPr>
+              <w:pStyle w:val="Normal"/>
+              <w:widowControl w:val="false"/>
+              <w:spacing w:lineRule="auto" w:line="180"/>
+              <w:jc w:val="center"/>
+              <w:rPr>
+                <w:color w:val="000000"/>
+                <w:sz w:val="16"/>
+                <w:szCs w:val="16"/>
+              </w:rPr>
+            </w:pPr>
+            <w:r>
+              <w:rPr>
+                <w:color w:val="000000"/>
+                <w:sz w:val="16"/>
+                <w:szCs w:val="16"/>
+              </w:rPr>
+              <w:t>Train Light Off</w:t>
+            </w:r>
+          </w:p>
+        </w:tc>
+        <w:tc>
+          <w:tcPr>
+            <w:tcW w:w="1016" w:type="dxa"/>
+            <w:tcBorders>
+              <w:top w:val="single" w:sz="4" w:space="0" w:color="000000"/>
+              <w:left w:val="single" w:sz="4" w:space="0" w:color="000000"/>
+              <w:bottom w:val="single" w:sz="4" w:space="0" w:color="000000"/>
+            </w:tcBorders>
+            <w:vAlign w:val="bottom"/>
+          </w:tcPr>
+          <w:p>
+            <w:pPr>
+              <w:pStyle w:val="Normal"/>
+              <w:widowControl w:val="false"/>
+              <w:jc w:val="center"/>
+              <w:rPr>
+                <w:color w:val="000000"/>
+                <w:sz w:val="16"/>
+                <w:szCs w:val="16"/>
+              </w:rPr>
+            </w:pPr>
+            <w:r>
+              <w:rPr>
+                <w:color w:val="000000"/>
+                <w:sz w:val="16"/>
+                <w:szCs w:val="16"/>
+              </w:rPr>
+            </w:r>
+          </w:p>
+        </w:tc>
+        <w:tc>
+          <w:tcPr>
+            <w:tcW w:w="1016" w:type="dxa"/>
+            <w:tcBorders>
+              <w:top w:val="single" w:sz="4" w:space="0" w:color="000000"/>
+              <w:left w:val="single" w:sz="4" w:space="0" w:color="000000"/>
+              <w:bottom w:val="single" w:sz="4" w:space="0" w:color="000000"/>
+            </w:tcBorders>
+            <w:vAlign w:val="bottom"/>
+          </w:tcPr>
+          <w:p>
+            <w:pPr>
+              <w:pStyle w:val="Normal"/>
+              <w:widowControl w:val="false"/>
+              <w:spacing w:lineRule="auto" w:line="180"/>
+              <w:jc w:val="center"/>
+              <w:rPr>
+                <w:color w:val="000000"/>
+                <w:sz w:val="16"/>
+                <w:szCs w:val="16"/>
+              </w:rPr>
+            </w:pPr>
+            <w:r>
+              <w:rPr>
+                <w:color w:val="000000"/>
+                <w:sz w:val="16"/>
+                <w:szCs w:val="16"/>
+              </w:rPr>
+            </w:r>
+          </w:p>
+        </w:tc>
+        <w:tc>
+          <w:tcPr>
+            <w:tcW w:w="1017" w:type="dxa"/>
+            <w:tcBorders>
+              <w:top w:val="single" w:sz="4" w:space="0" w:color="000000"/>
+              <w:left w:val="single" w:sz="4" w:space="0" w:color="000000"/>
+              <w:bottom w:val="single" w:sz="4" w:space="0" w:color="000000"/>
+            </w:tcBorders>
+            <w:vAlign w:val="bottom"/>
+          </w:tcPr>
+          <w:p>
+            <w:pPr>
+              <w:pStyle w:val="Normal"/>
+              <w:widowControl w:val="false"/>
+              <w:jc w:val="center"/>
+              <w:rPr>
+                <w:rFonts w:ascii="arial" w:hAnsi="arial" w:eastAsia="arial"/>
+                <w:color w:val="000000"/>
+                <w:sz w:val="16"/>
+                <w:szCs w:val="16"/>
+              </w:rPr>
+            </w:pPr>
+            <w:r>
+              <w:rPr>
+                <w:rFonts w:eastAsia="arial" w:ascii="arial" w:hAnsi="arial"/>
+                <w:color w:val="000000"/>
+                <w:sz w:val="16"/>
+                <w:szCs w:val="16"/>
+              </w:rPr>
+            </w:r>
+          </w:p>
+        </w:tc>
+        <w:tc>
+          <w:tcPr>
+            <w:tcW w:w="1016" w:type="dxa"/>
+            <w:tcBorders>
+              <w:top w:val="single" w:sz="4" w:space="0" w:color="000000"/>
+              <w:left w:val="single" w:sz="4" w:space="0" w:color="000000"/>
+              <w:bottom w:val="single" w:sz="4" w:space="0" w:color="000000"/>
+            </w:tcBorders>
+            <w:vAlign w:val="bottom"/>
+          </w:tcPr>
+          <w:p>
+            <w:pPr>
+              <w:pStyle w:val="Normal"/>
+              <w:widowControl w:val="false"/>
+              <w:jc w:val="center"/>
+              <w:rPr>
+                <w:color w:val="000000"/>
+                <w:sz w:val="16"/>
+                <w:szCs w:val="16"/>
+              </w:rPr>
+            </w:pPr>
+            <w:r>
+              <w:rPr>
+                <w:color w:val="000000"/>
+                <w:sz w:val="16"/>
+                <w:szCs w:val="16"/>
+              </w:rPr>
+            </w:r>
+          </w:p>
+        </w:tc>
+        <w:tc>
+          <w:tcPr>
+            <w:tcW w:w="1020" w:type="dxa"/>
+            <w:tcBorders>
+              <w:top w:val="single" w:sz="4" w:space="0" w:color="000000"/>
+              <w:left w:val="single" w:sz="4" w:space="0" w:color="000000"/>
+              <w:bottom w:val="single" w:sz="4" w:space="0" w:color="000000"/>
+            </w:tcBorders>
+            <w:vAlign w:val="bottom"/>
+          </w:tcPr>
+          <w:p>
+            <w:pPr>
+              <w:pStyle w:val="Normal"/>
+              <w:widowControl w:val="false"/>
+              <w:jc w:val="center"/>
+              <w:rPr>
+                <w:color w:val="000000"/>
+                <w:sz w:val="16"/>
+                <w:szCs w:val="16"/>
+              </w:rPr>
+            </w:pPr>
+            <w:r>
+              <w:rPr>
+                <w:color w:val="000000"/>
+                <w:sz w:val="16"/>
+                <w:szCs w:val="16"/>
+              </w:rPr>
+            </w:r>
+          </w:p>
+        </w:tc>
+        <w:tc>
+          <w:tcPr>
+            <w:tcW w:w="1016" w:type="dxa"/>
+            <w:tcBorders>
+              <w:top w:val="single" w:sz="4" w:space="0" w:color="000000"/>
+              <w:left w:val="single" w:sz="4" w:space="0" w:color="000000"/>
+              <w:bottom w:val="single" w:sz="4" w:space="0" w:color="000000"/>
+            </w:tcBorders>
+            <w:vAlign w:val="bottom"/>
+          </w:tcPr>
+          <w:p>
+            <w:pPr>
+              <w:pStyle w:val="Normal"/>
+              <w:widowControl w:val="false"/>
+              <w:spacing w:lineRule="auto" w:line="180"/>
+              <w:jc w:val="center"/>
+              <w:rPr>
+                <w:sz w:val="16"/>
+                <w:szCs w:val="16"/>
+              </w:rPr>
+            </w:pPr>
+            <w:r>
+              <w:rPr>
+                <w:sz w:val="16"/>
+                <w:szCs w:val="16"/>
+              </w:rPr>
+              <w:t>Instrument Light</w:t>
+            </w:r>
+          </w:p>
+        </w:tc>
+        <w:tc>
+          <w:tcPr>
+            <w:tcW w:w="1016" w:type="dxa"/>
+            <w:tcBorders>
+              <w:top w:val="single" w:sz="4" w:space="0" w:color="000000"/>
+              <w:left w:val="single" w:sz="4" w:space="0" w:color="000000"/>
+              <w:bottom w:val="single" w:sz="4" w:space="0" w:color="000000"/>
+            </w:tcBorders>
+            <w:vAlign w:val="bottom"/>
+          </w:tcPr>
+          <w:p>
+            <w:pPr>
+              <w:pStyle w:val="Normal"/>
+              <w:widowControl w:val="false"/>
+              <w:spacing w:lineRule="auto" w:line="180"/>
+              <w:jc w:val="center"/>
+              <w:rPr>
+                <w:sz w:val="16"/>
+                <w:szCs w:val="16"/>
+              </w:rPr>
+            </w:pPr>
+            <w:r>
+              <w:rPr>
+                <w:sz w:val="16"/>
+                <w:szCs w:val="16"/>
+              </w:rPr>
+              <w:t>Uncouple</w:t>
+            </w:r>
+          </w:p>
+        </w:tc>
+        <w:tc>
+          <w:tcPr>
+            <w:tcW w:w="1016" w:type="dxa"/>
+            <w:tcBorders>
+              <w:top w:val="single" w:sz="4" w:space="0" w:color="000000"/>
+              <w:left w:val="single" w:sz="4" w:space="0" w:color="000000"/>
+              <w:bottom w:val="single" w:sz="4" w:space="0" w:color="000000"/>
+            </w:tcBorders>
+            <w:vAlign w:val="bottom"/>
+          </w:tcPr>
+          <w:p>
+            <w:pPr>
+              <w:pStyle w:val="Normal"/>
+              <w:widowControl w:val="false"/>
+              <w:spacing w:lineRule="auto" w:line="180"/>
+              <w:jc w:val="center"/>
+              <w:rPr>
+                <w:sz w:val="16"/>
+                <w:szCs w:val="16"/>
+              </w:rPr>
+            </w:pPr>
+            <w:r>
+              <w:rPr>
+                <w:rFonts w:eastAsia="arial" w:ascii="arial" w:hAnsi="arial"/>
+                <w:color w:val="000000"/>
+                <w:sz w:val="16"/>
+                <w:szCs w:val="16"/>
+              </w:rPr>
+              <w:t>Exterior</w:t>
+            </w:r>
+          </w:p>
+          <w:p>
+            <w:pPr>
+              <w:pStyle w:val="Normal"/>
+              <w:widowControl w:val="false"/>
+              <w:spacing w:lineRule="auto" w:line="180"/>
+              <w:jc w:val="center"/>
+              <w:rPr>
+                <w:sz w:val="16"/>
+                <w:szCs w:val="16"/>
+              </w:rPr>
+            </w:pPr>
+            <w:r>
+              <w:rPr>
+                <w:rFonts w:eastAsia="arial" w:ascii="arial" w:hAnsi="arial"/>
+                <w:color w:val="000000"/>
+                <w:sz w:val="16"/>
+                <w:szCs w:val="16"/>
+              </w:rPr>
+              <w:t>Camera</w:t>
+            </w:r>
+          </w:p>
+        </w:tc>
+        <w:tc>
+          <w:tcPr>
+            <w:tcW w:w="1029" w:type="dxa"/>
+            <w:tcBorders>
+              <w:top w:val="single" w:sz="4" w:space="0" w:color="000000"/>
+              <w:left w:val="single" w:sz="4" w:space="0" w:color="000000"/>
+              <w:bottom w:val="single" w:sz="4" w:space="0" w:color="000000"/>
+              <w:right w:val="single" w:sz="4" w:space="0" w:color="000000"/>
+            </w:tcBorders>
+            <w:vAlign w:val="bottom"/>
+          </w:tcPr>
+          <w:p>
+            <w:pPr>
+              <w:pStyle w:val="Normal"/>
+              <w:widowControl w:val="false"/>
+              <w:spacing w:lineRule="auto" w:line="180"/>
+              <w:jc w:val="center"/>
+              <w:rPr>
+                <w:sz w:val="16"/>
+                <w:szCs w:val="16"/>
+              </w:rPr>
+            </w:pPr>
+            <w:r>
+              <w:rPr>
+                <w:rFonts w:eastAsia="arial" w:ascii="arial" w:hAnsi="arial"/>
+                <w:color w:val="000000"/>
+                <w:sz w:val="16"/>
+                <w:szCs w:val="16"/>
+              </w:rPr>
+              <w:t>Prev</w:t>
+            </w:r>
+          </w:p>
+          <w:p>
+            <w:pPr>
+              <w:pStyle w:val="Normal"/>
+              <w:widowControl w:val="false"/>
+              <w:spacing w:lineRule="auto" w:line="180"/>
+              <w:jc w:val="center"/>
+              <w:rPr>
+                <w:sz w:val="16"/>
+                <w:szCs w:val="16"/>
+              </w:rPr>
+            </w:pPr>
+            <w:r>
+              <w:rPr>
+                <w:rFonts w:eastAsia="arial" w:ascii="arial" w:hAnsi="arial"/>
+                <w:color w:val="000000"/>
+                <w:sz w:val="16"/>
+                <w:szCs w:val="16"/>
+              </w:rPr>
+              <w:t>Cab Cam</w:t>
+            </w:r>
+          </w:p>
+        </w:tc>
+      </w:tr>
+    </w:tbl>
+    <w:p>
+      <w:pPr>
+        <w:pStyle w:val="Normal"/>
+        <w:rPr>
+          <w:color w:val="000000"/>
+          <w:sz w:val="16"/>
+          <w:szCs w:val="16"/>
+        </w:rPr>
+      </w:pPr>
+      <w:r>
+        <w:rPr>
+          <w:rFonts w:eastAsia="arial" w:ascii="arial" w:hAnsi="arial"/>
+          <w:color w:val="000000"/>
+          <w:sz w:val="16"/>
+          <w:szCs w:val="16"/>
+        </w:rPr>
+        <w:tab/>
+        <w:t xml:space="preserve">           Class 1</w:t>
       </w:r>
       <w:r>
         <w:rPr>
@@ -20583,7 +21098,565 @@
           <w:sz w:val="16"/>
           <w:szCs w:val="16"/>
         </w:rPr>
-        <w:t>8</w:t>
+        <w:t>66</w:t>
+      </w:r>
+      <w:r>
+        <w:rPr>
+          <w:rFonts w:eastAsia="arial" w:ascii="arial" w:hAnsi="arial"/>
+          <w:color w:val="000000"/>
+          <w:sz w:val="16"/>
+          <w:szCs w:val="16"/>
+        </w:rPr>
+        <w:t>-1</w:t>
+      </w:r>
+    </w:p>
+    <w:tbl>
+      <w:tblPr>
+        <w:tblW w:w="14248" w:type="dxa"/>
+        <w:jc w:val="left"/>
+        <w:tblInd w:w="-5" w:type="dxa"/>
+        <w:tblLayout w:type="fixed"/>
+        <w:tblCellMar>
+          <w:top w:w="0" w:type="dxa"/>
+          <w:left w:w="108" w:type="dxa"/>
+          <w:bottom w:w="0" w:type="dxa"/>
+          <w:right w:w="108" w:type="dxa"/>
+        </w:tblCellMar>
+        <w:tblLook w:firstRow="1" w:noVBand="1" w:lastRow="0" w:firstColumn="1" w:lastColumn="0" w:noHBand="0" w:val="04a0"/>
+      </w:tblPr>
+      <w:tblGrid>
+        <w:gridCol w:w="1017"/>
+        <w:gridCol w:w="1019"/>
+        <w:gridCol w:w="1014"/>
+        <w:gridCol w:w="1016"/>
+        <w:gridCol w:w="1020"/>
+        <w:gridCol w:w="1016"/>
+        <w:gridCol w:w="1016"/>
+        <w:gridCol w:w="1017"/>
+        <w:gridCol w:w="1016"/>
+        <w:gridCol w:w="1020"/>
+        <w:gridCol w:w="1016"/>
+        <w:gridCol w:w="1016"/>
+        <w:gridCol w:w="1016"/>
+        <w:gridCol w:w="1029"/>
+      </w:tblGrid>
+      <w:tr>
+        <w:trPr>
+          <w:trHeight w:val="440" w:hRule="exact"/>
+          <w:cantSplit w:val="true"/>
+        </w:trPr>
+        <w:tc>
+          <w:tcPr>
+            <w:tcW w:w="1017" w:type="dxa"/>
+            <w:tcBorders>
+              <w:top w:val="single" w:sz="4" w:space="0" w:color="000000"/>
+              <w:left w:val="single" w:sz="4" w:space="0" w:color="000000"/>
+              <w:bottom w:val="single" w:sz="4" w:space="0" w:color="000000"/>
+            </w:tcBorders>
+            <w:vAlign w:val="bottom"/>
+          </w:tcPr>
+          <w:p>
+            <w:pPr>
+              <w:pStyle w:val="Normal"/>
+              <w:widowControl w:val="false"/>
+              <w:spacing w:lineRule="auto" w:line="180" w:before="0" w:after="60"/>
+              <w:jc w:val="center"/>
+              <w:rPr>
+                <w:color w:val="000000"/>
+                <w:sz w:val="16"/>
+                <w:szCs w:val="16"/>
+              </w:rPr>
+            </w:pPr>
+            <w:r>
+              <w:rPr>
+                <w:rFonts w:eastAsia="arial" w:ascii="arial" w:hAnsi="arial"/>
+                <w:b/>
+                <w:color w:val="000000"/>
+                <w:sz w:val="16"/>
+                <w:szCs w:val="16"/>
+              </w:rPr>
+              <w:t>Pause</w:t>
+            </w:r>
+          </w:p>
+        </w:tc>
+        <w:tc>
+          <w:tcPr>
+            <w:tcW w:w="1019" w:type="dxa"/>
+            <w:tcBorders>
+              <w:top w:val="single" w:sz="4" w:space="0" w:color="000000"/>
+              <w:left w:val="single" w:sz="4" w:space="0" w:color="000000"/>
+              <w:bottom w:val="single" w:sz="4" w:space="0" w:color="000000"/>
+            </w:tcBorders>
+            <w:vAlign w:val="bottom"/>
+          </w:tcPr>
+          <w:p>
+            <w:pPr>
+              <w:pStyle w:val="Normal"/>
+              <w:widowControl w:val="false"/>
+              <w:spacing w:lineRule="auto" w:line="180"/>
+              <w:jc w:val="center"/>
+              <w:rPr>
+                <w:color w:val="000000"/>
+                <w:sz w:val="16"/>
+                <w:szCs w:val="16"/>
+              </w:rPr>
+            </w:pPr>
+            <w:r>
+              <w:rPr>
+                <w:color w:val="000000"/>
+                <w:sz w:val="16"/>
+                <w:szCs w:val="16"/>
+              </w:rPr>
+              <w:t>Master Key</w:t>
+            </w:r>
+          </w:p>
+        </w:tc>
+        <w:tc>
+          <w:tcPr>
+            <w:tcW w:w="1014" w:type="dxa"/>
+            <w:tcBorders>
+              <w:top w:val="single" w:sz="4" w:space="0" w:color="000000"/>
+              <w:left w:val="single" w:sz="4" w:space="0" w:color="000000"/>
+              <w:bottom w:val="single" w:sz="4" w:space="0" w:color="000000"/>
+            </w:tcBorders>
+            <w:vAlign w:val="bottom"/>
+          </w:tcPr>
+          <w:p>
+            <w:pPr>
+              <w:pStyle w:val="Normal"/>
+              <w:widowControl w:val="false"/>
+              <w:spacing w:lineRule="auto" w:line="180"/>
+              <w:jc w:val="center"/>
+              <w:rPr>
+                <w:color w:val="000000"/>
+                <w:sz w:val="16"/>
+                <w:szCs w:val="16"/>
+              </w:rPr>
+            </w:pPr>
+            <w:r>
+              <w:rPr>
+                <w:rFonts w:eastAsia="arial" w:ascii="arial" w:hAnsi="arial"/>
+                <w:color w:val="000000"/>
+                <w:sz w:val="16"/>
+                <w:szCs w:val="16"/>
+              </w:rPr>
+              <w:t>Engine Start</w:t>
+            </w:r>
+          </w:p>
+        </w:tc>
+        <w:tc>
+          <w:tcPr>
+            <w:tcW w:w="1016" w:type="dxa"/>
+            <w:tcBorders>
+              <w:top w:val="single" w:sz="4" w:space="0" w:color="000000"/>
+              <w:left w:val="single" w:sz="4" w:space="0" w:color="000000"/>
+              <w:bottom w:val="single" w:sz="4" w:space="0" w:color="000000"/>
+            </w:tcBorders>
+            <w:vAlign w:val="bottom"/>
+          </w:tcPr>
+          <w:p>
+            <w:pPr>
+              <w:pStyle w:val="Normal"/>
+              <w:widowControl w:val="false"/>
+              <w:spacing w:lineRule="auto" w:line="180"/>
+              <w:jc w:val="center"/>
+              <w:rPr>
+                <w:color w:val="000000"/>
+                <w:sz w:val="16"/>
+                <w:szCs w:val="16"/>
+              </w:rPr>
+            </w:pPr>
+            <w:r>
+              <w:rPr>
+                <w:color w:val="000000"/>
+                <w:sz w:val="16"/>
+                <w:szCs w:val="16"/>
+              </w:rPr>
+              <w:t>AWS/TPWS</w:t>
+            </w:r>
+          </w:p>
+        </w:tc>
+        <w:tc>
+          <w:tcPr>
+            <w:tcW w:w="1020" w:type="dxa"/>
+            <w:tcBorders>
+              <w:top w:val="single" w:sz="4" w:space="0" w:color="000000"/>
+              <w:left w:val="single" w:sz="4" w:space="0" w:color="000000"/>
+              <w:bottom w:val="single" w:sz="4" w:space="0" w:color="000000"/>
+            </w:tcBorders>
+            <w:vAlign w:val="bottom"/>
+          </w:tcPr>
+          <w:p>
+            <w:pPr>
+              <w:pStyle w:val="Normal"/>
+              <w:widowControl w:val="false"/>
+              <w:spacing w:lineRule="auto" w:line="180"/>
+              <w:jc w:val="center"/>
+              <w:rPr>
+                <w:color w:val="000000"/>
+                <w:sz w:val="16"/>
+                <w:szCs w:val="16"/>
+              </w:rPr>
+            </w:pPr>
+            <w:r>
+              <w:rPr>
+                <w:color w:val="000000"/>
+                <w:sz w:val="16"/>
+                <w:szCs w:val="16"/>
+              </w:rPr>
+              <w:t>Train Light On</w:t>
+            </w:r>
+          </w:p>
+        </w:tc>
+        <w:tc>
+          <w:tcPr>
+            <w:tcW w:w="1016" w:type="dxa"/>
+            <w:tcBorders>
+              <w:top w:val="single" w:sz="4" w:space="0" w:color="000000"/>
+              <w:left w:val="single" w:sz="4" w:space="0" w:color="000000"/>
+              <w:bottom w:val="single" w:sz="4" w:space="0" w:color="000000"/>
+            </w:tcBorders>
+            <w:vAlign w:val="bottom"/>
+          </w:tcPr>
+          <w:p>
+            <w:pPr>
+              <w:pStyle w:val="Normal"/>
+              <w:widowControl w:val="false"/>
+              <w:jc w:val="center"/>
+              <w:rPr>
+                <w:color w:val="000000"/>
+                <w:sz w:val="16"/>
+                <w:szCs w:val="16"/>
+              </w:rPr>
+            </w:pPr>
+            <w:r>
+              <w:rPr>
+                <w:color w:val="000000"/>
+                <w:sz w:val="16"/>
+                <w:szCs w:val="16"/>
+              </w:rPr>
+              <w:t>DRA</w:t>
+            </w:r>
+          </w:p>
+        </w:tc>
+        <w:tc>
+          <w:tcPr>
+            <w:tcW w:w="1016" w:type="dxa"/>
+            <w:tcBorders>
+              <w:top w:val="single" w:sz="4" w:space="0" w:color="000000"/>
+              <w:left w:val="single" w:sz="4" w:space="0" w:color="000000"/>
+              <w:bottom w:val="single" w:sz="4" w:space="0" w:color="000000"/>
+            </w:tcBorders>
+            <w:vAlign w:val="bottom"/>
+          </w:tcPr>
+          <w:p>
+            <w:pPr>
+              <w:pStyle w:val="Normal"/>
+              <w:widowControl w:val="false"/>
+              <w:spacing w:lineRule="auto" w:line="180"/>
+              <w:jc w:val="center"/>
+              <w:rPr>
+                <w:color w:val="000000"/>
+                <w:sz w:val="16"/>
+                <w:szCs w:val="16"/>
+              </w:rPr>
+            </w:pPr>
+            <w:r>
+              <w:rPr>
+                <w:color w:val="000000"/>
+                <w:sz w:val="16"/>
+                <w:szCs w:val="16"/>
+              </w:rPr>
+            </w:r>
+          </w:p>
+        </w:tc>
+        <w:tc>
+          <w:tcPr>
+            <w:tcW w:w="1017" w:type="dxa"/>
+            <w:tcBorders>
+              <w:top w:val="single" w:sz="4" w:space="0" w:color="000000"/>
+              <w:left w:val="single" w:sz="4" w:space="0" w:color="000000"/>
+              <w:bottom w:val="single" w:sz="4" w:space="0" w:color="000000"/>
+            </w:tcBorders>
+            <w:vAlign w:val="bottom"/>
+          </w:tcPr>
+          <w:p>
+            <w:pPr>
+              <w:pStyle w:val="Normal"/>
+              <w:widowControl w:val="false"/>
+              <w:jc w:val="center"/>
+              <w:rPr>
+                <w:color w:val="000000"/>
+                <w:sz w:val="16"/>
+                <w:szCs w:val="16"/>
+              </w:rPr>
+            </w:pPr>
+            <w:r>
+              <w:rPr>
+                <w:color w:val="000000"/>
+                <w:sz w:val="16"/>
+                <w:szCs w:val="16"/>
+              </w:rPr>
+            </w:r>
+          </w:p>
+        </w:tc>
+        <w:tc>
+          <w:tcPr>
+            <w:tcW w:w="1016" w:type="dxa"/>
+            <w:tcBorders>
+              <w:top w:val="single" w:sz="4" w:space="0" w:color="000000"/>
+              <w:left w:val="single" w:sz="4" w:space="0" w:color="000000"/>
+              <w:bottom w:val="single" w:sz="4" w:space="0" w:color="000000"/>
+            </w:tcBorders>
+            <w:vAlign w:val="bottom"/>
+          </w:tcPr>
+          <w:p>
+            <w:pPr>
+              <w:pStyle w:val="Normal"/>
+              <w:widowControl w:val="false"/>
+              <w:jc w:val="center"/>
+              <w:rPr>
+                <w:color w:val="000000"/>
+                <w:sz w:val="16"/>
+                <w:szCs w:val="16"/>
+              </w:rPr>
+            </w:pPr>
+            <w:r>
+              <w:rPr>
+                <w:color w:val="000000"/>
+                <w:sz w:val="16"/>
+                <w:szCs w:val="16"/>
+              </w:rPr>
+            </w:r>
+          </w:p>
+        </w:tc>
+        <w:tc>
+          <w:tcPr>
+            <w:tcW w:w="1020" w:type="dxa"/>
+            <w:tcBorders>
+              <w:top w:val="single" w:sz="4" w:space="0" w:color="000000"/>
+              <w:left w:val="single" w:sz="4" w:space="0" w:color="000000"/>
+              <w:bottom w:val="single" w:sz="4" w:space="0" w:color="000000"/>
+            </w:tcBorders>
+            <w:vAlign w:val="bottom"/>
+          </w:tcPr>
+          <w:p>
+            <w:pPr>
+              <w:pStyle w:val="Normal"/>
+              <w:widowControl w:val="false"/>
+              <w:jc w:val="center"/>
+              <w:rPr>
+                <w:color w:val="000000"/>
+                <w:sz w:val="16"/>
+                <w:szCs w:val="16"/>
+              </w:rPr>
+            </w:pPr>
+            <w:r>
+              <w:rPr>
+                <w:color w:val="000000"/>
+                <w:sz w:val="16"/>
+                <w:szCs w:val="16"/>
+              </w:rPr>
+            </w:r>
+          </w:p>
+        </w:tc>
+        <w:tc>
+          <w:tcPr>
+            <w:tcW w:w="1016" w:type="dxa"/>
+            <w:tcBorders>
+              <w:top w:val="single" w:sz="4" w:space="0" w:color="000000"/>
+              <w:left w:val="single" w:sz="4" w:space="0" w:color="000000"/>
+              <w:bottom w:val="single" w:sz="4" w:space="0" w:color="000000"/>
+            </w:tcBorders>
+            <w:vAlign w:val="bottom"/>
+          </w:tcPr>
+          <w:p>
+            <w:pPr>
+              <w:pStyle w:val="Normal"/>
+              <w:widowControl w:val="false"/>
+              <w:spacing w:lineRule="auto" w:line="180"/>
+              <w:jc w:val="center"/>
+              <w:rPr>
+                <w:sz w:val="16"/>
+                <w:szCs w:val="16"/>
+              </w:rPr>
+            </w:pPr>
+            <w:r>
+              <w:rPr>
+                <w:rFonts w:eastAsia="arial" w:ascii="arial" w:hAnsi="arial"/>
+                <w:color w:val="000000"/>
+                <w:sz w:val="16"/>
+                <w:szCs w:val="16"/>
+              </w:rPr>
+              <w:t>Cab Light</w:t>
+            </w:r>
+          </w:p>
+        </w:tc>
+        <w:tc>
+          <w:tcPr>
+            <w:tcW w:w="1016" w:type="dxa"/>
+            <w:tcBorders>
+              <w:top w:val="single" w:sz="4" w:space="0" w:color="000000"/>
+              <w:left w:val="single" w:sz="4" w:space="0" w:color="000000"/>
+              <w:bottom w:val="single" w:sz="4" w:space="0" w:color="000000"/>
+            </w:tcBorders>
+            <w:vAlign w:val="bottom"/>
+          </w:tcPr>
+          <w:p>
+            <w:pPr>
+              <w:pStyle w:val="Normal"/>
+              <w:widowControl w:val="false"/>
+              <w:jc w:val="center"/>
+              <w:rPr>
+                <w:color w:val="000000"/>
+                <w:sz w:val="16"/>
+                <w:szCs w:val="16"/>
+              </w:rPr>
+            </w:pPr>
+            <w:r>
+              <w:rPr>
+                <w:color w:val="000000"/>
+                <w:sz w:val="16"/>
+                <w:szCs w:val="16"/>
+              </w:rPr>
+              <w:t>Couple</w:t>
+            </w:r>
+          </w:p>
+        </w:tc>
+        <w:tc>
+          <w:tcPr>
+            <w:tcW w:w="1016" w:type="dxa"/>
+            <w:tcBorders>
+              <w:top w:val="single" w:sz="4" w:space="0" w:color="000000"/>
+              <w:left w:val="single" w:sz="4" w:space="0" w:color="000000"/>
+              <w:bottom w:val="single" w:sz="4" w:space="0" w:color="000000"/>
+            </w:tcBorders>
+            <w:vAlign w:val="bottom"/>
+          </w:tcPr>
+          <w:p>
+            <w:pPr>
+              <w:pStyle w:val="Normal"/>
+              <w:widowControl w:val="false"/>
+              <w:spacing w:lineRule="auto" w:line="180"/>
+              <w:jc w:val="center"/>
+              <w:rPr>
+                <w:sz w:val="16"/>
+                <w:szCs w:val="16"/>
+              </w:rPr>
+            </w:pPr>
+            <w:r>
+              <w:rPr>
+                <w:rFonts w:eastAsia="arial" w:ascii="arial" w:hAnsi="arial"/>
+                <w:color w:val="000000"/>
+                <w:sz w:val="16"/>
+                <w:szCs w:val="16"/>
+              </w:rPr>
+              <w:t>1-Person</w:t>
+            </w:r>
+          </w:p>
+        </w:tc>
+        <w:tc>
+          <w:tcPr>
+            <w:tcW w:w="1029" w:type="dxa"/>
+            <w:tcBorders>
+              <w:top w:val="single" w:sz="4" w:space="0" w:color="000000"/>
+              <w:left w:val="single" w:sz="4" w:space="0" w:color="000000"/>
+              <w:bottom w:val="single" w:sz="4" w:space="0" w:color="000000"/>
+              <w:right w:val="single" w:sz="4" w:space="0" w:color="000000"/>
+            </w:tcBorders>
+            <w:vAlign w:val="bottom"/>
+          </w:tcPr>
+          <w:p>
+            <w:pPr>
+              <w:pStyle w:val="Normal"/>
+              <w:widowControl w:val="false"/>
+              <w:spacing w:lineRule="auto" w:line="180"/>
+              <w:jc w:val="center"/>
+              <w:rPr>
+                <w:sz w:val="16"/>
+                <w:szCs w:val="16"/>
+              </w:rPr>
+            </w:pPr>
+            <w:r>
+              <w:rPr>
+                <w:rFonts w:eastAsia="arial" w:ascii="arial" w:hAnsi="arial"/>
+                <w:color w:val="000000"/>
+                <w:sz w:val="16"/>
+                <w:szCs w:val="16"/>
+              </w:rPr>
+              <w:t>Next</w:t>
+            </w:r>
+          </w:p>
+          <w:p>
+            <w:pPr>
+              <w:pStyle w:val="Normal"/>
+              <w:widowControl w:val="false"/>
+              <w:spacing w:lineRule="auto" w:line="180"/>
+              <w:jc w:val="center"/>
+              <w:rPr>
+                <w:sz w:val="16"/>
+                <w:szCs w:val="16"/>
+              </w:rPr>
+            </w:pPr>
+            <w:r>
+              <w:rPr>
+                <w:rFonts w:eastAsia="arial" w:ascii="arial" w:hAnsi="arial"/>
+                <w:color w:val="000000"/>
+                <w:sz w:val="16"/>
+                <w:szCs w:val="16"/>
+              </w:rPr>
+              <w:t>Cab Cam</w:t>
+            </w:r>
+          </w:p>
+        </w:tc>
+      </w:tr>
+    </w:tbl>
+    <w:p>
+      <w:pPr>
+        <w:pStyle w:val="Normal"/>
+        <w:rPr>
+          <w:rFonts w:ascii="arial" w:hAnsi="arial" w:eastAsia="arial"/>
+          <w:color w:val="000000"/>
+          <w:sz w:val="16"/>
+          <w:szCs w:val="16"/>
+        </w:rPr>
+      </w:pPr>
+      <w:r>
+        <w:rPr>
+          <w:rFonts w:eastAsia="arial" w:ascii="arial" w:hAnsi="arial"/>
+          <w:color w:val="000000"/>
+          <w:sz w:val="16"/>
+          <w:szCs w:val="16"/>
+        </w:rPr>
+      </w:r>
+    </w:p>
+    <w:p>
+      <w:pPr>
+        <w:pStyle w:val="Normal"/>
+        <w:rPr>
+          <w:color w:val="000000"/>
+          <w:sz w:val="16"/>
+          <w:szCs w:val="16"/>
+        </w:rPr>
+      </w:pPr>
+      <w:r>
+        <w:rPr>
+          <w:rFonts w:eastAsia="arial" w:ascii="arial" w:hAnsi="arial"/>
+          <w:color w:val="000000"/>
+          <w:sz w:val="16"/>
+          <w:szCs w:val="16"/>
+        </w:rPr>
+        <w:tab/>
+        <w:t xml:space="preserve">           Class 1</w:t>
+      </w:r>
+      <w:r>
+        <w:rPr>
+          <w:rFonts w:eastAsia="arial" w:ascii="arial" w:hAnsi="arial"/>
+          <w:color w:val="000000"/>
+          <w:sz w:val="16"/>
+          <w:szCs w:val="16"/>
+        </w:rPr>
+        <w:t>66</w:t>
       </w:r>
       <w:r>
         <w:rPr>
@@ -20905,7 +21978,11 @@
               </w:rPr>
             </w:pPr>
             <w:r>
-              <w:rPr/>
+              <w:rPr>
+                <w:color w:val="000000"/>
+                <w:sz w:val="16"/>
+                <w:szCs w:val="16"/>
+              </w:rPr>
             </w:r>
           </w:p>
         </w:tc>
@@ -20931,37 +22008,1174 @@
               </w:rPr>
             </w:pPr>
             <w:r>
-              <w:rPr/>
-            </w:r>
-          </w:p>
-        </w:tc>
-        <w:tc>
-          <w:tcPr>
-            <w:tcW w:w="1016" w:type="dxa"/>
-            <w:tcBorders>
-              <w:top w:val="single" w:sz="4" w:space="0" w:color="000000"/>
-              <w:left w:val="single" w:sz="4" w:space="0" w:color="000000"/>
-              <w:bottom w:val="single" w:sz="4" w:space="0" w:color="000000"/>
-            </w:tcBorders>
-            <w:vAlign w:val="bottom"/>
-          </w:tcPr>
-          <w:p>
-            <w:pPr>
-              <w:pStyle w:val="Normal"/>
-              <w:widowControl w:val="false"/>
-              <w:spacing w:lineRule="auto" w:line="180"/>
-              <w:jc w:val="center"/>
-              <w:rPr>
-                <w:sz w:val="16"/>
-                <w:szCs w:val="16"/>
-              </w:rPr>
-            </w:pPr>
-            <w:r>
-              <w:rPr>
-                <w:sz w:val="16"/>
-                <w:szCs w:val="16"/>
-              </w:rPr>
-              <w:t>Instrument Light</w:t>
+              <w:rPr>
+                <w:color w:val="000000"/>
+                <w:sz w:val="16"/>
+                <w:szCs w:val="16"/>
+              </w:rPr>
+            </w:r>
+          </w:p>
+        </w:tc>
+        <w:tc>
+          <w:tcPr>
+            <w:tcW w:w="1016" w:type="dxa"/>
+            <w:tcBorders>
+              <w:top w:val="single" w:sz="4" w:space="0" w:color="000000"/>
+              <w:left w:val="single" w:sz="4" w:space="0" w:color="000000"/>
+              <w:bottom w:val="single" w:sz="4" w:space="0" w:color="000000"/>
+            </w:tcBorders>
+            <w:vAlign w:val="bottom"/>
+          </w:tcPr>
+          <w:p>
+            <w:pPr>
+              <w:pStyle w:val="Normal"/>
+              <w:widowControl w:val="false"/>
+              <w:jc w:val="center"/>
+              <w:rPr>
+                <w:color w:val="000000"/>
+                <w:sz w:val="16"/>
+                <w:szCs w:val="16"/>
+              </w:rPr>
+            </w:pPr>
+            <w:r>
+              <w:rPr>
+                <w:color w:val="000000"/>
+                <w:sz w:val="16"/>
+                <w:szCs w:val="16"/>
+              </w:rPr>
+              <w:t>Gauge Light</w:t>
+            </w:r>
+          </w:p>
+        </w:tc>
+        <w:tc>
+          <w:tcPr>
+            <w:tcW w:w="1016" w:type="dxa"/>
+            <w:tcBorders>
+              <w:top w:val="single" w:sz="4" w:space="0" w:color="000000"/>
+              <w:left w:val="single" w:sz="4" w:space="0" w:color="000000"/>
+              <w:bottom w:val="single" w:sz="4" w:space="0" w:color="000000"/>
+            </w:tcBorders>
+            <w:vAlign w:val="bottom"/>
+          </w:tcPr>
+          <w:p>
+            <w:pPr>
+              <w:pStyle w:val="Normal"/>
+              <w:widowControl w:val="false"/>
+              <w:spacing w:lineRule="auto" w:line="180"/>
+              <w:jc w:val="center"/>
+              <w:rPr>
+                <w:sz w:val="16"/>
+                <w:szCs w:val="16"/>
+              </w:rPr>
+            </w:pPr>
+            <w:r>
+              <w:rPr>
+                <w:sz w:val="16"/>
+                <w:szCs w:val="16"/>
+              </w:rPr>
+              <w:t>Uncouple</w:t>
+            </w:r>
+          </w:p>
+        </w:tc>
+        <w:tc>
+          <w:tcPr>
+            <w:tcW w:w="1016" w:type="dxa"/>
+            <w:tcBorders>
+              <w:top w:val="single" w:sz="4" w:space="0" w:color="000000"/>
+              <w:left w:val="single" w:sz="4" w:space="0" w:color="000000"/>
+              <w:bottom w:val="single" w:sz="4" w:space="0" w:color="000000"/>
+            </w:tcBorders>
+            <w:vAlign w:val="bottom"/>
+          </w:tcPr>
+          <w:p>
+            <w:pPr>
+              <w:pStyle w:val="Normal"/>
+              <w:widowControl w:val="false"/>
+              <w:spacing w:lineRule="auto" w:line="180"/>
+              <w:jc w:val="center"/>
+              <w:rPr>
+                <w:sz w:val="16"/>
+                <w:szCs w:val="16"/>
+              </w:rPr>
+            </w:pPr>
+            <w:r>
+              <w:rPr>
+                <w:rFonts w:eastAsia="arial" w:ascii="arial" w:hAnsi="arial"/>
+                <w:color w:val="000000"/>
+                <w:sz w:val="16"/>
+                <w:szCs w:val="16"/>
+              </w:rPr>
+              <w:t>Exterior</w:t>
+            </w:r>
+          </w:p>
+          <w:p>
+            <w:pPr>
+              <w:pStyle w:val="Normal"/>
+              <w:widowControl w:val="false"/>
+              <w:spacing w:lineRule="auto" w:line="180"/>
+              <w:jc w:val="center"/>
+              <w:rPr>
+                <w:sz w:val="16"/>
+                <w:szCs w:val="16"/>
+              </w:rPr>
+            </w:pPr>
+            <w:r>
+              <w:rPr>
+                <w:rFonts w:eastAsia="arial" w:ascii="arial" w:hAnsi="arial"/>
+                <w:color w:val="000000"/>
+                <w:sz w:val="16"/>
+                <w:szCs w:val="16"/>
+              </w:rPr>
+              <w:t>Camera</w:t>
+            </w:r>
+          </w:p>
+        </w:tc>
+        <w:tc>
+          <w:tcPr>
+            <w:tcW w:w="1029" w:type="dxa"/>
+            <w:tcBorders>
+              <w:top w:val="single" w:sz="4" w:space="0" w:color="000000"/>
+              <w:left w:val="single" w:sz="4" w:space="0" w:color="000000"/>
+              <w:bottom w:val="single" w:sz="4" w:space="0" w:color="000000"/>
+              <w:right w:val="single" w:sz="4" w:space="0" w:color="000000"/>
+            </w:tcBorders>
+            <w:vAlign w:val="bottom"/>
+          </w:tcPr>
+          <w:p>
+            <w:pPr>
+              <w:pStyle w:val="Normal"/>
+              <w:widowControl w:val="false"/>
+              <w:spacing w:lineRule="auto" w:line="180"/>
+              <w:jc w:val="center"/>
+              <w:rPr>
+                <w:sz w:val="16"/>
+                <w:szCs w:val="16"/>
+              </w:rPr>
+            </w:pPr>
+            <w:r>
+              <w:rPr>
+                <w:rFonts w:eastAsia="arial" w:ascii="arial" w:hAnsi="arial"/>
+                <w:color w:val="000000"/>
+                <w:sz w:val="16"/>
+                <w:szCs w:val="16"/>
+              </w:rPr>
+              <w:t>Prev</w:t>
+            </w:r>
+          </w:p>
+          <w:p>
+            <w:pPr>
+              <w:pStyle w:val="Normal"/>
+              <w:widowControl w:val="false"/>
+              <w:spacing w:lineRule="auto" w:line="180"/>
+              <w:jc w:val="center"/>
+              <w:rPr>
+                <w:sz w:val="16"/>
+                <w:szCs w:val="16"/>
+              </w:rPr>
+            </w:pPr>
+            <w:r>
+              <w:rPr>
+                <w:rFonts w:eastAsia="arial" w:ascii="arial" w:hAnsi="arial"/>
+                <w:color w:val="000000"/>
+                <w:sz w:val="16"/>
+                <w:szCs w:val="16"/>
+              </w:rPr>
+              <w:t>Cab Cam</w:t>
+            </w:r>
+          </w:p>
+        </w:tc>
+      </w:tr>
+    </w:tbl>
+    <w:p>
+      <w:pPr>
+        <w:pStyle w:val="Normal"/>
+        <w:rPr>
+          <w:color w:val="000000"/>
+          <w:sz w:val="16"/>
+          <w:szCs w:val="16"/>
+        </w:rPr>
+      </w:pPr>
+      <w:r>
+        <w:rPr>
+          <w:color w:val="000000"/>
+          <w:sz w:val="16"/>
+          <w:szCs w:val="16"/>
+        </w:rPr>
+      </w:r>
+    </w:p>
+    <w:p>
+      <w:pPr>
+        <w:pStyle w:val="Normal"/>
+        <w:rPr>
+          <w:color w:val="000000"/>
+          <w:sz w:val="16"/>
+          <w:szCs w:val="16"/>
+        </w:rPr>
+      </w:pPr>
+      <w:r>
+        <w:rPr>
+          <w:rFonts w:eastAsia="arial" w:ascii="arial" w:hAnsi="arial"/>
+          <w:color w:val="000000"/>
+          <w:sz w:val="16"/>
+          <w:szCs w:val="16"/>
+        </w:rPr>
+        <w:tab/>
+        <w:t xml:space="preserve">           Class 1</w:t>
+      </w:r>
+      <w:r>
+        <w:rPr>
+          <w:rFonts w:eastAsia="arial" w:ascii="arial" w:hAnsi="arial"/>
+          <w:color w:val="000000"/>
+          <w:sz w:val="16"/>
+          <w:szCs w:val="16"/>
+        </w:rPr>
+        <w:t>70/171</w:t>
+      </w:r>
+      <w:r>
+        <w:rPr>
+          <w:rFonts w:eastAsia="arial" w:ascii="arial" w:hAnsi="arial"/>
+          <w:color w:val="000000"/>
+          <w:sz w:val="16"/>
+          <w:szCs w:val="16"/>
+        </w:rPr>
+        <w:t>-1</w:t>
+      </w:r>
+    </w:p>
+    <w:tbl>
+      <w:tblPr>
+        <w:tblW w:w="14248" w:type="dxa"/>
+        <w:jc w:val="left"/>
+        <w:tblInd w:w="-5" w:type="dxa"/>
+        <w:tblLayout w:type="fixed"/>
+        <w:tblCellMar>
+          <w:top w:w="0" w:type="dxa"/>
+          <w:left w:w="108" w:type="dxa"/>
+          <w:bottom w:w="0" w:type="dxa"/>
+          <w:right w:w="108" w:type="dxa"/>
+        </w:tblCellMar>
+        <w:tblLook w:firstRow="1" w:noVBand="1" w:lastRow="0" w:firstColumn="1" w:lastColumn="0" w:noHBand="0" w:val="04a0"/>
+      </w:tblPr>
+      <w:tblGrid>
+        <w:gridCol w:w="1017"/>
+        <w:gridCol w:w="1019"/>
+        <w:gridCol w:w="1014"/>
+        <w:gridCol w:w="1016"/>
+        <w:gridCol w:w="1020"/>
+        <w:gridCol w:w="1016"/>
+        <w:gridCol w:w="1016"/>
+        <w:gridCol w:w="1017"/>
+        <w:gridCol w:w="1016"/>
+        <w:gridCol w:w="1020"/>
+        <w:gridCol w:w="1016"/>
+        <w:gridCol w:w="1016"/>
+        <w:gridCol w:w="1016"/>
+        <w:gridCol w:w="1029"/>
+      </w:tblGrid>
+      <w:tr>
+        <w:trPr>
+          <w:trHeight w:val="440" w:hRule="exact"/>
+          <w:cantSplit w:val="true"/>
+        </w:trPr>
+        <w:tc>
+          <w:tcPr>
+            <w:tcW w:w="1017" w:type="dxa"/>
+            <w:tcBorders>
+              <w:top w:val="single" w:sz="4" w:space="0" w:color="000000"/>
+              <w:left w:val="single" w:sz="4" w:space="0" w:color="000000"/>
+              <w:bottom w:val="single" w:sz="4" w:space="0" w:color="000000"/>
+            </w:tcBorders>
+            <w:vAlign w:val="bottom"/>
+          </w:tcPr>
+          <w:p>
+            <w:pPr>
+              <w:pStyle w:val="Normal"/>
+              <w:widowControl w:val="false"/>
+              <w:spacing w:lineRule="auto" w:line="180" w:before="0" w:after="60"/>
+              <w:jc w:val="center"/>
+              <w:rPr>
+                <w:color w:val="000000"/>
+                <w:sz w:val="16"/>
+                <w:szCs w:val="16"/>
+              </w:rPr>
+            </w:pPr>
+            <w:r>
+              <w:rPr>
+                <w:rFonts w:eastAsia="arial" w:ascii="arial" w:hAnsi="arial"/>
+                <w:b/>
+                <w:color w:val="000000"/>
+                <w:sz w:val="16"/>
+                <w:szCs w:val="16"/>
+              </w:rPr>
+              <w:t>Pause</w:t>
+            </w:r>
+          </w:p>
+        </w:tc>
+        <w:tc>
+          <w:tcPr>
+            <w:tcW w:w="1019" w:type="dxa"/>
+            <w:tcBorders>
+              <w:top w:val="single" w:sz="4" w:space="0" w:color="000000"/>
+              <w:left w:val="single" w:sz="4" w:space="0" w:color="000000"/>
+              <w:bottom w:val="single" w:sz="4" w:space="0" w:color="000000"/>
+            </w:tcBorders>
+            <w:vAlign w:val="bottom"/>
+          </w:tcPr>
+          <w:p>
+            <w:pPr>
+              <w:pStyle w:val="Normal"/>
+              <w:widowControl w:val="false"/>
+              <w:spacing w:lineRule="auto" w:line="180"/>
+              <w:jc w:val="center"/>
+              <w:rPr>
+                <w:color w:val="000000"/>
+                <w:sz w:val="16"/>
+                <w:szCs w:val="16"/>
+              </w:rPr>
+            </w:pPr>
+            <w:r>
+              <w:rPr>
+                <w:color w:val="000000"/>
+                <w:sz w:val="16"/>
+                <w:szCs w:val="16"/>
+              </w:rPr>
+              <w:t>Master Key</w:t>
+            </w:r>
+          </w:p>
+        </w:tc>
+        <w:tc>
+          <w:tcPr>
+            <w:tcW w:w="1014" w:type="dxa"/>
+            <w:tcBorders>
+              <w:top w:val="single" w:sz="4" w:space="0" w:color="000000"/>
+              <w:left w:val="single" w:sz="4" w:space="0" w:color="000000"/>
+              <w:bottom w:val="single" w:sz="4" w:space="0" w:color="000000"/>
+            </w:tcBorders>
+            <w:vAlign w:val="bottom"/>
+          </w:tcPr>
+          <w:p>
+            <w:pPr>
+              <w:pStyle w:val="Normal"/>
+              <w:widowControl w:val="false"/>
+              <w:spacing w:lineRule="auto" w:line="180"/>
+              <w:jc w:val="center"/>
+              <w:rPr>
+                <w:color w:val="000000"/>
+                <w:sz w:val="16"/>
+                <w:szCs w:val="16"/>
+              </w:rPr>
+            </w:pPr>
+            <w:r>
+              <w:rPr>
+                <w:rFonts w:eastAsia="arial" w:ascii="arial" w:hAnsi="arial"/>
+                <w:color w:val="000000"/>
+                <w:sz w:val="16"/>
+                <w:szCs w:val="16"/>
+              </w:rPr>
+              <w:t>Engine Start</w:t>
+            </w:r>
+          </w:p>
+        </w:tc>
+        <w:tc>
+          <w:tcPr>
+            <w:tcW w:w="1016" w:type="dxa"/>
+            <w:tcBorders>
+              <w:top w:val="single" w:sz="4" w:space="0" w:color="000000"/>
+              <w:left w:val="single" w:sz="4" w:space="0" w:color="000000"/>
+              <w:bottom w:val="single" w:sz="4" w:space="0" w:color="000000"/>
+            </w:tcBorders>
+            <w:vAlign w:val="bottom"/>
+          </w:tcPr>
+          <w:p>
+            <w:pPr>
+              <w:pStyle w:val="Normal"/>
+              <w:widowControl w:val="false"/>
+              <w:spacing w:lineRule="auto" w:line="180"/>
+              <w:jc w:val="center"/>
+              <w:rPr>
+                <w:color w:val="000000"/>
+                <w:sz w:val="16"/>
+                <w:szCs w:val="16"/>
+              </w:rPr>
+            </w:pPr>
+            <w:r>
+              <w:rPr>
+                <w:color w:val="000000"/>
+                <w:sz w:val="16"/>
+                <w:szCs w:val="16"/>
+              </w:rPr>
+              <w:t>AWS/TPWS</w:t>
+            </w:r>
+          </w:p>
+        </w:tc>
+        <w:tc>
+          <w:tcPr>
+            <w:tcW w:w="1020" w:type="dxa"/>
+            <w:tcBorders>
+              <w:top w:val="single" w:sz="4" w:space="0" w:color="000000"/>
+              <w:left w:val="single" w:sz="4" w:space="0" w:color="000000"/>
+              <w:bottom w:val="single" w:sz="4" w:space="0" w:color="000000"/>
+            </w:tcBorders>
+            <w:vAlign w:val="bottom"/>
+          </w:tcPr>
+          <w:p>
+            <w:pPr>
+              <w:pStyle w:val="Normal"/>
+              <w:widowControl w:val="false"/>
+              <w:spacing w:lineRule="auto" w:line="180"/>
+              <w:jc w:val="center"/>
+              <w:rPr>
+                <w:color w:val="000000"/>
+                <w:sz w:val="16"/>
+                <w:szCs w:val="16"/>
+              </w:rPr>
+            </w:pPr>
+            <w:r>
+              <w:rPr>
+                <w:color w:val="000000"/>
+                <w:sz w:val="16"/>
+                <w:szCs w:val="16"/>
+              </w:rPr>
+              <w:t>Train Light On</w:t>
+            </w:r>
+          </w:p>
+        </w:tc>
+        <w:tc>
+          <w:tcPr>
+            <w:tcW w:w="1016" w:type="dxa"/>
+            <w:tcBorders>
+              <w:top w:val="single" w:sz="4" w:space="0" w:color="000000"/>
+              <w:left w:val="single" w:sz="4" w:space="0" w:color="000000"/>
+              <w:bottom w:val="single" w:sz="4" w:space="0" w:color="000000"/>
+            </w:tcBorders>
+            <w:vAlign w:val="bottom"/>
+          </w:tcPr>
+          <w:p>
+            <w:pPr>
+              <w:pStyle w:val="Normal"/>
+              <w:widowControl w:val="false"/>
+              <w:jc w:val="center"/>
+              <w:rPr>
+                <w:color w:val="000000"/>
+                <w:sz w:val="16"/>
+                <w:szCs w:val="16"/>
+              </w:rPr>
+            </w:pPr>
+            <w:r>
+              <w:rPr>
+                <w:color w:val="000000"/>
+                <w:sz w:val="16"/>
+                <w:szCs w:val="16"/>
+              </w:rPr>
+              <w:t>DRA</w:t>
+            </w:r>
+          </w:p>
+        </w:tc>
+        <w:tc>
+          <w:tcPr>
+            <w:tcW w:w="1016" w:type="dxa"/>
+            <w:tcBorders>
+              <w:top w:val="single" w:sz="4" w:space="0" w:color="000000"/>
+              <w:left w:val="single" w:sz="4" w:space="0" w:color="000000"/>
+              <w:bottom w:val="single" w:sz="4" w:space="0" w:color="000000"/>
+            </w:tcBorders>
+            <w:vAlign w:val="bottom"/>
+          </w:tcPr>
+          <w:p>
+            <w:pPr>
+              <w:pStyle w:val="Normal"/>
+              <w:widowControl w:val="false"/>
+              <w:spacing w:lineRule="auto" w:line="180"/>
+              <w:jc w:val="center"/>
+              <w:rPr>
+                <w:color w:val="000000"/>
+                <w:sz w:val="16"/>
+                <w:szCs w:val="16"/>
+              </w:rPr>
+            </w:pPr>
+            <w:r>
+              <w:rPr>
+                <w:color w:val="000000"/>
+                <w:sz w:val="16"/>
+                <w:szCs w:val="16"/>
+              </w:rPr>
+            </w:r>
+          </w:p>
+        </w:tc>
+        <w:tc>
+          <w:tcPr>
+            <w:tcW w:w="1017" w:type="dxa"/>
+            <w:tcBorders>
+              <w:top w:val="single" w:sz="4" w:space="0" w:color="000000"/>
+              <w:left w:val="single" w:sz="4" w:space="0" w:color="000000"/>
+              <w:bottom w:val="single" w:sz="4" w:space="0" w:color="000000"/>
+            </w:tcBorders>
+            <w:vAlign w:val="bottom"/>
+          </w:tcPr>
+          <w:p>
+            <w:pPr>
+              <w:pStyle w:val="Normal"/>
+              <w:widowControl w:val="false"/>
+              <w:jc w:val="center"/>
+              <w:rPr>
+                <w:color w:val="000000"/>
+                <w:sz w:val="16"/>
+                <w:szCs w:val="16"/>
+              </w:rPr>
+            </w:pPr>
+            <w:r>
+              <w:rPr>
+                <w:color w:val="000000"/>
+                <w:sz w:val="16"/>
+                <w:szCs w:val="16"/>
+              </w:rPr>
+            </w:r>
+          </w:p>
+        </w:tc>
+        <w:tc>
+          <w:tcPr>
+            <w:tcW w:w="1016" w:type="dxa"/>
+            <w:tcBorders>
+              <w:top w:val="single" w:sz="4" w:space="0" w:color="000000"/>
+              <w:left w:val="single" w:sz="4" w:space="0" w:color="000000"/>
+              <w:bottom w:val="single" w:sz="4" w:space="0" w:color="000000"/>
+            </w:tcBorders>
+            <w:vAlign w:val="bottom"/>
+          </w:tcPr>
+          <w:p>
+            <w:pPr>
+              <w:pStyle w:val="Normal"/>
+              <w:widowControl w:val="false"/>
+              <w:jc w:val="center"/>
+              <w:rPr>
+                <w:color w:val="000000"/>
+                <w:sz w:val="16"/>
+                <w:szCs w:val="16"/>
+              </w:rPr>
+            </w:pPr>
+            <w:r>
+              <w:rPr>
+                <w:color w:val="000000"/>
+                <w:sz w:val="16"/>
+                <w:szCs w:val="16"/>
+              </w:rPr>
+            </w:r>
+          </w:p>
+        </w:tc>
+        <w:tc>
+          <w:tcPr>
+            <w:tcW w:w="1020" w:type="dxa"/>
+            <w:tcBorders>
+              <w:top w:val="single" w:sz="4" w:space="0" w:color="000000"/>
+              <w:left w:val="single" w:sz="4" w:space="0" w:color="000000"/>
+              <w:bottom w:val="single" w:sz="4" w:space="0" w:color="000000"/>
+            </w:tcBorders>
+            <w:vAlign w:val="bottom"/>
+          </w:tcPr>
+          <w:p>
+            <w:pPr>
+              <w:pStyle w:val="Normal"/>
+              <w:widowControl w:val="false"/>
+              <w:jc w:val="center"/>
+              <w:rPr>
+                <w:color w:val="000000"/>
+                <w:sz w:val="16"/>
+                <w:szCs w:val="16"/>
+              </w:rPr>
+            </w:pPr>
+            <w:r>
+              <w:rPr>
+                <w:color w:val="000000"/>
+                <w:sz w:val="16"/>
+                <w:szCs w:val="16"/>
+              </w:rPr>
+              <w:t>Tail Light</w:t>
+            </w:r>
+          </w:p>
+        </w:tc>
+        <w:tc>
+          <w:tcPr>
+            <w:tcW w:w="1016" w:type="dxa"/>
+            <w:tcBorders>
+              <w:top w:val="single" w:sz="4" w:space="0" w:color="000000"/>
+              <w:left w:val="single" w:sz="4" w:space="0" w:color="000000"/>
+              <w:bottom w:val="single" w:sz="4" w:space="0" w:color="000000"/>
+            </w:tcBorders>
+            <w:vAlign w:val="bottom"/>
+          </w:tcPr>
+          <w:p>
+            <w:pPr>
+              <w:pStyle w:val="Normal"/>
+              <w:widowControl w:val="false"/>
+              <w:spacing w:lineRule="auto" w:line="180"/>
+              <w:jc w:val="center"/>
+              <w:rPr>
+                <w:sz w:val="16"/>
+                <w:szCs w:val="16"/>
+              </w:rPr>
+            </w:pPr>
+            <w:r>
+              <w:rPr>
+                <w:rFonts w:eastAsia="arial" w:ascii="arial" w:hAnsi="arial"/>
+                <w:color w:val="000000"/>
+                <w:sz w:val="16"/>
+                <w:szCs w:val="16"/>
+              </w:rPr>
+              <w:t>Cab Light</w:t>
+            </w:r>
+          </w:p>
+        </w:tc>
+        <w:tc>
+          <w:tcPr>
+            <w:tcW w:w="1016" w:type="dxa"/>
+            <w:tcBorders>
+              <w:top w:val="single" w:sz="4" w:space="0" w:color="000000"/>
+              <w:left w:val="single" w:sz="4" w:space="0" w:color="000000"/>
+              <w:bottom w:val="single" w:sz="4" w:space="0" w:color="000000"/>
+            </w:tcBorders>
+            <w:vAlign w:val="bottom"/>
+          </w:tcPr>
+          <w:p>
+            <w:pPr>
+              <w:pStyle w:val="Normal"/>
+              <w:widowControl w:val="false"/>
+              <w:jc w:val="center"/>
+              <w:rPr>
+                <w:color w:val="000000"/>
+                <w:sz w:val="16"/>
+                <w:szCs w:val="16"/>
+              </w:rPr>
+            </w:pPr>
+            <w:r>
+              <w:rPr>
+                <w:color w:val="000000"/>
+                <w:sz w:val="16"/>
+                <w:szCs w:val="16"/>
+              </w:rPr>
+              <w:t>Couple</w:t>
+            </w:r>
+          </w:p>
+        </w:tc>
+        <w:tc>
+          <w:tcPr>
+            <w:tcW w:w="1016" w:type="dxa"/>
+            <w:tcBorders>
+              <w:top w:val="single" w:sz="4" w:space="0" w:color="000000"/>
+              <w:left w:val="single" w:sz="4" w:space="0" w:color="000000"/>
+              <w:bottom w:val="single" w:sz="4" w:space="0" w:color="000000"/>
+            </w:tcBorders>
+            <w:vAlign w:val="bottom"/>
+          </w:tcPr>
+          <w:p>
+            <w:pPr>
+              <w:pStyle w:val="Normal"/>
+              <w:widowControl w:val="false"/>
+              <w:spacing w:lineRule="auto" w:line="180"/>
+              <w:jc w:val="center"/>
+              <w:rPr>
+                <w:sz w:val="16"/>
+                <w:szCs w:val="16"/>
+              </w:rPr>
+            </w:pPr>
+            <w:r>
+              <w:rPr>
+                <w:rFonts w:eastAsia="arial" w:ascii="arial" w:hAnsi="arial"/>
+                <w:color w:val="000000"/>
+                <w:sz w:val="16"/>
+                <w:szCs w:val="16"/>
+              </w:rPr>
+              <w:t>1-Person</w:t>
+            </w:r>
+          </w:p>
+        </w:tc>
+        <w:tc>
+          <w:tcPr>
+            <w:tcW w:w="1029" w:type="dxa"/>
+            <w:tcBorders>
+              <w:top w:val="single" w:sz="4" w:space="0" w:color="000000"/>
+              <w:left w:val="single" w:sz="4" w:space="0" w:color="000000"/>
+              <w:bottom w:val="single" w:sz="4" w:space="0" w:color="000000"/>
+              <w:right w:val="single" w:sz="4" w:space="0" w:color="000000"/>
+            </w:tcBorders>
+            <w:vAlign w:val="bottom"/>
+          </w:tcPr>
+          <w:p>
+            <w:pPr>
+              <w:pStyle w:val="Normal"/>
+              <w:widowControl w:val="false"/>
+              <w:spacing w:lineRule="auto" w:line="180"/>
+              <w:jc w:val="center"/>
+              <w:rPr>
+                <w:sz w:val="16"/>
+                <w:szCs w:val="16"/>
+              </w:rPr>
+            </w:pPr>
+            <w:r>
+              <w:rPr>
+                <w:rFonts w:eastAsia="arial" w:ascii="arial" w:hAnsi="arial"/>
+                <w:color w:val="000000"/>
+                <w:sz w:val="16"/>
+                <w:szCs w:val="16"/>
+              </w:rPr>
+              <w:t>Next</w:t>
+            </w:r>
+          </w:p>
+          <w:p>
+            <w:pPr>
+              <w:pStyle w:val="Normal"/>
+              <w:widowControl w:val="false"/>
+              <w:spacing w:lineRule="auto" w:line="180"/>
+              <w:jc w:val="center"/>
+              <w:rPr>
+                <w:sz w:val="16"/>
+                <w:szCs w:val="16"/>
+              </w:rPr>
+            </w:pPr>
+            <w:r>
+              <w:rPr>
+                <w:rFonts w:eastAsia="arial" w:ascii="arial" w:hAnsi="arial"/>
+                <w:color w:val="000000"/>
+                <w:sz w:val="16"/>
+                <w:szCs w:val="16"/>
+              </w:rPr>
+              <w:t>Cab Cam</w:t>
+            </w:r>
+          </w:p>
+        </w:tc>
+      </w:tr>
+    </w:tbl>
+    <w:p>
+      <w:pPr>
+        <w:pStyle w:val="Normal"/>
+        <w:rPr>
+          <w:rFonts w:ascii="arial" w:hAnsi="arial" w:eastAsia="arial"/>
+          <w:color w:val="000000"/>
+          <w:sz w:val="16"/>
+          <w:szCs w:val="16"/>
+        </w:rPr>
+      </w:pPr>
+      <w:r>
+        <w:rPr>
+          <w:rFonts w:eastAsia="arial" w:ascii="arial" w:hAnsi="arial"/>
+          <w:color w:val="000000"/>
+          <w:sz w:val="16"/>
+          <w:szCs w:val="16"/>
+        </w:rPr>
+      </w:r>
+    </w:p>
+    <w:p>
+      <w:pPr>
+        <w:pStyle w:val="Normal"/>
+        <w:rPr>
+          <w:color w:val="000000"/>
+          <w:sz w:val="16"/>
+          <w:szCs w:val="16"/>
+        </w:rPr>
+      </w:pPr>
+      <w:r>
+        <w:rPr>
+          <w:rFonts w:eastAsia="arial" w:ascii="arial" w:hAnsi="arial"/>
+          <w:color w:val="000000"/>
+          <w:sz w:val="16"/>
+          <w:szCs w:val="16"/>
+        </w:rPr>
+        <w:tab/>
+        <w:t xml:space="preserve">           Class 1</w:t>
+      </w:r>
+      <w:r>
+        <w:rPr>
+          <w:rFonts w:eastAsia="arial" w:ascii="arial" w:hAnsi="arial"/>
+          <w:color w:val="000000"/>
+          <w:sz w:val="16"/>
+          <w:szCs w:val="16"/>
+        </w:rPr>
+        <w:t>70/171</w:t>
+      </w:r>
+      <w:r>
+        <w:rPr>
+          <w:rFonts w:eastAsia="arial" w:ascii="arial" w:hAnsi="arial"/>
+          <w:color w:val="000000"/>
+          <w:sz w:val="16"/>
+          <w:szCs w:val="16"/>
+        </w:rPr>
+        <w:t>-2</w:t>
+      </w:r>
+    </w:p>
+    <w:tbl>
+      <w:tblPr>
+        <w:tblW w:w="14248" w:type="dxa"/>
+        <w:jc w:val="left"/>
+        <w:tblInd w:w="-5" w:type="dxa"/>
+        <w:tblLayout w:type="fixed"/>
+        <w:tblCellMar>
+          <w:top w:w="0" w:type="dxa"/>
+          <w:left w:w="108" w:type="dxa"/>
+          <w:bottom w:w="0" w:type="dxa"/>
+          <w:right w:w="108" w:type="dxa"/>
+        </w:tblCellMar>
+        <w:tblLook w:firstRow="1" w:noVBand="1" w:lastRow="0" w:firstColumn="1" w:lastColumn="0" w:noHBand="0" w:val="04a0"/>
+      </w:tblPr>
+      <w:tblGrid>
+        <w:gridCol w:w="1017"/>
+        <w:gridCol w:w="1019"/>
+        <w:gridCol w:w="1014"/>
+        <w:gridCol w:w="1016"/>
+        <w:gridCol w:w="1020"/>
+        <w:gridCol w:w="1016"/>
+        <w:gridCol w:w="1016"/>
+        <w:gridCol w:w="1017"/>
+        <w:gridCol w:w="1016"/>
+        <w:gridCol w:w="1020"/>
+        <w:gridCol w:w="1016"/>
+        <w:gridCol w:w="1016"/>
+        <w:gridCol w:w="1016"/>
+        <w:gridCol w:w="1029"/>
+      </w:tblGrid>
+      <w:tr>
+        <w:trPr>
+          <w:trHeight w:val="440" w:hRule="exact"/>
+          <w:cantSplit w:val="true"/>
+        </w:trPr>
+        <w:tc>
+          <w:tcPr>
+            <w:tcW w:w="1017" w:type="dxa"/>
+            <w:tcBorders>
+              <w:top w:val="single" w:sz="4" w:space="0" w:color="000000"/>
+              <w:left w:val="single" w:sz="4" w:space="0" w:color="000000"/>
+              <w:bottom w:val="single" w:sz="4" w:space="0" w:color="000000"/>
+            </w:tcBorders>
+            <w:vAlign w:val="bottom"/>
+          </w:tcPr>
+          <w:p>
+            <w:pPr>
+              <w:pStyle w:val="Normal"/>
+              <w:widowControl w:val="false"/>
+              <w:spacing w:lineRule="auto" w:line="180" w:before="0" w:after="60"/>
+              <w:jc w:val="center"/>
+              <w:rPr>
+                <w:b/>
+                <w:bCs/>
+              </w:rPr>
+            </w:pPr>
+            <w:r>
+              <w:rPr>
+                <w:b/>
+                <w:bCs/>
+                <w:color w:val="000000"/>
+                <w:sz w:val="16"/>
+                <w:szCs w:val="16"/>
+              </w:rPr>
+              <w:t>HUD</w:t>
+            </w:r>
+          </w:p>
+        </w:tc>
+        <w:tc>
+          <w:tcPr>
+            <w:tcW w:w="1019" w:type="dxa"/>
+            <w:tcBorders>
+              <w:top w:val="single" w:sz="4" w:space="0" w:color="000000"/>
+              <w:left w:val="single" w:sz="4" w:space="0" w:color="000000"/>
+              <w:bottom w:val="single" w:sz="4" w:space="0" w:color="000000"/>
+            </w:tcBorders>
+            <w:vAlign w:val="bottom"/>
+          </w:tcPr>
+          <w:p>
+            <w:pPr>
+              <w:pStyle w:val="Normal"/>
+              <w:widowControl w:val="false"/>
+              <w:spacing w:lineRule="auto" w:line="180"/>
+              <w:jc w:val="center"/>
+              <w:rPr>
+                <w:color w:val="000000"/>
+                <w:sz w:val="16"/>
+                <w:szCs w:val="16"/>
+              </w:rPr>
+            </w:pPr>
+            <w:r>
+              <w:rPr>
+                <w:color w:val="000000"/>
+                <w:sz w:val="16"/>
+                <w:szCs w:val="16"/>
+              </w:rPr>
+              <w:t>Schedule</w:t>
+            </w:r>
+          </w:p>
+        </w:tc>
+        <w:tc>
+          <w:tcPr>
+            <w:tcW w:w="1014" w:type="dxa"/>
+            <w:tcBorders>
+              <w:top w:val="single" w:sz="4" w:space="0" w:color="000000"/>
+              <w:left w:val="single" w:sz="4" w:space="0" w:color="000000"/>
+              <w:bottom w:val="single" w:sz="4" w:space="0" w:color="000000"/>
+            </w:tcBorders>
+            <w:vAlign w:val="bottom"/>
+          </w:tcPr>
+          <w:p>
+            <w:pPr>
+              <w:pStyle w:val="Normal"/>
+              <w:widowControl w:val="false"/>
+              <w:spacing w:lineRule="auto" w:line="180"/>
+              <w:jc w:val="center"/>
+              <w:rPr>
+                <w:sz w:val="16"/>
+                <w:szCs w:val="16"/>
+              </w:rPr>
+            </w:pPr>
+            <w:r>
+              <w:rPr>
+                <w:rFonts w:eastAsia="arial" w:ascii="arial" w:hAnsi="arial"/>
+                <w:sz w:val="16"/>
+                <w:szCs w:val="16"/>
+              </w:rPr>
+              <w:t>Engine Stop</w:t>
+            </w:r>
+          </w:p>
+        </w:tc>
+        <w:tc>
+          <w:tcPr>
+            <w:tcW w:w="1016" w:type="dxa"/>
+            <w:tcBorders>
+              <w:top w:val="single" w:sz="4" w:space="0" w:color="000000"/>
+              <w:left w:val="single" w:sz="4" w:space="0" w:color="000000"/>
+              <w:bottom w:val="single" w:sz="4" w:space="0" w:color="000000"/>
+            </w:tcBorders>
+            <w:vAlign w:val="bottom"/>
+          </w:tcPr>
+          <w:p>
+            <w:pPr>
+              <w:pStyle w:val="Normal"/>
+              <w:widowControl w:val="false"/>
+              <w:spacing w:lineRule="auto" w:line="180"/>
+              <w:jc w:val="center"/>
+              <w:rPr>
+                <w:color w:val="000000"/>
+                <w:sz w:val="16"/>
+                <w:szCs w:val="16"/>
+              </w:rPr>
+            </w:pPr>
+            <w:r>
+              <w:rPr>
+                <w:color w:val="000000"/>
+                <w:sz w:val="16"/>
+                <w:szCs w:val="16"/>
+              </w:rPr>
+              <w:t>DSD/Vigilance</w:t>
+            </w:r>
+          </w:p>
+        </w:tc>
+        <w:tc>
+          <w:tcPr>
+            <w:tcW w:w="1020" w:type="dxa"/>
+            <w:tcBorders>
+              <w:top w:val="single" w:sz="4" w:space="0" w:color="000000"/>
+              <w:left w:val="single" w:sz="4" w:space="0" w:color="000000"/>
+              <w:bottom w:val="single" w:sz="4" w:space="0" w:color="000000"/>
+            </w:tcBorders>
+            <w:vAlign w:val="bottom"/>
+          </w:tcPr>
+          <w:p>
+            <w:pPr>
+              <w:pStyle w:val="Normal"/>
+              <w:widowControl w:val="false"/>
+              <w:spacing w:lineRule="auto" w:line="180"/>
+              <w:jc w:val="center"/>
+              <w:rPr>
+                <w:color w:val="000000"/>
+                <w:sz w:val="16"/>
+                <w:szCs w:val="16"/>
+              </w:rPr>
+            </w:pPr>
+            <w:r>
+              <w:rPr>
+                <w:color w:val="000000"/>
+                <w:sz w:val="16"/>
+                <w:szCs w:val="16"/>
+              </w:rPr>
+              <w:t>Train Light Off</w:t>
+            </w:r>
+          </w:p>
+        </w:tc>
+        <w:tc>
+          <w:tcPr>
+            <w:tcW w:w="1016" w:type="dxa"/>
+            <w:tcBorders>
+              <w:top w:val="single" w:sz="4" w:space="0" w:color="000000"/>
+              <w:left w:val="single" w:sz="4" w:space="0" w:color="000000"/>
+              <w:bottom w:val="single" w:sz="4" w:space="0" w:color="000000"/>
+            </w:tcBorders>
+            <w:vAlign w:val="bottom"/>
+          </w:tcPr>
+          <w:p>
+            <w:pPr>
+              <w:pStyle w:val="Normal"/>
+              <w:widowControl w:val="false"/>
+              <w:jc w:val="center"/>
+              <w:rPr>
+                <w:color w:val="000000"/>
+                <w:sz w:val="16"/>
+                <w:szCs w:val="16"/>
+              </w:rPr>
+            </w:pPr>
+            <w:r>
+              <w:rPr>
+                <w:color w:val="000000"/>
+                <w:sz w:val="16"/>
+                <w:szCs w:val="16"/>
+              </w:rPr>
+            </w:r>
+          </w:p>
+        </w:tc>
+        <w:tc>
+          <w:tcPr>
+            <w:tcW w:w="1016" w:type="dxa"/>
+            <w:tcBorders>
+              <w:top w:val="single" w:sz="4" w:space="0" w:color="000000"/>
+              <w:left w:val="single" w:sz="4" w:space="0" w:color="000000"/>
+              <w:bottom w:val="single" w:sz="4" w:space="0" w:color="000000"/>
+            </w:tcBorders>
+            <w:vAlign w:val="bottom"/>
+          </w:tcPr>
+          <w:p>
+            <w:pPr>
+              <w:pStyle w:val="Normal"/>
+              <w:widowControl w:val="false"/>
+              <w:spacing w:lineRule="auto" w:line="180"/>
+              <w:jc w:val="center"/>
+              <w:rPr>
+                <w:color w:val="000000"/>
+                <w:sz w:val="16"/>
+                <w:szCs w:val="16"/>
+              </w:rPr>
+            </w:pPr>
+            <w:r>
+              <w:rPr>
+                <w:color w:val="000000"/>
+                <w:sz w:val="16"/>
+                <w:szCs w:val="16"/>
+              </w:rPr>
+            </w:r>
+          </w:p>
+        </w:tc>
+        <w:tc>
+          <w:tcPr>
+            <w:tcW w:w="1017" w:type="dxa"/>
+            <w:tcBorders>
+              <w:top w:val="single" w:sz="4" w:space="0" w:color="000000"/>
+              <w:left w:val="single" w:sz="4" w:space="0" w:color="000000"/>
+              <w:bottom w:val="single" w:sz="4" w:space="0" w:color="000000"/>
+            </w:tcBorders>
+            <w:vAlign w:val="bottom"/>
+          </w:tcPr>
+          <w:p>
+            <w:pPr>
+              <w:pStyle w:val="Normal"/>
+              <w:widowControl w:val="false"/>
+              <w:jc w:val="center"/>
+              <w:rPr>
+                <w:rFonts w:ascii="arial" w:hAnsi="arial" w:eastAsia="arial"/>
+                <w:color w:val="000000"/>
+                <w:sz w:val="16"/>
+                <w:szCs w:val="16"/>
+              </w:rPr>
+            </w:pPr>
+            <w:r>
+              <w:rPr>
+                <w:rFonts w:eastAsia="arial" w:ascii="arial" w:hAnsi="arial"/>
+                <w:color w:val="000000"/>
+                <w:sz w:val="16"/>
+                <w:szCs w:val="16"/>
+              </w:rPr>
+            </w:r>
+          </w:p>
+        </w:tc>
+        <w:tc>
+          <w:tcPr>
+            <w:tcW w:w="1016" w:type="dxa"/>
+            <w:tcBorders>
+              <w:top w:val="single" w:sz="4" w:space="0" w:color="000000"/>
+              <w:left w:val="single" w:sz="4" w:space="0" w:color="000000"/>
+              <w:bottom w:val="single" w:sz="4" w:space="0" w:color="000000"/>
+            </w:tcBorders>
+            <w:vAlign w:val="bottom"/>
+          </w:tcPr>
+          <w:p>
+            <w:pPr>
+              <w:pStyle w:val="Normal"/>
+              <w:widowControl w:val="false"/>
+              <w:jc w:val="center"/>
+              <w:rPr>
+                <w:color w:val="000000"/>
+                <w:sz w:val="16"/>
+                <w:szCs w:val="16"/>
+              </w:rPr>
+            </w:pPr>
+            <w:r>
+              <w:rPr>
+                <w:color w:val="000000"/>
+                <w:sz w:val="16"/>
+                <w:szCs w:val="16"/>
+              </w:rPr>
+            </w:r>
+          </w:p>
+        </w:tc>
+        <w:tc>
+          <w:tcPr>
+            <w:tcW w:w="1020" w:type="dxa"/>
+            <w:tcBorders>
+              <w:top w:val="single" w:sz="4" w:space="0" w:color="000000"/>
+              <w:left w:val="single" w:sz="4" w:space="0" w:color="000000"/>
+              <w:bottom w:val="single" w:sz="4" w:space="0" w:color="000000"/>
+            </w:tcBorders>
+            <w:vAlign w:val="bottom"/>
+          </w:tcPr>
+          <w:p>
+            <w:pPr>
+              <w:pStyle w:val="Normal"/>
+              <w:widowControl w:val="false"/>
+              <w:jc w:val="center"/>
+              <w:rPr>
+                <w:color w:val="000000"/>
+                <w:sz w:val="16"/>
+                <w:szCs w:val="16"/>
+              </w:rPr>
+            </w:pPr>
+            <w:r>
+              <w:rPr>
+                <w:color w:val="000000"/>
+                <w:sz w:val="16"/>
+                <w:szCs w:val="16"/>
+              </w:rPr>
+              <w:t>Notice Light</w:t>
+            </w:r>
+          </w:p>
+        </w:tc>
+        <w:tc>
+          <w:tcPr>
+            <w:tcW w:w="1016" w:type="dxa"/>
+            <w:tcBorders>
+              <w:top w:val="single" w:sz="4" w:space="0" w:color="000000"/>
+              <w:left w:val="single" w:sz="4" w:space="0" w:color="000000"/>
+              <w:bottom w:val="single" w:sz="4" w:space="0" w:color="000000"/>
+            </w:tcBorders>
+            <w:vAlign w:val="bottom"/>
+          </w:tcPr>
+          <w:p>
+            <w:pPr>
+              <w:pStyle w:val="Normal"/>
+              <w:widowControl w:val="false"/>
+              <w:jc w:val="center"/>
+              <w:rPr>
+                <w:color w:val="000000"/>
+                <w:sz w:val="16"/>
+                <w:szCs w:val="16"/>
+              </w:rPr>
+            </w:pPr>
+            <w:r>
+              <w:rPr>
+                <w:color w:val="000000"/>
+                <w:sz w:val="16"/>
+                <w:szCs w:val="16"/>
+              </w:rPr>
             </w:r>
           </w:p>
         </w:tc>
@@ -22142,12 +24356,12 @@
       <w:rFonts w:ascii="Symbol" w:hAnsi="Symbol" w:cs="Symbol"/>
     </w:rPr>
   </w:style>
-  <w:style w:type="character" w:styleId="Style5" w:customStyle="1">
-    <w:name w:val="번호 매기기 기호"/>
+  <w:style w:type="character" w:styleId="user" w:customStyle="1">
+    <w:name w:val="번호 매기기 기호 (user)"/>
     <w:qFormat/>
     <w:rPr/>
   </w:style>
-  <w:style w:type="paragraph" w:styleId="Style6">
+  <w:style w:type="paragraph" w:styleId="Style5">
     <w:name w:val="제목"/>
     <w:basedOn w:val="Normal"/>
     <w:next w:val="BodyText"/>
@@ -22157,7 +24371,7 @@
       <w:spacing w:before="240" w:after="120"/>
     </w:pPr>
     <w:rPr>
-      <w:rFonts w:ascii="Liberation Sans" w:hAnsi="Liberation Sans" w:eastAsia="나눔고딕" w:cs="Arial"/>
+      <w:rFonts w:ascii="Liberation Sans" w:hAnsi="Liberation Sans" w:eastAsia="Noto Sans CJK KR" w:cs="Lohit Devanagari"/>
       <w:sz w:val="28"/>
       <w:szCs w:val="28"/>
     </w:rPr>
@@ -22194,7 +24408,7 @@
       <w:szCs w:val="24"/>
     </w:rPr>
   </w:style>
-  <w:style w:type="paragraph" w:styleId="Style7">
+  <w:style w:type="paragraph" w:styleId="Style6" w:customStyle="1">
     <w:name w:val="색인"/>
     <w:basedOn w:val="Normal"/>
     <w:qFormat/>
@@ -22202,11 +24416,10 @@
       <w:suppressLineNumbers/>
     </w:pPr>
     <w:rPr>
-      <w:rFonts w:cs="Arial"/>
-      <w:sz w:val="24"/>
+      <w:rFonts w:cs="Lohit Devanagari"/>
     </w:rPr>
   </w:style>
-  <w:style w:type="paragraph" w:styleId="user">
+  <w:style w:type="paragraph" w:styleId="user1">
     <w:name w:val="제목 (user)"/>
     <w:basedOn w:val="Normal"/>
     <w:next w:val="BodyText"/>
@@ -22216,12 +24429,12 @@
       <w:spacing w:before="240" w:after="120"/>
     </w:pPr>
     <w:rPr>
-      <w:rFonts w:ascii="Liberation Sans" w:hAnsi="Liberation Sans" w:eastAsia="Noto Sans CJK KR" w:cs="Lohit Devanagari"/>
+      <w:rFonts w:ascii="Liberation Sans" w:hAnsi="Liberation Sans" w:eastAsia="나눔고딕" w:cs="Arial"/>
       <w:sz w:val="28"/>
       <w:szCs w:val="28"/>
     </w:rPr>
   </w:style>
-  <w:style w:type="paragraph" w:styleId="user1" w:customStyle="1">
+  <w:style w:type="paragraph" w:styleId="user2">
     <w:name w:val="색인 (user)"/>
     <w:basedOn w:val="Normal"/>
     <w:qFormat/>
@@ -22229,7 +24442,8 @@
       <w:suppressLineNumbers/>
     </w:pPr>
     <w:rPr>
-      <w:rFonts w:cs="Lohit Devanagari"/>
+      <w:rFonts w:cs="Arial"/>
+      <w:sz w:val="24"/>
     </w:rPr>
   </w:style>
   <w:style w:type="paragraph" w:styleId="Title">
@@ -22911,8 +25125,8 @@
       <w:szCs w:val="24"/>
     </w:rPr>
   </w:style>
-  <w:style w:type="paragraph" w:styleId="user2" w:customStyle="1">
-    <w:name w:val="표 내용 (user)"/>
+  <w:style w:type="paragraph" w:styleId="Style7" w:customStyle="1">
+    <w:name w:val="표 내용"/>
     <w:basedOn w:val="Normal"/>
     <w:qFormat/>
     <w:pPr>
@@ -22920,9 +25134,9 @@
     </w:pPr>
     <w:rPr/>
   </w:style>
-  <w:style w:type="paragraph" w:styleId="user3" w:customStyle="1">
-    <w:name w:val="표제목 (user)"/>
-    <w:basedOn w:val="user2"/>
+  <w:style w:type="paragraph" w:styleId="Style8" w:customStyle="1">
+    <w:name w:val="표제목"/>
+    <w:basedOn w:val="Style7"/>
     <w:qFormat/>
     <w:pPr>
       <w:jc w:val="center"/>
@@ -22932,8 +25146,8 @@
       <w:bCs/>
     </w:rPr>
   </w:style>
-  <w:style w:type="paragraph" w:styleId="Style8">
-    <w:name w:val="표 내용"/>
+  <w:style w:type="paragraph" w:styleId="user3">
+    <w:name w:val="표 내용 (user)"/>
     <w:basedOn w:val="Normal"/>
     <w:qFormat/>
     <w:pPr>
@@ -22942,9 +25156,9 @@
     </w:pPr>
     <w:rPr/>
   </w:style>
-  <w:style w:type="paragraph" w:styleId="Style9">
-    <w:name w:val="표제목"/>
-    <w:basedOn w:val="Style8"/>
+  <w:style w:type="paragraph" w:styleId="user4">
+    <w:name w:val="표제목 (user)"/>
+    <w:basedOn w:val="user3"/>
     <w:qFormat/>
     <w:pPr>
       <w:suppressLineNumbers/>

</xml_diff>

<commit_message>
Add WCML Crewe Preston
</commit_message>
<xml_diff>
--- a/raildriver-UK-Remapped.docx
+++ b/raildriver-UK-Remapped.docx
@@ -314,39 +314,52 @@
                 <w:sz w:val="16"/>
                 <w:szCs w:val="16"/>
               </w:rPr>
-              <w:t>Brake Switch</w:t>
-            </w:r>
-          </w:p>
-        </w:tc>
-        <w:tc>
-          <w:tcPr>
-            <w:tcW w:w="1016" w:type="dxa"/>
-            <w:tcBorders>
-              <w:top w:val="single" w:sz="4" w:space="0" w:color="000000"/>
-              <w:left w:val="single" w:sz="4" w:space="0" w:color="000000"/>
-              <w:bottom w:val="single" w:sz="4" w:space="0" w:color="000000"/>
-            </w:tcBorders>
-            <w:vAlign w:val="bottom"/>
-          </w:tcPr>
-          <w:p>
-            <w:pPr>
-              <w:pStyle w:val="Normal"/>
-              <w:widowControl w:val="false"/>
-              <w:jc w:val="center"/>
-              <w:rPr>
-                <w:rFonts w:ascii="arial" w:hAnsi="arial" w:eastAsia="arial"/>
-                <w:color w:val="000000"/>
-                <w:sz w:val="16"/>
-                <w:szCs w:val="16"/>
-              </w:rPr>
-            </w:pPr>
-            <w:r>
-              <w:rPr>
-                <w:rFonts w:eastAsia="arial" w:ascii="arial" w:hAnsi="arial"/>
-                <w:color w:val="000000"/>
-                <w:sz w:val="16"/>
-                <w:szCs w:val="16"/>
-              </w:rPr>
+              <w:t xml:space="preserve">Brake Switch </w:t>
+            </w:r>
+            <w:r>
+              <w:rPr>
+                <w:rFonts w:eastAsia="arial" w:ascii="arial" w:hAnsi="arial"/>
+                <w:color w:val="000000"/>
+                <w:sz w:val="16"/>
+                <w:szCs w:val="16"/>
+              </w:rPr>
+              <w:t>Vac</w:t>
+            </w:r>
+          </w:p>
+        </w:tc>
+        <w:tc>
+          <w:tcPr>
+            <w:tcW w:w="1016" w:type="dxa"/>
+            <w:tcBorders>
+              <w:top w:val="single" w:sz="4" w:space="0" w:color="000000"/>
+              <w:left w:val="single" w:sz="4" w:space="0" w:color="000000"/>
+              <w:bottom w:val="single" w:sz="4" w:space="0" w:color="000000"/>
+            </w:tcBorders>
+            <w:vAlign w:val="bottom"/>
+          </w:tcPr>
+          <w:p>
+            <w:pPr>
+              <w:pStyle w:val="Normal"/>
+              <w:widowControl w:val="false"/>
+              <w:jc w:val="center"/>
+              <w:rPr>
+                <w:sz w:val="16"/>
+                <w:szCs w:val="16"/>
+              </w:rPr>
+            </w:pPr>
+            <w:r>
+              <w:rPr>
+                <w:sz w:val="16"/>
+                <w:szCs w:val="16"/>
+              </w:rPr>
+              <w:t xml:space="preserve">Brake Switch </w:t>
+            </w:r>
+            <w:r>
+              <w:rPr>
+                <w:sz w:val="16"/>
+                <w:szCs w:val="16"/>
+              </w:rPr>
+              <w:t>Air</w:t>
             </w:r>
           </w:p>
         </w:tc>
@@ -26701,25 +26714,7 @@
           <w:szCs w:val="16"/>
         </w:rPr>
         <w:tab/>
-        <w:t xml:space="preserve">           Class </w:t>
-      </w:r>
-      <w:r>
-        <w:rPr>
-          <w:rFonts w:eastAsia="arial" w:ascii="arial" w:hAnsi="arial"/>
-          <w:color w:val="000000"/>
-          <w:sz w:val="16"/>
-          <w:szCs w:val="16"/>
-        </w:rPr>
-        <w:t>313</w:t>
-      </w:r>
-      <w:r>
-        <w:rPr>
-          <w:rFonts w:eastAsia="arial" w:ascii="arial" w:hAnsi="arial"/>
-          <w:color w:val="000000"/>
-          <w:sz w:val="16"/>
-          <w:szCs w:val="16"/>
-        </w:rPr>
-        <w:t>-1</w:t>
+        <w:t xml:space="preserve">           Class 313-1</w:t>
       </w:r>
     </w:p>
     <w:tbl>
@@ -27089,15 +27084,7 @@
                 <w:sz w:val="16"/>
                 <w:szCs w:val="16"/>
               </w:rPr>
-              <w:t>Inst.</w:t>
-            </w:r>
-            <w:r>
-              <w:rPr>
-                <w:color w:val="000000"/>
-                <w:sz w:val="16"/>
-                <w:szCs w:val="16"/>
-              </w:rPr>
-              <w:t xml:space="preserve"> Light</w:t>
+              <w:t>Inst. Light</w:t>
             </w:r>
           </w:p>
         </w:tc>
@@ -27288,25 +27275,7 @@
           <w:szCs w:val="16"/>
         </w:rPr>
         <w:tab/>
-        <w:t xml:space="preserve">           Class </w:t>
-      </w:r>
-      <w:r>
-        <w:rPr>
-          <w:rFonts w:eastAsia="arial" w:ascii="arial" w:hAnsi="arial"/>
-          <w:color w:val="000000"/>
-          <w:sz w:val="16"/>
-          <w:szCs w:val="16"/>
-        </w:rPr>
-        <w:t>313</w:t>
-      </w:r>
-      <w:r>
-        <w:rPr>
-          <w:rFonts w:eastAsia="arial" w:ascii="arial" w:hAnsi="arial"/>
-          <w:color w:val="000000"/>
-          <w:sz w:val="16"/>
-          <w:szCs w:val="16"/>
-        </w:rPr>
-        <w:t>-2</w:t>
+        <w:t xml:space="preserve">           Class 313-2</w:t>
       </w:r>
     </w:p>
     <w:tbl>
@@ -27641,7 +27610,10 @@
               </w:rPr>
             </w:pPr>
             <w:r>
-              <w:rPr/>
+              <w:rPr>
+                <w:sz w:val="16"/>
+                <w:szCs w:val="16"/>
+              </w:rPr>
             </w:r>
           </w:p>
         </w:tc>
@@ -28884,12 +28856,12 @@
       <w:rFonts w:ascii="Symbol" w:hAnsi="Symbol" w:cs="Symbol"/>
     </w:rPr>
   </w:style>
-  <w:style w:type="character" w:styleId="Style5" w:customStyle="1">
-    <w:name w:val="번호 매기기 기호"/>
+  <w:style w:type="character" w:styleId="user" w:customStyle="1">
+    <w:name w:val="번호 매기기 기호 (user)"/>
     <w:qFormat/>
     <w:rPr/>
   </w:style>
-  <w:style w:type="paragraph" w:styleId="Style6">
+  <w:style w:type="paragraph" w:styleId="Style5">
     <w:name w:val="제목"/>
     <w:basedOn w:val="Normal"/>
     <w:next w:val="BodyText"/>
@@ -28899,7 +28871,7 @@
       <w:spacing w:before="240" w:after="120"/>
     </w:pPr>
     <w:rPr>
-      <w:rFonts w:ascii="Liberation Sans" w:hAnsi="Liberation Sans" w:eastAsia="나눔고딕" w:cs="Arial"/>
+      <w:rFonts w:ascii="Liberation Sans" w:hAnsi="Liberation Sans" w:eastAsia="Noto Sans CJK KR" w:cs="Lohit Devanagari"/>
       <w:sz w:val="28"/>
       <w:szCs w:val="28"/>
     </w:rPr>
@@ -28936,7 +28908,7 @@
       <w:szCs w:val="24"/>
     </w:rPr>
   </w:style>
-  <w:style w:type="paragraph" w:styleId="Style7">
+  <w:style w:type="paragraph" w:styleId="Style6" w:customStyle="1">
     <w:name w:val="색인"/>
     <w:basedOn w:val="Normal"/>
     <w:qFormat/>
@@ -28944,11 +28916,10 @@
       <w:suppressLineNumbers/>
     </w:pPr>
     <w:rPr>
-      <w:rFonts w:cs="Arial"/>
-      <w:sz w:val="24"/>
+      <w:rFonts w:cs="Lohit Devanagari"/>
     </w:rPr>
   </w:style>
-  <w:style w:type="paragraph" w:styleId="user">
+  <w:style w:type="paragraph" w:styleId="user1">
     <w:name w:val="제목 (user)"/>
     <w:basedOn w:val="Normal"/>
     <w:next w:val="BodyText"/>
@@ -28958,12 +28929,12 @@
       <w:spacing w:before="240" w:after="120"/>
     </w:pPr>
     <w:rPr>
-      <w:rFonts w:ascii="Liberation Sans" w:hAnsi="Liberation Sans" w:eastAsia="Noto Sans CJK KR" w:cs="Lohit Devanagari"/>
+      <w:rFonts w:ascii="Liberation Sans" w:hAnsi="Liberation Sans" w:eastAsia="나눔고딕" w:cs="Arial"/>
       <w:sz w:val="28"/>
       <w:szCs w:val="28"/>
     </w:rPr>
   </w:style>
-  <w:style w:type="paragraph" w:styleId="user1" w:customStyle="1">
+  <w:style w:type="paragraph" w:styleId="user2">
     <w:name w:val="색인 (user)"/>
     <w:basedOn w:val="Normal"/>
     <w:qFormat/>
@@ -28971,7 +28942,8 @@
       <w:suppressLineNumbers/>
     </w:pPr>
     <w:rPr>
-      <w:rFonts w:cs="Lohit Devanagari"/>
+      <w:rFonts w:cs="Arial"/>
+      <w:sz w:val="24"/>
     </w:rPr>
   </w:style>
   <w:style w:type="paragraph" w:styleId="Title">
@@ -29653,8 +29625,8 @@
       <w:szCs w:val="24"/>
     </w:rPr>
   </w:style>
-  <w:style w:type="paragraph" w:styleId="user2" w:customStyle="1">
-    <w:name w:val="표 내용 (user)"/>
+  <w:style w:type="paragraph" w:styleId="Style7" w:customStyle="1">
+    <w:name w:val="표 내용"/>
     <w:basedOn w:val="Normal"/>
     <w:qFormat/>
     <w:pPr>
@@ -29662,9 +29634,9 @@
     </w:pPr>
     <w:rPr/>
   </w:style>
-  <w:style w:type="paragraph" w:styleId="user3" w:customStyle="1">
-    <w:name w:val="표제목 (user)"/>
-    <w:basedOn w:val="user2"/>
+  <w:style w:type="paragraph" w:styleId="Style8" w:customStyle="1">
+    <w:name w:val="표제목"/>
+    <w:basedOn w:val="Style7"/>
     <w:qFormat/>
     <w:pPr>
       <w:jc w:val="center"/>
@@ -29674,8 +29646,8 @@
       <w:bCs/>
     </w:rPr>
   </w:style>
-  <w:style w:type="paragraph" w:styleId="Style8">
-    <w:name w:val="표 내용"/>
+  <w:style w:type="paragraph" w:styleId="user3">
+    <w:name w:val="표 내용 (user)"/>
     <w:basedOn w:val="Normal"/>
     <w:qFormat/>
     <w:pPr>
@@ -29684,9 +29656,9 @@
     </w:pPr>
     <w:rPr/>
   </w:style>
-  <w:style w:type="paragraph" w:styleId="Style9">
-    <w:name w:val="표제목"/>
-    <w:basedOn w:val="Style8"/>
+  <w:style w:type="paragraph" w:styleId="user4">
+    <w:name w:val="표제목 (user)"/>
+    <w:basedOn w:val="user3"/>
     <w:qFormat/>
     <w:pPr>
       <w:suppressLineNumbers/>

</xml_diff>

<commit_message>
Add Class 314, 323 and 350
</commit_message>
<xml_diff>
--- a/raildriver-UK-Remapped.docx
+++ b/raildriver-UK-Remapped.docx
@@ -314,52 +314,36 @@
                 <w:sz w:val="16"/>
                 <w:szCs w:val="16"/>
               </w:rPr>
-              <w:t xml:space="preserve">Brake Switch </w:t>
-            </w:r>
-            <w:r>
-              <w:rPr>
-                <w:rFonts w:eastAsia="arial" w:ascii="arial" w:hAnsi="arial"/>
-                <w:color w:val="000000"/>
-                <w:sz w:val="16"/>
-                <w:szCs w:val="16"/>
-              </w:rPr>
-              <w:t>Vac</w:t>
-            </w:r>
-          </w:p>
-        </w:tc>
-        <w:tc>
-          <w:tcPr>
-            <w:tcW w:w="1016" w:type="dxa"/>
-            <w:tcBorders>
-              <w:top w:val="single" w:sz="4" w:space="0" w:color="000000"/>
-              <w:left w:val="single" w:sz="4" w:space="0" w:color="000000"/>
-              <w:bottom w:val="single" w:sz="4" w:space="0" w:color="000000"/>
-            </w:tcBorders>
-            <w:vAlign w:val="bottom"/>
-          </w:tcPr>
-          <w:p>
-            <w:pPr>
-              <w:pStyle w:val="Normal"/>
-              <w:widowControl w:val="false"/>
-              <w:jc w:val="center"/>
-              <w:rPr>
-                <w:sz w:val="16"/>
-                <w:szCs w:val="16"/>
-              </w:rPr>
-            </w:pPr>
-            <w:r>
-              <w:rPr>
-                <w:sz w:val="16"/>
-                <w:szCs w:val="16"/>
-              </w:rPr>
-              <w:t xml:space="preserve">Brake Switch </w:t>
-            </w:r>
-            <w:r>
-              <w:rPr>
-                <w:sz w:val="16"/>
-                <w:szCs w:val="16"/>
-              </w:rPr>
-              <w:t>Air</w:t>
+              <w:t>Brake Switch Vac</w:t>
+            </w:r>
+          </w:p>
+        </w:tc>
+        <w:tc>
+          <w:tcPr>
+            <w:tcW w:w="1016" w:type="dxa"/>
+            <w:tcBorders>
+              <w:top w:val="single" w:sz="4" w:space="0" w:color="000000"/>
+              <w:left w:val="single" w:sz="4" w:space="0" w:color="000000"/>
+              <w:bottom w:val="single" w:sz="4" w:space="0" w:color="000000"/>
+            </w:tcBorders>
+            <w:vAlign w:val="bottom"/>
+          </w:tcPr>
+          <w:p>
+            <w:pPr>
+              <w:pStyle w:val="Normal"/>
+              <w:widowControl w:val="false"/>
+              <w:jc w:val="center"/>
+              <w:rPr>
+                <w:sz w:val="16"/>
+                <w:szCs w:val="16"/>
+              </w:rPr>
+            </w:pPr>
+            <w:r>
+              <w:rPr>
+                <w:sz w:val="16"/>
+                <w:szCs w:val="16"/>
+              </w:rPr>
+              <w:t>Brake Switch Air</w:t>
             </w:r>
           </w:p>
         </w:tc>
@@ -27676,6 +27660,3321 @@
                 <w:szCs w:val="16"/>
               </w:rPr>
               <w:t>Fluores. Light</w:t>
+            </w:r>
+          </w:p>
+        </w:tc>
+        <w:tc>
+          <w:tcPr>
+            <w:tcW w:w="1016" w:type="dxa"/>
+            <w:tcBorders>
+              <w:top w:val="single" w:sz="4" w:space="0" w:color="000000"/>
+              <w:left w:val="single" w:sz="4" w:space="0" w:color="000000"/>
+              <w:bottom w:val="single" w:sz="4" w:space="0" w:color="000000"/>
+            </w:tcBorders>
+            <w:vAlign w:val="bottom"/>
+          </w:tcPr>
+          <w:p>
+            <w:pPr>
+              <w:pStyle w:val="Normal"/>
+              <w:widowControl w:val="false"/>
+              <w:spacing w:lineRule="auto" w:line="180"/>
+              <w:jc w:val="center"/>
+              <w:rPr>
+                <w:sz w:val="16"/>
+                <w:szCs w:val="16"/>
+              </w:rPr>
+            </w:pPr>
+            <w:r>
+              <w:rPr>
+                <w:sz w:val="16"/>
+                <w:szCs w:val="16"/>
+              </w:rPr>
+              <w:t>Uncouple</w:t>
+            </w:r>
+          </w:p>
+        </w:tc>
+        <w:tc>
+          <w:tcPr>
+            <w:tcW w:w="1016" w:type="dxa"/>
+            <w:tcBorders>
+              <w:top w:val="single" w:sz="4" w:space="0" w:color="000000"/>
+              <w:left w:val="single" w:sz="4" w:space="0" w:color="000000"/>
+              <w:bottom w:val="single" w:sz="4" w:space="0" w:color="000000"/>
+            </w:tcBorders>
+            <w:vAlign w:val="bottom"/>
+          </w:tcPr>
+          <w:p>
+            <w:pPr>
+              <w:pStyle w:val="Normal"/>
+              <w:widowControl w:val="false"/>
+              <w:spacing w:lineRule="auto" w:line="180"/>
+              <w:jc w:val="center"/>
+              <w:rPr>
+                <w:sz w:val="16"/>
+                <w:szCs w:val="16"/>
+              </w:rPr>
+            </w:pPr>
+            <w:r>
+              <w:rPr>
+                <w:rFonts w:eastAsia="arial" w:ascii="arial" w:hAnsi="arial"/>
+                <w:color w:val="000000"/>
+                <w:sz w:val="16"/>
+                <w:szCs w:val="16"/>
+              </w:rPr>
+              <w:t>Exterior</w:t>
+            </w:r>
+          </w:p>
+          <w:p>
+            <w:pPr>
+              <w:pStyle w:val="Normal"/>
+              <w:widowControl w:val="false"/>
+              <w:spacing w:lineRule="auto" w:line="180"/>
+              <w:jc w:val="center"/>
+              <w:rPr>
+                <w:sz w:val="16"/>
+                <w:szCs w:val="16"/>
+              </w:rPr>
+            </w:pPr>
+            <w:r>
+              <w:rPr>
+                <w:rFonts w:eastAsia="arial" w:ascii="arial" w:hAnsi="arial"/>
+                <w:color w:val="000000"/>
+                <w:sz w:val="16"/>
+                <w:szCs w:val="16"/>
+              </w:rPr>
+              <w:t>Camera</w:t>
+            </w:r>
+          </w:p>
+        </w:tc>
+        <w:tc>
+          <w:tcPr>
+            <w:tcW w:w="1029" w:type="dxa"/>
+            <w:tcBorders>
+              <w:top w:val="single" w:sz="4" w:space="0" w:color="000000"/>
+              <w:left w:val="single" w:sz="4" w:space="0" w:color="000000"/>
+              <w:bottom w:val="single" w:sz="4" w:space="0" w:color="000000"/>
+              <w:right w:val="single" w:sz="4" w:space="0" w:color="000000"/>
+            </w:tcBorders>
+            <w:vAlign w:val="bottom"/>
+          </w:tcPr>
+          <w:p>
+            <w:pPr>
+              <w:pStyle w:val="Normal"/>
+              <w:widowControl w:val="false"/>
+              <w:spacing w:lineRule="auto" w:line="180"/>
+              <w:jc w:val="center"/>
+              <w:rPr>
+                <w:sz w:val="16"/>
+                <w:szCs w:val="16"/>
+              </w:rPr>
+            </w:pPr>
+            <w:r>
+              <w:rPr>
+                <w:rFonts w:eastAsia="arial" w:ascii="arial" w:hAnsi="arial"/>
+                <w:color w:val="000000"/>
+                <w:sz w:val="16"/>
+                <w:szCs w:val="16"/>
+              </w:rPr>
+              <w:t>Prev</w:t>
+            </w:r>
+          </w:p>
+          <w:p>
+            <w:pPr>
+              <w:pStyle w:val="Normal"/>
+              <w:widowControl w:val="false"/>
+              <w:spacing w:lineRule="auto" w:line="180"/>
+              <w:jc w:val="center"/>
+              <w:rPr>
+                <w:sz w:val="16"/>
+                <w:szCs w:val="16"/>
+              </w:rPr>
+            </w:pPr>
+            <w:r>
+              <w:rPr>
+                <w:rFonts w:eastAsia="arial" w:ascii="arial" w:hAnsi="arial"/>
+                <w:color w:val="000000"/>
+                <w:sz w:val="16"/>
+                <w:szCs w:val="16"/>
+              </w:rPr>
+              <w:t>Cab Cam</w:t>
+            </w:r>
+          </w:p>
+        </w:tc>
+      </w:tr>
+    </w:tbl>
+    <w:p>
+      <w:pPr>
+        <w:pStyle w:val="Normal"/>
+        <w:rPr>
+          <w:color w:val="000000"/>
+          <w:sz w:val="16"/>
+          <w:szCs w:val="16"/>
+        </w:rPr>
+      </w:pPr>
+      <w:r>
+        <w:rPr>
+          <w:color w:val="000000"/>
+          <w:sz w:val="16"/>
+          <w:szCs w:val="16"/>
+        </w:rPr>
+      </w:r>
+    </w:p>
+    <w:p>
+      <w:pPr>
+        <w:pStyle w:val="Normal"/>
+        <w:rPr>
+          <w:color w:val="000000"/>
+          <w:sz w:val="16"/>
+          <w:szCs w:val="16"/>
+        </w:rPr>
+      </w:pPr>
+      <w:r>
+        <w:rPr>
+          <w:rFonts w:eastAsia="arial" w:ascii="arial" w:hAnsi="arial"/>
+          <w:color w:val="000000"/>
+          <w:sz w:val="16"/>
+          <w:szCs w:val="16"/>
+        </w:rPr>
+        <w:tab/>
+        <w:t xml:space="preserve">           Class 314-1</w:t>
+      </w:r>
+    </w:p>
+    <w:tbl>
+      <w:tblPr>
+        <w:tblW w:w="14248" w:type="dxa"/>
+        <w:jc w:val="left"/>
+        <w:tblInd w:w="-5" w:type="dxa"/>
+        <w:tblLayout w:type="fixed"/>
+        <w:tblCellMar>
+          <w:top w:w="0" w:type="dxa"/>
+          <w:left w:w="108" w:type="dxa"/>
+          <w:bottom w:w="0" w:type="dxa"/>
+          <w:right w:w="108" w:type="dxa"/>
+        </w:tblCellMar>
+        <w:tblLook w:firstRow="1" w:noVBand="1" w:lastRow="0" w:firstColumn="1" w:lastColumn="0" w:noHBand="0" w:val="04a0"/>
+      </w:tblPr>
+      <w:tblGrid>
+        <w:gridCol w:w="1017"/>
+        <w:gridCol w:w="1019"/>
+        <w:gridCol w:w="1014"/>
+        <w:gridCol w:w="1016"/>
+        <w:gridCol w:w="1020"/>
+        <w:gridCol w:w="1016"/>
+        <w:gridCol w:w="1016"/>
+        <w:gridCol w:w="1017"/>
+        <w:gridCol w:w="1016"/>
+        <w:gridCol w:w="1020"/>
+        <w:gridCol w:w="1016"/>
+        <w:gridCol w:w="1016"/>
+        <w:gridCol w:w="1016"/>
+        <w:gridCol w:w="1029"/>
+      </w:tblGrid>
+      <w:tr>
+        <w:trPr>
+          <w:trHeight w:val="440" w:hRule="exact"/>
+          <w:cantSplit w:val="true"/>
+        </w:trPr>
+        <w:tc>
+          <w:tcPr>
+            <w:tcW w:w="1017" w:type="dxa"/>
+            <w:tcBorders>
+              <w:top w:val="single" w:sz="4" w:space="0" w:color="000000"/>
+              <w:left w:val="single" w:sz="4" w:space="0" w:color="000000"/>
+              <w:bottom w:val="single" w:sz="4" w:space="0" w:color="000000"/>
+            </w:tcBorders>
+            <w:vAlign w:val="bottom"/>
+          </w:tcPr>
+          <w:p>
+            <w:pPr>
+              <w:pStyle w:val="Normal"/>
+              <w:widowControl w:val="false"/>
+              <w:spacing w:lineRule="auto" w:line="180" w:before="0" w:after="60"/>
+              <w:jc w:val="center"/>
+              <w:rPr>
+                <w:color w:val="000000"/>
+                <w:sz w:val="16"/>
+                <w:szCs w:val="16"/>
+              </w:rPr>
+            </w:pPr>
+            <w:r>
+              <w:rPr>
+                <w:rFonts w:eastAsia="arial" w:ascii="arial" w:hAnsi="arial"/>
+                <w:b/>
+                <w:color w:val="000000"/>
+                <w:sz w:val="16"/>
+                <w:szCs w:val="16"/>
+              </w:rPr>
+              <w:t>Pause</w:t>
+            </w:r>
+          </w:p>
+        </w:tc>
+        <w:tc>
+          <w:tcPr>
+            <w:tcW w:w="1019" w:type="dxa"/>
+            <w:tcBorders>
+              <w:top w:val="single" w:sz="4" w:space="0" w:color="000000"/>
+              <w:left w:val="single" w:sz="4" w:space="0" w:color="000000"/>
+              <w:bottom w:val="single" w:sz="4" w:space="0" w:color="000000"/>
+            </w:tcBorders>
+            <w:vAlign w:val="bottom"/>
+          </w:tcPr>
+          <w:p>
+            <w:pPr>
+              <w:pStyle w:val="Normal"/>
+              <w:widowControl w:val="false"/>
+              <w:spacing w:lineRule="auto" w:line="180"/>
+              <w:jc w:val="center"/>
+              <w:rPr>
+                <w:color w:val="000000"/>
+                <w:sz w:val="16"/>
+                <w:szCs w:val="16"/>
+              </w:rPr>
+            </w:pPr>
+            <w:r>
+              <w:rPr>
+                <w:color w:val="000000"/>
+                <w:sz w:val="16"/>
+                <w:szCs w:val="16"/>
+              </w:rPr>
+              <w:t>Master Key</w:t>
+            </w:r>
+          </w:p>
+        </w:tc>
+        <w:tc>
+          <w:tcPr>
+            <w:tcW w:w="1014" w:type="dxa"/>
+            <w:tcBorders>
+              <w:top w:val="single" w:sz="4" w:space="0" w:color="000000"/>
+              <w:left w:val="single" w:sz="4" w:space="0" w:color="000000"/>
+              <w:bottom w:val="single" w:sz="4" w:space="0" w:color="000000"/>
+            </w:tcBorders>
+            <w:vAlign w:val="bottom"/>
+          </w:tcPr>
+          <w:p>
+            <w:pPr>
+              <w:pStyle w:val="Normal"/>
+              <w:widowControl w:val="false"/>
+              <w:spacing w:lineRule="auto" w:line="180"/>
+              <w:jc w:val="center"/>
+              <w:rPr>
+                <w:color w:val="000000"/>
+                <w:sz w:val="16"/>
+                <w:szCs w:val="16"/>
+              </w:rPr>
+            </w:pPr>
+            <w:r>
+              <w:rPr>
+                <w:color w:val="000000"/>
+                <w:sz w:val="16"/>
+                <w:szCs w:val="16"/>
+              </w:rPr>
+              <w:t>Auxiliary</w:t>
+            </w:r>
+          </w:p>
+          <w:p>
+            <w:pPr>
+              <w:pStyle w:val="Normal"/>
+              <w:widowControl w:val="false"/>
+              <w:spacing w:lineRule="auto" w:line="180"/>
+              <w:jc w:val="center"/>
+              <w:rPr>
+                <w:color w:val="000000"/>
+                <w:sz w:val="16"/>
+                <w:szCs w:val="16"/>
+              </w:rPr>
+            </w:pPr>
+            <w:r>
+              <w:rPr>
+                <w:rFonts w:eastAsia="arial" w:ascii="arial" w:hAnsi="arial"/>
+                <w:color w:val="000000"/>
+                <w:sz w:val="16"/>
+                <w:szCs w:val="16"/>
+              </w:rPr>
+              <w:t>Set</w:t>
+            </w:r>
+          </w:p>
+        </w:tc>
+        <w:tc>
+          <w:tcPr>
+            <w:tcW w:w="1016" w:type="dxa"/>
+            <w:tcBorders>
+              <w:top w:val="single" w:sz="4" w:space="0" w:color="000000"/>
+              <w:left w:val="single" w:sz="4" w:space="0" w:color="000000"/>
+              <w:bottom w:val="single" w:sz="4" w:space="0" w:color="000000"/>
+            </w:tcBorders>
+            <w:vAlign w:val="bottom"/>
+          </w:tcPr>
+          <w:p>
+            <w:pPr>
+              <w:pStyle w:val="Normal"/>
+              <w:widowControl w:val="false"/>
+              <w:spacing w:lineRule="auto" w:line="180"/>
+              <w:jc w:val="center"/>
+              <w:rPr>
+                <w:color w:val="000000"/>
+                <w:sz w:val="16"/>
+                <w:szCs w:val="16"/>
+              </w:rPr>
+            </w:pPr>
+            <w:r>
+              <w:rPr>
+                <w:color w:val="000000"/>
+                <w:sz w:val="16"/>
+                <w:szCs w:val="16"/>
+              </w:rPr>
+              <w:t>AWS/TPWS</w:t>
+            </w:r>
+          </w:p>
+        </w:tc>
+        <w:tc>
+          <w:tcPr>
+            <w:tcW w:w="1020" w:type="dxa"/>
+            <w:tcBorders>
+              <w:top w:val="single" w:sz="4" w:space="0" w:color="000000"/>
+              <w:left w:val="single" w:sz="4" w:space="0" w:color="000000"/>
+              <w:bottom w:val="single" w:sz="4" w:space="0" w:color="000000"/>
+            </w:tcBorders>
+            <w:vAlign w:val="bottom"/>
+          </w:tcPr>
+          <w:p>
+            <w:pPr>
+              <w:pStyle w:val="Normal"/>
+              <w:widowControl w:val="false"/>
+              <w:spacing w:lineRule="auto" w:line="180"/>
+              <w:jc w:val="center"/>
+              <w:rPr>
+                <w:color w:val="000000"/>
+                <w:sz w:val="16"/>
+                <w:szCs w:val="16"/>
+              </w:rPr>
+            </w:pPr>
+            <w:r>
+              <w:rPr>
+                <w:color w:val="000000"/>
+                <w:sz w:val="16"/>
+                <w:szCs w:val="16"/>
+              </w:rPr>
+              <w:t>Panto. Raise</w:t>
+            </w:r>
+          </w:p>
+        </w:tc>
+        <w:tc>
+          <w:tcPr>
+            <w:tcW w:w="1016" w:type="dxa"/>
+            <w:tcBorders>
+              <w:top w:val="single" w:sz="4" w:space="0" w:color="000000"/>
+              <w:left w:val="single" w:sz="4" w:space="0" w:color="000000"/>
+              <w:bottom w:val="single" w:sz="4" w:space="0" w:color="000000"/>
+            </w:tcBorders>
+            <w:vAlign w:val="bottom"/>
+          </w:tcPr>
+          <w:p>
+            <w:pPr>
+              <w:pStyle w:val="Normal"/>
+              <w:widowControl w:val="false"/>
+              <w:spacing w:lineRule="auto" w:line="180"/>
+              <w:jc w:val="center"/>
+              <w:rPr>
+                <w:color w:val="000000"/>
+                <w:sz w:val="16"/>
+                <w:szCs w:val="16"/>
+              </w:rPr>
+            </w:pPr>
+            <w:r>
+              <w:rPr>
+                <w:color w:val="000000"/>
+                <w:sz w:val="16"/>
+                <w:szCs w:val="16"/>
+              </w:rPr>
+              <w:t>Lignting Set</w:t>
+            </w:r>
+          </w:p>
+        </w:tc>
+        <w:tc>
+          <w:tcPr>
+            <w:tcW w:w="1016" w:type="dxa"/>
+            <w:tcBorders>
+              <w:top w:val="single" w:sz="4" w:space="0" w:color="000000"/>
+              <w:left w:val="single" w:sz="4" w:space="0" w:color="000000"/>
+              <w:bottom w:val="single" w:sz="4" w:space="0" w:color="000000"/>
+            </w:tcBorders>
+            <w:vAlign w:val="bottom"/>
+          </w:tcPr>
+          <w:p>
+            <w:pPr>
+              <w:pStyle w:val="Normal"/>
+              <w:widowControl w:val="false"/>
+              <w:jc w:val="center"/>
+              <w:rPr>
+                <w:sz w:val="16"/>
+                <w:szCs w:val="16"/>
+              </w:rPr>
+            </w:pPr>
+            <w:r>
+              <w:rPr>
+                <w:sz w:val="16"/>
+                <w:szCs w:val="16"/>
+              </w:rPr>
+              <w:t>DRA</w:t>
+            </w:r>
+          </w:p>
+        </w:tc>
+        <w:tc>
+          <w:tcPr>
+            <w:tcW w:w="1017" w:type="dxa"/>
+            <w:tcBorders>
+              <w:top w:val="single" w:sz="4" w:space="0" w:color="000000"/>
+              <w:left w:val="single" w:sz="4" w:space="0" w:color="000000"/>
+              <w:bottom w:val="single" w:sz="4" w:space="0" w:color="000000"/>
+            </w:tcBorders>
+            <w:vAlign w:val="bottom"/>
+          </w:tcPr>
+          <w:p>
+            <w:pPr>
+              <w:pStyle w:val="Normal"/>
+              <w:widowControl w:val="false"/>
+              <w:jc w:val="center"/>
+              <w:rPr>
+                <w:color w:val="000000"/>
+                <w:sz w:val="16"/>
+                <w:szCs w:val="16"/>
+              </w:rPr>
+            </w:pPr>
+            <w:r>
+              <w:rPr>
+                <w:color w:val="000000"/>
+                <w:sz w:val="16"/>
+                <w:szCs w:val="16"/>
+              </w:rPr>
+            </w:r>
+          </w:p>
+        </w:tc>
+        <w:tc>
+          <w:tcPr>
+            <w:tcW w:w="1016" w:type="dxa"/>
+            <w:tcBorders>
+              <w:top w:val="single" w:sz="4" w:space="0" w:color="000000"/>
+              <w:left w:val="single" w:sz="4" w:space="0" w:color="000000"/>
+              <w:bottom w:val="single" w:sz="4" w:space="0" w:color="000000"/>
+            </w:tcBorders>
+            <w:vAlign w:val="bottom"/>
+          </w:tcPr>
+          <w:p>
+            <w:pPr>
+              <w:pStyle w:val="Normal"/>
+              <w:widowControl w:val="false"/>
+              <w:jc w:val="center"/>
+              <w:rPr>
+                <w:sz w:val="16"/>
+                <w:szCs w:val="16"/>
+              </w:rPr>
+            </w:pPr>
+            <w:r>
+              <w:rPr>
+                <w:sz w:val="16"/>
+                <w:szCs w:val="16"/>
+              </w:rPr>
+            </w:r>
+          </w:p>
+        </w:tc>
+        <w:tc>
+          <w:tcPr>
+            <w:tcW w:w="1020" w:type="dxa"/>
+            <w:tcBorders>
+              <w:top w:val="single" w:sz="4" w:space="0" w:color="000000"/>
+              <w:left w:val="single" w:sz="4" w:space="0" w:color="000000"/>
+              <w:bottom w:val="single" w:sz="4" w:space="0" w:color="000000"/>
+            </w:tcBorders>
+            <w:vAlign w:val="bottom"/>
+          </w:tcPr>
+          <w:p>
+            <w:pPr>
+              <w:pStyle w:val="Normal"/>
+              <w:widowControl w:val="false"/>
+              <w:jc w:val="center"/>
+              <w:rPr>
+                <w:color w:val="000000"/>
+                <w:sz w:val="16"/>
+                <w:szCs w:val="16"/>
+              </w:rPr>
+            </w:pPr>
+            <w:r>
+              <w:rPr>
+                <w:color w:val="000000"/>
+                <w:sz w:val="16"/>
+                <w:szCs w:val="16"/>
+              </w:rPr>
+              <w:t>Indicator Dimmer</w:t>
+            </w:r>
+          </w:p>
+        </w:tc>
+        <w:tc>
+          <w:tcPr>
+            <w:tcW w:w="1016" w:type="dxa"/>
+            <w:tcBorders>
+              <w:top w:val="single" w:sz="4" w:space="0" w:color="000000"/>
+              <w:left w:val="single" w:sz="4" w:space="0" w:color="000000"/>
+              <w:bottom w:val="single" w:sz="4" w:space="0" w:color="000000"/>
+            </w:tcBorders>
+            <w:vAlign w:val="bottom"/>
+          </w:tcPr>
+          <w:p>
+            <w:pPr>
+              <w:pStyle w:val="Normal"/>
+              <w:widowControl w:val="false"/>
+              <w:spacing w:lineRule="auto" w:line="180"/>
+              <w:jc w:val="center"/>
+              <w:rPr>
+                <w:sz w:val="16"/>
+                <w:szCs w:val="16"/>
+              </w:rPr>
+            </w:pPr>
+            <w:r>
+              <w:rPr>
+                <w:rFonts w:eastAsia="arial" w:ascii="arial" w:hAnsi="arial"/>
+                <w:color w:val="000000"/>
+                <w:sz w:val="16"/>
+                <w:szCs w:val="16"/>
+              </w:rPr>
+              <w:t>Cab Light</w:t>
+            </w:r>
+          </w:p>
+        </w:tc>
+        <w:tc>
+          <w:tcPr>
+            <w:tcW w:w="1016" w:type="dxa"/>
+            <w:tcBorders>
+              <w:top w:val="single" w:sz="4" w:space="0" w:color="000000"/>
+              <w:left w:val="single" w:sz="4" w:space="0" w:color="000000"/>
+              <w:bottom w:val="single" w:sz="4" w:space="0" w:color="000000"/>
+            </w:tcBorders>
+            <w:vAlign w:val="bottom"/>
+          </w:tcPr>
+          <w:p>
+            <w:pPr>
+              <w:pStyle w:val="Normal"/>
+              <w:widowControl w:val="false"/>
+              <w:jc w:val="center"/>
+              <w:rPr>
+                <w:color w:val="000000"/>
+                <w:sz w:val="16"/>
+                <w:szCs w:val="16"/>
+              </w:rPr>
+            </w:pPr>
+            <w:r>
+              <w:rPr>
+                <w:color w:val="000000"/>
+                <w:sz w:val="16"/>
+                <w:szCs w:val="16"/>
+              </w:rPr>
+              <w:t>Couple</w:t>
+            </w:r>
+          </w:p>
+        </w:tc>
+        <w:tc>
+          <w:tcPr>
+            <w:tcW w:w="1016" w:type="dxa"/>
+            <w:tcBorders>
+              <w:top w:val="single" w:sz="4" w:space="0" w:color="000000"/>
+              <w:left w:val="single" w:sz="4" w:space="0" w:color="000000"/>
+              <w:bottom w:val="single" w:sz="4" w:space="0" w:color="000000"/>
+            </w:tcBorders>
+            <w:vAlign w:val="bottom"/>
+          </w:tcPr>
+          <w:p>
+            <w:pPr>
+              <w:pStyle w:val="Normal"/>
+              <w:widowControl w:val="false"/>
+              <w:spacing w:lineRule="auto" w:line="180"/>
+              <w:jc w:val="center"/>
+              <w:rPr>
+                <w:sz w:val="16"/>
+                <w:szCs w:val="16"/>
+              </w:rPr>
+            </w:pPr>
+            <w:r>
+              <w:rPr>
+                <w:rFonts w:eastAsia="arial" w:ascii="arial" w:hAnsi="arial"/>
+                <w:color w:val="000000"/>
+                <w:sz w:val="16"/>
+                <w:szCs w:val="16"/>
+              </w:rPr>
+              <w:t>1-Person</w:t>
+            </w:r>
+          </w:p>
+        </w:tc>
+        <w:tc>
+          <w:tcPr>
+            <w:tcW w:w="1029" w:type="dxa"/>
+            <w:tcBorders>
+              <w:top w:val="single" w:sz="4" w:space="0" w:color="000000"/>
+              <w:left w:val="single" w:sz="4" w:space="0" w:color="000000"/>
+              <w:bottom w:val="single" w:sz="4" w:space="0" w:color="000000"/>
+              <w:right w:val="single" w:sz="4" w:space="0" w:color="000000"/>
+            </w:tcBorders>
+            <w:vAlign w:val="bottom"/>
+          </w:tcPr>
+          <w:p>
+            <w:pPr>
+              <w:pStyle w:val="Normal"/>
+              <w:widowControl w:val="false"/>
+              <w:spacing w:lineRule="auto" w:line="180"/>
+              <w:jc w:val="center"/>
+              <w:rPr>
+                <w:sz w:val="16"/>
+                <w:szCs w:val="16"/>
+              </w:rPr>
+            </w:pPr>
+            <w:r>
+              <w:rPr>
+                <w:rFonts w:eastAsia="arial" w:ascii="arial" w:hAnsi="arial"/>
+                <w:color w:val="000000"/>
+                <w:sz w:val="16"/>
+                <w:szCs w:val="16"/>
+              </w:rPr>
+              <w:t>Next</w:t>
+            </w:r>
+          </w:p>
+          <w:p>
+            <w:pPr>
+              <w:pStyle w:val="Normal"/>
+              <w:widowControl w:val="false"/>
+              <w:spacing w:lineRule="auto" w:line="180"/>
+              <w:jc w:val="center"/>
+              <w:rPr>
+                <w:sz w:val="16"/>
+                <w:szCs w:val="16"/>
+              </w:rPr>
+            </w:pPr>
+            <w:r>
+              <w:rPr>
+                <w:rFonts w:eastAsia="arial" w:ascii="arial" w:hAnsi="arial"/>
+                <w:color w:val="000000"/>
+                <w:sz w:val="16"/>
+                <w:szCs w:val="16"/>
+              </w:rPr>
+              <w:t>Cab Cam</w:t>
+            </w:r>
+          </w:p>
+        </w:tc>
+      </w:tr>
+    </w:tbl>
+    <w:p>
+      <w:pPr>
+        <w:pStyle w:val="Normal"/>
+        <w:rPr>
+          <w:rFonts w:ascii="arial" w:hAnsi="arial" w:eastAsia="arial"/>
+          <w:color w:val="000000"/>
+          <w:sz w:val="16"/>
+          <w:szCs w:val="16"/>
+        </w:rPr>
+      </w:pPr>
+      <w:r>
+        <w:rPr>
+          <w:rFonts w:eastAsia="arial" w:ascii="arial" w:hAnsi="arial"/>
+          <w:color w:val="000000"/>
+          <w:sz w:val="16"/>
+          <w:szCs w:val="16"/>
+        </w:rPr>
+      </w:r>
+    </w:p>
+    <w:p>
+      <w:pPr>
+        <w:pStyle w:val="Normal"/>
+        <w:rPr>
+          <w:color w:val="000000"/>
+          <w:sz w:val="16"/>
+          <w:szCs w:val="16"/>
+        </w:rPr>
+      </w:pPr>
+      <w:r>
+        <w:rPr>
+          <w:rFonts w:eastAsia="arial" w:ascii="arial" w:hAnsi="arial"/>
+          <w:color w:val="000000"/>
+          <w:sz w:val="16"/>
+          <w:szCs w:val="16"/>
+        </w:rPr>
+        <w:tab/>
+        <w:t xml:space="preserve">           Class 314-2</w:t>
+      </w:r>
+    </w:p>
+    <w:tbl>
+      <w:tblPr>
+        <w:tblW w:w="14248" w:type="dxa"/>
+        <w:jc w:val="left"/>
+        <w:tblInd w:w="-5" w:type="dxa"/>
+        <w:tblLayout w:type="fixed"/>
+        <w:tblCellMar>
+          <w:top w:w="0" w:type="dxa"/>
+          <w:left w:w="108" w:type="dxa"/>
+          <w:bottom w:w="0" w:type="dxa"/>
+          <w:right w:w="108" w:type="dxa"/>
+        </w:tblCellMar>
+        <w:tblLook w:firstRow="1" w:noVBand="1" w:lastRow="0" w:firstColumn="1" w:lastColumn="0" w:noHBand="0" w:val="04a0"/>
+      </w:tblPr>
+      <w:tblGrid>
+        <w:gridCol w:w="1017"/>
+        <w:gridCol w:w="1019"/>
+        <w:gridCol w:w="1014"/>
+        <w:gridCol w:w="1016"/>
+        <w:gridCol w:w="1020"/>
+        <w:gridCol w:w="1016"/>
+        <w:gridCol w:w="1016"/>
+        <w:gridCol w:w="1017"/>
+        <w:gridCol w:w="1016"/>
+        <w:gridCol w:w="1020"/>
+        <w:gridCol w:w="1016"/>
+        <w:gridCol w:w="1016"/>
+        <w:gridCol w:w="1016"/>
+        <w:gridCol w:w="1029"/>
+      </w:tblGrid>
+      <w:tr>
+        <w:trPr>
+          <w:trHeight w:val="440" w:hRule="exact"/>
+          <w:cantSplit w:val="true"/>
+        </w:trPr>
+        <w:tc>
+          <w:tcPr>
+            <w:tcW w:w="1017" w:type="dxa"/>
+            <w:tcBorders>
+              <w:top w:val="single" w:sz="4" w:space="0" w:color="000000"/>
+              <w:left w:val="single" w:sz="4" w:space="0" w:color="000000"/>
+              <w:bottom w:val="single" w:sz="4" w:space="0" w:color="000000"/>
+            </w:tcBorders>
+            <w:vAlign w:val="bottom"/>
+          </w:tcPr>
+          <w:p>
+            <w:pPr>
+              <w:pStyle w:val="Normal"/>
+              <w:widowControl w:val="false"/>
+              <w:spacing w:lineRule="auto" w:line="180" w:before="0" w:after="60"/>
+              <w:jc w:val="center"/>
+              <w:rPr>
+                <w:b/>
+                <w:bCs/>
+              </w:rPr>
+            </w:pPr>
+            <w:r>
+              <w:rPr>
+                <w:b/>
+                <w:bCs/>
+                <w:color w:val="000000"/>
+                <w:sz w:val="16"/>
+                <w:szCs w:val="16"/>
+              </w:rPr>
+              <w:t>HUD</w:t>
+            </w:r>
+          </w:p>
+        </w:tc>
+        <w:tc>
+          <w:tcPr>
+            <w:tcW w:w="1019" w:type="dxa"/>
+            <w:tcBorders>
+              <w:top w:val="single" w:sz="4" w:space="0" w:color="000000"/>
+              <w:left w:val="single" w:sz="4" w:space="0" w:color="000000"/>
+              <w:bottom w:val="single" w:sz="4" w:space="0" w:color="000000"/>
+            </w:tcBorders>
+            <w:vAlign w:val="bottom"/>
+          </w:tcPr>
+          <w:p>
+            <w:pPr>
+              <w:pStyle w:val="Normal"/>
+              <w:widowControl w:val="false"/>
+              <w:spacing w:lineRule="auto" w:line="180"/>
+              <w:jc w:val="center"/>
+              <w:rPr>
+                <w:color w:val="000000"/>
+                <w:sz w:val="16"/>
+                <w:szCs w:val="16"/>
+              </w:rPr>
+            </w:pPr>
+            <w:r>
+              <w:rPr>
+                <w:color w:val="000000"/>
+                <w:sz w:val="16"/>
+                <w:szCs w:val="16"/>
+              </w:rPr>
+              <w:t>Schedule</w:t>
+            </w:r>
+          </w:p>
+        </w:tc>
+        <w:tc>
+          <w:tcPr>
+            <w:tcW w:w="1014" w:type="dxa"/>
+            <w:tcBorders>
+              <w:top w:val="single" w:sz="4" w:space="0" w:color="000000"/>
+              <w:left w:val="single" w:sz="4" w:space="0" w:color="000000"/>
+              <w:bottom w:val="single" w:sz="4" w:space="0" w:color="000000"/>
+            </w:tcBorders>
+            <w:vAlign w:val="bottom"/>
+          </w:tcPr>
+          <w:p>
+            <w:pPr>
+              <w:pStyle w:val="Normal"/>
+              <w:widowControl w:val="false"/>
+              <w:spacing w:lineRule="auto" w:line="180"/>
+              <w:jc w:val="center"/>
+              <w:rPr>
+                <w:color w:val="000000"/>
+                <w:sz w:val="16"/>
+                <w:szCs w:val="16"/>
+              </w:rPr>
+            </w:pPr>
+            <w:r>
+              <w:rPr>
+                <w:color w:val="000000"/>
+                <w:sz w:val="16"/>
+                <w:szCs w:val="16"/>
+              </w:rPr>
+              <w:t>Auxiliary</w:t>
+            </w:r>
+          </w:p>
+          <w:p>
+            <w:pPr>
+              <w:pStyle w:val="Normal"/>
+              <w:widowControl w:val="false"/>
+              <w:spacing w:lineRule="auto" w:line="180"/>
+              <w:jc w:val="center"/>
+              <w:rPr>
+                <w:color w:val="000000"/>
+                <w:sz w:val="16"/>
+                <w:szCs w:val="16"/>
+              </w:rPr>
+            </w:pPr>
+            <w:r>
+              <w:rPr>
+                <w:rFonts w:eastAsia="arial" w:ascii="arial" w:hAnsi="arial"/>
+                <w:color w:val="000000"/>
+                <w:sz w:val="16"/>
+                <w:szCs w:val="16"/>
+              </w:rPr>
+              <w:t>Trip</w:t>
+            </w:r>
+          </w:p>
+        </w:tc>
+        <w:tc>
+          <w:tcPr>
+            <w:tcW w:w="1016" w:type="dxa"/>
+            <w:tcBorders>
+              <w:top w:val="single" w:sz="4" w:space="0" w:color="000000"/>
+              <w:left w:val="single" w:sz="4" w:space="0" w:color="000000"/>
+              <w:bottom w:val="single" w:sz="4" w:space="0" w:color="000000"/>
+            </w:tcBorders>
+            <w:vAlign w:val="bottom"/>
+          </w:tcPr>
+          <w:p>
+            <w:pPr>
+              <w:pStyle w:val="Normal"/>
+              <w:widowControl w:val="false"/>
+              <w:spacing w:lineRule="auto" w:line="180"/>
+              <w:jc w:val="center"/>
+              <w:rPr>
+                <w:color w:val="000000"/>
+                <w:sz w:val="16"/>
+                <w:szCs w:val="16"/>
+              </w:rPr>
+            </w:pPr>
+            <w:r>
+              <w:rPr>
+                <w:color w:val="000000"/>
+                <w:sz w:val="16"/>
+                <w:szCs w:val="16"/>
+              </w:rPr>
+              <w:t>DSD</w:t>
+            </w:r>
+          </w:p>
+        </w:tc>
+        <w:tc>
+          <w:tcPr>
+            <w:tcW w:w="1020" w:type="dxa"/>
+            <w:tcBorders>
+              <w:top w:val="single" w:sz="4" w:space="0" w:color="000000"/>
+              <w:left w:val="single" w:sz="4" w:space="0" w:color="000000"/>
+              <w:bottom w:val="single" w:sz="4" w:space="0" w:color="000000"/>
+            </w:tcBorders>
+            <w:vAlign w:val="bottom"/>
+          </w:tcPr>
+          <w:p>
+            <w:pPr>
+              <w:pStyle w:val="Normal"/>
+              <w:widowControl w:val="false"/>
+              <w:spacing w:lineRule="auto" w:line="180"/>
+              <w:jc w:val="center"/>
+              <w:rPr>
+                <w:color w:val="000000"/>
+                <w:sz w:val="16"/>
+                <w:szCs w:val="16"/>
+              </w:rPr>
+            </w:pPr>
+            <w:r>
+              <w:rPr>
+                <w:color w:val="000000"/>
+                <w:sz w:val="16"/>
+                <w:szCs w:val="16"/>
+              </w:rPr>
+              <w:t>Panto. Low</w:t>
+            </w:r>
+          </w:p>
+        </w:tc>
+        <w:tc>
+          <w:tcPr>
+            <w:tcW w:w="1016" w:type="dxa"/>
+            <w:tcBorders>
+              <w:top w:val="single" w:sz="4" w:space="0" w:color="000000"/>
+              <w:left w:val="single" w:sz="4" w:space="0" w:color="000000"/>
+              <w:bottom w:val="single" w:sz="4" w:space="0" w:color="000000"/>
+            </w:tcBorders>
+            <w:vAlign w:val="bottom"/>
+          </w:tcPr>
+          <w:p>
+            <w:pPr>
+              <w:pStyle w:val="Normal"/>
+              <w:widowControl w:val="false"/>
+              <w:spacing w:lineRule="auto" w:line="180"/>
+              <w:jc w:val="center"/>
+              <w:rPr>
+                <w:sz w:val="16"/>
+                <w:szCs w:val="16"/>
+              </w:rPr>
+            </w:pPr>
+            <w:r>
+              <w:rPr>
+                <w:sz w:val="16"/>
+                <w:szCs w:val="16"/>
+              </w:rPr>
+              <w:t>Lignting Trip</w:t>
+            </w:r>
+          </w:p>
+        </w:tc>
+        <w:tc>
+          <w:tcPr>
+            <w:tcW w:w="1016" w:type="dxa"/>
+            <w:tcBorders>
+              <w:top w:val="single" w:sz="4" w:space="0" w:color="000000"/>
+              <w:left w:val="single" w:sz="4" w:space="0" w:color="000000"/>
+              <w:bottom w:val="single" w:sz="4" w:space="0" w:color="000000"/>
+            </w:tcBorders>
+            <w:vAlign w:val="bottom"/>
+          </w:tcPr>
+          <w:p>
+            <w:pPr>
+              <w:pStyle w:val="Normal"/>
+              <w:widowControl w:val="false"/>
+              <w:spacing w:lineRule="auto" w:line="180"/>
+              <w:jc w:val="center"/>
+              <w:rPr>
+                <w:color w:val="000000"/>
+                <w:sz w:val="16"/>
+                <w:szCs w:val="16"/>
+              </w:rPr>
+            </w:pPr>
+            <w:r>
+              <w:rPr>
+                <w:color w:val="000000"/>
+                <w:sz w:val="16"/>
+                <w:szCs w:val="16"/>
+              </w:rPr>
+              <w:t>TPWS Cutout</w:t>
+            </w:r>
+          </w:p>
+        </w:tc>
+        <w:tc>
+          <w:tcPr>
+            <w:tcW w:w="1017" w:type="dxa"/>
+            <w:tcBorders>
+              <w:top w:val="single" w:sz="4" w:space="0" w:color="000000"/>
+              <w:left w:val="single" w:sz="4" w:space="0" w:color="000000"/>
+              <w:bottom w:val="single" w:sz="4" w:space="0" w:color="000000"/>
+            </w:tcBorders>
+            <w:vAlign w:val="bottom"/>
+          </w:tcPr>
+          <w:p>
+            <w:pPr>
+              <w:pStyle w:val="Normal"/>
+              <w:widowControl w:val="false"/>
+              <w:jc w:val="center"/>
+              <w:rPr>
+                <w:rFonts w:ascii="arial" w:hAnsi="arial" w:eastAsia="arial"/>
+                <w:color w:val="000000"/>
+                <w:sz w:val="16"/>
+                <w:szCs w:val="16"/>
+              </w:rPr>
+            </w:pPr>
+            <w:r>
+              <w:rPr>
+                <w:rFonts w:eastAsia="arial" w:ascii="arial" w:hAnsi="arial"/>
+                <w:color w:val="000000"/>
+                <w:sz w:val="16"/>
+                <w:szCs w:val="16"/>
+              </w:rPr>
+            </w:r>
+          </w:p>
+        </w:tc>
+        <w:tc>
+          <w:tcPr>
+            <w:tcW w:w="1016" w:type="dxa"/>
+            <w:tcBorders>
+              <w:top w:val="single" w:sz="4" w:space="0" w:color="000000"/>
+              <w:left w:val="single" w:sz="4" w:space="0" w:color="000000"/>
+              <w:bottom w:val="single" w:sz="4" w:space="0" w:color="000000"/>
+            </w:tcBorders>
+            <w:vAlign w:val="bottom"/>
+          </w:tcPr>
+          <w:p>
+            <w:pPr>
+              <w:pStyle w:val="Normal"/>
+              <w:widowControl w:val="false"/>
+              <w:jc w:val="center"/>
+              <w:rPr>
+                <w:sz w:val="16"/>
+                <w:szCs w:val="16"/>
+              </w:rPr>
+            </w:pPr>
+            <w:r>
+              <w:rPr>
+                <w:sz w:val="16"/>
+                <w:szCs w:val="16"/>
+              </w:rPr>
+              <w:t>Headlight Beam</w:t>
+            </w:r>
+          </w:p>
+        </w:tc>
+        <w:tc>
+          <w:tcPr>
+            <w:tcW w:w="1020" w:type="dxa"/>
+            <w:tcBorders>
+              <w:top w:val="single" w:sz="4" w:space="0" w:color="000000"/>
+              <w:left w:val="single" w:sz="4" w:space="0" w:color="000000"/>
+              <w:bottom w:val="single" w:sz="4" w:space="0" w:color="000000"/>
+            </w:tcBorders>
+            <w:vAlign w:val="bottom"/>
+          </w:tcPr>
+          <w:p>
+            <w:pPr>
+              <w:pStyle w:val="Normal"/>
+              <w:widowControl w:val="false"/>
+              <w:jc w:val="center"/>
+              <w:rPr>
+                <w:color w:val="000000"/>
+                <w:sz w:val="16"/>
+                <w:szCs w:val="16"/>
+              </w:rPr>
+            </w:pPr>
+            <w:r>
+              <w:rPr>
+                <w:color w:val="000000"/>
+                <w:sz w:val="16"/>
+                <w:szCs w:val="16"/>
+              </w:rPr>
+              <w:t>Vestibule Light</w:t>
+            </w:r>
+          </w:p>
+        </w:tc>
+        <w:tc>
+          <w:tcPr>
+            <w:tcW w:w="1016" w:type="dxa"/>
+            <w:tcBorders>
+              <w:top w:val="single" w:sz="4" w:space="0" w:color="000000"/>
+              <w:left w:val="single" w:sz="4" w:space="0" w:color="000000"/>
+              <w:bottom w:val="single" w:sz="4" w:space="0" w:color="000000"/>
+            </w:tcBorders>
+            <w:vAlign w:val="bottom"/>
+          </w:tcPr>
+          <w:p>
+            <w:pPr>
+              <w:pStyle w:val="Normal"/>
+              <w:widowControl w:val="false"/>
+              <w:jc w:val="center"/>
+              <w:rPr>
+                <w:color w:val="000000"/>
+                <w:sz w:val="16"/>
+                <w:szCs w:val="16"/>
+              </w:rPr>
+            </w:pPr>
+            <w:r>
+              <w:rPr>
+                <w:color w:val="000000"/>
+                <w:sz w:val="16"/>
+                <w:szCs w:val="16"/>
+              </w:rPr>
+              <w:t>Fluores. Light</w:t>
+            </w:r>
+          </w:p>
+        </w:tc>
+        <w:tc>
+          <w:tcPr>
+            <w:tcW w:w="1016" w:type="dxa"/>
+            <w:tcBorders>
+              <w:top w:val="single" w:sz="4" w:space="0" w:color="000000"/>
+              <w:left w:val="single" w:sz="4" w:space="0" w:color="000000"/>
+              <w:bottom w:val="single" w:sz="4" w:space="0" w:color="000000"/>
+            </w:tcBorders>
+            <w:vAlign w:val="bottom"/>
+          </w:tcPr>
+          <w:p>
+            <w:pPr>
+              <w:pStyle w:val="Normal"/>
+              <w:widowControl w:val="false"/>
+              <w:spacing w:lineRule="auto" w:line="180"/>
+              <w:jc w:val="center"/>
+              <w:rPr>
+                <w:sz w:val="16"/>
+                <w:szCs w:val="16"/>
+              </w:rPr>
+            </w:pPr>
+            <w:r>
+              <w:rPr>
+                <w:sz w:val="16"/>
+                <w:szCs w:val="16"/>
+              </w:rPr>
+              <w:t>Uncouple</w:t>
+            </w:r>
+          </w:p>
+        </w:tc>
+        <w:tc>
+          <w:tcPr>
+            <w:tcW w:w="1016" w:type="dxa"/>
+            <w:tcBorders>
+              <w:top w:val="single" w:sz="4" w:space="0" w:color="000000"/>
+              <w:left w:val="single" w:sz="4" w:space="0" w:color="000000"/>
+              <w:bottom w:val="single" w:sz="4" w:space="0" w:color="000000"/>
+            </w:tcBorders>
+            <w:vAlign w:val="bottom"/>
+          </w:tcPr>
+          <w:p>
+            <w:pPr>
+              <w:pStyle w:val="Normal"/>
+              <w:widowControl w:val="false"/>
+              <w:spacing w:lineRule="auto" w:line="180"/>
+              <w:jc w:val="center"/>
+              <w:rPr>
+                <w:sz w:val="16"/>
+                <w:szCs w:val="16"/>
+              </w:rPr>
+            </w:pPr>
+            <w:r>
+              <w:rPr>
+                <w:rFonts w:eastAsia="arial" w:ascii="arial" w:hAnsi="arial"/>
+                <w:color w:val="000000"/>
+                <w:sz w:val="16"/>
+                <w:szCs w:val="16"/>
+              </w:rPr>
+              <w:t>Exterior</w:t>
+            </w:r>
+          </w:p>
+          <w:p>
+            <w:pPr>
+              <w:pStyle w:val="Normal"/>
+              <w:widowControl w:val="false"/>
+              <w:spacing w:lineRule="auto" w:line="180"/>
+              <w:jc w:val="center"/>
+              <w:rPr>
+                <w:sz w:val="16"/>
+                <w:szCs w:val="16"/>
+              </w:rPr>
+            </w:pPr>
+            <w:r>
+              <w:rPr>
+                <w:rFonts w:eastAsia="arial" w:ascii="arial" w:hAnsi="arial"/>
+                <w:color w:val="000000"/>
+                <w:sz w:val="16"/>
+                <w:szCs w:val="16"/>
+              </w:rPr>
+              <w:t>Camera</w:t>
+            </w:r>
+          </w:p>
+        </w:tc>
+        <w:tc>
+          <w:tcPr>
+            <w:tcW w:w="1029" w:type="dxa"/>
+            <w:tcBorders>
+              <w:top w:val="single" w:sz="4" w:space="0" w:color="000000"/>
+              <w:left w:val="single" w:sz="4" w:space="0" w:color="000000"/>
+              <w:bottom w:val="single" w:sz="4" w:space="0" w:color="000000"/>
+              <w:right w:val="single" w:sz="4" w:space="0" w:color="000000"/>
+            </w:tcBorders>
+            <w:vAlign w:val="bottom"/>
+          </w:tcPr>
+          <w:p>
+            <w:pPr>
+              <w:pStyle w:val="Normal"/>
+              <w:widowControl w:val="false"/>
+              <w:spacing w:lineRule="auto" w:line="180"/>
+              <w:jc w:val="center"/>
+              <w:rPr>
+                <w:sz w:val="16"/>
+                <w:szCs w:val="16"/>
+              </w:rPr>
+            </w:pPr>
+            <w:r>
+              <w:rPr>
+                <w:rFonts w:eastAsia="arial" w:ascii="arial" w:hAnsi="arial"/>
+                <w:color w:val="000000"/>
+                <w:sz w:val="16"/>
+                <w:szCs w:val="16"/>
+              </w:rPr>
+              <w:t>Prev</w:t>
+            </w:r>
+          </w:p>
+          <w:p>
+            <w:pPr>
+              <w:pStyle w:val="Normal"/>
+              <w:widowControl w:val="false"/>
+              <w:spacing w:lineRule="auto" w:line="180"/>
+              <w:jc w:val="center"/>
+              <w:rPr>
+                <w:sz w:val="16"/>
+                <w:szCs w:val="16"/>
+              </w:rPr>
+            </w:pPr>
+            <w:r>
+              <w:rPr>
+                <w:rFonts w:eastAsia="arial" w:ascii="arial" w:hAnsi="arial"/>
+                <w:color w:val="000000"/>
+                <w:sz w:val="16"/>
+                <w:szCs w:val="16"/>
+              </w:rPr>
+              <w:t>Cab Cam</w:t>
+            </w:r>
+          </w:p>
+        </w:tc>
+      </w:tr>
+    </w:tbl>
+    <w:p>
+      <w:pPr>
+        <w:pStyle w:val="Normal"/>
+        <w:rPr>
+          <w:color w:val="000000"/>
+          <w:sz w:val="16"/>
+          <w:szCs w:val="16"/>
+        </w:rPr>
+      </w:pPr>
+      <w:r>
+        <w:rPr>
+          <w:color w:val="000000"/>
+          <w:sz w:val="16"/>
+          <w:szCs w:val="16"/>
+        </w:rPr>
+      </w:r>
+    </w:p>
+    <w:p>
+      <w:pPr>
+        <w:pStyle w:val="Normal"/>
+        <w:rPr>
+          <w:color w:val="000000"/>
+          <w:sz w:val="16"/>
+          <w:szCs w:val="16"/>
+        </w:rPr>
+      </w:pPr>
+      <w:r>
+        <w:rPr>
+          <w:rFonts w:eastAsia="arial" w:ascii="arial" w:hAnsi="arial"/>
+          <w:color w:val="000000"/>
+          <w:sz w:val="16"/>
+          <w:szCs w:val="16"/>
+        </w:rPr>
+        <w:tab/>
+        <w:t xml:space="preserve">           Class 323-1</w:t>
+      </w:r>
+    </w:p>
+    <w:tbl>
+      <w:tblPr>
+        <w:tblW w:w="14248" w:type="dxa"/>
+        <w:jc w:val="left"/>
+        <w:tblInd w:w="-5" w:type="dxa"/>
+        <w:tblLayout w:type="fixed"/>
+        <w:tblCellMar>
+          <w:top w:w="0" w:type="dxa"/>
+          <w:left w:w="108" w:type="dxa"/>
+          <w:bottom w:w="0" w:type="dxa"/>
+          <w:right w:w="108" w:type="dxa"/>
+        </w:tblCellMar>
+        <w:tblLook w:firstRow="1" w:noVBand="1" w:lastRow="0" w:firstColumn="1" w:lastColumn="0" w:noHBand="0" w:val="04a0"/>
+      </w:tblPr>
+      <w:tblGrid>
+        <w:gridCol w:w="1017"/>
+        <w:gridCol w:w="1019"/>
+        <w:gridCol w:w="1014"/>
+        <w:gridCol w:w="1016"/>
+        <w:gridCol w:w="1020"/>
+        <w:gridCol w:w="1016"/>
+        <w:gridCol w:w="1016"/>
+        <w:gridCol w:w="1017"/>
+        <w:gridCol w:w="1016"/>
+        <w:gridCol w:w="1020"/>
+        <w:gridCol w:w="1016"/>
+        <w:gridCol w:w="1016"/>
+        <w:gridCol w:w="1016"/>
+        <w:gridCol w:w="1029"/>
+      </w:tblGrid>
+      <w:tr>
+        <w:trPr>
+          <w:trHeight w:val="440" w:hRule="exact"/>
+          <w:cantSplit w:val="true"/>
+        </w:trPr>
+        <w:tc>
+          <w:tcPr>
+            <w:tcW w:w="1017" w:type="dxa"/>
+            <w:tcBorders>
+              <w:top w:val="single" w:sz="4" w:space="0" w:color="000000"/>
+              <w:left w:val="single" w:sz="4" w:space="0" w:color="000000"/>
+              <w:bottom w:val="single" w:sz="4" w:space="0" w:color="000000"/>
+            </w:tcBorders>
+            <w:vAlign w:val="bottom"/>
+          </w:tcPr>
+          <w:p>
+            <w:pPr>
+              <w:pStyle w:val="Normal"/>
+              <w:widowControl w:val="false"/>
+              <w:spacing w:lineRule="auto" w:line="180" w:before="0" w:after="60"/>
+              <w:jc w:val="center"/>
+              <w:rPr>
+                <w:color w:val="000000"/>
+                <w:sz w:val="16"/>
+                <w:szCs w:val="16"/>
+              </w:rPr>
+            </w:pPr>
+            <w:r>
+              <w:rPr>
+                <w:rFonts w:eastAsia="arial" w:ascii="arial" w:hAnsi="arial"/>
+                <w:b/>
+                <w:color w:val="000000"/>
+                <w:sz w:val="16"/>
+                <w:szCs w:val="16"/>
+              </w:rPr>
+              <w:t>Pause</w:t>
+            </w:r>
+          </w:p>
+        </w:tc>
+        <w:tc>
+          <w:tcPr>
+            <w:tcW w:w="1019" w:type="dxa"/>
+            <w:tcBorders>
+              <w:top w:val="single" w:sz="4" w:space="0" w:color="000000"/>
+              <w:left w:val="single" w:sz="4" w:space="0" w:color="000000"/>
+              <w:bottom w:val="single" w:sz="4" w:space="0" w:color="000000"/>
+            </w:tcBorders>
+            <w:vAlign w:val="bottom"/>
+          </w:tcPr>
+          <w:p>
+            <w:pPr>
+              <w:pStyle w:val="Normal"/>
+              <w:widowControl w:val="false"/>
+              <w:spacing w:lineRule="auto" w:line="180"/>
+              <w:jc w:val="center"/>
+              <w:rPr>
+                <w:color w:val="000000"/>
+                <w:sz w:val="16"/>
+                <w:szCs w:val="16"/>
+              </w:rPr>
+            </w:pPr>
+            <w:r>
+              <w:rPr>
+                <w:color w:val="000000"/>
+                <w:sz w:val="16"/>
+                <w:szCs w:val="16"/>
+              </w:rPr>
+              <w:t>Master Key</w:t>
+            </w:r>
+          </w:p>
+        </w:tc>
+        <w:tc>
+          <w:tcPr>
+            <w:tcW w:w="1014" w:type="dxa"/>
+            <w:tcBorders>
+              <w:top w:val="single" w:sz="4" w:space="0" w:color="000000"/>
+              <w:left w:val="single" w:sz="4" w:space="0" w:color="000000"/>
+              <w:bottom w:val="single" w:sz="4" w:space="0" w:color="000000"/>
+            </w:tcBorders>
+            <w:vAlign w:val="bottom"/>
+          </w:tcPr>
+          <w:p>
+            <w:pPr>
+              <w:pStyle w:val="Normal"/>
+              <w:widowControl w:val="false"/>
+              <w:spacing w:lineRule="auto" w:line="180"/>
+              <w:jc w:val="center"/>
+              <w:rPr>
+                <w:color w:val="000000"/>
+                <w:sz w:val="16"/>
+                <w:szCs w:val="16"/>
+              </w:rPr>
+            </w:pPr>
+            <w:r>
+              <w:rPr>
+                <w:rFonts w:eastAsia="arial" w:ascii="arial" w:hAnsi="arial"/>
+                <w:color w:val="000000"/>
+                <w:sz w:val="16"/>
+                <w:szCs w:val="16"/>
+              </w:rPr>
+              <w:t>Aux On</w:t>
+            </w:r>
+          </w:p>
+        </w:tc>
+        <w:tc>
+          <w:tcPr>
+            <w:tcW w:w="1016" w:type="dxa"/>
+            <w:tcBorders>
+              <w:top w:val="single" w:sz="4" w:space="0" w:color="000000"/>
+              <w:left w:val="single" w:sz="4" w:space="0" w:color="000000"/>
+              <w:bottom w:val="single" w:sz="4" w:space="0" w:color="000000"/>
+            </w:tcBorders>
+            <w:vAlign w:val="bottom"/>
+          </w:tcPr>
+          <w:p>
+            <w:pPr>
+              <w:pStyle w:val="Normal"/>
+              <w:widowControl w:val="false"/>
+              <w:spacing w:lineRule="auto" w:line="180"/>
+              <w:jc w:val="center"/>
+              <w:rPr>
+                <w:color w:val="000000"/>
+                <w:sz w:val="16"/>
+                <w:szCs w:val="16"/>
+              </w:rPr>
+            </w:pPr>
+            <w:r>
+              <w:rPr>
+                <w:color w:val="000000"/>
+                <w:sz w:val="16"/>
+                <w:szCs w:val="16"/>
+              </w:rPr>
+              <w:t>AWS/TPWS</w:t>
+            </w:r>
+          </w:p>
+        </w:tc>
+        <w:tc>
+          <w:tcPr>
+            <w:tcW w:w="1020" w:type="dxa"/>
+            <w:tcBorders>
+              <w:top w:val="single" w:sz="4" w:space="0" w:color="000000"/>
+              <w:left w:val="single" w:sz="4" w:space="0" w:color="000000"/>
+              <w:bottom w:val="single" w:sz="4" w:space="0" w:color="000000"/>
+            </w:tcBorders>
+            <w:vAlign w:val="bottom"/>
+          </w:tcPr>
+          <w:p>
+            <w:pPr>
+              <w:pStyle w:val="Normal"/>
+              <w:widowControl w:val="false"/>
+              <w:spacing w:lineRule="auto" w:line="180"/>
+              <w:jc w:val="center"/>
+              <w:rPr>
+                <w:color w:val="000000"/>
+                <w:sz w:val="16"/>
+                <w:szCs w:val="16"/>
+              </w:rPr>
+            </w:pPr>
+            <w:r>
+              <w:rPr>
+                <w:color w:val="000000"/>
+                <w:sz w:val="16"/>
+                <w:szCs w:val="16"/>
+              </w:rPr>
+              <w:t>Panto. Raise</w:t>
+            </w:r>
+          </w:p>
+        </w:tc>
+        <w:tc>
+          <w:tcPr>
+            <w:tcW w:w="1016" w:type="dxa"/>
+            <w:tcBorders>
+              <w:top w:val="single" w:sz="4" w:space="0" w:color="000000"/>
+              <w:left w:val="single" w:sz="4" w:space="0" w:color="000000"/>
+              <w:bottom w:val="single" w:sz="4" w:space="0" w:color="000000"/>
+            </w:tcBorders>
+            <w:vAlign w:val="bottom"/>
+          </w:tcPr>
+          <w:p>
+            <w:pPr>
+              <w:pStyle w:val="Normal"/>
+              <w:widowControl w:val="false"/>
+              <w:spacing w:lineRule="auto" w:line="180"/>
+              <w:jc w:val="center"/>
+              <w:rPr>
+                <w:color w:val="000000"/>
+                <w:sz w:val="16"/>
+                <w:szCs w:val="16"/>
+              </w:rPr>
+            </w:pPr>
+            <w:r>
+              <w:rPr>
+                <w:color w:val="000000"/>
+                <w:sz w:val="16"/>
+                <w:szCs w:val="16"/>
+              </w:rPr>
+              <w:t>Coach Light On</w:t>
+            </w:r>
+          </w:p>
+        </w:tc>
+        <w:tc>
+          <w:tcPr>
+            <w:tcW w:w="1016" w:type="dxa"/>
+            <w:tcBorders>
+              <w:top w:val="single" w:sz="4" w:space="0" w:color="000000"/>
+              <w:left w:val="single" w:sz="4" w:space="0" w:color="000000"/>
+              <w:bottom w:val="single" w:sz="4" w:space="0" w:color="000000"/>
+            </w:tcBorders>
+            <w:vAlign w:val="bottom"/>
+          </w:tcPr>
+          <w:p>
+            <w:pPr>
+              <w:pStyle w:val="Normal"/>
+              <w:widowControl w:val="false"/>
+              <w:jc w:val="center"/>
+              <w:rPr>
+                <w:sz w:val="16"/>
+                <w:szCs w:val="16"/>
+              </w:rPr>
+            </w:pPr>
+            <w:r>
+              <w:rPr>
+                <w:sz w:val="16"/>
+                <w:szCs w:val="16"/>
+              </w:rPr>
+              <w:t>DRA</w:t>
+            </w:r>
+          </w:p>
+        </w:tc>
+        <w:tc>
+          <w:tcPr>
+            <w:tcW w:w="1017" w:type="dxa"/>
+            <w:tcBorders>
+              <w:top w:val="single" w:sz="4" w:space="0" w:color="000000"/>
+              <w:left w:val="single" w:sz="4" w:space="0" w:color="000000"/>
+              <w:bottom w:val="single" w:sz="4" w:space="0" w:color="000000"/>
+            </w:tcBorders>
+            <w:vAlign w:val="bottom"/>
+          </w:tcPr>
+          <w:p>
+            <w:pPr>
+              <w:pStyle w:val="Normal"/>
+              <w:widowControl w:val="false"/>
+              <w:jc w:val="center"/>
+              <w:rPr>
+                <w:color w:val="000000"/>
+                <w:sz w:val="16"/>
+                <w:szCs w:val="16"/>
+              </w:rPr>
+            </w:pPr>
+            <w:r>
+              <w:rPr>
+                <w:color w:val="000000"/>
+                <w:sz w:val="16"/>
+                <w:szCs w:val="16"/>
+              </w:rPr>
+            </w:r>
+          </w:p>
+        </w:tc>
+        <w:tc>
+          <w:tcPr>
+            <w:tcW w:w="1016" w:type="dxa"/>
+            <w:tcBorders>
+              <w:top w:val="single" w:sz="4" w:space="0" w:color="000000"/>
+              <w:left w:val="single" w:sz="4" w:space="0" w:color="000000"/>
+              <w:bottom w:val="single" w:sz="4" w:space="0" w:color="000000"/>
+            </w:tcBorders>
+            <w:vAlign w:val="bottom"/>
+          </w:tcPr>
+          <w:p>
+            <w:pPr>
+              <w:pStyle w:val="Normal"/>
+              <w:widowControl w:val="false"/>
+              <w:jc w:val="center"/>
+              <w:rPr>
+                <w:sz w:val="16"/>
+                <w:szCs w:val="16"/>
+              </w:rPr>
+            </w:pPr>
+            <w:r>
+              <w:rPr>
+                <w:sz w:val="16"/>
+                <w:szCs w:val="16"/>
+              </w:rPr>
+            </w:r>
+          </w:p>
+        </w:tc>
+        <w:tc>
+          <w:tcPr>
+            <w:tcW w:w="1020" w:type="dxa"/>
+            <w:tcBorders>
+              <w:top w:val="single" w:sz="4" w:space="0" w:color="000000"/>
+              <w:left w:val="single" w:sz="4" w:space="0" w:color="000000"/>
+              <w:bottom w:val="single" w:sz="4" w:space="0" w:color="000000"/>
+            </w:tcBorders>
+            <w:vAlign w:val="bottom"/>
+          </w:tcPr>
+          <w:p>
+            <w:pPr>
+              <w:pStyle w:val="Normal"/>
+              <w:widowControl w:val="false"/>
+              <w:jc w:val="center"/>
+              <w:rPr>
+                <w:color w:val="000000"/>
+                <w:sz w:val="16"/>
+                <w:szCs w:val="16"/>
+              </w:rPr>
+            </w:pPr>
+            <w:r>
+              <w:rPr>
+                <w:color w:val="000000"/>
+                <w:sz w:val="16"/>
+                <w:szCs w:val="16"/>
+              </w:rPr>
+              <w:t>Hazard Light</w:t>
+            </w:r>
+          </w:p>
+        </w:tc>
+        <w:tc>
+          <w:tcPr>
+            <w:tcW w:w="1016" w:type="dxa"/>
+            <w:tcBorders>
+              <w:top w:val="single" w:sz="4" w:space="0" w:color="000000"/>
+              <w:left w:val="single" w:sz="4" w:space="0" w:color="000000"/>
+              <w:bottom w:val="single" w:sz="4" w:space="0" w:color="000000"/>
+            </w:tcBorders>
+            <w:vAlign w:val="bottom"/>
+          </w:tcPr>
+          <w:p>
+            <w:pPr>
+              <w:pStyle w:val="Normal"/>
+              <w:widowControl w:val="false"/>
+              <w:spacing w:lineRule="auto" w:line="180"/>
+              <w:jc w:val="center"/>
+              <w:rPr>
+                <w:sz w:val="16"/>
+                <w:szCs w:val="16"/>
+              </w:rPr>
+            </w:pPr>
+            <w:r>
+              <w:rPr>
+                <w:rFonts w:eastAsia="arial" w:ascii="arial" w:hAnsi="arial"/>
+                <w:color w:val="000000"/>
+                <w:sz w:val="16"/>
+                <w:szCs w:val="16"/>
+              </w:rPr>
+              <w:t>Cab Light</w:t>
+            </w:r>
+          </w:p>
+        </w:tc>
+        <w:tc>
+          <w:tcPr>
+            <w:tcW w:w="1016" w:type="dxa"/>
+            <w:tcBorders>
+              <w:top w:val="single" w:sz="4" w:space="0" w:color="000000"/>
+              <w:left w:val="single" w:sz="4" w:space="0" w:color="000000"/>
+              <w:bottom w:val="single" w:sz="4" w:space="0" w:color="000000"/>
+            </w:tcBorders>
+            <w:vAlign w:val="bottom"/>
+          </w:tcPr>
+          <w:p>
+            <w:pPr>
+              <w:pStyle w:val="Normal"/>
+              <w:widowControl w:val="false"/>
+              <w:jc w:val="center"/>
+              <w:rPr>
+                <w:color w:val="000000"/>
+                <w:sz w:val="16"/>
+                <w:szCs w:val="16"/>
+              </w:rPr>
+            </w:pPr>
+            <w:r>
+              <w:rPr>
+                <w:color w:val="000000"/>
+                <w:sz w:val="16"/>
+                <w:szCs w:val="16"/>
+              </w:rPr>
+              <w:t>Couple</w:t>
+            </w:r>
+          </w:p>
+        </w:tc>
+        <w:tc>
+          <w:tcPr>
+            <w:tcW w:w="1016" w:type="dxa"/>
+            <w:tcBorders>
+              <w:top w:val="single" w:sz="4" w:space="0" w:color="000000"/>
+              <w:left w:val="single" w:sz="4" w:space="0" w:color="000000"/>
+              <w:bottom w:val="single" w:sz="4" w:space="0" w:color="000000"/>
+            </w:tcBorders>
+            <w:vAlign w:val="bottom"/>
+          </w:tcPr>
+          <w:p>
+            <w:pPr>
+              <w:pStyle w:val="Normal"/>
+              <w:widowControl w:val="false"/>
+              <w:spacing w:lineRule="auto" w:line="180"/>
+              <w:jc w:val="center"/>
+              <w:rPr>
+                <w:sz w:val="16"/>
+                <w:szCs w:val="16"/>
+              </w:rPr>
+            </w:pPr>
+            <w:r>
+              <w:rPr>
+                <w:rFonts w:eastAsia="arial" w:ascii="arial" w:hAnsi="arial"/>
+                <w:color w:val="000000"/>
+                <w:sz w:val="16"/>
+                <w:szCs w:val="16"/>
+              </w:rPr>
+              <w:t>1-Person</w:t>
+            </w:r>
+          </w:p>
+        </w:tc>
+        <w:tc>
+          <w:tcPr>
+            <w:tcW w:w="1029" w:type="dxa"/>
+            <w:tcBorders>
+              <w:top w:val="single" w:sz="4" w:space="0" w:color="000000"/>
+              <w:left w:val="single" w:sz="4" w:space="0" w:color="000000"/>
+              <w:bottom w:val="single" w:sz="4" w:space="0" w:color="000000"/>
+              <w:right w:val="single" w:sz="4" w:space="0" w:color="000000"/>
+            </w:tcBorders>
+            <w:vAlign w:val="bottom"/>
+          </w:tcPr>
+          <w:p>
+            <w:pPr>
+              <w:pStyle w:val="Normal"/>
+              <w:widowControl w:val="false"/>
+              <w:spacing w:lineRule="auto" w:line="180"/>
+              <w:jc w:val="center"/>
+              <w:rPr>
+                <w:sz w:val="16"/>
+                <w:szCs w:val="16"/>
+              </w:rPr>
+            </w:pPr>
+            <w:r>
+              <w:rPr>
+                <w:rFonts w:eastAsia="arial" w:ascii="arial" w:hAnsi="arial"/>
+                <w:color w:val="000000"/>
+                <w:sz w:val="16"/>
+                <w:szCs w:val="16"/>
+              </w:rPr>
+              <w:t>Next</w:t>
+            </w:r>
+          </w:p>
+          <w:p>
+            <w:pPr>
+              <w:pStyle w:val="Normal"/>
+              <w:widowControl w:val="false"/>
+              <w:spacing w:lineRule="auto" w:line="180"/>
+              <w:jc w:val="center"/>
+              <w:rPr>
+                <w:sz w:val="16"/>
+                <w:szCs w:val="16"/>
+              </w:rPr>
+            </w:pPr>
+            <w:r>
+              <w:rPr>
+                <w:rFonts w:eastAsia="arial" w:ascii="arial" w:hAnsi="arial"/>
+                <w:color w:val="000000"/>
+                <w:sz w:val="16"/>
+                <w:szCs w:val="16"/>
+              </w:rPr>
+              <w:t>Cab Cam</w:t>
+            </w:r>
+          </w:p>
+        </w:tc>
+      </w:tr>
+    </w:tbl>
+    <w:p>
+      <w:pPr>
+        <w:pStyle w:val="Normal"/>
+        <w:rPr>
+          <w:rFonts w:ascii="arial" w:hAnsi="arial" w:eastAsia="arial"/>
+          <w:color w:val="000000"/>
+          <w:sz w:val="16"/>
+          <w:szCs w:val="16"/>
+        </w:rPr>
+      </w:pPr>
+      <w:r>
+        <w:rPr>
+          <w:rFonts w:eastAsia="arial" w:ascii="arial" w:hAnsi="arial"/>
+          <w:color w:val="000000"/>
+          <w:sz w:val="16"/>
+          <w:szCs w:val="16"/>
+        </w:rPr>
+      </w:r>
+    </w:p>
+    <w:p>
+      <w:pPr>
+        <w:pStyle w:val="Normal"/>
+        <w:rPr>
+          <w:color w:val="000000"/>
+          <w:sz w:val="16"/>
+          <w:szCs w:val="16"/>
+        </w:rPr>
+      </w:pPr>
+      <w:r>
+        <w:rPr>
+          <w:rFonts w:eastAsia="arial" w:ascii="arial" w:hAnsi="arial"/>
+          <w:color w:val="000000"/>
+          <w:sz w:val="16"/>
+          <w:szCs w:val="16"/>
+        </w:rPr>
+        <w:tab/>
+        <w:t xml:space="preserve">           Class 323-2</w:t>
+      </w:r>
+    </w:p>
+    <w:tbl>
+      <w:tblPr>
+        <w:tblW w:w="14248" w:type="dxa"/>
+        <w:jc w:val="left"/>
+        <w:tblInd w:w="-5" w:type="dxa"/>
+        <w:tblLayout w:type="fixed"/>
+        <w:tblCellMar>
+          <w:top w:w="0" w:type="dxa"/>
+          <w:left w:w="108" w:type="dxa"/>
+          <w:bottom w:w="0" w:type="dxa"/>
+          <w:right w:w="108" w:type="dxa"/>
+        </w:tblCellMar>
+        <w:tblLook w:firstRow="1" w:noVBand="1" w:lastRow="0" w:firstColumn="1" w:lastColumn="0" w:noHBand="0" w:val="04a0"/>
+      </w:tblPr>
+      <w:tblGrid>
+        <w:gridCol w:w="1017"/>
+        <w:gridCol w:w="1019"/>
+        <w:gridCol w:w="1014"/>
+        <w:gridCol w:w="1016"/>
+        <w:gridCol w:w="1020"/>
+        <w:gridCol w:w="1016"/>
+        <w:gridCol w:w="1016"/>
+        <w:gridCol w:w="1017"/>
+        <w:gridCol w:w="1016"/>
+        <w:gridCol w:w="1020"/>
+        <w:gridCol w:w="1016"/>
+        <w:gridCol w:w="1016"/>
+        <w:gridCol w:w="1016"/>
+        <w:gridCol w:w="1029"/>
+      </w:tblGrid>
+      <w:tr>
+        <w:trPr>
+          <w:trHeight w:val="440" w:hRule="exact"/>
+          <w:cantSplit w:val="true"/>
+        </w:trPr>
+        <w:tc>
+          <w:tcPr>
+            <w:tcW w:w="1017" w:type="dxa"/>
+            <w:tcBorders>
+              <w:top w:val="single" w:sz="4" w:space="0" w:color="000000"/>
+              <w:left w:val="single" w:sz="4" w:space="0" w:color="000000"/>
+              <w:bottom w:val="single" w:sz="4" w:space="0" w:color="000000"/>
+            </w:tcBorders>
+            <w:vAlign w:val="bottom"/>
+          </w:tcPr>
+          <w:p>
+            <w:pPr>
+              <w:pStyle w:val="Normal"/>
+              <w:widowControl w:val="false"/>
+              <w:spacing w:lineRule="auto" w:line="180" w:before="0" w:after="60"/>
+              <w:jc w:val="center"/>
+              <w:rPr>
+                <w:b/>
+                <w:bCs/>
+              </w:rPr>
+            </w:pPr>
+            <w:r>
+              <w:rPr>
+                <w:b/>
+                <w:bCs/>
+                <w:color w:val="000000"/>
+                <w:sz w:val="16"/>
+                <w:szCs w:val="16"/>
+              </w:rPr>
+              <w:t>HUD</w:t>
+            </w:r>
+          </w:p>
+        </w:tc>
+        <w:tc>
+          <w:tcPr>
+            <w:tcW w:w="1019" w:type="dxa"/>
+            <w:tcBorders>
+              <w:top w:val="single" w:sz="4" w:space="0" w:color="000000"/>
+              <w:left w:val="single" w:sz="4" w:space="0" w:color="000000"/>
+              <w:bottom w:val="single" w:sz="4" w:space="0" w:color="000000"/>
+            </w:tcBorders>
+            <w:vAlign w:val="bottom"/>
+          </w:tcPr>
+          <w:p>
+            <w:pPr>
+              <w:pStyle w:val="Normal"/>
+              <w:widowControl w:val="false"/>
+              <w:spacing w:lineRule="auto" w:line="180"/>
+              <w:jc w:val="center"/>
+              <w:rPr>
+                <w:color w:val="000000"/>
+                <w:sz w:val="16"/>
+                <w:szCs w:val="16"/>
+              </w:rPr>
+            </w:pPr>
+            <w:r>
+              <w:rPr>
+                <w:color w:val="000000"/>
+                <w:sz w:val="16"/>
+                <w:szCs w:val="16"/>
+              </w:rPr>
+              <w:t>Schedule</w:t>
+            </w:r>
+          </w:p>
+        </w:tc>
+        <w:tc>
+          <w:tcPr>
+            <w:tcW w:w="1014" w:type="dxa"/>
+            <w:tcBorders>
+              <w:top w:val="single" w:sz="4" w:space="0" w:color="000000"/>
+              <w:left w:val="single" w:sz="4" w:space="0" w:color="000000"/>
+              <w:bottom w:val="single" w:sz="4" w:space="0" w:color="000000"/>
+            </w:tcBorders>
+            <w:vAlign w:val="bottom"/>
+          </w:tcPr>
+          <w:p>
+            <w:pPr>
+              <w:pStyle w:val="Normal"/>
+              <w:widowControl w:val="false"/>
+              <w:spacing w:lineRule="auto" w:line="180"/>
+              <w:jc w:val="center"/>
+              <w:rPr>
+                <w:color w:val="000000"/>
+                <w:sz w:val="16"/>
+                <w:szCs w:val="16"/>
+              </w:rPr>
+            </w:pPr>
+            <w:r>
+              <w:rPr>
+                <w:rFonts w:eastAsia="arial" w:ascii="arial" w:hAnsi="arial"/>
+                <w:color w:val="000000"/>
+                <w:sz w:val="16"/>
+                <w:szCs w:val="16"/>
+              </w:rPr>
+              <w:t>Aux Off</w:t>
+            </w:r>
+          </w:p>
+        </w:tc>
+        <w:tc>
+          <w:tcPr>
+            <w:tcW w:w="1016" w:type="dxa"/>
+            <w:tcBorders>
+              <w:top w:val="single" w:sz="4" w:space="0" w:color="000000"/>
+              <w:left w:val="single" w:sz="4" w:space="0" w:color="000000"/>
+              <w:bottom w:val="single" w:sz="4" w:space="0" w:color="000000"/>
+            </w:tcBorders>
+            <w:vAlign w:val="bottom"/>
+          </w:tcPr>
+          <w:p>
+            <w:pPr>
+              <w:pStyle w:val="Normal"/>
+              <w:widowControl w:val="false"/>
+              <w:spacing w:lineRule="auto" w:line="180"/>
+              <w:jc w:val="center"/>
+              <w:rPr>
+                <w:color w:val="000000"/>
+                <w:sz w:val="16"/>
+                <w:szCs w:val="16"/>
+              </w:rPr>
+            </w:pPr>
+            <w:r>
+              <w:rPr>
+                <w:color w:val="000000"/>
+                <w:sz w:val="16"/>
+                <w:szCs w:val="16"/>
+              </w:rPr>
+              <w:t>DSD/Vigilance</w:t>
+            </w:r>
+          </w:p>
+        </w:tc>
+        <w:tc>
+          <w:tcPr>
+            <w:tcW w:w="1020" w:type="dxa"/>
+            <w:tcBorders>
+              <w:top w:val="single" w:sz="4" w:space="0" w:color="000000"/>
+              <w:left w:val="single" w:sz="4" w:space="0" w:color="000000"/>
+              <w:bottom w:val="single" w:sz="4" w:space="0" w:color="000000"/>
+            </w:tcBorders>
+            <w:vAlign w:val="bottom"/>
+          </w:tcPr>
+          <w:p>
+            <w:pPr>
+              <w:pStyle w:val="Normal"/>
+              <w:widowControl w:val="false"/>
+              <w:spacing w:lineRule="auto" w:line="180"/>
+              <w:jc w:val="center"/>
+              <w:rPr>
+                <w:color w:val="000000"/>
+                <w:sz w:val="16"/>
+                <w:szCs w:val="16"/>
+              </w:rPr>
+            </w:pPr>
+            <w:r>
+              <w:rPr>
+                <w:color w:val="000000"/>
+                <w:sz w:val="16"/>
+                <w:szCs w:val="16"/>
+              </w:rPr>
+              <w:t>Panto. Low</w:t>
+            </w:r>
+          </w:p>
+        </w:tc>
+        <w:tc>
+          <w:tcPr>
+            <w:tcW w:w="1016" w:type="dxa"/>
+            <w:tcBorders>
+              <w:top w:val="single" w:sz="4" w:space="0" w:color="000000"/>
+              <w:left w:val="single" w:sz="4" w:space="0" w:color="000000"/>
+              <w:bottom w:val="single" w:sz="4" w:space="0" w:color="000000"/>
+            </w:tcBorders>
+            <w:vAlign w:val="bottom"/>
+          </w:tcPr>
+          <w:p>
+            <w:pPr>
+              <w:pStyle w:val="Normal"/>
+              <w:widowControl w:val="false"/>
+              <w:spacing w:lineRule="auto" w:line="180"/>
+              <w:jc w:val="center"/>
+              <w:rPr>
+                <w:sz w:val="16"/>
+                <w:szCs w:val="16"/>
+              </w:rPr>
+            </w:pPr>
+            <w:r>
+              <w:rPr>
+                <w:color w:val="000000"/>
+                <w:sz w:val="16"/>
+                <w:szCs w:val="16"/>
+              </w:rPr>
+              <w:t>Coach Light Off</w:t>
+            </w:r>
+          </w:p>
+        </w:tc>
+        <w:tc>
+          <w:tcPr>
+            <w:tcW w:w="1016" w:type="dxa"/>
+            <w:tcBorders>
+              <w:top w:val="single" w:sz="4" w:space="0" w:color="000000"/>
+              <w:left w:val="single" w:sz="4" w:space="0" w:color="000000"/>
+              <w:bottom w:val="single" w:sz="4" w:space="0" w:color="000000"/>
+            </w:tcBorders>
+            <w:vAlign w:val="bottom"/>
+          </w:tcPr>
+          <w:p>
+            <w:pPr>
+              <w:pStyle w:val="Normal"/>
+              <w:widowControl w:val="false"/>
+              <w:spacing w:lineRule="auto" w:line="180"/>
+              <w:jc w:val="center"/>
+              <w:rPr>
+                <w:color w:val="000000"/>
+                <w:sz w:val="16"/>
+                <w:szCs w:val="16"/>
+              </w:rPr>
+            </w:pPr>
+            <w:r>
+              <w:rPr>
+                <w:color w:val="000000"/>
+                <w:sz w:val="16"/>
+                <w:szCs w:val="16"/>
+              </w:rPr>
+            </w:r>
+          </w:p>
+        </w:tc>
+        <w:tc>
+          <w:tcPr>
+            <w:tcW w:w="1017" w:type="dxa"/>
+            <w:tcBorders>
+              <w:top w:val="single" w:sz="4" w:space="0" w:color="000000"/>
+              <w:left w:val="single" w:sz="4" w:space="0" w:color="000000"/>
+              <w:bottom w:val="single" w:sz="4" w:space="0" w:color="000000"/>
+            </w:tcBorders>
+            <w:vAlign w:val="bottom"/>
+          </w:tcPr>
+          <w:p>
+            <w:pPr>
+              <w:pStyle w:val="Normal"/>
+              <w:widowControl w:val="false"/>
+              <w:jc w:val="center"/>
+              <w:rPr>
+                <w:rFonts w:ascii="arial" w:hAnsi="arial" w:eastAsia="arial"/>
+                <w:color w:val="000000"/>
+                <w:sz w:val="16"/>
+                <w:szCs w:val="16"/>
+              </w:rPr>
+            </w:pPr>
+            <w:r>
+              <w:rPr>
+                <w:rFonts w:eastAsia="arial" w:ascii="arial" w:hAnsi="arial"/>
+                <w:color w:val="000000"/>
+                <w:sz w:val="16"/>
+                <w:szCs w:val="16"/>
+              </w:rPr>
+            </w:r>
+          </w:p>
+        </w:tc>
+        <w:tc>
+          <w:tcPr>
+            <w:tcW w:w="1016" w:type="dxa"/>
+            <w:tcBorders>
+              <w:top w:val="single" w:sz="4" w:space="0" w:color="000000"/>
+              <w:left w:val="single" w:sz="4" w:space="0" w:color="000000"/>
+              <w:bottom w:val="single" w:sz="4" w:space="0" w:color="000000"/>
+            </w:tcBorders>
+            <w:vAlign w:val="bottom"/>
+          </w:tcPr>
+          <w:p>
+            <w:pPr>
+              <w:pStyle w:val="Normal"/>
+              <w:widowControl w:val="false"/>
+              <w:jc w:val="center"/>
+              <w:rPr>
+                <w:sz w:val="16"/>
+                <w:szCs w:val="16"/>
+              </w:rPr>
+            </w:pPr>
+            <w:r>
+              <w:rPr>
+                <w:sz w:val="16"/>
+                <w:szCs w:val="16"/>
+              </w:rPr>
+            </w:r>
+          </w:p>
+        </w:tc>
+        <w:tc>
+          <w:tcPr>
+            <w:tcW w:w="1020" w:type="dxa"/>
+            <w:tcBorders>
+              <w:top w:val="single" w:sz="4" w:space="0" w:color="000000"/>
+              <w:left w:val="single" w:sz="4" w:space="0" w:color="000000"/>
+              <w:bottom w:val="single" w:sz="4" w:space="0" w:color="000000"/>
+            </w:tcBorders>
+            <w:vAlign w:val="bottom"/>
+          </w:tcPr>
+          <w:p>
+            <w:pPr>
+              <w:pStyle w:val="Normal"/>
+              <w:widowControl w:val="false"/>
+              <w:jc w:val="center"/>
+              <w:rPr>
+                <w:color w:val="000000"/>
+                <w:sz w:val="16"/>
+                <w:szCs w:val="16"/>
+              </w:rPr>
+            </w:pPr>
+            <w:r>
+              <w:rPr>
+                <w:color w:val="000000"/>
+                <w:sz w:val="16"/>
+                <w:szCs w:val="16"/>
+              </w:rPr>
+              <w:t>Door Key</w:t>
+            </w:r>
+          </w:p>
+        </w:tc>
+        <w:tc>
+          <w:tcPr>
+            <w:tcW w:w="1016" w:type="dxa"/>
+            <w:tcBorders>
+              <w:top w:val="single" w:sz="4" w:space="0" w:color="000000"/>
+              <w:left w:val="single" w:sz="4" w:space="0" w:color="000000"/>
+              <w:bottom w:val="single" w:sz="4" w:space="0" w:color="000000"/>
+            </w:tcBorders>
+            <w:vAlign w:val="bottom"/>
+          </w:tcPr>
+          <w:p>
+            <w:pPr>
+              <w:pStyle w:val="Normal"/>
+              <w:widowControl w:val="false"/>
+              <w:jc w:val="center"/>
+              <w:rPr>
+                <w:color w:val="000000"/>
+                <w:sz w:val="16"/>
+                <w:szCs w:val="16"/>
+              </w:rPr>
+            </w:pPr>
+            <w:r>
+              <w:rPr>
+                <w:color w:val="000000"/>
+                <w:sz w:val="16"/>
+                <w:szCs w:val="16"/>
+              </w:rPr>
+              <w:t>Tail Light</w:t>
+            </w:r>
+          </w:p>
+        </w:tc>
+        <w:tc>
+          <w:tcPr>
+            <w:tcW w:w="1016" w:type="dxa"/>
+            <w:tcBorders>
+              <w:top w:val="single" w:sz="4" w:space="0" w:color="000000"/>
+              <w:left w:val="single" w:sz="4" w:space="0" w:color="000000"/>
+              <w:bottom w:val="single" w:sz="4" w:space="0" w:color="000000"/>
+            </w:tcBorders>
+            <w:vAlign w:val="bottom"/>
+          </w:tcPr>
+          <w:p>
+            <w:pPr>
+              <w:pStyle w:val="Normal"/>
+              <w:widowControl w:val="false"/>
+              <w:spacing w:lineRule="auto" w:line="180"/>
+              <w:jc w:val="center"/>
+              <w:rPr>
+                <w:sz w:val="16"/>
+                <w:szCs w:val="16"/>
+              </w:rPr>
+            </w:pPr>
+            <w:r>
+              <w:rPr>
+                <w:sz w:val="16"/>
+                <w:szCs w:val="16"/>
+              </w:rPr>
+              <w:t>Uncouple</w:t>
+            </w:r>
+          </w:p>
+        </w:tc>
+        <w:tc>
+          <w:tcPr>
+            <w:tcW w:w="1016" w:type="dxa"/>
+            <w:tcBorders>
+              <w:top w:val="single" w:sz="4" w:space="0" w:color="000000"/>
+              <w:left w:val="single" w:sz="4" w:space="0" w:color="000000"/>
+              <w:bottom w:val="single" w:sz="4" w:space="0" w:color="000000"/>
+            </w:tcBorders>
+            <w:vAlign w:val="bottom"/>
+          </w:tcPr>
+          <w:p>
+            <w:pPr>
+              <w:pStyle w:val="Normal"/>
+              <w:widowControl w:val="false"/>
+              <w:spacing w:lineRule="auto" w:line="180"/>
+              <w:jc w:val="center"/>
+              <w:rPr>
+                <w:sz w:val="16"/>
+                <w:szCs w:val="16"/>
+              </w:rPr>
+            </w:pPr>
+            <w:r>
+              <w:rPr>
+                <w:rFonts w:eastAsia="arial" w:ascii="arial" w:hAnsi="arial"/>
+                <w:color w:val="000000"/>
+                <w:sz w:val="16"/>
+                <w:szCs w:val="16"/>
+              </w:rPr>
+              <w:t>Exterior</w:t>
+            </w:r>
+          </w:p>
+          <w:p>
+            <w:pPr>
+              <w:pStyle w:val="Normal"/>
+              <w:widowControl w:val="false"/>
+              <w:spacing w:lineRule="auto" w:line="180"/>
+              <w:jc w:val="center"/>
+              <w:rPr>
+                <w:sz w:val="16"/>
+                <w:szCs w:val="16"/>
+              </w:rPr>
+            </w:pPr>
+            <w:r>
+              <w:rPr>
+                <w:rFonts w:eastAsia="arial" w:ascii="arial" w:hAnsi="arial"/>
+                <w:color w:val="000000"/>
+                <w:sz w:val="16"/>
+                <w:szCs w:val="16"/>
+              </w:rPr>
+              <w:t>Camera</w:t>
+            </w:r>
+          </w:p>
+        </w:tc>
+        <w:tc>
+          <w:tcPr>
+            <w:tcW w:w="1029" w:type="dxa"/>
+            <w:tcBorders>
+              <w:top w:val="single" w:sz="4" w:space="0" w:color="000000"/>
+              <w:left w:val="single" w:sz="4" w:space="0" w:color="000000"/>
+              <w:bottom w:val="single" w:sz="4" w:space="0" w:color="000000"/>
+              <w:right w:val="single" w:sz="4" w:space="0" w:color="000000"/>
+            </w:tcBorders>
+            <w:vAlign w:val="bottom"/>
+          </w:tcPr>
+          <w:p>
+            <w:pPr>
+              <w:pStyle w:val="Normal"/>
+              <w:widowControl w:val="false"/>
+              <w:spacing w:lineRule="auto" w:line="180"/>
+              <w:jc w:val="center"/>
+              <w:rPr>
+                <w:sz w:val="16"/>
+                <w:szCs w:val="16"/>
+              </w:rPr>
+            </w:pPr>
+            <w:r>
+              <w:rPr>
+                <w:rFonts w:eastAsia="arial" w:ascii="arial" w:hAnsi="arial"/>
+                <w:color w:val="000000"/>
+                <w:sz w:val="16"/>
+                <w:szCs w:val="16"/>
+              </w:rPr>
+              <w:t>Prev</w:t>
+            </w:r>
+          </w:p>
+          <w:p>
+            <w:pPr>
+              <w:pStyle w:val="Normal"/>
+              <w:widowControl w:val="false"/>
+              <w:spacing w:lineRule="auto" w:line="180"/>
+              <w:jc w:val="center"/>
+              <w:rPr>
+                <w:sz w:val="16"/>
+                <w:szCs w:val="16"/>
+              </w:rPr>
+            </w:pPr>
+            <w:r>
+              <w:rPr>
+                <w:rFonts w:eastAsia="arial" w:ascii="arial" w:hAnsi="arial"/>
+                <w:color w:val="000000"/>
+                <w:sz w:val="16"/>
+                <w:szCs w:val="16"/>
+              </w:rPr>
+              <w:t>Cab Cam</w:t>
+            </w:r>
+          </w:p>
+        </w:tc>
+      </w:tr>
+    </w:tbl>
+    <w:p>
+      <w:pPr>
+        <w:pStyle w:val="Normal"/>
+        <w:rPr>
+          <w:color w:val="000000"/>
+          <w:sz w:val="16"/>
+          <w:szCs w:val="16"/>
+        </w:rPr>
+      </w:pPr>
+      <w:r>
+        <w:rPr>
+          <w:color w:val="000000"/>
+          <w:sz w:val="16"/>
+          <w:szCs w:val="16"/>
+        </w:rPr>
+      </w:r>
+    </w:p>
+    <w:p>
+      <w:pPr>
+        <w:pStyle w:val="Normal"/>
+        <w:rPr>
+          <w:color w:val="000000"/>
+          <w:sz w:val="16"/>
+          <w:szCs w:val="16"/>
+        </w:rPr>
+      </w:pPr>
+      <w:r>
+        <w:rPr>
+          <w:rFonts w:eastAsia="arial" w:ascii="arial" w:hAnsi="arial"/>
+          <w:color w:val="000000"/>
+          <w:sz w:val="16"/>
+          <w:szCs w:val="16"/>
+        </w:rPr>
+        <w:tab/>
+        <w:t xml:space="preserve">           Class 350-1</w:t>
+      </w:r>
+    </w:p>
+    <w:tbl>
+      <w:tblPr>
+        <w:tblW w:w="14248" w:type="dxa"/>
+        <w:jc w:val="left"/>
+        <w:tblInd w:w="-5" w:type="dxa"/>
+        <w:tblLayout w:type="fixed"/>
+        <w:tblCellMar>
+          <w:top w:w="0" w:type="dxa"/>
+          <w:left w:w="108" w:type="dxa"/>
+          <w:bottom w:w="0" w:type="dxa"/>
+          <w:right w:w="108" w:type="dxa"/>
+        </w:tblCellMar>
+        <w:tblLook w:firstRow="1" w:noVBand="1" w:lastRow="0" w:firstColumn="1" w:lastColumn="0" w:noHBand="0" w:val="04a0"/>
+      </w:tblPr>
+      <w:tblGrid>
+        <w:gridCol w:w="1017"/>
+        <w:gridCol w:w="1019"/>
+        <w:gridCol w:w="1014"/>
+        <w:gridCol w:w="1016"/>
+        <w:gridCol w:w="1020"/>
+        <w:gridCol w:w="1016"/>
+        <w:gridCol w:w="1016"/>
+        <w:gridCol w:w="1017"/>
+        <w:gridCol w:w="1016"/>
+        <w:gridCol w:w="1020"/>
+        <w:gridCol w:w="1016"/>
+        <w:gridCol w:w="1016"/>
+        <w:gridCol w:w="1016"/>
+        <w:gridCol w:w="1029"/>
+      </w:tblGrid>
+      <w:tr>
+        <w:trPr>
+          <w:trHeight w:val="440" w:hRule="exact"/>
+          <w:cantSplit w:val="true"/>
+        </w:trPr>
+        <w:tc>
+          <w:tcPr>
+            <w:tcW w:w="1017" w:type="dxa"/>
+            <w:tcBorders>
+              <w:top w:val="single" w:sz="4" w:space="0" w:color="000000"/>
+              <w:left w:val="single" w:sz="4" w:space="0" w:color="000000"/>
+              <w:bottom w:val="single" w:sz="4" w:space="0" w:color="000000"/>
+            </w:tcBorders>
+            <w:vAlign w:val="bottom"/>
+          </w:tcPr>
+          <w:p>
+            <w:pPr>
+              <w:pStyle w:val="Normal"/>
+              <w:widowControl w:val="false"/>
+              <w:spacing w:lineRule="auto" w:line="180" w:before="0" w:after="60"/>
+              <w:jc w:val="center"/>
+              <w:rPr>
+                <w:color w:val="000000"/>
+                <w:sz w:val="16"/>
+                <w:szCs w:val="16"/>
+              </w:rPr>
+            </w:pPr>
+            <w:r>
+              <w:rPr>
+                <w:rFonts w:eastAsia="arial" w:ascii="arial" w:hAnsi="arial"/>
+                <w:b/>
+                <w:color w:val="000000"/>
+                <w:sz w:val="16"/>
+                <w:szCs w:val="16"/>
+              </w:rPr>
+              <w:t>Pause</w:t>
+            </w:r>
+          </w:p>
+        </w:tc>
+        <w:tc>
+          <w:tcPr>
+            <w:tcW w:w="1019" w:type="dxa"/>
+            <w:tcBorders>
+              <w:top w:val="single" w:sz="4" w:space="0" w:color="000000"/>
+              <w:left w:val="single" w:sz="4" w:space="0" w:color="000000"/>
+              <w:bottom w:val="single" w:sz="4" w:space="0" w:color="000000"/>
+            </w:tcBorders>
+            <w:vAlign w:val="bottom"/>
+          </w:tcPr>
+          <w:p>
+            <w:pPr>
+              <w:pStyle w:val="Normal"/>
+              <w:widowControl w:val="false"/>
+              <w:spacing w:lineRule="auto" w:line="180"/>
+              <w:jc w:val="center"/>
+              <w:rPr>
+                <w:color w:val="000000"/>
+                <w:sz w:val="16"/>
+                <w:szCs w:val="16"/>
+              </w:rPr>
+            </w:pPr>
+            <w:r>
+              <w:rPr>
+                <w:color w:val="000000"/>
+                <w:sz w:val="16"/>
+                <w:szCs w:val="16"/>
+              </w:rPr>
+              <w:t>Master Key</w:t>
+            </w:r>
+          </w:p>
+        </w:tc>
+        <w:tc>
+          <w:tcPr>
+            <w:tcW w:w="1014" w:type="dxa"/>
+            <w:tcBorders>
+              <w:top w:val="single" w:sz="4" w:space="0" w:color="000000"/>
+              <w:left w:val="single" w:sz="4" w:space="0" w:color="000000"/>
+              <w:bottom w:val="single" w:sz="4" w:space="0" w:color="000000"/>
+            </w:tcBorders>
+            <w:vAlign w:val="bottom"/>
+          </w:tcPr>
+          <w:p>
+            <w:pPr>
+              <w:pStyle w:val="Normal"/>
+              <w:widowControl w:val="false"/>
+              <w:spacing w:lineRule="auto" w:line="180"/>
+              <w:jc w:val="center"/>
+              <w:rPr>
+                <w:color w:val="000000"/>
+                <w:sz w:val="16"/>
+                <w:szCs w:val="16"/>
+              </w:rPr>
+            </w:pPr>
+            <w:r>
+              <w:rPr/>
+            </w:r>
+          </w:p>
+        </w:tc>
+        <w:tc>
+          <w:tcPr>
+            <w:tcW w:w="1016" w:type="dxa"/>
+            <w:tcBorders>
+              <w:top w:val="single" w:sz="4" w:space="0" w:color="000000"/>
+              <w:left w:val="single" w:sz="4" w:space="0" w:color="000000"/>
+              <w:bottom w:val="single" w:sz="4" w:space="0" w:color="000000"/>
+            </w:tcBorders>
+            <w:vAlign w:val="bottom"/>
+          </w:tcPr>
+          <w:p>
+            <w:pPr>
+              <w:pStyle w:val="Normal"/>
+              <w:widowControl w:val="false"/>
+              <w:spacing w:lineRule="auto" w:line="180"/>
+              <w:jc w:val="center"/>
+              <w:rPr>
+                <w:color w:val="000000"/>
+                <w:sz w:val="16"/>
+                <w:szCs w:val="16"/>
+              </w:rPr>
+            </w:pPr>
+            <w:r>
+              <w:rPr>
+                <w:color w:val="000000"/>
+                <w:sz w:val="16"/>
+                <w:szCs w:val="16"/>
+              </w:rPr>
+              <w:t>AWS/TPWS</w:t>
+            </w:r>
+          </w:p>
+        </w:tc>
+        <w:tc>
+          <w:tcPr>
+            <w:tcW w:w="1020" w:type="dxa"/>
+            <w:tcBorders>
+              <w:top w:val="single" w:sz="4" w:space="0" w:color="000000"/>
+              <w:left w:val="single" w:sz="4" w:space="0" w:color="000000"/>
+              <w:bottom w:val="single" w:sz="4" w:space="0" w:color="000000"/>
+            </w:tcBorders>
+            <w:vAlign w:val="bottom"/>
+          </w:tcPr>
+          <w:p>
+            <w:pPr>
+              <w:pStyle w:val="Normal"/>
+              <w:widowControl w:val="false"/>
+              <w:spacing w:lineRule="auto" w:line="180"/>
+              <w:jc w:val="center"/>
+              <w:rPr>
+                <w:color w:val="000000"/>
+                <w:sz w:val="16"/>
+                <w:szCs w:val="16"/>
+              </w:rPr>
+            </w:pPr>
+            <w:r>
+              <w:rPr>
+                <w:color w:val="000000"/>
+                <w:sz w:val="16"/>
+                <w:szCs w:val="16"/>
+              </w:rPr>
+              <w:t>Panto. Raise</w:t>
+            </w:r>
+          </w:p>
+        </w:tc>
+        <w:tc>
+          <w:tcPr>
+            <w:tcW w:w="1016" w:type="dxa"/>
+            <w:tcBorders>
+              <w:top w:val="single" w:sz="4" w:space="0" w:color="000000"/>
+              <w:left w:val="single" w:sz="4" w:space="0" w:color="000000"/>
+              <w:bottom w:val="single" w:sz="4" w:space="0" w:color="000000"/>
+            </w:tcBorders>
+            <w:vAlign w:val="bottom"/>
+          </w:tcPr>
+          <w:p>
+            <w:pPr>
+              <w:pStyle w:val="Normal"/>
+              <w:widowControl w:val="false"/>
+              <w:spacing w:lineRule="auto" w:line="180"/>
+              <w:jc w:val="center"/>
+              <w:rPr>
+                <w:color w:val="000000"/>
+                <w:sz w:val="16"/>
+                <w:szCs w:val="16"/>
+              </w:rPr>
+            </w:pPr>
+            <w:r>
+              <w:rPr>
+                <w:color w:val="000000"/>
+                <w:sz w:val="16"/>
+                <w:szCs w:val="16"/>
+              </w:rPr>
+              <w:t>AC</w:t>
+            </w:r>
+          </w:p>
+        </w:tc>
+        <w:tc>
+          <w:tcPr>
+            <w:tcW w:w="1016" w:type="dxa"/>
+            <w:tcBorders>
+              <w:top w:val="single" w:sz="4" w:space="0" w:color="000000"/>
+              <w:left w:val="single" w:sz="4" w:space="0" w:color="000000"/>
+              <w:bottom w:val="single" w:sz="4" w:space="0" w:color="000000"/>
+            </w:tcBorders>
+            <w:vAlign w:val="bottom"/>
+          </w:tcPr>
+          <w:p>
+            <w:pPr>
+              <w:pStyle w:val="Normal"/>
+              <w:widowControl w:val="false"/>
+              <w:jc w:val="center"/>
+              <w:rPr>
+                <w:sz w:val="16"/>
+                <w:szCs w:val="16"/>
+              </w:rPr>
+            </w:pPr>
+            <w:r>
+              <w:rPr>
+                <w:sz w:val="16"/>
+                <w:szCs w:val="16"/>
+              </w:rPr>
+              <w:t>DRA</w:t>
+            </w:r>
+          </w:p>
+        </w:tc>
+        <w:tc>
+          <w:tcPr>
+            <w:tcW w:w="1017" w:type="dxa"/>
+            <w:tcBorders>
+              <w:top w:val="single" w:sz="4" w:space="0" w:color="000000"/>
+              <w:left w:val="single" w:sz="4" w:space="0" w:color="000000"/>
+              <w:bottom w:val="single" w:sz="4" w:space="0" w:color="000000"/>
+            </w:tcBorders>
+            <w:vAlign w:val="bottom"/>
+          </w:tcPr>
+          <w:p>
+            <w:pPr>
+              <w:pStyle w:val="Normal"/>
+              <w:widowControl w:val="false"/>
+              <w:jc w:val="center"/>
+              <w:rPr>
+                <w:color w:val="000000"/>
+                <w:sz w:val="16"/>
+                <w:szCs w:val="16"/>
+              </w:rPr>
+            </w:pPr>
+            <w:r>
+              <w:rPr>
+                <w:color w:val="000000"/>
+                <w:sz w:val="16"/>
+                <w:szCs w:val="16"/>
+              </w:rPr>
+              <w:t>Desk Light Up</w:t>
+            </w:r>
+          </w:p>
+        </w:tc>
+        <w:tc>
+          <w:tcPr>
+            <w:tcW w:w="1016" w:type="dxa"/>
+            <w:tcBorders>
+              <w:top w:val="single" w:sz="4" w:space="0" w:color="000000"/>
+              <w:left w:val="single" w:sz="4" w:space="0" w:color="000000"/>
+              <w:bottom w:val="single" w:sz="4" w:space="0" w:color="000000"/>
+            </w:tcBorders>
+            <w:vAlign w:val="bottom"/>
+          </w:tcPr>
+          <w:p>
+            <w:pPr>
+              <w:pStyle w:val="Normal"/>
+              <w:widowControl w:val="false"/>
+              <w:jc w:val="center"/>
+              <w:rPr>
+                <w:sz w:val="16"/>
+                <w:szCs w:val="16"/>
+              </w:rPr>
+            </w:pPr>
+            <w:r>
+              <w:rPr>
+                <w:sz w:val="16"/>
+                <w:szCs w:val="16"/>
+              </w:rPr>
+              <w:t>Equipment Light Up</w:t>
+            </w:r>
+          </w:p>
+        </w:tc>
+        <w:tc>
+          <w:tcPr>
+            <w:tcW w:w="1020" w:type="dxa"/>
+            <w:tcBorders>
+              <w:top w:val="single" w:sz="4" w:space="0" w:color="000000"/>
+              <w:left w:val="single" w:sz="4" w:space="0" w:color="000000"/>
+              <w:bottom w:val="single" w:sz="4" w:space="0" w:color="000000"/>
+            </w:tcBorders>
+            <w:vAlign w:val="bottom"/>
+          </w:tcPr>
+          <w:p>
+            <w:pPr>
+              <w:pStyle w:val="Normal"/>
+              <w:widowControl w:val="false"/>
+              <w:jc w:val="center"/>
+              <w:rPr>
+                <w:color w:val="000000"/>
+                <w:sz w:val="16"/>
+                <w:szCs w:val="16"/>
+              </w:rPr>
+            </w:pPr>
+            <w:r>
+              <w:rPr>
+                <w:color w:val="000000"/>
+                <w:sz w:val="16"/>
+                <w:szCs w:val="16"/>
+              </w:rPr>
+              <w:t>Hazard Light</w:t>
+            </w:r>
+          </w:p>
+        </w:tc>
+        <w:tc>
+          <w:tcPr>
+            <w:tcW w:w="1016" w:type="dxa"/>
+            <w:tcBorders>
+              <w:top w:val="single" w:sz="4" w:space="0" w:color="000000"/>
+              <w:left w:val="single" w:sz="4" w:space="0" w:color="000000"/>
+              <w:bottom w:val="single" w:sz="4" w:space="0" w:color="000000"/>
+            </w:tcBorders>
+            <w:vAlign w:val="bottom"/>
+          </w:tcPr>
+          <w:p>
+            <w:pPr>
+              <w:pStyle w:val="Normal"/>
+              <w:widowControl w:val="false"/>
+              <w:spacing w:lineRule="auto" w:line="180"/>
+              <w:jc w:val="center"/>
+              <w:rPr>
+                <w:sz w:val="16"/>
+                <w:szCs w:val="16"/>
+              </w:rPr>
+            </w:pPr>
+            <w:r>
+              <w:rPr>
+                <w:rFonts w:eastAsia="arial" w:ascii="arial" w:hAnsi="arial"/>
+                <w:color w:val="000000"/>
+                <w:sz w:val="16"/>
+                <w:szCs w:val="16"/>
+              </w:rPr>
+              <w:t>Cab Light</w:t>
+            </w:r>
+          </w:p>
+        </w:tc>
+        <w:tc>
+          <w:tcPr>
+            <w:tcW w:w="1016" w:type="dxa"/>
+            <w:tcBorders>
+              <w:top w:val="single" w:sz="4" w:space="0" w:color="000000"/>
+              <w:left w:val="single" w:sz="4" w:space="0" w:color="000000"/>
+              <w:bottom w:val="single" w:sz="4" w:space="0" w:color="000000"/>
+            </w:tcBorders>
+            <w:vAlign w:val="bottom"/>
+          </w:tcPr>
+          <w:p>
+            <w:pPr>
+              <w:pStyle w:val="Normal"/>
+              <w:widowControl w:val="false"/>
+              <w:jc w:val="center"/>
+              <w:rPr>
+                <w:color w:val="000000"/>
+                <w:sz w:val="16"/>
+                <w:szCs w:val="16"/>
+              </w:rPr>
+            </w:pPr>
+            <w:r>
+              <w:rPr/>
+            </w:r>
+          </w:p>
+        </w:tc>
+        <w:tc>
+          <w:tcPr>
+            <w:tcW w:w="1016" w:type="dxa"/>
+            <w:tcBorders>
+              <w:top w:val="single" w:sz="4" w:space="0" w:color="000000"/>
+              <w:left w:val="single" w:sz="4" w:space="0" w:color="000000"/>
+              <w:bottom w:val="single" w:sz="4" w:space="0" w:color="000000"/>
+            </w:tcBorders>
+            <w:vAlign w:val="bottom"/>
+          </w:tcPr>
+          <w:p>
+            <w:pPr>
+              <w:pStyle w:val="Normal"/>
+              <w:widowControl w:val="false"/>
+              <w:spacing w:lineRule="auto" w:line="180"/>
+              <w:jc w:val="center"/>
+              <w:rPr>
+                <w:sz w:val="16"/>
+                <w:szCs w:val="16"/>
+              </w:rPr>
+            </w:pPr>
+            <w:r>
+              <w:rPr>
+                <w:rFonts w:eastAsia="arial" w:ascii="arial" w:hAnsi="arial"/>
+                <w:color w:val="000000"/>
+                <w:sz w:val="16"/>
+                <w:szCs w:val="16"/>
+              </w:rPr>
+              <w:t>1-Person</w:t>
+            </w:r>
+          </w:p>
+        </w:tc>
+        <w:tc>
+          <w:tcPr>
+            <w:tcW w:w="1029" w:type="dxa"/>
+            <w:tcBorders>
+              <w:top w:val="single" w:sz="4" w:space="0" w:color="000000"/>
+              <w:left w:val="single" w:sz="4" w:space="0" w:color="000000"/>
+              <w:bottom w:val="single" w:sz="4" w:space="0" w:color="000000"/>
+              <w:right w:val="single" w:sz="4" w:space="0" w:color="000000"/>
+            </w:tcBorders>
+            <w:vAlign w:val="bottom"/>
+          </w:tcPr>
+          <w:p>
+            <w:pPr>
+              <w:pStyle w:val="Normal"/>
+              <w:widowControl w:val="false"/>
+              <w:spacing w:lineRule="auto" w:line="180"/>
+              <w:jc w:val="center"/>
+              <w:rPr>
+                <w:sz w:val="16"/>
+                <w:szCs w:val="16"/>
+              </w:rPr>
+            </w:pPr>
+            <w:r>
+              <w:rPr>
+                <w:rFonts w:eastAsia="arial" w:ascii="arial" w:hAnsi="arial"/>
+                <w:color w:val="000000"/>
+                <w:sz w:val="16"/>
+                <w:szCs w:val="16"/>
+              </w:rPr>
+              <w:t>Next</w:t>
+            </w:r>
+          </w:p>
+          <w:p>
+            <w:pPr>
+              <w:pStyle w:val="Normal"/>
+              <w:widowControl w:val="false"/>
+              <w:spacing w:lineRule="auto" w:line="180"/>
+              <w:jc w:val="center"/>
+              <w:rPr>
+                <w:sz w:val="16"/>
+                <w:szCs w:val="16"/>
+              </w:rPr>
+            </w:pPr>
+            <w:r>
+              <w:rPr>
+                <w:rFonts w:eastAsia="arial" w:ascii="arial" w:hAnsi="arial"/>
+                <w:color w:val="000000"/>
+                <w:sz w:val="16"/>
+                <w:szCs w:val="16"/>
+              </w:rPr>
+              <w:t>Cab Cam</w:t>
+            </w:r>
+          </w:p>
+        </w:tc>
+      </w:tr>
+    </w:tbl>
+    <w:p>
+      <w:pPr>
+        <w:pStyle w:val="Normal"/>
+        <w:rPr>
+          <w:rFonts w:ascii="arial" w:hAnsi="arial" w:eastAsia="arial"/>
+          <w:color w:val="000000"/>
+          <w:sz w:val="16"/>
+          <w:szCs w:val="16"/>
+        </w:rPr>
+      </w:pPr>
+      <w:r>
+        <w:rPr>
+          <w:rFonts w:eastAsia="arial" w:ascii="arial" w:hAnsi="arial"/>
+          <w:color w:val="000000"/>
+          <w:sz w:val="16"/>
+          <w:szCs w:val="16"/>
+        </w:rPr>
+      </w:r>
+    </w:p>
+    <w:p>
+      <w:pPr>
+        <w:pStyle w:val="Normal"/>
+        <w:rPr>
+          <w:color w:val="000000"/>
+          <w:sz w:val="16"/>
+          <w:szCs w:val="16"/>
+        </w:rPr>
+      </w:pPr>
+      <w:r>
+        <w:rPr>
+          <w:rFonts w:eastAsia="arial" w:ascii="arial" w:hAnsi="arial"/>
+          <w:color w:val="000000"/>
+          <w:sz w:val="16"/>
+          <w:szCs w:val="16"/>
+        </w:rPr>
+        <w:tab/>
+        <w:t xml:space="preserve">           Class 350-2</w:t>
+      </w:r>
+    </w:p>
+    <w:tbl>
+      <w:tblPr>
+        <w:tblW w:w="14248" w:type="dxa"/>
+        <w:jc w:val="left"/>
+        <w:tblInd w:w="-5" w:type="dxa"/>
+        <w:tblLayout w:type="fixed"/>
+        <w:tblCellMar>
+          <w:top w:w="0" w:type="dxa"/>
+          <w:left w:w="108" w:type="dxa"/>
+          <w:bottom w:w="0" w:type="dxa"/>
+          <w:right w:w="108" w:type="dxa"/>
+        </w:tblCellMar>
+        <w:tblLook w:firstRow="1" w:noVBand="1" w:lastRow="0" w:firstColumn="1" w:lastColumn="0" w:noHBand="0" w:val="04a0"/>
+      </w:tblPr>
+      <w:tblGrid>
+        <w:gridCol w:w="1017"/>
+        <w:gridCol w:w="1019"/>
+        <w:gridCol w:w="1014"/>
+        <w:gridCol w:w="1016"/>
+        <w:gridCol w:w="1020"/>
+        <w:gridCol w:w="1016"/>
+        <w:gridCol w:w="1016"/>
+        <w:gridCol w:w="1017"/>
+        <w:gridCol w:w="1016"/>
+        <w:gridCol w:w="1020"/>
+        <w:gridCol w:w="1016"/>
+        <w:gridCol w:w="1016"/>
+        <w:gridCol w:w="1016"/>
+        <w:gridCol w:w="1029"/>
+      </w:tblGrid>
+      <w:tr>
+        <w:trPr>
+          <w:trHeight w:val="440" w:hRule="exact"/>
+          <w:cantSplit w:val="true"/>
+        </w:trPr>
+        <w:tc>
+          <w:tcPr>
+            <w:tcW w:w="1017" w:type="dxa"/>
+            <w:tcBorders>
+              <w:top w:val="single" w:sz="4" w:space="0" w:color="000000"/>
+              <w:left w:val="single" w:sz="4" w:space="0" w:color="000000"/>
+              <w:bottom w:val="single" w:sz="4" w:space="0" w:color="000000"/>
+            </w:tcBorders>
+            <w:vAlign w:val="bottom"/>
+          </w:tcPr>
+          <w:p>
+            <w:pPr>
+              <w:pStyle w:val="Normal"/>
+              <w:widowControl w:val="false"/>
+              <w:spacing w:lineRule="auto" w:line="180" w:before="0" w:after="60"/>
+              <w:jc w:val="center"/>
+              <w:rPr>
+                <w:b/>
+                <w:bCs/>
+              </w:rPr>
+            </w:pPr>
+            <w:r>
+              <w:rPr>
+                <w:b/>
+                <w:bCs/>
+                <w:color w:val="000000"/>
+                <w:sz w:val="16"/>
+                <w:szCs w:val="16"/>
+              </w:rPr>
+              <w:t>HUD</w:t>
+            </w:r>
+          </w:p>
+        </w:tc>
+        <w:tc>
+          <w:tcPr>
+            <w:tcW w:w="1019" w:type="dxa"/>
+            <w:tcBorders>
+              <w:top w:val="single" w:sz="4" w:space="0" w:color="000000"/>
+              <w:left w:val="single" w:sz="4" w:space="0" w:color="000000"/>
+              <w:bottom w:val="single" w:sz="4" w:space="0" w:color="000000"/>
+            </w:tcBorders>
+            <w:vAlign w:val="bottom"/>
+          </w:tcPr>
+          <w:p>
+            <w:pPr>
+              <w:pStyle w:val="Normal"/>
+              <w:widowControl w:val="false"/>
+              <w:spacing w:lineRule="auto" w:line="180"/>
+              <w:jc w:val="center"/>
+              <w:rPr>
+                <w:color w:val="000000"/>
+                <w:sz w:val="16"/>
+                <w:szCs w:val="16"/>
+              </w:rPr>
+            </w:pPr>
+            <w:r>
+              <w:rPr>
+                <w:color w:val="000000"/>
+                <w:sz w:val="16"/>
+                <w:szCs w:val="16"/>
+              </w:rPr>
+              <w:t>Schedule</w:t>
+            </w:r>
+          </w:p>
+        </w:tc>
+        <w:tc>
+          <w:tcPr>
+            <w:tcW w:w="1014" w:type="dxa"/>
+            <w:tcBorders>
+              <w:top w:val="single" w:sz="4" w:space="0" w:color="000000"/>
+              <w:left w:val="single" w:sz="4" w:space="0" w:color="000000"/>
+              <w:bottom w:val="single" w:sz="4" w:space="0" w:color="000000"/>
+            </w:tcBorders>
+            <w:vAlign w:val="bottom"/>
+          </w:tcPr>
+          <w:p>
+            <w:pPr>
+              <w:pStyle w:val="Normal"/>
+              <w:widowControl w:val="false"/>
+              <w:spacing w:lineRule="auto" w:line="180"/>
+              <w:jc w:val="center"/>
+              <w:rPr>
+                <w:color w:val="000000"/>
+                <w:sz w:val="16"/>
+                <w:szCs w:val="16"/>
+              </w:rPr>
+            </w:pPr>
+            <w:r>
+              <w:rPr/>
+            </w:r>
+          </w:p>
+        </w:tc>
+        <w:tc>
+          <w:tcPr>
+            <w:tcW w:w="1016" w:type="dxa"/>
+            <w:tcBorders>
+              <w:top w:val="single" w:sz="4" w:space="0" w:color="000000"/>
+              <w:left w:val="single" w:sz="4" w:space="0" w:color="000000"/>
+              <w:bottom w:val="single" w:sz="4" w:space="0" w:color="000000"/>
+            </w:tcBorders>
+            <w:vAlign w:val="bottom"/>
+          </w:tcPr>
+          <w:p>
+            <w:pPr>
+              <w:pStyle w:val="Normal"/>
+              <w:widowControl w:val="false"/>
+              <w:spacing w:lineRule="auto" w:line="180"/>
+              <w:jc w:val="center"/>
+              <w:rPr>
+                <w:color w:val="000000"/>
+                <w:sz w:val="16"/>
+                <w:szCs w:val="16"/>
+              </w:rPr>
+            </w:pPr>
+            <w:r>
+              <w:rPr>
+                <w:color w:val="000000"/>
+                <w:sz w:val="16"/>
+                <w:szCs w:val="16"/>
+              </w:rPr>
+              <w:t>DSD/Vigilance</w:t>
+            </w:r>
+          </w:p>
+        </w:tc>
+        <w:tc>
+          <w:tcPr>
+            <w:tcW w:w="1020" w:type="dxa"/>
+            <w:tcBorders>
+              <w:top w:val="single" w:sz="4" w:space="0" w:color="000000"/>
+              <w:left w:val="single" w:sz="4" w:space="0" w:color="000000"/>
+              <w:bottom w:val="single" w:sz="4" w:space="0" w:color="000000"/>
+            </w:tcBorders>
+            <w:vAlign w:val="bottom"/>
+          </w:tcPr>
+          <w:p>
+            <w:pPr>
+              <w:pStyle w:val="Normal"/>
+              <w:widowControl w:val="false"/>
+              <w:spacing w:lineRule="auto" w:line="180"/>
+              <w:jc w:val="center"/>
+              <w:rPr>
+                <w:color w:val="000000"/>
+                <w:sz w:val="16"/>
+                <w:szCs w:val="16"/>
+              </w:rPr>
+            </w:pPr>
+            <w:r>
+              <w:rPr>
+                <w:color w:val="000000"/>
+                <w:sz w:val="16"/>
+                <w:szCs w:val="16"/>
+              </w:rPr>
+              <w:t>Panto. Low</w:t>
+            </w:r>
+          </w:p>
+        </w:tc>
+        <w:tc>
+          <w:tcPr>
+            <w:tcW w:w="1016" w:type="dxa"/>
+            <w:tcBorders>
+              <w:top w:val="single" w:sz="4" w:space="0" w:color="000000"/>
+              <w:left w:val="single" w:sz="4" w:space="0" w:color="000000"/>
+              <w:bottom w:val="single" w:sz="4" w:space="0" w:color="000000"/>
+            </w:tcBorders>
+            <w:vAlign w:val="bottom"/>
+          </w:tcPr>
+          <w:p>
+            <w:pPr>
+              <w:pStyle w:val="Normal"/>
+              <w:widowControl w:val="false"/>
+              <w:spacing w:lineRule="auto" w:line="180"/>
+              <w:jc w:val="center"/>
+              <w:rPr>
+                <w:sz w:val="16"/>
+                <w:szCs w:val="16"/>
+              </w:rPr>
+            </w:pPr>
+            <w:r>
+              <w:rPr>
+                <w:color w:val="000000"/>
+                <w:sz w:val="16"/>
+                <w:szCs w:val="16"/>
+              </w:rPr>
+              <w:t>DC</w:t>
+            </w:r>
+          </w:p>
+        </w:tc>
+        <w:tc>
+          <w:tcPr>
+            <w:tcW w:w="1016" w:type="dxa"/>
+            <w:tcBorders>
+              <w:top w:val="single" w:sz="4" w:space="0" w:color="000000"/>
+              <w:left w:val="single" w:sz="4" w:space="0" w:color="000000"/>
+              <w:bottom w:val="single" w:sz="4" w:space="0" w:color="000000"/>
+            </w:tcBorders>
+            <w:vAlign w:val="bottom"/>
+          </w:tcPr>
+          <w:p>
+            <w:pPr>
+              <w:pStyle w:val="Normal"/>
+              <w:widowControl w:val="false"/>
+              <w:jc w:val="center"/>
+              <w:rPr>
+                <w:color w:val="000000"/>
+                <w:sz w:val="16"/>
+                <w:szCs w:val="16"/>
+              </w:rPr>
+            </w:pPr>
+            <w:r>
+              <w:rPr>
+                <w:color w:val="000000"/>
+                <w:sz w:val="16"/>
+                <w:szCs w:val="16"/>
+              </w:rPr>
+              <w:t>Power Reduction</w:t>
+            </w:r>
+          </w:p>
+        </w:tc>
+        <w:tc>
+          <w:tcPr>
+            <w:tcW w:w="1017" w:type="dxa"/>
+            <w:tcBorders>
+              <w:top w:val="single" w:sz="4" w:space="0" w:color="000000"/>
+              <w:left w:val="single" w:sz="4" w:space="0" w:color="000000"/>
+              <w:bottom w:val="single" w:sz="4" w:space="0" w:color="000000"/>
+            </w:tcBorders>
+            <w:vAlign w:val="bottom"/>
+          </w:tcPr>
+          <w:p>
+            <w:pPr>
+              <w:pStyle w:val="Normal"/>
+              <w:widowControl w:val="false"/>
+              <w:jc w:val="center"/>
+              <w:rPr>
+                <w:color w:val="000000"/>
+                <w:sz w:val="16"/>
+                <w:szCs w:val="16"/>
+              </w:rPr>
+            </w:pPr>
+            <w:r>
+              <w:rPr>
+                <w:color w:val="000000"/>
+                <w:sz w:val="16"/>
+                <w:szCs w:val="16"/>
+              </w:rPr>
+              <w:t>Desk Light Down</w:t>
+            </w:r>
+          </w:p>
+        </w:tc>
+        <w:tc>
+          <w:tcPr>
+            <w:tcW w:w="1016" w:type="dxa"/>
+            <w:tcBorders>
+              <w:top w:val="single" w:sz="4" w:space="0" w:color="000000"/>
+              <w:left w:val="single" w:sz="4" w:space="0" w:color="000000"/>
+              <w:bottom w:val="single" w:sz="4" w:space="0" w:color="000000"/>
+            </w:tcBorders>
+            <w:vAlign w:val="bottom"/>
+          </w:tcPr>
+          <w:p>
+            <w:pPr>
+              <w:pStyle w:val="Normal"/>
+              <w:widowControl w:val="false"/>
+              <w:jc w:val="center"/>
+              <w:rPr>
+                <w:sz w:val="16"/>
+                <w:szCs w:val="16"/>
+              </w:rPr>
+            </w:pPr>
+            <w:r>
+              <w:rPr>
+                <w:sz w:val="16"/>
+                <w:szCs w:val="16"/>
+              </w:rPr>
+              <w:t>Equipment Light Dw.</w:t>
+            </w:r>
+          </w:p>
+        </w:tc>
+        <w:tc>
+          <w:tcPr>
+            <w:tcW w:w="1020" w:type="dxa"/>
+            <w:tcBorders>
+              <w:top w:val="single" w:sz="4" w:space="0" w:color="000000"/>
+              <w:left w:val="single" w:sz="4" w:space="0" w:color="000000"/>
+              <w:bottom w:val="single" w:sz="4" w:space="0" w:color="000000"/>
+            </w:tcBorders>
+            <w:vAlign w:val="bottom"/>
+          </w:tcPr>
+          <w:p>
+            <w:pPr>
+              <w:pStyle w:val="Normal"/>
+              <w:widowControl w:val="false"/>
+              <w:jc w:val="center"/>
+              <w:rPr>
+                <w:rFonts w:ascii="arial" w:hAnsi="arial" w:eastAsia="arial"/>
+                <w:color w:val="000000"/>
+                <w:sz w:val="16"/>
+                <w:szCs w:val="16"/>
+              </w:rPr>
+            </w:pPr>
+            <w:r>
+              <w:rPr>
+                <w:rFonts w:eastAsia="arial" w:ascii="arial" w:hAnsi="arial"/>
+                <w:color w:val="000000"/>
+                <w:sz w:val="16"/>
+                <w:szCs w:val="16"/>
+              </w:rPr>
+              <w:t>Low Speed</w:t>
+            </w:r>
+          </w:p>
+        </w:tc>
+        <w:tc>
+          <w:tcPr>
+            <w:tcW w:w="1016" w:type="dxa"/>
+            <w:tcBorders>
+              <w:top w:val="single" w:sz="4" w:space="0" w:color="000000"/>
+              <w:left w:val="single" w:sz="4" w:space="0" w:color="000000"/>
+              <w:bottom w:val="single" w:sz="4" w:space="0" w:color="000000"/>
+            </w:tcBorders>
+            <w:vAlign w:val="bottom"/>
+          </w:tcPr>
+          <w:p>
+            <w:pPr>
+              <w:pStyle w:val="Normal"/>
+              <w:widowControl w:val="false"/>
+              <w:jc w:val="center"/>
+              <w:rPr>
+                <w:color w:val="000000"/>
+                <w:sz w:val="16"/>
+                <w:szCs w:val="16"/>
+              </w:rPr>
+            </w:pPr>
+            <w:r>
+              <w:rPr>
+                <w:color w:val="000000"/>
+                <w:sz w:val="16"/>
+                <w:szCs w:val="16"/>
+              </w:rPr>
+              <w:t>Tail Light</w:t>
             </w:r>
           </w:p>
         </w:tc>

</xml_diff>

<commit_message>
Add Class 375 and 377
</commit_message>
<xml_diff>
--- a/raildriver-UK-Remapped.docx
+++ b/raildriver-UK-Remapped.docx
@@ -30196,7 +30196,11 @@
               </w:rPr>
             </w:pPr>
             <w:r>
-              <w:rPr/>
+              <w:rPr>
+                <w:color w:val="000000"/>
+                <w:sz w:val="16"/>
+                <w:szCs w:val="16"/>
+              </w:rPr>
             </w:r>
           </w:p>
         </w:tc>
@@ -30470,7 +30474,11 @@
               </w:rPr>
             </w:pPr>
             <w:r>
-              <w:rPr/>
+              <w:rPr>
+                <w:color w:val="000000"/>
+                <w:sz w:val="16"/>
+                <w:szCs w:val="16"/>
+              </w:rPr>
             </w:r>
           </w:p>
         </w:tc>
@@ -30724,7 +30732,11 @@
               </w:rPr>
             </w:pPr>
             <w:r>
-              <w:rPr/>
+              <w:rPr>
+                <w:color w:val="000000"/>
+                <w:sz w:val="16"/>
+                <w:szCs w:val="16"/>
+              </w:rPr>
             </w:r>
           </w:p>
         </w:tc>
@@ -30944,6 +30956,2193 @@
                 <w:szCs w:val="16"/>
               </w:rPr>
               <w:t>Low Speed</w:t>
+            </w:r>
+          </w:p>
+        </w:tc>
+        <w:tc>
+          <w:tcPr>
+            <w:tcW w:w="1016" w:type="dxa"/>
+            <w:tcBorders>
+              <w:top w:val="single" w:sz="4" w:space="0" w:color="000000"/>
+              <w:left w:val="single" w:sz="4" w:space="0" w:color="000000"/>
+              <w:bottom w:val="single" w:sz="4" w:space="0" w:color="000000"/>
+            </w:tcBorders>
+            <w:vAlign w:val="bottom"/>
+          </w:tcPr>
+          <w:p>
+            <w:pPr>
+              <w:pStyle w:val="Normal"/>
+              <w:widowControl w:val="false"/>
+              <w:jc w:val="center"/>
+              <w:rPr>
+                <w:color w:val="000000"/>
+                <w:sz w:val="16"/>
+                <w:szCs w:val="16"/>
+              </w:rPr>
+            </w:pPr>
+            <w:r>
+              <w:rPr>
+                <w:color w:val="000000"/>
+                <w:sz w:val="16"/>
+                <w:szCs w:val="16"/>
+              </w:rPr>
+              <w:t>Tail Light</w:t>
+            </w:r>
+          </w:p>
+        </w:tc>
+        <w:tc>
+          <w:tcPr>
+            <w:tcW w:w="1016" w:type="dxa"/>
+            <w:tcBorders>
+              <w:top w:val="single" w:sz="4" w:space="0" w:color="000000"/>
+              <w:left w:val="single" w:sz="4" w:space="0" w:color="000000"/>
+              <w:bottom w:val="single" w:sz="4" w:space="0" w:color="000000"/>
+            </w:tcBorders>
+            <w:vAlign w:val="bottom"/>
+          </w:tcPr>
+          <w:p>
+            <w:pPr>
+              <w:pStyle w:val="Normal"/>
+              <w:widowControl w:val="false"/>
+              <w:spacing w:lineRule="auto" w:line="180"/>
+              <w:jc w:val="center"/>
+              <w:rPr>
+                <w:sz w:val="16"/>
+                <w:szCs w:val="16"/>
+              </w:rPr>
+            </w:pPr>
+            <w:r>
+              <w:rPr>
+                <w:sz w:val="16"/>
+                <w:szCs w:val="16"/>
+              </w:rPr>
+              <w:t>Uncouple</w:t>
+            </w:r>
+          </w:p>
+        </w:tc>
+        <w:tc>
+          <w:tcPr>
+            <w:tcW w:w="1016" w:type="dxa"/>
+            <w:tcBorders>
+              <w:top w:val="single" w:sz="4" w:space="0" w:color="000000"/>
+              <w:left w:val="single" w:sz="4" w:space="0" w:color="000000"/>
+              <w:bottom w:val="single" w:sz="4" w:space="0" w:color="000000"/>
+            </w:tcBorders>
+            <w:vAlign w:val="bottom"/>
+          </w:tcPr>
+          <w:p>
+            <w:pPr>
+              <w:pStyle w:val="Normal"/>
+              <w:widowControl w:val="false"/>
+              <w:spacing w:lineRule="auto" w:line="180"/>
+              <w:jc w:val="center"/>
+              <w:rPr>
+                <w:sz w:val="16"/>
+                <w:szCs w:val="16"/>
+              </w:rPr>
+            </w:pPr>
+            <w:r>
+              <w:rPr>
+                <w:rFonts w:eastAsia="arial" w:ascii="arial" w:hAnsi="arial"/>
+                <w:color w:val="000000"/>
+                <w:sz w:val="16"/>
+                <w:szCs w:val="16"/>
+              </w:rPr>
+              <w:t>Exterior</w:t>
+            </w:r>
+          </w:p>
+          <w:p>
+            <w:pPr>
+              <w:pStyle w:val="Normal"/>
+              <w:widowControl w:val="false"/>
+              <w:spacing w:lineRule="auto" w:line="180"/>
+              <w:jc w:val="center"/>
+              <w:rPr>
+                <w:sz w:val="16"/>
+                <w:szCs w:val="16"/>
+              </w:rPr>
+            </w:pPr>
+            <w:r>
+              <w:rPr>
+                <w:rFonts w:eastAsia="arial" w:ascii="arial" w:hAnsi="arial"/>
+                <w:color w:val="000000"/>
+                <w:sz w:val="16"/>
+                <w:szCs w:val="16"/>
+              </w:rPr>
+              <w:t>Camera</w:t>
+            </w:r>
+          </w:p>
+        </w:tc>
+        <w:tc>
+          <w:tcPr>
+            <w:tcW w:w="1029" w:type="dxa"/>
+            <w:tcBorders>
+              <w:top w:val="single" w:sz="4" w:space="0" w:color="000000"/>
+              <w:left w:val="single" w:sz="4" w:space="0" w:color="000000"/>
+              <w:bottom w:val="single" w:sz="4" w:space="0" w:color="000000"/>
+              <w:right w:val="single" w:sz="4" w:space="0" w:color="000000"/>
+            </w:tcBorders>
+            <w:vAlign w:val="bottom"/>
+          </w:tcPr>
+          <w:p>
+            <w:pPr>
+              <w:pStyle w:val="Normal"/>
+              <w:widowControl w:val="false"/>
+              <w:spacing w:lineRule="auto" w:line="180"/>
+              <w:jc w:val="center"/>
+              <w:rPr>
+                <w:sz w:val="16"/>
+                <w:szCs w:val="16"/>
+              </w:rPr>
+            </w:pPr>
+            <w:r>
+              <w:rPr>
+                <w:rFonts w:eastAsia="arial" w:ascii="arial" w:hAnsi="arial"/>
+                <w:color w:val="000000"/>
+                <w:sz w:val="16"/>
+                <w:szCs w:val="16"/>
+              </w:rPr>
+              <w:t>Prev</w:t>
+            </w:r>
+          </w:p>
+          <w:p>
+            <w:pPr>
+              <w:pStyle w:val="Normal"/>
+              <w:widowControl w:val="false"/>
+              <w:spacing w:lineRule="auto" w:line="180"/>
+              <w:jc w:val="center"/>
+              <w:rPr>
+                <w:sz w:val="16"/>
+                <w:szCs w:val="16"/>
+              </w:rPr>
+            </w:pPr>
+            <w:r>
+              <w:rPr>
+                <w:rFonts w:eastAsia="arial" w:ascii="arial" w:hAnsi="arial"/>
+                <w:color w:val="000000"/>
+                <w:sz w:val="16"/>
+                <w:szCs w:val="16"/>
+              </w:rPr>
+              <w:t>Cab Cam</w:t>
+            </w:r>
+          </w:p>
+        </w:tc>
+      </w:tr>
+    </w:tbl>
+    <w:p>
+      <w:pPr>
+        <w:pStyle w:val="Normal"/>
+        <w:rPr>
+          <w:color w:val="000000"/>
+          <w:sz w:val="16"/>
+          <w:szCs w:val="16"/>
+        </w:rPr>
+      </w:pPr>
+      <w:r>
+        <w:rPr>
+          <w:color w:val="000000"/>
+          <w:sz w:val="16"/>
+          <w:szCs w:val="16"/>
+        </w:rPr>
+      </w:r>
+    </w:p>
+    <w:p>
+      <w:pPr>
+        <w:pStyle w:val="Normal"/>
+        <w:rPr>
+          <w:color w:val="000000"/>
+          <w:sz w:val="16"/>
+          <w:szCs w:val="16"/>
+        </w:rPr>
+      </w:pPr>
+      <w:r>
+        <w:rPr>
+          <w:rFonts w:eastAsia="arial" w:ascii="arial" w:hAnsi="arial"/>
+          <w:color w:val="000000"/>
+          <w:sz w:val="16"/>
+          <w:szCs w:val="16"/>
+        </w:rPr>
+        <w:tab/>
+        <w:t xml:space="preserve">           Class 375-1</w:t>
+      </w:r>
+    </w:p>
+    <w:tbl>
+      <w:tblPr>
+        <w:tblW w:w="14248" w:type="dxa"/>
+        <w:jc w:val="left"/>
+        <w:tblInd w:w="-5" w:type="dxa"/>
+        <w:tblLayout w:type="fixed"/>
+        <w:tblCellMar>
+          <w:top w:w="0" w:type="dxa"/>
+          <w:left w:w="108" w:type="dxa"/>
+          <w:bottom w:w="0" w:type="dxa"/>
+          <w:right w:w="108" w:type="dxa"/>
+        </w:tblCellMar>
+        <w:tblLook w:firstRow="1" w:noVBand="1" w:lastRow="0" w:firstColumn="1" w:lastColumn="0" w:noHBand="0" w:val="04a0"/>
+      </w:tblPr>
+      <w:tblGrid>
+        <w:gridCol w:w="1017"/>
+        <w:gridCol w:w="1019"/>
+        <w:gridCol w:w="1014"/>
+        <w:gridCol w:w="1016"/>
+        <w:gridCol w:w="1020"/>
+        <w:gridCol w:w="1016"/>
+        <w:gridCol w:w="1016"/>
+        <w:gridCol w:w="1017"/>
+        <w:gridCol w:w="1016"/>
+        <w:gridCol w:w="1020"/>
+        <w:gridCol w:w="1016"/>
+        <w:gridCol w:w="1016"/>
+        <w:gridCol w:w="1016"/>
+        <w:gridCol w:w="1029"/>
+      </w:tblGrid>
+      <w:tr>
+        <w:trPr>
+          <w:trHeight w:val="440" w:hRule="exact"/>
+          <w:cantSplit w:val="true"/>
+        </w:trPr>
+        <w:tc>
+          <w:tcPr>
+            <w:tcW w:w="1017" w:type="dxa"/>
+            <w:tcBorders>
+              <w:top w:val="single" w:sz="4" w:space="0" w:color="000000"/>
+              <w:left w:val="single" w:sz="4" w:space="0" w:color="000000"/>
+              <w:bottom w:val="single" w:sz="4" w:space="0" w:color="000000"/>
+            </w:tcBorders>
+            <w:vAlign w:val="bottom"/>
+          </w:tcPr>
+          <w:p>
+            <w:pPr>
+              <w:pStyle w:val="Normal"/>
+              <w:widowControl w:val="false"/>
+              <w:spacing w:lineRule="auto" w:line="180" w:before="0" w:after="60"/>
+              <w:jc w:val="center"/>
+              <w:rPr>
+                <w:color w:val="000000"/>
+                <w:sz w:val="16"/>
+                <w:szCs w:val="16"/>
+              </w:rPr>
+            </w:pPr>
+            <w:r>
+              <w:rPr>
+                <w:rFonts w:eastAsia="arial" w:ascii="arial" w:hAnsi="arial"/>
+                <w:b/>
+                <w:color w:val="000000"/>
+                <w:sz w:val="16"/>
+                <w:szCs w:val="16"/>
+              </w:rPr>
+              <w:t>Pause</w:t>
+            </w:r>
+          </w:p>
+        </w:tc>
+        <w:tc>
+          <w:tcPr>
+            <w:tcW w:w="1019" w:type="dxa"/>
+            <w:tcBorders>
+              <w:top w:val="single" w:sz="4" w:space="0" w:color="000000"/>
+              <w:left w:val="single" w:sz="4" w:space="0" w:color="000000"/>
+              <w:bottom w:val="single" w:sz="4" w:space="0" w:color="000000"/>
+            </w:tcBorders>
+            <w:vAlign w:val="bottom"/>
+          </w:tcPr>
+          <w:p>
+            <w:pPr>
+              <w:pStyle w:val="Normal"/>
+              <w:widowControl w:val="false"/>
+              <w:spacing w:lineRule="auto" w:line="180"/>
+              <w:jc w:val="center"/>
+              <w:rPr>
+                <w:color w:val="000000"/>
+                <w:sz w:val="16"/>
+                <w:szCs w:val="16"/>
+              </w:rPr>
+            </w:pPr>
+            <w:r>
+              <w:rPr>
+                <w:color w:val="000000"/>
+                <w:sz w:val="16"/>
+                <w:szCs w:val="16"/>
+              </w:rPr>
+              <w:t>Master Key</w:t>
+            </w:r>
+          </w:p>
+        </w:tc>
+        <w:tc>
+          <w:tcPr>
+            <w:tcW w:w="1014" w:type="dxa"/>
+            <w:tcBorders>
+              <w:top w:val="single" w:sz="4" w:space="0" w:color="000000"/>
+              <w:left w:val="single" w:sz="4" w:space="0" w:color="000000"/>
+              <w:bottom w:val="single" w:sz="4" w:space="0" w:color="000000"/>
+            </w:tcBorders>
+            <w:vAlign w:val="bottom"/>
+          </w:tcPr>
+          <w:p>
+            <w:pPr>
+              <w:pStyle w:val="Normal"/>
+              <w:widowControl w:val="false"/>
+              <w:spacing w:lineRule="auto" w:line="180"/>
+              <w:jc w:val="center"/>
+              <w:rPr>
+                <w:color w:val="000000"/>
+                <w:sz w:val="16"/>
+                <w:szCs w:val="16"/>
+              </w:rPr>
+            </w:pPr>
+            <w:r>
+              <w:rPr>
+                <w:color w:val="000000"/>
+                <w:sz w:val="16"/>
+                <w:szCs w:val="16"/>
+              </w:rPr>
+              <w:t>Aux On</w:t>
+            </w:r>
+          </w:p>
+        </w:tc>
+        <w:tc>
+          <w:tcPr>
+            <w:tcW w:w="1016" w:type="dxa"/>
+            <w:tcBorders>
+              <w:top w:val="single" w:sz="4" w:space="0" w:color="000000"/>
+              <w:left w:val="single" w:sz="4" w:space="0" w:color="000000"/>
+              <w:bottom w:val="single" w:sz="4" w:space="0" w:color="000000"/>
+            </w:tcBorders>
+            <w:vAlign w:val="bottom"/>
+          </w:tcPr>
+          <w:p>
+            <w:pPr>
+              <w:pStyle w:val="Normal"/>
+              <w:widowControl w:val="false"/>
+              <w:spacing w:lineRule="auto" w:line="180"/>
+              <w:jc w:val="center"/>
+              <w:rPr>
+                <w:color w:val="000000"/>
+                <w:sz w:val="16"/>
+                <w:szCs w:val="16"/>
+              </w:rPr>
+            </w:pPr>
+            <w:r>
+              <w:rPr>
+                <w:color w:val="000000"/>
+                <w:sz w:val="16"/>
+                <w:szCs w:val="16"/>
+              </w:rPr>
+              <w:t>AWS/TPWS</w:t>
+            </w:r>
+          </w:p>
+        </w:tc>
+        <w:tc>
+          <w:tcPr>
+            <w:tcW w:w="1020" w:type="dxa"/>
+            <w:tcBorders>
+              <w:top w:val="single" w:sz="4" w:space="0" w:color="000000"/>
+              <w:left w:val="single" w:sz="4" w:space="0" w:color="000000"/>
+              <w:bottom w:val="single" w:sz="4" w:space="0" w:color="000000"/>
+            </w:tcBorders>
+            <w:vAlign w:val="bottom"/>
+          </w:tcPr>
+          <w:p>
+            <w:pPr>
+              <w:pStyle w:val="Normal"/>
+              <w:widowControl w:val="false"/>
+              <w:spacing w:lineRule="auto" w:line="180"/>
+              <w:jc w:val="center"/>
+              <w:rPr>
+                <w:color w:val="000000"/>
+                <w:sz w:val="16"/>
+                <w:szCs w:val="16"/>
+              </w:rPr>
+            </w:pPr>
+            <w:r>
+              <w:rPr>
+                <w:color w:val="000000"/>
+                <w:sz w:val="16"/>
+                <w:szCs w:val="16"/>
+              </w:rPr>
+              <w:t>Panto. Up/Shoe L</w:t>
+            </w:r>
+          </w:p>
+        </w:tc>
+        <w:tc>
+          <w:tcPr>
+            <w:tcW w:w="1016" w:type="dxa"/>
+            <w:tcBorders>
+              <w:top w:val="single" w:sz="4" w:space="0" w:color="000000"/>
+              <w:left w:val="single" w:sz="4" w:space="0" w:color="000000"/>
+              <w:bottom w:val="single" w:sz="4" w:space="0" w:color="000000"/>
+            </w:tcBorders>
+            <w:vAlign w:val="bottom"/>
+          </w:tcPr>
+          <w:p>
+            <w:pPr>
+              <w:pStyle w:val="Normal"/>
+              <w:widowControl w:val="false"/>
+              <w:spacing w:lineRule="auto" w:line="180"/>
+              <w:jc w:val="center"/>
+              <w:rPr>
+                <w:color w:val="000000"/>
+                <w:sz w:val="16"/>
+                <w:szCs w:val="16"/>
+              </w:rPr>
+            </w:pPr>
+            <w:r>
+              <w:rPr>
+                <w:color w:val="000000"/>
+                <w:sz w:val="16"/>
+                <w:szCs w:val="16"/>
+              </w:rPr>
+              <w:t>AC</w:t>
+            </w:r>
+          </w:p>
+        </w:tc>
+        <w:tc>
+          <w:tcPr>
+            <w:tcW w:w="1016" w:type="dxa"/>
+            <w:tcBorders>
+              <w:top w:val="single" w:sz="4" w:space="0" w:color="000000"/>
+              <w:left w:val="single" w:sz="4" w:space="0" w:color="000000"/>
+              <w:bottom w:val="single" w:sz="4" w:space="0" w:color="000000"/>
+            </w:tcBorders>
+            <w:vAlign w:val="bottom"/>
+          </w:tcPr>
+          <w:p>
+            <w:pPr>
+              <w:pStyle w:val="Normal"/>
+              <w:widowControl w:val="false"/>
+              <w:jc w:val="center"/>
+              <w:rPr>
+                <w:sz w:val="16"/>
+                <w:szCs w:val="16"/>
+              </w:rPr>
+            </w:pPr>
+            <w:r>
+              <w:rPr>
+                <w:sz w:val="16"/>
+                <w:szCs w:val="16"/>
+              </w:rPr>
+              <w:t>DRA</w:t>
+            </w:r>
+          </w:p>
+        </w:tc>
+        <w:tc>
+          <w:tcPr>
+            <w:tcW w:w="1017" w:type="dxa"/>
+            <w:tcBorders>
+              <w:top w:val="single" w:sz="4" w:space="0" w:color="000000"/>
+              <w:left w:val="single" w:sz="4" w:space="0" w:color="000000"/>
+              <w:bottom w:val="single" w:sz="4" w:space="0" w:color="000000"/>
+            </w:tcBorders>
+            <w:vAlign w:val="bottom"/>
+          </w:tcPr>
+          <w:p>
+            <w:pPr>
+              <w:pStyle w:val="Normal"/>
+              <w:widowControl w:val="false"/>
+              <w:jc w:val="center"/>
+              <w:rPr>
+                <w:color w:val="000000"/>
+                <w:sz w:val="16"/>
+                <w:szCs w:val="16"/>
+              </w:rPr>
+            </w:pPr>
+            <w:r>
+              <w:rPr>
+                <w:color w:val="000000"/>
+                <w:sz w:val="16"/>
+                <w:szCs w:val="16"/>
+              </w:rPr>
+            </w:r>
+          </w:p>
+        </w:tc>
+        <w:tc>
+          <w:tcPr>
+            <w:tcW w:w="1016" w:type="dxa"/>
+            <w:tcBorders>
+              <w:top w:val="single" w:sz="4" w:space="0" w:color="000000"/>
+              <w:left w:val="single" w:sz="4" w:space="0" w:color="000000"/>
+              <w:bottom w:val="single" w:sz="4" w:space="0" w:color="000000"/>
+            </w:tcBorders>
+            <w:vAlign w:val="bottom"/>
+          </w:tcPr>
+          <w:p>
+            <w:pPr>
+              <w:pStyle w:val="Normal"/>
+              <w:widowControl w:val="false"/>
+              <w:jc w:val="center"/>
+              <w:rPr>
+                <w:sz w:val="16"/>
+                <w:szCs w:val="16"/>
+              </w:rPr>
+            </w:pPr>
+            <w:r>
+              <w:rPr>
+                <w:sz w:val="16"/>
+                <w:szCs w:val="16"/>
+              </w:rPr>
+            </w:r>
+          </w:p>
+        </w:tc>
+        <w:tc>
+          <w:tcPr>
+            <w:tcW w:w="1020" w:type="dxa"/>
+            <w:tcBorders>
+              <w:top w:val="single" w:sz="4" w:space="0" w:color="000000"/>
+              <w:left w:val="single" w:sz="4" w:space="0" w:color="000000"/>
+              <w:bottom w:val="single" w:sz="4" w:space="0" w:color="000000"/>
+            </w:tcBorders>
+            <w:vAlign w:val="bottom"/>
+          </w:tcPr>
+          <w:p>
+            <w:pPr>
+              <w:pStyle w:val="Normal"/>
+              <w:widowControl w:val="false"/>
+              <w:jc w:val="center"/>
+              <w:rPr>
+                <w:color w:val="000000"/>
+                <w:sz w:val="16"/>
+                <w:szCs w:val="16"/>
+              </w:rPr>
+            </w:pPr>
+            <w:r>
+              <w:rPr>
+                <w:color w:val="000000"/>
+                <w:sz w:val="16"/>
+                <w:szCs w:val="16"/>
+              </w:rPr>
+              <w:t>Hazard Light</w:t>
+            </w:r>
+          </w:p>
+        </w:tc>
+        <w:tc>
+          <w:tcPr>
+            <w:tcW w:w="1016" w:type="dxa"/>
+            <w:tcBorders>
+              <w:top w:val="single" w:sz="4" w:space="0" w:color="000000"/>
+              <w:left w:val="single" w:sz="4" w:space="0" w:color="000000"/>
+              <w:bottom w:val="single" w:sz="4" w:space="0" w:color="000000"/>
+            </w:tcBorders>
+            <w:vAlign w:val="bottom"/>
+          </w:tcPr>
+          <w:p>
+            <w:pPr>
+              <w:pStyle w:val="Normal"/>
+              <w:widowControl w:val="false"/>
+              <w:spacing w:lineRule="auto" w:line="180"/>
+              <w:jc w:val="center"/>
+              <w:rPr>
+                <w:sz w:val="16"/>
+                <w:szCs w:val="16"/>
+              </w:rPr>
+            </w:pPr>
+            <w:r>
+              <w:rPr>
+                <w:rFonts w:eastAsia="arial" w:ascii="arial" w:hAnsi="arial"/>
+                <w:color w:val="000000"/>
+                <w:sz w:val="16"/>
+                <w:szCs w:val="16"/>
+              </w:rPr>
+              <w:t>Cab Light</w:t>
+            </w:r>
+          </w:p>
+        </w:tc>
+        <w:tc>
+          <w:tcPr>
+            <w:tcW w:w="1016" w:type="dxa"/>
+            <w:tcBorders>
+              <w:top w:val="single" w:sz="4" w:space="0" w:color="000000"/>
+              <w:left w:val="single" w:sz="4" w:space="0" w:color="000000"/>
+              <w:bottom w:val="single" w:sz="4" w:space="0" w:color="000000"/>
+            </w:tcBorders>
+            <w:vAlign w:val="bottom"/>
+          </w:tcPr>
+          <w:p>
+            <w:pPr>
+              <w:pStyle w:val="Normal"/>
+              <w:widowControl w:val="false"/>
+              <w:jc w:val="center"/>
+              <w:rPr>
+                <w:color w:val="000000"/>
+                <w:sz w:val="16"/>
+                <w:szCs w:val="16"/>
+              </w:rPr>
+            </w:pPr>
+            <w:r>
+              <w:rPr>
+                <w:color w:val="000000"/>
+                <w:sz w:val="16"/>
+                <w:szCs w:val="16"/>
+              </w:rPr>
+              <w:t>Couple</w:t>
+            </w:r>
+          </w:p>
+        </w:tc>
+        <w:tc>
+          <w:tcPr>
+            <w:tcW w:w="1016" w:type="dxa"/>
+            <w:tcBorders>
+              <w:top w:val="single" w:sz="4" w:space="0" w:color="000000"/>
+              <w:left w:val="single" w:sz="4" w:space="0" w:color="000000"/>
+              <w:bottom w:val="single" w:sz="4" w:space="0" w:color="000000"/>
+            </w:tcBorders>
+            <w:vAlign w:val="bottom"/>
+          </w:tcPr>
+          <w:p>
+            <w:pPr>
+              <w:pStyle w:val="Normal"/>
+              <w:widowControl w:val="false"/>
+              <w:spacing w:lineRule="auto" w:line="180"/>
+              <w:jc w:val="center"/>
+              <w:rPr>
+                <w:sz w:val="16"/>
+                <w:szCs w:val="16"/>
+              </w:rPr>
+            </w:pPr>
+            <w:r>
+              <w:rPr>
+                <w:rFonts w:eastAsia="arial" w:ascii="arial" w:hAnsi="arial"/>
+                <w:color w:val="000000"/>
+                <w:sz w:val="16"/>
+                <w:szCs w:val="16"/>
+              </w:rPr>
+              <w:t>1-Person</w:t>
+            </w:r>
+          </w:p>
+        </w:tc>
+        <w:tc>
+          <w:tcPr>
+            <w:tcW w:w="1029" w:type="dxa"/>
+            <w:tcBorders>
+              <w:top w:val="single" w:sz="4" w:space="0" w:color="000000"/>
+              <w:left w:val="single" w:sz="4" w:space="0" w:color="000000"/>
+              <w:bottom w:val="single" w:sz="4" w:space="0" w:color="000000"/>
+              <w:right w:val="single" w:sz="4" w:space="0" w:color="000000"/>
+            </w:tcBorders>
+            <w:vAlign w:val="bottom"/>
+          </w:tcPr>
+          <w:p>
+            <w:pPr>
+              <w:pStyle w:val="Normal"/>
+              <w:widowControl w:val="false"/>
+              <w:spacing w:lineRule="auto" w:line="180"/>
+              <w:jc w:val="center"/>
+              <w:rPr>
+                <w:sz w:val="16"/>
+                <w:szCs w:val="16"/>
+              </w:rPr>
+            </w:pPr>
+            <w:r>
+              <w:rPr>
+                <w:rFonts w:eastAsia="arial" w:ascii="arial" w:hAnsi="arial"/>
+                <w:color w:val="000000"/>
+                <w:sz w:val="16"/>
+                <w:szCs w:val="16"/>
+              </w:rPr>
+              <w:t>Next</w:t>
+            </w:r>
+          </w:p>
+          <w:p>
+            <w:pPr>
+              <w:pStyle w:val="Normal"/>
+              <w:widowControl w:val="false"/>
+              <w:spacing w:lineRule="auto" w:line="180"/>
+              <w:jc w:val="center"/>
+              <w:rPr>
+                <w:sz w:val="16"/>
+                <w:szCs w:val="16"/>
+              </w:rPr>
+            </w:pPr>
+            <w:r>
+              <w:rPr>
+                <w:rFonts w:eastAsia="arial" w:ascii="arial" w:hAnsi="arial"/>
+                <w:color w:val="000000"/>
+                <w:sz w:val="16"/>
+                <w:szCs w:val="16"/>
+              </w:rPr>
+              <w:t>Cab Cam</w:t>
+            </w:r>
+          </w:p>
+        </w:tc>
+      </w:tr>
+    </w:tbl>
+    <w:p>
+      <w:pPr>
+        <w:pStyle w:val="Normal"/>
+        <w:rPr>
+          <w:rFonts w:ascii="arial" w:hAnsi="arial" w:eastAsia="arial"/>
+          <w:color w:val="000000"/>
+          <w:sz w:val="16"/>
+          <w:szCs w:val="16"/>
+        </w:rPr>
+      </w:pPr>
+      <w:r>
+        <w:rPr>
+          <w:rFonts w:eastAsia="arial" w:ascii="arial" w:hAnsi="arial"/>
+          <w:color w:val="000000"/>
+          <w:sz w:val="16"/>
+          <w:szCs w:val="16"/>
+        </w:rPr>
+      </w:r>
+    </w:p>
+    <w:p>
+      <w:pPr>
+        <w:pStyle w:val="Normal"/>
+        <w:rPr>
+          <w:color w:val="000000"/>
+          <w:sz w:val="16"/>
+          <w:szCs w:val="16"/>
+        </w:rPr>
+      </w:pPr>
+      <w:r>
+        <w:rPr>
+          <w:rFonts w:eastAsia="arial" w:ascii="arial" w:hAnsi="arial"/>
+          <w:color w:val="000000"/>
+          <w:sz w:val="16"/>
+          <w:szCs w:val="16"/>
+        </w:rPr>
+        <w:tab/>
+        <w:t xml:space="preserve">           Class 375-2</w:t>
+      </w:r>
+    </w:p>
+    <w:tbl>
+      <w:tblPr>
+        <w:tblW w:w="14248" w:type="dxa"/>
+        <w:jc w:val="left"/>
+        <w:tblInd w:w="-5" w:type="dxa"/>
+        <w:tblLayout w:type="fixed"/>
+        <w:tblCellMar>
+          <w:top w:w="0" w:type="dxa"/>
+          <w:left w:w="108" w:type="dxa"/>
+          <w:bottom w:w="0" w:type="dxa"/>
+          <w:right w:w="108" w:type="dxa"/>
+        </w:tblCellMar>
+        <w:tblLook w:firstRow="1" w:noVBand="1" w:lastRow="0" w:firstColumn="1" w:lastColumn="0" w:noHBand="0" w:val="04a0"/>
+      </w:tblPr>
+      <w:tblGrid>
+        <w:gridCol w:w="1017"/>
+        <w:gridCol w:w="1019"/>
+        <w:gridCol w:w="1014"/>
+        <w:gridCol w:w="1016"/>
+        <w:gridCol w:w="1020"/>
+        <w:gridCol w:w="1016"/>
+        <w:gridCol w:w="1016"/>
+        <w:gridCol w:w="1017"/>
+        <w:gridCol w:w="1016"/>
+        <w:gridCol w:w="1020"/>
+        <w:gridCol w:w="1016"/>
+        <w:gridCol w:w="1016"/>
+        <w:gridCol w:w="1016"/>
+        <w:gridCol w:w="1029"/>
+      </w:tblGrid>
+      <w:tr>
+        <w:trPr>
+          <w:trHeight w:val="440" w:hRule="exact"/>
+          <w:cantSplit w:val="true"/>
+        </w:trPr>
+        <w:tc>
+          <w:tcPr>
+            <w:tcW w:w="1017" w:type="dxa"/>
+            <w:tcBorders>
+              <w:top w:val="single" w:sz="4" w:space="0" w:color="000000"/>
+              <w:left w:val="single" w:sz="4" w:space="0" w:color="000000"/>
+              <w:bottom w:val="single" w:sz="4" w:space="0" w:color="000000"/>
+            </w:tcBorders>
+            <w:vAlign w:val="bottom"/>
+          </w:tcPr>
+          <w:p>
+            <w:pPr>
+              <w:pStyle w:val="Normal"/>
+              <w:widowControl w:val="false"/>
+              <w:spacing w:lineRule="auto" w:line="180" w:before="0" w:after="60"/>
+              <w:jc w:val="center"/>
+              <w:rPr>
+                <w:b/>
+                <w:bCs/>
+              </w:rPr>
+            </w:pPr>
+            <w:r>
+              <w:rPr>
+                <w:b/>
+                <w:bCs/>
+                <w:color w:val="000000"/>
+                <w:sz w:val="16"/>
+                <w:szCs w:val="16"/>
+              </w:rPr>
+              <w:t>HUD</w:t>
+            </w:r>
+          </w:p>
+        </w:tc>
+        <w:tc>
+          <w:tcPr>
+            <w:tcW w:w="1019" w:type="dxa"/>
+            <w:tcBorders>
+              <w:top w:val="single" w:sz="4" w:space="0" w:color="000000"/>
+              <w:left w:val="single" w:sz="4" w:space="0" w:color="000000"/>
+              <w:bottom w:val="single" w:sz="4" w:space="0" w:color="000000"/>
+            </w:tcBorders>
+            <w:vAlign w:val="bottom"/>
+          </w:tcPr>
+          <w:p>
+            <w:pPr>
+              <w:pStyle w:val="Normal"/>
+              <w:widowControl w:val="false"/>
+              <w:spacing w:lineRule="auto" w:line="180"/>
+              <w:jc w:val="center"/>
+              <w:rPr>
+                <w:color w:val="000000"/>
+                <w:sz w:val="16"/>
+                <w:szCs w:val="16"/>
+              </w:rPr>
+            </w:pPr>
+            <w:r>
+              <w:rPr>
+                <w:color w:val="000000"/>
+                <w:sz w:val="16"/>
+                <w:szCs w:val="16"/>
+              </w:rPr>
+              <w:t>Schedule</w:t>
+            </w:r>
+          </w:p>
+        </w:tc>
+        <w:tc>
+          <w:tcPr>
+            <w:tcW w:w="1014" w:type="dxa"/>
+            <w:tcBorders>
+              <w:top w:val="single" w:sz="4" w:space="0" w:color="000000"/>
+              <w:left w:val="single" w:sz="4" w:space="0" w:color="000000"/>
+              <w:bottom w:val="single" w:sz="4" w:space="0" w:color="000000"/>
+            </w:tcBorders>
+            <w:vAlign w:val="bottom"/>
+          </w:tcPr>
+          <w:p>
+            <w:pPr>
+              <w:pStyle w:val="Normal"/>
+              <w:widowControl w:val="false"/>
+              <w:spacing w:lineRule="auto" w:line="180"/>
+              <w:jc w:val="center"/>
+              <w:rPr>
+                <w:color w:val="000000"/>
+                <w:sz w:val="16"/>
+                <w:szCs w:val="16"/>
+              </w:rPr>
+            </w:pPr>
+            <w:r>
+              <w:rPr>
+                <w:color w:val="000000"/>
+                <w:sz w:val="16"/>
+                <w:szCs w:val="16"/>
+              </w:rPr>
+              <w:t>Aux Off</w:t>
+            </w:r>
+          </w:p>
+        </w:tc>
+        <w:tc>
+          <w:tcPr>
+            <w:tcW w:w="1016" w:type="dxa"/>
+            <w:tcBorders>
+              <w:top w:val="single" w:sz="4" w:space="0" w:color="000000"/>
+              <w:left w:val="single" w:sz="4" w:space="0" w:color="000000"/>
+              <w:bottom w:val="single" w:sz="4" w:space="0" w:color="000000"/>
+            </w:tcBorders>
+            <w:vAlign w:val="bottom"/>
+          </w:tcPr>
+          <w:p>
+            <w:pPr>
+              <w:pStyle w:val="Normal"/>
+              <w:widowControl w:val="false"/>
+              <w:spacing w:lineRule="auto" w:line="180"/>
+              <w:jc w:val="center"/>
+              <w:rPr>
+                <w:color w:val="000000"/>
+                <w:sz w:val="16"/>
+                <w:szCs w:val="16"/>
+              </w:rPr>
+            </w:pPr>
+            <w:r>
+              <w:rPr>
+                <w:color w:val="000000"/>
+                <w:sz w:val="16"/>
+                <w:szCs w:val="16"/>
+              </w:rPr>
+              <w:t>DSD/Vigilance</w:t>
+            </w:r>
+          </w:p>
+        </w:tc>
+        <w:tc>
+          <w:tcPr>
+            <w:tcW w:w="1020" w:type="dxa"/>
+            <w:tcBorders>
+              <w:top w:val="single" w:sz="4" w:space="0" w:color="000000"/>
+              <w:left w:val="single" w:sz="4" w:space="0" w:color="000000"/>
+              <w:bottom w:val="single" w:sz="4" w:space="0" w:color="000000"/>
+            </w:tcBorders>
+            <w:vAlign w:val="bottom"/>
+          </w:tcPr>
+          <w:p>
+            <w:pPr>
+              <w:pStyle w:val="Normal"/>
+              <w:widowControl w:val="false"/>
+              <w:spacing w:lineRule="auto" w:line="180"/>
+              <w:jc w:val="center"/>
+              <w:rPr>
+                <w:color w:val="000000"/>
+                <w:sz w:val="16"/>
+                <w:szCs w:val="16"/>
+              </w:rPr>
+            </w:pPr>
+            <w:r>
+              <w:rPr>
+                <w:color w:val="000000"/>
+                <w:sz w:val="16"/>
+                <w:szCs w:val="16"/>
+              </w:rPr>
+              <w:t>Panto. L/Shoe Up</w:t>
+            </w:r>
+          </w:p>
+        </w:tc>
+        <w:tc>
+          <w:tcPr>
+            <w:tcW w:w="1016" w:type="dxa"/>
+            <w:tcBorders>
+              <w:top w:val="single" w:sz="4" w:space="0" w:color="000000"/>
+              <w:left w:val="single" w:sz="4" w:space="0" w:color="000000"/>
+              <w:bottom w:val="single" w:sz="4" w:space="0" w:color="000000"/>
+            </w:tcBorders>
+            <w:vAlign w:val="bottom"/>
+          </w:tcPr>
+          <w:p>
+            <w:pPr>
+              <w:pStyle w:val="Normal"/>
+              <w:widowControl w:val="false"/>
+              <w:spacing w:lineRule="auto" w:line="180"/>
+              <w:jc w:val="center"/>
+              <w:rPr>
+                <w:sz w:val="16"/>
+                <w:szCs w:val="16"/>
+              </w:rPr>
+            </w:pPr>
+            <w:r>
+              <w:rPr>
+                <w:color w:val="000000"/>
+                <w:sz w:val="16"/>
+                <w:szCs w:val="16"/>
+              </w:rPr>
+              <w:t>DC</w:t>
+            </w:r>
+          </w:p>
+        </w:tc>
+        <w:tc>
+          <w:tcPr>
+            <w:tcW w:w="1016" w:type="dxa"/>
+            <w:tcBorders>
+              <w:top w:val="single" w:sz="4" w:space="0" w:color="000000"/>
+              <w:left w:val="single" w:sz="4" w:space="0" w:color="000000"/>
+              <w:bottom w:val="single" w:sz="4" w:space="0" w:color="000000"/>
+            </w:tcBorders>
+            <w:vAlign w:val="bottom"/>
+          </w:tcPr>
+          <w:p>
+            <w:pPr>
+              <w:pStyle w:val="Normal"/>
+              <w:widowControl w:val="false"/>
+              <w:jc w:val="center"/>
+              <w:rPr>
+                <w:color w:val="000000"/>
+                <w:sz w:val="16"/>
+                <w:szCs w:val="16"/>
+              </w:rPr>
+            </w:pPr>
+            <w:r>
+              <w:rPr>
+                <w:color w:val="000000"/>
+                <w:sz w:val="16"/>
+                <w:szCs w:val="16"/>
+              </w:rPr>
+            </w:r>
+          </w:p>
+        </w:tc>
+        <w:tc>
+          <w:tcPr>
+            <w:tcW w:w="1017" w:type="dxa"/>
+            <w:tcBorders>
+              <w:top w:val="single" w:sz="4" w:space="0" w:color="000000"/>
+              <w:left w:val="single" w:sz="4" w:space="0" w:color="000000"/>
+              <w:bottom w:val="single" w:sz="4" w:space="0" w:color="000000"/>
+            </w:tcBorders>
+            <w:vAlign w:val="bottom"/>
+          </w:tcPr>
+          <w:p>
+            <w:pPr>
+              <w:pStyle w:val="Normal"/>
+              <w:widowControl w:val="false"/>
+              <w:jc w:val="center"/>
+              <w:rPr>
+                <w:color w:val="000000"/>
+                <w:sz w:val="16"/>
+                <w:szCs w:val="16"/>
+              </w:rPr>
+            </w:pPr>
+            <w:r>
+              <w:rPr>
+                <w:color w:val="000000"/>
+                <w:sz w:val="16"/>
+                <w:szCs w:val="16"/>
+              </w:rPr>
+            </w:r>
+          </w:p>
+        </w:tc>
+        <w:tc>
+          <w:tcPr>
+            <w:tcW w:w="1016" w:type="dxa"/>
+            <w:tcBorders>
+              <w:top w:val="single" w:sz="4" w:space="0" w:color="000000"/>
+              <w:left w:val="single" w:sz="4" w:space="0" w:color="000000"/>
+              <w:bottom w:val="single" w:sz="4" w:space="0" w:color="000000"/>
+            </w:tcBorders>
+            <w:vAlign w:val="bottom"/>
+          </w:tcPr>
+          <w:p>
+            <w:pPr>
+              <w:pStyle w:val="Normal"/>
+              <w:widowControl w:val="false"/>
+              <w:jc w:val="center"/>
+              <w:rPr>
+                <w:sz w:val="16"/>
+                <w:szCs w:val="16"/>
+              </w:rPr>
+            </w:pPr>
+            <w:r>
+              <w:rPr>
+                <w:sz w:val="16"/>
+                <w:szCs w:val="16"/>
+              </w:rPr>
+            </w:r>
+          </w:p>
+        </w:tc>
+        <w:tc>
+          <w:tcPr>
+            <w:tcW w:w="1020" w:type="dxa"/>
+            <w:tcBorders>
+              <w:top w:val="single" w:sz="4" w:space="0" w:color="000000"/>
+              <w:left w:val="single" w:sz="4" w:space="0" w:color="000000"/>
+              <w:bottom w:val="single" w:sz="4" w:space="0" w:color="000000"/>
+            </w:tcBorders>
+            <w:vAlign w:val="bottom"/>
+          </w:tcPr>
+          <w:p>
+            <w:pPr>
+              <w:pStyle w:val="Normal"/>
+              <w:widowControl w:val="false"/>
+              <w:jc w:val="center"/>
+              <w:rPr>
+                <w:rFonts w:ascii="arial" w:hAnsi="arial" w:eastAsia="arial"/>
+                <w:color w:val="000000"/>
+                <w:sz w:val="16"/>
+                <w:szCs w:val="16"/>
+              </w:rPr>
+            </w:pPr>
+            <w:r>
+              <w:rPr>
+                <w:rFonts w:eastAsia="arial" w:ascii="arial" w:hAnsi="arial"/>
+                <w:color w:val="000000"/>
+                <w:sz w:val="16"/>
+                <w:szCs w:val="16"/>
+              </w:rPr>
+              <w:t>Notice Bd. Light</w:t>
+            </w:r>
+          </w:p>
+        </w:tc>
+        <w:tc>
+          <w:tcPr>
+            <w:tcW w:w="1016" w:type="dxa"/>
+            <w:tcBorders>
+              <w:top w:val="single" w:sz="4" w:space="0" w:color="000000"/>
+              <w:left w:val="single" w:sz="4" w:space="0" w:color="000000"/>
+              <w:bottom w:val="single" w:sz="4" w:space="0" w:color="000000"/>
+            </w:tcBorders>
+            <w:vAlign w:val="bottom"/>
+          </w:tcPr>
+          <w:p>
+            <w:pPr>
+              <w:pStyle w:val="Normal"/>
+              <w:widowControl w:val="false"/>
+              <w:jc w:val="center"/>
+              <w:rPr>
+                <w:color w:val="000000"/>
+                <w:sz w:val="16"/>
+                <w:szCs w:val="16"/>
+              </w:rPr>
+            </w:pPr>
+            <w:r>
+              <w:rPr>
+                <w:color w:val="000000"/>
+                <w:sz w:val="16"/>
+                <w:szCs w:val="16"/>
+              </w:rPr>
+              <w:t>Tail Light</w:t>
+            </w:r>
+          </w:p>
+        </w:tc>
+        <w:tc>
+          <w:tcPr>
+            <w:tcW w:w="1016" w:type="dxa"/>
+            <w:tcBorders>
+              <w:top w:val="single" w:sz="4" w:space="0" w:color="000000"/>
+              <w:left w:val="single" w:sz="4" w:space="0" w:color="000000"/>
+              <w:bottom w:val="single" w:sz="4" w:space="0" w:color="000000"/>
+            </w:tcBorders>
+            <w:vAlign w:val="bottom"/>
+          </w:tcPr>
+          <w:p>
+            <w:pPr>
+              <w:pStyle w:val="Normal"/>
+              <w:widowControl w:val="false"/>
+              <w:spacing w:lineRule="auto" w:line="180"/>
+              <w:jc w:val="center"/>
+              <w:rPr>
+                <w:sz w:val="16"/>
+                <w:szCs w:val="16"/>
+              </w:rPr>
+            </w:pPr>
+            <w:r>
+              <w:rPr>
+                <w:sz w:val="16"/>
+                <w:szCs w:val="16"/>
+              </w:rPr>
+              <w:t>Uncouple</w:t>
+            </w:r>
+          </w:p>
+        </w:tc>
+        <w:tc>
+          <w:tcPr>
+            <w:tcW w:w="1016" w:type="dxa"/>
+            <w:tcBorders>
+              <w:top w:val="single" w:sz="4" w:space="0" w:color="000000"/>
+              <w:left w:val="single" w:sz="4" w:space="0" w:color="000000"/>
+              <w:bottom w:val="single" w:sz="4" w:space="0" w:color="000000"/>
+            </w:tcBorders>
+            <w:vAlign w:val="bottom"/>
+          </w:tcPr>
+          <w:p>
+            <w:pPr>
+              <w:pStyle w:val="Normal"/>
+              <w:widowControl w:val="false"/>
+              <w:spacing w:lineRule="auto" w:line="180"/>
+              <w:jc w:val="center"/>
+              <w:rPr>
+                <w:sz w:val="16"/>
+                <w:szCs w:val="16"/>
+              </w:rPr>
+            </w:pPr>
+            <w:r>
+              <w:rPr>
+                <w:rFonts w:eastAsia="arial" w:ascii="arial" w:hAnsi="arial"/>
+                <w:color w:val="000000"/>
+                <w:sz w:val="16"/>
+                <w:szCs w:val="16"/>
+              </w:rPr>
+              <w:t>Exterior</w:t>
+            </w:r>
+          </w:p>
+          <w:p>
+            <w:pPr>
+              <w:pStyle w:val="Normal"/>
+              <w:widowControl w:val="false"/>
+              <w:spacing w:lineRule="auto" w:line="180"/>
+              <w:jc w:val="center"/>
+              <w:rPr>
+                <w:sz w:val="16"/>
+                <w:szCs w:val="16"/>
+              </w:rPr>
+            </w:pPr>
+            <w:r>
+              <w:rPr>
+                <w:rFonts w:eastAsia="arial" w:ascii="arial" w:hAnsi="arial"/>
+                <w:color w:val="000000"/>
+                <w:sz w:val="16"/>
+                <w:szCs w:val="16"/>
+              </w:rPr>
+              <w:t>Camera</w:t>
+            </w:r>
+          </w:p>
+        </w:tc>
+        <w:tc>
+          <w:tcPr>
+            <w:tcW w:w="1029" w:type="dxa"/>
+            <w:tcBorders>
+              <w:top w:val="single" w:sz="4" w:space="0" w:color="000000"/>
+              <w:left w:val="single" w:sz="4" w:space="0" w:color="000000"/>
+              <w:bottom w:val="single" w:sz="4" w:space="0" w:color="000000"/>
+              <w:right w:val="single" w:sz="4" w:space="0" w:color="000000"/>
+            </w:tcBorders>
+            <w:vAlign w:val="bottom"/>
+          </w:tcPr>
+          <w:p>
+            <w:pPr>
+              <w:pStyle w:val="Normal"/>
+              <w:widowControl w:val="false"/>
+              <w:spacing w:lineRule="auto" w:line="180"/>
+              <w:jc w:val="center"/>
+              <w:rPr>
+                <w:sz w:val="16"/>
+                <w:szCs w:val="16"/>
+              </w:rPr>
+            </w:pPr>
+            <w:r>
+              <w:rPr>
+                <w:rFonts w:eastAsia="arial" w:ascii="arial" w:hAnsi="arial"/>
+                <w:color w:val="000000"/>
+                <w:sz w:val="16"/>
+                <w:szCs w:val="16"/>
+              </w:rPr>
+              <w:t>Prev</w:t>
+            </w:r>
+          </w:p>
+          <w:p>
+            <w:pPr>
+              <w:pStyle w:val="Normal"/>
+              <w:widowControl w:val="false"/>
+              <w:spacing w:lineRule="auto" w:line="180"/>
+              <w:jc w:val="center"/>
+              <w:rPr>
+                <w:sz w:val="16"/>
+                <w:szCs w:val="16"/>
+              </w:rPr>
+            </w:pPr>
+            <w:r>
+              <w:rPr>
+                <w:rFonts w:eastAsia="arial" w:ascii="arial" w:hAnsi="arial"/>
+                <w:color w:val="000000"/>
+                <w:sz w:val="16"/>
+                <w:szCs w:val="16"/>
+              </w:rPr>
+              <w:t>Cab Cam</w:t>
+            </w:r>
+          </w:p>
+        </w:tc>
+      </w:tr>
+    </w:tbl>
+    <w:p>
+      <w:pPr>
+        <w:pStyle w:val="Normal"/>
+        <w:rPr>
+          <w:color w:val="000000"/>
+          <w:sz w:val="16"/>
+          <w:szCs w:val="16"/>
+        </w:rPr>
+      </w:pPr>
+      <w:r>
+        <w:rPr>
+          <w:color w:val="000000"/>
+          <w:sz w:val="16"/>
+          <w:szCs w:val="16"/>
+        </w:rPr>
+      </w:r>
+    </w:p>
+    <w:p>
+      <w:pPr>
+        <w:pStyle w:val="Normal"/>
+        <w:rPr>
+          <w:color w:val="000000"/>
+          <w:sz w:val="16"/>
+          <w:szCs w:val="16"/>
+        </w:rPr>
+      </w:pPr>
+      <w:r>
+        <w:rPr>
+          <w:rFonts w:eastAsia="arial" w:ascii="arial" w:hAnsi="arial"/>
+          <w:color w:val="000000"/>
+          <w:sz w:val="16"/>
+          <w:szCs w:val="16"/>
+        </w:rPr>
+        <w:tab/>
+        <w:t xml:space="preserve">           Class 377-1</w:t>
+      </w:r>
+    </w:p>
+    <w:tbl>
+      <w:tblPr>
+        <w:tblW w:w="14248" w:type="dxa"/>
+        <w:jc w:val="left"/>
+        <w:tblInd w:w="-5" w:type="dxa"/>
+        <w:tblLayout w:type="fixed"/>
+        <w:tblCellMar>
+          <w:top w:w="0" w:type="dxa"/>
+          <w:left w:w="108" w:type="dxa"/>
+          <w:bottom w:w="0" w:type="dxa"/>
+          <w:right w:w="108" w:type="dxa"/>
+        </w:tblCellMar>
+        <w:tblLook w:firstRow="1" w:noVBand="1" w:lastRow="0" w:firstColumn="1" w:lastColumn="0" w:noHBand="0" w:val="04a0"/>
+      </w:tblPr>
+      <w:tblGrid>
+        <w:gridCol w:w="1017"/>
+        <w:gridCol w:w="1019"/>
+        <w:gridCol w:w="1014"/>
+        <w:gridCol w:w="1016"/>
+        <w:gridCol w:w="1020"/>
+        <w:gridCol w:w="1016"/>
+        <w:gridCol w:w="1016"/>
+        <w:gridCol w:w="1017"/>
+        <w:gridCol w:w="1016"/>
+        <w:gridCol w:w="1020"/>
+        <w:gridCol w:w="1016"/>
+        <w:gridCol w:w="1016"/>
+        <w:gridCol w:w="1016"/>
+        <w:gridCol w:w="1029"/>
+      </w:tblGrid>
+      <w:tr>
+        <w:trPr>
+          <w:trHeight w:val="440" w:hRule="exact"/>
+          <w:cantSplit w:val="true"/>
+        </w:trPr>
+        <w:tc>
+          <w:tcPr>
+            <w:tcW w:w="1017" w:type="dxa"/>
+            <w:tcBorders>
+              <w:top w:val="single" w:sz="4" w:space="0" w:color="000000"/>
+              <w:left w:val="single" w:sz="4" w:space="0" w:color="000000"/>
+              <w:bottom w:val="single" w:sz="4" w:space="0" w:color="000000"/>
+            </w:tcBorders>
+            <w:vAlign w:val="bottom"/>
+          </w:tcPr>
+          <w:p>
+            <w:pPr>
+              <w:pStyle w:val="Normal"/>
+              <w:widowControl w:val="false"/>
+              <w:spacing w:lineRule="auto" w:line="180" w:before="0" w:after="60"/>
+              <w:jc w:val="center"/>
+              <w:rPr>
+                <w:color w:val="000000"/>
+                <w:sz w:val="16"/>
+                <w:szCs w:val="16"/>
+              </w:rPr>
+            </w:pPr>
+            <w:r>
+              <w:rPr>
+                <w:rFonts w:eastAsia="arial" w:ascii="arial" w:hAnsi="arial"/>
+                <w:b/>
+                <w:color w:val="000000"/>
+                <w:sz w:val="16"/>
+                <w:szCs w:val="16"/>
+              </w:rPr>
+              <w:t>Pause</w:t>
+            </w:r>
+          </w:p>
+        </w:tc>
+        <w:tc>
+          <w:tcPr>
+            <w:tcW w:w="1019" w:type="dxa"/>
+            <w:tcBorders>
+              <w:top w:val="single" w:sz="4" w:space="0" w:color="000000"/>
+              <w:left w:val="single" w:sz="4" w:space="0" w:color="000000"/>
+              <w:bottom w:val="single" w:sz="4" w:space="0" w:color="000000"/>
+            </w:tcBorders>
+            <w:vAlign w:val="bottom"/>
+          </w:tcPr>
+          <w:p>
+            <w:pPr>
+              <w:pStyle w:val="Normal"/>
+              <w:widowControl w:val="false"/>
+              <w:spacing w:lineRule="auto" w:line="180"/>
+              <w:jc w:val="center"/>
+              <w:rPr>
+                <w:color w:val="000000"/>
+                <w:sz w:val="16"/>
+                <w:szCs w:val="16"/>
+              </w:rPr>
+            </w:pPr>
+            <w:r>
+              <w:rPr>
+                <w:color w:val="000000"/>
+                <w:sz w:val="16"/>
+                <w:szCs w:val="16"/>
+              </w:rPr>
+              <w:t>Master Key</w:t>
+            </w:r>
+          </w:p>
+        </w:tc>
+        <w:tc>
+          <w:tcPr>
+            <w:tcW w:w="1014" w:type="dxa"/>
+            <w:tcBorders>
+              <w:top w:val="single" w:sz="4" w:space="0" w:color="000000"/>
+              <w:left w:val="single" w:sz="4" w:space="0" w:color="000000"/>
+              <w:bottom w:val="single" w:sz="4" w:space="0" w:color="000000"/>
+            </w:tcBorders>
+            <w:vAlign w:val="bottom"/>
+          </w:tcPr>
+          <w:p>
+            <w:pPr>
+              <w:pStyle w:val="Normal"/>
+              <w:widowControl w:val="false"/>
+              <w:spacing w:lineRule="auto" w:line="180"/>
+              <w:jc w:val="center"/>
+              <w:rPr>
+                <w:color w:val="000000"/>
+                <w:sz w:val="16"/>
+                <w:szCs w:val="16"/>
+              </w:rPr>
+            </w:pPr>
+            <w:r>
+              <w:rPr>
+                <w:color w:val="000000"/>
+                <w:sz w:val="16"/>
+                <w:szCs w:val="16"/>
+              </w:rPr>
+              <w:t>Aux On</w:t>
+            </w:r>
+          </w:p>
+        </w:tc>
+        <w:tc>
+          <w:tcPr>
+            <w:tcW w:w="1016" w:type="dxa"/>
+            <w:tcBorders>
+              <w:top w:val="single" w:sz="4" w:space="0" w:color="000000"/>
+              <w:left w:val="single" w:sz="4" w:space="0" w:color="000000"/>
+              <w:bottom w:val="single" w:sz="4" w:space="0" w:color="000000"/>
+            </w:tcBorders>
+            <w:vAlign w:val="bottom"/>
+          </w:tcPr>
+          <w:p>
+            <w:pPr>
+              <w:pStyle w:val="Normal"/>
+              <w:widowControl w:val="false"/>
+              <w:spacing w:lineRule="auto" w:line="180"/>
+              <w:jc w:val="center"/>
+              <w:rPr>
+                <w:color w:val="000000"/>
+                <w:sz w:val="16"/>
+                <w:szCs w:val="16"/>
+              </w:rPr>
+            </w:pPr>
+            <w:r>
+              <w:rPr>
+                <w:color w:val="000000"/>
+                <w:sz w:val="16"/>
+                <w:szCs w:val="16"/>
+              </w:rPr>
+              <w:t>AWS/TPWS</w:t>
+            </w:r>
+          </w:p>
+        </w:tc>
+        <w:tc>
+          <w:tcPr>
+            <w:tcW w:w="1020" w:type="dxa"/>
+            <w:tcBorders>
+              <w:top w:val="single" w:sz="4" w:space="0" w:color="000000"/>
+              <w:left w:val="single" w:sz="4" w:space="0" w:color="000000"/>
+              <w:bottom w:val="single" w:sz="4" w:space="0" w:color="000000"/>
+            </w:tcBorders>
+            <w:vAlign w:val="bottom"/>
+          </w:tcPr>
+          <w:p>
+            <w:pPr>
+              <w:pStyle w:val="Normal"/>
+              <w:widowControl w:val="false"/>
+              <w:spacing w:lineRule="auto" w:line="180"/>
+              <w:jc w:val="center"/>
+              <w:rPr>
+                <w:color w:val="000000"/>
+                <w:sz w:val="16"/>
+                <w:szCs w:val="16"/>
+              </w:rPr>
+            </w:pPr>
+            <w:r>
+              <w:rPr>
+                <w:color w:val="000000"/>
+                <w:sz w:val="16"/>
+                <w:szCs w:val="16"/>
+              </w:rPr>
+              <w:t>Panto. Up/Shoe L</w:t>
+            </w:r>
+          </w:p>
+        </w:tc>
+        <w:tc>
+          <w:tcPr>
+            <w:tcW w:w="1016" w:type="dxa"/>
+            <w:tcBorders>
+              <w:top w:val="single" w:sz="4" w:space="0" w:color="000000"/>
+              <w:left w:val="single" w:sz="4" w:space="0" w:color="000000"/>
+              <w:bottom w:val="single" w:sz="4" w:space="0" w:color="000000"/>
+            </w:tcBorders>
+            <w:vAlign w:val="bottom"/>
+          </w:tcPr>
+          <w:p>
+            <w:pPr>
+              <w:pStyle w:val="Normal"/>
+              <w:widowControl w:val="false"/>
+              <w:spacing w:lineRule="auto" w:line="180"/>
+              <w:jc w:val="center"/>
+              <w:rPr>
+                <w:color w:val="000000"/>
+                <w:sz w:val="16"/>
+                <w:szCs w:val="16"/>
+              </w:rPr>
+            </w:pPr>
+            <w:r>
+              <w:rPr>
+                <w:color w:val="000000"/>
+                <w:sz w:val="16"/>
+                <w:szCs w:val="16"/>
+              </w:rPr>
+              <w:t>AC</w:t>
+            </w:r>
+          </w:p>
+        </w:tc>
+        <w:tc>
+          <w:tcPr>
+            <w:tcW w:w="1016" w:type="dxa"/>
+            <w:tcBorders>
+              <w:top w:val="single" w:sz="4" w:space="0" w:color="000000"/>
+              <w:left w:val="single" w:sz="4" w:space="0" w:color="000000"/>
+              <w:bottom w:val="single" w:sz="4" w:space="0" w:color="000000"/>
+            </w:tcBorders>
+            <w:vAlign w:val="bottom"/>
+          </w:tcPr>
+          <w:p>
+            <w:pPr>
+              <w:pStyle w:val="Normal"/>
+              <w:widowControl w:val="false"/>
+              <w:jc w:val="center"/>
+              <w:rPr>
+                <w:sz w:val="16"/>
+                <w:szCs w:val="16"/>
+              </w:rPr>
+            </w:pPr>
+            <w:r>
+              <w:rPr>
+                <w:sz w:val="16"/>
+                <w:szCs w:val="16"/>
+              </w:rPr>
+              <w:t>DRA</w:t>
+            </w:r>
+          </w:p>
+        </w:tc>
+        <w:tc>
+          <w:tcPr>
+            <w:tcW w:w="1017" w:type="dxa"/>
+            <w:tcBorders>
+              <w:top w:val="single" w:sz="4" w:space="0" w:color="000000"/>
+              <w:left w:val="single" w:sz="4" w:space="0" w:color="000000"/>
+              <w:bottom w:val="single" w:sz="4" w:space="0" w:color="000000"/>
+            </w:tcBorders>
+            <w:vAlign w:val="bottom"/>
+          </w:tcPr>
+          <w:p>
+            <w:pPr>
+              <w:pStyle w:val="Normal"/>
+              <w:widowControl w:val="false"/>
+              <w:jc w:val="center"/>
+              <w:rPr>
+                <w:color w:val="000000"/>
+                <w:sz w:val="16"/>
+                <w:szCs w:val="16"/>
+              </w:rPr>
+            </w:pPr>
+            <w:r>
+              <w:rPr>
+                <w:color w:val="000000"/>
+                <w:sz w:val="16"/>
+                <w:szCs w:val="16"/>
+              </w:rPr>
+              <w:t>Train Car Length 12</w:t>
+            </w:r>
+          </w:p>
+        </w:tc>
+        <w:tc>
+          <w:tcPr>
+            <w:tcW w:w="1016" w:type="dxa"/>
+            <w:tcBorders>
+              <w:top w:val="single" w:sz="4" w:space="0" w:color="000000"/>
+              <w:left w:val="single" w:sz="4" w:space="0" w:color="000000"/>
+              <w:bottom w:val="single" w:sz="4" w:space="0" w:color="000000"/>
+            </w:tcBorders>
+            <w:vAlign w:val="bottom"/>
+          </w:tcPr>
+          <w:p>
+            <w:pPr>
+              <w:pStyle w:val="Normal"/>
+              <w:widowControl w:val="false"/>
+              <w:jc w:val="center"/>
+              <w:rPr>
+                <w:sz w:val="16"/>
+                <w:szCs w:val="16"/>
+              </w:rPr>
+            </w:pPr>
+            <w:r>
+              <w:rPr>
+                <w:sz w:val="16"/>
+                <w:szCs w:val="16"/>
+              </w:rPr>
+              <w:t>Speed Set</w:t>
+            </w:r>
+          </w:p>
+        </w:tc>
+        <w:tc>
+          <w:tcPr>
+            <w:tcW w:w="1020" w:type="dxa"/>
+            <w:tcBorders>
+              <w:top w:val="single" w:sz="4" w:space="0" w:color="000000"/>
+              <w:left w:val="single" w:sz="4" w:space="0" w:color="000000"/>
+              <w:bottom w:val="single" w:sz="4" w:space="0" w:color="000000"/>
+            </w:tcBorders>
+            <w:vAlign w:val="bottom"/>
+          </w:tcPr>
+          <w:p>
+            <w:pPr>
+              <w:pStyle w:val="Normal"/>
+              <w:widowControl w:val="false"/>
+              <w:jc w:val="center"/>
+              <w:rPr>
+                <w:color w:val="000000"/>
+                <w:sz w:val="16"/>
+                <w:szCs w:val="16"/>
+              </w:rPr>
+            </w:pPr>
+            <w:r>
+              <w:rPr>
+                <w:color w:val="000000"/>
+                <w:sz w:val="16"/>
+                <w:szCs w:val="16"/>
+              </w:rPr>
+              <w:t>Hazard Light</w:t>
+            </w:r>
+          </w:p>
+        </w:tc>
+        <w:tc>
+          <w:tcPr>
+            <w:tcW w:w="1016" w:type="dxa"/>
+            <w:tcBorders>
+              <w:top w:val="single" w:sz="4" w:space="0" w:color="000000"/>
+              <w:left w:val="single" w:sz="4" w:space="0" w:color="000000"/>
+              <w:bottom w:val="single" w:sz="4" w:space="0" w:color="000000"/>
+            </w:tcBorders>
+            <w:vAlign w:val="bottom"/>
+          </w:tcPr>
+          <w:p>
+            <w:pPr>
+              <w:pStyle w:val="Normal"/>
+              <w:widowControl w:val="false"/>
+              <w:spacing w:lineRule="auto" w:line="180"/>
+              <w:jc w:val="center"/>
+              <w:rPr>
+                <w:sz w:val="16"/>
+                <w:szCs w:val="16"/>
+              </w:rPr>
+            </w:pPr>
+            <w:r>
+              <w:rPr>
+                <w:rFonts w:eastAsia="arial" w:ascii="arial" w:hAnsi="arial"/>
+                <w:color w:val="000000"/>
+                <w:sz w:val="16"/>
+                <w:szCs w:val="16"/>
+              </w:rPr>
+              <w:t>Cab Light</w:t>
+            </w:r>
+          </w:p>
+        </w:tc>
+        <w:tc>
+          <w:tcPr>
+            <w:tcW w:w="1016" w:type="dxa"/>
+            <w:tcBorders>
+              <w:top w:val="single" w:sz="4" w:space="0" w:color="000000"/>
+              <w:left w:val="single" w:sz="4" w:space="0" w:color="000000"/>
+              <w:bottom w:val="single" w:sz="4" w:space="0" w:color="000000"/>
+            </w:tcBorders>
+            <w:vAlign w:val="bottom"/>
+          </w:tcPr>
+          <w:p>
+            <w:pPr>
+              <w:pStyle w:val="Normal"/>
+              <w:widowControl w:val="false"/>
+              <w:jc w:val="center"/>
+              <w:rPr>
+                <w:color w:val="000000"/>
+                <w:sz w:val="16"/>
+                <w:szCs w:val="16"/>
+              </w:rPr>
+            </w:pPr>
+            <w:r>
+              <w:rPr>
+                <w:color w:val="000000"/>
+                <w:sz w:val="16"/>
+                <w:szCs w:val="16"/>
+              </w:rPr>
+              <w:t>Couple</w:t>
+            </w:r>
+          </w:p>
+        </w:tc>
+        <w:tc>
+          <w:tcPr>
+            <w:tcW w:w="1016" w:type="dxa"/>
+            <w:tcBorders>
+              <w:top w:val="single" w:sz="4" w:space="0" w:color="000000"/>
+              <w:left w:val="single" w:sz="4" w:space="0" w:color="000000"/>
+              <w:bottom w:val="single" w:sz="4" w:space="0" w:color="000000"/>
+            </w:tcBorders>
+            <w:vAlign w:val="bottom"/>
+          </w:tcPr>
+          <w:p>
+            <w:pPr>
+              <w:pStyle w:val="Normal"/>
+              <w:widowControl w:val="false"/>
+              <w:spacing w:lineRule="auto" w:line="180"/>
+              <w:jc w:val="center"/>
+              <w:rPr>
+                <w:sz w:val="16"/>
+                <w:szCs w:val="16"/>
+              </w:rPr>
+            </w:pPr>
+            <w:r>
+              <w:rPr>
+                <w:rFonts w:eastAsia="arial" w:ascii="arial" w:hAnsi="arial"/>
+                <w:color w:val="000000"/>
+                <w:sz w:val="16"/>
+                <w:szCs w:val="16"/>
+              </w:rPr>
+              <w:t>1-Person</w:t>
+            </w:r>
+          </w:p>
+        </w:tc>
+        <w:tc>
+          <w:tcPr>
+            <w:tcW w:w="1029" w:type="dxa"/>
+            <w:tcBorders>
+              <w:top w:val="single" w:sz="4" w:space="0" w:color="000000"/>
+              <w:left w:val="single" w:sz="4" w:space="0" w:color="000000"/>
+              <w:bottom w:val="single" w:sz="4" w:space="0" w:color="000000"/>
+              <w:right w:val="single" w:sz="4" w:space="0" w:color="000000"/>
+            </w:tcBorders>
+            <w:vAlign w:val="bottom"/>
+          </w:tcPr>
+          <w:p>
+            <w:pPr>
+              <w:pStyle w:val="Normal"/>
+              <w:widowControl w:val="false"/>
+              <w:spacing w:lineRule="auto" w:line="180"/>
+              <w:jc w:val="center"/>
+              <w:rPr>
+                <w:sz w:val="16"/>
+                <w:szCs w:val="16"/>
+              </w:rPr>
+            </w:pPr>
+            <w:r>
+              <w:rPr>
+                <w:rFonts w:eastAsia="arial" w:ascii="arial" w:hAnsi="arial"/>
+                <w:color w:val="000000"/>
+                <w:sz w:val="16"/>
+                <w:szCs w:val="16"/>
+              </w:rPr>
+              <w:t>Next</w:t>
+            </w:r>
+          </w:p>
+          <w:p>
+            <w:pPr>
+              <w:pStyle w:val="Normal"/>
+              <w:widowControl w:val="false"/>
+              <w:spacing w:lineRule="auto" w:line="180"/>
+              <w:jc w:val="center"/>
+              <w:rPr>
+                <w:sz w:val="16"/>
+                <w:szCs w:val="16"/>
+              </w:rPr>
+            </w:pPr>
+            <w:r>
+              <w:rPr>
+                <w:rFonts w:eastAsia="arial" w:ascii="arial" w:hAnsi="arial"/>
+                <w:color w:val="000000"/>
+                <w:sz w:val="16"/>
+                <w:szCs w:val="16"/>
+              </w:rPr>
+              <w:t>Cab Cam</w:t>
+            </w:r>
+          </w:p>
+        </w:tc>
+      </w:tr>
+    </w:tbl>
+    <w:p>
+      <w:pPr>
+        <w:pStyle w:val="Normal"/>
+        <w:rPr>
+          <w:rFonts w:ascii="arial" w:hAnsi="arial" w:eastAsia="arial"/>
+          <w:color w:val="000000"/>
+          <w:sz w:val="16"/>
+          <w:szCs w:val="16"/>
+        </w:rPr>
+      </w:pPr>
+      <w:r>
+        <w:rPr>
+          <w:rFonts w:eastAsia="arial" w:ascii="arial" w:hAnsi="arial"/>
+          <w:color w:val="000000"/>
+          <w:sz w:val="16"/>
+          <w:szCs w:val="16"/>
+        </w:rPr>
+      </w:r>
+    </w:p>
+    <w:p>
+      <w:pPr>
+        <w:pStyle w:val="Normal"/>
+        <w:rPr>
+          <w:color w:val="000000"/>
+          <w:sz w:val="16"/>
+          <w:szCs w:val="16"/>
+        </w:rPr>
+      </w:pPr>
+      <w:r>
+        <w:rPr>
+          <w:rFonts w:eastAsia="arial" w:ascii="arial" w:hAnsi="arial"/>
+          <w:color w:val="000000"/>
+          <w:sz w:val="16"/>
+          <w:szCs w:val="16"/>
+        </w:rPr>
+        <w:tab/>
+        <w:t xml:space="preserve">           Class 377-2</w:t>
+      </w:r>
+    </w:p>
+    <w:tbl>
+      <w:tblPr>
+        <w:tblW w:w="14248" w:type="dxa"/>
+        <w:jc w:val="left"/>
+        <w:tblInd w:w="-5" w:type="dxa"/>
+        <w:tblLayout w:type="fixed"/>
+        <w:tblCellMar>
+          <w:top w:w="0" w:type="dxa"/>
+          <w:left w:w="108" w:type="dxa"/>
+          <w:bottom w:w="0" w:type="dxa"/>
+          <w:right w:w="108" w:type="dxa"/>
+        </w:tblCellMar>
+        <w:tblLook w:firstRow="1" w:noVBand="1" w:lastRow="0" w:firstColumn="1" w:lastColumn="0" w:noHBand="0" w:val="04a0"/>
+      </w:tblPr>
+      <w:tblGrid>
+        <w:gridCol w:w="1017"/>
+        <w:gridCol w:w="1019"/>
+        <w:gridCol w:w="1014"/>
+        <w:gridCol w:w="1016"/>
+        <w:gridCol w:w="1020"/>
+        <w:gridCol w:w="1016"/>
+        <w:gridCol w:w="1016"/>
+        <w:gridCol w:w="1017"/>
+        <w:gridCol w:w="1016"/>
+        <w:gridCol w:w="1020"/>
+        <w:gridCol w:w="1016"/>
+        <w:gridCol w:w="1016"/>
+        <w:gridCol w:w="1016"/>
+        <w:gridCol w:w="1029"/>
+      </w:tblGrid>
+      <w:tr>
+        <w:trPr>
+          <w:trHeight w:val="440" w:hRule="exact"/>
+          <w:cantSplit w:val="true"/>
+        </w:trPr>
+        <w:tc>
+          <w:tcPr>
+            <w:tcW w:w="1017" w:type="dxa"/>
+            <w:tcBorders>
+              <w:top w:val="single" w:sz="4" w:space="0" w:color="000000"/>
+              <w:left w:val="single" w:sz="4" w:space="0" w:color="000000"/>
+              <w:bottom w:val="single" w:sz="4" w:space="0" w:color="000000"/>
+            </w:tcBorders>
+            <w:vAlign w:val="bottom"/>
+          </w:tcPr>
+          <w:p>
+            <w:pPr>
+              <w:pStyle w:val="Normal"/>
+              <w:widowControl w:val="false"/>
+              <w:spacing w:lineRule="auto" w:line="180" w:before="0" w:after="60"/>
+              <w:jc w:val="center"/>
+              <w:rPr>
+                <w:b/>
+                <w:bCs/>
+              </w:rPr>
+            </w:pPr>
+            <w:r>
+              <w:rPr>
+                <w:b/>
+                <w:bCs/>
+                <w:color w:val="000000"/>
+                <w:sz w:val="16"/>
+                <w:szCs w:val="16"/>
+              </w:rPr>
+              <w:t>HUD</w:t>
+            </w:r>
+          </w:p>
+        </w:tc>
+        <w:tc>
+          <w:tcPr>
+            <w:tcW w:w="1019" w:type="dxa"/>
+            <w:tcBorders>
+              <w:top w:val="single" w:sz="4" w:space="0" w:color="000000"/>
+              <w:left w:val="single" w:sz="4" w:space="0" w:color="000000"/>
+              <w:bottom w:val="single" w:sz="4" w:space="0" w:color="000000"/>
+            </w:tcBorders>
+            <w:vAlign w:val="bottom"/>
+          </w:tcPr>
+          <w:p>
+            <w:pPr>
+              <w:pStyle w:val="Normal"/>
+              <w:widowControl w:val="false"/>
+              <w:spacing w:lineRule="auto" w:line="180"/>
+              <w:jc w:val="center"/>
+              <w:rPr>
+                <w:color w:val="000000"/>
+                <w:sz w:val="16"/>
+                <w:szCs w:val="16"/>
+              </w:rPr>
+            </w:pPr>
+            <w:r>
+              <w:rPr>
+                <w:color w:val="000000"/>
+                <w:sz w:val="16"/>
+                <w:szCs w:val="16"/>
+              </w:rPr>
+              <w:t>Schedule</w:t>
+            </w:r>
+          </w:p>
+        </w:tc>
+        <w:tc>
+          <w:tcPr>
+            <w:tcW w:w="1014" w:type="dxa"/>
+            <w:tcBorders>
+              <w:top w:val="single" w:sz="4" w:space="0" w:color="000000"/>
+              <w:left w:val="single" w:sz="4" w:space="0" w:color="000000"/>
+              <w:bottom w:val="single" w:sz="4" w:space="0" w:color="000000"/>
+            </w:tcBorders>
+            <w:vAlign w:val="bottom"/>
+          </w:tcPr>
+          <w:p>
+            <w:pPr>
+              <w:pStyle w:val="Normal"/>
+              <w:widowControl w:val="false"/>
+              <w:spacing w:lineRule="auto" w:line="180"/>
+              <w:jc w:val="center"/>
+              <w:rPr>
+                <w:color w:val="000000"/>
+                <w:sz w:val="16"/>
+                <w:szCs w:val="16"/>
+              </w:rPr>
+            </w:pPr>
+            <w:r>
+              <w:rPr>
+                <w:color w:val="000000"/>
+                <w:sz w:val="16"/>
+                <w:szCs w:val="16"/>
+              </w:rPr>
+              <w:t>Aux Off</w:t>
+            </w:r>
+          </w:p>
+        </w:tc>
+        <w:tc>
+          <w:tcPr>
+            <w:tcW w:w="1016" w:type="dxa"/>
+            <w:tcBorders>
+              <w:top w:val="single" w:sz="4" w:space="0" w:color="000000"/>
+              <w:left w:val="single" w:sz="4" w:space="0" w:color="000000"/>
+              <w:bottom w:val="single" w:sz="4" w:space="0" w:color="000000"/>
+            </w:tcBorders>
+            <w:vAlign w:val="bottom"/>
+          </w:tcPr>
+          <w:p>
+            <w:pPr>
+              <w:pStyle w:val="Normal"/>
+              <w:widowControl w:val="false"/>
+              <w:spacing w:lineRule="auto" w:line="180"/>
+              <w:jc w:val="center"/>
+              <w:rPr>
+                <w:color w:val="000000"/>
+                <w:sz w:val="16"/>
+                <w:szCs w:val="16"/>
+              </w:rPr>
+            </w:pPr>
+            <w:r>
+              <w:rPr>
+                <w:color w:val="000000"/>
+                <w:sz w:val="16"/>
+                <w:szCs w:val="16"/>
+              </w:rPr>
+              <w:t>DSD/Vigilance</w:t>
+            </w:r>
+          </w:p>
+        </w:tc>
+        <w:tc>
+          <w:tcPr>
+            <w:tcW w:w="1020" w:type="dxa"/>
+            <w:tcBorders>
+              <w:top w:val="single" w:sz="4" w:space="0" w:color="000000"/>
+              <w:left w:val="single" w:sz="4" w:space="0" w:color="000000"/>
+              <w:bottom w:val="single" w:sz="4" w:space="0" w:color="000000"/>
+            </w:tcBorders>
+            <w:vAlign w:val="bottom"/>
+          </w:tcPr>
+          <w:p>
+            <w:pPr>
+              <w:pStyle w:val="Normal"/>
+              <w:widowControl w:val="false"/>
+              <w:spacing w:lineRule="auto" w:line="180"/>
+              <w:jc w:val="center"/>
+              <w:rPr>
+                <w:color w:val="000000"/>
+                <w:sz w:val="16"/>
+                <w:szCs w:val="16"/>
+              </w:rPr>
+            </w:pPr>
+            <w:r>
+              <w:rPr>
+                <w:color w:val="000000"/>
+                <w:sz w:val="16"/>
+                <w:szCs w:val="16"/>
+              </w:rPr>
+              <w:t>Panto. L/Shoe Up</w:t>
+            </w:r>
+          </w:p>
+        </w:tc>
+        <w:tc>
+          <w:tcPr>
+            <w:tcW w:w="1016" w:type="dxa"/>
+            <w:tcBorders>
+              <w:top w:val="single" w:sz="4" w:space="0" w:color="000000"/>
+              <w:left w:val="single" w:sz="4" w:space="0" w:color="000000"/>
+              <w:bottom w:val="single" w:sz="4" w:space="0" w:color="000000"/>
+            </w:tcBorders>
+            <w:vAlign w:val="bottom"/>
+          </w:tcPr>
+          <w:p>
+            <w:pPr>
+              <w:pStyle w:val="Normal"/>
+              <w:widowControl w:val="false"/>
+              <w:spacing w:lineRule="auto" w:line="180"/>
+              <w:jc w:val="center"/>
+              <w:rPr>
+                <w:sz w:val="16"/>
+                <w:szCs w:val="16"/>
+              </w:rPr>
+            </w:pPr>
+            <w:r>
+              <w:rPr>
+                <w:color w:val="000000"/>
+                <w:sz w:val="16"/>
+                <w:szCs w:val="16"/>
+              </w:rPr>
+              <w:t>DC</w:t>
+            </w:r>
+          </w:p>
+        </w:tc>
+        <w:tc>
+          <w:tcPr>
+            <w:tcW w:w="1016" w:type="dxa"/>
+            <w:tcBorders>
+              <w:top w:val="single" w:sz="4" w:space="0" w:color="000000"/>
+              <w:left w:val="single" w:sz="4" w:space="0" w:color="000000"/>
+              <w:bottom w:val="single" w:sz="4" w:space="0" w:color="000000"/>
+            </w:tcBorders>
+            <w:vAlign w:val="bottom"/>
+          </w:tcPr>
+          <w:p>
+            <w:pPr>
+              <w:pStyle w:val="Normal"/>
+              <w:widowControl w:val="false"/>
+              <w:jc w:val="center"/>
+              <w:rPr>
+                <w:color w:val="000000"/>
+                <w:sz w:val="16"/>
+                <w:szCs w:val="16"/>
+              </w:rPr>
+            </w:pPr>
+            <w:r>
+              <w:rPr>
+                <w:color w:val="000000"/>
+                <w:sz w:val="16"/>
+                <w:szCs w:val="16"/>
+              </w:rPr>
+            </w:r>
+          </w:p>
+        </w:tc>
+        <w:tc>
+          <w:tcPr>
+            <w:tcW w:w="1017" w:type="dxa"/>
+            <w:tcBorders>
+              <w:top w:val="single" w:sz="4" w:space="0" w:color="000000"/>
+              <w:left w:val="single" w:sz="4" w:space="0" w:color="000000"/>
+              <w:bottom w:val="single" w:sz="4" w:space="0" w:color="000000"/>
+            </w:tcBorders>
+            <w:vAlign w:val="bottom"/>
+          </w:tcPr>
+          <w:p>
+            <w:pPr>
+              <w:pStyle w:val="Normal"/>
+              <w:widowControl w:val="false"/>
+              <w:jc w:val="center"/>
+              <w:rPr>
+                <w:color w:val="000000"/>
+                <w:sz w:val="16"/>
+                <w:szCs w:val="16"/>
+              </w:rPr>
+            </w:pPr>
+            <w:r>
+              <w:rPr>
+                <w:color w:val="000000"/>
+                <w:sz w:val="16"/>
+                <w:szCs w:val="16"/>
+              </w:rPr>
+              <w:t>Train Car Length 4</w:t>
+            </w:r>
+          </w:p>
+        </w:tc>
+        <w:tc>
+          <w:tcPr>
+            <w:tcW w:w="1016" w:type="dxa"/>
+            <w:tcBorders>
+              <w:top w:val="single" w:sz="4" w:space="0" w:color="000000"/>
+              <w:left w:val="single" w:sz="4" w:space="0" w:color="000000"/>
+              <w:bottom w:val="single" w:sz="4" w:space="0" w:color="000000"/>
+            </w:tcBorders>
+            <w:vAlign w:val="bottom"/>
+          </w:tcPr>
+          <w:p>
+            <w:pPr>
+              <w:pStyle w:val="Normal"/>
+              <w:widowControl w:val="false"/>
+              <w:jc w:val="center"/>
+              <w:rPr>
+                <w:sz w:val="16"/>
+                <w:szCs w:val="16"/>
+              </w:rPr>
+            </w:pPr>
+            <w:r>
+              <w:rPr>
+                <w:sz w:val="16"/>
+                <w:szCs w:val="16"/>
+              </w:rPr>
+            </w:r>
+          </w:p>
+        </w:tc>
+        <w:tc>
+          <w:tcPr>
+            <w:tcW w:w="1020" w:type="dxa"/>
+            <w:tcBorders>
+              <w:top w:val="single" w:sz="4" w:space="0" w:color="000000"/>
+              <w:left w:val="single" w:sz="4" w:space="0" w:color="000000"/>
+              <w:bottom w:val="single" w:sz="4" w:space="0" w:color="000000"/>
+            </w:tcBorders>
+            <w:vAlign w:val="bottom"/>
+          </w:tcPr>
+          <w:p>
+            <w:pPr>
+              <w:pStyle w:val="Normal"/>
+              <w:widowControl w:val="false"/>
+              <w:jc w:val="center"/>
+              <w:rPr>
+                <w:rFonts w:ascii="arial" w:hAnsi="arial" w:eastAsia="arial"/>
+                <w:color w:val="000000"/>
+                <w:sz w:val="16"/>
+                <w:szCs w:val="16"/>
+              </w:rPr>
+            </w:pPr>
+            <w:r>
+              <w:rPr>
+                <w:rFonts w:eastAsia="arial" w:ascii="arial" w:hAnsi="arial"/>
+                <w:color w:val="000000"/>
+                <w:sz w:val="16"/>
+                <w:szCs w:val="16"/>
+              </w:rPr>
+              <w:t>Notice Bd. Light</w:t>
             </w:r>
           </w:p>
         </w:tc>

</xml_diff>

<commit_message>
Add Class 378 and 380
</commit_message>
<xml_diff>
--- a/raildriver-UK-Remapped.docx
+++ b/raildriver-UK-Remapped.docx
@@ -33204,6 +33204,2275 @@
                 <w:szCs w:val="16"/>
               </w:rPr>
               <w:t>Uncouple</w:t>
+            </w:r>
+          </w:p>
+        </w:tc>
+        <w:tc>
+          <w:tcPr>
+            <w:tcW w:w="1016" w:type="dxa"/>
+            <w:tcBorders>
+              <w:top w:val="single" w:sz="4" w:space="0" w:color="000000"/>
+              <w:left w:val="single" w:sz="4" w:space="0" w:color="000000"/>
+              <w:bottom w:val="single" w:sz="4" w:space="0" w:color="000000"/>
+            </w:tcBorders>
+            <w:vAlign w:val="bottom"/>
+          </w:tcPr>
+          <w:p>
+            <w:pPr>
+              <w:pStyle w:val="Normal"/>
+              <w:widowControl w:val="false"/>
+              <w:spacing w:lineRule="auto" w:line="180"/>
+              <w:jc w:val="center"/>
+              <w:rPr>
+                <w:sz w:val="16"/>
+                <w:szCs w:val="16"/>
+              </w:rPr>
+            </w:pPr>
+            <w:r>
+              <w:rPr>
+                <w:rFonts w:eastAsia="arial" w:ascii="arial" w:hAnsi="arial"/>
+                <w:color w:val="000000"/>
+                <w:sz w:val="16"/>
+                <w:szCs w:val="16"/>
+              </w:rPr>
+              <w:t>Exterior</w:t>
+            </w:r>
+          </w:p>
+          <w:p>
+            <w:pPr>
+              <w:pStyle w:val="Normal"/>
+              <w:widowControl w:val="false"/>
+              <w:spacing w:lineRule="auto" w:line="180"/>
+              <w:jc w:val="center"/>
+              <w:rPr>
+                <w:sz w:val="16"/>
+                <w:szCs w:val="16"/>
+              </w:rPr>
+            </w:pPr>
+            <w:r>
+              <w:rPr>
+                <w:rFonts w:eastAsia="arial" w:ascii="arial" w:hAnsi="arial"/>
+                <w:color w:val="000000"/>
+                <w:sz w:val="16"/>
+                <w:szCs w:val="16"/>
+              </w:rPr>
+              <w:t>Camera</w:t>
+            </w:r>
+          </w:p>
+        </w:tc>
+        <w:tc>
+          <w:tcPr>
+            <w:tcW w:w="1029" w:type="dxa"/>
+            <w:tcBorders>
+              <w:top w:val="single" w:sz="4" w:space="0" w:color="000000"/>
+              <w:left w:val="single" w:sz="4" w:space="0" w:color="000000"/>
+              <w:bottom w:val="single" w:sz="4" w:space="0" w:color="000000"/>
+              <w:right w:val="single" w:sz="4" w:space="0" w:color="000000"/>
+            </w:tcBorders>
+            <w:vAlign w:val="bottom"/>
+          </w:tcPr>
+          <w:p>
+            <w:pPr>
+              <w:pStyle w:val="Normal"/>
+              <w:widowControl w:val="false"/>
+              <w:spacing w:lineRule="auto" w:line="180"/>
+              <w:jc w:val="center"/>
+              <w:rPr>
+                <w:sz w:val="16"/>
+                <w:szCs w:val="16"/>
+              </w:rPr>
+            </w:pPr>
+            <w:r>
+              <w:rPr>
+                <w:rFonts w:eastAsia="arial" w:ascii="arial" w:hAnsi="arial"/>
+                <w:color w:val="000000"/>
+                <w:sz w:val="16"/>
+                <w:szCs w:val="16"/>
+              </w:rPr>
+              <w:t>Prev</w:t>
+            </w:r>
+          </w:p>
+          <w:p>
+            <w:pPr>
+              <w:pStyle w:val="Normal"/>
+              <w:widowControl w:val="false"/>
+              <w:spacing w:lineRule="auto" w:line="180"/>
+              <w:jc w:val="center"/>
+              <w:rPr>
+                <w:sz w:val="16"/>
+                <w:szCs w:val="16"/>
+              </w:rPr>
+            </w:pPr>
+            <w:r>
+              <w:rPr>
+                <w:rFonts w:eastAsia="arial" w:ascii="arial" w:hAnsi="arial"/>
+                <w:color w:val="000000"/>
+                <w:sz w:val="16"/>
+                <w:szCs w:val="16"/>
+              </w:rPr>
+              <w:t>Cab Cam</w:t>
+            </w:r>
+          </w:p>
+        </w:tc>
+      </w:tr>
+    </w:tbl>
+    <w:p>
+      <w:pPr>
+        <w:pStyle w:val="Normal"/>
+        <w:rPr>
+          <w:color w:val="000000"/>
+          <w:sz w:val="16"/>
+          <w:szCs w:val="16"/>
+        </w:rPr>
+      </w:pPr>
+      <w:r>
+        <w:rPr>
+          <w:color w:val="000000"/>
+          <w:sz w:val="16"/>
+          <w:szCs w:val="16"/>
+        </w:rPr>
+      </w:r>
+    </w:p>
+    <w:p>
+      <w:pPr>
+        <w:pStyle w:val="Normal"/>
+        <w:rPr>
+          <w:color w:val="000000"/>
+          <w:sz w:val="16"/>
+          <w:szCs w:val="16"/>
+        </w:rPr>
+      </w:pPr>
+      <w:r>
+        <w:rPr>
+          <w:rFonts w:eastAsia="arial" w:ascii="arial" w:hAnsi="arial"/>
+          <w:color w:val="000000"/>
+          <w:sz w:val="16"/>
+          <w:szCs w:val="16"/>
+        </w:rPr>
+        <w:tab/>
+        <w:t xml:space="preserve">           Class 37</w:t>
+      </w:r>
+      <w:r>
+        <w:rPr>
+          <w:rFonts w:eastAsia="arial" w:ascii="arial" w:hAnsi="arial"/>
+          <w:color w:val="000000"/>
+          <w:sz w:val="16"/>
+          <w:szCs w:val="16"/>
+        </w:rPr>
+        <w:t>8</w:t>
+      </w:r>
+      <w:r>
+        <w:rPr>
+          <w:rFonts w:eastAsia="arial" w:ascii="arial" w:hAnsi="arial"/>
+          <w:color w:val="000000"/>
+          <w:sz w:val="16"/>
+          <w:szCs w:val="16"/>
+        </w:rPr>
+        <w:t>-1</w:t>
+      </w:r>
+    </w:p>
+    <w:tbl>
+      <w:tblPr>
+        <w:tblW w:w="14248" w:type="dxa"/>
+        <w:jc w:val="left"/>
+        <w:tblInd w:w="-5" w:type="dxa"/>
+        <w:tblLayout w:type="fixed"/>
+        <w:tblCellMar>
+          <w:top w:w="0" w:type="dxa"/>
+          <w:left w:w="108" w:type="dxa"/>
+          <w:bottom w:w="0" w:type="dxa"/>
+          <w:right w:w="108" w:type="dxa"/>
+        </w:tblCellMar>
+        <w:tblLook w:firstRow="1" w:noVBand="1" w:lastRow="0" w:firstColumn="1" w:lastColumn="0" w:noHBand="0" w:val="04a0"/>
+      </w:tblPr>
+      <w:tblGrid>
+        <w:gridCol w:w="1017"/>
+        <w:gridCol w:w="1019"/>
+        <w:gridCol w:w="1014"/>
+        <w:gridCol w:w="1016"/>
+        <w:gridCol w:w="1020"/>
+        <w:gridCol w:w="1016"/>
+        <w:gridCol w:w="1016"/>
+        <w:gridCol w:w="1017"/>
+        <w:gridCol w:w="1016"/>
+        <w:gridCol w:w="1020"/>
+        <w:gridCol w:w="1016"/>
+        <w:gridCol w:w="1016"/>
+        <w:gridCol w:w="1016"/>
+        <w:gridCol w:w="1029"/>
+      </w:tblGrid>
+      <w:tr>
+        <w:trPr>
+          <w:trHeight w:val="440" w:hRule="exact"/>
+          <w:cantSplit w:val="true"/>
+        </w:trPr>
+        <w:tc>
+          <w:tcPr>
+            <w:tcW w:w="1017" w:type="dxa"/>
+            <w:tcBorders>
+              <w:top w:val="single" w:sz="4" w:space="0" w:color="000000"/>
+              <w:left w:val="single" w:sz="4" w:space="0" w:color="000000"/>
+              <w:bottom w:val="single" w:sz="4" w:space="0" w:color="000000"/>
+            </w:tcBorders>
+            <w:vAlign w:val="bottom"/>
+          </w:tcPr>
+          <w:p>
+            <w:pPr>
+              <w:pStyle w:val="Normal"/>
+              <w:widowControl w:val="false"/>
+              <w:spacing w:lineRule="auto" w:line="180" w:before="0" w:after="60"/>
+              <w:jc w:val="center"/>
+              <w:rPr>
+                <w:color w:val="000000"/>
+                <w:sz w:val="16"/>
+                <w:szCs w:val="16"/>
+              </w:rPr>
+            </w:pPr>
+            <w:r>
+              <w:rPr>
+                <w:rFonts w:eastAsia="arial" w:ascii="arial" w:hAnsi="arial"/>
+                <w:b/>
+                <w:color w:val="000000"/>
+                <w:sz w:val="16"/>
+                <w:szCs w:val="16"/>
+              </w:rPr>
+              <w:t>Pause</w:t>
+            </w:r>
+          </w:p>
+        </w:tc>
+        <w:tc>
+          <w:tcPr>
+            <w:tcW w:w="1019" w:type="dxa"/>
+            <w:tcBorders>
+              <w:top w:val="single" w:sz="4" w:space="0" w:color="000000"/>
+              <w:left w:val="single" w:sz="4" w:space="0" w:color="000000"/>
+              <w:bottom w:val="single" w:sz="4" w:space="0" w:color="000000"/>
+            </w:tcBorders>
+            <w:vAlign w:val="bottom"/>
+          </w:tcPr>
+          <w:p>
+            <w:pPr>
+              <w:pStyle w:val="Normal"/>
+              <w:widowControl w:val="false"/>
+              <w:spacing w:lineRule="auto" w:line="180"/>
+              <w:jc w:val="center"/>
+              <w:rPr>
+                <w:color w:val="000000"/>
+                <w:sz w:val="16"/>
+                <w:szCs w:val="16"/>
+              </w:rPr>
+            </w:pPr>
+            <w:r>
+              <w:rPr>
+                <w:color w:val="000000"/>
+                <w:sz w:val="16"/>
+                <w:szCs w:val="16"/>
+              </w:rPr>
+              <w:t>Master Key</w:t>
+            </w:r>
+          </w:p>
+        </w:tc>
+        <w:tc>
+          <w:tcPr>
+            <w:tcW w:w="1014" w:type="dxa"/>
+            <w:tcBorders>
+              <w:top w:val="single" w:sz="4" w:space="0" w:color="000000"/>
+              <w:left w:val="single" w:sz="4" w:space="0" w:color="000000"/>
+              <w:bottom w:val="single" w:sz="4" w:space="0" w:color="000000"/>
+            </w:tcBorders>
+            <w:vAlign w:val="bottom"/>
+          </w:tcPr>
+          <w:p>
+            <w:pPr>
+              <w:pStyle w:val="Normal"/>
+              <w:widowControl w:val="false"/>
+              <w:spacing w:lineRule="auto" w:line="180"/>
+              <w:jc w:val="center"/>
+              <w:rPr>
+                <w:color w:val="000000"/>
+                <w:sz w:val="16"/>
+                <w:szCs w:val="16"/>
+              </w:rPr>
+            </w:pPr>
+            <w:r>
+              <w:rPr>
+                <w:color w:val="000000"/>
+                <w:sz w:val="16"/>
+                <w:szCs w:val="16"/>
+              </w:rPr>
+              <w:t>Aux On</w:t>
+            </w:r>
+          </w:p>
+        </w:tc>
+        <w:tc>
+          <w:tcPr>
+            <w:tcW w:w="1016" w:type="dxa"/>
+            <w:tcBorders>
+              <w:top w:val="single" w:sz="4" w:space="0" w:color="000000"/>
+              <w:left w:val="single" w:sz="4" w:space="0" w:color="000000"/>
+              <w:bottom w:val="single" w:sz="4" w:space="0" w:color="000000"/>
+            </w:tcBorders>
+            <w:vAlign w:val="bottom"/>
+          </w:tcPr>
+          <w:p>
+            <w:pPr>
+              <w:pStyle w:val="Normal"/>
+              <w:widowControl w:val="false"/>
+              <w:spacing w:lineRule="auto" w:line="180"/>
+              <w:jc w:val="center"/>
+              <w:rPr>
+                <w:color w:val="000000"/>
+                <w:sz w:val="16"/>
+                <w:szCs w:val="16"/>
+              </w:rPr>
+            </w:pPr>
+            <w:r>
+              <w:rPr>
+                <w:color w:val="000000"/>
+                <w:sz w:val="16"/>
+                <w:szCs w:val="16"/>
+              </w:rPr>
+              <w:t>AWS/TPWS</w:t>
+            </w:r>
+          </w:p>
+        </w:tc>
+        <w:tc>
+          <w:tcPr>
+            <w:tcW w:w="1020" w:type="dxa"/>
+            <w:tcBorders>
+              <w:top w:val="single" w:sz="4" w:space="0" w:color="000000"/>
+              <w:left w:val="single" w:sz="4" w:space="0" w:color="000000"/>
+              <w:bottom w:val="single" w:sz="4" w:space="0" w:color="000000"/>
+            </w:tcBorders>
+            <w:vAlign w:val="bottom"/>
+          </w:tcPr>
+          <w:p>
+            <w:pPr>
+              <w:pStyle w:val="Normal"/>
+              <w:widowControl w:val="false"/>
+              <w:spacing w:lineRule="auto" w:line="180"/>
+              <w:jc w:val="center"/>
+              <w:rPr>
+                <w:color w:val="000000"/>
+                <w:sz w:val="16"/>
+                <w:szCs w:val="16"/>
+              </w:rPr>
+            </w:pPr>
+            <w:r>
+              <w:rPr>
+                <w:color w:val="000000"/>
+                <w:sz w:val="16"/>
+                <w:szCs w:val="16"/>
+              </w:rPr>
+              <w:t>Panto. Up/Shoe L</w:t>
+            </w:r>
+          </w:p>
+        </w:tc>
+        <w:tc>
+          <w:tcPr>
+            <w:tcW w:w="1016" w:type="dxa"/>
+            <w:tcBorders>
+              <w:top w:val="single" w:sz="4" w:space="0" w:color="000000"/>
+              <w:left w:val="single" w:sz="4" w:space="0" w:color="000000"/>
+              <w:bottom w:val="single" w:sz="4" w:space="0" w:color="000000"/>
+            </w:tcBorders>
+            <w:vAlign w:val="bottom"/>
+          </w:tcPr>
+          <w:p>
+            <w:pPr>
+              <w:pStyle w:val="Normal"/>
+              <w:widowControl w:val="false"/>
+              <w:spacing w:lineRule="auto" w:line="180"/>
+              <w:jc w:val="center"/>
+              <w:rPr>
+                <w:color w:val="000000"/>
+                <w:sz w:val="16"/>
+                <w:szCs w:val="16"/>
+              </w:rPr>
+            </w:pPr>
+            <w:r>
+              <w:rPr>
+                <w:color w:val="000000"/>
+                <w:sz w:val="16"/>
+                <w:szCs w:val="16"/>
+              </w:rPr>
+              <w:t>AC</w:t>
+            </w:r>
+          </w:p>
+        </w:tc>
+        <w:tc>
+          <w:tcPr>
+            <w:tcW w:w="1016" w:type="dxa"/>
+            <w:tcBorders>
+              <w:top w:val="single" w:sz="4" w:space="0" w:color="000000"/>
+              <w:left w:val="single" w:sz="4" w:space="0" w:color="000000"/>
+              <w:bottom w:val="single" w:sz="4" w:space="0" w:color="000000"/>
+            </w:tcBorders>
+            <w:vAlign w:val="bottom"/>
+          </w:tcPr>
+          <w:p>
+            <w:pPr>
+              <w:pStyle w:val="Normal"/>
+              <w:widowControl w:val="false"/>
+              <w:jc w:val="center"/>
+              <w:rPr>
+                <w:sz w:val="16"/>
+                <w:szCs w:val="16"/>
+              </w:rPr>
+            </w:pPr>
+            <w:r>
+              <w:rPr>
+                <w:sz w:val="16"/>
+                <w:szCs w:val="16"/>
+              </w:rPr>
+              <w:t>DRA</w:t>
+            </w:r>
+          </w:p>
+        </w:tc>
+        <w:tc>
+          <w:tcPr>
+            <w:tcW w:w="1017" w:type="dxa"/>
+            <w:tcBorders>
+              <w:top w:val="single" w:sz="4" w:space="0" w:color="000000"/>
+              <w:left w:val="single" w:sz="4" w:space="0" w:color="000000"/>
+              <w:bottom w:val="single" w:sz="4" w:space="0" w:color="000000"/>
+            </w:tcBorders>
+            <w:vAlign w:val="bottom"/>
+          </w:tcPr>
+          <w:p>
+            <w:pPr>
+              <w:pStyle w:val="Normal"/>
+              <w:widowControl w:val="false"/>
+              <w:jc w:val="center"/>
+              <w:rPr>
+                <w:color w:val="000000"/>
+                <w:sz w:val="16"/>
+                <w:szCs w:val="16"/>
+              </w:rPr>
+            </w:pPr>
+            <w:r>
+              <w:rPr/>
+            </w:r>
+          </w:p>
+        </w:tc>
+        <w:tc>
+          <w:tcPr>
+            <w:tcW w:w="1016" w:type="dxa"/>
+            <w:tcBorders>
+              <w:top w:val="single" w:sz="4" w:space="0" w:color="000000"/>
+              <w:left w:val="single" w:sz="4" w:space="0" w:color="000000"/>
+              <w:bottom w:val="single" w:sz="4" w:space="0" w:color="000000"/>
+            </w:tcBorders>
+            <w:vAlign w:val="bottom"/>
+          </w:tcPr>
+          <w:p>
+            <w:pPr>
+              <w:pStyle w:val="Normal"/>
+              <w:widowControl w:val="false"/>
+              <w:jc w:val="center"/>
+              <w:rPr>
+                <w:sz w:val="16"/>
+                <w:szCs w:val="16"/>
+              </w:rPr>
+            </w:pPr>
+            <w:r>
+              <w:rPr/>
+            </w:r>
+          </w:p>
+        </w:tc>
+        <w:tc>
+          <w:tcPr>
+            <w:tcW w:w="1020" w:type="dxa"/>
+            <w:tcBorders>
+              <w:top w:val="single" w:sz="4" w:space="0" w:color="000000"/>
+              <w:left w:val="single" w:sz="4" w:space="0" w:color="000000"/>
+              <w:bottom w:val="single" w:sz="4" w:space="0" w:color="000000"/>
+            </w:tcBorders>
+            <w:vAlign w:val="bottom"/>
+          </w:tcPr>
+          <w:p>
+            <w:pPr>
+              <w:pStyle w:val="Normal"/>
+              <w:widowControl w:val="false"/>
+              <w:jc w:val="center"/>
+              <w:rPr>
+                <w:color w:val="000000"/>
+                <w:sz w:val="16"/>
+                <w:szCs w:val="16"/>
+              </w:rPr>
+            </w:pPr>
+            <w:r>
+              <w:rPr>
+                <w:color w:val="000000"/>
+                <w:sz w:val="16"/>
+                <w:szCs w:val="16"/>
+              </w:rPr>
+              <w:t>Hazard Light</w:t>
+            </w:r>
+          </w:p>
+        </w:tc>
+        <w:tc>
+          <w:tcPr>
+            <w:tcW w:w="1016" w:type="dxa"/>
+            <w:tcBorders>
+              <w:top w:val="single" w:sz="4" w:space="0" w:color="000000"/>
+              <w:left w:val="single" w:sz="4" w:space="0" w:color="000000"/>
+              <w:bottom w:val="single" w:sz="4" w:space="0" w:color="000000"/>
+            </w:tcBorders>
+            <w:vAlign w:val="bottom"/>
+          </w:tcPr>
+          <w:p>
+            <w:pPr>
+              <w:pStyle w:val="Normal"/>
+              <w:widowControl w:val="false"/>
+              <w:spacing w:lineRule="auto" w:line="180"/>
+              <w:jc w:val="center"/>
+              <w:rPr>
+                <w:sz w:val="16"/>
+                <w:szCs w:val="16"/>
+              </w:rPr>
+            </w:pPr>
+            <w:r>
+              <w:rPr>
+                <w:rFonts w:eastAsia="arial" w:ascii="arial" w:hAnsi="arial"/>
+                <w:color w:val="000000"/>
+                <w:sz w:val="16"/>
+                <w:szCs w:val="16"/>
+              </w:rPr>
+              <w:t>Cab Light</w:t>
+            </w:r>
+          </w:p>
+        </w:tc>
+        <w:tc>
+          <w:tcPr>
+            <w:tcW w:w="1016" w:type="dxa"/>
+            <w:tcBorders>
+              <w:top w:val="single" w:sz="4" w:space="0" w:color="000000"/>
+              <w:left w:val="single" w:sz="4" w:space="0" w:color="000000"/>
+              <w:bottom w:val="single" w:sz="4" w:space="0" w:color="000000"/>
+            </w:tcBorders>
+            <w:vAlign w:val="bottom"/>
+          </w:tcPr>
+          <w:p>
+            <w:pPr>
+              <w:pStyle w:val="Normal"/>
+              <w:widowControl w:val="false"/>
+              <w:jc w:val="center"/>
+              <w:rPr>
+                <w:color w:val="000000"/>
+                <w:sz w:val="16"/>
+                <w:szCs w:val="16"/>
+              </w:rPr>
+            </w:pPr>
+            <w:r>
+              <w:rPr>
+                <w:color w:val="000000"/>
+                <w:sz w:val="16"/>
+                <w:szCs w:val="16"/>
+              </w:rPr>
+              <w:t>Couple</w:t>
+            </w:r>
+          </w:p>
+        </w:tc>
+        <w:tc>
+          <w:tcPr>
+            <w:tcW w:w="1016" w:type="dxa"/>
+            <w:tcBorders>
+              <w:top w:val="single" w:sz="4" w:space="0" w:color="000000"/>
+              <w:left w:val="single" w:sz="4" w:space="0" w:color="000000"/>
+              <w:bottom w:val="single" w:sz="4" w:space="0" w:color="000000"/>
+            </w:tcBorders>
+            <w:vAlign w:val="bottom"/>
+          </w:tcPr>
+          <w:p>
+            <w:pPr>
+              <w:pStyle w:val="Normal"/>
+              <w:widowControl w:val="false"/>
+              <w:spacing w:lineRule="auto" w:line="180"/>
+              <w:jc w:val="center"/>
+              <w:rPr>
+                <w:sz w:val="16"/>
+                <w:szCs w:val="16"/>
+              </w:rPr>
+            </w:pPr>
+            <w:r>
+              <w:rPr>
+                <w:rFonts w:eastAsia="arial" w:ascii="arial" w:hAnsi="arial"/>
+                <w:color w:val="000000"/>
+                <w:sz w:val="16"/>
+                <w:szCs w:val="16"/>
+              </w:rPr>
+              <w:t>1-Person</w:t>
+            </w:r>
+          </w:p>
+        </w:tc>
+        <w:tc>
+          <w:tcPr>
+            <w:tcW w:w="1029" w:type="dxa"/>
+            <w:tcBorders>
+              <w:top w:val="single" w:sz="4" w:space="0" w:color="000000"/>
+              <w:left w:val="single" w:sz="4" w:space="0" w:color="000000"/>
+              <w:bottom w:val="single" w:sz="4" w:space="0" w:color="000000"/>
+              <w:right w:val="single" w:sz="4" w:space="0" w:color="000000"/>
+            </w:tcBorders>
+            <w:vAlign w:val="bottom"/>
+          </w:tcPr>
+          <w:p>
+            <w:pPr>
+              <w:pStyle w:val="Normal"/>
+              <w:widowControl w:val="false"/>
+              <w:spacing w:lineRule="auto" w:line="180"/>
+              <w:jc w:val="center"/>
+              <w:rPr>
+                <w:sz w:val="16"/>
+                <w:szCs w:val="16"/>
+              </w:rPr>
+            </w:pPr>
+            <w:r>
+              <w:rPr>
+                <w:rFonts w:eastAsia="arial" w:ascii="arial" w:hAnsi="arial"/>
+                <w:color w:val="000000"/>
+                <w:sz w:val="16"/>
+                <w:szCs w:val="16"/>
+              </w:rPr>
+              <w:t>Next</w:t>
+            </w:r>
+          </w:p>
+          <w:p>
+            <w:pPr>
+              <w:pStyle w:val="Normal"/>
+              <w:widowControl w:val="false"/>
+              <w:spacing w:lineRule="auto" w:line="180"/>
+              <w:jc w:val="center"/>
+              <w:rPr>
+                <w:sz w:val="16"/>
+                <w:szCs w:val="16"/>
+              </w:rPr>
+            </w:pPr>
+            <w:r>
+              <w:rPr>
+                <w:rFonts w:eastAsia="arial" w:ascii="arial" w:hAnsi="arial"/>
+                <w:color w:val="000000"/>
+                <w:sz w:val="16"/>
+                <w:szCs w:val="16"/>
+              </w:rPr>
+              <w:t>Cab Cam</w:t>
+            </w:r>
+          </w:p>
+        </w:tc>
+      </w:tr>
+    </w:tbl>
+    <w:p>
+      <w:pPr>
+        <w:pStyle w:val="Normal"/>
+        <w:rPr>
+          <w:rFonts w:ascii="arial" w:hAnsi="arial" w:eastAsia="arial"/>
+          <w:color w:val="000000"/>
+          <w:sz w:val="16"/>
+          <w:szCs w:val="16"/>
+        </w:rPr>
+      </w:pPr>
+      <w:r>
+        <w:rPr>
+          <w:rFonts w:eastAsia="arial" w:ascii="arial" w:hAnsi="arial"/>
+          <w:color w:val="000000"/>
+          <w:sz w:val="16"/>
+          <w:szCs w:val="16"/>
+        </w:rPr>
+      </w:r>
+    </w:p>
+    <w:p>
+      <w:pPr>
+        <w:pStyle w:val="Normal"/>
+        <w:rPr>
+          <w:color w:val="000000"/>
+          <w:sz w:val="16"/>
+          <w:szCs w:val="16"/>
+        </w:rPr>
+      </w:pPr>
+      <w:r>
+        <w:rPr>
+          <w:rFonts w:eastAsia="arial" w:ascii="arial" w:hAnsi="arial"/>
+          <w:color w:val="000000"/>
+          <w:sz w:val="16"/>
+          <w:szCs w:val="16"/>
+        </w:rPr>
+        <w:tab/>
+        <w:t xml:space="preserve">           Class 37</w:t>
+      </w:r>
+      <w:r>
+        <w:rPr>
+          <w:rFonts w:eastAsia="arial" w:ascii="arial" w:hAnsi="arial"/>
+          <w:color w:val="000000"/>
+          <w:sz w:val="16"/>
+          <w:szCs w:val="16"/>
+        </w:rPr>
+        <w:t>8</w:t>
+      </w:r>
+      <w:r>
+        <w:rPr>
+          <w:rFonts w:eastAsia="arial" w:ascii="arial" w:hAnsi="arial"/>
+          <w:color w:val="000000"/>
+          <w:sz w:val="16"/>
+          <w:szCs w:val="16"/>
+        </w:rPr>
+        <w:t>-2</w:t>
+      </w:r>
+    </w:p>
+    <w:tbl>
+      <w:tblPr>
+        <w:tblW w:w="14248" w:type="dxa"/>
+        <w:jc w:val="left"/>
+        <w:tblInd w:w="-5" w:type="dxa"/>
+        <w:tblLayout w:type="fixed"/>
+        <w:tblCellMar>
+          <w:top w:w="0" w:type="dxa"/>
+          <w:left w:w="108" w:type="dxa"/>
+          <w:bottom w:w="0" w:type="dxa"/>
+          <w:right w:w="108" w:type="dxa"/>
+        </w:tblCellMar>
+        <w:tblLook w:firstRow="1" w:noVBand="1" w:lastRow="0" w:firstColumn="1" w:lastColumn="0" w:noHBand="0" w:val="04a0"/>
+      </w:tblPr>
+      <w:tblGrid>
+        <w:gridCol w:w="1017"/>
+        <w:gridCol w:w="1019"/>
+        <w:gridCol w:w="1014"/>
+        <w:gridCol w:w="1016"/>
+        <w:gridCol w:w="1020"/>
+        <w:gridCol w:w="1016"/>
+        <w:gridCol w:w="1016"/>
+        <w:gridCol w:w="1017"/>
+        <w:gridCol w:w="1016"/>
+        <w:gridCol w:w="1020"/>
+        <w:gridCol w:w="1016"/>
+        <w:gridCol w:w="1016"/>
+        <w:gridCol w:w="1016"/>
+        <w:gridCol w:w="1029"/>
+      </w:tblGrid>
+      <w:tr>
+        <w:trPr>
+          <w:trHeight w:val="440" w:hRule="exact"/>
+          <w:cantSplit w:val="true"/>
+        </w:trPr>
+        <w:tc>
+          <w:tcPr>
+            <w:tcW w:w="1017" w:type="dxa"/>
+            <w:tcBorders>
+              <w:top w:val="single" w:sz="4" w:space="0" w:color="000000"/>
+              <w:left w:val="single" w:sz="4" w:space="0" w:color="000000"/>
+              <w:bottom w:val="single" w:sz="4" w:space="0" w:color="000000"/>
+            </w:tcBorders>
+            <w:vAlign w:val="bottom"/>
+          </w:tcPr>
+          <w:p>
+            <w:pPr>
+              <w:pStyle w:val="Normal"/>
+              <w:widowControl w:val="false"/>
+              <w:spacing w:lineRule="auto" w:line="180" w:before="0" w:after="60"/>
+              <w:jc w:val="center"/>
+              <w:rPr>
+                <w:b/>
+                <w:bCs/>
+              </w:rPr>
+            </w:pPr>
+            <w:r>
+              <w:rPr>
+                <w:b/>
+                <w:bCs/>
+                <w:color w:val="000000"/>
+                <w:sz w:val="16"/>
+                <w:szCs w:val="16"/>
+              </w:rPr>
+              <w:t>HUD</w:t>
+            </w:r>
+          </w:p>
+        </w:tc>
+        <w:tc>
+          <w:tcPr>
+            <w:tcW w:w="1019" w:type="dxa"/>
+            <w:tcBorders>
+              <w:top w:val="single" w:sz="4" w:space="0" w:color="000000"/>
+              <w:left w:val="single" w:sz="4" w:space="0" w:color="000000"/>
+              <w:bottom w:val="single" w:sz="4" w:space="0" w:color="000000"/>
+            </w:tcBorders>
+            <w:vAlign w:val="bottom"/>
+          </w:tcPr>
+          <w:p>
+            <w:pPr>
+              <w:pStyle w:val="Normal"/>
+              <w:widowControl w:val="false"/>
+              <w:spacing w:lineRule="auto" w:line="180"/>
+              <w:jc w:val="center"/>
+              <w:rPr>
+                <w:color w:val="000000"/>
+                <w:sz w:val="16"/>
+                <w:szCs w:val="16"/>
+              </w:rPr>
+            </w:pPr>
+            <w:r>
+              <w:rPr>
+                <w:color w:val="000000"/>
+                <w:sz w:val="16"/>
+                <w:szCs w:val="16"/>
+              </w:rPr>
+              <w:t>Schedule</w:t>
+            </w:r>
+          </w:p>
+        </w:tc>
+        <w:tc>
+          <w:tcPr>
+            <w:tcW w:w="1014" w:type="dxa"/>
+            <w:tcBorders>
+              <w:top w:val="single" w:sz="4" w:space="0" w:color="000000"/>
+              <w:left w:val="single" w:sz="4" w:space="0" w:color="000000"/>
+              <w:bottom w:val="single" w:sz="4" w:space="0" w:color="000000"/>
+            </w:tcBorders>
+            <w:vAlign w:val="bottom"/>
+          </w:tcPr>
+          <w:p>
+            <w:pPr>
+              <w:pStyle w:val="Normal"/>
+              <w:widowControl w:val="false"/>
+              <w:spacing w:lineRule="auto" w:line="180"/>
+              <w:jc w:val="center"/>
+              <w:rPr>
+                <w:color w:val="000000"/>
+                <w:sz w:val="16"/>
+                <w:szCs w:val="16"/>
+              </w:rPr>
+            </w:pPr>
+            <w:r>
+              <w:rPr>
+                <w:color w:val="000000"/>
+                <w:sz w:val="16"/>
+                <w:szCs w:val="16"/>
+              </w:rPr>
+              <w:t>Aux Off</w:t>
+            </w:r>
+          </w:p>
+        </w:tc>
+        <w:tc>
+          <w:tcPr>
+            <w:tcW w:w="1016" w:type="dxa"/>
+            <w:tcBorders>
+              <w:top w:val="single" w:sz="4" w:space="0" w:color="000000"/>
+              <w:left w:val="single" w:sz="4" w:space="0" w:color="000000"/>
+              <w:bottom w:val="single" w:sz="4" w:space="0" w:color="000000"/>
+            </w:tcBorders>
+            <w:vAlign w:val="bottom"/>
+          </w:tcPr>
+          <w:p>
+            <w:pPr>
+              <w:pStyle w:val="Normal"/>
+              <w:widowControl w:val="false"/>
+              <w:spacing w:lineRule="auto" w:line="180"/>
+              <w:jc w:val="center"/>
+              <w:rPr>
+                <w:color w:val="000000"/>
+                <w:sz w:val="16"/>
+                <w:szCs w:val="16"/>
+              </w:rPr>
+            </w:pPr>
+            <w:r>
+              <w:rPr>
+                <w:color w:val="000000"/>
+                <w:sz w:val="16"/>
+                <w:szCs w:val="16"/>
+              </w:rPr>
+              <w:t>DSD/Vigilance</w:t>
+            </w:r>
+          </w:p>
+        </w:tc>
+        <w:tc>
+          <w:tcPr>
+            <w:tcW w:w="1020" w:type="dxa"/>
+            <w:tcBorders>
+              <w:top w:val="single" w:sz="4" w:space="0" w:color="000000"/>
+              <w:left w:val="single" w:sz="4" w:space="0" w:color="000000"/>
+              <w:bottom w:val="single" w:sz="4" w:space="0" w:color="000000"/>
+            </w:tcBorders>
+            <w:vAlign w:val="bottom"/>
+          </w:tcPr>
+          <w:p>
+            <w:pPr>
+              <w:pStyle w:val="Normal"/>
+              <w:widowControl w:val="false"/>
+              <w:spacing w:lineRule="auto" w:line="180"/>
+              <w:jc w:val="center"/>
+              <w:rPr>
+                <w:color w:val="000000"/>
+                <w:sz w:val="16"/>
+                <w:szCs w:val="16"/>
+              </w:rPr>
+            </w:pPr>
+            <w:r>
+              <w:rPr>
+                <w:color w:val="000000"/>
+                <w:sz w:val="16"/>
+                <w:szCs w:val="16"/>
+              </w:rPr>
+              <w:t>Panto. L/Shoe Up</w:t>
+            </w:r>
+          </w:p>
+        </w:tc>
+        <w:tc>
+          <w:tcPr>
+            <w:tcW w:w="1016" w:type="dxa"/>
+            <w:tcBorders>
+              <w:top w:val="single" w:sz="4" w:space="0" w:color="000000"/>
+              <w:left w:val="single" w:sz="4" w:space="0" w:color="000000"/>
+              <w:bottom w:val="single" w:sz="4" w:space="0" w:color="000000"/>
+            </w:tcBorders>
+            <w:vAlign w:val="bottom"/>
+          </w:tcPr>
+          <w:p>
+            <w:pPr>
+              <w:pStyle w:val="Normal"/>
+              <w:widowControl w:val="false"/>
+              <w:spacing w:lineRule="auto" w:line="180"/>
+              <w:jc w:val="center"/>
+              <w:rPr>
+                <w:sz w:val="16"/>
+                <w:szCs w:val="16"/>
+              </w:rPr>
+            </w:pPr>
+            <w:r>
+              <w:rPr>
+                <w:color w:val="000000"/>
+                <w:sz w:val="16"/>
+                <w:szCs w:val="16"/>
+              </w:rPr>
+              <w:t>DC</w:t>
+            </w:r>
+          </w:p>
+        </w:tc>
+        <w:tc>
+          <w:tcPr>
+            <w:tcW w:w="1016" w:type="dxa"/>
+            <w:tcBorders>
+              <w:top w:val="single" w:sz="4" w:space="0" w:color="000000"/>
+              <w:left w:val="single" w:sz="4" w:space="0" w:color="000000"/>
+              <w:bottom w:val="single" w:sz="4" w:space="0" w:color="000000"/>
+            </w:tcBorders>
+            <w:vAlign w:val="bottom"/>
+          </w:tcPr>
+          <w:p>
+            <w:pPr>
+              <w:pStyle w:val="Normal"/>
+              <w:widowControl w:val="false"/>
+              <w:jc w:val="center"/>
+              <w:rPr>
+                <w:color w:val="000000"/>
+                <w:sz w:val="16"/>
+                <w:szCs w:val="16"/>
+              </w:rPr>
+            </w:pPr>
+            <w:r>
+              <w:rPr>
+                <w:color w:val="000000"/>
+                <w:sz w:val="16"/>
+                <w:szCs w:val="16"/>
+              </w:rPr>
+            </w:r>
+          </w:p>
+        </w:tc>
+        <w:tc>
+          <w:tcPr>
+            <w:tcW w:w="1017" w:type="dxa"/>
+            <w:tcBorders>
+              <w:top w:val="single" w:sz="4" w:space="0" w:color="000000"/>
+              <w:left w:val="single" w:sz="4" w:space="0" w:color="000000"/>
+              <w:bottom w:val="single" w:sz="4" w:space="0" w:color="000000"/>
+            </w:tcBorders>
+            <w:vAlign w:val="bottom"/>
+          </w:tcPr>
+          <w:p>
+            <w:pPr>
+              <w:pStyle w:val="Normal"/>
+              <w:widowControl w:val="false"/>
+              <w:jc w:val="center"/>
+              <w:rPr>
+                <w:color w:val="000000"/>
+                <w:sz w:val="16"/>
+                <w:szCs w:val="16"/>
+              </w:rPr>
+            </w:pPr>
+            <w:r>
+              <w:rPr/>
+            </w:r>
+          </w:p>
+        </w:tc>
+        <w:tc>
+          <w:tcPr>
+            <w:tcW w:w="1016" w:type="dxa"/>
+            <w:tcBorders>
+              <w:top w:val="single" w:sz="4" w:space="0" w:color="000000"/>
+              <w:left w:val="single" w:sz="4" w:space="0" w:color="000000"/>
+              <w:bottom w:val="single" w:sz="4" w:space="0" w:color="000000"/>
+            </w:tcBorders>
+            <w:vAlign w:val="bottom"/>
+          </w:tcPr>
+          <w:p>
+            <w:pPr>
+              <w:pStyle w:val="Normal"/>
+              <w:widowControl w:val="false"/>
+              <w:jc w:val="center"/>
+              <w:rPr>
+                <w:sz w:val="16"/>
+                <w:szCs w:val="16"/>
+              </w:rPr>
+            </w:pPr>
+            <w:r>
+              <w:rPr>
+                <w:sz w:val="16"/>
+                <w:szCs w:val="16"/>
+              </w:rPr>
+            </w:r>
+          </w:p>
+        </w:tc>
+        <w:tc>
+          <w:tcPr>
+            <w:tcW w:w="1020" w:type="dxa"/>
+            <w:tcBorders>
+              <w:top w:val="single" w:sz="4" w:space="0" w:color="000000"/>
+              <w:left w:val="single" w:sz="4" w:space="0" w:color="000000"/>
+              <w:bottom w:val="single" w:sz="4" w:space="0" w:color="000000"/>
+            </w:tcBorders>
+            <w:vAlign w:val="bottom"/>
+          </w:tcPr>
+          <w:p>
+            <w:pPr>
+              <w:pStyle w:val="Normal"/>
+              <w:widowControl w:val="false"/>
+              <w:jc w:val="center"/>
+              <w:rPr>
+                <w:rFonts w:ascii="arial" w:hAnsi="arial" w:eastAsia="arial"/>
+                <w:color w:val="000000"/>
+                <w:sz w:val="16"/>
+                <w:szCs w:val="16"/>
+              </w:rPr>
+            </w:pPr>
+            <w:r>
+              <w:rPr>
+                <w:rFonts w:eastAsia="arial" w:ascii="arial" w:hAnsi="arial"/>
+                <w:color w:val="000000"/>
+                <w:sz w:val="16"/>
+                <w:szCs w:val="16"/>
+              </w:rPr>
+              <w:t>Notice Bd. Light</w:t>
+            </w:r>
+          </w:p>
+        </w:tc>
+        <w:tc>
+          <w:tcPr>
+            <w:tcW w:w="1016" w:type="dxa"/>
+            <w:tcBorders>
+              <w:top w:val="single" w:sz="4" w:space="0" w:color="000000"/>
+              <w:left w:val="single" w:sz="4" w:space="0" w:color="000000"/>
+              <w:bottom w:val="single" w:sz="4" w:space="0" w:color="000000"/>
+            </w:tcBorders>
+            <w:vAlign w:val="bottom"/>
+          </w:tcPr>
+          <w:p>
+            <w:pPr>
+              <w:pStyle w:val="Normal"/>
+              <w:widowControl w:val="false"/>
+              <w:jc w:val="center"/>
+              <w:rPr>
+                <w:color w:val="000000"/>
+                <w:sz w:val="16"/>
+                <w:szCs w:val="16"/>
+              </w:rPr>
+            </w:pPr>
+            <w:r>
+              <w:rPr>
+                <w:color w:val="000000"/>
+                <w:sz w:val="16"/>
+                <w:szCs w:val="16"/>
+              </w:rPr>
+              <w:t>Tail Light</w:t>
+            </w:r>
+          </w:p>
+        </w:tc>
+        <w:tc>
+          <w:tcPr>
+            <w:tcW w:w="1016" w:type="dxa"/>
+            <w:tcBorders>
+              <w:top w:val="single" w:sz="4" w:space="0" w:color="000000"/>
+              <w:left w:val="single" w:sz="4" w:space="0" w:color="000000"/>
+              <w:bottom w:val="single" w:sz="4" w:space="0" w:color="000000"/>
+            </w:tcBorders>
+            <w:vAlign w:val="bottom"/>
+          </w:tcPr>
+          <w:p>
+            <w:pPr>
+              <w:pStyle w:val="Normal"/>
+              <w:widowControl w:val="false"/>
+              <w:spacing w:lineRule="auto" w:line="180"/>
+              <w:jc w:val="center"/>
+              <w:rPr>
+                <w:sz w:val="16"/>
+                <w:szCs w:val="16"/>
+              </w:rPr>
+            </w:pPr>
+            <w:r>
+              <w:rPr>
+                <w:sz w:val="16"/>
+                <w:szCs w:val="16"/>
+              </w:rPr>
+              <w:t>Uncouple</w:t>
+            </w:r>
+          </w:p>
+        </w:tc>
+        <w:tc>
+          <w:tcPr>
+            <w:tcW w:w="1016" w:type="dxa"/>
+            <w:tcBorders>
+              <w:top w:val="single" w:sz="4" w:space="0" w:color="000000"/>
+              <w:left w:val="single" w:sz="4" w:space="0" w:color="000000"/>
+              <w:bottom w:val="single" w:sz="4" w:space="0" w:color="000000"/>
+            </w:tcBorders>
+            <w:vAlign w:val="bottom"/>
+          </w:tcPr>
+          <w:p>
+            <w:pPr>
+              <w:pStyle w:val="Normal"/>
+              <w:widowControl w:val="false"/>
+              <w:spacing w:lineRule="auto" w:line="180"/>
+              <w:jc w:val="center"/>
+              <w:rPr>
+                <w:sz w:val="16"/>
+                <w:szCs w:val="16"/>
+              </w:rPr>
+            </w:pPr>
+            <w:r>
+              <w:rPr>
+                <w:rFonts w:eastAsia="arial" w:ascii="arial" w:hAnsi="arial"/>
+                <w:color w:val="000000"/>
+                <w:sz w:val="16"/>
+                <w:szCs w:val="16"/>
+              </w:rPr>
+              <w:t>Exterior</w:t>
+            </w:r>
+          </w:p>
+          <w:p>
+            <w:pPr>
+              <w:pStyle w:val="Normal"/>
+              <w:widowControl w:val="false"/>
+              <w:spacing w:lineRule="auto" w:line="180"/>
+              <w:jc w:val="center"/>
+              <w:rPr>
+                <w:sz w:val="16"/>
+                <w:szCs w:val="16"/>
+              </w:rPr>
+            </w:pPr>
+            <w:r>
+              <w:rPr>
+                <w:rFonts w:eastAsia="arial" w:ascii="arial" w:hAnsi="arial"/>
+                <w:color w:val="000000"/>
+                <w:sz w:val="16"/>
+                <w:szCs w:val="16"/>
+              </w:rPr>
+              <w:t>Camera</w:t>
+            </w:r>
+          </w:p>
+        </w:tc>
+        <w:tc>
+          <w:tcPr>
+            <w:tcW w:w="1029" w:type="dxa"/>
+            <w:tcBorders>
+              <w:top w:val="single" w:sz="4" w:space="0" w:color="000000"/>
+              <w:left w:val="single" w:sz="4" w:space="0" w:color="000000"/>
+              <w:bottom w:val="single" w:sz="4" w:space="0" w:color="000000"/>
+              <w:right w:val="single" w:sz="4" w:space="0" w:color="000000"/>
+            </w:tcBorders>
+            <w:vAlign w:val="bottom"/>
+          </w:tcPr>
+          <w:p>
+            <w:pPr>
+              <w:pStyle w:val="Normal"/>
+              <w:widowControl w:val="false"/>
+              <w:spacing w:lineRule="auto" w:line="180"/>
+              <w:jc w:val="center"/>
+              <w:rPr>
+                <w:sz w:val="16"/>
+                <w:szCs w:val="16"/>
+              </w:rPr>
+            </w:pPr>
+            <w:r>
+              <w:rPr>
+                <w:rFonts w:eastAsia="arial" w:ascii="arial" w:hAnsi="arial"/>
+                <w:color w:val="000000"/>
+                <w:sz w:val="16"/>
+                <w:szCs w:val="16"/>
+              </w:rPr>
+              <w:t>Prev</w:t>
+            </w:r>
+          </w:p>
+          <w:p>
+            <w:pPr>
+              <w:pStyle w:val="Normal"/>
+              <w:widowControl w:val="false"/>
+              <w:spacing w:lineRule="auto" w:line="180"/>
+              <w:jc w:val="center"/>
+              <w:rPr>
+                <w:sz w:val="16"/>
+                <w:szCs w:val="16"/>
+              </w:rPr>
+            </w:pPr>
+            <w:r>
+              <w:rPr>
+                <w:rFonts w:eastAsia="arial" w:ascii="arial" w:hAnsi="arial"/>
+                <w:color w:val="000000"/>
+                <w:sz w:val="16"/>
+                <w:szCs w:val="16"/>
+              </w:rPr>
+              <w:t>Cab Cam</w:t>
+            </w:r>
+          </w:p>
+        </w:tc>
+      </w:tr>
+    </w:tbl>
+    <w:p>
+      <w:pPr>
+        <w:pStyle w:val="Normal"/>
+        <w:rPr>
+          <w:color w:val="000000"/>
+          <w:sz w:val="16"/>
+          <w:szCs w:val="16"/>
+        </w:rPr>
+      </w:pPr>
+      <w:r>
+        <w:rPr>
+          <w:color w:val="000000"/>
+          <w:sz w:val="16"/>
+          <w:szCs w:val="16"/>
+        </w:rPr>
+      </w:r>
+    </w:p>
+    <w:p>
+      <w:pPr>
+        <w:pStyle w:val="Normal"/>
+        <w:rPr>
+          <w:color w:val="000000"/>
+          <w:sz w:val="16"/>
+          <w:szCs w:val="16"/>
+        </w:rPr>
+      </w:pPr>
+      <w:r>
+        <w:rPr>
+          <w:rFonts w:eastAsia="arial" w:ascii="arial" w:hAnsi="arial"/>
+          <w:color w:val="000000"/>
+          <w:sz w:val="16"/>
+          <w:szCs w:val="16"/>
+        </w:rPr>
+        <w:tab/>
+        <w:t xml:space="preserve">           Class 3</w:t>
+      </w:r>
+      <w:r>
+        <w:rPr>
+          <w:rFonts w:eastAsia="arial" w:ascii="arial" w:hAnsi="arial"/>
+          <w:color w:val="000000"/>
+          <w:sz w:val="16"/>
+          <w:szCs w:val="16"/>
+        </w:rPr>
+        <w:t>80</w:t>
+      </w:r>
+      <w:r>
+        <w:rPr>
+          <w:rFonts w:eastAsia="arial" w:ascii="arial" w:hAnsi="arial"/>
+          <w:color w:val="000000"/>
+          <w:sz w:val="16"/>
+          <w:szCs w:val="16"/>
+        </w:rPr>
+        <w:t>-1</w:t>
+      </w:r>
+    </w:p>
+    <w:tbl>
+      <w:tblPr>
+        <w:tblW w:w="14248" w:type="dxa"/>
+        <w:jc w:val="left"/>
+        <w:tblInd w:w="-5" w:type="dxa"/>
+        <w:tblLayout w:type="fixed"/>
+        <w:tblCellMar>
+          <w:top w:w="0" w:type="dxa"/>
+          <w:left w:w="108" w:type="dxa"/>
+          <w:bottom w:w="0" w:type="dxa"/>
+          <w:right w:w="108" w:type="dxa"/>
+        </w:tblCellMar>
+        <w:tblLook w:firstRow="1" w:noVBand="1" w:lastRow="0" w:firstColumn="1" w:lastColumn="0" w:noHBand="0" w:val="04a0"/>
+      </w:tblPr>
+      <w:tblGrid>
+        <w:gridCol w:w="1017"/>
+        <w:gridCol w:w="1019"/>
+        <w:gridCol w:w="1014"/>
+        <w:gridCol w:w="1016"/>
+        <w:gridCol w:w="1020"/>
+        <w:gridCol w:w="1016"/>
+        <w:gridCol w:w="1016"/>
+        <w:gridCol w:w="1017"/>
+        <w:gridCol w:w="1016"/>
+        <w:gridCol w:w="1020"/>
+        <w:gridCol w:w="1016"/>
+        <w:gridCol w:w="1016"/>
+        <w:gridCol w:w="1016"/>
+        <w:gridCol w:w="1029"/>
+      </w:tblGrid>
+      <w:tr>
+        <w:trPr>
+          <w:trHeight w:val="440" w:hRule="exact"/>
+          <w:cantSplit w:val="true"/>
+        </w:trPr>
+        <w:tc>
+          <w:tcPr>
+            <w:tcW w:w="1017" w:type="dxa"/>
+            <w:tcBorders>
+              <w:top w:val="single" w:sz="4" w:space="0" w:color="000000"/>
+              <w:left w:val="single" w:sz="4" w:space="0" w:color="000000"/>
+              <w:bottom w:val="single" w:sz="4" w:space="0" w:color="000000"/>
+            </w:tcBorders>
+            <w:vAlign w:val="bottom"/>
+          </w:tcPr>
+          <w:p>
+            <w:pPr>
+              <w:pStyle w:val="Normal"/>
+              <w:widowControl w:val="false"/>
+              <w:spacing w:lineRule="auto" w:line="180" w:before="0" w:after="60"/>
+              <w:jc w:val="center"/>
+              <w:rPr>
+                <w:color w:val="000000"/>
+                <w:sz w:val="16"/>
+                <w:szCs w:val="16"/>
+              </w:rPr>
+            </w:pPr>
+            <w:r>
+              <w:rPr>
+                <w:rFonts w:eastAsia="arial" w:ascii="arial" w:hAnsi="arial"/>
+                <w:b/>
+                <w:color w:val="000000"/>
+                <w:sz w:val="16"/>
+                <w:szCs w:val="16"/>
+              </w:rPr>
+              <w:t>Pause</w:t>
+            </w:r>
+          </w:p>
+        </w:tc>
+        <w:tc>
+          <w:tcPr>
+            <w:tcW w:w="1019" w:type="dxa"/>
+            <w:tcBorders>
+              <w:top w:val="single" w:sz="4" w:space="0" w:color="000000"/>
+              <w:left w:val="single" w:sz="4" w:space="0" w:color="000000"/>
+              <w:bottom w:val="single" w:sz="4" w:space="0" w:color="000000"/>
+            </w:tcBorders>
+            <w:vAlign w:val="bottom"/>
+          </w:tcPr>
+          <w:p>
+            <w:pPr>
+              <w:pStyle w:val="Normal"/>
+              <w:widowControl w:val="false"/>
+              <w:spacing w:lineRule="auto" w:line="180"/>
+              <w:jc w:val="center"/>
+              <w:rPr>
+                <w:color w:val="000000"/>
+                <w:sz w:val="16"/>
+                <w:szCs w:val="16"/>
+              </w:rPr>
+            </w:pPr>
+            <w:r>
+              <w:rPr>
+                <w:color w:val="000000"/>
+                <w:sz w:val="16"/>
+                <w:szCs w:val="16"/>
+              </w:rPr>
+              <w:t>Master Key</w:t>
+            </w:r>
+          </w:p>
+        </w:tc>
+        <w:tc>
+          <w:tcPr>
+            <w:tcW w:w="1014" w:type="dxa"/>
+            <w:tcBorders>
+              <w:top w:val="single" w:sz="4" w:space="0" w:color="000000"/>
+              <w:left w:val="single" w:sz="4" w:space="0" w:color="000000"/>
+              <w:bottom w:val="single" w:sz="4" w:space="0" w:color="000000"/>
+            </w:tcBorders>
+            <w:vAlign w:val="bottom"/>
+          </w:tcPr>
+          <w:p>
+            <w:pPr>
+              <w:pStyle w:val="Normal"/>
+              <w:widowControl w:val="false"/>
+              <w:spacing w:lineRule="auto" w:line="180"/>
+              <w:jc w:val="center"/>
+              <w:rPr>
+                <w:color w:val="000000"/>
+                <w:sz w:val="16"/>
+                <w:szCs w:val="16"/>
+              </w:rPr>
+            </w:pPr>
+            <w:r>
+              <w:rPr/>
+            </w:r>
+          </w:p>
+        </w:tc>
+        <w:tc>
+          <w:tcPr>
+            <w:tcW w:w="1016" w:type="dxa"/>
+            <w:tcBorders>
+              <w:top w:val="single" w:sz="4" w:space="0" w:color="000000"/>
+              <w:left w:val="single" w:sz="4" w:space="0" w:color="000000"/>
+              <w:bottom w:val="single" w:sz="4" w:space="0" w:color="000000"/>
+            </w:tcBorders>
+            <w:vAlign w:val="bottom"/>
+          </w:tcPr>
+          <w:p>
+            <w:pPr>
+              <w:pStyle w:val="Normal"/>
+              <w:widowControl w:val="false"/>
+              <w:spacing w:lineRule="auto" w:line="180"/>
+              <w:jc w:val="center"/>
+              <w:rPr>
+                <w:color w:val="000000"/>
+                <w:sz w:val="16"/>
+                <w:szCs w:val="16"/>
+              </w:rPr>
+            </w:pPr>
+            <w:r>
+              <w:rPr>
+                <w:color w:val="000000"/>
+                <w:sz w:val="16"/>
+                <w:szCs w:val="16"/>
+              </w:rPr>
+              <w:t>AWS/TPWS</w:t>
+            </w:r>
+          </w:p>
+        </w:tc>
+        <w:tc>
+          <w:tcPr>
+            <w:tcW w:w="1020" w:type="dxa"/>
+            <w:tcBorders>
+              <w:top w:val="single" w:sz="4" w:space="0" w:color="000000"/>
+              <w:left w:val="single" w:sz="4" w:space="0" w:color="000000"/>
+              <w:bottom w:val="single" w:sz="4" w:space="0" w:color="000000"/>
+            </w:tcBorders>
+            <w:vAlign w:val="bottom"/>
+          </w:tcPr>
+          <w:p>
+            <w:pPr>
+              <w:pStyle w:val="Normal"/>
+              <w:widowControl w:val="false"/>
+              <w:spacing w:lineRule="auto" w:line="180"/>
+              <w:jc w:val="center"/>
+              <w:rPr>
+                <w:color w:val="000000"/>
+                <w:sz w:val="16"/>
+                <w:szCs w:val="16"/>
+              </w:rPr>
+            </w:pPr>
+            <w:r>
+              <w:rPr>
+                <w:color w:val="000000"/>
+                <w:sz w:val="16"/>
+                <w:szCs w:val="16"/>
+              </w:rPr>
+              <w:t>Panto. Up</w:t>
+            </w:r>
+          </w:p>
+        </w:tc>
+        <w:tc>
+          <w:tcPr>
+            <w:tcW w:w="1016" w:type="dxa"/>
+            <w:tcBorders>
+              <w:top w:val="single" w:sz="4" w:space="0" w:color="000000"/>
+              <w:left w:val="single" w:sz="4" w:space="0" w:color="000000"/>
+              <w:bottom w:val="single" w:sz="4" w:space="0" w:color="000000"/>
+            </w:tcBorders>
+            <w:vAlign w:val="bottom"/>
+          </w:tcPr>
+          <w:p>
+            <w:pPr>
+              <w:pStyle w:val="Normal"/>
+              <w:widowControl w:val="false"/>
+              <w:spacing w:lineRule="auto" w:line="180"/>
+              <w:jc w:val="center"/>
+              <w:rPr>
+                <w:color w:val="000000"/>
+                <w:sz w:val="16"/>
+                <w:szCs w:val="16"/>
+              </w:rPr>
+            </w:pPr>
+            <w:r>
+              <w:rPr>
+                <w:color w:val="000000"/>
+                <w:sz w:val="16"/>
+                <w:szCs w:val="16"/>
+              </w:rPr>
+              <w:t>Saloon Light</w:t>
+            </w:r>
+          </w:p>
+        </w:tc>
+        <w:tc>
+          <w:tcPr>
+            <w:tcW w:w="1016" w:type="dxa"/>
+            <w:tcBorders>
+              <w:top w:val="single" w:sz="4" w:space="0" w:color="000000"/>
+              <w:left w:val="single" w:sz="4" w:space="0" w:color="000000"/>
+              <w:bottom w:val="single" w:sz="4" w:space="0" w:color="000000"/>
+            </w:tcBorders>
+            <w:vAlign w:val="bottom"/>
+          </w:tcPr>
+          <w:p>
+            <w:pPr>
+              <w:pStyle w:val="Normal"/>
+              <w:widowControl w:val="false"/>
+              <w:jc w:val="center"/>
+              <w:rPr>
+                <w:sz w:val="16"/>
+                <w:szCs w:val="16"/>
+              </w:rPr>
+            </w:pPr>
+            <w:r>
+              <w:rPr>
+                <w:sz w:val="16"/>
+                <w:szCs w:val="16"/>
+              </w:rPr>
+              <w:t>DRA</w:t>
+            </w:r>
+          </w:p>
+        </w:tc>
+        <w:tc>
+          <w:tcPr>
+            <w:tcW w:w="1017" w:type="dxa"/>
+            <w:tcBorders>
+              <w:top w:val="single" w:sz="4" w:space="0" w:color="000000"/>
+              <w:left w:val="single" w:sz="4" w:space="0" w:color="000000"/>
+              <w:bottom w:val="single" w:sz="4" w:space="0" w:color="000000"/>
+            </w:tcBorders>
+            <w:vAlign w:val="bottom"/>
+          </w:tcPr>
+          <w:p>
+            <w:pPr>
+              <w:pStyle w:val="Normal"/>
+              <w:widowControl w:val="false"/>
+              <w:jc w:val="center"/>
+              <w:rPr>
+                <w:color w:val="000000"/>
+                <w:sz w:val="16"/>
+                <w:szCs w:val="16"/>
+              </w:rPr>
+            </w:pPr>
+            <w:r>
+              <w:rPr/>
+            </w:r>
+          </w:p>
+        </w:tc>
+        <w:tc>
+          <w:tcPr>
+            <w:tcW w:w="1016" w:type="dxa"/>
+            <w:tcBorders>
+              <w:top w:val="single" w:sz="4" w:space="0" w:color="000000"/>
+              <w:left w:val="single" w:sz="4" w:space="0" w:color="000000"/>
+              <w:bottom w:val="single" w:sz="4" w:space="0" w:color="000000"/>
+            </w:tcBorders>
+            <w:vAlign w:val="bottom"/>
+          </w:tcPr>
+          <w:p>
+            <w:pPr>
+              <w:pStyle w:val="Normal"/>
+              <w:widowControl w:val="false"/>
+              <w:jc w:val="center"/>
+              <w:rPr>
+                <w:sz w:val="16"/>
+                <w:szCs w:val="16"/>
+              </w:rPr>
+            </w:pPr>
+            <w:r>
+              <w:rPr>
+                <w:sz w:val="16"/>
+                <w:szCs w:val="16"/>
+              </w:rPr>
+              <w:t>Gangway Deploy</w:t>
+            </w:r>
+          </w:p>
+        </w:tc>
+        <w:tc>
+          <w:tcPr>
+            <w:tcW w:w="1020" w:type="dxa"/>
+            <w:tcBorders>
+              <w:top w:val="single" w:sz="4" w:space="0" w:color="000000"/>
+              <w:left w:val="single" w:sz="4" w:space="0" w:color="000000"/>
+              <w:bottom w:val="single" w:sz="4" w:space="0" w:color="000000"/>
+            </w:tcBorders>
+            <w:vAlign w:val="bottom"/>
+          </w:tcPr>
+          <w:p>
+            <w:pPr>
+              <w:pStyle w:val="Normal"/>
+              <w:widowControl w:val="false"/>
+              <w:jc w:val="center"/>
+              <w:rPr>
+                <w:color w:val="000000"/>
+                <w:sz w:val="16"/>
+                <w:szCs w:val="16"/>
+              </w:rPr>
+            </w:pPr>
+            <w:r>
+              <w:rPr>
+                <w:color w:val="000000"/>
+                <w:sz w:val="16"/>
+                <w:szCs w:val="16"/>
+              </w:rPr>
+              <w:t>Hazard Light</w:t>
+            </w:r>
+          </w:p>
+        </w:tc>
+        <w:tc>
+          <w:tcPr>
+            <w:tcW w:w="1016" w:type="dxa"/>
+            <w:tcBorders>
+              <w:top w:val="single" w:sz="4" w:space="0" w:color="000000"/>
+              <w:left w:val="single" w:sz="4" w:space="0" w:color="000000"/>
+              <w:bottom w:val="single" w:sz="4" w:space="0" w:color="000000"/>
+            </w:tcBorders>
+            <w:vAlign w:val="bottom"/>
+          </w:tcPr>
+          <w:p>
+            <w:pPr>
+              <w:pStyle w:val="Normal"/>
+              <w:widowControl w:val="false"/>
+              <w:spacing w:lineRule="auto" w:line="180"/>
+              <w:jc w:val="center"/>
+              <w:rPr>
+                <w:sz w:val="16"/>
+                <w:szCs w:val="16"/>
+              </w:rPr>
+            </w:pPr>
+            <w:r>
+              <w:rPr>
+                <w:rFonts w:eastAsia="arial" w:ascii="arial" w:hAnsi="arial"/>
+                <w:color w:val="000000"/>
+                <w:sz w:val="16"/>
+                <w:szCs w:val="16"/>
+              </w:rPr>
+              <w:t>Cab Light</w:t>
+            </w:r>
+          </w:p>
+        </w:tc>
+        <w:tc>
+          <w:tcPr>
+            <w:tcW w:w="1016" w:type="dxa"/>
+            <w:tcBorders>
+              <w:top w:val="single" w:sz="4" w:space="0" w:color="000000"/>
+              <w:left w:val="single" w:sz="4" w:space="0" w:color="000000"/>
+              <w:bottom w:val="single" w:sz="4" w:space="0" w:color="000000"/>
+            </w:tcBorders>
+            <w:vAlign w:val="bottom"/>
+          </w:tcPr>
+          <w:p>
+            <w:pPr>
+              <w:pStyle w:val="Normal"/>
+              <w:widowControl w:val="false"/>
+              <w:jc w:val="center"/>
+              <w:rPr>
+                <w:color w:val="000000"/>
+                <w:sz w:val="16"/>
+                <w:szCs w:val="16"/>
+              </w:rPr>
+            </w:pPr>
+            <w:r>
+              <w:rPr/>
+            </w:r>
+          </w:p>
+        </w:tc>
+        <w:tc>
+          <w:tcPr>
+            <w:tcW w:w="1016" w:type="dxa"/>
+            <w:tcBorders>
+              <w:top w:val="single" w:sz="4" w:space="0" w:color="000000"/>
+              <w:left w:val="single" w:sz="4" w:space="0" w:color="000000"/>
+              <w:bottom w:val="single" w:sz="4" w:space="0" w:color="000000"/>
+            </w:tcBorders>
+            <w:vAlign w:val="bottom"/>
+          </w:tcPr>
+          <w:p>
+            <w:pPr>
+              <w:pStyle w:val="Normal"/>
+              <w:widowControl w:val="false"/>
+              <w:spacing w:lineRule="auto" w:line="180"/>
+              <w:jc w:val="center"/>
+              <w:rPr>
+                <w:sz w:val="16"/>
+                <w:szCs w:val="16"/>
+              </w:rPr>
+            </w:pPr>
+            <w:r>
+              <w:rPr>
+                <w:rFonts w:eastAsia="arial" w:ascii="arial" w:hAnsi="arial"/>
+                <w:color w:val="000000"/>
+                <w:sz w:val="16"/>
+                <w:szCs w:val="16"/>
+              </w:rPr>
+              <w:t>1-Person</w:t>
+            </w:r>
+          </w:p>
+        </w:tc>
+        <w:tc>
+          <w:tcPr>
+            <w:tcW w:w="1029" w:type="dxa"/>
+            <w:tcBorders>
+              <w:top w:val="single" w:sz="4" w:space="0" w:color="000000"/>
+              <w:left w:val="single" w:sz="4" w:space="0" w:color="000000"/>
+              <w:bottom w:val="single" w:sz="4" w:space="0" w:color="000000"/>
+              <w:right w:val="single" w:sz="4" w:space="0" w:color="000000"/>
+            </w:tcBorders>
+            <w:vAlign w:val="bottom"/>
+          </w:tcPr>
+          <w:p>
+            <w:pPr>
+              <w:pStyle w:val="Normal"/>
+              <w:widowControl w:val="false"/>
+              <w:spacing w:lineRule="auto" w:line="180"/>
+              <w:jc w:val="center"/>
+              <w:rPr>
+                <w:sz w:val="16"/>
+                <w:szCs w:val="16"/>
+              </w:rPr>
+            </w:pPr>
+            <w:r>
+              <w:rPr>
+                <w:rFonts w:eastAsia="arial" w:ascii="arial" w:hAnsi="arial"/>
+                <w:color w:val="000000"/>
+                <w:sz w:val="16"/>
+                <w:szCs w:val="16"/>
+              </w:rPr>
+              <w:t>Next</w:t>
+            </w:r>
+          </w:p>
+          <w:p>
+            <w:pPr>
+              <w:pStyle w:val="Normal"/>
+              <w:widowControl w:val="false"/>
+              <w:spacing w:lineRule="auto" w:line="180"/>
+              <w:jc w:val="center"/>
+              <w:rPr>
+                <w:sz w:val="16"/>
+                <w:szCs w:val="16"/>
+              </w:rPr>
+            </w:pPr>
+            <w:r>
+              <w:rPr>
+                <w:rFonts w:eastAsia="arial" w:ascii="arial" w:hAnsi="arial"/>
+                <w:color w:val="000000"/>
+                <w:sz w:val="16"/>
+                <w:szCs w:val="16"/>
+              </w:rPr>
+              <w:t>Cab Cam</w:t>
+            </w:r>
+          </w:p>
+        </w:tc>
+      </w:tr>
+    </w:tbl>
+    <w:p>
+      <w:pPr>
+        <w:pStyle w:val="Normal"/>
+        <w:rPr>
+          <w:rFonts w:ascii="arial" w:hAnsi="arial" w:eastAsia="arial"/>
+          <w:color w:val="000000"/>
+          <w:sz w:val="16"/>
+          <w:szCs w:val="16"/>
+        </w:rPr>
+      </w:pPr>
+      <w:r>
+        <w:rPr>
+          <w:rFonts w:eastAsia="arial" w:ascii="arial" w:hAnsi="arial"/>
+          <w:color w:val="000000"/>
+          <w:sz w:val="16"/>
+          <w:szCs w:val="16"/>
+        </w:rPr>
+      </w:r>
+    </w:p>
+    <w:p>
+      <w:pPr>
+        <w:pStyle w:val="Normal"/>
+        <w:rPr>
+          <w:rFonts w:ascii="arial" w:hAnsi="arial" w:eastAsia="arial"/>
+          <w:color w:val="000000"/>
+          <w:sz w:val="16"/>
+          <w:szCs w:val="16"/>
+        </w:rPr>
+      </w:pPr>
+      <w:r>
+        <w:rPr>
+          <w:rFonts w:eastAsia="arial" w:ascii="arial" w:hAnsi="arial"/>
+          <w:color w:val="000000"/>
+          <w:sz w:val="16"/>
+          <w:szCs w:val="16"/>
+        </w:rPr>
+      </w:r>
+    </w:p>
+    <w:p>
+      <w:pPr>
+        <w:pStyle w:val="Normal"/>
+        <w:rPr>
+          <w:rFonts w:ascii="arial" w:hAnsi="arial" w:eastAsia="arial"/>
+          <w:color w:val="000000"/>
+          <w:sz w:val="16"/>
+          <w:szCs w:val="16"/>
+        </w:rPr>
+      </w:pPr>
+      <w:r>
+        <w:rPr>
+          <w:rFonts w:eastAsia="arial" w:ascii="arial" w:hAnsi="arial"/>
+          <w:color w:val="000000"/>
+          <w:sz w:val="16"/>
+          <w:szCs w:val="16"/>
+        </w:rPr>
+      </w:r>
+    </w:p>
+    <w:p>
+      <w:pPr>
+        <w:pStyle w:val="Normal"/>
+        <w:rPr>
+          <w:rFonts w:ascii="arial" w:hAnsi="arial" w:eastAsia="arial"/>
+          <w:color w:val="000000"/>
+          <w:sz w:val="16"/>
+          <w:szCs w:val="16"/>
+        </w:rPr>
+      </w:pPr>
+      <w:r>
+        <w:rPr>
+          <w:rFonts w:eastAsia="arial" w:ascii="arial" w:hAnsi="arial"/>
+          <w:color w:val="000000"/>
+          <w:sz w:val="16"/>
+          <w:szCs w:val="16"/>
+        </w:rPr>
+      </w:r>
+    </w:p>
+    <w:p>
+      <w:pPr>
+        <w:pStyle w:val="Normal"/>
+        <w:rPr>
+          <w:color w:val="000000"/>
+          <w:sz w:val="16"/>
+          <w:szCs w:val="16"/>
+        </w:rPr>
+      </w:pPr>
+      <w:r>
+        <w:rPr>
+          <w:rFonts w:eastAsia="arial" w:ascii="arial" w:hAnsi="arial"/>
+          <w:color w:val="000000"/>
+          <w:sz w:val="16"/>
+          <w:szCs w:val="16"/>
+        </w:rPr>
+        <w:tab/>
+        <w:t xml:space="preserve">           Class 3</w:t>
+      </w:r>
+      <w:r>
+        <w:rPr>
+          <w:rFonts w:eastAsia="arial" w:ascii="arial" w:hAnsi="arial"/>
+          <w:color w:val="000000"/>
+          <w:sz w:val="16"/>
+          <w:szCs w:val="16"/>
+        </w:rPr>
+        <w:t>80</w:t>
+      </w:r>
+      <w:r>
+        <w:rPr>
+          <w:rFonts w:eastAsia="arial" w:ascii="arial" w:hAnsi="arial"/>
+          <w:color w:val="000000"/>
+          <w:sz w:val="16"/>
+          <w:szCs w:val="16"/>
+        </w:rPr>
+        <w:t>-2</w:t>
+      </w:r>
+    </w:p>
+    <w:tbl>
+      <w:tblPr>
+        <w:tblW w:w="14248" w:type="dxa"/>
+        <w:jc w:val="left"/>
+        <w:tblInd w:w="-5" w:type="dxa"/>
+        <w:tblLayout w:type="fixed"/>
+        <w:tblCellMar>
+          <w:top w:w="0" w:type="dxa"/>
+          <w:left w:w="108" w:type="dxa"/>
+          <w:bottom w:w="0" w:type="dxa"/>
+          <w:right w:w="108" w:type="dxa"/>
+        </w:tblCellMar>
+        <w:tblLook w:firstRow="1" w:noVBand="1" w:lastRow="0" w:firstColumn="1" w:lastColumn="0" w:noHBand="0" w:val="04a0"/>
+      </w:tblPr>
+      <w:tblGrid>
+        <w:gridCol w:w="1017"/>
+        <w:gridCol w:w="1019"/>
+        <w:gridCol w:w="1014"/>
+        <w:gridCol w:w="1016"/>
+        <w:gridCol w:w="1020"/>
+        <w:gridCol w:w="1016"/>
+        <w:gridCol w:w="1016"/>
+        <w:gridCol w:w="1017"/>
+        <w:gridCol w:w="1016"/>
+        <w:gridCol w:w="1020"/>
+        <w:gridCol w:w="1016"/>
+        <w:gridCol w:w="1016"/>
+        <w:gridCol w:w="1016"/>
+        <w:gridCol w:w="1029"/>
+      </w:tblGrid>
+      <w:tr>
+        <w:trPr>
+          <w:trHeight w:val="440" w:hRule="exact"/>
+          <w:cantSplit w:val="true"/>
+        </w:trPr>
+        <w:tc>
+          <w:tcPr>
+            <w:tcW w:w="1017" w:type="dxa"/>
+            <w:tcBorders>
+              <w:top w:val="single" w:sz="4" w:space="0" w:color="000000"/>
+              <w:left w:val="single" w:sz="4" w:space="0" w:color="000000"/>
+              <w:bottom w:val="single" w:sz="4" w:space="0" w:color="000000"/>
+            </w:tcBorders>
+            <w:vAlign w:val="bottom"/>
+          </w:tcPr>
+          <w:p>
+            <w:pPr>
+              <w:pStyle w:val="Normal"/>
+              <w:widowControl w:val="false"/>
+              <w:spacing w:lineRule="auto" w:line="180" w:before="0" w:after="60"/>
+              <w:jc w:val="center"/>
+              <w:rPr>
+                <w:b/>
+                <w:bCs/>
+              </w:rPr>
+            </w:pPr>
+            <w:r>
+              <w:rPr>
+                <w:b/>
+                <w:bCs/>
+                <w:color w:val="000000"/>
+                <w:sz w:val="16"/>
+                <w:szCs w:val="16"/>
+              </w:rPr>
+              <w:t>HUD</w:t>
+            </w:r>
+          </w:p>
+        </w:tc>
+        <w:tc>
+          <w:tcPr>
+            <w:tcW w:w="1019" w:type="dxa"/>
+            <w:tcBorders>
+              <w:top w:val="single" w:sz="4" w:space="0" w:color="000000"/>
+              <w:left w:val="single" w:sz="4" w:space="0" w:color="000000"/>
+              <w:bottom w:val="single" w:sz="4" w:space="0" w:color="000000"/>
+            </w:tcBorders>
+            <w:vAlign w:val="bottom"/>
+          </w:tcPr>
+          <w:p>
+            <w:pPr>
+              <w:pStyle w:val="Normal"/>
+              <w:widowControl w:val="false"/>
+              <w:spacing w:lineRule="auto" w:line="180"/>
+              <w:jc w:val="center"/>
+              <w:rPr>
+                <w:color w:val="000000"/>
+                <w:sz w:val="16"/>
+                <w:szCs w:val="16"/>
+              </w:rPr>
+            </w:pPr>
+            <w:r>
+              <w:rPr>
+                <w:color w:val="000000"/>
+                <w:sz w:val="16"/>
+                <w:szCs w:val="16"/>
+              </w:rPr>
+              <w:t>Schedule</w:t>
+            </w:r>
+          </w:p>
+        </w:tc>
+        <w:tc>
+          <w:tcPr>
+            <w:tcW w:w="1014" w:type="dxa"/>
+            <w:tcBorders>
+              <w:top w:val="single" w:sz="4" w:space="0" w:color="000000"/>
+              <w:left w:val="single" w:sz="4" w:space="0" w:color="000000"/>
+              <w:bottom w:val="single" w:sz="4" w:space="0" w:color="000000"/>
+            </w:tcBorders>
+            <w:vAlign w:val="bottom"/>
+          </w:tcPr>
+          <w:p>
+            <w:pPr>
+              <w:pStyle w:val="Normal"/>
+              <w:widowControl w:val="false"/>
+              <w:spacing w:lineRule="auto" w:line="180"/>
+              <w:jc w:val="center"/>
+              <w:rPr>
+                <w:color w:val="000000"/>
+                <w:sz w:val="16"/>
+                <w:szCs w:val="16"/>
+              </w:rPr>
+            </w:pPr>
+            <w:r>
+              <w:rPr/>
+            </w:r>
+          </w:p>
+        </w:tc>
+        <w:tc>
+          <w:tcPr>
+            <w:tcW w:w="1016" w:type="dxa"/>
+            <w:tcBorders>
+              <w:top w:val="single" w:sz="4" w:space="0" w:color="000000"/>
+              <w:left w:val="single" w:sz="4" w:space="0" w:color="000000"/>
+              <w:bottom w:val="single" w:sz="4" w:space="0" w:color="000000"/>
+            </w:tcBorders>
+            <w:vAlign w:val="bottom"/>
+          </w:tcPr>
+          <w:p>
+            <w:pPr>
+              <w:pStyle w:val="Normal"/>
+              <w:widowControl w:val="false"/>
+              <w:spacing w:lineRule="auto" w:line="180"/>
+              <w:jc w:val="center"/>
+              <w:rPr>
+                <w:color w:val="000000"/>
+                <w:sz w:val="16"/>
+                <w:szCs w:val="16"/>
+              </w:rPr>
+            </w:pPr>
+            <w:r>
+              <w:rPr>
+                <w:color w:val="000000"/>
+                <w:sz w:val="16"/>
+                <w:szCs w:val="16"/>
+              </w:rPr>
+              <w:t>DSD/Vigilance</w:t>
+            </w:r>
+          </w:p>
+        </w:tc>
+        <w:tc>
+          <w:tcPr>
+            <w:tcW w:w="1020" w:type="dxa"/>
+            <w:tcBorders>
+              <w:top w:val="single" w:sz="4" w:space="0" w:color="000000"/>
+              <w:left w:val="single" w:sz="4" w:space="0" w:color="000000"/>
+              <w:bottom w:val="single" w:sz="4" w:space="0" w:color="000000"/>
+            </w:tcBorders>
+            <w:vAlign w:val="bottom"/>
+          </w:tcPr>
+          <w:p>
+            <w:pPr>
+              <w:pStyle w:val="Normal"/>
+              <w:widowControl w:val="false"/>
+              <w:spacing w:lineRule="auto" w:line="180"/>
+              <w:jc w:val="center"/>
+              <w:rPr>
+                <w:color w:val="000000"/>
+                <w:sz w:val="16"/>
+                <w:szCs w:val="16"/>
+              </w:rPr>
+            </w:pPr>
+            <w:r>
+              <w:rPr>
+                <w:color w:val="000000"/>
+                <w:sz w:val="16"/>
+                <w:szCs w:val="16"/>
+              </w:rPr>
+              <w:t>Panto. L</w:t>
+            </w:r>
+            <w:r>
+              <w:rPr>
+                <w:color w:val="000000"/>
+                <w:sz w:val="16"/>
+                <w:szCs w:val="16"/>
+              </w:rPr>
+              <w:t>ow</w:t>
+            </w:r>
+          </w:p>
+        </w:tc>
+        <w:tc>
+          <w:tcPr>
+            <w:tcW w:w="1016" w:type="dxa"/>
+            <w:tcBorders>
+              <w:top w:val="single" w:sz="4" w:space="0" w:color="000000"/>
+              <w:left w:val="single" w:sz="4" w:space="0" w:color="000000"/>
+              <w:bottom w:val="single" w:sz="4" w:space="0" w:color="000000"/>
+            </w:tcBorders>
+            <w:vAlign w:val="bottom"/>
+          </w:tcPr>
+          <w:p>
+            <w:pPr>
+              <w:pStyle w:val="Normal"/>
+              <w:widowControl w:val="false"/>
+              <w:spacing w:lineRule="auto" w:line="180"/>
+              <w:jc w:val="center"/>
+              <w:rPr>
+                <w:sz w:val="16"/>
+                <w:szCs w:val="16"/>
+              </w:rPr>
+            </w:pPr>
+            <w:r>
+              <w:rPr/>
+            </w:r>
+          </w:p>
+        </w:tc>
+        <w:tc>
+          <w:tcPr>
+            <w:tcW w:w="1016" w:type="dxa"/>
+            <w:tcBorders>
+              <w:top w:val="single" w:sz="4" w:space="0" w:color="000000"/>
+              <w:left w:val="single" w:sz="4" w:space="0" w:color="000000"/>
+              <w:bottom w:val="single" w:sz="4" w:space="0" w:color="000000"/>
+            </w:tcBorders>
+            <w:vAlign w:val="bottom"/>
+          </w:tcPr>
+          <w:p>
+            <w:pPr>
+              <w:pStyle w:val="Normal"/>
+              <w:widowControl w:val="false"/>
+              <w:jc w:val="center"/>
+              <w:rPr>
+                <w:color w:val="000000"/>
+                <w:sz w:val="16"/>
+                <w:szCs w:val="16"/>
+              </w:rPr>
+            </w:pPr>
+            <w:r>
+              <w:rPr>
+                <w:color w:val="000000"/>
+                <w:sz w:val="16"/>
+                <w:szCs w:val="16"/>
+              </w:rPr>
+            </w:r>
+          </w:p>
+        </w:tc>
+        <w:tc>
+          <w:tcPr>
+            <w:tcW w:w="1017" w:type="dxa"/>
+            <w:tcBorders>
+              <w:top w:val="single" w:sz="4" w:space="0" w:color="000000"/>
+              <w:left w:val="single" w:sz="4" w:space="0" w:color="000000"/>
+              <w:bottom w:val="single" w:sz="4" w:space="0" w:color="000000"/>
+            </w:tcBorders>
+            <w:vAlign w:val="bottom"/>
+          </w:tcPr>
+          <w:p>
+            <w:pPr>
+              <w:pStyle w:val="Normal"/>
+              <w:widowControl w:val="false"/>
+              <w:jc w:val="center"/>
+              <w:rPr>
+                <w:color w:val="000000"/>
+                <w:sz w:val="16"/>
+                <w:szCs w:val="16"/>
+              </w:rPr>
+            </w:pPr>
+            <w:r>
+              <w:rPr/>
+            </w:r>
+          </w:p>
+        </w:tc>
+        <w:tc>
+          <w:tcPr>
+            <w:tcW w:w="1016" w:type="dxa"/>
+            <w:tcBorders>
+              <w:top w:val="single" w:sz="4" w:space="0" w:color="000000"/>
+              <w:left w:val="single" w:sz="4" w:space="0" w:color="000000"/>
+              <w:bottom w:val="single" w:sz="4" w:space="0" w:color="000000"/>
+            </w:tcBorders>
+            <w:vAlign w:val="bottom"/>
+          </w:tcPr>
+          <w:p>
+            <w:pPr>
+              <w:pStyle w:val="Normal"/>
+              <w:widowControl w:val="false"/>
+              <w:jc w:val="center"/>
+              <w:rPr>
+                <w:sz w:val="16"/>
+                <w:szCs w:val="16"/>
+              </w:rPr>
+            </w:pPr>
+            <w:r>
+              <w:rPr>
+                <w:sz w:val="16"/>
+                <w:szCs w:val="16"/>
+              </w:rPr>
+              <w:t>Gangway Retract</w:t>
+            </w:r>
+          </w:p>
+        </w:tc>
+        <w:tc>
+          <w:tcPr>
+            <w:tcW w:w="1020" w:type="dxa"/>
+            <w:tcBorders>
+              <w:top w:val="single" w:sz="4" w:space="0" w:color="000000"/>
+              <w:left w:val="single" w:sz="4" w:space="0" w:color="000000"/>
+              <w:bottom w:val="single" w:sz="4" w:space="0" w:color="000000"/>
+            </w:tcBorders>
+            <w:vAlign w:val="bottom"/>
+          </w:tcPr>
+          <w:p>
+            <w:pPr>
+              <w:pStyle w:val="Normal"/>
+              <w:widowControl w:val="false"/>
+              <w:jc w:val="center"/>
+              <w:rPr>
+                <w:rFonts w:ascii="arial" w:hAnsi="arial" w:eastAsia="arial"/>
+                <w:color w:val="000000"/>
+                <w:sz w:val="16"/>
+                <w:szCs w:val="16"/>
+              </w:rPr>
+            </w:pPr>
+            <w:r>
+              <w:rPr/>
+            </w:r>
+          </w:p>
+        </w:tc>
+        <w:tc>
+          <w:tcPr>
+            <w:tcW w:w="1016" w:type="dxa"/>
+            <w:tcBorders>
+              <w:top w:val="single" w:sz="4" w:space="0" w:color="000000"/>
+              <w:left w:val="single" w:sz="4" w:space="0" w:color="000000"/>
+              <w:bottom w:val="single" w:sz="4" w:space="0" w:color="000000"/>
+            </w:tcBorders>
+            <w:vAlign w:val="bottom"/>
+          </w:tcPr>
+          <w:p>
+            <w:pPr>
+              <w:pStyle w:val="Normal"/>
+              <w:widowControl w:val="false"/>
+              <w:jc w:val="center"/>
+              <w:rPr>
+                <w:color w:val="000000"/>
+                <w:sz w:val="16"/>
+                <w:szCs w:val="16"/>
+              </w:rPr>
+            </w:pPr>
+            <w:r>
+              <w:rPr/>
+            </w:r>
+          </w:p>
+        </w:tc>
+        <w:tc>
+          <w:tcPr>
+            <w:tcW w:w="1016" w:type="dxa"/>
+            <w:tcBorders>
+              <w:top w:val="single" w:sz="4" w:space="0" w:color="000000"/>
+              <w:left w:val="single" w:sz="4" w:space="0" w:color="000000"/>
+              <w:bottom w:val="single" w:sz="4" w:space="0" w:color="000000"/>
+            </w:tcBorders>
+            <w:vAlign w:val="bottom"/>
+          </w:tcPr>
+          <w:p>
+            <w:pPr>
+              <w:pStyle w:val="Normal"/>
+              <w:widowControl w:val="false"/>
+              <w:spacing w:lineRule="auto" w:line="180"/>
+              <w:jc w:val="center"/>
+              <w:rPr>
+                <w:sz w:val="16"/>
+                <w:szCs w:val="16"/>
+              </w:rPr>
+            </w:pPr>
+            <w:r>
+              <w:rPr/>
             </w:r>
           </w:p>
         </w:tc>
@@ -34354,12 +36623,12 @@
       <w:rFonts w:ascii="Symbol" w:hAnsi="Symbol" w:cs="Symbol"/>
     </w:rPr>
   </w:style>
-  <w:style w:type="character" w:styleId="user" w:customStyle="1">
-    <w:name w:val="번호 매기기 기호 (user)"/>
+  <w:style w:type="character" w:styleId="Style5" w:customStyle="1">
+    <w:name w:val="번호 매기기 기호"/>
     <w:qFormat/>
     <w:rPr/>
   </w:style>
-  <w:style w:type="paragraph" w:styleId="Style5">
+  <w:style w:type="paragraph" w:styleId="Style6">
     <w:name w:val="제목"/>
     <w:basedOn w:val="Normal"/>
     <w:next w:val="BodyText"/>
@@ -34369,7 +36638,7 @@
       <w:spacing w:before="240" w:after="120"/>
     </w:pPr>
     <w:rPr>
-      <w:rFonts w:ascii="Liberation Sans" w:hAnsi="Liberation Sans" w:eastAsia="Noto Sans CJK KR" w:cs="Lohit Devanagari"/>
+      <w:rFonts w:ascii="Liberation Sans" w:hAnsi="Liberation Sans" w:eastAsia="나눔고딕" w:cs="Arial"/>
       <w:sz w:val="28"/>
       <w:szCs w:val="28"/>
     </w:rPr>
@@ -34406,7 +36675,7 @@
       <w:szCs w:val="24"/>
     </w:rPr>
   </w:style>
-  <w:style w:type="paragraph" w:styleId="Style6" w:customStyle="1">
+  <w:style w:type="paragraph" w:styleId="Style7">
     <w:name w:val="색인"/>
     <w:basedOn w:val="Normal"/>
     <w:qFormat/>
@@ -34414,10 +36683,11 @@
       <w:suppressLineNumbers/>
     </w:pPr>
     <w:rPr>
-      <w:rFonts w:cs="Lohit Devanagari"/>
+      <w:rFonts w:cs="Arial"/>
+      <w:sz w:val="24"/>
     </w:rPr>
   </w:style>
-  <w:style w:type="paragraph" w:styleId="user1">
+  <w:style w:type="paragraph" w:styleId="user">
     <w:name w:val="제목 (user)"/>
     <w:basedOn w:val="Normal"/>
     <w:next w:val="BodyText"/>
@@ -34427,12 +36697,12 @@
       <w:spacing w:before="240" w:after="120"/>
     </w:pPr>
     <w:rPr>
-      <w:rFonts w:ascii="Liberation Sans" w:hAnsi="Liberation Sans" w:eastAsia="나눔고딕" w:cs="Arial"/>
+      <w:rFonts w:ascii="Liberation Sans" w:hAnsi="Liberation Sans" w:eastAsia="Noto Sans CJK KR" w:cs="Lohit Devanagari"/>
       <w:sz w:val="28"/>
       <w:szCs w:val="28"/>
     </w:rPr>
   </w:style>
-  <w:style w:type="paragraph" w:styleId="user2">
+  <w:style w:type="paragraph" w:styleId="user1" w:customStyle="1">
     <w:name w:val="색인 (user)"/>
     <w:basedOn w:val="Normal"/>
     <w:qFormat/>
@@ -34440,8 +36710,7 @@
       <w:suppressLineNumbers/>
     </w:pPr>
     <w:rPr>
-      <w:rFonts w:cs="Arial"/>
-      <w:sz w:val="24"/>
+      <w:rFonts w:cs="Lohit Devanagari"/>
     </w:rPr>
   </w:style>
   <w:style w:type="paragraph" w:styleId="Title">
@@ -35123,8 +37392,8 @@
       <w:szCs w:val="24"/>
     </w:rPr>
   </w:style>
-  <w:style w:type="paragraph" w:styleId="Style7" w:customStyle="1">
-    <w:name w:val="표 내용"/>
+  <w:style w:type="paragraph" w:styleId="user2" w:customStyle="1">
+    <w:name w:val="표 내용 (user)"/>
     <w:basedOn w:val="Normal"/>
     <w:qFormat/>
     <w:pPr>
@@ -35132,9 +37401,9 @@
     </w:pPr>
     <w:rPr/>
   </w:style>
-  <w:style w:type="paragraph" w:styleId="Style8" w:customStyle="1">
-    <w:name w:val="표제목"/>
-    <w:basedOn w:val="Style7"/>
+  <w:style w:type="paragraph" w:styleId="user3" w:customStyle="1">
+    <w:name w:val="표제목 (user)"/>
+    <w:basedOn w:val="user2"/>
     <w:qFormat/>
     <w:pPr>
       <w:jc w:val="center"/>
@@ -35144,8 +37413,8 @@
       <w:bCs/>
     </w:rPr>
   </w:style>
-  <w:style w:type="paragraph" w:styleId="user3">
-    <w:name w:val="표 내용 (user)"/>
+  <w:style w:type="paragraph" w:styleId="Style8">
+    <w:name w:val="표 내용"/>
     <w:basedOn w:val="Normal"/>
     <w:qFormat/>
     <w:pPr>
@@ -35154,9 +37423,9 @@
     </w:pPr>
     <w:rPr/>
   </w:style>
-  <w:style w:type="paragraph" w:styleId="user4">
-    <w:name w:val="표제목 (user)"/>
-    <w:basedOn w:val="user3"/>
+  <w:style w:type="paragraph" w:styleId="Style9">
+    <w:name w:val="표제목"/>
+    <w:basedOn w:val="Style8"/>
     <w:qFormat/>
     <w:pPr>
       <w:suppressLineNumbers/>

</xml_diff>

<commit_message>
Add Class 385 and 387
</commit_message>
<xml_diff>
--- a/raildriver-UK-Remapped.docx
+++ b/raildriver-UK-Remapped.docx
@@ -33350,25 +33350,7 @@
           <w:szCs w:val="16"/>
         </w:rPr>
         <w:tab/>
-        <w:t xml:space="preserve">           Class 37</w:t>
-      </w:r>
-      <w:r>
-        <w:rPr>
-          <w:rFonts w:eastAsia="arial" w:ascii="arial" w:hAnsi="arial"/>
-          <w:color w:val="000000"/>
-          <w:sz w:val="16"/>
-          <w:szCs w:val="16"/>
-        </w:rPr>
-        <w:t>8</w:t>
-      </w:r>
-      <w:r>
-        <w:rPr>
-          <w:rFonts w:eastAsia="arial" w:ascii="arial" w:hAnsi="arial"/>
-          <w:color w:val="000000"/>
-          <w:sz w:val="16"/>
-          <w:szCs w:val="16"/>
-        </w:rPr>
-        <w:t>-1</w:t>
+        <w:t xml:space="preserve">           Class 378-1</w:t>
       </w:r>
     </w:p>
     <w:tbl>
@@ -33651,32 +33633,39 @@
               </w:rPr>
             </w:pPr>
             <w:r>
-              <w:rPr/>
-            </w:r>
-          </w:p>
-        </w:tc>
-        <w:tc>
-          <w:tcPr>
-            <w:tcW w:w="1016" w:type="dxa"/>
-            <w:tcBorders>
-              <w:top w:val="single" w:sz="4" w:space="0" w:color="000000"/>
-              <w:left w:val="single" w:sz="4" w:space="0" w:color="000000"/>
-              <w:bottom w:val="single" w:sz="4" w:space="0" w:color="000000"/>
-            </w:tcBorders>
-            <w:vAlign w:val="bottom"/>
-          </w:tcPr>
-          <w:p>
-            <w:pPr>
-              <w:pStyle w:val="Normal"/>
-              <w:widowControl w:val="false"/>
-              <w:jc w:val="center"/>
-              <w:rPr>
-                <w:sz w:val="16"/>
-                <w:szCs w:val="16"/>
-              </w:rPr>
-            </w:pPr>
-            <w:r>
-              <w:rPr/>
+              <w:rPr>
+                <w:color w:val="000000"/>
+                <w:sz w:val="16"/>
+                <w:szCs w:val="16"/>
+              </w:rPr>
+            </w:r>
+          </w:p>
+        </w:tc>
+        <w:tc>
+          <w:tcPr>
+            <w:tcW w:w="1016" w:type="dxa"/>
+            <w:tcBorders>
+              <w:top w:val="single" w:sz="4" w:space="0" w:color="000000"/>
+              <w:left w:val="single" w:sz="4" w:space="0" w:color="000000"/>
+              <w:bottom w:val="single" w:sz="4" w:space="0" w:color="000000"/>
+            </w:tcBorders>
+            <w:vAlign w:val="bottom"/>
+          </w:tcPr>
+          <w:p>
+            <w:pPr>
+              <w:pStyle w:val="Normal"/>
+              <w:widowControl w:val="false"/>
+              <w:jc w:val="center"/>
+              <w:rPr>
+                <w:sz w:val="16"/>
+                <w:szCs w:val="16"/>
+              </w:rPr>
+            </w:pPr>
+            <w:r>
+              <w:rPr>
+                <w:sz w:val="16"/>
+                <w:szCs w:val="16"/>
+              </w:rPr>
             </w:r>
           </w:p>
         </w:tc>
@@ -33898,25 +33887,7 @@
           <w:szCs w:val="16"/>
         </w:rPr>
         <w:tab/>
-        <w:t xml:space="preserve">           Class 37</w:t>
-      </w:r>
-      <w:r>
-        <w:rPr>
-          <w:rFonts w:eastAsia="arial" w:ascii="arial" w:hAnsi="arial"/>
-          <w:color w:val="000000"/>
-          <w:sz w:val="16"/>
-          <w:szCs w:val="16"/>
-        </w:rPr>
-        <w:t>8</w:t>
-      </w:r>
-      <w:r>
-        <w:rPr>
-          <w:rFonts w:eastAsia="arial" w:ascii="arial" w:hAnsi="arial"/>
-          <w:color w:val="000000"/>
-          <w:sz w:val="16"/>
-          <w:szCs w:val="16"/>
-        </w:rPr>
-        <w:t>-2</w:t>
+        <w:t xml:space="preserve">           Class 378-2</w:t>
       </w:r>
     </w:p>
     <w:tbl>
@@ -34198,7 +34169,11 @@
               </w:rPr>
             </w:pPr>
             <w:r>
-              <w:rPr/>
+              <w:rPr>
+                <w:color w:val="000000"/>
+                <w:sz w:val="16"/>
+                <w:szCs w:val="16"/>
+              </w:rPr>
             </w:r>
           </w:p>
         </w:tc>
@@ -34467,25 +34442,7 @@
           <w:szCs w:val="16"/>
         </w:rPr>
         <w:tab/>
-        <w:t xml:space="preserve">           Class 3</w:t>
-      </w:r>
-      <w:r>
-        <w:rPr>
-          <w:rFonts w:eastAsia="arial" w:ascii="arial" w:hAnsi="arial"/>
-          <w:color w:val="000000"/>
-          <w:sz w:val="16"/>
-          <w:szCs w:val="16"/>
-        </w:rPr>
-        <w:t>80</w:t>
-      </w:r>
-      <w:r>
-        <w:rPr>
-          <w:rFonts w:eastAsia="arial" w:ascii="arial" w:hAnsi="arial"/>
-          <w:color w:val="000000"/>
-          <w:sz w:val="16"/>
-          <w:szCs w:val="16"/>
-        </w:rPr>
-        <w:t>-1</w:t>
+        <w:t xml:space="preserve">           Class 380-1</w:t>
       </w:r>
     </w:p>
     <w:tbl>
@@ -34612,7 +34569,11 @@
               </w:rPr>
             </w:pPr>
             <w:r>
-              <w:rPr/>
+              <w:rPr>
+                <w:color w:val="000000"/>
+                <w:sz w:val="16"/>
+                <w:szCs w:val="16"/>
+              </w:rPr>
             </w:r>
           </w:p>
         </w:tc>
@@ -34763,7 +34724,11 @@
               </w:rPr>
             </w:pPr>
             <w:r>
-              <w:rPr/>
+              <w:rPr>
+                <w:color w:val="000000"/>
+                <w:sz w:val="16"/>
+                <w:szCs w:val="16"/>
+              </w:rPr>
             </w:r>
           </w:p>
         </w:tc>
@@ -34881,7 +34846,11 @@
               </w:rPr>
             </w:pPr>
             <w:r>
-              <w:rPr/>
+              <w:rPr>
+                <w:color w:val="000000"/>
+                <w:sz w:val="16"/>
+                <w:szCs w:val="16"/>
+              </w:rPr>
             </w:r>
           </w:p>
         </w:tc>
@@ -35066,7 +35035,557 @@
           <w:szCs w:val="16"/>
         </w:rPr>
         <w:tab/>
-        <w:t xml:space="preserve">           Class 3</w:t>
+        <w:t xml:space="preserve">           Class 380-2</w:t>
+      </w:r>
+    </w:p>
+    <w:tbl>
+      <w:tblPr>
+        <w:tblW w:w="14248" w:type="dxa"/>
+        <w:jc w:val="left"/>
+        <w:tblInd w:w="-5" w:type="dxa"/>
+        <w:tblLayout w:type="fixed"/>
+        <w:tblCellMar>
+          <w:top w:w="0" w:type="dxa"/>
+          <w:left w:w="108" w:type="dxa"/>
+          <w:bottom w:w="0" w:type="dxa"/>
+          <w:right w:w="108" w:type="dxa"/>
+        </w:tblCellMar>
+        <w:tblLook w:firstRow="1" w:noVBand="1" w:lastRow="0" w:firstColumn="1" w:lastColumn="0" w:noHBand="0" w:val="04a0"/>
+      </w:tblPr>
+      <w:tblGrid>
+        <w:gridCol w:w="1017"/>
+        <w:gridCol w:w="1019"/>
+        <w:gridCol w:w="1014"/>
+        <w:gridCol w:w="1016"/>
+        <w:gridCol w:w="1020"/>
+        <w:gridCol w:w="1016"/>
+        <w:gridCol w:w="1016"/>
+        <w:gridCol w:w="1017"/>
+        <w:gridCol w:w="1016"/>
+        <w:gridCol w:w="1020"/>
+        <w:gridCol w:w="1016"/>
+        <w:gridCol w:w="1016"/>
+        <w:gridCol w:w="1016"/>
+        <w:gridCol w:w="1029"/>
+      </w:tblGrid>
+      <w:tr>
+        <w:trPr>
+          <w:trHeight w:val="440" w:hRule="exact"/>
+          <w:cantSplit w:val="true"/>
+        </w:trPr>
+        <w:tc>
+          <w:tcPr>
+            <w:tcW w:w="1017" w:type="dxa"/>
+            <w:tcBorders>
+              <w:top w:val="single" w:sz="4" w:space="0" w:color="000000"/>
+              <w:left w:val="single" w:sz="4" w:space="0" w:color="000000"/>
+              <w:bottom w:val="single" w:sz="4" w:space="0" w:color="000000"/>
+            </w:tcBorders>
+            <w:vAlign w:val="bottom"/>
+          </w:tcPr>
+          <w:p>
+            <w:pPr>
+              <w:pStyle w:val="Normal"/>
+              <w:widowControl w:val="false"/>
+              <w:spacing w:lineRule="auto" w:line="180" w:before="0" w:after="60"/>
+              <w:jc w:val="center"/>
+              <w:rPr>
+                <w:b/>
+                <w:bCs/>
+              </w:rPr>
+            </w:pPr>
+            <w:r>
+              <w:rPr>
+                <w:b/>
+                <w:bCs/>
+                <w:color w:val="000000"/>
+                <w:sz w:val="16"/>
+                <w:szCs w:val="16"/>
+              </w:rPr>
+              <w:t>HUD</w:t>
+            </w:r>
+          </w:p>
+        </w:tc>
+        <w:tc>
+          <w:tcPr>
+            <w:tcW w:w="1019" w:type="dxa"/>
+            <w:tcBorders>
+              <w:top w:val="single" w:sz="4" w:space="0" w:color="000000"/>
+              <w:left w:val="single" w:sz="4" w:space="0" w:color="000000"/>
+              <w:bottom w:val="single" w:sz="4" w:space="0" w:color="000000"/>
+            </w:tcBorders>
+            <w:vAlign w:val="bottom"/>
+          </w:tcPr>
+          <w:p>
+            <w:pPr>
+              <w:pStyle w:val="Normal"/>
+              <w:widowControl w:val="false"/>
+              <w:spacing w:lineRule="auto" w:line="180"/>
+              <w:jc w:val="center"/>
+              <w:rPr>
+                <w:color w:val="000000"/>
+                <w:sz w:val="16"/>
+                <w:szCs w:val="16"/>
+              </w:rPr>
+            </w:pPr>
+            <w:r>
+              <w:rPr>
+                <w:color w:val="000000"/>
+                <w:sz w:val="16"/>
+                <w:szCs w:val="16"/>
+              </w:rPr>
+              <w:t>Schedule</w:t>
+            </w:r>
+          </w:p>
+        </w:tc>
+        <w:tc>
+          <w:tcPr>
+            <w:tcW w:w="1014" w:type="dxa"/>
+            <w:tcBorders>
+              <w:top w:val="single" w:sz="4" w:space="0" w:color="000000"/>
+              <w:left w:val="single" w:sz="4" w:space="0" w:color="000000"/>
+              <w:bottom w:val="single" w:sz="4" w:space="0" w:color="000000"/>
+            </w:tcBorders>
+            <w:vAlign w:val="bottom"/>
+          </w:tcPr>
+          <w:p>
+            <w:pPr>
+              <w:pStyle w:val="Normal"/>
+              <w:widowControl w:val="false"/>
+              <w:spacing w:lineRule="auto" w:line="180"/>
+              <w:jc w:val="center"/>
+              <w:rPr>
+                <w:color w:val="000000"/>
+                <w:sz w:val="16"/>
+                <w:szCs w:val="16"/>
+              </w:rPr>
+            </w:pPr>
+            <w:r>
+              <w:rPr>
+                <w:color w:val="000000"/>
+                <w:sz w:val="16"/>
+                <w:szCs w:val="16"/>
+              </w:rPr>
+            </w:r>
+          </w:p>
+        </w:tc>
+        <w:tc>
+          <w:tcPr>
+            <w:tcW w:w="1016" w:type="dxa"/>
+            <w:tcBorders>
+              <w:top w:val="single" w:sz="4" w:space="0" w:color="000000"/>
+              <w:left w:val="single" w:sz="4" w:space="0" w:color="000000"/>
+              <w:bottom w:val="single" w:sz="4" w:space="0" w:color="000000"/>
+            </w:tcBorders>
+            <w:vAlign w:val="bottom"/>
+          </w:tcPr>
+          <w:p>
+            <w:pPr>
+              <w:pStyle w:val="Normal"/>
+              <w:widowControl w:val="false"/>
+              <w:spacing w:lineRule="auto" w:line="180"/>
+              <w:jc w:val="center"/>
+              <w:rPr>
+                <w:color w:val="000000"/>
+                <w:sz w:val="16"/>
+                <w:szCs w:val="16"/>
+              </w:rPr>
+            </w:pPr>
+            <w:r>
+              <w:rPr>
+                <w:color w:val="000000"/>
+                <w:sz w:val="16"/>
+                <w:szCs w:val="16"/>
+              </w:rPr>
+              <w:t>DSD/Vigilance</w:t>
+            </w:r>
+          </w:p>
+        </w:tc>
+        <w:tc>
+          <w:tcPr>
+            <w:tcW w:w="1020" w:type="dxa"/>
+            <w:tcBorders>
+              <w:top w:val="single" w:sz="4" w:space="0" w:color="000000"/>
+              <w:left w:val="single" w:sz="4" w:space="0" w:color="000000"/>
+              <w:bottom w:val="single" w:sz="4" w:space="0" w:color="000000"/>
+            </w:tcBorders>
+            <w:vAlign w:val="bottom"/>
+          </w:tcPr>
+          <w:p>
+            <w:pPr>
+              <w:pStyle w:val="Normal"/>
+              <w:widowControl w:val="false"/>
+              <w:spacing w:lineRule="auto" w:line="180"/>
+              <w:jc w:val="center"/>
+              <w:rPr>
+                <w:color w:val="000000"/>
+                <w:sz w:val="16"/>
+                <w:szCs w:val="16"/>
+              </w:rPr>
+            </w:pPr>
+            <w:r>
+              <w:rPr>
+                <w:color w:val="000000"/>
+                <w:sz w:val="16"/>
+                <w:szCs w:val="16"/>
+              </w:rPr>
+              <w:t>Panto. Low</w:t>
+            </w:r>
+          </w:p>
+        </w:tc>
+        <w:tc>
+          <w:tcPr>
+            <w:tcW w:w="1016" w:type="dxa"/>
+            <w:tcBorders>
+              <w:top w:val="single" w:sz="4" w:space="0" w:color="000000"/>
+              <w:left w:val="single" w:sz="4" w:space="0" w:color="000000"/>
+              <w:bottom w:val="single" w:sz="4" w:space="0" w:color="000000"/>
+            </w:tcBorders>
+            <w:vAlign w:val="bottom"/>
+          </w:tcPr>
+          <w:p>
+            <w:pPr>
+              <w:pStyle w:val="Normal"/>
+              <w:widowControl w:val="false"/>
+              <w:spacing w:lineRule="auto" w:line="180"/>
+              <w:jc w:val="center"/>
+              <w:rPr>
+                <w:sz w:val="16"/>
+                <w:szCs w:val="16"/>
+              </w:rPr>
+            </w:pPr>
+            <w:r>
+              <w:rPr>
+                <w:sz w:val="16"/>
+                <w:szCs w:val="16"/>
+              </w:rPr>
+            </w:r>
+          </w:p>
+        </w:tc>
+        <w:tc>
+          <w:tcPr>
+            <w:tcW w:w="1016" w:type="dxa"/>
+            <w:tcBorders>
+              <w:top w:val="single" w:sz="4" w:space="0" w:color="000000"/>
+              <w:left w:val="single" w:sz="4" w:space="0" w:color="000000"/>
+              <w:bottom w:val="single" w:sz="4" w:space="0" w:color="000000"/>
+            </w:tcBorders>
+            <w:vAlign w:val="bottom"/>
+          </w:tcPr>
+          <w:p>
+            <w:pPr>
+              <w:pStyle w:val="Normal"/>
+              <w:widowControl w:val="false"/>
+              <w:jc w:val="center"/>
+              <w:rPr>
+                <w:color w:val="000000"/>
+                <w:sz w:val="16"/>
+                <w:szCs w:val="16"/>
+              </w:rPr>
+            </w:pPr>
+            <w:r>
+              <w:rPr>
+                <w:color w:val="000000"/>
+                <w:sz w:val="16"/>
+                <w:szCs w:val="16"/>
+              </w:rPr>
+            </w:r>
+          </w:p>
+        </w:tc>
+        <w:tc>
+          <w:tcPr>
+            <w:tcW w:w="1017" w:type="dxa"/>
+            <w:tcBorders>
+              <w:top w:val="single" w:sz="4" w:space="0" w:color="000000"/>
+              <w:left w:val="single" w:sz="4" w:space="0" w:color="000000"/>
+              <w:bottom w:val="single" w:sz="4" w:space="0" w:color="000000"/>
+            </w:tcBorders>
+            <w:vAlign w:val="bottom"/>
+          </w:tcPr>
+          <w:p>
+            <w:pPr>
+              <w:pStyle w:val="Normal"/>
+              <w:widowControl w:val="false"/>
+              <w:jc w:val="center"/>
+              <w:rPr>
+                <w:color w:val="000000"/>
+                <w:sz w:val="16"/>
+                <w:szCs w:val="16"/>
+              </w:rPr>
+            </w:pPr>
+            <w:r>
+              <w:rPr>
+                <w:color w:val="000000"/>
+                <w:sz w:val="16"/>
+                <w:szCs w:val="16"/>
+              </w:rPr>
+            </w:r>
+          </w:p>
+        </w:tc>
+        <w:tc>
+          <w:tcPr>
+            <w:tcW w:w="1016" w:type="dxa"/>
+            <w:tcBorders>
+              <w:top w:val="single" w:sz="4" w:space="0" w:color="000000"/>
+              <w:left w:val="single" w:sz="4" w:space="0" w:color="000000"/>
+              <w:bottom w:val="single" w:sz="4" w:space="0" w:color="000000"/>
+            </w:tcBorders>
+            <w:vAlign w:val="bottom"/>
+          </w:tcPr>
+          <w:p>
+            <w:pPr>
+              <w:pStyle w:val="Normal"/>
+              <w:widowControl w:val="false"/>
+              <w:jc w:val="center"/>
+              <w:rPr>
+                <w:sz w:val="16"/>
+                <w:szCs w:val="16"/>
+              </w:rPr>
+            </w:pPr>
+            <w:r>
+              <w:rPr>
+                <w:sz w:val="16"/>
+                <w:szCs w:val="16"/>
+              </w:rPr>
+              <w:t>Gangway Retract</w:t>
+            </w:r>
+          </w:p>
+        </w:tc>
+        <w:tc>
+          <w:tcPr>
+            <w:tcW w:w="1020" w:type="dxa"/>
+            <w:tcBorders>
+              <w:top w:val="single" w:sz="4" w:space="0" w:color="000000"/>
+              <w:left w:val="single" w:sz="4" w:space="0" w:color="000000"/>
+              <w:bottom w:val="single" w:sz="4" w:space="0" w:color="000000"/>
+            </w:tcBorders>
+            <w:vAlign w:val="bottom"/>
+          </w:tcPr>
+          <w:p>
+            <w:pPr>
+              <w:pStyle w:val="Normal"/>
+              <w:widowControl w:val="false"/>
+              <w:jc w:val="center"/>
+              <w:rPr>
+                <w:rFonts w:ascii="arial" w:hAnsi="arial" w:eastAsia="arial"/>
+                <w:color w:val="000000"/>
+                <w:sz w:val="16"/>
+                <w:szCs w:val="16"/>
+              </w:rPr>
+            </w:pPr>
+            <w:r>
+              <w:rPr>
+                <w:rFonts w:eastAsia="arial" w:ascii="arial" w:hAnsi="arial"/>
+                <w:color w:val="000000"/>
+                <w:sz w:val="16"/>
+                <w:szCs w:val="16"/>
+              </w:rPr>
+            </w:r>
+          </w:p>
+        </w:tc>
+        <w:tc>
+          <w:tcPr>
+            <w:tcW w:w="1016" w:type="dxa"/>
+            <w:tcBorders>
+              <w:top w:val="single" w:sz="4" w:space="0" w:color="000000"/>
+              <w:left w:val="single" w:sz="4" w:space="0" w:color="000000"/>
+              <w:bottom w:val="single" w:sz="4" w:space="0" w:color="000000"/>
+            </w:tcBorders>
+            <w:vAlign w:val="bottom"/>
+          </w:tcPr>
+          <w:p>
+            <w:pPr>
+              <w:pStyle w:val="Normal"/>
+              <w:widowControl w:val="false"/>
+              <w:jc w:val="center"/>
+              <w:rPr>
+                <w:color w:val="000000"/>
+                <w:sz w:val="16"/>
+                <w:szCs w:val="16"/>
+              </w:rPr>
+            </w:pPr>
+            <w:r>
+              <w:rPr>
+                <w:color w:val="000000"/>
+                <w:sz w:val="16"/>
+                <w:szCs w:val="16"/>
+              </w:rPr>
+            </w:r>
+          </w:p>
+        </w:tc>
+        <w:tc>
+          <w:tcPr>
+            <w:tcW w:w="1016" w:type="dxa"/>
+            <w:tcBorders>
+              <w:top w:val="single" w:sz="4" w:space="0" w:color="000000"/>
+              <w:left w:val="single" w:sz="4" w:space="0" w:color="000000"/>
+              <w:bottom w:val="single" w:sz="4" w:space="0" w:color="000000"/>
+            </w:tcBorders>
+            <w:vAlign w:val="bottom"/>
+          </w:tcPr>
+          <w:p>
+            <w:pPr>
+              <w:pStyle w:val="Normal"/>
+              <w:widowControl w:val="false"/>
+              <w:spacing w:lineRule="auto" w:line="180"/>
+              <w:jc w:val="center"/>
+              <w:rPr>
+                <w:sz w:val="16"/>
+                <w:szCs w:val="16"/>
+              </w:rPr>
+            </w:pPr>
+            <w:r>
+              <w:rPr>
+                <w:sz w:val="16"/>
+                <w:szCs w:val="16"/>
+              </w:rPr>
+            </w:r>
+          </w:p>
+        </w:tc>
+        <w:tc>
+          <w:tcPr>
+            <w:tcW w:w="1016" w:type="dxa"/>
+            <w:tcBorders>
+              <w:top w:val="single" w:sz="4" w:space="0" w:color="000000"/>
+              <w:left w:val="single" w:sz="4" w:space="0" w:color="000000"/>
+              <w:bottom w:val="single" w:sz="4" w:space="0" w:color="000000"/>
+            </w:tcBorders>
+            <w:vAlign w:val="bottom"/>
+          </w:tcPr>
+          <w:p>
+            <w:pPr>
+              <w:pStyle w:val="Normal"/>
+              <w:widowControl w:val="false"/>
+              <w:spacing w:lineRule="auto" w:line="180"/>
+              <w:jc w:val="center"/>
+              <w:rPr>
+                <w:sz w:val="16"/>
+                <w:szCs w:val="16"/>
+              </w:rPr>
+            </w:pPr>
+            <w:r>
+              <w:rPr>
+                <w:rFonts w:eastAsia="arial" w:ascii="arial" w:hAnsi="arial"/>
+                <w:color w:val="000000"/>
+                <w:sz w:val="16"/>
+                <w:szCs w:val="16"/>
+              </w:rPr>
+              <w:t>Exterior</w:t>
+            </w:r>
+          </w:p>
+          <w:p>
+            <w:pPr>
+              <w:pStyle w:val="Normal"/>
+              <w:widowControl w:val="false"/>
+              <w:spacing w:lineRule="auto" w:line="180"/>
+              <w:jc w:val="center"/>
+              <w:rPr>
+                <w:sz w:val="16"/>
+                <w:szCs w:val="16"/>
+              </w:rPr>
+            </w:pPr>
+            <w:r>
+              <w:rPr>
+                <w:rFonts w:eastAsia="arial" w:ascii="arial" w:hAnsi="arial"/>
+                <w:color w:val="000000"/>
+                <w:sz w:val="16"/>
+                <w:szCs w:val="16"/>
+              </w:rPr>
+              <w:t>Camera</w:t>
+            </w:r>
+          </w:p>
+        </w:tc>
+        <w:tc>
+          <w:tcPr>
+            <w:tcW w:w="1029" w:type="dxa"/>
+            <w:tcBorders>
+              <w:top w:val="single" w:sz="4" w:space="0" w:color="000000"/>
+              <w:left w:val="single" w:sz="4" w:space="0" w:color="000000"/>
+              <w:bottom w:val="single" w:sz="4" w:space="0" w:color="000000"/>
+              <w:right w:val="single" w:sz="4" w:space="0" w:color="000000"/>
+            </w:tcBorders>
+            <w:vAlign w:val="bottom"/>
+          </w:tcPr>
+          <w:p>
+            <w:pPr>
+              <w:pStyle w:val="Normal"/>
+              <w:widowControl w:val="false"/>
+              <w:spacing w:lineRule="auto" w:line="180"/>
+              <w:jc w:val="center"/>
+              <w:rPr>
+                <w:sz w:val="16"/>
+                <w:szCs w:val="16"/>
+              </w:rPr>
+            </w:pPr>
+            <w:r>
+              <w:rPr>
+                <w:rFonts w:eastAsia="arial" w:ascii="arial" w:hAnsi="arial"/>
+                <w:color w:val="000000"/>
+                <w:sz w:val="16"/>
+                <w:szCs w:val="16"/>
+              </w:rPr>
+              <w:t>Prev</w:t>
+            </w:r>
+          </w:p>
+          <w:p>
+            <w:pPr>
+              <w:pStyle w:val="Normal"/>
+              <w:widowControl w:val="false"/>
+              <w:spacing w:lineRule="auto" w:line="180"/>
+              <w:jc w:val="center"/>
+              <w:rPr>
+                <w:sz w:val="16"/>
+                <w:szCs w:val="16"/>
+              </w:rPr>
+            </w:pPr>
+            <w:r>
+              <w:rPr>
+                <w:rFonts w:eastAsia="arial" w:ascii="arial" w:hAnsi="arial"/>
+                <w:color w:val="000000"/>
+                <w:sz w:val="16"/>
+                <w:szCs w:val="16"/>
+              </w:rPr>
+              <w:t>Cab Cam</w:t>
+            </w:r>
+          </w:p>
+        </w:tc>
+      </w:tr>
+    </w:tbl>
+    <w:p>
+      <w:pPr>
+        <w:pStyle w:val="Normal"/>
+        <w:rPr>
+          <w:color w:val="000000"/>
+          <w:sz w:val="16"/>
+          <w:szCs w:val="16"/>
+        </w:rPr>
+      </w:pPr>
+      <w:r>
+        <w:rPr>
+          <w:color w:val="000000"/>
+          <w:sz w:val="16"/>
+          <w:szCs w:val="16"/>
+        </w:rPr>
+      </w:r>
+    </w:p>
+    <w:p>
+      <w:pPr>
+        <w:pStyle w:val="Normal"/>
+        <w:rPr>
+          <w:color w:val="000000"/>
+          <w:sz w:val="16"/>
+          <w:szCs w:val="16"/>
+        </w:rPr>
+      </w:pPr>
+      <w:r>
+        <w:rPr>
+          <w:rFonts w:eastAsia="arial" w:ascii="arial" w:hAnsi="arial"/>
+          <w:color w:val="000000"/>
+          <w:sz w:val="16"/>
+          <w:szCs w:val="16"/>
+        </w:rPr>
+        <w:tab/>
+        <w:t xml:space="preserve">           Class 38</w:t>
       </w:r>
       <w:r>
         <w:rPr>
@@ -35075,7 +35594,558 @@
           <w:sz w:val="16"/>
           <w:szCs w:val="16"/>
         </w:rPr>
-        <w:t>80</w:t>
+        <w:t>5</w:t>
+      </w:r>
+      <w:r>
+        <w:rPr>
+          <w:rFonts w:eastAsia="arial" w:ascii="arial" w:hAnsi="arial"/>
+          <w:color w:val="000000"/>
+          <w:sz w:val="16"/>
+          <w:szCs w:val="16"/>
+        </w:rPr>
+        <w:t>-1</w:t>
+      </w:r>
+    </w:p>
+    <w:tbl>
+      <w:tblPr>
+        <w:tblW w:w="14248" w:type="dxa"/>
+        <w:jc w:val="left"/>
+        <w:tblInd w:w="-5" w:type="dxa"/>
+        <w:tblLayout w:type="fixed"/>
+        <w:tblCellMar>
+          <w:top w:w="0" w:type="dxa"/>
+          <w:left w:w="108" w:type="dxa"/>
+          <w:bottom w:w="0" w:type="dxa"/>
+          <w:right w:w="108" w:type="dxa"/>
+        </w:tblCellMar>
+        <w:tblLook w:firstRow="1" w:noVBand="1" w:lastRow="0" w:firstColumn="1" w:lastColumn="0" w:noHBand="0" w:val="04a0"/>
+      </w:tblPr>
+      <w:tblGrid>
+        <w:gridCol w:w="1017"/>
+        <w:gridCol w:w="1019"/>
+        <w:gridCol w:w="1014"/>
+        <w:gridCol w:w="1016"/>
+        <w:gridCol w:w="1020"/>
+        <w:gridCol w:w="1016"/>
+        <w:gridCol w:w="1016"/>
+        <w:gridCol w:w="1017"/>
+        <w:gridCol w:w="1016"/>
+        <w:gridCol w:w="1020"/>
+        <w:gridCol w:w="1016"/>
+        <w:gridCol w:w="1016"/>
+        <w:gridCol w:w="1016"/>
+        <w:gridCol w:w="1029"/>
+      </w:tblGrid>
+      <w:tr>
+        <w:trPr>
+          <w:trHeight w:val="440" w:hRule="exact"/>
+          <w:cantSplit w:val="true"/>
+        </w:trPr>
+        <w:tc>
+          <w:tcPr>
+            <w:tcW w:w="1017" w:type="dxa"/>
+            <w:tcBorders>
+              <w:top w:val="single" w:sz="4" w:space="0" w:color="000000"/>
+              <w:left w:val="single" w:sz="4" w:space="0" w:color="000000"/>
+              <w:bottom w:val="single" w:sz="4" w:space="0" w:color="000000"/>
+            </w:tcBorders>
+            <w:vAlign w:val="bottom"/>
+          </w:tcPr>
+          <w:p>
+            <w:pPr>
+              <w:pStyle w:val="Normal"/>
+              <w:widowControl w:val="false"/>
+              <w:spacing w:lineRule="auto" w:line="180" w:before="0" w:after="60"/>
+              <w:jc w:val="center"/>
+              <w:rPr>
+                <w:color w:val="000000"/>
+                <w:sz w:val="16"/>
+                <w:szCs w:val="16"/>
+              </w:rPr>
+            </w:pPr>
+            <w:r>
+              <w:rPr>
+                <w:rFonts w:eastAsia="arial" w:ascii="arial" w:hAnsi="arial"/>
+                <w:b/>
+                <w:color w:val="000000"/>
+                <w:sz w:val="16"/>
+                <w:szCs w:val="16"/>
+              </w:rPr>
+              <w:t>Pause</w:t>
+            </w:r>
+          </w:p>
+        </w:tc>
+        <w:tc>
+          <w:tcPr>
+            <w:tcW w:w="1019" w:type="dxa"/>
+            <w:tcBorders>
+              <w:top w:val="single" w:sz="4" w:space="0" w:color="000000"/>
+              <w:left w:val="single" w:sz="4" w:space="0" w:color="000000"/>
+              <w:bottom w:val="single" w:sz="4" w:space="0" w:color="000000"/>
+            </w:tcBorders>
+            <w:vAlign w:val="bottom"/>
+          </w:tcPr>
+          <w:p>
+            <w:pPr>
+              <w:pStyle w:val="Normal"/>
+              <w:widowControl w:val="false"/>
+              <w:spacing w:lineRule="auto" w:line="180"/>
+              <w:jc w:val="center"/>
+              <w:rPr>
+                <w:color w:val="000000"/>
+                <w:sz w:val="16"/>
+                <w:szCs w:val="16"/>
+              </w:rPr>
+            </w:pPr>
+            <w:r>
+              <w:rPr>
+                <w:color w:val="000000"/>
+                <w:sz w:val="16"/>
+                <w:szCs w:val="16"/>
+              </w:rPr>
+              <w:t>Master Key</w:t>
+            </w:r>
+          </w:p>
+        </w:tc>
+        <w:tc>
+          <w:tcPr>
+            <w:tcW w:w="1014" w:type="dxa"/>
+            <w:tcBorders>
+              <w:top w:val="single" w:sz="4" w:space="0" w:color="000000"/>
+              <w:left w:val="single" w:sz="4" w:space="0" w:color="000000"/>
+              <w:bottom w:val="single" w:sz="4" w:space="0" w:color="000000"/>
+            </w:tcBorders>
+            <w:vAlign w:val="bottom"/>
+          </w:tcPr>
+          <w:p>
+            <w:pPr>
+              <w:pStyle w:val="Normal"/>
+              <w:widowControl w:val="false"/>
+              <w:spacing w:lineRule="auto" w:line="180"/>
+              <w:jc w:val="center"/>
+              <w:rPr>
+                <w:color w:val="000000"/>
+                <w:sz w:val="16"/>
+                <w:szCs w:val="16"/>
+              </w:rPr>
+            </w:pPr>
+            <w:r>
+              <w:rPr>
+                <w:color w:val="000000"/>
+                <w:sz w:val="16"/>
+                <w:szCs w:val="16"/>
+              </w:rPr>
+              <w:t>DRA Isolation</w:t>
+            </w:r>
+          </w:p>
+        </w:tc>
+        <w:tc>
+          <w:tcPr>
+            <w:tcW w:w="1016" w:type="dxa"/>
+            <w:tcBorders>
+              <w:top w:val="single" w:sz="4" w:space="0" w:color="000000"/>
+              <w:left w:val="single" w:sz="4" w:space="0" w:color="000000"/>
+              <w:bottom w:val="single" w:sz="4" w:space="0" w:color="000000"/>
+            </w:tcBorders>
+            <w:vAlign w:val="bottom"/>
+          </w:tcPr>
+          <w:p>
+            <w:pPr>
+              <w:pStyle w:val="Normal"/>
+              <w:widowControl w:val="false"/>
+              <w:spacing w:lineRule="auto" w:line="180"/>
+              <w:jc w:val="center"/>
+              <w:rPr>
+                <w:color w:val="000000"/>
+                <w:sz w:val="16"/>
+                <w:szCs w:val="16"/>
+              </w:rPr>
+            </w:pPr>
+            <w:r>
+              <w:rPr>
+                <w:color w:val="000000"/>
+                <w:sz w:val="16"/>
+                <w:szCs w:val="16"/>
+              </w:rPr>
+              <w:t>AWS/TPWS</w:t>
+            </w:r>
+          </w:p>
+        </w:tc>
+        <w:tc>
+          <w:tcPr>
+            <w:tcW w:w="1020" w:type="dxa"/>
+            <w:tcBorders>
+              <w:top w:val="single" w:sz="4" w:space="0" w:color="000000"/>
+              <w:left w:val="single" w:sz="4" w:space="0" w:color="000000"/>
+              <w:bottom w:val="single" w:sz="4" w:space="0" w:color="000000"/>
+            </w:tcBorders>
+            <w:vAlign w:val="bottom"/>
+          </w:tcPr>
+          <w:p>
+            <w:pPr>
+              <w:pStyle w:val="Normal"/>
+              <w:widowControl w:val="false"/>
+              <w:spacing w:lineRule="auto" w:line="180"/>
+              <w:jc w:val="center"/>
+              <w:rPr>
+                <w:color w:val="000000"/>
+                <w:sz w:val="16"/>
+                <w:szCs w:val="16"/>
+              </w:rPr>
+            </w:pPr>
+            <w:r>
+              <w:rPr>
+                <w:color w:val="000000"/>
+                <w:sz w:val="16"/>
+                <w:szCs w:val="16"/>
+              </w:rPr>
+              <w:t>Panto. Up</w:t>
+            </w:r>
+          </w:p>
+        </w:tc>
+        <w:tc>
+          <w:tcPr>
+            <w:tcW w:w="1016" w:type="dxa"/>
+            <w:tcBorders>
+              <w:top w:val="single" w:sz="4" w:space="0" w:color="000000"/>
+              <w:left w:val="single" w:sz="4" w:space="0" w:color="000000"/>
+              <w:bottom w:val="single" w:sz="4" w:space="0" w:color="000000"/>
+            </w:tcBorders>
+            <w:vAlign w:val="bottom"/>
+          </w:tcPr>
+          <w:p>
+            <w:pPr>
+              <w:pStyle w:val="Normal"/>
+              <w:widowControl w:val="false"/>
+              <w:spacing w:lineRule="auto" w:line="180"/>
+              <w:jc w:val="center"/>
+              <w:rPr>
+                <w:color w:val="000000"/>
+                <w:sz w:val="16"/>
+                <w:szCs w:val="16"/>
+              </w:rPr>
+            </w:pPr>
+            <w:r>
+              <w:rPr>
+                <w:color w:val="000000"/>
+                <w:sz w:val="16"/>
+                <w:szCs w:val="16"/>
+              </w:rPr>
+              <w:t>Saloon Light On</w:t>
+            </w:r>
+          </w:p>
+        </w:tc>
+        <w:tc>
+          <w:tcPr>
+            <w:tcW w:w="1016" w:type="dxa"/>
+            <w:tcBorders>
+              <w:top w:val="single" w:sz="4" w:space="0" w:color="000000"/>
+              <w:left w:val="single" w:sz="4" w:space="0" w:color="000000"/>
+              <w:bottom w:val="single" w:sz="4" w:space="0" w:color="000000"/>
+            </w:tcBorders>
+            <w:vAlign w:val="bottom"/>
+          </w:tcPr>
+          <w:p>
+            <w:pPr>
+              <w:pStyle w:val="Normal"/>
+              <w:widowControl w:val="false"/>
+              <w:jc w:val="center"/>
+              <w:rPr>
+                <w:sz w:val="16"/>
+                <w:szCs w:val="16"/>
+              </w:rPr>
+            </w:pPr>
+            <w:r>
+              <w:rPr>
+                <w:sz w:val="16"/>
+                <w:szCs w:val="16"/>
+              </w:rPr>
+              <w:t>DRA</w:t>
+            </w:r>
+          </w:p>
+        </w:tc>
+        <w:tc>
+          <w:tcPr>
+            <w:tcW w:w="1017" w:type="dxa"/>
+            <w:tcBorders>
+              <w:top w:val="single" w:sz="4" w:space="0" w:color="000000"/>
+              <w:left w:val="single" w:sz="4" w:space="0" w:color="000000"/>
+              <w:bottom w:val="single" w:sz="4" w:space="0" w:color="000000"/>
+            </w:tcBorders>
+            <w:vAlign w:val="bottom"/>
+          </w:tcPr>
+          <w:p>
+            <w:pPr>
+              <w:pStyle w:val="Normal"/>
+              <w:widowControl w:val="false"/>
+              <w:jc w:val="center"/>
+              <w:rPr>
+                <w:color w:val="000000"/>
+                <w:sz w:val="16"/>
+                <w:szCs w:val="16"/>
+              </w:rPr>
+            </w:pPr>
+            <w:r>
+              <w:rPr>
+                <w:color w:val="000000"/>
+                <w:sz w:val="16"/>
+                <w:szCs w:val="16"/>
+              </w:rPr>
+            </w:r>
+          </w:p>
+        </w:tc>
+        <w:tc>
+          <w:tcPr>
+            <w:tcW w:w="1016" w:type="dxa"/>
+            <w:tcBorders>
+              <w:top w:val="single" w:sz="4" w:space="0" w:color="000000"/>
+              <w:left w:val="single" w:sz="4" w:space="0" w:color="000000"/>
+              <w:bottom w:val="single" w:sz="4" w:space="0" w:color="000000"/>
+            </w:tcBorders>
+            <w:vAlign w:val="bottom"/>
+          </w:tcPr>
+          <w:p>
+            <w:pPr>
+              <w:pStyle w:val="Normal"/>
+              <w:widowControl w:val="false"/>
+              <w:jc w:val="center"/>
+              <w:rPr>
+                <w:sz w:val="16"/>
+                <w:szCs w:val="16"/>
+              </w:rPr>
+            </w:pPr>
+            <w:r>
+              <w:rPr/>
+            </w:r>
+          </w:p>
+        </w:tc>
+        <w:tc>
+          <w:tcPr>
+            <w:tcW w:w="1020" w:type="dxa"/>
+            <w:tcBorders>
+              <w:top w:val="single" w:sz="4" w:space="0" w:color="000000"/>
+              <w:left w:val="single" w:sz="4" w:space="0" w:color="000000"/>
+              <w:bottom w:val="single" w:sz="4" w:space="0" w:color="000000"/>
+            </w:tcBorders>
+            <w:vAlign w:val="bottom"/>
+          </w:tcPr>
+          <w:p>
+            <w:pPr>
+              <w:pStyle w:val="Normal"/>
+              <w:widowControl w:val="false"/>
+              <w:jc w:val="center"/>
+              <w:rPr>
+                <w:color w:val="000000"/>
+                <w:sz w:val="16"/>
+                <w:szCs w:val="16"/>
+              </w:rPr>
+            </w:pPr>
+            <w:r>
+              <w:rPr>
+                <w:color w:val="000000"/>
+                <w:sz w:val="16"/>
+                <w:szCs w:val="16"/>
+              </w:rPr>
+              <w:t>Hazard Light</w:t>
+            </w:r>
+          </w:p>
+        </w:tc>
+        <w:tc>
+          <w:tcPr>
+            <w:tcW w:w="1016" w:type="dxa"/>
+            <w:tcBorders>
+              <w:top w:val="single" w:sz="4" w:space="0" w:color="000000"/>
+              <w:left w:val="single" w:sz="4" w:space="0" w:color="000000"/>
+              <w:bottom w:val="single" w:sz="4" w:space="0" w:color="000000"/>
+            </w:tcBorders>
+            <w:vAlign w:val="bottom"/>
+          </w:tcPr>
+          <w:p>
+            <w:pPr>
+              <w:pStyle w:val="Normal"/>
+              <w:widowControl w:val="false"/>
+              <w:spacing w:lineRule="auto" w:line="180"/>
+              <w:jc w:val="center"/>
+              <w:rPr>
+                <w:sz w:val="16"/>
+                <w:szCs w:val="16"/>
+              </w:rPr>
+            </w:pPr>
+            <w:r>
+              <w:rPr>
+                <w:rFonts w:eastAsia="arial" w:ascii="arial" w:hAnsi="arial"/>
+                <w:color w:val="000000"/>
+                <w:sz w:val="16"/>
+                <w:szCs w:val="16"/>
+              </w:rPr>
+              <w:t>Cab Light</w:t>
+            </w:r>
+          </w:p>
+        </w:tc>
+        <w:tc>
+          <w:tcPr>
+            <w:tcW w:w="1016" w:type="dxa"/>
+            <w:tcBorders>
+              <w:top w:val="single" w:sz="4" w:space="0" w:color="000000"/>
+              <w:left w:val="single" w:sz="4" w:space="0" w:color="000000"/>
+              <w:bottom w:val="single" w:sz="4" w:space="0" w:color="000000"/>
+            </w:tcBorders>
+            <w:vAlign w:val="bottom"/>
+          </w:tcPr>
+          <w:p>
+            <w:pPr>
+              <w:pStyle w:val="Normal"/>
+              <w:widowControl w:val="false"/>
+              <w:jc w:val="center"/>
+              <w:rPr>
+                <w:color w:val="000000"/>
+                <w:sz w:val="16"/>
+                <w:szCs w:val="16"/>
+              </w:rPr>
+            </w:pPr>
+            <w:r>
+              <w:rPr>
+                <w:color w:val="000000"/>
+                <w:sz w:val="16"/>
+                <w:szCs w:val="16"/>
+              </w:rPr>
+            </w:r>
+          </w:p>
+        </w:tc>
+        <w:tc>
+          <w:tcPr>
+            <w:tcW w:w="1016" w:type="dxa"/>
+            <w:tcBorders>
+              <w:top w:val="single" w:sz="4" w:space="0" w:color="000000"/>
+              <w:left w:val="single" w:sz="4" w:space="0" w:color="000000"/>
+              <w:bottom w:val="single" w:sz="4" w:space="0" w:color="000000"/>
+            </w:tcBorders>
+            <w:vAlign w:val="bottom"/>
+          </w:tcPr>
+          <w:p>
+            <w:pPr>
+              <w:pStyle w:val="Normal"/>
+              <w:widowControl w:val="false"/>
+              <w:spacing w:lineRule="auto" w:line="180"/>
+              <w:jc w:val="center"/>
+              <w:rPr>
+                <w:sz w:val="16"/>
+                <w:szCs w:val="16"/>
+              </w:rPr>
+            </w:pPr>
+            <w:r>
+              <w:rPr>
+                <w:rFonts w:eastAsia="arial" w:ascii="arial" w:hAnsi="arial"/>
+                <w:color w:val="000000"/>
+                <w:sz w:val="16"/>
+                <w:szCs w:val="16"/>
+              </w:rPr>
+              <w:t>1-Person</w:t>
+            </w:r>
+          </w:p>
+        </w:tc>
+        <w:tc>
+          <w:tcPr>
+            <w:tcW w:w="1029" w:type="dxa"/>
+            <w:tcBorders>
+              <w:top w:val="single" w:sz="4" w:space="0" w:color="000000"/>
+              <w:left w:val="single" w:sz="4" w:space="0" w:color="000000"/>
+              <w:bottom w:val="single" w:sz="4" w:space="0" w:color="000000"/>
+              <w:right w:val="single" w:sz="4" w:space="0" w:color="000000"/>
+            </w:tcBorders>
+            <w:vAlign w:val="bottom"/>
+          </w:tcPr>
+          <w:p>
+            <w:pPr>
+              <w:pStyle w:val="Normal"/>
+              <w:widowControl w:val="false"/>
+              <w:spacing w:lineRule="auto" w:line="180"/>
+              <w:jc w:val="center"/>
+              <w:rPr>
+                <w:sz w:val="16"/>
+                <w:szCs w:val="16"/>
+              </w:rPr>
+            </w:pPr>
+            <w:r>
+              <w:rPr>
+                <w:rFonts w:eastAsia="arial" w:ascii="arial" w:hAnsi="arial"/>
+                <w:color w:val="000000"/>
+                <w:sz w:val="16"/>
+                <w:szCs w:val="16"/>
+              </w:rPr>
+              <w:t>Next</w:t>
+            </w:r>
+          </w:p>
+          <w:p>
+            <w:pPr>
+              <w:pStyle w:val="Normal"/>
+              <w:widowControl w:val="false"/>
+              <w:spacing w:lineRule="auto" w:line="180"/>
+              <w:jc w:val="center"/>
+              <w:rPr>
+                <w:sz w:val="16"/>
+                <w:szCs w:val="16"/>
+              </w:rPr>
+            </w:pPr>
+            <w:r>
+              <w:rPr>
+                <w:rFonts w:eastAsia="arial" w:ascii="arial" w:hAnsi="arial"/>
+                <w:color w:val="000000"/>
+                <w:sz w:val="16"/>
+                <w:szCs w:val="16"/>
+              </w:rPr>
+              <w:t>Cab Cam</w:t>
+            </w:r>
+          </w:p>
+        </w:tc>
+      </w:tr>
+    </w:tbl>
+    <w:p>
+      <w:pPr>
+        <w:pStyle w:val="Normal"/>
+        <w:rPr>
+          <w:rFonts w:ascii="arial" w:hAnsi="arial" w:eastAsia="arial"/>
+          <w:color w:val="000000"/>
+          <w:sz w:val="16"/>
+          <w:szCs w:val="16"/>
+        </w:rPr>
+      </w:pPr>
+      <w:r>
+        <w:rPr>
+          <w:rFonts w:eastAsia="arial" w:ascii="arial" w:hAnsi="arial"/>
+          <w:color w:val="000000"/>
+          <w:sz w:val="16"/>
+          <w:szCs w:val="16"/>
+        </w:rPr>
+      </w:r>
+    </w:p>
+    <w:p>
+      <w:pPr>
+        <w:pStyle w:val="Normal"/>
+        <w:rPr>
+          <w:color w:val="000000"/>
+          <w:sz w:val="16"/>
+          <w:szCs w:val="16"/>
+        </w:rPr>
+      </w:pPr>
+      <w:r>
+        <w:rPr>
+          <w:rFonts w:eastAsia="arial" w:ascii="arial" w:hAnsi="arial"/>
+          <w:color w:val="000000"/>
+          <w:sz w:val="16"/>
+          <w:szCs w:val="16"/>
+        </w:rPr>
+        <w:tab/>
+        <w:t xml:space="preserve">           Class 38</w:t>
+      </w:r>
+      <w:r>
+        <w:rPr>
+          <w:rFonts w:eastAsia="arial" w:ascii="arial" w:hAnsi="arial"/>
+          <w:color w:val="000000"/>
+          <w:sz w:val="16"/>
+          <w:szCs w:val="16"/>
+        </w:rPr>
+        <w:t>5</w:t>
       </w:r>
       <w:r>
         <w:rPr>
@@ -35210,12 +36280,1141 @@
               </w:rPr>
             </w:pPr>
             <w:r>
+              <w:rPr>
+                <w:color w:val="000000"/>
+                <w:sz w:val="16"/>
+                <w:szCs w:val="16"/>
+              </w:rPr>
+            </w:r>
+          </w:p>
+        </w:tc>
+        <w:tc>
+          <w:tcPr>
+            <w:tcW w:w="1016" w:type="dxa"/>
+            <w:tcBorders>
+              <w:top w:val="single" w:sz="4" w:space="0" w:color="000000"/>
+              <w:left w:val="single" w:sz="4" w:space="0" w:color="000000"/>
+              <w:bottom w:val="single" w:sz="4" w:space="0" w:color="000000"/>
+            </w:tcBorders>
+            <w:vAlign w:val="bottom"/>
+          </w:tcPr>
+          <w:p>
+            <w:pPr>
+              <w:pStyle w:val="Normal"/>
+              <w:widowControl w:val="false"/>
+              <w:spacing w:lineRule="auto" w:line="180"/>
+              <w:jc w:val="center"/>
+              <w:rPr>
+                <w:color w:val="000000"/>
+                <w:sz w:val="16"/>
+                <w:szCs w:val="16"/>
+              </w:rPr>
+            </w:pPr>
+            <w:r>
+              <w:rPr>
+                <w:color w:val="000000"/>
+                <w:sz w:val="16"/>
+                <w:szCs w:val="16"/>
+              </w:rPr>
+              <w:t>DSD</w:t>
+            </w:r>
+          </w:p>
+        </w:tc>
+        <w:tc>
+          <w:tcPr>
+            <w:tcW w:w="1020" w:type="dxa"/>
+            <w:tcBorders>
+              <w:top w:val="single" w:sz="4" w:space="0" w:color="000000"/>
+              <w:left w:val="single" w:sz="4" w:space="0" w:color="000000"/>
+              <w:bottom w:val="single" w:sz="4" w:space="0" w:color="000000"/>
+            </w:tcBorders>
+            <w:vAlign w:val="bottom"/>
+          </w:tcPr>
+          <w:p>
+            <w:pPr>
+              <w:pStyle w:val="Normal"/>
+              <w:widowControl w:val="false"/>
+              <w:spacing w:lineRule="auto" w:line="180"/>
+              <w:jc w:val="center"/>
+              <w:rPr>
+                <w:color w:val="000000"/>
+                <w:sz w:val="16"/>
+                <w:szCs w:val="16"/>
+              </w:rPr>
+            </w:pPr>
+            <w:r>
+              <w:rPr>
+                <w:color w:val="000000"/>
+                <w:sz w:val="16"/>
+                <w:szCs w:val="16"/>
+              </w:rPr>
+              <w:t>Panto. Low</w:t>
+            </w:r>
+          </w:p>
+        </w:tc>
+        <w:tc>
+          <w:tcPr>
+            <w:tcW w:w="1016" w:type="dxa"/>
+            <w:tcBorders>
+              <w:top w:val="single" w:sz="4" w:space="0" w:color="000000"/>
+              <w:left w:val="single" w:sz="4" w:space="0" w:color="000000"/>
+              <w:bottom w:val="single" w:sz="4" w:space="0" w:color="000000"/>
+            </w:tcBorders>
+            <w:vAlign w:val="bottom"/>
+          </w:tcPr>
+          <w:p>
+            <w:pPr>
+              <w:pStyle w:val="Normal"/>
+              <w:widowControl w:val="false"/>
+              <w:spacing w:lineRule="auto" w:line="180"/>
+              <w:jc w:val="center"/>
+              <w:rPr>
+                <w:sz w:val="16"/>
+                <w:szCs w:val="16"/>
+              </w:rPr>
+            </w:pPr>
+            <w:r>
+              <w:rPr>
+                <w:color w:val="000000"/>
+                <w:sz w:val="16"/>
+                <w:szCs w:val="16"/>
+              </w:rPr>
+              <w:t>Saloon Light Off</w:t>
+            </w:r>
+          </w:p>
+        </w:tc>
+        <w:tc>
+          <w:tcPr>
+            <w:tcW w:w="1016" w:type="dxa"/>
+            <w:tcBorders>
+              <w:top w:val="single" w:sz="4" w:space="0" w:color="000000"/>
+              <w:left w:val="single" w:sz="4" w:space="0" w:color="000000"/>
+              <w:bottom w:val="single" w:sz="4" w:space="0" w:color="000000"/>
+            </w:tcBorders>
+            <w:vAlign w:val="bottom"/>
+          </w:tcPr>
+          <w:p>
+            <w:pPr>
+              <w:pStyle w:val="Normal"/>
+              <w:widowControl w:val="false"/>
+              <w:jc w:val="center"/>
+              <w:rPr>
+                <w:color w:val="000000"/>
+                <w:sz w:val="16"/>
+                <w:szCs w:val="16"/>
+              </w:rPr>
+            </w:pPr>
+            <w:r>
+              <w:rPr>
+                <w:color w:val="000000"/>
+                <w:sz w:val="16"/>
+                <w:szCs w:val="16"/>
+              </w:rPr>
+            </w:r>
+          </w:p>
+        </w:tc>
+        <w:tc>
+          <w:tcPr>
+            <w:tcW w:w="1017" w:type="dxa"/>
+            <w:tcBorders>
+              <w:top w:val="single" w:sz="4" w:space="0" w:color="000000"/>
+              <w:left w:val="single" w:sz="4" w:space="0" w:color="000000"/>
+              <w:bottom w:val="single" w:sz="4" w:space="0" w:color="000000"/>
+            </w:tcBorders>
+            <w:vAlign w:val="bottom"/>
+          </w:tcPr>
+          <w:p>
+            <w:pPr>
+              <w:pStyle w:val="Normal"/>
+              <w:widowControl w:val="false"/>
+              <w:jc w:val="center"/>
+              <w:rPr>
+                <w:color w:val="000000"/>
+                <w:sz w:val="16"/>
+                <w:szCs w:val="16"/>
+              </w:rPr>
+            </w:pPr>
+            <w:r>
+              <w:rPr>
+                <w:color w:val="000000"/>
+                <w:sz w:val="16"/>
+                <w:szCs w:val="16"/>
+              </w:rPr>
+            </w:r>
+          </w:p>
+        </w:tc>
+        <w:tc>
+          <w:tcPr>
+            <w:tcW w:w="1016" w:type="dxa"/>
+            <w:tcBorders>
+              <w:top w:val="single" w:sz="4" w:space="0" w:color="000000"/>
+              <w:left w:val="single" w:sz="4" w:space="0" w:color="000000"/>
+              <w:bottom w:val="single" w:sz="4" w:space="0" w:color="000000"/>
+            </w:tcBorders>
+            <w:vAlign w:val="bottom"/>
+          </w:tcPr>
+          <w:p>
+            <w:pPr>
+              <w:pStyle w:val="Normal"/>
+              <w:widowControl w:val="false"/>
+              <w:jc w:val="center"/>
+              <w:rPr>
+                <w:sz w:val="16"/>
+                <w:szCs w:val="16"/>
+              </w:rPr>
+            </w:pPr>
+            <w:r>
               <w:rPr/>
             </w:r>
           </w:p>
         </w:tc>
         <w:tc>
           <w:tcPr>
+            <w:tcW w:w="1020" w:type="dxa"/>
+            <w:tcBorders>
+              <w:top w:val="single" w:sz="4" w:space="0" w:color="000000"/>
+              <w:left w:val="single" w:sz="4" w:space="0" w:color="000000"/>
+              <w:bottom w:val="single" w:sz="4" w:space="0" w:color="000000"/>
+            </w:tcBorders>
+            <w:vAlign w:val="bottom"/>
+          </w:tcPr>
+          <w:p>
+            <w:pPr>
+              <w:pStyle w:val="Normal"/>
+              <w:widowControl w:val="false"/>
+              <w:jc w:val="center"/>
+              <w:rPr>
+                <w:rFonts w:ascii="arial" w:hAnsi="arial" w:eastAsia="arial"/>
+                <w:color w:val="000000"/>
+                <w:sz w:val="16"/>
+                <w:szCs w:val="16"/>
+              </w:rPr>
+            </w:pPr>
+            <w:r>
+              <w:rPr>
+                <w:rFonts w:eastAsia="arial" w:ascii="arial" w:hAnsi="arial"/>
+                <w:color w:val="000000"/>
+                <w:sz w:val="16"/>
+                <w:szCs w:val="16"/>
+              </w:rPr>
+            </w:r>
+          </w:p>
+        </w:tc>
+        <w:tc>
+          <w:tcPr>
+            <w:tcW w:w="1016" w:type="dxa"/>
+            <w:tcBorders>
+              <w:top w:val="single" w:sz="4" w:space="0" w:color="000000"/>
+              <w:left w:val="single" w:sz="4" w:space="0" w:color="000000"/>
+              <w:bottom w:val="single" w:sz="4" w:space="0" w:color="000000"/>
+            </w:tcBorders>
+            <w:vAlign w:val="bottom"/>
+          </w:tcPr>
+          <w:p>
+            <w:pPr>
+              <w:pStyle w:val="Normal"/>
+              <w:widowControl w:val="false"/>
+              <w:jc w:val="center"/>
+              <w:rPr>
+                <w:color w:val="000000"/>
+                <w:sz w:val="16"/>
+                <w:szCs w:val="16"/>
+              </w:rPr>
+            </w:pPr>
+            <w:r>
+              <w:rPr>
+                <w:color w:val="000000"/>
+                <w:sz w:val="16"/>
+                <w:szCs w:val="16"/>
+              </w:rPr>
+              <w:t>Down Light</w:t>
+            </w:r>
+          </w:p>
+        </w:tc>
+        <w:tc>
+          <w:tcPr>
+            <w:tcW w:w="1016" w:type="dxa"/>
+            <w:tcBorders>
+              <w:top w:val="single" w:sz="4" w:space="0" w:color="000000"/>
+              <w:left w:val="single" w:sz="4" w:space="0" w:color="000000"/>
+              <w:bottom w:val="single" w:sz="4" w:space="0" w:color="000000"/>
+            </w:tcBorders>
+            <w:vAlign w:val="bottom"/>
+          </w:tcPr>
+          <w:p>
+            <w:pPr>
+              <w:pStyle w:val="Normal"/>
+              <w:widowControl w:val="false"/>
+              <w:spacing w:lineRule="auto" w:line="180"/>
+              <w:jc w:val="center"/>
+              <w:rPr>
+                <w:sz w:val="16"/>
+                <w:szCs w:val="16"/>
+              </w:rPr>
+            </w:pPr>
+            <w:r>
+              <w:rPr>
+                <w:sz w:val="16"/>
+                <w:szCs w:val="16"/>
+              </w:rPr>
+            </w:r>
+          </w:p>
+        </w:tc>
+        <w:tc>
+          <w:tcPr>
+            <w:tcW w:w="1016" w:type="dxa"/>
+            <w:tcBorders>
+              <w:top w:val="single" w:sz="4" w:space="0" w:color="000000"/>
+              <w:left w:val="single" w:sz="4" w:space="0" w:color="000000"/>
+              <w:bottom w:val="single" w:sz="4" w:space="0" w:color="000000"/>
+            </w:tcBorders>
+            <w:vAlign w:val="bottom"/>
+          </w:tcPr>
+          <w:p>
+            <w:pPr>
+              <w:pStyle w:val="Normal"/>
+              <w:widowControl w:val="false"/>
+              <w:spacing w:lineRule="auto" w:line="180"/>
+              <w:jc w:val="center"/>
+              <w:rPr>
+                <w:sz w:val="16"/>
+                <w:szCs w:val="16"/>
+              </w:rPr>
+            </w:pPr>
+            <w:r>
+              <w:rPr>
+                <w:rFonts w:eastAsia="arial" w:ascii="arial" w:hAnsi="arial"/>
+                <w:color w:val="000000"/>
+                <w:sz w:val="16"/>
+                <w:szCs w:val="16"/>
+              </w:rPr>
+              <w:t>Exterior</w:t>
+            </w:r>
+          </w:p>
+          <w:p>
+            <w:pPr>
+              <w:pStyle w:val="Normal"/>
+              <w:widowControl w:val="false"/>
+              <w:spacing w:lineRule="auto" w:line="180"/>
+              <w:jc w:val="center"/>
+              <w:rPr>
+                <w:sz w:val="16"/>
+                <w:szCs w:val="16"/>
+              </w:rPr>
+            </w:pPr>
+            <w:r>
+              <w:rPr>
+                <w:rFonts w:eastAsia="arial" w:ascii="arial" w:hAnsi="arial"/>
+                <w:color w:val="000000"/>
+                <w:sz w:val="16"/>
+                <w:szCs w:val="16"/>
+              </w:rPr>
+              <w:t>Camera</w:t>
+            </w:r>
+          </w:p>
+        </w:tc>
+        <w:tc>
+          <w:tcPr>
+            <w:tcW w:w="1029" w:type="dxa"/>
+            <w:tcBorders>
+              <w:top w:val="single" w:sz="4" w:space="0" w:color="000000"/>
+              <w:left w:val="single" w:sz="4" w:space="0" w:color="000000"/>
+              <w:bottom w:val="single" w:sz="4" w:space="0" w:color="000000"/>
+              <w:right w:val="single" w:sz="4" w:space="0" w:color="000000"/>
+            </w:tcBorders>
+            <w:vAlign w:val="bottom"/>
+          </w:tcPr>
+          <w:p>
+            <w:pPr>
+              <w:pStyle w:val="Normal"/>
+              <w:widowControl w:val="false"/>
+              <w:spacing w:lineRule="auto" w:line="180"/>
+              <w:jc w:val="center"/>
+              <w:rPr>
+                <w:sz w:val="16"/>
+                <w:szCs w:val="16"/>
+              </w:rPr>
+            </w:pPr>
+            <w:r>
+              <w:rPr>
+                <w:rFonts w:eastAsia="arial" w:ascii="arial" w:hAnsi="arial"/>
+                <w:color w:val="000000"/>
+                <w:sz w:val="16"/>
+                <w:szCs w:val="16"/>
+              </w:rPr>
+              <w:t>Prev</w:t>
+            </w:r>
+          </w:p>
+          <w:p>
+            <w:pPr>
+              <w:pStyle w:val="Normal"/>
+              <w:widowControl w:val="false"/>
+              <w:spacing w:lineRule="auto" w:line="180"/>
+              <w:jc w:val="center"/>
+              <w:rPr>
+                <w:sz w:val="16"/>
+                <w:szCs w:val="16"/>
+              </w:rPr>
+            </w:pPr>
+            <w:r>
+              <w:rPr>
+                <w:rFonts w:eastAsia="arial" w:ascii="arial" w:hAnsi="arial"/>
+                <w:color w:val="000000"/>
+                <w:sz w:val="16"/>
+                <w:szCs w:val="16"/>
+              </w:rPr>
+              <w:t>Cab Cam</w:t>
+            </w:r>
+          </w:p>
+        </w:tc>
+      </w:tr>
+    </w:tbl>
+    <w:p>
+      <w:pPr>
+        <w:pStyle w:val="Normal"/>
+        <w:rPr>
+          <w:color w:val="000000"/>
+          <w:sz w:val="16"/>
+          <w:szCs w:val="16"/>
+        </w:rPr>
+      </w:pPr>
+      <w:r>
+        <w:rPr>
+          <w:color w:val="000000"/>
+          <w:sz w:val="16"/>
+          <w:szCs w:val="16"/>
+        </w:rPr>
+      </w:r>
+    </w:p>
+    <w:p>
+      <w:pPr>
+        <w:pStyle w:val="Normal"/>
+        <w:rPr>
+          <w:color w:val="000000"/>
+          <w:sz w:val="16"/>
+          <w:szCs w:val="16"/>
+        </w:rPr>
+      </w:pPr>
+      <w:r>
+        <w:rPr>
+          <w:rFonts w:eastAsia="arial" w:ascii="arial" w:hAnsi="arial"/>
+          <w:color w:val="000000"/>
+          <w:sz w:val="16"/>
+          <w:szCs w:val="16"/>
+        </w:rPr>
+        <w:tab/>
+        <w:t xml:space="preserve">           Class 3</w:t>
+      </w:r>
+      <w:r>
+        <w:rPr>
+          <w:rFonts w:eastAsia="arial" w:ascii="arial" w:hAnsi="arial"/>
+          <w:color w:val="000000"/>
+          <w:sz w:val="16"/>
+          <w:szCs w:val="16"/>
+        </w:rPr>
+        <w:t>87</w:t>
+      </w:r>
+      <w:r>
+        <w:rPr>
+          <w:rFonts w:eastAsia="arial" w:ascii="arial" w:hAnsi="arial"/>
+          <w:color w:val="000000"/>
+          <w:sz w:val="16"/>
+          <w:szCs w:val="16"/>
+        </w:rPr>
+        <w:t>-1</w:t>
+      </w:r>
+    </w:p>
+    <w:tbl>
+      <w:tblPr>
+        <w:tblW w:w="14248" w:type="dxa"/>
+        <w:jc w:val="left"/>
+        <w:tblInd w:w="-5" w:type="dxa"/>
+        <w:tblLayout w:type="fixed"/>
+        <w:tblCellMar>
+          <w:top w:w="0" w:type="dxa"/>
+          <w:left w:w="108" w:type="dxa"/>
+          <w:bottom w:w="0" w:type="dxa"/>
+          <w:right w:w="108" w:type="dxa"/>
+        </w:tblCellMar>
+        <w:tblLook w:firstRow="1" w:noVBand="1" w:lastRow="0" w:firstColumn="1" w:lastColumn="0" w:noHBand="0" w:val="04a0"/>
+      </w:tblPr>
+      <w:tblGrid>
+        <w:gridCol w:w="1017"/>
+        <w:gridCol w:w="1019"/>
+        <w:gridCol w:w="1014"/>
+        <w:gridCol w:w="1016"/>
+        <w:gridCol w:w="1020"/>
+        <w:gridCol w:w="1016"/>
+        <w:gridCol w:w="1016"/>
+        <w:gridCol w:w="1017"/>
+        <w:gridCol w:w="1016"/>
+        <w:gridCol w:w="1020"/>
+        <w:gridCol w:w="1016"/>
+        <w:gridCol w:w="1016"/>
+        <w:gridCol w:w="1016"/>
+        <w:gridCol w:w="1029"/>
+      </w:tblGrid>
+      <w:tr>
+        <w:trPr>
+          <w:trHeight w:val="440" w:hRule="exact"/>
+          <w:cantSplit w:val="true"/>
+        </w:trPr>
+        <w:tc>
+          <w:tcPr>
+            <w:tcW w:w="1017" w:type="dxa"/>
+            <w:tcBorders>
+              <w:top w:val="single" w:sz="4" w:space="0" w:color="000000"/>
+              <w:left w:val="single" w:sz="4" w:space="0" w:color="000000"/>
+              <w:bottom w:val="single" w:sz="4" w:space="0" w:color="000000"/>
+            </w:tcBorders>
+            <w:vAlign w:val="bottom"/>
+          </w:tcPr>
+          <w:p>
+            <w:pPr>
+              <w:pStyle w:val="Normal"/>
+              <w:widowControl w:val="false"/>
+              <w:spacing w:lineRule="auto" w:line="180" w:before="0" w:after="60"/>
+              <w:jc w:val="center"/>
+              <w:rPr>
+                <w:color w:val="000000"/>
+                <w:sz w:val="16"/>
+                <w:szCs w:val="16"/>
+              </w:rPr>
+            </w:pPr>
+            <w:r>
+              <w:rPr>
+                <w:rFonts w:eastAsia="arial" w:ascii="arial" w:hAnsi="arial"/>
+                <w:b/>
+                <w:color w:val="000000"/>
+                <w:sz w:val="16"/>
+                <w:szCs w:val="16"/>
+              </w:rPr>
+              <w:t>Pause</w:t>
+            </w:r>
+          </w:p>
+        </w:tc>
+        <w:tc>
+          <w:tcPr>
+            <w:tcW w:w="1019" w:type="dxa"/>
+            <w:tcBorders>
+              <w:top w:val="single" w:sz="4" w:space="0" w:color="000000"/>
+              <w:left w:val="single" w:sz="4" w:space="0" w:color="000000"/>
+              <w:bottom w:val="single" w:sz="4" w:space="0" w:color="000000"/>
+            </w:tcBorders>
+            <w:vAlign w:val="bottom"/>
+          </w:tcPr>
+          <w:p>
+            <w:pPr>
+              <w:pStyle w:val="Normal"/>
+              <w:widowControl w:val="false"/>
+              <w:spacing w:lineRule="auto" w:line="180"/>
+              <w:jc w:val="center"/>
+              <w:rPr>
+                <w:color w:val="000000"/>
+                <w:sz w:val="16"/>
+                <w:szCs w:val="16"/>
+              </w:rPr>
+            </w:pPr>
+            <w:r>
+              <w:rPr>
+                <w:color w:val="000000"/>
+                <w:sz w:val="16"/>
+                <w:szCs w:val="16"/>
+              </w:rPr>
+              <w:t>Master Key</w:t>
+            </w:r>
+          </w:p>
+        </w:tc>
+        <w:tc>
+          <w:tcPr>
+            <w:tcW w:w="1014" w:type="dxa"/>
+            <w:tcBorders>
+              <w:top w:val="single" w:sz="4" w:space="0" w:color="000000"/>
+              <w:left w:val="single" w:sz="4" w:space="0" w:color="000000"/>
+              <w:bottom w:val="single" w:sz="4" w:space="0" w:color="000000"/>
+            </w:tcBorders>
+            <w:vAlign w:val="bottom"/>
+          </w:tcPr>
+          <w:p>
+            <w:pPr>
+              <w:pStyle w:val="Normal"/>
+              <w:widowControl w:val="false"/>
+              <w:spacing w:lineRule="auto" w:line="180"/>
+              <w:jc w:val="center"/>
+              <w:rPr>
+                <w:color w:val="000000"/>
+                <w:sz w:val="16"/>
+                <w:szCs w:val="16"/>
+              </w:rPr>
+            </w:pPr>
+            <w:r>
+              <w:rPr>
+                <w:color w:val="000000"/>
+                <w:sz w:val="16"/>
+                <w:szCs w:val="16"/>
+              </w:rPr>
+              <w:t>Aux On</w:t>
+            </w:r>
+          </w:p>
+        </w:tc>
+        <w:tc>
+          <w:tcPr>
+            <w:tcW w:w="1016" w:type="dxa"/>
+            <w:tcBorders>
+              <w:top w:val="single" w:sz="4" w:space="0" w:color="000000"/>
+              <w:left w:val="single" w:sz="4" w:space="0" w:color="000000"/>
+              <w:bottom w:val="single" w:sz="4" w:space="0" w:color="000000"/>
+            </w:tcBorders>
+            <w:vAlign w:val="bottom"/>
+          </w:tcPr>
+          <w:p>
+            <w:pPr>
+              <w:pStyle w:val="Normal"/>
+              <w:widowControl w:val="false"/>
+              <w:spacing w:lineRule="auto" w:line="180"/>
+              <w:jc w:val="center"/>
+              <w:rPr>
+                <w:color w:val="000000"/>
+                <w:sz w:val="16"/>
+                <w:szCs w:val="16"/>
+              </w:rPr>
+            </w:pPr>
+            <w:r>
+              <w:rPr>
+                <w:color w:val="000000"/>
+                <w:sz w:val="16"/>
+                <w:szCs w:val="16"/>
+              </w:rPr>
+              <w:t>AWS/TPWS</w:t>
+            </w:r>
+          </w:p>
+        </w:tc>
+        <w:tc>
+          <w:tcPr>
+            <w:tcW w:w="1020" w:type="dxa"/>
+            <w:tcBorders>
+              <w:top w:val="single" w:sz="4" w:space="0" w:color="000000"/>
+              <w:left w:val="single" w:sz="4" w:space="0" w:color="000000"/>
+              <w:bottom w:val="single" w:sz="4" w:space="0" w:color="000000"/>
+            </w:tcBorders>
+            <w:vAlign w:val="bottom"/>
+          </w:tcPr>
+          <w:p>
+            <w:pPr>
+              <w:pStyle w:val="Normal"/>
+              <w:widowControl w:val="false"/>
+              <w:spacing w:lineRule="auto" w:line="180"/>
+              <w:jc w:val="center"/>
+              <w:rPr>
+                <w:color w:val="000000"/>
+                <w:sz w:val="16"/>
+                <w:szCs w:val="16"/>
+              </w:rPr>
+            </w:pPr>
+            <w:r>
+              <w:rPr>
+                <w:color w:val="000000"/>
+                <w:sz w:val="16"/>
+                <w:szCs w:val="16"/>
+              </w:rPr>
+              <w:t>Panto. Up/Shoe L</w:t>
+            </w:r>
+          </w:p>
+        </w:tc>
+        <w:tc>
+          <w:tcPr>
+            <w:tcW w:w="1016" w:type="dxa"/>
+            <w:tcBorders>
+              <w:top w:val="single" w:sz="4" w:space="0" w:color="000000"/>
+              <w:left w:val="single" w:sz="4" w:space="0" w:color="000000"/>
+              <w:bottom w:val="single" w:sz="4" w:space="0" w:color="000000"/>
+            </w:tcBorders>
+            <w:vAlign w:val="bottom"/>
+          </w:tcPr>
+          <w:p>
+            <w:pPr>
+              <w:pStyle w:val="Normal"/>
+              <w:widowControl w:val="false"/>
+              <w:spacing w:lineRule="auto" w:line="180"/>
+              <w:jc w:val="center"/>
+              <w:rPr>
+                <w:color w:val="000000"/>
+                <w:sz w:val="16"/>
+                <w:szCs w:val="16"/>
+              </w:rPr>
+            </w:pPr>
+            <w:r>
+              <w:rPr>
+                <w:color w:val="000000"/>
+                <w:sz w:val="16"/>
+                <w:szCs w:val="16"/>
+              </w:rPr>
+              <w:t>AC</w:t>
+            </w:r>
+          </w:p>
+        </w:tc>
+        <w:tc>
+          <w:tcPr>
+            <w:tcW w:w="1016" w:type="dxa"/>
+            <w:tcBorders>
+              <w:top w:val="single" w:sz="4" w:space="0" w:color="000000"/>
+              <w:left w:val="single" w:sz="4" w:space="0" w:color="000000"/>
+              <w:bottom w:val="single" w:sz="4" w:space="0" w:color="000000"/>
+            </w:tcBorders>
+            <w:vAlign w:val="bottom"/>
+          </w:tcPr>
+          <w:p>
+            <w:pPr>
+              <w:pStyle w:val="Normal"/>
+              <w:widowControl w:val="false"/>
+              <w:jc w:val="center"/>
+              <w:rPr>
+                <w:sz w:val="16"/>
+                <w:szCs w:val="16"/>
+              </w:rPr>
+            </w:pPr>
+            <w:r>
+              <w:rPr>
+                <w:sz w:val="16"/>
+                <w:szCs w:val="16"/>
+              </w:rPr>
+              <w:t>DRA</w:t>
+            </w:r>
+          </w:p>
+        </w:tc>
+        <w:tc>
+          <w:tcPr>
+            <w:tcW w:w="1017" w:type="dxa"/>
+            <w:tcBorders>
+              <w:top w:val="single" w:sz="4" w:space="0" w:color="000000"/>
+              <w:left w:val="single" w:sz="4" w:space="0" w:color="000000"/>
+              <w:bottom w:val="single" w:sz="4" w:space="0" w:color="000000"/>
+            </w:tcBorders>
+            <w:vAlign w:val="bottom"/>
+          </w:tcPr>
+          <w:p>
+            <w:pPr>
+              <w:pStyle w:val="Normal"/>
+              <w:widowControl w:val="false"/>
+              <w:jc w:val="center"/>
+              <w:rPr>
+                <w:color w:val="000000"/>
+                <w:sz w:val="16"/>
+                <w:szCs w:val="16"/>
+              </w:rPr>
+            </w:pPr>
+            <w:r>
+              <w:rPr>
+                <w:color w:val="000000"/>
+                <w:sz w:val="16"/>
+                <w:szCs w:val="16"/>
+              </w:rPr>
+              <w:t>Hill Start</w:t>
+            </w:r>
+          </w:p>
+        </w:tc>
+        <w:tc>
+          <w:tcPr>
+            <w:tcW w:w="1016" w:type="dxa"/>
+            <w:tcBorders>
+              <w:top w:val="single" w:sz="4" w:space="0" w:color="000000"/>
+              <w:left w:val="single" w:sz="4" w:space="0" w:color="000000"/>
+              <w:bottom w:val="single" w:sz="4" w:space="0" w:color="000000"/>
+            </w:tcBorders>
+            <w:vAlign w:val="bottom"/>
+          </w:tcPr>
+          <w:p>
+            <w:pPr>
+              <w:pStyle w:val="Normal"/>
+              <w:widowControl w:val="false"/>
+              <w:jc w:val="center"/>
+              <w:rPr>
+                <w:sz w:val="16"/>
+                <w:szCs w:val="16"/>
+              </w:rPr>
+            </w:pPr>
+            <w:r>
+              <w:rPr>
+                <w:sz w:val="16"/>
+                <w:szCs w:val="16"/>
+              </w:rPr>
+              <w:t>Brake Release</w:t>
+            </w:r>
+          </w:p>
+        </w:tc>
+        <w:tc>
+          <w:tcPr>
+            <w:tcW w:w="1020" w:type="dxa"/>
+            <w:tcBorders>
+              <w:top w:val="single" w:sz="4" w:space="0" w:color="000000"/>
+              <w:left w:val="single" w:sz="4" w:space="0" w:color="000000"/>
+              <w:bottom w:val="single" w:sz="4" w:space="0" w:color="000000"/>
+            </w:tcBorders>
+            <w:vAlign w:val="bottom"/>
+          </w:tcPr>
+          <w:p>
+            <w:pPr>
+              <w:pStyle w:val="Normal"/>
+              <w:widowControl w:val="false"/>
+              <w:jc w:val="center"/>
+              <w:rPr>
+                <w:color w:val="000000"/>
+                <w:sz w:val="16"/>
+                <w:szCs w:val="16"/>
+              </w:rPr>
+            </w:pPr>
+            <w:r>
+              <w:rPr>
+                <w:color w:val="000000"/>
+                <w:sz w:val="16"/>
+                <w:szCs w:val="16"/>
+              </w:rPr>
+              <w:t>Hazard Light</w:t>
+            </w:r>
+          </w:p>
+        </w:tc>
+        <w:tc>
+          <w:tcPr>
+            <w:tcW w:w="1016" w:type="dxa"/>
+            <w:tcBorders>
+              <w:top w:val="single" w:sz="4" w:space="0" w:color="000000"/>
+              <w:left w:val="single" w:sz="4" w:space="0" w:color="000000"/>
+              <w:bottom w:val="single" w:sz="4" w:space="0" w:color="000000"/>
+            </w:tcBorders>
+            <w:vAlign w:val="bottom"/>
+          </w:tcPr>
+          <w:p>
+            <w:pPr>
+              <w:pStyle w:val="Normal"/>
+              <w:widowControl w:val="false"/>
+              <w:spacing w:lineRule="auto" w:line="180"/>
+              <w:jc w:val="center"/>
+              <w:rPr>
+                <w:sz w:val="16"/>
+                <w:szCs w:val="16"/>
+              </w:rPr>
+            </w:pPr>
+            <w:r>
+              <w:rPr>
+                <w:rFonts w:eastAsia="arial" w:ascii="arial" w:hAnsi="arial"/>
+                <w:color w:val="000000"/>
+                <w:sz w:val="16"/>
+                <w:szCs w:val="16"/>
+              </w:rPr>
+              <w:t>Cab Light</w:t>
+            </w:r>
+          </w:p>
+        </w:tc>
+        <w:tc>
+          <w:tcPr>
+            <w:tcW w:w="1016" w:type="dxa"/>
+            <w:tcBorders>
+              <w:top w:val="single" w:sz="4" w:space="0" w:color="000000"/>
+              <w:left w:val="single" w:sz="4" w:space="0" w:color="000000"/>
+              <w:bottom w:val="single" w:sz="4" w:space="0" w:color="000000"/>
+            </w:tcBorders>
+            <w:vAlign w:val="bottom"/>
+          </w:tcPr>
+          <w:p>
+            <w:pPr>
+              <w:pStyle w:val="Normal"/>
+              <w:widowControl w:val="false"/>
+              <w:jc w:val="center"/>
+              <w:rPr>
+                <w:color w:val="000000"/>
+                <w:sz w:val="16"/>
+                <w:szCs w:val="16"/>
+              </w:rPr>
+            </w:pPr>
+            <w:r>
+              <w:rPr>
+                <w:color w:val="000000"/>
+                <w:sz w:val="16"/>
+                <w:szCs w:val="16"/>
+              </w:rPr>
+              <w:t>Couple</w:t>
+            </w:r>
+          </w:p>
+        </w:tc>
+        <w:tc>
+          <w:tcPr>
+            <w:tcW w:w="1016" w:type="dxa"/>
+            <w:tcBorders>
+              <w:top w:val="single" w:sz="4" w:space="0" w:color="000000"/>
+              <w:left w:val="single" w:sz="4" w:space="0" w:color="000000"/>
+              <w:bottom w:val="single" w:sz="4" w:space="0" w:color="000000"/>
+            </w:tcBorders>
+            <w:vAlign w:val="bottom"/>
+          </w:tcPr>
+          <w:p>
+            <w:pPr>
+              <w:pStyle w:val="Normal"/>
+              <w:widowControl w:val="false"/>
+              <w:spacing w:lineRule="auto" w:line="180"/>
+              <w:jc w:val="center"/>
+              <w:rPr>
+                <w:sz w:val="16"/>
+                <w:szCs w:val="16"/>
+              </w:rPr>
+            </w:pPr>
+            <w:r>
+              <w:rPr>
+                <w:rFonts w:eastAsia="arial" w:ascii="arial" w:hAnsi="arial"/>
+                <w:color w:val="000000"/>
+                <w:sz w:val="16"/>
+                <w:szCs w:val="16"/>
+              </w:rPr>
+              <w:t>1-Person</w:t>
+            </w:r>
+          </w:p>
+        </w:tc>
+        <w:tc>
+          <w:tcPr>
+            <w:tcW w:w="1029" w:type="dxa"/>
+            <w:tcBorders>
+              <w:top w:val="single" w:sz="4" w:space="0" w:color="000000"/>
+              <w:left w:val="single" w:sz="4" w:space="0" w:color="000000"/>
+              <w:bottom w:val="single" w:sz="4" w:space="0" w:color="000000"/>
+              <w:right w:val="single" w:sz="4" w:space="0" w:color="000000"/>
+            </w:tcBorders>
+            <w:vAlign w:val="bottom"/>
+          </w:tcPr>
+          <w:p>
+            <w:pPr>
+              <w:pStyle w:val="Normal"/>
+              <w:widowControl w:val="false"/>
+              <w:spacing w:lineRule="auto" w:line="180"/>
+              <w:jc w:val="center"/>
+              <w:rPr>
+                <w:sz w:val="16"/>
+                <w:szCs w:val="16"/>
+              </w:rPr>
+            </w:pPr>
+            <w:r>
+              <w:rPr>
+                <w:rFonts w:eastAsia="arial" w:ascii="arial" w:hAnsi="arial"/>
+                <w:color w:val="000000"/>
+                <w:sz w:val="16"/>
+                <w:szCs w:val="16"/>
+              </w:rPr>
+              <w:t>Next</w:t>
+            </w:r>
+          </w:p>
+          <w:p>
+            <w:pPr>
+              <w:pStyle w:val="Normal"/>
+              <w:widowControl w:val="false"/>
+              <w:spacing w:lineRule="auto" w:line="180"/>
+              <w:jc w:val="center"/>
+              <w:rPr>
+                <w:sz w:val="16"/>
+                <w:szCs w:val="16"/>
+              </w:rPr>
+            </w:pPr>
+            <w:r>
+              <w:rPr>
+                <w:rFonts w:eastAsia="arial" w:ascii="arial" w:hAnsi="arial"/>
+                <w:color w:val="000000"/>
+                <w:sz w:val="16"/>
+                <w:szCs w:val="16"/>
+              </w:rPr>
+              <w:t>Cab Cam</w:t>
+            </w:r>
+          </w:p>
+        </w:tc>
+      </w:tr>
+    </w:tbl>
+    <w:p>
+      <w:pPr>
+        <w:pStyle w:val="Normal"/>
+        <w:rPr>
+          <w:rFonts w:ascii="arial" w:hAnsi="arial" w:eastAsia="arial"/>
+          <w:color w:val="000000"/>
+          <w:sz w:val="16"/>
+          <w:szCs w:val="16"/>
+        </w:rPr>
+      </w:pPr>
+      <w:r>
+        <w:rPr>
+          <w:rFonts w:eastAsia="arial" w:ascii="arial" w:hAnsi="arial"/>
+          <w:color w:val="000000"/>
+          <w:sz w:val="16"/>
+          <w:szCs w:val="16"/>
+        </w:rPr>
+      </w:r>
+    </w:p>
+    <w:p>
+      <w:pPr>
+        <w:pStyle w:val="Normal"/>
+        <w:rPr>
+          <w:color w:val="000000"/>
+          <w:sz w:val="16"/>
+          <w:szCs w:val="16"/>
+        </w:rPr>
+      </w:pPr>
+      <w:r>
+        <w:rPr>
+          <w:rFonts w:eastAsia="arial" w:ascii="arial" w:hAnsi="arial"/>
+          <w:color w:val="000000"/>
+          <w:sz w:val="16"/>
+          <w:szCs w:val="16"/>
+        </w:rPr>
+        <w:tab/>
+        <w:t xml:space="preserve">           Class 3</w:t>
+      </w:r>
+      <w:r>
+        <w:rPr>
+          <w:rFonts w:eastAsia="arial" w:ascii="arial" w:hAnsi="arial"/>
+          <w:color w:val="000000"/>
+          <w:sz w:val="16"/>
+          <w:szCs w:val="16"/>
+        </w:rPr>
+        <w:t>87</w:t>
+      </w:r>
+      <w:r>
+        <w:rPr>
+          <w:rFonts w:eastAsia="arial" w:ascii="arial" w:hAnsi="arial"/>
+          <w:color w:val="000000"/>
+          <w:sz w:val="16"/>
+          <w:szCs w:val="16"/>
+        </w:rPr>
+        <w:t>-2</w:t>
+      </w:r>
+    </w:p>
+    <w:tbl>
+      <w:tblPr>
+        <w:tblW w:w="14248" w:type="dxa"/>
+        <w:jc w:val="left"/>
+        <w:tblInd w:w="-5" w:type="dxa"/>
+        <w:tblLayout w:type="fixed"/>
+        <w:tblCellMar>
+          <w:top w:w="0" w:type="dxa"/>
+          <w:left w:w="108" w:type="dxa"/>
+          <w:bottom w:w="0" w:type="dxa"/>
+          <w:right w:w="108" w:type="dxa"/>
+        </w:tblCellMar>
+        <w:tblLook w:firstRow="1" w:noVBand="1" w:lastRow="0" w:firstColumn="1" w:lastColumn="0" w:noHBand="0" w:val="04a0"/>
+      </w:tblPr>
+      <w:tblGrid>
+        <w:gridCol w:w="1017"/>
+        <w:gridCol w:w="1019"/>
+        <w:gridCol w:w="1014"/>
+        <w:gridCol w:w="1016"/>
+        <w:gridCol w:w="1020"/>
+        <w:gridCol w:w="1016"/>
+        <w:gridCol w:w="1016"/>
+        <w:gridCol w:w="1017"/>
+        <w:gridCol w:w="1016"/>
+        <w:gridCol w:w="1020"/>
+        <w:gridCol w:w="1016"/>
+        <w:gridCol w:w="1016"/>
+        <w:gridCol w:w="1016"/>
+        <w:gridCol w:w="1029"/>
+      </w:tblGrid>
+      <w:tr>
+        <w:trPr>
+          <w:trHeight w:val="440" w:hRule="exact"/>
+          <w:cantSplit w:val="true"/>
+        </w:trPr>
+        <w:tc>
+          <w:tcPr>
+            <w:tcW w:w="1017" w:type="dxa"/>
+            <w:tcBorders>
+              <w:top w:val="single" w:sz="4" w:space="0" w:color="000000"/>
+              <w:left w:val="single" w:sz="4" w:space="0" w:color="000000"/>
+              <w:bottom w:val="single" w:sz="4" w:space="0" w:color="000000"/>
+            </w:tcBorders>
+            <w:vAlign w:val="bottom"/>
+          </w:tcPr>
+          <w:p>
+            <w:pPr>
+              <w:pStyle w:val="Normal"/>
+              <w:widowControl w:val="false"/>
+              <w:spacing w:lineRule="auto" w:line="180" w:before="0" w:after="60"/>
+              <w:jc w:val="center"/>
+              <w:rPr>
+                <w:b/>
+                <w:bCs/>
+              </w:rPr>
+            </w:pPr>
+            <w:r>
+              <w:rPr>
+                <w:b/>
+                <w:bCs/>
+                <w:color w:val="000000"/>
+                <w:sz w:val="16"/>
+                <w:szCs w:val="16"/>
+              </w:rPr>
+              <w:t>HUD</w:t>
+            </w:r>
+          </w:p>
+        </w:tc>
+        <w:tc>
+          <w:tcPr>
+            <w:tcW w:w="1019" w:type="dxa"/>
+            <w:tcBorders>
+              <w:top w:val="single" w:sz="4" w:space="0" w:color="000000"/>
+              <w:left w:val="single" w:sz="4" w:space="0" w:color="000000"/>
+              <w:bottom w:val="single" w:sz="4" w:space="0" w:color="000000"/>
+            </w:tcBorders>
+            <w:vAlign w:val="bottom"/>
+          </w:tcPr>
+          <w:p>
+            <w:pPr>
+              <w:pStyle w:val="Normal"/>
+              <w:widowControl w:val="false"/>
+              <w:spacing w:lineRule="auto" w:line="180"/>
+              <w:jc w:val="center"/>
+              <w:rPr>
+                <w:color w:val="000000"/>
+                <w:sz w:val="16"/>
+                <w:szCs w:val="16"/>
+              </w:rPr>
+            </w:pPr>
+            <w:r>
+              <w:rPr>
+                <w:color w:val="000000"/>
+                <w:sz w:val="16"/>
+                <w:szCs w:val="16"/>
+              </w:rPr>
+              <w:t>Schedule</w:t>
+            </w:r>
+          </w:p>
+        </w:tc>
+        <w:tc>
+          <w:tcPr>
+            <w:tcW w:w="1014" w:type="dxa"/>
+            <w:tcBorders>
+              <w:top w:val="single" w:sz="4" w:space="0" w:color="000000"/>
+              <w:left w:val="single" w:sz="4" w:space="0" w:color="000000"/>
+              <w:bottom w:val="single" w:sz="4" w:space="0" w:color="000000"/>
+            </w:tcBorders>
+            <w:vAlign w:val="bottom"/>
+          </w:tcPr>
+          <w:p>
+            <w:pPr>
+              <w:pStyle w:val="Normal"/>
+              <w:widowControl w:val="false"/>
+              <w:spacing w:lineRule="auto" w:line="180"/>
+              <w:jc w:val="center"/>
+              <w:rPr>
+                <w:color w:val="000000"/>
+                <w:sz w:val="16"/>
+                <w:szCs w:val="16"/>
+              </w:rPr>
+            </w:pPr>
+            <w:r>
+              <w:rPr>
+                <w:color w:val="000000"/>
+                <w:sz w:val="16"/>
+                <w:szCs w:val="16"/>
+              </w:rPr>
+              <w:t>Aux Off</w:t>
+            </w:r>
+          </w:p>
+        </w:tc>
+        <w:tc>
+          <w:tcPr>
             <w:tcW w:w="1016" w:type="dxa"/>
             <w:tcBorders>
               <w:top w:val="single" w:sz="4" w:space="0" w:color="000000"/>
@@ -35274,41 +37473,38 @@
                 <w:sz w:val="16"/>
                 <w:szCs w:val="16"/>
               </w:rPr>
-              <w:t>Panto. L</w:t>
-            </w:r>
-            <w:r>
-              <w:rPr>
-                <w:color w:val="000000"/>
-                <w:sz w:val="16"/>
-                <w:szCs w:val="16"/>
-              </w:rPr>
-              <w:t>ow</w:t>
-            </w:r>
-          </w:p>
-        </w:tc>
-        <w:tc>
-          <w:tcPr>
-            <w:tcW w:w="1016" w:type="dxa"/>
-            <w:tcBorders>
-              <w:top w:val="single" w:sz="4" w:space="0" w:color="000000"/>
-              <w:left w:val="single" w:sz="4" w:space="0" w:color="000000"/>
-              <w:bottom w:val="single" w:sz="4" w:space="0" w:color="000000"/>
-            </w:tcBorders>
-            <w:vAlign w:val="bottom"/>
-          </w:tcPr>
-          <w:p>
-            <w:pPr>
-              <w:pStyle w:val="Normal"/>
-              <w:widowControl w:val="false"/>
-              <w:spacing w:lineRule="auto" w:line="180"/>
-              <w:jc w:val="center"/>
-              <w:rPr>
-                <w:sz w:val="16"/>
-                <w:szCs w:val="16"/>
-              </w:rPr>
-            </w:pPr>
-            <w:r>
-              <w:rPr/>
+              <w:t>Panto. L/Shoe Up</w:t>
+            </w:r>
+          </w:p>
+        </w:tc>
+        <w:tc>
+          <w:tcPr>
+            <w:tcW w:w="1016" w:type="dxa"/>
+            <w:tcBorders>
+              <w:top w:val="single" w:sz="4" w:space="0" w:color="000000"/>
+              <w:left w:val="single" w:sz="4" w:space="0" w:color="000000"/>
+              <w:bottom w:val="single" w:sz="4" w:space="0" w:color="000000"/>
+            </w:tcBorders>
+            <w:vAlign w:val="bottom"/>
+          </w:tcPr>
+          <w:p>
+            <w:pPr>
+              <w:pStyle w:val="Normal"/>
+              <w:widowControl w:val="false"/>
+              <w:spacing w:lineRule="auto" w:line="180"/>
+              <w:jc w:val="center"/>
+              <w:rPr>
+                <w:sz w:val="16"/>
+                <w:szCs w:val="16"/>
+              </w:rPr>
+            </w:pPr>
+            <w:r>
+              <w:rPr>
+                <w:color w:val="000000"/>
+                <w:sz w:val="16"/>
+                <w:szCs w:val="16"/>
+              </w:rPr>
+              <w:t>DC</w:t>
             </w:r>
           </w:p>
         </w:tc>
@@ -35364,36 +37560,41 @@
               </w:rPr>
             </w:pPr>
             <w:r>
-              <w:rPr/>
-            </w:r>
-          </w:p>
-        </w:tc>
-        <w:tc>
-          <w:tcPr>
-            <w:tcW w:w="1016" w:type="dxa"/>
-            <w:tcBorders>
-              <w:top w:val="single" w:sz="4" w:space="0" w:color="000000"/>
-              <w:left w:val="single" w:sz="4" w:space="0" w:color="000000"/>
-              <w:bottom w:val="single" w:sz="4" w:space="0" w:color="000000"/>
-            </w:tcBorders>
-            <w:vAlign w:val="bottom"/>
-          </w:tcPr>
-          <w:p>
-            <w:pPr>
-              <w:pStyle w:val="Normal"/>
-              <w:widowControl w:val="false"/>
-              <w:jc w:val="center"/>
-              <w:rPr>
-                <w:sz w:val="16"/>
-                <w:szCs w:val="16"/>
-              </w:rPr>
-            </w:pPr>
-            <w:r>
-              <w:rPr>
-                <w:sz w:val="16"/>
-                <w:szCs w:val="16"/>
-              </w:rPr>
-              <w:t>Gangway Retract</w:t>
+              <w:rPr>
+                <w:color w:val="000000"/>
+                <w:sz w:val="16"/>
+                <w:szCs w:val="16"/>
+              </w:rPr>
+              <w:t>Manual Supp.</w:t>
+            </w:r>
+          </w:p>
+        </w:tc>
+        <w:tc>
+          <w:tcPr>
+            <w:tcW w:w="1016" w:type="dxa"/>
+            <w:tcBorders>
+              <w:top w:val="single" w:sz="4" w:space="0" w:color="000000"/>
+              <w:left w:val="single" w:sz="4" w:space="0" w:color="000000"/>
+              <w:bottom w:val="single" w:sz="4" w:space="0" w:color="000000"/>
+            </w:tcBorders>
+            <w:vAlign w:val="bottom"/>
+          </w:tcPr>
+          <w:p>
+            <w:pPr>
+              <w:pStyle w:val="Normal"/>
+              <w:widowControl w:val="false"/>
+              <w:jc w:val="center"/>
+              <w:rPr>
+                <w:sz w:val="16"/>
+                <w:szCs w:val="16"/>
+              </w:rPr>
+            </w:pPr>
+            <w:r>
+              <w:rPr>
+                <w:sz w:val="16"/>
+                <w:szCs w:val="16"/>
+              </w:rPr>
+              <w:t>Train Fault Ack.</w:t>
             </w:r>
           </w:p>
         </w:tc>
@@ -35420,59 +37621,74 @@
               </w:rPr>
             </w:pPr>
             <w:r>
-              <w:rPr/>
-            </w:r>
-          </w:p>
-        </w:tc>
-        <w:tc>
-          <w:tcPr>
-            <w:tcW w:w="1016" w:type="dxa"/>
-            <w:tcBorders>
-              <w:top w:val="single" w:sz="4" w:space="0" w:color="000000"/>
-              <w:left w:val="single" w:sz="4" w:space="0" w:color="000000"/>
-              <w:bottom w:val="single" w:sz="4" w:space="0" w:color="000000"/>
-            </w:tcBorders>
-            <w:vAlign w:val="bottom"/>
-          </w:tcPr>
-          <w:p>
-            <w:pPr>
-              <w:pStyle w:val="Normal"/>
-              <w:widowControl w:val="false"/>
-              <w:jc w:val="center"/>
-              <w:rPr>
-                <w:color w:val="000000"/>
-                <w:sz w:val="16"/>
-                <w:szCs w:val="16"/>
-              </w:rPr>
-            </w:pPr>
-            <w:r>
-              <w:rPr/>
-            </w:r>
-          </w:p>
-        </w:tc>
-        <w:tc>
-          <w:tcPr>
-            <w:tcW w:w="1016" w:type="dxa"/>
-            <w:tcBorders>
-              <w:top w:val="single" w:sz="4" w:space="0" w:color="000000"/>
-              <w:left w:val="single" w:sz="4" w:space="0" w:color="000000"/>
-              <w:bottom w:val="single" w:sz="4" w:space="0" w:color="000000"/>
-            </w:tcBorders>
-            <w:vAlign w:val="bottom"/>
-          </w:tcPr>
-          <w:p>
-            <w:pPr>
-              <w:pStyle w:val="Normal"/>
-              <w:widowControl w:val="false"/>
-              <w:spacing w:lineRule="auto" w:line="180"/>
-              <w:jc w:val="center"/>
-              <w:rPr>
-                <w:sz w:val="16"/>
-                <w:szCs w:val="16"/>
-              </w:rPr>
-            </w:pPr>
-            <w:r>
-              <w:rPr/>
+              <w:rPr>
+                <w:rFonts w:eastAsia="arial" w:ascii="arial" w:hAnsi="arial"/>
+                <w:color w:val="000000"/>
+                <w:sz w:val="16"/>
+                <w:szCs w:val="16"/>
+              </w:rPr>
+              <w:t>Notice Bd. Light</w:t>
+            </w:r>
+          </w:p>
+        </w:tc>
+        <w:tc>
+          <w:tcPr>
+            <w:tcW w:w="1016" w:type="dxa"/>
+            <w:tcBorders>
+              <w:top w:val="single" w:sz="4" w:space="0" w:color="000000"/>
+              <w:left w:val="single" w:sz="4" w:space="0" w:color="000000"/>
+              <w:bottom w:val="single" w:sz="4" w:space="0" w:color="000000"/>
+            </w:tcBorders>
+            <w:vAlign w:val="bottom"/>
+          </w:tcPr>
+          <w:p>
+            <w:pPr>
+              <w:pStyle w:val="Normal"/>
+              <w:widowControl w:val="false"/>
+              <w:jc w:val="center"/>
+              <w:rPr>
+                <w:color w:val="000000"/>
+                <w:sz w:val="16"/>
+                <w:szCs w:val="16"/>
+              </w:rPr>
+            </w:pPr>
+            <w:r>
+              <w:rPr>
+                <w:color w:val="000000"/>
+                <w:sz w:val="16"/>
+                <w:szCs w:val="16"/>
+              </w:rPr>
+              <w:t>Tail Light</w:t>
+            </w:r>
+          </w:p>
+        </w:tc>
+        <w:tc>
+          <w:tcPr>
+            <w:tcW w:w="1016" w:type="dxa"/>
+            <w:tcBorders>
+              <w:top w:val="single" w:sz="4" w:space="0" w:color="000000"/>
+              <w:left w:val="single" w:sz="4" w:space="0" w:color="000000"/>
+              <w:bottom w:val="single" w:sz="4" w:space="0" w:color="000000"/>
+            </w:tcBorders>
+            <w:vAlign w:val="bottom"/>
+          </w:tcPr>
+          <w:p>
+            <w:pPr>
+              <w:pStyle w:val="Normal"/>
+              <w:widowControl w:val="false"/>
+              <w:spacing w:lineRule="auto" w:line="180"/>
+              <w:jc w:val="center"/>
+              <w:rPr>
+                <w:sz w:val="16"/>
+                <w:szCs w:val="16"/>
+              </w:rPr>
+            </w:pPr>
+            <w:r>
+              <w:rPr>
+                <w:sz w:val="16"/>
+                <w:szCs w:val="16"/>
+              </w:rPr>
+              <w:t>Uncouple</w:t>
             </w:r>
           </w:p>
         </w:tc>
@@ -36623,12 +38839,12 @@
       <w:rFonts w:ascii="Symbol" w:hAnsi="Symbol" w:cs="Symbol"/>
     </w:rPr>
   </w:style>
-  <w:style w:type="character" w:styleId="Style5" w:customStyle="1">
-    <w:name w:val="번호 매기기 기호"/>
+  <w:style w:type="character" w:styleId="user" w:customStyle="1">
+    <w:name w:val="번호 매기기 기호 (user)"/>
     <w:qFormat/>
     <w:rPr/>
   </w:style>
-  <w:style w:type="paragraph" w:styleId="Style6">
+  <w:style w:type="paragraph" w:styleId="Style5">
     <w:name w:val="제목"/>
     <w:basedOn w:val="Normal"/>
     <w:next w:val="BodyText"/>
@@ -36638,7 +38854,7 @@
       <w:spacing w:before="240" w:after="120"/>
     </w:pPr>
     <w:rPr>
-      <w:rFonts w:ascii="Liberation Sans" w:hAnsi="Liberation Sans" w:eastAsia="나눔고딕" w:cs="Arial"/>
+      <w:rFonts w:ascii="Liberation Sans" w:hAnsi="Liberation Sans" w:eastAsia="Noto Sans CJK KR" w:cs="Lohit Devanagari"/>
       <w:sz w:val="28"/>
       <w:szCs w:val="28"/>
     </w:rPr>
@@ -36675,7 +38891,7 @@
       <w:szCs w:val="24"/>
     </w:rPr>
   </w:style>
-  <w:style w:type="paragraph" w:styleId="Style7">
+  <w:style w:type="paragraph" w:styleId="Style6" w:customStyle="1">
     <w:name w:val="색인"/>
     <w:basedOn w:val="Normal"/>
     <w:qFormat/>
@@ -36683,11 +38899,10 @@
       <w:suppressLineNumbers/>
     </w:pPr>
     <w:rPr>
-      <w:rFonts w:cs="Arial"/>
-      <w:sz w:val="24"/>
+      <w:rFonts w:cs="Lohit Devanagari"/>
     </w:rPr>
   </w:style>
-  <w:style w:type="paragraph" w:styleId="user">
+  <w:style w:type="paragraph" w:styleId="user1">
     <w:name w:val="제목 (user)"/>
     <w:basedOn w:val="Normal"/>
     <w:next w:val="BodyText"/>
@@ -36697,12 +38912,12 @@
       <w:spacing w:before="240" w:after="120"/>
     </w:pPr>
     <w:rPr>
-      <w:rFonts w:ascii="Liberation Sans" w:hAnsi="Liberation Sans" w:eastAsia="Noto Sans CJK KR" w:cs="Lohit Devanagari"/>
+      <w:rFonts w:ascii="Liberation Sans" w:hAnsi="Liberation Sans" w:eastAsia="나눔고딕" w:cs="Arial"/>
       <w:sz w:val="28"/>
       <w:szCs w:val="28"/>
     </w:rPr>
   </w:style>
-  <w:style w:type="paragraph" w:styleId="user1" w:customStyle="1">
+  <w:style w:type="paragraph" w:styleId="user2">
     <w:name w:val="색인 (user)"/>
     <w:basedOn w:val="Normal"/>
     <w:qFormat/>
@@ -36710,7 +38925,8 @@
       <w:suppressLineNumbers/>
     </w:pPr>
     <w:rPr>
-      <w:rFonts w:cs="Lohit Devanagari"/>
+      <w:rFonts w:cs="Arial"/>
+      <w:sz w:val="24"/>
     </w:rPr>
   </w:style>
   <w:style w:type="paragraph" w:styleId="Title">
@@ -37392,8 +39608,8 @@
       <w:szCs w:val="24"/>
     </w:rPr>
   </w:style>
-  <w:style w:type="paragraph" w:styleId="user2" w:customStyle="1">
-    <w:name w:val="표 내용 (user)"/>
+  <w:style w:type="paragraph" w:styleId="Style7" w:customStyle="1">
+    <w:name w:val="표 내용"/>
     <w:basedOn w:val="Normal"/>
     <w:qFormat/>
     <w:pPr>
@@ -37401,9 +39617,9 @@
     </w:pPr>
     <w:rPr/>
   </w:style>
-  <w:style w:type="paragraph" w:styleId="user3" w:customStyle="1">
-    <w:name w:val="표제목 (user)"/>
-    <w:basedOn w:val="user2"/>
+  <w:style w:type="paragraph" w:styleId="Style8" w:customStyle="1">
+    <w:name w:val="표제목"/>
+    <w:basedOn w:val="Style7"/>
     <w:qFormat/>
     <w:pPr>
       <w:jc w:val="center"/>
@@ -37413,8 +39629,8 @@
       <w:bCs/>
     </w:rPr>
   </w:style>
-  <w:style w:type="paragraph" w:styleId="Style8">
-    <w:name w:val="표 내용"/>
+  <w:style w:type="paragraph" w:styleId="user3">
+    <w:name w:val="표 내용 (user)"/>
     <w:basedOn w:val="Normal"/>
     <w:qFormat/>
     <w:pPr>
@@ -37423,9 +39639,9 @@
     </w:pPr>
     <w:rPr/>
   </w:style>
-  <w:style w:type="paragraph" w:styleId="Style9">
-    <w:name w:val="표제목"/>
-    <w:basedOn w:val="Style8"/>
+  <w:style w:type="paragraph" w:styleId="user4">
+    <w:name w:val="표제목 (user)"/>
+    <w:basedOn w:val="user3"/>
     <w:qFormat/>
     <w:pPr>
       <w:suppressLineNumbers/>

</xml_diff>

<commit_message>
Add Class 395 and 465
</commit_message>
<xml_diff>
--- a/raildriver-UK-Remapped.docx
+++ b/raildriver-UK-Remapped.docx
@@ -37769,25 +37769,7 @@
           <w:szCs w:val="16"/>
         </w:rPr>
         <w:tab/>
-        <w:t xml:space="preserve">           Class 3</w:t>
-      </w:r>
-      <w:r>
-        <w:rPr>
-          <w:rFonts w:eastAsia="arial" w:ascii="arial" w:hAnsi="arial"/>
-          <w:color w:val="000000"/>
-          <w:sz w:val="16"/>
-          <w:szCs w:val="16"/>
-        </w:rPr>
-        <w:t>90</w:t>
-      </w:r>
-      <w:r>
-        <w:rPr>
-          <w:rFonts w:eastAsia="arial" w:ascii="arial" w:hAnsi="arial"/>
-          <w:color w:val="000000"/>
-          <w:sz w:val="16"/>
-          <w:szCs w:val="16"/>
-        </w:rPr>
-        <w:t>-1</w:t>
+        <w:t xml:space="preserve">           Class 390-1</w:t>
       </w:r>
     </w:p>
     <w:tbl>
@@ -37919,15 +37901,7 @@
                 <w:sz w:val="16"/>
                 <w:szCs w:val="16"/>
               </w:rPr>
-              <w:t xml:space="preserve">Aux </w:t>
-            </w:r>
-            <w:r>
-              <w:rPr>
-                <w:color w:val="000000"/>
-                <w:sz w:val="16"/>
-                <w:szCs w:val="16"/>
-              </w:rPr>
-              <w:t>Set</w:t>
+              <w:t>Aux Set</w:t>
             </w:r>
           </w:p>
         </w:tc>
@@ -37991,15 +37965,7 @@
                 <w:sz w:val="16"/>
                 <w:szCs w:val="16"/>
               </w:rPr>
-              <w:t xml:space="preserve">Panto. </w:t>
-            </w:r>
-            <w:r>
-              <w:rPr>
-                <w:color w:val="000000"/>
-                <w:sz w:val="16"/>
-                <w:szCs w:val="16"/>
-              </w:rPr>
-              <w:t>Raise</w:t>
+              <w:t>Panto. Raise</w:t>
             </w:r>
           </w:p>
         </w:tc>
@@ -38342,7 +38308,564 @@
           <w:szCs w:val="16"/>
         </w:rPr>
         <w:tab/>
-        <w:t xml:space="preserve">           Class 3</w:t>
+        <w:t xml:space="preserve">           Class 390-2</w:t>
+      </w:r>
+    </w:p>
+    <w:tbl>
+      <w:tblPr>
+        <w:tblW w:w="14248" w:type="dxa"/>
+        <w:jc w:val="left"/>
+        <w:tblInd w:w="-5" w:type="dxa"/>
+        <w:tblLayout w:type="fixed"/>
+        <w:tblCellMar>
+          <w:top w:w="0" w:type="dxa"/>
+          <w:left w:w="108" w:type="dxa"/>
+          <w:bottom w:w="0" w:type="dxa"/>
+          <w:right w:w="108" w:type="dxa"/>
+        </w:tblCellMar>
+        <w:tblLook w:firstRow="1" w:noVBand="1" w:lastRow="0" w:firstColumn="1" w:lastColumn="0" w:noHBand="0" w:val="04a0"/>
+      </w:tblPr>
+      <w:tblGrid>
+        <w:gridCol w:w="1017"/>
+        <w:gridCol w:w="1019"/>
+        <w:gridCol w:w="1014"/>
+        <w:gridCol w:w="1016"/>
+        <w:gridCol w:w="1020"/>
+        <w:gridCol w:w="1016"/>
+        <w:gridCol w:w="1016"/>
+        <w:gridCol w:w="1017"/>
+        <w:gridCol w:w="1016"/>
+        <w:gridCol w:w="1020"/>
+        <w:gridCol w:w="1016"/>
+        <w:gridCol w:w="1016"/>
+        <w:gridCol w:w="1016"/>
+        <w:gridCol w:w="1029"/>
+      </w:tblGrid>
+      <w:tr>
+        <w:trPr>
+          <w:trHeight w:val="440" w:hRule="exact"/>
+          <w:cantSplit w:val="true"/>
+        </w:trPr>
+        <w:tc>
+          <w:tcPr>
+            <w:tcW w:w="1017" w:type="dxa"/>
+            <w:tcBorders>
+              <w:top w:val="single" w:sz="4" w:space="0" w:color="000000"/>
+              <w:left w:val="single" w:sz="4" w:space="0" w:color="000000"/>
+              <w:bottom w:val="single" w:sz="4" w:space="0" w:color="000000"/>
+            </w:tcBorders>
+            <w:vAlign w:val="bottom"/>
+          </w:tcPr>
+          <w:p>
+            <w:pPr>
+              <w:pStyle w:val="Normal"/>
+              <w:widowControl w:val="false"/>
+              <w:spacing w:lineRule="auto" w:line="180" w:before="0" w:after="60"/>
+              <w:jc w:val="center"/>
+              <w:rPr>
+                <w:b/>
+                <w:bCs/>
+              </w:rPr>
+            </w:pPr>
+            <w:r>
+              <w:rPr>
+                <w:b/>
+                <w:bCs/>
+                <w:color w:val="000000"/>
+                <w:sz w:val="16"/>
+                <w:szCs w:val="16"/>
+              </w:rPr>
+              <w:t>HUD</w:t>
+            </w:r>
+          </w:p>
+        </w:tc>
+        <w:tc>
+          <w:tcPr>
+            <w:tcW w:w="1019" w:type="dxa"/>
+            <w:tcBorders>
+              <w:top w:val="single" w:sz="4" w:space="0" w:color="000000"/>
+              <w:left w:val="single" w:sz="4" w:space="0" w:color="000000"/>
+              <w:bottom w:val="single" w:sz="4" w:space="0" w:color="000000"/>
+            </w:tcBorders>
+            <w:vAlign w:val="bottom"/>
+          </w:tcPr>
+          <w:p>
+            <w:pPr>
+              <w:pStyle w:val="Normal"/>
+              <w:widowControl w:val="false"/>
+              <w:spacing w:lineRule="auto" w:line="180"/>
+              <w:jc w:val="center"/>
+              <w:rPr>
+                <w:color w:val="000000"/>
+                <w:sz w:val="16"/>
+                <w:szCs w:val="16"/>
+              </w:rPr>
+            </w:pPr>
+            <w:r>
+              <w:rPr>
+                <w:color w:val="000000"/>
+                <w:sz w:val="16"/>
+                <w:szCs w:val="16"/>
+              </w:rPr>
+              <w:t>Schedule</w:t>
+            </w:r>
+          </w:p>
+        </w:tc>
+        <w:tc>
+          <w:tcPr>
+            <w:tcW w:w="1014" w:type="dxa"/>
+            <w:tcBorders>
+              <w:top w:val="single" w:sz="4" w:space="0" w:color="000000"/>
+              <w:left w:val="single" w:sz="4" w:space="0" w:color="000000"/>
+              <w:bottom w:val="single" w:sz="4" w:space="0" w:color="000000"/>
+            </w:tcBorders>
+            <w:vAlign w:val="bottom"/>
+          </w:tcPr>
+          <w:p>
+            <w:pPr>
+              <w:pStyle w:val="Normal"/>
+              <w:widowControl w:val="false"/>
+              <w:spacing w:lineRule="auto" w:line="180"/>
+              <w:jc w:val="center"/>
+              <w:rPr>
+                <w:color w:val="000000"/>
+                <w:sz w:val="16"/>
+                <w:szCs w:val="16"/>
+              </w:rPr>
+            </w:pPr>
+            <w:r>
+              <w:rPr>
+                <w:color w:val="000000"/>
+                <w:sz w:val="16"/>
+                <w:szCs w:val="16"/>
+              </w:rPr>
+              <w:t>Aux Trip</w:t>
+            </w:r>
+          </w:p>
+        </w:tc>
+        <w:tc>
+          <w:tcPr>
+            <w:tcW w:w="1016" w:type="dxa"/>
+            <w:tcBorders>
+              <w:top w:val="single" w:sz="4" w:space="0" w:color="000000"/>
+              <w:left w:val="single" w:sz="4" w:space="0" w:color="000000"/>
+              <w:bottom w:val="single" w:sz="4" w:space="0" w:color="000000"/>
+            </w:tcBorders>
+            <w:vAlign w:val="bottom"/>
+          </w:tcPr>
+          <w:p>
+            <w:pPr>
+              <w:pStyle w:val="Normal"/>
+              <w:widowControl w:val="false"/>
+              <w:spacing w:lineRule="auto" w:line="180"/>
+              <w:jc w:val="center"/>
+              <w:rPr>
+                <w:color w:val="000000"/>
+                <w:sz w:val="16"/>
+                <w:szCs w:val="16"/>
+              </w:rPr>
+            </w:pPr>
+            <w:r>
+              <w:rPr>
+                <w:color w:val="000000"/>
+                <w:sz w:val="16"/>
+                <w:szCs w:val="16"/>
+              </w:rPr>
+              <w:t>DSD/Vigilance</w:t>
+            </w:r>
+          </w:p>
+        </w:tc>
+        <w:tc>
+          <w:tcPr>
+            <w:tcW w:w="1020" w:type="dxa"/>
+            <w:tcBorders>
+              <w:top w:val="single" w:sz="4" w:space="0" w:color="000000"/>
+              <w:left w:val="single" w:sz="4" w:space="0" w:color="000000"/>
+              <w:bottom w:val="single" w:sz="4" w:space="0" w:color="000000"/>
+            </w:tcBorders>
+            <w:vAlign w:val="bottom"/>
+          </w:tcPr>
+          <w:p>
+            <w:pPr>
+              <w:pStyle w:val="Normal"/>
+              <w:widowControl w:val="false"/>
+              <w:spacing w:lineRule="auto" w:line="180"/>
+              <w:jc w:val="center"/>
+              <w:rPr>
+                <w:color w:val="000000"/>
+                <w:sz w:val="16"/>
+                <w:szCs w:val="16"/>
+              </w:rPr>
+            </w:pPr>
+            <w:r>
+              <w:rPr>
+                <w:color w:val="000000"/>
+                <w:sz w:val="16"/>
+                <w:szCs w:val="16"/>
+              </w:rPr>
+              <w:t>Panto. Low</w:t>
+            </w:r>
+          </w:p>
+        </w:tc>
+        <w:tc>
+          <w:tcPr>
+            <w:tcW w:w="1016" w:type="dxa"/>
+            <w:tcBorders>
+              <w:top w:val="single" w:sz="4" w:space="0" w:color="000000"/>
+              <w:left w:val="single" w:sz="4" w:space="0" w:color="000000"/>
+              <w:bottom w:val="single" w:sz="4" w:space="0" w:color="000000"/>
+            </w:tcBorders>
+            <w:vAlign w:val="bottom"/>
+          </w:tcPr>
+          <w:p>
+            <w:pPr>
+              <w:pStyle w:val="Normal"/>
+              <w:widowControl w:val="false"/>
+              <w:spacing w:lineRule="auto" w:line="180"/>
+              <w:jc w:val="center"/>
+              <w:rPr>
+                <w:sz w:val="16"/>
+                <w:szCs w:val="16"/>
+              </w:rPr>
+            </w:pPr>
+            <w:r>
+              <w:rPr>
+                <w:color w:val="000000"/>
+                <w:sz w:val="16"/>
+                <w:szCs w:val="16"/>
+              </w:rPr>
+              <w:t>Snow Brake</w:t>
+            </w:r>
+          </w:p>
+        </w:tc>
+        <w:tc>
+          <w:tcPr>
+            <w:tcW w:w="1016" w:type="dxa"/>
+            <w:tcBorders>
+              <w:top w:val="single" w:sz="4" w:space="0" w:color="000000"/>
+              <w:left w:val="single" w:sz="4" w:space="0" w:color="000000"/>
+              <w:bottom w:val="single" w:sz="4" w:space="0" w:color="000000"/>
+            </w:tcBorders>
+            <w:vAlign w:val="bottom"/>
+          </w:tcPr>
+          <w:p>
+            <w:pPr>
+              <w:pStyle w:val="Normal"/>
+              <w:widowControl w:val="false"/>
+              <w:jc w:val="center"/>
+              <w:rPr>
+                <w:color w:val="000000"/>
+                <w:sz w:val="16"/>
+                <w:szCs w:val="16"/>
+              </w:rPr>
+            </w:pPr>
+            <w:r>
+              <w:rPr>
+                <w:color w:val="000000"/>
+                <w:sz w:val="16"/>
+                <w:szCs w:val="16"/>
+              </w:rPr>
+              <w:t>Speed Set</w:t>
+            </w:r>
+          </w:p>
+        </w:tc>
+        <w:tc>
+          <w:tcPr>
+            <w:tcW w:w="1017" w:type="dxa"/>
+            <w:tcBorders>
+              <w:top w:val="single" w:sz="4" w:space="0" w:color="000000"/>
+              <w:left w:val="single" w:sz="4" w:space="0" w:color="000000"/>
+              <w:bottom w:val="single" w:sz="4" w:space="0" w:color="000000"/>
+            </w:tcBorders>
+            <w:vAlign w:val="bottom"/>
+          </w:tcPr>
+          <w:p>
+            <w:pPr>
+              <w:pStyle w:val="Normal"/>
+              <w:widowControl w:val="false"/>
+              <w:jc w:val="center"/>
+              <w:rPr>
+                <w:color w:val="000000"/>
+                <w:sz w:val="16"/>
+                <w:szCs w:val="16"/>
+              </w:rPr>
+            </w:pPr>
+            <w:r>
+              <w:rPr>
+                <w:color w:val="000000"/>
+                <w:sz w:val="16"/>
+                <w:szCs w:val="16"/>
+              </w:rPr>
+              <w:t>Panto. Select</w:t>
+            </w:r>
+          </w:p>
+        </w:tc>
+        <w:tc>
+          <w:tcPr>
+            <w:tcW w:w="1016" w:type="dxa"/>
+            <w:tcBorders>
+              <w:top w:val="single" w:sz="4" w:space="0" w:color="000000"/>
+              <w:left w:val="single" w:sz="4" w:space="0" w:color="000000"/>
+              <w:bottom w:val="single" w:sz="4" w:space="0" w:color="000000"/>
+            </w:tcBorders>
+            <w:vAlign w:val="bottom"/>
+          </w:tcPr>
+          <w:p>
+            <w:pPr>
+              <w:pStyle w:val="Normal"/>
+              <w:widowControl w:val="false"/>
+              <w:jc w:val="center"/>
+              <w:rPr>
+                <w:sz w:val="16"/>
+                <w:szCs w:val="16"/>
+              </w:rPr>
+            </w:pPr>
+            <w:r>
+              <w:rPr>
+                <w:sz w:val="16"/>
+                <w:szCs w:val="16"/>
+              </w:rPr>
+              <w:t>Coupler Retract</w:t>
+            </w:r>
+          </w:p>
+        </w:tc>
+        <w:tc>
+          <w:tcPr>
+            <w:tcW w:w="1020" w:type="dxa"/>
+            <w:tcBorders>
+              <w:top w:val="single" w:sz="4" w:space="0" w:color="000000"/>
+              <w:left w:val="single" w:sz="4" w:space="0" w:color="000000"/>
+              <w:bottom w:val="single" w:sz="4" w:space="0" w:color="000000"/>
+            </w:tcBorders>
+            <w:vAlign w:val="bottom"/>
+          </w:tcPr>
+          <w:p>
+            <w:pPr>
+              <w:pStyle w:val="Normal"/>
+              <w:widowControl w:val="false"/>
+              <w:jc w:val="center"/>
+              <w:rPr>
+                <w:color w:val="000000"/>
+                <w:sz w:val="16"/>
+                <w:szCs w:val="16"/>
+              </w:rPr>
+            </w:pPr>
+            <w:r>
+              <w:rPr>
+                <w:rFonts w:eastAsia="arial" w:ascii="arial" w:hAnsi="arial"/>
+                <w:color w:val="000000"/>
+                <w:sz w:val="16"/>
+                <w:szCs w:val="16"/>
+              </w:rPr>
+              <w:t>Alarm Ack</w:t>
+            </w:r>
+          </w:p>
+        </w:tc>
+        <w:tc>
+          <w:tcPr>
+            <w:tcW w:w="1016" w:type="dxa"/>
+            <w:tcBorders>
+              <w:top w:val="single" w:sz="4" w:space="0" w:color="000000"/>
+              <w:left w:val="single" w:sz="4" w:space="0" w:color="000000"/>
+              <w:bottom w:val="single" w:sz="4" w:space="0" w:color="000000"/>
+            </w:tcBorders>
+            <w:vAlign w:val="bottom"/>
+          </w:tcPr>
+          <w:p>
+            <w:pPr>
+              <w:pStyle w:val="Normal"/>
+              <w:widowControl w:val="false"/>
+              <w:jc w:val="center"/>
+              <w:rPr>
+                <w:color w:val="000000"/>
+                <w:sz w:val="16"/>
+                <w:szCs w:val="16"/>
+              </w:rPr>
+            </w:pPr>
+            <w:r>
+              <w:rPr>
+                <w:color w:val="000000"/>
+                <w:sz w:val="16"/>
+                <w:szCs w:val="16"/>
+              </w:rPr>
+              <w:t>Notepad Light</w:t>
+            </w:r>
+          </w:p>
+        </w:tc>
+        <w:tc>
+          <w:tcPr>
+            <w:tcW w:w="1016" w:type="dxa"/>
+            <w:tcBorders>
+              <w:top w:val="single" w:sz="4" w:space="0" w:color="000000"/>
+              <w:left w:val="single" w:sz="4" w:space="0" w:color="000000"/>
+              <w:bottom w:val="single" w:sz="4" w:space="0" w:color="000000"/>
+            </w:tcBorders>
+            <w:vAlign w:val="bottom"/>
+          </w:tcPr>
+          <w:p>
+            <w:pPr>
+              <w:pStyle w:val="Normal"/>
+              <w:widowControl w:val="false"/>
+              <w:spacing w:lineRule="auto" w:line="180"/>
+              <w:jc w:val="center"/>
+              <w:rPr>
+                <w:sz w:val="16"/>
+                <w:szCs w:val="16"/>
+              </w:rPr>
+            </w:pPr>
+            <w:r>
+              <w:rPr>
+                <w:sz w:val="16"/>
+                <w:szCs w:val="16"/>
+              </w:rPr>
+              <w:t>Uncouple</w:t>
+            </w:r>
+          </w:p>
+        </w:tc>
+        <w:tc>
+          <w:tcPr>
+            <w:tcW w:w="1016" w:type="dxa"/>
+            <w:tcBorders>
+              <w:top w:val="single" w:sz="4" w:space="0" w:color="000000"/>
+              <w:left w:val="single" w:sz="4" w:space="0" w:color="000000"/>
+              <w:bottom w:val="single" w:sz="4" w:space="0" w:color="000000"/>
+            </w:tcBorders>
+            <w:vAlign w:val="bottom"/>
+          </w:tcPr>
+          <w:p>
+            <w:pPr>
+              <w:pStyle w:val="Normal"/>
+              <w:widowControl w:val="false"/>
+              <w:spacing w:lineRule="auto" w:line="180"/>
+              <w:jc w:val="center"/>
+              <w:rPr>
+                <w:sz w:val="16"/>
+                <w:szCs w:val="16"/>
+              </w:rPr>
+            </w:pPr>
+            <w:r>
+              <w:rPr>
+                <w:rFonts w:eastAsia="arial" w:ascii="arial" w:hAnsi="arial"/>
+                <w:color w:val="000000"/>
+                <w:sz w:val="16"/>
+                <w:szCs w:val="16"/>
+              </w:rPr>
+              <w:t>Exterior</w:t>
+            </w:r>
+          </w:p>
+          <w:p>
+            <w:pPr>
+              <w:pStyle w:val="Normal"/>
+              <w:widowControl w:val="false"/>
+              <w:spacing w:lineRule="auto" w:line="180"/>
+              <w:jc w:val="center"/>
+              <w:rPr>
+                <w:sz w:val="16"/>
+                <w:szCs w:val="16"/>
+              </w:rPr>
+            </w:pPr>
+            <w:r>
+              <w:rPr>
+                <w:rFonts w:eastAsia="arial" w:ascii="arial" w:hAnsi="arial"/>
+                <w:color w:val="000000"/>
+                <w:sz w:val="16"/>
+                <w:szCs w:val="16"/>
+              </w:rPr>
+              <w:t>Camera</w:t>
+            </w:r>
+          </w:p>
+        </w:tc>
+        <w:tc>
+          <w:tcPr>
+            <w:tcW w:w="1029" w:type="dxa"/>
+            <w:tcBorders>
+              <w:top w:val="single" w:sz="4" w:space="0" w:color="000000"/>
+              <w:left w:val="single" w:sz="4" w:space="0" w:color="000000"/>
+              <w:bottom w:val="single" w:sz="4" w:space="0" w:color="000000"/>
+              <w:right w:val="single" w:sz="4" w:space="0" w:color="000000"/>
+            </w:tcBorders>
+            <w:vAlign w:val="bottom"/>
+          </w:tcPr>
+          <w:p>
+            <w:pPr>
+              <w:pStyle w:val="Normal"/>
+              <w:widowControl w:val="false"/>
+              <w:spacing w:lineRule="auto" w:line="180"/>
+              <w:jc w:val="center"/>
+              <w:rPr>
+                <w:sz w:val="16"/>
+                <w:szCs w:val="16"/>
+              </w:rPr>
+            </w:pPr>
+            <w:r>
+              <w:rPr>
+                <w:rFonts w:eastAsia="arial" w:ascii="arial" w:hAnsi="arial"/>
+                <w:color w:val="000000"/>
+                <w:sz w:val="16"/>
+                <w:szCs w:val="16"/>
+              </w:rPr>
+              <w:t>Prev</w:t>
+            </w:r>
+          </w:p>
+          <w:p>
+            <w:pPr>
+              <w:pStyle w:val="Normal"/>
+              <w:widowControl w:val="false"/>
+              <w:spacing w:lineRule="auto" w:line="180"/>
+              <w:jc w:val="center"/>
+              <w:rPr>
+                <w:sz w:val="16"/>
+                <w:szCs w:val="16"/>
+              </w:rPr>
+            </w:pPr>
+            <w:r>
+              <w:rPr>
+                <w:rFonts w:eastAsia="arial" w:ascii="arial" w:hAnsi="arial"/>
+                <w:color w:val="000000"/>
+                <w:sz w:val="16"/>
+                <w:szCs w:val="16"/>
+              </w:rPr>
+              <w:t>Cab Cam</w:t>
+            </w:r>
+          </w:p>
+        </w:tc>
+      </w:tr>
+    </w:tbl>
+    <w:p>
+      <w:pPr>
+        <w:pStyle w:val="Normal"/>
+        <w:rPr>
+          <w:color w:val="000000"/>
+          <w:sz w:val="16"/>
+          <w:szCs w:val="16"/>
+        </w:rPr>
+      </w:pPr>
+      <w:r>
+        <w:rPr>
+          <w:color w:val="000000"/>
+          <w:sz w:val="16"/>
+          <w:szCs w:val="16"/>
+        </w:rPr>
+      </w:r>
+    </w:p>
+    <w:p>
+      <w:pPr>
+        <w:pStyle w:val="Normal"/>
+        <w:rPr>
+          <w:color w:val="000000"/>
+          <w:sz w:val="16"/>
+          <w:szCs w:val="16"/>
+        </w:rPr>
+      </w:pPr>
+      <w:r>
+        <w:rPr>
+          <w:rFonts w:eastAsia="arial" w:ascii="arial" w:hAnsi="arial"/>
+          <w:color w:val="000000"/>
+          <w:sz w:val="16"/>
+          <w:szCs w:val="16"/>
+        </w:rPr>
+        <w:tab/>
+        <w:t xml:space="preserve">           Class 39</w:t>
       </w:r>
       <w:r>
         <w:rPr>
@@ -38351,7 +38874,579 @@
           <w:sz w:val="16"/>
           <w:szCs w:val="16"/>
         </w:rPr>
-        <w:t>90</w:t>
+        <w:t>5</w:t>
+      </w:r>
+      <w:r>
+        <w:rPr>
+          <w:rFonts w:eastAsia="arial" w:ascii="arial" w:hAnsi="arial"/>
+          <w:color w:val="000000"/>
+          <w:sz w:val="16"/>
+          <w:szCs w:val="16"/>
+        </w:rPr>
+        <w:t>-1</w:t>
+      </w:r>
+    </w:p>
+    <w:tbl>
+      <w:tblPr>
+        <w:tblW w:w="14248" w:type="dxa"/>
+        <w:jc w:val="left"/>
+        <w:tblInd w:w="-5" w:type="dxa"/>
+        <w:tblLayout w:type="fixed"/>
+        <w:tblCellMar>
+          <w:top w:w="0" w:type="dxa"/>
+          <w:left w:w="108" w:type="dxa"/>
+          <w:bottom w:w="0" w:type="dxa"/>
+          <w:right w:w="108" w:type="dxa"/>
+        </w:tblCellMar>
+        <w:tblLook w:firstRow="1" w:noVBand="1" w:lastRow="0" w:firstColumn="1" w:lastColumn="0" w:noHBand="0" w:val="04a0"/>
+      </w:tblPr>
+      <w:tblGrid>
+        <w:gridCol w:w="1017"/>
+        <w:gridCol w:w="1019"/>
+        <w:gridCol w:w="1014"/>
+        <w:gridCol w:w="1016"/>
+        <w:gridCol w:w="1020"/>
+        <w:gridCol w:w="1016"/>
+        <w:gridCol w:w="1016"/>
+        <w:gridCol w:w="1017"/>
+        <w:gridCol w:w="1016"/>
+        <w:gridCol w:w="1020"/>
+        <w:gridCol w:w="1016"/>
+        <w:gridCol w:w="1016"/>
+        <w:gridCol w:w="1016"/>
+        <w:gridCol w:w="1029"/>
+      </w:tblGrid>
+      <w:tr>
+        <w:trPr>
+          <w:trHeight w:val="440" w:hRule="exact"/>
+          <w:cantSplit w:val="true"/>
+        </w:trPr>
+        <w:tc>
+          <w:tcPr>
+            <w:tcW w:w="1017" w:type="dxa"/>
+            <w:tcBorders>
+              <w:top w:val="single" w:sz="4" w:space="0" w:color="000000"/>
+              <w:left w:val="single" w:sz="4" w:space="0" w:color="000000"/>
+              <w:bottom w:val="single" w:sz="4" w:space="0" w:color="000000"/>
+            </w:tcBorders>
+            <w:vAlign w:val="bottom"/>
+          </w:tcPr>
+          <w:p>
+            <w:pPr>
+              <w:pStyle w:val="Normal"/>
+              <w:widowControl w:val="false"/>
+              <w:spacing w:lineRule="auto" w:line="180" w:before="0" w:after="60"/>
+              <w:jc w:val="center"/>
+              <w:rPr>
+                <w:color w:val="000000"/>
+                <w:sz w:val="16"/>
+                <w:szCs w:val="16"/>
+              </w:rPr>
+            </w:pPr>
+            <w:r>
+              <w:rPr>
+                <w:rFonts w:eastAsia="arial" w:ascii="arial" w:hAnsi="arial"/>
+                <w:b/>
+                <w:color w:val="000000"/>
+                <w:sz w:val="16"/>
+                <w:szCs w:val="16"/>
+              </w:rPr>
+              <w:t>Pause</w:t>
+            </w:r>
+          </w:p>
+        </w:tc>
+        <w:tc>
+          <w:tcPr>
+            <w:tcW w:w="1019" w:type="dxa"/>
+            <w:tcBorders>
+              <w:top w:val="single" w:sz="4" w:space="0" w:color="000000"/>
+              <w:left w:val="single" w:sz="4" w:space="0" w:color="000000"/>
+              <w:bottom w:val="single" w:sz="4" w:space="0" w:color="000000"/>
+            </w:tcBorders>
+            <w:vAlign w:val="bottom"/>
+          </w:tcPr>
+          <w:p>
+            <w:pPr>
+              <w:pStyle w:val="Normal"/>
+              <w:widowControl w:val="false"/>
+              <w:spacing w:lineRule="auto" w:line="180"/>
+              <w:jc w:val="center"/>
+              <w:rPr>
+                <w:color w:val="000000"/>
+                <w:sz w:val="16"/>
+                <w:szCs w:val="16"/>
+              </w:rPr>
+            </w:pPr>
+            <w:r>
+              <w:rPr>
+                <w:color w:val="000000"/>
+                <w:sz w:val="16"/>
+                <w:szCs w:val="16"/>
+              </w:rPr>
+              <w:t>Master Key</w:t>
+            </w:r>
+          </w:p>
+        </w:tc>
+        <w:tc>
+          <w:tcPr>
+            <w:tcW w:w="1014" w:type="dxa"/>
+            <w:tcBorders>
+              <w:top w:val="single" w:sz="4" w:space="0" w:color="000000"/>
+              <w:left w:val="single" w:sz="4" w:space="0" w:color="000000"/>
+              <w:bottom w:val="single" w:sz="4" w:space="0" w:color="000000"/>
+            </w:tcBorders>
+            <w:vAlign w:val="bottom"/>
+          </w:tcPr>
+          <w:p>
+            <w:pPr>
+              <w:pStyle w:val="Normal"/>
+              <w:widowControl w:val="false"/>
+              <w:spacing w:lineRule="auto" w:line="180"/>
+              <w:jc w:val="center"/>
+              <w:rPr>
+                <w:color w:val="000000"/>
+                <w:sz w:val="16"/>
+                <w:szCs w:val="16"/>
+              </w:rPr>
+            </w:pPr>
+            <w:r>
+              <w:rPr>
+                <w:color w:val="000000"/>
+                <w:sz w:val="16"/>
+                <w:szCs w:val="16"/>
+              </w:rPr>
+              <w:t xml:space="preserve">Aux </w:t>
+            </w:r>
+            <w:r>
+              <w:rPr>
+                <w:color w:val="000000"/>
+                <w:sz w:val="16"/>
+                <w:szCs w:val="16"/>
+              </w:rPr>
+              <w:t>On</w:t>
+            </w:r>
+          </w:p>
+        </w:tc>
+        <w:tc>
+          <w:tcPr>
+            <w:tcW w:w="1016" w:type="dxa"/>
+            <w:tcBorders>
+              <w:top w:val="single" w:sz="4" w:space="0" w:color="000000"/>
+              <w:left w:val="single" w:sz="4" w:space="0" w:color="000000"/>
+              <w:bottom w:val="single" w:sz="4" w:space="0" w:color="000000"/>
+            </w:tcBorders>
+            <w:vAlign w:val="bottom"/>
+          </w:tcPr>
+          <w:p>
+            <w:pPr>
+              <w:pStyle w:val="Normal"/>
+              <w:widowControl w:val="false"/>
+              <w:spacing w:lineRule="auto" w:line="180"/>
+              <w:jc w:val="center"/>
+              <w:rPr>
+                <w:color w:val="000000"/>
+                <w:sz w:val="16"/>
+                <w:szCs w:val="16"/>
+              </w:rPr>
+            </w:pPr>
+            <w:r>
+              <w:rPr>
+                <w:color w:val="000000"/>
+                <w:sz w:val="16"/>
+                <w:szCs w:val="16"/>
+              </w:rPr>
+              <w:t>AWS/</w:t>
+            </w:r>
+            <w:r>
+              <w:rPr>
+                <w:color w:val="000000"/>
+                <w:sz w:val="16"/>
+                <w:szCs w:val="16"/>
+              </w:rPr>
+              <w:t>TVM/KVB</w:t>
+            </w:r>
+          </w:p>
+        </w:tc>
+        <w:tc>
+          <w:tcPr>
+            <w:tcW w:w="1020" w:type="dxa"/>
+            <w:tcBorders>
+              <w:top w:val="single" w:sz="4" w:space="0" w:color="000000"/>
+              <w:left w:val="single" w:sz="4" w:space="0" w:color="000000"/>
+              <w:bottom w:val="single" w:sz="4" w:space="0" w:color="000000"/>
+            </w:tcBorders>
+            <w:vAlign w:val="bottom"/>
+          </w:tcPr>
+          <w:p>
+            <w:pPr>
+              <w:pStyle w:val="Normal"/>
+              <w:widowControl w:val="false"/>
+              <w:spacing w:lineRule="auto" w:line="180"/>
+              <w:jc w:val="center"/>
+              <w:rPr>
+                <w:color w:val="000000"/>
+                <w:sz w:val="16"/>
+                <w:szCs w:val="16"/>
+              </w:rPr>
+            </w:pPr>
+            <w:r>
+              <w:rPr>
+                <w:color w:val="000000"/>
+                <w:sz w:val="16"/>
+                <w:szCs w:val="16"/>
+              </w:rPr>
+              <w:t>Panto. Raise</w:t>
+            </w:r>
+          </w:p>
+        </w:tc>
+        <w:tc>
+          <w:tcPr>
+            <w:tcW w:w="1016" w:type="dxa"/>
+            <w:tcBorders>
+              <w:top w:val="single" w:sz="4" w:space="0" w:color="000000"/>
+              <w:left w:val="single" w:sz="4" w:space="0" w:color="000000"/>
+              <w:bottom w:val="single" w:sz="4" w:space="0" w:color="000000"/>
+            </w:tcBorders>
+            <w:vAlign w:val="bottom"/>
+          </w:tcPr>
+          <w:p>
+            <w:pPr>
+              <w:pStyle w:val="Normal"/>
+              <w:widowControl w:val="false"/>
+              <w:spacing w:lineRule="auto" w:line="180"/>
+              <w:jc w:val="center"/>
+              <w:rPr>
+                <w:color w:val="000000"/>
+                <w:sz w:val="16"/>
+                <w:szCs w:val="16"/>
+              </w:rPr>
+            </w:pPr>
+            <w:r>
+              <w:rPr>
+                <w:color w:val="000000"/>
+                <w:sz w:val="16"/>
+                <w:szCs w:val="16"/>
+              </w:rPr>
+              <w:t>CTRL</w:t>
+            </w:r>
+          </w:p>
+        </w:tc>
+        <w:tc>
+          <w:tcPr>
+            <w:tcW w:w="1016" w:type="dxa"/>
+            <w:tcBorders>
+              <w:top w:val="single" w:sz="4" w:space="0" w:color="000000"/>
+              <w:left w:val="single" w:sz="4" w:space="0" w:color="000000"/>
+              <w:bottom w:val="single" w:sz="4" w:space="0" w:color="000000"/>
+            </w:tcBorders>
+            <w:vAlign w:val="bottom"/>
+          </w:tcPr>
+          <w:p>
+            <w:pPr>
+              <w:pStyle w:val="Normal"/>
+              <w:widowControl w:val="false"/>
+              <w:jc w:val="center"/>
+              <w:rPr>
+                <w:sz w:val="16"/>
+                <w:szCs w:val="16"/>
+              </w:rPr>
+            </w:pPr>
+            <w:r>
+              <w:rPr>
+                <w:sz w:val="16"/>
+                <w:szCs w:val="16"/>
+              </w:rPr>
+              <w:t>DRA</w:t>
+            </w:r>
+          </w:p>
+        </w:tc>
+        <w:tc>
+          <w:tcPr>
+            <w:tcW w:w="1017" w:type="dxa"/>
+            <w:tcBorders>
+              <w:top w:val="single" w:sz="4" w:space="0" w:color="000000"/>
+              <w:left w:val="single" w:sz="4" w:space="0" w:color="000000"/>
+              <w:bottom w:val="single" w:sz="4" w:space="0" w:color="000000"/>
+            </w:tcBorders>
+            <w:vAlign w:val="bottom"/>
+          </w:tcPr>
+          <w:p>
+            <w:pPr>
+              <w:pStyle w:val="Normal"/>
+              <w:widowControl w:val="false"/>
+              <w:jc w:val="center"/>
+              <w:rPr>
+                <w:sz w:val="16"/>
+                <w:szCs w:val="16"/>
+              </w:rPr>
+            </w:pPr>
+            <w:r>
+              <w:rPr>
+                <w:color w:val="000000"/>
+                <w:sz w:val="16"/>
+                <w:szCs w:val="16"/>
+              </w:rPr>
+              <w:t>Wiper Mode Park</w:t>
+            </w:r>
+          </w:p>
+        </w:tc>
+        <w:tc>
+          <w:tcPr>
+            <w:tcW w:w="1016" w:type="dxa"/>
+            <w:tcBorders>
+              <w:top w:val="single" w:sz="4" w:space="0" w:color="000000"/>
+              <w:left w:val="single" w:sz="4" w:space="0" w:color="000000"/>
+              <w:bottom w:val="single" w:sz="4" w:space="0" w:color="000000"/>
+            </w:tcBorders>
+            <w:vAlign w:val="bottom"/>
+          </w:tcPr>
+          <w:p>
+            <w:pPr>
+              <w:pStyle w:val="Normal"/>
+              <w:widowControl w:val="false"/>
+              <w:jc w:val="center"/>
+              <w:rPr>
+                <w:sz w:val="16"/>
+                <w:szCs w:val="16"/>
+              </w:rPr>
+            </w:pPr>
+            <w:r>
+              <w:rPr>
+                <w:sz w:val="16"/>
+                <w:szCs w:val="16"/>
+              </w:rPr>
+              <w:t>TVM Dim Night</w:t>
+            </w:r>
+          </w:p>
+        </w:tc>
+        <w:tc>
+          <w:tcPr>
+            <w:tcW w:w="1020" w:type="dxa"/>
+            <w:tcBorders>
+              <w:top w:val="single" w:sz="4" w:space="0" w:color="000000"/>
+              <w:left w:val="single" w:sz="4" w:space="0" w:color="000000"/>
+              <w:bottom w:val="single" w:sz="4" w:space="0" w:color="000000"/>
+            </w:tcBorders>
+            <w:vAlign w:val="bottom"/>
+          </w:tcPr>
+          <w:p>
+            <w:pPr>
+              <w:pStyle w:val="Normal"/>
+              <w:widowControl w:val="false"/>
+              <w:jc w:val="center"/>
+              <w:rPr>
+                <w:color w:val="000000"/>
+                <w:sz w:val="16"/>
+                <w:szCs w:val="16"/>
+              </w:rPr>
+            </w:pPr>
+            <w:r>
+              <w:rPr>
+                <w:color w:val="000000"/>
+                <w:sz w:val="16"/>
+                <w:szCs w:val="16"/>
+              </w:rPr>
+              <w:t>Front Coupler</w:t>
+            </w:r>
+          </w:p>
+        </w:tc>
+        <w:tc>
+          <w:tcPr>
+            <w:tcW w:w="1016" w:type="dxa"/>
+            <w:tcBorders>
+              <w:top w:val="single" w:sz="4" w:space="0" w:color="000000"/>
+              <w:left w:val="single" w:sz="4" w:space="0" w:color="000000"/>
+              <w:bottom w:val="single" w:sz="4" w:space="0" w:color="000000"/>
+            </w:tcBorders>
+            <w:vAlign w:val="bottom"/>
+          </w:tcPr>
+          <w:p>
+            <w:pPr>
+              <w:pStyle w:val="Normal"/>
+              <w:widowControl w:val="false"/>
+              <w:spacing w:lineRule="auto" w:line="180"/>
+              <w:jc w:val="center"/>
+              <w:rPr>
+                <w:sz w:val="16"/>
+                <w:szCs w:val="16"/>
+              </w:rPr>
+            </w:pPr>
+            <w:r>
+              <w:rPr>
+                <w:rFonts w:eastAsia="arial" w:ascii="arial" w:hAnsi="arial"/>
+                <w:color w:val="000000"/>
+                <w:sz w:val="16"/>
+                <w:szCs w:val="16"/>
+              </w:rPr>
+              <w:t>Cab Light</w:t>
+            </w:r>
+          </w:p>
+        </w:tc>
+        <w:tc>
+          <w:tcPr>
+            <w:tcW w:w="1016" w:type="dxa"/>
+            <w:tcBorders>
+              <w:top w:val="single" w:sz="4" w:space="0" w:color="000000"/>
+              <w:left w:val="single" w:sz="4" w:space="0" w:color="000000"/>
+              <w:bottom w:val="single" w:sz="4" w:space="0" w:color="000000"/>
+            </w:tcBorders>
+            <w:vAlign w:val="bottom"/>
+          </w:tcPr>
+          <w:p>
+            <w:pPr>
+              <w:pStyle w:val="Normal"/>
+              <w:widowControl w:val="false"/>
+              <w:jc w:val="center"/>
+              <w:rPr>
+                <w:color w:val="000000"/>
+                <w:sz w:val="16"/>
+                <w:szCs w:val="16"/>
+              </w:rPr>
+            </w:pPr>
+            <w:r>
+              <w:rPr>
+                <w:color w:val="000000"/>
+                <w:sz w:val="16"/>
+                <w:szCs w:val="16"/>
+              </w:rPr>
+              <w:t>Couple</w:t>
+            </w:r>
+          </w:p>
+        </w:tc>
+        <w:tc>
+          <w:tcPr>
+            <w:tcW w:w="1016" w:type="dxa"/>
+            <w:tcBorders>
+              <w:top w:val="single" w:sz="4" w:space="0" w:color="000000"/>
+              <w:left w:val="single" w:sz="4" w:space="0" w:color="000000"/>
+              <w:bottom w:val="single" w:sz="4" w:space="0" w:color="000000"/>
+            </w:tcBorders>
+            <w:vAlign w:val="bottom"/>
+          </w:tcPr>
+          <w:p>
+            <w:pPr>
+              <w:pStyle w:val="Normal"/>
+              <w:widowControl w:val="false"/>
+              <w:spacing w:lineRule="auto" w:line="180"/>
+              <w:jc w:val="center"/>
+              <w:rPr>
+                <w:sz w:val="16"/>
+                <w:szCs w:val="16"/>
+              </w:rPr>
+            </w:pPr>
+            <w:r>
+              <w:rPr>
+                <w:rFonts w:eastAsia="arial" w:ascii="arial" w:hAnsi="arial"/>
+                <w:color w:val="000000"/>
+                <w:sz w:val="16"/>
+                <w:szCs w:val="16"/>
+              </w:rPr>
+              <w:t>1-Person</w:t>
+            </w:r>
+          </w:p>
+        </w:tc>
+        <w:tc>
+          <w:tcPr>
+            <w:tcW w:w="1029" w:type="dxa"/>
+            <w:tcBorders>
+              <w:top w:val="single" w:sz="4" w:space="0" w:color="000000"/>
+              <w:left w:val="single" w:sz="4" w:space="0" w:color="000000"/>
+              <w:bottom w:val="single" w:sz="4" w:space="0" w:color="000000"/>
+              <w:right w:val="single" w:sz="4" w:space="0" w:color="000000"/>
+            </w:tcBorders>
+            <w:vAlign w:val="bottom"/>
+          </w:tcPr>
+          <w:p>
+            <w:pPr>
+              <w:pStyle w:val="Normal"/>
+              <w:widowControl w:val="false"/>
+              <w:spacing w:lineRule="auto" w:line="180"/>
+              <w:jc w:val="center"/>
+              <w:rPr>
+                <w:sz w:val="16"/>
+                <w:szCs w:val="16"/>
+              </w:rPr>
+            </w:pPr>
+            <w:r>
+              <w:rPr>
+                <w:rFonts w:eastAsia="arial" w:ascii="arial" w:hAnsi="arial"/>
+                <w:color w:val="000000"/>
+                <w:sz w:val="16"/>
+                <w:szCs w:val="16"/>
+              </w:rPr>
+              <w:t>Next</w:t>
+            </w:r>
+          </w:p>
+          <w:p>
+            <w:pPr>
+              <w:pStyle w:val="Normal"/>
+              <w:widowControl w:val="false"/>
+              <w:spacing w:lineRule="auto" w:line="180"/>
+              <w:jc w:val="center"/>
+              <w:rPr>
+                <w:sz w:val="16"/>
+                <w:szCs w:val="16"/>
+              </w:rPr>
+            </w:pPr>
+            <w:r>
+              <w:rPr>
+                <w:rFonts w:eastAsia="arial" w:ascii="arial" w:hAnsi="arial"/>
+                <w:color w:val="000000"/>
+                <w:sz w:val="16"/>
+                <w:szCs w:val="16"/>
+              </w:rPr>
+              <w:t>Cab Cam</w:t>
+            </w:r>
+          </w:p>
+        </w:tc>
+      </w:tr>
+    </w:tbl>
+    <w:p>
+      <w:pPr>
+        <w:pStyle w:val="Normal"/>
+        <w:rPr>
+          <w:rFonts w:ascii="arial" w:hAnsi="arial" w:eastAsia="arial"/>
+          <w:color w:val="000000"/>
+          <w:sz w:val="16"/>
+          <w:szCs w:val="16"/>
+        </w:rPr>
+      </w:pPr>
+      <w:r>
+        <w:rPr>
+          <w:rFonts w:eastAsia="arial" w:ascii="arial" w:hAnsi="arial"/>
+          <w:color w:val="000000"/>
+          <w:sz w:val="16"/>
+          <w:szCs w:val="16"/>
+        </w:rPr>
+      </w:r>
+    </w:p>
+    <w:p>
+      <w:pPr>
+        <w:pStyle w:val="Normal"/>
+        <w:rPr>
+          <w:color w:val="000000"/>
+          <w:sz w:val="16"/>
+          <w:szCs w:val="16"/>
+        </w:rPr>
+      </w:pPr>
+      <w:r>
+        <w:rPr>
+          <w:rFonts w:eastAsia="arial" w:ascii="arial" w:hAnsi="arial"/>
+          <w:color w:val="000000"/>
+          <w:sz w:val="16"/>
+          <w:szCs w:val="16"/>
+        </w:rPr>
+        <w:tab/>
+        <w:t xml:space="preserve">           Class 39</w:t>
+      </w:r>
+      <w:r>
+        <w:rPr>
+          <w:rFonts w:eastAsia="arial" w:ascii="arial" w:hAnsi="arial"/>
+          <w:color w:val="000000"/>
+          <w:sz w:val="16"/>
+          <w:szCs w:val="16"/>
+        </w:rPr>
+        <w:t>5</w:t>
       </w:r>
       <w:r>
         <w:rPr>
@@ -38499,39 +39594,39 @@
                 <w:sz w:val="16"/>
                 <w:szCs w:val="16"/>
               </w:rPr>
-              <w:t>Trip</w:t>
-            </w:r>
-          </w:p>
-        </w:tc>
-        <w:tc>
-          <w:tcPr>
-            <w:tcW w:w="1016" w:type="dxa"/>
-            <w:tcBorders>
-              <w:top w:val="single" w:sz="4" w:space="0" w:color="000000"/>
-              <w:left w:val="single" w:sz="4" w:space="0" w:color="000000"/>
-              <w:bottom w:val="single" w:sz="4" w:space="0" w:color="000000"/>
-            </w:tcBorders>
-            <w:vAlign w:val="bottom"/>
-          </w:tcPr>
-          <w:p>
-            <w:pPr>
-              <w:pStyle w:val="Normal"/>
-              <w:widowControl w:val="false"/>
-              <w:spacing w:lineRule="auto" w:line="180"/>
-              <w:jc w:val="center"/>
-              <w:rPr>
-                <w:color w:val="000000"/>
-                <w:sz w:val="16"/>
-                <w:szCs w:val="16"/>
-              </w:rPr>
-            </w:pPr>
-            <w:r>
-              <w:rPr>
-                <w:color w:val="000000"/>
-                <w:sz w:val="16"/>
-                <w:szCs w:val="16"/>
-              </w:rPr>
-              <w:t>DSD/Vigilance</w:t>
+              <w:t>Off</w:t>
+            </w:r>
+          </w:p>
+        </w:tc>
+        <w:tc>
+          <w:tcPr>
+            <w:tcW w:w="1016" w:type="dxa"/>
+            <w:tcBorders>
+              <w:top w:val="single" w:sz="4" w:space="0" w:color="000000"/>
+              <w:left w:val="single" w:sz="4" w:space="0" w:color="000000"/>
+              <w:bottom w:val="single" w:sz="4" w:space="0" w:color="000000"/>
+            </w:tcBorders>
+            <w:vAlign w:val="bottom"/>
+          </w:tcPr>
+          <w:p>
+            <w:pPr>
+              <w:pStyle w:val="Normal"/>
+              <w:widowControl w:val="false"/>
+              <w:spacing w:lineRule="auto" w:line="180"/>
+              <w:jc w:val="center"/>
+              <w:rPr>
+                <w:color w:val="000000"/>
+                <w:sz w:val="16"/>
+                <w:szCs w:val="16"/>
+              </w:rPr>
+            </w:pPr>
+            <w:r>
+              <w:rPr>
+                <w:color w:val="000000"/>
+                <w:sz w:val="16"/>
+                <w:szCs w:val="16"/>
+              </w:rPr>
+              <w:t>DSD</w:t>
             </w:r>
           </w:p>
         </w:tc>
@@ -38563,77 +39658,68 @@
                 <w:sz w:val="16"/>
                 <w:szCs w:val="16"/>
               </w:rPr>
-              <w:t>Panto. L</w:t>
-            </w:r>
-            <w:r>
-              <w:rPr>
-                <w:color w:val="000000"/>
-                <w:sz w:val="16"/>
-                <w:szCs w:val="16"/>
-              </w:rPr>
-              <w:t>ow</w:t>
-            </w:r>
-          </w:p>
-        </w:tc>
-        <w:tc>
-          <w:tcPr>
-            <w:tcW w:w="1016" w:type="dxa"/>
-            <w:tcBorders>
-              <w:top w:val="single" w:sz="4" w:space="0" w:color="000000"/>
-              <w:left w:val="single" w:sz="4" w:space="0" w:color="000000"/>
-              <w:bottom w:val="single" w:sz="4" w:space="0" w:color="000000"/>
-            </w:tcBorders>
-            <w:vAlign w:val="bottom"/>
-          </w:tcPr>
-          <w:p>
-            <w:pPr>
-              <w:pStyle w:val="Normal"/>
-              <w:widowControl w:val="false"/>
-              <w:spacing w:lineRule="auto" w:line="180"/>
-              <w:jc w:val="center"/>
-              <w:rPr>
-                <w:sz w:val="16"/>
-                <w:szCs w:val="16"/>
-              </w:rPr>
-            </w:pPr>
-            <w:r>
-              <w:rPr>
-                <w:color w:val="000000"/>
-                <w:sz w:val="16"/>
-                <w:szCs w:val="16"/>
-              </w:rPr>
-              <w:t>Snow Brake</w:t>
-            </w:r>
-          </w:p>
-        </w:tc>
-        <w:tc>
-          <w:tcPr>
-            <w:tcW w:w="1016" w:type="dxa"/>
-            <w:tcBorders>
-              <w:top w:val="single" w:sz="4" w:space="0" w:color="000000"/>
-              <w:left w:val="single" w:sz="4" w:space="0" w:color="000000"/>
-              <w:bottom w:val="single" w:sz="4" w:space="0" w:color="000000"/>
-            </w:tcBorders>
-            <w:vAlign w:val="bottom"/>
-          </w:tcPr>
-          <w:p>
-            <w:pPr>
-              <w:pStyle w:val="Normal"/>
-              <w:widowControl w:val="false"/>
-              <w:jc w:val="center"/>
-              <w:rPr>
-                <w:color w:val="000000"/>
-                <w:sz w:val="16"/>
-                <w:szCs w:val="16"/>
-              </w:rPr>
-            </w:pPr>
-            <w:r>
-              <w:rPr>
-                <w:color w:val="000000"/>
-                <w:sz w:val="16"/>
-                <w:szCs w:val="16"/>
-              </w:rPr>
-              <w:t>Speed Set</w:t>
+              <w:t>Panto. Low</w:t>
+            </w:r>
+          </w:p>
+        </w:tc>
+        <w:tc>
+          <w:tcPr>
+            <w:tcW w:w="1016" w:type="dxa"/>
+            <w:tcBorders>
+              <w:top w:val="single" w:sz="4" w:space="0" w:color="000000"/>
+              <w:left w:val="single" w:sz="4" w:space="0" w:color="000000"/>
+              <w:bottom w:val="single" w:sz="4" w:space="0" w:color="000000"/>
+            </w:tcBorders>
+            <w:vAlign w:val="bottom"/>
+          </w:tcPr>
+          <w:p>
+            <w:pPr>
+              <w:pStyle w:val="Normal"/>
+              <w:widowControl w:val="false"/>
+              <w:spacing w:lineRule="auto" w:line="180"/>
+              <w:jc w:val="center"/>
+              <w:rPr>
+                <w:sz w:val="16"/>
+                <w:szCs w:val="16"/>
+              </w:rPr>
+            </w:pPr>
+            <w:r>
+              <w:rPr>
+                <w:color w:val="000000"/>
+                <w:sz w:val="16"/>
+                <w:szCs w:val="16"/>
+              </w:rPr>
+              <w:t>DC</w:t>
+            </w:r>
+          </w:p>
+        </w:tc>
+        <w:tc>
+          <w:tcPr>
+            <w:tcW w:w="1016" w:type="dxa"/>
+            <w:tcBorders>
+              <w:top w:val="single" w:sz="4" w:space="0" w:color="000000"/>
+              <w:left w:val="single" w:sz="4" w:space="0" w:color="000000"/>
+              <w:bottom w:val="single" w:sz="4" w:space="0" w:color="000000"/>
+            </w:tcBorders>
+            <w:vAlign w:val="bottom"/>
+          </w:tcPr>
+          <w:p>
+            <w:pPr>
+              <w:pStyle w:val="Normal"/>
+              <w:widowControl w:val="false"/>
+              <w:jc w:val="center"/>
+              <w:rPr>
+                <w:sz w:val="16"/>
+                <w:szCs w:val="16"/>
+              </w:rPr>
+            </w:pPr>
+            <w:r>
+              <w:rPr>
+                <w:color w:val="000000"/>
+                <w:sz w:val="16"/>
+                <w:szCs w:val="16"/>
+              </w:rPr>
+              <w:t>Hazard Warning</w:t>
             </w:r>
           </w:p>
         </w:tc>
@@ -38653,47 +39739,46 @@
               <w:widowControl w:val="false"/>
               <w:jc w:val="center"/>
               <w:rPr>
-                <w:color w:val="000000"/>
-                <w:sz w:val="16"/>
-                <w:szCs w:val="16"/>
-              </w:rPr>
-            </w:pPr>
-            <w:r>
-              <w:rPr>
-                <w:color w:val="000000"/>
-                <w:sz w:val="16"/>
-                <w:szCs w:val="16"/>
-              </w:rPr>
-              <w:t>Panto. Select</w:t>
-            </w:r>
-          </w:p>
-        </w:tc>
-        <w:tc>
-          <w:tcPr>
-            <w:tcW w:w="1016" w:type="dxa"/>
-            <w:tcBorders>
-              <w:top w:val="single" w:sz="4" w:space="0" w:color="000000"/>
-              <w:left w:val="single" w:sz="4" w:space="0" w:color="000000"/>
-              <w:bottom w:val="single" w:sz="4" w:space="0" w:color="000000"/>
-            </w:tcBorders>
-            <w:vAlign w:val="bottom"/>
-          </w:tcPr>
-          <w:p>
-            <w:pPr>
-              <w:pStyle w:val="Normal"/>
-              <w:widowControl w:val="false"/>
-              <w:jc w:val="center"/>
-              <w:rPr>
-                <w:sz w:val="16"/>
-                <w:szCs w:val="16"/>
-              </w:rPr>
-            </w:pPr>
-            <w:r>
-              <w:rPr>
-                <w:sz w:val="16"/>
-                <w:szCs w:val="16"/>
-              </w:rPr>
-              <w:t>Coupler Retract</w:t>
+                <w:sz w:val="16"/>
+                <w:szCs w:val="16"/>
+              </w:rPr>
+            </w:pPr>
+            <w:r>
+              <w:rPr>
+                <w:color w:val="000000"/>
+                <w:sz w:val="16"/>
+                <w:szCs w:val="16"/>
+              </w:rPr>
+              <w:t>Wiper Mode Wip</w:t>
+            </w:r>
+          </w:p>
+        </w:tc>
+        <w:tc>
+          <w:tcPr>
+            <w:tcW w:w="1016" w:type="dxa"/>
+            <w:tcBorders>
+              <w:top w:val="single" w:sz="4" w:space="0" w:color="000000"/>
+              <w:left w:val="single" w:sz="4" w:space="0" w:color="000000"/>
+              <w:bottom w:val="single" w:sz="4" w:space="0" w:color="000000"/>
+            </w:tcBorders>
+            <w:vAlign w:val="bottom"/>
+          </w:tcPr>
+          <w:p>
+            <w:pPr>
+              <w:pStyle w:val="Normal"/>
+              <w:widowControl w:val="false"/>
+              <w:jc w:val="center"/>
+              <w:rPr>
+                <w:sz w:val="16"/>
+                <w:szCs w:val="16"/>
+              </w:rPr>
+            </w:pPr>
+            <w:r>
+              <w:rPr>
+                <w:sz w:val="16"/>
+                <w:szCs w:val="16"/>
+              </w:rPr>
+              <w:t>TVM Dim Day</w:t>
             </w:r>
           </w:p>
         </w:tc>
@@ -38725,38 +39810,1224 @@
                 <w:sz w:val="16"/>
                 <w:szCs w:val="16"/>
               </w:rPr>
-              <w:t>Alarm Ack</w:t>
-            </w:r>
-          </w:p>
-        </w:tc>
-        <w:tc>
-          <w:tcPr>
-            <w:tcW w:w="1016" w:type="dxa"/>
-            <w:tcBorders>
-              <w:top w:val="single" w:sz="4" w:space="0" w:color="000000"/>
-              <w:left w:val="single" w:sz="4" w:space="0" w:color="000000"/>
-              <w:bottom w:val="single" w:sz="4" w:space="0" w:color="000000"/>
-            </w:tcBorders>
-            <w:vAlign w:val="bottom"/>
-          </w:tcPr>
-          <w:p>
-            <w:pPr>
-              <w:pStyle w:val="Normal"/>
-              <w:widowControl w:val="false"/>
-              <w:jc w:val="center"/>
-              <w:rPr>
-                <w:color w:val="000000"/>
-                <w:sz w:val="16"/>
-                <w:szCs w:val="16"/>
-              </w:rPr>
-            </w:pPr>
-            <w:r>
-              <w:rPr>
-                <w:color w:val="000000"/>
-                <w:sz w:val="16"/>
-                <w:szCs w:val="16"/>
-              </w:rPr>
-              <w:t>Notepad Light</w:t>
+              <w:t>Rear Coupler</w:t>
+            </w:r>
+          </w:p>
+        </w:tc>
+        <w:tc>
+          <w:tcPr>
+            <w:tcW w:w="1016" w:type="dxa"/>
+            <w:tcBorders>
+              <w:top w:val="single" w:sz="4" w:space="0" w:color="000000"/>
+              <w:left w:val="single" w:sz="4" w:space="0" w:color="000000"/>
+              <w:bottom w:val="single" w:sz="4" w:space="0" w:color="000000"/>
+            </w:tcBorders>
+            <w:vAlign w:val="bottom"/>
+          </w:tcPr>
+          <w:p>
+            <w:pPr>
+              <w:pStyle w:val="Normal"/>
+              <w:widowControl w:val="false"/>
+              <w:jc w:val="center"/>
+              <w:rPr>
+                <w:color w:val="000000"/>
+                <w:sz w:val="16"/>
+                <w:szCs w:val="16"/>
+              </w:rPr>
+            </w:pPr>
+            <w:r>
+              <w:rPr>
+                <w:color w:val="000000"/>
+                <w:sz w:val="16"/>
+                <w:szCs w:val="16"/>
+              </w:rPr>
+              <w:t>Reading Light</w:t>
+            </w:r>
+          </w:p>
+        </w:tc>
+        <w:tc>
+          <w:tcPr>
+            <w:tcW w:w="1016" w:type="dxa"/>
+            <w:tcBorders>
+              <w:top w:val="single" w:sz="4" w:space="0" w:color="000000"/>
+              <w:left w:val="single" w:sz="4" w:space="0" w:color="000000"/>
+              <w:bottom w:val="single" w:sz="4" w:space="0" w:color="000000"/>
+            </w:tcBorders>
+            <w:vAlign w:val="bottom"/>
+          </w:tcPr>
+          <w:p>
+            <w:pPr>
+              <w:pStyle w:val="Normal"/>
+              <w:widowControl w:val="false"/>
+              <w:spacing w:lineRule="auto" w:line="180"/>
+              <w:jc w:val="center"/>
+              <w:rPr>
+                <w:sz w:val="16"/>
+                <w:szCs w:val="16"/>
+              </w:rPr>
+            </w:pPr>
+            <w:r>
+              <w:rPr>
+                <w:sz w:val="16"/>
+                <w:szCs w:val="16"/>
+              </w:rPr>
+              <w:t>Uncouple</w:t>
+            </w:r>
+          </w:p>
+        </w:tc>
+        <w:tc>
+          <w:tcPr>
+            <w:tcW w:w="1016" w:type="dxa"/>
+            <w:tcBorders>
+              <w:top w:val="single" w:sz="4" w:space="0" w:color="000000"/>
+              <w:left w:val="single" w:sz="4" w:space="0" w:color="000000"/>
+              <w:bottom w:val="single" w:sz="4" w:space="0" w:color="000000"/>
+            </w:tcBorders>
+            <w:vAlign w:val="bottom"/>
+          </w:tcPr>
+          <w:p>
+            <w:pPr>
+              <w:pStyle w:val="Normal"/>
+              <w:widowControl w:val="false"/>
+              <w:spacing w:lineRule="auto" w:line="180"/>
+              <w:jc w:val="center"/>
+              <w:rPr>
+                <w:sz w:val="16"/>
+                <w:szCs w:val="16"/>
+              </w:rPr>
+            </w:pPr>
+            <w:r>
+              <w:rPr>
+                <w:rFonts w:eastAsia="arial" w:ascii="arial" w:hAnsi="arial"/>
+                <w:color w:val="000000"/>
+                <w:sz w:val="16"/>
+                <w:szCs w:val="16"/>
+              </w:rPr>
+              <w:t>Exterior</w:t>
+            </w:r>
+          </w:p>
+          <w:p>
+            <w:pPr>
+              <w:pStyle w:val="Normal"/>
+              <w:widowControl w:val="false"/>
+              <w:spacing w:lineRule="auto" w:line="180"/>
+              <w:jc w:val="center"/>
+              <w:rPr>
+                <w:sz w:val="16"/>
+                <w:szCs w:val="16"/>
+              </w:rPr>
+            </w:pPr>
+            <w:r>
+              <w:rPr>
+                <w:rFonts w:eastAsia="arial" w:ascii="arial" w:hAnsi="arial"/>
+                <w:color w:val="000000"/>
+                <w:sz w:val="16"/>
+                <w:szCs w:val="16"/>
+              </w:rPr>
+              <w:t>Camera</w:t>
+            </w:r>
+          </w:p>
+        </w:tc>
+        <w:tc>
+          <w:tcPr>
+            <w:tcW w:w="1029" w:type="dxa"/>
+            <w:tcBorders>
+              <w:top w:val="single" w:sz="4" w:space="0" w:color="000000"/>
+              <w:left w:val="single" w:sz="4" w:space="0" w:color="000000"/>
+              <w:bottom w:val="single" w:sz="4" w:space="0" w:color="000000"/>
+              <w:right w:val="single" w:sz="4" w:space="0" w:color="000000"/>
+            </w:tcBorders>
+            <w:vAlign w:val="bottom"/>
+          </w:tcPr>
+          <w:p>
+            <w:pPr>
+              <w:pStyle w:val="Normal"/>
+              <w:widowControl w:val="false"/>
+              <w:spacing w:lineRule="auto" w:line="180"/>
+              <w:jc w:val="center"/>
+              <w:rPr>
+                <w:sz w:val="16"/>
+                <w:szCs w:val="16"/>
+              </w:rPr>
+            </w:pPr>
+            <w:r>
+              <w:rPr>
+                <w:rFonts w:eastAsia="arial" w:ascii="arial" w:hAnsi="arial"/>
+                <w:color w:val="000000"/>
+                <w:sz w:val="16"/>
+                <w:szCs w:val="16"/>
+              </w:rPr>
+              <w:t>Prev</w:t>
+            </w:r>
+          </w:p>
+          <w:p>
+            <w:pPr>
+              <w:pStyle w:val="Normal"/>
+              <w:widowControl w:val="false"/>
+              <w:spacing w:lineRule="auto" w:line="180"/>
+              <w:jc w:val="center"/>
+              <w:rPr>
+                <w:sz w:val="16"/>
+                <w:szCs w:val="16"/>
+              </w:rPr>
+            </w:pPr>
+            <w:r>
+              <w:rPr>
+                <w:rFonts w:eastAsia="arial" w:ascii="arial" w:hAnsi="arial"/>
+                <w:color w:val="000000"/>
+                <w:sz w:val="16"/>
+                <w:szCs w:val="16"/>
+              </w:rPr>
+              <w:t>Cab Cam</w:t>
+            </w:r>
+          </w:p>
+        </w:tc>
+      </w:tr>
+    </w:tbl>
+    <w:p>
+      <w:pPr>
+        <w:pStyle w:val="Normal"/>
+        <w:rPr>
+          <w:color w:val="000000"/>
+          <w:sz w:val="16"/>
+          <w:szCs w:val="16"/>
+        </w:rPr>
+      </w:pPr>
+      <w:r>
+        <w:rPr>
+          <w:color w:val="000000"/>
+          <w:sz w:val="16"/>
+          <w:szCs w:val="16"/>
+        </w:rPr>
+      </w:r>
+    </w:p>
+    <w:p>
+      <w:pPr>
+        <w:pStyle w:val="Normal"/>
+        <w:rPr>
+          <w:color w:val="000000"/>
+          <w:sz w:val="16"/>
+          <w:szCs w:val="16"/>
+        </w:rPr>
+      </w:pPr>
+      <w:r>
+        <w:rPr>
+          <w:rFonts w:eastAsia="arial" w:ascii="arial" w:hAnsi="arial"/>
+          <w:color w:val="000000"/>
+          <w:sz w:val="16"/>
+          <w:szCs w:val="16"/>
+        </w:rPr>
+        <w:tab/>
+        <w:t xml:space="preserve">           Class </w:t>
+      </w:r>
+      <w:r>
+        <w:rPr>
+          <w:rFonts w:eastAsia="arial" w:ascii="arial" w:hAnsi="arial"/>
+          <w:color w:val="000000"/>
+          <w:sz w:val="16"/>
+          <w:szCs w:val="16"/>
+        </w:rPr>
+        <w:t>465</w:t>
+      </w:r>
+      <w:r>
+        <w:rPr>
+          <w:rFonts w:eastAsia="arial" w:ascii="arial" w:hAnsi="arial"/>
+          <w:color w:val="000000"/>
+          <w:sz w:val="16"/>
+          <w:szCs w:val="16"/>
+        </w:rPr>
+        <w:t>-1</w:t>
+      </w:r>
+    </w:p>
+    <w:tbl>
+      <w:tblPr>
+        <w:tblW w:w="14248" w:type="dxa"/>
+        <w:jc w:val="left"/>
+        <w:tblInd w:w="-5" w:type="dxa"/>
+        <w:tblLayout w:type="fixed"/>
+        <w:tblCellMar>
+          <w:top w:w="0" w:type="dxa"/>
+          <w:left w:w="108" w:type="dxa"/>
+          <w:bottom w:w="0" w:type="dxa"/>
+          <w:right w:w="108" w:type="dxa"/>
+        </w:tblCellMar>
+        <w:tblLook w:firstRow="1" w:noVBand="1" w:lastRow="0" w:firstColumn="1" w:lastColumn="0" w:noHBand="0" w:val="04a0"/>
+      </w:tblPr>
+      <w:tblGrid>
+        <w:gridCol w:w="1017"/>
+        <w:gridCol w:w="1019"/>
+        <w:gridCol w:w="1014"/>
+        <w:gridCol w:w="1016"/>
+        <w:gridCol w:w="1020"/>
+        <w:gridCol w:w="1016"/>
+        <w:gridCol w:w="1016"/>
+        <w:gridCol w:w="1017"/>
+        <w:gridCol w:w="1016"/>
+        <w:gridCol w:w="1020"/>
+        <w:gridCol w:w="1016"/>
+        <w:gridCol w:w="1016"/>
+        <w:gridCol w:w="1016"/>
+        <w:gridCol w:w="1029"/>
+      </w:tblGrid>
+      <w:tr>
+        <w:trPr>
+          <w:trHeight w:val="440" w:hRule="exact"/>
+          <w:cantSplit w:val="true"/>
+        </w:trPr>
+        <w:tc>
+          <w:tcPr>
+            <w:tcW w:w="1017" w:type="dxa"/>
+            <w:tcBorders>
+              <w:top w:val="single" w:sz="4" w:space="0" w:color="000000"/>
+              <w:left w:val="single" w:sz="4" w:space="0" w:color="000000"/>
+              <w:bottom w:val="single" w:sz="4" w:space="0" w:color="000000"/>
+            </w:tcBorders>
+            <w:vAlign w:val="bottom"/>
+          </w:tcPr>
+          <w:p>
+            <w:pPr>
+              <w:pStyle w:val="Normal"/>
+              <w:widowControl w:val="false"/>
+              <w:spacing w:lineRule="auto" w:line="180" w:before="0" w:after="60"/>
+              <w:jc w:val="center"/>
+              <w:rPr>
+                <w:color w:val="000000"/>
+                <w:sz w:val="16"/>
+                <w:szCs w:val="16"/>
+              </w:rPr>
+            </w:pPr>
+            <w:r>
+              <w:rPr>
+                <w:rFonts w:eastAsia="arial" w:ascii="arial" w:hAnsi="arial"/>
+                <w:b/>
+                <w:color w:val="000000"/>
+                <w:sz w:val="16"/>
+                <w:szCs w:val="16"/>
+              </w:rPr>
+              <w:t>Pause</w:t>
+            </w:r>
+          </w:p>
+        </w:tc>
+        <w:tc>
+          <w:tcPr>
+            <w:tcW w:w="1019" w:type="dxa"/>
+            <w:tcBorders>
+              <w:top w:val="single" w:sz="4" w:space="0" w:color="000000"/>
+              <w:left w:val="single" w:sz="4" w:space="0" w:color="000000"/>
+              <w:bottom w:val="single" w:sz="4" w:space="0" w:color="000000"/>
+            </w:tcBorders>
+            <w:vAlign w:val="bottom"/>
+          </w:tcPr>
+          <w:p>
+            <w:pPr>
+              <w:pStyle w:val="Normal"/>
+              <w:widowControl w:val="false"/>
+              <w:spacing w:lineRule="auto" w:line="180"/>
+              <w:jc w:val="center"/>
+              <w:rPr>
+                <w:color w:val="000000"/>
+                <w:sz w:val="16"/>
+                <w:szCs w:val="16"/>
+              </w:rPr>
+            </w:pPr>
+            <w:r>
+              <w:rPr>
+                <w:color w:val="000000"/>
+                <w:sz w:val="16"/>
+                <w:szCs w:val="16"/>
+              </w:rPr>
+              <w:t>Master Key</w:t>
+            </w:r>
+          </w:p>
+        </w:tc>
+        <w:tc>
+          <w:tcPr>
+            <w:tcW w:w="1014" w:type="dxa"/>
+            <w:tcBorders>
+              <w:top w:val="single" w:sz="4" w:space="0" w:color="000000"/>
+              <w:left w:val="single" w:sz="4" w:space="0" w:color="000000"/>
+              <w:bottom w:val="single" w:sz="4" w:space="0" w:color="000000"/>
+            </w:tcBorders>
+            <w:vAlign w:val="bottom"/>
+          </w:tcPr>
+          <w:p>
+            <w:pPr>
+              <w:pStyle w:val="Normal"/>
+              <w:widowControl w:val="false"/>
+              <w:spacing w:lineRule="auto" w:line="180"/>
+              <w:jc w:val="center"/>
+              <w:rPr>
+                <w:color w:val="000000"/>
+                <w:sz w:val="16"/>
+                <w:szCs w:val="16"/>
+              </w:rPr>
+            </w:pPr>
+            <w:r>
+              <w:rPr>
+                <w:color w:val="000000"/>
+                <w:sz w:val="16"/>
+                <w:szCs w:val="16"/>
+              </w:rPr>
+              <w:t>Aux/</w:t>
+            </w:r>
+            <w:r>
+              <w:rPr>
+                <w:color w:val="000000"/>
+                <w:sz w:val="16"/>
+                <w:szCs w:val="16"/>
+              </w:rPr>
+              <w:t>Light</w:t>
+            </w:r>
+            <w:r>
+              <w:rPr>
+                <w:color w:val="000000"/>
+                <w:sz w:val="16"/>
+                <w:szCs w:val="16"/>
+              </w:rPr>
+              <w:t xml:space="preserve"> </w:t>
+            </w:r>
+            <w:r>
+              <w:rPr>
+                <w:color w:val="000000"/>
+                <w:sz w:val="16"/>
+                <w:szCs w:val="16"/>
+              </w:rPr>
+              <w:t>On</w:t>
+            </w:r>
+          </w:p>
+        </w:tc>
+        <w:tc>
+          <w:tcPr>
+            <w:tcW w:w="1016" w:type="dxa"/>
+            <w:tcBorders>
+              <w:top w:val="single" w:sz="4" w:space="0" w:color="000000"/>
+              <w:left w:val="single" w:sz="4" w:space="0" w:color="000000"/>
+              <w:bottom w:val="single" w:sz="4" w:space="0" w:color="000000"/>
+            </w:tcBorders>
+            <w:vAlign w:val="bottom"/>
+          </w:tcPr>
+          <w:p>
+            <w:pPr>
+              <w:pStyle w:val="Normal"/>
+              <w:widowControl w:val="false"/>
+              <w:spacing w:lineRule="auto" w:line="180"/>
+              <w:jc w:val="center"/>
+              <w:rPr>
+                <w:color w:val="000000"/>
+                <w:sz w:val="16"/>
+                <w:szCs w:val="16"/>
+              </w:rPr>
+            </w:pPr>
+            <w:r>
+              <w:rPr>
+                <w:color w:val="000000"/>
+                <w:sz w:val="16"/>
+                <w:szCs w:val="16"/>
+              </w:rPr>
+              <w:t>AWS</w:t>
+            </w:r>
+          </w:p>
+        </w:tc>
+        <w:tc>
+          <w:tcPr>
+            <w:tcW w:w="1020" w:type="dxa"/>
+            <w:tcBorders>
+              <w:top w:val="single" w:sz="4" w:space="0" w:color="000000"/>
+              <w:left w:val="single" w:sz="4" w:space="0" w:color="000000"/>
+              <w:bottom w:val="single" w:sz="4" w:space="0" w:color="000000"/>
+            </w:tcBorders>
+            <w:vAlign w:val="bottom"/>
+          </w:tcPr>
+          <w:p>
+            <w:pPr>
+              <w:pStyle w:val="Normal"/>
+              <w:widowControl w:val="false"/>
+              <w:spacing w:lineRule="auto" w:line="180"/>
+              <w:jc w:val="center"/>
+              <w:rPr>
+                <w:color w:val="000000"/>
+                <w:sz w:val="16"/>
+                <w:szCs w:val="16"/>
+              </w:rPr>
+            </w:pPr>
+            <w:r>
+              <w:rPr>
+                <w:color w:val="000000"/>
+                <w:sz w:val="16"/>
+                <w:szCs w:val="16"/>
+              </w:rPr>
+              <w:t>Regen Brake On</w:t>
+            </w:r>
+          </w:p>
+        </w:tc>
+        <w:tc>
+          <w:tcPr>
+            <w:tcW w:w="1016" w:type="dxa"/>
+            <w:tcBorders>
+              <w:top w:val="single" w:sz="4" w:space="0" w:color="000000"/>
+              <w:left w:val="single" w:sz="4" w:space="0" w:color="000000"/>
+              <w:bottom w:val="single" w:sz="4" w:space="0" w:color="000000"/>
+            </w:tcBorders>
+            <w:vAlign w:val="bottom"/>
+          </w:tcPr>
+          <w:p>
+            <w:pPr>
+              <w:pStyle w:val="Normal"/>
+              <w:widowControl w:val="false"/>
+              <w:spacing w:lineRule="auto" w:line="180"/>
+              <w:jc w:val="center"/>
+              <w:rPr>
+                <w:color w:val="000000"/>
+                <w:sz w:val="16"/>
+                <w:szCs w:val="16"/>
+              </w:rPr>
+            </w:pPr>
+            <w:r>
+              <w:rPr>
+                <w:color w:val="000000"/>
+                <w:sz w:val="16"/>
+                <w:szCs w:val="16"/>
+              </w:rPr>
+              <w:t>Train Heat Off</w:t>
+            </w:r>
+          </w:p>
+        </w:tc>
+        <w:tc>
+          <w:tcPr>
+            <w:tcW w:w="1016" w:type="dxa"/>
+            <w:tcBorders>
+              <w:top w:val="single" w:sz="4" w:space="0" w:color="000000"/>
+              <w:left w:val="single" w:sz="4" w:space="0" w:color="000000"/>
+              <w:bottom w:val="single" w:sz="4" w:space="0" w:color="000000"/>
+            </w:tcBorders>
+            <w:vAlign w:val="bottom"/>
+          </w:tcPr>
+          <w:p>
+            <w:pPr>
+              <w:pStyle w:val="Normal"/>
+              <w:widowControl w:val="false"/>
+              <w:jc w:val="center"/>
+              <w:rPr>
+                <w:sz w:val="16"/>
+                <w:szCs w:val="16"/>
+              </w:rPr>
+            </w:pPr>
+            <w:r>
+              <w:rPr>
+                <w:sz w:val="16"/>
+                <w:szCs w:val="16"/>
+              </w:rPr>
+              <w:t>DRA</w:t>
+            </w:r>
+          </w:p>
+        </w:tc>
+        <w:tc>
+          <w:tcPr>
+            <w:tcW w:w="1017" w:type="dxa"/>
+            <w:tcBorders>
+              <w:top w:val="single" w:sz="4" w:space="0" w:color="000000"/>
+              <w:left w:val="single" w:sz="4" w:space="0" w:color="000000"/>
+              <w:bottom w:val="single" w:sz="4" w:space="0" w:color="000000"/>
+            </w:tcBorders>
+            <w:vAlign w:val="bottom"/>
+          </w:tcPr>
+          <w:p>
+            <w:pPr>
+              <w:pStyle w:val="Normal"/>
+              <w:widowControl w:val="false"/>
+              <w:jc w:val="center"/>
+              <w:rPr>
+                <w:sz w:val="16"/>
+                <w:szCs w:val="16"/>
+              </w:rPr>
+            </w:pPr>
+            <w:r>
+              <w:rPr>
+                <w:color w:val="000000"/>
+                <w:sz w:val="16"/>
+                <w:szCs w:val="16"/>
+              </w:rPr>
+              <w:t>Fault Light Bright</w:t>
+            </w:r>
+          </w:p>
+        </w:tc>
+        <w:tc>
+          <w:tcPr>
+            <w:tcW w:w="1016" w:type="dxa"/>
+            <w:tcBorders>
+              <w:top w:val="single" w:sz="4" w:space="0" w:color="000000"/>
+              <w:left w:val="single" w:sz="4" w:space="0" w:color="000000"/>
+              <w:bottom w:val="single" w:sz="4" w:space="0" w:color="000000"/>
+            </w:tcBorders>
+            <w:vAlign w:val="bottom"/>
+          </w:tcPr>
+          <w:p>
+            <w:pPr>
+              <w:pStyle w:val="Normal"/>
+              <w:widowControl w:val="false"/>
+              <w:jc w:val="center"/>
+              <w:rPr>
+                <w:sz w:val="16"/>
+                <w:szCs w:val="16"/>
+              </w:rPr>
+            </w:pPr>
+            <w:r>
+              <w:rPr>
+                <w:sz w:val="16"/>
+                <w:szCs w:val="16"/>
+              </w:rPr>
+              <w:t>Gauge Light Up</w:t>
+            </w:r>
+          </w:p>
+        </w:tc>
+        <w:tc>
+          <w:tcPr>
+            <w:tcW w:w="1020" w:type="dxa"/>
+            <w:tcBorders>
+              <w:top w:val="single" w:sz="4" w:space="0" w:color="000000"/>
+              <w:left w:val="single" w:sz="4" w:space="0" w:color="000000"/>
+              <w:bottom w:val="single" w:sz="4" w:space="0" w:color="000000"/>
+            </w:tcBorders>
+            <w:vAlign w:val="bottom"/>
+          </w:tcPr>
+          <w:p>
+            <w:pPr>
+              <w:pStyle w:val="Normal"/>
+              <w:widowControl w:val="false"/>
+              <w:jc w:val="center"/>
+              <w:rPr>
+                <w:color w:val="000000"/>
+                <w:sz w:val="16"/>
+                <w:szCs w:val="16"/>
+              </w:rPr>
+            </w:pPr>
+            <w:r>
+              <w:rPr>
+                <w:color w:val="000000"/>
+                <w:sz w:val="16"/>
+                <w:szCs w:val="16"/>
+              </w:rPr>
+              <w:t>Tail Light On</w:t>
+            </w:r>
+          </w:p>
+        </w:tc>
+        <w:tc>
+          <w:tcPr>
+            <w:tcW w:w="1016" w:type="dxa"/>
+            <w:tcBorders>
+              <w:top w:val="single" w:sz="4" w:space="0" w:color="000000"/>
+              <w:left w:val="single" w:sz="4" w:space="0" w:color="000000"/>
+              <w:bottom w:val="single" w:sz="4" w:space="0" w:color="000000"/>
+            </w:tcBorders>
+            <w:vAlign w:val="bottom"/>
+          </w:tcPr>
+          <w:p>
+            <w:pPr>
+              <w:pStyle w:val="Normal"/>
+              <w:widowControl w:val="false"/>
+              <w:spacing w:lineRule="auto" w:line="180"/>
+              <w:jc w:val="center"/>
+              <w:rPr>
+                <w:sz w:val="16"/>
+                <w:szCs w:val="16"/>
+              </w:rPr>
+            </w:pPr>
+            <w:r>
+              <w:rPr>
+                <w:rFonts w:eastAsia="arial" w:ascii="arial" w:hAnsi="arial"/>
+                <w:color w:val="000000"/>
+                <w:sz w:val="16"/>
+                <w:szCs w:val="16"/>
+              </w:rPr>
+              <w:t>Cab Light</w:t>
+            </w:r>
+          </w:p>
+        </w:tc>
+        <w:tc>
+          <w:tcPr>
+            <w:tcW w:w="1016" w:type="dxa"/>
+            <w:tcBorders>
+              <w:top w:val="single" w:sz="4" w:space="0" w:color="000000"/>
+              <w:left w:val="single" w:sz="4" w:space="0" w:color="000000"/>
+              <w:bottom w:val="single" w:sz="4" w:space="0" w:color="000000"/>
+            </w:tcBorders>
+            <w:vAlign w:val="bottom"/>
+          </w:tcPr>
+          <w:p>
+            <w:pPr>
+              <w:pStyle w:val="Normal"/>
+              <w:widowControl w:val="false"/>
+              <w:jc w:val="center"/>
+              <w:rPr>
+                <w:color w:val="000000"/>
+                <w:sz w:val="16"/>
+                <w:szCs w:val="16"/>
+              </w:rPr>
+            </w:pPr>
+            <w:r>
+              <w:rPr>
+                <w:color w:val="000000"/>
+                <w:sz w:val="16"/>
+                <w:szCs w:val="16"/>
+              </w:rPr>
+              <w:t>Couple</w:t>
+            </w:r>
+          </w:p>
+        </w:tc>
+        <w:tc>
+          <w:tcPr>
+            <w:tcW w:w="1016" w:type="dxa"/>
+            <w:tcBorders>
+              <w:top w:val="single" w:sz="4" w:space="0" w:color="000000"/>
+              <w:left w:val="single" w:sz="4" w:space="0" w:color="000000"/>
+              <w:bottom w:val="single" w:sz="4" w:space="0" w:color="000000"/>
+            </w:tcBorders>
+            <w:vAlign w:val="bottom"/>
+          </w:tcPr>
+          <w:p>
+            <w:pPr>
+              <w:pStyle w:val="Normal"/>
+              <w:widowControl w:val="false"/>
+              <w:spacing w:lineRule="auto" w:line="180"/>
+              <w:jc w:val="center"/>
+              <w:rPr>
+                <w:sz w:val="16"/>
+                <w:szCs w:val="16"/>
+              </w:rPr>
+            </w:pPr>
+            <w:r>
+              <w:rPr>
+                <w:rFonts w:eastAsia="arial" w:ascii="arial" w:hAnsi="arial"/>
+                <w:color w:val="000000"/>
+                <w:sz w:val="16"/>
+                <w:szCs w:val="16"/>
+              </w:rPr>
+              <w:t>1-Person</w:t>
+            </w:r>
+          </w:p>
+        </w:tc>
+        <w:tc>
+          <w:tcPr>
+            <w:tcW w:w="1029" w:type="dxa"/>
+            <w:tcBorders>
+              <w:top w:val="single" w:sz="4" w:space="0" w:color="000000"/>
+              <w:left w:val="single" w:sz="4" w:space="0" w:color="000000"/>
+              <w:bottom w:val="single" w:sz="4" w:space="0" w:color="000000"/>
+              <w:right w:val="single" w:sz="4" w:space="0" w:color="000000"/>
+            </w:tcBorders>
+            <w:vAlign w:val="bottom"/>
+          </w:tcPr>
+          <w:p>
+            <w:pPr>
+              <w:pStyle w:val="Normal"/>
+              <w:widowControl w:val="false"/>
+              <w:spacing w:lineRule="auto" w:line="180"/>
+              <w:jc w:val="center"/>
+              <w:rPr>
+                <w:sz w:val="16"/>
+                <w:szCs w:val="16"/>
+              </w:rPr>
+            </w:pPr>
+            <w:r>
+              <w:rPr>
+                <w:rFonts w:eastAsia="arial" w:ascii="arial" w:hAnsi="arial"/>
+                <w:color w:val="000000"/>
+                <w:sz w:val="16"/>
+                <w:szCs w:val="16"/>
+              </w:rPr>
+              <w:t>Next</w:t>
+            </w:r>
+          </w:p>
+          <w:p>
+            <w:pPr>
+              <w:pStyle w:val="Normal"/>
+              <w:widowControl w:val="false"/>
+              <w:spacing w:lineRule="auto" w:line="180"/>
+              <w:jc w:val="center"/>
+              <w:rPr>
+                <w:sz w:val="16"/>
+                <w:szCs w:val="16"/>
+              </w:rPr>
+            </w:pPr>
+            <w:r>
+              <w:rPr>
+                <w:rFonts w:eastAsia="arial" w:ascii="arial" w:hAnsi="arial"/>
+                <w:color w:val="000000"/>
+                <w:sz w:val="16"/>
+                <w:szCs w:val="16"/>
+              </w:rPr>
+              <w:t>Cab Cam</w:t>
+            </w:r>
+          </w:p>
+        </w:tc>
+      </w:tr>
+    </w:tbl>
+    <w:p>
+      <w:pPr>
+        <w:pStyle w:val="Normal"/>
+        <w:rPr>
+          <w:rFonts w:ascii="arial" w:hAnsi="arial" w:eastAsia="arial"/>
+          <w:color w:val="000000"/>
+          <w:sz w:val="16"/>
+          <w:szCs w:val="16"/>
+        </w:rPr>
+      </w:pPr>
+      <w:r>
+        <w:rPr>
+          <w:rFonts w:eastAsia="arial" w:ascii="arial" w:hAnsi="arial"/>
+          <w:color w:val="000000"/>
+          <w:sz w:val="16"/>
+          <w:szCs w:val="16"/>
+        </w:rPr>
+      </w:r>
+    </w:p>
+    <w:p>
+      <w:pPr>
+        <w:pStyle w:val="Normal"/>
+        <w:rPr>
+          <w:color w:val="000000"/>
+          <w:sz w:val="16"/>
+          <w:szCs w:val="16"/>
+        </w:rPr>
+      </w:pPr>
+      <w:r>
+        <w:rPr>
+          <w:rFonts w:eastAsia="arial" w:ascii="arial" w:hAnsi="arial"/>
+          <w:color w:val="000000"/>
+          <w:sz w:val="16"/>
+          <w:szCs w:val="16"/>
+        </w:rPr>
+        <w:tab/>
+        <w:t xml:space="preserve">           Class </w:t>
+      </w:r>
+      <w:r>
+        <w:rPr>
+          <w:rFonts w:eastAsia="arial" w:ascii="arial" w:hAnsi="arial"/>
+          <w:color w:val="000000"/>
+          <w:sz w:val="16"/>
+          <w:szCs w:val="16"/>
+        </w:rPr>
+        <w:t>465</w:t>
+      </w:r>
+      <w:r>
+        <w:rPr>
+          <w:rFonts w:eastAsia="arial" w:ascii="arial" w:hAnsi="arial"/>
+          <w:color w:val="000000"/>
+          <w:sz w:val="16"/>
+          <w:szCs w:val="16"/>
+        </w:rPr>
+        <w:t>-2</w:t>
+      </w:r>
+    </w:p>
+    <w:tbl>
+      <w:tblPr>
+        <w:tblW w:w="14248" w:type="dxa"/>
+        <w:jc w:val="left"/>
+        <w:tblInd w:w="-5" w:type="dxa"/>
+        <w:tblLayout w:type="fixed"/>
+        <w:tblCellMar>
+          <w:top w:w="0" w:type="dxa"/>
+          <w:left w:w="108" w:type="dxa"/>
+          <w:bottom w:w="0" w:type="dxa"/>
+          <w:right w:w="108" w:type="dxa"/>
+        </w:tblCellMar>
+        <w:tblLook w:firstRow="1" w:noVBand="1" w:lastRow="0" w:firstColumn="1" w:lastColumn="0" w:noHBand="0" w:val="04a0"/>
+      </w:tblPr>
+      <w:tblGrid>
+        <w:gridCol w:w="1017"/>
+        <w:gridCol w:w="1019"/>
+        <w:gridCol w:w="1014"/>
+        <w:gridCol w:w="1016"/>
+        <w:gridCol w:w="1020"/>
+        <w:gridCol w:w="1016"/>
+        <w:gridCol w:w="1016"/>
+        <w:gridCol w:w="1017"/>
+        <w:gridCol w:w="1016"/>
+        <w:gridCol w:w="1020"/>
+        <w:gridCol w:w="1016"/>
+        <w:gridCol w:w="1016"/>
+        <w:gridCol w:w="1016"/>
+        <w:gridCol w:w="1029"/>
+      </w:tblGrid>
+      <w:tr>
+        <w:trPr>
+          <w:trHeight w:val="440" w:hRule="exact"/>
+          <w:cantSplit w:val="true"/>
+        </w:trPr>
+        <w:tc>
+          <w:tcPr>
+            <w:tcW w:w="1017" w:type="dxa"/>
+            <w:tcBorders>
+              <w:top w:val="single" w:sz="4" w:space="0" w:color="000000"/>
+              <w:left w:val="single" w:sz="4" w:space="0" w:color="000000"/>
+              <w:bottom w:val="single" w:sz="4" w:space="0" w:color="000000"/>
+            </w:tcBorders>
+            <w:vAlign w:val="bottom"/>
+          </w:tcPr>
+          <w:p>
+            <w:pPr>
+              <w:pStyle w:val="Normal"/>
+              <w:widowControl w:val="false"/>
+              <w:spacing w:lineRule="auto" w:line="180" w:before="0" w:after="60"/>
+              <w:jc w:val="center"/>
+              <w:rPr>
+                <w:b/>
+                <w:bCs/>
+              </w:rPr>
+            </w:pPr>
+            <w:r>
+              <w:rPr>
+                <w:b/>
+                <w:bCs/>
+                <w:color w:val="000000"/>
+                <w:sz w:val="16"/>
+                <w:szCs w:val="16"/>
+              </w:rPr>
+              <w:t>HUD</w:t>
+            </w:r>
+          </w:p>
+        </w:tc>
+        <w:tc>
+          <w:tcPr>
+            <w:tcW w:w="1019" w:type="dxa"/>
+            <w:tcBorders>
+              <w:top w:val="single" w:sz="4" w:space="0" w:color="000000"/>
+              <w:left w:val="single" w:sz="4" w:space="0" w:color="000000"/>
+              <w:bottom w:val="single" w:sz="4" w:space="0" w:color="000000"/>
+            </w:tcBorders>
+            <w:vAlign w:val="bottom"/>
+          </w:tcPr>
+          <w:p>
+            <w:pPr>
+              <w:pStyle w:val="Normal"/>
+              <w:widowControl w:val="false"/>
+              <w:spacing w:lineRule="auto" w:line="180"/>
+              <w:jc w:val="center"/>
+              <w:rPr>
+                <w:color w:val="000000"/>
+                <w:sz w:val="16"/>
+                <w:szCs w:val="16"/>
+              </w:rPr>
+            </w:pPr>
+            <w:r>
+              <w:rPr>
+                <w:color w:val="000000"/>
+                <w:sz w:val="16"/>
+                <w:szCs w:val="16"/>
+              </w:rPr>
+              <w:t>Schedule</w:t>
+            </w:r>
+          </w:p>
+        </w:tc>
+        <w:tc>
+          <w:tcPr>
+            <w:tcW w:w="1014" w:type="dxa"/>
+            <w:tcBorders>
+              <w:top w:val="single" w:sz="4" w:space="0" w:color="000000"/>
+              <w:left w:val="single" w:sz="4" w:space="0" w:color="000000"/>
+              <w:bottom w:val="single" w:sz="4" w:space="0" w:color="000000"/>
+            </w:tcBorders>
+            <w:vAlign w:val="bottom"/>
+          </w:tcPr>
+          <w:p>
+            <w:pPr>
+              <w:pStyle w:val="Normal"/>
+              <w:widowControl w:val="false"/>
+              <w:spacing w:lineRule="auto" w:line="180"/>
+              <w:jc w:val="center"/>
+              <w:rPr>
+                <w:color w:val="000000"/>
+                <w:sz w:val="16"/>
+                <w:szCs w:val="16"/>
+              </w:rPr>
+            </w:pPr>
+            <w:r>
+              <w:rPr>
+                <w:color w:val="000000"/>
+                <w:sz w:val="16"/>
+                <w:szCs w:val="16"/>
+              </w:rPr>
+              <w:t>Aux/</w:t>
+            </w:r>
+            <w:r>
+              <w:rPr>
+                <w:color w:val="000000"/>
+                <w:sz w:val="16"/>
+                <w:szCs w:val="16"/>
+              </w:rPr>
+              <w:t>Light</w:t>
+            </w:r>
+            <w:r>
+              <w:rPr>
+                <w:color w:val="000000"/>
+                <w:sz w:val="16"/>
+                <w:szCs w:val="16"/>
+              </w:rPr>
+              <w:t xml:space="preserve"> </w:t>
+            </w:r>
+            <w:r>
+              <w:rPr>
+                <w:color w:val="000000"/>
+                <w:sz w:val="16"/>
+                <w:szCs w:val="16"/>
+              </w:rPr>
+              <w:t>Off</w:t>
+            </w:r>
+          </w:p>
+        </w:tc>
+        <w:tc>
+          <w:tcPr>
+            <w:tcW w:w="1016" w:type="dxa"/>
+            <w:tcBorders>
+              <w:top w:val="single" w:sz="4" w:space="0" w:color="000000"/>
+              <w:left w:val="single" w:sz="4" w:space="0" w:color="000000"/>
+              <w:bottom w:val="single" w:sz="4" w:space="0" w:color="000000"/>
+            </w:tcBorders>
+            <w:vAlign w:val="bottom"/>
+          </w:tcPr>
+          <w:p>
+            <w:pPr>
+              <w:pStyle w:val="Normal"/>
+              <w:widowControl w:val="false"/>
+              <w:spacing w:lineRule="auto" w:line="180"/>
+              <w:jc w:val="center"/>
+              <w:rPr>
+                <w:color w:val="000000"/>
+                <w:sz w:val="16"/>
+                <w:szCs w:val="16"/>
+              </w:rPr>
+            </w:pPr>
+            <w:r>
+              <w:rPr>
+                <w:color w:val="000000"/>
+                <w:sz w:val="16"/>
+                <w:szCs w:val="16"/>
+              </w:rPr>
+              <w:t>DSD/</w:t>
+            </w:r>
+            <w:r>
+              <w:rPr>
+                <w:color w:val="000000"/>
+                <w:sz w:val="16"/>
+                <w:szCs w:val="16"/>
+              </w:rPr>
+              <w:t>Vigilance</w:t>
+            </w:r>
+          </w:p>
+        </w:tc>
+        <w:tc>
+          <w:tcPr>
+            <w:tcW w:w="1020" w:type="dxa"/>
+            <w:tcBorders>
+              <w:top w:val="single" w:sz="4" w:space="0" w:color="000000"/>
+              <w:left w:val="single" w:sz="4" w:space="0" w:color="000000"/>
+              <w:bottom w:val="single" w:sz="4" w:space="0" w:color="000000"/>
+            </w:tcBorders>
+            <w:vAlign w:val="bottom"/>
+          </w:tcPr>
+          <w:p>
+            <w:pPr>
+              <w:pStyle w:val="Normal"/>
+              <w:widowControl w:val="false"/>
+              <w:spacing w:lineRule="auto" w:line="180"/>
+              <w:jc w:val="center"/>
+              <w:rPr>
+                <w:color w:val="000000"/>
+                <w:sz w:val="16"/>
+                <w:szCs w:val="16"/>
+              </w:rPr>
+            </w:pPr>
+            <w:r>
+              <w:rPr>
+                <w:color w:val="000000"/>
+                <w:sz w:val="16"/>
+                <w:szCs w:val="16"/>
+              </w:rPr>
+              <w:t>Regen Brake Off</w:t>
+            </w:r>
+          </w:p>
+        </w:tc>
+        <w:tc>
+          <w:tcPr>
+            <w:tcW w:w="1016" w:type="dxa"/>
+            <w:tcBorders>
+              <w:top w:val="single" w:sz="4" w:space="0" w:color="000000"/>
+              <w:left w:val="single" w:sz="4" w:space="0" w:color="000000"/>
+              <w:bottom w:val="single" w:sz="4" w:space="0" w:color="000000"/>
+            </w:tcBorders>
+            <w:vAlign w:val="bottom"/>
+          </w:tcPr>
+          <w:p>
+            <w:pPr>
+              <w:pStyle w:val="Normal"/>
+              <w:widowControl w:val="false"/>
+              <w:spacing w:lineRule="auto" w:line="180"/>
+              <w:jc w:val="center"/>
+              <w:rPr>
+                <w:sz w:val="16"/>
+                <w:szCs w:val="16"/>
+              </w:rPr>
+            </w:pPr>
+            <w:r>
+              <w:rPr>
+                <w:color w:val="000000"/>
+                <w:sz w:val="16"/>
+                <w:szCs w:val="16"/>
+              </w:rPr>
+              <w:t>Train Light Off</w:t>
+            </w:r>
+          </w:p>
+        </w:tc>
+        <w:tc>
+          <w:tcPr>
+            <w:tcW w:w="1016" w:type="dxa"/>
+            <w:tcBorders>
+              <w:top w:val="single" w:sz="4" w:space="0" w:color="000000"/>
+              <w:left w:val="single" w:sz="4" w:space="0" w:color="000000"/>
+              <w:bottom w:val="single" w:sz="4" w:space="0" w:color="000000"/>
+            </w:tcBorders>
+            <w:vAlign w:val="bottom"/>
+          </w:tcPr>
+          <w:p>
+            <w:pPr>
+              <w:pStyle w:val="Normal"/>
+              <w:widowControl w:val="false"/>
+              <w:jc w:val="center"/>
+              <w:rPr>
+                <w:sz w:val="16"/>
+                <w:szCs w:val="16"/>
+              </w:rPr>
+            </w:pPr>
+            <w:r>
+              <w:rPr>
+                <w:rFonts w:eastAsia="arial" w:ascii="arial" w:hAnsi="arial"/>
+                <w:color w:val="000000"/>
+                <w:sz w:val="16"/>
+                <w:szCs w:val="16"/>
+              </w:rPr>
+              <w:t>Hazard Light</w:t>
+            </w:r>
+          </w:p>
+        </w:tc>
+        <w:tc>
+          <w:tcPr>
+            <w:tcW w:w="1017" w:type="dxa"/>
+            <w:tcBorders>
+              <w:top w:val="single" w:sz="4" w:space="0" w:color="000000"/>
+              <w:left w:val="single" w:sz="4" w:space="0" w:color="000000"/>
+              <w:bottom w:val="single" w:sz="4" w:space="0" w:color="000000"/>
+            </w:tcBorders>
+            <w:vAlign w:val="bottom"/>
+          </w:tcPr>
+          <w:p>
+            <w:pPr>
+              <w:pStyle w:val="Normal"/>
+              <w:widowControl w:val="false"/>
+              <w:jc w:val="center"/>
+              <w:rPr>
+                <w:sz w:val="16"/>
+                <w:szCs w:val="16"/>
+              </w:rPr>
+            </w:pPr>
+            <w:r>
+              <w:rPr>
+                <w:color w:val="000000"/>
+                <w:sz w:val="16"/>
+                <w:szCs w:val="16"/>
+              </w:rPr>
+              <w:t>Fault Light Dim</w:t>
+            </w:r>
+          </w:p>
+        </w:tc>
+        <w:tc>
+          <w:tcPr>
+            <w:tcW w:w="1016" w:type="dxa"/>
+            <w:tcBorders>
+              <w:top w:val="single" w:sz="4" w:space="0" w:color="000000"/>
+              <w:left w:val="single" w:sz="4" w:space="0" w:color="000000"/>
+              <w:bottom w:val="single" w:sz="4" w:space="0" w:color="000000"/>
+            </w:tcBorders>
+            <w:vAlign w:val="bottom"/>
+          </w:tcPr>
+          <w:p>
+            <w:pPr>
+              <w:pStyle w:val="Normal"/>
+              <w:widowControl w:val="false"/>
+              <w:jc w:val="center"/>
+              <w:rPr>
+                <w:sz w:val="16"/>
+                <w:szCs w:val="16"/>
+              </w:rPr>
+            </w:pPr>
+            <w:r>
+              <w:rPr>
+                <w:sz w:val="16"/>
+                <w:szCs w:val="16"/>
+              </w:rPr>
+              <w:t>Gauge Light Dw.</w:t>
+            </w:r>
+          </w:p>
+        </w:tc>
+        <w:tc>
+          <w:tcPr>
+            <w:tcW w:w="1020" w:type="dxa"/>
+            <w:tcBorders>
+              <w:top w:val="single" w:sz="4" w:space="0" w:color="000000"/>
+              <w:left w:val="single" w:sz="4" w:space="0" w:color="000000"/>
+              <w:bottom w:val="single" w:sz="4" w:space="0" w:color="000000"/>
+            </w:tcBorders>
+            <w:vAlign w:val="bottom"/>
+          </w:tcPr>
+          <w:p>
+            <w:pPr>
+              <w:pStyle w:val="Normal"/>
+              <w:widowControl w:val="false"/>
+              <w:jc w:val="center"/>
+              <w:rPr>
+                <w:color w:val="000000"/>
+                <w:sz w:val="16"/>
+                <w:szCs w:val="16"/>
+              </w:rPr>
+            </w:pPr>
+            <w:r>
+              <w:rPr>
+                <w:rFonts w:eastAsia="arial" w:ascii="arial" w:hAnsi="arial"/>
+                <w:color w:val="000000"/>
+                <w:sz w:val="16"/>
+                <w:szCs w:val="16"/>
+              </w:rPr>
+              <w:t>Tail Light Off</w:t>
+            </w:r>
+          </w:p>
+        </w:tc>
+        <w:tc>
+          <w:tcPr>
+            <w:tcW w:w="1016" w:type="dxa"/>
+            <w:tcBorders>
+              <w:top w:val="single" w:sz="4" w:space="0" w:color="000000"/>
+              <w:left w:val="single" w:sz="4" w:space="0" w:color="000000"/>
+              <w:bottom w:val="single" w:sz="4" w:space="0" w:color="000000"/>
+            </w:tcBorders>
+            <w:vAlign w:val="bottom"/>
+          </w:tcPr>
+          <w:p>
+            <w:pPr>
+              <w:pStyle w:val="Normal"/>
+              <w:widowControl w:val="false"/>
+              <w:jc w:val="center"/>
+              <w:rPr>
+                <w:color w:val="000000"/>
+                <w:sz w:val="16"/>
+                <w:szCs w:val="16"/>
+              </w:rPr>
+            </w:pPr>
+            <w:r>
+              <w:rPr>
+                <w:color w:val="000000"/>
+                <w:sz w:val="16"/>
+                <w:szCs w:val="16"/>
+              </w:rPr>
+              <w:t>Clipboard Light</w:t>
             </w:r>
           </w:p>
         </w:tc>
@@ -39937,12 +42208,12 @@
       <w:rFonts w:ascii="Symbol" w:hAnsi="Symbol" w:cs="Symbol"/>
     </w:rPr>
   </w:style>
-  <w:style w:type="character" w:styleId="Style5" w:customStyle="1">
-    <w:name w:val="번호 매기기 기호"/>
+  <w:style w:type="character" w:styleId="user" w:customStyle="1">
+    <w:name w:val="번호 매기기 기호 (user)"/>
     <w:qFormat/>
     <w:rPr/>
   </w:style>
-  <w:style w:type="paragraph" w:styleId="Style6">
+  <w:style w:type="paragraph" w:styleId="Style5">
     <w:name w:val="제목"/>
     <w:basedOn w:val="Normal"/>
     <w:next w:val="BodyText"/>
@@ -39952,7 +42223,7 @@
       <w:spacing w:before="240" w:after="120"/>
     </w:pPr>
     <w:rPr>
-      <w:rFonts w:ascii="Liberation Sans" w:hAnsi="Liberation Sans" w:eastAsia="나눔고딕" w:cs="Arial"/>
+      <w:rFonts w:ascii="Liberation Sans" w:hAnsi="Liberation Sans" w:eastAsia="Noto Sans CJK KR" w:cs="Lohit Devanagari"/>
       <w:sz w:val="28"/>
       <w:szCs w:val="28"/>
     </w:rPr>
@@ -39989,7 +42260,7 @@
       <w:szCs w:val="24"/>
     </w:rPr>
   </w:style>
-  <w:style w:type="paragraph" w:styleId="Style7">
+  <w:style w:type="paragraph" w:styleId="Style6" w:customStyle="1">
     <w:name w:val="색인"/>
     <w:basedOn w:val="Normal"/>
     <w:qFormat/>
@@ -39997,11 +42268,10 @@
       <w:suppressLineNumbers/>
     </w:pPr>
     <w:rPr>
-      <w:rFonts w:cs="Arial"/>
-      <w:sz w:val="24"/>
+      <w:rFonts w:cs="Lohit Devanagari"/>
     </w:rPr>
   </w:style>
-  <w:style w:type="paragraph" w:styleId="user">
+  <w:style w:type="paragraph" w:styleId="user1">
     <w:name w:val="제목 (user)"/>
     <w:basedOn w:val="Normal"/>
     <w:next w:val="BodyText"/>
@@ -40011,12 +42281,12 @@
       <w:spacing w:before="240" w:after="120"/>
     </w:pPr>
     <w:rPr>
-      <w:rFonts w:ascii="Liberation Sans" w:hAnsi="Liberation Sans" w:eastAsia="Noto Sans CJK KR" w:cs="Lohit Devanagari"/>
+      <w:rFonts w:ascii="Liberation Sans" w:hAnsi="Liberation Sans" w:eastAsia="나눔고딕" w:cs="Arial"/>
       <w:sz w:val="28"/>
       <w:szCs w:val="28"/>
     </w:rPr>
   </w:style>
-  <w:style w:type="paragraph" w:styleId="user1" w:customStyle="1">
+  <w:style w:type="paragraph" w:styleId="user2">
     <w:name w:val="색인 (user)"/>
     <w:basedOn w:val="Normal"/>
     <w:qFormat/>
@@ -40024,7 +42294,8 @@
       <w:suppressLineNumbers/>
     </w:pPr>
     <w:rPr>
-      <w:rFonts w:cs="Lohit Devanagari"/>
+      <w:rFonts w:cs="Arial"/>
+      <w:sz w:val="24"/>
     </w:rPr>
   </w:style>
   <w:style w:type="paragraph" w:styleId="Title">
@@ -40706,8 +42977,8 @@
       <w:szCs w:val="24"/>
     </w:rPr>
   </w:style>
-  <w:style w:type="paragraph" w:styleId="user2" w:customStyle="1">
-    <w:name w:val="표 내용 (user)"/>
+  <w:style w:type="paragraph" w:styleId="Style7" w:customStyle="1">
+    <w:name w:val="표 내용"/>
     <w:basedOn w:val="Normal"/>
     <w:qFormat/>
     <w:pPr>
@@ -40715,9 +42986,9 @@
     </w:pPr>
     <w:rPr/>
   </w:style>
-  <w:style w:type="paragraph" w:styleId="user3" w:customStyle="1">
-    <w:name w:val="표제목 (user)"/>
-    <w:basedOn w:val="user2"/>
+  <w:style w:type="paragraph" w:styleId="Style8" w:customStyle="1">
+    <w:name w:val="표제목"/>
+    <w:basedOn w:val="Style7"/>
     <w:qFormat/>
     <w:pPr>
       <w:jc w:val="center"/>
@@ -40727,8 +42998,8 @@
       <w:bCs/>
     </w:rPr>
   </w:style>
-  <w:style w:type="paragraph" w:styleId="Style8">
-    <w:name w:val="표 내용"/>
+  <w:style w:type="paragraph" w:styleId="user3">
+    <w:name w:val="표 내용 (user)"/>
     <w:basedOn w:val="Normal"/>
     <w:qFormat/>
     <w:pPr>
@@ -40737,9 +43008,9 @@
     </w:pPr>
     <w:rPr/>
   </w:style>
-  <w:style w:type="paragraph" w:styleId="Style9">
-    <w:name w:val="표제목"/>
-    <w:basedOn w:val="Style8"/>
+  <w:style w:type="paragraph" w:styleId="user4">
+    <w:name w:val="표제목 (user)"/>
+    <w:basedOn w:val="user3"/>
     <w:qFormat/>
     <w:pPr>
       <w:suppressLineNumbers/>

</xml_diff>

<commit_message>
Add Class 484 and 700
</commit_message>
<xml_diff>
--- a/raildriver-UK-Remapped.docx
+++ b/raildriver-UK-Remapped.docx
@@ -41052,25 +41052,7 @@
           <w:szCs w:val="16"/>
         </w:rPr>
         <w:tab/>
-        <w:t xml:space="preserve">           Class 4</w:t>
-      </w:r>
-      <w:r>
-        <w:rPr>
-          <w:rFonts w:eastAsia="arial" w:ascii="arial" w:hAnsi="arial"/>
-          <w:color w:val="000000"/>
-          <w:sz w:val="16"/>
-          <w:szCs w:val="16"/>
-        </w:rPr>
-        <w:t>83</w:t>
-      </w:r>
-      <w:r>
-        <w:rPr>
-          <w:rFonts w:eastAsia="arial" w:ascii="arial" w:hAnsi="arial"/>
-          <w:color w:val="000000"/>
-          <w:sz w:val="16"/>
-          <w:szCs w:val="16"/>
-        </w:rPr>
-        <w:t>-1</w:t>
+        <w:t xml:space="preserve">           Class 483-1</w:t>
       </w:r>
     </w:p>
     <w:tbl>
@@ -41170,15 +41152,7 @@
                 <w:sz w:val="16"/>
                 <w:szCs w:val="16"/>
               </w:rPr>
-              <w:t>Master</w:t>
-            </w:r>
-            <w:r>
-              <w:rPr>
-                <w:color w:val="000000"/>
-                <w:sz w:val="16"/>
-                <w:szCs w:val="16"/>
-              </w:rPr>
-              <w:t xml:space="preserve"> Key</w:t>
+              <w:t>Master Key</w:t>
             </w:r>
           </w:p>
         </w:tc>
@@ -41331,7 +41305,10 @@
               </w:rPr>
             </w:pPr>
             <w:r>
-              <w:rPr/>
+              <w:rPr>
+                <w:sz w:val="16"/>
+                <w:szCs w:val="16"/>
+              </w:rPr>
             </w:r>
           </w:p>
         </w:tc>
@@ -41356,7 +41333,10 @@
               </w:rPr>
             </w:pPr>
             <w:r>
-              <w:rPr/>
+              <w:rPr>
+                <w:sz w:val="16"/>
+                <w:szCs w:val="16"/>
+              </w:rPr>
             </w:r>
           </w:p>
         </w:tc>
@@ -41419,16 +41399,7 @@
                 <w:sz w:val="16"/>
                 <w:szCs w:val="16"/>
               </w:rPr>
-              <w:t xml:space="preserve">Cab Light </w:t>
-            </w:r>
-            <w:r>
-              <w:rPr>
-                <w:rFonts w:eastAsia="arial" w:ascii="arial" w:hAnsi="arial"/>
-                <w:color w:val="000000"/>
-                <w:sz w:val="16"/>
-                <w:szCs w:val="16"/>
-              </w:rPr>
-              <w:t>On</w:t>
+              <w:t>Cab Light On</w:t>
             </w:r>
           </w:p>
         </w:tc>
@@ -41619,7 +41590,547 @@
           <w:szCs w:val="16"/>
         </w:rPr>
         <w:tab/>
-        <w:t xml:space="preserve">           Class 4</w:t>
+        <w:t xml:space="preserve">           Class 483-2</w:t>
+      </w:r>
+    </w:p>
+    <w:tbl>
+      <w:tblPr>
+        <w:tblW w:w="14248" w:type="dxa"/>
+        <w:jc w:val="left"/>
+        <w:tblInd w:w="-5" w:type="dxa"/>
+        <w:tblLayout w:type="fixed"/>
+        <w:tblCellMar>
+          <w:top w:w="0" w:type="dxa"/>
+          <w:left w:w="108" w:type="dxa"/>
+          <w:bottom w:w="0" w:type="dxa"/>
+          <w:right w:w="108" w:type="dxa"/>
+        </w:tblCellMar>
+        <w:tblLook w:firstRow="1" w:noVBand="1" w:lastRow="0" w:firstColumn="1" w:lastColumn="0" w:noHBand="0" w:val="04a0"/>
+      </w:tblPr>
+      <w:tblGrid>
+        <w:gridCol w:w="1017"/>
+        <w:gridCol w:w="1019"/>
+        <w:gridCol w:w="1014"/>
+        <w:gridCol w:w="1016"/>
+        <w:gridCol w:w="1020"/>
+        <w:gridCol w:w="1016"/>
+        <w:gridCol w:w="1016"/>
+        <w:gridCol w:w="1017"/>
+        <w:gridCol w:w="1016"/>
+        <w:gridCol w:w="1020"/>
+        <w:gridCol w:w="1016"/>
+        <w:gridCol w:w="1016"/>
+        <w:gridCol w:w="1016"/>
+        <w:gridCol w:w="1029"/>
+      </w:tblGrid>
+      <w:tr>
+        <w:trPr>
+          <w:trHeight w:val="440" w:hRule="exact"/>
+          <w:cantSplit w:val="true"/>
+        </w:trPr>
+        <w:tc>
+          <w:tcPr>
+            <w:tcW w:w="1017" w:type="dxa"/>
+            <w:tcBorders>
+              <w:top w:val="single" w:sz="4" w:space="0" w:color="000000"/>
+              <w:left w:val="single" w:sz="4" w:space="0" w:color="000000"/>
+              <w:bottom w:val="single" w:sz="4" w:space="0" w:color="000000"/>
+            </w:tcBorders>
+            <w:vAlign w:val="bottom"/>
+          </w:tcPr>
+          <w:p>
+            <w:pPr>
+              <w:pStyle w:val="Normal"/>
+              <w:widowControl w:val="false"/>
+              <w:spacing w:lineRule="auto" w:line="180" w:before="0" w:after="60"/>
+              <w:jc w:val="center"/>
+              <w:rPr>
+                <w:b/>
+                <w:bCs/>
+              </w:rPr>
+            </w:pPr>
+            <w:r>
+              <w:rPr>
+                <w:b/>
+                <w:bCs/>
+                <w:color w:val="000000"/>
+                <w:sz w:val="16"/>
+                <w:szCs w:val="16"/>
+              </w:rPr>
+              <w:t>HUD</w:t>
+            </w:r>
+          </w:p>
+        </w:tc>
+        <w:tc>
+          <w:tcPr>
+            <w:tcW w:w="1019" w:type="dxa"/>
+            <w:tcBorders>
+              <w:top w:val="single" w:sz="4" w:space="0" w:color="000000"/>
+              <w:left w:val="single" w:sz="4" w:space="0" w:color="000000"/>
+              <w:bottom w:val="single" w:sz="4" w:space="0" w:color="000000"/>
+            </w:tcBorders>
+            <w:vAlign w:val="bottom"/>
+          </w:tcPr>
+          <w:p>
+            <w:pPr>
+              <w:pStyle w:val="Normal"/>
+              <w:widowControl w:val="false"/>
+              <w:spacing w:lineRule="auto" w:line="180"/>
+              <w:jc w:val="center"/>
+              <w:rPr>
+                <w:color w:val="000000"/>
+                <w:sz w:val="16"/>
+                <w:szCs w:val="16"/>
+              </w:rPr>
+            </w:pPr>
+            <w:r>
+              <w:rPr>
+                <w:color w:val="000000"/>
+                <w:sz w:val="16"/>
+                <w:szCs w:val="16"/>
+              </w:rPr>
+              <w:t>Schedule</w:t>
+            </w:r>
+          </w:p>
+        </w:tc>
+        <w:tc>
+          <w:tcPr>
+            <w:tcW w:w="1014" w:type="dxa"/>
+            <w:tcBorders>
+              <w:top w:val="single" w:sz="4" w:space="0" w:color="000000"/>
+              <w:left w:val="single" w:sz="4" w:space="0" w:color="000000"/>
+              <w:bottom w:val="single" w:sz="4" w:space="0" w:color="000000"/>
+            </w:tcBorders>
+            <w:vAlign w:val="bottom"/>
+          </w:tcPr>
+          <w:p>
+            <w:pPr>
+              <w:pStyle w:val="Normal"/>
+              <w:widowControl w:val="false"/>
+              <w:spacing w:lineRule="auto" w:line="180"/>
+              <w:jc w:val="center"/>
+              <w:rPr>
+                <w:color w:val="000000"/>
+                <w:sz w:val="16"/>
+                <w:szCs w:val="16"/>
+              </w:rPr>
+            </w:pPr>
+            <w:r>
+              <w:rPr>
+                <w:color w:val="000000"/>
+                <w:sz w:val="16"/>
+                <w:szCs w:val="16"/>
+              </w:rPr>
+              <w:t>Master Off</w:t>
+            </w:r>
+          </w:p>
+        </w:tc>
+        <w:tc>
+          <w:tcPr>
+            <w:tcW w:w="1016" w:type="dxa"/>
+            <w:tcBorders>
+              <w:top w:val="single" w:sz="4" w:space="0" w:color="000000"/>
+              <w:left w:val="single" w:sz="4" w:space="0" w:color="000000"/>
+              <w:bottom w:val="single" w:sz="4" w:space="0" w:color="000000"/>
+            </w:tcBorders>
+            <w:vAlign w:val="bottom"/>
+          </w:tcPr>
+          <w:p>
+            <w:pPr>
+              <w:pStyle w:val="Normal"/>
+              <w:widowControl w:val="false"/>
+              <w:spacing w:lineRule="auto" w:line="180"/>
+              <w:jc w:val="center"/>
+              <w:rPr>
+                <w:color w:val="000000"/>
+                <w:sz w:val="16"/>
+                <w:szCs w:val="16"/>
+              </w:rPr>
+            </w:pPr>
+            <w:r>
+              <w:rPr>
+                <w:color w:val="000000"/>
+                <w:sz w:val="16"/>
+                <w:szCs w:val="16"/>
+              </w:rPr>
+            </w:r>
+          </w:p>
+        </w:tc>
+        <w:tc>
+          <w:tcPr>
+            <w:tcW w:w="1020" w:type="dxa"/>
+            <w:tcBorders>
+              <w:top w:val="single" w:sz="4" w:space="0" w:color="000000"/>
+              <w:left w:val="single" w:sz="4" w:space="0" w:color="000000"/>
+              <w:bottom w:val="single" w:sz="4" w:space="0" w:color="000000"/>
+            </w:tcBorders>
+            <w:vAlign w:val="bottom"/>
+          </w:tcPr>
+          <w:p>
+            <w:pPr>
+              <w:pStyle w:val="Normal"/>
+              <w:widowControl w:val="false"/>
+              <w:spacing w:lineRule="auto" w:line="180"/>
+              <w:jc w:val="center"/>
+              <w:rPr>
+                <w:color w:val="000000"/>
+                <w:sz w:val="16"/>
+                <w:szCs w:val="16"/>
+              </w:rPr>
+            </w:pPr>
+            <w:r>
+              <w:rPr>
+                <w:color w:val="000000"/>
+                <w:sz w:val="16"/>
+                <w:szCs w:val="16"/>
+              </w:rPr>
+              <w:br/>
+              <w:t>Trip Power</w:t>
+            </w:r>
+          </w:p>
+        </w:tc>
+        <w:tc>
+          <w:tcPr>
+            <w:tcW w:w="1016" w:type="dxa"/>
+            <w:tcBorders>
+              <w:top w:val="single" w:sz="4" w:space="0" w:color="000000"/>
+              <w:left w:val="single" w:sz="4" w:space="0" w:color="000000"/>
+              <w:bottom w:val="single" w:sz="4" w:space="0" w:color="000000"/>
+            </w:tcBorders>
+            <w:vAlign w:val="bottom"/>
+          </w:tcPr>
+          <w:p>
+            <w:pPr>
+              <w:pStyle w:val="Normal"/>
+              <w:widowControl w:val="false"/>
+              <w:spacing w:lineRule="auto" w:line="180"/>
+              <w:jc w:val="center"/>
+              <w:rPr>
+                <w:color w:val="000000"/>
+                <w:sz w:val="16"/>
+                <w:szCs w:val="16"/>
+              </w:rPr>
+            </w:pPr>
+            <w:r>
+              <w:rPr>
+                <w:color w:val="000000"/>
+                <w:sz w:val="16"/>
+                <w:szCs w:val="16"/>
+              </w:rPr>
+              <w:t>Pass. Light Off</w:t>
+            </w:r>
+          </w:p>
+        </w:tc>
+        <w:tc>
+          <w:tcPr>
+            <w:tcW w:w="1016" w:type="dxa"/>
+            <w:tcBorders>
+              <w:top w:val="single" w:sz="4" w:space="0" w:color="000000"/>
+              <w:left w:val="single" w:sz="4" w:space="0" w:color="000000"/>
+              <w:bottom w:val="single" w:sz="4" w:space="0" w:color="000000"/>
+            </w:tcBorders>
+            <w:vAlign w:val="bottom"/>
+          </w:tcPr>
+          <w:p>
+            <w:pPr>
+              <w:pStyle w:val="Normal"/>
+              <w:widowControl w:val="false"/>
+              <w:jc w:val="center"/>
+              <w:rPr>
+                <w:sz w:val="16"/>
+                <w:szCs w:val="16"/>
+              </w:rPr>
+            </w:pPr>
+            <w:r>
+              <w:rPr>
+                <w:sz w:val="16"/>
+                <w:szCs w:val="16"/>
+              </w:rPr>
+            </w:r>
+          </w:p>
+        </w:tc>
+        <w:tc>
+          <w:tcPr>
+            <w:tcW w:w="1017" w:type="dxa"/>
+            <w:tcBorders>
+              <w:top w:val="single" w:sz="4" w:space="0" w:color="000000"/>
+              <w:left w:val="single" w:sz="4" w:space="0" w:color="000000"/>
+              <w:bottom w:val="single" w:sz="4" w:space="0" w:color="000000"/>
+            </w:tcBorders>
+            <w:vAlign w:val="bottom"/>
+          </w:tcPr>
+          <w:p>
+            <w:pPr>
+              <w:pStyle w:val="Normal"/>
+              <w:widowControl w:val="false"/>
+              <w:jc w:val="center"/>
+              <w:rPr>
+                <w:sz w:val="16"/>
+                <w:szCs w:val="16"/>
+              </w:rPr>
+            </w:pPr>
+            <w:r>
+              <w:rPr>
+                <w:sz w:val="16"/>
+                <w:szCs w:val="16"/>
+              </w:rPr>
+            </w:r>
+          </w:p>
+        </w:tc>
+        <w:tc>
+          <w:tcPr>
+            <w:tcW w:w="1016" w:type="dxa"/>
+            <w:tcBorders>
+              <w:top w:val="single" w:sz="4" w:space="0" w:color="000000"/>
+              <w:left w:val="single" w:sz="4" w:space="0" w:color="000000"/>
+              <w:bottom w:val="single" w:sz="4" w:space="0" w:color="000000"/>
+            </w:tcBorders>
+            <w:vAlign w:val="bottom"/>
+          </w:tcPr>
+          <w:p>
+            <w:pPr>
+              <w:pStyle w:val="Normal"/>
+              <w:widowControl w:val="false"/>
+              <w:jc w:val="center"/>
+              <w:rPr>
+                <w:color w:val="000000"/>
+                <w:sz w:val="16"/>
+                <w:szCs w:val="16"/>
+              </w:rPr>
+            </w:pPr>
+            <w:r>
+              <w:rPr>
+                <w:rFonts w:eastAsia="arial" w:ascii="arial" w:hAnsi="arial"/>
+                <w:color w:val="000000"/>
+                <w:sz w:val="16"/>
+                <w:szCs w:val="16"/>
+              </w:rPr>
+              <w:t>Inst. Light Off</w:t>
+            </w:r>
+          </w:p>
+        </w:tc>
+        <w:tc>
+          <w:tcPr>
+            <w:tcW w:w="1020" w:type="dxa"/>
+            <w:tcBorders>
+              <w:top w:val="single" w:sz="4" w:space="0" w:color="000000"/>
+              <w:left w:val="single" w:sz="4" w:space="0" w:color="000000"/>
+              <w:bottom w:val="single" w:sz="4" w:space="0" w:color="000000"/>
+            </w:tcBorders>
+            <w:vAlign w:val="bottom"/>
+          </w:tcPr>
+          <w:p>
+            <w:pPr>
+              <w:pStyle w:val="Normal"/>
+              <w:widowControl w:val="false"/>
+              <w:spacing w:lineRule="auto" w:line="180"/>
+              <w:jc w:val="center"/>
+              <w:rPr>
+                <w:sz w:val="16"/>
+                <w:szCs w:val="16"/>
+              </w:rPr>
+            </w:pPr>
+            <w:r>
+              <w:rPr>
+                <w:rFonts w:eastAsia="arial" w:ascii="arial" w:hAnsi="arial"/>
+                <w:color w:val="000000"/>
+                <w:sz w:val="16"/>
+                <w:szCs w:val="16"/>
+              </w:rPr>
+              <w:t>Cab Light Off</w:t>
+            </w:r>
+          </w:p>
+        </w:tc>
+        <w:tc>
+          <w:tcPr>
+            <w:tcW w:w="1016" w:type="dxa"/>
+            <w:tcBorders>
+              <w:top w:val="single" w:sz="4" w:space="0" w:color="000000"/>
+              <w:left w:val="single" w:sz="4" w:space="0" w:color="000000"/>
+              <w:bottom w:val="single" w:sz="4" w:space="0" w:color="000000"/>
+            </w:tcBorders>
+            <w:vAlign w:val="bottom"/>
+          </w:tcPr>
+          <w:p>
+            <w:pPr>
+              <w:pStyle w:val="Normal"/>
+              <w:widowControl w:val="false"/>
+              <w:spacing w:lineRule="auto" w:line="180"/>
+              <w:jc w:val="center"/>
+              <w:rPr>
+                <w:sz w:val="16"/>
+                <w:szCs w:val="16"/>
+              </w:rPr>
+            </w:pPr>
+            <w:r>
+              <w:rPr>
+                <w:rFonts w:eastAsia="arial" w:ascii="arial" w:hAnsi="arial"/>
+                <w:color w:val="000000"/>
+                <w:sz w:val="16"/>
+                <w:szCs w:val="16"/>
+              </w:rPr>
+              <w:t>Uncouple</w:t>
+            </w:r>
+          </w:p>
+        </w:tc>
+        <w:tc>
+          <w:tcPr>
+            <w:tcW w:w="1016" w:type="dxa"/>
+            <w:tcBorders>
+              <w:top w:val="single" w:sz="4" w:space="0" w:color="000000"/>
+              <w:left w:val="single" w:sz="4" w:space="0" w:color="000000"/>
+              <w:bottom w:val="single" w:sz="4" w:space="0" w:color="000000"/>
+            </w:tcBorders>
+            <w:vAlign w:val="bottom"/>
+          </w:tcPr>
+          <w:p>
+            <w:pPr>
+              <w:pStyle w:val="Normal"/>
+              <w:widowControl w:val="false"/>
+              <w:jc w:val="center"/>
+              <w:rPr>
+                <w:color w:val="000000"/>
+                <w:sz w:val="16"/>
+                <w:szCs w:val="16"/>
+              </w:rPr>
+            </w:pPr>
+            <w:r>
+              <w:rPr>
+                <w:color w:val="000000"/>
+                <w:sz w:val="16"/>
+                <w:szCs w:val="16"/>
+              </w:rPr>
+              <w:t>Handbrake Off</w:t>
+            </w:r>
+          </w:p>
+        </w:tc>
+        <w:tc>
+          <w:tcPr>
+            <w:tcW w:w="1016" w:type="dxa"/>
+            <w:tcBorders>
+              <w:top w:val="single" w:sz="4" w:space="0" w:color="000000"/>
+              <w:left w:val="single" w:sz="4" w:space="0" w:color="000000"/>
+              <w:bottom w:val="single" w:sz="4" w:space="0" w:color="000000"/>
+            </w:tcBorders>
+            <w:vAlign w:val="bottom"/>
+          </w:tcPr>
+          <w:p>
+            <w:pPr>
+              <w:pStyle w:val="Normal"/>
+              <w:widowControl w:val="false"/>
+              <w:spacing w:lineRule="auto" w:line="180"/>
+              <w:jc w:val="center"/>
+              <w:rPr>
+                <w:sz w:val="16"/>
+                <w:szCs w:val="16"/>
+              </w:rPr>
+            </w:pPr>
+            <w:r>
+              <w:rPr>
+                <w:rFonts w:eastAsia="arial" w:ascii="arial" w:hAnsi="arial"/>
+                <w:color w:val="000000"/>
+                <w:sz w:val="16"/>
+                <w:szCs w:val="16"/>
+              </w:rPr>
+              <w:t>Exterior</w:t>
+            </w:r>
+          </w:p>
+          <w:p>
+            <w:pPr>
+              <w:pStyle w:val="Normal"/>
+              <w:widowControl w:val="false"/>
+              <w:spacing w:lineRule="auto" w:line="180"/>
+              <w:jc w:val="center"/>
+              <w:rPr>
+                <w:sz w:val="16"/>
+                <w:szCs w:val="16"/>
+              </w:rPr>
+            </w:pPr>
+            <w:r>
+              <w:rPr>
+                <w:rFonts w:eastAsia="arial" w:ascii="arial" w:hAnsi="arial"/>
+                <w:color w:val="000000"/>
+                <w:sz w:val="16"/>
+                <w:szCs w:val="16"/>
+              </w:rPr>
+              <w:t>Camera</w:t>
+            </w:r>
+          </w:p>
+        </w:tc>
+        <w:tc>
+          <w:tcPr>
+            <w:tcW w:w="1029" w:type="dxa"/>
+            <w:tcBorders>
+              <w:top w:val="single" w:sz="4" w:space="0" w:color="000000"/>
+              <w:left w:val="single" w:sz="4" w:space="0" w:color="000000"/>
+              <w:bottom w:val="single" w:sz="4" w:space="0" w:color="000000"/>
+              <w:right w:val="single" w:sz="4" w:space="0" w:color="000000"/>
+            </w:tcBorders>
+            <w:vAlign w:val="bottom"/>
+          </w:tcPr>
+          <w:p>
+            <w:pPr>
+              <w:pStyle w:val="Normal"/>
+              <w:widowControl w:val="false"/>
+              <w:spacing w:lineRule="auto" w:line="180"/>
+              <w:jc w:val="center"/>
+              <w:rPr>
+                <w:sz w:val="16"/>
+                <w:szCs w:val="16"/>
+              </w:rPr>
+            </w:pPr>
+            <w:r>
+              <w:rPr>
+                <w:rFonts w:eastAsia="arial" w:ascii="arial" w:hAnsi="arial"/>
+                <w:color w:val="000000"/>
+                <w:sz w:val="16"/>
+                <w:szCs w:val="16"/>
+              </w:rPr>
+              <w:t>Prev</w:t>
+            </w:r>
+          </w:p>
+          <w:p>
+            <w:pPr>
+              <w:pStyle w:val="Normal"/>
+              <w:widowControl w:val="false"/>
+              <w:spacing w:lineRule="auto" w:line="180"/>
+              <w:jc w:val="center"/>
+              <w:rPr>
+                <w:sz w:val="16"/>
+                <w:szCs w:val="16"/>
+              </w:rPr>
+            </w:pPr>
+            <w:r>
+              <w:rPr>
+                <w:rFonts w:eastAsia="arial" w:ascii="arial" w:hAnsi="arial"/>
+                <w:color w:val="000000"/>
+                <w:sz w:val="16"/>
+                <w:szCs w:val="16"/>
+              </w:rPr>
+              <w:t>Cab Cam</w:t>
+            </w:r>
+          </w:p>
+        </w:tc>
+      </w:tr>
+    </w:tbl>
+    <w:p>
+      <w:pPr>
+        <w:pStyle w:val="Normal"/>
+        <w:rPr>
+          <w:color w:val="000000"/>
+          <w:sz w:val="16"/>
+          <w:szCs w:val="16"/>
+        </w:rPr>
+      </w:pPr>
+      <w:r>
+        <w:rPr>
+          <w:rFonts w:eastAsia="arial" w:ascii="arial" w:hAnsi="arial"/>
+          <w:color w:val="000000"/>
+          <w:sz w:val="16"/>
+          <w:szCs w:val="16"/>
+        </w:rPr>
+        <w:tab/>
+        <w:t xml:space="preserve">           Class 48</w:t>
       </w:r>
       <w:r>
         <w:rPr>
@@ -41628,7 +42139,560 @@
           <w:sz w:val="16"/>
           <w:szCs w:val="16"/>
         </w:rPr>
-        <w:t>83</w:t>
+        <w:t>4</w:t>
+      </w:r>
+      <w:r>
+        <w:rPr>
+          <w:rFonts w:eastAsia="arial" w:ascii="arial" w:hAnsi="arial"/>
+          <w:color w:val="000000"/>
+          <w:sz w:val="16"/>
+          <w:szCs w:val="16"/>
+        </w:rPr>
+        <w:t>-1</w:t>
+      </w:r>
+    </w:p>
+    <w:tbl>
+      <w:tblPr>
+        <w:tblW w:w="14248" w:type="dxa"/>
+        <w:jc w:val="left"/>
+        <w:tblInd w:w="-5" w:type="dxa"/>
+        <w:tblLayout w:type="fixed"/>
+        <w:tblCellMar>
+          <w:top w:w="0" w:type="dxa"/>
+          <w:left w:w="108" w:type="dxa"/>
+          <w:bottom w:w="0" w:type="dxa"/>
+          <w:right w:w="108" w:type="dxa"/>
+        </w:tblCellMar>
+        <w:tblLook w:firstRow="1" w:noVBand="1" w:lastRow="0" w:firstColumn="1" w:lastColumn="0" w:noHBand="0" w:val="04a0"/>
+      </w:tblPr>
+      <w:tblGrid>
+        <w:gridCol w:w="1017"/>
+        <w:gridCol w:w="1019"/>
+        <w:gridCol w:w="1014"/>
+        <w:gridCol w:w="1016"/>
+        <w:gridCol w:w="1020"/>
+        <w:gridCol w:w="1016"/>
+        <w:gridCol w:w="1016"/>
+        <w:gridCol w:w="1017"/>
+        <w:gridCol w:w="1016"/>
+        <w:gridCol w:w="1020"/>
+        <w:gridCol w:w="1016"/>
+        <w:gridCol w:w="1016"/>
+        <w:gridCol w:w="1016"/>
+        <w:gridCol w:w="1029"/>
+      </w:tblGrid>
+      <w:tr>
+        <w:trPr>
+          <w:trHeight w:val="440" w:hRule="exact"/>
+          <w:cantSplit w:val="true"/>
+        </w:trPr>
+        <w:tc>
+          <w:tcPr>
+            <w:tcW w:w="1017" w:type="dxa"/>
+            <w:tcBorders>
+              <w:top w:val="single" w:sz="4" w:space="0" w:color="000000"/>
+              <w:left w:val="single" w:sz="4" w:space="0" w:color="000000"/>
+              <w:bottom w:val="single" w:sz="4" w:space="0" w:color="000000"/>
+            </w:tcBorders>
+            <w:vAlign w:val="bottom"/>
+          </w:tcPr>
+          <w:p>
+            <w:pPr>
+              <w:pStyle w:val="Normal"/>
+              <w:widowControl w:val="false"/>
+              <w:spacing w:lineRule="auto" w:line="180" w:before="0" w:after="60"/>
+              <w:jc w:val="center"/>
+              <w:rPr>
+                <w:color w:val="000000"/>
+                <w:sz w:val="16"/>
+                <w:szCs w:val="16"/>
+              </w:rPr>
+            </w:pPr>
+            <w:r>
+              <w:rPr>
+                <w:rFonts w:eastAsia="arial" w:ascii="arial" w:hAnsi="arial"/>
+                <w:b/>
+                <w:color w:val="000000"/>
+                <w:sz w:val="16"/>
+                <w:szCs w:val="16"/>
+              </w:rPr>
+              <w:t>Pause</w:t>
+            </w:r>
+          </w:p>
+        </w:tc>
+        <w:tc>
+          <w:tcPr>
+            <w:tcW w:w="1019" w:type="dxa"/>
+            <w:tcBorders>
+              <w:top w:val="single" w:sz="4" w:space="0" w:color="000000"/>
+              <w:left w:val="single" w:sz="4" w:space="0" w:color="000000"/>
+              <w:bottom w:val="single" w:sz="4" w:space="0" w:color="000000"/>
+            </w:tcBorders>
+            <w:vAlign w:val="bottom"/>
+          </w:tcPr>
+          <w:p>
+            <w:pPr>
+              <w:pStyle w:val="Normal"/>
+              <w:widowControl w:val="false"/>
+              <w:spacing w:lineRule="auto" w:line="180"/>
+              <w:jc w:val="center"/>
+              <w:rPr>
+                <w:color w:val="000000"/>
+                <w:sz w:val="16"/>
+                <w:szCs w:val="16"/>
+              </w:rPr>
+            </w:pPr>
+            <w:r>
+              <w:rPr>
+                <w:color w:val="000000"/>
+                <w:sz w:val="16"/>
+                <w:szCs w:val="16"/>
+              </w:rPr>
+              <w:t>Master Key</w:t>
+            </w:r>
+          </w:p>
+        </w:tc>
+        <w:tc>
+          <w:tcPr>
+            <w:tcW w:w="1014" w:type="dxa"/>
+            <w:tcBorders>
+              <w:top w:val="single" w:sz="4" w:space="0" w:color="000000"/>
+              <w:left w:val="single" w:sz="4" w:space="0" w:color="000000"/>
+              <w:bottom w:val="single" w:sz="4" w:space="0" w:color="000000"/>
+            </w:tcBorders>
+            <w:vAlign w:val="bottom"/>
+          </w:tcPr>
+          <w:p>
+            <w:pPr>
+              <w:pStyle w:val="Normal"/>
+              <w:widowControl w:val="false"/>
+              <w:spacing w:lineRule="auto" w:line="180"/>
+              <w:jc w:val="center"/>
+              <w:rPr>
+                <w:color w:val="000000"/>
+                <w:sz w:val="16"/>
+                <w:szCs w:val="16"/>
+              </w:rPr>
+            </w:pPr>
+            <w:r>
+              <w:rPr>
+                <w:color w:val="000000"/>
+                <w:sz w:val="16"/>
+                <w:szCs w:val="16"/>
+              </w:rPr>
+              <w:t>Aux On</w:t>
+            </w:r>
+          </w:p>
+        </w:tc>
+        <w:tc>
+          <w:tcPr>
+            <w:tcW w:w="1016" w:type="dxa"/>
+            <w:tcBorders>
+              <w:top w:val="single" w:sz="4" w:space="0" w:color="000000"/>
+              <w:left w:val="single" w:sz="4" w:space="0" w:color="000000"/>
+              <w:bottom w:val="single" w:sz="4" w:space="0" w:color="000000"/>
+            </w:tcBorders>
+            <w:vAlign w:val="bottom"/>
+          </w:tcPr>
+          <w:p>
+            <w:pPr>
+              <w:pStyle w:val="Normal"/>
+              <w:widowControl w:val="false"/>
+              <w:spacing w:lineRule="auto" w:line="180"/>
+              <w:jc w:val="center"/>
+              <w:rPr>
+                <w:color w:val="000000"/>
+                <w:sz w:val="16"/>
+                <w:szCs w:val="16"/>
+              </w:rPr>
+            </w:pPr>
+            <w:r>
+              <w:rPr>
+                <w:color w:val="000000"/>
+                <w:sz w:val="16"/>
+                <w:szCs w:val="16"/>
+              </w:rPr>
+              <w:t>AWS/TPWS</w:t>
+            </w:r>
+          </w:p>
+        </w:tc>
+        <w:tc>
+          <w:tcPr>
+            <w:tcW w:w="1020" w:type="dxa"/>
+            <w:tcBorders>
+              <w:top w:val="single" w:sz="4" w:space="0" w:color="000000"/>
+              <w:left w:val="single" w:sz="4" w:space="0" w:color="000000"/>
+              <w:bottom w:val="single" w:sz="4" w:space="0" w:color="000000"/>
+            </w:tcBorders>
+            <w:vAlign w:val="bottom"/>
+          </w:tcPr>
+          <w:p>
+            <w:pPr>
+              <w:pStyle w:val="Normal"/>
+              <w:widowControl w:val="false"/>
+              <w:spacing w:lineRule="auto" w:line="180"/>
+              <w:jc w:val="center"/>
+              <w:rPr>
+                <w:color w:val="000000"/>
+                <w:sz w:val="16"/>
+                <w:szCs w:val="16"/>
+              </w:rPr>
+            </w:pPr>
+            <w:r>
+              <w:rPr>
+                <w:color w:val="000000"/>
+                <w:sz w:val="16"/>
+                <w:szCs w:val="16"/>
+              </w:rPr>
+              <w:t>DRA</w:t>
+            </w:r>
+          </w:p>
+        </w:tc>
+        <w:tc>
+          <w:tcPr>
+            <w:tcW w:w="1016" w:type="dxa"/>
+            <w:tcBorders>
+              <w:top w:val="single" w:sz="4" w:space="0" w:color="000000"/>
+              <w:left w:val="single" w:sz="4" w:space="0" w:color="000000"/>
+              <w:bottom w:val="single" w:sz="4" w:space="0" w:color="000000"/>
+            </w:tcBorders>
+            <w:vAlign w:val="bottom"/>
+          </w:tcPr>
+          <w:p>
+            <w:pPr>
+              <w:pStyle w:val="Normal"/>
+              <w:widowControl w:val="false"/>
+              <w:spacing w:lineRule="auto" w:line="180"/>
+              <w:jc w:val="center"/>
+              <w:rPr>
+                <w:color w:val="000000"/>
+                <w:sz w:val="16"/>
+                <w:szCs w:val="16"/>
+              </w:rPr>
+            </w:pPr>
+            <w:r>
+              <w:rPr>
+                <w:color w:val="000000"/>
+                <w:sz w:val="16"/>
+                <w:szCs w:val="16"/>
+              </w:rPr>
+              <w:t>Saloon Light On</w:t>
+            </w:r>
+          </w:p>
+        </w:tc>
+        <w:tc>
+          <w:tcPr>
+            <w:tcW w:w="1016" w:type="dxa"/>
+            <w:tcBorders>
+              <w:top w:val="single" w:sz="4" w:space="0" w:color="000000"/>
+              <w:left w:val="single" w:sz="4" w:space="0" w:color="000000"/>
+              <w:bottom w:val="single" w:sz="4" w:space="0" w:color="000000"/>
+            </w:tcBorders>
+            <w:vAlign w:val="bottom"/>
+          </w:tcPr>
+          <w:p>
+            <w:pPr>
+              <w:pStyle w:val="Normal"/>
+              <w:widowControl w:val="false"/>
+              <w:jc w:val="center"/>
+              <w:rPr>
+                <w:sz w:val="16"/>
+                <w:szCs w:val="16"/>
+              </w:rPr>
+            </w:pPr>
+            <w:r>
+              <w:rPr>
+                <w:sz w:val="16"/>
+                <w:szCs w:val="16"/>
+              </w:rPr>
+              <w:t>Reduced Power</w:t>
+            </w:r>
+          </w:p>
+        </w:tc>
+        <w:tc>
+          <w:tcPr>
+            <w:tcW w:w="1017" w:type="dxa"/>
+            <w:tcBorders>
+              <w:top w:val="single" w:sz="4" w:space="0" w:color="000000"/>
+              <w:left w:val="single" w:sz="4" w:space="0" w:color="000000"/>
+              <w:bottom w:val="single" w:sz="4" w:space="0" w:color="000000"/>
+            </w:tcBorders>
+            <w:vAlign w:val="bottom"/>
+          </w:tcPr>
+          <w:p>
+            <w:pPr>
+              <w:pStyle w:val="Normal"/>
+              <w:widowControl w:val="false"/>
+              <w:jc w:val="center"/>
+              <w:rPr>
+                <w:sz w:val="16"/>
+                <w:szCs w:val="16"/>
+              </w:rPr>
+            </w:pPr>
+            <w:r>
+              <w:rPr>
+                <w:sz w:val="16"/>
+                <w:szCs w:val="16"/>
+              </w:rPr>
+            </w:r>
+          </w:p>
+        </w:tc>
+        <w:tc>
+          <w:tcPr>
+            <w:tcW w:w="1016" w:type="dxa"/>
+            <w:tcBorders>
+              <w:top w:val="single" w:sz="4" w:space="0" w:color="000000"/>
+              <w:left w:val="single" w:sz="4" w:space="0" w:color="000000"/>
+              <w:bottom w:val="single" w:sz="4" w:space="0" w:color="000000"/>
+            </w:tcBorders>
+            <w:vAlign w:val="bottom"/>
+          </w:tcPr>
+          <w:p>
+            <w:pPr>
+              <w:pStyle w:val="Normal"/>
+              <w:widowControl w:val="false"/>
+              <w:jc w:val="center"/>
+              <w:rPr>
+                <w:color w:val="000000"/>
+                <w:sz w:val="16"/>
+                <w:szCs w:val="16"/>
+              </w:rPr>
+            </w:pPr>
+            <w:r>
+              <w:rPr/>
+            </w:r>
+          </w:p>
+        </w:tc>
+        <w:tc>
+          <w:tcPr>
+            <w:tcW w:w="1020" w:type="dxa"/>
+            <w:tcBorders>
+              <w:top w:val="single" w:sz="4" w:space="0" w:color="000000"/>
+              <w:left w:val="single" w:sz="4" w:space="0" w:color="000000"/>
+              <w:bottom w:val="single" w:sz="4" w:space="0" w:color="000000"/>
+            </w:tcBorders>
+            <w:vAlign w:val="bottom"/>
+          </w:tcPr>
+          <w:p>
+            <w:pPr>
+              <w:pStyle w:val="Normal"/>
+              <w:widowControl w:val="false"/>
+              <w:spacing w:lineRule="auto" w:line="180"/>
+              <w:jc w:val="center"/>
+              <w:rPr>
+                <w:sz w:val="16"/>
+                <w:szCs w:val="16"/>
+              </w:rPr>
+            </w:pPr>
+            <w:r>
+              <w:rPr>
+                <w:rFonts w:eastAsia="arial" w:ascii="arial" w:hAnsi="arial"/>
+                <w:color w:val="000000"/>
+                <w:sz w:val="16"/>
+                <w:szCs w:val="16"/>
+              </w:rPr>
+              <w:t>Inst. Light Up</w:t>
+            </w:r>
+          </w:p>
+        </w:tc>
+        <w:tc>
+          <w:tcPr>
+            <w:tcW w:w="1016" w:type="dxa"/>
+            <w:tcBorders>
+              <w:top w:val="single" w:sz="4" w:space="0" w:color="000000"/>
+              <w:left w:val="single" w:sz="4" w:space="0" w:color="000000"/>
+              <w:bottom w:val="single" w:sz="4" w:space="0" w:color="000000"/>
+            </w:tcBorders>
+            <w:vAlign w:val="bottom"/>
+          </w:tcPr>
+          <w:p>
+            <w:pPr>
+              <w:pStyle w:val="Normal"/>
+              <w:widowControl w:val="false"/>
+              <w:spacing w:lineRule="auto" w:line="180"/>
+              <w:jc w:val="center"/>
+              <w:rPr>
+                <w:sz w:val="16"/>
+                <w:szCs w:val="16"/>
+              </w:rPr>
+            </w:pPr>
+            <w:r>
+              <w:rPr>
+                <w:rFonts w:eastAsia="arial" w:ascii="arial" w:hAnsi="arial"/>
+                <w:color w:val="000000"/>
+                <w:sz w:val="16"/>
+                <w:szCs w:val="16"/>
+              </w:rPr>
+              <w:t>Cab Light</w:t>
+            </w:r>
+          </w:p>
+        </w:tc>
+        <w:tc>
+          <w:tcPr>
+            <w:tcW w:w="1016" w:type="dxa"/>
+            <w:tcBorders>
+              <w:top w:val="single" w:sz="4" w:space="0" w:color="000000"/>
+              <w:left w:val="single" w:sz="4" w:space="0" w:color="000000"/>
+              <w:bottom w:val="single" w:sz="4" w:space="0" w:color="000000"/>
+            </w:tcBorders>
+            <w:vAlign w:val="bottom"/>
+          </w:tcPr>
+          <w:p>
+            <w:pPr>
+              <w:pStyle w:val="Normal"/>
+              <w:widowControl w:val="false"/>
+              <w:jc w:val="center"/>
+              <w:rPr>
+                <w:color w:val="000000"/>
+                <w:sz w:val="16"/>
+                <w:szCs w:val="16"/>
+              </w:rPr>
+            </w:pPr>
+            <w:r>
+              <w:rPr>
+                <w:rFonts w:eastAsia="arial" w:ascii="arial" w:hAnsi="arial"/>
+                <w:color w:val="000000"/>
+                <w:sz w:val="16"/>
+                <w:szCs w:val="16"/>
+              </w:rPr>
+              <w:t>Couple</w:t>
+            </w:r>
+          </w:p>
+        </w:tc>
+        <w:tc>
+          <w:tcPr>
+            <w:tcW w:w="1016" w:type="dxa"/>
+            <w:tcBorders>
+              <w:top w:val="single" w:sz="4" w:space="0" w:color="000000"/>
+              <w:left w:val="single" w:sz="4" w:space="0" w:color="000000"/>
+              <w:bottom w:val="single" w:sz="4" w:space="0" w:color="000000"/>
+            </w:tcBorders>
+            <w:vAlign w:val="bottom"/>
+          </w:tcPr>
+          <w:p>
+            <w:pPr>
+              <w:pStyle w:val="Normal"/>
+              <w:widowControl w:val="false"/>
+              <w:spacing w:lineRule="auto" w:line="180"/>
+              <w:jc w:val="center"/>
+              <w:rPr>
+                <w:sz w:val="16"/>
+                <w:szCs w:val="16"/>
+              </w:rPr>
+            </w:pPr>
+            <w:r>
+              <w:rPr>
+                <w:rFonts w:eastAsia="arial" w:ascii="arial" w:hAnsi="arial"/>
+                <w:color w:val="000000"/>
+                <w:sz w:val="16"/>
+                <w:szCs w:val="16"/>
+              </w:rPr>
+              <w:t>1-Person</w:t>
+            </w:r>
+          </w:p>
+        </w:tc>
+        <w:tc>
+          <w:tcPr>
+            <w:tcW w:w="1029" w:type="dxa"/>
+            <w:tcBorders>
+              <w:top w:val="single" w:sz="4" w:space="0" w:color="000000"/>
+              <w:left w:val="single" w:sz="4" w:space="0" w:color="000000"/>
+              <w:bottom w:val="single" w:sz="4" w:space="0" w:color="000000"/>
+              <w:right w:val="single" w:sz="4" w:space="0" w:color="000000"/>
+            </w:tcBorders>
+            <w:vAlign w:val="bottom"/>
+          </w:tcPr>
+          <w:p>
+            <w:pPr>
+              <w:pStyle w:val="Normal"/>
+              <w:widowControl w:val="false"/>
+              <w:spacing w:lineRule="auto" w:line="180"/>
+              <w:jc w:val="center"/>
+              <w:rPr>
+                <w:sz w:val="16"/>
+                <w:szCs w:val="16"/>
+              </w:rPr>
+            </w:pPr>
+            <w:r>
+              <w:rPr>
+                <w:rFonts w:eastAsia="arial" w:ascii="arial" w:hAnsi="arial"/>
+                <w:color w:val="000000"/>
+                <w:sz w:val="16"/>
+                <w:szCs w:val="16"/>
+              </w:rPr>
+              <w:t>Next</w:t>
+            </w:r>
+          </w:p>
+          <w:p>
+            <w:pPr>
+              <w:pStyle w:val="Normal"/>
+              <w:widowControl w:val="false"/>
+              <w:spacing w:lineRule="auto" w:line="180"/>
+              <w:jc w:val="center"/>
+              <w:rPr>
+                <w:sz w:val="16"/>
+                <w:szCs w:val="16"/>
+              </w:rPr>
+            </w:pPr>
+            <w:r>
+              <w:rPr>
+                <w:rFonts w:eastAsia="arial" w:ascii="arial" w:hAnsi="arial"/>
+                <w:color w:val="000000"/>
+                <w:sz w:val="16"/>
+                <w:szCs w:val="16"/>
+              </w:rPr>
+              <w:t>Cab Cam</w:t>
+            </w:r>
+          </w:p>
+        </w:tc>
+      </w:tr>
+    </w:tbl>
+    <w:p>
+      <w:pPr>
+        <w:pStyle w:val="Normal"/>
+        <w:rPr>
+          <w:rFonts w:ascii="arial" w:hAnsi="arial" w:eastAsia="arial"/>
+          <w:color w:val="000000"/>
+          <w:sz w:val="16"/>
+          <w:szCs w:val="16"/>
+        </w:rPr>
+      </w:pPr>
+      <w:r>
+        <w:rPr>
+          <w:rFonts w:eastAsia="arial" w:ascii="arial" w:hAnsi="arial"/>
+          <w:color w:val="000000"/>
+          <w:sz w:val="16"/>
+          <w:szCs w:val="16"/>
+        </w:rPr>
+      </w:r>
+    </w:p>
+    <w:p>
+      <w:pPr>
+        <w:pStyle w:val="Normal"/>
+        <w:rPr>
+          <w:color w:val="000000"/>
+          <w:sz w:val="16"/>
+          <w:szCs w:val="16"/>
+        </w:rPr>
+      </w:pPr>
+      <w:r>
+        <w:rPr>
+          <w:rFonts w:eastAsia="arial" w:ascii="arial" w:hAnsi="arial"/>
+          <w:color w:val="000000"/>
+          <w:sz w:val="16"/>
+          <w:szCs w:val="16"/>
+        </w:rPr>
+        <w:tab/>
+        <w:t xml:space="preserve">           Class 48</w:t>
+      </w:r>
+      <w:r>
+        <w:rPr>
+          <w:rFonts w:eastAsia="arial" w:ascii="arial" w:hAnsi="arial"/>
+          <w:color w:val="000000"/>
+          <w:sz w:val="16"/>
+          <w:szCs w:val="16"/>
+        </w:rPr>
+        <w:t>4</w:t>
       </w:r>
       <w:r>
         <w:rPr>
@@ -41768,25 +42832,176 @@
                 <w:sz w:val="16"/>
                 <w:szCs w:val="16"/>
               </w:rPr>
-              <w:t>Master Off</w:t>
-            </w:r>
-          </w:p>
-        </w:tc>
-        <w:tc>
-          <w:tcPr>
-            <w:tcW w:w="1016" w:type="dxa"/>
-            <w:tcBorders>
-              <w:top w:val="single" w:sz="4" w:space="0" w:color="000000"/>
-              <w:left w:val="single" w:sz="4" w:space="0" w:color="000000"/>
-              <w:bottom w:val="single" w:sz="4" w:space="0" w:color="000000"/>
-            </w:tcBorders>
-            <w:vAlign w:val="bottom"/>
-          </w:tcPr>
-          <w:p>
-            <w:pPr>
-              <w:pStyle w:val="Normal"/>
-              <w:widowControl w:val="false"/>
-              <w:spacing w:lineRule="auto" w:line="180"/>
+              <w:t>Aux Off</w:t>
+            </w:r>
+          </w:p>
+        </w:tc>
+        <w:tc>
+          <w:tcPr>
+            <w:tcW w:w="1016" w:type="dxa"/>
+            <w:tcBorders>
+              <w:top w:val="single" w:sz="4" w:space="0" w:color="000000"/>
+              <w:left w:val="single" w:sz="4" w:space="0" w:color="000000"/>
+              <w:bottom w:val="single" w:sz="4" w:space="0" w:color="000000"/>
+            </w:tcBorders>
+            <w:vAlign w:val="bottom"/>
+          </w:tcPr>
+          <w:p>
+            <w:pPr>
+              <w:pStyle w:val="Normal"/>
+              <w:widowControl w:val="false"/>
+              <w:spacing w:lineRule="auto" w:line="180"/>
+              <w:jc w:val="center"/>
+              <w:rPr>
+                <w:color w:val="000000"/>
+                <w:sz w:val="16"/>
+                <w:szCs w:val="16"/>
+              </w:rPr>
+            </w:pPr>
+            <w:r>
+              <w:rPr>
+                <w:color w:val="000000"/>
+                <w:sz w:val="16"/>
+                <w:szCs w:val="16"/>
+              </w:rPr>
+              <w:t>DSD</w:t>
+            </w:r>
+          </w:p>
+        </w:tc>
+        <w:tc>
+          <w:tcPr>
+            <w:tcW w:w="1020" w:type="dxa"/>
+            <w:tcBorders>
+              <w:top w:val="single" w:sz="4" w:space="0" w:color="000000"/>
+              <w:left w:val="single" w:sz="4" w:space="0" w:color="000000"/>
+              <w:bottom w:val="single" w:sz="4" w:space="0" w:color="000000"/>
+            </w:tcBorders>
+            <w:vAlign w:val="bottom"/>
+          </w:tcPr>
+          <w:p>
+            <w:pPr>
+              <w:pStyle w:val="Normal"/>
+              <w:widowControl w:val="false"/>
+              <w:spacing w:lineRule="auto" w:line="180"/>
+              <w:jc w:val="center"/>
+              <w:rPr>
+                <w:color w:val="000000"/>
+                <w:sz w:val="16"/>
+                <w:szCs w:val="16"/>
+              </w:rPr>
+            </w:pPr>
+            <w:r>
+              <w:rPr>
+                <w:color w:val="000000"/>
+                <w:sz w:val="16"/>
+                <w:szCs w:val="16"/>
+              </w:rPr>
+              <w:t>DRA Isolation</w:t>
+            </w:r>
+          </w:p>
+        </w:tc>
+        <w:tc>
+          <w:tcPr>
+            <w:tcW w:w="1016" w:type="dxa"/>
+            <w:tcBorders>
+              <w:top w:val="single" w:sz="4" w:space="0" w:color="000000"/>
+              <w:left w:val="single" w:sz="4" w:space="0" w:color="000000"/>
+              <w:bottom w:val="single" w:sz="4" w:space="0" w:color="000000"/>
+            </w:tcBorders>
+            <w:vAlign w:val="bottom"/>
+          </w:tcPr>
+          <w:p>
+            <w:pPr>
+              <w:pStyle w:val="Normal"/>
+              <w:widowControl w:val="false"/>
+              <w:spacing w:lineRule="auto" w:line="180"/>
+              <w:jc w:val="center"/>
+              <w:rPr>
+                <w:color w:val="000000"/>
+                <w:sz w:val="16"/>
+                <w:szCs w:val="16"/>
+              </w:rPr>
+            </w:pPr>
+            <w:r>
+              <w:rPr>
+                <w:color w:val="000000"/>
+                <w:sz w:val="16"/>
+                <w:szCs w:val="16"/>
+              </w:rPr>
+              <w:t>Saloon Light Off</w:t>
+            </w:r>
+          </w:p>
+        </w:tc>
+        <w:tc>
+          <w:tcPr>
+            <w:tcW w:w="1016" w:type="dxa"/>
+            <w:tcBorders>
+              <w:top w:val="single" w:sz="4" w:space="0" w:color="000000"/>
+              <w:left w:val="single" w:sz="4" w:space="0" w:color="000000"/>
+              <w:bottom w:val="single" w:sz="4" w:space="0" w:color="000000"/>
+            </w:tcBorders>
+            <w:vAlign w:val="bottom"/>
+          </w:tcPr>
+          <w:p>
+            <w:pPr>
+              <w:pStyle w:val="Normal"/>
+              <w:widowControl w:val="false"/>
+              <w:jc w:val="center"/>
+              <w:rPr>
+                <w:sz w:val="16"/>
+                <w:szCs w:val="16"/>
+              </w:rPr>
+            </w:pPr>
+            <w:r>
+              <w:rPr>
+                <w:sz w:val="16"/>
+                <w:szCs w:val="16"/>
+              </w:rPr>
+            </w:r>
+          </w:p>
+        </w:tc>
+        <w:tc>
+          <w:tcPr>
+            <w:tcW w:w="1017" w:type="dxa"/>
+            <w:tcBorders>
+              <w:top w:val="single" w:sz="4" w:space="0" w:color="000000"/>
+              <w:left w:val="single" w:sz="4" w:space="0" w:color="000000"/>
+              <w:bottom w:val="single" w:sz="4" w:space="0" w:color="000000"/>
+            </w:tcBorders>
+            <w:vAlign w:val="bottom"/>
+          </w:tcPr>
+          <w:p>
+            <w:pPr>
+              <w:pStyle w:val="Normal"/>
+              <w:widowControl w:val="false"/>
+              <w:jc w:val="center"/>
+              <w:rPr>
+                <w:sz w:val="16"/>
+                <w:szCs w:val="16"/>
+              </w:rPr>
+            </w:pPr>
+            <w:r>
+              <w:rPr>
+                <w:sz w:val="16"/>
+                <w:szCs w:val="16"/>
+              </w:rPr>
+            </w:r>
+          </w:p>
+        </w:tc>
+        <w:tc>
+          <w:tcPr>
+            <w:tcW w:w="1016" w:type="dxa"/>
+            <w:tcBorders>
+              <w:top w:val="single" w:sz="4" w:space="0" w:color="000000"/>
+              <w:left w:val="single" w:sz="4" w:space="0" w:color="000000"/>
+              <w:bottom w:val="single" w:sz="4" w:space="0" w:color="000000"/>
+            </w:tcBorders>
+            <w:vAlign w:val="bottom"/>
+          </w:tcPr>
+          <w:p>
+            <w:pPr>
+              <w:pStyle w:val="Normal"/>
+              <w:widowControl w:val="false"/>
               <w:jc w:val="center"/>
               <w:rPr>
                 <w:color w:val="000000"/>
@@ -41816,77 +43031,552 @@
               <w:spacing w:lineRule="auto" w:line="180"/>
               <w:jc w:val="center"/>
               <w:rPr>
-                <w:color w:val="000000"/>
-                <w:sz w:val="16"/>
-                <w:szCs w:val="16"/>
-              </w:rPr>
-            </w:pPr>
-            <w:r>
-              <w:rPr>
-                <w:color w:val="000000"/>
-                <w:sz w:val="16"/>
-                <w:szCs w:val="16"/>
-              </w:rPr>
-              <w:br/>
-            </w:r>
-            <w:r>
-              <w:rPr>
-                <w:color w:val="000000"/>
-                <w:sz w:val="16"/>
-                <w:szCs w:val="16"/>
-              </w:rPr>
-              <w:t>Trip Power</w:t>
-            </w:r>
-          </w:p>
-        </w:tc>
-        <w:tc>
-          <w:tcPr>
-            <w:tcW w:w="1016" w:type="dxa"/>
-            <w:tcBorders>
-              <w:top w:val="single" w:sz="4" w:space="0" w:color="000000"/>
-              <w:left w:val="single" w:sz="4" w:space="0" w:color="000000"/>
-              <w:bottom w:val="single" w:sz="4" w:space="0" w:color="000000"/>
-            </w:tcBorders>
-            <w:vAlign w:val="bottom"/>
-          </w:tcPr>
-          <w:p>
-            <w:pPr>
-              <w:pStyle w:val="Normal"/>
-              <w:widowControl w:val="false"/>
-              <w:spacing w:lineRule="auto" w:line="180"/>
-              <w:jc w:val="center"/>
-              <w:rPr>
-                <w:color w:val="000000"/>
-                <w:sz w:val="16"/>
-                <w:szCs w:val="16"/>
-              </w:rPr>
-            </w:pPr>
-            <w:r>
-              <w:rPr>
-                <w:color w:val="000000"/>
-                <w:sz w:val="16"/>
-                <w:szCs w:val="16"/>
-              </w:rPr>
-              <w:t>Pass. Light Off</w:t>
-            </w:r>
-          </w:p>
-        </w:tc>
-        <w:tc>
-          <w:tcPr>
-            <w:tcW w:w="1016" w:type="dxa"/>
-            <w:tcBorders>
-              <w:top w:val="single" w:sz="4" w:space="0" w:color="000000"/>
-              <w:left w:val="single" w:sz="4" w:space="0" w:color="000000"/>
-              <w:bottom w:val="single" w:sz="4" w:space="0" w:color="000000"/>
-            </w:tcBorders>
-            <w:vAlign w:val="bottom"/>
-          </w:tcPr>
-          <w:p>
-            <w:pPr>
-              <w:pStyle w:val="Normal"/>
-              <w:widowControl w:val="false"/>
-              <w:jc w:val="center"/>
-              <w:rPr>
+                <w:sz w:val="16"/>
+                <w:szCs w:val="16"/>
+              </w:rPr>
+            </w:pPr>
+            <w:r>
+              <w:rPr>
+                <w:rFonts w:eastAsia="arial" w:ascii="arial" w:hAnsi="arial"/>
+                <w:color w:val="000000"/>
+                <w:sz w:val="16"/>
+                <w:szCs w:val="16"/>
+              </w:rPr>
+              <w:t>Inst. Light Down</w:t>
+            </w:r>
+          </w:p>
+        </w:tc>
+        <w:tc>
+          <w:tcPr>
+            <w:tcW w:w="1016" w:type="dxa"/>
+            <w:tcBorders>
+              <w:top w:val="single" w:sz="4" w:space="0" w:color="000000"/>
+              <w:left w:val="single" w:sz="4" w:space="0" w:color="000000"/>
+              <w:bottom w:val="single" w:sz="4" w:space="0" w:color="000000"/>
+            </w:tcBorders>
+            <w:vAlign w:val="bottom"/>
+          </w:tcPr>
+          <w:p>
+            <w:pPr>
+              <w:pStyle w:val="Normal"/>
+              <w:widowControl w:val="false"/>
+              <w:spacing w:lineRule="auto" w:line="180"/>
+              <w:jc w:val="center"/>
+              <w:rPr>
+                <w:sz w:val="16"/>
+                <w:szCs w:val="16"/>
+              </w:rPr>
+            </w:pPr>
+            <w:r>
+              <w:rPr>
+                <w:rFonts w:eastAsia="arial" w:ascii="arial" w:hAnsi="arial"/>
+                <w:color w:val="000000"/>
+                <w:sz w:val="16"/>
+                <w:szCs w:val="16"/>
+              </w:rPr>
+              <w:t>Spot Light</w:t>
+            </w:r>
+          </w:p>
+        </w:tc>
+        <w:tc>
+          <w:tcPr>
+            <w:tcW w:w="1016" w:type="dxa"/>
+            <w:tcBorders>
+              <w:top w:val="single" w:sz="4" w:space="0" w:color="000000"/>
+              <w:left w:val="single" w:sz="4" w:space="0" w:color="000000"/>
+              <w:bottom w:val="single" w:sz="4" w:space="0" w:color="000000"/>
+            </w:tcBorders>
+            <w:vAlign w:val="bottom"/>
+          </w:tcPr>
+          <w:p>
+            <w:pPr>
+              <w:pStyle w:val="Normal"/>
+              <w:widowControl w:val="false"/>
+              <w:spacing w:lineRule="auto" w:line="180"/>
+              <w:jc w:val="center"/>
+              <w:rPr>
+                <w:sz w:val="16"/>
+                <w:szCs w:val="16"/>
+              </w:rPr>
+            </w:pPr>
+            <w:r>
+              <w:rPr>
+                <w:rFonts w:eastAsia="arial" w:ascii="arial" w:hAnsi="arial"/>
+                <w:color w:val="000000"/>
+                <w:sz w:val="16"/>
+                <w:szCs w:val="16"/>
+              </w:rPr>
+              <w:t>Uncouple</w:t>
+            </w:r>
+          </w:p>
+        </w:tc>
+        <w:tc>
+          <w:tcPr>
+            <w:tcW w:w="1016" w:type="dxa"/>
+            <w:tcBorders>
+              <w:top w:val="single" w:sz="4" w:space="0" w:color="000000"/>
+              <w:left w:val="single" w:sz="4" w:space="0" w:color="000000"/>
+              <w:bottom w:val="single" w:sz="4" w:space="0" w:color="000000"/>
+            </w:tcBorders>
+            <w:vAlign w:val="bottom"/>
+          </w:tcPr>
+          <w:p>
+            <w:pPr>
+              <w:pStyle w:val="Normal"/>
+              <w:widowControl w:val="false"/>
+              <w:spacing w:lineRule="auto" w:line="180"/>
+              <w:jc w:val="center"/>
+              <w:rPr>
+                <w:sz w:val="16"/>
+                <w:szCs w:val="16"/>
+              </w:rPr>
+            </w:pPr>
+            <w:r>
+              <w:rPr>
+                <w:rFonts w:eastAsia="arial" w:ascii="arial" w:hAnsi="arial"/>
+                <w:color w:val="000000"/>
+                <w:sz w:val="16"/>
+                <w:szCs w:val="16"/>
+              </w:rPr>
+              <w:t>Exterior</w:t>
+            </w:r>
+          </w:p>
+          <w:p>
+            <w:pPr>
+              <w:pStyle w:val="Normal"/>
+              <w:widowControl w:val="false"/>
+              <w:spacing w:lineRule="auto" w:line="180"/>
+              <w:jc w:val="center"/>
+              <w:rPr>
+                <w:sz w:val="16"/>
+                <w:szCs w:val="16"/>
+              </w:rPr>
+            </w:pPr>
+            <w:r>
+              <w:rPr>
+                <w:rFonts w:eastAsia="arial" w:ascii="arial" w:hAnsi="arial"/>
+                <w:color w:val="000000"/>
+                <w:sz w:val="16"/>
+                <w:szCs w:val="16"/>
+              </w:rPr>
+              <w:t>Camera</w:t>
+            </w:r>
+          </w:p>
+        </w:tc>
+        <w:tc>
+          <w:tcPr>
+            <w:tcW w:w="1029" w:type="dxa"/>
+            <w:tcBorders>
+              <w:top w:val="single" w:sz="4" w:space="0" w:color="000000"/>
+              <w:left w:val="single" w:sz="4" w:space="0" w:color="000000"/>
+              <w:bottom w:val="single" w:sz="4" w:space="0" w:color="000000"/>
+              <w:right w:val="single" w:sz="4" w:space="0" w:color="000000"/>
+            </w:tcBorders>
+            <w:vAlign w:val="bottom"/>
+          </w:tcPr>
+          <w:p>
+            <w:pPr>
+              <w:pStyle w:val="Normal"/>
+              <w:widowControl w:val="false"/>
+              <w:spacing w:lineRule="auto" w:line="180"/>
+              <w:jc w:val="center"/>
+              <w:rPr>
+                <w:sz w:val="16"/>
+                <w:szCs w:val="16"/>
+              </w:rPr>
+            </w:pPr>
+            <w:r>
+              <w:rPr>
+                <w:rFonts w:eastAsia="arial" w:ascii="arial" w:hAnsi="arial"/>
+                <w:color w:val="000000"/>
+                <w:sz w:val="16"/>
+                <w:szCs w:val="16"/>
+              </w:rPr>
+              <w:t>Prev</w:t>
+            </w:r>
+          </w:p>
+          <w:p>
+            <w:pPr>
+              <w:pStyle w:val="Normal"/>
+              <w:widowControl w:val="false"/>
+              <w:spacing w:lineRule="auto" w:line="180"/>
+              <w:jc w:val="center"/>
+              <w:rPr>
+                <w:sz w:val="16"/>
+                <w:szCs w:val="16"/>
+              </w:rPr>
+            </w:pPr>
+            <w:r>
+              <w:rPr>
+                <w:rFonts w:eastAsia="arial" w:ascii="arial" w:hAnsi="arial"/>
+                <w:color w:val="000000"/>
+                <w:sz w:val="16"/>
+                <w:szCs w:val="16"/>
+              </w:rPr>
+              <w:t>Cab Cam</w:t>
+            </w:r>
+          </w:p>
+        </w:tc>
+      </w:tr>
+    </w:tbl>
+    <w:p>
+      <w:pPr>
+        <w:pStyle w:val="Normal"/>
+        <w:rPr>
+          <w:color w:val="000000"/>
+          <w:sz w:val="16"/>
+          <w:szCs w:val="16"/>
+        </w:rPr>
+      </w:pPr>
+      <w:r>
+        <w:rPr>
+          <w:color w:val="000000"/>
+          <w:sz w:val="16"/>
+          <w:szCs w:val="16"/>
+        </w:rPr>
+      </w:r>
+    </w:p>
+    <w:p>
+      <w:pPr>
+        <w:pStyle w:val="Normal"/>
+        <w:rPr>
+          <w:color w:val="000000"/>
+          <w:sz w:val="16"/>
+          <w:szCs w:val="16"/>
+        </w:rPr>
+      </w:pPr>
+      <w:r>
+        <w:rPr>
+          <w:rFonts w:eastAsia="arial" w:ascii="arial" w:hAnsi="arial"/>
+          <w:color w:val="000000"/>
+          <w:sz w:val="16"/>
+          <w:szCs w:val="16"/>
+        </w:rPr>
+        <w:tab/>
+        <w:t xml:space="preserve">           Class </w:t>
+      </w:r>
+      <w:r>
+        <w:rPr>
+          <w:rFonts w:eastAsia="arial" w:ascii="arial" w:hAnsi="arial"/>
+          <w:color w:val="000000"/>
+          <w:sz w:val="16"/>
+          <w:szCs w:val="16"/>
+        </w:rPr>
+        <w:t>700</w:t>
+      </w:r>
+      <w:r>
+        <w:rPr>
+          <w:rFonts w:eastAsia="arial" w:ascii="arial" w:hAnsi="arial"/>
+          <w:color w:val="000000"/>
+          <w:sz w:val="16"/>
+          <w:szCs w:val="16"/>
+        </w:rPr>
+        <w:t>-1</w:t>
+      </w:r>
+    </w:p>
+    <w:tbl>
+      <w:tblPr>
+        <w:tblW w:w="14248" w:type="dxa"/>
+        <w:jc w:val="left"/>
+        <w:tblInd w:w="-5" w:type="dxa"/>
+        <w:tblLayout w:type="fixed"/>
+        <w:tblCellMar>
+          <w:top w:w="0" w:type="dxa"/>
+          <w:left w:w="108" w:type="dxa"/>
+          <w:bottom w:w="0" w:type="dxa"/>
+          <w:right w:w="108" w:type="dxa"/>
+        </w:tblCellMar>
+        <w:tblLook w:firstRow="1" w:noVBand="1" w:lastRow="0" w:firstColumn="1" w:lastColumn="0" w:noHBand="0" w:val="04a0"/>
+      </w:tblPr>
+      <w:tblGrid>
+        <w:gridCol w:w="1017"/>
+        <w:gridCol w:w="1019"/>
+        <w:gridCol w:w="1014"/>
+        <w:gridCol w:w="1016"/>
+        <w:gridCol w:w="1020"/>
+        <w:gridCol w:w="1016"/>
+        <w:gridCol w:w="1016"/>
+        <w:gridCol w:w="1017"/>
+        <w:gridCol w:w="1016"/>
+        <w:gridCol w:w="1020"/>
+        <w:gridCol w:w="1016"/>
+        <w:gridCol w:w="1016"/>
+        <w:gridCol w:w="1016"/>
+        <w:gridCol w:w="1029"/>
+      </w:tblGrid>
+      <w:tr>
+        <w:trPr>
+          <w:trHeight w:val="440" w:hRule="exact"/>
+          <w:cantSplit w:val="true"/>
+        </w:trPr>
+        <w:tc>
+          <w:tcPr>
+            <w:tcW w:w="1017" w:type="dxa"/>
+            <w:tcBorders>
+              <w:top w:val="single" w:sz="4" w:space="0" w:color="000000"/>
+              <w:left w:val="single" w:sz="4" w:space="0" w:color="000000"/>
+              <w:bottom w:val="single" w:sz="4" w:space="0" w:color="000000"/>
+            </w:tcBorders>
+            <w:vAlign w:val="bottom"/>
+          </w:tcPr>
+          <w:p>
+            <w:pPr>
+              <w:pStyle w:val="Normal"/>
+              <w:widowControl w:val="false"/>
+              <w:spacing w:lineRule="auto" w:line="180" w:before="0" w:after="60"/>
+              <w:jc w:val="center"/>
+              <w:rPr>
+                <w:color w:val="000000"/>
+                <w:sz w:val="16"/>
+                <w:szCs w:val="16"/>
+              </w:rPr>
+            </w:pPr>
+            <w:r>
+              <w:rPr>
+                <w:rFonts w:eastAsia="arial" w:ascii="arial" w:hAnsi="arial"/>
+                <w:b/>
+                <w:color w:val="000000"/>
+                <w:sz w:val="16"/>
+                <w:szCs w:val="16"/>
+              </w:rPr>
+              <w:t>Pause</w:t>
+            </w:r>
+          </w:p>
+        </w:tc>
+        <w:tc>
+          <w:tcPr>
+            <w:tcW w:w="1019" w:type="dxa"/>
+            <w:tcBorders>
+              <w:top w:val="single" w:sz="4" w:space="0" w:color="000000"/>
+              <w:left w:val="single" w:sz="4" w:space="0" w:color="000000"/>
+              <w:bottom w:val="single" w:sz="4" w:space="0" w:color="000000"/>
+            </w:tcBorders>
+            <w:vAlign w:val="bottom"/>
+          </w:tcPr>
+          <w:p>
+            <w:pPr>
+              <w:pStyle w:val="Normal"/>
+              <w:widowControl w:val="false"/>
+              <w:spacing w:lineRule="auto" w:line="180"/>
+              <w:jc w:val="center"/>
+              <w:rPr>
+                <w:color w:val="000000"/>
+                <w:sz w:val="16"/>
+                <w:szCs w:val="16"/>
+              </w:rPr>
+            </w:pPr>
+            <w:r>
+              <w:rPr>
+                <w:color w:val="000000"/>
+                <w:sz w:val="16"/>
+                <w:szCs w:val="16"/>
+              </w:rPr>
+              <w:t>Master Key</w:t>
+            </w:r>
+          </w:p>
+        </w:tc>
+        <w:tc>
+          <w:tcPr>
+            <w:tcW w:w="1014" w:type="dxa"/>
+            <w:tcBorders>
+              <w:top w:val="single" w:sz="4" w:space="0" w:color="000000"/>
+              <w:left w:val="single" w:sz="4" w:space="0" w:color="000000"/>
+              <w:bottom w:val="single" w:sz="4" w:space="0" w:color="000000"/>
+            </w:tcBorders>
+            <w:vAlign w:val="bottom"/>
+          </w:tcPr>
+          <w:p>
+            <w:pPr>
+              <w:pStyle w:val="Normal"/>
+              <w:widowControl w:val="false"/>
+              <w:spacing w:lineRule="auto" w:line="180"/>
+              <w:jc w:val="center"/>
+              <w:rPr>
+                <w:color w:val="000000"/>
+                <w:sz w:val="16"/>
+                <w:szCs w:val="16"/>
+              </w:rPr>
+            </w:pPr>
+            <w:r>
+              <w:rPr>
+                <w:color w:val="000000"/>
+                <w:sz w:val="16"/>
+                <w:szCs w:val="16"/>
+              </w:rPr>
+              <w:t>Power Supply On</w:t>
+            </w:r>
+          </w:p>
+        </w:tc>
+        <w:tc>
+          <w:tcPr>
+            <w:tcW w:w="1016" w:type="dxa"/>
+            <w:tcBorders>
+              <w:top w:val="single" w:sz="4" w:space="0" w:color="000000"/>
+              <w:left w:val="single" w:sz="4" w:space="0" w:color="000000"/>
+              <w:bottom w:val="single" w:sz="4" w:space="0" w:color="000000"/>
+            </w:tcBorders>
+            <w:vAlign w:val="bottom"/>
+          </w:tcPr>
+          <w:p>
+            <w:pPr>
+              <w:pStyle w:val="Normal"/>
+              <w:widowControl w:val="false"/>
+              <w:spacing w:lineRule="auto" w:line="180"/>
+              <w:jc w:val="center"/>
+              <w:rPr>
+                <w:color w:val="000000"/>
+                <w:sz w:val="16"/>
+                <w:szCs w:val="16"/>
+              </w:rPr>
+            </w:pPr>
+            <w:r>
+              <w:rPr>
+                <w:color w:val="000000"/>
+                <w:sz w:val="16"/>
+                <w:szCs w:val="16"/>
+              </w:rPr>
+              <w:t>AWS/TPWS</w:t>
+            </w:r>
+          </w:p>
+        </w:tc>
+        <w:tc>
+          <w:tcPr>
+            <w:tcW w:w="1020" w:type="dxa"/>
+            <w:tcBorders>
+              <w:top w:val="single" w:sz="4" w:space="0" w:color="000000"/>
+              <w:left w:val="single" w:sz="4" w:space="0" w:color="000000"/>
+              <w:bottom w:val="single" w:sz="4" w:space="0" w:color="000000"/>
+            </w:tcBorders>
+            <w:vAlign w:val="bottom"/>
+          </w:tcPr>
+          <w:p>
+            <w:pPr>
+              <w:pStyle w:val="Normal"/>
+              <w:widowControl w:val="false"/>
+              <w:spacing w:lineRule="auto" w:line="180"/>
+              <w:jc w:val="center"/>
+              <w:rPr>
+                <w:color w:val="000000"/>
+                <w:sz w:val="16"/>
+                <w:szCs w:val="16"/>
+              </w:rPr>
+            </w:pPr>
+            <w:r>
+              <w:rPr>
+                <w:color w:val="000000"/>
+                <w:sz w:val="16"/>
+                <w:szCs w:val="16"/>
+              </w:rPr>
+              <w:t>DRA</w:t>
+            </w:r>
+          </w:p>
+        </w:tc>
+        <w:tc>
+          <w:tcPr>
+            <w:tcW w:w="1016" w:type="dxa"/>
+            <w:tcBorders>
+              <w:top w:val="single" w:sz="4" w:space="0" w:color="000000"/>
+              <w:left w:val="single" w:sz="4" w:space="0" w:color="000000"/>
+              <w:bottom w:val="single" w:sz="4" w:space="0" w:color="000000"/>
+            </w:tcBorders>
+            <w:vAlign w:val="bottom"/>
+          </w:tcPr>
+          <w:p>
+            <w:pPr>
+              <w:pStyle w:val="Normal"/>
+              <w:widowControl w:val="false"/>
+              <w:spacing w:lineRule="auto" w:line="180"/>
+              <w:jc w:val="center"/>
+              <w:rPr>
+                <w:color w:val="000000"/>
+                <w:sz w:val="16"/>
+                <w:szCs w:val="16"/>
+              </w:rPr>
+            </w:pPr>
+            <w:r>
+              <w:rPr>
+                <w:color w:val="000000"/>
+                <w:sz w:val="16"/>
+                <w:szCs w:val="16"/>
+              </w:rPr>
+              <w:t>Saloon Light</w:t>
+            </w:r>
+          </w:p>
+        </w:tc>
+        <w:tc>
+          <w:tcPr>
+            <w:tcW w:w="1016" w:type="dxa"/>
+            <w:tcBorders>
+              <w:top w:val="single" w:sz="4" w:space="0" w:color="000000"/>
+              <w:left w:val="single" w:sz="4" w:space="0" w:color="000000"/>
+              <w:bottom w:val="single" w:sz="4" w:space="0" w:color="000000"/>
+            </w:tcBorders>
+            <w:vAlign w:val="bottom"/>
+          </w:tcPr>
+          <w:p>
+            <w:pPr>
+              <w:pStyle w:val="Normal"/>
+              <w:widowControl w:val="false"/>
+              <w:jc w:val="center"/>
+              <w:rPr>
+                <w:sz w:val="16"/>
+                <w:szCs w:val="16"/>
+              </w:rPr>
+            </w:pPr>
+            <w:r>
+              <w:rPr>
+                <w:sz w:val="16"/>
+                <w:szCs w:val="16"/>
+              </w:rPr>
+              <w:t>Mode AC</w:t>
+            </w:r>
+          </w:p>
+        </w:tc>
+        <w:tc>
+          <w:tcPr>
+            <w:tcW w:w="1017" w:type="dxa"/>
+            <w:tcBorders>
+              <w:top w:val="single" w:sz="4" w:space="0" w:color="000000"/>
+              <w:left w:val="single" w:sz="4" w:space="0" w:color="000000"/>
+              <w:bottom w:val="single" w:sz="4" w:space="0" w:color="000000"/>
+            </w:tcBorders>
+            <w:vAlign w:val="bottom"/>
+          </w:tcPr>
+          <w:p>
+            <w:pPr>
+              <w:pStyle w:val="Normal"/>
+              <w:widowControl w:val="false"/>
+              <w:jc w:val="center"/>
+              <w:rPr>
+                <w:sz w:val="16"/>
+                <w:szCs w:val="16"/>
+              </w:rPr>
+            </w:pPr>
+            <w:r>
+              <w:rPr>
+                <w:sz w:val="16"/>
+                <w:szCs w:val="16"/>
+              </w:rPr>
+            </w:r>
+          </w:p>
+        </w:tc>
+        <w:tc>
+          <w:tcPr>
+            <w:tcW w:w="1016" w:type="dxa"/>
+            <w:tcBorders>
+              <w:top w:val="single" w:sz="4" w:space="0" w:color="000000"/>
+              <w:left w:val="single" w:sz="4" w:space="0" w:color="000000"/>
+              <w:bottom w:val="single" w:sz="4" w:space="0" w:color="000000"/>
+            </w:tcBorders>
+            <w:vAlign w:val="bottom"/>
+          </w:tcPr>
+          <w:p>
+            <w:pPr>
+              <w:pStyle w:val="Normal"/>
+              <w:widowControl w:val="false"/>
+              <w:jc w:val="center"/>
+              <w:rPr>
+                <w:color w:val="000000"/>
                 <w:sz w:val="16"/>
                 <w:szCs w:val="16"/>
               </w:rPr>
@@ -41898,6 +43588,291 @@
         </w:tc>
         <w:tc>
           <w:tcPr>
+            <w:tcW w:w="1020" w:type="dxa"/>
+            <w:tcBorders>
+              <w:top w:val="single" w:sz="4" w:space="0" w:color="000000"/>
+              <w:left w:val="single" w:sz="4" w:space="0" w:color="000000"/>
+              <w:bottom w:val="single" w:sz="4" w:space="0" w:color="000000"/>
+            </w:tcBorders>
+            <w:vAlign w:val="bottom"/>
+          </w:tcPr>
+          <w:p>
+            <w:pPr>
+              <w:pStyle w:val="Normal"/>
+              <w:widowControl w:val="false"/>
+              <w:spacing w:lineRule="auto" w:line="180"/>
+              <w:jc w:val="center"/>
+              <w:rPr>
+                <w:sz w:val="16"/>
+                <w:szCs w:val="16"/>
+              </w:rPr>
+            </w:pPr>
+            <w:r>
+              <w:rPr>
+                <w:rFonts w:eastAsia="arial" w:ascii="arial" w:hAnsi="arial"/>
+                <w:color w:val="000000"/>
+                <w:sz w:val="16"/>
+                <w:szCs w:val="16"/>
+              </w:rPr>
+              <w:t>Hazard Warning</w:t>
+            </w:r>
+          </w:p>
+        </w:tc>
+        <w:tc>
+          <w:tcPr>
+            <w:tcW w:w="1016" w:type="dxa"/>
+            <w:tcBorders>
+              <w:top w:val="single" w:sz="4" w:space="0" w:color="000000"/>
+              <w:left w:val="single" w:sz="4" w:space="0" w:color="000000"/>
+              <w:bottom w:val="single" w:sz="4" w:space="0" w:color="000000"/>
+            </w:tcBorders>
+            <w:vAlign w:val="bottom"/>
+          </w:tcPr>
+          <w:p>
+            <w:pPr>
+              <w:pStyle w:val="Normal"/>
+              <w:widowControl w:val="false"/>
+              <w:spacing w:lineRule="auto" w:line="180"/>
+              <w:jc w:val="center"/>
+              <w:rPr>
+                <w:sz w:val="16"/>
+                <w:szCs w:val="16"/>
+              </w:rPr>
+            </w:pPr>
+            <w:r>
+              <w:rPr>
+                <w:rFonts w:eastAsia="arial" w:ascii="arial" w:hAnsi="arial"/>
+                <w:color w:val="000000"/>
+                <w:sz w:val="16"/>
+                <w:szCs w:val="16"/>
+              </w:rPr>
+              <w:t>Desk Light</w:t>
+            </w:r>
+          </w:p>
+        </w:tc>
+        <w:tc>
+          <w:tcPr>
+            <w:tcW w:w="1016" w:type="dxa"/>
+            <w:tcBorders>
+              <w:top w:val="single" w:sz="4" w:space="0" w:color="000000"/>
+              <w:left w:val="single" w:sz="4" w:space="0" w:color="000000"/>
+              <w:bottom w:val="single" w:sz="4" w:space="0" w:color="000000"/>
+            </w:tcBorders>
+            <w:vAlign w:val="bottom"/>
+          </w:tcPr>
+          <w:p>
+            <w:pPr>
+              <w:pStyle w:val="Normal"/>
+              <w:widowControl w:val="false"/>
+              <w:spacing w:lineRule="auto" w:line="180"/>
+              <w:jc w:val="center"/>
+              <w:rPr>
+                <w:sz w:val="16"/>
+                <w:szCs w:val="16"/>
+              </w:rPr>
+            </w:pPr>
+            <w:r>
+              <w:rPr>
+                <w:rFonts w:eastAsia="arial" w:ascii="arial" w:hAnsi="arial"/>
+                <w:color w:val="000000"/>
+                <w:sz w:val="16"/>
+                <w:szCs w:val="16"/>
+              </w:rPr>
+              <w:t xml:space="preserve">Cab Light </w:t>
+            </w:r>
+            <w:r>
+              <w:rPr>
+                <w:rFonts w:eastAsia="arial" w:ascii="arial" w:hAnsi="arial"/>
+                <w:color w:val="000000"/>
+                <w:sz w:val="16"/>
+                <w:szCs w:val="16"/>
+              </w:rPr>
+              <w:t>Main</w:t>
+            </w:r>
+          </w:p>
+        </w:tc>
+        <w:tc>
+          <w:tcPr>
+            <w:tcW w:w="1016" w:type="dxa"/>
+            <w:tcBorders>
+              <w:top w:val="single" w:sz="4" w:space="0" w:color="000000"/>
+              <w:left w:val="single" w:sz="4" w:space="0" w:color="000000"/>
+              <w:bottom w:val="single" w:sz="4" w:space="0" w:color="000000"/>
+            </w:tcBorders>
+            <w:vAlign w:val="bottom"/>
+          </w:tcPr>
+          <w:p>
+            <w:pPr>
+              <w:pStyle w:val="Normal"/>
+              <w:widowControl w:val="false"/>
+              <w:spacing w:lineRule="auto" w:line="180"/>
+              <w:jc w:val="center"/>
+              <w:rPr>
+                <w:sz w:val="16"/>
+                <w:szCs w:val="16"/>
+              </w:rPr>
+            </w:pPr>
+            <w:r>
+              <w:rPr>
+                <w:rFonts w:eastAsia="arial" w:ascii="arial" w:hAnsi="arial"/>
+                <w:color w:val="000000"/>
+                <w:sz w:val="16"/>
+                <w:szCs w:val="16"/>
+              </w:rPr>
+              <w:t>1-Person</w:t>
+            </w:r>
+          </w:p>
+        </w:tc>
+        <w:tc>
+          <w:tcPr>
+            <w:tcW w:w="1029" w:type="dxa"/>
+            <w:tcBorders>
+              <w:top w:val="single" w:sz="4" w:space="0" w:color="000000"/>
+              <w:left w:val="single" w:sz="4" w:space="0" w:color="000000"/>
+              <w:bottom w:val="single" w:sz="4" w:space="0" w:color="000000"/>
+              <w:right w:val="single" w:sz="4" w:space="0" w:color="000000"/>
+            </w:tcBorders>
+            <w:vAlign w:val="bottom"/>
+          </w:tcPr>
+          <w:p>
+            <w:pPr>
+              <w:pStyle w:val="Normal"/>
+              <w:widowControl w:val="false"/>
+              <w:spacing w:lineRule="auto" w:line="180"/>
+              <w:jc w:val="center"/>
+              <w:rPr>
+                <w:sz w:val="16"/>
+                <w:szCs w:val="16"/>
+              </w:rPr>
+            </w:pPr>
+            <w:r>
+              <w:rPr>
+                <w:rFonts w:eastAsia="arial" w:ascii="arial" w:hAnsi="arial"/>
+                <w:color w:val="000000"/>
+                <w:sz w:val="16"/>
+                <w:szCs w:val="16"/>
+              </w:rPr>
+              <w:t>Next</w:t>
+            </w:r>
+          </w:p>
+          <w:p>
+            <w:pPr>
+              <w:pStyle w:val="Normal"/>
+              <w:widowControl w:val="false"/>
+              <w:spacing w:lineRule="auto" w:line="180"/>
+              <w:jc w:val="center"/>
+              <w:rPr>
+                <w:sz w:val="16"/>
+                <w:szCs w:val="16"/>
+              </w:rPr>
+            </w:pPr>
+            <w:r>
+              <w:rPr>
+                <w:rFonts w:eastAsia="arial" w:ascii="arial" w:hAnsi="arial"/>
+                <w:color w:val="000000"/>
+                <w:sz w:val="16"/>
+                <w:szCs w:val="16"/>
+              </w:rPr>
+              <w:t>Cab Cam</w:t>
+            </w:r>
+          </w:p>
+        </w:tc>
+      </w:tr>
+    </w:tbl>
+    <w:p>
+      <w:pPr>
+        <w:pStyle w:val="Normal"/>
+        <w:rPr>
+          <w:rFonts w:ascii="arial" w:hAnsi="arial" w:eastAsia="arial"/>
+          <w:color w:val="000000"/>
+          <w:sz w:val="16"/>
+          <w:szCs w:val="16"/>
+        </w:rPr>
+      </w:pPr>
+      <w:r>
+        <w:rPr>
+          <w:rFonts w:eastAsia="arial" w:ascii="arial" w:hAnsi="arial"/>
+          <w:color w:val="000000"/>
+          <w:sz w:val="16"/>
+          <w:szCs w:val="16"/>
+        </w:rPr>
+      </w:r>
+    </w:p>
+    <w:p>
+      <w:pPr>
+        <w:pStyle w:val="Normal"/>
+        <w:rPr>
+          <w:color w:val="000000"/>
+          <w:sz w:val="16"/>
+          <w:szCs w:val="16"/>
+        </w:rPr>
+      </w:pPr>
+      <w:r>
+        <w:rPr>
+          <w:rFonts w:eastAsia="arial" w:ascii="arial" w:hAnsi="arial"/>
+          <w:color w:val="000000"/>
+          <w:sz w:val="16"/>
+          <w:szCs w:val="16"/>
+        </w:rPr>
+        <w:tab/>
+        <w:t xml:space="preserve">           Class </w:t>
+      </w:r>
+      <w:r>
+        <w:rPr>
+          <w:rFonts w:eastAsia="arial" w:ascii="arial" w:hAnsi="arial"/>
+          <w:color w:val="000000"/>
+          <w:sz w:val="16"/>
+          <w:szCs w:val="16"/>
+        </w:rPr>
+        <w:t>700</w:t>
+      </w:r>
+      <w:r>
+        <w:rPr>
+          <w:rFonts w:eastAsia="arial" w:ascii="arial" w:hAnsi="arial"/>
+          <w:color w:val="000000"/>
+          <w:sz w:val="16"/>
+          <w:szCs w:val="16"/>
+        </w:rPr>
+        <w:t>-2</w:t>
+      </w:r>
+    </w:p>
+    <w:tbl>
+      <w:tblPr>
+        <w:tblW w:w="14248" w:type="dxa"/>
+        <w:jc w:val="left"/>
+        <w:tblInd w:w="-5" w:type="dxa"/>
+        <w:tblLayout w:type="fixed"/>
+        <w:tblCellMar>
+          <w:top w:w="0" w:type="dxa"/>
+          <w:left w:w="108" w:type="dxa"/>
+          <w:bottom w:w="0" w:type="dxa"/>
+          <w:right w:w="108" w:type="dxa"/>
+        </w:tblCellMar>
+        <w:tblLook w:firstRow="1" w:noVBand="1" w:lastRow="0" w:firstColumn="1" w:lastColumn="0" w:noHBand="0" w:val="04a0"/>
+      </w:tblPr>
+      <w:tblGrid>
+        <w:gridCol w:w="1017"/>
+        <w:gridCol w:w="1019"/>
+        <w:gridCol w:w="1014"/>
+        <w:gridCol w:w="1016"/>
+        <w:gridCol w:w="1020"/>
+        <w:gridCol w:w="1016"/>
+        <w:gridCol w:w="1016"/>
+        <w:gridCol w:w="1017"/>
+        <w:gridCol w:w="1016"/>
+        <w:gridCol w:w="1020"/>
+        <w:gridCol w:w="1016"/>
+        <w:gridCol w:w="1016"/>
+        <w:gridCol w:w="1016"/>
+        <w:gridCol w:w="1029"/>
+      </w:tblGrid>
+      <w:tr>
+        <w:trPr>
+          <w:trHeight w:val="440" w:hRule="exact"/>
+          <w:cantSplit w:val="true"/>
+        </w:trPr>
+        <w:tc>
+          <w:tcPr>
             <w:tcW w:w="1017" w:type="dxa"/>
             <w:tcBorders>
               <w:top w:val="single" w:sz="4" w:space="0" w:color="000000"/>
@@ -41910,8 +43885,139 @@
             <w:pPr>
               <w:pStyle w:val="Normal"/>
               <w:widowControl w:val="false"/>
-              <w:jc w:val="center"/>
-              <w:rPr>
+              <w:spacing w:lineRule="auto" w:line="180" w:before="0" w:after="60"/>
+              <w:jc w:val="center"/>
+              <w:rPr>
+                <w:b/>
+                <w:bCs/>
+              </w:rPr>
+            </w:pPr>
+            <w:r>
+              <w:rPr>
+                <w:b/>
+                <w:bCs/>
+                <w:color w:val="000000"/>
+                <w:sz w:val="16"/>
+                <w:szCs w:val="16"/>
+              </w:rPr>
+              <w:t>HUD</w:t>
+            </w:r>
+          </w:p>
+        </w:tc>
+        <w:tc>
+          <w:tcPr>
+            <w:tcW w:w="1019" w:type="dxa"/>
+            <w:tcBorders>
+              <w:top w:val="single" w:sz="4" w:space="0" w:color="000000"/>
+              <w:left w:val="single" w:sz="4" w:space="0" w:color="000000"/>
+              <w:bottom w:val="single" w:sz="4" w:space="0" w:color="000000"/>
+            </w:tcBorders>
+            <w:vAlign w:val="bottom"/>
+          </w:tcPr>
+          <w:p>
+            <w:pPr>
+              <w:pStyle w:val="Normal"/>
+              <w:widowControl w:val="false"/>
+              <w:spacing w:lineRule="auto" w:line="180"/>
+              <w:jc w:val="center"/>
+              <w:rPr>
+                <w:color w:val="000000"/>
+                <w:sz w:val="16"/>
+                <w:szCs w:val="16"/>
+              </w:rPr>
+            </w:pPr>
+            <w:r>
+              <w:rPr>
+                <w:color w:val="000000"/>
+                <w:sz w:val="16"/>
+                <w:szCs w:val="16"/>
+              </w:rPr>
+              <w:t>Schedule</w:t>
+            </w:r>
+          </w:p>
+        </w:tc>
+        <w:tc>
+          <w:tcPr>
+            <w:tcW w:w="1014" w:type="dxa"/>
+            <w:tcBorders>
+              <w:top w:val="single" w:sz="4" w:space="0" w:color="000000"/>
+              <w:left w:val="single" w:sz="4" w:space="0" w:color="000000"/>
+              <w:bottom w:val="single" w:sz="4" w:space="0" w:color="000000"/>
+            </w:tcBorders>
+            <w:vAlign w:val="bottom"/>
+          </w:tcPr>
+          <w:p>
+            <w:pPr>
+              <w:pStyle w:val="Normal"/>
+              <w:widowControl w:val="false"/>
+              <w:spacing w:lineRule="auto" w:line="180"/>
+              <w:jc w:val="center"/>
+              <w:rPr>
+                <w:color w:val="000000"/>
+                <w:sz w:val="16"/>
+                <w:szCs w:val="16"/>
+              </w:rPr>
+            </w:pPr>
+            <w:r>
+              <w:rPr>
+                <w:color w:val="000000"/>
+                <w:sz w:val="16"/>
+                <w:szCs w:val="16"/>
+              </w:rPr>
+              <w:t>Power Supply Off</w:t>
+            </w:r>
+          </w:p>
+        </w:tc>
+        <w:tc>
+          <w:tcPr>
+            <w:tcW w:w="1016" w:type="dxa"/>
+            <w:tcBorders>
+              <w:top w:val="single" w:sz="4" w:space="0" w:color="000000"/>
+              <w:left w:val="single" w:sz="4" w:space="0" w:color="000000"/>
+              <w:bottom w:val="single" w:sz="4" w:space="0" w:color="000000"/>
+            </w:tcBorders>
+            <w:vAlign w:val="bottom"/>
+          </w:tcPr>
+          <w:p>
+            <w:pPr>
+              <w:pStyle w:val="Normal"/>
+              <w:widowControl w:val="false"/>
+              <w:spacing w:lineRule="auto" w:line="180"/>
+              <w:jc w:val="center"/>
+              <w:rPr>
+                <w:color w:val="000000"/>
+                <w:sz w:val="16"/>
+                <w:szCs w:val="16"/>
+              </w:rPr>
+            </w:pPr>
+            <w:r>
+              <w:rPr>
+                <w:color w:val="000000"/>
+                <w:sz w:val="16"/>
+                <w:szCs w:val="16"/>
+              </w:rPr>
+              <w:t>DSD/Vigilance</w:t>
+            </w:r>
+          </w:p>
+        </w:tc>
+        <w:tc>
+          <w:tcPr>
+            <w:tcW w:w="1020" w:type="dxa"/>
+            <w:tcBorders>
+              <w:top w:val="single" w:sz="4" w:space="0" w:color="000000"/>
+              <w:left w:val="single" w:sz="4" w:space="0" w:color="000000"/>
+              <w:bottom w:val="single" w:sz="4" w:space="0" w:color="000000"/>
+            </w:tcBorders>
+            <w:vAlign w:val="bottom"/>
+          </w:tcPr>
+          <w:p>
+            <w:pPr>
+              <w:pStyle w:val="Normal"/>
+              <w:widowControl w:val="false"/>
+              <w:spacing w:lineRule="auto" w:line="180"/>
+              <w:jc w:val="center"/>
+              <w:rPr>
+                <w:color w:val="000000"/>
                 <w:sz w:val="16"/>
                 <w:szCs w:val="16"/>
               </w:rPr>
@@ -41935,21 +44041,99 @@
             <w:pPr>
               <w:pStyle w:val="Normal"/>
               <w:widowControl w:val="false"/>
-              <w:jc w:val="center"/>
-              <w:rPr>
-                <w:color w:val="000000"/>
-                <w:sz w:val="16"/>
-                <w:szCs w:val="16"/>
-              </w:rPr>
-            </w:pPr>
-            <w:r>
-              <w:rPr>
-                <w:rFonts w:eastAsia="arial" w:ascii="arial" w:hAnsi="arial"/>
-                <w:color w:val="000000"/>
-                <w:sz w:val="16"/>
-                <w:szCs w:val="16"/>
-              </w:rPr>
-              <w:t>Inst. Light Off</w:t>
+              <w:spacing w:lineRule="auto" w:line="180"/>
+              <w:jc w:val="center"/>
+              <w:rPr>
+                <w:color w:val="000000"/>
+                <w:sz w:val="16"/>
+                <w:szCs w:val="16"/>
+              </w:rPr>
+            </w:pPr>
+            <w:r>
+              <w:rPr/>
+            </w:r>
+          </w:p>
+        </w:tc>
+        <w:tc>
+          <w:tcPr>
+            <w:tcW w:w="1016" w:type="dxa"/>
+            <w:tcBorders>
+              <w:top w:val="single" w:sz="4" w:space="0" w:color="000000"/>
+              <w:left w:val="single" w:sz="4" w:space="0" w:color="000000"/>
+              <w:bottom w:val="single" w:sz="4" w:space="0" w:color="000000"/>
+            </w:tcBorders>
+            <w:vAlign w:val="bottom"/>
+          </w:tcPr>
+          <w:p>
+            <w:pPr>
+              <w:pStyle w:val="Normal"/>
+              <w:widowControl w:val="false"/>
+              <w:jc w:val="center"/>
+              <w:rPr>
+                <w:sz w:val="16"/>
+                <w:szCs w:val="16"/>
+              </w:rPr>
+            </w:pPr>
+            <w:r>
+              <w:rPr>
+                <w:sz w:val="16"/>
+                <w:szCs w:val="16"/>
+              </w:rPr>
+              <w:t>Mode DC</w:t>
+            </w:r>
+          </w:p>
+        </w:tc>
+        <w:tc>
+          <w:tcPr>
+            <w:tcW w:w="1017" w:type="dxa"/>
+            <w:tcBorders>
+              <w:top w:val="single" w:sz="4" w:space="0" w:color="000000"/>
+              <w:left w:val="single" w:sz="4" w:space="0" w:color="000000"/>
+              <w:bottom w:val="single" w:sz="4" w:space="0" w:color="000000"/>
+            </w:tcBorders>
+            <w:vAlign w:val="bottom"/>
+          </w:tcPr>
+          <w:p>
+            <w:pPr>
+              <w:pStyle w:val="Normal"/>
+              <w:widowControl w:val="false"/>
+              <w:jc w:val="center"/>
+              <w:rPr>
+                <w:sz w:val="16"/>
+                <w:szCs w:val="16"/>
+              </w:rPr>
+            </w:pPr>
+            <w:r>
+              <w:rPr>
+                <w:sz w:val="16"/>
+                <w:szCs w:val="16"/>
+              </w:rPr>
+            </w:r>
+          </w:p>
+        </w:tc>
+        <w:tc>
+          <w:tcPr>
+            <w:tcW w:w="1016" w:type="dxa"/>
+            <w:tcBorders>
+              <w:top w:val="single" w:sz="4" w:space="0" w:color="000000"/>
+              <w:left w:val="single" w:sz="4" w:space="0" w:color="000000"/>
+              <w:bottom w:val="single" w:sz="4" w:space="0" w:color="000000"/>
+            </w:tcBorders>
+            <w:vAlign w:val="bottom"/>
+          </w:tcPr>
+          <w:p>
+            <w:pPr>
+              <w:pStyle w:val="Normal"/>
+              <w:widowControl w:val="false"/>
+              <w:jc w:val="center"/>
+              <w:rPr>
+                <w:color w:val="000000"/>
+                <w:sz w:val="16"/>
+                <w:szCs w:val="16"/>
+              </w:rPr>
+            </w:pPr>
+            <w:r>
+              <w:rPr/>
             </w:r>
           </w:p>
         </w:tc>
@@ -41975,6 +44159,58 @@
               </w:rPr>
             </w:pPr>
             <w:r>
+              <w:rPr/>
+            </w:r>
+          </w:p>
+        </w:tc>
+        <w:tc>
+          <w:tcPr>
+            <w:tcW w:w="1016" w:type="dxa"/>
+            <w:tcBorders>
+              <w:top w:val="single" w:sz="4" w:space="0" w:color="000000"/>
+              <w:left w:val="single" w:sz="4" w:space="0" w:color="000000"/>
+              <w:bottom w:val="single" w:sz="4" w:space="0" w:color="000000"/>
+            </w:tcBorders>
+            <w:vAlign w:val="bottom"/>
+          </w:tcPr>
+          <w:p>
+            <w:pPr>
+              <w:pStyle w:val="Normal"/>
+              <w:widowControl w:val="false"/>
+              <w:spacing w:lineRule="auto" w:line="180"/>
+              <w:jc w:val="center"/>
+              <w:rPr>
+                <w:sz w:val="16"/>
+                <w:szCs w:val="16"/>
+              </w:rPr>
+            </w:pPr>
+            <w:r>
+              <w:rPr/>
+            </w:r>
+          </w:p>
+        </w:tc>
+        <w:tc>
+          <w:tcPr>
+            <w:tcW w:w="1016" w:type="dxa"/>
+            <w:tcBorders>
+              <w:top w:val="single" w:sz="4" w:space="0" w:color="000000"/>
+              <w:left w:val="single" w:sz="4" w:space="0" w:color="000000"/>
+              <w:bottom w:val="single" w:sz="4" w:space="0" w:color="000000"/>
+            </w:tcBorders>
+            <w:vAlign w:val="bottom"/>
+          </w:tcPr>
+          <w:p>
+            <w:pPr>
+              <w:pStyle w:val="Normal"/>
+              <w:widowControl w:val="false"/>
+              <w:spacing w:lineRule="auto" w:line="180"/>
+              <w:jc w:val="center"/>
+              <w:rPr>
+                <w:sz w:val="16"/>
+                <w:szCs w:val="16"/>
+              </w:rPr>
+            </w:pPr>
+            <w:r>
               <w:rPr>
                 <w:rFonts w:eastAsia="arial" w:ascii="arial" w:hAnsi="arial"/>
                 <w:color w:val="000000"/>
@@ -41990,70 +44226,7 @@
                 <w:sz w:val="16"/>
                 <w:szCs w:val="16"/>
               </w:rPr>
-              <w:t>Off</w:t>
-            </w:r>
-          </w:p>
-        </w:tc>
-        <w:tc>
-          <w:tcPr>
-            <w:tcW w:w="1016" w:type="dxa"/>
-            <w:tcBorders>
-              <w:top w:val="single" w:sz="4" w:space="0" w:color="000000"/>
-              <w:left w:val="single" w:sz="4" w:space="0" w:color="000000"/>
-              <w:bottom w:val="single" w:sz="4" w:space="0" w:color="000000"/>
-            </w:tcBorders>
-            <w:vAlign w:val="bottom"/>
-          </w:tcPr>
-          <w:p>
-            <w:pPr>
-              <w:pStyle w:val="Normal"/>
-              <w:widowControl w:val="false"/>
-              <w:spacing w:lineRule="auto" w:line="180"/>
-              <w:jc w:val="center"/>
-              <w:rPr>
-                <w:sz w:val="16"/>
-                <w:szCs w:val="16"/>
-              </w:rPr>
-            </w:pPr>
-            <w:r>
-              <w:rPr>
-                <w:rFonts w:eastAsia="arial" w:ascii="arial" w:hAnsi="arial"/>
-                <w:color w:val="000000"/>
-                <w:sz w:val="16"/>
-                <w:szCs w:val="16"/>
-              </w:rPr>
-              <w:t>Uncouple</w:t>
-            </w:r>
-          </w:p>
-        </w:tc>
-        <w:tc>
-          <w:tcPr>
-            <w:tcW w:w="1016" w:type="dxa"/>
-            <w:tcBorders>
-              <w:top w:val="single" w:sz="4" w:space="0" w:color="000000"/>
-              <w:left w:val="single" w:sz="4" w:space="0" w:color="000000"/>
-              <w:bottom w:val="single" w:sz="4" w:space="0" w:color="000000"/>
-            </w:tcBorders>
-            <w:vAlign w:val="bottom"/>
-          </w:tcPr>
-          <w:p>
-            <w:pPr>
-              <w:pStyle w:val="Normal"/>
-              <w:widowControl w:val="false"/>
-              <w:jc w:val="center"/>
-              <w:rPr>
-                <w:color w:val="000000"/>
-                <w:sz w:val="16"/>
-                <w:szCs w:val="16"/>
-              </w:rPr>
-            </w:pPr>
-            <w:r>
-              <w:rPr>
-                <w:color w:val="000000"/>
-                <w:sz w:val="16"/>
-                <w:szCs w:val="16"/>
-              </w:rPr>
-              <w:t>Handbrake Off</w:t>
+              <w:t>Spot</w:t>
             </w:r>
           </w:p>
         </w:tc>
@@ -43204,12 +45377,12 @@
       <w:rFonts w:ascii="Symbol" w:hAnsi="Symbol" w:cs="Symbol"/>
     </w:rPr>
   </w:style>
-  <w:style w:type="character" w:styleId="Style5" w:customStyle="1">
-    <w:name w:val="번호 매기기 기호"/>
+  <w:style w:type="character" w:styleId="user" w:customStyle="1">
+    <w:name w:val="번호 매기기 기호 (user)"/>
     <w:qFormat/>
     <w:rPr/>
   </w:style>
-  <w:style w:type="paragraph" w:styleId="Style6">
+  <w:style w:type="paragraph" w:styleId="Style5">
     <w:name w:val="제목"/>
     <w:basedOn w:val="Normal"/>
     <w:next w:val="BodyText"/>
@@ -43219,7 +45392,7 @@
       <w:spacing w:before="240" w:after="120"/>
     </w:pPr>
     <w:rPr>
-      <w:rFonts w:ascii="Liberation Sans" w:hAnsi="Liberation Sans" w:eastAsia="나눔고딕" w:cs="Arial"/>
+      <w:rFonts w:ascii="Liberation Sans" w:hAnsi="Liberation Sans" w:eastAsia="Noto Sans CJK KR" w:cs="Lohit Devanagari"/>
       <w:sz w:val="28"/>
       <w:szCs w:val="28"/>
     </w:rPr>
@@ -43256,7 +45429,7 @@
       <w:szCs w:val="24"/>
     </w:rPr>
   </w:style>
-  <w:style w:type="paragraph" w:styleId="Style7">
+  <w:style w:type="paragraph" w:styleId="Style6" w:customStyle="1">
     <w:name w:val="색인"/>
     <w:basedOn w:val="Normal"/>
     <w:qFormat/>
@@ -43264,11 +45437,10 @@
       <w:suppressLineNumbers/>
     </w:pPr>
     <w:rPr>
-      <w:rFonts w:cs="Arial"/>
-      <w:sz w:val="24"/>
+      <w:rFonts w:cs="Lohit Devanagari"/>
     </w:rPr>
   </w:style>
-  <w:style w:type="paragraph" w:styleId="user">
+  <w:style w:type="paragraph" w:styleId="user1">
     <w:name w:val="제목 (user)"/>
     <w:basedOn w:val="Normal"/>
     <w:next w:val="BodyText"/>
@@ -43278,12 +45450,12 @@
       <w:spacing w:before="240" w:after="120"/>
     </w:pPr>
     <w:rPr>
-      <w:rFonts w:ascii="Liberation Sans" w:hAnsi="Liberation Sans" w:eastAsia="Noto Sans CJK KR" w:cs="Lohit Devanagari"/>
+      <w:rFonts w:ascii="Liberation Sans" w:hAnsi="Liberation Sans" w:eastAsia="나눔고딕" w:cs="Arial"/>
       <w:sz w:val="28"/>
       <w:szCs w:val="28"/>
     </w:rPr>
   </w:style>
-  <w:style w:type="paragraph" w:styleId="user1" w:customStyle="1">
+  <w:style w:type="paragraph" w:styleId="user2">
     <w:name w:val="색인 (user)"/>
     <w:basedOn w:val="Normal"/>
     <w:qFormat/>
@@ -43291,7 +45463,8 @@
       <w:suppressLineNumbers/>
     </w:pPr>
     <w:rPr>
-      <w:rFonts w:cs="Lohit Devanagari"/>
+      <w:rFonts w:cs="Arial"/>
+      <w:sz w:val="24"/>
     </w:rPr>
   </w:style>
   <w:style w:type="paragraph" w:styleId="Title">
@@ -43973,8 +46146,8 @@
       <w:szCs w:val="24"/>
     </w:rPr>
   </w:style>
-  <w:style w:type="paragraph" w:styleId="user2" w:customStyle="1">
-    <w:name w:val="표 내용 (user)"/>
+  <w:style w:type="paragraph" w:styleId="Style7" w:customStyle="1">
+    <w:name w:val="표 내용"/>
     <w:basedOn w:val="Normal"/>
     <w:qFormat/>
     <w:pPr>
@@ -43982,9 +46155,9 @@
     </w:pPr>
     <w:rPr/>
   </w:style>
-  <w:style w:type="paragraph" w:styleId="user3" w:customStyle="1">
-    <w:name w:val="표제목 (user)"/>
-    <w:basedOn w:val="user2"/>
+  <w:style w:type="paragraph" w:styleId="Style8" w:customStyle="1">
+    <w:name w:val="표제목"/>
+    <w:basedOn w:val="Style7"/>
     <w:qFormat/>
     <w:pPr>
       <w:jc w:val="center"/>
@@ -43994,8 +46167,8 @@
       <w:bCs/>
     </w:rPr>
   </w:style>
-  <w:style w:type="paragraph" w:styleId="Style8">
-    <w:name w:val="표 내용"/>
+  <w:style w:type="paragraph" w:styleId="user3">
+    <w:name w:val="표 내용 (user)"/>
     <w:basedOn w:val="Normal"/>
     <w:qFormat/>
     <w:pPr>
@@ -44004,9 +46177,9 @@
     </w:pPr>
     <w:rPr/>
   </w:style>
-  <w:style w:type="paragraph" w:styleId="Style9">
-    <w:name w:val="표제목"/>
-    <w:basedOn w:val="Style8"/>
+  <w:style w:type="paragraph" w:styleId="user4">
+    <w:name w:val="표제목 (user)"/>
+    <w:basedOn w:val="user3"/>
     <w:qFormat/>
     <w:pPr>
       <w:suppressLineNumbers/>

</xml_diff>

<commit_message>
Add Class 710, 801 and 802
</commit_message>
<xml_diff>
--- a/raildriver-UK-Remapped.docx
+++ b/raildriver-UK-Remapped.docx
@@ -42130,25 +42130,7 @@
           <w:szCs w:val="16"/>
         </w:rPr>
         <w:tab/>
-        <w:t xml:space="preserve">           Class 48</w:t>
-      </w:r>
-      <w:r>
-        <w:rPr>
-          <w:rFonts w:eastAsia="arial" w:ascii="arial" w:hAnsi="arial"/>
-          <w:color w:val="000000"/>
-          <w:sz w:val="16"/>
-          <w:szCs w:val="16"/>
-        </w:rPr>
-        <w:t>4</w:t>
-      </w:r>
-      <w:r>
-        <w:rPr>
-          <w:rFonts w:eastAsia="arial" w:ascii="arial" w:hAnsi="arial"/>
-          <w:color w:val="000000"/>
-          <w:sz w:val="16"/>
-          <w:szCs w:val="16"/>
-        </w:rPr>
-        <w:t>-1</w:t>
+        <w:t xml:space="preserve">           Class 484-1</w:t>
       </w:r>
     </w:p>
     <w:tbl>
@@ -42459,7 +42441,11 @@
               </w:rPr>
             </w:pPr>
             <w:r>
-              <w:rPr/>
+              <w:rPr>
+                <w:color w:val="000000"/>
+                <w:sz w:val="16"/>
+                <w:szCs w:val="16"/>
+              </w:rPr>
             </w:r>
           </w:p>
         </w:tc>
@@ -42683,25 +42669,7 @@
           <w:szCs w:val="16"/>
         </w:rPr>
         <w:tab/>
-        <w:t xml:space="preserve">           Class 48</w:t>
-      </w:r>
-      <w:r>
-        <w:rPr>
-          <w:rFonts w:eastAsia="arial" w:ascii="arial" w:hAnsi="arial"/>
-          <w:color w:val="000000"/>
-          <w:sz w:val="16"/>
-          <w:szCs w:val="16"/>
-        </w:rPr>
-        <w:t>4</w:t>
-      </w:r>
-      <w:r>
-        <w:rPr>
-          <w:rFonts w:eastAsia="arial" w:ascii="arial" w:hAnsi="arial"/>
-          <w:color w:val="000000"/>
-          <w:sz w:val="16"/>
-          <w:szCs w:val="16"/>
-        </w:rPr>
-        <w:t>-2</w:t>
+        <w:t xml:space="preserve">           Class 484-2</w:t>
       </w:r>
     </w:p>
     <w:tbl>
@@ -43010,7 +42978,11 @@
               </w:rPr>
             </w:pPr>
             <w:r>
-              <w:rPr/>
+              <w:rPr>
+                <w:color w:val="000000"/>
+                <w:sz w:val="16"/>
+                <w:szCs w:val="16"/>
+              </w:rPr>
             </w:r>
           </w:p>
         </w:tc>
@@ -43253,25 +43225,7 @@
           <w:szCs w:val="16"/>
         </w:rPr>
         <w:tab/>
-        <w:t xml:space="preserve">           Class </w:t>
-      </w:r>
-      <w:r>
-        <w:rPr>
-          <w:rFonts w:eastAsia="arial" w:ascii="arial" w:hAnsi="arial"/>
-          <w:color w:val="000000"/>
-          <w:sz w:val="16"/>
-          <w:szCs w:val="16"/>
-        </w:rPr>
-        <w:t>700</w:t>
-      </w:r>
-      <w:r>
-        <w:rPr>
-          <w:rFonts w:eastAsia="arial" w:ascii="arial" w:hAnsi="arial"/>
-          <w:color w:val="000000"/>
-          <w:sz w:val="16"/>
-          <w:szCs w:val="16"/>
-        </w:rPr>
-        <w:t>-1</w:t>
+        <w:t xml:space="preserve">           Class 700-1</w:t>
       </w:r>
     </w:p>
     <w:tbl>
@@ -43582,7 +43536,11 @@
               </w:rPr>
             </w:pPr>
             <w:r>
-              <w:rPr/>
+              <w:rPr>
+                <w:color w:val="000000"/>
+                <w:sz w:val="16"/>
+                <w:szCs w:val="16"/>
+              </w:rPr>
             </w:r>
           </w:p>
         </w:tc>
@@ -43678,16 +43636,7 @@
                 <w:sz w:val="16"/>
                 <w:szCs w:val="16"/>
               </w:rPr>
-              <w:t xml:space="preserve">Cab Light </w:t>
-            </w:r>
-            <w:r>
-              <w:rPr>
-                <w:rFonts w:eastAsia="arial" w:ascii="arial" w:hAnsi="arial"/>
-                <w:color w:val="000000"/>
-                <w:sz w:val="16"/>
-                <w:szCs w:val="16"/>
-              </w:rPr>
-              <w:t>Main</w:t>
+              <w:t>Cab Light Main</w:t>
             </w:r>
           </w:p>
         </w:tc>
@@ -43815,25 +43764,7 @@
           <w:szCs w:val="16"/>
         </w:rPr>
         <w:tab/>
-        <w:t xml:space="preserve">           Class </w:t>
-      </w:r>
-      <w:r>
-        <w:rPr>
-          <w:rFonts w:eastAsia="arial" w:ascii="arial" w:hAnsi="arial"/>
-          <w:color w:val="000000"/>
-          <w:sz w:val="16"/>
-          <w:szCs w:val="16"/>
-        </w:rPr>
-        <w:t>700</w:t>
-      </w:r>
-      <w:r>
-        <w:rPr>
-          <w:rFonts w:eastAsia="arial" w:ascii="arial" w:hAnsi="arial"/>
-          <w:color w:val="000000"/>
-          <w:sz w:val="16"/>
-          <w:szCs w:val="16"/>
-        </w:rPr>
-        <w:t>-2</w:t>
+        <w:t xml:space="preserve">           Class 700-2</w:t>
       </w:r>
     </w:p>
     <w:tbl>
@@ -44023,34 +43954,42 @@
               </w:rPr>
             </w:pPr>
             <w:r>
-              <w:rPr/>
-            </w:r>
-          </w:p>
-        </w:tc>
-        <w:tc>
-          <w:tcPr>
-            <w:tcW w:w="1016" w:type="dxa"/>
-            <w:tcBorders>
-              <w:top w:val="single" w:sz="4" w:space="0" w:color="000000"/>
-              <w:left w:val="single" w:sz="4" w:space="0" w:color="000000"/>
-              <w:bottom w:val="single" w:sz="4" w:space="0" w:color="000000"/>
-            </w:tcBorders>
-            <w:vAlign w:val="bottom"/>
-          </w:tcPr>
-          <w:p>
-            <w:pPr>
-              <w:pStyle w:val="Normal"/>
-              <w:widowControl w:val="false"/>
-              <w:spacing w:lineRule="auto" w:line="180"/>
-              <w:jc w:val="center"/>
-              <w:rPr>
-                <w:color w:val="000000"/>
-                <w:sz w:val="16"/>
-                <w:szCs w:val="16"/>
-              </w:rPr>
-            </w:pPr>
-            <w:r>
-              <w:rPr/>
+              <w:rPr>
+                <w:color w:val="000000"/>
+                <w:sz w:val="16"/>
+                <w:szCs w:val="16"/>
+              </w:rPr>
+            </w:r>
+          </w:p>
+        </w:tc>
+        <w:tc>
+          <w:tcPr>
+            <w:tcW w:w="1016" w:type="dxa"/>
+            <w:tcBorders>
+              <w:top w:val="single" w:sz="4" w:space="0" w:color="000000"/>
+              <w:left w:val="single" w:sz="4" w:space="0" w:color="000000"/>
+              <w:bottom w:val="single" w:sz="4" w:space="0" w:color="000000"/>
+            </w:tcBorders>
+            <w:vAlign w:val="bottom"/>
+          </w:tcPr>
+          <w:p>
+            <w:pPr>
+              <w:pStyle w:val="Normal"/>
+              <w:widowControl w:val="false"/>
+              <w:spacing w:lineRule="auto" w:line="180"/>
+              <w:jc w:val="center"/>
+              <w:rPr>
+                <w:color w:val="000000"/>
+                <w:sz w:val="16"/>
+                <w:szCs w:val="16"/>
+              </w:rPr>
+            </w:pPr>
+            <w:r>
+              <w:rPr>
+                <w:color w:val="000000"/>
+                <w:sz w:val="16"/>
+                <w:szCs w:val="16"/>
+              </w:rPr>
             </w:r>
           </w:p>
         </w:tc>
@@ -44133,7 +44072,11 @@
               </w:rPr>
             </w:pPr>
             <w:r>
-              <w:rPr/>
+              <w:rPr>
+                <w:color w:val="000000"/>
+                <w:sz w:val="16"/>
+                <w:szCs w:val="16"/>
+              </w:rPr>
             </w:r>
           </w:p>
         </w:tc>
@@ -44159,74 +44102,3426 @@
               </w:rPr>
             </w:pPr>
             <w:r>
-              <w:rPr/>
-            </w:r>
-          </w:p>
-        </w:tc>
-        <w:tc>
-          <w:tcPr>
-            <w:tcW w:w="1016" w:type="dxa"/>
-            <w:tcBorders>
-              <w:top w:val="single" w:sz="4" w:space="0" w:color="000000"/>
-              <w:left w:val="single" w:sz="4" w:space="0" w:color="000000"/>
-              <w:bottom w:val="single" w:sz="4" w:space="0" w:color="000000"/>
-            </w:tcBorders>
-            <w:vAlign w:val="bottom"/>
-          </w:tcPr>
-          <w:p>
-            <w:pPr>
-              <w:pStyle w:val="Normal"/>
-              <w:widowControl w:val="false"/>
-              <w:spacing w:lineRule="auto" w:line="180"/>
-              <w:jc w:val="center"/>
-              <w:rPr>
-                <w:sz w:val="16"/>
-                <w:szCs w:val="16"/>
-              </w:rPr>
-            </w:pPr>
-            <w:r>
-              <w:rPr/>
-            </w:r>
-          </w:p>
-        </w:tc>
-        <w:tc>
-          <w:tcPr>
-            <w:tcW w:w="1016" w:type="dxa"/>
-            <w:tcBorders>
-              <w:top w:val="single" w:sz="4" w:space="0" w:color="000000"/>
-              <w:left w:val="single" w:sz="4" w:space="0" w:color="000000"/>
-              <w:bottom w:val="single" w:sz="4" w:space="0" w:color="000000"/>
-            </w:tcBorders>
-            <w:vAlign w:val="bottom"/>
-          </w:tcPr>
-          <w:p>
-            <w:pPr>
-              <w:pStyle w:val="Normal"/>
-              <w:widowControl w:val="false"/>
-              <w:spacing w:lineRule="auto" w:line="180"/>
-              <w:jc w:val="center"/>
-              <w:rPr>
-                <w:sz w:val="16"/>
-                <w:szCs w:val="16"/>
-              </w:rPr>
-            </w:pPr>
-            <w:r>
-              <w:rPr>
-                <w:rFonts w:eastAsia="arial" w:ascii="arial" w:hAnsi="arial"/>
-                <w:color w:val="000000"/>
-                <w:sz w:val="16"/>
-                <w:szCs w:val="16"/>
-              </w:rPr>
-              <w:t xml:space="preserve">Cab Light </w:t>
-            </w:r>
-            <w:r>
-              <w:rPr>
-                <w:rFonts w:eastAsia="arial" w:ascii="arial" w:hAnsi="arial"/>
-                <w:color w:val="000000"/>
-                <w:sz w:val="16"/>
-                <w:szCs w:val="16"/>
-              </w:rPr>
-              <w:t>Spot</w:t>
+              <w:rPr>
+                <w:sz w:val="16"/>
+                <w:szCs w:val="16"/>
+              </w:rPr>
+            </w:r>
+          </w:p>
+        </w:tc>
+        <w:tc>
+          <w:tcPr>
+            <w:tcW w:w="1016" w:type="dxa"/>
+            <w:tcBorders>
+              <w:top w:val="single" w:sz="4" w:space="0" w:color="000000"/>
+              <w:left w:val="single" w:sz="4" w:space="0" w:color="000000"/>
+              <w:bottom w:val="single" w:sz="4" w:space="0" w:color="000000"/>
+            </w:tcBorders>
+            <w:vAlign w:val="bottom"/>
+          </w:tcPr>
+          <w:p>
+            <w:pPr>
+              <w:pStyle w:val="Normal"/>
+              <w:widowControl w:val="false"/>
+              <w:spacing w:lineRule="auto" w:line="180"/>
+              <w:jc w:val="center"/>
+              <w:rPr>
+                <w:sz w:val="16"/>
+                <w:szCs w:val="16"/>
+              </w:rPr>
+            </w:pPr>
+            <w:r>
+              <w:rPr>
+                <w:sz w:val="16"/>
+                <w:szCs w:val="16"/>
+              </w:rPr>
+            </w:r>
+          </w:p>
+        </w:tc>
+        <w:tc>
+          <w:tcPr>
+            <w:tcW w:w="1016" w:type="dxa"/>
+            <w:tcBorders>
+              <w:top w:val="single" w:sz="4" w:space="0" w:color="000000"/>
+              <w:left w:val="single" w:sz="4" w:space="0" w:color="000000"/>
+              <w:bottom w:val="single" w:sz="4" w:space="0" w:color="000000"/>
+            </w:tcBorders>
+            <w:vAlign w:val="bottom"/>
+          </w:tcPr>
+          <w:p>
+            <w:pPr>
+              <w:pStyle w:val="Normal"/>
+              <w:widowControl w:val="false"/>
+              <w:spacing w:lineRule="auto" w:line="180"/>
+              <w:jc w:val="center"/>
+              <w:rPr>
+                <w:sz w:val="16"/>
+                <w:szCs w:val="16"/>
+              </w:rPr>
+            </w:pPr>
+            <w:r>
+              <w:rPr>
+                <w:rFonts w:eastAsia="arial" w:ascii="arial" w:hAnsi="arial"/>
+                <w:color w:val="000000"/>
+                <w:sz w:val="16"/>
+                <w:szCs w:val="16"/>
+              </w:rPr>
+              <w:t>Cab Light Spot</w:t>
+            </w:r>
+          </w:p>
+        </w:tc>
+        <w:tc>
+          <w:tcPr>
+            <w:tcW w:w="1016" w:type="dxa"/>
+            <w:tcBorders>
+              <w:top w:val="single" w:sz="4" w:space="0" w:color="000000"/>
+              <w:left w:val="single" w:sz="4" w:space="0" w:color="000000"/>
+              <w:bottom w:val="single" w:sz="4" w:space="0" w:color="000000"/>
+            </w:tcBorders>
+            <w:vAlign w:val="bottom"/>
+          </w:tcPr>
+          <w:p>
+            <w:pPr>
+              <w:pStyle w:val="Normal"/>
+              <w:widowControl w:val="false"/>
+              <w:spacing w:lineRule="auto" w:line="180"/>
+              <w:jc w:val="center"/>
+              <w:rPr>
+                <w:sz w:val="16"/>
+                <w:szCs w:val="16"/>
+              </w:rPr>
+            </w:pPr>
+            <w:r>
+              <w:rPr>
+                <w:rFonts w:eastAsia="arial" w:ascii="arial" w:hAnsi="arial"/>
+                <w:color w:val="000000"/>
+                <w:sz w:val="16"/>
+                <w:szCs w:val="16"/>
+              </w:rPr>
+              <w:t>Exterior</w:t>
+            </w:r>
+          </w:p>
+          <w:p>
+            <w:pPr>
+              <w:pStyle w:val="Normal"/>
+              <w:widowControl w:val="false"/>
+              <w:spacing w:lineRule="auto" w:line="180"/>
+              <w:jc w:val="center"/>
+              <w:rPr>
+                <w:sz w:val="16"/>
+                <w:szCs w:val="16"/>
+              </w:rPr>
+            </w:pPr>
+            <w:r>
+              <w:rPr>
+                <w:rFonts w:eastAsia="arial" w:ascii="arial" w:hAnsi="arial"/>
+                <w:color w:val="000000"/>
+                <w:sz w:val="16"/>
+                <w:szCs w:val="16"/>
+              </w:rPr>
+              <w:t>Camera</w:t>
+            </w:r>
+          </w:p>
+        </w:tc>
+        <w:tc>
+          <w:tcPr>
+            <w:tcW w:w="1029" w:type="dxa"/>
+            <w:tcBorders>
+              <w:top w:val="single" w:sz="4" w:space="0" w:color="000000"/>
+              <w:left w:val="single" w:sz="4" w:space="0" w:color="000000"/>
+              <w:bottom w:val="single" w:sz="4" w:space="0" w:color="000000"/>
+              <w:right w:val="single" w:sz="4" w:space="0" w:color="000000"/>
+            </w:tcBorders>
+            <w:vAlign w:val="bottom"/>
+          </w:tcPr>
+          <w:p>
+            <w:pPr>
+              <w:pStyle w:val="Normal"/>
+              <w:widowControl w:val="false"/>
+              <w:spacing w:lineRule="auto" w:line="180"/>
+              <w:jc w:val="center"/>
+              <w:rPr>
+                <w:sz w:val="16"/>
+                <w:szCs w:val="16"/>
+              </w:rPr>
+            </w:pPr>
+            <w:r>
+              <w:rPr>
+                <w:rFonts w:eastAsia="arial" w:ascii="arial" w:hAnsi="arial"/>
+                <w:color w:val="000000"/>
+                <w:sz w:val="16"/>
+                <w:szCs w:val="16"/>
+              </w:rPr>
+              <w:t>Prev</w:t>
+            </w:r>
+          </w:p>
+          <w:p>
+            <w:pPr>
+              <w:pStyle w:val="Normal"/>
+              <w:widowControl w:val="false"/>
+              <w:spacing w:lineRule="auto" w:line="180"/>
+              <w:jc w:val="center"/>
+              <w:rPr>
+                <w:sz w:val="16"/>
+                <w:szCs w:val="16"/>
+              </w:rPr>
+            </w:pPr>
+            <w:r>
+              <w:rPr>
+                <w:rFonts w:eastAsia="arial" w:ascii="arial" w:hAnsi="arial"/>
+                <w:color w:val="000000"/>
+                <w:sz w:val="16"/>
+                <w:szCs w:val="16"/>
+              </w:rPr>
+              <w:t>Cab Cam</w:t>
+            </w:r>
+          </w:p>
+        </w:tc>
+      </w:tr>
+    </w:tbl>
+    <w:p>
+      <w:pPr>
+        <w:pStyle w:val="Normal"/>
+        <w:rPr>
+          <w:color w:val="000000"/>
+          <w:sz w:val="16"/>
+          <w:szCs w:val="16"/>
+        </w:rPr>
+      </w:pPr>
+      <w:r>
+        <w:rPr>
+          <w:color w:val="000000"/>
+          <w:sz w:val="16"/>
+          <w:szCs w:val="16"/>
+        </w:rPr>
+      </w:r>
+    </w:p>
+    <w:p>
+      <w:pPr>
+        <w:pStyle w:val="Normal"/>
+        <w:rPr>
+          <w:color w:val="000000"/>
+          <w:sz w:val="16"/>
+          <w:szCs w:val="16"/>
+        </w:rPr>
+      </w:pPr>
+      <w:r>
+        <w:rPr>
+          <w:rFonts w:eastAsia="arial" w:ascii="arial" w:hAnsi="arial"/>
+          <w:color w:val="000000"/>
+          <w:sz w:val="16"/>
+          <w:szCs w:val="16"/>
+        </w:rPr>
+        <w:tab/>
+        <w:t xml:space="preserve">           Class 710-1</w:t>
+      </w:r>
+    </w:p>
+    <w:tbl>
+      <w:tblPr>
+        <w:tblW w:w="14248" w:type="dxa"/>
+        <w:jc w:val="left"/>
+        <w:tblInd w:w="-5" w:type="dxa"/>
+        <w:tblLayout w:type="fixed"/>
+        <w:tblCellMar>
+          <w:top w:w="0" w:type="dxa"/>
+          <w:left w:w="108" w:type="dxa"/>
+          <w:bottom w:w="0" w:type="dxa"/>
+          <w:right w:w="108" w:type="dxa"/>
+        </w:tblCellMar>
+        <w:tblLook w:firstRow="1" w:noVBand="1" w:lastRow="0" w:firstColumn="1" w:lastColumn="0" w:noHBand="0" w:val="04a0"/>
+      </w:tblPr>
+      <w:tblGrid>
+        <w:gridCol w:w="1017"/>
+        <w:gridCol w:w="1019"/>
+        <w:gridCol w:w="1014"/>
+        <w:gridCol w:w="1016"/>
+        <w:gridCol w:w="1020"/>
+        <w:gridCol w:w="1016"/>
+        <w:gridCol w:w="1016"/>
+        <w:gridCol w:w="1017"/>
+        <w:gridCol w:w="1016"/>
+        <w:gridCol w:w="1020"/>
+        <w:gridCol w:w="1016"/>
+        <w:gridCol w:w="1016"/>
+        <w:gridCol w:w="1016"/>
+        <w:gridCol w:w="1029"/>
+      </w:tblGrid>
+      <w:tr>
+        <w:trPr>
+          <w:trHeight w:val="440" w:hRule="exact"/>
+          <w:cantSplit w:val="true"/>
+        </w:trPr>
+        <w:tc>
+          <w:tcPr>
+            <w:tcW w:w="1017" w:type="dxa"/>
+            <w:tcBorders>
+              <w:top w:val="single" w:sz="4" w:space="0" w:color="000000"/>
+              <w:left w:val="single" w:sz="4" w:space="0" w:color="000000"/>
+              <w:bottom w:val="single" w:sz="4" w:space="0" w:color="000000"/>
+            </w:tcBorders>
+            <w:vAlign w:val="bottom"/>
+          </w:tcPr>
+          <w:p>
+            <w:pPr>
+              <w:pStyle w:val="Normal"/>
+              <w:widowControl w:val="false"/>
+              <w:spacing w:lineRule="auto" w:line="180" w:before="0" w:after="60"/>
+              <w:jc w:val="center"/>
+              <w:rPr>
+                <w:color w:val="000000"/>
+                <w:sz w:val="16"/>
+                <w:szCs w:val="16"/>
+              </w:rPr>
+            </w:pPr>
+            <w:r>
+              <w:rPr>
+                <w:rFonts w:eastAsia="arial" w:ascii="arial" w:hAnsi="arial"/>
+                <w:b/>
+                <w:color w:val="000000"/>
+                <w:sz w:val="16"/>
+                <w:szCs w:val="16"/>
+              </w:rPr>
+              <w:t>Pause</w:t>
+            </w:r>
+          </w:p>
+        </w:tc>
+        <w:tc>
+          <w:tcPr>
+            <w:tcW w:w="1019" w:type="dxa"/>
+            <w:tcBorders>
+              <w:top w:val="single" w:sz="4" w:space="0" w:color="000000"/>
+              <w:left w:val="single" w:sz="4" w:space="0" w:color="000000"/>
+              <w:bottom w:val="single" w:sz="4" w:space="0" w:color="000000"/>
+            </w:tcBorders>
+            <w:vAlign w:val="bottom"/>
+          </w:tcPr>
+          <w:p>
+            <w:pPr>
+              <w:pStyle w:val="Normal"/>
+              <w:widowControl w:val="false"/>
+              <w:spacing w:lineRule="auto" w:line="180"/>
+              <w:jc w:val="center"/>
+              <w:rPr>
+                <w:color w:val="000000"/>
+                <w:sz w:val="16"/>
+                <w:szCs w:val="16"/>
+              </w:rPr>
+            </w:pPr>
+            <w:r>
+              <w:rPr>
+                <w:color w:val="000000"/>
+                <w:sz w:val="16"/>
+                <w:szCs w:val="16"/>
+              </w:rPr>
+              <w:t>Master Key</w:t>
+            </w:r>
+          </w:p>
+        </w:tc>
+        <w:tc>
+          <w:tcPr>
+            <w:tcW w:w="1014" w:type="dxa"/>
+            <w:tcBorders>
+              <w:top w:val="single" w:sz="4" w:space="0" w:color="000000"/>
+              <w:left w:val="single" w:sz="4" w:space="0" w:color="000000"/>
+              <w:bottom w:val="single" w:sz="4" w:space="0" w:color="000000"/>
+            </w:tcBorders>
+            <w:vAlign w:val="bottom"/>
+          </w:tcPr>
+          <w:p>
+            <w:pPr>
+              <w:pStyle w:val="Normal"/>
+              <w:widowControl w:val="false"/>
+              <w:spacing w:lineRule="auto" w:line="180"/>
+              <w:jc w:val="center"/>
+              <w:rPr>
+                <w:color w:val="000000"/>
+                <w:sz w:val="16"/>
+                <w:szCs w:val="16"/>
+              </w:rPr>
+            </w:pPr>
+            <w:r>
+              <w:rPr>
+                <w:color w:val="000000"/>
+                <w:sz w:val="16"/>
+                <w:szCs w:val="16"/>
+              </w:rPr>
+              <w:t>Aux On</w:t>
+            </w:r>
+          </w:p>
+        </w:tc>
+        <w:tc>
+          <w:tcPr>
+            <w:tcW w:w="1016" w:type="dxa"/>
+            <w:tcBorders>
+              <w:top w:val="single" w:sz="4" w:space="0" w:color="000000"/>
+              <w:left w:val="single" w:sz="4" w:space="0" w:color="000000"/>
+              <w:bottom w:val="single" w:sz="4" w:space="0" w:color="000000"/>
+            </w:tcBorders>
+            <w:vAlign w:val="bottom"/>
+          </w:tcPr>
+          <w:p>
+            <w:pPr>
+              <w:pStyle w:val="Normal"/>
+              <w:widowControl w:val="false"/>
+              <w:spacing w:lineRule="auto" w:line="180"/>
+              <w:jc w:val="center"/>
+              <w:rPr>
+                <w:color w:val="000000"/>
+                <w:sz w:val="16"/>
+                <w:szCs w:val="16"/>
+              </w:rPr>
+            </w:pPr>
+            <w:r>
+              <w:rPr>
+                <w:color w:val="000000"/>
+                <w:sz w:val="16"/>
+                <w:szCs w:val="16"/>
+              </w:rPr>
+              <w:t>AWS/TPWS</w:t>
+            </w:r>
+          </w:p>
+        </w:tc>
+        <w:tc>
+          <w:tcPr>
+            <w:tcW w:w="1020" w:type="dxa"/>
+            <w:tcBorders>
+              <w:top w:val="single" w:sz="4" w:space="0" w:color="000000"/>
+              <w:left w:val="single" w:sz="4" w:space="0" w:color="000000"/>
+              <w:bottom w:val="single" w:sz="4" w:space="0" w:color="000000"/>
+            </w:tcBorders>
+            <w:vAlign w:val="bottom"/>
+          </w:tcPr>
+          <w:p>
+            <w:pPr>
+              <w:pStyle w:val="Normal"/>
+              <w:widowControl w:val="false"/>
+              <w:spacing w:lineRule="auto" w:line="180"/>
+              <w:jc w:val="center"/>
+              <w:rPr>
+                <w:color w:val="000000"/>
+                <w:sz w:val="16"/>
+                <w:szCs w:val="16"/>
+              </w:rPr>
+            </w:pPr>
+            <w:r>
+              <w:rPr>
+                <w:color w:val="000000"/>
+                <w:sz w:val="16"/>
+                <w:szCs w:val="16"/>
+              </w:rPr>
+              <w:t>Pan Up</w:t>
+            </w:r>
+          </w:p>
+          <w:p>
+            <w:pPr>
+              <w:pStyle w:val="Normal"/>
+              <w:widowControl w:val="false"/>
+              <w:spacing w:lineRule="auto" w:line="180"/>
+              <w:jc w:val="center"/>
+              <w:rPr>
+                <w:color w:val="000000"/>
+                <w:sz w:val="16"/>
+                <w:szCs w:val="16"/>
+              </w:rPr>
+            </w:pPr>
+            <w:r>
+              <w:rPr>
+                <w:color w:val="000000"/>
+                <w:sz w:val="16"/>
+                <w:szCs w:val="16"/>
+              </w:rPr>
+              <w:t>/Shoes Dw</w:t>
+            </w:r>
+          </w:p>
+        </w:tc>
+        <w:tc>
+          <w:tcPr>
+            <w:tcW w:w="1016" w:type="dxa"/>
+            <w:tcBorders>
+              <w:top w:val="single" w:sz="4" w:space="0" w:color="000000"/>
+              <w:left w:val="single" w:sz="4" w:space="0" w:color="000000"/>
+              <w:bottom w:val="single" w:sz="4" w:space="0" w:color="000000"/>
+            </w:tcBorders>
+            <w:vAlign w:val="bottom"/>
+          </w:tcPr>
+          <w:p>
+            <w:pPr>
+              <w:pStyle w:val="Normal"/>
+              <w:widowControl w:val="false"/>
+              <w:spacing w:lineRule="auto" w:line="180"/>
+              <w:jc w:val="center"/>
+              <w:rPr>
+                <w:color w:val="000000"/>
+                <w:sz w:val="16"/>
+                <w:szCs w:val="16"/>
+              </w:rPr>
+            </w:pPr>
+            <w:r>
+              <w:rPr>
+                <w:color w:val="000000"/>
+                <w:sz w:val="16"/>
+                <w:szCs w:val="16"/>
+              </w:rPr>
+              <w:t>DRA</w:t>
+            </w:r>
+          </w:p>
+        </w:tc>
+        <w:tc>
+          <w:tcPr>
+            <w:tcW w:w="1016" w:type="dxa"/>
+            <w:tcBorders>
+              <w:top w:val="single" w:sz="4" w:space="0" w:color="000000"/>
+              <w:left w:val="single" w:sz="4" w:space="0" w:color="000000"/>
+              <w:bottom w:val="single" w:sz="4" w:space="0" w:color="000000"/>
+            </w:tcBorders>
+            <w:vAlign w:val="bottom"/>
+          </w:tcPr>
+          <w:p>
+            <w:pPr>
+              <w:pStyle w:val="Normal"/>
+              <w:widowControl w:val="false"/>
+              <w:jc w:val="center"/>
+              <w:rPr>
+                <w:sz w:val="16"/>
+                <w:szCs w:val="16"/>
+              </w:rPr>
+            </w:pPr>
+            <w:r>
+              <w:rPr>
+                <w:sz w:val="16"/>
+                <w:szCs w:val="16"/>
+              </w:rPr>
+              <w:t>AC</w:t>
+            </w:r>
+          </w:p>
+        </w:tc>
+        <w:tc>
+          <w:tcPr>
+            <w:tcW w:w="1017" w:type="dxa"/>
+            <w:tcBorders>
+              <w:top w:val="single" w:sz="4" w:space="0" w:color="000000"/>
+              <w:left w:val="single" w:sz="4" w:space="0" w:color="000000"/>
+              <w:bottom w:val="single" w:sz="4" w:space="0" w:color="000000"/>
+            </w:tcBorders>
+            <w:vAlign w:val="bottom"/>
+          </w:tcPr>
+          <w:p>
+            <w:pPr>
+              <w:pStyle w:val="Normal"/>
+              <w:widowControl w:val="false"/>
+              <w:jc w:val="center"/>
+              <w:rPr>
+                <w:sz w:val="16"/>
+                <w:szCs w:val="16"/>
+              </w:rPr>
+            </w:pPr>
+            <w:r>
+              <w:rPr>
+                <w:sz w:val="16"/>
+                <w:szCs w:val="16"/>
+              </w:rPr>
+              <w:t>Sunblind Up</w:t>
+            </w:r>
+          </w:p>
+        </w:tc>
+        <w:tc>
+          <w:tcPr>
+            <w:tcW w:w="1016" w:type="dxa"/>
+            <w:tcBorders>
+              <w:top w:val="single" w:sz="4" w:space="0" w:color="000000"/>
+              <w:left w:val="single" w:sz="4" w:space="0" w:color="000000"/>
+              <w:bottom w:val="single" w:sz="4" w:space="0" w:color="000000"/>
+            </w:tcBorders>
+            <w:vAlign w:val="bottom"/>
+          </w:tcPr>
+          <w:p>
+            <w:pPr>
+              <w:pStyle w:val="Normal"/>
+              <w:widowControl w:val="false"/>
+              <w:jc w:val="center"/>
+              <w:rPr>
+                <w:color w:val="000000"/>
+                <w:sz w:val="16"/>
+                <w:szCs w:val="16"/>
+              </w:rPr>
+            </w:pPr>
+            <w:r>
+              <w:rPr>
+                <w:color w:val="000000"/>
+                <w:sz w:val="16"/>
+                <w:szCs w:val="16"/>
+              </w:rPr>
+              <w:t>Tail Light</w:t>
+            </w:r>
+          </w:p>
+        </w:tc>
+        <w:tc>
+          <w:tcPr>
+            <w:tcW w:w="1020" w:type="dxa"/>
+            <w:tcBorders>
+              <w:top w:val="single" w:sz="4" w:space="0" w:color="000000"/>
+              <w:left w:val="single" w:sz="4" w:space="0" w:color="000000"/>
+              <w:bottom w:val="single" w:sz="4" w:space="0" w:color="000000"/>
+            </w:tcBorders>
+            <w:vAlign w:val="bottom"/>
+          </w:tcPr>
+          <w:p>
+            <w:pPr>
+              <w:pStyle w:val="Normal"/>
+              <w:widowControl w:val="false"/>
+              <w:spacing w:lineRule="auto" w:line="180"/>
+              <w:jc w:val="center"/>
+              <w:rPr>
+                <w:sz w:val="16"/>
+                <w:szCs w:val="16"/>
+              </w:rPr>
+            </w:pPr>
+            <w:r>
+              <w:rPr>
+                <w:sz w:val="16"/>
+                <w:szCs w:val="16"/>
+              </w:rPr>
+            </w:r>
+          </w:p>
+        </w:tc>
+        <w:tc>
+          <w:tcPr>
+            <w:tcW w:w="1016" w:type="dxa"/>
+            <w:tcBorders>
+              <w:top w:val="single" w:sz="4" w:space="0" w:color="000000"/>
+              <w:left w:val="single" w:sz="4" w:space="0" w:color="000000"/>
+              <w:bottom w:val="single" w:sz="4" w:space="0" w:color="000000"/>
+            </w:tcBorders>
+            <w:vAlign w:val="bottom"/>
+          </w:tcPr>
+          <w:p>
+            <w:pPr>
+              <w:pStyle w:val="Normal"/>
+              <w:widowControl w:val="false"/>
+              <w:spacing w:lineRule="auto" w:line="180"/>
+              <w:jc w:val="center"/>
+              <w:rPr>
+                <w:sz w:val="16"/>
+                <w:szCs w:val="16"/>
+              </w:rPr>
+            </w:pPr>
+            <w:r>
+              <w:rPr>
+                <w:rFonts w:eastAsia="arial" w:ascii="arial" w:hAnsi="arial"/>
+                <w:color w:val="000000"/>
+                <w:sz w:val="16"/>
+                <w:szCs w:val="16"/>
+              </w:rPr>
+              <w:t>Cab Light On</w:t>
+            </w:r>
+          </w:p>
+        </w:tc>
+        <w:tc>
+          <w:tcPr>
+            <w:tcW w:w="1016" w:type="dxa"/>
+            <w:tcBorders>
+              <w:top w:val="single" w:sz="4" w:space="0" w:color="000000"/>
+              <w:left w:val="single" w:sz="4" w:space="0" w:color="000000"/>
+              <w:bottom w:val="single" w:sz="4" w:space="0" w:color="000000"/>
+            </w:tcBorders>
+            <w:vAlign w:val="bottom"/>
+          </w:tcPr>
+          <w:p>
+            <w:pPr>
+              <w:pStyle w:val="Normal"/>
+              <w:widowControl w:val="false"/>
+              <w:spacing w:lineRule="auto" w:line="180"/>
+              <w:jc w:val="center"/>
+              <w:rPr>
+                <w:sz w:val="16"/>
+                <w:szCs w:val="16"/>
+              </w:rPr>
+            </w:pPr>
+            <w:r>
+              <w:rPr>
+                <w:rFonts w:eastAsia="arial" w:ascii="arial" w:hAnsi="arial"/>
+                <w:color w:val="000000"/>
+                <w:sz w:val="16"/>
+                <w:szCs w:val="16"/>
+              </w:rPr>
+              <w:t>Couple</w:t>
+            </w:r>
+          </w:p>
+        </w:tc>
+        <w:tc>
+          <w:tcPr>
+            <w:tcW w:w="1016" w:type="dxa"/>
+            <w:tcBorders>
+              <w:top w:val="single" w:sz="4" w:space="0" w:color="000000"/>
+              <w:left w:val="single" w:sz="4" w:space="0" w:color="000000"/>
+              <w:bottom w:val="single" w:sz="4" w:space="0" w:color="000000"/>
+            </w:tcBorders>
+            <w:vAlign w:val="bottom"/>
+          </w:tcPr>
+          <w:p>
+            <w:pPr>
+              <w:pStyle w:val="Normal"/>
+              <w:widowControl w:val="false"/>
+              <w:spacing w:lineRule="auto" w:line="180"/>
+              <w:jc w:val="center"/>
+              <w:rPr>
+                <w:sz w:val="16"/>
+                <w:szCs w:val="16"/>
+              </w:rPr>
+            </w:pPr>
+            <w:r>
+              <w:rPr>
+                <w:rFonts w:eastAsia="arial" w:ascii="arial" w:hAnsi="arial"/>
+                <w:color w:val="000000"/>
+                <w:sz w:val="16"/>
+                <w:szCs w:val="16"/>
+              </w:rPr>
+              <w:t>1-Person</w:t>
+            </w:r>
+          </w:p>
+        </w:tc>
+        <w:tc>
+          <w:tcPr>
+            <w:tcW w:w="1029" w:type="dxa"/>
+            <w:tcBorders>
+              <w:top w:val="single" w:sz="4" w:space="0" w:color="000000"/>
+              <w:left w:val="single" w:sz="4" w:space="0" w:color="000000"/>
+              <w:bottom w:val="single" w:sz="4" w:space="0" w:color="000000"/>
+              <w:right w:val="single" w:sz="4" w:space="0" w:color="000000"/>
+            </w:tcBorders>
+            <w:vAlign w:val="bottom"/>
+          </w:tcPr>
+          <w:p>
+            <w:pPr>
+              <w:pStyle w:val="Normal"/>
+              <w:widowControl w:val="false"/>
+              <w:spacing w:lineRule="auto" w:line="180"/>
+              <w:jc w:val="center"/>
+              <w:rPr>
+                <w:sz w:val="16"/>
+                <w:szCs w:val="16"/>
+              </w:rPr>
+            </w:pPr>
+            <w:r>
+              <w:rPr>
+                <w:rFonts w:eastAsia="arial" w:ascii="arial" w:hAnsi="arial"/>
+                <w:color w:val="000000"/>
+                <w:sz w:val="16"/>
+                <w:szCs w:val="16"/>
+              </w:rPr>
+              <w:t>Next</w:t>
+            </w:r>
+          </w:p>
+          <w:p>
+            <w:pPr>
+              <w:pStyle w:val="Normal"/>
+              <w:widowControl w:val="false"/>
+              <w:spacing w:lineRule="auto" w:line="180"/>
+              <w:jc w:val="center"/>
+              <w:rPr>
+                <w:sz w:val="16"/>
+                <w:szCs w:val="16"/>
+              </w:rPr>
+            </w:pPr>
+            <w:r>
+              <w:rPr>
+                <w:rFonts w:eastAsia="arial" w:ascii="arial" w:hAnsi="arial"/>
+                <w:color w:val="000000"/>
+                <w:sz w:val="16"/>
+                <w:szCs w:val="16"/>
+              </w:rPr>
+              <w:t>Cab Cam</w:t>
+            </w:r>
+          </w:p>
+        </w:tc>
+      </w:tr>
+    </w:tbl>
+    <w:p>
+      <w:pPr>
+        <w:pStyle w:val="Normal"/>
+        <w:rPr>
+          <w:rFonts w:ascii="arial" w:hAnsi="arial" w:eastAsia="arial"/>
+          <w:color w:val="000000"/>
+          <w:sz w:val="16"/>
+          <w:szCs w:val="16"/>
+        </w:rPr>
+      </w:pPr>
+      <w:r>
+        <w:rPr>
+          <w:rFonts w:eastAsia="arial" w:ascii="arial" w:hAnsi="arial"/>
+          <w:color w:val="000000"/>
+          <w:sz w:val="16"/>
+          <w:szCs w:val="16"/>
+        </w:rPr>
+      </w:r>
+    </w:p>
+    <w:p>
+      <w:pPr>
+        <w:pStyle w:val="Normal"/>
+        <w:rPr>
+          <w:color w:val="000000"/>
+          <w:sz w:val="16"/>
+          <w:szCs w:val="16"/>
+        </w:rPr>
+      </w:pPr>
+      <w:r>
+        <w:rPr>
+          <w:rFonts w:eastAsia="arial" w:ascii="arial" w:hAnsi="arial"/>
+          <w:color w:val="000000"/>
+          <w:sz w:val="16"/>
+          <w:szCs w:val="16"/>
+        </w:rPr>
+        <w:tab/>
+        <w:t xml:space="preserve">           Class 710-2</w:t>
+      </w:r>
+    </w:p>
+    <w:tbl>
+      <w:tblPr>
+        <w:tblW w:w="14248" w:type="dxa"/>
+        <w:jc w:val="left"/>
+        <w:tblInd w:w="-5" w:type="dxa"/>
+        <w:tblLayout w:type="fixed"/>
+        <w:tblCellMar>
+          <w:top w:w="0" w:type="dxa"/>
+          <w:left w:w="108" w:type="dxa"/>
+          <w:bottom w:w="0" w:type="dxa"/>
+          <w:right w:w="108" w:type="dxa"/>
+        </w:tblCellMar>
+        <w:tblLook w:firstRow="1" w:noVBand="1" w:lastRow="0" w:firstColumn="1" w:lastColumn="0" w:noHBand="0" w:val="04a0"/>
+      </w:tblPr>
+      <w:tblGrid>
+        <w:gridCol w:w="1017"/>
+        <w:gridCol w:w="1019"/>
+        <w:gridCol w:w="1014"/>
+        <w:gridCol w:w="1016"/>
+        <w:gridCol w:w="1020"/>
+        <w:gridCol w:w="1016"/>
+        <w:gridCol w:w="1016"/>
+        <w:gridCol w:w="1017"/>
+        <w:gridCol w:w="1016"/>
+        <w:gridCol w:w="1020"/>
+        <w:gridCol w:w="1016"/>
+        <w:gridCol w:w="1016"/>
+        <w:gridCol w:w="1016"/>
+        <w:gridCol w:w="1029"/>
+      </w:tblGrid>
+      <w:tr>
+        <w:trPr>
+          <w:trHeight w:val="440" w:hRule="exact"/>
+          <w:cantSplit w:val="true"/>
+        </w:trPr>
+        <w:tc>
+          <w:tcPr>
+            <w:tcW w:w="1017" w:type="dxa"/>
+            <w:tcBorders>
+              <w:top w:val="single" w:sz="4" w:space="0" w:color="000000"/>
+              <w:left w:val="single" w:sz="4" w:space="0" w:color="000000"/>
+              <w:bottom w:val="single" w:sz="4" w:space="0" w:color="000000"/>
+            </w:tcBorders>
+            <w:vAlign w:val="bottom"/>
+          </w:tcPr>
+          <w:p>
+            <w:pPr>
+              <w:pStyle w:val="Normal"/>
+              <w:widowControl w:val="false"/>
+              <w:spacing w:lineRule="auto" w:line="180" w:before="0" w:after="60"/>
+              <w:jc w:val="center"/>
+              <w:rPr>
+                <w:b/>
+                <w:bCs/>
+              </w:rPr>
+            </w:pPr>
+            <w:r>
+              <w:rPr>
+                <w:b/>
+                <w:bCs/>
+                <w:color w:val="000000"/>
+                <w:sz w:val="16"/>
+                <w:szCs w:val="16"/>
+              </w:rPr>
+              <w:t>HUD</w:t>
+            </w:r>
+          </w:p>
+        </w:tc>
+        <w:tc>
+          <w:tcPr>
+            <w:tcW w:w="1019" w:type="dxa"/>
+            <w:tcBorders>
+              <w:top w:val="single" w:sz="4" w:space="0" w:color="000000"/>
+              <w:left w:val="single" w:sz="4" w:space="0" w:color="000000"/>
+              <w:bottom w:val="single" w:sz="4" w:space="0" w:color="000000"/>
+            </w:tcBorders>
+            <w:vAlign w:val="bottom"/>
+          </w:tcPr>
+          <w:p>
+            <w:pPr>
+              <w:pStyle w:val="Normal"/>
+              <w:widowControl w:val="false"/>
+              <w:spacing w:lineRule="auto" w:line="180"/>
+              <w:jc w:val="center"/>
+              <w:rPr>
+                <w:color w:val="000000"/>
+                <w:sz w:val="16"/>
+                <w:szCs w:val="16"/>
+              </w:rPr>
+            </w:pPr>
+            <w:r>
+              <w:rPr>
+                <w:color w:val="000000"/>
+                <w:sz w:val="16"/>
+                <w:szCs w:val="16"/>
+              </w:rPr>
+              <w:t>Schedule</w:t>
+            </w:r>
+          </w:p>
+        </w:tc>
+        <w:tc>
+          <w:tcPr>
+            <w:tcW w:w="1014" w:type="dxa"/>
+            <w:tcBorders>
+              <w:top w:val="single" w:sz="4" w:space="0" w:color="000000"/>
+              <w:left w:val="single" w:sz="4" w:space="0" w:color="000000"/>
+              <w:bottom w:val="single" w:sz="4" w:space="0" w:color="000000"/>
+            </w:tcBorders>
+            <w:vAlign w:val="bottom"/>
+          </w:tcPr>
+          <w:p>
+            <w:pPr>
+              <w:pStyle w:val="Normal"/>
+              <w:widowControl w:val="false"/>
+              <w:spacing w:lineRule="auto" w:line="180"/>
+              <w:jc w:val="center"/>
+              <w:rPr>
+                <w:color w:val="000000"/>
+                <w:sz w:val="16"/>
+                <w:szCs w:val="16"/>
+              </w:rPr>
+            </w:pPr>
+            <w:r>
+              <w:rPr>
+                <w:color w:val="000000"/>
+                <w:sz w:val="16"/>
+                <w:szCs w:val="16"/>
+              </w:rPr>
+              <w:t>Aux Off</w:t>
+            </w:r>
+          </w:p>
+        </w:tc>
+        <w:tc>
+          <w:tcPr>
+            <w:tcW w:w="1016" w:type="dxa"/>
+            <w:tcBorders>
+              <w:top w:val="single" w:sz="4" w:space="0" w:color="000000"/>
+              <w:left w:val="single" w:sz="4" w:space="0" w:color="000000"/>
+              <w:bottom w:val="single" w:sz="4" w:space="0" w:color="000000"/>
+            </w:tcBorders>
+            <w:vAlign w:val="bottom"/>
+          </w:tcPr>
+          <w:p>
+            <w:pPr>
+              <w:pStyle w:val="Normal"/>
+              <w:widowControl w:val="false"/>
+              <w:spacing w:lineRule="auto" w:line="180"/>
+              <w:jc w:val="center"/>
+              <w:rPr>
+                <w:color w:val="000000"/>
+                <w:sz w:val="16"/>
+                <w:szCs w:val="16"/>
+              </w:rPr>
+            </w:pPr>
+            <w:r>
+              <w:rPr>
+                <w:color w:val="000000"/>
+                <w:sz w:val="16"/>
+                <w:szCs w:val="16"/>
+              </w:rPr>
+              <w:t>DSD/Vigilance</w:t>
+            </w:r>
+          </w:p>
+        </w:tc>
+        <w:tc>
+          <w:tcPr>
+            <w:tcW w:w="1020" w:type="dxa"/>
+            <w:tcBorders>
+              <w:top w:val="single" w:sz="4" w:space="0" w:color="000000"/>
+              <w:left w:val="single" w:sz="4" w:space="0" w:color="000000"/>
+              <w:bottom w:val="single" w:sz="4" w:space="0" w:color="000000"/>
+            </w:tcBorders>
+            <w:vAlign w:val="bottom"/>
+          </w:tcPr>
+          <w:p>
+            <w:pPr>
+              <w:pStyle w:val="Normal"/>
+              <w:widowControl w:val="false"/>
+              <w:spacing w:lineRule="auto" w:line="180"/>
+              <w:jc w:val="center"/>
+              <w:rPr>
+                <w:color w:val="000000"/>
+                <w:sz w:val="16"/>
+                <w:szCs w:val="16"/>
+              </w:rPr>
+            </w:pPr>
+            <w:r>
+              <w:rPr>
+                <w:color w:val="000000"/>
+                <w:sz w:val="16"/>
+                <w:szCs w:val="16"/>
+              </w:rPr>
+              <w:t>Pan Down</w:t>
+            </w:r>
+          </w:p>
+          <w:p>
+            <w:pPr>
+              <w:pStyle w:val="Normal"/>
+              <w:widowControl w:val="false"/>
+              <w:spacing w:lineRule="auto" w:line="180"/>
+              <w:jc w:val="center"/>
+              <w:rPr>
+                <w:color w:val="000000"/>
+                <w:sz w:val="16"/>
+                <w:szCs w:val="16"/>
+              </w:rPr>
+            </w:pPr>
+            <w:r>
+              <w:rPr>
+                <w:color w:val="000000"/>
+                <w:sz w:val="16"/>
+                <w:szCs w:val="16"/>
+              </w:rPr>
+              <w:t>/Shoes Up</w:t>
+            </w:r>
+          </w:p>
+        </w:tc>
+        <w:tc>
+          <w:tcPr>
+            <w:tcW w:w="1016" w:type="dxa"/>
+            <w:tcBorders>
+              <w:top w:val="single" w:sz="4" w:space="0" w:color="000000"/>
+              <w:left w:val="single" w:sz="4" w:space="0" w:color="000000"/>
+              <w:bottom w:val="single" w:sz="4" w:space="0" w:color="000000"/>
+            </w:tcBorders>
+            <w:vAlign w:val="bottom"/>
+          </w:tcPr>
+          <w:p>
+            <w:pPr>
+              <w:pStyle w:val="Normal"/>
+              <w:widowControl w:val="false"/>
+              <w:spacing w:lineRule="auto" w:line="180"/>
+              <w:jc w:val="center"/>
+              <w:rPr>
+                <w:color w:val="000000"/>
+                <w:sz w:val="16"/>
+                <w:szCs w:val="16"/>
+              </w:rPr>
+            </w:pPr>
+            <w:r>
+              <w:rPr>
+                <w:color w:val="000000"/>
+                <w:sz w:val="16"/>
+                <w:szCs w:val="16"/>
+              </w:rPr>
+              <w:t>TCMS</w:t>
+            </w:r>
+          </w:p>
+          <w:p>
+            <w:pPr>
+              <w:pStyle w:val="Normal"/>
+              <w:widowControl w:val="false"/>
+              <w:spacing w:lineRule="auto" w:line="180"/>
+              <w:jc w:val="center"/>
+              <w:rPr>
+                <w:color w:val="000000"/>
+                <w:sz w:val="16"/>
+                <w:szCs w:val="16"/>
+              </w:rPr>
+            </w:pPr>
+            <w:r>
+              <w:rPr>
+                <w:color w:val="000000"/>
+                <w:sz w:val="16"/>
+                <w:szCs w:val="16"/>
+              </w:rPr>
+              <w:t>Ack.</w:t>
+            </w:r>
+          </w:p>
+        </w:tc>
+        <w:tc>
+          <w:tcPr>
+            <w:tcW w:w="1016" w:type="dxa"/>
+            <w:tcBorders>
+              <w:top w:val="single" w:sz="4" w:space="0" w:color="000000"/>
+              <w:left w:val="single" w:sz="4" w:space="0" w:color="000000"/>
+              <w:bottom w:val="single" w:sz="4" w:space="0" w:color="000000"/>
+            </w:tcBorders>
+            <w:vAlign w:val="bottom"/>
+          </w:tcPr>
+          <w:p>
+            <w:pPr>
+              <w:pStyle w:val="Normal"/>
+              <w:widowControl w:val="false"/>
+              <w:jc w:val="center"/>
+              <w:rPr>
+                <w:sz w:val="16"/>
+                <w:szCs w:val="16"/>
+              </w:rPr>
+            </w:pPr>
+            <w:r>
+              <w:rPr>
+                <w:sz w:val="16"/>
+                <w:szCs w:val="16"/>
+              </w:rPr>
+              <w:t>DC</w:t>
+            </w:r>
+          </w:p>
+        </w:tc>
+        <w:tc>
+          <w:tcPr>
+            <w:tcW w:w="1017" w:type="dxa"/>
+            <w:tcBorders>
+              <w:top w:val="single" w:sz="4" w:space="0" w:color="000000"/>
+              <w:left w:val="single" w:sz="4" w:space="0" w:color="000000"/>
+              <w:bottom w:val="single" w:sz="4" w:space="0" w:color="000000"/>
+            </w:tcBorders>
+            <w:vAlign w:val="bottom"/>
+          </w:tcPr>
+          <w:p>
+            <w:pPr>
+              <w:pStyle w:val="Normal"/>
+              <w:widowControl w:val="false"/>
+              <w:jc w:val="center"/>
+              <w:rPr>
+                <w:sz w:val="16"/>
+                <w:szCs w:val="16"/>
+              </w:rPr>
+            </w:pPr>
+            <w:r>
+              <w:rPr>
+                <w:sz w:val="16"/>
+                <w:szCs w:val="16"/>
+              </w:rPr>
+              <w:t>Sunblind Down</w:t>
+            </w:r>
+          </w:p>
+        </w:tc>
+        <w:tc>
+          <w:tcPr>
+            <w:tcW w:w="1016" w:type="dxa"/>
+            <w:tcBorders>
+              <w:top w:val="single" w:sz="4" w:space="0" w:color="000000"/>
+              <w:left w:val="single" w:sz="4" w:space="0" w:color="000000"/>
+              <w:bottom w:val="single" w:sz="4" w:space="0" w:color="000000"/>
+            </w:tcBorders>
+            <w:vAlign w:val="bottom"/>
+          </w:tcPr>
+          <w:p>
+            <w:pPr>
+              <w:pStyle w:val="Normal"/>
+              <w:widowControl w:val="false"/>
+              <w:jc w:val="center"/>
+              <w:rPr>
+                <w:color w:val="000000"/>
+                <w:sz w:val="16"/>
+                <w:szCs w:val="16"/>
+              </w:rPr>
+            </w:pPr>
+            <w:r>
+              <w:rPr>
+                <w:color w:val="000000"/>
+                <w:sz w:val="16"/>
+                <w:szCs w:val="16"/>
+              </w:rPr>
+              <w:t>Hazard Light</w:t>
+            </w:r>
+          </w:p>
+        </w:tc>
+        <w:tc>
+          <w:tcPr>
+            <w:tcW w:w="1020" w:type="dxa"/>
+            <w:tcBorders>
+              <w:top w:val="single" w:sz="4" w:space="0" w:color="000000"/>
+              <w:left w:val="single" w:sz="4" w:space="0" w:color="000000"/>
+              <w:bottom w:val="single" w:sz="4" w:space="0" w:color="000000"/>
+            </w:tcBorders>
+            <w:vAlign w:val="bottom"/>
+          </w:tcPr>
+          <w:p>
+            <w:pPr>
+              <w:pStyle w:val="Normal"/>
+              <w:widowControl w:val="false"/>
+              <w:spacing w:lineRule="auto" w:line="180"/>
+              <w:jc w:val="center"/>
+              <w:rPr>
+                <w:rFonts w:ascii="arial" w:hAnsi="arial" w:eastAsia="arial"/>
+                <w:color w:val="000000"/>
+              </w:rPr>
+            </w:pPr>
+            <w:r>
+              <w:rPr>
+                <w:rFonts w:eastAsia="arial" w:ascii="arial" w:hAnsi="arial"/>
+                <w:color w:val="000000"/>
+              </w:rPr>
+            </w:r>
+          </w:p>
+        </w:tc>
+        <w:tc>
+          <w:tcPr>
+            <w:tcW w:w="1016" w:type="dxa"/>
+            <w:tcBorders>
+              <w:top w:val="single" w:sz="4" w:space="0" w:color="000000"/>
+              <w:left w:val="single" w:sz="4" w:space="0" w:color="000000"/>
+              <w:bottom w:val="single" w:sz="4" w:space="0" w:color="000000"/>
+            </w:tcBorders>
+            <w:vAlign w:val="bottom"/>
+          </w:tcPr>
+          <w:p>
+            <w:pPr>
+              <w:pStyle w:val="Normal"/>
+              <w:widowControl w:val="false"/>
+              <w:spacing w:lineRule="auto" w:line="180"/>
+              <w:jc w:val="center"/>
+              <w:rPr>
+                <w:sz w:val="16"/>
+                <w:szCs w:val="16"/>
+              </w:rPr>
+            </w:pPr>
+            <w:r>
+              <w:rPr>
+                <w:rFonts w:eastAsia="arial" w:ascii="arial" w:hAnsi="arial"/>
+                <w:color w:val="000000"/>
+                <w:sz w:val="16"/>
+                <w:szCs w:val="16"/>
+              </w:rPr>
+              <w:t>Cab Light Off</w:t>
+            </w:r>
+          </w:p>
+        </w:tc>
+        <w:tc>
+          <w:tcPr>
+            <w:tcW w:w="1016" w:type="dxa"/>
+            <w:tcBorders>
+              <w:top w:val="single" w:sz="4" w:space="0" w:color="000000"/>
+              <w:left w:val="single" w:sz="4" w:space="0" w:color="000000"/>
+              <w:bottom w:val="single" w:sz="4" w:space="0" w:color="000000"/>
+            </w:tcBorders>
+            <w:vAlign w:val="bottom"/>
+          </w:tcPr>
+          <w:p>
+            <w:pPr>
+              <w:pStyle w:val="Normal"/>
+              <w:widowControl w:val="false"/>
+              <w:spacing w:lineRule="auto" w:line="180"/>
+              <w:jc w:val="center"/>
+              <w:rPr>
+                <w:sz w:val="16"/>
+                <w:szCs w:val="16"/>
+              </w:rPr>
+            </w:pPr>
+            <w:r>
+              <w:rPr>
+                <w:rFonts w:eastAsia="arial" w:ascii="arial" w:hAnsi="arial"/>
+                <w:color w:val="000000"/>
+                <w:sz w:val="16"/>
+                <w:szCs w:val="16"/>
+              </w:rPr>
+              <w:t>Uncouple</w:t>
+            </w:r>
+          </w:p>
+        </w:tc>
+        <w:tc>
+          <w:tcPr>
+            <w:tcW w:w="1016" w:type="dxa"/>
+            <w:tcBorders>
+              <w:top w:val="single" w:sz="4" w:space="0" w:color="000000"/>
+              <w:left w:val="single" w:sz="4" w:space="0" w:color="000000"/>
+              <w:bottom w:val="single" w:sz="4" w:space="0" w:color="000000"/>
+            </w:tcBorders>
+            <w:vAlign w:val="bottom"/>
+          </w:tcPr>
+          <w:p>
+            <w:pPr>
+              <w:pStyle w:val="Normal"/>
+              <w:widowControl w:val="false"/>
+              <w:spacing w:lineRule="auto" w:line="180"/>
+              <w:jc w:val="center"/>
+              <w:rPr>
+                <w:sz w:val="16"/>
+                <w:szCs w:val="16"/>
+              </w:rPr>
+            </w:pPr>
+            <w:r>
+              <w:rPr>
+                <w:rFonts w:eastAsia="arial" w:ascii="arial" w:hAnsi="arial"/>
+                <w:color w:val="000000"/>
+                <w:sz w:val="16"/>
+                <w:szCs w:val="16"/>
+              </w:rPr>
+              <w:t>Exterior</w:t>
+            </w:r>
+          </w:p>
+          <w:p>
+            <w:pPr>
+              <w:pStyle w:val="Normal"/>
+              <w:widowControl w:val="false"/>
+              <w:spacing w:lineRule="auto" w:line="180"/>
+              <w:jc w:val="center"/>
+              <w:rPr>
+                <w:sz w:val="16"/>
+                <w:szCs w:val="16"/>
+              </w:rPr>
+            </w:pPr>
+            <w:r>
+              <w:rPr>
+                <w:rFonts w:eastAsia="arial" w:ascii="arial" w:hAnsi="arial"/>
+                <w:color w:val="000000"/>
+                <w:sz w:val="16"/>
+                <w:szCs w:val="16"/>
+              </w:rPr>
+              <w:t>Camera</w:t>
+            </w:r>
+          </w:p>
+        </w:tc>
+        <w:tc>
+          <w:tcPr>
+            <w:tcW w:w="1029" w:type="dxa"/>
+            <w:tcBorders>
+              <w:top w:val="single" w:sz="4" w:space="0" w:color="000000"/>
+              <w:left w:val="single" w:sz="4" w:space="0" w:color="000000"/>
+              <w:bottom w:val="single" w:sz="4" w:space="0" w:color="000000"/>
+              <w:right w:val="single" w:sz="4" w:space="0" w:color="000000"/>
+            </w:tcBorders>
+            <w:vAlign w:val="bottom"/>
+          </w:tcPr>
+          <w:p>
+            <w:pPr>
+              <w:pStyle w:val="Normal"/>
+              <w:widowControl w:val="false"/>
+              <w:spacing w:lineRule="auto" w:line="180"/>
+              <w:jc w:val="center"/>
+              <w:rPr>
+                <w:sz w:val="16"/>
+                <w:szCs w:val="16"/>
+              </w:rPr>
+            </w:pPr>
+            <w:r>
+              <w:rPr>
+                <w:rFonts w:eastAsia="arial" w:ascii="arial" w:hAnsi="arial"/>
+                <w:color w:val="000000"/>
+                <w:sz w:val="16"/>
+                <w:szCs w:val="16"/>
+              </w:rPr>
+              <w:t>Prev</w:t>
+            </w:r>
+          </w:p>
+          <w:p>
+            <w:pPr>
+              <w:pStyle w:val="Normal"/>
+              <w:widowControl w:val="false"/>
+              <w:spacing w:lineRule="auto" w:line="180"/>
+              <w:jc w:val="center"/>
+              <w:rPr>
+                <w:sz w:val="16"/>
+                <w:szCs w:val="16"/>
+              </w:rPr>
+            </w:pPr>
+            <w:r>
+              <w:rPr>
+                <w:rFonts w:eastAsia="arial" w:ascii="arial" w:hAnsi="arial"/>
+                <w:color w:val="000000"/>
+                <w:sz w:val="16"/>
+                <w:szCs w:val="16"/>
+              </w:rPr>
+              <w:t>Cab Cam</w:t>
+            </w:r>
+          </w:p>
+        </w:tc>
+      </w:tr>
+    </w:tbl>
+    <w:p>
+      <w:pPr>
+        <w:pStyle w:val="Normal"/>
+        <w:rPr>
+          <w:color w:val="000000"/>
+          <w:sz w:val="16"/>
+          <w:szCs w:val="16"/>
+        </w:rPr>
+      </w:pPr>
+      <w:r>
+        <w:rPr>
+          <w:color w:val="000000"/>
+          <w:sz w:val="16"/>
+          <w:szCs w:val="16"/>
+        </w:rPr>
+      </w:r>
+    </w:p>
+    <w:p>
+      <w:pPr>
+        <w:pStyle w:val="Normal"/>
+        <w:rPr>
+          <w:color w:val="000000"/>
+          <w:sz w:val="16"/>
+          <w:szCs w:val="16"/>
+        </w:rPr>
+      </w:pPr>
+      <w:r>
+        <w:rPr>
+          <w:rFonts w:eastAsia="arial" w:ascii="arial" w:hAnsi="arial"/>
+          <w:color w:val="000000"/>
+          <w:sz w:val="16"/>
+          <w:szCs w:val="16"/>
+        </w:rPr>
+        <w:tab/>
+        <w:t xml:space="preserve">           Class 801-1</w:t>
+      </w:r>
+    </w:p>
+    <w:tbl>
+      <w:tblPr>
+        <w:tblW w:w="14248" w:type="dxa"/>
+        <w:jc w:val="left"/>
+        <w:tblInd w:w="-5" w:type="dxa"/>
+        <w:tblLayout w:type="fixed"/>
+        <w:tblCellMar>
+          <w:top w:w="0" w:type="dxa"/>
+          <w:left w:w="108" w:type="dxa"/>
+          <w:bottom w:w="0" w:type="dxa"/>
+          <w:right w:w="108" w:type="dxa"/>
+        </w:tblCellMar>
+        <w:tblLook w:firstRow="1" w:noVBand="1" w:lastRow="0" w:firstColumn="1" w:lastColumn="0" w:noHBand="0" w:val="04a0"/>
+      </w:tblPr>
+      <w:tblGrid>
+        <w:gridCol w:w="1017"/>
+        <w:gridCol w:w="1019"/>
+        <w:gridCol w:w="1014"/>
+        <w:gridCol w:w="1016"/>
+        <w:gridCol w:w="1020"/>
+        <w:gridCol w:w="1016"/>
+        <w:gridCol w:w="1016"/>
+        <w:gridCol w:w="1017"/>
+        <w:gridCol w:w="1016"/>
+        <w:gridCol w:w="1020"/>
+        <w:gridCol w:w="1016"/>
+        <w:gridCol w:w="1016"/>
+        <w:gridCol w:w="1016"/>
+        <w:gridCol w:w="1029"/>
+      </w:tblGrid>
+      <w:tr>
+        <w:trPr>
+          <w:trHeight w:val="440" w:hRule="exact"/>
+          <w:cantSplit w:val="true"/>
+        </w:trPr>
+        <w:tc>
+          <w:tcPr>
+            <w:tcW w:w="1017" w:type="dxa"/>
+            <w:tcBorders>
+              <w:top w:val="single" w:sz="4" w:space="0" w:color="000000"/>
+              <w:left w:val="single" w:sz="4" w:space="0" w:color="000000"/>
+              <w:bottom w:val="single" w:sz="4" w:space="0" w:color="000000"/>
+            </w:tcBorders>
+            <w:vAlign w:val="bottom"/>
+          </w:tcPr>
+          <w:p>
+            <w:pPr>
+              <w:pStyle w:val="Normal"/>
+              <w:widowControl w:val="false"/>
+              <w:spacing w:lineRule="auto" w:line="180" w:before="0" w:after="60"/>
+              <w:jc w:val="center"/>
+              <w:rPr>
+                <w:color w:val="000000"/>
+                <w:sz w:val="16"/>
+                <w:szCs w:val="16"/>
+              </w:rPr>
+            </w:pPr>
+            <w:r>
+              <w:rPr>
+                <w:rFonts w:eastAsia="arial" w:ascii="arial" w:hAnsi="arial"/>
+                <w:b/>
+                <w:color w:val="000000"/>
+                <w:sz w:val="16"/>
+                <w:szCs w:val="16"/>
+              </w:rPr>
+              <w:t>Pause</w:t>
+            </w:r>
+          </w:p>
+        </w:tc>
+        <w:tc>
+          <w:tcPr>
+            <w:tcW w:w="1019" w:type="dxa"/>
+            <w:tcBorders>
+              <w:top w:val="single" w:sz="4" w:space="0" w:color="000000"/>
+              <w:left w:val="single" w:sz="4" w:space="0" w:color="000000"/>
+              <w:bottom w:val="single" w:sz="4" w:space="0" w:color="000000"/>
+            </w:tcBorders>
+            <w:vAlign w:val="bottom"/>
+          </w:tcPr>
+          <w:p>
+            <w:pPr>
+              <w:pStyle w:val="Normal"/>
+              <w:widowControl w:val="false"/>
+              <w:spacing w:lineRule="auto" w:line="180"/>
+              <w:jc w:val="center"/>
+              <w:rPr>
+                <w:color w:val="000000"/>
+                <w:sz w:val="16"/>
+                <w:szCs w:val="16"/>
+              </w:rPr>
+            </w:pPr>
+            <w:r>
+              <w:rPr>
+                <w:color w:val="000000"/>
+                <w:sz w:val="16"/>
+                <w:szCs w:val="16"/>
+              </w:rPr>
+              <w:t>Master Key</w:t>
+            </w:r>
+          </w:p>
+        </w:tc>
+        <w:tc>
+          <w:tcPr>
+            <w:tcW w:w="1014" w:type="dxa"/>
+            <w:tcBorders>
+              <w:top w:val="single" w:sz="4" w:space="0" w:color="000000"/>
+              <w:left w:val="single" w:sz="4" w:space="0" w:color="000000"/>
+              <w:bottom w:val="single" w:sz="4" w:space="0" w:color="000000"/>
+            </w:tcBorders>
+            <w:vAlign w:val="bottom"/>
+          </w:tcPr>
+          <w:p>
+            <w:pPr>
+              <w:pStyle w:val="Normal"/>
+              <w:widowControl w:val="false"/>
+              <w:spacing w:lineRule="auto" w:line="180"/>
+              <w:jc w:val="center"/>
+              <w:rPr>
+                <w:color w:val="000000"/>
+                <w:sz w:val="16"/>
+                <w:szCs w:val="16"/>
+              </w:rPr>
+            </w:pPr>
+            <w:r>
+              <w:rPr>
+                <w:color w:val="000000"/>
+                <w:sz w:val="16"/>
+                <w:szCs w:val="16"/>
+              </w:rPr>
+              <w:t>Aux On</w:t>
+            </w:r>
+          </w:p>
+        </w:tc>
+        <w:tc>
+          <w:tcPr>
+            <w:tcW w:w="1016" w:type="dxa"/>
+            <w:tcBorders>
+              <w:top w:val="single" w:sz="4" w:space="0" w:color="000000"/>
+              <w:left w:val="single" w:sz="4" w:space="0" w:color="000000"/>
+              <w:bottom w:val="single" w:sz="4" w:space="0" w:color="000000"/>
+            </w:tcBorders>
+            <w:vAlign w:val="bottom"/>
+          </w:tcPr>
+          <w:p>
+            <w:pPr>
+              <w:pStyle w:val="Normal"/>
+              <w:widowControl w:val="false"/>
+              <w:spacing w:lineRule="auto" w:line="180"/>
+              <w:jc w:val="center"/>
+              <w:rPr>
+                <w:color w:val="000000"/>
+                <w:sz w:val="16"/>
+                <w:szCs w:val="16"/>
+              </w:rPr>
+            </w:pPr>
+            <w:r>
+              <w:rPr>
+                <w:color w:val="000000"/>
+                <w:sz w:val="16"/>
+                <w:szCs w:val="16"/>
+              </w:rPr>
+              <w:t>AWS/TPWS</w:t>
+            </w:r>
+          </w:p>
+        </w:tc>
+        <w:tc>
+          <w:tcPr>
+            <w:tcW w:w="1020" w:type="dxa"/>
+            <w:tcBorders>
+              <w:top w:val="single" w:sz="4" w:space="0" w:color="000000"/>
+              <w:left w:val="single" w:sz="4" w:space="0" w:color="000000"/>
+              <w:bottom w:val="single" w:sz="4" w:space="0" w:color="000000"/>
+            </w:tcBorders>
+            <w:vAlign w:val="bottom"/>
+          </w:tcPr>
+          <w:p>
+            <w:pPr>
+              <w:pStyle w:val="Normal"/>
+              <w:widowControl w:val="false"/>
+              <w:spacing w:lineRule="auto" w:line="180"/>
+              <w:jc w:val="center"/>
+              <w:rPr>
+                <w:color w:val="000000"/>
+                <w:sz w:val="16"/>
+                <w:szCs w:val="16"/>
+              </w:rPr>
+            </w:pPr>
+            <w:r>
+              <w:rPr>
+                <w:color w:val="000000"/>
+                <w:sz w:val="16"/>
+                <w:szCs w:val="16"/>
+              </w:rPr>
+              <w:t>Panto. Raise</w:t>
+            </w:r>
+          </w:p>
+        </w:tc>
+        <w:tc>
+          <w:tcPr>
+            <w:tcW w:w="1016" w:type="dxa"/>
+            <w:tcBorders>
+              <w:top w:val="single" w:sz="4" w:space="0" w:color="000000"/>
+              <w:left w:val="single" w:sz="4" w:space="0" w:color="000000"/>
+              <w:bottom w:val="single" w:sz="4" w:space="0" w:color="000000"/>
+            </w:tcBorders>
+            <w:vAlign w:val="bottom"/>
+          </w:tcPr>
+          <w:p>
+            <w:pPr>
+              <w:pStyle w:val="Normal"/>
+              <w:widowControl w:val="false"/>
+              <w:spacing w:lineRule="auto" w:line="180"/>
+              <w:jc w:val="center"/>
+              <w:rPr>
+                <w:color w:val="000000"/>
+                <w:sz w:val="16"/>
+                <w:szCs w:val="16"/>
+              </w:rPr>
+            </w:pPr>
+            <w:r>
+              <w:rPr>
+                <w:color w:val="000000"/>
+                <w:sz w:val="16"/>
+                <w:szCs w:val="16"/>
+              </w:rPr>
+              <w:t>DRA</w:t>
+            </w:r>
+          </w:p>
+        </w:tc>
+        <w:tc>
+          <w:tcPr>
+            <w:tcW w:w="1016" w:type="dxa"/>
+            <w:tcBorders>
+              <w:top w:val="single" w:sz="4" w:space="0" w:color="000000"/>
+              <w:left w:val="single" w:sz="4" w:space="0" w:color="000000"/>
+              <w:bottom w:val="single" w:sz="4" w:space="0" w:color="000000"/>
+            </w:tcBorders>
+            <w:vAlign w:val="bottom"/>
+          </w:tcPr>
+          <w:p>
+            <w:pPr>
+              <w:pStyle w:val="Normal"/>
+              <w:widowControl w:val="false"/>
+              <w:jc w:val="center"/>
+              <w:rPr>
+                <w:sz w:val="16"/>
+                <w:szCs w:val="16"/>
+              </w:rPr>
+            </w:pPr>
+            <w:r>
+              <w:rPr>
+                <w:sz w:val="16"/>
+                <w:szCs w:val="16"/>
+              </w:rPr>
+              <w:t>Engine Start</w:t>
+            </w:r>
+          </w:p>
+        </w:tc>
+        <w:tc>
+          <w:tcPr>
+            <w:tcW w:w="1017" w:type="dxa"/>
+            <w:tcBorders>
+              <w:top w:val="single" w:sz="4" w:space="0" w:color="000000"/>
+              <w:left w:val="single" w:sz="4" w:space="0" w:color="000000"/>
+              <w:bottom w:val="single" w:sz="4" w:space="0" w:color="000000"/>
+            </w:tcBorders>
+            <w:vAlign w:val="bottom"/>
+          </w:tcPr>
+          <w:p>
+            <w:pPr>
+              <w:pStyle w:val="Normal"/>
+              <w:widowControl w:val="false"/>
+              <w:jc w:val="center"/>
+              <w:rPr>
+                <w:sz w:val="16"/>
+                <w:szCs w:val="16"/>
+              </w:rPr>
+            </w:pPr>
+            <w:r>
+              <w:rPr>
+                <w:sz w:val="16"/>
+                <w:szCs w:val="16"/>
+              </w:rPr>
+              <w:t>Electric</w:t>
+            </w:r>
+          </w:p>
+        </w:tc>
+        <w:tc>
+          <w:tcPr>
+            <w:tcW w:w="1016" w:type="dxa"/>
+            <w:tcBorders>
+              <w:top w:val="single" w:sz="4" w:space="0" w:color="000000"/>
+              <w:left w:val="single" w:sz="4" w:space="0" w:color="000000"/>
+              <w:bottom w:val="single" w:sz="4" w:space="0" w:color="000000"/>
+            </w:tcBorders>
+            <w:vAlign w:val="bottom"/>
+          </w:tcPr>
+          <w:p>
+            <w:pPr>
+              <w:pStyle w:val="Normal"/>
+              <w:widowControl w:val="false"/>
+              <w:jc w:val="center"/>
+              <w:rPr>
+                <w:color w:val="000000"/>
+                <w:sz w:val="16"/>
+                <w:szCs w:val="16"/>
+              </w:rPr>
+            </w:pPr>
+            <w:r>
+              <w:rPr>
+                <w:color w:val="000000"/>
+                <w:sz w:val="16"/>
+                <w:szCs w:val="16"/>
+              </w:rPr>
+              <w:t>Front Coupler</w:t>
+            </w:r>
+          </w:p>
+        </w:tc>
+        <w:tc>
+          <w:tcPr>
+            <w:tcW w:w="1020" w:type="dxa"/>
+            <w:tcBorders>
+              <w:top w:val="single" w:sz="4" w:space="0" w:color="000000"/>
+              <w:left w:val="single" w:sz="4" w:space="0" w:color="000000"/>
+              <w:bottom w:val="single" w:sz="4" w:space="0" w:color="000000"/>
+            </w:tcBorders>
+            <w:vAlign w:val="bottom"/>
+          </w:tcPr>
+          <w:p>
+            <w:pPr>
+              <w:pStyle w:val="Normal"/>
+              <w:widowControl w:val="false"/>
+              <w:spacing w:lineRule="auto" w:line="180"/>
+              <w:jc w:val="center"/>
+              <w:rPr>
+                <w:sz w:val="16"/>
+                <w:szCs w:val="16"/>
+              </w:rPr>
+            </w:pPr>
+            <w:r>
+              <w:rPr>
+                <w:rFonts w:eastAsia="arial" w:ascii="arial" w:hAnsi="arial"/>
+                <w:color w:val="000000"/>
+                <w:sz w:val="16"/>
+                <w:szCs w:val="16"/>
+              </w:rPr>
+              <w:t>Desk Light Up</w:t>
+            </w:r>
+          </w:p>
+        </w:tc>
+        <w:tc>
+          <w:tcPr>
+            <w:tcW w:w="1016" w:type="dxa"/>
+            <w:tcBorders>
+              <w:top w:val="single" w:sz="4" w:space="0" w:color="000000"/>
+              <w:left w:val="single" w:sz="4" w:space="0" w:color="000000"/>
+              <w:bottom w:val="single" w:sz="4" w:space="0" w:color="000000"/>
+            </w:tcBorders>
+            <w:vAlign w:val="bottom"/>
+          </w:tcPr>
+          <w:p>
+            <w:pPr>
+              <w:pStyle w:val="Normal"/>
+              <w:widowControl w:val="false"/>
+              <w:spacing w:lineRule="auto" w:line="180"/>
+              <w:jc w:val="center"/>
+              <w:rPr>
+                <w:sz w:val="16"/>
+                <w:szCs w:val="16"/>
+              </w:rPr>
+            </w:pPr>
+            <w:r>
+              <w:rPr>
+                <w:rFonts w:eastAsia="arial" w:ascii="arial" w:hAnsi="arial"/>
+                <w:color w:val="000000"/>
+                <w:sz w:val="16"/>
+                <w:szCs w:val="16"/>
+              </w:rPr>
+              <w:t>Cab Light</w:t>
+            </w:r>
+          </w:p>
+        </w:tc>
+        <w:tc>
+          <w:tcPr>
+            <w:tcW w:w="1016" w:type="dxa"/>
+            <w:tcBorders>
+              <w:top w:val="single" w:sz="4" w:space="0" w:color="000000"/>
+              <w:left w:val="single" w:sz="4" w:space="0" w:color="000000"/>
+              <w:bottom w:val="single" w:sz="4" w:space="0" w:color="000000"/>
+            </w:tcBorders>
+            <w:vAlign w:val="bottom"/>
+          </w:tcPr>
+          <w:p>
+            <w:pPr>
+              <w:pStyle w:val="Normal"/>
+              <w:widowControl w:val="false"/>
+              <w:spacing w:lineRule="auto" w:line="180"/>
+              <w:jc w:val="center"/>
+              <w:rPr>
+                <w:sz w:val="16"/>
+                <w:szCs w:val="16"/>
+              </w:rPr>
+            </w:pPr>
+            <w:r>
+              <w:rPr>
+                <w:rFonts w:eastAsia="arial" w:ascii="arial" w:hAnsi="arial"/>
+                <w:color w:val="000000"/>
+                <w:sz w:val="16"/>
+                <w:szCs w:val="16"/>
+              </w:rPr>
+              <w:t>Couple</w:t>
+            </w:r>
+          </w:p>
+        </w:tc>
+        <w:tc>
+          <w:tcPr>
+            <w:tcW w:w="1016" w:type="dxa"/>
+            <w:tcBorders>
+              <w:top w:val="single" w:sz="4" w:space="0" w:color="000000"/>
+              <w:left w:val="single" w:sz="4" w:space="0" w:color="000000"/>
+              <w:bottom w:val="single" w:sz="4" w:space="0" w:color="000000"/>
+            </w:tcBorders>
+            <w:vAlign w:val="bottom"/>
+          </w:tcPr>
+          <w:p>
+            <w:pPr>
+              <w:pStyle w:val="Normal"/>
+              <w:widowControl w:val="false"/>
+              <w:spacing w:lineRule="auto" w:line="180"/>
+              <w:jc w:val="center"/>
+              <w:rPr>
+                <w:sz w:val="16"/>
+                <w:szCs w:val="16"/>
+              </w:rPr>
+            </w:pPr>
+            <w:r>
+              <w:rPr>
+                <w:rFonts w:eastAsia="arial" w:ascii="arial" w:hAnsi="arial"/>
+                <w:color w:val="000000"/>
+                <w:sz w:val="16"/>
+                <w:szCs w:val="16"/>
+              </w:rPr>
+              <w:t>1-Person</w:t>
+            </w:r>
+          </w:p>
+        </w:tc>
+        <w:tc>
+          <w:tcPr>
+            <w:tcW w:w="1029" w:type="dxa"/>
+            <w:tcBorders>
+              <w:top w:val="single" w:sz="4" w:space="0" w:color="000000"/>
+              <w:left w:val="single" w:sz="4" w:space="0" w:color="000000"/>
+              <w:bottom w:val="single" w:sz="4" w:space="0" w:color="000000"/>
+              <w:right w:val="single" w:sz="4" w:space="0" w:color="000000"/>
+            </w:tcBorders>
+            <w:vAlign w:val="bottom"/>
+          </w:tcPr>
+          <w:p>
+            <w:pPr>
+              <w:pStyle w:val="Normal"/>
+              <w:widowControl w:val="false"/>
+              <w:spacing w:lineRule="auto" w:line="180"/>
+              <w:jc w:val="center"/>
+              <w:rPr>
+                <w:sz w:val="16"/>
+                <w:szCs w:val="16"/>
+              </w:rPr>
+            </w:pPr>
+            <w:r>
+              <w:rPr>
+                <w:rFonts w:eastAsia="arial" w:ascii="arial" w:hAnsi="arial"/>
+                <w:color w:val="000000"/>
+                <w:sz w:val="16"/>
+                <w:szCs w:val="16"/>
+              </w:rPr>
+              <w:t>Next</w:t>
+            </w:r>
+          </w:p>
+          <w:p>
+            <w:pPr>
+              <w:pStyle w:val="Normal"/>
+              <w:widowControl w:val="false"/>
+              <w:spacing w:lineRule="auto" w:line="180"/>
+              <w:jc w:val="center"/>
+              <w:rPr>
+                <w:sz w:val="16"/>
+                <w:szCs w:val="16"/>
+              </w:rPr>
+            </w:pPr>
+            <w:r>
+              <w:rPr>
+                <w:rFonts w:eastAsia="arial" w:ascii="arial" w:hAnsi="arial"/>
+                <w:color w:val="000000"/>
+                <w:sz w:val="16"/>
+                <w:szCs w:val="16"/>
+              </w:rPr>
+              <w:t>Cab Cam</w:t>
+            </w:r>
+          </w:p>
+        </w:tc>
+      </w:tr>
+    </w:tbl>
+    <w:p>
+      <w:pPr>
+        <w:pStyle w:val="Normal"/>
+        <w:rPr>
+          <w:rFonts w:ascii="arial" w:hAnsi="arial" w:eastAsia="arial"/>
+          <w:color w:val="000000"/>
+          <w:sz w:val="16"/>
+          <w:szCs w:val="16"/>
+        </w:rPr>
+      </w:pPr>
+      <w:r>
+        <w:rPr>
+          <w:rFonts w:eastAsia="arial" w:ascii="arial" w:hAnsi="arial"/>
+          <w:color w:val="000000"/>
+          <w:sz w:val="16"/>
+          <w:szCs w:val="16"/>
+        </w:rPr>
+      </w:r>
+    </w:p>
+    <w:p>
+      <w:pPr>
+        <w:pStyle w:val="Normal"/>
+        <w:rPr>
+          <w:color w:val="000000"/>
+          <w:sz w:val="16"/>
+          <w:szCs w:val="16"/>
+        </w:rPr>
+      </w:pPr>
+      <w:r>
+        <w:rPr>
+          <w:rFonts w:eastAsia="arial" w:ascii="arial" w:hAnsi="arial"/>
+          <w:color w:val="000000"/>
+          <w:sz w:val="16"/>
+          <w:szCs w:val="16"/>
+        </w:rPr>
+        <w:tab/>
+        <w:t xml:space="preserve">           Class 801-2</w:t>
+      </w:r>
+    </w:p>
+    <w:tbl>
+      <w:tblPr>
+        <w:tblW w:w="14248" w:type="dxa"/>
+        <w:jc w:val="left"/>
+        <w:tblInd w:w="-5" w:type="dxa"/>
+        <w:tblLayout w:type="fixed"/>
+        <w:tblCellMar>
+          <w:top w:w="0" w:type="dxa"/>
+          <w:left w:w="108" w:type="dxa"/>
+          <w:bottom w:w="0" w:type="dxa"/>
+          <w:right w:w="108" w:type="dxa"/>
+        </w:tblCellMar>
+        <w:tblLook w:firstRow="1" w:noVBand="1" w:lastRow="0" w:firstColumn="1" w:lastColumn="0" w:noHBand="0" w:val="04a0"/>
+      </w:tblPr>
+      <w:tblGrid>
+        <w:gridCol w:w="1017"/>
+        <w:gridCol w:w="1019"/>
+        <w:gridCol w:w="1014"/>
+        <w:gridCol w:w="1016"/>
+        <w:gridCol w:w="1020"/>
+        <w:gridCol w:w="1016"/>
+        <w:gridCol w:w="1016"/>
+        <w:gridCol w:w="1017"/>
+        <w:gridCol w:w="1016"/>
+        <w:gridCol w:w="1020"/>
+        <w:gridCol w:w="1016"/>
+        <w:gridCol w:w="1016"/>
+        <w:gridCol w:w="1016"/>
+        <w:gridCol w:w="1029"/>
+      </w:tblGrid>
+      <w:tr>
+        <w:trPr>
+          <w:trHeight w:val="440" w:hRule="exact"/>
+          <w:cantSplit w:val="true"/>
+        </w:trPr>
+        <w:tc>
+          <w:tcPr>
+            <w:tcW w:w="1017" w:type="dxa"/>
+            <w:tcBorders>
+              <w:top w:val="single" w:sz="4" w:space="0" w:color="000000"/>
+              <w:left w:val="single" w:sz="4" w:space="0" w:color="000000"/>
+              <w:bottom w:val="single" w:sz="4" w:space="0" w:color="000000"/>
+            </w:tcBorders>
+            <w:vAlign w:val="bottom"/>
+          </w:tcPr>
+          <w:p>
+            <w:pPr>
+              <w:pStyle w:val="Normal"/>
+              <w:widowControl w:val="false"/>
+              <w:spacing w:lineRule="auto" w:line="180" w:before="0" w:after="60"/>
+              <w:jc w:val="center"/>
+              <w:rPr>
+                <w:b/>
+                <w:bCs/>
+              </w:rPr>
+            </w:pPr>
+            <w:r>
+              <w:rPr>
+                <w:b/>
+                <w:bCs/>
+                <w:color w:val="000000"/>
+                <w:sz w:val="16"/>
+                <w:szCs w:val="16"/>
+              </w:rPr>
+              <w:t>HUD</w:t>
+            </w:r>
+          </w:p>
+        </w:tc>
+        <w:tc>
+          <w:tcPr>
+            <w:tcW w:w="1019" w:type="dxa"/>
+            <w:tcBorders>
+              <w:top w:val="single" w:sz="4" w:space="0" w:color="000000"/>
+              <w:left w:val="single" w:sz="4" w:space="0" w:color="000000"/>
+              <w:bottom w:val="single" w:sz="4" w:space="0" w:color="000000"/>
+            </w:tcBorders>
+            <w:vAlign w:val="bottom"/>
+          </w:tcPr>
+          <w:p>
+            <w:pPr>
+              <w:pStyle w:val="Normal"/>
+              <w:widowControl w:val="false"/>
+              <w:spacing w:lineRule="auto" w:line="180"/>
+              <w:jc w:val="center"/>
+              <w:rPr>
+                <w:color w:val="000000"/>
+                <w:sz w:val="16"/>
+                <w:szCs w:val="16"/>
+              </w:rPr>
+            </w:pPr>
+            <w:r>
+              <w:rPr>
+                <w:color w:val="000000"/>
+                <w:sz w:val="16"/>
+                <w:szCs w:val="16"/>
+              </w:rPr>
+              <w:t>Schedule</w:t>
+            </w:r>
+          </w:p>
+        </w:tc>
+        <w:tc>
+          <w:tcPr>
+            <w:tcW w:w="1014" w:type="dxa"/>
+            <w:tcBorders>
+              <w:top w:val="single" w:sz="4" w:space="0" w:color="000000"/>
+              <w:left w:val="single" w:sz="4" w:space="0" w:color="000000"/>
+              <w:bottom w:val="single" w:sz="4" w:space="0" w:color="000000"/>
+            </w:tcBorders>
+            <w:vAlign w:val="bottom"/>
+          </w:tcPr>
+          <w:p>
+            <w:pPr>
+              <w:pStyle w:val="Normal"/>
+              <w:widowControl w:val="false"/>
+              <w:spacing w:lineRule="auto" w:line="180"/>
+              <w:jc w:val="center"/>
+              <w:rPr>
+                <w:color w:val="000000"/>
+                <w:sz w:val="16"/>
+                <w:szCs w:val="16"/>
+              </w:rPr>
+            </w:pPr>
+            <w:r>
+              <w:rPr>
+                <w:color w:val="000000"/>
+                <w:sz w:val="16"/>
+                <w:szCs w:val="16"/>
+              </w:rPr>
+              <w:t>Aux Off</w:t>
+            </w:r>
+          </w:p>
+        </w:tc>
+        <w:tc>
+          <w:tcPr>
+            <w:tcW w:w="1016" w:type="dxa"/>
+            <w:tcBorders>
+              <w:top w:val="single" w:sz="4" w:space="0" w:color="000000"/>
+              <w:left w:val="single" w:sz="4" w:space="0" w:color="000000"/>
+              <w:bottom w:val="single" w:sz="4" w:space="0" w:color="000000"/>
+            </w:tcBorders>
+            <w:vAlign w:val="bottom"/>
+          </w:tcPr>
+          <w:p>
+            <w:pPr>
+              <w:pStyle w:val="Normal"/>
+              <w:widowControl w:val="false"/>
+              <w:spacing w:lineRule="auto" w:line="180"/>
+              <w:jc w:val="center"/>
+              <w:rPr>
+                <w:color w:val="000000"/>
+                <w:sz w:val="16"/>
+                <w:szCs w:val="16"/>
+              </w:rPr>
+            </w:pPr>
+            <w:r>
+              <w:rPr>
+                <w:color w:val="000000"/>
+                <w:sz w:val="16"/>
+                <w:szCs w:val="16"/>
+              </w:rPr>
+              <w:t>DSD/Vigilance</w:t>
+            </w:r>
+          </w:p>
+        </w:tc>
+        <w:tc>
+          <w:tcPr>
+            <w:tcW w:w="1020" w:type="dxa"/>
+            <w:tcBorders>
+              <w:top w:val="single" w:sz="4" w:space="0" w:color="000000"/>
+              <w:left w:val="single" w:sz="4" w:space="0" w:color="000000"/>
+              <w:bottom w:val="single" w:sz="4" w:space="0" w:color="000000"/>
+            </w:tcBorders>
+            <w:vAlign w:val="bottom"/>
+          </w:tcPr>
+          <w:p>
+            <w:pPr>
+              <w:pStyle w:val="Normal"/>
+              <w:widowControl w:val="false"/>
+              <w:spacing w:lineRule="auto" w:line="180"/>
+              <w:jc w:val="center"/>
+              <w:rPr>
+                <w:color w:val="000000"/>
+                <w:sz w:val="16"/>
+                <w:szCs w:val="16"/>
+              </w:rPr>
+            </w:pPr>
+            <w:r>
+              <w:rPr>
+                <w:color w:val="000000"/>
+                <w:sz w:val="16"/>
+                <w:szCs w:val="16"/>
+              </w:rPr>
+              <w:t>Panto. Low</w:t>
+            </w:r>
+          </w:p>
+        </w:tc>
+        <w:tc>
+          <w:tcPr>
+            <w:tcW w:w="1016" w:type="dxa"/>
+            <w:tcBorders>
+              <w:top w:val="single" w:sz="4" w:space="0" w:color="000000"/>
+              <w:left w:val="single" w:sz="4" w:space="0" w:color="000000"/>
+              <w:bottom w:val="single" w:sz="4" w:space="0" w:color="000000"/>
+            </w:tcBorders>
+            <w:vAlign w:val="bottom"/>
+          </w:tcPr>
+          <w:p>
+            <w:pPr>
+              <w:pStyle w:val="Normal"/>
+              <w:widowControl w:val="false"/>
+              <w:spacing w:lineRule="auto" w:line="180"/>
+              <w:jc w:val="center"/>
+              <w:rPr>
+                <w:sz w:val="16"/>
+                <w:szCs w:val="16"/>
+              </w:rPr>
+            </w:pPr>
+            <w:r>
+              <w:rPr>
+                <w:rFonts w:eastAsia="arial" w:ascii="arial" w:hAnsi="arial"/>
+                <w:sz w:val="16"/>
+                <w:szCs w:val="16"/>
+              </w:rPr>
+              <w:t>Snow Brake</w:t>
+            </w:r>
+          </w:p>
+        </w:tc>
+        <w:tc>
+          <w:tcPr>
+            <w:tcW w:w="1016" w:type="dxa"/>
+            <w:tcBorders>
+              <w:top w:val="single" w:sz="4" w:space="0" w:color="000000"/>
+              <w:left w:val="single" w:sz="4" w:space="0" w:color="000000"/>
+              <w:bottom w:val="single" w:sz="4" w:space="0" w:color="000000"/>
+            </w:tcBorders>
+            <w:vAlign w:val="bottom"/>
+          </w:tcPr>
+          <w:p>
+            <w:pPr>
+              <w:pStyle w:val="Normal"/>
+              <w:widowControl w:val="false"/>
+              <w:jc w:val="center"/>
+              <w:rPr>
+                <w:sz w:val="16"/>
+                <w:szCs w:val="16"/>
+              </w:rPr>
+            </w:pPr>
+            <w:r>
+              <w:rPr>
+                <w:sz w:val="16"/>
+                <w:szCs w:val="16"/>
+              </w:rPr>
+              <w:t>Engine Stop</w:t>
+            </w:r>
+          </w:p>
+        </w:tc>
+        <w:tc>
+          <w:tcPr>
+            <w:tcW w:w="1017" w:type="dxa"/>
+            <w:tcBorders>
+              <w:top w:val="single" w:sz="4" w:space="0" w:color="000000"/>
+              <w:left w:val="single" w:sz="4" w:space="0" w:color="000000"/>
+              <w:bottom w:val="single" w:sz="4" w:space="0" w:color="000000"/>
+            </w:tcBorders>
+            <w:vAlign w:val="bottom"/>
+          </w:tcPr>
+          <w:p>
+            <w:pPr>
+              <w:pStyle w:val="Normal"/>
+              <w:widowControl w:val="false"/>
+              <w:jc w:val="center"/>
+              <w:rPr>
+                <w:sz w:val="16"/>
+                <w:szCs w:val="16"/>
+              </w:rPr>
+            </w:pPr>
+            <w:r>
+              <w:rPr>
+                <w:sz w:val="16"/>
+                <w:szCs w:val="16"/>
+              </w:rPr>
+              <w:t>Diesel</w:t>
+            </w:r>
+          </w:p>
+        </w:tc>
+        <w:tc>
+          <w:tcPr>
+            <w:tcW w:w="1016" w:type="dxa"/>
+            <w:tcBorders>
+              <w:top w:val="single" w:sz="4" w:space="0" w:color="000000"/>
+              <w:left w:val="single" w:sz="4" w:space="0" w:color="000000"/>
+              <w:bottom w:val="single" w:sz="4" w:space="0" w:color="000000"/>
+            </w:tcBorders>
+            <w:vAlign w:val="bottom"/>
+          </w:tcPr>
+          <w:p>
+            <w:pPr>
+              <w:pStyle w:val="Normal"/>
+              <w:widowControl w:val="false"/>
+              <w:jc w:val="center"/>
+              <w:rPr>
+                <w:color w:val="000000"/>
+                <w:sz w:val="16"/>
+                <w:szCs w:val="16"/>
+              </w:rPr>
+            </w:pPr>
+            <w:r>
+              <w:rPr>
+                <w:color w:val="000000"/>
+                <w:sz w:val="16"/>
+                <w:szCs w:val="16"/>
+              </w:rPr>
+              <w:t>Rear Coupler</w:t>
+            </w:r>
+          </w:p>
+        </w:tc>
+        <w:tc>
+          <w:tcPr>
+            <w:tcW w:w="1020" w:type="dxa"/>
+            <w:tcBorders>
+              <w:top w:val="single" w:sz="4" w:space="0" w:color="000000"/>
+              <w:left w:val="single" w:sz="4" w:space="0" w:color="000000"/>
+              <w:bottom w:val="single" w:sz="4" w:space="0" w:color="000000"/>
+            </w:tcBorders>
+            <w:vAlign w:val="bottom"/>
+          </w:tcPr>
+          <w:p>
+            <w:pPr>
+              <w:pStyle w:val="Normal"/>
+              <w:widowControl w:val="false"/>
+              <w:spacing w:lineRule="auto" w:line="180"/>
+              <w:jc w:val="center"/>
+              <w:rPr>
+                <w:sz w:val="16"/>
+                <w:szCs w:val="16"/>
+              </w:rPr>
+            </w:pPr>
+            <w:r>
+              <w:rPr>
+                <w:rFonts w:eastAsia="arial" w:ascii="arial" w:hAnsi="arial"/>
+                <w:color w:val="000000"/>
+                <w:sz w:val="16"/>
+                <w:szCs w:val="16"/>
+              </w:rPr>
+              <w:t>Desk Light Down</w:t>
+            </w:r>
+          </w:p>
+        </w:tc>
+        <w:tc>
+          <w:tcPr>
+            <w:tcW w:w="1016" w:type="dxa"/>
+            <w:tcBorders>
+              <w:top w:val="single" w:sz="4" w:space="0" w:color="000000"/>
+              <w:left w:val="single" w:sz="4" w:space="0" w:color="000000"/>
+              <w:bottom w:val="single" w:sz="4" w:space="0" w:color="000000"/>
+            </w:tcBorders>
+            <w:vAlign w:val="bottom"/>
+          </w:tcPr>
+          <w:p>
+            <w:pPr>
+              <w:pStyle w:val="Normal"/>
+              <w:widowControl w:val="false"/>
+              <w:spacing w:lineRule="auto" w:line="180"/>
+              <w:jc w:val="center"/>
+              <w:rPr>
+                <w:sz w:val="16"/>
+                <w:szCs w:val="16"/>
+              </w:rPr>
+            </w:pPr>
+            <w:r>
+              <w:rPr>
+                <w:rFonts w:eastAsia="arial" w:ascii="arial" w:hAnsi="arial"/>
+                <w:color w:val="000000"/>
+                <w:sz w:val="16"/>
+                <w:szCs w:val="16"/>
+              </w:rPr>
+              <w:t>Hazard Warning</w:t>
+            </w:r>
+          </w:p>
+        </w:tc>
+        <w:tc>
+          <w:tcPr>
+            <w:tcW w:w="1016" w:type="dxa"/>
+            <w:tcBorders>
+              <w:top w:val="single" w:sz="4" w:space="0" w:color="000000"/>
+              <w:left w:val="single" w:sz="4" w:space="0" w:color="000000"/>
+              <w:bottom w:val="single" w:sz="4" w:space="0" w:color="000000"/>
+            </w:tcBorders>
+            <w:vAlign w:val="bottom"/>
+          </w:tcPr>
+          <w:p>
+            <w:pPr>
+              <w:pStyle w:val="Normal"/>
+              <w:widowControl w:val="false"/>
+              <w:spacing w:lineRule="auto" w:line="180"/>
+              <w:jc w:val="center"/>
+              <w:rPr>
+                <w:sz w:val="16"/>
+                <w:szCs w:val="16"/>
+              </w:rPr>
+            </w:pPr>
+            <w:r>
+              <w:rPr>
+                <w:rFonts w:eastAsia="arial" w:ascii="arial" w:hAnsi="arial"/>
+                <w:color w:val="000000"/>
+                <w:sz w:val="16"/>
+                <w:szCs w:val="16"/>
+              </w:rPr>
+              <w:t>Uncouple</w:t>
+            </w:r>
+          </w:p>
+        </w:tc>
+        <w:tc>
+          <w:tcPr>
+            <w:tcW w:w="1016" w:type="dxa"/>
+            <w:tcBorders>
+              <w:top w:val="single" w:sz="4" w:space="0" w:color="000000"/>
+              <w:left w:val="single" w:sz="4" w:space="0" w:color="000000"/>
+              <w:bottom w:val="single" w:sz="4" w:space="0" w:color="000000"/>
+            </w:tcBorders>
+            <w:vAlign w:val="bottom"/>
+          </w:tcPr>
+          <w:p>
+            <w:pPr>
+              <w:pStyle w:val="Normal"/>
+              <w:widowControl w:val="false"/>
+              <w:spacing w:lineRule="auto" w:line="180"/>
+              <w:jc w:val="center"/>
+              <w:rPr>
+                <w:sz w:val="16"/>
+                <w:szCs w:val="16"/>
+              </w:rPr>
+            </w:pPr>
+            <w:r>
+              <w:rPr>
+                <w:rFonts w:eastAsia="arial" w:ascii="arial" w:hAnsi="arial"/>
+                <w:color w:val="000000"/>
+                <w:sz w:val="16"/>
+                <w:szCs w:val="16"/>
+              </w:rPr>
+              <w:t>Exterior</w:t>
+            </w:r>
+          </w:p>
+          <w:p>
+            <w:pPr>
+              <w:pStyle w:val="Normal"/>
+              <w:widowControl w:val="false"/>
+              <w:spacing w:lineRule="auto" w:line="180"/>
+              <w:jc w:val="center"/>
+              <w:rPr>
+                <w:sz w:val="16"/>
+                <w:szCs w:val="16"/>
+              </w:rPr>
+            </w:pPr>
+            <w:r>
+              <w:rPr>
+                <w:rFonts w:eastAsia="arial" w:ascii="arial" w:hAnsi="arial"/>
+                <w:color w:val="000000"/>
+                <w:sz w:val="16"/>
+                <w:szCs w:val="16"/>
+              </w:rPr>
+              <w:t>Camera</w:t>
+            </w:r>
+          </w:p>
+        </w:tc>
+        <w:tc>
+          <w:tcPr>
+            <w:tcW w:w="1029" w:type="dxa"/>
+            <w:tcBorders>
+              <w:top w:val="single" w:sz="4" w:space="0" w:color="000000"/>
+              <w:left w:val="single" w:sz="4" w:space="0" w:color="000000"/>
+              <w:bottom w:val="single" w:sz="4" w:space="0" w:color="000000"/>
+              <w:right w:val="single" w:sz="4" w:space="0" w:color="000000"/>
+            </w:tcBorders>
+            <w:vAlign w:val="bottom"/>
+          </w:tcPr>
+          <w:p>
+            <w:pPr>
+              <w:pStyle w:val="Normal"/>
+              <w:widowControl w:val="false"/>
+              <w:spacing w:lineRule="auto" w:line="180"/>
+              <w:jc w:val="center"/>
+              <w:rPr>
+                <w:sz w:val="16"/>
+                <w:szCs w:val="16"/>
+              </w:rPr>
+            </w:pPr>
+            <w:r>
+              <w:rPr>
+                <w:rFonts w:eastAsia="arial" w:ascii="arial" w:hAnsi="arial"/>
+                <w:color w:val="000000"/>
+                <w:sz w:val="16"/>
+                <w:szCs w:val="16"/>
+              </w:rPr>
+              <w:t>Prev</w:t>
+            </w:r>
+          </w:p>
+          <w:p>
+            <w:pPr>
+              <w:pStyle w:val="Normal"/>
+              <w:widowControl w:val="false"/>
+              <w:spacing w:lineRule="auto" w:line="180"/>
+              <w:jc w:val="center"/>
+              <w:rPr>
+                <w:sz w:val="16"/>
+                <w:szCs w:val="16"/>
+              </w:rPr>
+            </w:pPr>
+            <w:r>
+              <w:rPr>
+                <w:rFonts w:eastAsia="arial" w:ascii="arial" w:hAnsi="arial"/>
+                <w:color w:val="000000"/>
+                <w:sz w:val="16"/>
+                <w:szCs w:val="16"/>
+              </w:rPr>
+              <w:t>Cab Cam</w:t>
+            </w:r>
+          </w:p>
+        </w:tc>
+      </w:tr>
+    </w:tbl>
+    <w:p>
+      <w:pPr>
+        <w:pStyle w:val="Normal"/>
+        <w:rPr>
+          <w:color w:val="000000"/>
+          <w:sz w:val="16"/>
+          <w:szCs w:val="16"/>
+        </w:rPr>
+      </w:pPr>
+      <w:r>
+        <w:rPr>
+          <w:color w:val="000000"/>
+          <w:sz w:val="16"/>
+          <w:szCs w:val="16"/>
+        </w:rPr>
+      </w:r>
+    </w:p>
+    <w:p>
+      <w:pPr>
+        <w:pStyle w:val="Normal"/>
+        <w:rPr>
+          <w:color w:val="000000"/>
+          <w:sz w:val="16"/>
+          <w:szCs w:val="16"/>
+        </w:rPr>
+      </w:pPr>
+      <w:r>
+        <w:rPr>
+          <w:rFonts w:eastAsia="arial" w:ascii="arial" w:hAnsi="arial"/>
+          <w:color w:val="000000"/>
+          <w:sz w:val="16"/>
+          <w:szCs w:val="16"/>
+        </w:rPr>
+        <w:tab/>
+        <w:t xml:space="preserve">           Class 802-1</w:t>
+      </w:r>
+    </w:p>
+    <w:tbl>
+      <w:tblPr>
+        <w:tblW w:w="14248" w:type="dxa"/>
+        <w:jc w:val="left"/>
+        <w:tblInd w:w="-5" w:type="dxa"/>
+        <w:tblLayout w:type="fixed"/>
+        <w:tblCellMar>
+          <w:top w:w="0" w:type="dxa"/>
+          <w:left w:w="108" w:type="dxa"/>
+          <w:bottom w:w="0" w:type="dxa"/>
+          <w:right w:w="108" w:type="dxa"/>
+        </w:tblCellMar>
+        <w:tblLook w:firstRow="1" w:noVBand="1" w:lastRow="0" w:firstColumn="1" w:lastColumn="0" w:noHBand="0" w:val="04a0"/>
+      </w:tblPr>
+      <w:tblGrid>
+        <w:gridCol w:w="1017"/>
+        <w:gridCol w:w="1019"/>
+        <w:gridCol w:w="1014"/>
+        <w:gridCol w:w="1016"/>
+        <w:gridCol w:w="1020"/>
+        <w:gridCol w:w="1016"/>
+        <w:gridCol w:w="1016"/>
+        <w:gridCol w:w="1017"/>
+        <w:gridCol w:w="1016"/>
+        <w:gridCol w:w="1020"/>
+        <w:gridCol w:w="1016"/>
+        <w:gridCol w:w="1016"/>
+        <w:gridCol w:w="1016"/>
+        <w:gridCol w:w="1029"/>
+      </w:tblGrid>
+      <w:tr>
+        <w:trPr>
+          <w:trHeight w:val="440" w:hRule="exact"/>
+          <w:cantSplit w:val="true"/>
+        </w:trPr>
+        <w:tc>
+          <w:tcPr>
+            <w:tcW w:w="1017" w:type="dxa"/>
+            <w:tcBorders>
+              <w:top w:val="single" w:sz="4" w:space="0" w:color="000000"/>
+              <w:left w:val="single" w:sz="4" w:space="0" w:color="000000"/>
+              <w:bottom w:val="single" w:sz="4" w:space="0" w:color="000000"/>
+            </w:tcBorders>
+            <w:vAlign w:val="bottom"/>
+          </w:tcPr>
+          <w:p>
+            <w:pPr>
+              <w:pStyle w:val="Normal"/>
+              <w:widowControl w:val="false"/>
+              <w:spacing w:lineRule="auto" w:line="180" w:before="0" w:after="60"/>
+              <w:jc w:val="center"/>
+              <w:rPr>
+                <w:color w:val="000000"/>
+                <w:sz w:val="16"/>
+                <w:szCs w:val="16"/>
+              </w:rPr>
+            </w:pPr>
+            <w:r>
+              <w:rPr>
+                <w:rFonts w:eastAsia="arial" w:ascii="arial" w:hAnsi="arial"/>
+                <w:b/>
+                <w:color w:val="000000"/>
+                <w:sz w:val="16"/>
+                <w:szCs w:val="16"/>
+              </w:rPr>
+              <w:t>Pause</w:t>
+            </w:r>
+          </w:p>
+        </w:tc>
+        <w:tc>
+          <w:tcPr>
+            <w:tcW w:w="1019" w:type="dxa"/>
+            <w:tcBorders>
+              <w:top w:val="single" w:sz="4" w:space="0" w:color="000000"/>
+              <w:left w:val="single" w:sz="4" w:space="0" w:color="000000"/>
+              <w:bottom w:val="single" w:sz="4" w:space="0" w:color="000000"/>
+            </w:tcBorders>
+            <w:vAlign w:val="bottom"/>
+          </w:tcPr>
+          <w:p>
+            <w:pPr>
+              <w:pStyle w:val="Normal"/>
+              <w:widowControl w:val="false"/>
+              <w:spacing w:lineRule="auto" w:line="180"/>
+              <w:jc w:val="center"/>
+              <w:rPr>
+                <w:color w:val="000000"/>
+                <w:sz w:val="16"/>
+                <w:szCs w:val="16"/>
+              </w:rPr>
+            </w:pPr>
+            <w:r>
+              <w:rPr>
+                <w:color w:val="000000"/>
+                <w:sz w:val="16"/>
+                <w:szCs w:val="16"/>
+              </w:rPr>
+              <w:t>Master Key</w:t>
+            </w:r>
+          </w:p>
+        </w:tc>
+        <w:tc>
+          <w:tcPr>
+            <w:tcW w:w="1014" w:type="dxa"/>
+            <w:tcBorders>
+              <w:top w:val="single" w:sz="4" w:space="0" w:color="000000"/>
+              <w:left w:val="single" w:sz="4" w:space="0" w:color="000000"/>
+              <w:bottom w:val="single" w:sz="4" w:space="0" w:color="000000"/>
+            </w:tcBorders>
+            <w:vAlign w:val="bottom"/>
+          </w:tcPr>
+          <w:p>
+            <w:pPr>
+              <w:pStyle w:val="Normal"/>
+              <w:widowControl w:val="false"/>
+              <w:spacing w:lineRule="auto" w:line="180"/>
+              <w:jc w:val="center"/>
+              <w:rPr>
+                <w:color w:val="000000"/>
+                <w:sz w:val="16"/>
+                <w:szCs w:val="16"/>
+              </w:rPr>
+            </w:pPr>
+            <w:r>
+              <w:rPr>
+                <w:color w:val="000000"/>
+                <w:sz w:val="16"/>
+                <w:szCs w:val="16"/>
+              </w:rPr>
+              <w:t>Aux On</w:t>
+            </w:r>
+          </w:p>
+        </w:tc>
+        <w:tc>
+          <w:tcPr>
+            <w:tcW w:w="1016" w:type="dxa"/>
+            <w:tcBorders>
+              <w:top w:val="single" w:sz="4" w:space="0" w:color="000000"/>
+              <w:left w:val="single" w:sz="4" w:space="0" w:color="000000"/>
+              <w:bottom w:val="single" w:sz="4" w:space="0" w:color="000000"/>
+            </w:tcBorders>
+            <w:vAlign w:val="bottom"/>
+          </w:tcPr>
+          <w:p>
+            <w:pPr>
+              <w:pStyle w:val="Normal"/>
+              <w:widowControl w:val="false"/>
+              <w:spacing w:lineRule="auto" w:line="180"/>
+              <w:jc w:val="center"/>
+              <w:rPr>
+                <w:color w:val="000000"/>
+                <w:sz w:val="16"/>
+                <w:szCs w:val="16"/>
+              </w:rPr>
+            </w:pPr>
+            <w:r>
+              <w:rPr>
+                <w:color w:val="000000"/>
+                <w:sz w:val="16"/>
+                <w:szCs w:val="16"/>
+              </w:rPr>
+              <w:t>AWS/TPWS</w:t>
+            </w:r>
+          </w:p>
+        </w:tc>
+        <w:tc>
+          <w:tcPr>
+            <w:tcW w:w="1020" w:type="dxa"/>
+            <w:tcBorders>
+              <w:top w:val="single" w:sz="4" w:space="0" w:color="000000"/>
+              <w:left w:val="single" w:sz="4" w:space="0" w:color="000000"/>
+              <w:bottom w:val="single" w:sz="4" w:space="0" w:color="000000"/>
+            </w:tcBorders>
+            <w:vAlign w:val="bottom"/>
+          </w:tcPr>
+          <w:p>
+            <w:pPr>
+              <w:pStyle w:val="Normal"/>
+              <w:widowControl w:val="false"/>
+              <w:spacing w:lineRule="auto" w:line="180"/>
+              <w:jc w:val="center"/>
+              <w:rPr>
+                <w:color w:val="000000"/>
+                <w:sz w:val="16"/>
+                <w:szCs w:val="16"/>
+              </w:rPr>
+            </w:pPr>
+            <w:r>
+              <w:rPr>
+                <w:color w:val="000000"/>
+                <w:sz w:val="16"/>
+                <w:szCs w:val="16"/>
+              </w:rPr>
+              <w:t>Panto. Raise</w:t>
+            </w:r>
+          </w:p>
+        </w:tc>
+        <w:tc>
+          <w:tcPr>
+            <w:tcW w:w="1016" w:type="dxa"/>
+            <w:tcBorders>
+              <w:top w:val="single" w:sz="4" w:space="0" w:color="000000"/>
+              <w:left w:val="single" w:sz="4" w:space="0" w:color="000000"/>
+              <w:bottom w:val="single" w:sz="4" w:space="0" w:color="000000"/>
+            </w:tcBorders>
+            <w:vAlign w:val="bottom"/>
+          </w:tcPr>
+          <w:p>
+            <w:pPr>
+              <w:pStyle w:val="Normal"/>
+              <w:widowControl w:val="false"/>
+              <w:spacing w:lineRule="auto" w:line="180"/>
+              <w:jc w:val="center"/>
+              <w:rPr>
+                <w:color w:val="000000"/>
+                <w:sz w:val="16"/>
+                <w:szCs w:val="16"/>
+              </w:rPr>
+            </w:pPr>
+            <w:r>
+              <w:rPr>
+                <w:color w:val="000000"/>
+                <w:sz w:val="16"/>
+                <w:szCs w:val="16"/>
+              </w:rPr>
+              <w:t>DRA</w:t>
+            </w:r>
+          </w:p>
+        </w:tc>
+        <w:tc>
+          <w:tcPr>
+            <w:tcW w:w="1016" w:type="dxa"/>
+            <w:tcBorders>
+              <w:top w:val="single" w:sz="4" w:space="0" w:color="000000"/>
+              <w:left w:val="single" w:sz="4" w:space="0" w:color="000000"/>
+              <w:bottom w:val="single" w:sz="4" w:space="0" w:color="000000"/>
+            </w:tcBorders>
+            <w:vAlign w:val="bottom"/>
+          </w:tcPr>
+          <w:p>
+            <w:pPr>
+              <w:pStyle w:val="Normal"/>
+              <w:widowControl w:val="false"/>
+              <w:jc w:val="center"/>
+              <w:rPr>
+                <w:sz w:val="16"/>
+                <w:szCs w:val="16"/>
+              </w:rPr>
+            </w:pPr>
+            <w:r>
+              <w:rPr>
+                <w:sz w:val="16"/>
+                <w:szCs w:val="16"/>
+              </w:rPr>
+              <w:t>Engine Start</w:t>
+            </w:r>
+          </w:p>
+        </w:tc>
+        <w:tc>
+          <w:tcPr>
+            <w:tcW w:w="1017" w:type="dxa"/>
+            <w:tcBorders>
+              <w:top w:val="single" w:sz="4" w:space="0" w:color="000000"/>
+              <w:left w:val="single" w:sz="4" w:space="0" w:color="000000"/>
+              <w:bottom w:val="single" w:sz="4" w:space="0" w:color="000000"/>
+            </w:tcBorders>
+            <w:vAlign w:val="bottom"/>
+          </w:tcPr>
+          <w:p>
+            <w:pPr>
+              <w:pStyle w:val="Normal"/>
+              <w:widowControl w:val="false"/>
+              <w:jc w:val="center"/>
+              <w:rPr>
+                <w:sz w:val="16"/>
+                <w:szCs w:val="16"/>
+              </w:rPr>
+            </w:pPr>
+            <w:r>
+              <w:rPr>
+                <w:sz w:val="16"/>
+                <w:szCs w:val="16"/>
+              </w:rPr>
+              <w:t>Electric</w:t>
+            </w:r>
+          </w:p>
+        </w:tc>
+        <w:tc>
+          <w:tcPr>
+            <w:tcW w:w="1016" w:type="dxa"/>
+            <w:tcBorders>
+              <w:top w:val="single" w:sz="4" w:space="0" w:color="000000"/>
+              <w:left w:val="single" w:sz="4" w:space="0" w:color="000000"/>
+              <w:bottom w:val="single" w:sz="4" w:space="0" w:color="000000"/>
+            </w:tcBorders>
+            <w:vAlign w:val="bottom"/>
+          </w:tcPr>
+          <w:p>
+            <w:pPr>
+              <w:pStyle w:val="Normal"/>
+              <w:widowControl w:val="false"/>
+              <w:jc w:val="center"/>
+              <w:rPr>
+                <w:color w:val="000000"/>
+                <w:sz w:val="16"/>
+                <w:szCs w:val="16"/>
+              </w:rPr>
+            </w:pPr>
+            <w:r>
+              <w:rPr>
+                <w:color w:val="000000"/>
+                <w:sz w:val="16"/>
+                <w:szCs w:val="16"/>
+              </w:rPr>
+              <w:t>Front Coupler</w:t>
+            </w:r>
+          </w:p>
+        </w:tc>
+        <w:tc>
+          <w:tcPr>
+            <w:tcW w:w="1020" w:type="dxa"/>
+            <w:tcBorders>
+              <w:top w:val="single" w:sz="4" w:space="0" w:color="000000"/>
+              <w:left w:val="single" w:sz="4" w:space="0" w:color="000000"/>
+              <w:bottom w:val="single" w:sz="4" w:space="0" w:color="000000"/>
+            </w:tcBorders>
+            <w:vAlign w:val="bottom"/>
+          </w:tcPr>
+          <w:p>
+            <w:pPr>
+              <w:pStyle w:val="Normal"/>
+              <w:widowControl w:val="false"/>
+              <w:spacing w:lineRule="auto" w:line="180"/>
+              <w:jc w:val="center"/>
+              <w:rPr>
+                <w:sz w:val="16"/>
+                <w:szCs w:val="16"/>
+              </w:rPr>
+            </w:pPr>
+            <w:r>
+              <w:rPr>
+                <w:rFonts w:eastAsia="arial" w:ascii="arial" w:hAnsi="arial"/>
+                <w:color w:val="000000"/>
+                <w:sz w:val="16"/>
+                <w:szCs w:val="16"/>
+              </w:rPr>
+              <w:t>Desk Light Up</w:t>
+            </w:r>
+          </w:p>
+        </w:tc>
+        <w:tc>
+          <w:tcPr>
+            <w:tcW w:w="1016" w:type="dxa"/>
+            <w:tcBorders>
+              <w:top w:val="single" w:sz="4" w:space="0" w:color="000000"/>
+              <w:left w:val="single" w:sz="4" w:space="0" w:color="000000"/>
+              <w:bottom w:val="single" w:sz="4" w:space="0" w:color="000000"/>
+            </w:tcBorders>
+            <w:vAlign w:val="bottom"/>
+          </w:tcPr>
+          <w:p>
+            <w:pPr>
+              <w:pStyle w:val="Normal"/>
+              <w:widowControl w:val="false"/>
+              <w:spacing w:lineRule="auto" w:line="180"/>
+              <w:jc w:val="center"/>
+              <w:rPr>
+                <w:sz w:val="16"/>
+                <w:szCs w:val="16"/>
+              </w:rPr>
+            </w:pPr>
+            <w:r>
+              <w:rPr>
+                <w:rFonts w:eastAsia="arial" w:ascii="arial" w:hAnsi="arial"/>
+                <w:color w:val="000000"/>
+                <w:sz w:val="16"/>
+                <w:szCs w:val="16"/>
+              </w:rPr>
+              <w:t>Cab Light</w:t>
+            </w:r>
+          </w:p>
+        </w:tc>
+        <w:tc>
+          <w:tcPr>
+            <w:tcW w:w="1016" w:type="dxa"/>
+            <w:tcBorders>
+              <w:top w:val="single" w:sz="4" w:space="0" w:color="000000"/>
+              <w:left w:val="single" w:sz="4" w:space="0" w:color="000000"/>
+              <w:bottom w:val="single" w:sz="4" w:space="0" w:color="000000"/>
+            </w:tcBorders>
+            <w:vAlign w:val="bottom"/>
+          </w:tcPr>
+          <w:p>
+            <w:pPr>
+              <w:pStyle w:val="Normal"/>
+              <w:widowControl w:val="false"/>
+              <w:spacing w:lineRule="auto" w:line="180"/>
+              <w:jc w:val="center"/>
+              <w:rPr>
+                <w:sz w:val="16"/>
+                <w:szCs w:val="16"/>
+              </w:rPr>
+            </w:pPr>
+            <w:r>
+              <w:rPr>
+                <w:rFonts w:eastAsia="arial" w:ascii="arial" w:hAnsi="arial"/>
+                <w:color w:val="000000"/>
+                <w:sz w:val="16"/>
+                <w:szCs w:val="16"/>
+              </w:rPr>
+              <w:t>Couple</w:t>
+            </w:r>
+          </w:p>
+        </w:tc>
+        <w:tc>
+          <w:tcPr>
+            <w:tcW w:w="1016" w:type="dxa"/>
+            <w:tcBorders>
+              <w:top w:val="single" w:sz="4" w:space="0" w:color="000000"/>
+              <w:left w:val="single" w:sz="4" w:space="0" w:color="000000"/>
+              <w:bottom w:val="single" w:sz="4" w:space="0" w:color="000000"/>
+            </w:tcBorders>
+            <w:vAlign w:val="bottom"/>
+          </w:tcPr>
+          <w:p>
+            <w:pPr>
+              <w:pStyle w:val="Normal"/>
+              <w:widowControl w:val="false"/>
+              <w:spacing w:lineRule="auto" w:line="180"/>
+              <w:jc w:val="center"/>
+              <w:rPr>
+                <w:sz w:val="16"/>
+                <w:szCs w:val="16"/>
+              </w:rPr>
+            </w:pPr>
+            <w:r>
+              <w:rPr>
+                <w:rFonts w:eastAsia="arial" w:ascii="arial" w:hAnsi="arial"/>
+                <w:color w:val="000000"/>
+                <w:sz w:val="16"/>
+                <w:szCs w:val="16"/>
+              </w:rPr>
+              <w:t>1-Person</w:t>
+            </w:r>
+          </w:p>
+        </w:tc>
+        <w:tc>
+          <w:tcPr>
+            <w:tcW w:w="1029" w:type="dxa"/>
+            <w:tcBorders>
+              <w:top w:val="single" w:sz="4" w:space="0" w:color="000000"/>
+              <w:left w:val="single" w:sz="4" w:space="0" w:color="000000"/>
+              <w:bottom w:val="single" w:sz="4" w:space="0" w:color="000000"/>
+              <w:right w:val="single" w:sz="4" w:space="0" w:color="000000"/>
+            </w:tcBorders>
+            <w:vAlign w:val="bottom"/>
+          </w:tcPr>
+          <w:p>
+            <w:pPr>
+              <w:pStyle w:val="Normal"/>
+              <w:widowControl w:val="false"/>
+              <w:spacing w:lineRule="auto" w:line="180"/>
+              <w:jc w:val="center"/>
+              <w:rPr>
+                <w:sz w:val="16"/>
+                <w:szCs w:val="16"/>
+              </w:rPr>
+            </w:pPr>
+            <w:r>
+              <w:rPr>
+                <w:rFonts w:eastAsia="arial" w:ascii="arial" w:hAnsi="arial"/>
+                <w:color w:val="000000"/>
+                <w:sz w:val="16"/>
+                <w:szCs w:val="16"/>
+              </w:rPr>
+              <w:t>Next</w:t>
+            </w:r>
+          </w:p>
+          <w:p>
+            <w:pPr>
+              <w:pStyle w:val="Normal"/>
+              <w:widowControl w:val="false"/>
+              <w:spacing w:lineRule="auto" w:line="180"/>
+              <w:jc w:val="center"/>
+              <w:rPr>
+                <w:sz w:val="16"/>
+                <w:szCs w:val="16"/>
+              </w:rPr>
+            </w:pPr>
+            <w:r>
+              <w:rPr>
+                <w:rFonts w:eastAsia="arial" w:ascii="arial" w:hAnsi="arial"/>
+                <w:color w:val="000000"/>
+                <w:sz w:val="16"/>
+                <w:szCs w:val="16"/>
+              </w:rPr>
+              <w:t>Cab Cam</w:t>
+            </w:r>
+          </w:p>
+        </w:tc>
+      </w:tr>
+    </w:tbl>
+    <w:p>
+      <w:pPr>
+        <w:pStyle w:val="Normal"/>
+        <w:rPr>
+          <w:rFonts w:ascii="arial" w:hAnsi="arial" w:eastAsia="arial"/>
+          <w:color w:val="000000"/>
+          <w:sz w:val="16"/>
+          <w:szCs w:val="16"/>
+        </w:rPr>
+      </w:pPr>
+      <w:r>
+        <w:rPr>
+          <w:rFonts w:eastAsia="arial" w:ascii="arial" w:hAnsi="arial"/>
+          <w:color w:val="000000"/>
+          <w:sz w:val="16"/>
+          <w:szCs w:val="16"/>
+        </w:rPr>
+      </w:r>
+    </w:p>
+    <w:p>
+      <w:pPr>
+        <w:pStyle w:val="Normal"/>
+        <w:rPr>
+          <w:color w:val="000000"/>
+          <w:sz w:val="16"/>
+          <w:szCs w:val="16"/>
+        </w:rPr>
+      </w:pPr>
+      <w:r>
+        <w:rPr>
+          <w:rFonts w:eastAsia="arial" w:ascii="arial" w:hAnsi="arial"/>
+          <w:color w:val="000000"/>
+          <w:sz w:val="16"/>
+          <w:szCs w:val="16"/>
+        </w:rPr>
+        <w:tab/>
+        <w:t xml:space="preserve">           Class 802-2</w:t>
+      </w:r>
+    </w:p>
+    <w:tbl>
+      <w:tblPr>
+        <w:tblW w:w="14248" w:type="dxa"/>
+        <w:jc w:val="left"/>
+        <w:tblInd w:w="-5" w:type="dxa"/>
+        <w:tblLayout w:type="fixed"/>
+        <w:tblCellMar>
+          <w:top w:w="0" w:type="dxa"/>
+          <w:left w:w="108" w:type="dxa"/>
+          <w:bottom w:w="0" w:type="dxa"/>
+          <w:right w:w="108" w:type="dxa"/>
+        </w:tblCellMar>
+        <w:tblLook w:firstRow="1" w:noVBand="1" w:lastRow="0" w:firstColumn="1" w:lastColumn="0" w:noHBand="0" w:val="04a0"/>
+      </w:tblPr>
+      <w:tblGrid>
+        <w:gridCol w:w="1017"/>
+        <w:gridCol w:w="1019"/>
+        <w:gridCol w:w="1014"/>
+        <w:gridCol w:w="1016"/>
+        <w:gridCol w:w="1020"/>
+        <w:gridCol w:w="1016"/>
+        <w:gridCol w:w="1016"/>
+        <w:gridCol w:w="1017"/>
+        <w:gridCol w:w="1016"/>
+        <w:gridCol w:w="1020"/>
+        <w:gridCol w:w="1016"/>
+        <w:gridCol w:w="1016"/>
+        <w:gridCol w:w="1016"/>
+        <w:gridCol w:w="1029"/>
+      </w:tblGrid>
+      <w:tr>
+        <w:trPr>
+          <w:trHeight w:val="440" w:hRule="exact"/>
+          <w:cantSplit w:val="true"/>
+        </w:trPr>
+        <w:tc>
+          <w:tcPr>
+            <w:tcW w:w="1017" w:type="dxa"/>
+            <w:tcBorders>
+              <w:top w:val="single" w:sz="4" w:space="0" w:color="000000"/>
+              <w:left w:val="single" w:sz="4" w:space="0" w:color="000000"/>
+              <w:bottom w:val="single" w:sz="4" w:space="0" w:color="000000"/>
+            </w:tcBorders>
+            <w:vAlign w:val="bottom"/>
+          </w:tcPr>
+          <w:p>
+            <w:pPr>
+              <w:pStyle w:val="Normal"/>
+              <w:widowControl w:val="false"/>
+              <w:spacing w:lineRule="auto" w:line="180" w:before="0" w:after="60"/>
+              <w:jc w:val="center"/>
+              <w:rPr>
+                <w:b/>
+                <w:bCs/>
+              </w:rPr>
+            </w:pPr>
+            <w:r>
+              <w:rPr>
+                <w:b/>
+                <w:bCs/>
+                <w:color w:val="000000"/>
+                <w:sz w:val="16"/>
+                <w:szCs w:val="16"/>
+              </w:rPr>
+              <w:t>HUD</w:t>
+            </w:r>
+          </w:p>
+        </w:tc>
+        <w:tc>
+          <w:tcPr>
+            <w:tcW w:w="1019" w:type="dxa"/>
+            <w:tcBorders>
+              <w:top w:val="single" w:sz="4" w:space="0" w:color="000000"/>
+              <w:left w:val="single" w:sz="4" w:space="0" w:color="000000"/>
+              <w:bottom w:val="single" w:sz="4" w:space="0" w:color="000000"/>
+            </w:tcBorders>
+            <w:vAlign w:val="bottom"/>
+          </w:tcPr>
+          <w:p>
+            <w:pPr>
+              <w:pStyle w:val="Normal"/>
+              <w:widowControl w:val="false"/>
+              <w:spacing w:lineRule="auto" w:line="180"/>
+              <w:jc w:val="center"/>
+              <w:rPr>
+                <w:color w:val="000000"/>
+                <w:sz w:val="16"/>
+                <w:szCs w:val="16"/>
+              </w:rPr>
+            </w:pPr>
+            <w:r>
+              <w:rPr>
+                <w:color w:val="000000"/>
+                <w:sz w:val="16"/>
+                <w:szCs w:val="16"/>
+              </w:rPr>
+              <w:t>Schedule</w:t>
+            </w:r>
+          </w:p>
+        </w:tc>
+        <w:tc>
+          <w:tcPr>
+            <w:tcW w:w="1014" w:type="dxa"/>
+            <w:tcBorders>
+              <w:top w:val="single" w:sz="4" w:space="0" w:color="000000"/>
+              <w:left w:val="single" w:sz="4" w:space="0" w:color="000000"/>
+              <w:bottom w:val="single" w:sz="4" w:space="0" w:color="000000"/>
+            </w:tcBorders>
+            <w:vAlign w:val="bottom"/>
+          </w:tcPr>
+          <w:p>
+            <w:pPr>
+              <w:pStyle w:val="Normal"/>
+              <w:widowControl w:val="false"/>
+              <w:spacing w:lineRule="auto" w:line="180"/>
+              <w:jc w:val="center"/>
+              <w:rPr>
+                <w:color w:val="000000"/>
+                <w:sz w:val="16"/>
+                <w:szCs w:val="16"/>
+              </w:rPr>
+            </w:pPr>
+            <w:r>
+              <w:rPr>
+                <w:color w:val="000000"/>
+                <w:sz w:val="16"/>
+                <w:szCs w:val="16"/>
+              </w:rPr>
+              <w:t>Aux Off</w:t>
+            </w:r>
+          </w:p>
+        </w:tc>
+        <w:tc>
+          <w:tcPr>
+            <w:tcW w:w="1016" w:type="dxa"/>
+            <w:tcBorders>
+              <w:top w:val="single" w:sz="4" w:space="0" w:color="000000"/>
+              <w:left w:val="single" w:sz="4" w:space="0" w:color="000000"/>
+              <w:bottom w:val="single" w:sz="4" w:space="0" w:color="000000"/>
+            </w:tcBorders>
+            <w:vAlign w:val="bottom"/>
+          </w:tcPr>
+          <w:p>
+            <w:pPr>
+              <w:pStyle w:val="Normal"/>
+              <w:widowControl w:val="false"/>
+              <w:spacing w:lineRule="auto" w:line="180"/>
+              <w:jc w:val="center"/>
+              <w:rPr>
+                <w:color w:val="000000"/>
+                <w:sz w:val="16"/>
+                <w:szCs w:val="16"/>
+              </w:rPr>
+            </w:pPr>
+            <w:r>
+              <w:rPr>
+                <w:color w:val="000000"/>
+                <w:sz w:val="16"/>
+                <w:szCs w:val="16"/>
+              </w:rPr>
+              <w:t>DSD/Vigilance</w:t>
+            </w:r>
+          </w:p>
+        </w:tc>
+        <w:tc>
+          <w:tcPr>
+            <w:tcW w:w="1020" w:type="dxa"/>
+            <w:tcBorders>
+              <w:top w:val="single" w:sz="4" w:space="0" w:color="000000"/>
+              <w:left w:val="single" w:sz="4" w:space="0" w:color="000000"/>
+              <w:bottom w:val="single" w:sz="4" w:space="0" w:color="000000"/>
+            </w:tcBorders>
+            <w:vAlign w:val="bottom"/>
+          </w:tcPr>
+          <w:p>
+            <w:pPr>
+              <w:pStyle w:val="Normal"/>
+              <w:widowControl w:val="false"/>
+              <w:spacing w:lineRule="auto" w:line="180"/>
+              <w:jc w:val="center"/>
+              <w:rPr>
+                <w:color w:val="000000"/>
+                <w:sz w:val="16"/>
+                <w:szCs w:val="16"/>
+              </w:rPr>
+            </w:pPr>
+            <w:r>
+              <w:rPr>
+                <w:color w:val="000000"/>
+                <w:sz w:val="16"/>
+                <w:szCs w:val="16"/>
+              </w:rPr>
+              <w:t>Panto. Low</w:t>
+            </w:r>
+          </w:p>
+        </w:tc>
+        <w:tc>
+          <w:tcPr>
+            <w:tcW w:w="1016" w:type="dxa"/>
+            <w:tcBorders>
+              <w:top w:val="single" w:sz="4" w:space="0" w:color="000000"/>
+              <w:left w:val="single" w:sz="4" w:space="0" w:color="000000"/>
+              <w:bottom w:val="single" w:sz="4" w:space="0" w:color="000000"/>
+            </w:tcBorders>
+            <w:vAlign w:val="bottom"/>
+          </w:tcPr>
+          <w:p>
+            <w:pPr>
+              <w:pStyle w:val="Normal"/>
+              <w:widowControl w:val="false"/>
+              <w:spacing w:lineRule="auto" w:line="180"/>
+              <w:jc w:val="center"/>
+              <w:rPr>
+                <w:sz w:val="16"/>
+                <w:szCs w:val="16"/>
+              </w:rPr>
+            </w:pPr>
+            <w:r>
+              <w:rPr>
+                <w:rFonts w:eastAsia="arial" w:ascii="arial" w:hAnsi="arial"/>
+                <w:sz w:val="16"/>
+                <w:szCs w:val="16"/>
+              </w:rPr>
+              <w:t>Snow Brake</w:t>
+            </w:r>
+          </w:p>
+        </w:tc>
+        <w:tc>
+          <w:tcPr>
+            <w:tcW w:w="1016" w:type="dxa"/>
+            <w:tcBorders>
+              <w:top w:val="single" w:sz="4" w:space="0" w:color="000000"/>
+              <w:left w:val="single" w:sz="4" w:space="0" w:color="000000"/>
+              <w:bottom w:val="single" w:sz="4" w:space="0" w:color="000000"/>
+            </w:tcBorders>
+            <w:vAlign w:val="bottom"/>
+          </w:tcPr>
+          <w:p>
+            <w:pPr>
+              <w:pStyle w:val="Normal"/>
+              <w:widowControl w:val="false"/>
+              <w:jc w:val="center"/>
+              <w:rPr>
+                <w:sz w:val="16"/>
+                <w:szCs w:val="16"/>
+              </w:rPr>
+            </w:pPr>
+            <w:r>
+              <w:rPr>
+                <w:sz w:val="16"/>
+                <w:szCs w:val="16"/>
+              </w:rPr>
+              <w:t>Engine Stop</w:t>
+            </w:r>
+          </w:p>
+        </w:tc>
+        <w:tc>
+          <w:tcPr>
+            <w:tcW w:w="1017" w:type="dxa"/>
+            <w:tcBorders>
+              <w:top w:val="single" w:sz="4" w:space="0" w:color="000000"/>
+              <w:left w:val="single" w:sz="4" w:space="0" w:color="000000"/>
+              <w:bottom w:val="single" w:sz="4" w:space="0" w:color="000000"/>
+            </w:tcBorders>
+            <w:vAlign w:val="bottom"/>
+          </w:tcPr>
+          <w:p>
+            <w:pPr>
+              <w:pStyle w:val="Normal"/>
+              <w:widowControl w:val="false"/>
+              <w:jc w:val="center"/>
+              <w:rPr>
+                <w:sz w:val="16"/>
+                <w:szCs w:val="16"/>
+              </w:rPr>
+            </w:pPr>
+            <w:r>
+              <w:rPr>
+                <w:sz w:val="16"/>
+                <w:szCs w:val="16"/>
+              </w:rPr>
+              <w:t>Diesel</w:t>
+            </w:r>
+          </w:p>
+        </w:tc>
+        <w:tc>
+          <w:tcPr>
+            <w:tcW w:w="1016" w:type="dxa"/>
+            <w:tcBorders>
+              <w:top w:val="single" w:sz="4" w:space="0" w:color="000000"/>
+              <w:left w:val="single" w:sz="4" w:space="0" w:color="000000"/>
+              <w:bottom w:val="single" w:sz="4" w:space="0" w:color="000000"/>
+            </w:tcBorders>
+            <w:vAlign w:val="bottom"/>
+          </w:tcPr>
+          <w:p>
+            <w:pPr>
+              <w:pStyle w:val="Normal"/>
+              <w:widowControl w:val="false"/>
+              <w:jc w:val="center"/>
+              <w:rPr>
+                <w:color w:val="000000"/>
+                <w:sz w:val="16"/>
+                <w:szCs w:val="16"/>
+              </w:rPr>
+            </w:pPr>
+            <w:r>
+              <w:rPr>
+                <w:color w:val="000000"/>
+                <w:sz w:val="16"/>
+                <w:szCs w:val="16"/>
+              </w:rPr>
+              <w:t>Rear Coupler</w:t>
+            </w:r>
+          </w:p>
+        </w:tc>
+        <w:tc>
+          <w:tcPr>
+            <w:tcW w:w="1020" w:type="dxa"/>
+            <w:tcBorders>
+              <w:top w:val="single" w:sz="4" w:space="0" w:color="000000"/>
+              <w:left w:val="single" w:sz="4" w:space="0" w:color="000000"/>
+              <w:bottom w:val="single" w:sz="4" w:space="0" w:color="000000"/>
+            </w:tcBorders>
+            <w:vAlign w:val="bottom"/>
+          </w:tcPr>
+          <w:p>
+            <w:pPr>
+              <w:pStyle w:val="Normal"/>
+              <w:widowControl w:val="false"/>
+              <w:spacing w:lineRule="auto" w:line="180"/>
+              <w:jc w:val="center"/>
+              <w:rPr>
+                <w:sz w:val="16"/>
+                <w:szCs w:val="16"/>
+              </w:rPr>
+            </w:pPr>
+            <w:r>
+              <w:rPr>
+                <w:rFonts w:eastAsia="arial" w:ascii="arial" w:hAnsi="arial"/>
+                <w:color w:val="000000"/>
+                <w:sz w:val="16"/>
+                <w:szCs w:val="16"/>
+              </w:rPr>
+              <w:t>Desk Light Down</w:t>
+            </w:r>
+          </w:p>
+        </w:tc>
+        <w:tc>
+          <w:tcPr>
+            <w:tcW w:w="1016" w:type="dxa"/>
+            <w:tcBorders>
+              <w:top w:val="single" w:sz="4" w:space="0" w:color="000000"/>
+              <w:left w:val="single" w:sz="4" w:space="0" w:color="000000"/>
+              <w:bottom w:val="single" w:sz="4" w:space="0" w:color="000000"/>
+            </w:tcBorders>
+            <w:vAlign w:val="bottom"/>
+          </w:tcPr>
+          <w:p>
+            <w:pPr>
+              <w:pStyle w:val="Normal"/>
+              <w:widowControl w:val="false"/>
+              <w:spacing w:lineRule="auto" w:line="180"/>
+              <w:jc w:val="center"/>
+              <w:rPr>
+                <w:sz w:val="16"/>
+                <w:szCs w:val="16"/>
+              </w:rPr>
+            </w:pPr>
+            <w:r>
+              <w:rPr>
+                <w:rFonts w:eastAsia="arial" w:ascii="arial" w:hAnsi="arial"/>
+                <w:color w:val="000000"/>
+                <w:sz w:val="16"/>
+                <w:szCs w:val="16"/>
+              </w:rPr>
+              <w:t>Hazard Warning</w:t>
+            </w:r>
+          </w:p>
+        </w:tc>
+        <w:tc>
+          <w:tcPr>
+            <w:tcW w:w="1016" w:type="dxa"/>
+            <w:tcBorders>
+              <w:top w:val="single" w:sz="4" w:space="0" w:color="000000"/>
+              <w:left w:val="single" w:sz="4" w:space="0" w:color="000000"/>
+              <w:bottom w:val="single" w:sz="4" w:space="0" w:color="000000"/>
+            </w:tcBorders>
+            <w:vAlign w:val="bottom"/>
+          </w:tcPr>
+          <w:p>
+            <w:pPr>
+              <w:pStyle w:val="Normal"/>
+              <w:widowControl w:val="false"/>
+              <w:spacing w:lineRule="auto" w:line="180"/>
+              <w:jc w:val="center"/>
+              <w:rPr>
+                <w:sz w:val="16"/>
+                <w:szCs w:val="16"/>
+              </w:rPr>
+            </w:pPr>
+            <w:r>
+              <w:rPr>
+                <w:rFonts w:eastAsia="arial" w:ascii="arial" w:hAnsi="arial"/>
+                <w:color w:val="000000"/>
+                <w:sz w:val="16"/>
+                <w:szCs w:val="16"/>
+              </w:rPr>
+              <w:t>Uncouple</w:t>
             </w:r>
           </w:p>
         </w:tc>

</xml_diff>

<commit_message>
Add 1938 and 1972 Tube Stock
</commit_message>
<xml_diff>
--- a/raildriver-UK-Remapped.docx
+++ b/raildriver-UK-Remapped.docx
@@ -47668,25 +47668,7 @@
           <w:szCs w:val="16"/>
         </w:rPr>
         <w:tab/>
-        <w:t xml:space="preserve">           Class 80</w:t>
-      </w:r>
-      <w:r>
-        <w:rPr>
-          <w:rFonts w:eastAsia="arial" w:ascii="arial" w:hAnsi="arial"/>
-          <w:color w:val="000000"/>
-          <w:sz w:val="16"/>
-          <w:szCs w:val="16"/>
-        </w:rPr>
-        <w:t>5/807</w:t>
-      </w:r>
-      <w:r>
-        <w:rPr>
-          <w:rFonts w:eastAsia="arial" w:ascii="arial" w:hAnsi="arial"/>
-          <w:color w:val="000000"/>
-          <w:sz w:val="16"/>
-          <w:szCs w:val="16"/>
-        </w:rPr>
-        <w:t>-1</w:t>
+        <w:t xml:space="preserve">           Class 805/807-1</w:t>
       </w:r>
     </w:p>
     <w:tbl>
@@ -48227,7 +48209,565 @@
           <w:szCs w:val="16"/>
         </w:rPr>
         <w:tab/>
-        <w:t xml:space="preserve">           Class 80</w:t>
+        <w:t xml:space="preserve">           Class 805/807-2</w:t>
+      </w:r>
+    </w:p>
+    <w:tbl>
+      <w:tblPr>
+        <w:tblW w:w="14248" w:type="dxa"/>
+        <w:jc w:val="left"/>
+        <w:tblInd w:w="-5" w:type="dxa"/>
+        <w:tblLayout w:type="fixed"/>
+        <w:tblCellMar>
+          <w:top w:w="0" w:type="dxa"/>
+          <w:left w:w="108" w:type="dxa"/>
+          <w:bottom w:w="0" w:type="dxa"/>
+          <w:right w:w="108" w:type="dxa"/>
+        </w:tblCellMar>
+        <w:tblLook w:firstRow="1" w:noVBand="1" w:lastRow="0" w:firstColumn="1" w:lastColumn="0" w:noHBand="0" w:val="04a0"/>
+      </w:tblPr>
+      <w:tblGrid>
+        <w:gridCol w:w="1017"/>
+        <w:gridCol w:w="1019"/>
+        <w:gridCol w:w="1014"/>
+        <w:gridCol w:w="1016"/>
+        <w:gridCol w:w="1020"/>
+        <w:gridCol w:w="1016"/>
+        <w:gridCol w:w="1016"/>
+        <w:gridCol w:w="1017"/>
+        <w:gridCol w:w="1016"/>
+        <w:gridCol w:w="1020"/>
+        <w:gridCol w:w="1016"/>
+        <w:gridCol w:w="1016"/>
+        <w:gridCol w:w="1016"/>
+        <w:gridCol w:w="1029"/>
+      </w:tblGrid>
+      <w:tr>
+        <w:trPr>
+          <w:trHeight w:val="440" w:hRule="exact"/>
+          <w:cantSplit w:val="true"/>
+        </w:trPr>
+        <w:tc>
+          <w:tcPr>
+            <w:tcW w:w="1017" w:type="dxa"/>
+            <w:tcBorders>
+              <w:top w:val="single" w:sz="4" w:space="0" w:color="000000"/>
+              <w:left w:val="single" w:sz="4" w:space="0" w:color="000000"/>
+              <w:bottom w:val="single" w:sz="4" w:space="0" w:color="000000"/>
+            </w:tcBorders>
+            <w:vAlign w:val="bottom"/>
+          </w:tcPr>
+          <w:p>
+            <w:pPr>
+              <w:pStyle w:val="Normal"/>
+              <w:widowControl w:val="false"/>
+              <w:spacing w:lineRule="auto" w:line="180" w:before="0" w:after="60"/>
+              <w:jc w:val="center"/>
+              <w:rPr>
+                <w:b/>
+                <w:bCs/>
+              </w:rPr>
+            </w:pPr>
+            <w:r>
+              <w:rPr>
+                <w:b/>
+                <w:bCs/>
+                <w:color w:val="000000"/>
+                <w:sz w:val="16"/>
+                <w:szCs w:val="16"/>
+              </w:rPr>
+              <w:t>HUD</w:t>
+            </w:r>
+          </w:p>
+        </w:tc>
+        <w:tc>
+          <w:tcPr>
+            <w:tcW w:w="1019" w:type="dxa"/>
+            <w:tcBorders>
+              <w:top w:val="single" w:sz="4" w:space="0" w:color="000000"/>
+              <w:left w:val="single" w:sz="4" w:space="0" w:color="000000"/>
+              <w:bottom w:val="single" w:sz="4" w:space="0" w:color="000000"/>
+            </w:tcBorders>
+            <w:vAlign w:val="bottom"/>
+          </w:tcPr>
+          <w:p>
+            <w:pPr>
+              <w:pStyle w:val="Normal"/>
+              <w:widowControl w:val="false"/>
+              <w:spacing w:lineRule="auto" w:line="180"/>
+              <w:jc w:val="center"/>
+              <w:rPr>
+                <w:color w:val="000000"/>
+                <w:sz w:val="16"/>
+                <w:szCs w:val="16"/>
+              </w:rPr>
+            </w:pPr>
+            <w:r>
+              <w:rPr>
+                <w:color w:val="000000"/>
+                <w:sz w:val="16"/>
+                <w:szCs w:val="16"/>
+              </w:rPr>
+              <w:t>Schedule</w:t>
+            </w:r>
+          </w:p>
+        </w:tc>
+        <w:tc>
+          <w:tcPr>
+            <w:tcW w:w="1014" w:type="dxa"/>
+            <w:tcBorders>
+              <w:top w:val="single" w:sz="4" w:space="0" w:color="000000"/>
+              <w:left w:val="single" w:sz="4" w:space="0" w:color="000000"/>
+              <w:bottom w:val="single" w:sz="4" w:space="0" w:color="000000"/>
+            </w:tcBorders>
+            <w:vAlign w:val="bottom"/>
+          </w:tcPr>
+          <w:p>
+            <w:pPr>
+              <w:pStyle w:val="Normal"/>
+              <w:widowControl w:val="false"/>
+              <w:spacing w:lineRule="auto" w:line="180"/>
+              <w:jc w:val="center"/>
+              <w:rPr>
+                <w:color w:val="000000"/>
+                <w:sz w:val="16"/>
+                <w:szCs w:val="16"/>
+              </w:rPr>
+            </w:pPr>
+            <w:r>
+              <w:rPr>
+                <w:color w:val="000000"/>
+                <w:sz w:val="16"/>
+                <w:szCs w:val="16"/>
+              </w:rPr>
+              <w:t>Aux Off</w:t>
+            </w:r>
+          </w:p>
+        </w:tc>
+        <w:tc>
+          <w:tcPr>
+            <w:tcW w:w="1016" w:type="dxa"/>
+            <w:tcBorders>
+              <w:top w:val="single" w:sz="4" w:space="0" w:color="000000"/>
+              <w:left w:val="single" w:sz="4" w:space="0" w:color="000000"/>
+              <w:bottom w:val="single" w:sz="4" w:space="0" w:color="000000"/>
+            </w:tcBorders>
+            <w:vAlign w:val="bottom"/>
+          </w:tcPr>
+          <w:p>
+            <w:pPr>
+              <w:pStyle w:val="Normal"/>
+              <w:widowControl w:val="false"/>
+              <w:spacing w:lineRule="auto" w:line="180"/>
+              <w:jc w:val="center"/>
+              <w:rPr>
+                <w:color w:val="000000"/>
+                <w:sz w:val="16"/>
+                <w:szCs w:val="16"/>
+              </w:rPr>
+            </w:pPr>
+            <w:r>
+              <w:rPr>
+                <w:color w:val="000000"/>
+                <w:sz w:val="16"/>
+                <w:szCs w:val="16"/>
+              </w:rPr>
+              <w:t>DSD/Vigilance</w:t>
+            </w:r>
+          </w:p>
+        </w:tc>
+        <w:tc>
+          <w:tcPr>
+            <w:tcW w:w="1020" w:type="dxa"/>
+            <w:tcBorders>
+              <w:top w:val="single" w:sz="4" w:space="0" w:color="000000"/>
+              <w:left w:val="single" w:sz="4" w:space="0" w:color="000000"/>
+              <w:bottom w:val="single" w:sz="4" w:space="0" w:color="000000"/>
+            </w:tcBorders>
+            <w:vAlign w:val="bottom"/>
+          </w:tcPr>
+          <w:p>
+            <w:pPr>
+              <w:pStyle w:val="Normal"/>
+              <w:widowControl w:val="false"/>
+              <w:spacing w:lineRule="auto" w:line="180"/>
+              <w:jc w:val="center"/>
+              <w:rPr>
+                <w:color w:val="000000"/>
+                <w:sz w:val="16"/>
+                <w:szCs w:val="16"/>
+              </w:rPr>
+            </w:pPr>
+            <w:r>
+              <w:rPr>
+                <w:color w:val="000000"/>
+                <w:sz w:val="16"/>
+                <w:szCs w:val="16"/>
+              </w:rPr>
+              <w:t>Panto. Low</w:t>
+            </w:r>
+          </w:p>
+        </w:tc>
+        <w:tc>
+          <w:tcPr>
+            <w:tcW w:w="1016" w:type="dxa"/>
+            <w:tcBorders>
+              <w:top w:val="single" w:sz="4" w:space="0" w:color="000000"/>
+              <w:left w:val="single" w:sz="4" w:space="0" w:color="000000"/>
+              <w:bottom w:val="single" w:sz="4" w:space="0" w:color="000000"/>
+            </w:tcBorders>
+            <w:vAlign w:val="bottom"/>
+          </w:tcPr>
+          <w:p>
+            <w:pPr>
+              <w:pStyle w:val="Normal"/>
+              <w:widowControl w:val="false"/>
+              <w:spacing w:lineRule="auto" w:line="180"/>
+              <w:jc w:val="center"/>
+              <w:rPr>
+                <w:sz w:val="16"/>
+                <w:szCs w:val="16"/>
+              </w:rPr>
+            </w:pPr>
+            <w:r>
+              <w:rPr>
+                <w:rFonts w:eastAsia="arial" w:ascii="arial" w:hAnsi="arial"/>
+                <w:sz w:val="16"/>
+                <w:szCs w:val="16"/>
+              </w:rPr>
+              <w:t>Snow Brake</w:t>
+            </w:r>
+          </w:p>
+        </w:tc>
+        <w:tc>
+          <w:tcPr>
+            <w:tcW w:w="1016" w:type="dxa"/>
+            <w:tcBorders>
+              <w:top w:val="single" w:sz="4" w:space="0" w:color="000000"/>
+              <w:left w:val="single" w:sz="4" w:space="0" w:color="000000"/>
+              <w:bottom w:val="single" w:sz="4" w:space="0" w:color="000000"/>
+            </w:tcBorders>
+            <w:vAlign w:val="bottom"/>
+          </w:tcPr>
+          <w:p>
+            <w:pPr>
+              <w:pStyle w:val="Normal"/>
+              <w:widowControl w:val="false"/>
+              <w:jc w:val="center"/>
+              <w:rPr>
+                <w:sz w:val="16"/>
+                <w:szCs w:val="16"/>
+              </w:rPr>
+            </w:pPr>
+            <w:r>
+              <w:rPr>
+                <w:sz w:val="16"/>
+                <w:szCs w:val="16"/>
+              </w:rPr>
+              <w:t>Engine Stop</w:t>
+            </w:r>
+          </w:p>
+        </w:tc>
+        <w:tc>
+          <w:tcPr>
+            <w:tcW w:w="1017" w:type="dxa"/>
+            <w:tcBorders>
+              <w:top w:val="single" w:sz="4" w:space="0" w:color="000000"/>
+              <w:left w:val="single" w:sz="4" w:space="0" w:color="000000"/>
+              <w:bottom w:val="single" w:sz="4" w:space="0" w:color="000000"/>
+            </w:tcBorders>
+            <w:vAlign w:val="bottom"/>
+          </w:tcPr>
+          <w:p>
+            <w:pPr>
+              <w:pStyle w:val="Normal"/>
+              <w:widowControl w:val="false"/>
+              <w:jc w:val="center"/>
+              <w:rPr>
+                <w:sz w:val="16"/>
+                <w:szCs w:val="16"/>
+              </w:rPr>
+            </w:pPr>
+            <w:r>
+              <w:rPr>
+                <w:sz w:val="16"/>
+                <w:szCs w:val="16"/>
+              </w:rPr>
+              <w:t>Diesel</w:t>
+            </w:r>
+          </w:p>
+        </w:tc>
+        <w:tc>
+          <w:tcPr>
+            <w:tcW w:w="1016" w:type="dxa"/>
+            <w:tcBorders>
+              <w:top w:val="single" w:sz="4" w:space="0" w:color="000000"/>
+              <w:left w:val="single" w:sz="4" w:space="0" w:color="000000"/>
+              <w:bottom w:val="single" w:sz="4" w:space="0" w:color="000000"/>
+            </w:tcBorders>
+            <w:vAlign w:val="bottom"/>
+          </w:tcPr>
+          <w:p>
+            <w:pPr>
+              <w:pStyle w:val="Normal"/>
+              <w:widowControl w:val="false"/>
+              <w:jc w:val="center"/>
+              <w:rPr>
+                <w:color w:val="000000"/>
+                <w:sz w:val="16"/>
+                <w:szCs w:val="16"/>
+              </w:rPr>
+            </w:pPr>
+            <w:r>
+              <w:rPr>
+                <w:color w:val="000000"/>
+                <w:sz w:val="16"/>
+                <w:szCs w:val="16"/>
+              </w:rPr>
+              <w:t>Rear Coupler</w:t>
+            </w:r>
+          </w:p>
+        </w:tc>
+        <w:tc>
+          <w:tcPr>
+            <w:tcW w:w="1020" w:type="dxa"/>
+            <w:tcBorders>
+              <w:top w:val="single" w:sz="4" w:space="0" w:color="000000"/>
+              <w:left w:val="single" w:sz="4" w:space="0" w:color="000000"/>
+              <w:bottom w:val="single" w:sz="4" w:space="0" w:color="000000"/>
+            </w:tcBorders>
+            <w:vAlign w:val="bottom"/>
+          </w:tcPr>
+          <w:p>
+            <w:pPr>
+              <w:pStyle w:val="Normal"/>
+              <w:widowControl w:val="false"/>
+              <w:spacing w:lineRule="auto" w:line="180"/>
+              <w:jc w:val="center"/>
+              <w:rPr>
+                <w:sz w:val="16"/>
+                <w:szCs w:val="16"/>
+              </w:rPr>
+            </w:pPr>
+            <w:r>
+              <w:rPr>
+                <w:rFonts w:eastAsia="arial" w:ascii="arial" w:hAnsi="arial"/>
+                <w:color w:val="000000"/>
+                <w:sz w:val="16"/>
+                <w:szCs w:val="16"/>
+              </w:rPr>
+              <w:t>Desk Light Down</w:t>
+            </w:r>
+          </w:p>
+        </w:tc>
+        <w:tc>
+          <w:tcPr>
+            <w:tcW w:w="1016" w:type="dxa"/>
+            <w:tcBorders>
+              <w:top w:val="single" w:sz="4" w:space="0" w:color="000000"/>
+              <w:left w:val="single" w:sz="4" w:space="0" w:color="000000"/>
+              <w:bottom w:val="single" w:sz="4" w:space="0" w:color="000000"/>
+            </w:tcBorders>
+            <w:vAlign w:val="bottom"/>
+          </w:tcPr>
+          <w:p>
+            <w:pPr>
+              <w:pStyle w:val="Normal"/>
+              <w:widowControl w:val="false"/>
+              <w:spacing w:lineRule="auto" w:line="180"/>
+              <w:jc w:val="center"/>
+              <w:rPr>
+                <w:sz w:val="16"/>
+                <w:szCs w:val="16"/>
+              </w:rPr>
+            </w:pPr>
+            <w:r>
+              <w:rPr>
+                <w:rFonts w:eastAsia="arial" w:ascii="arial" w:hAnsi="arial"/>
+                <w:color w:val="000000"/>
+                <w:sz w:val="16"/>
+                <w:szCs w:val="16"/>
+              </w:rPr>
+              <w:t>Hazard Warning</w:t>
+            </w:r>
+          </w:p>
+        </w:tc>
+        <w:tc>
+          <w:tcPr>
+            <w:tcW w:w="1016" w:type="dxa"/>
+            <w:tcBorders>
+              <w:top w:val="single" w:sz="4" w:space="0" w:color="000000"/>
+              <w:left w:val="single" w:sz="4" w:space="0" w:color="000000"/>
+              <w:bottom w:val="single" w:sz="4" w:space="0" w:color="000000"/>
+            </w:tcBorders>
+            <w:vAlign w:val="bottom"/>
+          </w:tcPr>
+          <w:p>
+            <w:pPr>
+              <w:pStyle w:val="Normal"/>
+              <w:widowControl w:val="false"/>
+              <w:spacing w:lineRule="auto" w:line="180"/>
+              <w:jc w:val="center"/>
+              <w:rPr>
+                <w:sz w:val="16"/>
+                <w:szCs w:val="16"/>
+              </w:rPr>
+            </w:pPr>
+            <w:r>
+              <w:rPr>
+                <w:rFonts w:eastAsia="arial" w:ascii="arial" w:hAnsi="arial"/>
+                <w:color w:val="000000"/>
+                <w:sz w:val="16"/>
+                <w:szCs w:val="16"/>
+              </w:rPr>
+              <w:t>Uncouple</w:t>
+            </w:r>
+          </w:p>
+        </w:tc>
+        <w:tc>
+          <w:tcPr>
+            <w:tcW w:w="1016" w:type="dxa"/>
+            <w:tcBorders>
+              <w:top w:val="single" w:sz="4" w:space="0" w:color="000000"/>
+              <w:left w:val="single" w:sz="4" w:space="0" w:color="000000"/>
+              <w:bottom w:val="single" w:sz="4" w:space="0" w:color="000000"/>
+            </w:tcBorders>
+            <w:vAlign w:val="bottom"/>
+          </w:tcPr>
+          <w:p>
+            <w:pPr>
+              <w:pStyle w:val="Normal"/>
+              <w:widowControl w:val="false"/>
+              <w:spacing w:lineRule="auto" w:line="180"/>
+              <w:jc w:val="center"/>
+              <w:rPr>
+                <w:sz w:val="16"/>
+                <w:szCs w:val="16"/>
+              </w:rPr>
+            </w:pPr>
+            <w:r>
+              <w:rPr>
+                <w:rFonts w:eastAsia="arial" w:ascii="arial" w:hAnsi="arial"/>
+                <w:color w:val="000000"/>
+                <w:sz w:val="16"/>
+                <w:szCs w:val="16"/>
+              </w:rPr>
+              <w:t>Exterior</w:t>
+            </w:r>
+          </w:p>
+          <w:p>
+            <w:pPr>
+              <w:pStyle w:val="Normal"/>
+              <w:widowControl w:val="false"/>
+              <w:spacing w:lineRule="auto" w:line="180"/>
+              <w:jc w:val="center"/>
+              <w:rPr>
+                <w:sz w:val="16"/>
+                <w:szCs w:val="16"/>
+              </w:rPr>
+            </w:pPr>
+            <w:r>
+              <w:rPr>
+                <w:rFonts w:eastAsia="arial" w:ascii="arial" w:hAnsi="arial"/>
+                <w:color w:val="000000"/>
+                <w:sz w:val="16"/>
+                <w:szCs w:val="16"/>
+              </w:rPr>
+              <w:t>Camera</w:t>
+            </w:r>
+          </w:p>
+        </w:tc>
+        <w:tc>
+          <w:tcPr>
+            <w:tcW w:w="1029" w:type="dxa"/>
+            <w:tcBorders>
+              <w:top w:val="single" w:sz="4" w:space="0" w:color="000000"/>
+              <w:left w:val="single" w:sz="4" w:space="0" w:color="000000"/>
+              <w:bottom w:val="single" w:sz="4" w:space="0" w:color="000000"/>
+              <w:right w:val="single" w:sz="4" w:space="0" w:color="000000"/>
+            </w:tcBorders>
+            <w:vAlign w:val="bottom"/>
+          </w:tcPr>
+          <w:p>
+            <w:pPr>
+              <w:pStyle w:val="Normal"/>
+              <w:widowControl w:val="false"/>
+              <w:spacing w:lineRule="auto" w:line="180"/>
+              <w:jc w:val="center"/>
+              <w:rPr>
+                <w:sz w:val="16"/>
+                <w:szCs w:val="16"/>
+              </w:rPr>
+            </w:pPr>
+            <w:r>
+              <w:rPr>
+                <w:rFonts w:eastAsia="arial" w:ascii="arial" w:hAnsi="arial"/>
+                <w:color w:val="000000"/>
+                <w:sz w:val="16"/>
+                <w:szCs w:val="16"/>
+              </w:rPr>
+              <w:t>Prev</w:t>
+            </w:r>
+          </w:p>
+          <w:p>
+            <w:pPr>
+              <w:pStyle w:val="Normal"/>
+              <w:widowControl w:val="false"/>
+              <w:spacing w:lineRule="auto" w:line="180"/>
+              <w:jc w:val="center"/>
+              <w:rPr>
+                <w:sz w:val="16"/>
+                <w:szCs w:val="16"/>
+              </w:rPr>
+            </w:pPr>
+            <w:r>
+              <w:rPr>
+                <w:rFonts w:eastAsia="arial" w:ascii="arial" w:hAnsi="arial"/>
+                <w:color w:val="000000"/>
+                <w:sz w:val="16"/>
+                <w:szCs w:val="16"/>
+              </w:rPr>
+              <w:t>Cab Cam</w:t>
+            </w:r>
+          </w:p>
+        </w:tc>
+      </w:tr>
+    </w:tbl>
+    <w:p>
+      <w:pPr>
+        <w:pStyle w:val="Normal"/>
+        <w:rPr>
+          <w:color w:val="000000"/>
+          <w:sz w:val="16"/>
+          <w:szCs w:val="16"/>
+        </w:rPr>
+      </w:pPr>
+      <w:r>
+        <w:rPr>
+          <w:color w:val="000000"/>
+          <w:sz w:val="16"/>
+          <w:szCs w:val="16"/>
+        </w:rPr>
+      </w:r>
+    </w:p>
+    <w:p>
+      <w:pPr>
+        <w:pStyle w:val="Normal"/>
+        <w:rPr>
+          <w:color w:val="000000"/>
+          <w:sz w:val="16"/>
+          <w:szCs w:val="16"/>
+        </w:rPr>
+      </w:pPr>
+      <w:r>
+        <w:rPr>
+          <w:rFonts w:eastAsia="arial" w:ascii="arial" w:hAnsi="arial"/>
+          <w:color w:val="000000"/>
+          <w:sz w:val="16"/>
+          <w:szCs w:val="16"/>
+        </w:rPr>
+        <w:tab/>
+        <w:t xml:space="preserve">           </w:t>
       </w:r>
       <w:r>
         <w:rPr>
@@ -48236,7 +48776,564 @@
           <w:sz w:val="16"/>
           <w:szCs w:val="16"/>
         </w:rPr>
-        <w:t>5/807</w:t>
+        <w:t>1938 Tube Stock</w:t>
+      </w:r>
+      <w:r>
+        <w:rPr>
+          <w:rFonts w:eastAsia="arial" w:ascii="arial" w:hAnsi="arial"/>
+          <w:color w:val="000000"/>
+          <w:sz w:val="16"/>
+          <w:szCs w:val="16"/>
+        </w:rPr>
+        <w:t>-1</w:t>
+      </w:r>
+    </w:p>
+    <w:tbl>
+      <w:tblPr>
+        <w:tblW w:w="14248" w:type="dxa"/>
+        <w:jc w:val="left"/>
+        <w:tblInd w:w="-5" w:type="dxa"/>
+        <w:tblLayout w:type="fixed"/>
+        <w:tblCellMar>
+          <w:top w:w="0" w:type="dxa"/>
+          <w:left w:w="108" w:type="dxa"/>
+          <w:bottom w:w="0" w:type="dxa"/>
+          <w:right w:w="108" w:type="dxa"/>
+        </w:tblCellMar>
+        <w:tblLook w:firstRow="1" w:noVBand="1" w:lastRow="0" w:firstColumn="1" w:lastColumn="0" w:noHBand="0" w:val="04a0"/>
+      </w:tblPr>
+      <w:tblGrid>
+        <w:gridCol w:w="1017"/>
+        <w:gridCol w:w="1019"/>
+        <w:gridCol w:w="1014"/>
+        <w:gridCol w:w="1016"/>
+        <w:gridCol w:w="1020"/>
+        <w:gridCol w:w="1016"/>
+        <w:gridCol w:w="1016"/>
+        <w:gridCol w:w="1017"/>
+        <w:gridCol w:w="1016"/>
+        <w:gridCol w:w="1020"/>
+        <w:gridCol w:w="1016"/>
+        <w:gridCol w:w="1016"/>
+        <w:gridCol w:w="1016"/>
+        <w:gridCol w:w="1029"/>
+      </w:tblGrid>
+      <w:tr>
+        <w:trPr>
+          <w:trHeight w:val="440" w:hRule="exact"/>
+          <w:cantSplit w:val="true"/>
+        </w:trPr>
+        <w:tc>
+          <w:tcPr>
+            <w:tcW w:w="1017" w:type="dxa"/>
+            <w:tcBorders>
+              <w:top w:val="single" w:sz="4" w:space="0" w:color="000000"/>
+              <w:left w:val="single" w:sz="4" w:space="0" w:color="000000"/>
+              <w:bottom w:val="single" w:sz="4" w:space="0" w:color="000000"/>
+            </w:tcBorders>
+            <w:vAlign w:val="bottom"/>
+          </w:tcPr>
+          <w:p>
+            <w:pPr>
+              <w:pStyle w:val="Normal"/>
+              <w:widowControl w:val="false"/>
+              <w:spacing w:lineRule="auto" w:line="180" w:before="0" w:after="60"/>
+              <w:jc w:val="center"/>
+              <w:rPr>
+                <w:color w:val="000000"/>
+                <w:sz w:val="16"/>
+                <w:szCs w:val="16"/>
+              </w:rPr>
+            </w:pPr>
+            <w:r>
+              <w:rPr>
+                <w:rFonts w:eastAsia="arial" w:ascii="arial" w:hAnsi="arial"/>
+                <w:b/>
+                <w:color w:val="000000"/>
+                <w:sz w:val="16"/>
+                <w:szCs w:val="16"/>
+              </w:rPr>
+              <w:t>Pause</w:t>
+            </w:r>
+          </w:p>
+        </w:tc>
+        <w:tc>
+          <w:tcPr>
+            <w:tcW w:w="1019" w:type="dxa"/>
+            <w:tcBorders>
+              <w:top w:val="single" w:sz="4" w:space="0" w:color="000000"/>
+              <w:left w:val="single" w:sz="4" w:space="0" w:color="000000"/>
+              <w:bottom w:val="single" w:sz="4" w:space="0" w:color="000000"/>
+            </w:tcBorders>
+            <w:vAlign w:val="bottom"/>
+          </w:tcPr>
+          <w:p>
+            <w:pPr>
+              <w:pStyle w:val="Normal"/>
+              <w:widowControl w:val="false"/>
+              <w:bidi w:val="0"/>
+              <w:spacing w:lineRule="auto" w:line="180"/>
+              <w:jc w:val="center"/>
+              <w:rPr>
+                <w:color w:val="000000"/>
+                <w:sz w:val="16"/>
+                <w:szCs w:val="16"/>
+              </w:rPr>
+            </w:pPr>
+            <w:r>
+              <w:rPr>
+                <w:color w:val="000000"/>
+                <w:sz w:val="16"/>
+                <w:szCs w:val="16"/>
+              </w:rPr>
+              <w:t>Master Key</w:t>
+            </w:r>
+          </w:p>
+        </w:tc>
+        <w:tc>
+          <w:tcPr>
+            <w:tcW w:w="1014" w:type="dxa"/>
+            <w:tcBorders>
+              <w:top w:val="single" w:sz="4" w:space="0" w:color="000000"/>
+              <w:left w:val="single" w:sz="4" w:space="0" w:color="000000"/>
+              <w:bottom w:val="single" w:sz="4" w:space="0" w:color="000000"/>
+            </w:tcBorders>
+            <w:vAlign w:val="bottom"/>
+          </w:tcPr>
+          <w:p>
+            <w:pPr>
+              <w:pStyle w:val="Normal"/>
+              <w:widowControl w:val="false"/>
+              <w:spacing w:lineRule="auto" w:line="180"/>
+              <w:jc w:val="center"/>
+              <w:rPr>
+                <w:color w:val="000000"/>
+                <w:sz w:val="16"/>
+                <w:szCs w:val="16"/>
+              </w:rPr>
+            </w:pPr>
+            <w:r>
+              <w:rPr>
+                <w:color w:val="000000"/>
+                <w:sz w:val="16"/>
+                <w:szCs w:val="16"/>
+              </w:rPr>
+              <w:t>Master On</w:t>
+            </w:r>
+          </w:p>
+        </w:tc>
+        <w:tc>
+          <w:tcPr>
+            <w:tcW w:w="1016" w:type="dxa"/>
+            <w:tcBorders>
+              <w:top w:val="single" w:sz="4" w:space="0" w:color="000000"/>
+              <w:left w:val="single" w:sz="4" w:space="0" w:color="000000"/>
+              <w:bottom w:val="single" w:sz="4" w:space="0" w:color="000000"/>
+            </w:tcBorders>
+            <w:vAlign w:val="bottom"/>
+          </w:tcPr>
+          <w:p>
+            <w:pPr>
+              <w:pStyle w:val="Normal"/>
+              <w:widowControl w:val="false"/>
+              <w:spacing w:lineRule="auto" w:line="180"/>
+              <w:jc w:val="center"/>
+              <w:rPr>
+                <w:color w:val="000000"/>
+                <w:sz w:val="16"/>
+                <w:szCs w:val="16"/>
+              </w:rPr>
+            </w:pPr>
+            <w:r>
+              <w:rPr>
+                <w:color w:val="000000"/>
+                <w:sz w:val="16"/>
+                <w:szCs w:val="16"/>
+              </w:rPr>
+              <w:t>Reverser Key</w:t>
+            </w:r>
+          </w:p>
+        </w:tc>
+        <w:tc>
+          <w:tcPr>
+            <w:tcW w:w="1020" w:type="dxa"/>
+            <w:tcBorders>
+              <w:top w:val="single" w:sz="4" w:space="0" w:color="000000"/>
+              <w:left w:val="single" w:sz="4" w:space="0" w:color="000000"/>
+              <w:bottom w:val="single" w:sz="4" w:space="0" w:color="000000"/>
+            </w:tcBorders>
+            <w:vAlign w:val="bottom"/>
+          </w:tcPr>
+          <w:p>
+            <w:pPr>
+              <w:pStyle w:val="Normal"/>
+              <w:widowControl w:val="false"/>
+              <w:spacing w:lineRule="auto" w:line="180"/>
+              <w:jc w:val="center"/>
+              <w:rPr>
+                <w:color w:val="000000"/>
+                <w:sz w:val="16"/>
+                <w:szCs w:val="16"/>
+              </w:rPr>
+            </w:pPr>
+            <w:r>
+              <w:rPr>
+                <w:color w:val="000000"/>
+                <w:sz w:val="16"/>
+                <w:szCs w:val="16"/>
+              </w:rPr>
+              <w:t>Cold Start</w:t>
+            </w:r>
+          </w:p>
+        </w:tc>
+        <w:tc>
+          <w:tcPr>
+            <w:tcW w:w="1016" w:type="dxa"/>
+            <w:tcBorders>
+              <w:top w:val="single" w:sz="4" w:space="0" w:color="000000"/>
+              <w:left w:val="single" w:sz="4" w:space="0" w:color="000000"/>
+              <w:bottom w:val="single" w:sz="4" w:space="0" w:color="000000"/>
+            </w:tcBorders>
+            <w:vAlign w:val="bottom"/>
+          </w:tcPr>
+          <w:p>
+            <w:pPr>
+              <w:pStyle w:val="Normal"/>
+              <w:widowControl w:val="false"/>
+              <w:spacing w:lineRule="auto" w:line="180"/>
+              <w:jc w:val="center"/>
+              <w:rPr>
+                <w:color w:val="000000"/>
+                <w:sz w:val="16"/>
+                <w:szCs w:val="16"/>
+              </w:rPr>
+            </w:pPr>
+            <w:r>
+              <w:rPr>
+                <w:color w:val="000000"/>
+                <w:sz w:val="16"/>
+                <w:szCs w:val="16"/>
+              </w:rPr>
+              <w:t>Pass. Light On</w:t>
+            </w:r>
+          </w:p>
+        </w:tc>
+        <w:tc>
+          <w:tcPr>
+            <w:tcW w:w="1016" w:type="dxa"/>
+            <w:tcBorders>
+              <w:top w:val="single" w:sz="4" w:space="0" w:color="000000"/>
+              <w:left w:val="single" w:sz="4" w:space="0" w:color="000000"/>
+              <w:bottom w:val="single" w:sz="4" w:space="0" w:color="000000"/>
+            </w:tcBorders>
+            <w:vAlign w:val="bottom"/>
+          </w:tcPr>
+          <w:p>
+            <w:pPr>
+              <w:pStyle w:val="Normal"/>
+              <w:widowControl w:val="false"/>
+              <w:jc w:val="center"/>
+              <w:rPr>
+                <w:sz w:val="16"/>
+                <w:szCs w:val="16"/>
+              </w:rPr>
+            </w:pPr>
+            <w:r>
+              <w:rPr>
+                <w:sz w:val="16"/>
+                <w:szCs w:val="16"/>
+              </w:rPr>
+            </w:r>
+          </w:p>
+        </w:tc>
+        <w:tc>
+          <w:tcPr>
+            <w:tcW w:w="1017" w:type="dxa"/>
+            <w:tcBorders>
+              <w:top w:val="single" w:sz="4" w:space="0" w:color="000000"/>
+              <w:left w:val="single" w:sz="4" w:space="0" w:color="000000"/>
+              <w:bottom w:val="single" w:sz="4" w:space="0" w:color="000000"/>
+            </w:tcBorders>
+            <w:vAlign w:val="bottom"/>
+          </w:tcPr>
+          <w:p>
+            <w:pPr>
+              <w:pStyle w:val="Normal"/>
+              <w:widowControl w:val="false"/>
+              <w:jc w:val="center"/>
+              <w:rPr>
+                <w:sz w:val="16"/>
+                <w:szCs w:val="16"/>
+              </w:rPr>
+            </w:pPr>
+            <w:r>
+              <w:rPr>
+                <w:sz w:val="16"/>
+                <w:szCs w:val="16"/>
+              </w:rPr>
+            </w:r>
+          </w:p>
+        </w:tc>
+        <w:tc>
+          <w:tcPr>
+            <w:tcW w:w="1016" w:type="dxa"/>
+            <w:tcBorders>
+              <w:top w:val="single" w:sz="4" w:space="0" w:color="000000"/>
+              <w:left w:val="single" w:sz="4" w:space="0" w:color="000000"/>
+              <w:bottom w:val="single" w:sz="4" w:space="0" w:color="000000"/>
+            </w:tcBorders>
+            <w:vAlign w:val="bottom"/>
+          </w:tcPr>
+          <w:p>
+            <w:pPr>
+              <w:pStyle w:val="Normal"/>
+              <w:widowControl w:val="false"/>
+              <w:jc w:val="center"/>
+              <w:rPr>
+                <w:color w:val="000000"/>
+                <w:sz w:val="16"/>
+                <w:szCs w:val="16"/>
+              </w:rPr>
+            </w:pPr>
+            <w:r>
+              <w:rPr>
+                <w:color w:val="000000"/>
+                <w:sz w:val="16"/>
+                <w:szCs w:val="16"/>
+              </w:rPr>
+              <w:t>Inst. Light On</w:t>
+            </w:r>
+          </w:p>
+        </w:tc>
+        <w:tc>
+          <w:tcPr>
+            <w:tcW w:w="1020" w:type="dxa"/>
+            <w:tcBorders>
+              <w:top w:val="single" w:sz="4" w:space="0" w:color="000000"/>
+              <w:left w:val="single" w:sz="4" w:space="0" w:color="000000"/>
+              <w:bottom w:val="single" w:sz="4" w:space="0" w:color="000000"/>
+            </w:tcBorders>
+            <w:vAlign w:val="bottom"/>
+          </w:tcPr>
+          <w:p>
+            <w:pPr>
+              <w:pStyle w:val="Normal"/>
+              <w:widowControl w:val="false"/>
+              <w:spacing w:lineRule="auto" w:line="180"/>
+              <w:jc w:val="center"/>
+              <w:rPr>
+                <w:sz w:val="16"/>
+                <w:szCs w:val="16"/>
+              </w:rPr>
+            </w:pPr>
+            <w:r>
+              <w:rPr>
+                <w:rFonts w:eastAsia="arial" w:ascii="arial" w:hAnsi="arial"/>
+                <w:color w:val="000000"/>
+                <w:sz w:val="16"/>
+                <w:szCs w:val="16"/>
+              </w:rPr>
+              <w:t>Cab Light On</w:t>
+            </w:r>
+          </w:p>
+        </w:tc>
+        <w:tc>
+          <w:tcPr>
+            <w:tcW w:w="1016" w:type="dxa"/>
+            <w:tcBorders>
+              <w:top w:val="single" w:sz="4" w:space="0" w:color="000000"/>
+              <w:left w:val="single" w:sz="4" w:space="0" w:color="000000"/>
+              <w:bottom w:val="single" w:sz="4" w:space="0" w:color="000000"/>
+            </w:tcBorders>
+            <w:vAlign w:val="bottom"/>
+          </w:tcPr>
+          <w:p>
+            <w:pPr>
+              <w:pStyle w:val="Normal"/>
+              <w:widowControl w:val="false"/>
+              <w:jc w:val="center"/>
+              <w:rPr>
+                <w:color w:val="000000"/>
+                <w:sz w:val="16"/>
+                <w:szCs w:val="16"/>
+              </w:rPr>
+            </w:pPr>
+            <w:r>
+              <w:rPr>
+                <w:rFonts w:eastAsia="arial" w:ascii="arial" w:hAnsi="arial"/>
+                <w:color w:val="000000"/>
+                <w:sz w:val="16"/>
+                <w:szCs w:val="16"/>
+              </w:rPr>
+              <w:t>Couple</w:t>
+            </w:r>
+          </w:p>
+        </w:tc>
+        <w:tc>
+          <w:tcPr>
+            <w:tcW w:w="1016" w:type="dxa"/>
+            <w:tcBorders>
+              <w:top w:val="single" w:sz="4" w:space="0" w:color="000000"/>
+              <w:left w:val="single" w:sz="4" w:space="0" w:color="000000"/>
+              <w:bottom w:val="single" w:sz="4" w:space="0" w:color="000000"/>
+            </w:tcBorders>
+            <w:vAlign w:val="bottom"/>
+          </w:tcPr>
+          <w:p>
+            <w:pPr>
+              <w:pStyle w:val="Normal"/>
+              <w:widowControl w:val="false"/>
+              <w:jc w:val="center"/>
+              <w:rPr>
+                <w:color w:val="000000"/>
+                <w:sz w:val="16"/>
+                <w:szCs w:val="16"/>
+              </w:rPr>
+            </w:pPr>
+            <w:r>
+              <w:rPr>
+                <w:color w:val="000000"/>
+                <w:sz w:val="16"/>
+                <w:szCs w:val="16"/>
+              </w:rPr>
+              <w:t>Handbrake On</w:t>
+            </w:r>
+          </w:p>
+        </w:tc>
+        <w:tc>
+          <w:tcPr>
+            <w:tcW w:w="1016" w:type="dxa"/>
+            <w:tcBorders>
+              <w:top w:val="single" w:sz="4" w:space="0" w:color="000000"/>
+              <w:left w:val="single" w:sz="4" w:space="0" w:color="000000"/>
+              <w:bottom w:val="single" w:sz="4" w:space="0" w:color="000000"/>
+            </w:tcBorders>
+            <w:vAlign w:val="bottom"/>
+          </w:tcPr>
+          <w:p>
+            <w:pPr>
+              <w:pStyle w:val="Normal"/>
+              <w:widowControl w:val="false"/>
+              <w:spacing w:lineRule="auto" w:line="180"/>
+              <w:jc w:val="center"/>
+              <w:rPr>
+                <w:sz w:val="16"/>
+                <w:szCs w:val="16"/>
+              </w:rPr>
+            </w:pPr>
+            <w:r>
+              <w:rPr>
+                <w:rFonts w:eastAsia="arial" w:ascii="arial" w:hAnsi="arial"/>
+                <w:color w:val="000000"/>
+                <w:sz w:val="16"/>
+                <w:szCs w:val="16"/>
+              </w:rPr>
+              <w:t>1-Person</w:t>
+            </w:r>
+          </w:p>
+        </w:tc>
+        <w:tc>
+          <w:tcPr>
+            <w:tcW w:w="1029" w:type="dxa"/>
+            <w:tcBorders>
+              <w:top w:val="single" w:sz="4" w:space="0" w:color="000000"/>
+              <w:left w:val="single" w:sz="4" w:space="0" w:color="000000"/>
+              <w:bottom w:val="single" w:sz="4" w:space="0" w:color="000000"/>
+              <w:right w:val="single" w:sz="4" w:space="0" w:color="000000"/>
+            </w:tcBorders>
+            <w:vAlign w:val="bottom"/>
+          </w:tcPr>
+          <w:p>
+            <w:pPr>
+              <w:pStyle w:val="Normal"/>
+              <w:widowControl w:val="false"/>
+              <w:spacing w:lineRule="auto" w:line="180"/>
+              <w:jc w:val="center"/>
+              <w:rPr>
+                <w:sz w:val="16"/>
+                <w:szCs w:val="16"/>
+              </w:rPr>
+            </w:pPr>
+            <w:r>
+              <w:rPr>
+                <w:rFonts w:eastAsia="arial" w:ascii="arial" w:hAnsi="arial"/>
+                <w:color w:val="000000"/>
+                <w:sz w:val="16"/>
+                <w:szCs w:val="16"/>
+              </w:rPr>
+              <w:t>Next</w:t>
+            </w:r>
+          </w:p>
+          <w:p>
+            <w:pPr>
+              <w:pStyle w:val="Normal"/>
+              <w:widowControl w:val="false"/>
+              <w:spacing w:lineRule="auto" w:line="180"/>
+              <w:jc w:val="center"/>
+              <w:rPr>
+                <w:sz w:val="16"/>
+                <w:szCs w:val="16"/>
+              </w:rPr>
+            </w:pPr>
+            <w:r>
+              <w:rPr>
+                <w:rFonts w:eastAsia="arial" w:ascii="arial" w:hAnsi="arial"/>
+                <w:color w:val="000000"/>
+                <w:sz w:val="16"/>
+                <w:szCs w:val="16"/>
+              </w:rPr>
+              <w:t>Cab Cam</w:t>
+            </w:r>
+          </w:p>
+        </w:tc>
+      </w:tr>
+    </w:tbl>
+    <w:p>
+      <w:pPr>
+        <w:pStyle w:val="Normal"/>
+        <w:rPr>
+          <w:rFonts w:ascii="arial" w:hAnsi="arial" w:eastAsia="arial"/>
+          <w:color w:val="000000"/>
+          <w:sz w:val="16"/>
+          <w:szCs w:val="16"/>
+        </w:rPr>
+      </w:pPr>
+      <w:r>
+        <w:rPr>
+          <w:rFonts w:eastAsia="arial" w:ascii="arial" w:hAnsi="arial"/>
+          <w:color w:val="000000"/>
+          <w:sz w:val="16"/>
+          <w:szCs w:val="16"/>
+        </w:rPr>
+      </w:r>
+    </w:p>
+    <w:p>
+      <w:pPr>
+        <w:pStyle w:val="Normal"/>
+        <w:rPr>
+          <w:color w:val="000000"/>
+          <w:sz w:val="16"/>
+          <w:szCs w:val="16"/>
+        </w:rPr>
+      </w:pPr>
+      <w:r>
+        <w:rPr>
+          <w:rFonts w:eastAsia="arial" w:ascii="arial" w:hAnsi="arial"/>
+          <w:color w:val="000000"/>
+          <w:sz w:val="16"/>
+          <w:szCs w:val="16"/>
+        </w:rPr>
+        <w:tab/>
+        <w:t xml:space="preserve">           </w:t>
+      </w:r>
+      <w:r>
+        <w:rPr>
+          <w:rFonts w:eastAsia="arial" w:ascii="arial" w:hAnsi="arial"/>
+          <w:color w:val="000000"/>
+          <w:sz w:val="16"/>
+          <w:szCs w:val="16"/>
+        </w:rPr>
+        <w:t>1938 Tube Stock</w:t>
       </w:r>
       <w:r>
         <w:rPr>
@@ -48376,39 +49473,38 @@
                 <w:sz w:val="16"/>
                 <w:szCs w:val="16"/>
               </w:rPr>
-              <w:t>Aux Off</w:t>
-            </w:r>
-          </w:p>
-        </w:tc>
-        <w:tc>
-          <w:tcPr>
-            <w:tcW w:w="1016" w:type="dxa"/>
-            <w:tcBorders>
-              <w:top w:val="single" w:sz="4" w:space="0" w:color="000000"/>
-              <w:left w:val="single" w:sz="4" w:space="0" w:color="000000"/>
-              <w:bottom w:val="single" w:sz="4" w:space="0" w:color="000000"/>
-            </w:tcBorders>
-            <w:vAlign w:val="bottom"/>
-          </w:tcPr>
-          <w:p>
-            <w:pPr>
-              <w:pStyle w:val="Normal"/>
-              <w:widowControl w:val="false"/>
-              <w:spacing w:lineRule="auto" w:line="180"/>
-              <w:jc w:val="center"/>
-              <w:rPr>
-                <w:color w:val="000000"/>
-                <w:sz w:val="16"/>
-                <w:szCs w:val="16"/>
-              </w:rPr>
-            </w:pPr>
-            <w:r>
-              <w:rPr>
-                <w:color w:val="000000"/>
-                <w:sz w:val="16"/>
-                <w:szCs w:val="16"/>
-              </w:rPr>
-              <w:t>DSD/Vigilance</w:t>
+              <w:t>Master Off</w:t>
+            </w:r>
+          </w:p>
+        </w:tc>
+        <w:tc>
+          <w:tcPr>
+            <w:tcW w:w="1016" w:type="dxa"/>
+            <w:tcBorders>
+              <w:top w:val="single" w:sz="4" w:space="0" w:color="000000"/>
+              <w:left w:val="single" w:sz="4" w:space="0" w:color="000000"/>
+              <w:bottom w:val="single" w:sz="4" w:space="0" w:color="000000"/>
+            </w:tcBorders>
+            <w:vAlign w:val="bottom"/>
+          </w:tcPr>
+          <w:p>
+            <w:pPr>
+              <w:pStyle w:val="Normal"/>
+              <w:widowControl w:val="false"/>
+              <w:spacing w:lineRule="auto" w:line="180"/>
+              <w:jc w:val="center"/>
+              <w:rPr>
+                <w:color w:val="000000"/>
+                <w:sz w:val="16"/>
+                <w:szCs w:val="16"/>
+              </w:rPr>
+            </w:pPr>
+            <w:r>
+              <w:rPr>
+                <w:color w:val="000000"/>
+                <w:sz w:val="16"/>
+                <w:szCs w:val="16"/>
+              </w:rPr>
             </w:r>
           </w:p>
         </w:tc>
@@ -48440,67 +49536,68 @@
                 <w:sz w:val="16"/>
                 <w:szCs w:val="16"/>
               </w:rPr>
-              <w:t>Panto. Low</w:t>
-            </w:r>
-          </w:p>
-        </w:tc>
-        <w:tc>
-          <w:tcPr>
-            <w:tcW w:w="1016" w:type="dxa"/>
-            <w:tcBorders>
-              <w:top w:val="single" w:sz="4" w:space="0" w:color="000000"/>
-              <w:left w:val="single" w:sz="4" w:space="0" w:color="000000"/>
-              <w:bottom w:val="single" w:sz="4" w:space="0" w:color="000000"/>
-            </w:tcBorders>
-            <w:vAlign w:val="bottom"/>
-          </w:tcPr>
-          <w:p>
-            <w:pPr>
-              <w:pStyle w:val="Normal"/>
-              <w:widowControl w:val="false"/>
-              <w:spacing w:lineRule="auto" w:line="180"/>
-              <w:jc w:val="center"/>
-              <w:rPr>
-                <w:sz w:val="16"/>
-                <w:szCs w:val="16"/>
-              </w:rPr>
-            </w:pPr>
-            <w:r>
-              <w:rPr>
-                <w:rFonts w:eastAsia="arial" w:ascii="arial" w:hAnsi="arial"/>
-                <w:sz w:val="16"/>
-                <w:szCs w:val="16"/>
-              </w:rPr>
-              <w:t>Snow Brake</w:t>
-            </w:r>
-          </w:p>
-        </w:tc>
-        <w:tc>
-          <w:tcPr>
-            <w:tcW w:w="1016" w:type="dxa"/>
-            <w:tcBorders>
-              <w:top w:val="single" w:sz="4" w:space="0" w:color="000000"/>
-              <w:left w:val="single" w:sz="4" w:space="0" w:color="000000"/>
-              <w:bottom w:val="single" w:sz="4" w:space="0" w:color="000000"/>
-            </w:tcBorders>
-            <w:vAlign w:val="bottom"/>
-          </w:tcPr>
-          <w:p>
-            <w:pPr>
-              <w:pStyle w:val="Normal"/>
-              <w:widowControl w:val="false"/>
-              <w:jc w:val="center"/>
-              <w:rPr>
-                <w:sz w:val="16"/>
-                <w:szCs w:val="16"/>
-              </w:rPr>
-            </w:pPr>
-            <w:r>
-              <w:rPr>
-                <w:sz w:val="16"/>
-                <w:szCs w:val="16"/>
-              </w:rPr>
-              <w:t>Engine Stop</w:t>
+              <w:br/>
+              <w:t>Trip Power</w:t>
+            </w:r>
+          </w:p>
+        </w:tc>
+        <w:tc>
+          <w:tcPr>
+            <w:tcW w:w="1016" w:type="dxa"/>
+            <w:tcBorders>
+              <w:top w:val="single" w:sz="4" w:space="0" w:color="000000"/>
+              <w:left w:val="single" w:sz="4" w:space="0" w:color="000000"/>
+              <w:bottom w:val="single" w:sz="4" w:space="0" w:color="000000"/>
+            </w:tcBorders>
+            <w:vAlign w:val="bottom"/>
+          </w:tcPr>
+          <w:p>
+            <w:pPr>
+              <w:pStyle w:val="Normal"/>
+              <w:widowControl w:val="false"/>
+              <w:spacing w:lineRule="auto" w:line="180"/>
+              <w:jc w:val="center"/>
+              <w:rPr>
+                <w:color w:val="000000"/>
+                <w:sz w:val="16"/>
+                <w:szCs w:val="16"/>
+              </w:rPr>
+            </w:pPr>
+            <w:r>
+              <w:rPr>
+                <w:color w:val="000000"/>
+                <w:sz w:val="16"/>
+                <w:szCs w:val="16"/>
+              </w:rPr>
+              <w:t>Pass. Light Off</w:t>
+            </w:r>
+          </w:p>
+        </w:tc>
+        <w:tc>
+          <w:tcPr>
+            <w:tcW w:w="1016" w:type="dxa"/>
+            <w:tcBorders>
+              <w:top w:val="single" w:sz="4" w:space="0" w:color="000000"/>
+              <w:left w:val="single" w:sz="4" w:space="0" w:color="000000"/>
+              <w:bottom w:val="single" w:sz="4" w:space="0" w:color="000000"/>
+            </w:tcBorders>
+            <w:vAlign w:val="bottom"/>
+          </w:tcPr>
+          <w:p>
+            <w:pPr>
+              <w:pStyle w:val="Normal"/>
+              <w:widowControl w:val="false"/>
+              <w:jc w:val="center"/>
+              <w:rPr>
+                <w:sz w:val="16"/>
+                <w:szCs w:val="16"/>
+              </w:rPr>
+            </w:pPr>
+            <w:r>
+              <w:rPr>
+                <w:sz w:val="16"/>
+                <w:szCs w:val="16"/>
+              </w:rPr>
             </w:r>
           </w:p>
         </w:tc>
@@ -48529,38 +49626,38 @@
                 <w:sz w:val="16"/>
                 <w:szCs w:val="16"/>
               </w:rPr>
-              <w:t>Diesel</w:t>
-            </w:r>
-          </w:p>
-        </w:tc>
-        <w:tc>
-          <w:tcPr>
-            <w:tcW w:w="1016" w:type="dxa"/>
-            <w:tcBorders>
-              <w:top w:val="single" w:sz="4" w:space="0" w:color="000000"/>
-              <w:left w:val="single" w:sz="4" w:space="0" w:color="000000"/>
-              <w:bottom w:val="single" w:sz="4" w:space="0" w:color="000000"/>
-            </w:tcBorders>
-            <w:vAlign w:val="bottom"/>
-          </w:tcPr>
-          <w:p>
-            <w:pPr>
-              <w:pStyle w:val="Normal"/>
-              <w:widowControl w:val="false"/>
-              <w:jc w:val="center"/>
-              <w:rPr>
-                <w:color w:val="000000"/>
-                <w:sz w:val="16"/>
-                <w:szCs w:val="16"/>
-              </w:rPr>
-            </w:pPr>
-            <w:r>
-              <w:rPr>
-                <w:color w:val="000000"/>
-                <w:sz w:val="16"/>
-                <w:szCs w:val="16"/>
-              </w:rPr>
-              <w:t>Rear Coupler</w:t>
+            </w:r>
+          </w:p>
+        </w:tc>
+        <w:tc>
+          <w:tcPr>
+            <w:tcW w:w="1016" w:type="dxa"/>
+            <w:tcBorders>
+              <w:top w:val="single" w:sz="4" w:space="0" w:color="000000"/>
+              <w:left w:val="single" w:sz="4" w:space="0" w:color="000000"/>
+              <w:bottom w:val="single" w:sz="4" w:space="0" w:color="000000"/>
+            </w:tcBorders>
+            <w:vAlign w:val="bottom"/>
+          </w:tcPr>
+          <w:p>
+            <w:pPr>
+              <w:pStyle w:val="Normal"/>
+              <w:widowControl w:val="false"/>
+              <w:jc w:val="center"/>
+              <w:rPr>
+                <w:color w:val="000000"/>
+                <w:sz w:val="16"/>
+                <w:szCs w:val="16"/>
+              </w:rPr>
+            </w:pPr>
+            <w:r>
+              <w:rPr>
+                <w:rFonts w:eastAsia="arial" w:ascii="arial" w:hAnsi="arial"/>
+                <w:color w:val="000000"/>
+                <w:sz w:val="16"/>
+                <w:szCs w:val="16"/>
+              </w:rPr>
+              <w:t>Inst. Light Off</w:t>
             </w:r>
           </w:p>
         </w:tc>
@@ -48592,39 +49689,7 @@
                 <w:sz w:val="16"/>
                 <w:szCs w:val="16"/>
               </w:rPr>
-              <w:t>Desk Light Down</w:t>
-            </w:r>
-          </w:p>
-        </w:tc>
-        <w:tc>
-          <w:tcPr>
-            <w:tcW w:w="1016" w:type="dxa"/>
-            <w:tcBorders>
-              <w:top w:val="single" w:sz="4" w:space="0" w:color="000000"/>
-              <w:left w:val="single" w:sz="4" w:space="0" w:color="000000"/>
-              <w:bottom w:val="single" w:sz="4" w:space="0" w:color="000000"/>
-            </w:tcBorders>
-            <w:vAlign w:val="bottom"/>
-          </w:tcPr>
-          <w:p>
-            <w:pPr>
-              <w:pStyle w:val="Normal"/>
-              <w:widowControl w:val="false"/>
-              <w:spacing w:lineRule="auto" w:line="180"/>
-              <w:jc w:val="center"/>
-              <w:rPr>
-                <w:sz w:val="16"/>
-                <w:szCs w:val="16"/>
-              </w:rPr>
-            </w:pPr>
-            <w:r>
-              <w:rPr>
-                <w:rFonts w:eastAsia="arial" w:ascii="arial" w:hAnsi="arial"/>
-                <w:color w:val="000000"/>
-                <w:sz w:val="16"/>
-                <w:szCs w:val="16"/>
-              </w:rPr>
-              <w:t>Hazard Warning</w:t>
+              <w:t>Cab Light Off</w:t>
             </w:r>
           </w:p>
         </w:tc>
@@ -48657,6 +49722,37 @@
                 <w:szCs w:val="16"/>
               </w:rPr>
               <w:t>Uncouple</w:t>
+            </w:r>
+          </w:p>
+        </w:tc>
+        <w:tc>
+          <w:tcPr>
+            <w:tcW w:w="1016" w:type="dxa"/>
+            <w:tcBorders>
+              <w:top w:val="single" w:sz="4" w:space="0" w:color="000000"/>
+              <w:left w:val="single" w:sz="4" w:space="0" w:color="000000"/>
+              <w:bottom w:val="single" w:sz="4" w:space="0" w:color="000000"/>
+            </w:tcBorders>
+            <w:vAlign w:val="bottom"/>
+          </w:tcPr>
+          <w:p>
+            <w:pPr>
+              <w:pStyle w:val="Normal"/>
+              <w:widowControl w:val="false"/>
+              <w:jc w:val="center"/>
+              <w:rPr>
+                <w:color w:val="000000"/>
+                <w:sz w:val="16"/>
+                <w:szCs w:val="16"/>
+              </w:rPr>
+            </w:pPr>
+            <w:r>
+              <w:rPr>
+                <w:color w:val="000000"/>
+                <w:sz w:val="16"/>
+                <w:szCs w:val="16"/>
+              </w:rPr>
+              <w:t>Handbrake Off</w:t>
             </w:r>
           </w:p>
         </w:tc>
@@ -48780,6 +49876,1175 @@
       </w:pPr>
       <w:r>
         <w:rPr>
+          <w:rFonts w:eastAsia="arial" w:ascii="arial" w:hAnsi="arial"/>
+          <w:color w:val="000000"/>
+          <w:sz w:val="16"/>
+          <w:szCs w:val="16"/>
+        </w:rPr>
+      </w:r>
+    </w:p>
+    <w:p>
+      <w:pPr>
+        <w:pStyle w:val="Normal"/>
+        <w:rPr>
+          <w:color w:val="000000"/>
+          <w:sz w:val="16"/>
+          <w:szCs w:val="16"/>
+        </w:rPr>
+      </w:pPr>
+      <w:r>
+        <w:rPr>
+          <w:rFonts w:eastAsia="arial" w:ascii="arial" w:hAnsi="arial"/>
+          <w:color w:val="000000"/>
+          <w:sz w:val="16"/>
+          <w:szCs w:val="16"/>
+        </w:rPr>
+        <w:tab/>
+        <w:t xml:space="preserve">           </w:t>
+      </w:r>
+      <w:r>
+        <w:rPr>
+          <w:rFonts w:eastAsia="arial" w:ascii="arial" w:hAnsi="arial"/>
+          <w:color w:val="000000"/>
+          <w:sz w:val="16"/>
+          <w:szCs w:val="16"/>
+        </w:rPr>
+        <w:t>1972 Tube Stock</w:t>
+      </w:r>
+      <w:r>
+        <w:rPr>
+          <w:rFonts w:eastAsia="arial" w:ascii="arial" w:hAnsi="arial"/>
+          <w:color w:val="000000"/>
+          <w:sz w:val="16"/>
+          <w:szCs w:val="16"/>
+        </w:rPr>
+        <w:t>-1</w:t>
+      </w:r>
+    </w:p>
+    <w:tbl>
+      <w:tblPr>
+        <w:tblW w:w="14248" w:type="dxa"/>
+        <w:jc w:val="left"/>
+        <w:tblInd w:w="-5" w:type="dxa"/>
+        <w:tblLayout w:type="fixed"/>
+        <w:tblCellMar>
+          <w:top w:w="0" w:type="dxa"/>
+          <w:left w:w="108" w:type="dxa"/>
+          <w:bottom w:w="0" w:type="dxa"/>
+          <w:right w:w="108" w:type="dxa"/>
+        </w:tblCellMar>
+        <w:tblLook w:firstRow="1" w:noVBand="1" w:lastRow="0" w:firstColumn="1" w:lastColumn="0" w:noHBand="0" w:val="04a0"/>
+      </w:tblPr>
+      <w:tblGrid>
+        <w:gridCol w:w="1017"/>
+        <w:gridCol w:w="1019"/>
+        <w:gridCol w:w="1014"/>
+        <w:gridCol w:w="1016"/>
+        <w:gridCol w:w="1020"/>
+        <w:gridCol w:w="1016"/>
+        <w:gridCol w:w="1016"/>
+        <w:gridCol w:w="1017"/>
+        <w:gridCol w:w="1016"/>
+        <w:gridCol w:w="1020"/>
+        <w:gridCol w:w="1016"/>
+        <w:gridCol w:w="1016"/>
+        <w:gridCol w:w="1016"/>
+        <w:gridCol w:w="1029"/>
+      </w:tblGrid>
+      <w:tr>
+        <w:trPr>
+          <w:trHeight w:val="440" w:hRule="exact"/>
+          <w:cantSplit w:val="true"/>
+        </w:trPr>
+        <w:tc>
+          <w:tcPr>
+            <w:tcW w:w="1017" w:type="dxa"/>
+            <w:tcBorders>
+              <w:top w:val="single" w:sz="4" w:space="0" w:color="000000"/>
+              <w:left w:val="single" w:sz="4" w:space="0" w:color="000000"/>
+              <w:bottom w:val="single" w:sz="4" w:space="0" w:color="000000"/>
+            </w:tcBorders>
+            <w:vAlign w:val="bottom"/>
+          </w:tcPr>
+          <w:p>
+            <w:pPr>
+              <w:pStyle w:val="Normal"/>
+              <w:widowControl w:val="false"/>
+              <w:spacing w:lineRule="auto" w:line="180" w:before="0" w:after="60"/>
+              <w:jc w:val="center"/>
+              <w:rPr>
+                <w:color w:val="000000"/>
+                <w:sz w:val="16"/>
+                <w:szCs w:val="16"/>
+              </w:rPr>
+            </w:pPr>
+            <w:r>
+              <w:rPr>
+                <w:rFonts w:eastAsia="arial" w:ascii="arial" w:hAnsi="arial"/>
+                <w:b/>
+                <w:color w:val="000000"/>
+                <w:sz w:val="16"/>
+                <w:szCs w:val="16"/>
+              </w:rPr>
+              <w:t>Pause</w:t>
+            </w:r>
+          </w:p>
+        </w:tc>
+        <w:tc>
+          <w:tcPr>
+            <w:tcW w:w="1019" w:type="dxa"/>
+            <w:tcBorders>
+              <w:top w:val="single" w:sz="4" w:space="0" w:color="000000"/>
+              <w:left w:val="single" w:sz="4" w:space="0" w:color="000000"/>
+              <w:bottom w:val="single" w:sz="4" w:space="0" w:color="000000"/>
+            </w:tcBorders>
+            <w:vAlign w:val="bottom"/>
+          </w:tcPr>
+          <w:p>
+            <w:pPr>
+              <w:pStyle w:val="Normal"/>
+              <w:widowControl w:val="false"/>
+              <w:bidi w:val="0"/>
+              <w:spacing w:lineRule="auto" w:line="180"/>
+              <w:jc w:val="center"/>
+              <w:rPr>
+                <w:color w:val="000000"/>
+                <w:sz w:val="16"/>
+                <w:szCs w:val="16"/>
+              </w:rPr>
+            </w:pPr>
+            <w:r>
+              <w:rPr>
+                <w:color w:val="000000"/>
+                <w:sz w:val="16"/>
+                <w:szCs w:val="16"/>
+              </w:rPr>
+              <w:t>Control</w:t>
+            </w:r>
+            <w:r>
+              <w:rPr>
+                <w:color w:val="000000"/>
+                <w:sz w:val="16"/>
+                <w:szCs w:val="16"/>
+              </w:rPr>
+              <w:t xml:space="preserve"> Key</w:t>
+            </w:r>
+          </w:p>
+        </w:tc>
+        <w:tc>
+          <w:tcPr>
+            <w:tcW w:w="1014" w:type="dxa"/>
+            <w:tcBorders>
+              <w:top w:val="single" w:sz="4" w:space="0" w:color="000000"/>
+              <w:left w:val="single" w:sz="4" w:space="0" w:color="000000"/>
+              <w:bottom w:val="single" w:sz="4" w:space="0" w:color="000000"/>
+            </w:tcBorders>
+            <w:vAlign w:val="bottom"/>
+          </w:tcPr>
+          <w:p>
+            <w:pPr>
+              <w:pStyle w:val="Normal"/>
+              <w:widowControl w:val="false"/>
+              <w:spacing w:lineRule="auto" w:line="180"/>
+              <w:jc w:val="center"/>
+              <w:rPr>
+                <w:color w:val="000000"/>
+                <w:sz w:val="16"/>
+                <w:szCs w:val="16"/>
+              </w:rPr>
+            </w:pPr>
+            <w:r>
+              <w:rPr>
+                <w:color w:val="000000"/>
+                <w:sz w:val="16"/>
+                <w:szCs w:val="16"/>
+              </w:rPr>
+              <w:t>Control</w:t>
+            </w:r>
+            <w:r>
+              <w:rPr>
+                <w:color w:val="000000"/>
+                <w:sz w:val="16"/>
+                <w:szCs w:val="16"/>
+              </w:rPr>
+              <w:t xml:space="preserve"> On</w:t>
+            </w:r>
+          </w:p>
+        </w:tc>
+        <w:tc>
+          <w:tcPr>
+            <w:tcW w:w="1016" w:type="dxa"/>
+            <w:tcBorders>
+              <w:top w:val="single" w:sz="4" w:space="0" w:color="000000"/>
+              <w:left w:val="single" w:sz="4" w:space="0" w:color="000000"/>
+              <w:bottom w:val="single" w:sz="4" w:space="0" w:color="000000"/>
+            </w:tcBorders>
+            <w:vAlign w:val="bottom"/>
+          </w:tcPr>
+          <w:p>
+            <w:pPr>
+              <w:pStyle w:val="Normal"/>
+              <w:widowControl w:val="false"/>
+              <w:spacing w:lineRule="auto" w:line="180"/>
+              <w:jc w:val="center"/>
+              <w:rPr>
+                <w:color w:val="000000"/>
+                <w:sz w:val="16"/>
+                <w:szCs w:val="16"/>
+              </w:rPr>
+            </w:pPr>
+            <w:r>
+              <w:rPr>
+                <w:color w:val="000000"/>
+                <w:sz w:val="16"/>
+                <w:szCs w:val="16"/>
+              </w:rPr>
+              <w:t>Reverser Key</w:t>
+            </w:r>
+          </w:p>
+        </w:tc>
+        <w:tc>
+          <w:tcPr>
+            <w:tcW w:w="1020" w:type="dxa"/>
+            <w:tcBorders>
+              <w:top w:val="single" w:sz="4" w:space="0" w:color="000000"/>
+              <w:left w:val="single" w:sz="4" w:space="0" w:color="000000"/>
+              <w:bottom w:val="single" w:sz="4" w:space="0" w:color="000000"/>
+            </w:tcBorders>
+            <w:vAlign w:val="bottom"/>
+          </w:tcPr>
+          <w:p>
+            <w:pPr>
+              <w:pStyle w:val="Normal"/>
+              <w:widowControl w:val="false"/>
+              <w:spacing w:lineRule="auto" w:line="180"/>
+              <w:jc w:val="center"/>
+              <w:rPr>
+                <w:color w:val="000000"/>
+                <w:sz w:val="16"/>
+                <w:szCs w:val="16"/>
+              </w:rPr>
+            </w:pPr>
+            <w:r>
+              <w:rPr>
+                <w:color w:val="000000"/>
+                <w:sz w:val="16"/>
+                <w:szCs w:val="16"/>
+              </w:rPr>
+              <w:t>MG Set</w:t>
+            </w:r>
+          </w:p>
+        </w:tc>
+        <w:tc>
+          <w:tcPr>
+            <w:tcW w:w="1016" w:type="dxa"/>
+            <w:tcBorders>
+              <w:top w:val="single" w:sz="4" w:space="0" w:color="000000"/>
+              <w:left w:val="single" w:sz="4" w:space="0" w:color="000000"/>
+              <w:bottom w:val="single" w:sz="4" w:space="0" w:color="000000"/>
+            </w:tcBorders>
+            <w:vAlign w:val="bottom"/>
+          </w:tcPr>
+          <w:p>
+            <w:pPr>
+              <w:pStyle w:val="Normal"/>
+              <w:widowControl w:val="false"/>
+              <w:spacing w:lineRule="auto" w:line="180"/>
+              <w:jc w:val="center"/>
+              <w:rPr>
+                <w:color w:val="000000"/>
+                <w:sz w:val="16"/>
+                <w:szCs w:val="16"/>
+              </w:rPr>
+            </w:pPr>
+            <w:r>
+              <w:rPr>
+                <w:color w:val="000000"/>
+                <w:sz w:val="16"/>
+                <w:szCs w:val="16"/>
+              </w:rPr>
+              <w:t>Saloon</w:t>
+            </w:r>
+            <w:r>
+              <w:rPr>
+                <w:color w:val="000000"/>
+                <w:sz w:val="16"/>
+                <w:szCs w:val="16"/>
+              </w:rPr>
+              <w:t xml:space="preserve"> Light On</w:t>
+            </w:r>
+          </w:p>
+        </w:tc>
+        <w:tc>
+          <w:tcPr>
+            <w:tcW w:w="1016" w:type="dxa"/>
+            <w:tcBorders>
+              <w:top w:val="single" w:sz="4" w:space="0" w:color="000000"/>
+              <w:left w:val="single" w:sz="4" w:space="0" w:color="000000"/>
+              <w:bottom w:val="single" w:sz="4" w:space="0" w:color="000000"/>
+            </w:tcBorders>
+            <w:vAlign w:val="bottom"/>
+          </w:tcPr>
+          <w:p>
+            <w:pPr>
+              <w:pStyle w:val="Normal"/>
+              <w:widowControl w:val="false"/>
+              <w:jc w:val="center"/>
+              <w:rPr>
+                <w:sz w:val="16"/>
+                <w:szCs w:val="16"/>
+              </w:rPr>
+            </w:pPr>
+            <w:r>
+              <w:rPr>
+                <w:sz w:val="16"/>
+                <w:szCs w:val="16"/>
+              </w:rPr>
+              <w:t>PEA</w:t>
+            </w:r>
+          </w:p>
+        </w:tc>
+        <w:tc>
+          <w:tcPr>
+            <w:tcW w:w="1017" w:type="dxa"/>
+            <w:tcBorders>
+              <w:top w:val="single" w:sz="4" w:space="0" w:color="000000"/>
+              <w:left w:val="single" w:sz="4" w:space="0" w:color="000000"/>
+              <w:bottom w:val="single" w:sz="4" w:space="0" w:color="000000"/>
+            </w:tcBorders>
+            <w:vAlign w:val="bottom"/>
+          </w:tcPr>
+          <w:p>
+            <w:pPr>
+              <w:pStyle w:val="Normal"/>
+              <w:widowControl w:val="false"/>
+              <w:jc w:val="center"/>
+              <w:rPr>
+                <w:sz w:val="16"/>
+                <w:szCs w:val="16"/>
+              </w:rPr>
+            </w:pPr>
+            <w:r>
+              <w:rPr>
+                <w:sz w:val="16"/>
+                <w:szCs w:val="16"/>
+              </w:rPr>
+              <w:t>Destination Up</w:t>
+            </w:r>
+          </w:p>
+        </w:tc>
+        <w:tc>
+          <w:tcPr>
+            <w:tcW w:w="1016" w:type="dxa"/>
+            <w:tcBorders>
+              <w:top w:val="single" w:sz="4" w:space="0" w:color="000000"/>
+              <w:left w:val="single" w:sz="4" w:space="0" w:color="000000"/>
+              <w:bottom w:val="single" w:sz="4" w:space="0" w:color="000000"/>
+            </w:tcBorders>
+            <w:vAlign w:val="bottom"/>
+          </w:tcPr>
+          <w:p>
+            <w:pPr>
+              <w:pStyle w:val="Normal"/>
+              <w:widowControl w:val="false"/>
+              <w:jc w:val="center"/>
+              <w:rPr>
+                <w:color w:val="000000"/>
+                <w:sz w:val="16"/>
+                <w:szCs w:val="16"/>
+              </w:rPr>
+            </w:pPr>
+            <w:r>
+              <w:rPr/>
+            </w:r>
+          </w:p>
+        </w:tc>
+        <w:tc>
+          <w:tcPr>
+            <w:tcW w:w="1020" w:type="dxa"/>
+            <w:tcBorders>
+              <w:top w:val="single" w:sz="4" w:space="0" w:color="000000"/>
+              <w:left w:val="single" w:sz="4" w:space="0" w:color="000000"/>
+              <w:bottom w:val="single" w:sz="4" w:space="0" w:color="000000"/>
+            </w:tcBorders>
+            <w:vAlign w:val="bottom"/>
+          </w:tcPr>
+          <w:p>
+            <w:pPr>
+              <w:pStyle w:val="Normal"/>
+              <w:widowControl w:val="false"/>
+              <w:spacing w:lineRule="auto" w:line="180"/>
+              <w:jc w:val="center"/>
+              <w:rPr>
+                <w:sz w:val="16"/>
+                <w:szCs w:val="16"/>
+              </w:rPr>
+            </w:pPr>
+            <w:r>
+              <w:rPr>
+                <w:rFonts w:eastAsia="arial" w:ascii="arial" w:hAnsi="arial"/>
+                <w:color w:val="000000"/>
+                <w:sz w:val="16"/>
+                <w:szCs w:val="16"/>
+              </w:rPr>
+              <w:t>Destination Light</w:t>
+            </w:r>
+          </w:p>
+        </w:tc>
+        <w:tc>
+          <w:tcPr>
+            <w:tcW w:w="1016" w:type="dxa"/>
+            <w:tcBorders>
+              <w:top w:val="single" w:sz="4" w:space="0" w:color="000000"/>
+              <w:left w:val="single" w:sz="4" w:space="0" w:color="000000"/>
+              <w:bottom w:val="single" w:sz="4" w:space="0" w:color="000000"/>
+            </w:tcBorders>
+            <w:vAlign w:val="bottom"/>
+          </w:tcPr>
+          <w:p>
+            <w:pPr>
+              <w:pStyle w:val="Normal"/>
+              <w:widowControl w:val="false"/>
+              <w:jc w:val="center"/>
+              <w:rPr>
+                <w:color w:val="000000"/>
+                <w:sz w:val="16"/>
+                <w:szCs w:val="16"/>
+              </w:rPr>
+            </w:pPr>
+            <w:r>
+              <w:rPr>
+                <w:rFonts w:eastAsia="arial" w:ascii="arial" w:hAnsi="arial"/>
+                <w:color w:val="000000"/>
+                <w:sz w:val="16"/>
+                <w:szCs w:val="16"/>
+              </w:rPr>
+              <w:t>Stable Tail Light</w:t>
+            </w:r>
+          </w:p>
+        </w:tc>
+        <w:tc>
+          <w:tcPr>
+            <w:tcW w:w="1016" w:type="dxa"/>
+            <w:tcBorders>
+              <w:top w:val="single" w:sz="4" w:space="0" w:color="000000"/>
+              <w:left w:val="single" w:sz="4" w:space="0" w:color="000000"/>
+              <w:bottom w:val="single" w:sz="4" w:space="0" w:color="000000"/>
+            </w:tcBorders>
+            <w:vAlign w:val="bottom"/>
+          </w:tcPr>
+          <w:p>
+            <w:pPr>
+              <w:pStyle w:val="Normal"/>
+              <w:widowControl w:val="false"/>
+              <w:jc w:val="center"/>
+              <w:rPr>
+                <w:color w:val="000000"/>
+                <w:sz w:val="16"/>
+                <w:szCs w:val="16"/>
+              </w:rPr>
+            </w:pPr>
+            <w:r>
+              <w:rPr>
+                <w:color w:val="000000"/>
+                <w:sz w:val="16"/>
+                <w:szCs w:val="16"/>
+              </w:rPr>
+              <w:t>Cab Light</w:t>
+            </w:r>
+          </w:p>
+        </w:tc>
+        <w:tc>
+          <w:tcPr>
+            <w:tcW w:w="1016" w:type="dxa"/>
+            <w:tcBorders>
+              <w:top w:val="single" w:sz="4" w:space="0" w:color="000000"/>
+              <w:left w:val="single" w:sz="4" w:space="0" w:color="000000"/>
+              <w:bottom w:val="single" w:sz="4" w:space="0" w:color="000000"/>
+            </w:tcBorders>
+            <w:vAlign w:val="bottom"/>
+          </w:tcPr>
+          <w:p>
+            <w:pPr>
+              <w:pStyle w:val="Normal"/>
+              <w:widowControl w:val="false"/>
+              <w:spacing w:lineRule="auto" w:line="180"/>
+              <w:jc w:val="center"/>
+              <w:rPr>
+                <w:sz w:val="16"/>
+                <w:szCs w:val="16"/>
+              </w:rPr>
+            </w:pPr>
+            <w:r>
+              <w:rPr>
+                <w:rFonts w:eastAsia="arial" w:ascii="arial" w:hAnsi="arial"/>
+                <w:color w:val="000000"/>
+                <w:sz w:val="16"/>
+                <w:szCs w:val="16"/>
+              </w:rPr>
+              <w:t>1-Person</w:t>
+            </w:r>
+          </w:p>
+        </w:tc>
+        <w:tc>
+          <w:tcPr>
+            <w:tcW w:w="1029" w:type="dxa"/>
+            <w:tcBorders>
+              <w:top w:val="single" w:sz="4" w:space="0" w:color="000000"/>
+              <w:left w:val="single" w:sz="4" w:space="0" w:color="000000"/>
+              <w:bottom w:val="single" w:sz="4" w:space="0" w:color="000000"/>
+              <w:right w:val="single" w:sz="4" w:space="0" w:color="000000"/>
+            </w:tcBorders>
+            <w:vAlign w:val="bottom"/>
+          </w:tcPr>
+          <w:p>
+            <w:pPr>
+              <w:pStyle w:val="Normal"/>
+              <w:widowControl w:val="false"/>
+              <w:spacing w:lineRule="auto" w:line="180"/>
+              <w:jc w:val="center"/>
+              <w:rPr>
+                <w:sz w:val="16"/>
+                <w:szCs w:val="16"/>
+              </w:rPr>
+            </w:pPr>
+            <w:r>
+              <w:rPr>
+                <w:rFonts w:eastAsia="arial" w:ascii="arial" w:hAnsi="arial"/>
+                <w:color w:val="000000"/>
+                <w:sz w:val="16"/>
+                <w:szCs w:val="16"/>
+              </w:rPr>
+              <w:t>Next</w:t>
+            </w:r>
+          </w:p>
+          <w:p>
+            <w:pPr>
+              <w:pStyle w:val="Normal"/>
+              <w:widowControl w:val="false"/>
+              <w:spacing w:lineRule="auto" w:line="180"/>
+              <w:jc w:val="center"/>
+              <w:rPr>
+                <w:sz w:val="16"/>
+                <w:szCs w:val="16"/>
+              </w:rPr>
+            </w:pPr>
+            <w:r>
+              <w:rPr>
+                <w:rFonts w:eastAsia="arial" w:ascii="arial" w:hAnsi="arial"/>
+                <w:color w:val="000000"/>
+                <w:sz w:val="16"/>
+                <w:szCs w:val="16"/>
+              </w:rPr>
+              <w:t>Cab Cam</w:t>
+            </w:r>
+          </w:p>
+        </w:tc>
+      </w:tr>
+    </w:tbl>
+    <w:p>
+      <w:pPr>
+        <w:pStyle w:val="Normal"/>
+        <w:rPr>
+          <w:rFonts w:ascii="arial" w:hAnsi="arial" w:eastAsia="arial"/>
+          <w:color w:val="000000"/>
+          <w:sz w:val="16"/>
+          <w:szCs w:val="16"/>
+        </w:rPr>
+      </w:pPr>
+      <w:r>
+        <w:rPr>
+          <w:rFonts w:eastAsia="arial" w:ascii="arial" w:hAnsi="arial"/>
+          <w:color w:val="000000"/>
+          <w:sz w:val="16"/>
+          <w:szCs w:val="16"/>
+        </w:rPr>
+      </w:r>
+    </w:p>
+    <w:p>
+      <w:pPr>
+        <w:pStyle w:val="Normal"/>
+        <w:rPr>
+          <w:color w:val="000000"/>
+          <w:sz w:val="16"/>
+          <w:szCs w:val="16"/>
+        </w:rPr>
+      </w:pPr>
+      <w:r>
+        <w:rPr>
+          <w:rFonts w:eastAsia="arial" w:ascii="arial" w:hAnsi="arial"/>
+          <w:color w:val="000000"/>
+          <w:sz w:val="16"/>
+          <w:szCs w:val="16"/>
+        </w:rPr>
+        <w:tab/>
+        <w:t xml:space="preserve">           </w:t>
+      </w:r>
+      <w:r>
+        <w:rPr>
+          <w:rFonts w:eastAsia="arial" w:ascii="arial" w:hAnsi="arial"/>
+          <w:color w:val="000000"/>
+          <w:sz w:val="16"/>
+          <w:szCs w:val="16"/>
+        </w:rPr>
+        <w:t>1972 Tube Stock</w:t>
+      </w:r>
+      <w:r>
+        <w:rPr>
+          <w:rFonts w:eastAsia="arial" w:ascii="arial" w:hAnsi="arial"/>
+          <w:color w:val="000000"/>
+          <w:sz w:val="16"/>
+          <w:szCs w:val="16"/>
+        </w:rPr>
+        <w:t>-2</w:t>
+      </w:r>
+    </w:p>
+    <w:tbl>
+      <w:tblPr>
+        <w:tblW w:w="14248" w:type="dxa"/>
+        <w:jc w:val="left"/>
+        <w:tblInd w:w="-5" w:type="dxa"/>
+        <w:tblLayout w:type="fixed"/>
+        <w:tblCellMar>
+          <w:top w:w="0" w:type="dxa"/>
+          <w:left w:w="108" w:type="dxa"/>
+          <w:bottom w:w="0" w:type="dxa"/>
+          <w:right w:w="108" w:type="dxa"/>
+        </w:tblCellMar>
+        <w:tblLook w:firstRow="1" w:noVBand="1" w:lastRow="0" w:firstColumn="1" w:lastColumn="0" w:noHBand="0" w:val="04a0"/>
+      </w:tblPr>
+      <w:tblGrid>
+        <w:gridCol w:w="1017"/>
+        <w:gridCol w:w="1019"/>
+        <w:gridCol w:w="1014"/>
+        <w:gridCol w:w="1016"/>
+        <w:gridCol w:w="1020"/>
+        <w:gridCol w:w="1016"/>
+        <w:gridCol w:w="1016"/>
+        <w:gridCol w:w="1017"/>
+        <w:gridCol w:w="1016"/>
+        <w:gridCol w:w="1020"/>
+        <w:gridCol w:w="1016"/>
+        <w:gridCol w:w="1016"/>
+        <w:gridCol w:w="1016"/>
+        <w:gridCol w:w="1029"/>
+      </w:tblGrid>
+      <w:tr>
+        <w:trPr>
+          <w:trHeight w:val="440" w:hRule="exact"/>
+          <w:cantSplit w:val="true"/>
+        </w:trPr>
+        <w:tc>
+          <w:tcPr>
+            <w:tcW w:w="1017" w:type="dxa"/>
+            <w:tcBorders>
+              <w:top w:val="single" w:sz="4" w:space="0" w:color="000000"/>
+              <w:left w:val="single" w:sz="4" w:space="0" w:color="000000"/>
+              <w:bottom w:val="single" w:sz="4" w:space="0" w:color="000000"/>
+            </w:tcBorders>
+            <w:vAlign w:val="bottom"/>
+          </w:tcPr>
+          <w:p>
+            <w:pPr>
+              <w:pStyle w:val="Normal"/>
+              <w:widowControl w:val="false"/>
+              <w:spacing w:lineRule="auto" w:line="180" w:before="0" w:after="60"/>
+              <w:jc w:val="center"/>
+              <w:rPr>
+                <w:b/>
+                <w:bCs/>
+              </w:rPr>
+            </w:pPr>
+            <w:r>
+              <w:rPr>
+                <w:b/>
+                <w:bCs/>
+                <w:color w:val="000000"/>
+                <w:sz w:val="16"/>
+                <w:szCs w:val="16"/>
+              </w:rPr>
+              <w:t>HUD</w:t>
+            </w:r>
+          </w:p>
+        </w:tc>
+        <w:tc>
+          <w:tcPr>
+            <w:tcW w:w="1019" w:type="dxa"/>
+            <w:tcBorders>
+              <w:top w:val="single" w:sz="4" w:space="0" w:color="000000"/>
+              <w:left w:val="single" w:sz="4" w:space="0" w:color="000000"/>
+              <w:bottom w:val="single" w:sz="4" w:space="0" w:color="000000"/>
+            </w:tcBorders>
+            <w:vAlign w:val="bottom"/>
+          </w:tcPr>
+          <w:p>
+            <w:pPr>
+              <w:pStyle w:val="Normal"/>
+              <w:widowControl w:val="false"/>
+              <w:spacing w:lineRule="auto" w:line="180"/>
+              <w:jc w:val="center"/>
+              <w:rPr>
+                <w:color w:val="000000"/>
+                <w:sz w:val="16"/>
+                <w:szCs w:val="16"/>
+              </w:rPr>
+            </w:pPr>
+            <w:r>
+              <w:rPr>
+                <w:color w:val="000000"/>
+                <w:sz w:val="16"/>
+                <w:szCs w:val="16"/>
+              </w:rPr>
+              <w:t>Schedule</w:t>
+            </w:r>
+          </w:p>
+        </w:tc>
+        <w:tc>
+          <w:tcPr>
+            <w:tcW w:w="1014" w:type="dxa"/>
+            <w:tcBorders>
+              <w:top w:val="single" w:sz="4" w:space="0" w:color="000000"/>
+              <w:left w:val="single" w:sz="4" w:space="0" w:color="000000"/>
+              <w:bottom w:val="single" w:sz="4" w:space="0" w:color="000000"/>
+            </w:tcBorders>
+            <w:vAlign w:val="bottom"/>
+          </w:tcPr>
+          <w:p>
+            <w:pPr>
+              <w:pStyle w:val="Normal"/>
+              <w:widowControl w:val="false"/>
+              <w:spacing w:lineRule="auto" w:line="180"/>
+              <w:jc w:val="center"/>
+              <w:rPr>
+                <w:color w:val="000000"/>
+                <w:sz w:val="16"/>
+                <w:szCs w:val="16"/>
+              </w:rPr>
+            </w:pPr>
+            <w:r>
+              <w:rPr>
+                <w:color w:val="000000"/>
+                <w:sz w:val="16"/>
+                <w:szCs w:val="16"/>
+              </w:rPr>
+              <w:t>Control</w:t>
+            </w:r>
+            <w:r>
+              <w:rPr>
+                <w:color w:val="000000"/>
+                <w:sz w:val="16"/>
+                <w:szCs w:val="16"/>
+              </w:rPr>
+              <w:t xml:space="preserve"> Off</w:t>
+            </w:r>
+          </w:p>
+        </w:tc>
+        <w:tc>
+          <w:tcPr>
+            <w:tcW w:w="1016" w:type="dxa"/>
+            <w:tcBorders>
+              <w:top w:val="single" w:sz="4" w:space="0" w:color="000000"/>
+              <w:left w:val="single" w:sz="4" w:space="0" w:color="000000"/>
+              <w:bottom w:val="single" w:sz="4" w:space="0" w:color="000000"/>
+            </w:tcBorders>
+            <w:vAlign w:val="bottom"/>
+          </w:tcPr>
+          <w:p>
+            <w:pPr>
+              <w:pStyle w:val="Normal"/>
+              <w:widowControl w:val="false"/>
+              <w:spacing w:lineRule="auto" w:line="180"/>
+              <w:jc w:val="center"/>
+              <w:rPr>
+                <w:color w:val="000000"/>
+                <w:sz w:val="16"/>
+                <w:szCs w:val="16"/>
+              </w:rPr>
+            </w:pPr>
+            <w:r>
+              <w:rPr>
+                <w:color w:val="000000"/>
+                <w:sz w:val="16"/>
+                <w:szCs w:val="16"/>
+              </w:rPr>
+              <w:t>Overload Relay Trip</w:t>
+            </w:r>
+          </w:p>
+        </w:tc>
+        <w:tc>
+          <w:tcPr>
+            <w:tcW w:w="1020" w:type="dxa"/>
+            <w:tcBorders>
+              <w:top w:val="single" w:sz="4" w:space="0" w:color="000000"/>
+              <w:left w:val="single" w:sz="4" w:space="0" w:color="000000"/>
+              <w:bottom w:val="single" w:sz="4" w:space="0" w:color="000000"/>
+            </w:tcBorders>
+            <w:vAlign w:val="bottom"/>
+          </w:tcPr>
+          <w:p>
+            <w:pPr>
+              <w:pStyle w:val="Normal"/>
+              <w:widowControl w:val="false"/>
+              <w:spacing w:lineRule="auto" w:line="180"/>
+              <w:jc w:val="center"/>
+              <w:rPr>
+                <w:color w:val="000000"/>
+                <w:sz w:val="16"/>
+                <w:szCs w:val="16"/>
+              </w:rPr>
+            </w:pPr>
+            <w:r>
+              <w:rPr>
+                <w:color w:val="000000"/>
+                <w:sz w:val="16"/>
+                <w:szCs w:val="16"/>
+              </w:rPr>
+              <w:t>MG Trip</w:t>
+            </w:r>
+          </w:p>
+        </w:tc>
+        <w:tc>
+          <w:tcPr>
+            <w:tcW w:w="1016" w:type="dxa"/>
+            <w:tcBorders>
+              <w:top w:val="single" w:sz="4" w:space="0" w:color="000000"/>
+              <w:left w:val="single" w:sz="4" w:space="0" w:color="000000"/>
+              <w:bottom w:val="single" w:sz="4" w:space="0" w:color="000000"/>
+            </w:tcBorders>
+            <w:vAlign w:val="bottom"/>
+          </w:tcPr>
+          <w:p>
+            <w:pPr>
+              <w:pStyle w:val="Normal"/>
+              <w:widowControl w:val="false"/>
+              <w:spacing w:lineRule="auto" w:line="180"/>
+              <w:jc w:val="center"/>
+              <w:rPr>
+                <w:color w:val="000000"/>
+                <w:sz w:val="16"/>
+                <w:szCs w:val="16"/>
+              </w:rPr>
+            </w:pPr>
+            <w:r>
+              <w:rPr>
+                <w:color w:val="000000"/>
+                <w:sz w:val="16"/>
+                <w:szCs w:val="16"/>
+              </w:rPr>
+              <w:t>Saloon</w:t>
+            </w:r>
+            <w:r>
+              <w:rPr>
+                <w:color w:val="000000"/>
+                <w:sz w:val="16"/>
+                <w:szCs w:val="16"/>
+              </w:rPr>
+              <w:t xml:space="preserve"> Light Off</w:t>
+            </w:r>
+          </w:p>
+        </w:tc>
+        <w:tc>
+          <w:tcPr>
+            <w:tcW w:w="1016" w:type="dxa"/>
+            <w:tcBorders>
+              <w:top w:val="single" w:sz="4" w:space="0" w:color="000000"/>
+              <w:left w:val="single" w:sz="4" w:space="0" w:color="000000"/>
+              <w:bottom w:val="single" w:sz="4" w:space="0" w:color="000000"/>
+            </w:tcBorders>
+            <w:vAlign w:val="bottom"/>
+          </w:tcPr>
+          <w:p>
+            <w:pPr>
+              <w:pStyle w:val="Normal"/>
+              <w:widowControl w:val="false"/>
+              <w:spacing w:lineRule="auto" w:line="180"/>
+              <w:jc w:val="center"/>
+              <w:rPr>
+                <w:sz w:val="16"/>
+                <w:szCs w:val="16"/>
+              </w:rPr>
+            </w:pPr>
+            <w:r>
+              <w:rPr>
+                <w:color w:val="000000"/>
+                <w:sz w:val="16"/>
+                <w:szCs w:val="16"/>
+              </w:rPr>
+              <w:t>Heat &amp; Vent Off</w:t>
+            </w:r>
+          </w:p>
+        </w:tc>
+        <w:tc>
+          <w:tcPr>
+            <w:tcW w:w="1017" w:type="dxa"/>
+            <w:tcBorders>
+              <w:top w:val="single" w:sz="4" w:space="0" w:color="000000"/>
+              <w:left w:val="single" w:sz="4" w:space="0" w:color="000000"/>
+              <w:bottom w:val="single" w:sz="4" w:space="0" w:color="000000"/>
+            </w:tcBorders>
+            <w:vAlign w:val="bottom"/>
+          </w:tcPr>
+          <w:p>
+            <w:pPr>
+              <w:pStyle w:val="Normal"/>
+              <w:widowControl w:val="false"/>
+              <w:jc w:val="center"/>
+              <w:rPr>
+                <w:sz w:val="16"/>
+                <w:szCs w:val="16"/>
+              </w:rPr>
+            </w:pPr>
+            <w:r>
+              <w:rPr>
+                <w:sz w:val="16"/>
+                <w:szCs w:val="16"/>
+              </w:rPr>
+              <w:t>Destination Down</w:t>
+            </w:r>
+          </w:p>
+        </w:tc>
+        <w:tc>
+          <w:tcPr>
+            <w:tcW w:w="1016" w:type="dxa"/>
+            <w:tcBorders>
+              <w:top w:val="single" w:sz="4" w:space="0" w:color="000000"/>
+              <w:left w:val="single" w:sz="4" w:space="0" w:color="000000"/>
+              <w:bottom w:val="single" w:sz="4" w:space="0" w:color="000000"/>
+            </w:tcBorders>
+            <w:vAlign w:val="bottom"/>
+          </w:tcPr>
+          <w:p>
+            <w:pPr>
+              <w:pStyle w:val="Normal"/>
+              <w:widowControl w:val="false"/>
+              <w:jc w:val="center"/>
+              <w:rPr>
+                <w:color w:val="000000"/>
+                <w:sz w:val="16"/>
+                <w:szCs w:val="16"/>
+              </w:rPr>
+            </w:pPr>
+            <w:r>
+              <w:rPr>
+                <w:rFonts w:eastAsia="arial" w:ascii="arial" w:hAnsi="arial"/>
+                <w:color w:val="000000"/>
+                <w:sz w:val="16"/>
+                <w:szCs w:val="16"/>
+              </w:rPr>
+              <w:t>Rate Switch</w:t>
+            </w:r>
+          </w:p>
+        </w:tc>
+        <w:tc>
+          <w:tcPr>
+            <w:tcW w:w="1020" w:type="dxa"/>
+            <w:tcBorders>
+              <w:top w:val="single" w:sz="4" w:space="0" w:color="000000"/>
+              <w:left w:val="single" w:sz="4" w:space="0" w:color="000000"/>
+              <w:bottom w:val="single" w:sz="4" w:space="0" w:color="000000"/>
+            </w:tcBorders>
+            <w:vAlign w:val="bottom"/>
+          </w:tcPr>
+          <w:p>
+            <w:pPr>
+              <w:pStyle w:val="Normal"/>
+              <w:widowControl w:val="false"/>
+              <w:spacing w:lineRule="auto" w:line="180"/>
+              <w:jc w:val="center"/>
+              <w:rPr>
+                <w:sz w:val="16"/>
+                <w:szCs w:val="16"/>
+              </w:rPr>
+            </w:pPr>
+            <w:r>
+              <w:rPr/>
+            </w:r>
+          </w:p>
+        </w:tc>
+        <w:tc>
+          <w:tcPr>
+            <w:tcW w:w="1016" w:type="dxa"/>
+            <w:tcBorders>
+              <w:top w:val="single" w:sz="4" w:space="0" w:color="000000"/>
+              <w:left w:val="single" w:sz="4" w:space="0" w:color="000000"/>
+              <w:bottom w:val="single" w:sz="4" w:space="0" w:color="000000"/>
+            </w:tcBorders>
+            <w:vAlign w:val="bottom"/>
+          </w:tcPr>
+          <w:p>
+            <w:pPr>
+              <w:pStyle w:val="Normal"/>
+              <w:widowControl w:val="false"/>
+              <w:spacing w:lineRule="auto" w:line="180"/>
+              <w:jc w:val="center"/>
+              <w:rPr>
+                <w:sz w:val="16"/>
+                <w:szCs w:val="16"/>
+              </w:rPr>
+            </w:pPr>
+            <w:r>
+              <w:rPr>
+                <w:rFonts w:eastAsia="arial" w:ascii="arial" w:hAnsi="arial"/>
+                <w:color w:val="000000"/>
+                <w:sz w:val="16"/>
+                <w:szCs w:val="16"/>
+              </w:rPr>
+              <w:t>Tail Light</w:t>
+            </w:r>
+          </w:p>
+        </w:tc>
+        <w:tc>
+          <w:tcPr>
+            <w:tcW w:w="1016" w:type="dxa"/>
+            <w:tcBorders>
+              <w:top w:val="single" w:sz="4" w:space="0" w:color="000000"/>
+              <w:left w:val="single" w:sz="4" w:space="0" w:color="000000"/>
+              <w:bottom w:val="single" w:sz="4" w:space="0" w:color="000000"/>
+            </w:tcBorders>
+            <w:vAlign w:val="bottom"/>
+          </w:tcPr>
+          <w:p>
+            <w:pPr>
+              <w:pStyle w:val="Normal"/>
+              <w:widowControl w:val="false"/>
+              <w:jc w:val="center"/>
+              <w:rPr>
+                <w:color w:val="000000"/>
+                <w:sz w:val="16"/>
+                <w:szCs w:val="16"/>
+              </w:rPr>
+            </w:pPr>
+            <w:r>
+              <w:rPr>
+                <w:color w:val="000000"/>
+                <w:sz w:val="16"/>
+                <w:szCs w:val="16"/>
+              </w:rPr>
+              <w:t>Gauge Light</w:t>
+            </w:r>
+          </w:p>
+        </w:tc>
+        <w:tc>
+          <w:tcPr>
+            <w:tcW w:w="1016" w:type="dxa"/>
+            <w:tcBorders>
+              <w:top w:val="single" w:sz="4" w:space="0" w:color="000000"/>
+              <w:left w:val="single" w:sz="4" w:space="0" w:color="000000"/>
+              <w:bottom w:val="single" w:sz="4" w:space="0" w:color="000000"/>
+            </w:tcBorders>
+            <w:vAlign w:val="bottom"/>
+          </w:tcPr>
+          <w:p>
+            <w:pPr>
+              <w:pStyle w:val="Normal"/>
+              <w:widowControl w:val="false"/>
+              <w:spacing w:lineRule="auto" w:line="180"/>
+              <w:jc w:val="center"/>
+              <w:rPr>
+                <w:sz w:val="16"/>
+                <w:szCs w:val="16"/>
+              </w:rPr>
+            </w:pPr>
+            <w:r>
+              <w:rPr>
+                <w:rFonts w:eastAsia="arial" w:ascii="arial" w:hAnsi="arial"/>
+                <w:color w:val="000000"/>
+                <w:sz w:val="16"/>
+                <w:szCs w:val="16"/>
+              </w:rPr>
+              <w:t>Exterior</w:t>
+            </w:r>
+          </w:p>
+          <w:p>
+            <w:pPr>
+              <w:pStyle w:val="Normal"/>
+              <w:widowControl w:val="false"/>
+              <w:spacing w:lineRule="auto" w:line="180"/>
+              <w:jc w:val="center"/>
+              <w:rPr>
+                <w:sz w:val="16"/>
+                <w:szCs w:val="16"/>
+              </w:rPr>
+            </w:pPr>
+            <w:r>
+              <w:rPr>
+                <w:rFonts w:eastAsia="arial" w:ascii="arial" w:hAnsi="arial"/>
+                <w:color w:val="000000"/>
+                <w:sz w:val="16"/>
+                <w:szCs w:val="16"/>
+              </w:rPr>
+              <w:t>Camera</w:t>
+            </w:r>
+          </w:p>
+        </w:tc>
+        <w:tc>
+          <w:tcPr>
+            <w:tcW w:w="1029" w:type="dxa"/>
+            <w:tcBorders>
+              <w:top w:val="single" w:sz="4" w:space="0" w:color="000000"/>
+              <w:left w:val="single" w:sz="4" w:space="0" w:color="000000"/>
+              <w:bottom w:val="single" w:sz="4" w:space="0" w:color="000000"/>
+              <w:right w:val="single" w:sz="4" w:space="0" w:color="000000"/>
+            </w:tcBorders>
+            <w:vAlign w:val="bottom"/>
+          </w:tcPr>
+          <w:p>
+            <w:pPr>
+              <w:pStyle w:val="Normal"/>
+              <w:widowControl w:val="false"/>
+              <w:spacing w:lineRule="auto" w:line="180"/>
+              <w:jc w:val="center"/>
+              <w:rPr>
+                <w:sz w:val="16"/>
+                <w:szCs w:val="16"/>
+              </w:rPr>
+            </w:pPr>
+            <w:r>
+              <w:rPr>
+                <w:rFonts w:eastAsia="arial" w:ascii="arial" w:hAnsi="arial"/>
+                <w:color w:val="000000"/>
+                <w:sz w:val="16"/>
+                <w:szCs w:val="16"/>
+              </w:rPr>
+              <w:t>Prev</w:t>
+            </w:r>
+          </w:p>
+          <w:p>
+            <w:pPr>
+              <w:pStyle w:val="Normal"/>
+              <w:widowControl w:val="false"/>
+              <w:spacing w:lineRule="auto" w:line="180"/>
+              <w:jc w:val="center"/>
+              <w:rPr>
+                <w:sz w:val="16"/>
+                <w:szCs w:val="16"/>
+              </w:rPr>
+            </w:pPr>
+            <w:r>
+              <w:rPr>
+                <w:rFonts w:eastAsia="arial" w:ascii="arial" w:hAnsi="arial"/>
+                <w:color w:val="000000"/>
+                <w:sz w:val="16"/>
+                <w:szCs w:val="16"/>
+              </w:rPr>
+              <w:t>Cab Cam</w:t>
+            </w:r>
+          </w:p>
+        </w:tc>
+      </w:tr>
+    </w:tbl>
+    <w:p>
+      <w:pPr>
+        <w:pStyle w:val="Normal"/>
+        <w:rPr>
+          <w:color w:val="000000"/>
+          <w:sz w:val="16"/>
+          <w:szCs w:val="16"/>
+        </w:rPr>
+      </w:pPr>
+      <w:r>
+        <w:rPr>
+          <w:rFonts w:eastAsia="arial" w:ascii="arial" w:hAnsi="arial"/>
           <w:color w:val="000000"/>
           <w:sz w:val="16"/>
           <w:szCs w:val="16"/>
@@ -49807,12 +52072,12 @@
       <w:rFonts w:ascii="Symbol" w:hAnsi="Symbol" w:cs="Symbol"/>
     </w:rPr>
   </w:style>
-  <w:style w:type="character" w:styleId="Style5" w:customStyle="1">
-    <w:name w:val="번호 매기기 기호"/>
+  <w:style w:type="character" w:styleId="user" w:customStyle="1">
+    <w:name w:val="번호 매기기 기호 (user)"/>
     <w:qFormat/>
     <w:rPr/>
   </w:style>
-  <w:style w:type="paragraph" w:styleId="Style6">
+  <w:style w:type="paragraph" w:styleId="Style5">
     <w:name w:val="제목"/>
     <w:basedOn w:val="Normal"/>
     <w:next w:val="BodyText"/>
@@ -49822,7 +52087,7 @@
       <w:spacing w:before="240" w:after="120"/>
     </w:pPr>
     <w:rPr>
-      <w:rFonts w:ascii="Liberation Sans" w:hAnsi="Liberation Sans" w:eastAsia="나눔고딕" w:cs="Arial"/>
+      <w:rFonts w:ascii="Liberation Sans" w:hAnsi="Liberation Sans" w:eastAsia="Noto Sans CJK KR" w:cs="Lohit Devanagari"/>
       <w:sz w:val="28"/>
       <w:szCs w:val="28"/>
     </w:rPr>
@@ -49859,7 +52124,7 @@
       <w:szCs w:val="24"/>
     </w:rPr>
   </w:style>
-  <w:style w:type="paragraph" w:styleId="Style7">
+  <w:style w:type="paragraph" w:styleId="Style6" w:customStyle="1">
     <w:name w:val="색인"/>
     <w:basedOn w:val="Normal"/>
     <w:qFormat/>
@@ -49867,11 +52132,10 @@
       <w:suppressLineNumbers/>
     </w:pPr>
     <w:rPr>
-      <w:rFonts w:cs="Arial"/>
-      <w:sz w:val="24"/>
+      <w:rFonts w:cs="Lohit Devanagari"/>
     </w:rPr>
   </w:style>
-  <w:style w:type="paragraph" w:styleId="user">
+  <w:style w:type="paragraph" w:styleId="user1">
     <w:name w:val="제목 (user)"/>
     <w:basedOn w:val="Normal"/>
     <w:next w:val="BodyText"/>
@@ -49881,12 +52145,12 @@
       <w:spacing w:before="240" w:after="120"/>
     </w:pPr>
     <w:rPr>
-      <w:rFonts w:ascii="Liberation Sans" w:hAnsi="Liberation Sans" w:eastAsia="Noto Sans CJK KR" w:cs="Lohit Devanagari"/>
+      <w:rFonts w:ascii="Liberation Sans" w:hAnsi="Liberation Sans" w:eastAsia="나눔고딕" w:cs="Arial"/>
       <w:sz w:val="28"/>
       <w:szCs w:val="28"/>
     </w:rPr>
   </w:style>
-  <w:style w:type="paragraph" w:styleId="user1" w:customStyle="1">
+  <w:style w:type="paragraph" w:styleId="user2">
     <w:name w:val="색인 (user)"/>
     <w:basedOn w:val="Normal"/>
     <w:qFormat/>
@@ -49894,7 +52158,8 @@
       <w:suppressLineNumbers/>
     </w:pPr>
     <w:rPr>
-      <w:rFonts w:cs="Lohit Devanagari"/>
+      <w:rFonts w:cs="Arial"/>
+      <w:sz w:val="24"/>
     </w:rPr>
   </w:style>
   <w:style w:type="paragraph" w:styleId="Title">
@@ -50576,8 +52841,8 @@
       <w:szCs w:val="24"/>
     </w:rPr>
   </w:style>
-  <w:style w:type="paragraph" w:styleId="user2" w:customStyle="1">
-    <w:name w:val="표 내용 (user)"/>
+  <w:style w:type="paragraph" w:styleId="Style7" w:customStyle="1">
+    <w:name w:val="표 내용"/>
     <w:basedOn w:val="Normal"/>
     <w:qFormat/>
     <w:pPr>
@@ -50585,9 +52850,9 @@
     </w:pPr>
     <w:rPr/>
   </w:style>
-  <w:style w:type="paragraph" w:styleId="user3" w:customStyle="1">
-    <w:name w:val="표제목 (user)"/>
-    <w:basedOn w:val="user2"/>
+  <w:style w:type="paragraph" w:styleId="Style8" w:customStyle="1">
+    <w:name w:val="표제목"/>
+    <w:basedOn w:val="Style7"/>
     <w:qFormat/>
     <w:pPr>
       <w:jc w:val="center"/>
@@ -50597,8 +52862,8 @@
       <w:bCs/>
     </w:rPr>
   </w:style>
-  <w:style w:type="paragraph" w:styleId="Style8">
-    <w:name w:val="표 내용"/>
+  <w:style w:type="paragraph" w:styleId="user3">
+    <w:name w:val="표 내용 (user)"/>
     <w:basedOn w:val="Normal"/>
     <w:qFormat/>
     <w:pPr>
@@ -50607,9 +52872,9 @@
     </w:pPr>
     <w:rPr/>
   </w:style>
-  <w:style w:type="paragraph" w:styleId="Style9">
-    <w:name w:val="표제목"/>
-    <w:basedOn w:val="Style8"/>
+  <w:style w:type="paragraph" w:styleId="user4">
+    <w:name w:val="표제목 (user)"/>
+    <w:basedOn w:val="user3"/>
     <w:qFormat/>
     <w:pPr>
       <w:suppressLineNumbers/>

</xml_diff>

<commit_message>
Add Thames Valley Branches Class 165
</commit_message>
<xml_diff>
--- a/raildriver-UK-Remapped.docx
+++ b/raildriver-UK-Remapped.docx
@@ -21086,7 +21086,25 @@
           <w:szCs w:val="16"/>
         </w:rPr>
         <w:tab/>
-        <w:t xml:space="preserve">           Class 166-1</w:t>
+        <w:t xml:space="preserve">           Class </w:t>
+      </w:r>
+      <w:r>
+        <w:rPr>
+          <w:rFonts w:eastAsia="arial" w:ascii="arial" w:hAnsi="arial"/>
+          <w:color w:val="000000"/>
+          <w:sz w:val="16"/>
+          <w:szCs w:val="16"/>
+        </w:rPr>
+        <w:t>165/</w:t>
+      </w:r>
+      <w:r>
+        <w:rPr>
+          <w:rFonts w:eastAsia="arial" w:ascii="arial" w:hAnsi="arial"/>
+          <w:color w:val="000000"/>
+          <w:sz w:val="16"/>
+          <w:szCs w:val="16"/>
+        </w:rPr>
+        <w:t>166-1</w:t>
       </w:r>
     </w:p>
     <w:tbl>
@@ -21626,7 +21644,25 @@
           <w:szCs w:val="16"/>
         </w:rPr>
         <w:tab/>
-        <w:t xml:space="preserve">           Class 166-2</w:t>
+        <w:t xml:space="preserve">           Class </w:t>
+      </w:r>
+      <w:r>
+        <w:rPr>
+          <w:rFonts w:eastAsia="arial" w:ascii="arial" w:hAnsi="arial"/>
+          <w:color w:val="000000"/>
+          <w:sz w:val="16"/>
+          <w:szCs w:val="16"/>
+        </w:rPr>
+        <w:t>165/</w:t>
+      </w:r>
+      <w:r>
+        <w:rPr>
+          <w:rFonts w:eastAsia="arial" w:ascii="arial" w:hAnsi="arial"/>
+          <w:color w:val="000000"/>
+          <w:sz w:val="16"/>
+          <w:szCs w:val="16"/>
+        </w:rPr>
+        <w:t>166-2</w:t>
       </w:r>
     </w:p>
     <w:tbl>
@@ -48767,25 +48803,7 @@
           <w:szCs w:val="16"/>
         </w:rPr>
         <w:tab/>
-        <w:t xml:space="preserve">           </w:t>
-      </w:r>
-      <w:r>
-        <w:rPr>
-          <w:rFonts w:eastAsia="arial" w:ascii="arial" w:hAnsi="arial"/>
-          <w:color w:val="000000"/>
-          <w:sz w:val="16"/>
-          <w:szCs w:val="16"/>
-        </w:rPr>
-        <w:t>1938 Tube Stock</w:t>
-      </w:r>
-      <w:r>
-        <w:rPr>
-          <w:rFonts w:eastAsia="arial" w:ascii="arial" w:hAnsi="arial"/>
-          <w:color w:val="000000"/>
-          <w:sz w:val="16"/>
-          <w:szCs w:val="16"/>
-        </w:rPr>
-        <w:t>-1</w:t>
+        <w:t xml:space="preserve">           1938 Tube Stock-1</w:t>
       </w:r>
     </w:p>
     <w:tbl>
@@ -49324,25 +49342,7 @@
           <w:szCs w:val="16"/>
         </w:rPr>
         <w:tab/>
-        <w:t xml:space="preserve">           </w:t>
-      </w:r>
-      <w:r>
-        <w:rPr>
-          <w:rFonts w:eastAsia="arial" w:ascii="arial" w:hAnsi="arial"/>
-          <w:color w:val="000000"/>
-          <w:sz w:val="16"/>
-          <w:szCs w:val="16"/>
-        </w:rPr>
-        <w:t>1938 Tube Stock</w:t>
-      </w:r>
-      <w:r>
-        <w:rPr>
-          <w:rFonts w:eastAsia="arial" w:ascii="arial" w:hAnsi="arial"/>
-          <w:color w:val="000000"/>
-          <w:sz w:val="16"/>
-          <w:szCs w:val="16"/>
-        </w:rPr>
-        <w:t>-2</w:t>
+        <w:t xml:space="preserve">           1938 Tube Stock-2</w:t>
       </w:r>
     </w:p>
     <w:tbl>
@@ -49876,7 +49876,6 @@
       </w:pPr>
       <w:r>
         <w:rPr>
-          <w:rFonts w:eastAsia="arial" w:ascii="arial" w:hAnsi="arial"/>
           <w:color w:val="000000"/>
           <w:sz w:val="16"/>
           <w:szCs w:val="16"/>
@@ -49900,25 +49899,7 @@
           <w:szCs w:val="16"/>
         </w:rPr>
         <w:tab/>
-        <w:t xml:space="preserve">           </w:t>
-      </w:r>
-      <w:r>
-        <w:rPr>
-          <w:rFonts w:eastAsia="arial" w:ascii="arial" w:hAnsi="arial"/>
-          <w:color w:val="000000"/>
-          <w:sz w:val="16"/>
-          <w:szCs w:val="16"/>
-        </w:rPr>
-        <w:t>1972 Tube Stock</w:t>
-      </w:r>
-      <w:r>
-        <w:rPr>
-          <w:rFonts w:eastAsia="arial" w:ascii="arial" w:hAnsi="arial"/>
-          <w:color w:val="000000"/>
-          <w:sz w:val="16"/>
-          <w:szCs w:val="16"/>
-        </w:rPr>
-        <w:t>-1</w:t>
+        <w:t xml:space="preserve">           1972 Tube Stock-1</w:t>
       </w:r>
     </w:p>
     <w:tbl>
@@ -50019,15 +50000,7 @@
                 <w:sz w:val="16"/>
                 <w:szCs w:val="16"/>
               </w:rPr>
-              <w:t>Control</w:t>
-            </w:r>
-            <w:r>
-              <w:rPr>
-                <w:color w:val="000000"/>
-                <w:sz w:val="16"/>
-                <w:szCs w:val="16"/>
-              </w:rPr>
-              <w:t xml:space="preserve"> Key</w:t>
+              <w:t>Control Key</w:t>
             </w:r>
           </w:p>
         </w:tc>
@@ -50059,15 +50032,7 @@
                 <w:sz w:val="16"/>
                 <w:szCs w:val="16"/>
               </w:rPr>
-              <w:t>Control</w:t>
-            </w:r>
-            <w:r>
-              <w:rPr>
-                <w:color w:val="000000"/>
-                <w:sz w:val="16"/>
-                <w:szCs w:val="16"/>
-              </w:rPr>
-              <w:t xml:space="preserve"> On</w:t>
+              <w:t>Control On</w:t>
             </w:r>
           </w:p>
         </w:tc>
@@ -50163,15 +50128,7 @@
                 <w:sz w:val="16"/>
                 <w:szCs w:val="16"/>
               </w:rPr>
-              <w:t>Saloon</w:t>
-            </w:r>
-            <w:r>
-              <w:rPr>
-                <w:color w:val="000000"/>
-                <w:sz w:val="16"/>
-                <w:szCs w:val="16"/>
-              </w:rPr>
-              <w:t xml:space="preserve"> Light On</w:t>
+              <w:t>Saloon Light On</w:t>
             </w:r>
           </w:p>
         </w:tc>
@@ -50255,7 +50212,11 @@
               </w:rPr>
             </w:pPr>
             <w:r>
-              <w:rPr/>
+              <w:rPr>
+                <w:color w:val="000000"/>
+                <w:sz w:val="16"/>
+                <w:szCs w:val="16"/>
+              </w:rPr>
             </w:r>
           </w:p>
         </w:tc>
@@ -50478,25 +50439,7 @@
           <w:szCs w:val="16"/>
         </w:rPr>
         <w:tab/>
-        <w:t xml:space="preserve">           </w:t>
-      </w:r>
-      <w:r>
-        <w:rPr>
-          <w:rFonts w:eastAsia="arial" w:ascii="arial" w:hAnsi="arial"/>
-          <w:color w:val="000000"/>
-          <w:sz w:val="16"/>
-          <w:szCs w:val="16"/>
-        </w:rPr>
-        <w:t>1972 Tube Stock</w:t>
-      </w:r>
-      <w:r>
-        <w:rPr>
-          <w:rFonts w:eastAsia="arial" w:ascii="arial" w:hAnsi="arial"/>
-          <w:color w:val="000000"/>
-          <w:sz w:val="16"/>
-          <w:szCs w:val="16"/>
-        </w:rPr>
-        <w:t>-2</w:t>
+        <w:t xml:space="preserve">           1972 Tube Stock-2</w:t>
       </w:r>
     </w:p>
     <w:tbl>
@@ -50627,15 +50570,7 @@
                 <w:sz w:val="16"/>
                 <w:szCs w:val="16"/>
               </w:rPr>
-              <w:t>Control</w:t>
-            </w:r>
-            <w:r>
-              <w:rPr>
-                <w:color w:val="000000"/>
-                <w:sz w:val="16"/>
-                <w:szCs w:val="16"/>
-              </w:rPr>
-              <w:t xml:space="preserve"> Off</w:t>
+              <w:t>Control Off</w:t>
             </w:r>
           </w:p>
         </w:tc>
@@ -50731,15 +50666,7 @@
                 <w:sz w:val="16"/>
                 <w:szCs w:val="16"/>
               </w:rPr>
-              <w:t>Saloon</w:t>
-            </w:r>
-            <w:r>
-              <w:rPr>
-                <w:color w:val="000000"/>
-                <w:sz w:val="16"/>
-                <w:szCs w:val="16"/>
-              </w:rPr>
-              <w:t xml:space="preserve"> Light Off</w:t>
+              <w:t>Saloon Light Off</w:t>
             </w:r>
           </w:p>
         </w:tc>
@@ -50857,7 +50784,10 @@
               </w:rPr>
             </w:pPr>
             <w:r>
-              <w:rPr/>
+              <w:rPr>
+                <w:sz w:val="16"/>
+                <w:szCs w:val="16"/>
+              </w:rPr>
             </w:r>
           </w:p>
         </w:tc>
@@ -51044,7 +50974,6 @@
       </w:pPr>
       <w:r>
         <w:rPr>
-          <w:rFonts w:eastAsia="arial" w:ascii="arial" w:hAnsi="arial"/>
           <w:color w:val="000000"/>
           <w:sz w:val="16"/>
           <w:szCs w:val="16"/>
@@ -52072,12 +52001,12 @@
       <w:rFonts w:ascii="Symbol" w:hAnsi="Symbol" w:cs="Symbol"/>
     </w:rPr>
   </w:style>
-  <w:style w:type="character" w:styleId="user" w:customStyle="1">
-    <w:name w:val="번호 매기기 기호 (user)"/>
+  <w:style w:type="character" w:styleId="Style5" w:customStyle="1">
+    <w:name w:val="번호 매기기 기호"/>
     <w:qFormat/>
     <w:rPr/>
   </w:style>
-  <w:style w:type="paragraph" w:styleId="Style5">
+  <w:style w:type="paragraph" w:styleId="Style6">
     <w:name w:val="제목"/>
     <w:basedOn w:val="Normal"/>
     <w:next w:val="BodyText"/>
@@ -52087,7 +52016,7 @@
       <w:spacing w:before="240" w:after="120"/>
     </w:pPr>
     <w:rPr>
-      <w:rFonts w:ascii="Liberation Sans" w:hAnsi="Liberation Sans" w:eastAsia="Noto Sans CJK KR" w:cs="Lohit Devanagari"/>
+      <w:rFonts w:ascii="Liberation Sans" w:hAnsi="Liberation Sans" w:eastAsia="나눔고딕" w:cs="Arial"/>
       <w:sz w:val="28"/>
       <w:szCs w:val="28"/>
     </w:rPr>
@@ -52124,7 +52053,7 @@
       <w:szCs w:val="24"/>
     </w:rPr>
   </w:style>
-  <w:style w:type="paragraph" w:styleId="Style6" w:customStyle="1">
+  <w:style w:type="paragraph" w:styleId="Style7">
     <w:name w:val="색인"/>
     <w:basedOn w:val="Normal"/>
     <w:qFormat/>
@@ -52132,10 +52061,11 @@
       <w:suppressLineNumbers/>
     </w:pPr>
     <w:rPr>
-      <w:rFonts w:cs="Lohit Devanagari"/>
+      <w:rFonts w:cs="Arial"/>
+      <w:sz w:val="24"/>
     </w:rPr>
   </w:style>
-  <w:style w:type="paragraph" w:styleId="user1">
+  <w:style w:type="paragraph" w:styleId="user">
     <w:name w:val="제목 (user)"/>
     <w:basedOn w:val="Normal"/>
     <w:next w:val="BodyText"/>
@@ -52145,12 +52075,12 @@
       <w:spacing w:before="240" w:after="120"/>
     </w:pPr>
     <w:rPr>
-      <w:rFonts w:ascii="Liberation Sans" w:hAnsi="Liberation Sans" w:eastAsia="나눔고딕" w:cs="Arial"/>
+      <w:rFonts w:ascii="Liberation Sans" w:hAnsi="Liberation Sans" w:eastAsia="Noto Sans CJK KR" w:cs="Lohit Devanagari"/>
       <w:sz w:val="28"/>
       <w:szCs w:val="28"/>
     </w:rPr>
   </w:style>
-  <w:style w:type="paragraph" w:styleId="user2">
+  <w:style w:type="paragraph" w:styleId="user1" w:customStyle="1">
     <w:name w:val="색인 (user)"/>
     <w:basedOn w:val="Normal"/>
     <w:qFormat/>
@@ -52158,8 +52088,7 @@
       <w:suppressLineNumbers/>
     </w:pPr>
     <w:rPr>
-      <w:rFonts w:cs="Arial"/>
-      <w:sz w:val="24"/>
+      <w:rFonts w:cs="Lohit Devanagari"/>
     </w:rPr>
   </w:style>
   <w:style w:type="paragraph" w:styleId="Title">
@@ -52841,8 +52770,8 @@
       <w:szCs w:val="24"/>
     </w:rPr>
   </w:style>
-  <w:style w:type="paragraph" w:styleId="Style7" w:customStyle="1">
-    <w:name w:val="표 내용"/>
+  <w:style w:type="paragraph" w:styleId="user2" w:customStyle="1">
+    <w:name w:val="표 내용 (user)"/>
     <w:basedOn w:val="Normal"/>
     <w:qFormat/>
     <w:pPr>
@@ -52850,9 +52779,9 @@
     </w:pPr>
     <w:rPr/>
   </w:style>
-  <w:style w:type="paragraph" w:styleId="Style8" w:customStyle="1">
-    <w:name w:val="표제목"/>
-    <w:basedOn w:val="Style7"/>
+  <w:style w:type="paragraph" w:styleId="user3" w:customStyle="1">
+    <w:name w:val="표제목 (user)"/>
+    <w:basedOn w:val="user2"/>
     <w:qFormat/>
     <w:pPr>
       <w:jc w:val="center"/>
@@ -52862,8 +52791,8 @@
       <w:bCs/>
     </w:rPr>
   </w:style>
-  <w:style w:type="paragraph" w:styleId="user3">
-    <w:name w:val="표 내용 (user)"/>
+  <w:style w:type="paragraph" w:styleId="Style8">
+    <w:name w:val="표 내용"/>
     <w:basedOn w:val="Normal"/>
     <w:qFormat/>
     <w:pPr>
@@ -52872,9 +52801,9 @@
     </w:pPr>
     <w:rPr/>
   </w:style>
-  <w:style w:type="paragraph" w:styleId="user4">
-    <w:name w:val="표제목 (user)"/>
-    <w:basedOn w:val="user3"/>
+  <w:style w:type="paragraph" w:styleId="Style9">
+    <w:name w:val="표제목"/>
+    <w:basedOn w:val="Style8"/>
     <w:qFormat/>
     <w:pPr>
       <w:suppressLineNumbers/>

</xml_diff>